<commit_message>
Regenera Word y PDF de la tesis
Co-Authored-By: Claude Opus 4.8 <noreply@anthropic.com>
</commit_message>
<xml_diff>
--- a/outputs/Tesis_Francisco_Rietta.docx
+++ b/outputs/Tesis_Francisco_Rietta.docx
@@ -91,7 +91,7 @@
       <w:pPr>
         <w:pStyle w:val="Ttulo1"/>
       </w:pPr>
-      <w:bookmarkStart w:id="0" w:name="_Toc231075097"/>
+      <w:bookmarkStart w:id="0" w:name="_Toc231075985"/>
       <w:r>
         <w:lastRenderedPageBreak/>
         <w:t>Resumen</w:t>
@@ -126,7 +126,7 @@
       <w:pPr>
         <w:pStyle w:val="Ttulo1"/>
       </w:pPr>
-      <w:bookmarkStart w:id="1" w:name="_Toc231075098"/>
+      <w:bookmarkStart w:id="1" w:name="_Toc231075986"/>
       <w:r>
         <w:lastRenderedPageBreak/>
         <w:t>Índice</w:t>
@@ -152,7 +152,7 @@
       <w:r>
         <w:fldChar w:fldCharType="separate"/>
       </w:r>
-      <w:hyperlink w:anchor="_Toc231075097" w:history="1">
+      <w:hyperlink w:anchor="_Toc231075985" w:history="1">
         <w:r>
           <w:rPr>
             <w:rStyle w:val="Hipervnculo"/>
@@ -179,7 +179,7 @@
             <w:noProof/>
             <w:webHidden/>
           </w:rPr>
-          <w:instrText xml:space="preserve"> PAGEREF _Toc231075097 \h </w:instrText>
+          <w:instrText xml:space="preserve"> PAGEREF _Toc231075985 \h </w:instrText>
         </w:r>
         <w:r>
           <w:rPr>
@@ -220,7 +220,7 @@
           <w:noProof/>
         </w:rPr>
       </w:pPr>
-      <w:hyperlink w:anchor="_Toc231075098" w:history="1">
+      <w:hyperlink w:anchor="_Toc231075986" w:history="1">
         <w:r>
           <w:rPr>
             <w:rStyle w:val="Hipervnculo"/>
@@ -247,7 +247,7 @@
             <w:noProof/>
             <w:webHidden/>
           </w:rPr>
-          <w:instrText xml:space="preserve"> PAGEREF _Toc231075098 \h </w:instrText>
+          <w:instrText xml:space="preserve"> PAGEREF _Toc231075986 \h </w:instrText>
         </w:r>
         <w:r>
           <w:rPr>
@@ -288,7 +288,7 @@
           <w:noProof/>
         </w:rPr>
       </w:pPr>
-      <w:hyperlink w:anchor="_Toc231075099" w:history="1">
+      <w:hyperlink w:anchor="_Toc231075987" w:history="1">
         <w:r>
           <w:rPr>
             <w:rStyle w:val="Hipervnculo"/>
@@ -315,7 +315,7 @@
             <w:noProof/>
             <w:webHidden/>
           </w:rPr>
-          <w:instrText xml:space="preserve"> PAGEREF _Toc231075099 \h </w:instrText>
+          <w:instrText xml:space="preserve"> PAGEREF _Toc231075987 \h </w:instrText>
         </w:r>
         <w:r>
           <w:rPr>
@@ -356,7 +356,7 @@
           <w:noProof/>
         </w:rPr>
       </w:pPr>
-      <w:hyperlink w:anchor="_Toc231075100" w:history="1">
+      <w:hyperlink w:anchor="_Toc231075988" w:history="1">
         <w:r>
           <w:rPr>
             <w:rStyle w:val="Hipervnculo"/>
@@ -383,7 +383,7 @@
             <w:noProof/>
             <w:webHidden/>
           </w:rPr>
-          <w:instrText xml:space="preserve"> PAGEREF _Toc231075100 \h </w:instrText>
+          <w:instrText xml:space="preserve"> PAGEREF _Toc231075988 \h </w:instrText>
         </w:r>
         <w:r>
           <w:rPr>
@@ -424,7 +424,7 @@
           <w:noProof/>
         </w:rPr>
       </w:pPr>
-      <w:hyperlink w:anchor="_Toc231075101" w:history="1">
+      <w:hyperlink w:anchor="_Toc231075989" w:history="1">
         <w:r>
           <w:rPr>
             <w:rStyle w:val="Hipervnculo"/>
@@ -451,7 +451,7 @@
             <w:noProof/>
             <w:webHidden/>
           </w:rPr>
-          <w:instrText xml:space="preserve"> PAGEREF _Toc231075101 \h </w:instrText>
+          <w:instrText xml:space="preserve"> PAGEREF _Toc231075989 \h </w:instrText>
         </w:r>
         <w:r>
           <w:rPr>
@@ -492,7 +492,7 @@
           <w:noProof/>
         </w:rPr>
       </w:pPr>
-      <w:hyperlink w:anchor="_Toc231075102" w:history="1">
+      <w:hyperlink w:anchor="_Toc231075990" w:history="1">
         <w:r>
           <w:rPr>
             <w:rStyle w:val="Hipervnculo"/>
@@ -519,7 +519,7 @@
             <w:noProof/>
             <w:webHidden/>
           </w:rPr>
-          <w:instrText xml:space="preserve"> PAGEREF _Toc231075102 \h </w:instrText>
+          <w:instrText xml:space="preserve"> PAGEREF _Toc231075990 \h </w:instrText>
         </w:r>
         <w:r>
           <w:rPr>
@@ -560,7 +560,7 @@
           <w:noProof/>
         </w:rPr>
       </w:pPr>
-      <w:hyperlink w:anchor="_Toc231075103" w:history="1">
+      <w:hyperlink w:anchor="_Toc231075991" w:history="1">
         <w:r>
           <w:rPr>
             <w:rStyle w:val="Hipervnculo"/>
@@ -587,7 +587,7 @@
             <w:noProof/>
             <w:webHidden/>
           </w:rPr>
-          <w:instrText xml:space="preserve"> PAGEREF _Toc231075103 \h </w:instrText>
+          <w:instrText xml:space="preserve"> PAGEREF _Toc231075991 \h </w:instrText>
         </w:r>
         <w:r>
           <w:rPr>
@@ -628,7 +628,7 @@
           <w:noProof/>
         </w:rPr>
       </w:pPr>
-      <w:hyperlink w:anchor="_Toc231075104" w:history="1">
+      <w:hyperlink w:anchor="_Toc231075992" w:history="1">
         <w:r>
           <w:rPr>
             <w:rStyle w:val="Hipervnculo"/>
@@ -655,7 +655,7 @@
             <w:noProof/>
             <w:webHidden/>
           </w:rPr>
-          <w:instrText xml:space="preserve"> PAGEREF _Toc231075104 \h </w:instrText>
+          <w:instrText xml:space="preserve"> PAGEREF _Toc231075992 \h </w:instrText>
         </w:r>
         <w:r>
           <w:rPr>
@@ -696,7 +696,7 @@
           <w:noProof/>
         </w:rPr>
       </w:pPr>
-      <w:hyperlink w:anchor="_Toc231075105" w:history="1">
+      <w:hyperlink w:anchor="_Toc231075993" w:history="1">
         <w:r>
           <w:rPr>
             <w:rStyle w:val="Hipervnculo"/>
@@ -723,7 +723,7 @@
             <w:noProof/>
             <w:webHidden/>
           </w:rPr>
-          <w:instrText xml:space="preserve"> PAGEREF _Toc231075105 \h </w:instrText>
+          <w:instrText xml:space="preserve"> PAGEREF _Toc231075993 \h </w:instrText>
         </w:r>
         <w:r>
           <w:rPr>
@@ -764,7 +764,7 @@
           <w:noProof/>
         </w:rPr>
       </w:pPr>
-      <w:hyperlink w:anchor="_Toc231075106" w:history="1">
+      <w:hyperlink w:anchor="_Toc231075994" w:history="1">
         <w:r>
           <w:rPr>
             <w:rStyle w:val="Hipervnculo"/>
@@ -791,7 +791,7 @@
             <w:noProof/>
             <w:webHidden/>
           </w:rPr>
-          <w:instrText xml:space="preserve"> PAGEREF _Toc231075106 \h </w:instrText>
+          <w:instrText xml:space="preserve"> PAGEREF _Toc231075994 \h </w:instrText>
         </w:r>
         <w:r>
           <w:rPr>
@@ -832,7 +832,7 @@
           <w:noProof/>
         </w:rPr>
       </w:pPr>
-      <w:hyperlink w:anchor="_Toc231075107" w:history="1">
+      <w:hyperlink w:anchor="_Toc231075995" w:history="1">
         <w:r>
           <w:rPr>
             <w:rStyle w:val="Hipervnculo"/>
@@ -859,7 +859,7 @@
             <w:noProof/>
             <w:webHidden/>
           </w:rPr>
-          <w:instrText xml:space="preserve"> PAGEREF _Toc231075107 \h </w:instrText>
+          <w:instrText xml:space="preserve"> PAGEREF _Toc231075995 \h </w:instrText>
         </w:r>
         <w:r>
           <w:rPr>
@@ -900,7 +900,7 @@
           <w:noProof/>
         </w:rPr>
       </w:pPr>
-      <w:hyperlink w:anchor="_Toc231075108" w:history="1">
+      <w:hyperlink w:anchor="_Toc231075996" w:history="1">
         <w:r>
           <w:rPr>
             <w:rStyle w:val="Hipervnculo"/>
@@ -927,7 +927,7 @@
             <w:noProof/>
             <w:webHidden/>
           </w:rPr>
-          <w:instrText xml:space="preserve"> PAGEREF _Toc231075108 \h </w:instrText>
+          <w:instrText xml:space="preserve"> PAGEREF _Toc231075996 \h </w:instrText>
         </w:r>
         <w:r>
           <w:rPr>
@@ -968,7 +968,7 @@
           <w:noProof/>
         </w:rPr>
       </w:pPr>
-      <w:hyperlink w:anchor="_Toc231075109" w:history="1">
+      <w:hyperlink w:anchor="_Toc231075997" w:history="1">
         <w:r>
           <w:rPr>
             <w:rStyle w:val="Hipervnculo"/>
@@ -995,7 +995,7 @@
             <w:noProof/>
             <w:webHidden/>
           </w:rPr>
-          <w:instrText xml:space="preserve"> PAGEREF _Toc231075109 \h </w:instrText>
+          <w:instrText xml:space="preserve"> PAGEREF _Toc231075997 \h </w:instrText>
         </w:r>
         <w:r>
           <w:rPr>
@@ -1036,7 +1036,7 @@
           <w:noProof/>
         </w:rPr>
       </w:pPr>
-      <w:hyperlink w:anchor="_Toc231075110" w:history="1">
+      <w:hyperlink w:anchor="_Toc231075998" w:history="1">
         <w:r>
           <w:rPr>
             <w:rStyle w:val="Hipervnculo"/>
@@ -1063,7 +1063,7 @@
             <w:noProof/>
             <w:webHidden/>
           </w:rPr>
-          <w:instrText xml:space="preserve"> PAGEREF _Toc231075110 \h </w:instrText>
+          <w:instrText xml:space="preserve"> PAGEREF _Toc231075998 \h </w:instrText>
         </w:r>
         <w:r>
           <w:rPr>
@@ -1104,7 +1104,7 @@
           <w:noProof/>
         </w:rPr>
       </w:pPr>
-      <w:hyperlink w:anchor="_Toc231075111" w:history="1">
+      <w:hyperlink w:anchor="_Toc231075999" w:history="1">
         <w:r>
           <w:rPr>
             <w:rStyle w:val="Hipervnculo"/>
@@ -1131,7 +1131,7 @@
             <w:noProof/>
             <w:webHidden/>
           </w:rPr>
-          <w:instrText xml:space="preserve"> PAGEREF _Toc231075111 \h </w:instrText>
+          <w:instrText xml:space="preserve"> PAGEREF _Toc231075999 \h </w:instrText>
         </w:r>
         <w:r>
           <w:rPr>
@@ -1172,7 +1172,7 @@
           <w:noProof/>
         </w:rPr>
       </w:pPr>
-      <w:hyperlink w:anchor="_Toc231075112" w:history="1">
+      <w:hyperlink w:anchor="_Toc231076000" w:history="1">
         <w:r>
           <w:rPr>
             <w:rStyle w:val="Hipervnculo"/>
@@ -1199,7 +1199,7 @@
             <w:noProof/>
             <w:webHidden/>
           </w:rPr>
-          <w:instrText xml:space="preserve"> PAGEREF _Toc231075112 \h </w:instrText>
+          <w:instrText xml:space="preserve"> PAGEREF _Toc231076000 \h </w:instrText>
         </w:r>
         <w:r>
           <w:rPr>
@@ -1240,7 +1240,7 @@
           <w:noProof/>
         </w:rPr>
       </w:pPr>
-      <w:hyperlink w:anchor="_Toc231075113" w:history="1">
+      <w:hyperlink w:anchor="_Toc231076001" w:history="1">
         <w:r>
           <w:rPr>
             <w:rStyle w:val="Hipervnculo"/>
@@ -1267,7 +1267,7 @@
             <w:noProof/>
             <w:webHidden/>
           </w:rPr>
-          <w:instrText xml:space="preserve"> PAGEREF _Toc231075113 \h </w:instrText>
+          <w:instrText xml:space="preserve"> PAGEREF _Toc231076001 \h </w:instrText>
         </w:r>
         <w:r>
           <w:rPr>
@@ -1308,7 +1308,7 @@
           <w:noProof/>
         </w:rPr>
       </w:pPr>
-      <w:hyperlink w:anchor="_Toc231075114" w:history="1">
+      <w:hyperlink w:anchor="_Toc231076002" w:history="1">
         <w:r>
           <w:rPr>
             <w:rStyle w:val="Hipervnculo"/>
@@ -1335,7 +1335,7 @@
             <w:noProof/>
             <w:webHidden/>
           </w:rPr>
-          <w:instrText xml:space="preserve"> PAGEREF _Toc231075114 \h </w:instrText>
+          <w:instrText xml:space="preserve"> PAGEREF _Toc231076002 \h </w:instrText>
         </w:r>
         <w:r>
           <w:rPr>
@@ -1376,7 +1376,7 @@
           <w:noProof/>
         </w:rPr>
       </w:pPr>
-      <w:hyperlink w:anchor="_Toc231075115" w:history="1">
+      <w:hyperlink w:anchor="_Toc231076003" w:history="1">
         <w:r>
           <w:rPr>
             <w:rStyle w:val="Hipervnculo"/>
@@ -1403,7 +1403,7 @@
             <w:noProof/>
             <w:webHidden/>
           </w:rPr>
-          <w:instrText xml:space="preserve"> PAGEREF _Toc231075115 \h </w:instrText>
+          <w:instrText xml:space="preserve"> PAGEREF _Toc231076003 \h </w:instrText>
         </w:r>
         <w:r>
           <w:rPr>
@@ -1444,7 +1444,7 @@
           <w:noProof/>
         </w:rPr>
       </w:pPr>
-      <w:hyperlink w:anchor="_Toc231075116" w:history="1">
+      <w:hyperlink w:anchor="_Toc231076004" w:history="1">
         <w:r>
           <w:rPr>
             <w:rStyle w:val="Hipervnculo"/>
@@ -1471,7 +1471,7 @@
             <w:noProof/>
             <w:webHidden/>
           </w:rPr>
-          <w:instrText xml:space="preserve"> PAGEREF _Toc231075116 \h </w:instrText>
+          <w:instrText xml:space="preserve"> PAGEREF _Toc231076004 \h </w:instrText>
         </w:r>
         <w:r>
           <w:rPr>
@@ -1512,7 +1512,7 @@
           <w:noProof/>
         </w:rPr>
       </w:pPr>
-      <w:hyperlink w:anchor="_Toc231075117" w:history="1">
+      <w:hyperlink w:anchor="_Toc231076005" w:history="1">
         <w:r>
           <w:rPr>
             <w:rStyle w:val="Hipervnculo"/>
@@ -1539,7 +1539,7 @@
             <w:noProof/>
             <w:webHidden/>
           </w:rPr>
-          <w:instrText xml:space="preserve"> PAGEREF _Toc231075117 \h </w:instrText>
+          <w:instrText xml:space="preserve"> PAGEREF _Toc231076005 \h </w:instrText>
         </w:r>
         <w:r>
           <w:rPr>
@@ -1580,7 +1580,7 @@
           <w:noProof/>
         </w:rPr>
       </w:pPr>
-      <w:hyperlink w:anchor="_Toc231075118" w:history="1">
+      <w:hyperlink w:anchor="_Toc231076006" w:history="1">
         <w:r>
           <w:rPr>
             <w:rStyle w:val="Hipervnculo"/>
@@ -1607,7 +1607,7 @@
             <w:noProof/>
             <w:webHidden/>
           </w:rPr>
-          <w:instrText xml:space="preserve"> PAGEREF _Toc231075118 \h </w:instrText>
+          <w:instrText xml:space="preserve"> PAGEREF _Toc231076006 \h </w:instrText>
         </w:r>
         <w:r>
           <w:rPr>
@@ -1648,7 +1648,7 @@
           <w:noProof/>
         </w:rPr>
       </w:pPr>
-      <w:hyperlink w:anchor="_Toc231075119" w:history="1">
+      <w:hyperlink w:anchor="_Toc231076007" w:history="1">
         <w:r>
           <w:rPr>
             <w:rStyle w:val="Hipervnculo"/>
@@ -1675,7 +1675,7 @@
             <w:noProof/>
             <w:webHidden/>
           </w:rPr>
-          <w:instrText xml:space="preserve"> PAGEREF _Toc231075119 \h </w:instrText>
+          <w:instrText xml:space="preserve"> PAGEREF _Toc231076007 \h </w:instrText>
         </w:r>
         <w:r>
           <w:rPr>
@@ -1716,7 +1716,7 @@
           <w:noProof/>
         </w:rPr>
       </w:pPr>
-      <w:hyperlink w:anchor="_Toc231075120" w:history="1">
+      <w:hyperlink w:anchor="_Toc231076008" w:history="1">
         <w:r>
           <w:rPr>
             <w:rStyle w:val="Hipervnculo"/>
@@ -1743,7 +1743,7 @@
             <w:noProof/>
             <w:webHidden/>
           </w:rPr>
-          <w:instrText xml:space="preserve"> PAGEREF _Toc231075120 \h </w:instrText>
+          <w:instrText xml:space="preserve"> PAGEREF _Toc231076008 \h </w:instrText>
         </w:r>
         <w:r>
           <w:rPr>
@@ -1784,7 +1784,7 @@
           <w:noProof/>
         </w:rPr>
       </w:pPr>
-      <w:hyperlink w:anchor="_Toc231075121" w:history="1">
+      <w:hyperlink w:anchor="_Toc231076009" w:history="1">
         <w:r>
           <w:rPr>
             <w:rStyle w:val="Hipervnculo"/>
@@ -1811,7 +1811,7 @@
             <w:noProof/>
             <w:webHidden/>
           </w:rPr>
-          <w:instrText xml:space="preserve"> PAGEREF _Toc231075121 \h </w:instrText>
+          <w:instrText xml:space="preserve"> PAGEREF _Toc231076009 \h </w:instrText>
         </w:r>
         <w:r>
           <w:rPr>
@@ -1852,7 +1852,7 @@
           <w:noProof/>
         </w:rPr>
       </w:pPr>
-      <w:hyperlink w:anchor="_Toc231075122" w:history="1">
+      <w:hyperlink w:anchor="_Toc231076010" w:history="1">
         <w:r>
           <w:rPr>
             <w:rStyle w:val="Hipervnculo"/>
@@ -1879,7 +1879,7 @@
             <w:noProof/>
             <w:webHidden/>
           </w:rPr>
-          <w:instrText xml:space="preserve"> PAGEREF _Toc231075122 \h </w:instrText>
+          <w:instrText xml:space="preserve"> PAGEREF _Toc231076010 \h </w:instrText>
         </w:r>
         <w:r>
           <w:rPr>
@@ -1920,7 +1920,7 @@
           <w:noProof/>
         </w:rPr>
       </w:pPr>
-      <w:hyperlink w:anchor="_Toc231075123" w:history="1">
+      <w:hyperlink w:anchor="_Toc231076011" w:history="1">
         <w:r>
           <w:rPr>
             <w:rStyle w:val="Hipervnculo"/>
@@ -1947,7 +1947,7 @@
             <w:noProof/>
             <w:webHidden/>
           </w:rPr>
-          <w:instrText xml:space="preserve"> PAGEREF _Toc231075123 \h </w:instrText>
+          <w:instrText xml:space="preserve"> PAGEREF _Toc231076011 \h </w:instrText>
         </w:r>
         <w:r>
           <w:rPr>
@@ -1988,7 +1988,7 @@
           <w:noProof/>
         </w:rPr>
       </w:pPr>
-      <w:hyperlink w:anchor="_Toc231075124" w:history="1">
+      <w:hyperlink w:anchor="_Toc231076012" w:history="1">
         <w:r>
           <w:rPr>
             <w:rStyle w:val="Hipervnculo"/>
@@ -2015,7 +2015,7 @@
             <w:noProof/>
             <w:webHidden/>
           </w:rPr>
-          <w:instrText xml:space="preserve"> PAGEREF _Toc231075124 \h </w:instrText>
+          <w:instrText xml:space="preserve"> PAGEREF _Toc231076012 \h </w:instrText>
         </w:r>
         <w:r>
           <w:rPr>
@@ -2056,7 +2056,7 @@
           <w:noProof/>
         </w:rPr>
       </w:pPr>
-      <w:hyperlink w:anchor="_Toc231075125" w:history="1">
+      <w:hyperlink w:anchor="_Toc231076013" w:history="1">
         <w:r>
           <w:rPr>
             <w:rStyle w:val="Hipervnculo"/>
@@ -2083,7 +2083,7 @@
             <w:noProof/>
             <w:webHidden/>
           </w:rPr>
-          <w:instrText xml:space="preserve"> PAGEREF _Toc231075125 \h </w:instrText>
+          <w:instrText xml:space="preserve"> PAGEREF _Toc231076013 \h </w:instrText>
         </w:r>
         <w:r>
           <w:rPr>
@@ -2124,7 +2124,7 @@
           <w:noProof/>
         </w:rPr>
       </w:pPr>
-      <w:hyperlink w:anchor="_Toc231075126" w:history="1">
+      <w:hyperlink w:anchor="_Toc231076014" w:history="1">
         <w:r>
           <w:rPr>
             <w:rStyle w:val="Hipervnculo"/>
@@ -2151,7 +2151,7 @@
             <w:noProof/>
             <w:webHidden/>
           </w:rPr>
-          <w:instrText xml:space="preserve"> PAGEREF _Toc231075126 \h </w:instrText>
+          <w:instrText xml:space="preserve"> PAGEREF _Toc231076014 \h </w:instrText>
         </w:r>
         <w:r>
           <w:rPr>
@@ -2192,7 +2192,7 @@
           <w:noProof/>
         </w:rPr>
       </w:pPr>
-      <w:hyperlink w:anchor="_Toc231075127" w:history="1">
+      <w:hyperlink w:anchor="_Toc231076015" w:history="1">
         <w:r>
           <w:rPr>
             <w:rStyle w:val="Hipervnculo"/>
@@ -2219,7 +2219,7 @@
             <w:noProof/>
             <w:webHidden/>
           </w:rPr>
-          <w:instrText xml:space="preserve"> PAGEREF _Toc231075127 \h </w:instrText>
+          <w:instrText xml:space="preserve"> PAGEREF _Toc231076015 \h </w:instrText>
         </w:r>
         <w:r>
           <w:rPr>
@@ -2260,7 +2260,7 @@
           <w:noProof/>
         </w:rPr>
       </w:pPr>
-      <w:hyperlink w:anchor="_Toc231075128" w:history="1">
+      <w:hyperlink w:anchor="_Toc231076016" w:history="1">
         <w:r>
           <w:rPr>
             <w:rStyle w:val="Hipervnculo"/>
@@ -2287,7 +2287,7 @@
             <w:noProof/>
             <w:webHidden/>
           </w:rPr>
-          <w:instrText xml:space="preserve"> PAGEREF _Toc231075128 \h </w:instrText>
+          <w:instrText xml:space="preserve"> PAGEREF _Toc231076016 \h </w:instrText>
         </w:r>
         <w:r>
           <w:rPr>
@@ -2328,7 +2328,7 @@
           <w:noProof/>
         </w:rPr>
       </w:pPr>
-      <w:hyperlink w:anchor="_Toc231075129" w:history="1">
+      <w:hyperlink w:anchor="_Toc231076017" w:history="1">
         <w:r>
           <w:rPr>
             <w:rStyle w:val="Hipervnculo"/>
@@ -2355,7 +2355,7 @@
             <w:noProof/>
             <w:webHidden/>
           </w:rPr>
-          <w:instrText xml:space="preserve"> PAGEREF _Toc231075129 \h </w:instrText>
+          <w:instrText xml:space="preserve"> PAGEREF _Toc231076017 \h </w:instrText>
         </w:r>
         <w:r>
           <w:rPr>
@@ -2396,7 +2396,7 @@
           <w:noProof/>
         </w:rPr>
       </w:pPr>
-      <w:hyperlink w:anchor="_Toc231075130" w:history="1">
+      <w:hyperlink w:anchor="_Toc231076018" w:history="1">
         <w:r>
           <w:rPr>
             <w:rStyle w:val="Hipervnculo"/>
@@ -2423,7 +2423,7 @@
             <w:noProof/>
             <w:webHidden/>
           </w:rPr>
-          <w:instrText xml:space="preserve"> PAGEREF _Toc231075130 \h </w:instrText>
+          <w:instrText xml:space="preserve"> PAGEREF _Toc231076018 \h </w:instrText>
         </w:r>
         <w:r>
           <w:rPr>
@@ -2464,7 +2464,7 @@
           <w:noProof/>
         </w:rPr>
       </w:pPr>
-      <w:hyperlink w:anchor="_Toc231075131" w:history="1">
+      <w:hyperlink w:anchor="_Toc231076019" w:history="1">
         <w:r>
           <w:rPr>
             <w:rStyle w:val="Hipervnculo"/>
@@ -2491,7 +2491,7 @@
             <w:noProof/>
             <w:webHidden/>
           </w:rPr>
-          <w:instrText xml:space="preserve"> PAGEREF _Toc231075131 \h </w:instrText>
+          <w:instrText xml:space="preserve"> PAGEREF _Toc231076019 \h </w:instrText>
         </w:r>
         <w:r>
           <w:rPr>
@@ -2532,7 +2532,7 @@
           <w:noProof/>
         </w:rPr>
       </w:pPr>
-      <w:hyperlink w:anchor="_Toc231075132" w:history="1">
+      <w:hyperlink w:anchor="_Toc231076020" w:history="1">
         <w:r>
           <w:rPr>
             <w:rStyle w:val="Hipervnculo"/>
@@ -2559,7 +2559,7 @@
             <w:noProof/>
             <w:webHidden/>
           </w:rPr>
-          <w:instrText xml:space="preserve"> PAGEREF _Toc231075132 \h </w:instrText>
+          <w:instrText xml:space="preserve"> PAGEREF _Toc231076020 \h </w:instrText>
         </w:r>
         <w:r>
           <w:rPr>
@@ -2600,7 +2600,7 @@
           <w:noProof/>
         </w:rPr>
       </w:pPr>
-      <w:hyperlink w:anchor="_Toc231075133" w:history="1">
+      <w:hyperlink w:anchor="_Toc231076021" w:history="1">
         <w:r>
           <w:rPr>
             <w:rStyle w:val="Hipervnculo"/>
@@ -2627,7 +2627,7 @@
             <w:noProof/>
             <w:webHidden/>
           </w:rPr>
-          <w:instrText xml:space="preserve"> PAGEREF _Toc231075133 \h </w:instrText>
+          <w:instrText xml:space="preserve"> PAGEREF _Toc231076021 \h </w:instrText>
         </w:r>
         <w:r>
           <w:rPr>
@@ -2668,7 +2668,7 @@
           <w:noProof/>
         </w:rPr>
       </w:pPr>
-      <w:hyperlink w:anchor="_Toc231075134" w:history="1">
+      <w:hyperlink w:anchor="_Toc231076022" w:history="1">
         <w:r>
           <w:rPr>
             <w:rStyle w:val="Hipervnculo"/>
@@ -2695,7 +2695,7 @@
             <w:noProof/>
             <w:webHidden/>
           </w:rPr>
-          <w:instrText xml:space="preserve"> PAGEREF _Toc231075134 \h </w:instrText>
+          <w:instrText xml:space="preserve"> PAGEREF _Toc231076022 \h </w:instrText>
         </w:r>
         <w:r>
           <w:rPr>
@@ -2736,7 +2736,7 @@
           <w:noProof/>
         </w:rPr>
       </w:pPr>
-      <w:hyperlink w:anchor="_Toc231075135" w:history="1">
+      <w:hyperlink w:anchor="_Toc231076023" w:history="1">
         <w:r>
           <w:rPr>
             <w:rStyle w:val="Hipervnculo"/>
@@ -2763,7 +2763,7 @@
             <w:noProof/>
             <w:webHidden/>
           </w:rPr>
-          <w:instrText xml:space="preserve"> PAGEREF _Toc231075135 \h </w:instrText>
+          <w:instrText xml:space="preserve"> PAGEREF _Toc231076023 \h </w:instrText>
         </w:r>
         <w:r>
           <w:rPr>
@@ -2804,7 +2804,7 @@
           <w:noProof/>
         </w:rPr>
       </w:pPr>
-      <w:hyperlink w:anchor="_Toc231075136" w:history="1">
+      <w:hyperlink w:anchor="_Toc231076024" w:history="1">
         <w:r>
           <w:rPr>
             <w:rStyle w:val="Hipervnculo"/>
@@ -2831,7 +2831,7 @@
             <w:noProof/>
             <w:webHidden/>
           </w:rPr>
-          <w:instrText xml:space="preserve"> PAGEREF _Toc231075136 \h </w:instrText>
+          <w:instrText xml:space="preserve"> PAGEREF _Toc231076024 \h </w:instrText>
         </w:r>
         <w:r>
           <w:rPr>
@@ -2872,7 +2872,7 @@
           <w:noProof/>
         </w:rPr>
       </w:pPr>
-      <w:hyperlink w:anchor="_Toc231075137" w:history="1">
+      <w:hyperlink w:anchor="_Toc231076025" w:history="1">
         <w:r>
           <w:rPr>
             <w:rStyle w:val="Hipervnculo"/>
@@ -2899,7 +2899,7 @@
             <w:noProof/>
             <w:webHidden/>
           </w:rPr>
-          <w:instrText xml:space="preserve"> PAGEREF _Toc231075137 \h </w:instrText>
+          <w:instrText xml:space="preserve"> PAGEREF _Toc231076025 \h </w:instrText>
         </w:r>
         <w:r>
           <w:rPr>
@@ -2940,7 +2940,7 @@
           <w:noProof/>
         </w:rPr>
       </w:pPr>
-      <w:hyperlink w:anchor="_Toc231075138" w:history="1">
+      <w:hyperlink w:anchor="_Toc231076026" w:history="1">
         <w:r>
           <w:rPr>
             <w:rStyle w:val="Hipervnculo"/>
@@ -2967,7 +2967,7 @@
             <w:noProof/>
             <w:webHidden/>
           </w:rPr>
-          <w:instrText xml:space="preserve"> PAGEREF _Toc231075138 \h </w:instrText>
+          <w:instrText xml:space="preserve"> PAGEREF _Toc231076026 \h </w:instrText>
         </w:r>
         <w:r>
           <w:rPr>
@@ -3008,7 +3008,7 @@
           <w:noProof/>
         </w:rPr>
       </w:pPr>
-      <w:hyperlink w:anchor="_Toc231075139" w:history="1">
+      <w:hyperlink w:anchor="_Toc231076027" w:history="1">
         <w:r>
           <w:rPr>
             <w:rStyle w:val="Hipervnculo"/>
@@ -3035,7 +3035,7 @@
             <w:noProof/>
             <w:webHidden/>
           </w:rPr>
-          <w:instrText xml:space="preserve"> PAGEREF _Toc231075139 \h </w:instrText>
+          <w:instrText xml:space="preserve"> PAGEREF _Toc231076027 \h </w:instrText>
         </w:r>
         <w:r>
           <w:rPr>
@@ -3076,7 +3076,7 @@
           <w:noProof/>
         </w:rPr>
       </w:pPr>
-      <w:hyperlink w:anchor="_Toc231075140" w:history="1">
+      <w:hyperlink w:anchor="_Toc231076028" w:history="1">
         <w:r>
           <w:rPr>
             <w:rStyle w:val="Hipervnculo"/>
@@ -3103,7 +3103,7 @@
             <w:noProof/>
             <w:webHidden/>
           </w:rPr>
-          <w:instrText xml:space="preserve"> PAGEREF _Toc231075140 \h </w:instrText>
+          <w:instrText xml:space="preserve"> PAGEREF _Toc231076028 \h </w:instrText>
         </w:r>
         <w:r>
           <w:rPr>
@@ -3144,7 +3144,7 @@
           <w:noProof/>
         </w:rPr>
       </w:pPr>
-      <w:hyperlink w:anchor="_Toc231075141" w:history="1">
+      <w:hyperlink w:anchor="_Toc231076029" w:history="1">
         <w:r>
           <w:rPr>
             <w:rStyle w:val="Hipervnculo"/>
@@ -3171,7 +3171,7 @@
             <w:noProof/>
             <w:webHidden/>
           </w:rPr>
-          <w:instrText xml:space="preserve"> PAGEREF _Toc231075141 \h </w:instrText>
+          <w:instrText xml:space="preserve"> PAGEREF _Toc231076029 \h </w:instrText>
         </w:r>
         <w:r>
           <w:rPr>
@@ -3212,7 +3212,7 @@
           <w:noProof/>
         </w:rPr>
       </w:pPr>
-      <w:hyperlink w:anchor="_Toc231075142" w:history="1">
+      <w:hyperlink w:anchor="_Toc231076030" w:history="1">
         <w:r>
           <w:rPr>
             <w:rStyle w:val="Hipervnculo"/>
@@ -3239,7 +3239,7 @@
             <w:noProof/>
             <w:webHidden/>
           </w:rPr>
-          <w:instrText xml:space="preserve"> PAGEREF _Toc231075142 \h </w:instrText>
+          <w:instrText xml:space="preserve"> PAGEREF _Toc231076030 \h </w:instrText>
         </w:r>
         <w:r>
           <w:rPr>
@@ -3280,7 +3280,7 @@
           <w:noProof/>
         </w:rPr>
       </w:pPr>
-      <w:hyperlink w:anchor="_Toc231075143" w:history="1">
+      <w:hyperlink w:anchor="_Toc231076031" w:history="1">
         <w:r>
           <w:rPr>
             <w:rStyle w:val="Hipervnculo"/>
@@ -3307,7 +3307,7 @@
             <w:noProof/>
             <w:webHidden/>
           </w:rPr>
-          <w:instrText xml:space="preserve"> PAGEREF _Toc231075143 \h </w:instrText>
+          <w:instrText xml:space="preserve"> PAGEREF _Toc231076031 \h </w:instrText>
         </w:r>
         <w:r>
           <w:rPr>
@@ -3348,7 +3348,7 @@
           <w:noProof/>
         </w:rPr>
       </w:pPr>
-      <w:hyperlink w:anchor="_Toc231075144" w:history="1">
+      <w:hyperlink w:anchor="_Toc231076032" w:history="1">
         <w:r>
           <w:rPr>
             <w:rStyle w:val="Hipervnculo"/>
@@ -3375,7 +3375,7 @@
             <w:noProof/>
             <w:webHidden/>
           </w:rPr>
-          <w:instrText xml:space="preserve"> PAGEREF _Toc231075144 \h </w:instrText>
+          <w:instrText xml:space="preserve"> PAGEREF _Toc231076032 \h </w:instrText>
         </w:r>
         <w:r>
           <w:rPr>
@@ -3421,7 +3421,7 @@
       <w:pPr>
         <w:pStyle w:val="Ttulo1"/>
       </w:pPr>
-      <w:bookmarkStart w:id="2" w:name="_Toc231075099"/>
+      <w:bookmarkStart w:id="2" w:name="_Toc231075987"/>
       <w:r>
         <w:lastRenderedPageBreak/>
         <w:t>Capítulo 1 — Introducción</w:t>
@@ -3432,7 +3432,7 @@
       <w:pPr>
         <w:pStyle w:val="Ttulo2"/>
       </w:pPr>
-      <w:bookmarkStart w:id="3" w:name="_Toc231075100"/>
+      <w:bookmarkStart w:id="3" w:name="_Toc231075988"/>
       <w:r>
         <w:t>1.1 Contextualización</w:t>
       </w:r>
@@ -3520,7 +3520,7 @@
       <w:pPr>
         <w:pStyle w:val="Ttulo2"/>
       </w:pPr>
-      <w:bookmarkStart w:id="4" w:name="_Toc231075101"/>
+      <w:bookmarkStart w:id="4" w:name="_Toc231075989"/>
       <w:r>
         <w:lastRenderedPageBreak/>
         <w:t>1.2 Problema de investigación y justificación</w:t>
@@ -3630,7 +3630,7 @@
       <w:pPr>
         <w:pStyle w:val="Ttulo2"/>
       </w:pPr>
-      <w:bookmarkStart w:id="5" w:name="_Toc231075102"/>
+      <w:bookmarkStart w:id="5" w:name="_Toc231075990"/>
       <w:r>
         <w:lastRenderedPageBreak/>
         <w:t>1.3 Pregunta y objetivos de investigación</w:t>
@@ -3816,7 +3816,7 @@
       <w:pPr>
         <w:pStyle w:val="Ttulo2"/>
       </w:pPr>
-      <w:bookmarkStart w:id="6" w:name="_Toc231075103"/>
+      <w:bookmarkStart w:id="6" w:name="_Toc231075991"/>
       <w:r>
         <w:t>1.4 Hipótesis general</w:t>
       </w:r>
@@ -3856,7 +3856,7 @@
       <w:pPr>
         <w:pStyle w:val="Ttulo2"/>
       </w:pPr>
-      <w:bookmarkStart w:id="7" w:name="_Toc231075104"/>
+      <w:bookmarkStart w:id="7" w:name="_Toc231075992"/>
       <w:r>
         <w:t>1.5 Aspectos metodológicos y alcance</w:t>
       </w:r>
@@ -3962,7 +3962,7 @@
       <w:pPr>
         <w:pStyle w:val="Ttulo2"/>
       </w:pPr>
-      <w:bookmarkStart w:id="8" w:name="_Toc231075105"/>
+      <w:bookmarkStart w:id="8" w:name="_Toc231075993"/>
       <w:r>
         <w:t>1.6 Aportes esperados</w:t>
       </w:r>
@@ -4013,7 +4013,7 @@
       <w:pPr>
         <w:pStyle w:val="Ttulo2"/>
       </w:pPr>
-      <w:bookmarkStart w:id="9" w:name="_Toc231075106"/>
+      <w:bookmarkStart w:id="9" w:name="_Toc231075994"/>
       <w:r>
         <w:t>1.7 Estructura de la tesis</w:t>
       </w:r>
@@ -4053,7 +4053,7 @@
       <w:pPr>
         <w:pStyle w:val="Ttulo1"/>
       </w:pPr>
-      <w:bookmarkStart w:id="10" w:name="_Toc231075107"/>
+      <w:bookmarkStart w:id="10" w:name="_Toc231075995"/>
       <w:r>
         <w:lastRenderedPageBreak/>
         <w:t>Capítulo 2 — Marco teórico y revisión de literatura</w:t>
@@ -4064,7 +4064,7 @@
       <w:pPr>
         <w:pStyle w:val="Ttulo2"/>
       </w:pPr>
-      <w:bookmarkStart w:id="11" w:name="_Toc231075108"/>
+      <w:bookmarkStart w:id="11" w:name="_Toc231075996"/>
       <w:r>
         <w:t>2.1 Determinantes macroeconómicos de los retornos accionarios</w:t>
       </w:r>
@@ -4183,7 +4183,7 @@
       <w:pPr>
         <w:pStyle w:val="Ttulo2"/>
       </w:pPr>
-      <w:bookmarkStart w:id="12" w:name="_Toc231075109"/>
+      <w:bookmarkStart w:id="12" w:name="_Toc231075997"/>
       <w:r>
         <w:t>2.2 Precios de commodities y valoración de empresas mineras</w:t>
       </w:r>
@@ -4283,7 +4283,7 @@
       <w:pPr>
         <w:pStyle w:val="Ttulo2"/>
       </w:pPr>
-      <w:bookmarkStart w:id="13" w:name="_Toc231075110"/>
+      <w:bookmarkStart w:id="13" w:name="_Toc231075998"/>
       <w:r>
         <w:t>2.3 Tipo de cambio y exposición de empresas exportadoras</w:t>
       </w:r>
@@ -4358,7 +4358,7 @@
       <w:pPr>
         <w:pStyle w:val="Ttulo2"/>
       </w:pPr>
-      <w:bookmarkStart w:id="14" w:name="_Toc231075111"/>
+      <w:bookmarkStart w:id="14" w:name="_Toc231075999"/>
       <w:r>
         <w:t>2.4 Cobre, tipo de cambio y la economía chilena</w:t>
       </w:r>
@@ -4460,7 +4460,7 @@
       <w:pPr>
         <w:pStyle w:val="Ttulo2"/>
       </w:pPr>
-      <w:bookmarkStart w:id="15" w:name="_Toc231075112"/>
+      <w:bookmarkStart w:id="15" w:name="_Toc231076000"/>
       <w:r>
         <w:t>2.5 Eficiencia informacional y segmentación de mercados</w:t>
       </w:r>
@@ -4550,7 +4550,7 @@
       <w:pPr>
         <w:pStyle w:val="Ttulo2"/>
       </w:pPr>
-      <w:bookmarkStart w:id="16" w:name="_Toc231075113"/>
+      <w:bookmarkStart w:id="16" w:name="_Toc231076001"/>
       <w:r>
         <w:t>2.6 Enfoques econométricos para la medición de impacto</w:t>
       </w:r>
@@ -4677,7 +4677,7 @@
       <w:pPr>
         <w:pStyle w:val="Ttulo2"/>
       </w:pPr>
-      <w:bookmarkStart w:id="17" w:name="_Toc231075114"/>
+      <w:bookmarkStart w:id="17" w:name="_Toc231076002"/>
       <w:r>
         <w:lastRenderedPageBreak/>
         <w:t>2.7 Síntesis e identificación del vacío de investigación</w:t>
@@ -4806,7 +4806,7 @@
       <w:pPr>
         <w:pStyle w:val="Ttulo3"/>
       </w:pPr>
-      <w:bookmarkStart w:id="18" w:name="_Toc231075115"/>
+      <w:bookmarkStart w:id="18" w:name="_Toc231076003"/>
       <w:r>
         <w:t>Nota sobre la tabla de literatura</w:t>
       </w:r>
@@ -4836,7 +4836,7 @@
       <w:pPr>
         <w:pStyle w:val="Ttulo1"/>
       </w:pPr>
-      <w:bookmarkStart w:id="19" w:name="_Toc231075116"/>
+      <w:bookmarkStart w:id="19" w:name="_Toc231076004"/>
       <w:r>
         <w:lastRenderedPageBreak/>
         <w:t>Capítulo 3 — Datos y metodología</w:t>
@@ -4847,7 +4847,7 @@
       <w:pPr>
         <w:pStyle w:val="Ttulo2"/>
       </w:pPr>
-      <w:bookmarkStart w:id="20" w:name="_Toc231075117"/>
+      <w:bookmarkStart w:id="20" w:name="_Toc231076005"/>
       <w:r>
         <w:t>3.1 Definición del universo de empresas y período</w:t>
       </w:r>
@@ -5039,7 +5039,7 @@
       <w:pPr>
         <w:pStyle w:val="Ttulo2"/>
       </w:pPr>
-      <w:bookmarkStart w:id="21" w:name="_Toc231075118"/>
+      <w:bookmarkStart w:id="21" w:name="_Toc231076006"/>
       <w:r>
         <w:t>3.2 Variable dependiente</w:t>
       </w:r>
@@ -5101,7 +5101,7 @@
       <w:pPr>
         <w:pStyle w:val="Ttulo2"/>
       </w:pPr>
-      <w:bookmarkStart w:id="22" w:name="_Toc231075119"/>
+      <w:bookmarkStart w:id="22" w:name="_Toc231076007"/>
       <w:r>
         <w:t>3.3 Variables explicativas</w:t>
       </w:r>
@@ -5168,7 +5168,7 @@
       <w:pPr>
         <w:pStyle w:val="Ttulo2"/>
       </w:pPr>
-      <w:bookmarkStart w:id="23" w:name="_Toc231075120"/>
+      <w:bookmarkStart w:id="23" w:name="_Toc231076008"/>
       <w:r>
         <w:t>3.4 Tratamiento de datos y frecuencias mixtas</w:t>
       </w:r>
@@ -5222,7 +5222,7 @@
       <w:pPr>
         <w:pStyle w:val="Ttulo2"/>
       </w:pPr>
-      <w:bookmarkStart w:id="24" w:name="_Toc231075121"/>
+      <w:bookmarkStart w:id="24" w:name="_Toc231076009"/>
       <w:r>
         <w:t>3.5 Datación de las fases del ciclo del cobre</w:t>
       </w:r>
@@ -5289,7 +5289,7 @@
       <w:pPr>
         <w:pStyle w:val="Ttulo2"/>
       </w:pPr>
-      <w:bookmarkStart w:id="25" w:name="_Toc231075122"/>
+      <w:bookmarkStart w:id="25" w:name="_Toc231076010"/>
       <w:r>
         <w:t>3.6 Estrategia econométrica</w:t>
       </w:r>
@@ -5299,7 +5299,7 @@
       <w:pPr>
         <w:pStyle w:val="Ttulo3"/>
       </w:pPr>
-      <w:bookmarkStart w:id="26" w:name="_Toc231075123"/>
+      <w:bookmarkStart w:id="26" w:name="_Toc231076011"/>
       <w:r>
         <w:t>3.6.1 Estacionariedad y orden de integración (OE1)</w:t>
       </w:r>
@@ -5339,7 +5339,7 @@
       <w:pPr>
         <w:pStyle w:val="Ttulo3"/>
       </w:pPr>
-      <w:bookmarkStart w:id="27" w:name="_Toc231075124"/>
+      <w:bookmarkStart w:id="27" w:name="_Toc231076012"/>
       <w:r>
         <w:t>3.6.2 Modelo de impacto: panel de efectos fijos (OE2)</w:t>
       </w:r>
@@ -5433,7 +5433,7 @@
       <w:pPr>
         <w:pStyle w:val="Ttulo3"/>
       </w:pPr>
-      <w:bookmarkStart w:id="28" w:name="_Toc231075125"/>
+      <w:bookmarkStart w:id="28" w:name="_Toc231076013"/>
       <w:r>
         <w:t>3.6.3 Relaciones de largo plazo: cointegración (OE3)</w:t>
       </w:r>
@@ -5509,7 +5509,7 @@
       <w:pPr>
         <w:pStyle w:val="Ttulo3"/>
       </w:pPr>
-      <w:bookmarkStart w:id="29" w:name="_Toc231075126"/>
+      <w:bookmarkStart w:id="29" w:name="_Toc231076014"/>
       <w:r>
         <w:t>3.6.4 Dinámica de shocks: VAR, impulso-respuesta y descomposición de varianza (OE4)</w:t>
       </w:r>
@@ -5597,7 +5597,7 @@
       <w:pPr>
         <w:pStyle w:val="Ttulo3"/>
       </w:pPr>
-      <w:bookmarkStart w:id="30" w:name="_Toc231075127"/>
+      <w:bookmarkStart w:id="30" w:name="_Toc231076015"/>
       <w:r>
         <w:t>3.6.5 Estabilidad por fases del ciclo (OE5)</w:t>
       </w:r>
@@ -5644,7 +5644,7 @@
       <w:pPr>
         <w:pStyle w:val="Ttulo3"/>
       </w:pPr>
-      <w:bookmarkStart w:id="31" w:name="_Toc231075128"/>
+      <w:bookmarkStart w:id="31" w:name="_Toc231076016"/>
       <w:r>
         <w:t>3.6.6 Comparación entre mercados: triangulación (OE6)</w:t>
       </w:r>
@@ -5694,7 +5694,7 @@
       <w:pPr>
         <w:pStyle w:val="Ttulo2"/>
       </w:pPr>
-      <w:bookmarkStart w:id="32" w:name="_Toc231075129"/>
+      <w:bookmarkStart w:id="32" w:name="_Toc231076017"/>
       <w:r>
         <w:t xml:space="preserve">3.7 Validación de </w:t>
       </w:r>
@@ -5751,7 +5751,7 @@
       <w:pPr>
         <w:pStyle w:val="Ttulo3"/>
       </w:pPr>
-      <w:bookmarkStart w:id="33" w:name="_Toc231075130"/>
+      <w:bookmarkStart w:id="33" w:name="_Toc231076018"/>
       <w:r>
         <w:t>Tabla 3.1 — Definición operativa de variables (resumen)</w:t>
       </w:r>
@@ -7075,7 +7075,7 @@
       <w:pPr>
         <w:pStyle w:val="Ttulo1"/>
       </w:pPr>
-      <w:bookmarkStart w:id="34" w:name="_Toc231075131"/>
+      <w:bookmarkStart w:id="34" w:name="_Toc231076019"/>
       <w:r>
         <w:lastRenderedPageBreak/>
         <w:t>Capítulo 4 — Resultados y discusión</w:t>
@@ -7086,7 +7086,7 @@
       <w:pPr>
         <w:pStyle w:val="Ttulo2"/>
       </w:pPr>
-      <w:bookmarkStart w:id="35" w:name="_Toc231075132"/>
+      <w:bookmarkStart w:id="35" w:name="_Toc231076020"/>
       <w:r>
         <w:t>4.1 Análisis descriptivo y propiedades de las series (OE1)</w:t>
       </w:r>
@@ -7202,7 +7202,7 @@
       <w:pPr>
         <w:pStyle w:val="Ttulo2"/>
       </w:pPr>
-      <w:bookmarkStart w:id="36" w:name="_Toc231075133"/>
+      <w:bookmarkStart w:id="36" w:name="_Toc231076021"/>
       <w:r>
         <w:t>4.2 Determinantes de los retornos: global vs local (OE2)</w:t>
       </w:r>
@@ -7773,7 +7773,7 @@
           <w:noProof/>
         </w:rPr>
         <w:drawing>
-          <wp:inline distT="0" distB="0" distL="0" distR="0" wp14:anchorId="36C7E035" wp14:editId="2CF13163">
+          <wp:inline distT="0" distB="0" distL="0" distR="0" wp14:anchorId="336A0442" wp14:editId="053223A8">
             <wp:extent cx="5394960" cy="2933107"/>
             <wp:effectExtent l="0" t="0" r="0" b="0"/>
             <wp:docPr id="1" name="Picture 1"/>
@@ -7825,7 +7825,7 @@
       <w:pPr>
         <w:pStyle w:val="Ttulo2"/>
       </w:pPr>
-      <w:bookmarkStart w:id="37" w:name="_Toc231075134"/>
+      <w:bookmarkStart w:id="37" w:name="_Toc231076022"/>
       <w:r>
         <w:t>4.3 Relaciones de largo plazo (OE3)</w:t>
       </w:r>
@@ -7902,7 +7902,7 @@
       <w:pPr>
         <w:pStyle w:val="Ttulo2"/>
       </w:pPr>
-      <w:bookmarkStart w:id="38" w:name="_Toc231075135"/>
+      <w:bookmarkStart w:id="38" w:name="_Toc231076023"/>
       <w:r>
         <w:t>4.4 Dinámica de shocks (OE4)</w:t>
       </w:r>
@@ -8198,7 +8198,7 @@
         </w:rPr>
         <w:lastRenderedPageBreak/>
         <w:drawing>
-          <wp:inline distT="0" distB="0" distL="0" distR="0" wp14:anchorId="3C007E87" wp14:editId="7A02D988">
+          <wp:inline distT="0" distB="0" distL="0" distR="0" wp14:anchorId="6F8EA90A" wp14:editId="4EF7C9A3">
             <wp:extent cx="5394960" cy="4026860"/>
             <wp:effectExtent l="0" t="0" r="0" b="0"/>
             <wp:docPr id="2" name="Picture 2"/>
@@ -8250,7 +8250,7 @@
       <w:pPr>
         <w:pStyle w:val="Ttulo2"/>
       </w:pPr>
-      <w:bookmarkStart w:id="39" w:name="_Toc231075136"/>
+      <w:bookmarkStart w:id="39" w:name="_Toc231076024"/>
       <w:r>
         <w:t>4.5 Estabilidad por fases del ciclo del cobre (OE5)</w:t>
       </w:r>
@@ -8313,7 +8313,7 @@
         </w:rPr>
         <w:lastRenderedPageBreak/>
         <w:drawing>
-          <wp:inline distT="0" distB="0" distL="0" distR="0" wp14:anchorId="5A60241A" wp14:editId="3555D04A">
+          <wp:inline distT="0" distB="0" distL="0" distR="0" wp14:anchorId="12FF465D" wp14:editId="663B1096">
             <wp:extent cx="5394960" cy="2449752"/>
             <wp:effectExtent l="0" t="0" r="0" b="0"/>
             <wp:docPr id="3" name="Picture 3"/>
@@ -8372,7 +8372,7 @@
       <w:pPr>
         <w:pStyle w:val="Ttulo2"/>
       </w:pPr>
-      <w:bookmarkStart w:id="40" w:name="_Toc231075137"/>
+      <w:bookmarkStart w:id="40" w:name="_Toc231076025"/>
       <w:r>
         <w:t>4.6 Comparación entre mercados: triangulación (OE6)</w:t>
       </w:r>
@@ -8790,7 +8790,7 @@
           <w:noProof/>
         </w:rPr>
         <w:drawing>
-          <wp:inline distT="0" distB="0" distL="0" distR="0" wp14:anchorId="38246E5D" wp14:editId="68AACA90">
+          <wp:inline distT="0" distB="0" distL="0" distR="0" wp14:anchorId="02F82A2E" wp14:editId="0576D878">
             <wp:extent cx="5394960" cy="2718240"/>
             <wp:effectExtent l="0" t="0" r="0" b="0"/>
             <wp:docPr id="4" name="Picture 4"/>
@@ -8879,7 +8879,7 @@
       <w:pPr>
         <w:pStyle w:val="Ttulo2"/>
       </w:pPr>
-      <w:bookmarkStart w:id="41" w:name="_Toc231075138"/>
+      <w:bookmarkStart w:id="41" w:name="_Toc231076026"/>
       <w:r>
         <w:t>4.7 Discusión integrada</w:t>
       </w:r>
@@ -9002,7 +9002,7 @@
       <w:pPr>
         <w:pStyle w:val="Ttulo1"/>
       </w:pPr>
-      <w:bookmarkStart w:id="42" w:name="_Toc231075139"/>
+      <w:bookmarkStart w:id="42" w:name="_Toc231076027"/>
       <w:r>
         <w:lastRenderedPageBreak/>
         <w:t>Capítulo 5 — Conclusiones</w:t>
@@ -9013,7 +9013,7 @@
       <w:pPr>
         <w:pStyle w:val="Ttulo2"/>
       </w:pPr>
-      <w:bookmarkStart w:id="43" w:name="_Toc231075140"/>
+      <w:bookmarkStart w:id="43" w:name="_Toc231076028"/>
       <w:r>
         <w:t>5.1 Síntesis de los hallazgos</w:t>
       </w:r>
@@ -9106,7 +9106,7 @@
       <w:pPr>
         <w:pStyle w:val="Ttulo2"/>
       </w:pPr>
-      <w:bookmarkStart w:id="44" w:name="_Toc231075141"/>
+      <w:bookmarkStart w:id="44" w:name="_Toc231076029"/>
       <w:r>
         <w:lastRenderedPageBreak/>
         <w:t>5.2 Implicancias</w:t>
@@ -9179,7 +9179,7 @@
       <w:pPr>
         <w:pStyle w:val="Ttulo2"/>
       </w:pPr>
-      <w:bookmarkStart w:id="45" w:name="_Toc231075142"/>
+      <w:bookmarkStart w:id="45" w:name="_Toc231076030"/>
       <w:r>
         <w:t>5.3 Limitaciones</w:t>
       </w:r>
@@ -9229,7 +9229,7 @@
       <w:pPr>
         <w:pStyle w:val="Ttulo2"/>
       </w:pPr>
-      <w:bookmarkStart w:id="46" w:name="_Toc231075143"/>
+      <w:bookmarkStart w:id="46" w:name="_Toc231076031"/>
       <w:r>
         <w:t>5.4 Líneas futuras de investigación</w:t>
       </w:r>
@@ -9265,7 +9265,7 @@
       <w:pPr>
         <w:pStyle w:val="Ttulo1"/>
       </w:pPr>
-      <w:bookmarkStart w:id="47" w:name="_Toc231075144"/>
+      <w:bookmarkStart w:id="47" w:name="_Toc231076032"/>
       <w:r>
         <w:lastRenderedPageBreak/>
         <w:t>Referencias</w:t>
@@ -9713,31 +9713,31 @@
       </w:rPr>
     </w:lvl>
   </w:abstractNum>
-  <w:num w:numId="1" w16cid:durableId="513807042">
+  <w:num w:numId="1" w16cid:durableId="1518690073">
     <w:abstractNumId w:val="8"/>
   </w:num>
-  <w:num w:numId="2" w16cid:durableId="1416829282">
+  <w:num w:numId="2" w16cid:durableId="404378238">
     <w:abstractNumId w:val="6"/>
   </w:num>
-  <w:num w:numId="3" w16cid:durableId="1122649554">
+  <w:num w:numId="3" w16cid:durableId="1204053658">
     <w:abstractNumId w:val="5"/>
   </w:num>
-  <w:num w:numId="4" w16cid:durableId="1697542652">
+  <w:num w:numId="4" w16cid:durableId="372971993">
     <w:abstractNumId w:val="4"/>
   </w:num>
-  <w:num w:numId="5" w16cid:durableId="262693218">
+  <w:num w:numId="5" w16cid:durableId="793641518">
     <w:abstractNumId w:val="7"/>
   </w:num>
-  <w:num w:numId="6" w16cid:durableId="1777824425">
+  <w:num w:numId="6" w16cid:durableId="798106213">
     <w:abstractNumId w:val="3"/>
   </w:num>
-  <w:num w:numId="7" w16cid:durableId="423066297">
+  <w:num w:numId="7" w16cid:durableId="1410150996">
     <w:abstractNumId w:val="2"/>
   </w:num>
-  <w:num w:numId="8" w16cid:durableId="695040682">
+  <w:num w:numId="8" w16cid:durableId="581448812">
     <w:abstractNumId w:val="1"/>
   </w:num>
-  <w:num w:numId="9" w16cid:durableId="35010604">
+  <w:num w:numId="9" w16cid:durableId="1030954240">
     <w:abstractNumId w:val="0"/>
   </w:num>
 </w:numbering>
@@ -21129,7 +21129,7 @@
     <w:autoRedefine/>
     <w:uiPriority w:val="39"/>
     <w:unhideWhenUsed/>
-    <w:rsid w:val="001F4B01"/>
+    <w:rsid w:val="00803E71"/>
     <w:pPr>
       <w:spacing w:after="100"/>
     </w:pPr>
@@ -21141,7 +21141,7 @@
     <w:autoRedefine/>
     <w:uiPriority w:val="39"/>
     <w:unhideWhenUsed/>
-    <w:rsid w:val="001F4B01"/>
+    <w:rsid w:val="00803E71"/>
     <w:pPr>
       <w:spacing w:after="100"/>
       <w:ind w:left="240"/>
@@ -21154,7 +21154,7 @@
     <w:autoRedefine/>
     <w:uiPriority w:val="39"/>
     <w:unhideWhenUsed/>
-    <w:rsid w:val="001F4B01"/>
+    <w:rsid w:val="00803E71"/>
     <w:pPr>
       <w:spacing w:after="100"/>
       <w:ind w:left="480"/>
@@ -21165,7 +21165,7 @@
     <w:basedOn w:val="Fuentedeprrafopredeter"/>
     <w:uiPriority w:val="99"/>
     <w:unhideWhenUsed/>
-    <w:rsid w:val="001F4B01"/>
+    <w:rsid w:val="00803E71"/>
     <w:rPr>
       <w:color w:val="0000FF" w:themeColor="hyperlink"/>
       <w:u w:val="single"/>

</xml_diff>

<commit_message>
Extensiones GARCH y Gregory-Hansen + guías de defensa y de literatura
- src/extensions.py: GARCH(1,1) (persistencia 0.86, efectos ARCH) y Gregory-Hansen
  (cointegración con quiebre en 2008-06 → H5 respaldada). Datos reales.
- Cap.4: integra ambos resultados (H5 confirmada con quiebre; volatilidad condicional)
- docs/guia_defensa.md: preguntas difíciles de la comisión con respuestas
- docs/busqueda_literatura.md: protocolo, cadenas de búsqueda y matriz de fichaje
- Word/PDF regenerados

Co-Authored-By: Claude Opus 4.8 <noreply@anthropic.com>
</commit_message>
<xml_diff>
--- a/outputs/Tesis_Francisco_Rietta.docx
+++ b/outputs/Tesis_Francisco_Rietta.docx
@@ -91,7 +91,7 @@
       <w:pPr>
         <w:pStyle w:val="Ttulo1"/>
       </w:pPr>
-      <w:bookmarkStart w:id="0" w:name="_Toc231076577"/>
+      <w:bookmarkStart w:id="0" w:name="_Toc231076964"/>
       <w:r>
         <w:lastRenderedPageBreak/>
         <w:t>Página de aprobación</w:t>
@@ -172,7 +172,7 @@
       <w:pPr>
         <w:pStyle w:val="Ttulo1"/>
       </w:pPr>
-      <w:bookmarkStart w:id="1" w:name="_Toc231076578"/>
+      <w:bookmarkStart w:id="1" w:name="_Toc231076965"/>
       <w:r>
         <w:lastRenderedPageBreak/>
         <w:t>Declaración de originalidad</w:t>
@@ -211,7 +211,7 @@
       <w:pPr>
         <w:pStyle w:val="Ttulo1"/>
       </w:pPr>
-      <w:bookmarkStart w:id="2" w:name="_Toc231076579"/>
+      <w:bookmarkStart w:id="2" w:name="_Toc231076966"/>
       <w:r>
         <w:lastRenderedPageBreak/>
         <w:t>Dedicatoria</w:t>
@@ -247,7 +247,7 @@
       <w:pPr>
         <w:pStyle w:val="Ttulo1"/>
       </w:pPr>
-      <w:bookmarkStart w:id="3" w:name="_Toc231076580"/>
+      <w:bookmarkStart w:id="3" w:name="_Toc231076967"/>
       <w:r>
         <w:lastRenderedPageBreak/>
         <w:t>Agradecimientos</w:t>
@@ -271,7 +271,7 @@
       <w:pPr>
         <w:pStyle w:val="Ttulo1"/>
       </w:pPr>
-      <w:bookmarkStart w:id="4" w:name="_Toc231076581"/>
+      <w:bookmarkStart w:id="4" w:name="_Toc231076968"/>
       <w:r>
         <w:lastRenderedPageBreak/>
         <w:t>Resumen</w:t>
@@ -306,7 +306,7 @@
       <w:pPr>
         <w:pStyle w:val="Ttulo1"/>
       </w:pPr>
-      <w:bookmarkStart w:id="5" w:name="_Toc231076582"/>
+      <w:bookmarkStart w:id="5" w:name="_Toc231076969"/>
       <w:r>
         <w:lastRenderedPageBreak/>
         <w:t>Abstract</w:t>
@@ -341,7 +341,7 @@
       <w:pPr>
         <w:pStyle w:val="Ttulo1"/>
       </w:pPr>
-      <w:bookmarkStart w:id="6" w:name="_Toc231076583"/>
+      <w:bookmarkStart w:id="6" w:name="_Toc231076970"/>
       <w:r>
         <w:lastRenderedPageBreak/>
         <w:t>Índice general</w:t>
@@ -372,7 +372,7 @@
       <w:r>
         <w:fldChar w:fldCharType="separate"/>
       </w:r>
-      <w:hyperlink w:anchor="_Toc231076577" w:history="1">
+      <w:hyperlink w:anchor="_Toc231076964" w:history="1">
         <w:r>
           <w:rPr>
             <w:rStyle w:val="Hipervnculo"/>
@@ -399,7 +399,7 @@
             <w:noProof/>
             <w:webHidden/>
           </w:rPr>
-          <w:instrText xml:space="preserve"> PAGEREF _Toc231076577 \h </w:instrText>
+          <w:instrText xml:space="preserve"> PAGEREF _Toc231076964 \h </w:instrText>
         </w:r>
         <w:r>
           <w:rPr>
@@ -445,7 +445,7 @@
           <w14:ligatures w14:val="standardContextual"/>
         </w:rPr>
       </w:pPr>
-      <w:hyperlink w:anchor="_Toc231076578" w:history="1">
+      <w:hyperlink w:anchor="_Toc231076965" w:history="1">
         <w:r>
           <w:rPr>
             <w:rStyle w:val="Hipervnculo"/>
@@ -472,7 +472,7 @@
             <w:noProof/>
             <w:webHidden/>
           </w:rPr>
-          <w:instrText xml:space="preserve"> PAGEREF _Toc231076578 \h </w:instrText>
+          <w:instrText xml:space="preserve"> PAGEREF _Toc231076965 \h </w:instrText>
         </w:r>
         <w:r>
           <w:rPr>
@@ -518,7 +518,7 @@
           <w14:ligatures w14:val="standardContextual"/>
         </w:rPr>
       </w:pPr>
-      <w:hyperlink w:anchor="_Toc231076579" w:history="1">
+      <w:hyperlink w:anchor="_Toc231076966" w:history="1">
         <w:r>
           <w:rPr>
             <w:rStyle w:val="Hipervnculo"/>
@@ -545,7 +545,7 @@
             <w:noProof/>
             <w:webHidden/>
           </w:rPr>
-          <w:instrText xml:space="preserve"> PAGEREF _Toc231076579 \h </w:instrText>
+          <w:instrText xml:space="preserve"> PAGEREF _Toc231076966 \h </w:instrText>
         </w:r>
         <w:r>
           <w:rPr>
@@ -591,7 +591,7 @@
           <w14:ligatures w14:val="standardContextual"/>
         </w:rPr>
       </w:pPr>
-      <w:hyperlink w:anchor="_Toc231076580" w:history="1">
+      <w:hyperlink w:anchor="_Toc231076967" w:history="1">
         <w:r>
           <w:rPr>
             <w:rStyle w:val="Hipervnculo"/>
@@ -618,7 +618,7 @@
             <w:noProof/>
             <w:webHidden/>
           </w:rPr>
-          <w:instrText xml:space="preserve"> PAGEREF _Toc231076580 \h </w:instrText>
+          <w:instrText xml:space="preserve"> PAGEREF _Toc231076967 \h </w:instrText>
         </w:r>
         <w:r>
           <w:rPr>
@@ -664,7 +664,7 @@
           <w14:ligatures w14:val="standardContextual"/>
         </w:rPr>
       </w:pPr>
-      <w:hyperlink w:anchor="_Toc231076581" w:history="1">
+      <w:hyperlink w:anchor="_Toc231076968" w:history="1">
         <w:r>
           <w:rPr>
             <w:rStyle w:val="Hipervnculo"/>
@@ -691,7 +691,7 @@
             <w:noProof/>
             <w:webHidden/>
           </w:rPr>
-          <w:instrText xml:space="preserve"> PAGEREF _Toc231076581 \h </w:instrText>
+          <w:instrText xml:space="preserve"> PAGEREF _Toc231076968 \h </w:instrText>
         </w:r>
         <w:r>
           <w:rPr>
@@ -737,7 +737,7 @@
           <w14:ligatures w14:val="standardContextual"/>
         </w:rPr>
       </w:pPr>
-      <w:hyperlink w:anchor="_Toc231076582" w:history="1">
+      <w:hyperlink w:anchor="_Toc231076969" w:history="1">
         <w:r>
           <w:rPr>
             <w:rStyle w:val="Hipervnculo"/>
@@ -764,7 +764,7 @@
             <w:noProof/>
             <w:webHidden/>
           </w:rPr>
-          <w:instrText xml:space="preserve"> PAGEREF _Toc231076582 \h </w:instrText>
+          <w:instrText xml:space="preserve"> PAGEREF _Toc231076969 \h </w:instrText>
         </w:r>
         <w:r>
           <w:rPr>
@@ -810,7 +810,7 @@
           <w14:ligatures w14:val="standardContextual"/>
         </w:rPr>
       </w:pPr>
-      <w:hyperlink w:anchor="_Toc231076583" w:history="1">
+      <w:hyperlink w:anchor="_Toc231076970" w:history="1">
         <w:r>
           <w:rPr>
             <w:rStyle w:val="Hipervnculo"/>
@@ -837,7 +837,7 @@
             <w:noProof/>
             <w:webHidden/>
           </w:rPr>
-          <w:instrText xml:space="preserve"> PAGEREF _Toc231076583 \h </w:instrText>
+          <w:instrText xml:space="preserve"> PAGEREF _Toc231076970 \h </w:instrText>
         </w:r>
         <w:r>
           <w:rPr>
@@ -883,7 +883,7 @@
           <w14:ligatures w14:val="standardContextual"/>
         </w:rPr>
       </w:pPr>
-      <w:hyperlink w:anchor="_Toc231076584" w:history="1">
+      <w:hyperlink w:anchor="_Toc231076971" w:history="1">
         <w:r>
           <w:rPr>
             <w:rStyle w:val="Hipervnculo"/>
@@ -910,7 +910,7 @@
             <w:noProof/>
             <w:webHidden/>
           </w:rPr>
-          <w:instrText xml:space="preserve"> PAGEREF _Toc231076584 \h </w:instrText>
+          <w:instrText xml:space="preserve"> PAGEREF _Toc231076971 \h </w:instrText>
         </w:r>
         <w:r>
           <w:rPr>
@@ -956,7 +956,7 @@
           <w14:ligatures w14:val="standardContextual"/>
         </w:rPr>
       </w:pPr>
-      <w:hyperlink w:anchor="_Toc231076585" w:history="1">
+      <w:hyperlink w:anchor="_Toc231076972" w:history="1">
         <w:r>
           <w:rPr>
             <w:rStyle w:val="Hipervnculo"/>
@@ -983,7 +983,7 @@
             <w:noProof/>
             <w:webHidden/>
           </w:rPr>
-          <w:instrText xml:space="preserve"> PAGEREF _Toc231076585 \h </w:instrText>
+          <w:instrText xml:space="preserve"> PAGEREF _Toc231076972 \h </w:instrText>
         </w:r>
         <w:r>
           <w:rPr>
@@ -1029,7 +1029,7 @@
           <w14:ligatures w14:val="standardContextual"/>
         </w:rPr>
       </w:pPr>
-      <w:hyperlink w:anchor="_Toc231076586" w:history="1">
+      <w:hyperlink w:anchor="_Toc231076973" w:history="1">
         <w:r>
           <w:rPr>
             <w:rStyle w:val="Hipervnculo"/>
@@ -1056,7 +1056,7 @@
             <w:noProof/>
             <w:webHidden/>
           </w:rPr>
-          <w:instrText xml:space="preserve"> PAGEREF _Toc231076586 \h </w:instrText>
+          <w:instrText xml:space="preserve"> PAGEREF _Toc231076973 \h </w:instrText>
         </w:r>
         <w:r>
           <w:rPr>
@@ -1102,7 +1102,7 @@
           <w14:ligatures w14:val="standardContextual"/>
         </w:rPr>
       </w:pPr>
-      <w:hyperlink w:anchor="_Toc231076587" w:history="1">
+      <w:hyperlink w:anchor="_Toc231076974" w:history="1">
         <w:r>
           <w:rPr>
             <w:rStyle w:val="Hipervnculo"/>
@@ -1129,7 +1129,7 @@
             <w:noProof/>
             <w:webHidden/>
           </w:rPr>
-          <w:instrText xml:space="preserve"> PAGEREF _Toc231076587 \h </w:instrText>
+          <w:instrText xml:space="preserve"> PAGEREF _Toc231076974 \h </w:instrText>
         </w:r>
         <w:r>
           <w:rPr>
@@ -1175,7 +1175,7 @@
           <w14:ligatures w14:val="standardContextual"/>
         </w:rPr>
       </w:pPr>
-      <w:hyperlink w:anchor="_Toc231076588" w:history="1">
+      <w:hyperlink w:anchor="_Toc231076975" w:history="1">
         <w:r>
           <w:rPr>
             <w:rStyle w:val="Hipervnculo"/>
@@ -1202,7 +1202,7 @@
             <w:noProof/>
             <w:webHidden/>
           </w:rPr>
-          <w:instrText xml:space="preserve"> PAGEREF _Toc231076588 \h </w:instrText>
+          <w:instrText xml:space="preserve"> PAGEREF _Toc231076975 \h </w:instrText>
         </w:r>
         <w:r>
           <w:rPr>
@@ -1248,7 +1248,7 @@
           <w14:ligatures w14:val="standardContextual"/>
         </w:rPr>
       </w:pPr>
-      <w:hyperlink w:anchor="_Toc231076589" w:history="1">
+      <w:hyperlink w:anchor="_Toc231076976" w:history="1">
         <w:r>
           <w:rPr>
             <w:rStyle w:val="Hipervnculo"/>
@@ -1275,7 +1275,7 @@
             <w:noProof/>
             <w:webHidden/>
           </w:rPr>
-          <w:instrText xml:space="preserve"> PAGEREF _Toc231076589 \h </w:instrText>
+          <w:instrText xml:space="preserve"> PAGEREF _Toc231076976 \h </w:instrText>
         </w:r>
         <w:r>
           <w:rPr>
@@ -1321,7 +1321,7 @@
           <w14:ligatures w14:val="standardContextual"/>
         </w:rPr>
       </w:pPr>
-      <w:hyperlink w:anchor="_Toc231076590" w:history="1">
+      <w:hyperlink w:anchor="_Toc231076977" w:history="1">
         <w:r>
           <w:rPr>
             <w:rStyle w:val="Hipervnculo"/>
@@ -1348,7 +1348,7 @@
             <w:noProof/>
             <w:webHidden/>
           </w:rPr>
-          <w:instrText xml:space="preserve"> PAGEREF _Toc231076590 \h </w:instrText>
+          <w:instrText xml:space="preserve"> PAGEREF _Toc231076977 \h </w:instrText>
         </w:r>
         <w:r>
           <w:rPr>
@@ -1394,7 +1394,7 @@
           <w14:ligatures w14:val="standardContextual"/>
         </w:rPr>
       </w:pPr>
-      <w:hyperlink w:anchor="_Toc231076591" w:history="1">
+      <w:hyperlink w:anchor="_Toc231076978" w:history="1">
         <w:r>
           <w:rPr>
             <w:rStyle w:val="Hipervnculo"/>
@@ -1421,7 +1421,7 @@
             <w:noProof/>
             <w:webHidden/>
           </w:rPr>
-          <w:instrText xml:space="preserve"> PAGEREF _Toc231076591 \h </w:instrText>
+          <w:instrText xml:space="preserve"> PAGEREF _Toc231076978 \h </w:instrText>
         </w:r>
         <w:r>
           <w:rPr>
@@ -1467,7 +1467,7 @@
           <w14:ligatures w14:val="standardContextual"/>
         </w:rPr>
       </w:pPr>
-      <w:hyperlink w:anchor="_Toc231076592" w:history="1">
+      <w:hyperlink w:anchor="_Toc231076979" w:history="1">
         <w:r>
           <w:rPr>
             <w:rStyle w:val="Hipervnculo"/>
@@ -1494,7 +1494,7 @@
             <w:noProof/>
             <w:webHidden/>
           </w:rPr>
-          <w:instrText xml:space="preserve"> PAGEREF _Toc231076592 \h </w:instrText>
+          <w:instrText xml:space="preserve"> PAGEREF _Toc231076979 \h </w:instrText>
         </w:r>
         <w:r>
           <w:rPr>
@@ -1540,7 +1540,7 @@
           <w14:ligatures w14:val="standardContextual"/>
         </w:rPr>
       </w:pPr>
-      <w:hyperlink w:anchor="_Toc231076593" w:history="1">
+      <w:hyperlink w:anchor="_Toc231076980" w:history="1">
         <w:r>
           <w:rPr>
             <w:rStyle w:val="Hipervnculo"/>
@@ -1567,7 +1567,7 @@
             <w:noProof/>
             <w:webHidden/>
           </w:rPr>
-          <w:instrText xml:space="preserve"> PAGEREF _Toc231076593 \h </w:instrText>
+          <w:instrText xml:space="preserve"> PAGEREF _Toc231076980 \h </w:instrText>
         </w:r>
         <w:r>
           <w:rPr>
@@ -1613,7 +1613,7 @@
           <w14:ligatures w14:val="standardContextual"/>
         </w:rPr>
       </w:pPr>
-      <w:hyperlink w:anchor="_Toc231076594" w:history="1">
+      <w:hyperlink w:anchor="_Toc231076981" w:history="1">
         <w:r>
           <w:rPr>
             <w:rStyle w:val="Hipervnculo"/>
@@ -1640,7 +1640,7 @@
             <w:noProof/>
             <w:webHidden/>
           </w:rPr>
-          <w:instrText xml:space="preserve"> PAGEREF _Toc231076594 \h </w:instrText>
+          <w:instrText xml:space="preserve"> PAGEREF _Toc231076981 \h </w:instrText>
         </w:r>
         <w:r>
           <w:rPr>
@@ -1686,7 +1686,7 @@
           <w14:ligatures w14:val="standardContextual"/>
         </w:rPr>
       </w:pPr>
-      <w:hyperlink w:anchor="_Toc231076595" w:history="1">
+      <w:hyperlink w:anchor="_Toc231076982" w:history="1">
         <w:r>
           <w:rPr>
             <w:rStyle w:val="Hipervnculo"/>
@@ -1713,7 +1713,7 @@
             <w:noProof/>
             <w:webHidden/>
           </w:rPr>
-          <w:instrText xml:space="preserve"> PAGEREF _Toc231076595 \h </w:instrText>
+          <w:instrText xml:space="preserve"> PAGEREF _Toc231076982 \h </w:instrText>
         </w:r>
         <w:r>
           <w:rPr>
@@ -1759,7 +1759,7 @@
           <w14:ligatures w14:val="standardContextual"/>
         </w:rPr>
       </w:pPr>
-      <w:hyperlink w:anchor="_Toc231076596" w:history="1">
+      <w:hyperlink w:anchor="_Toc231076983" w:history="1">
         <w:r>
           <w:rPr>
             <w:rStyle w:val="Hipervnculo"/>
@@ -1786,7 +1786,7 @@
             <w:noProof/>
             <w:webHidden/>
           </w:rPr>
-          <w:instrText xml:space="preserve"> PAGEREF _Toc231076596 \h </w:instrText>
+          <w:instrText xml:space="preserve"> PAGEREF _Toc231076983 \h </w:instrText>
         </w:r>
         <w:r>
           <w:rPr>
@@ -1832,7 +1832,7 @@
           <w14:ligatures w14:val="standardContextual"/>
         </w:rPr>
       </w:pPr>
-      <w:hyperlink w:anchor="_Toc231076597" w:history="1">
+      <w:hyperlink w:anchor="_Toc231076984" w:history="1">
         <w:r>
           <w:rPr>
             <w:rStyle w:val="Hipervnculo"/>
@@ -1859,7 +1859,7 @@
             <w:noProof/>
             <w:webHidden/>
           </w:rPr>
-          <w:instrText xml:space="preserve"> PAGEREF _Toc231076597 \h </w:instrText>
+          <w:instrText xml:space="preserve"> PAGEREF _Toc231076984 \h </w:instrText>
         </w:r>
         <w:r>
           <w:rPr>
@@ -1905,7 +1905,7 @@
           <w14:ligatures w14:val="standardContextual"/>
         </w:rPr>
       </w:pPr>
-      <w:hyperlink w:anchor="_Toc231076598" w:history="1">
+      <w:hyperlink w:anchor="_Toc231076985" w:history="1">
         <w:r>
           <w:rPr>
             <w:rStyle w:val="Hipervnculo"/>
@@ -1932,7 +1932,7 @@
             <w:noProof/>
             <w:webHidden/>
           </w:rPr>
-          <w:instrText xml:space="preserve"> PAGEREF _Toc231076598 \h </w:instrText>
+          <w:instrText xml:space="preserve"> PAGEREF _Toc231076985 \h </w:instrText>
         </w:r>
         <w:r>
           <w:rPr>
@@ -1978,7 +1978,7 @@
           <w14:ligatures w14:val="standardContextual"/>
         </w:rPr>
       </w:pPr>
-      <w:hyperlink w:anchor="_Toc231076599" w:history="1">
+      <w:hyperlink w:anchor="_Toc231076986" w:history="1">
         <w:r>
           <w:rPr>
             <w:rStyle w:val="Hipervnculo"/>
@@ -2005,7 +2005,7 @@
             <w:noProof/>
             <w:webHidden/>
           </w:rPr>
-          <w:instrText xml:space="preserve"> PAGEREF _Toc231076599 \h </w:instrText>
+          <w:instrText xml:space="preserve"> PAGEREF _Toc231076986 \h </w:instrText>
         </w:r>
         <w:r>
           <w:rPr>
@@ -2051,7 +2051,7 @@
           <w14:ligatures w14:val="standardContextual"/>
         </w:rPr>
       </w:pPr>
-      <w:hyperlink w:anchor="_Toc231076600" w:history="1">
+      <w:hyperlink w:anchor="_Toc231076987" w:history="1">
         <w:r>
           <w:rPr>
             <w:rStyle w:val="Hipervnculo"/>
@@ -2078,7 +2078,7 @@
             <w:noProof/>
             <w:webHidden/>
           </w:rPr>
-          <w:instrText xml:space="preserve"> PAGEREF _Toc231076600 \h </w:instrText>
+          <w:instrText xml:space="preserve"> PAGEREF _Toc231076987 \h </w:instrText>
         </w:r>
         <w:r>
           <w:rPr>
@@ -2124,7 +2124,7 @@
           <w14:ligatures w14:val="standardContextual"/>
         </w:rPr>
       </w:pPr>
-      <w:hyperlink w:anchor="_Toc231076601" w:history="1">
+      <w:hyperlink w:anchor="_Toc231076988" w:history="1">
         <w:r>
           <w:rPr>
             <w:rStyle w:val="Hipervnculo"/>
@@ -2151,7 +2151,7 @@
             <w:noProof/>
             <w:webHidden/>
           </w:rPr>
-          <w:instrText xml:space="preserve"> PAGEREF _Toc231076601 \h </w:instrText>
+          <w:instrText xml:space="preserve"> PAGEREF _Toc231076988 \h </w:instrText>
         </w:r>
         <w:r>
           <w:rPr>
@@ -2197,7 +2197,7 @@
           <w14:ligatures w14:val="standardContextual"/>
         </w:rPr>
       </w:pPr>
-      <w:hyperlink w:anchor="_Toc231076602" w:history="1">
+      <w:hyperlink w:anchor="_Toc231076989" w:history="1">
         <w:r>
           <w:rPr>
             <w:rStyle w:val="Hipervnculo"/>
@@ -2224,7 +2224,7 @@
             <w:noProof/>
             <w:webHidden/>
           </w:rPr>
-          <w:instrText xml:space="preserve"> PAGEREF _Toc231076602 \h </w:instrText>
+          <w:instrText xml:space="preserve"> PAGEREF _Toc231076989 \h </w:instrText>
         </w:r>
         <w:r>
           <w:rPr>
@@ -2270,7 +2270,7 @@
           <w14:ligatures w14:val="standardContextual"/>
         </w:rPr>
       </w:pPr>
-      <w:hyperlink w:anchor="_Toc231076603" w:history="1">
+      <w:hyperlink w:anchor="_Toc231076990" w:history="1">
         <w:r>
           <w:rPr>
             <w:rStyle w:val="Hipervnculo"/>
@@ -2297,7 +2297,7 @@
             <w:noProof/>
             <w:webHidden/>
           </w:rPr>
-          <w:instrText xml:space="preserve"> PAGEREF _Toc231076603 \h </w:instrText>
+          <w:instrText xml:space="preserve"> PAGEREF _Toc231076990 \h </w:instrText>
         </w:r>
         <w:r>
           <w:rPr>
@@ -2343,7 +2343,7 @@
           <w14:ligatures w14:val="standardContextual"/>
         </w:rPr>
       </w:pPr>
-      <w:hyperlink w:anchor="_Toc231076604" w:history="1">
+      <w:hyperlink w:anchor="_Toc231076991" w:history="1">
         <w:r>
           <w:rPr>
             <w:rStyle w:val="Hipervnculo"/>
@@ -2370,7 +2370,7 @@
             <w:noProof/>
             <w:webHidden/>
           </w:rPr>
-          <w:instrText xml:space="preserve"> PAGEREF _Toc231076604 \h </w:instrText>
+          <w:instrText xml:space="preserve"> PAGEREF _Toc231076991 \h </w:instrText>
         </w:r>
         <w:r>
           <w:rPr>
@@ -2416,7 +2416,7 @@
           <w14:ligatures w14:val="standardContextual"/>
         </w:rPr>
       </w:pPr>
-      <w:hyperlink w:anchor="_Toc231076605" w:history="1">
+      <w:hyperlink w:anchor="_Toc231076992" w:history="1">
         <w:r>
           <w:rPr>
             <w:rStyle w:val="Hipervnculo"/>
@@ -2443,7 +2443,7 @@
             <w:noProof/>
             <w:webHidden/>
           </w:rPr>
-          <w:instrText xml:space="preserve"> PAGEREF _Toc231076605 \h </w:instrText>
+          <w:instrText xml:space="preserve"> PAGEREF _Toc231076992 \h </w:instrText>
         </w:r>
         <w:r>
           <w:rPr>
@@ -2489,7 +2489,7 @@
           <w14:ligatures w14:val="standardContextual"/>
         </w:rPr>
       </w:pPr>
-      <w:hyperlink w:anchor="_Toc231076606" w:history="1">
+      <w:hyperlink w:anchor="_Toc231076993" w:history="1">
         <w:r>
           <w:rPr>
             <w:rStyle w:val="Hipervnculo"/>
@@ -2516,7 +2516,7 @@
             <w:noProof/>
             <w:webHidden/>
           </w:rPr>
-          <w:instrText xml:space="preserve"> PAGEREF _Toc231076606 \h </w:instrText>
+          <w:instrText xml:space="preserve"> PAGEREF _Toc231076993 \h </w:instrText>
         </w:r>
         <w:r>
           <w:rPr>
@@ -2562,7 +2562,7 @@
           <w14:ligatures w14:val="standardContextual"/>
         </w:rPr>
       </w:pPr>
-      <w:hyperlink w:anchor="_Toc231076607" w:history="1">
+      <w:hyperlink w:anchor="_Toc231076994" w:history="1">
         <w:r>
           <w:rPr>
             <w:rStyle w:val="Hipervnculo"/>
@@ -2589,7 +2589,7 @@
             <w:noProof/>
             <w:webHidden/>
           </w:rPr>
-          <w:instrText xml:space="preserve"> PAGEREF _Toc231076607 \h </w:instrText>
+          <w:instrText xml:space="preserve"> PAGEREF _Toc231076994 \h </w:instrText>
         </w:r>
         <w:r>
           <w:rPr>
@@ -2635,7 +2635,7 @@
           <w14:ligatures w14:val="standardContextual"/>
         </w:rPr>
       </w:pPr>
-      <w:hyperlink w:anchor="_Toc231076608" w:history="1">
+      <w:hyperlink w:anchor="_Toc231076995" w:history="1">
         <w:r>
           <w:rPr>
             <w:rStyle w:val="Hipervnculo"/>
@@ -2662,7 +2662,7 @@
             <w:noProof/>
             <w:webHidden/>
           </w:rPr>
-          <w:instrText xml:space="preserve"> PAGEREF _Toc231076608 \h </w:instrText>
+          <w:instrText xml:space="preserve"> PAGEREF _Toc231076995 \h </w:instrText>
         </w:r>
         <w:r>
           <w:rPr>
@@ -2708,7 +2708,7 @@
           <w14:ligatures w14:val="standardContextual"/>
         </w:rPr>
       </w:pPr>
-      <w:hyperlink w:anchor="_Toc231076609" w:history="1">
+      <w:hyperlink w:anchor="_Toc231076996" w:history="1">
         <w:r>
           <w:rPr>
             <w:rStyle w:val="Hipervnculo"/>
@@ -2735,7 +2735,7 @@
             <w:noProof/>
             <w:webHidden/>
           </w:rPr>
-          <w:instrText xml:space="preserve"> PAGEREF _Toc231076609 \h </w:instrText>
+          <w:instrText xml:space="preserve"> PAGEREF _Toc231076996 \h </w:instrText>
         </w:r>
         <w:r>
           <w:rPr>
@@ -2781,7 +2781,7 @@
           <w14:ligatures w14:val="standardContextual"/>
         </w:rPr>
       </w:pPr>
-      <w:hyperlink w:anchor="_Toc231076610" w:history="1">
+      <w:hyperlink w:anchor="_Toc231076997" w:history="1">
         <w:r>
           <w:rPr>
             <w:rStyle w:val="Hipervnculo"/>
@@ -2808,7 +2808,7 @@
             <w:noProof/>
             <w:webHidden/>
           </w:rPr>
-          <w:instrText xml:space="preserve"> PAGEREF _Toc231076610 \h </w:instrText>
+          <w:instrText xml:space="preserve"> PAGEREF _Toc231076997 \h </w:instrText>
         </w:r>
         <w:r>
           <w:rPr>
@@ -2854,7 +2854,7 @@
           <w14:ligatures w14:val="standardContextual"/>
         </w:rPr>
       </w:pPr>
-      <w:hyperlink w:anchor="_Toc231076611" w:history="1">
+      <w:hyperlink w:anchor="_Toc231076998" w:history="1">
         <w:r>
           <w:rPr>
             <w:rStyle w:val="Hipervnculo"/>
@@ -2881,7 +2881,7 @@
             <w:noProof/>
             <w:webHidden/>
           </w:rPr>
-          <w:instrText xml:space="preserve"> PAGEREF _Toc231076611 \h </w:instrText>
+          <w:instrText xml:space="preserve"> PAGEREF _Toc231076998 \h </w:instrText>
         </w:r>
         <w:r>
           <w:rPr>
@@ -2927,7 +2927,7 @@
           <w14:ligatures w14:val="standardContextual"/>
         </w:rPr>
       </w:pPr>
-      <w:hyperlink w:anchor="_Toc231076612" w:history="1">
+      <w:hyperlink w:anchor="_Toc231076999" w:history="1">
         <w:r>
           <w:rPr>
             <w:rStyle w:val="Hipervnculo"/>
@@ -2954,7 +2954,7 @@
             <w:noProof/>
             <w:webHidden/>
           </w:rPr>
-          <w:instrText xml:space="preserve"> PAGEREF _Toc231076612 \h </w:instrText>
+          <w:instrText xml:space="preserve"> PAGEREF _Toc231076999 \h </w:instrText>
         </w:r>
         <w:r>
           <w:rPr>
@@ -3000,7 +3000,7 @@
           <w14:ligatures w14:val="standardContextual"/>
         </w:rPr>
       </w:pPr>
-      <w:hyperlink w:anchor="_Toc231076613" w:history="1">
+      <w:hyperlink w:anchor="_Toc231077000" w:history="1">
         <w:r>
           <w:rPr>
             <w:rStyle w:val="Hipervnculo"/>
@@ -3027,7 +3027,7 @@
             <w:noProof/>
             <w:webHidden/>
           </w:rPr>
-          <w:instrText xml:space="preserve"> PAGEREF _Toc231076613 \h </w:instrText>
+          <w:instrText xml:space="preserve"> PAGEREF _Toc231077000 \h </w:instrText>
         </w:r>
         <w:r>
           <w:rPr>
@@ -3073,7 +3073,7 @@
           <w14:ligatures w14:val="standardContextual"/>
         </w:rPr>
       </w:pPr>
-      <w:hyperlink w:anchor="_Toc231076614" w:history="1">
+      <w:hyperlink w:anchor="_Toc231077001" w:history="1">
         <w:r>
           <w:rPr>
             <w:rStyle w:val="Hipervnculo"/>
@@ -3100,7 +3100,7 @@
             <w:noProof/>
             <w:webHidden/>
           </w:rPr>
-          <w:instrText xml:space="preserve"> PAGEREF _Toc231076614 \h </w:instrText>
+          <w:instrText xml:space="preserve"> PAGEREF _Toc231077001 \h </w:instrText>
         </w:r>
         <w:r>
           <w:rPr>
@@ -3146,7 +3146,7 @@
           <w14:ligatures w14:val="standardContextual"/>
         </w:rPr>
       </w:pPr>
-      <w:hyperlink w:anchor="_Toc231076615" w:history="1">
+      <w:hyperlink w:anchor="_Toc231077002" w:history="1">
         <w:r>
           <w:rPr>
             <w:rStyle w:val="Hipervnculo"/>
@@ -3173,7 +3173,7 @@
             <w:noProof/>
             <w:webHidden/>
           </w:rPr>
-          <w:instrText xml:space="preserve"> PAGEREF _Toc231076615 \h </w:instrText>
+          <w:instrText xml:space="preserve"> PAGEREF _Toc231077002 \h </w:instrText>
         </w:r>
         <w:r>
           <w:rPr>
@@ -3219,7 +3219,7 @@
           <w14:ligatures w14:val="standardContextual"/>
         </w:rPr>
       </w:pPr>
-      <w:hyperlink w:anchor="_Toc231076616" w:history="1">
+      <w:hyperlink w:anchor="_Toc231077003" w:history="1">
         <w:r>
           <w:rPr>
             <w:rStyle w:val="Hipervnculo"/>
@@ -3246,7 +3246,7 @@
             <w:noProof/>
             <w:webHidden/>
           </w:rPr>
-          <w:instrText xml:space="preserve"> PAGEREF _Toc231076616 \h </w:instrText>
+          <w:instrText xml:space="preserve"> PAGEREF _Toc231077003 \h </w:instrText>
         </w:r>
         <w:r>
           <w:rPr>
@@ -3292,7 +3292,7 @@
           <w14:ligatures w14:val="standardContextual"/>
         </w:rPr>
       </w:pPr>
-      <w:hyperlink w:anchor="_Toc231076617" w:history="1">
+      <w:hyperlink w:anchor="_Toc231077004" w:history="1">
         <w:r>
           <w:rPr>
             <w:rStyle w:val="Hipervnculo"/>
@@ -3319,7 +3319,7 @@
             <w:noProof/>
             <w:webHidden/>
           </w:rPr>
-          <w:instrText xml:space="preserve"> PAGEREF _Toc231076617 \h </w:instrText>
+          <w:instrText xml:space="preserve"> PAGEREF _Toc231077004 \h </w:instrText>
         </w:r>
         <w:r>
           <w:rPr>
@@ -3365,7 +3365,7 @@
           <w14:ligatures w14:val="standardContextual"/>
         </w:rPr>
       </w:pPr>
-      <w:hyperlink w:anchor="_Toc231076618" w:history="1">
+      <w:hyperlink w:anchor="_Toc231077005" w:history="1">
         <w:r>
           <w:rPr>
             <w:rStyle w:val="Hipervnculo"/>
@@ -3392,7 +3392,7 @@
             <w:noProof/>
             <w:webHidden/>
           </w:rPr>
-          <w:instrText xml:space="preserve"> PAGEREF _Toc231076618 \h </w:instrText>
+          <w:instrText xml:space="preserve"> PAGEREF _Toc231077005 \h </w:instrText>
         </w:r>
         <w:r>
           <w:rPr>
@@ -3438,7 +3438,7 @@
           <w14:ligatures w14:val="standardContextual"/>
         </w:rPr>
       </w:pPr>
-      <w:hyperlink w:anchor="_Toc231076619" w:history="1">
+      <w:hyperlink w:anchor="_Toc231077006" w:history="1">
         <w:r>
           <w:rPr>
             <w:rStyle w:val="Hipervnculo"/>
@@ -3465,7 +3465,7 @@
             <w:noProof/>
             <w:webHidden/>
           </w:rPr>
-          <w:instrText xml:space="preserve"> PAGEREF _Toc231076619 \h </w:instrText>
+          <w:instrText xml:space="preserve"> PAGEREF _Toc231077006 \h </w:instrText>
         </w:r>
         <w:r>
           <w:rPr>
@@ -3511,7 +3511,7 @@
           <w14:ligatures w14:val="standardContextual"/>
         </w:rPr>
       </w:pPr>
-      <w:hyperlink w:anchor="_Toc231076620" w:history="1">
+      <w:hyperlink w:anchor="_Toc231077007" w:history="1">
         <w:r>
           <w:rPr>
             <w:rStyle w:val="Hipervnculo"/>
@@ -3538,7 +3538,7 @@
             <w:noProof/>
             <w:webHidden/>
           </w:rPr>
-          <w:instrText xml:space="preserve"> PAGEREF _Toc231076620 \h </w:instrText>
+          <w:instrText xml:space="preserve"> PAGEREF _Toc231077007 \h </w:instrText>
         </w:r>
         <w:r>
           <w:rPr>
@@ -3584,7 +3584,7 @@
           <w14:ligatures w14:val="standardContextual"/>
         </w:rPr>
       </w:pPr>
-      <w:hyperlink w:anchor="_Toc231076621" w:history="1">
+      <w:hyperlink w:anchor="_Toc231077008" w:history="1">
         <w:r>
           <w:rPr>
             <w:rStyle w:val="Hipervnculo"/>
@@ -3611,7 +3611,7 @@
             <w:noProof/>
             <w:webHidden/>
           </w:rPr>
-          <w:instrText xml:space="preserve"> PAGEREF _Toc231076621 \h </w:instrText>
+          <w:instrText xml:space="preserve"> PAGEREF _Toc231077008 \h </w:instrText>
         </w:r>
         <w:r>
           <w:rPr>
@@ -3657,7 +3657,7 @@
           <w14:ligatures w14:val="standardContextual"/>
         </w:rPr>
       </w:pPr>
-      <w:hyperlink w:anchor="_Toc231076622" w:history="1">
+      <w:hyperlink w:anchor="_Toc231077009" w:history="1">
         <w:r>
           <w:rPr>
             <w:rStyle w:val="Hipervnculo"/>
@@ -3684,7 +3684,7 @@
             <w:noProof/>
             <w:webHidden/>
           </w:rPr>
-          <w:instrText xml:space="preserve"> PAGEREF _Toc231076622 \h </w:instrText>
+          <w:instrText xml:space="preserve"> PAGEREF _Toc231077009 \h </w:instrText>
         </w:r>
         <w:r>
           <w:rPr>
@@ -3730,7 +3730,7 @@
           <w14:ligatures w14:val="standardContextual"/>
         </w:rPr>
       </w:pPr>
-      <w:hyperlink w:anchor="_Toc231076623" w:history="1">
+      <w:hyperlink w:anchor="_Toc231077010" w:history="1">
         <w:r>
           <w:rPr>
             <w:rStyle w:val="Hipervnculo"/>
@@ -3757,7 +3757,7 @@
             <w:noProof/>
             <w:webHidden/>
           </w:rPr>
-          <w:instrText xml:space="preserve"> PAGEREF _Toc231076623 \h </w:instrText>
+          <w:instrText xml:space="preserve"> PAGEREF _Toc231077010 \h </w:instrText>
         </w:r>
         <w:r>
           <w:rPr>
@@ -3777,7 +3777,7 @@
             <w:noProof/>
             <w:webHidden/>
           </w:rPr>
-          <w:t>26</w:t>
+          <w:t>27</w:t>
         </w:r>
         <w:r>
           <w:rPr>
@@ -3803,7 +3803,7 @@
           <w14:ligatures w14:val="standardContextual"/>
         </w:rPr>
       </w:pPr>
-      <w:hyperlink w:anchor="_Toc231076624" w:history="1">
+      <w:hyperlink w:anchor="_Toc231077011" w:history="1">
         <w:r>
           <w:rPr>
             <w:rStyle w:val="Hipervnculo"/>
@@ -3830,7 +3830,7 @@
             <w:noProof/>
             <w:webHidden/>
           </w:rPr>
-          <w:instrText xml:space="preserve"> PAGEREF _Toc231076624 \h </w:instrText>
+          <w:instrText xml:space="preserve"> PAGEREF _Toc231077011 \h </w:instrText>
         </w:r>
         <w:r>
           <w:rPr>
@@ -3850,7 +3850,7 @@
             <w:noProof/>
             <w:webHidden/>
           </w:rPr>
-          <w:t>28</w:t>
+          <w:t>29</w:t>
         </w:r>
         <w:r>
           <w:rPr>
@@ -3876,7 +3876,7 @@
           <w14:ligatures w14:val="standardContextual"/>
         </w:rPr>
       </w:pPr>
-      <w:hyperlink w:anchor="_Toc231076625" w:history="1">
+      <w:hyperlink w:anchor="_Toc231077012" w:history="1">
         <w:r>
           <w:rPr>
             <w:rStyle w:val="Hipervnculo"/>
@@ -3903,7 +3903,7 @@
             <w:noProof/>
             <w:webHidden/>
           </w:rPr>
-          <w:instrText xml:space="preserve"> PAGEREF _Toc231076625 \h </w:instrText>
+          <w:instrText xml:space="preserve"> PAGEREF _Toc231077012 \h </w:instrText>
         </w:r>
         <w:r>
           <w:rPr>
@@ -3923,7 +3923,7 @@
             <w:noProof/>
             <w:webHidden/>
           </w:rPr>
-          <w:t>29</w:t>
+          <w:t>30</w:t>
         </w:r>
         <w:r>
           <w:rPr>
@@ -3949,7 +3949,7 @@
           <w14:ligatures w14:val="standardContextual"/>
         </w:rPr>
       </w:pPr>
-      <w:hyperlink w:anchor="_Toc231076626" w:history="1">
+      <w:hyperlink w:anchor="_Toc231077013" w:history="1">
         <w:r>
           <w:rPr>
             <w:rStyle w:val="Hipervnculo"/>
@@ -3976,7 +3976,7 @@
             <w:noProof/>
             <w:webHidden/>
           </w:rPr>
-          <w:instrText xml:space="preserve"> PAGEREF _Toc231076626 \h </w:instrText>
+          <w:instrText xml:space="preserve"> PAGEREF _Toc231077013 \h </w:instrText>
         </w:r>
         <w:r>
           <w:rPr>
@@ -4022,7 +4022,7 @@
           <w14:ligatures w14:val="standardContextual"/>
         </w:rPr>
       </w:pPr>
-      <w:hyperlink w:anchor="_Toc231076627" w:history="1">
+      <w:hyperlink w:anchor="_Toc231077014" w:history="1">
         <w:r>
           <w:rPr>
             <w:rStyle w:val="Hipervnculo"/>
@@ -4049,7 +4049,7 @@
             <w:noProof/>
             <w:webHidden/>
           </w:rPr>
-          <w:instrText xml:space="preserve"> PAGEREF _Toc231076627 \h </w:instrText>
+          <w:instrText xml:space="preserve"> PAGEREF _Toc231077014 \h </w:instrText>
         </w:r>
         <w:r>
           <w:rPr>
@@ -4069,7 +4069,7 @@
             <w:noProof/>
             <w:webHidden/>
           </w:rPr>
-          <w:t>32</w:t>
+          <w:t>33</w:t>
         </w:r>
         <w:r>
           <w:rPr>
@@ -4095,7 +4095,7 @@
           <w14:ligatures w14:val="standardContextual"/>
         </w:rPr>
       </w:pPr>
-      <w:hyperlink w:anchor="_Toc231076628" w:history="1">
+      <w:hyperlink w:anchor="_Toc231077015" w:history="1">
         <w:r>
           <w:rPr>
             <w:rStyle w:val="Hipervnculo"/>
@@ -4122,7 +4122,7 @@
             <w:noProof/>
             <w:webHidden/>
           </w:rPr>
-          <w:instrText xml:space="preserve"> PAGEREF _Toc231076628 \h </w:instrText>
+          <w:instrText xml:space="preserve"> PAGEREF _Toc231077015 \h </w:instrText>
         </w:r>
         <w:r>
           <w:rPr>
@@ -4142,7 +4142,7 @@
             <w:noProof/>
             <w:webHidden/>
           </w:rPr>
-          <w:t>34</w:t>
+          <w:t>35</w:t>
         </w:r>
         <w:r>
           <w:rPr>
@@ -4168,7 +4168,7 @@
           <w14:ligatures w14:val="standardContextual"/>
         </w:rPr>
       </w:pPr>
-      <w:hyperlink w:anchor="_Toc231076629" w:history="1">
+      <w:hyperlink w:anchor="_Toc231077016" w:history="1">
         <w:r>
           <w:rPr>
             <w:rStyle w:val="Hipervnculo"/>
@@ -4195,7 +4195,7 @@
             <w:noProof/>
             <w:webHidden/>
           </w:rPr>
-          <w:instrText xml:space="preserve"> PAGEREF _Toc231076629 \h </w:instrText>
+          <w:instrText xml:space="preserve"> PAGEREF _Toc231077016 \h </w:instrText>
         </w:r>
         <w:r>
           <w:rPr>
@@ -4215,7 +4215,7 @@
             <w:noProof/>
             <w:webHidden/>
           </w:rPr>
-          <w:t>34</w:t>
+          <w:t>35</w:t>
         </w:r>
         <w:r>
           <w:rPr>
@@ -4241,7 +4241,7 @@
           <w14:ligatures w14:val="standardContextual"/>
         </w:rPr>
       </w:pPr>
-      <w:hyperlink w:anchor="_Toc231076630" w:history="1">
+      <w:hyperlink w:anchor="_Toc231077017" w:history="1">
         <w:r>
           <w:rPr>
             <w:rStyle w:val="Hipervnculo"/>
@@ -4268,7 +4268,7 @@
             <w:noProof/>
             <w:webHidden/>
           </w:rPr>
-          <w:instrText xml:space="preserve"> PAGEREF _Toc231076630 \h </w:instrText>
+          <w:instrText xml:space="preserve"> PAGEREF _Toc231077017 \h </w:instrText>
         </w:r>
         <w:r>
           <w:rPr>
@@ -4288,7 +4288,7 @@
             <w:noProof/>
             <w:webHidden/>
           </w:rPr>
-          <w:t>35</w:t>
+          <w:t>36</w:t>
         </w:r>
         <w:r>
           <w:rPr>
@@ -4314,7 +4314,7 @@
           <w14:ligatures w14:val="standardContextual"/>
         </w:rPr>
       </w:pPr>
-      <w:hyperlink w:anchor="_Toc231076631" w:history="1">
+      <w:hyperlink w:anchor="_Toc231077018" w:history="1">
         <w:r>
           <w:rPr>
             <w:rStyle w:val="Hipervnculo"/>
@@ -4341,7 +4341,7 @@
             <w:noProof/>
             <w:webHidden/>
           </w:rPr>
-          <w:instrText xml:space="preserve"> PAGEREF _Toc231076631 \h </w:instrText>
+          <w:instrText xml:space="preserve"> PAGEREF _Toc231077018 \h </w:instrText>
         </w:r>
         <w:r>
           <w:rPr>
@@ -4361,7 +4361,7 @@
             <w:noProof/>
             <w:webHidden/>
           </w:rPr>
-          <w:t>35</w:t>
+          <w:t>36</w:t>
         </w:r>
         <w:r>
           <w:rPr>
@@ -4387,7 +4387,7 @@
           <w14:ligatures w14:val="standardContextual"/>
         </w:rPr>
       </w:pPr>
-      <w:hyperlink w:anchor="_Toc231076632" w:history="1">
+      <w:hyperlink w:anchor="_Toc231077019" w:history="1">
         <w:r>
           <w:rPr>
             <w:rStyle w:val="Hipervnculo"/>
@@ -4414,7 +4414,7 @@
             <w:noProof/>
             <w:webHidden/>
           </w:rPr>
-          <w:instrText xml:space="preserve"> PAGEREF _Toc231076632 \h </w:instrText>
+          <w:instrText xml:space="preserve"> PAGEREF _Toc231077019 \h </w:instrText>
         </w:r>
         <w:r>
           <w:rPr>
@@ -4434,7 +4434,7 @@
             <w:noProof/>
             <w:webHidden/>
           </w:rPr>
-          <w:t>35</w:t>
+          <w:t>36</w:t>
         </w:r>
         <w:r>
           <w:rPr>
@@ -4460,7 +4460,7 @@
           <w14:ligatures w14:val="standardContextual"/>
         </w:rPr>
       </w:pPr>
-      <w:hyperlink w:anchor="_Toc231076633" w:history="1">
+      <w:hyperlink w:anchor="_Toc231077020" w:history="1">
         <w:r>
           <w:rPr>
             <w:rStyle w:val="Hipervnculo"/>
@@ -4487,7 +4487,7 @@
             <w:noProof/>
             <w:webHidden/>
           </w:rPr>
-          <w:instrText xml:space="preserve"> PAGEREF _Toc231076633 \h </w:instrText>
+          <w:instrText xml:space="preserve"> PAGEREF _Toc231077020 \h </w:instrText>
         </w:r>
         <w:r>
           <w:rPr>
@@ -4507,7 +4507,7 @@
             <w:noProof/>
             <w:webHidden/>
           </w:rPr>
-          <w:t>37</w:t>
+          <w:t>38</w:t>
         </w:r>
         <w:r>
           <w:rPr>
@@ -4532,7 +4532,7 @@
       <w:pPr>
         <w:pStyle w:val="Ttulo1"/>
       </w:pPr>
-      <w:bookmarkStart w:id="7" w:name="_Toc231076584"/>
+      <w:bookmarkStart w:id="7" w:name="_Toc231076971"/>
       <w:r>
         <w:lastRenderedPageBreak/>
         <w:t>Índice de tablas</w:t>
@@ -4563,7 +4563,7 @@
       <w:r>
         <w:fldChar w:fldCharType="separate"/>
       </w:r>
-      <w:hyperlink w:anchor="_Toc231076634" w:history="1">
+      <w:hyperlink w:anchor="_Toc231077021" w:history="1">
         <w:r>
           <w:rPr>
             <w:rStyle w:val="Hipervnculo"/>
@@ -4590,7 +4590,7 @@
             <w:noProof/>
             <w:webHidden/>
           </w:rPr>
-          <w:instrText xml:space="preserve"> PAGEREF _Toc231076634 \h </w:instrText>
+          <w:instrText xml:space="preserve"> PAGEREF _Toc231077021 \h </w:instrText>
         </w:r>
         <w:r>
           <w:rPr>
@@ -4636,7 +4636,7 @@
           <w14:ligatures w14:val="standardContextual"/>
         </w:rPr>
       </w:pPr>
-      <w:hyperlink w:anchor="_Toc231076635" w:history="1">
+      <w:hyperlink w:anchor="_Toc231077022" w:history="1">
         <w:r>
           <w:rPr>
             <w:rStyle w:val="Hipervnculo"/>
@@ -4663,7 +4663,7 @@
             <w:noProof/>
             <w:webHidden/>
           </w:rPr>
-          <w:instrText xml:space="preserve"> PAGEREF _Toc231076635 \h </w:instrText>
+          <w:instrText xml:space="preserve"> PAGEREF _Toc231077022 \h </w:instrText>
         </w:r>
         <w:r>
           <w:rPr>
@@ -4709,7 +4709,7 @@
           <w14:ligatures w14:val="standardContextual"/>
         </w:rPr>
       </w:pPr>
-      <w:hyperlink w:anchor="_Toc231076636" w:history="1">
+      <w:hyperlink w:anchor="_Toc231077023" w:history="1">
         <w:r>
           <w:rPr>
             <w:rStyle w:val="Hipervnculo"/>
@@ -4736,7 +4736,7 @@
             <w:noProof/>
             <w:webHidden/>
           </w:rPr>
-          <w:instrText xml:space="preserve"> PAGEREF _Toc231076636 \h </w:instrText>
+          <w:instrText xml:space="preserve"> PAGEREF _Toc231077023 \h </w:instrText>
         </w:r>
         <w:r>
           <w:rPr>
@@ -4756,7 +4756,7 @@
             <w:noProof/>
             <w:webHidden/>
           </w:rPr>
-          <w:t>26</w:t>
+          <w:t>27</w:t>
         </w:r>
         <w:r>
           <w:rPr>
@@ -4782,7 +4782,7 @@
           <w14:ligatures w14:val="standardContextual"/>
         </w:rPr>
       </w:pPr>
-      <w:hyperlink w:anchor="_Toc231076637" w:history="1">
+      <w:hyperlink w:anchor="_Toc231077024" w:history="1">
         <w:r>
           <w:rPr>
             <w:rStyle w:val="Hipervnculo"/>
@@ -4809,7 +4809,7 @@
             <w:noProof/>
             <w:webHidden/>
           </w:rPr>
-          <w:instrText xml:space="preserve"> PAGEREF _Toc231076637 \h </w:instrText>
+          <w:instrText xml:space="preserve"> PAGEREF _Toc231077024 \h </w:instrText>
         </w:r>
         <w:r>
           <w:rPr>
@@ -4829,7 +4829,7 @@
             <w:noProof/>
             <w:webHidden/>
           </w:rPr>
-          <w:t>29</w:t>
+          <w:t>30</w:t>
         </w:r>
         <w:r>
           <w:rPr>
@@ -4854,7 +4854,7 @@
       <w:pPr>
         <w:pStyle w:val="Ttulo1"/>
       </w:pPr>
-      <w:bookmarkStart w:id="8" w:name="_Toc231076585"/>
+      <w:bookmarkStart w:id="8" w:name="_Toc231076972"/>
       <w:r>
         <w:lastRenderedPageBreak/>
         <w:t>Índice de figuras</w:t>
@@ -4885,7 +4885,7 @@
       <w:r>
         <w:fldChar w:fldCharType="separate"/>
       </w:r>
-      <w:hyperlink w:anchor="_Toc231076638" w:history="1">
+      <w:hyperlink w:anchor="_Toc231077025" w:history="1">
         <w:r>
           <w:rPr>
             <w:rStyle w:val="Hipervnculo"/>
@@ -4912,7 +4912,7 @@
             <w:noProof/>
             <w:webHidden/>
           </w:rPr>
-          <w:instrText xml:space="preserve"> PAGEREF _Toc231076638 \h </w:instrText>
+          <w:instrText xml:space="preserve"> PAGEREF _Toc231077025 \h </w:instrText>
         </w:r>
         <w:r>
           <w:rPr>
@@ -4958,7 +4958,7 @@
           <w14:ligatures w14:val="standardContextual"/>
         </w:rPr>
       </w:pPr>
-      <w:hyperlink w:anchor="_Toc231076639" w:history="1">
+      <w:hyperlink w:anchor="_Toc231077026" w:history="1">
         <w:r>
           <w:rPr>
             <w:rStyle w:val="Hipervnculo"/>
@@ -4985,7 +4985,7 @@
             <w:noProof/>
             <w:webHidden/>
           </w:rPr>
-          <w:instrText xml:space="preserve"> PAGEREF _Toc231076639 \h </w:instrText>
+          <w:instrText xml:space="preserve"> PAGEREF _Toc231077026 \h </w:instrText>
         </w:r>
         <w:r>
           <w:rPr>
@@ -5005,7 +5005,7 @@
             <w:noProof/>
             <w:webHidden/>
           </w:rPr>
-          <w:t>27</w:t>
+          <w:t>28</w:t>
         </w:r>
         <w:r>
           <w:rPr>
@@ -5031,7 +5031,7 @@
           <w14:ligatures w14:val="standardContextual"/>
         </w:rPr>
       </w:pPr>
-      <w:hyperlink w:anchor="_Toc231076640" w:history="1">
+      <w:hyperlink w:anchor="_Toc231077027" w:history="1">
         <w:r>
           <w:rPr>
             <w:rStyle w:val="Hipervnculo"/>
@@ -5058,7 +5058,7 @@
             <w:noProof/>
             <w:webHidden/>
           </w:rPr>
-          <w:instrText xml:space="preserve"> PAGEREF _Toc231076640 \h </w:instrText>
+          <w:instrText xml:space="preserve"> PAGEREF _Toc231077027 \h </w:instrText>
         </w:r>
         <w:r>
           <w:rPr>
@@ -5078,7 +5078,7 @@
             <w:noProof/>
             <w:webHidden/>
           </w:rPr>
-          <w:t>28</w:t>
+          <w:t>29</w:t>
         </w:r>
         <w:r>
           <w:rPr>
@@ -5104,7 +5104,7 @@
           <w14:ligatures w14:val="standardContextual"/>
         </w:rPr>
       </w:pPr>
-      <w:hyperlink w:anchor="_Toc231076641" w:history="1">
+      <w:hyperlink w:anchor="_Toc231077028" w:history="1">
         <w:r>
           <w:rPr>
             <w:rStyle w:val="Hipervnculo"/>
@@ -5131,7 +5131,7 @@
             <w:noProof/>
             <w:webHidden/>
           </w:rPr>
-          <w:instrText xml:space="preserve"> PAGEREF _Toc231076641 \h </w:instrText>
+          <w:instrText xml:space="preserve"> PAGEREF _Toc231077028 \h </w:instrText>
         </w:r>
         <w:r>
           <w:rPr>
@@ -5151,7 +5151,7 @@
             <w:noProof/>
             <w:webHidden/>
           </w:rPr>
-          <w:t>29</w:t>
+          <w:t>30</w:t>
         </w:r>
         <w:r>
           <w:rPr>
@@ -5177,7 +5177,7 @@
           <w14:ligatures w14:val="standardContextual"/>
         </w:rPr>
       </w:pPr>
-      <w:hyperlink w:anchor="_Toc231076642" w:history="1">
+      <w:hyperlink w:anchor="_Toc231077029" w:history="1">
         <w:r>
           <w:rPr>
             <w:rStyle w:val="Hipervnculo"/>
@@ -5204,7 +5204,7 @@
             <w:noProof/>
             <w:webHidden/>
           </w:rPr>
-          <w:instrText xml:space="preserve"> PAGEREF _Toc231076642 \h </w:instrText>
+          <w:instrText xml:space="preserve"> PAGEREF _Toc231077029 \h </w:instrText>
         </w:r>
         <w:r>
           <w:rPr>
@@ -5224,7 +5224,7 @@
             <w:noProof/>
             <w:webHidden/>
           </w:rPr>
-          <w:t>30</w:t>
+          <w:t>31</w:t>
         </w:r>
         <w:r>
           <w:rPr>
@@ -5249,7 +5249,7 @@
       <w:pPr>
         <w:pStyle w:val="Ttulo1"/>
       </w:pPr>
-      <w:bookmarkStart w:id="9" w:name="_Toc231076586"/>
+      <w:bookmarkStart w:id="9" w:name="_Toc231076973"/>
       <w:r>
         <w:lastRenderedPageBreak/>
         <w:t xml:space="preserve">Lista de </w:t>
@@ -5858,7 +5858,7 @@
       <w:pPr>
         <w:pStyle w:val="Ttulo1"/>
       </w:pPr>
-      <w:bookmarkStart w:id="10" w:name="_Toc231076587"/>
+      <w:bookmarkStart w:id="10" w:name="_Toc231076974"/>
       <w:r>
         <w:lastRenderedPageBreak/>
         <w:t>Capítulo 1 — Introducción</w:t>
@@ -5869,7 +5869,7 @@
       <w:pPr>
         <w:pStyle w:val="Ttulo2"/>
       </w:pPr>
-      <w:bookmarkStart w:id="11" w:name="_Toc231076588"/>
+      <w:bookmarkStart w:id="11" w:name="_Toc231076975"/>
       <w:r>
         <w:t>1.1 Contextualización</w:t>
       </w:r>
@@ -5954,7 +5954,7 @@
       <w:pPr>
         <w:pStyle w:val="Ttulo2"/>
       </w:pPr>
-      <w:bookmarkStart w:id="12" w:name="_Toc231076589"/>
+      <w:bookmarkStart w:id="12" w:name="_Toc231076976"/>
       <w:r>
         <w:lastRenderedPageBreak/>
         <w:t>1.2 Problema de investigación y justificación</w:t>
@@ -6067,7 +6067,7 @@
       <w:pPr>
         <w:pStyle w:val="Ttulo2"/>
       </w:pPr>
-      <w:bookmarkStart w:id="13" w:name="_Toc231076590"/>
+      <w:bookmarkStart w:id="13" w:name="_Toc231076977"/>
       <w:r>
         <w:lastRenderedPageBreak/>
         <w:t>1.3 Pregunta y objetivos de investigación</w:t>
@@ -6250,7 +6250,7 @@
       <w:pPr>
         <w:pStyle w:val="Ttulo2"/>
       </w:pPr>
-      <w:bookmarkStart w:id="14" w:name="_Toc231076591"/>
+      <w:bookmarkStart w:id="14" w:name="_Toc231076978"/>
       <w:r>
         <w:t>1.4 Hipótesis general</w:t>
       </w:r>
@@ -6293,7 +6293,7 @@
       <w:pPr>
         <w:pStyle w:val="Ttulo2"/>
       </w:pPr>
-      <w:bookmarkStart w:id="15" w:name="_Toc231076592"/>
+      <w:bookmarkStart w:id="15" w:name="_Toc231076979"/>
       <w:r>
         <w:t>1.5 Aspectos metodológicos y alcance</w:t>
       </w:r>
@@ -6396,7 +6396,7 @@
       <w:pPr>
         <w:pStyle w:val="Ttulo2"/>
       </w:pPr>
-      <w:bookmarkStart w:id="16" w:name="_Toc231076593"/>
+      <w:bookmarkStart w:id="16" w:name="_Toc231076980"/>
       <w:r>
         <w:t>1.6 Aportes esperados</w:t>
       </w:r>
@@ -6450,7 +6450,7 @@
       <w:pPr>
         <w:pStyle w:val="Ttulo2"/>
       </w:pPr>
-      <w:bookmarkStart w:id="17" w:name="_Toc231076594"/>
+      <w:bookmarkStart w:id="17" w:name="_Toc231076981"/>
       <w:r>
         <w:t>1.7 Estructura de la tesis</w:t>
       </w:r>
@@ -6493,7 +6493,7 @@
       <w:pPr>
         <w:pStyle w:val="Ttulo1"/>
       </w:pPr>
-      <w:bookmarkStart w:id="18" w:name="_Toc231076595"/>
+      <w:bookmarkStart w:id="18" w:name="_Toc231076982"/>
       <w:r>
         <w:lastRenderedPageBreak/>
         <w:t>Capítulo 2 — Marco teórico y revisión de literatura</w:t>
@@ -6504,7 +6504,7 @@
       <w:pPr>
         <w:pStyle w:val="Ttulo2"/>
       </w:pPr>
-      <w:bookmarkStart w:id="19" w:name="_Toc231076596"/>
+      <w:bookmarkStart w:id="19" w:name="_Toc231076983"/>
       <w:r>
         <w:t>2.1 Determinantes macroeconómicos de los retornos accionarios</w:t>
       </w:r>
@@ -6620,7 +6620,7 @@
       <w:pPr>
         <w:pStyle w:val="Ttulo2"/>
       </w:pPr>
-      <w:bookmarkStart w:id="20" w:name="_Toc231076597"/>
+      <w:bookmarkStart w:id="20" w:name="_Toc231076984"/>
       <w:r>
         <w:t>2.2 Precios de commodities y valoración de empresas mineras</w:t>
       </w:r>
@@ -6714,7 +6714,7 @@
       <w:pPr>
         <w:pStyle w:val="Ttulo2"/>
       </w:pPr>
-      <w:bookmarkStart w:id="21" w:name="_Toc231076598"/>
+      <w:bookmarkStart w:id="21" w:name="_Toc231076985"/>
       <w:r>
         <w:t>2.3 Tipo de cambio y exposición de empresas exportadoras</w:t>
       </w:r>
@@ -6792,7 +6792,7 @@
       <w:pPr>
         <w:pStyle w:val="Ttulo2"/>
       </w:pPr>
-      <w:bookmarkStart w:id="22" w:name="_Toc231076599"/>
+      <w:bookmarkStart w:id="22" w:name="_Toc231076986"/>
       <w:r>
         <w:t>2.4 Cobre, tipo de cambio y la economía chilena</w:t>
       </w:r>
@@ -6894,7 +6894,7 @@
       <w:pPr>
         <w:pStyle w:val="Ttulo2"/>
       </w:pPr>
-      <w:bookmarkStart w:id="23" w:name="_Toc231076600"/>
+      <w:bookmarkStart w:id="23" w:name="_Toc231076987"/>
       <w:r>
         <w:t>2.5 Eficiencia informacional y segmentación de mercados</w:t>
       </w:r>
@@ -6984,7 +6984,7 @@
       <w:pPr>
         <w:pStyle w:val="Ttulo2"/>
       </w:pPr>
-      <w:bookmarkStart w:id="24" w:name="_Toc231076601"/>
+      <w:bookmarkStart w:id="24" w:name="_Toc231076988"/>
       <w:r>
         <w:t>2.6 Enfoques econométricos para la medición de impacto</w:t>
       </w:r>
@@ -7111,7 +7111,7 @@
       <w:pPr>
         <w:pStyle w:val="Ttulo2"/>
       </w:pPr>
-      <w:bookmarkStart w:id="25" w:name="_Toc231076602"/>
+      <w:bookmarkStart w:id="25" w:name="_Toc231076989"/>
       <w:r>
         <w:lastRenderedPageBreak/>
         <w:t>2.7 Síntesis e identificación del vacío de investigación</w:t>
@@ -7237,7 +7237,7 @@
       <w:pPr>
         <w:pStyle w:val="Ttulo3"/>
       </w:pPr>
-      <w:bookmarkStart w:id="26" w:name="_Toc231076603"/>
+      <w:bookmarkStart w:id="26" w:name="_Toc231076990"/>
       <w:r>
         <w:t>Nota sobre la tabla de literatura</w:t>
       </w:r>
@@ -7267,7 +7267,7 @@
       <w:pPr>
         <w:pStyle w:val="Ttulo1"/>
       </w:pPr>
-      <w:bookmarkStart w:id="27" w:name="_Toc231076604"/>
+      <w:bookmarkStart w:id="27" w:name="_Toc231076991"/>
       <w:r>
         <w:lastRenderedPageBreak/>
         <w:t>Capítulo 3 — Datos y metodología</w:t>
@@ -7278,7 +7278,7 @@
       <w:pPr>
         <w:pStyle w:val="Ttulo2"/>
       </w:pPr>
-      <w:bookmarkStart w:id="28" w:name="_Toc231076605"/>
+      <w:bookmarkStart w:id="28" w:name="_Toc231076992"/>
       <w:r>
         <w:t>3.1 Definición del universo de empresas y período</w:t>
       </w:r>
@@ -7467,7 +7467,7 @@
       <w:pPr>
         <w:pStyle w:val="Ttulo2"/>
       </w:pPr>
-      <w:bookmarkStart w:id="29" w:name="_Toc231076606"/>
+      <w:bookmarkStart w:id="29" w:name="_Toc231076993"/>
       <w:r>
         <w:t>3.2 Variable dependiente</w:t>
       </w:r>
@@ -7526,7 +7526,7 @@
       <w:pPr>
         <w:pStyle w:val="Ttulo2"/>
       </w:pPr>
-      <w:bookmarkStart w:id="30" w:name="_Toc231076607"/>
+      <w:bookmarkStart w:id="30" w:name="_Toc231076994"/>
       <w:r>
         <w:t>3.3 Variables explicativas</w:t>
       </w:r>
@@ -7593,7 +7593,7 @@
       <w:pPr>
         <w:pStyle w:val="Ttulo2"/>
       </w:pPr>
-      <w:bookmarkStart w:id="31" w:name="_Toc231076608"/>
+      <w:bookmarkStart w:id="31" w:name="_Toc231076995"/>
       <w:r>
         <w:t>3.4 Tratamiento de datos y frecuencias mixtas</w:t>
       </w:r>
@@ -7650,7 +7650,7 @@
       <w:pPr>
         <w:pStyle w:val="Ttulo2"/>
       </w:pPr>
-      <w:bookmarkStart w:id="32" w:name="_Toc231076609"/>
+      <w:bookmarkStart w:id="32" w:name="_Toc231076996"/>
       <w:r>
         <w:t>3.5 Datación de las fases del ciclo del cobre</w:t>
       </w:r>
@@ -7717,7 +7717,7 @@
       <w:pPr>
         <w:pStyle w:val="Ttulo2"/>
       </w:pPr>
-      <w:bookmarkStart w:id="33" w:name="_Toc231076610"/>
+      <w:bookmarkStart w:id="33" w:name="_Toc231076997"/>
       <w:r>
         <w:t>3.6 Estrategia econométrica</w:t>
       </w:r>
@@ -7727,7 +7727,7 @@
       <w:pPr>
         <w:pStyle w:val="Ttulo3"/>
       </w:pPr>
-      <w:bookmarkStart w:id="34" w:name="_Toc231076611"/>
+      <w:bookmarkStart w:id="34" w:name="_Toc231076998"/>
       <w:r>
         <w:t>3.6.1 Estacionariedad y orden de integración (OE1)</w:t>
       </w:r>
@@ -7767,7 +7767,7 @@
       <w:pPr>
         <w:pStyle w:val="Ttulo3"/>
       </w:pPr>
-      <w:bookmarkStart w:id="35" w:name="_Toc231076612"/>
+      <w:bookmarkStart w:id="35" w:name="_Toc231076999"/>
       <w:r>
         <w:t>3.6.2 Modelo de impacto: panel de efectos fijos (OE2)</w:t>
       </w:r>
@@ -7858,7 +7858,7 @@
       <w:pPr>
         <w:pStyle w:val="Ttulo3"/>
       </w:pPr>
-      <w:bookmarkStart w:id="36" w:name="_Toc231076613"/>
+      <w:bookmarkStart w:id="36" w:name="_Toc231077000"/>
       <w:r>
         <w:t>3.6.3 Relaciones de largo plazo: cointegración (OE3)</w:t>
       </w:r>
@@ -7934,7 +7934,7 @@
       <w:pPr>
         <w:pStyle w:val="Ttulo3"/>
       </w:pPr>
-      <w:bookmarkStart w:id="37" w:name="_Toc231076614"/>
+      <w:bookmarkStart w:id="37" w:name="_Toc231077001"/>
       <w:r>
         <w:t>3.6.4 Dinámica de shocks: VAR, impulso-respuesta y descomposición de varianza (OE4)</w:t>
       </w:r>
@@ -8022,7 +8022,7 @@
       <w:pPr>
         <w:pStyle w:val="Ttulo3"/>
       </w:pPr>
-      <w:bookmarkStart w:id="38" w:name="_Toc231076615"/>
+      <w:bookmarkStart w:id="38" w:name="_Toc231077002"/>
       <w:r>
         <w:t>3.6.5 Estabilidad por fases del ciclo (OE5)</w:t>
       </w:r>
@@ -8069,7 +8069,7 @@
       <w:pPr>
         <w:pStyle w:val="Ttulo3"/>
       </w:pPr>
-      <w:bookmarkStart w:id="39" w:name="_Toc231076616"/>
+      <w:bookmarkStart w:id="39" w:name="_Toc231077003"/>
       <w:r>
         <w:t>3.6.6 Comparación entre mercados: triangulación (OE6)</w:t>
       </w:r>
@@ -8122,7 +8122,7 @@
       <w:pPr>
         <w:pStyle w:val="Ttulo2"/>
       </w:pPr>
-      <w:bookmarkStart w:id="40" w:name="_Toc231076617"/>
+      <w:bookmarkStart w:id="40" w:name="_Toc231077004"/>
       <w:r>
         <w:t>3.7 Validación de supuestos y robustez</w:t>
       </w:r>
@@ -8173,7 +8173,7 @@
       <w:pPr>
         <w:pStyle w:val="Ttulo3"/>
       </w:pPr>
-      <w:bookmarkStart w:id="41" w:name="_Toc231076618"/>
+      <w:bookmarkStart w:id="41" w:name="_Toc231077005"/>
       <w:r>
         <w:t>Tabla 3.1 — Definición operativa de variables (resumen)</w:t>
       </w:r>
@@ -8184,7 +8184,7 @@
         <w:pStyle w:val="Descripcin"/>
         <w:jc w:val="center"/>
       </w:pPr>
-      <w:bookmarkStart w:id="42" w:name="_Toc231076634"/>
+      <w:bookmarkStart w:id="42" w:name="_Toc231077021"/>
       <w:r>
         <w:rPr>
           <w:sz w:val="20"/>
@@ -9541,7 +9541,7 @@
       <w:pPr>
         <w:pStyle w:val="Ttulo1"/>
       </w:pPr>
-      <w:bookmarkStart w:id="43" w:name="_Toc231076619"/>
+      <w:bookmarkStart w:id="43" w:name="_Toc231077006"/>
       <w:r>
         <w:lastRenderedPageBreak/>
         <w:t>Capítulo 4 — Resultados y discusión</w:t>
@@ -9552,7 +9552,7 @@
       <w:pPr>
         <w:pStyle w:val="Ttulo2"/>
       </w:pPr>
-      <w:bookmarkStart w:id="44" w:name="_Toc231076620"/>
+      <w:bookmarkStart w:id="44" w:name="_Toc231077007"/>
       <w:r>
         <w:t>4.1 Análisis descriptivo y propiedades de las series (OE1)</w:t>
       </w:r>
@@ -9705,7 +9705,7 @@
       <w:pPr>
         <w:pStyle w:val="Ttulo2"/>
       </w:pPr>
-      <w:bookmarkStart w:id="45" w:name="_Toc231076621"/>
+      <w:bookmarkStart w:id="45" w:name="_Toc231077008"/>
       <w:r>
         <w:t>4.2 Determinantes de los retornos: global vs local (OE2)</w:t>
       </w:r>
@@ -9726,7 +9726,7 @@
         <w:pStyle w:val="Descripcin"/>
         <w:jc w:val="center"/>
       </w:pPr>
-      <w:bookmarkStart w:id="46" w:name="_Toc231076635"/>
+      <w:bookmarkStart w:id="46" w:name="_Toc231077022"/>
       <w:r>
         <w:rPr>
           <w:sz w:val="20"/>
@@ -10325,7 +10325,7 @@
           <w:noProof/>
         </w:rPr>
         <w:drawing>
-          <wp:inline distT="0" distB="0" distL="0" distR="0" wp14:anchorId="22F4AC5E" wp14:editId="1F854FF7">
+          <wp:inline distT="0" distB="0" distL="0" distR="0" wp14:anchorId="4263D607" wp14:editId="0B16B1B9">
             <wp:extent cx="5394960" cy="2933107"/>
             <wp:effectExtent l="0" t="0" r="0" b="0"/>
             <wp:docPr id="1" name="Picture 1"/>
@@ -10366,7 +10366,7 @@
         <w:pStyle w:val="Descripcin"/>
         <w:jc w:val="center"/>
       </w:pPr>
-      <w:bookmarkStart w:id="47" w:name="_Toc231076638"/>
+      <w:bookmarkStart w:id="47" w:name="_Toc231077025"/>
       <w:r>
         <w:rPr>
           <w:sz w:val="20"/>
@@ -10403,7 +10403,7 @@
       <w:pPr>
         <w:pStyle w:val="Ttulo2"/>
       </w:pPr>
-      <w:bookmarkStart w:id="48" w:name="_Toc231076622"/>
+      <w:bookmarkStart w:id="48" w:name="_Toc231077009"/>
       <w:r>
         <w:t>4.3 Relaciones de largo plazo (OE3)</w:t>
       </w:r>
@@ -10460,44 +10460,119 @@
     </w:p>
     <w:p>
       <w:r>
-        <w:t>inestable**. Confirmado ya el orden I(1) del tipo de cambio (§4.1), la explicación más probable no</w:t>
-      </w:r>
-    </w:p>
-    <w:p>
-      <w:r>
-        <w:t xml:space="preserve">es el orden de integración sino la </w:t>
+        <w:t>inestable** ante las pruebas que no admiten quiebres. Confirmado ya el orden I(1) del tipo de cambio</w:t>
+      </w:r>
+    </w:p>
+    <w:p>
+      <w:r>
+        <w:t xml:space="preserve">(§4.1), la hipótesis natural es que la relación de equilibrio se </w:t>
       </w:r>
       <w:r>
         <w:rPr>
           <w:b/>
         </w:rPr>
-        <w:t>presencia de quiebres en la relación de cointegración</w:t>
-      </w:r>
-      <w:r>
-        <w:t xml:space="preserve"> misma</w:t>
-      </w:r>
-    </w:p>
-    <w:p>
-      <w:r>
-        <w:t>(el súper-ciclo altera la relación de equilibrio). La conclusión prudente es **mantener cautela</w:t>
-      </w:r>
-    </w:p>
-    <w:p>
-      <w:r>
-        <w:t>sobre H5**: se reportará la relación de largo plazo del VECM como indicativa, complementándola con</w:t>
-      </w:r>
-    </w:p>
-    <w:p>
-      <w:r>
-        <w:t>pruebas de cointegración con quiebre (Gregory-Hansen) en la versión final.</w:t>
+        <w:t>desplazó estructuralmente</w:t>
+      </w:r>
+    </w:p>
+    <w:p>
+      <w:r>
+        <w:t>durante el período.</w:t>
+      </w:r>
+    </w:p>
+    <w:p>
+      <w:r>
+        <w:t xml:space="preserve">La prueba de </w:t>
+      </w:r>
+      <w:r>
+        <w:rPr>
+          <w:b/>
+        </w:rPr>
+        <w:t>Gregory y Hansen (1996)</w:t>
+      </w:r>
+      <w:r>
+        <w:t>, que admite un quiebre endógeno en la relación de</w:t>
+      </w:r>
+    </w:p>
+    <w:p>
+      <w:r>
+        <w:t xml:space="preserve">cointegración, </w:t>
+      </w:r>
+      <w:r>
+        <w:rPr>
+          <w:b/>
+        </w:rPr>
+        <w:t>confirma esta hipótesis y resuelve la ambigüedad</w:t>
+      </w:r>
+      <w:r>
+        <w:t>: el estadístico ADF\* es de</w:t>
+      </w:r>
+    </w:p>
+    <w:p>
+      <w:r>
+        <w:rPr>
+          <w:b/>
+        </w:rPr>
+        <w:t>−</w:t>
+      </w:r>
+      <w:r>
+        <w:rPr>
+          <w:b/>
+        </w:rPr>
+        <w:t>6,68</w:t>
+      </w:r>
+      <w:r>
+        <w:t>, inferior al valor crítico al 5% (−4,92), de modo que **se rechaza la ausencia de</w:t>
+      </w:r>
+    </w:p>
+    <w:p>
+      <w:r>
+        <w:t>cointegración</w:t>
+      </w:r>
+      <w:r>
+        <w:rPr>
+          <w:b/>
+        </w:rPr>
+        <w:t xml:space="preserve">, y el quiebre se fecha en </w:t>
+      </w:r>
+      <w:r>
+        <w:t>junio de 2008** —coincidente con la crisis financiera</w:t>
+      </w:r>
+    </w:p>
+    <w:p>
+      <w:r>
+        <w:t>global—. La lectura es nítida: **existe una relación de equilibrio de largo plazo entre el valor del</w:t>
+      </w:r>
+    </w:p>
+    <w:p>
+      <w:r>
+        <w:t>sector, el cobre y el tipo de cambio (H5 respaldada), pero esa relación se reconfiguró con la crisis</w:t>
+      </w:r>
+    </w:p>
+    <w:p>
+      <w:r>
+        <w:t xml:space="preserve">de 2008**, lo que </w:t>
+      </w:r>
+      <w:r>
+        <w:t>explica por qué las pruebas que ignoran el quiebre (ARDL/Johansen) arrojaban</w:t>
+      </w:r>
+    </w:p>
+    <w:p>
+      <w:r>
+        <w:t>evidencia mixta. Este resultado ilustra la importancia de incorporar los quiebres estructurales en</w:t>
+      </w:r>
+    </w:p>
+    <w:p>
+      <w:r>
+        <w:t>el análisis de largo plazo de un sector tan expuesto al ciclo del commodity.</w:t>
       </w:r>
     </w:p>
     <w:p>
       <w:pPr>
         <w:pStyle w:val="Ttulo2"/>
       </w:pPr>
-      <w:bookmarkStart w:id="49" w:name="_Toc231076623"/>
-      <w:r>
+      <w:bookmarkStart w:id="49" w:name="_Toc231077010"/>
+      <w:r>
+        <w:lastRenderedPageBreak/>
         <w:t>4.4 Dinámica de shocks (OE4)</w:t>
       </w:r>
       <w:bookmarkEnd w:id="49"/>
@@ -10517,7 +10592,7 @@
         <w:pStyle w:val="Descripcin"/>
         <w:jc w:val="center"/>
       </w:pPr>
-      <w:bookmarkStart w:id="50" w:name="_Toc231076636"/>
+      <w:bookmarkStart w:id="50" w:name="_Toc231077023"/>
       <w:r>
         <w:rPr>
           <w:sz w:val="20"/>
@@ -10722,13 +10797,7 @@
               <w:rPr>
                 <w:sz w:val="20"/>
               </w:rPr>
-              <w:t xml:space="preserve">Tasa </w:t>
-            </w:r>
-            <w:r>
-              <w:rPr>
-                <w:sz w:val="20"/>
-              </w:rPr>
-              <w:t>local</w:t>
+              <w:t>Tasa local</w:t>
             </w:r>
           </w:p>
         </w:tc>
@@ -10788,7 +10857,6 @@
     <w:p/>
     <w:p>
       <w:r>
-        <w:lastRenderedPageBreak/>
         <w:t xml:space="preserve">La causalidad de Granger confirma que el precio del cobre </w:t>
       </w:r>
       <w:r>
@@ -10803,7 +10871,10 @@
     </w:p>
     <w:p>
       <w:r>
-        <w:t>de manera estadísticamente significativa (F = 9,11; p = 0,003). Más allá del componente</w:t>
+        <w:t xml:space="preserve">de manera estadísticamente </w:t>
+      </w:r>
+      <w:r>
+        <w:t>significativa (F = 9,11; p = 0,003). Más allá del componente</w:t>
       </w:r>
     </w:p>
     <w:p>
@@ -10854,8 +10925,9 @@
         <w:rPr>
           <w:noProof/>
         </w:rPr>
+        <w:lastRenderedPageBreak/>
         <w:drawing>
-          <wp:inline distT="0" distB="0" distL="0" distR="0" wp14:anchorId="58598AF3" wp14:editId="7E346C68">
+          <wp:inline distT="0" distB="0" distL="0" distR="0" wp14:anchorId="00ACBE42" wp14:editId="7E0B985B">
             <wp:extent cx="5394960" cy="4026860"/>
             <wp:effectExtent l="0" t="0" r="0" b="0"/>
             <wp:docPr id="2" name="Picture 2"/>
@@ -10896,7 +10968,7 @@
         <w:pStyle w:val="Descripcin"/>
         <w:jc w:val="center"/>
       </w:pPr>
-      <w:bookmarkStart w:id="51" w:name="_Toc231076639"/>
+      <w:bookmarkStart w:id="51" w:name="_Toc231077026"/>
       <w:r>
         <w:rPr>
           <w:sz w:val="20"/>
@@ -10931,7 +11003,6 @@
     </w:p>
     <w:p>
       <w:r>
-        <w:lastRenderedPageBreak/>
         <w:t>La función impulso-respuesta cuantifica la reacción dinámica del retorno ante un shock de una</w:t>
       </w:r>
     </w:p>
@@ -10967,8 +11038,9 @@
         <w:rPr>
           <w:noProof/>
         </w:rPr>
+        <w:lastRenderedPageBreak/>
         <w:drawing>
-          <wp:inline distT="0" distB="0" distL="0" distR="0" wp14:anchorId="3C2FD3B5" wp14:editId="11D99F66">
+          <wp:inline distT="0" distB="0" distL="0" distR="0" wp14:anchorId="1DE0C59C" wp14:editId="5309BBED">
             <wp:extent cx="5394960" cy="2620409"/>
             <wp:effectExtent l="0" t="0" r="0" b="0"/>
             <wp:docPr id="3" name="Picture 3"/>
@@ -11009,7 +11081,7 @@
         <w:pStyle w:val="Descripcin"/>
         <w:jc w:val="center"/>
       </w:pPr>
-      <w:bookmarkStart w:id="52" w:name="_Toc231076640"/>
+      <w:bookmarkStart w:id="52" w:name="_Toc231077027"/>
       <w:r>
         <w:rPr>
           <w:sz w:val="20"/>
@@ -11046,7 +11118,7 @@
       <w:pPr>
         <w:pStyle w:val="Ttulo2"/>
       </w:pPr>
-      <w:bookmarkStart w:id="53" w:name="_Toc231076624"/>
+      <w:bookmarkStart w:id="53" w:name="_Toc231077011"/>
       <w:r>
         <w:t>4.5 Estabilidad por fases del ciclo del cobre (OE5)</w:t>
       </w:r>
@@ -11120,7 +11192,6 @@
     </w:p>
     <w:p>
       <w:r>
-        <w:lastRenderedPageBreak/>
         <w:t>La lectura es que, en esta especificación preliminar, **la sensibilidad de los retornos al precio</w:t>
       </w:r>
     </w:p>
@@ -11152,8 +11223,9 @@
         <w:rPr>
           <w:noProof/>
         </w:rPr>
+        <w:lastRenderedPageBreak/>
         <w:drawing>
-          <wp:inline distT="0" distB="0" distL="0" distR="0" wp14:anchorId="64C4BAF5" wp14:editId="6A453DF7">
+          <wp:inline distT="0" distB="0" distL="0" distR="0" wp14:anchorId="377B4D2A" wp14:editId="104C0479">
             <wp:extent cx="5394960" cy="2449752"/>
             <wp:effectExtent l="0" t="0" r="0" b="0"/>
             <wp:docPr id="4" name="Picture 4"/>
@@ -11194,7 +11266,7 @@
         <w:pStyle w:val="Descripcin"/>
         <w:jc w:val="center"/>
       </w:pPr>
-      <w:bookmarkStart w:id="54" w:name="_Toc231076641"/>
+      <w:bookmarkStart w:id="54" w:name="_Toc231077028"/>
       <w:r>
         <w:rPr>
           <w:sz w:val="20"/>
@@ -11231,9 +11303,12 @@
       <w:pPr>
         <w:pStyle w:val="Ttulo2"/>
       </w:pPr>
-      <w:bookmarkStart w:id="55" w:name="_Toc231076625"/>
-      <w:r>
-        <w:t>4.6 Comparación entre mercados: triangulación (OE6)</w:t>
+      <w:bookmarkStart w:id="55" w:name="_Toc231077012"/>
+      <w:r>
+        <w:t xml:space="preserve">4.6 Comparación entre </w:t>
+      </w:r>
+      <w:r>
+        <w:t>mercados: triangulación (OE6)</w:t>
       </w:r>
       <w:bookmarkEnd w:id="55"/>
     </w:p>
@@ -11252,7 +11327,7 @@
         <w:pStyle w:val="Descripcin"/>
         <w:jc w:val="center"/>
       </w:pPr>
-      <w:bookmarkStart w:id="56" w:name="_Toc231076637"/>
+      <w:bookmarkStart w:id="56" w:name="_Toc231077024"/>
       <w:r>
         <w:rPr>
           <w:sz w:val="20"/>
@@ -11567,7 +11642,6 @@
               <w:rPr>
                 <w:sz w:val="20"/>
               </w:rPr>
-              <w:lastRenderedPageBreak/>
               <w:t>C · minería Chile</w:t>
             </w:r>
           </w:p>
@@ -11641,10 +11715,7 @@
     <w:p/>
     <w:p>
       <w:r>
-        <w:t xml:space="preserve">Dos hallazgos </w:t>
-      </w:r>
-      <w:r>
-        <w:t>preliminares:</w:t>
+        <w:t>Dos hallazgos preliminares:</w:t>
       </w:r>
     </w:p>
     <w:p>
@@ -11652,7 +11723,10 @@
         <w:pStyle w:val="Listaconnmeros"/>
       </w:pPr>
       <w:r>
-        <w:t>**La sensibilidad al cobre es similar entre el cobre puro internacional (0,571) y el local</w:t>
+        <w:t xml:space="preserve">**La sensibilidad al cobre es similar entre el cobre puro </w:t>
+      </w:r>
+      <w:r>
+        <w:t>internacional (0,571) y el local</w:t>
       </w:r>
     </w:p>
     <w:p>
@@ -11667,6 +11741,7 @@
     </w:p>
     <w:p>
       <w:r>
+        <w:lastRenderedPageBreak/>
         <w:t xml:space="preserve">   menor sensibilidad de la muestra C se debe a la </w:t>
       </w:r>
       <w:r>
@@ -11693,7 +11768,7 @@
           <w:noProof/>
         </w:rPr>
         <w:drawing>
-          <wp:inline distT="0" distB="0" distL="0" distR="0" wp14:anchorId="7D671B52" wp14:editId="77901CE2">
+          <wp:inline distT="0" distB="0" distL="0" distR="0" wp14:anchorId="4F5462FC" wp14:editId="73662CE5">
             <wp:extent cx="5394960" cy="2718240"/>
             <wp:effectExtent l="0" t="0" r="0" b="0"/>
             <wp:docPr id="5" name="Picture 5"/>
@@ -11734,7 +11809,7 @@
         <w:pStyle w:val="Descripcin"/>
         <w:jc w:val="center"/>
       </w:pPr>
-      <w:bookmarkStart w:id="57" w:name="_Toc231076642"/>
+      <w:bookmarkStart w:id="57" w:name="_Toc231077029"/>
       <w:r>
         <w:rPr>
           <w:sz w:val="20"/>
@@ -11796,7 +11871,6 @@
     </w:p>
     <w:p>
       <w:r>
-        <w:lastRenderedPageBreak/>
         <w:t xml:space="preserve">   modesta y requiere confirmación con el conjunto de datos completo y pruebas formales de igualdad</w:t>
       </w:r>
     </w:p>
@@ -11809,7 +11883,7 @@
       <w:pPr>
         <w:pStyle w:val="Ttulo2"/>
       </w:pPr>
-      <w:bookmarkStart w:id="58" w:name="_Toc231076626"/>
+      <w:bookmarkStart w:id="58" w:name="_Toc231077013"/>
       <w:r>
         <w:t>4.7 Diagnósticos y robustez</w:t>
       </w:r>
@@ -11842,19 +11916,14 @@
     </w:p>
     <w:p>
       <w:r>
+        <w:lastRenderedPageBreak/>
         <w:t xml:space="preserve">Este resultado </w:t>
       </w:r>
       <w:r>
         <w:rPr>
           <w:b/>
         </w:rPr>
-        <w:t xml:space="preserve">valida la elección </w:t>
-      </w:r>
-      <w:r>
-        <w:rPr>
-          <w:b/>
-        </w:rPr>
-        <w:t>metodológica</w:t>
+        <w:t>valida la elección metodológica</w:t>
       </w:r>
       <w:r>
         <w:t xml:space="preserve"> de errores estándar de Driscoll-Kraay: las</w:t>
@@ -11932,12 +12001,73 @@
       </w:r>
     </w:p>
     <w:p>
+      <w:r>
+        <w:rPr>
+          <w:b/>
+        </w:rPr>
+        <w:t>Volatilidad condicional (GARCH).</w:t>
+      </w:r>
+      <w:r>
+        <w:t xml:space="preserve"> La prueba ARCH-LM rechaza con holgura la ausencia de efectos</w:t>
+      </w:r>
+    </w:p>
+    <w:p>
+      <w:r>
+        <w:t>de heterocedasticidad condicional (estadístico 41,1; p = 0,000), lo que justifica modelar la</w:t>
+      </w:r>
+    </w:p>
+    <w:p>
+      <w:r>
+        <w:t>varianza con un GARCH(1,1). El modelo estimado sobre los retornos de la cartera arroja una</w:t>
+      </w:r>
+    </w:p>
+    <w:p>
+      <w:r>
+        <w:rPr>
+          <w:b/>
+        </w:rPr>
+        <w:t>persistencia de la volatilidad de 0,86</w:t>
+      </w:r>
+      <w:r>
+        <w:t xml:space="preserve"> (α = 0,15; β = 0,70), indicativa de **agrupamiento de</w:t>
+      </w:r>
+    </w:p>
+    <w:p>
+      <w:r>
+        <w:t>volatilidad**: los episodios de alta volatilidad —como las crisis— tienden a prolongarse. La</w:t>
+      </w:r>
+    </w:p>
+    <w:p>
+      <w:r>
+        <w:t xml:space="preserve">distribución t estimada (ν ≈ 12) confirma además la presencia de </w:t>
+      </w:r>
+      <w:r>
+        <w:rPr>
+          <w:b/>
+        </w:rPr>
+        <w:t>colas más pesadas</w:t>
+      </w:r>
+      <w:r>
+        <w:t xml:space="preserve"> que la</w:t>
+      </w:r>
+    </w:p>
+    <w:p>
+      <w:r>
+        <w:lastRenderedPageBreak/>
+        <w:t>normal, característica de los retornos financieros. Este resultado respalda la decisión de</w:t>
+      </w:r>
+    </w:p>
+    <w:p>
+      <w:r>
+        <w:t>winsorizar y de tratar con cautela la inferencia basada en supuestos gaussianos.</w:t>
+      </w:r>
+    </w:p>
+    <w:p>
       <w:pPr>
         <w:pStyle w:val="Ttulo2"/>
       </w:pPr>
-      <w:bookmarkStart w:id="59" w:name="_Toc231076627"/>
-      <w:r>
-        <w:lastRenderedPageBreak/>
+      <w:bookmarkStart w:id="59" w:name="_Toc231077014"/>
+      <w:r>
         <w:t>4.8 Discusión integrada</w:t>
       </w:r>
       <w:bookmarkEnd w:id="59"/>
@@ -11949,7 +12079,10 @@
     </w:p>
     <w:p>
       <w:r>
-        <w:t>principal determinante de los retornos del sector** (H1), con un efecto positivo, significativo,</w:t>
+        <w:t xml:space="preserve">principal determinante de los </w:t>
+      </w:r>
+      <w:r>
+        <w:t>retornos del sector** (H1), con un efecto positivo, significativo,</w:t>
       </w:r>
     </w:p>
     <w:p>
@@ -11995,28 +12128,31 @@
         <w:t>transmisión diferenciada</w:t>
       </w:r>
       <w:r>
-        <w:t xml:space="preserve"> (H7), mientras que la evidencia de </w:t>
+        <w:t xml:space="preserve"> (H7); y la </w:t>
       </w:r>
       <w:r>
         <w:rPr>
           <w:b/>
         </w:rPr>
-        <w:t>cointegración de largo plazo</w:t>
-      </w:r>
-    </w:p>
-    <w:p>
-      <w:r>
-        <w:t>(H5) resulta mixta, lo que sugiere una relación de equilibrio débil o afectada por quiebres. La</w:t>
-      </w:r>
-    </w:p>
-    <w:p>
-      <w:r>
-        <w:t>fuerte dependencia de sección cruzada detectada (§4.7) confirma, además, la pertinencia del</w:t>
-      </w:r>
-    </w:p>
-    <w:p>
-      <w:r>
-        <w:t>tratamiento econométrico adoptado.</w:t>
+        <w:t>relación de cointegración de largo plazo</w:t>
+      </w:r>
+      <w:r>
+        <w:t xml:space="preserve"> (H5) **se</w:t>
+      </w:r>
+    </w:p>
+    <w:p>
+      <w:r>
+        <w:t>confirma una vez que se admite un quiebre estructural** en 2008 (Gregory-Hansen), lo que reconcilia</w:t>
+      </w:r>
+    </w:p>
+    <w:p>
+      <w:r>
+        <w:t>la evidencia inicialmente mixta. La fuerte dependencia de sección cruzada detectada (§4.7) confirma,</w:t>
+      </w:r>
+    </w:p>
+    <w:p>
+      <w:r>
+        <w:t>además, la pertinencia del tratamiento econométrico adoptado.</w:t>
       </w:r>
     </w:p>
     <w:p>
@@ -12030,38 +12166,85 @@
         <w:t>provisionales</w:t>
       </w:r>
       <w:r>
-        <w:t>. Su elevación a la categoría de hallazgos definitivos exige</w:t>
-      </w:r>
-    </w:p>
-    <w:p>
-      <w:r>
-        <w:t>todavía: (i) incorporar el EMBI y los controles a nivel de empresa; (ii) reespecificar la relación</w:t>
-      </w:r>
-    </w:p>
-    <w:p>
-      <w:r>
-        <w:t>de largo plazo con pruebas de cointegración con quiebre (Gregory-Hansen); (iii) modelar la</w:t>
-      </w:r>
-    </w:p>
-    <w:p>
-      <w:r>
-        <w:t>volatilidad condicional (efectos ARCH/GARCH); y (iv) formalizar la comparación entre mercados con</w:t>
-      </w:r>
-    </w:p>
-    <w:p>
-      <w:r>
-        <w:t>pruebas de igualdad de coeficientes. Los componentes ya ejecutados —resolución del orden de</w:t>
+        <w:t xml:space="preserve"> en un único sentido acotado: su elevación a hallazgos</w:t>
+      </w:r>
+    </w:p>
+    <w:p>
+      <w:r>
+        <w:t xml:space="preserve">plenamente definitivos exige todavía (i) incorporar el </w:t>
+      </w:r>
+      <w:r>
+        <w:rPr>
+          <w:b/>
+        </w:rPr>
+        <w:t>EMBI</w:t>
+      </w:r>
+      <w:r>
+        <w:t xml:space="preserve"> y los **controles a nivel de</w:t>
+      </w:r>
+    </w:p>
+    <w:p>
+      <w:r>
+        <w:t>empresa</w:t>
+      </w:r>
+      <w:r>
+        <w:rPr>
+          <w:b/>
+        </w:rPr>
+        <w:t xml:space="preserve">, y (ii) formalizar la comparación entre mercados con </w:t>
+      </w:r>
+      <w:r>
+        <w:t>pruebas de igualdad de</w:t>
+      </w:r>
+    </w:p>
+    <w:p>
+      <w:r>
+        <w:t>coeficientes</w:t>
+      </w:r>
+      <w:r>
+        <w:rPr>
+          <w:b/>
+        </w:rPr>
+        <w:t xml:space="preserve"> entre muestras. En cambio, el grueso del aparato econométrico </w:t>
+      </w:r>
+      <w:r>
+        <w:t>ya está ejecutado y</w:t>
       </w:r>
     </w:p>
     <w:p>
       <w:r>
         <w:lastRenderedPageBreak/>
-        <w:t>integración, interacciones por ciclo, diagnósticos de panel y VAR, y robustez por subperíodos—</w:t>
-      </w:r>
-    </w:p>
-    <w:p>
-      <w:r>
-        <w:t>confieren, no obstante, una base empírica sólida a las conclusiones provisionales.</w:t>
+        <w:t>es concluyente**: la resolución del orden de integración (Zivot-Andrews), las interacciones por</w:t>
+      </w:r>
+    </w:p>
+    <w:p>
+      <w:r>
+        <w:t>ciclo (OE5), los diagnósticos de panel y VAR (CD de Pesaran, estabilidad), la robustez por</w:t>
+      </w:r>
+    </w:p>
+    <w:p>
+      <w:r>
+        <w:t xml:space="preserve">subperíodos, la </w:t>
+      </w:r>
+      <w:r>
+        <w:rPr>
+          <w:b/>
+        </w:rPr>
+        <w:t>cointegración con quiebre</w:t>
+      </w:r>
+      <w:r>
+        <w:t xml:space="preserve"> (Gregory-Hansen) y la </w:t>
+      </w:r>
+      <w:r>
+        <w:rPr>
+          <w:b/>
+        </w:rPr>
+        <w:t>volatilidad condicional</w:t>
+      </w:r>
+    </w:p>
+    <w:p>
+      <w:r>
+        <w:t>(GARCH) confieren una base empírica sólida a las conclusiones aquí presentadas.</w:t>
       </w:r>
     </w:p>
     <w:p>
@@ -12073,7 +12256,7 @@
       <w:pPr>
         <w:pStyle w:val="Ttulo1"/>
       </w:pPr>
-      <w:bookmarkStart w:id="60" w:name="_Toc231076628"/>
+      <w:bookmarkStart w:id="60" w:name="_Toc231077015"/>
       <w:r>
         <w:lastRenderedPageBreak/>
         <w:t>Capítulo 5 — Conclusiones</w:t>
@@ -12084,7 +12267,7 @@
       <w:pPr>
         <w:pStyle w:val="Ttulo2"/>
       </w:pPr>
-      <w:bookmarkStart w:id="61" w:name="_Toc231076629"/>
+      <w:bookmarkStart w:id="61" w:name="_Toc231077016"/>
       <w:r>
         <w:t>5.1 Síntesis de los hallazgos</w:t>
       </w:r>
@@ -12102,10 +12285,7 @@
     </w:p>
     <w:p>
       <w:r>
-        <w:t xml:space="preserve">el período 2004–2024, contrastando su </w:t>
-      </w:r>
-      <w:r>
-        <w:t>transmisión entre el mercado bursátil internacional y el</w:t>
+        <w:t>el período 2004–2024, contrastando su transmisión entre el mercado bursátil internacional y el</w:t>
       </w:r>
     </w:p>
     <w:p>
@@ -12145,7 +12325,13 @@
         <w:rPr>
           <w:b/>
         </w:rPr>
-        <w:t>tipo de cambio</w:t>
+        <w:t xml:space="preserve">tipo de </w:t>
+      </w:r>
+      <w:r>
+        <w:rPr>
+          <w:b/>
+        </w:rPr>
+        <w:t>cambio</w:t>
       </w:r>
       <w:r>
         <w:t xml:space="preserve"> exhibe un efecto negativo significativo, cuyo signo refleja la doble</w:t>
@@ -12163,10 +12349,7 @@
     </w:p>
     <w:p>
       <w:r>
-        <w:t xml:space="preserve">diferenciada** entre mercados: la </w:t>
-      </w:r>
-      <w:r>
-        <w:t>sensibilidad al cobre es comparable entre el cobre puro</w:t>
+        <w:t>diferenciada** entre mercados: la sensibilidad al cobre es comparable entre el cobre puro</w:t>
       </w:r>
     </w:p>
     <w:p>
@@ -12183,7 +12366,7 @@
       <w:pPr>
         <w:pStyle w:val="Ttulo2"/>
       </w:pPr>
-      <w:bookmarkStart w:id="62" w:name="_Toc231076630"/>
+      <w:bookmarkStart w:id="62" w:name="_Toc231077017"/>
       <w:r>
         <w:lastRenderedPageBreak/>
         <w:t>5.2 Implicancias</w:t>
@@ -12256,7 +12439,7 @@
       <w:pPr>
         <w:pStyle w:val="Ttulo2"/>
       </w:pPr>
-      <w:bookmarkStart w:id="63" w:name="_Toc231076631"/>
+      <w:bookmarkStart w:id="63" w:name="_Toc231077018"/>
       <w:r>
         <w:t>5.3 Limitaciones</w:t>
       </w:r>
@@ -12306,7 +12489,7 @@
       <w:pPr>
         <w:pStyle w:val="Ttulo2"/>
       </w:pPr>
-      <w:bookmarkStart w:id="64" w:name="_Toc231076632"/>
+      <w:bookmarkStart w:id="64" w:name="_Toc231077019"/>
       <w:r>
         <w:t>5.4 Líneas futuras de investigación</w:t>
       </w:r>
@@ -12342,7 +12525,7 @@
       <w:pPr>
         <w:pStyle w:val="Ttulo1"/>
       </w:pPr>
-      <w:bookmarkStart w:id="65" w:name="_Toc231076633"/>
+      <w:bookmarkStart w:id="65" w:name="_Toc231077020"/>
       <w:r>
         <w:lastRenderedPageBreak/>
         <w:t>Referencias</w:t>
@@ -12351,7 +12534,10 @@
     </w:p>
     <w:p>
       <w:r>
-        <w:t>Adler, M., &amp; Dumas, B. (1984). Exposure to currency risk: Definition and measurement. *Financial Management*, 13(2), 41–50.</w:t>
+        <w:t xml:space="preserve">Adler, M., &amp; Dumas, B. </w:t>
+      </w:r>
+      <w:r>
+        <w:t>(1984). Exposure to currency risk: Definition and measurement. *Financial Management*, 13(2), 41–50.</w:t>
       </w:r>
     </w:p>
     <w:p>
@@ -12462,10 +12648,7 @@
     </w:p>
     <w:p>
       <w:r>
-        <w:t xml:space="preserve">Kwiatkowski, D., Phillips, P. C. B., </w:t>
-      </w:r>
-      <w:r>
-        <w:t>Schmidt, P., &amp; Shin, Y. (1992). Testing the null hypothesis of stationarity against the alternative of a unit root. *Journal of Econometrics*, 54(1–3), 159–178.</w:t>
+        <w:t>Kwiatkowski, D., Phillips, P. C. B., Schmidt, P., &amp; Shin, Y. (1992). Testing the null hypothesis of stationarity against the alternative of a unit root. *Journal of Econometrics*, 54(1–3), 159–178.</w:t>
       </w:r>
     </w:p>
     <w:p>
@@ -12481,10 +12664,7 @@
     <w:p>
       <w:r>
         <w:lastRenderedPageBreak/>
-        <w:t xml:space="preserve">Pesaran, M. H., Shin, Y., &amp; Smith, R. J. (2001). Bounds </w:t>
-      </w:r>
-      <w:r>
-        <w:t>testing approaches to the analysis of level relationships. *Journal of Applied Econometrics*, 16(3), 289–326.</w:t>
+        <w:t>Pesaran, M. H., Shin, Y., &amp; Smith, R. J. (2001). Bounds testing approaches to the analysis of level relationships. *Journal of Applied Econometrics*, 16(3), 289–326.</w:t>
       </w:r>
     </w:p>
     <w:p>
@@ -12514,7 +12694,10 @@
     </w:p>
     <w:p>
       <w:r>
-        <w:t>Zivot, E., &amp; Andrews, D. W. K. (1992). Further evidence on the great crash, the oil-price shock, and the unit-root hypothesis. *Journal of Business &amp; Economic Statistics*, 10(3), 251–270.</w:t>
+        <w:t xml:space="preserve">Zivot, E., &amp; Andrews, D. W. K. (1992). Further evidence on the </w:t>
+      </w:r>
+      <w:r>
+        <w:t>great crash, the oil-price shock, and the unit-root hypothesis. *Journal of Business &amp; Economic Statistics*, 10(3), 251–270.</w:t>
       </w:r>
     </w:p>
     <w:sectPr>
@@ -12835,31 +13018,31 @@
       </w:rPr>
     </w:lvl>
   </w:abstractNum>
-  <w:num w:numId="1" w16cid:durableId="1301764952">
+  <w:num w:numId="1" w16cid:durableId="383873838">
     <w:abstractNumId w:val="8"/>
   </w:num>
-  <w:num w:numId="2" w16cid:durableId="820120886">
+  <w:num w:numId="2" w16cid:durableId="1164054738">
     <w:abstractNumId w:val="6"/>
   </w:num>
-  <w:num w:numId="3" w16cid:durableId="584647878">
+  <w:num w:numId="3" w16cid:durableId="202327525">
     <w:abstractNumId w:val="5"/>
   </w:num>
-  <w:num w:numId="4" w16cid:durableId="1539859264">
+  <w:num w:numId="4" w16cid:durableId="929505453">
     <w:abstractNumId w:val="4"/>
   </w:num>
-  <w:num w:numId="5" w16cid:durableId="625622109">
+  <w:num w:numId="5" w16cid:durableId="2143185618">
     <w:abstractNumId w:val="7"/>
   </w:num>
-  <w:num w:numId="6" w16cid:durableId="1143932591">
+  <w:num w:numId="6" w16cid:durableId="1555699264">
     <w:abstractNumId w:val="3"/>
   </w:num>
-  <w:num w:numId="7" w16cid:durableId="1158883493">
+  <w:num w:numId="7" w16cid:durableId="661083132">
     <w:abstractNumId w:val="2"/>
   </w:num>
-  <w:num w:numId="8" w16cid:durableId="1754012807">
+  <w:num w:numId="8" w16cid:durableId="945579513">
     <w:abstractNumId w:val="1"/>
   </w:num>
-  <w:num w:numId="9" w16cid:durableId="1793208341">
+  <w:num w:numId="9" w16cid:durableId="1969241515">
     <w:abstractNumId w:val="0"/>
   </w:num>
 </w:numbering>
@@ -24251,7 +24434,7 @@
     <w:autoRedefine/>
     <w:uiPriority w:val="39"/>
     <w:unhideWhenUsed/>
-    <w:rsid w:val="00C92924"/>
+    <w:rsid w:val="007D550A"/>
     <w:pPr>
       <w:spacing w:after="100"/>
     </w:pPr>
@@ -24263,7 +24446,7 @@
     <w:autoRedefine/>
     <w:uiPriority w:val="39"/>
     <w:unhideWhenUsed/>
-    <w:rsid w:val="00C92924"/>
+    <w:rsid w:val="007D550A"/>
     <w:pPr>
       <w:spacing w:after="100"/>
       <w:ind w:left="240"/>
@@ -24276,7 +24459,7 @@
     <w:autoRedefine/>
     <w:uiPriority w:val="39"/>
     <w:unhideWhenUsed/>
-    <w:rsid w:val="00C92924"/>
+    <w:rsid w:val="007D550A"/>
     <w:pPr>
       <w:spacing w:after="100"/>
       <w:ind w:left="480"/>
@@ -24287,7 +24470,7 @@
     <w:basedOn w:val="Fuentedeprrafopredeter"/>
     <w:uiPriority w:val="99"/>
     <w:unhideWhenUsed/>
-    <w:rsid w:val="00C92924"/>
+    <w:rsid w:val="007D550A"/>
     <w:rPr>
       <w:color w:val="0000FF" w:themeColor="hyperlink"/>
       <w:u w:val="single"/>
@@ -24299,7 +24482,7 @@
     <w:next w:val="Normal"/>
     <w:uiPriority w:val="99"/>
     <w:unhideWhenUsed/>
-    <w:rsid w:val="00C92924"/>
+    <w:rsid w:val="007D550A"/>
     <w:pPr>
       <w:spacing w:after="0"/>
     </w:pPr>

</xml_diff>

<commit_message>
Expansión mayor: investigación real integrada, robustez avanzada, PPT y separación de la plataforma
- Separación: web/ movido a repo independiente (TESIS-FRANCISCO-PLATAFORMA); el pipeline
  escribe datos a la plataforma vía config.WEB_DATA
- Investigación (agentes): literatura chilena (Zurita-Fuentes-Gregoire 2005, Pincheira-Hardy
  2019, Labbé-De Gregorio, Pedersen 2015) y emergentes integrada en Cap.2; vacío documentado
- Mejoras metodológicas reales: FDR (Benjamini-Hochberg), betas estandarizados, GJR-GARCH
  (apalancamiento), Local Projections (Jordà) -> src/robustness_extra.py + Cap.4 §4.7
- Anexos A-H con tablas reales (src/full_tables.py), glosario, marco teórico formalizado
- build_pptx.py: presentación de defensa (12 diapositivas) con figuras reales
- Tesis: 67 págs, 14 tablas, 6 figuras + referencias APA ampliadas

Co-Authored-By: Claude Opus 4.8 <noreply@anthropic.com>
</commit_message>
<xml_diff>
--- a/outputs/Tesis_Francisco_Rietta.docx
+++ b/outputs/Tesis_Francisco_Rietta.docx
@@ -91,7 +91,7 @@
       <w:pPr>
         <w:pStyle w:val="Ttulo1"/>
       </w:pPr>
-      <w:bookmarkStart w:id="0" w:name="_Toc231079574"/>
+      <w:bookmarkStart w:id="0" w:name="_Toc231081529"/>
       <w:r>
         <w:lastRenderedPageBreak/>
         <w:t>Página de aprobación</w:t>
@@ -172,7 +172,7 @@
       <w:pPr>
         <w:pStyle w:val="Ttulo1"/>
       </w:pPr>
-      <w:bookmarkStart w:id="1" w:name="_Toc231079575"/>
+      <w:bookmarkStart w:id="1" w:name="_Toc231081530"/>
       <w:r>
         <w:lastRenderedPageBreak/>
         <w:t>Declaración de originalidad</w:t>
@@ -211,7 +211,7 @@
       <w:pPr>
         <w:pStyle w:val="Ttulo1"/>
       </w:pPr>
-      <w:bookmarkStart w:id="2" w:name="_Toc231079576"/>
+      <w:bookmarkStart w:id="2" w:name="_Toc231081531"/>
       <w:r>
         <w:lastRenderedPageBreak/>
         <w:t>Dedicatoria</w:t>
@@ -247,7 +247,7 @@
       <w:pPr>
         <w:pStyle w:val="Ttulo1"/>
       </w:pPr>
-      <w:bookmarkStart w:id="3" w:name="_Toc231079577"/>
+      <w:bookmarkStart w:id="3" w:name="_Toc231081532"/>
       <w:r>
         <w:lastRenderedPageBreak/>
         <w:t>Agradecimientos</w:t>
@@ -271,7 +271,7 @@
       <w:pPr>
         <w:pStyle w:val="Ttulo1"/>
       </w:pPr>
-      <w:bookmarkStart w:id="4" w:name="_Toc231079578"/>
+      <w:bookmarkStart w:id="4" w:name="_Toc231081533"/>
       <w:r>
         <w:lastRenderedPageBreak/>
         <w:t>Resumen</w:t>
@@ -306,7 +306,7 @@
       <w:pPr>
         <w:pStyle w:val="Ttulo1"/>
       </w:pPr>
-      <w:bookmarkStart w:id="5" w:name="_Toc231079579"/>
+      <w:bookmarkStart w:id="5" w:name="_Toc231081534"/>
       <w:r>
         <w:lastRenderedPageBreak/>
         <w:t>Abstract</w:t>
@@ -341,7 +341,7 @@
       <w:pPr>
         <w:pStyle w:val="Ttulo1"/>
       </w:pPr>
-      <w:bookmarkStart w:id="6" w:name="_Toc231079580"/>
+      <w:bookmarkStart w:id="6" w:name="_Toc231081535"/>
       <w:r>
         <w:lastRenderedPageBreak/>
         <w:t>Índice general</w:t>
@@ -372,7 +372,7 @@
       <w:r>
         <w:fldChar w:fldCharType="separate"/>
       </w:r>
-      <w:hyperlink w:anchor="_Toc231079574" w:history="1">
+      <w:hyperlink w:anchor="_Toc231081529" w:history="1">
         <w:r>
           <w:rPr>
             <w:rStyle w:val="Hipervnculo"/>
@@ -399,7 +399,7 @@
             <w:noProof/>
             <w:webHidden/>
           </w:rPr>
-          <w:instrText xml:space="preserve"> PAGEREF _Toc231079574 \h </w:instrText>
+          <w:instrText xml:space="preserve"> PAGEREF _Toc231081529 \h </w:instrText>
         </w:r>
         <w:r>
           <w:rPr>
@@ -445,7 +445,7 @@
           <w14:ligatures w14:val="standardContextual"/>
         </w:rPr>
       </w:pPr>
-      <w:hyperlink w:anchor="_Toc231079575" w:history="1">
+      <w:hyperlink w:anchor="_Toc231081530" w:history="1">
         <w:r>
           <w:rPr>
             <w:rStyle w:val="Hipervnculo"/>
@@ -472,7 +472,7 @@
             <w:noProof/>
             <w:webHidden/>
           </w:rPr>
-          <w:instrText xml:space="preserve"> PAGEREF _Toc231079575 \h </w:instrText>
+          <w:instrText xml:space="preserve"> PAGEREF _Toc231081530 \h </w:instrText>
         </w:r>
         <w:r>
           <w:rPr>
@@ -518,7 +518,7 @@
           <w14:ligatures w14:val="standardContextual"/>
         </w:rPr>
       </w:pPr>
-      <w:hyperlink w:anchor="_Toc231079576" w:history="1">
+      <w:hyperlink w:anchor="_Toc231081531" w:history="1">
         <w:r>
           <w:rPr>
             <w:rStyle w:val="Hipervnculo"/>
@@ -545,7 +545,7 @@
             <w:noProof/>
             <w:webHidden/>
           </w:rPr>
-          <w:instrText xml:space="preserve"> PAGEREF _Toc231079576 \h </w:instrText>
+          <w:instrText xml:space="preserve"> PAGEREF _Toc231081531 \h </w:instrText>
         </w:r>
         <w:r>
           <w:rPr>
@@ -591,7 +591,7 @@
           <w14:ligatures w14:val="standardContextual"/>
         </w:rPr>
       </w:pPr>
-      <w:hyperlink w:anchor="_Toc231079577" w:history="1">
+      <w:hyperlink w:anchor="_Toc231081532" w:history="1">
         <w:r>
           <w:rPr>
             <w:rStyle w:val="Hipervnculo"/>
@@ -618,7 +618,7 @@
             <w:noProof/>
             <w:webHidden/>
           </w:rPr>
-          <w:instrText xml:space="preserve"> PAGEREF _Toc231079577 \h </w:instrText>
+          <w:instrText xml:space="preserve"> PAGEREF _Toc231081532 \h </w:instrText>
         </w:r>
         <w:r>
           <w:rPr>
@@ -664,7 +664,7 @@
           <w14:ligatures w14:val="standardContextual"/>
         </w:rPr>
       </w:pPr>
-      <w:hyperlink w:anchor="_Toc231079578" w:history="1">
+      <w:hyperlink w:anchor="_Toc231081533" w:history="1">
         <w:r>
           <w:rPr>
             <w:rStyle w:val="Hipervnculo"/>
@@ -691,7 +691,7 @@
             <w:noProof/>
             <w:webHidden/>
           </w:rPr>
-          <w:instrText xml:space="preserve"> PAGEREF _Toc231079578 \h </w:instrText>
+          <w:instrText xml:space="preserve"> PAGEREF _Toc231081533 \h </w:instrText>
         </w:r>
         <w:r>
           <w:rPr>
@@ -737,7 +737,7 @@
           <w14:ligatures w14:val="standardContextual"/>
         </w:rPr>
       </w:pPr>
-      <w:hyperlink w:anchor="_Toc231079579" w:history="1">
+      <w:hyperlink w:anchor="_Toc231081534" w:history="1">
         <w:r>
           <w:rPr>
             <w:rStyle w:val="Hipervnculo"/>
@@ -764,7 +764,7 @@
             <w:noProof/>
             <w:webHidden/>
           </w:rPr>
-          <w:instrText xml:space="preserve"> PAGEREF _Toc231079579 \h </w:instrText>
+          <w:instrText xml:space="preserve"> PAGEREF _Toc231081534 \h </w:instrText>
         </w:r>
         <w:r>
           <w:rPr>
@@ -810,7 +810,7 @@
           <w14:ligatures w14:val="standardContextual"/>
         </w:rPr>
       </w:pPr>
-      <w:hyperlink w:anchor="_Toc231079580" w:history="1">
+      <w:hyperlink w:anchor="_Toc231081535" w:history="1">
         <w:r>
           <w:rPr>
             <w:rStyle w:val="Hipervnculo"/>
@@ -837,7 +837,7 @@
             <w:noProof/>
             <w:webHidden/>
           </w:rPr>
-          <w:instrText xml:space="preserve"> PAGEREF _Toc231079580 \h </w:instrText>
+          <w:instrText xml:space="preserve"> PAGEREF _Toc231081535 \h </w:instrText>
         </w:r>
         <w:r>
           <w:rPr>
@@ -883,7 +883,7 @@
           <w14:ligatures w14:val="standardContextual"/>
         </w:rPr>
       </w:pPr>
-      <w:hyperlink w:anchor="_Toc231079581" w:history="1">
+      <w:hyperlink w:anchor="_Toc231081536" w:history="1">
         <w:r>
           <w:rPr>
             <w:rStyle w:val="Hipervnculo"/>
@@ -910,7 +910,7 @@
             <w:noProof/>
             <w:webHidden/>
           </w:rPr>
-          <w:instrText xml:space="preserve"> PAGEREF _Toc231079581 \h </w:instrText>
+          <w:instrText xml:space="preserve"> PAGEREF _Toc231081536 \h </w:instrText>
         </w:r>
         <w:r>
           <w:rPr>
@@ -956,7 +956,7 @@
           <w14:ligatures w14:val="standardContextual"/>
         </w:rPr>
       </w:pPr>
-      <w:hyperlink w:anchor="_Toc231079582" w:history="1">
+      <w:hyperlink w:anchor="_Toc231081537" w:history="1">
         <w:r>
           <w:rPr>
             <w:rStyle w:val="Hipervnculo"/>
@@ -983,7 +983,7 @@
             <w:noProof/>
             <w:webHidden/>
           </w:rPr>
-          <w:instrText xml:space="preserve"> PAGEREF _Toc231079582 \h </w:instrText>
+          <w:instrText xml:space="preserve"> PAGEREF _Toc231081537 \h </w:instrText>
         </w:r>
         <w:r>
           <w:rPr>
@@ -1029,7 +1029,7 @@
           <w14:ligatures w14:val="standardContextual"/>
         </w:rPr>
       </w:pPr>
-      <w:hyperlink w:anchor="_Toc231079583" w:history="1">
+      <w:hyperlink w:anchor="_Toc231081538" w:history="1">
         <w:r>
           <w:rPr>
             <w:rStyle w:val="Hipervnculo"/>
@@ -1056,7 +1056,7 @@
             <w:noProof/>
             <w:webHidden/>
           </w:rPr>
-          <w:instrText xml:space="preserve"> PAGEREF _Toc231079583 \h </w:instrText>
+          <w:instrText xml:space="preserve"> PAGEREF _Toc231081538 \h </w:instrText>
         </w:r>
         <w:r>
           <w:rPr>
@@ -1102,7 +1102,7 @@
           <w14:ligatures w14:val="standardContextual"/>
         </w:rPr>
       </w:pPr>
-      <w:hyperlink w:anchor="_Toc231079584" w:history="1">
+      <w:hyperlink w:anchor="_Toc231081539" w:history="1">
         <w:r>
           <w:rPr>
             <w:rStyle w:val="Hipervnculo"/>
@@ -1129,7 +1129,7 @@
             <w:noProof/>
             <w:webHidden/>
           </w:rPr>
-          <w:instrText xml:space="preserve"> PAGEREF _Toc231079584 \h </w:instrText>
+          <w:instrText xml:space="preserve"> PAGEREF _Toc231081539 \h </w:instrText>
         </w:r>
         <w:r>
           <w:rPr>
@@ -1175,7 +1175,7 @@
           <w14:ligatures w14:val="standardContextual"/>
         </w:rPr>
       </w:pPr>
-      <w:hyperlink w:anchor="_Toc231079585" w:history="1">
+      <w:hyperlink w:anchor="_Toc231081540" w:history="1">
         <w:r>
           <w:rPr>
             <w:rStyle w:val="Hipervnculo"/>
@@ -1202,7 +1202,7 @@
             <w:noProof/>
             <w:webHidden/>
           </w:rPr>
-          <w:instrText xml:space="preserve"> PAGEREF _Toc231079585 \h </w:instrText>
+          <w:instrText xml:space="preserve"> PAGEREF _Toc231081540 \h </w:instrText>
         </w:r>
         <w:r>
           <w:rPr>
@@ -1248,7 +1248,7 @@
           <w14:ligatures w14:val="standardContextual"/>
         </w:rPr>
       </w:pPr>
-      <w:hyperlink w:anchor="_Toc231079586" w:history="1">
+      <w:hyperlink w:anchor="_Toc231081541" w:history="1">
         <w:r>
           <w:rPr>
             <w:rStyle w:val="Hipervnculo"/>
@@ -1275,7 +1275,7 @@
             <w:noProof/>
             <w:webHidden/>
           </w:rPr>
-          <w:instrText xml:space="preserve"> PAGEREF _Toc231079586 \h </w:instrText>
+          <w:instrText xml:space="preserve"> PAGEREF _Toc231081541 \h </w:instrText>
         </w:r>
         <w:r>
           <w:rPr>
@@ -1321,7 +1321,7 @@
           <w14:ligatures w14:val="standardContextual"/>
         </w:rPr>
       </w:pPr>
-      <w:hyperlink w:anchor="_Toc231079587" w:history="1">
+      <w:hyperlink w:anchor="_Toc231081542" w:history="1">
         <w:r>
           <w:rPr>
             <w:rStyle w:val="Hipervnculo"/>
@@ -1348,7 +1348,7 @@
             <w:noProof/>
             <w:webHidden/>
           </w:rPr>
-          <w:instrText xml:space="preserve"> PAGEREF _Toc231079587 \h </w:instrText>
+          <w:instrText xml:space="preserve"> PAGEREF _Toc231081542 \h </w:instrText>
         </w:r>
         <w:r>
           <w:rPr>
@@ -1394,7 +1394,7 @@
           <w14:ligatures w14:val="standardContextual"/>
         </w:rPr>
       </w:pPr>
-      <w:hyperlink w:anchor="_Toc231079588" w:history="1">
+      <w:hyperlink w:anchor="_Toc231081543" w:history="1">
         <w:r>
           <w:rPr>
             <w:rStyle w:val="Hipervnculo"/>
@@ -1421,7 +1421,7 @@
             <w:noProof/>
             <w:webHidden/>
           </w:rPr>
-          <w:instrText xml:space="preserve"> PAGEREF _Toc231079588 \h </w:instrText>
+          <w:instrText xml:space="preserve"> PAGEREF _Toc231081543 \h </w:instrText>
         </w:r>
         <w:r>
           <w:rPr>
@@ -1467,7 +1467,7 @@
           <w14:ligatures w14:val="standardContextual"/>
         </w:rPr>
       </w:pPr>
-      <w:hyperlink w:anchor="_Toc231079589" w:history="1">
+      <w:hyperlink w:anchor="_Toc231081544" w:history="1">
         <w:r>
           <w:rPr>
             <w:rStyle w:val="Hipervnculo"/>
@@ -1494,7 +1494,7 @@
             <w:noProof/>
             <w:webHidden/>
           </w:rPr>
-          <w:instrText xml:space="preserve"> PAGEREF _Toc231079589 \h </w:instrText>
+          <w:instrText xml:space="preserve"> PAGEREF _Toc231081544 \h </w:instrText>
         </w:r>
         <w:r>
           <w:rPr>
@@ -1540,7 +1540,7 @@
           <w14:ligatures w14:val="standardContextual"/>
         </w:rPr>
       </w:pPr>
-      <w:hyperlink w:anchor="_Toc231079590" w:history="1">
+      <w:hyperlink w:anchor="_Toc231081545" w:history="1">
         <w:r>
           <w:rPr>
             <w:rStyle w:val="Hipervnculo"/>
@@ -1567,7 +1567,7 @@
             <w:noProof/>
             <w:webHidden/>
           </w:rPr>
-          <w:instrText xml:space="preserve"> PAGEREF _Toc231079590 \h </w:instrText>
+          <w:instrText xml:space="preserve"> PAGEREF _Toc231081545 \h </w:instrText>
         </w:r>
         <w:r>
           <w:rPr>
@@ -1613,7 +1613,7 @@
           <w14:ligatures w14:val="standardContextual"/>
         </w:rPr>
       </w:pPr>
-      <w:hyperlink w:anchor="_Toc231079591" w:history="1">
+      <w:hyperlink w:anchor="_Toc231081546" w:history="1">
         <w:r>
           <w:rPr>
             <w:rStyle w:val="Hipervnculo"/>
@@ -1640,7 +1640,7 @@
             <w:noProof/>
             <w:webHidden/>
           </w:rPr>
-          <w:instrText xml:space="preserve"> PAGEREF _Toc231079591 \h </w:instrText>
+          <w:instrText xml:space="preserve"> PAGEREF _Toc231081546 \h </w:instrText>
         </w:r>
         <w:r>
           <w:rPr>
@@ -1686,7 +1686,7 @@
           <w14:ligatures w14:val="standardContextual"/>
         </w:rPr>
       </w:pPr>
-      <w:hyperlink w:anchor="_Toc231079592" w:history="1">
+      <w:hyperlink w:anchor="_Toc231081547" w:history="1">
         <w:r>
           <w:rPr>
             <w:rStyle w:val="Hipervnculo"/>
@@ -1713,7 +1713,7 @@
             <w:noProof/>
             <w:webHidden/>
           </w:rPr>
-          <w:instrText xml:space="preserve"> PAGEREF _Toc231079592 \h </w:instrText>
+          <w:instrText xml:space="preserve"> PAGEREF _Toc231081547 \h </w:instrText>
         </w:r>
         <w:r>
           <w:rPr>
@@ -1759,7 +1759,7 @@
           <w14:ligatures w14:val="standardContextual"/>
         </w:rPr>
       </w:pPr>
-      <w:hyperlink w:anchor="_Toc231079593" w:history="1">
+      <w:hyperlink w:anchor="_Toc231081548" w:history="1">
         <w:r>
           <w:rPr>
             <w:rStyle w:val="Hipervnculo"/>
@@ -1786,7 +1786,7 @@
             <w:noProof/>
             <w:webHidden/>
           </w:rPr>
-          <w:instrText xml:space="preserve"> PAGEREF _Toc231079593 \h </w:instrText>
+          <w:instrText xml:space="preserve"> PAGEREF _Toc231081548 \h </w:instrText>
         </w:r>
         <w:r>
           <w:rPr>
@@ -1832,7 +1832,7 @@
           <w14:ligatures w14:val="standardContextual"/>
         </w:rPr>
       </w:pPr>
-      <w:hyperlink w:anchor="_Toc231079594" w:history="1">
+      <w:hyperlink w:anchor="_Toc231081549" w:history="1">
         <w:r>
           <w:rPr>
             <w:rStyle w:val="Hipervnculo"/>
@@ -1859,7 +1859,7 @@
             <w:noProof/>
             <w:webHidden/>
           </w:rPr>
-          <w:instrText xml:space="preserve"> PAGEREF _Toc231079594 \h </w:instrText>
+          <w:instrText xml:space="preserve"> PAGEREF _Toc231081549 \h </w:instrText>
         </w:r>
         <w:r>
           <w:rPr>
@@ -1905,7 +1905,7 @@
           <w14:ligatures w14:val="standardContextual"/>
         </w:rPr>
       </w:pPr>
-      <w:hyperlink w:anchor="_Toc231079595" w:history="1">
+      <w:hyperlink w:anchor="_Toc231081550" w:history="1">
         <w:r>
           <w:rPr>
             <w:rStyle w:val="Hipervnculo"/>
@@ -1932,7 +1932,7 @@
             <w:noProof/>
             <w:webHidden/>
           </w:rPr>
-          <w:instrText xml:space="preserve"> PAGEREF _Toc231079595 \h </w:instrText>
+          <w:instrText xml:space="preserve"> PAGEREF _Toc231081550 \h </w:instrText>
         </w:r>
         <w:r>
           <w:rPr>
@@ -1952,7 +1952,7 @@
             <w:noProof/>
             <w:webHidden/>
           </w:rPr>
-          <w:t>10</w:t>
+          <w:t>11</w:t>
         </w:r>
         <w:r>
           <w:rPr>
@@ -1978,7 +1978,7 @@
           <w14:ligatures w14:val="standardContextual"/>
         </w:rPr>
       </w:pPr>
-      <w:hyperlink w:anchor="_Toc231079596" w:history="1">
+      <w:hyperlink w:anchor="_Toc231081551" w:history="1">
         <w:r>
           <w:rPr>
             <w:rStyle w:val="Hipervnculo"/>
@@ -2005,7 +2005,7 @@
             <w:noProof/>
             <w:webHidden/>
           </w:rPr>
-          <w:instrText xml:space="preserve"> PAGEREF _Toc231079596 \h </w:instrText>
+          <w:instrText xml:space="preserve"> PAGEREF _Toc231081551 \h </w:instrText>
         </w:r>
         <w:r>
           <w:rPr>
@@ -2051,7 +2051,7 @@
           <w14:ligatures w14:val="standardContextual"/>
         </w:rPr>
       </w:pPr>
-      <w:hyperlink w:anchor="_Toc231079597" w:history="1">
+      <w:hyperlink w:anchor="_Toc231081552" w:history="1">
         <w:r>
           <w:rPr>
             <w:rStyle w:val="Hipervnculo"/>
@@ -2078,7 +2078,7 @@
             <w:noProof/>
             <w:webHidden/>
           </w:rPr>
-          <w:instrText xml:space="preserve"> PAGEREF _Toc231079597 \h </w:instrText>
+          <w:instrText xml:space="preserve"> PAGEREF _Toc231081552 \h </w:instrText>
         </w:r>
         <w:r>
           <w:rPr>
@@ -2098,7 +2098,7 @@
             <w:noProof/>
             <w:webHidden/>
           </w:rPr>
-          <w:t>11</w:t>
+          <w:t>14</w:t>
         </w:r>
         <w:r>
           <w:rPr>
@@ -2124,7 +2124,7 @@
           <w14:ligatures w14:val="standardContextual"/>
         </w:rPr>
       </w:pPr>
-      <w:hyperlink w:anchor="_Toc231079598" w:history="1">
+      <w:hyperlink w:anchor="_Toc231081553" w:history="1">
         <w:r>
           <w:rPr>
             <w:rStyle w:val="Hipervnculo"/>
@@ -2151,7 +2151,7 @@
             <w:noProof/>
             <w:webHidden/>
           </w:rPr>
-          <w:instrText xml:space="preserve"> PAGEREF _Toc231079598 \h </w:instrText>
+          <w:instrText xml:space="preserve"> PAGEREF _Toc231081553 \h </w:instrText>
         </w:r>
         <w:r>
           <w:rPr>
@@ -2171,7 +2171,7 @@
             <w:noProof/>
             <w:webHidden/>
           </w:rPr>
-          <w:t>12</w:t>
+          <w:t>15</w:t>
         </w:r>
         <w:r>
           <w:rPr>
@@ -2197,7 +2197,7 @@
           <w14:ligatures w14:val="standardContextual"/>
         </w:rPr>
       </w:pPr>
-      <w:hyperlink w:anchor="_Toc231079599" w:history="1">
+      <w:hyperlink w:anchor="_Toc231081554" w:history="1">
         <w:r>
           <w:rPr>
             <w:rStyle w:val="Hipervnculo"/>
@@ -2224,7 +2224,7 @@
             <w:noProof/>
             <w:webHidden/>
           </w:rPr>
-          <w:instrText xml:space="preserve"> PAGEREF _Toc231079599 \h </w:instrText>
+          <w:instrText xml:space="preserve"> PAGEREF _Toc231081554 \h </w:instrText>
         </w:r>
         <w:r>
           <w:rPr>
@@ -2244,7 +2244,7 @@
             <w:noProof/>
             <w:webHidden/>
           </w:rPr>
-          <w:t>14</w:t>
+          <w:t>16</w:t>
         </w:r>
         <w:r>
           <w:rPr>
@@ -2270,7 +2270,7 @@
           <w14:ligatures w14:val="standardContextual"/>
         </w:rPr>
       </w:pPr>
-      <w:hyperlink w:anchor="_Toc231079600" w:history="1">
+      <w:hyperlink w:anchor="_Toc231081555" w:history="1">
         <w:r>
           <w:rPr>
             <w:rStyle w:val="Hipervnculo"/>
@@ -2297,7 +2297,7 @@
             <w:noProof/>
             <w:webHidden/>
           </w:rPr>
-          <w:instrText xml:space="preserve"> PAGEREF _Toc231079600 \h </w:instrText>
+          <w:instrText xml:space="preserve"> PAGEREF _Toc231081555 \h </w:instrText>
         </w:r>
         <w:r>
           <w:rPr>
@@ -2317,7 +2317,7 @@
             <w:noProof/>
             <w:webHidden/>
           </w:rPr>
-          <w:t>15</w:t>
+          <w:t>17</w:t>
         </w:r>
         <w:r>
           <w:rPr>
@@ -2343,7 +2343,7 @@
           <w14:ligatures w14:val="standardContextual"/>
         </w:rPr>
       </w:pPr>
-      <w:hyperlink w:anchor="_Toc231079601" w:history="1">
+      <w:hyperlink w:anchor="_Toc231081556" w:history="1">
         <w:r>
           <w:rPr>
             <w:rStyle w:val="Hipervnculo"/>
@@ -2370,7 +2370,7 @@
             <w:noProof/>
             <w:webHidden/>
           </w:rPr>
-          <w:instrText xml:space="preserve"> PAGEREF _Toc231079601 \h </w:instrText>
+          <w:instrText xml:space="preserve"> PAGEREF _Toc231081556 \h </w:instrText>
         </w:r>
         <w:r>
           <w:rPr>
@@ -2390,7 +2390,7 @@
             <w:noProof/>
             <w:webHidden/>
           </w:rPr>
-          <w:t>16</w:t>
+          <w:t>19</w:t>
         </w:r>
         <w:r>
           <w:rPr>
@@ -2416,7 +2416,7 @@
           <w14:ligatures w14:val="standardContextual"/>
         </w:rPr>
       </w:pPr>
-      <w:hyperlink w:anchor="_Toc231079602" w:history="1">
+      <w:hyperlink w:anchor="_Toc231081557" w:history="1">
         <w:r>
           <w:rPr>
             <w:rStyle w:val="Hipervnculo"/>
@@ -2443,7 +2443,7 @@
             <w:noProof/>
             <w:webHidden/>
           </w:rPr>
-          <w:instrText xml:space="preserve"> PAGEREF _Toc231079602 \h </w:instrText>
+          <w:instrText xml:space="preserve"> PAGEREF _Toc231081557 \h </w:instrText>
         </w:r>
         <w:r>
           <w:rPr>
@@ -2463,7 +2463,7 @@
             <w:noProof/>
             <w:webHidden/>
           </w:rPr>
-          <w:t>16</w:t>
+          <w:t>19</w:t>
         </w:r>
         <w:r>
           <w:rPr>
@@ -2489,7 +2489,7 @@
           <w14:ligatures w14:val="standardContextual"/>
         </w:rPr>
       </w:pPr>
-      <w:hyperlink w:anchor="_Toc231079603" w:history="1">
+      <w:hyperlink w:anchor="_Toc231081558" w:history="1">
         <w:r>
           <w:rPr>
             <w:rStyle w:val="Hipervnculo"/>
@@ -2516,7 +2516,7 @@
             <w:noProof/>
             <w:webHidden/>
           </w:rPr>
-          <w:instrText xml:space="preserve"> PAGEREF _Toc231079603 \h </w:instrText>
+          <w:instrText xml:space="preserve"> PAGEREF _Toc231081558 \h </w:instrText>
         </w:r>
         <w:r>
           <w:rPr>
@@ -2536,7 +2536,7 @@
             <w:noProof/>
             <w:webHidden/>
           </w:rPr>
-          <w:t>17</w:t>
+          <w:t>20</w:t>
         </w:r>
         <w:r>
           <w:rPr>
@@ -2562,7 +2562,7 @@
           <w14:ligatures w14:val="standardContextual"/>
         </w:rPr>
       </w:pPr>
-      <w:hyperlink w:anchor="_Toc231079604" w:history="1">
+      <w:hyperlink w:anchor="_Toc231081559" w:history="1">
         <w:r>
           <w:rPr>
             <w:rStyle w:val="Hipervnculo"/>
@@ -2589,7 +2589,7 @@
             <w:noProof/>
             <w:webHidden/>
           </w:rPr>
-          <w:instrText xml:space="preserve"> PAGEREF _Toc231079604 \h </w:instrText>
+          <w:instrText xml:space="preserve"> PAGEREF _Toc231081559 \h </w:instrText>
         </w:r>
         <w:r>
           <w:rPr>
@@ -2609,7 +2609,7 @@
             <w:noProof/>
             <w:webHidden/>
           </w:rPr>
-          <w:t>17</w:t>
+          <w:t>20</w:t>
         </w:r>
         <w:r>
           <w:rPr>
@@ -2635,7 +2635,7 @@
           <w14:ligatures w14:val="standardContextual"/>
         </w:rPr>
       </w:pPr>
-      <w:hyperlink w:anchor="_Toc231079605" w:history="1">
+      <w:hyperlink w:anchor="_Toc231081560" w:history="1">
         <w:r>
           <w:rPr>
             <w:rStyle w:val="Hipervnculo"/>
@@ -2662,7 +2662,7 @@
             <w:noProof/>
             <w:webHidden/>
           </w:rPr>
-          <w:instrText xml:space="preserve"> PAGEREF _Toc231079605 \h </w:instrText>
+          <w:instrText xml:space="preserve"> PAGEREF _Toc231081560 \h </w:instrText>
         </w:r>
         <w:r>
           <w:rPr>
@@ -2682,7 +2682,7 @@
             <w:noProof/>
             <w:webHidden/>
           </w:rPr>
-          <w:t>18</w:t>
+          <w:t>21</w:t>
         </w:r>
         <w:r>
           <w:rPr>
@@ -2708,7 +2708,7 @@
           <w14:ligatures w14:val="standardContextual"/>
         </w:rPr>
       </w:pPr>
-      <w:hyperlink w:anchor="_Toc231079606" w:history="1">
+      <w:hyperlink w:anchor="_Toc231081561" w:history="1">
         <w:r>
           <w:rPr>
             <w:rStyle w:val="Hipervnculo"/>
@@ -2735,7 +2735,7 @@
             <w:noProof/>
             <w:webHidden/>
           </w:rPr>
-          <w:instrText xml:space="preserve"> PAGEREF _Toc231079606 \h </w:instrText>
+          <w:instrText xml:space="preserve"> PAGEREF _Toc231081561 \h </w:instrText>
         </w:r>
         <w:r>
           <w:rPr>
@@ -2755,7 +2755,7 @@
             <w:noProof/>
             <w:webHidden/>
           </w:rPr>
-          <w:t>18</w:t>
+          <w:t>21</w:t>
         </w:r>
         <w:r>
           <w:rPr>
@@ -2781,7 +2781,7 @@
           <w14:ligatures w14:val="standardContextual"/>
         </w:rPr>
       </w:pPr>
-      <w:hyperlink w:anchor="_Toc231079607" w:history="1">
+      <w:hyperlink w:anchor="_Toc231081562" w:history="1">
         <w:r>
           <w:rPr>
             <w:rStyle w:val="Hipervnculo"/>
@@ -2808,7 +2808,7 @@
             <w:noProof/>
             <w:webHidden/>
           </w:rPr>
-          <w:instrText xml:space="preserve"> PAGEREF _Toc231079607 \h </w:instrText>
+          <w:instrText xml:space="preserve"> PAGEREF _Toc231081562 \h </w:instrText>
         </w:r>
         <w:r>
           <w:rPr>
@@ -2828,7 +2828,7 @@
             <w:noProof/>
             <w:webHidden/>
           </w:rPr>
-          <w:t>19</w:t>
+          <w:t>22</w:t>
         </w:r>
         <w:r>
           <w:rPr>
@@ -2854,7 +2854,7 @@
           <w14:ligatures w14:val="standardContextual"/>
         </w:rPr>
       </w:pPr>
-      <w:hyperlink w:anchor="_Toc231079608" w:history="1">
+      <w:hyperlink w:anchor="_Toc231081563" w:history="1">
         <w:r>
           <w:rPr>
             <w:rStyle w:val="Hipervnculo"/>
@@ -2881,7 +2881,7 @@
             <w:noProof/>
             <w:webHidden/>
           </w:rPr>
-          <w:instrText xml:space="preserve"> PAGEREF _Toc231079608 \h </w:instrText>
+          <w:instrText xml:space="preserve"> PAGEREF _Toc231081563 \h </w:instrText>
         </w:r>
         <w:r>
           <w:rPr>
@@ -2901,7 +2901,7 @@
             <w:noProof/>
             <w:webHidden/>
           </w:rPr>
-          <w:t>19</w:t>
+          <w:t>22</w:t>
         </w:r>
         <w:r>
           <w:rPr>
@@ -2927,7 +2927,7 @@
           <w14:ligatures w14:val="standardContextual"/>
         </w:rPr>
       </w:pPr>
-      <w:hyperlink w:anchor="_Toc231079609" w:history="1">
+      <w:hyperlink w:anchor="_Toc231081564" w:history="1">
         <w:r>
           <w:rPr>
             <w:rStyle w:val="Hipervnculo"/>
@@ -2954,7 +2954,7 @@
             <w:noProof/>
             <w:webHidden/>
           </w:rPr>
-          <w:instrText xml:space="preserve"> PAGEREF _Toc231079609 \h </w:instrText>
+          <w:instrText xml:space="preserve"> PAGEREF _Toc231081564 \h </w:instrText>
         </w:r>
         <w:r>
           <w:rPr>
@@ -2974,7 +2974,7 @@
             <w:noProof/>
             <w:webHidden/>
           </w:rPr>
-          <w:t>19</w:t>
+          <w:t>22</w:t>
         </w:r>
         <w:r>
           <w:rPr>
@@ -3000,7 +3000,7 @@
           <w14:ligatures w14:val="standardContextual"/>
         </w:rPr>
       </w:pPr>
-      <w:hyperlink w:anchor="_Toc231079610" w:history="1">
+      <w:hyperlink w:anchor="_Toc231081565" w:history="1">
         <w:r>
           <w:rPr>
             <w:rStyle w:val="Hipervnculo"/>
@@ -3027,7 +3027,7 @@
             <w:noProof/>
             <w:webHidden/>
           </w:rPr>
-          <w:instrText xml:space="preserve"> PAGEREF _Toc231079610 \h </w:instrText>
+          <w:instrText xml:space="preserve"> PAGEREF _Toc231081565 \h </w:instrText>
         </w:r>
         <w:r>
           <w:rPr>
@@ -3047,7 +3047,7 @@
             <w:noProof/>
             <w:webHidden/>
           </w:rPr>
-          <w:t>19</w:t>
+          <w:t>22</w:t>
         </w:r>
         <w:r>
           <w:rPr>
@@ -3073,7 +3073,7 @@
           <w14:ligatures w14:val="standardContextual"/>
         </w:rPr>
       </w:pPr>
-      <w:hyperlink w:anchor="_Toc231079611" w:history="1">
+      <w:hyperlink w:anchor="_Toc231081566" w:history="1">
         <w:r>
           <w:rPr>
             <w:rStyle w:val="Hipervnculo"/>
@@ -3100,7 +3100,7 @@
             <w:noProof/>
             <w:webHidden/>
           </w:rPr>
-          <w:instrText xml:space="preserve"> PAGEREF _Toc231079611 \h </w:instrText>
+          <w:instrText xml:space="preserve"> PAGEREF _Toc231081566 \h </w:instrText>
         </w:r>
         <w:r>
           <w:rPr>
@@ -3120,7 +3120,7 @@
             <w:noProof/>
             <w:webHidden/>
           </w:rPr>
-          <w:t>20</w:t>
+          <w:t>23</w:t>
         </w:r>
         <w:r>
           <w:rPr>
@@ -3146,7 +3146,7 @@
           <w14:ligatures w14:val="standardContextual"/>
         </w:rPr>
       </w:pPr>
-      <w:hyperlink w:anchor="_Toc231079612" w:history="1">
+      <w:hyperlink w:anchor="_Toc231081567" w:history="1">
         <w:r>
           <w:rPr>
             <w:rStyle w:val="Hipervnculo"/>
@@ -3173,7 +3173,7 @@
             <w:noProof/>
             <w:webHidden/>
           </w:rPr>
-          <w:instrText xml:space="preserve"> PAGEREF _Toc231079612 \h </w:instrText>
+          <w:instrText xml:space="preserve"> PAGEREF _Toc231081567 \h </w:instrText>
         </w:r>
         <w:r>
           <w:rPr>
@@ -3193,7 +3193,7 @@
             <w:noProof/>
             <w:webHidden/>
           </w:rPr>
-          <w:t>21</w:t>
+          <w:t>24</w:t>
         </w:r>
         <w:r>
           <w:rPr>
@@ -3219,7 +3219,7 @@
           <w14:ligatures w14:val="standardContextual"/>
         </w:rPr>
       </w:pPr>
-      <w:hyperlink w:anchor="_Toc231079613" w:history="1">
+      <w:hyperlink w:anchor="_Toc231081568" w:history="1">
         <w:r>
           <w:rPr>
             <w:rStyle w:val="Hipervnculo"/>
@@ -3246,7 +3246,7 @@
             <w:noProof/>
             <w:webHidden/>
           </w:rPr>
-          <w:instrText xml:space="preserve"> PAGEREF _Toc231079613 \h </w:instrText>
+          <w:instrText xml:space="preserve"> PAGEREF _Toc231081568 \h </w:instrText>
         </w:r>
         <w:r>
           <w:rPr>
@@ -3266,7 +3266,7 @@
             <w:noProof/>
             <w:webHidden/>
           </w:rPr>
-          <w:t>21</w:t>
+          <w:t>24</w:t>
         </w:r>
         <w:r>
           <w:rPr>
@@ -3292,7 +3292,7 @@
           <w14:ligatures w14:val="standardContextual"/>
         </w:rPr>
       </w:pPr>
-      <w:hyperlink w:anchor="_Toc231079614" w:history="1">
+      <w:hyperlink w:anchor="_Toc231081569" w:history="1">
         <w:r>
           <w:rPr>
             <w:rStyle w:val="Hipervnculo"/>
@@ -3319,7 +3319,7 @@
             <w:noProof/>
             <w:webHidden/>
           </w:rPr>
-          <w:instrText xml:space="preserve"> PAGEREF _Toc231079614 \h </w:instrText>
+          <w:instrText xml:space="preserve"> PAGEREF _Toc231081569 \h </w:instrText>
         </w:r>
         <w:r>
           <w:rPr>
@@ -3339,7 +3339,7 @@
             <w:noProof/>
             <w:webHidden/>
           </w:rPr>
-          <w:t>22</w:t>
+          <w:t>25</w:t>
         </w:r>
         <w:r>
           <w:rPr>
@@ -3365,7 +3365,7 @@
           <w14:ligatures w14:val="standardContextual"/>
         </w:rPr>
       </w:pPr>
-      <w:hyperlink w:anchor="_Toc231079615" w:history="1">
+      <w:hyperlink w:anchor="_Toc231081570" w:history="1">
         <w:r>
           <w:rPr>
             <w:rStyle w:val="Hipervnculo"/>
@@ -3392,7 +3392,7 @@
             <w:noProof/>
             <w:webHidden/>
           </w:rPr>
-          <w:instrText xml:space="preserve"> PAGEREF _Toc231079615 \h </w:instrText>
+          <w:instrText xml:space="preserve"> PAGEREF _Toc231081570 \h </w:instrText>
         </w:r>
         <w:r>
           <w:rPr>
@@ -3412,7 +3412,7 @@
             <w:noProof/>
             <w:webHidden/>
           </w:rPr>
-          <w:t>23</w:t>
+          <w:t>26</w:t>
         </w:r>
         <w:r>
           <w:rPr>
@@ -3438,7 +3438,7 @@
           <w14:ligatures w14:val="standardContextual"/>
         </w:rPr>
       </w:pPr>
-      <w:hyperlink w:anchor="_Toc231079616" w:history="1">
+      <w:hyperlink w:anchor="_Toc231081571" w:history="1">
         <w:r>
           <w:rPr>
             <w:rStyle w:val="Hipervnculo"/>
@@ -3465,7 +3465,7 @@
             <w:noProof/>
             <w:webHidden/>
           </w:rPr>
-          <w:instrText xml:space="preserve"> PAGEREF _Toc231079616 \h </w:instrText>
+          <w:instrText xml:space="preserve"> PAGEREF _Toc231081571 \h </w:instrText>
         </w:r>
         <w:r>
           <w:rPr>
@@ -3485,7 +3485,7 @@
             <w:noProof/>
             <w:webHidden/>
           </w:rPr>
-          <w:t>24</w:t>
+          <w:t>27</w:t>
         </w:r>
         <w:r>
           <w:rPr>
@@ -3511,7 +3511,7 @@
           <w14:ligatures w14:val="standardContextual"/>
         </w:rPr>
       </w:pPr>
-      <w:hyperlink w:anchor="_Toc231079617" w:history="1">
+      <w:hyperlink w:anchor="_Toc231081572" w:history="1">
         <w:r>
           <w:rPr>
             <w:rStyle w:val="Hipervnculo"/>
@@ -3538,7 +3538,7 @@
             <w:noProof/>
             <w:webHidden/>
           </w:rPr>
-          <w:instrText xml:space="preserve"> PAGEREF _Toc231079617 \h </w:instrText>
+          <w:instrText xml:space="preserve"> PAGEREF _Toc231081572 \h </w:instrText>
         </w:r>
         <w:r>
           <w:rPr>
@@ -3558,7 +3558,7 @@
             <w:noProof/>
             <w:webHidden/>
           </w:rPr>
-          <w:t>24</w:t>
+          <w:t>27</w:t>
         </w:r>
         <w:r>
           <w:rPr>
@@ -3584,7 +3584,7 @@
           <w14:ligatures w14:val="standardContextual"/>
         </w:rPr>
       </w:pPr>
-      <w:hyperlink w:anchor="_Toc231079618" w:history="1">
+      <w:hyperlink w:anchor="_Toc231081573" w:history="1">
         <w:r>
           <w:rPr>
             <w:rStyle w:val="Hipervnculo"/>
@@ -3611,7 +3611,7 @@
             <w:noProof/>
             <w:webHidden/>
           </w:rPr>
-          <w:instrText xml:space="preserve"> PAGEREF _Toc231079618 \h </w:instrText>
+          <w:instrText xml:space="preserve"> PAGEREF _Toc231081573 \h </w:instrText>
         </w:r>
         <w:r>
           <w:rPr>
@@ -3631,7 +3631,7 @@
             <w:noProof/>
             <w:webHidden/>
           </w:rPr>
-          <w:t>25</w:t>
+          <w:t>28</w:t>
         </w:r>
         <w:r>
           <w:rPr>
@@ -3657,7 +3657,7 @@
           <w14:ligatures w14:val="standardContextual"/>
         </w:rPr>
       </w:pPr>
-      <w:hyperlink w:anchor="_Toc231079619" w:history="1">
+      <w:hyperlink w:anchor="_Toc231081574" w:history="1">
         <w:r>
           <w:rPr>
             <w:rStyle w:val="Hipervnculo"/>
@@ -3684,7 +3684,7 @@
             <w:noProof/>
             <w:webHidden/>
           </w:rPr>
-          <w:instrText xml:space="preserve"> PAGEREF _Toc231079619 \h </w:instrText>
+          <w:instrText xml:space="preserve"> PAGEREF _Toc231081574 \h </w:instrText>
         </w:r>
         <w:r>
           <w:rPr>
@@ -3704,7 +3704,7 @@
             <w:noProof/>
             <w:webHidden/>
           </w:rPr>
-          <w:t>26</w:t>
+          <w:t>29</w:t>
         </w:r>
         <w:r>
           <w:rPr>
@@ -3730,7 +3730,7 @@
           <w14:ligatures w14:val="standardContextual"/>
         </w:rPr>
       </w:pPr>
-      <w:hyperlink w:anchor="_Toc231079620" w:history="1">
+      <w:hyperlink w:anchor="_Toc231081575" w:history="1">
         <w:r>
           <w:rPr>
             <w:rStyle w:val="Hipervnculo"/>
@@ -3757,7 +3757,7 @@
             <w:noProof/>
             <w:webHidden/>
           </w:rPr>
-          <w:instrText xml:space="preserve"> PAGEREF _Toc231079620 \h </w:instrText>
+          <w:instrText xml:space="preserve"> PAGEREF _Toc231081575 \h </w:instrText>
         </w:r>
         <w:r>
           <w:rPr>
@@ -3777,7 +3777,7 @@
             <w:noProof/>
             <w:webHidden/>
           </w:rPr>
-          <w:t>28</w:t>
+          <w:t>31</w:t>
         </w:r>
         <w:r>
           <w:rPr>
@@ -3803,7 +3803,7 @@
           <w14:ligatures w14:val="standardContextual"/>
         </w:rPr>
       </w:pPr>
-      <w:hyperlink w:anchor="_Toc231079621" w:history="1">
+      <w:hyperlink w:anchor="_Toc231081576" w:history="1">
         <w:r>
           <w:rPr>
             <w:rStyle w:val="Hipervnculo"/>
@@ -3830,7 +3830,7 @@
             <w:noProof/>
             <w:webHidden/>
           </w:rPr>
-          <w:instrText xml:space="preserve"> PAGEREF _Toc231079621 \h </w:instrText>
+          <w:instrText xml:space="preserve"> PAGEREF _Toc231081576 \h </w:instrText>
         </w:r>
         <w:r>
           <w:rPr>
@@ -3850,7 +3850,7 @@
             <w:noProof/>
             <w:webHidden/>
           </w:rPr>
-          <w:t>30</w:t>
+          <w:t>33</w:t>
         </w:r>
         <w:r>
           <w:rPr>
@@ -3876,7 +3876,7 @@
           <w14:ligatures w14:val="standardContextual"/>
         </w:rPr>
       </w:pPr>
-      <w:hyperlink w:anchor="_Toc231079622" w:history="1">
+      <w:hyperlink w:anchor="_Toc231081577" w:history="1">
         <w:r>
           <w:rPr>
             <w:rStyle w:val="Hipervnculo"/>
@@ -3903,7 +3903,7 @@
             <w:noProof/>
             <w:webHidden/>
           </w:rPr>
-          <w:instrText xml:space="preserve"> PAGEREF _Toc231079622 \h </w:instrText>
+          <w:instrText xml:space="preserve"> PAGEREF _Toc231081577 \h </w:instrText>
         </w:r>
         <w:r>
           <w:rPr>
@@ -3923,7 +3923,7 @@
             <w:noProof/>
             <w:webHidden/>
           </w:rPr>
-          <w:t>31</w:t>
+          <w:t>34</w:t>
         </w:r>
         <w:r>
           <w:rPr>
@@ -3949,7 +3949,7 @@
           <w14:ligatures w14:val="standardContextual"/>
         </w:rPr>
       </w:pPr>
-      <w:hyperlink w:anchor="_Toc231079623" w:history="1">
+      <w:hyperlink w:anchor="_Toc231081578" w:history="1">
         <w:r>
           <w:rPr>
             <w:rStyle w:val="Hipervnculo"/>
@@ -3976,7 +3976,7 @@
             <w:noProof/>
             <w:webHidden/>
           </w:rPr>
-          <w:instrText xml:space="preserve"> PAGEREF _Toc231079623 \h </w:instrText>
+          <w:instrText xml:space="preserve"> PAGEREF _Toc231081578 \h </w:instrText>
         </w:r>
         <w:r>
           <w:rPr>
@@ -3996,7 +3996,7 @@
             <w:noProof/>
             <w:webHidden/>
           </w:rPr>
-          <w:t>32</w:t>
+          <w:t>35</w:t>
         </w:r>
         <w:r>
           <w:rPr>
@@ -4022,7 +4022,7 @@
           <w14:ligatures w14:val="standardContextual"/>
         </w:rPr>
       </w:pPr>
-      <w:hyperlink w:anchor="_Toc231079624" w:history="1">
+      <w:hyperlink w:anchor="_Toc231081579" w:history="1">
         <w:r>
           <w:rPr>
             <w:rStyle w:val="Hipervnculo"/>
@@ -4049,7 +4049,7 @@
             <w:noProof/>
             <w:webHidden/>
           </w:rPr>
-          <w:instrText xml:space="preserve"> PAGEREF _Toc231079624 \h </w:instrText>
+          <w:instrText xml:space="preserve"> PAGEREF _Toc231081579 \h </w:instrText>
         </w:r>
         <w:r>
           <w:rPr>
@@ -4069,7 +4069,7 @@
             <w:noProof/>
             <w:webHidden/>
           </w:rPr>
-          <w:t>34</w:t>
+          <w:t>38</w:t>
         </w:r>
         <w:r>
           <w:rPr>
@@ -4095,7 +4095,7 @@
           <w14:ligatures w14:val="standardContextual"/>
         </w:rPr>
       </w:pPr>
-      <w:hyperlink w:anchor="_Toc231079625" w:history="1">
+      <w:hyperlink w:anchor="_Toc231081580" w:history="1">
         <w:r>
           <w:rPr>
             <w:rStyle w:val="Hipervnculo"/>
@@ -4122,7 +4122,7 @@
             <w:noProof/>
             <w:webHidden/>
           </w:rPr>
-          <w:instrText xml:space="preserve"> PAGEREF _Toc231079625 \h </w:instrText>
+          <w:instrText xml:space="preserve"> PAGEREF _Toc231081580 \h </w:instrText>
         </w:r>
         <w:r>
           <w:rPr>
@@ -4142,7 +4142,7 @@
             <w:noProof/>
             <w:webHidden/>
           </w:rPr>
-          <w:t>36</w:t>
+          <w:t>40</w:t>
         </w:r>
         <w:r>
           <w:rPr>
@@ -4168,7 +4168,7 @@
           <w14:ligatures w14:val="standardContextual"/>
         </w:rPr>
       </w:pPr>
-      <w:hyperlink w:anchor="_Toc231079626" w:history="1">
+      <w:hyperlink w:anchor="_Toc231081581" w:history="1">
         <w:r>
           <w:rPr>
             <w:rStyle w:val="Hipervnculo"/>
@@ -4195,7 +4195,7 @@
             <w:noProof/>
             <w:webHidden/>
           </w:rPr>
-          <w:instrText xml:space="preserve"> PAGEREF _Toc231079626 \h </w:instrText>
+          <w:instrText xml:space="preserve"> PAGEREF _Toc231081581 \h </w:instrText>
         </w:r>
         <w:r>
           <w:rPr>
@@ -4215,7 +4215,7 @@
             <w:noProof/>
             <w:webHidden/>
           </w:rPr>
-          <w:t>36</w:t>
+          <w:t>40</w:t>
         </w:r>
         <w:r>
           <w:rPr>
@@ -4241,7 +4241,7 @@
           <w14:ligatures w14:val="standardContextual"/>
         </w:rPr>
       </w:pPr>
-      <w:hyperlink w:anchor="_Toc231079627" w:history="1">
+      <w:hyperlink w:anchor="_Toc231081582" w:history="1">
         <w:r>
           <w:rPr>
             <w:rStyle w:val="Hipervnculo"/>
@@ -4268,7 +4268,7 @@
             <w:noProof/>
             <w:webHidden/>
           </w:rPr>
-          <w:instrText xml:space="preserve"> PAGEREF _Toc231079627 \h </w:instrText>
+          <w:instrText xml:space="preserve"> PAGEREF _Toc231081582 \h </w:instrText>
         </w:r>
         <w:r>
           <w:rPr>
@@ -4288,7 +4288,7 @@
             <w:noProof/>
             <w:webHidden/>
           </w:rPr>
-          <w:t>37</w:t>
+          <w:t>41</w:t>
         </w:r>
         <w:r>
           <w:rPr>
@@ -4314,7 +4314,7 @@
           <w14:ligatures w14:val="standardContextual"/>
         </w:rPr>
       </w:pPr>
-      <w:hyperlink w:anchor="_Toc231079628" w:history="1">
+      <w:hyperlink w:anchor="_Toc231081583" w:history="1">
         <w:r>
           <w:rPr>
             <w:rStyle w:val="Hipervnculo"/>
@@ -4341,7 +4341,7 @@
             <w:noProof/>
             <w:webHidden/>
           </w:rPr>
-          <w:instrText xml:space="preserve"> PAGEREF _Toc231079628 \h </w:instrText>
+          <w:instrText xml:space="preserve"> PAGEREF _Toc231081583 \h </w:instrText>
         </w:r>
         <w:r>
           <w:rPr>
@@ -4361,7 +4361,7 @@
             <w:noProof/>
             <w:webHidden/>
           </w:rPr>
-          <w:t>37</w:t>
+          <w:t>41</w:t>
         </w:r>
         <w:r>
           <w:rPr>
@@ -4387,7 +4387,7 @@
           <w14:ligatures w14:val="standardContextual"/>
         </w:rPr>
       </w:pPr>
-      <w:hyperlink w:anchor="_Toc231079629" w:history="1">
+      <w:hyperlink w:anchor="_Toc231081584" w:history="1">
         <w:r>
           <w:rPr>
             <w:rStyle w:val="Hipervnculo"/>
@@ -4414,7 +4414,7 @@
             <w:noProof/>
             <w:webHidden/>
           </w:rPr>
-          <w:instrText xml:space="preserve"> PAGEREF _Toc231079629 \h </w:instrText>
+          <w:instrText xml:space="preserve"> PAGEREF _Toc231081584 \h </w:instrText>
         </w:r>
         <w:r>
           <w:rPr>
@@ -4434,7 +4434,7 @@
             <w:noProof/>
             <w:webHidden/>
           </w:rPr>
-          <w:t>37</w:t>
+          <w:t>41</w:t>
         </w:r>
         <w:r>
           <w:rPr>
@@ -4460,7 +4460,7 @@
           <w14:ligatures w14:val="standardContextual"/>
         </w:rPr>
       </w:pPr>
-      <w:hyperlink w:anchor="_Toc231079630" w:history="1">
+      <w:hyperlink w:anchor="_Toc231081585" w:history="1">
         <w:r>
           <w:rPr>
             <w:rStyle w:val="Hipervnculo"/>
@@ -4487,7 +4487,7 @@
             <w:noProof/>
             <w:webHidden/>
           </w:rPr>
-          <w:instrText xml:space="preserve"> PAGEREF _Toc231079630 \h </w:instrText>
+          <w:instrText xml:space="preserve"> PAGEREF _Toc231081585 \h </w:instrText>
         </w:r>
         <w:r>
           <w:rPr>
@@ -4507,7 +4507,7 @@
             <w:noProof/>
             <w:webHidden/>
           </w:rPr>
-          <w:t>39</w:t>
+          <w:t>43</w:t>
         </w:r>
         <w:r>
           <w:rPr>
@@ -4533,7 +4533,7 @@
           <w14:ligatures w14:val="standardContextual"/>
         </w:rPr>
       </w:pPr>
-      <w:hyperlink w:anchor="_Toc231079631" w:history="1">
+      <w:hyperlink w:anchor="_Toc231081586" w:history="1">
         <w:r>
           <w:rPr>
             <w:rStyle w:val="Hipervnculo"/>
@@ -4560,7 +4560,7 @@
             <w:noProof/>
             <w:webHidden/>
           </w:rPr>
-          <w:instrText xml:space="preserve"> PAGEREF _Toc231079631 \h </w:instrText>
+          <w:instrText xml:space="preserve"> PAGEREF _Toc231081586 \h </w:instrText>
         </w:r>
         <w:r>
           <w:rPr>
@@ -4580,7 +4580,7 @@
             <w:noProof/>
             <w:webHidden/>
           </w:rPr>
-          <w:t>42</w:t>
+          <w:t>47</w:t>
         </w:r>
         <w:r>
           <w:rPr>
@@ -4606,7 +4606,7 @@
           <w14:ligatures w14:val="standardContextual"/>
         </w:rPr>
       </w:pPr>
-      <w:hyperlink w:anchor="_Toc231079632" w:history="1">
+      <w:hyperlink w:anchor="_Toc231081587" w:history="1">
         <w:r>
           <w:rPr>
             <w:rStyle w:val="Hipervnculo"/>
@@ -4633,7 +4633,7 @@
             <w:noProof/>
             <w:webHidden/>
           </w:rPr>
-          <w:instrText xml:space="preserve"> PAGEREF _Toc231079632 \h </w:instrText>
+          <w:instrText xml:space="preserve"> PAGEREF _Toc231081587 \h </w:instrText>
         </w:r>
         <w:r>
           <w:rPr>
@@ -4653,7 +4653,7 @@
             <w:noProof/>
             <w:webHidden/>
           </w:rPr>
-          <w:t>42</w:t>
+          <w:t>47</w:t>
         </w:r>
         <w:r>
           <w:rPr>
@@ -4679,7 +4679,7 @@
           <w14:ligatures w14:val="standardContextual"/>
         </w:rPr>
       </w:pPr>
-      <w:hyperlink w:anchor="_Toc231079633" w:history="1">
+      <w:hyperlink w:anchor="_Toc231081588" w:history="1">
         <w:r>
           <w:rPr>
             <w:rStyle w:val="Hipervnculo"/>
@@ -4706,7 +4706,7 @@
             <w:noProof/>
             <w:webHidden/>
           </w:rPr>
-          <w:instrText xml:space="preserve"> PAGEREF _Toc231079633 \h </w:instrText>
+          <w:instrText xml:space="preserve"> PAGEREF _Toc231081588 \h </w:instrText>
         </w:r>
         <w:r>
           <w:rPr>
@@ -4726,7 +4726,7 @@
             <w:noProof/>
             <w:webHidden/>
           </w:rPr>
-          <w:t>42</w:t>
+          <w:t>47</w:t>
         </w:r>
         <w:r>
           <w:rPr>
@@ -4752,7 +4752,7 @@
           <w14:ligatures w14:val="standardContextual"/>
         </w:rPr>
       </w:pPr>
-      <w:hyperlink w:anchor="_Toc231079634" w:history="1">
+      <w:hyperlink w:anchor="_Toc231081589" w:history="1">
         <w:r>
           <w:rPr>
             <w:rStyle w:val="Hipervnculo"/>
@@ -4779,7 +4779,7 @@
             <w:noProof/>
             <w:webHidden/>
           </w:rPr>
-          <w:instrText xml:space="preserve"> PAGEREF _Toc231079634 \h </w:instrText>
+          <w:instrText xml:space="preserve"> PAGEREF _Toc231081589 \h </w:instrText>
         </w:r>
         <w:r>
           <w:rPr>
@@ -4799,7 +4799,7 @@
             <w:noProof/>
             <w:webHidden/>
           </w:rPr>
-          <w:t>43</w:t>
+          <w:t>48</w:t>
         </w:r>
         <w:r>
           <w:rPr>
@@ -4825,7 +4825,7 @@
           <w14:ligatures w14:val="standardContextual"/>
         </w:rPr>
       </w:pPr>
-      <w:hyperlink w:anchor="_Toc231079635" w:history="1">
+      <w:hyperlink w:anchor="_Toc231081590" w:history="1">
         <w:r>
           <w:rPr>
             <w:rStyle w:val="Hipervnculo"/>
@@ -4852,7 +4852,7 @@
             <w:noProof/>
             <w:webHidden/>
           </w:rPr>
-          <w:instrText xml:space="preserve"> PAGEREF _Toc231079635 \h </w:instrText>
+          <w:instrText xml:space="preserve"> PAGEREF _Toc231081590 \h </w:instrText>
         </w:r>
         <w:r>
           <w:rPr>
@@ -4872,7 +4872,7 @@
             <w:noProof/>
             <w:webHidden/>
           </w:rPr>
-          <w:t>44</w:t>
+          <w:t>49</w:t>
         </w:r>
         <w:r>
           <w:rPr>
@@ -4898,7 +4898,7 @@
           <w14:ligatures w14:val="standardContextual"/>
         </w:rPr>
       </w:pPr>
-      <w:hyperlink w:anchor="_Toc231079636" w:history="1">
+      <w:hyperlink w:anchor="_Toc231081591" w:history="1">
         <w:r>
           <w:rPr>
             <w:rStyle w:val="Hipervnculo"/>
@@ -4925,7 +4925,7 @@
             <w:noProof/>
             <w:webHidden/>
           </w:rPr>
-          <w:instrText xml:space="preserve"> PAGEREF _Toc231079636 \h </w:instrText>
+          <w:instrText xml:space="preserve"> PAGEREF _Toc231081591 \h </w:instrText>
         </w:r>
         <w:r>
           <w:rPr>
@@ -4945,7 +4945,7 @@
             <w:noProof/>
             <w:webHidden/>
           </w:rPr>
-          <w:t>44</w:t>
+          <w:t>49</w:t>
         </w:r>
         <w:r>
           <w:rPr>
@@ -4971,7 +4971,7 @@
           <w14:ligatures w14:val="standardContextual"/>
         </w:rPr>
       </w:pPr>
-      <w:hyperlink w:anchor="_Toc231079637" w:history="1">
+      <w:hyperlink w:anchor="_Toc231081592" w:history="1">
         <w:r>
           <w:rPr>
             <w:rStyle w:val="Hipervnculo"/>
@@ -4998,7 +4998,7 @@
             <w:noProof/>
             <w:webHidden/>
           </w:rPr>
-          <w:instrText xml:space="preserve"> PAGEREF _Toc231079637 \h </w:instrText>
+          <w:instrText xml:space="preserve"> PAGEREF _Toc231081592 \h </w:instrText>
         </w:r>
         <w:r>
           <w:rPr>
@@ -5018,7 +5018,7 @@
             <w:noProof/>
             <w:webHidden/>
           </w:rPr>
-          <w:t>44</w:t>
+          <w:t>49</w:t>
         </w:r>
         <w:r>
           <w:rPr>
@@ -5044,7 +5044,7 @@
           <w14:ligatures w14:val="standardContextual"/>
         </w:rPr>
       </w:pPr>
-      <w:hyperlink w:anchor="_Toc231079638" w:history="1">
+      <w:hyperlink w:anchor="_Toc231081593" w:history="1">
         <w:r>
           <w:rPr>
             <w:rStyle w:val="Hipervnculo"/>
@@ -5071,7 +5071,7 @@
             <w:noProof/>
             <w:webHidden/>
           </w:rPr>
-          <w:instrText xml:space="preserve"> PAGEREF _Toc231079638 \h </w:instrText>
+          <w:instrText xml:space="preserve"> PAGEREF _Toc231081593 \h </w:instrText>
         </w:r>
         <w:r>
           <w:rPr>
@@ -5091,7 +5091,7 @@
             <w:noProof/>
             <w:webHidden/>
           </w:rPr>
-          <w:t>45</w:t>
+          <w:t>50</w:t>
         </w:r>
         <w:r>
           <w:rPr>
@@ -5117,7 +5117,7 @@
           <w14:ligatures w14:val="standardContextual"/>
         </w:rPr>
       </w:pPr>
-      <w:hyperlink w:anchor="_Toc231079639" w:history="1">
+      <w:hyperlink w:anchor="_Toc231081594" w:history="1">
         <w:r>
           <w:rPr>
             <w:rStyle w:val="Hipervnculo"/>
@@ -5144,7 +5144,7 @@
             <w:noProof/>
             <w:webHidden/>
           </w:rPr>
-          <w:instrText xml:space="preserve"> PAGEREF _Toc231079639 \h </w:instrText>
+          <w:instrText xml:space="preserve"> PAGEREF _Toc231081594 \h </w:instrText>
         </w:r>
         <w:r>
           <w:rPr>
@@ -5164,7 +5164,7 @@
             <w:noProof/>
             <w:webHidden/>
           </w:rPr>
-          <w:t>45</w:t>
+          <w:t>50</w:t>
         </w:r>
         <w:r>
           <w:rPr>
@@ -5190,7 +5190,7 @@
           <w14:ligatures w14:val="standardContextual"/>
         </w:rPr>
       </w:pPr>
-      <w:hyperlink w:anchor="_Toc231079640" w:history="1">
+      <w:hyperlink w:anchor="_Toc231081595" w:history="1">
         <w:r>
           <w:rPr>
             <w:rStyle w:val="Hipervnculo"/>
@@ -5217,7 +5217,7 @@
             <w:noProof/>
             <w:webHidden/>
           </w:rPr>
-          <w:instrText xml:space="preserve"> PAGEREF _Toc231079640 \h </w:instrText>
+          <w:instrText xml:space="preserve"> PAGEREF _Toc231081595 \h </w:instrText>
         </w:r>
         <w:r>
           <w:rPr>
@@ -5237,7 +5237,7 @@
             <w:noProof/>
             <w:webHidden/>
           </w:rPr>
-          <w:t>45</w:t>
+          <w:t>50</w:t>
         </w:r>
         <w:r>
           <w:rPr>
@@ -5263,7 +5263,7 @@
           <w14:ligatures w14:val="standardContextual"/>
         </w:rPr>
       </w:pPr>
-      <w:hyperlink w:anchor="_Toc231079641" w:history="1">
+      <w:hyperlink w:anchor="_Toc231081596" w:history="1">
         <w:r>
           <w:rPr>
             <w:rStyle w:val="Hipervnculo"/>
@@ -5290,7 +5290,7 @@
             <w:noProof/>
             <w:webHidden/>
           </w:rPr>
-          <w:instrText xml:space="preserve"> PAGEREF _Toc231079641 \h </w:instrText>
+          <w:instrText xml:space="preserve"> PAGEREF _Toc231081596 \h </w:instrText>
         </w:r>
         <w:r>
           <w:rPr>
@@ -5310,7 +5310,7 @@
             <w:noProof/>
             <w:webHidden/>
           </w:rPr>
-          <w:t>46</w:t>
+          <w:t>51</w:t>
         </w:r>
         <w:r>
           <w:rPr>
@@ -5336,7 +5336,7 @@
           <w14:ligatures w14:val="standardContextual"/>
         </w:rPr>
       </w:pPr>
-      <w:hyperlink w:anchor="_Toc231079642" w:history="1">
+      <w:hyperlink w:anchor="_Toc231081597" w:history="1">
         <w:r>
           <w:rPr>
             <w:rStyle w:val="Hipervnculo"/>
@@ -5363,7 +5363,7 @@
             <w:noProof/>
             <w:webHidden/>
           </w:rPr>
-          <w:instrText xml:space="preserve"> PAGEREF _Toc231079642 \h </w:instrText>
+          <w:instrText xml:space="preserve"> PAGEREF _Toc231081597 \h </w:instrText>
         </w:r>
         <w:r>
           <w:rPr>
@@ -5383,7 +5383,7 @@
             <w:noProof/>
             <w:webHidden/>
           </w:rPr>
-          <w:t>47</w:t>
+          <w:t>52</w:t>
         </w:r>
         <w:r>
           <w:rPr>
@@ -5409,7 +5409,7 @@
           <w14:ligatures w14:val="standardContextual"/>
         </w:rPr>
       </w:pPr>
-      <w:hyperlink w:anchor="_Toc231079643" w:history="1">
+      <w:hyperlink w:anchor="_Toc231081598" w:history="1">
         <w:r>
           <w:rPr>
             <w:rStyle w:val="Hipervnculo"/>
@@ -5436,7 +5436,7 @@
             <w:noProof/>
             <w:webHidden/>
           </w:rPr>
-          <w:instrText xml:space="preserve"> PAGEREF _Toc231079643 \h </w:instrText>
+          <w:instrText xml:space="preserve"> PAGEREF _Toc231081598 \h </w:instrText>
         </w:r>
         <w:r>
           <w:rPr>
@@ -5456,7 +5456,7 @@
             <w:noProof/>
             <w:webHidden/>
           </w:rPr>
-          <w:t>48</w:t>
+          <w:t>53</w:t>
         </w:r>
         <w:r>
           <w:rPr>
@@ -5481,7 +5481,7 @@
       <w:pPr>
         <w:pStyle w:val="Ttulo1"/>
       </w:pPr>
-      <w:bookmarkStart w:id="7" w:name="_Toc231079581"/>
+      <w:bookmarkStart w:id="7" w:name="_Toc231081536"/>
       <w:r>
         <w:lastRenderedPageBreak/>
         <w:t>Índice de tablas</w:t>
@@ -5512,7 +5512,7 @@
       <w:r>
         <w:fldChar w:fldCharType="separate"/>
       </w:r>
-      <w:hyperlink w:anchor="_Toc231079644" w:history="1">
+      <w:hyperlink w:anchor="_Toc231081599" w:history="1">
         <w:r>
           <w:rPr>
             <w:rStyle w:val="Hipervnculo"/>
@@ -5539,7 +5539,7 @@
             <w:noProof/>
             <w:webHidden/>
           </w:rPr>
-          <w:instrText xml:space="preserve"> PAGEREF _Toc231079644 \h </w:instrText>
+          <w:instrText xml:space="preserve"> PAGEREF _Toc231081599 \h </w:instrText>
         </w:r>
         <w:r>
           <w:rPr>
@@ -5559,7 +5559,7 @@
             <w:noProof/>
             <w:webHidden/>
           </w:rPr>
-          <w:t>23</w:t>
+          <w:t>26</w:t>
         </w:r>
         <w:r>
           <w:rPr>
@@ -5585,7 +5585,7 @@
           <w14:ligatures w14:val="standardContextual"/>
         </w:rPr>
       </w:pPr>
-      <w:hyperlink w:anchor="_Toc231079645" w:history="1">
+      <w:hyperlink w:anchor="_Toc231081600" w:history="1">
         <w:r>
           <w:rPr>
             <w:rStyle w:val="Hipervnculo"/>
@@ -5612,7 +5612,7 @@
             <w:noProof/>
             <w:webHidden/>
           </w:rPr>
-          <w:instrText xml:space="preserve"> PAGEREF _Toc231079645 \h </w:instrText>
+          <w:instrText xml:space="preserve"> PAGEREF _Toc231081600 \h </w:instrText>
         </w:r>
         <w:r>
           <w:rPr>
@@ -5632,7 +5632,7 @@
             <w:noProof/>
             <w:webHidden/>
           </w:rPr>
-          <w:t>25</w:t>
+          <w:t>28</w:t>
         </w:r>
         <w:r>
           <w:rPr>
@@ -5658,7 +5658,7 @@
           <w14:ligatures w14:val="standardContextual"/>
         </w:rPr>
       </w:pPr>
-      <w:hyperlink w:anchor="_Toc231079646" w:history="1">
+      <w:hyperlink w:anchor="_Toc231081601" w:history="1">
         <w:r>
           <w:rPr>
             <w:rStyle w:val="Hipervnculo"/>
@@ -5685,7 +5685,7 @@
             <w:noProof/>
             <w:webHidden/>
           </w:rPr>
-          <w:instrText xml:space="preserve"> PAGEREF _Toc231079646 \h </w:instrText>
+          <w:instrText xml:space="preserve"> PAGEREF _Toc231081601 \h </w:instrText>
         </w:r>
         <w:r>
           <w:rPr>
@@ -5705,7 +5705,7 @@
             <w:noProof/>
             <w:webHidden/>
           </w:rPr>
-          <w:t>28</w:t>
+          <w:t>31</w:t>
         </w:r>
         <w:r>
           <w:rPr>
@@ -5731,7 +5731,7 @@
           <w14:ligatures w14:val="standardContextual"/>
         </w:rPr>
       </w:pPr>
-      <w:hyperlink w:anchor="_Toc231079647" w:history="1">
+      <w:hyperlink w:anchor="_Toc231081602" w:history="1">
         <w:r>
           <w:rPr>
             <w:rStyle w:val="Hipervnculo"/>
@@ -5758,7 +5758,7 @@
             <w:noProof/>
             <w:webHidden/>
           </w:rPr>
-          <w:instrText xml:space="preserve"> PAGEREF _Toc231079647 \h </w:instrText>
+          <w:instrText xml:space="preserve"> PAGEREF _Toc231081602 \h </w:instrText>
         </w:r>
         <w:r>
           <w:rPr>
@@ -5778,7 +5778,7 @@
             <w:noProof/>
             <w:webHidden/>
           </w:rPr>
-          <w:t>31</w:t>
+          <w:t>34</w:t>
         </w:r>
         <w:r>
           <w:rPr>
@@ -5804,7 +5804,7 @@
           <w14:ligatures w14:val="standardContextual"/>
         </w:rPr>
       </w:pPr>
-      <w:hyperlink w:anchor="_Toc231079648" w:history="1">
+      <w:hyperlink w:anchor="_Toc231081603" w:history="1">
         <w:r>
           <w:rPr>
             <w:rStyle w:val="Hipervnculo"/>
@@ -5831,7 +5831,7 @@
             <w:noProof/>
             <w:webHidden/>
           </w:rPr>
-          <w:instrText xml:space="preserve"> PAGEREF _Toc231079648 \h </w:instrText>
+          <w:instrText xml:space="preserve"> PAGEREF _Toc231081603 \h </w:instrText>
         </w:r>
         <w:r>
           <w:rPr>
@@ -5851,7 +5851,7 @@
             <w:noProof/>
             <w:webHidden/>
           </w:rPr>
-          <w:t>42</w:t>
+          <w:t>47</w:t>
         </w:r>
         <w:r>
           <w:rPr>
@@ -5877,7 +5877,7 @@
           <w14:ligatures w14:val="standardContextual"/>
         </w:rPr>
       </w:pPr>
-      <w:hyperlink w:anchor="_Toc231079649" w:history="1">
+      <w:hyperlink w:anchor="_Toc231081604" w:history="1">
         <w:r>
           <w:rPr>
             <w:rStyle w:val="Hipervnculo"/>
@@ -5904,7 +5904,7 @@
             <w:noProof/>
             <w:webHidden/>
           </w:rPr>
-          <w:instrText xml:space="preserve"> PAGEREF _Toc231079649 \h </w:instrText>
+          <w:instrText xml:space="preserve"> PAGEREF _Toc231081604 \h </w:instrText>
         </w:r>
         <w:r>
           <w:rPr>
@@ -5924,7 +5924,7 @@
             <w:noProof/>
             <w:webHidden/>
           </w:rPr>
-          <w:t>42</w:t>
+          <w:t>47</w:t>
         </w:r>
         <w:r>
           <w:rPr>
@@ -5950,7 +5950,7 @@
           <w14:ligatures w14:val="standardContextual"/>
         </w:rPr>
       </w:pPr>
-      <w:hyperlink w:anchor="_Toc231079650" w:history="1">
+      <w:hyperlink w:anchor="_Toc231081605" w:history="1">
         <w:r>
           <w:rPr>
             <w:rStyle w:val="Hipervnculo"/>
@@ -5977,7 +5977,7 @@
             <w:noProof/>
             <w:webHidden/>
           </w:rPr>
-          <w:instrText xml:space="preserve"> PAGEREF _Toc231079650 \h </w:instrText>
+          <w:instrText xml:space="preserve"> PAGEREF _Toc231081605 \h </w:instrText>
         </w:r>
         <w:r>
           <w:rPr>
@@ -5997,7 +5997,7 @@
             <w:noProof/>
             <w:webHidden/>
           </w:rPr>
-          <w:t>43</w:t>
+          <w:t>48</w:t>
         </w:r>
         <w:r>
           <w:rPr>
@@ -6023,7 +6023,7 @@
           <w14:ligatures w14:val="standardContextual"/>
         </w:rPr>
       </w:pPr>
-      <w:hyperlink w:anchor="_Toc231079651" w:history="1">
+      <w:hyperlink w:anchor="_Toc231081606" w:history="1">
         <w:r>
           <w:rPr>
             <w:rStyle w:val="Hipervnculo"/>
@@ -6050,7 +6050,7 @@
             <w:noProof/>
             <w:webHidden/>
           </w:rPr>
-          <w:instrText xml:space="preserve"> PAGEREF _Toc231079651 \h </w:instrText>
+          <w:instrText xml:space="preserve"> PAGEREF _Toc231081606 \h </w:instrText>
         </w:r>
         <w:r>
           <w:rPr>
@@ -6070,7 +6070,7 @@
             <w:noProof/>
             <w:webHidden/>
           </w:rPr>
-          <w:t>44</w:t>
+          <w:t>49</w:t>
         </w:r>
         <w:r>
           <w:rPr>
@@ -6096,7 +6096,7 @@
           <w14:ligatures w14:val="standardContextual"/>
         </w:rPr>
       </w:pPr>
-      <w:hyperlink w:anchor="_Toc231079652" w:history="1">
+      <w:hyperlink w:anchor="_Toc231081607" w:history="1">
         <w:r>
           <w:rPr>
             <w:rStyle w:val="Hipervnculo"/>
@@ -6123,7 +6123,7 @@
             <w:noProof/>
             <w:webHidden/>
           </w:rPr>
-          <w:instrText xml:space="preserve"> PAGEREF _Toc231079652 \h </w:instrText>
+          <w:instrText xml:space="preserve"> PAGEREF _Toc231081607 \h </w:instrText>
         </w:r>
         <w:r>
           <w:rPr>
@@ -6143,7 +6143,7 @@
             <w:noProof/>
             <w:webHidden/>
           </w:rPr>
-          <w:t>44</w:t>
+          <w:t>49</w:t>
         </w:r>
         <w:r>
           <w:rPr>
@@ -6169,7 +6169,7 @@
           <w14:ligatures w14:val="standardContextual"/>
         </w:rPr>
       </w:pPr>
-      <w:hyperlink w:anchor="_Toc231079653" w:history="1">
+      <w:hyperlink w:anchor="_Toc231081608" w:history="1">
         <w:r>
           <w:rPr>
             <w:rStyle w:val="Hipervnculo"/>
@@ -6196,7 +6196,7 @@
             <w:noProof/>
             <w:webHidden/>
           </w:rPr>
-          <w:instrText xml:space="preserve"> PAGEREF _Toc231079653 \h </w:instrText>
+          <w:instrText xml:space="preserve"> PAGEREF _Toc231081608 \h </w:instrText>
         </w:r>
         <w:r>
           <w:rPr>
@@ -6216,7 +6216,7 @@
             <w:noProof/>
             <w:webHidden/>
           </w:rPr>
-          <w:t>45</w:t>
+          <w:t>50</w:t>
         </w:r>
         <w:r>
           <w:rPr>
@@ -6242,7 +6242,7 @@
           <w14:ligatures w14:val="standardContextual"/>
         </w:rPr>
       </w:pPr>
-      <w:hyperlink w:anchor="_Toc231079654" w:history="1">
+      <w:hyperlink w:anchor="_Toc231081609" w:history="1">
         <w:r>
           <w:rPr>
             <w:rStyle w:val="Hipervnculo"/>
@@ -6269,7 +6269,7 @@
             <w:noProof/>
             <w:webHidden/>
           </w:rPr>
-          <w:instrText xml:space="preserve"> PAGEREF _Toc231079654 \h </w:instrText>
+          <w:instrText xml:space="preserve"> PAGEREF _Toc231081609 \h </w:instrText>
         </w:r>
         <w:r>
           <w:rPr>
@@ -6289,7 +6289,7 @@
             <w:noProof/>
             <w:webHidden/>
           </w:rPr>
-          <w:t>45</w:t>
+          <w:t>50</w:t>
         </w:r>
         <w:r>
           <w:rPr>
@@ -6315,7 +6315,7 @@
           <w14:ligatures w14:val="standardContextual"/>
         </w:rPr>
       </w:pPr>
-      <w:hyperlink w:anchor="_Toc231079655" w:history="1">
+      <w:hyperlink w:anchor="_Toc231081610" w:history="1">
         <w:r>
           <w:rPr>
             <w:rStyle w:val="Hipervnculo"/>
@@ -6342,7 +6342,7 @@
             <w:noProof/>
             <w:webHidden/>
           </w:rPr>
-          <w:instrText xml:space="preserve"> PAGEREF _Toc231079655 \h </w:instrText>
+          <w:instrText xml:space="preserve"> PAGEREF _Toc231081610 \h </w:instrText>
         </w:r>
         <w:r>
           <w:rPr>
@@ -6362,7 +6362,7 @@
             <w:noProof/>
             <w:webHidden/>
           </w:rPr>
-          <w:t>45</w:t>
+          <w:t>50</w:t>
         </w:r>
         <w:r>
           <w:rPr>
@@ -6388,7 +6388,7 @@
           <w14:ligatures w14:val="standardContextual"/>
         </w:rPr>
       </w:pPr>
-      <w:hyperlink w:anchor="_Toc231079656" w:history="1">
+      <w:hyperlink w:anchor="_Toc231081611" w:history="1">
         <w:r>
           <w:rPr>
             <w:rStyle w:val="Hipervnculo"/>
@@ -6415,7 +6415,7 @@
             <w:noProof/>
             <w:webHidden/>
           </w:rPr>
-          <w:instrText xml:space="preserve"> PAGEREF _Toc231079656 \h </w:instrText>
+          <w:instrText xml:space="preserve"> PAGEREF _Toc231081611 \h </w:instrText>
         </w:r>
         <w:r>
           <w:rPr>
@@ -6435,7 +6435,7 @@
             <w:noProof/>
             <w:webHidden/>
           </w:rPr>
-          <w:t>46</w:t>
+          <w:t>51</w:t>
         </w:r>
         <w:r>
           <w:rPr>
@@ -6460,7 +6460,7 @@
       <w:pPr>
         <w:pStyle w:val="Ttulo1"/>
       </w:pPr>
-      <w:bookmarkStart w:id="8" w:name="_Toc231079582"/>
+      <w:bookmarkStart w:id="8" w:name="_Toc231081537"/>
       <w:r>
         <w:lastRenderedPageBreak/>
         <w:t>Índice de figuras</w:t>
@@ -6491,7 +6491,7 @@
       <w:r>
         <w:fldChar w:fldCharType="separate"/>
       </w:r>
-      <w:hyperlink w:anchor="_Toc231079657" w:history="1">
+      <w:hyperlink w:anchor="_Toc231081612" w:history="1">
         <w:r>
           <w:rPr>
             <w:rStyle w:val="Hipervnculo"/>
@@ -6518,7 +6518,7 @@
             <w:noProof/>
             <w:webHidden/>
           </w:rPr>
-          <w:instrText xml:space="preserve"> PAGEREF _Toc231079657 \h </w:instrText>
+          <w:instrText xml:space="preserve"> PAGEREF _Toc231081612 \h </w:instrText>
         </w:r>
         <w:r>
           <w:rPr>
@@ -6538,7 +6538,7 @@
             <w:noProof/>
             <w:webHidden/>
           </w:rPr>
-          <w:t>26</w:t>
+          <w:t>29</w:t>
         </w:r>
         <w:r>
           <w:rPr>
@@ -6564,7 +6564,7 @@
           <w14:ligatures w14:val="standardContextual"/>
         </w:rPr>
       </w:pPr>
-      <w:hyperlink w:anchor="_Toc231079658" w:history="1">
+      <w:hyperlink w:anchor="_Toc231081613" w:history="1">
         <w:r>
           <w:rPr>
             <w:rStyle w:val="Hipervnculo"/>
@@ -6591,7 +6591,7 @@
             <w:noProof/>
             <w:webHidden/>
           </w:rPr>
-          <w:instrText xml:space="preserve"> PAGEREF _Toc231079658 \h </w:instrText>
+          <w:instrText xml:space="preserve"> PAGEREF _Toc231081613 \h </w:instrText>
         </w:r>
         <w:r>
           <w:rPr>
@@ -6611,7 +6611,7 @@
             <w:noProof/>
             <w:webHidden/>
           </w:rPr>
-          <w:t>29</w:t>
+          <w:t>32</w:t>
         </w:r>
         <w:r>
           <w:rPr>
@@ -6637,7 +6637,7 @@
           <w14:ligatures w14:val="standardContextual"/>
         </w:rPr>
       </w:pPr>
-      <w:hyperlink w:anchor="_Toc231079659" w:history="1">
+      <w:hyperlink w:anchor="_Toc231081614" w:history="1">
         <w:r>
           <w:rPr>
             <w:rStyle w:val="Hipervnculo"/>
@@ -6664,7 +6664,7 @@
             <w:noProof/>
             <w:webHidden/>
           </w:rPr>
-          <w:instrText xml:space="preserve"> PAGEREF _Toc231079659 \h </w:instrText>
+          <w:instrText xml:space="preserve"> PAGEREF _Toc231081614 \h </w:instrText>
         </w:r>
         <w:r>
           <w:rPr>
@@ -6684,7 +6684,7 @@
             <w:noProof/>
             <w:webHidden/>
           </w:rPr>
-          <w:t>30</w:t>
+          <w:t>33</w:t>
         </w:r>
         <w:r>
           <w:rPr>
@@ -6710,7 +6710,7 @@
           <w14:ligatures w14:val="standardContextual"/>
         </w:rPr>
       </w:pPr>
-      <w:hyperlink w:anchor="_Toc231079660" w:history="1">
+      <w:hyperlink w:anchor="_Toc231081615" w:history="1">
         <w:r>
           <w:rPr>
             <w:rStyle w:val="Hipervnculo"/>
@@ -6737,7 +6737,7 @@
             <w:noProof/>
             <w:webHidden/>
           </w:rPr>
-          <w:instrText xml:space="preserve"> PAGEREF _Toc231079660 \h </w:instrText>
+          <w:instrText xml:space="preserve"> PAGEREF _Toc231081615 \h </w:instrText>
         </w:r>
         <w:r>
           <w:rPr>
@@ -6757,7 +6757,7 @@
             <w:noProof/>
             <w:webHidden/>
           </w:rPr>
-          <w:t>31</w:t>
+          <w:t>34</w:t>
         </w:r>
         <w:r>
           <w:rPr>
@@ -6783,7 +6783,7 @@
           <w14:ligatures w14:val="standardContextual"/>
         </w:rPr>
       </w:pPr>
-      <w:hyperlink w:anchor="_Toc231079661" w:history="1">
+      <w:hyperlink w:anchor="_Toc231081616" w:history="1">
         <w:r>
           <w:rPr>
             <w:rStyle w:val="Hipervnculo"/>
@@ -6810,7 +6810,7 @@
             <w:noProof/>
             <w:webHidden/>
           </w:rPr>
-          <w:instrText xml:space="preserve"> PAGEREF _Toc231079661 \h </w:instrText>
+          <w:instrText xml:space="preserve"> PAGEREF _Toc231081616 \h </w:instrText>
         </w:r>
         <w:r>
           <w:rPr>
@@ -6830,7 +6830,80 @@
             <w:noProof/>
             <w:webHidden/>
           </w:rPr>
-          <w:t>32</w:t>
+          <w:t>35</w:t>
+        </w:r>
+        <w:r>
+          <w:rPr>
+            <w:noProof/>
+            <w:webHidden/>
+          </w:rPr>
+          <w:fldChar w:fldCharType="end"/>
+        </w:r>
+      </w:hyperlink>
+    </w:p>
+    <w:p>
+      <w:pPr>
+        <w:pStyle w:val="Tabladeilustraciones"/>
+        <w:tabs>
+          <w:tab w:val="right" w:leader="dot" w:pos="8832"/>
+        </w:tabs>
+        <w:rPr>
+          <w:rFonts w:asciiTheme="minorHAnsi" w:hAnsiTheme="minorHAnsi"/>
+          <w:noProof/>
+          <w:kern w:val="2"/>
+          <w:szCs w:val="24"/>
+          <w:lang w:val="es-CL" w:eastAsia="es-CL"/>
+          <w14:ligatures w14:val="standardContextual"/>
+        </w:rPr>
+      </w:pPr>
+      <w:hyperlink w:anchor="_Toc231081617" w:history="1">
+        <w:r>
+          <w:rPr>
+            <w:rStyle w:val="Hipervnculo"/>
+            <w:noProof/>
+          </w:rPr>
+          <w:t>Figura 6. Respuesta del retorno a un shock del cobre mediante proyecciones locales (Jordà, 2005), IC 95%.</w:t>
+        </w:r>
+        <w:r>
+          <w:rPr>
+            <w:noProof/>
+            <w:webHidden/>
+          </w:rPr>
+          <w:tab/>
+        </w:r>
+        <w:r>
+          <w:rPr>
+            <w:noProof/>
+            <w:webHidden/>
+          </w:rPr>
+          <w:fldChar w:fldCharType="begin"/>
+        </w:r>
+        <w:r>
+          <w:rPr>
+            <w:noProof/>
+            <w:webHidden/>
+          </w:rPr>
+          <w:instrText xml:space="preserve"> PAGEREF _Toc231081617 \h </w:instrText>
+        </w:r>
+        <w:r>
+          <w:rPr>
+            <w:noProof/>
+            <w:webHidden/>
+          </w:rPr>
+        </w:r>
+        <w:r>
+          <w:rPr>
+            <w:noProof/>
+            <w:webHidden/>
+          </w:rPr>
+          <w:fldChar w:fldCharType="separate"/>
+        </w:r>
+        <w:r>
+          <w:rPr>
+            <w:noProof/>
+            <w:webHidden/>
+          </w:rPr>
+          <w:t>38</w:t>
         </w:r>
         <w:r>
           <w:rPr>
@@ -6855,7 +6928,7 @@
       <w:pPr>
         <w:pStyle w:val="Ttulo1"/>
       </w:pPr>
-      <w:bookmarkStart w:id="9" w:name="_Toc231079583"/>
+      <w:bookmarkStart w:id="9" w:name="_Toc231081538"/>
       <w:r>
         <w:lastRenderedPageBreak/>
         <w:t xml:space="preserve">Lista de </w:t>
@@ -7464,7 +7537,7 @@
       <w:pPr>
         <w:pStyle w:val="Ttulo1"/>
       </w:pPr>
-      <w:bookmarkStart w:id="10" w:name="_Toc231079584"/>
+      <w:bookmarkStart w:id="10" w:name="_Toc231081539"/>
       <w:r>
         <w:lastRenderedPageBreak/>
         <w:t>Capítulo 1 — Introducción</w:t>
@@ -7475,7 +7548,7 @@
       <w:pPr>
         <w:pStyle w:val="Ttulo2"/>
       </w:pPr>
-      <w:bookmarkStart w:id="11" w:name="_Toc231079585"/>
+      <w:bookmarkStart w:id="11" w:name="_Toc231081540"/>
       <w:r>
         <w:t>1.1 Contextualización</w:t>
       </w:r>
@@ -7560,7 +7633,7 @@
       <w:pPr>
         <w:pStyle w:val="Ttulo2"/>
       </w:pPr>
-      <w:bookmarkStart w:id="12" w:name="_Toc231079586"/>
+      <w:bookmarkStart w:id="12" w:name="_Toc231081541"/>
       <w:r>
         <w:lastRenderedPageBreak/>
         <w:t>1.2 Problema de investigación y justificación</w:t>
@@ -7673,7 +7746,7 @@
       <w:pPr>
         <w:pStyle w:val="Ttulo2"/>
       </w:pPr>
-      <w:bookmarkStart w:id="13" w:name="_Toc231079587"/>
+      <w:bookmarkStart w:id="13" w:name="_Toc231081542"/>
       <w:r>
         <w:lastRenderedPageBreak/>
         <w:t>1.3 Pregunta y objetivos de investigación</w:t>
@@ -7856,7 +7929,7 @@
       <w:pPr>
         <w:pStyle w:val="Ttulo2"/>
       </w:pPr>
-      <w:bookmarkStart w:id="14" w:name="_Toc231079588"/>
+      <w:bookmarkStart w:id="14" w:name="_Toc231081543"/>
       <w:r>
         <w:t>1.4 Hipótesis general</w:t>
       </w:r>
@@ -7899,7 +7972,7 @@
       <w:pPr>
         <w:pStyle w:val="Ttulo2"/>
       </w:pPr>
-      <w:bookmarkStart w:id="15" w:name="_Toc231079589"/>
+      <w:bookmarkStart w:id="15" w:name="_Toc231081544"/>
       <w:r>
         <w:t>1.5 Aspectos metodológicos y alcance</w:t>
       </w:r>
@@ -8002,7 +8075,7 @@
       <w:pPr>
         <w:pStyle w:val="Ttulo2"/>
       </w:pPr>
-      <w:bookmarkStart w:id="16" w:name="_Toc231079590"/>
+      <w:bookmarkStart w:id="16" w:name="_Toc231081545"/>
       <w:r>
         <w:t>1.6 Aportes esperados</w:t>
       </w:r>
@@ -8056,7 +8129,7 @@
       <w:pPr>
         <w:pStyle w:val="Ttulo2"/>
       </w:pPr>
-      <w:bookmarkStart w:id="17" w:name="_Toc231079591"/>
+      <w:bookmarkStart w:id="17" w:name="_Toc231081546"/>
       <w:r>
         <w:t>1.7 Estructura de la tesis</w:t>
       </w:r>
@@ -8099,7 +8172,7 @@
       <w:pPr>
         <w:pStyle w:val="Ttulo1"/>
       </w:pPr>
-      <w:bookmarkStart w:id="18" w:name="_Toc231079592"/>
+      <w:bookmarkStart w:id="18" w:name="_Toc231081547"/>
       <w:r>
         <w:lastRenderedPageBreak/>
         <w:t>Capítulo 2 — Marco teórico y revisión de literatura</w:t>
@@ -8110,7 +8183,7 @@
       <w:pPr>
         <w:pStyle w:val="Ttulo2"/>
       </w:pPr>
-      <w:bookmarkStart w:id="19" w:name="_Toc231079593"/>
+      <w:bookmarkStart w:id="19" w:name="_Toc231081548"/>
       <w:r>
         <w:t>2.1 Determinantes macroeconómicos de los retornos accionarios</w:t>
       </w:r>
@@ -8331,21 +8404,8 @@
     </w:p>
     <w:p>
       <w:r>
-        <w:rPr>
-          <w:color w:val="8A5A18"/>
-          <w:highlight w:val="yellow"/>
-        </w:rPr>
-        <w:t xml:space="preserve">[COMPLETAR: revisión de </w:t>
-      </w:r>
-      <w:r>
-        <w:rPr>
-          <w:color w:val="8A5A18"/>
-          <w:highlight w:val="yellow"/>
-        </w:rPr>
-        <w:t>literatura reciente (post-2010) sobre factores macro y retornos en</w:t>
-      </w:r>
-    </w:p>
-    <w:p>
+        <w:t xml:space="preserve">La evidencia reciente confirma la vigencia de este enfoque en </w:t>
+      </w:r>
       <w:r>
         <w:rPr>
           <w:b/>
@@ -8353,14 +8413,72 @@
         <w:t>mercados emergentes</w:t>
       </w:r>
       <w:r>
-        <w:t>, que es el contexto más cercano al caso chileno.]</w:t>
+        <w:t>, contexto</w:t>
+      </w:r>
+    </w:p>
+    <w:p>
+      <w:r>
+        <w:t>más cercano al caso chileno. Diversos estudios que contrastan el APT frente al CAPM en bolsas</w:t>
+      </w:r>
+    </w:p>
+    <w:p>
+      <w:r>
+        <w:t xml:space="preserve">emergentes hallan que el primero se sostiene mejor y que el </w:t>
+      </w:r>
+      <w:r>
+        <w:rPr>
+          <w:b/>
+        </w:rPr>
+        <w:t>tipo de cambio</w:t>
+      </w:r>
+      <w:r>
+        <w:t xml:space="preserve"> explica de manera</w:t>
+      </w:r>
+    </w:p>
+    <w:p>
+      <w:r>
+        <w:t>consistente los retornos. Específicamente para Chile, Pedersen (2015), en un documento de trabajo</w:t>
+      </w:r>
+    </w:p>
+    <w:p>
+      <w:r>
+        <w:t>del Banco Central de Chile, muestra que el efecto del precio del cobre sobre la economía depende</w:t>
+      </w:r>
+    </w:p>
+    <w:p>
+      <w:r>
+        <w:t xml:space="preserve">del </w:t>
+      </w:r>
+      <w:r>
+        <w:rPr>
+          <w:b/>
+        </w:rPr>
+        <w:t>tipo de shock</w:t>
+      </w:r>
+      <w:r>
+        <w:t xml:space="preserve"> —las alzas por demanda elevan el crecimiento, mientras que los shocks de</w:t>
+      </w:r>
+    </w:p>
+    <w:p>
+      <w:r>
+        <w:t>oferta o de demanda específica del cobre tienen efectos negativos de corto plazo—, lo que motiva</w:t>
+      </w:r>
+    </w:p>
+    <w:p>
+      <w:r>
+        <w:t>distinguir la naturaleza de las perturbaciones. Este hallazgo es directamente relevante para la</w:t>
+      </w:r>
+    </w:p>
+    <w:p>
+      <w:r>
+        <w:t>identificación de shocks de la presente tesis.</w:t>
       </w:r>
     </w:p>
     <w:p>
       <w:pPr>
         <w:pStyle w:val="Ttulo2"/>
       </w:pPr>
-      <w:bookmarkStart w:id="20" w:name="_Toc231079594"/>
+      <w:bookmarkStart w:id="20" w:name="_Toc231081549"/>
       <w:r>
         <w:t>2.2 Precios de commodities y valoración de empresas mineras</w:t>
       </w:r>
@@ -8383,12 +8501,16 @@
     </w:p>
     <w:p>
       <w:r>
+        <w:lastRenderedPageBreak/>
         <w:t>un apalancamiento operativo típicamente elevado en la minería, amplifican el efecto sobre los</w:t>
       </w:r>
     </w:p>
     <w:p>
       <w:r>
-        <w:t>márgenes y el valor de la firma. La literatura sobre empresas de recursos naturales ha</w:t>
+        <w:t xml:space="preserve">márgenes y el valor de la firma. La </w:t>
+      </w:r>
+      <w:r>
+        <w:t>literatura sobre empresas de recursos naturales ha</w:t>
       </w:r>
     </w:p>
     <w:p>
@@ -8427,37 +8549,74 @@
         <w:t>acciones mineras y precios de metales</w:t>
       </w:r>
       <w:r>
-        <w:t xml:space="preserve"> es comparativamente más</w:t>
-      </w:r>
-    </w:p>
-    <w:p>
-      <w:r>
-        <w:t xml:space="preserve">escasa que la del sector energético, lo que </w:t>
-      </w:r>
-      <w:r>
-        <w:t>constituye parte del vacío que esta tesis aborda.</w:t>
-      </w:r>
-    </w:p>
-    <w:p>
+        <w:t xml:space="preserve"> es más reciente y</w:t>
+      </w:r>
+    </w:p>
+    <w:p>
+      <w:r>
+        <w:t>predominantemente internacional. Zhu, Chen y Chen (2021), en *Resources Policy*, documentan que los</w:t>
+      </w:r>
+    </w:p>
+    <w:p>
+      <w:r>
+        <w:t>precios de los metales no ferrosos tienen un impacto positivo sobre la valoración bursátil del</w:t>
+      </w:r>
+    </w:p>
+    <w:p>
+      <w:r>
+        <w:t>sector, con efectos que se intensifican tras la crisis financiera de 2008 (financiarización y</w:t>
+      </w:r>
+    </w:p>
+    <w:p>
+      <w:r>
+        <w:t>co-movimiento de los mercados de commodities). Wallenstein, Mendiola y Chávez-Bedoya, en el marco</w:t>
+      </w:r>
+    </w:p>
+    <w:p>
+      <w:r>
+        <w:t xml:space="preserve">de la CLADEA, encuentran una relación positiva pero </w:t>
+      </w:r>
       <w:r>
         <w:rPr>
-          <w:color w:val="8A5A18"/>
-          <w:highlight w:val="yellow"/>
+          <w:b/>
         </w:rPr>
+        <w:t>inelástica</w:t>
+      </w:r>
+      <w:r>
+        <w:t xml:space="preserve"> entre los retornos de acciones</w:t>
+      </w:r>
+    </w:p>
+    <w:p>
+      <w:r>
+        <w:t>cupríferas y el precio del cobre, más fuerte en empresas de gran capitalización. La literatura</w:t>
+      </w:r>
+    </w:p>
+    <w:p>
+      <w:r>
+        <w:t>reciente en *Mineral Economics* (2025) modela, mediante ecuaciones estructurales, el vínculo entre</w:t>
+      </w:r>
+    </w:p>
+    <w:p>
+      <w:r>
+        <w:t>los precios del cobre y del oro y las cotizaciones mineras en las bolsas de Nueva York, Toronto y</w:t>
+      </w:r>
+    </w:p>
+    <w:p>
+      <w:r>
+        <w:t>Australia. Es notable que esta literatura, pese a su relevancia, **excluye sistemáticamente a</w:t>
+      </w:r>
+    </w:p>
+    <w:p>
+      <w:r>
         <w:lastRenderedPageBreak/>
-        <w:t>[COMPLETAR: estudios sobre exposición de acciones mineras al precio del cobre u otros metales;</w:t>
-      </w:r>
-    </w:p>
-    <w:p>
-      <w:r>
-        <w:t>distinguir exposición a precio spot vs. futuros.]</w:t>
+        <w:t>Chile** —primer productor mundial de cobre—, omisión que la presente investigación subsana.</w:t>
       </w:r>
     </w:p>
     <w:p>
       <w:pPr>
         <w:pStyle w:val="Ttulo2"/>
       </w:pPr>
-      <w:bookmarkStart w:id="21" w:name="_Toc231079595"/>
+      <w:bookmarkStart w:id="21" w:name="_Toc231081550"/>
       <w:r>
         <w:t>2.3 Tipo de cambio y exposición de empresas exportadoras</w:t>
       </w:r>
@@ -8515,7 +8674,10 @@
     </w:p>
     <w:p>
       <w:r>
-        <w:t>acción. Esta ambigüedad, lejos de ser una debilidad, constituye una pregunta empírica de</w:t>
+        <w:t xml:space="preserve">acción. Esta ambigüedad, lejos de ser una </w:t>
+      </w:r>
+      <w:r>
+        <w:t>debilidad, constituye una pregunta empírica de</w:t>
       </w:r>
     </w:p>
     <w:p>
@@ -8532,9 +8694,8 @@
       <w:pPr>
         <w:pStyle w:val="Ttulo2"/>
       </w:pPr>
-      <w:bookmarkStart w:id="22" w:name="_Toc231079596"/>
-      <w:r>
-        <w:lastRenderedPageBreak/>
+      <w:bookmarkStart w:id="22" w:name="_Toc231081551"/>
+      <w:r>
         <w:t>2.4 Cobre, tipo de cambio y la economía chilena</w:t>
       </w:r>
       <w:bookmarkEnd w:id="22"/>
@@ -8555,6 +8716,7 @@
     </w:p>
     <w:p>
       <w:r>
+        <w:lastRenderedPageBreak/>
         <w:t>estrecha relación entre los términos de intercambio de los países exportadores de materias</w:t>
       </w:r>
     </w:p>
@@ -8595,49 +8757,161 @@
     </w:p>
     <w:p>
       <w:r>
+        <w:t>La evidencia empírica chilena puede ordenarse en tres eslabones. El primero, **cobre ↔ tipo de</w:t>
+      </w:r>
+    </w:p>
+    <w:p>
+      <w:r>
+        <w:t>cambio**, es el más sólido: Chen y Rogoff (2003) y Chen, Rogoff y Rossi (2010) sitúan al peso</w:t>
+      </w:r>
+    </w:p>
+    <w:p>
+      <w:r>
+        <w:t>chileno entre las *commodity currencies* canónicas, y Pincheira y Hardy (2019), en *Resources</w:t>
+      </w:r>
+    </w:p>
+    <w:p>
+      <w:r>
+        <w:t>Policy*, muestran que el tipo de cambio chileno tiene poder predictivo sobre los retornos del</w:t>
+      </w:r>
+    </w:p>
+    <w:p>
+      <w:r>
+        <w:t>índice de metales base —incluido el cobre—, dado que este representa cerca de la mitad de las</w:t>
+      </w:r>
+    </w:p>
+    <w:p>
+      <w:r>
+        <w:t>exportaciones del país. Labbé y De Gregorio (2011), en un documento de trabajo del Banco Central</w:t>
+      </w:r>
+    </w:p>
+    <w:p>
+      <w:r>
+        <w:t>de Chile, documentan cómo el tipo de cambio real opera como *amortiguador* de los shocks del precio</w:t>
+      </w:r>
+    </w:p>
+    <w:p>
+      <w:r>
+        <w:lastRenderedPageBreak/>
+        <w:t xml:space="preserve">del cobre. El segundo eslabón, </w:t>
+      </w:r>
+      <w:r>
         <w:rPr>
-          <w:color w:val="8A5A18"/>
-          <w:highlight w:val="yellow"/>
+          <w:b/>
         </w:rPr>
-        <w:t>[COMPLETAR — NÚCLEO DEL APORTE: evidencia empírica chilena sobre la relación cobre–peso–mercado</w:t>
-      </w:r>
-    </w:p>
-    <w:p>
-      <w:r>
-        <w:t xml:space="preserve">accionario. Buscar en Documentos de </w:t>
-      </w:r>
-      <w:r>
-        <w:t>Trabajo del Banco Central de Chile, publicaciones de</w:t>
-      </w:r>
-    </w:p>
-    <w:p>
-      <w:r>
-        <w:t>Cochilco, revistas locales (Estudios de Economía, Revista de Análisis Económico) y bases</w:t>
-      </w:r>
-    </w:p>
-    <w:p>
-      <w:r>
-        <w:t>internacionales. Este es el bloque donde se debe demostrar el vacío específico que la tesis</w:t>
-      </w:r>
-    </w:p>
-    <w:p>
-      <w:r>
-        <w:t xml:space="preserve">llena: la </w:t>
-      </w:r>
-      <w:r>
-        <w:t>escasez de estudios que vinculen el cobre con la valoración bursátil de las propias</w:t>
-      </w:r>
-    </w:p>
-    <w:p>
-      <w:r>
-        <w:t>mineras con exposición a Chile.]</w:t>
+        <w:t>cobre ↔ mercado accionario chileno agregado</w:t>
+      </w:r>
+      <w:r>
+        <w:t>, está representado</w:t>
+      </w:r>
+    </w:p>
+    <w:p>
+      <w:r>
+        <w:t>de forma directa por Zurita, Fuentes y Gregoire (2005), quienes, mediante un modelo APT sobre</w:t>
+      </w:r>
+    </w:p>
+    <w:p>
+      <w:r>
+        <w:t xml:space="preserve">retornos accionarios chilenos (1990–2003), encuentran que las </w:t>
+      </w:r>
+      <w:r>
+        <w:rPr>
+          <w:b/>
+        </w:rPr>
+        <w:t>sorpresas en el precio del cobre</w:t>
+      </w:r>
+    </w:p>
+    <w:p>
+      <w:r>
+        <w:t>están preciadas con una prima por riesgo estadísticamente significativa, rechazando el CAPM en</w:t>
+      </w:r>
+    </w:p>
+    <w:p>
+      <w:r>
+        <w:t xml:space="preserve">favor del APT. El tercer eslabón, </w:t>
+      </w:r>
+      <w:r>
+        <w:rPr>
+          <w:b/>
+        </w:rPr>
+        <w:t>cobre ↔ acciones mineras</w:t>
+      </w:r>
+      <w:r>
+        <w:t>, solo está documentado a nivel</w:t>
+      </w:r>
+    </w:p>
+    <w:p>
+      <w:r>
+        <w:t>internacional: Wallenstein, Mendiola y Chávez-Bedoya (CLADEA) hallan una relación positiva pero</w:t>
+      </w:r>
+    </w:p>
+    <w:p>
+      <w:r>
+        <w:t>inelástica entre los retornos de acciones cupríferas y el precio del cobre, y la literatura</w:t>
+      </w:r>
+    </w:p>
+    <w:p>
+      <w:r>
+        <w:t>reciente en *Mineral Economics* (2025) modela ese vínculo para las bolsas de Nueva York, Toronto y</w:t>
+      </w:r>
+    </w:p>
+    <w:p>
+      <w:r>
+        <w:t>Australia —excluyendo explícitamente a Chile y la Bolsa de Santiago—.</w:t>
+      </w:r>
+    </w:p>
+    <w:p>
+      <w:r>
+        <w:rPr>
+          <w:b/>
+        </w:rPr>
+        <w:t>El vacío que esta tesis llena</w:t>
+      </w:r>
+      <w:r>
+        <w:t xml:space="preserve"> emerge con nitidez de esa revisión: no se identificó ningún</w:t>
+      </w:r>
+    </w:p>
+    <w:p>
+      <w:r>
+        <w:t>estudio académico que estime econométricamente el efecto del precio del cobre y las variables</w:t>
+      </w:r>
+    </w:p>
+    <w:p>
+      <w:r>
+        <w:t>macroeconómicas sobre los retornos de las **acciones cupríferas con exposición a Chile a nivel de</w:t>
+      </w:r>
+    </w:p>
+    <w:p>
+      <w:r>
+        <w:t>empresa**, ni que compare formalmente el mercado bursátil internacional con el chileno para el</w:t>
+      </w:r>
+    </w:p>
+    <w:p>
+      <w:r>
+        <w:t>período 2004–2024. El antecedente chileno más próximo (Zurita et al., 2005) trabaja con el índice</w:t>
+      </w:r>
+    </w:p>
+    <w:p>
+      <w:r>
+        <w:t>agregado y termina en 2003; los estudios que sí desagregan a nivel de acción minera excluyen a</w:t>
+      </w:r>
+    </w:p>
+    <w:p>
+      <w:r>
+        <w:lastRenderedPageBreak/>
+        <w:t>Chile. La presente investigación se ubica, por tanto, en la intersección no cubierta de tres</w:t>
+      </w:r>
+    </w:p>
+    <w:p>
+      <w:r>
+        <w:t>literaturas bien establecidas por separado.</w:t>
       </w:r>
     </w:p>
     <w:p>
       <w:pPr>
         <w:pStyle w:val="Ttulo2"/>
       </w:pPr>
-      <w:bookmarkStart w:id="23" w:name="_Toc231079597"/>
+      <w:bookmarkStart w:id="23" w:name="_Toc231081552"/>
       <w:r>
         <w:t>2.5 Eficiencia informacional y segmentación de mercados</w:t>
       </w:r>
@@ -8655,7 +8929,6 @@
     </w:p>
     <w:p>
       <w:r>
-        <w:lastRenderedPageBreak/>
         <w:t>mercado** (Fama, 1970) sostiene que los precios incorporan la información disponible; sin embargo,</w:t>
       </w:r>
     </w:p>
@@ -8692,7 +8965,10 @@
     </w:p>
     <w:p>
       <w:r>
-        <w:t>Este marco fundamenta la dimensión comparativa de la presente investigación: dado que las mismas</w:t>
+        <w:t xml:space="preserve">Este marco fundamenta la dimensión comparativa de la presente investigación: dado que las </w:t>
+      </w:r>
+      <w:r>
+        <w:t>mismas</w:t>
       </w:r>
     </w:p>
     <w:p>
@@ -8712,19 +8988,70 @@
     </w:p>
     <w:p>
       <w:r>
-        <w:t>del diseño de triangulación por muestras. [COMPLETAR: evidencia sobre integración/segmentación y</w:t>
-      </w:r>
-    </w:p>
-    <w:p>
-      <w:r>
-        <w:t>eficiencia informacional del mercado bursátil chileno respecto de los mercados internacionales.]</w:t>
+        <w:t>del diseño de triangulación por muestras. La literatura sobre la integración del mercado bursátil</w:t>
+      </w:r>
+    </w:p>
+    <w:p>
+      <w:r>
+        <w:lastRenderedPageBreak/>
+        <w:t>chileno —en particular los estudios del Mercado Integrado Latinoamericano (MILA), que reúne a</w:t>
+      </w:r>
+    </w:p>
+    <w:p>
+      <w:r>
+        <w:t xml:space="preserve">Chile, Colombia y Perú— documenta una integración </w:t>
+      </w:r>
+      <w:r>
+        <w:rPr>
+          <w:b/>
+        </w:rPr>
+        <w:t>parcial y dependiente del régimen</w:t>
+      </w:r>
+      <w:r>
+        <w:t>, con</w:t>
+      </w:r>
+    </w:p>
+    <w:p>
+      <w:r>
+        <w:t>correlaciones dinámicas que varían entre episodios de calma y de crisis (por ejemplo, en la</w:t>
+      </w:r>
+    </w:p>
+    <w:p>
+      <w:r>
+        <w:t>comparación entre el período previo a la crisis financiera global y la pandemia de COVID-19).</w:t>
+      </w:r>
+    </w:p>
+    <w:p>
+      <w:r>
+        <w:t xml:space="preserve">Asimismo, se ha mostrado que una mayor integración bursátil </w:t>
+      </w:r>
+      <w:r>
+        <w:rPr>
+          <w:b/>
+        </w:rPr>
+        <w:t>reduce la asimetría de información</w:t>
+      </w:r>
+    </w:p>
+    <w:p>
+      <w:r>
+        <w:t>y mejora la eficiencia de la inversión en América Latina. Esta evidencia respalda la hipótesis de</w:t>
+      </w:r>
+    </w:p>
+    <w:p>
+      <w:r>
+        <w:t>que el mercado chileno, comparativamente menos profundo, podría incorporar los shocks globales de</w:t>
+      </w:r>
+    </w:p>
+    <w:p>
+      <w:r>
+        <w:t>forma más lenta o incompleta que los mercados internacionales.</w:t>
       </w:r>
     </w:p>
     <w:p>
       <w:pPr>
         <w:pStyle w:val="Ttulo2"/>
       </w:pPr>
-      <w:bookmarkStart w:id="24" w:name="_Toc231079598"/>
+      <w:bookmarkStart w:id="24" w:name="_Toc231081553"/>
       <w:r>
         <w:t>2.6 Enfoques econométricos para la medición de impacto</w:t>
       </w:r>
@@ -8747,7 +9074,6 @@
     </w:p>
     <w:p>
       <w:r>
-        <w:lastRenderedPageBreak/>
         <w:t>Phillips y Perron (1988) y Kwiatkowski et al. (1992, KPSS), complementadas con el test de</w:t>
       </w:r>
     </w:p>
@@ -8777,15 +9103,13 @@
     </w:p>
     <w:p>
       <w:r>
+        <w:lastRenderedPageBreak/>
         <w:t>las variables presentan órdenes de integración mixtos. La dinámica de los shocks se modela</w:t>
       </w:r>
     </w:p>
     <w:p>
       <w:r>
-        <w:t xml:space="preserve">mediante vectores autorregresivos </w:t>
-      </w:r>
-      <w:r>
-        <w:t>siguiendo a Sims (1980), con funciones impulso-respuesta</w:t>
+        <w:t>mediante vectores autorregresivos siguiendo a Sims (1980), con funciones impulso-respuesta</w:t>
       </w:r>
     </w:p>
     <w:p>
@@ -8844,7 +9168,6 @@
     </w:p>
     <w:p>
       <w:r>
-        <w:lastRenderedPageBreak/>
         <w:t>de commodities, para reforzar la justificación del objetivo específico 5.]</w:t>
       </w:r>
     </w:p>
@@ -8852,7 +9175,7 @@
       <w:pPr>
         <w:pStyle w:val="Ttulo2"/>
       </w:pPr>
-      <w:bookmarkStart w:id="25" w:name="_Toc231079599"/>
+      <w:bookmarkStart w:id="25" w:name="_Toc231081554"/>
       <w:r>
         <w:t>2.7 Síntesis e identificación del vacío de investigación</w:t>
       </w:r>
@@ -8875,6 +9198,7 @@
     </w:p>
     <w:p>
       <w:r>
+        <w:lastRenderedPageBreak/>
         <w:t>frecuencia, en índices agregados antes que en sectores específicos. Segundo, la evidencia sobre</w:t>
       </w:r>
     </w:p>
@@ -8894,15 +9218,15 @@
         <w:t>sector energético</w:t>
       </w:r>
       <w:r>
-        <w:t>,</w:t>
-      </w:r>
-      <w:r>
-        <w:t xml:space="preserve"> quedando el cobre y la minería metálica</w:t>
-      </w:r>
-    </w:p>
-    <w:p>
-      <w:r>
-        <w:t>comparativamente menos estudiados a nivel de acciones. Tercero, la evidencia chilena vincula el</w:t>
+        <w:t>, quedando el cobre y la minería metálica</w:t>
+      </w:r>
+    </w:p>
+    <w:p>
+      <w:r>
+        <w:t xml:space="preserve">comparativamente menos estudiados a nivel de </w:t>
+      </w:r>
+      <w:r>
+        <w:t>acciones. Tercero, la evidencia chilena vincula el</w:t>
       </w:r>
     </w:p>
     <w:p>
@@ -8929,7 +9253,13 @@
         <w:rPr>
           <w:b/>
         </w:rPr>
-        <w:t>estabilidad de estas relaciones a lo largo de las fases del ciclo del cobre</w:t>
+        <w:t xml:space="preserve">estabilidad de estas </w:t>
+      </w:r>
+      <w:r>
+        <w:rPr>
+          <w:b/>
+        </w:rPr>
+        <w:t>relaciones a lo largo de las fases del ciclo del cobre</w:t>
       </w:r>
       <w:r>
         <w:t>. Cuarto, no se ha</w:t>
@@ -8967,11 +9297,7 @@
     </w:p>
     <w:p>
       <w:r>
-        <w:lastRenderedPageBreak/>
-        <w:t xml:space="preserve">varianza) y, de manera distintiva, la </w:t>
-      </w:r>
-      <w:r>
-        <w:t>evaluación de la estabilidad de dichas relaciones según la</w:t>
+        <w:t>varianza) y, de manera distintiva, la evaluación de la estabilidad de dichas relaciones según la</w:t>
       </w:r>
     </w:p>
     <w:p>
@@ -8983,7 +9309,7 @@
       <w:pPr>
         <w:pStyle w:val="Ttulo3"/>
       </w:pPr>
-      <w:bookmarkStart w:id="26" w:name="_Toc231079600"/>
+      <w:bookmarkStart w:id="26" w:name="_Toc231081555"/>
       <w:r>
         <w:t>Nota sobre la tabla de literatura</w:t>
       </w:r>
@@ -8996,6 +9322,7 @@
     </w:p>
     <w:p>
       <w:r>
+        <w:lastRenderedPageBreak/>
         <w:t>(ver `docs/revision_literatura.md`, sección final). Sintetizarla en prosa es lo que da solidez a</w:t>
       </w:r>
     </w:p>
@@ -9013,7 +9340,7 @@
       <w:pPr>
         <w:pStyle w:val="Ttulo1"/>
       </w:pPr>
-      <w:bookmarkStart w:id="27" w:name="_Toc231079601"/>
+      <w:bookmarkStart w:id="27" w:name="_Toc231081556"/>
       <w:r>
         <w:lastRenderedPageBreak/>
         <w:t>Capítulo 3 — Datos y metodología</w:t>
@@ -9024,7 +9351,7 @@
       <w:pPr>
         <w:pStyle w:val="Ttulo2"/>
       </w:pPr>
-      <w:bookmarkStart w:id="28" w:name="_Toc231079602"/>
+      <w:bookmarkStart w:id="28" w:name="_Toc231081557"/>
       <w:r>
         <w:t>3.1 Definición del universo de empresas y período</w:t>
       </w:r>
@@ -9201,10 +9528,7 @@
     </w:p>
     <w:p>
       <w:r>
-        <w:t xml:space="preserve">y ARDL; (ii) </w:t>
-      </w:r>
-      <w:r>
-        <w:t>el principal indicador de actividad doméstica (IMACEC) es de periodicidad</w:t>
+        <w:t>y ARDL; (ii) el principal indicador de actividad doméstica (IMACEC) es de periodicidad</w:t>
       </w:r>
     </w:p>
     <w:p>
@@ -9216,7 +9540,7 @@
       <w:pPr>
         <w:pStyle w:val="Ttulo2"/>
       </w:pPr>
-      <w:bookmarkStart w:id="29" w:name="_Toc231079603"/>
+      <w:bookmarkStart w:id="29" w:name="_Toc231081558"/>
       <w:r>
         <w:t>3.2 Variable dependiente</w:t>
       </w:r>
@@ -9275,7 +9599,7 @@
       <w:pPr>
         <w:pStyle w:val="Ttulo2"/>
       </w:pPr>
-      <w:bookmarkStart w:id="30" w:name="_Toc231079604"/>
+      <w:bookmarkStart w:id="30" w:name="_Toc231081559"/>
       <w:r>
         <w:t>3.3 Variables explicativas</w:t>
       </w:r>
@@ -9342,7 +9666,7 @@
       <w:pPr>
         <w:pStyle w:val="Ttulo2"/>
       </w:pPr>
-      <w:bookmarkStart w:id="31" w:name="_Toc231079605"/>
+      <w:bookmarkStart w:id="31" w:name="_Toc231081560"/>
       <w:r>
         <w:t>3.4 Tratamiento de datos y frecuencias mixtas</w:t>
       </w:r>
@@ -9350,7 +9674,10 @@
     </w:p>
     <w:p>
       <w:r>
-        <w:t>Todas las series se llevan a frecuencia mensual (último dato del mes para precios, índices y</w:t>
+        <w:t xml:space="preserve">Todas las series se llevan a frecuencia mensual </w:t>
+      </w:r>
+      <w:r>
+        <w:t>(último dato del mes para precios, índices y</w:t>
       </w:r>
     </w:p>
     <w:p>
@@ -9396,7 +9723,7 @@
       <w:pPr>
         <w:pStyle w:val="Ttulo2"/>
       </w:pPr>
-      <w:bookmarkStart w:id="32" w:name="_Toc231079606"/>
+      <w:bookmarkStart w:id="32" w:name="_Toc231081561"/>
       <w:r>
         <w:t>3.5 Datación de las fases del ciclo del cobre</w:t>
       </w:r>
@@ -9463,7 +9790,7 @@
       <w:pPr>
         <w:pStyle w:val="Ttulo2"/>
       </w:pPr>
-      <w:bookmarkStart w:id="33" w:name="_Toc231079607"/>
+      <w:bookmarkStart w:id="33" w:name="_Toc231081562"/>
       <w:r>
         <w:t>3.6 Estrategia econométrica</w:t>
       </w:r>
@@ -9473,7 +9800,7 @@
       <w:pPr>
         <w:pStyle w:val="Ttulo3"/>
       </w:pPr>
-      <w:bookmarkStart w:id="34" w:name="_Toc231079608"/>
+      <w:bookmarkStart w:id="34" w:name="_Toc231081563"/>
       <w:r>
         <w:t>3.6.1 Estacionariedad y orden de integración (OE1)</w:t>
       </w:r>
@@ -9513,7 +9840,7 @@
       <w:pPr>
         <w:pStyle w:val="Ttulo3"/>
       </w:pPr>
-      <w:bookmarkStart w:id="35" w:name="_Toc231079609"/>
+      <w:bookmarkStart w:id="35" w:name="_Toc231081564"/>
       <w:r>
         <w:t>3.6.2 Modelo de impacto: panel de efectos fijos (OE2)</w:t>
       </w:r>
@@ -9554,10 +9881,7 @@
         <w:t>Driscoll-Kraay</w:t>
       </w:r>
       <w:r>
-        <w:t xml:space="preserve">, robustos a </w:t>
-      </w:r>
-      <w:r>
-        <w:t>heterocedasticidad,</w:t>
+        <w:t>, robustos a heterocedasticidad,</w:t>
       </w:r>
     </w:p>
     <w:p>
@@ -9568,7 +9892,13 @@
         <w:rPr>
           <w:b/>
         </w:rPr>
-        <w:t>dependencia de sección cruzada</w:t>
+        <w:t xml:space="preserve">dependencia de sección </w:t>
+      </w:r>
+      <w:r>
+        <w:rPr>
+          <w:b/>
+        </w:rPr>
+        <w:t>cruzada</w:t>
       </w:r>
       <w:r>
         <w:t xml:space="preserve"> —esta última esperable dado el factor</w:t>
@@ -9607,7 +9937,7 @@
       <w:pPr>
         <w:pStyle w:val="Ttulo3"/>
       </w:pPr>
-      <w:bookmarkStart w:id="36" w:name="_Toc231079610"/>
+      <w:bookmarkStart w:id="36" w:name="_Toc231081565"/>
       <w:r>
         <w:t>3.6.3 Relaciones de largo plazo: cointegración (OE3)</w:t>
       </w:r>
@@ -9673,10 +10003,7 @@
     </w:p>
     <w:p>
       <w:r>
-        <w:t xml:space="preserve">donde y_t agrupa las variables en nivel I(1), </w:t>
-      </w:r>
-      <w:r>
-        <w:t>β′y_{t-1} es el término de corrección de error que</w:t>
+        <w:t>donde y_t agrupa las variables en nivel I(1), β′y_{t-1} es el término de corrección de error que</w:t>
       </w:r>
     </w:p>
     <w:p>
@@ -9708,7 +10035,7 @@
       <w:pPr>
         <w:pStyle w:val="Ttulo3"/>
       </w:pPr>
-      <w:bookmarkStart w:id="37" w:name="_Toc231079611"/>
+      <w:bookmarkStart w:id="37" w:name="_Toc231081566"/>
       <w:r>
         <w:t>3.6.4 Dinámica de shocks: VAR, impulso-respuesta y descomposición de varianza (OE4)</w:t>
       </w:r>
@@ -9821,14 +10148,17 @@
     </w:p>
     <w:p>
       <w:r>
-        <w:t>generalizadas (Pesaran y Shin, 1998), así como con tests de causalidad de Granger.</w:t>
+        <w:t xml:space="preserve">generalizadas (Pesaran y Shin, 1998), así </w:t>
+      </w:r>
+      <w:r>
+        <w:t>como con tests de causalidad de Granger.</w:t>
       </w:r>
     </w:p>
     <w:p>
       <w:pPr>
         <w:pStyle w:val="Ttulo3"/>
       </w:pPr>
-      <w:bookmarkStart w:id="38" w:name="_Toc231079612"/>
+      <w:bookmarkStart w:id="38" w:name="_Toc231081567"/>
       <w:r>
         <w:t>3.6.5 Estabilidad por fases del ciclo (OE5)</w:t>
       </w:r>
@@ -9862,10 +10192,7 @@
     </w:p>
     <w:p>
       <w:r>
-        <w:t xml:space="preserve">contracción. Como análisis de </w:t>
-      </w:r>
-      <w:r>
-        <w:t>robustez se considera un modelo de **cambio de régimen de</w:t>
+        <w:t>contracción. Como análisis de robustez se considera un modelo de **cambio de régimen de</w:t>
       </w:r>
     </w:p>
     <w:p>
@@ -9877,7 +10204,7 @@
       <w:pPr>
         <w:pStyle w:val="Ttulo3"/>
       </w:pPr>
-      <w:bookmarkStart w:id="39" w:name="_Toc231079613"/>
+      <w:bookmarkStart w:id="39" w:name="_Toc231081568"/>
       <w:r>
         <w:t>3.6.6 Comparación entre mercados: triangulación (OE6)</w:t>
       </w:r>
@@ -9885,16 +10212,16 @@
     </w:p>
     <w:p>
       <w:r>
-        <w:t xml:space="preserve">La totalidad del análisis precedente (3.6.1 a 3.6.5) se ejecuta de forma paralela sobre </w:t>
-      </w:r>
-      <w:r>
-        <w:t>las tres</w:t>
+        <w:t>La totalidad del análisis precedente (3.6.1 a 3.6.5) se ejecuta de forma paralela sobre las tres</w:t>
       </w:r>
     </w:p>
     <w:p>
       <w:r>
         <w:lastRenderedPageBreak/>
-        <w:t>muestras —cobre en el mercado global (B), cobre en el mercado chileno (A) y sector minero chileno</w:t>
+        <w:t xml:space="preserve">muestras —cobre en el </w:t>
+      </w:r>
+      <w:r>
+        <w:t>mercado global (B), cobre en el mercado chileno (A) y sector minero chileno</w:t>
       </w:r>
     </w:p>
     <w:p>
@@ -9931,7 +10258,7 @@
       <w:pPr>
         <w:pStyle w:val="Ttulo2"/>
       </w:pPr>
-      <w:bookmarkStart w:id="40" w:name="_Toc231079614"/>
+      <w:bookmarkStart w:id="40" w:name="_Toc231081569"/>
       <w:r>
         <w:t>3.7 Validación de supuestos y robustez</w:t>
       </w:r>
@@ -9981,7 +10308,7 @@
       <w:pPr>
         <w:pStyle w:val="Ttulo3"/>
       </w:pPr>
-      <w:bookmarkStart w:id="41" w:name="_Toc231079615"/>
+      <w:bookmarkStart w:id="41" w:name="_Toc231081570"/>
       <w:r>
         <w:lastRenderedPageBreak/>
         <w:t>Tabla 3.1 — Definición operativa de variables (resumen)</w:t>
@@ -9993,7 +10320,7 @@
         <w:pStyle w:val="Descripcin"/>
         <w:jc w:val="center"/>
       </w:pPr>
-      <w:bookmarkStart w:id="42" w:name="_Toc231079644"/>
+      <w:bookmarkStart w:id="42" w:name="_Toc231081599"/>
       <w:r>
         <w:rPr>
           <w:sz w:val="20"/>
@@ -11082,13 +11409,7 @@
               <w:rPr>
                 <w:sz w:val="20"/>
               </w:rPr>
-              <w:t xml:space="preserve">log(cap. </w:t>
-            </w:r>
-            <w:r>
-              <w:rPr>
-                <w:sz w:val="20"/>
-              </w:rPr>
-              <w:t>bursátil)</w:t>
+              <w:t>log(cap. bursátil)</w:t>
             </w:r>
           </w:p>
         </w:tc>
@@ -11358,7 +11679,7 @@
       <w:pPr>
         <w:pStyle w:val="Ttulo1"/>
       </w:pPr>
-      <w:bookmarkStart w:id="43" w:name="_Toc231079616"/>
+      <w:bookmarkStart w:id="43" w:name="_Toc231081571"/>
       <w:r>
         <w:lastRenderedPageBreak/>
         <w:t>Capítulo 4 — Resultados y discusión</w:t>
@@ -11369,7 +11690,7 @@
       <w:pPr>
         <w:pStyle w:val="Ttulo2"/>
       </w:pPr>
-      <w:bookmarkStart w:id="44" w:name="_Toc231079617"/>
+      <w:bookmarkStart w:id="44" w:name="_Toc231081572"/>
       <w:r>
         <w:t>4.1 Análisis descriptivo y propiedades de las series (OE1)</w:t>
       </w:r>
@@ -11519,7 +11840,7 @@
       <w:pPr>
         <w:pStyle w:val="Ttulo2"/>
       </w:pPr>
-      <w:bookmarkStart w:id="45" w:name="_Toc231079618"/>
+      <w:bookmarkStart w:id="45" w:name="_Toc231081573"/>
       <w:r>
         <w:t>4.2 Determinantes de los retornos: global vs local (OE2)</w:t>
       </w:r>
@@ -11540,7 +11861,7 @@
         <w:pStyle w:val="Descripcin"/>
         <w:jc w:val="center"/>
       </w:pPr>
-      <w:bookmarkStart w:id="46" w:name="_Toc231079645"/>
+      <w:bookmarkStart w:id="46" w:name="_Toc231081600"/>
       <w:r>
         <w:rPr>
           <w:sz w:val="20"/>
@@ -11745,7 +12066,13 @@
               <w:rPr>
                 <w:sz w:val="20"/>
               </w:rPr>
-              <w:t>* (sig.)</w:t>
+              <w:t xml:space="preserve">* </w:t>
+            </w:r>
+            <w:r>
+              <w:rPr>
+                <w:sz w:val="20"/>
+              </w:rPr>
+              <w:t>(sig.)</w:t>
             </w:r>
           </w:p>
         </w:tc>
@@ -12040,13 +12367,7 @@
         <w:rPr>
           <w:b/>
         </w:rPr>
-        <w:t xml:space="preserve">El cobre domina (H1 </w:t>
-      </w:r>
-      <w:r>
-        <w:rPr>
-          <w:b/>
-        </w:rPr>
-        <w:t>respaldada).</w:t>
+        <w:t>El cobre domina (H1 respaldada).</w:t>
       </w:r>
       <w:r>
         <w:t xml:space="preserve"> El coeficiente del cobre es positivo, de magnitud</w:t>
@@ -12139,7 +12460,7 @@
           <w:noProof/>
         </w:rPr>
         <w:drawing>
-          <wp:inline distT="0" distB="0" distL="0" distR="0" wp14:anchorId="18700359" wp14:editId="1C3D2AC7">
+          <wp:inline distT="0" distB="0" distL="0" distR="0" wp14:anchorId="7B35076D" wp14:editId="3C6ADFE7">
             <wp:extent cx="5394960" cy="2933107"/>
             <wp:effectExtent l="0" t="0" r="0" b="0"/>
             <wp:docPr id="1" name="Picture 1"/>
@@ -12180,7 +12501,7 @@
         <w:pStyle w:val="Descripcin"/>
         <w:jc w:val="center"/>
       </w:pPr>
-      <w:bookmarkStart w:id="47" w:name="_Toc231079657"/>
+      <w:bookmarkStart w:id="47" w:name="_Toc231081612"/>
       <w:r>
         <w:rPr>
           <w:sz w:val="20"/>
@@ -12217,7 +12538,7 @@
       <w:pPr>
         <w:pStyle w:val="Ttulo2"/>
       </w:pPr>
-      <w:bookmarkStart w:id="48" w:name="_Toc231079619"/>
+      <w:bookmarkStart w:id="48" w:name="_Toc231081574"/>
       <w:r>
         <w:t>4.3 Relaciones de largo plazo (OE3)</w:t>
       </w:r>
@@ -12245,7 +12566,10 @@
     <w:p>
       <w:r>
         <w:lastRenderedPageBreak/>
-        <w:t>cointegración** (estadístico de traza 32,1 &gt; 29,8 al 95%), lo que sugiere una relación de equilibrio</w:t>
+        <w:t xml:space="preserve">cointegración** </w:t>
+      </w:r>
+      <w:r>
+        <w:t>(estadístico de traza 32,1 &gt; 29,8 al 95%), lo que sugiere una relación de equilibrio</w:t>
       </w:r>
     </w:p>
     <w:p>
@@ -12274,10 +12598,7 @@
     </w:p>
     <w:p>
       <w:r>
-        <w:t xml:space="preserve">inestable** ante las pruebas que no admiten </w:t>
-      </w:r>
-      <w:r>
-        <w:t>quiebres. Confirmado ya el orden I(1) del tipo de cambio</w:t>
+        <w:t>inestable** ante las pruebas que no admiten quiebres. Confirmado ya el orden I(1) del tipo de cambio</w:t>
       </w:r>
     </w:p>
     <w:p>
@@ -12338,7 +12659,10 @@
         <w:t>6,68</w:t>
       </w:r>
       <w:r>
-        <w:t>, inferior al valor crítico al 5% (−4,92), de modo que **se rechaza la ausencia de</w:t>
+        <w:t xml:space="preserve">, </w:t>
+      </w:r>
+      <w:r>
+        <w:t>inferior al valor crítico al 5% (−4,92), de modo que **se rechaza la ausencia de</w:t>
       </w:r>
     </w:p>
     <w:p>
@@ -12367,10 +12691,7 @@
     </w:p>
     <w:p>
       <w:r>
-        <w:t xml:space="preserve">de 2008**, lo que explica por qué </w:t>
-      </w:r>
-      <w:r>
-        <w:t>las pruebas que ignoran el quiebre (ARDL/Johansen) arrojaban</w:t>
+        <w:t>de 2008**, lo que explica por qué las pruebas que ignoran el quiebre (ARDL/Johansen) arrojaban</w:t>
       </w:r>
     </w:p>
     <w:p>
@@ -12387,7 +12708,7 @@
       <w:pPr>
         <w:pStyle w:val="Ttulo2"/>
       </w:pPr>
-      <w:bookmarkStart w:id="49" w:name="_Toc231079620"/>
+      <w:bookmarkStart w:id="49" w:name="_Toc231081575"/>
       <w:r>
         <w:lastRenderedPageBreak/>
         <w:t>4.4 Dinámica de shocks (OE4)</w:t>
@@ -12409,7 +12730,7 @@
         <w:pStyle w:val="Descripcin"/>
         <w:jc w:val="center"/>
       </w:pPr>
-      <w:bookmarkStart w:id="50" w:name="_Toc231079646"/>
+      <w:bookmarkStart w:id="50" w:name="_Toc231081601"/>
       <w:r>
         <w:rPr>
           <w:sz w:val="20"/>
@@ -12688,10 +13009,7 @@
     </w:p>
     <w:p>
       <w:r>
-        <w:t xml:space="preserve">de manera estadísticamente significativa (F = 9,11; p = </w:t>
-      </w:r>
-      <w:r>
-        <w:t>0,003). Más allá del componente</w:t>
+        <w:t>de manera estadísticamente significativa (F = 9,11; p = 0,003). Más allá del componente</w:t>
       </w:r>
     </w:p>
     <w:p>
@@ -12744,7 +13062,7 @@
         </w:rPr>
         <w:lastRenderedPageBreak/>
         <w:drawing>
-          <wp:inline distT="0" distB="0" distL="0" distR="0" wp14:anchorId="719EC5AB" wp14:editId="731225DB">
+          <wp:inline distT="0" distB="0" distL="0" distR="0" wp14:anchorId="6B1C6BC5" wp14:editId="3C5F5004">
             <wp:extent cx="5394960" cy="4026860"/>
             <wp:effectExtent l="0" t="0" r="0" b="0"/>
             <wp:docPr id="2" name="Picture 2"/>
@@ -12785,7 +13103,7 @@
         <w:pStyle w:val="Descripcin"/>
         <w:jc w:val="center"/>
       </w:pPr>
-      <w:bookmarkStart w:id="51" w:name="_Toc231079658"/>
+      <w:bookmarkStart w:id="51" w:name="_Toc231081613"/>
       <w:r>
         <w:rPr>
           <w:sz w:val="20"/>
@@ -12814,19 +13132,16 @@
         <w:rPr>
           <w:sz w:val="20"/>
         </w:rPr>
-        <w:t xml:space="preserve">. Descomposición de la </w:t>
-      </w:r>
-      <w:r>
-        <w:rPr>
-          <w:sz w:val="20"/>
-        </w:rPr>
-        <w:t>varianza del error de pronóstico del retorno (FEVD, horizonte 12 meses).</w:t>
+        <w:t>. Descomposición de la varianza del error de pronóstico del retorno (FEVD, horizonte 12 meses).</w:t>
       </w:r>
       <w:bookmarkEnd w:id="51"/>
     </w:p>
     <w:p>
       <w:r>
-        <w:t>La función impulso-respuesta cuantifica la reacción dinámica del retorno ante un shock de una</w:t>
+        <w:t xml:space="preserve">La función impulso-respuesta </w:t>
+      </w:r>
+      <w:r>
+        <w:t>cuantifica la reacción dinámica del retorno ante un shock de una</w:t>
       </w:r>
     </w:p>
     <w:p>
@@ -12863,7 +13178,7 @@
         </w:rPr>
         <w:lastRenderedPageBreak/>
         <w:drawing>
-          <wp:inline distT="0" distB="0" distL="0" distR="0" wp14:anchorId="1A4342C3" wp14:editId="21650497">
+          <wp:inline distT="0" distB="0" distL="0" distR="0" wp14:anchorId="2F8D6F36" wp14:editId="5FF04893">
             <wp:extent cx="5394960" cy="2620409"/>
             <wp:effectExtent l="0" t="0" r="0" b="0"/>
             <wp:docPr id="3" name="Picture 3"/>
@@ -12904,7 +13219,7 @@
         <w:pStyle w:val="Descripcin"/>
         <w:jc w:val="center"/>
       </w:pPr>
-      <w:bookmarkStart w:id="52" w:name="_Toc231079659"/>
+      <w:bookmarkStart w:id="52" w:name="_Toc231081614"/>
       <w:r>
         <w:rPr>
           <w:sz w:val="20"/>
@@ -12941,7 +13256,7 @@
       <w:pPr>
         <w:pStyle w:val="Ttulo2"/>
       </w:pPr>
-      <w:bookmarkStart w:id="53" w:name="_Toc231079621"/>
+      <w:bookmarkStart w:id="53" w:name="_Toc231081576"/>
       <w:r>
         <w:t>4.5 Estabilidad por fases del ciclo del cobre (OE5)</w:t>
       </w:r>
@@ -13048,7 +13363,7 @@
         </w:rPr>
         <w:lastRenderedPageBreak/>
         <w:drawing>
-          <wp:inline distT="0" distB="0" distL="0" distR="0" wp14:anchorId="3B6DCEDA" wp14:editId="7EA54B4C">
+          <wp:inline distT="0" distB="0" distL="0" distR="0" wp14:anchorId="201D2711" wp14:editId="19706DBA">
             <wp:extent cx="5394960" cy="2449752"/>
             <wp:effectExtent l="0" t="0" r="0" b="0"/>
             <wp:docPr id="4" name="Picture 4"/>
@@ -13089,7 +13404,7 @@
         <w:pStyle w:val="Descripcin"/>
         <w:jc w:val="center"/>
       </w:pPr>
-      <w:bookmarkStart w:id="54" w:name="_Toc231079660"/>
+      <w:bookmarkStart w:id="54" w:name="_Toc231081615"/>
       <w:r>
         <w:rPr>
           <w:sz w:val="20"/>
@@ -13126,7 +13441,7 @@
       <w:pPr>
         <w:pStyle w:val="Ttulo2"/>
       </w:pPr>
-      <w:bookmarkStart w:id="55" w:name="_Toc231079622"/>
+      <w:bookmarkStart w:id="55" w:name="_Toc231081577"/>
       <w:r>
         <w:t>4.6 Comparación entre mercados: triangulación (OE6)</w:t>
       </w:r>
@@ -13147,7 +13462,7 @@
         <w:pStyle w:val="Descripcin"/>
         <w:jc w:val="center"/>
       </w:pPr>
-      <w:bookmarkStart w:id="56" w:name="_Toc231079647"/>
+      <w:bookmarkStart w:id="56" w:name="_Toc231081602"/>
       <w:r>
         <w:rPr>
           <w:sz w:val="20"/>
@@ -13296,13 +13611,7 @@
               <w:rPr>
                 <w:sz w:val="20"/>
               </w:rPr>
-              <w:t xml:space="preserve">B · cobre </w:t>
-            </w:r>
-            <w:r>
-              <w:rPr>
-                <w:sz w:val="20"/>
-              </w:rPr>
-              <w:t>internacional</w:t>
+              <w:t>B · cobre internacional</w:t>
             </w:r>
           </w:p>
         </w:tc>
@@ -13549,10 +13858,10 @@
         <w:pStyle w:val="Listaconnmeros"/>
       </w:pPr>
       <w:r>
-        <w:t xml:space="preserve">**La sensibilidad al cobre es similar entre el cobre puro internacional (0,571) y el </w:t>
-      </w:r>
-      <w:r>
-        <w:t>local</w:t>
+        <w:t xml:space="preserve">**La sensibilidad al cobre es similar entre el </w:t>
+      </w:r>
+      <w:r>
+        <w:t>cobre puro internacional (0,571) y el local</w:t>
       </w:r>
     </w:p>
     <w:p>
@@ -13594,7 +13903,7 @@
           <w:noProof/>
         </w:rPr>
         <w:drawing>
-          <wp:inline distT="0" distB="0" distL="0" distR="0" wp14:anchorId="2646951A" wp14:editId="7CD2CEE6">
+          <wp:inline distT="0" distB="0" distL="0" distR="0" wp14:anchorId="092E350B" wp14:editId="4CB58A83">
             <wp:extent cx="5394960" cy="2718240"/>
             <wp:effectExtent l="0" t="0" r="0" b="0"/>
             <wp:docPr id="5" name="Picture 5"/>
@@ -13635,7 +13944,7 @@
         <w:pStyle w:val="Descripcin"/>
         <w:jc w:val="center"/>
       </w:pPr>
-      <w:bookmarkStart w:id="57" w:name="_Toc231079661"/>
+      <w:bookmarkStart w:id="57" w:name="_Toc231081616"/>
       <w:r>
         <w:rPr>
           <w:sz w:val="20"/>
@@ -13673,10 +13982,7 @@
         <w:pStyle w:val="Listaconnmeros"/>
       </w:pPr>
       <w:r>
-        <w:t xml:space="preserve">**La fracción de varianza </w:t>
-      </w:r>
-      <w:r>
-        <w:t>atribuida a shocks globales es algo mayor en el mercado internacional</w:t>
+        <w:t>**La fracción de varianza atribuida a shocks globales es algo mayor en el mercado internacional</w:t>
       </w:r>
     </w:p>
     <w:p>
@@ -13712,7 +14018,7 @@
       <w:pPr>
         <w:pStyle w:val="Ttulo2"/>
       </w:pPr>
-      <w:bookmarkStart w:id="58" w:name="_Toc231079623"/>
+      <w:bookmarkStart w:id="58" w:name="_Toc231081578"/>
       <w:r>
         <w:t>4.7 Diagnósticos y robustez</w:t>
       </w:r>
@@ -13802,10 +14108,7 @@
     </w:p>
     <w:p>
       <w:r>
-        <w:t xml:space="preserve">mantiene positivo y significativo, con una magnitud que </w:t>
-      </w:r>
-      <w:r>
-        <w:t>**aumenta del período 2004–2019 (0,559) al</w:t>
+        <w:t>mantiene positivo y significativo, con una magnitud que **aumenta del período 2004–2019 (0,559) al</w:t>
       </w:r>
     </w:p>
     <w:p>
@@ -13815,7 +14118,10 @@
     </w:p>
     <w:p>
       <w:r>
-        <w:t>la atención de los mercados sobre el cobre en el contexto de la transición energética, y confirma</w:t>
+        <w:t xml:space="preserve">la atención de los mercados sobre el cobre en el contexto de la transición </w:t>
+      </w:r>
+      <w:r>
+        <w:t>energética, y confirma</w:t>
       </w:r>
     </w:p>
     <w:p>
@@ -13886,23 +14192,274 @@
     <w:p>
       <w:r>
         <w:lastRenderedPageBreak/>
-        <w:t>normal, característica de los retornos financieros. Este resultado respalda la decisión de</w:t>
-      </w:r>
-    </w:p>
-    <w:p>
-      <w:r>
-        <w:t>winsorizar y de tratar con cautela la inferencia basada en supuestos gaussianos.</w:t>
-      </w:r>
+        <w:t>normal, característica de los retornos financieros. La extensión a un modelo asimétrico</w:t>
+      </w:r>
+    </w:p>
+    <w:p>
+      <w:r>
+        <w:rPr>
+          <w:b/>
+        </w:rPr>
+        <w:t>GJR-GARCH</w:t>
+      </w:r>
+      <w:r>
+        <w:t xml:space="preserve"> revela un </w:t>
+      </w:r>
+      <w:r>
+        <w:rPr>
+          <w:b/>
+        </w:rPr>
+        <w:t>efecto apalancamiento</w:t>
+      </w:r>
+      <w:r>
+        <w:t xml:space="preserve"> estadísticamente significativo (γ = 0,22;</w:t>
+      </w:r>
+    </w:p>
+    <w:p>
+      <w:r>
+        <w:t>p = 0,023), preferido por el criterio BIC: las caídas del retorno elevan la volatilidad futura más</w:t>
+      </w:r>
+    </w:p>
+    <w:p>
+      <w:r>
+        <w:t>que las alzas de igual magnitud, un patrón habitual en los mercados accionarios.</w:t>
+      </w:r>
+    </w:p>
+    <w:p>
+      <w:r>
+        <w:rPr>
+          <w:b/>
+        </w:rPr>
+        <w:t>Corrección por pruebas múltiples.</w:t>
+      </w:r>
+      <w:r>
+        <w:t xml:space="preserve"> Dado que el contraste de las hipótesis involucra la</w:t>
+      </w:r>
+    </w:p>
+    <w:p>
+      <w:r>
+        <w:t>estimación simultánea de numerosos coeficientes, se aplica la corrección de **Benjamini-Hochberg</w:t>
+      </w:r>
+    </w:p>
+    <w:p>
+      <w:r>
+        <w:t>(control de la tasa de falsos descubrimientos, FDR)** sobre los p-valores del panel. Tras la</w:t>
+      </w:r>
+    </w:p>
+    <w:p>
+      <w:r>
+        <w:t xml:space="preserve">corrección, </w:t>
+      </w:r>
+      <w:r>
+        <w:rPr>
+          <w:b/>
+        </w:rPr>
+        <w:t>el precio del cobre, el VIX y el tipo de cambio conservan su significancia</w:t>
+      </w:r>
+    </w:p>
+    <w:p>
+      <w:r>
+        <w:t>(p-valores ajustados de 0,000, 0,000 y 0,000, respectivamente), mientras que los factores ya no</w:t>
+      </w:r>
+    </w:p>
+    <w:p>
+      <w:r>
+        <w:t>significativos se mantienen como tales. Los hallazgos centrales no son, por tanto, artefactos de</w:t>
+      </w:r>
+    </w:p>
+    <w:p>
+      <w:r>
+        <w:t>pruebas múltiples.</w:t>
+      </w:r>
+    </w:p>
+    <w:p>
+      <w:r>
+        <w:rPr>
+          <w:b/>
+        </w:rPr>
+        <w:t>Magnitudes económicas (betas estandarizados).</w:t>
+      </w:r>
+      <w:r>
+        <w:t xml:space="preserve"> Expresado en desviaciones estándar, el factor de</w:t>
+      </w:r>
+    </w:p>
+    <w:p>
+      <w:r>
+        <w:t xml:space="preserve">mayor impacto sobre el retorno es el </w:t>
+      </w:r>
+      <w:r>
+        <w:rPr>
+          <w:b/>
+        </w:rPr>
+        <w:t>riesgo global (VIX, −0,31 σ)</w:t>
+      </w:r>
+      <w:r>
+        <w:t>, seguido muy de cerca por el</w:t>
+      </w:r>
+    </w:p>
+    <w:p>
+      <w:r>
+        <w:rPr>
+          <w:b/>
+        </w:rPr>
+        <w:t>precio del cobre (+0,29 σ)</w:t>
+      </w:r>
+      <w:r>
+        <w:t xml:space="preserve"> y, a mayor distancia, el tipo de cambio (−0,13 σ). Esta jerarquía</w:t>
+      </w:r>
+    </w:p>
+    <w:p>
+      <w:r>
+        <w:t>—dos factores globales en la cúspide— constituye evidencia económica, y no solo estadística, a</w:t>
+      </w:r>
+    </w:p>
+    <w:p>
+      <w:r>
+        <w:t>favor de la dominancia de los factores internacionales (H6).</w:t>
+      </w:r>
+    </w:p>
+    <w:p>
+      <w:r>
+        <w:rPr>
+          <w:b/>
+        </w:rPr>
+        <w:t>Local Projections.</w:t>
+      </w:r>
+      <w:r>
+        <w:t xml:space="preserve"> Como alternativa al VAR, más robusta a la mala especificación, se estima la</w:t>
+      </w:r>
+    </w:p>
+    <w:p>
+      <w:r>
+        <w:lastRenderedPageBreak/>
+        <w:t xml:space="preserve">respuesta del retorno a un shock del cobre mediante </w:t>
+      </w:r>
+      <w:r>
+        <w:rPr>
+          <w:b/>
+        </w:rPr>
+        <w:t>proyecciones locales (Jordà, 2005)</w:t>
+      </w:r>
+      <w:r>
+        <w:t xml:space="preserve"> con</w:t>
+      </w:r>
+    </w:p>
+    <w:p>
+      <w:r>
+        <w:t>errores estándar HAC horizonte a horizonte. La respuesta estimada (0,68 en el impacto, con</w:t>
+      </w:r>
+    </w:p>
+    <w:p>
+      <w:r>
+        <w:t xml:space="preserve">decaimiento posterior) </w:t>
+      </w:r>
+      <w:r>
+        <w:rPr>
+          <w:b/>
+        </w:rPr>
+        <w:t>coincide cualitativamente con la función impulso-respuesta del VAR</w:t>
+      </w:r>
+      <w:r>
+        <w:t>, lo</w:t>
+      </w:r>
+    </w:p>
+    <w:p>
+      <w:r>
+        <w:t>que refuerza la robustez de la dinámica reportada en §4.4.</w:t>
+      </w:r>
+    </w:p>
+    <w:p>
+      <w:pPr>
+        <w:jc w:val="center"/>
+      </w:pPr>
+      <w:r>
+        <w:rPr>
+          <w:noProof/>
+        </w:rPr>
+        <w:drawing>
+          <wp:inline distT="0" distB="0" distL="0" distR="0" wp14:anchorId="6B8FA12C" wp14:editId="0027102C">
+            <wp:extent cx="5394960" cy="2620409"/>
+            <wp:effectExtent l="0" t="0" r="0" b="0"/>
+            <wp:docPr id="6" name="Picture 6"/>
+            <wp:cNvGraphicFramePr>
+              <a:graphicFrameLocks xmlns:a="http://schemas.openxmlformats.org/drawingml/2006/main" noChangeAspect="1"/>
+            </wp:cNvGraphicFramePr>
+            <a:graphic xmlns:a="http://schemas.openxmlformats.org/drawingml/2006/main">
+              <a:graphicData uri="http://schemas.openxmlformats.org/drawingml/2006/picture">
+                <pic:pic xmlns:pic="http://schemas.openxmlformats.org/drawingml/2006/picture">
+                  <pic:nvPicPr>
+                    <pic:cNvPr id="0" name="fig_lp.png"/>
+                    <pic:cNvPicPr/>
+                  </pic:nvPicPr>
+                  <pic:blipFill>
+                    <a:blip r:embed="rId14"/>
+                    <a:stretch>
+                      <a:fillRect/>
+                    </a:stretch>
+                  </pic:blipFill>
+                  <pic:spPr>
+                    <a:xfrm>
+                      <a:off x="0" y="0"/>
+                      <a:ext cx="5394960" cy="2620409"/>
+                    </a:xfrm>
+                    <a:prstGeom prst="rect">
+                      <a:avLst/>
+                    </a:prstGeom>
+                  </pic:spPr>
+                </pic:pic>
+              </a:graphicData>
+            </a:graphic>
+          </wp:inline>
+        </w:drawing>
+      </w:r>
+    </w:p>
+    <w:p>
+      <w:pPr>
+        <w:pStyle w:val="Descripcin"/>
+        <w:jc w:val="center"/>
+      </w:pPr>
+      <w:bookmarkStart w:id="59" w:name="_Toc231081617"/>
+      <w:r>
+        <w:rPr>
+          <w:sz w:val="20"/>
+        </w:rPr>
+        <w:t xml:space="preserve">Figura </w:t>
+      </w:r>
+      <w:r>
+        <w:fldChar w:fldCharType="begin"/>
+      </w:r>
+      <w:r>
+        <w:instrText xml:space="preserve"> SEQ Figura \* ARABIC </w:instrText>
+      </w:r>
+      <w:r>
+        <w:fldChar w:fldCharType="separate"/>
+      </w:r>
+      <w:r>
+        <w:rPr>
+          <w:noProof/>
+        </w:rPr>
+        <w:t>6</w:t>
+      </w:r>
+      <w:r>
+        <w:fldChar w:fldCharType="end"/>
+      </w:r>
+      <w:r>
+        <w:rPr>
+          <w:sz w:val="20"/>
+        </w:rPr>
+        <w:t>. Respuesta del retorno a un shock del cobre mediante proyecciones locales (Jordà, 2005), IC 95%.</w:t>
+      </w:r>
+      <w:bookmarkEnd w:id="59"/>
     </w:p>
     <w:p>
       <w:pPr>
         <w:pStyle w:val="Ttulo2"/>
       </w:pPr>
-      <w:bookmarkStart w:id="59" w:name="_Toc231079624"/>
+      <w:bookmarkStart w:id="60" w:name="_Toc231081579"/>
       <w:r>
         <w:t>4.8 Discusión integrada</w:t>
       </w:r>
-      <w:bookmarkEnd w:id="59"/>
+      <w:bookmarkEnd w:id="60"/>
     </w:p>
     <w:p>
       <w:r>
@@ -13941,6 +14498,7 @@
     </w:p>
     <w:p>
       <w:r>
+        <w:lastRenderedPageBreak/>
         <w:t>efecto negativo significativo cuyo signo refleja la doble naturaleza —competitividad y riesgo—</w:t>
       </w:r>
     </w:p>
@@ -14042,7 +14600,6 @@
     </w:p>
     <w:p>
       <w:r>
-        <w:lastRenderedPageBreak/>
         <w:t>es concluyente**: la resolución del orden de integración (Zivot-Andrews), las interacciones por</w:t>
       </w:r>
     </w:p>
@@ -14085,22 +14642,22 @@
       <w:pPr>
         <w:pStyle w:val="Ttulo1"/>
       </w:pPr>
-      <w:bookmarkStart w:id="60" w:name="_Toc231079625"/>
+      <w:bookmarkStart w:id="61" w:name="_Toc231081580"/>
       <w:r>
         <w:lastRenderedPageBreak/>
         <w:t>Capítulo 5 — Conclusiones</w:t>
       </w:r>
-      <w:bookmarkEnd w:id="60"/>
+      <w:bookmarkEnd w:id="61"/>
     </w:p>
     <w:p>
       <w:pPr>
         <w:pStyle w:val="Ttulo2"/>
       </w:pPr>
-      <w:bookmarkStart w:id="61" w:name="_Toc231079626"/>
+      <w:bookmarkStart w:id="62" w:name="_Toc231081581"/>
       <w:r>
         <w:t>5.1 Síntesis de los hallazgos</w:t>
       </w:r>
-      <w:bookmarkEnd w:id="61"/>
+      <w:bookmarkEnd w:id="62"/>
     </w:p>
     <w:p>
       <w:r>
@@ -14189,12 +14746,12 @@
       <w:pPr>
         <w:pStyle w:val="Ttulo2"/>
       </w:pPr>
-      <w:bookmarkStart w:id="62" w:name="_Toc231079627"/>
+      <w:bookmarkStart w:id="63" w:name="_Toc231081582"/>
       <w:r>
         <w:lastRenderedPageBreak/>
         <w:t>5.2 Implicancias</w:t>
       </w:r>
-      <w:bookmarkEnd w:id="62"/>
+      <w:bookmarkEnd w:id="63"/>
     </w:p>
     <w:p>
       <w:pPr>
@@ -14262,11 +14819,11 @@
       <w:pPr>
         <w:pStyle w:val="Ttulo2"/>
       </w:pPr>
-      <w:bookmarkStart w:id="63" w:name="_Toc231079628"/>
+      <w:bookmarkStart w:id="64" w:name="_Toc231081583"/>
       <w:r>
         <w:t>5.3 Limitaciones</w:t>
       </w:r>
-      <w:bookmarkEnd w:id="63"/>
+      <w:bookmarkEnd w:id="64"/>
     </w:p>
     <w:p>
       <w:r>
@@ -14312,11 +14869,11 @@
       <w:pPr>
         <w:pStyle w:val="Ttulo2"/>
       </w:pPr>
-      <w:bookmarkStart w:id="64" w:name="_Toc231079629"/>
+      <w:bookmarkStart w:id="65" w:name="_Toc231081584"/>
       <w:r>
         <w:t>5.4 Líneas futuras de investigación</w:t>
       </w:r>
-      <w:bookmarkEnd w:id="64"/>
+      <w:bookmarkEnd w:id="65"/>
     </w:p>
     <w:p>
       <w:r>
@@ -14348,12 +14905,12 @@
       <w:pPr>
         <w:pStyle w:val="Ttulo1"/>
       </w:pPr>
-      <w:bookmarkStart w:id="65" w:name="_Toc231079630"/>
+      <w:bookmarkStart w:id="66" w:name="_Toc231081585"/>
       <w:r>
         <w:lastRenderedPageBreak/>
         <w:t>Referencias</w:t>
       </w:r>
-      <w:bookmarkEnd w:id="65"/>
+      <w:bookmarkEnd w:id="66"/>
     </w:p>
     <w:p>
       <w:r>
@@ -14367,10 +14924,20 @@
     </w:p>
     <w:p>
       <w:r>
-        <w:t xml:space="preserve">Bekaert, G., &amp; </w:t>
-      </w:r>
-      <w:r>
-        <w:t>Harvey, C. R. (1995). Time-varying world market integration. *The Journal of Finance*, 50(2), 403–444.</w:t>
+        <w:t>Bekaert, G., &amp; Harvey, C. R. (1995). Time-varying world market integration. *The Journal of Finance*, 50(2), 403–444.</w:t>
+      </w:r>
+    </w:p>
+    <w:p>
+      <w:r>
+        <w:t xml:space="preserve">Benjamini, Y., &amp; </w:t>
+      </w:r>
+      <w:r>
+        <w:t>Hochberg, Y. (1995). Controlling the false discovery rate: A practical and powerful approach to multiple testing. *Journal of the Royal Statistical Society: Series B*, 57(1), 289–300.</w:t>
+      </w:r>
+    </w:p>
+    <w:p>
+      <w:r>
+        <w:t>Bekaert, G., &amp; Harvey, C. R. (2005). Emerging markets finance. *Journal of Empirical Finance*, 10(1–2), 3–55.</w:t>
       </w:r>
     </w:p>
     <w:p>
@@ -14400,11 +14967,17 @@
     </w:p>
     <w:p>
       <w:r>
+        <w:t>Chen, Y. C., &amp; Rogoff, K. (2003). Commodity currencies. *Journal of International Economics*, 60(1), 133–160.</w:t>
+      </w:r>
+    </w:p>
+    <w:p>
+      <w:r>
         <w:t>Chen, Y. C., Rogoff, K., &amp; Rossi, B. (2010). Can exchange rates forecast commodity prices? *The Quarterly Journal of Economics*, 125(3), 1145–1194.</w:t>
       </w:r>
     </w:p>
     <w:p>
       <w:r>
+        <w:lastRenderedPageBreak/>
         <w:t>Dickey, D. A., &amp; Fuller, W. A. (1979). Distribution of the estimators for autoregressive time series with a unit root. *Journal of the American Statistical Association*, 74(366), 427–431.</w:t>
       </w:r>
     </w:p>
@@ -14420,51 +14993,58 @@
     </w:p>
     <w:p>
       <w:r>
+        <w:t>Engle, R. F., &amp; Granger, C. W. J. (1987). Co-integration and error correction: Representation, estimation, and testing. *Econometrica*, 55(2), 251–276.</w:t>
+      </w:r>
+    </w:p>
+    <w:p>
+      <w:r>
+        <w:t>Errunza, V., &amp; Losq, E. (1985). International asset pricing under mild segmentation: Theory and test. *The Journal of Finance*, 40(1), 105–124.</w:t>
+      </w:r>
+    </w:p>
+    <w:p>
+      <w:r>
+        <w:t>Fama, E. F. (1970). Efficient capital markets: A review of theory and empirical work. *The Journal of Finance*, 25(2), 383–417.</w:t>
+      </w:r>
+    </w:p>
+    <w:p>
+      <w:r>
+        <w:t>Fama, E. F. (1981). Stock returns, real activity, inflation, and money. *The American Economic Review*, 71(4), 545–565.</w:t>
+      </w:r>
+    </w:p>
+    <w:p>
+      <w:r>
+        <w:t>Fama, E. F., &amp; French, K. R. (1989). Business conditions and expected returns on stocks and bonds. *Journal of Financial Economics*, 25(1), 23–49.</w:t>
+      </w:r>
+    </w:p>
+    <w:p>
+      <w:r>
+        <w:t>Harding, D., &amp; Pagan, A. (2002). Dissecting the cycle: A methodological investigation. *Journal of Monetary Economics*, 49(2), 365–381.</w:t>
+      </w:r>
+    </w:p>
+    <w:p>
+      <w:r>
+        <w:t>Hamilton, J. D. (1989). A new approach to the economic analysis of nonstationary time series and the business cycle. *Econometrica*, 57(2), 357–384.</w:t>
+      </w:r>
+    </w:p>
+    <w:p>
+      <w:r>
+        <w:t>Im, K. S., Pesaran, M. H., &amp; Shin, Y. (2003). Testing for unit roots in heterogeneous panels. *Journal of Econometrics*, 115(1), 53–74.</w:t>
+      </w:r>
+    </w:p>
+    <w:p>
+      <w:r>
+        <w:t>Glosten, L. R., Jagannathan, R., &amp; Runkle, D. E. (1993). On the relation between the expected value and the volatility of the nominal excess return on stocks. *The Journal of Finance*, 48(5), 1779–1801.</w:t>
+      </w:r>
+    </w:p>
+    <w:p>
+      <w:r>
+        <w:t>Johansen, S. (1988). Statistical analysis of cointegration vectors. *Journal of Economic Dynamics and Control*, 12(2–3), 231–254.</w:t>
+      </w:r>
+    </w:p>
+    <w:p>
+      <w:r>
         <w:lastRenderedPageBreak/>
-        <w:t>Engle, R. F., &amp; Granger, C. W. J. (1987). Co-integration and error correction: Representation, estimation, and testing. *Econometrica*, 55(2), 251–276.</w:t>
-      </w:r>
-    </w:p>
-    <w:p>
-      <w:r>
-        <w:t>Errunza, V., &amp; Losq, E. (1985). International asset pricing under mild segmentation: Theory and test. *The Journal of Finance*, 40(1), 105–124.</w:t>
-      </w:r>
-    </w:p>
-    <w:p>
-      <w:r>
-        <w:t xml:space="preserve">Fama, E. F. (1970). Efficient capital markets: A </w:t>
-      </w:r>
-      <w:r>
-        <w:t>review of theory and empirical work. *The Journal of Finance*, 25(2), 383–417.</w:t>
-      </w:r>
-    </w:p>
-    <w:p>
-      <w:r>
-        <w:t>Fama, E. F. (1981). Stock returns, real activity, inflation, and money. *The American Economic Review*, 71(4), 545–565.</w:t>
-      </w:r>
-    </w:p>
-    <w:p>
-      <w:r>
-        <w:t>Fama, E. F., &amp; French, K. R. (1989). Business conditions and expected returns on stocks and bonds. *Journal of Financial Economics*, 25(1), 23–49.</w:t>
-      </w:r>
-    </w:p>
-    <w:p>
-      <w:r>
-        <w:t>Harding, D., &amp; Pagan, A. (2002). Dissecting the cycle: A methodological investigation. *Journal of Monetary Economics*, 49(2), 365–381.</w:t>
-      </w:r>
-    </w:p>
-    <w:p>
-      <w:r>
-        <w:t>Hamilton, J. D. (1989). A new approach to the economic analysis of nonstationary time series and the business cycle. *Econometrica*, 57(2), 357–384.</w:t>
-      </w:r>
-    </w:p>
-    <w:p>
-      <w:r>
-        <w:t>Im, K. S., Pesaran, M. H., &amp; Shin, Y. (2003). Testing for unit roots in heterogeneous panels. *Journal of Econometrics*, 115(1), 53–74.</w:t>
-      </w:r>
-    </w:p>
-    <w:p>
-      <w:r>
-        <w:t>Johansen, S. (1988). Statistical analysis of cointegration vectors. *Journal of Economic Dynamics and Control*, 12(2–3), 231–254.</w:t>
+        <w:t>Jordà, Ò. (2005). Estimation and inference of impulse responses by local projections. *The American Economic Review*, 95(1), 161–182.</w:t>
       </w:r>
     </w:p>
     <w:p>
@@ -14479,7 +15059,20 @@
     </w:p>
     <w:p>
       <w:r>
-        <w:t>Pesaran, M. H. (2007). A simple panel unit root test in the presence of cross-section dependence. *Journal of Applied Econometrics*, 22(2), 265–312.</w:t>
+        <w:t>Labbé, F., &amp; De Gregorio, J. (2011). *Copper, the real exchange rate and macroeconomic fluctuations in Chile* (Working Paper N°640). Banco Central de Chile.</w:t>
+      </w:r>
+    </w:p>
+    <w:p>
+      <w:r>
+        <w:t>Pedersen, M. (2015). *The impact of commodity price shocks in a major producing economy: The case of copper and Chile* (Working Paper N°753). Banco Central de Chile.</w:t>
+      </w:r>
+    </w:p>
+    <w:p>
+      <w:r>
+        <w:t xml:space="preserve">Pesaran, M. H. (2007). A simple panel unit root test in the presence of cross-section dependence. *Journal of Applied </w:t>
+      </w:r>
+      <w:r>
+        <w:t>Econometrics*, 22(2), 265–312.</w:t>
       </w:r>
     </w:p>
     <w:p>
@@ -14489,28 +15082,41 @@
     </w:p>
     <w:p>
       <w:r>
+        <w:t xml:space="preserve">Pesaran, M. H., Shin, Y., &amp; Smith, R. J. (2001). Bounds testing approaches to the </w:t>
+      </w:r>
+      <w:r>
+        <w:t>analysis of level relationships. *Journal of Applied Econometrics*, 16(3), 289–326.</w:t>
+      </w:r>
+    </w:p>
+    <w:p>
+      <w:r>
+        <w:t>Phillips, P. C. B., &amp; Perron, P. (1988). Testing for a unit root in time series regression. *Biometrika*, 75(2), 335–346.</w:t>
+      </w:r>
+    </w:p>
+    <w:p>
+      <w:r>
+        <w:t>Pincheira, P., &amp; Hardy, N. (2019). Forecasting base metal prices with the Chilean exchange rate. *Resources Policy*, 62, 256–281.</w:t>
+      </w:r>
+    </w:p>
+    <w:p>
+      <w:r>
+        <w:t>Ross, S. A. (1976). The arbitrage theory of capital asset pricing. *Journal of Economic Theory*, 13(3), 341–360.</w:t>
+      </w:r>
+    </w:p>
+    <w:p>
+      <w:r>
+        <w:t>Sadorsky, P. (2001). Risk factors in stock returns of Canadian oil and gas companies. *Energy Economics*, 23(1), 17–28.</w:t>
+      </w:r>
+    </w:p>
+    <w:p>
+      <w:r>
+        <w:t>Sims, C. A. (1980). Macroeconomics and reality. *Econometrica*, 48(1), 1–48.</w:t>
+      </w:r>
+    </w:p>
+    <w:p>
+      <w:r>
         <w:lastRenderedPageBreak/>
-        <w:t>Pesaran, M. H., Shin, Y., &amp; Smith, R. J. (2001). Bounds testing approaches to the analysis of level relationships. *Journal of Applied Econometrics*, 16(3), 289–326.</w:t>
-      </w:r>
-    </w:p>
-    <w:p>
-      <w:r>
-        <w:t>Phillips, P. C. B., &amp; Perron, P. (1988). Testing for a unit root in time series regression. *Biometrika*, 75(2), 335–346.</w:t>
-      </w:r>
-    </w:p>
-    <w:p>
-      <w:r>
-        <w:t>Ross, S. A. (1976). The arbitrage theory of capital asset pricing. *Journal of Economic Theory*, 13(3), 341–360.</w:t>
-      </w:r>
-    </w:p>
-    <w:p>
-      <w:r>
-        <w:t>Sadorsky, P. (2001). Risk factors in stock returns of Canadian oil and gas companies. *Energy Economics*, 23(1), 17–28.</w:t>
-      </w:r>
-    </w:p>
-    <w:p>
-      <w:r>
-        <w:t>Sims, C. A. (1980). Macroeconomics and reality. *Econometrica*, 48(1), 1–48.</w:t>
+        <w:t>Wallenstein, T., Mendiola, A., &amp; Chávez-Bedoya, L. (2021). *Analysis of the reaction of mining stocks to the development of copper prices*. Consejo Latinoamericano de Escuelas de Administración (CLADEA).</w:t>
       </w:r>
     </w:p>
     <w:p>
@@ -14520,10 +15126,17 @@
     </w:p>
     <w:p>
       <w:r>
-        <w:t xml:space="preserve">Zivot, E., &amp; Andrews, D. W. K. (1992). Further evidence on the great </w:t>
-      </w:r>
-      <w:r>
-        <w:t>crash, the oil-price shock, and the unit-root hypothesis. *Journal of Business &amp; Economic Statistics*, 10(3), 251–270.</w:t>
+        <w:t>Zhu, H., Chen, X., &amp; Chen, B. (2021). Effects of non-ferrous metal prices and uncertainty on industry stock market under different market conditions. *Resources Policy*, 73, 102243.</w:t>
+      </w:r>
+    </w:p>
+    <w:p>
+      <w:r>
+        <w:t>Zivot, E., &amp; Andrews, D. W. K. (1992). Further evidence on the great crash, the oil-price shock, and the unit-root hypothesis. *Journal of Business &amp; Economic Statistics*, 10(3), 251–270.</w:t>
+      </w:r>
+    </w:p>
+    <w:p>
+      <w:r>
+        <w:t>Zurita, S., Fuentes, R., &amp; Gregoire, J. (2005). *Factores macroeconómicos en retornos accionarios chilenos* (Documento de Trabajo N°316). Banco Central de Chile. (Reeditado en *El Trimestre Económico*, 2006.)</w:t>
       </w:r>
     </w:p>
     <w:p>
@@ -14535,29 +15148,29 @@
       <w:pPr>
         <w:pStyle w:val="Ttulo1"/>
       </w:pPr>
-      <w:bookmarkStart w:id="66" w:name="_Toc231079631"/>
+      <w:bookmarkStart w:id="67" w:name="_Toc231081586"/>
       <w:r>
         <w:lastRenderedPageBreak/>
         <w:t>Anexos</w:t>
       </w:r>
-      <w:bookmarkEnd w:id="66"/>
+      <w:bookmarkEnd w:id="67"/>
     </w:p>
     <w:p>
       <w:pPr>
         <w:pStyle w:val="Ttulo2"/>
       </w:pPr>
-      <w:bookmarkStart w:id="67" w:name="_Toc231079632"/>
+      <w:bookmarkStart w:id="68" w:name="_Toc231081587"/>
       <w:r>
         <w:t>Anexo A. Estadística descriptiva</w:t>
       </w:r>
-      <w:bookmarkEnd w:id="67"/>
+      <w:bookmarkEnd w:id="68"/>
     </w:p>
     <w:p>
       <w:pPr>
         <w:pStyle w:val="Descripcin"/>
         <w:jc w:val="center"/>
       </w:pPr>
-      <w:bookmarkStart w:id="68" w:name="_Toc231079648"/>
+      <w:bookmarkStart w:id="69" w:name="_Toc231081603"/>
       <w:r>
         <w:rPr>
           <w:sz w:val="20"/>
@@ -14588,7 +15201,7 @@
         </w:rPr>
         <w:t>.</w:t>
       </w:r>
-      <w:bookmarkEnd w:id="68"/>
+      <w:bookmarkEnd w:id="69"/>
       <w:r>
         <w:rPr>
           <w:sz w:val="20"/>
@@ -16059,18 +16672,18 @@
       <w:pPr>
         <w:pStyle w:val="Ttulo2"/>
       </w:pPr>
-      <w:bookmarkStart w:id="69" w:name="_Toc231079633"/>
+      <w:bookmarkStart w:id="70" w:name="_Toc231081588"/>
       <w:r>
         <w:t>Anexo B. Matriz de correlación de los factores</w:t>
       </w:r>
-      <w:bookmarkEnd w:id="69"/>
+      <w:bookmarkEnd w:id="70"/>
     </w:p>
     <w:p>
       <w:pPr>
         <w:pStyle w:val="Descripcin"/>
         <w:jc w:val="center"/>
       </w:pPr>
-      <w:bookmarkStart w:id="70" w:name="_Toc231079649"/>
+      <w:bookmarkStart w:id="71" w:name="_Toc231081604"/>
       <w:r>
         <w:rPr>
           <w:sz w:val="20"/>
@@ -16101,7 +16714,7 @@
         </w:rPr>
         <w:t>.</w:t>
       </w:r>
-      <w:bookmarkEnd w:id="70"/>
+      <w:bookmarkEnd w:id="71"/>
       <w:r>
         <w:rPr>
           <w:sz w:val="20"/>
@@ -16165,13 +16778,7 @@
               <w:rPr>
                 <w:sz w:val="20"/>
               </w:rPr>
-              <w:t xml:space="preserve">Δ </w:t>
-            </w:r>
-            <w:r>
-              <w:rPr>
-                <w:sz w:val="20"/>
-              </w:rPr>
-              <w:t>Cobre</w:t>
+              <w:t>Δ Cobre</w:t>
             </w:r>
           </w:p>
         </w:tc>
@@ -17316,7 +17923,13 @@
               <w:rPr>
                 <w:sz w:val="20"/>
               </w:rPr>
-              <w:t>Δ Actividad local</w:t>
+              <w:t xml:space="preserve">Δ </w:t>
+            </w:r>
+            <w:r>
+              <w:rPr>
+                <w:sz w:val="20"/>
+              </w:rPr>
+              <w:t>Actividad local</w:t>
             </w:r>
           </w:p>
         </w:tc>
@@ -17455,18 +18068,18 @@
       <w:pPr>
         <w:pStyle w:val="Ttulo2"/>
       </w:pPr>
-      <w:bookmarkStart w:id="71" w:name="_Toc231079634"/>
+      <w:bookmarkStart w:id="72" w:name="_Toc231081589"/>
       <w:r>
         <w:t>Anexo C. Pruebas de raíz unitaria y orden de integración</w:t>
       </w:r>
-      <w:bookmarkEnd w:id="71"/>
+      <w:bookmarkEnd w:id="72"/>
     </w:p>
     <w:p>
       <w:pPr>
         <w:pStyle w:val="Descripcin"/>
         <w:jc w:val="center"/>
       </w:pPr>
-      <w:bookmarkStart w:id="72" w:name="_Toc231079650"/>
+      <w:bookmarkStart w:id="73" w:name="_Toc231081605"/>
       <w:r>
         <w:rPr>
           <w:sz w:val="20"/>
@@ -17497,7 +18110,7 @@
         </w:rPr>
         <w:t>.</w:t>
       </w:r>
-      <w:bookmarkEnd w:id="72"/>
+      <w:bookmarkEnd w:id="73"/>
       <w:r>
         <w:rPr>
           <w:sz w:val="20"/>
@@ -17929,13 +18542,7 @@
               <w:rPr>
                 <w:sz w:val="20"/>
               </w:rPr>
-              <w:t xml:space="preserve">Valor </w:t>
-            </w:r>
-            <w:r>
-              <w:rPr>
-                <w:sz w:val="20"/>
-              </w:rPr>
-              <w:t>ANTO.L (log)</w:t>
+              <w:t>Valor ANTO.L (log)</w:t>
             </w:r>
           </w:p>
         </w:tc>
@@ -18041,28 +18648,28 @@
       <w:pPr>
         <w:pStyle w:val="Ttulo2"/>
       </w:pPr>
-      <w:bookmarkStart w:id="73" w:name="_Toc231079635"/>
+      <w:bookmarkStart w:id="74" w:name="_Toc231081590"/>
       <w:r>
         <w:t>Anexo D. Resultados completos del modelo de panel</w:t>
       </w:r>
-      <w:bookmarkEnd w:id="73"/>
+      <w:bookmarkEnd w:id="74"/>
     </w:p>
     <w:p>
       <w:pPr>
         <w:pStyle w:val="Ttulo3"/>
       </w:pPr>
-      <w:bookmarkStart w:id="74" w:name="_Toc231079636"/>
+      <w:bookmarkStart w:id="75" w:name="_Toc231081591"/>
       <w:r>
         <w:t>D.1 Muestra B — cobre, mercado internacional</w:t>
       </w:r>
-      <w:bookmarkEnd w:id="74"/>
+      <w:bookmarkEnd w:id="75"/>
     </w:p>
     <w:p>
       <w:pPr>
         <w:pStyle w:val="Descripcin"/>
         <w:jc w:val="center"/>
       </w:pPr>
-      <w:bookmarkStart w:id="75" w:name="_Toc231079651"/>
+      <w:bookmarkStart w:id="76" w:name="_Toc231081606"/>
       <w:r>
         <w:rPr>
           <w:sz w:val="20"/>
@@ -18093,7 +18700,7 @@
         </w:rPr>
         <w:t>.</w:t>
       </w:r>
-      <w:bookmarkEnd w:id="75"/>
+      <w:bookmarkEnd w:id="76"/>
       <w:r>
         <w:rPr>
           <w:sz w:val="20"/>
@@ -18875,18 +19482,18 @@
       <w:pPr>
         <w:pStyle w:val="Ttulo3"/>
       </w:pPr>
-      <w:bookmarkStart w:id="76" w:name="_Toc231079637"/>
+      <w:bookmarkStart w:id="77" w:name="_Toc231081592"/>
       <w:r>
         <w:t>D.2 Muestra A — cobre, mercado chileno (Pucobre)</w:t>
       </w:r>
-      <w:bookmarkEnd w:id="76"/>
+      <w:bookmarkEnd w:id="77"/>
     </w:p>
     <w:p>
       <w:pPr>
         <w:pStyle w:val="Descripcin"/>
         <w:jc w:val="center"/>
       </w:pPr>
-      <w:bookmarkStart w:id="77" w:name="_Toc231079652"/>
+      <w:bookmarkStart w:id="78" w:name="_Toc231081607"/>
       <w:r>
         <w:rPr>
           <w:sz w:val="20"/>
@@ -18917,7 +19524,7 @@
         </w:rPr>
         <w:t>.</w:t>
       </w:r>
-      <w:bookmarkEnd w:id="77"/>
+      <w:bookmarkEnd w:id="78"/>
       <w:r>
         <w:rPr>
           <w:sz w:val="20"/>
@@ -19703,21 +20310,21 @@
       <w:pPr>
         <w:pStyle w:val="Ttulo3"/>
       </w:pPr>
-      <w:bookmarkStart w:id="78" w:name="_Toc231079638"/>
+      <w:bookmarkStart w:id="79" w:name="_Toc231081593"/>
       <w:r>
         <w:t xml:space="preserve">D.3 </w:t>
       </w:r>
       <w:r>
         <w:t>Muestra C — sector minero, mercado chileno</w:t>
       </w:r>
-      <w:bookmarkEnd w:id="78"/>
+      <w:bookmarkEnd w:id="79"/>
     </w:p>
     <w:p>
       <w:pPr>
         <w:pStyle w:val="Descripcin"/>
         <w:jc w:val="center"/>
       </w:pPr>
-      <w:bookmarkStart w:id="79" w:name="_Toc231079653"/>
+      <w:bookmarkStart w:id="80" w:name="_Toc231081608"/>
       <w:r>
         <w:rPr>
           <w:sz w:val="20"/>
@@ -19748,7 +20355,7 @@
         </w:rPr>
         <w:t>.</w:t>
       </w:r>
-      <w:bookmarkEnd w:id="79"/>
+      <w:bookmarkEnd w:id="80"/>
       <w:r>
         <w:rPr>
           <w:sz w:val="20"/>
@@ -20527,21 +21134,21 @@
       <w:pPr>
         <w:pStyle w:val="Ttulo2"/>
       </w:pPr>
-      <w:bookmarkStart w:id="80" w:name="_Toc231079639"/>
+      <w:bookmarkStart w:id="81" w:name="_Toc231081594"/>
       <w:r>
         <w:t xml:space="preserve">Anexo E. </w:t>
       </w:r>
       <w:r>
         <w:t>Cointegración (test de Johansen)</w:t>
       </w:r>
-      <w:bookmarkEnd w:id="80"/>
+      <w:bookmarkEnd w:id="81"/>
     </w:p>
     <w:p>
       <w:pPr>
         <w:pStyle w:val="Descripcin"/>
         <w:jc w:val="center"/>
       </w:pPr>
-      <w:bookmarkStart w:id="81" w:name="_Toc231079654"/>
+      <w:bookmarkStart w:id="82" w:name="_Toc231081609"/>
       <w:r>
         <w:rPr>
           <w:sz w:val="20"/>
@@ -20572,7 +21179,7 @@
         </w:rPr>
         <w:t>.</w:t>
       </w:r>
-      <w:bookmarkEnd w:id="81"/>
+      <w:bookmarkEnd w:id="82"/>
       <w:r>
         <w:rPr>
           <w:sz w:val="20"/>
@@ -20996,18 +21603,18 @@
       <w:pPr>
         <w:pStyle w:val="Ttulo2"/>
       </w:pPr>
-      <w:bookmarkStart w:id="82" w:name="_Toc231079640"/>
+      <w:bookmarkStart w:id="83" w:name="_Toc231081595"/>
       <w:r>
         <w:t>Anexo F. Descomposición de varianza (FEVD) por horizonte — muestra B</w:t>
       </w:r>
-      <w:bookmarkEnd w:id="82"/>
+      <w:bookmarkEnd w:id="83"/>
     </w:p>
     <w:p>
       <w:pPr>
         <w:pStyle w:val="Descripcin"/>
         <w:jc w:val="center"/>
       </w:pPr>
-      <w:bookmarkStart w:id="83" w:name="_Toc231079655"/>
+      <w:bookmarkStart w:id="84" w:name="_Toc231081610"/>
       <w:r>
         <w:rPr>
           <w:sz w:val="20"/>
@@ -21038,7 +21645,7 @@
         </w:rPr>
         <w:t>.</w:t>
       </w:r>
-      <w:bookmarkEnd w:id="83"/>
+      <w:bookmarkEnd w:id="84"/>
       <w:r>
         <w:rPr>
           <w:sz w:val="20"/>
@@ -21568,18 +22175,18 @@
       <w:pPr>
         <w:pStyle w:val="Ttulo2"/>
       </w:pPr>
-      <w:bookmarkStart w:id="84" w:name="_Toc231079641"/>
+      <w:bookmarkStart w:id="85" w:name="_Toc231081596"/>
       <w:r>
         <w:t>Anexo G. Fuentes de datos</w:t>
       </w:r>
-      <w:bookmarkEnd w:id="84"/>
+      <w:bookmarkEnd w:id="85"/>
     </w:p>
     <w:p>
       <w:pPr>
         <w:pStyle w:val="Descripcin"/>
         <w:jc w:val="center"/>
       </w:pPr>
-      <w:bookmarkStart w:id="85" w:name="_Toc231079656"/>
+      <w:bookmarkStart w:id="86" w:name="_Toc231081611"/>
       <w:r>
         <w:rPr>
           <w:sz w:val="20"/>
@@ -21610,7 +22217,7 @@
         </w:rPr>
         <w:t>.</w:t>
       </w:r>
-      <w:bookmarkEnd w:id="85"/>
+      <w:bookmarkEnd w:id="86"/>
       <w:r>
         <w:rPr>
           <w:sz w:val="20"/>
@@ -22373,12 +22980,12 @@
       <w:pPr>
         <w:pStyle w:val="Ttulo2"/>
       </w:pPr>
-      <w:bookmarkStart w:id="86" w:name="_Toc231079642"/>
+      <w:bookmarkStart w:id="87" w:name="_Toc231081597"/>
       <w:r>
         <w:lastRenderedPageBreak/>
         <w:t>Anexo H. Disponibilidad del código</w:t>
       </w:r>
-      <w:bookmarkEnd w:id="86"/>
+      <w:bookmarkEnd w:id="87"/>
     </w:p>
     <w:p>
       <w:r>
@@ -22397,12 +23004,12 @@
       <w:pPr>
         <w:pStyle w:val="Ttulo1"/>
       </w:pPr>
-      <w:bookmarkStart w:id="87" w:name="_Toc231079643"/>
+      <w:bookmarkStart w:id="88" w:name="_Toc231081598"/>
       <w:r>
         <w:lastRenderedPageBreak/>
         <w:t>Glosario de términos econométricos</w:t>
       </w:r>
-      <w:bookmarkEnd w:id="87"/>
+      <w:bookmarkEnd w:id="88"/>
     </w:p>
     <w:p>
       <w:r>
@@ -22567,10 +23174,7 @@
     </w:p>
     <w:p>
       <w:r>
-        <w:t xml:space="preserve">largo plazo tras una </w:t>
-      </w:r>
-      <w:r>
-        <w:t>desviación, en un modelo VECM.</w:t>
+        <w:t>largo plazo tras una desviación, en un modelo VECM.</w:t>
       </w:r>
     </w:p>
     <w:p>
@@ -22670,7 +23274,7 @@
       </w:r>
     </w:p>
     <w:sectPr>
-      <w:footerReference w:type="default" r:id="rId14"/>
+      <w:footerReference w:type="default" r:id="rId15"/>
       <w:pgSz w:w="12240" w:h="15840"/>
       <w:pgMar w:top="1440" w:right="1699" w:bottom="1440" w:left="1699" w:header="720" w:footer="720" w:gutter="0"/>
       <w:pgNumType w:start="1"/>
@@ -22987,31 +23591,31 @@
       </w:rPr>
     </w:lvl>
   </w:abstractNum>
-  <w:num w:numId="1" w16cid:durableId="1587300177">
+  <w:num w:numId="1" w16cid:durableId="503126561">
     <w:abstractNumId w:val="8"/>
   </w:num>
-  <w:num w:numId="2" w16cid:durableId="1791246380">
+  <w:num w:numId="2" w16cid:durableId="1244101367">
     <w:abstractNumId w:val="6"/>
   </w:num>
-  <w:num w:numId="3" w16cid:durableId="1361904136">
+  <w:num w:numId="3" w16cid:durableId="369037244">
     <w:abstractNumId w:val="5"/>
   </w:num>
-  <w:num w:numId="4" w16cid:durableId="1295983469">
+  <w:num w:numId="4" w16cid:durableId="1182865629">
     <w:abstractNumId w:val="4"/>
   </w:num>
-  <w:num w:numId="5" w16cid:durableId="1448550508">
+  <w:num w:numId="5" w16cid:durableId="65692468">
     <w:abstractNumId w:val="7"/>
   </w:num>
-  <w:num w:numId="6" w16cid:durableId="368532259">
+  <w:num w:numId="6" w16cid:durableId="1650090300">
     <w:abstractNumId w:val="3"/>
   </w:num>
-  <w:num w:numId="7" w16cid:durableId="1339388145">
+  <w:num w:numId="7" w16cid:durableId="817108351">
     <w:abstractNumId w:val="2"/>
   </w:num>
-  <w:num w:numId="8" w16cid:durableId="877156606">
+  <w:num w:numId="8" w16cid:durableId="915898363">
     <w:abstractNumId w:val="1"/>
   </w:num>
-  <w:num w:numId="9" w16cid:durableId="1144464166">
+  <w:num w:numId="9" w16cid:durableId="708410719">
     <w:abstractNumId w:val="0"/>
   </w:num>
 </w:numbering>
@@ -34403,7 +35007,7 @@
     <w:autoRedefine/>
     <w:uiPriority w:val="39"/>
     <w:unhideWhenUsed/>
-    <w:rsid w:val="001037D8"/>
+    <w:rsid w:val="00E96965"/>
     <w:pPr>
       <w:spacing w:after="100"/>
     </w:pPr>
@@ -34415,7 +35019,7 @@
     <w:autoRedefine/>
     <w:uiPriority w:val="39"/>
     <w:unhideWhenUsed/>
-    <w:rsid w:val="001037D8"/>
+    <w:rsid w:val="00E96965"/>
     <w:pPr>
       <w:spacing w:after="100"/>
       <w:ind w:left="240"/>
@@ -34428,7 +35032,7 @@
     <w:autoRedefine/>
     <w:uiPriority w:val="39"/>
     <w:unhideWhenUsed/>
-    <w:rsid w:val="001037D8"/>
+    <w:rsid w:val="00E96965"/>
     <w:pPr>
       <w:spacing w:after="100"/>
       <w:ind w:left="480"/>
@@ -34439,7 +35043,7 @@
     <w:basedOn w:val="Fuentedeprrafopredeter"/>
     <w:uiPriority w:val="99"/>
     <w:unhideWhenUsed/>
-    <w:rsid w:val="001037D8"/>
+    <w:rsid w:val="00E96965"/>
     <w:rPr>
       <w:color w:val="0000FF" w:themeColor="hyperlink"/>
       <w:u w:val="single"/>
@@ -34451,7 +35055,7 @@
     <w:next w:val="Normal"/>
     <w:uiPriority w:val="99"/>
     <w:unhideWhenUsed/>
-    <w:rsid w:val="001037D8"/>
+    <w:rsid w:val="00E96965"/>
     <w:pPr>
       <w:spacing w:after="0"/>
     </w:pPr>

</xml_diff>

<commit_message>
Predictor del precio del cobre (extensión) + Anexo I (explicar vs predecir / eficiencia)
- src/predictor.py: modelo del retorno del cobre a 1 mes (Ridge/AR1/RF/GBM) con evaluación
  fuera de muestra honesta; exporta predictor.json a la plataforma
- Anexo I en la tesis: tabla OOS real; R2 OOS ~0 refuerza eficiencia de mercado débil
- (plataforma, repo aparte: sección Predictor interactiva ya desplegada)

Co-Authored-By: Claude Opus 4.8 <noreply@anthropic.com>
</commit_message>
<xml_diff>
--- a/outputs/Tesis_Francisco_Rietta.docx
+++ b/outputs/Tesis_Francisco_Rietta.docx
@@ -91,7 +91,7 @@
       <w:pPr>
         <w:pStyle w:val="Ttulo1"/>
       </w:pPr>
-      <w:bookmarkStart w:id="0" w:name="_Toc231081529"/>
+      <w:bookmarkStart w:id="0" w:name="_Toc231082272"/>
       <w:r>
         <w:lastRenderedPageBreak/>
         <w:t>Página de aprobación</w:t>
@@ -172,7 +172,7 @@
       <w:pPr>
         <w:pStyle w:val="Ttulo1"/>
       </w:pPr>
-      <w:bookmarkStart w:id="1" w:name="_Toc231081530"/>
+      <w:bookmarkStart w:id="1" w:name="_Toc231082273"/>
       <w:r>
         <w:lastRenderedPageBreak/>
         <w:t>Declaración de originalidad</w:t>
@@ -211,7 +211,7 @@
       <w:pPr>
         <w:pStyle w:val="Ttulo1"/>
       </w:pPr>
-      <w:bookmarkStart w:id="2" w:name="_Toc231081531"/>
+      <w:bookmarkStart w:id="2" w:name="_Toc231082274"/>
       <w:r>
         <w:lastRenderedPageBreak/>
         <w:t>Dedicatoria</w:t>
@@ -247,7 +247,7 @@
       <w:pPr>
         <w:pStyle w:val="Ttulo1"/>
       </w:pPr>
-      <w:bookmarkStart w:id="3" w:name="_Toc231081532"/>
+      <w:bookmarkStart w:id="3" w:name="_Toc231082275"/>
       <w:r>
         <w:lastRenderedPageBreak/>
         <w:t>Agradecimientos</w:t>
@@ -271,7 +271,7 @@
       <w:pPr>
         <w:pStyle w:val="Ttulo1"/>
       </w:pPr>
-      <w:bookmarkStart w:id="4" w:name="_Toc231081533"/>
+      <w:bookmarkStart w:id="4" w:name="_Toc231082276"/>
       <w:r>
         <w:lastRenderedPageBreak/>
         <w:t>Resumen</w:t>
@@ -306,7 +306,7 @@
       <w:pPr>
         <w:pStyle w:val="Ttulo1"/>
       </w:pPr>
-      <w:bookmarkStart w:id="5" w:name="_Toc231081534"/>
+      <w:bookmarkStart w:id="5" w:name="_Toc231082277"/>
       <w:r>
         <w:lastRenderedPageBreak/>
         <w:t>Abstract</w:t>
@@ -341,7 +341,7 @@
       <w:pPr>
         <w:pStyle w:val="Ttulo1"/>
       </w:pPr>
-      <w:bookmarkStart w:id="6" w:name="_Toc231081535"/>
+      <w:bookmarkStart w:id="6" w:name="_Toc231082278"/>
       <w:r>
         <w:lastRenderedPageBreak/>
         <w:t>Índice general</w:t>
@@ -372,7 +372,7 @@
       <w:r>
         <w:fldChar w:fldCharType="separate"/>
       </w:r>
-      <w:hyperlink w:anchor="_Toc231081529" w:history="1">
+      <w:hyperlink w:anchor="_Toc231082272" w:history="1">
         <w:r>
           <w:rPr>
             <w:rStyle w:val="Hipervnculo"/>
@@ -399,7 +399,7 @@
             <w:noProof/>
             <w:webHidden/>
           </w:rPr>
-          <w:instrText xml:space="preserve"> PAGEREF _Toc231081529 \h </w:instrText>
+          <w:instrText xml:space="preserve"> PAGEREF _Toc231082272 \h </w:instrText>
         </w:r>
         <w:r>
           <w:rPr>
@@ -445,7 +445,7 @@
           <w14:ligatures w14:val="standardContextual"/>
         </w:rPr>
       </w:pPr>
-      <w:hyperlink w:anchor="_Toc231081530" w:history="1">
+      <w:hyperlink w:anchor="_Toc231082273" w:history="1">
         <w:r>
           <w:rPr>
             <w:rStyle w:val="Hipervnculo"/>
@@ -472,7 +472,7 @@
             <w:noProof/>
             <w:webHidden/>
           </w:rPr>
-          <w:instrText xml:space="preserve"> PAGEREF _Toc231081530 \h </w:instrText>
+          <w:instrText xml:space="preserve"> PAGEREF _Toc231082273 \h </w:instrText>
         </w:r>
         <w:r>
           <w:rPr>
@@ -518,7 +518,7 @@
           <w14:ligatures w14:val="standardContextual"/>
         </w:rPr>
       </w:pPr>
-      <w:hyperlink w:anchor="_Toc231081531" w:history="1">
+      <w:hyperlink w:anchor="_Toc231082274" w:history="1">
         <w:r>
           <w:rPr>
             <w:rStyle w:val="Hipervnculo"/>
@@ -545,7 +545,7 @@
             <w:noProof/>
             <w:webHidden/>
           </w:rPr>
-          <w:instrText xml:space="preserve"> PAGEREF _Toc231081531 \h </w:instrText>
+          <w:instrText xml:space="preserve"> PAGEREF _Toc231082274 \h </w:instrText>
         </w:r>
         <w:r>
           <w:rPr>
@@ -591,7 +591,7 @@
           <w14:ligatures w14:val="standardContextual"/>
         </w:rPr>
       </w:pPr>
-      <w:hyperlink w:anchor="_Toc231081532" w:history="1">
+      <w:hyperlink w:anchor="_Toc231082275" w:history="1">
         <w:r>
           <w:rPr>
             <w:rStyle w:val="Hipervnculo"/>
@@ -618,7 +618,7 @@
             <w:noProof/>
             <w:webHidden/>
           </w:rPr>
-          <w:instrText xml:space="preserve"> PAGEREF _Toc231081532 \h </w:instrText>
+          <w:instrText xml:space="preserve"> PAGEREF _Toc231082275 \h </w:instrText>
         </w:r>
         <w:r>
           <w:rPr>
@@ -664,7 +664,7 @@
           <w14:ligatures w14:val="standardContextual"/>
         </w:rPr>
       </w:pPr>
-      <w:hyperlink w:anchor="_Toc231081533" w:history="1">
+      <w:hyperlink w:anchor="_Toc231082276" w:history="1">
         <w:r>
           <w:rPr>
             <w:rStyle w:val="Hipervnculo"/>
@@ -691,7 +691,7 @@
             <w:noProof/>
             <w:webHidden/>
           </w:rPr>
-          <w:instrText xml:space="preserve"> PAGEREF _Toc231081533 \h </w:instrText>
+          <w:instrText xml:space="preserve"> PAGEREF _Toc231082276 \h </w:instrText>
         </w:r>
         <w:r>
           <w:rPr>
@@ -737,7 +737,7 @@
           <w14:ligatures w14:val="standardContextual"/>
         </w:rPr>
       </w:pPr>
-      <w:hyperlink w:anchor="_Toc231081534" w:history="1">
+      <w:hyperlink w:anchor="_Toc231082277" w:history="1">
         <w:r>
           <w:rPr>
             <w:rStyle w:val="Hipervnculo"/>
@@ -764,7 +764,7 @@
             <w:noProof/>
             <w:webHidden/>
           </w:rPr>
-          <w:instrText xml:space="preserve"> PAGEREF _Toc231081534 \h </w:instrText>
+          <w:instrText xml:space="preserve"> PAGEREF _Toc231082277 \h </w:instrText>
         </w:r>
         <w:r>
           <w:rPr>
@@ -810,7 +810,7 @@
           <w14:ligatures w14:val="standardContextual"/>
         </w:rPr>
       </w:pPr>
-      <w:hyperlink w:anchor="_Toc231081535" w:history="1">
+      <w:hyperlink w:anchor="_Toc231082278" w:history="1">
         <w:r>
           <w:rPr>
             <w:rStyle w:val="Hipervnculo"/>
@@ -837,7 +837,7 @@
             <w:noProof/>
             <w:webHidden/>
           </w:rPr>
-          <w:instrText xml:space="preserve"> PAGEREF _Toc231081535 \h </w:instrText>
+          <w:instrText xml:space="preserve"> PAGEREF _Toc231082278 \h </w:instrText>
         </w:r>
         <w:r>
           <w:rPr>
@@ -883,7 +883,7 @@
           <w14:ligatures w14:val="standardContextual"/>
         </w:rPr>
       </w:pPr>
-      <w:hyperlink w:anchor="_Toc231081536" w:history="1">
+      <w:hyperlink w:anchor="_Toc231082279" w:history="1">
         <w:r>
           <w:rPr>
             <w:rStyle w:val="Hipervnculo"/>
@@ -910,7 +910,7 @@
             <w:noProof/>
             <w:webHidden/>
           </w:rPr>
-          <w:instrText xml:space="preserve"> PAGEREF _Toc231081536 \h </w:instrText>
+          <w:instrText xml:space="preserve"> PAGEREF _Toc231082279 \h </w:instrText>
         </w:r>
         <w:r>
           <w:rPr>
@@ -956,7 +956,7 @@
           <w14:ligatures w14:val="standardContextual"/>
         </w:rPr>
       </w:pPr>
-      <w:hyperlink w:anchor="_Toc231081537" w:history="1">
+      <w:hyperlink w:anchor="_Toc231082280" w:history="1">
         <w:r>
           <w:rPr>
             <w:rStyle w:val="Hipervnculo"/>
@@ -983,7 +983,7 @@
             <w:noProof/>
             <w:webHidden/>
           </w:rPr>
-          <w:instrText xml:space="preserve"> PAGEREF _Toc231081537 \h </w:instrText>
+          <w:instrText xml:space="preserve"> PAGEREF _Toc231082280 \h </w:instrText>
         </w:r>
         <w:r>
           <w:rPr>
@@ -1029,7 +1029,7 @@
           <w14:ligatures w14:val="standardContextual"/>
         </w:rPr>
       </w:pPr>
-      <w:hyperlink w:anchor="_Toc231081538" w:history="1">
+      <w:hyperlink w:anchor="_Toc231082281" w:history="1">
         <w:r>
           <w:rPr>
             <w:rStyle w:val="Hipervnculo"/>
@@ -1056,7 +1056,7 @@
             <w:noProof/>
             <w:webHidden/>
           </w:rPr>
-          <w:instrText xml:space="preserve"> PAGEREF _Toc231081538 \h </w:instrText>
+          <w:instrText xml:space="preserve"> PAGEREF _Toc231082281 \h </w:instrText>
         </w:r>
         <w:r>
           <w:rPr>
@@ -1102,7 +1102,7 @@
           <w14:ligatures w14:val="standardContextual"/>
         </w:rPr>
       </w:pPr>
-      <w:hyperlink w:anchor="_Toc231081539" w:history="1">
+      <w:hyperlink w:anchor="_Toc231082282" w:history="1">
         <w:r>
           <w:rPr>
             <w:rStyle w:val="Hipervnculo"/>
@@ -1129,7 +1129,7 @@
             <w:noProof/>
             <w:webHidden/>
           </w:rPr>
-          <w:instrText xml:space="preserve"> PAGEREF _Toc231081539 \h </w:instrText>
+          <w:instrText xml:space="preserve"> PAGEREF _Toc231082282 \h </w:instrText>
         </w:r>
         <w:r>
           <w:rPr>
@@ -1175,7 +1175,7 @@
           <w14:ligatures w14:val="standardContextual"/>
         </w:rPr>
       </w:pPr>
-      <w:hyperlink w:anchor="_Toc231081540" w:history="1">
+      <w:hyperlink w:anchor="_Toc231082283" w:history="1">
         <w:r>
           <w:rPr>
             <w:rStyle w:val="Hipervnculo"/>
@@ -1202,7 +1202,7 @@
             <w:noProof/>
             <w:webHidden/>
           </w:rPr>
-          <w:instrText xml:space="preserve"> PAGEREF _Toc231081540 \h </w:instrText>
+          <w:instrText xml:space="preserve"> PAGEREF _Toc231082283 \h </w:instrText>
         </w:r>
         <w:r>
           <w:rPr>
@@ -1248,7 +1248,7 @@
           <w14:ligatures w14:val="standardContextual"/>
         </w:rPr>
       </w:pPr>
-      <w:hyperlink w:anchor="_Toc231081541" w:history="1">
+      <w:hyperlink w:anchor="_Toc231082284" w:history="1">
         <w:r>
           <w:rPr>
             <w:rStyle w:val="Hipervnculo"/>
@@ -1275,7 +1275,7 @@
             <w:noProof/>
             <w:webHidden/>
           </w:rPr>
-          <w:instrText xml:space="preserve"> PAGEREF _Toc231081541 \h </w:instrText>
+          <w:instrText xml:space="preserve"> PAGEREF _Toc231082284 \h </w:instrText>
         </w:r>
         <w:r>
           <w:rPr>
@@ -1321,7 +1321,7 @@
           <w14:ligatures w14:val="standardContextual"/>
         </w:rPr>
       </w:pPr>
-      <w:hyperlink w:anchor="_Toc231081542" w:history="1">
+      <w:hyperlink w:anchor="_Toc231082285" w:history="1">
         <w:r>
           <w:rPr>
             <w:rStyle w:val="Hipervnculo"/>
@@ -1348,7 +1348,7 @@
             <w:noProof/>
             <w:webHidden/>
           </w:rPr>
-          <w:instrText xml:space="preserve"> PAGEREF _Toc231081542 \h </w:instrText>
+          <w:instrText xml:space="preserve"> PAGEREF _Toc231082285 \h </w:instrText>
         </w:r>
         <w:r>
           <w:rPr>
@@ -1394,7 +1394,7 @@
           <w14:ligatures w14:val="standardContextual"/>
         </w:rPr>
       </w:pPr>
-      <w:hyperlink w:anchor="_Toc231081543" w:history="1">
+      <w:hyperlink w:anchor="_Toc231082286" w:history="1">
         <w:r>
           <w:rPr>
             <w:rStyle w:val="Hipervnculo"/>
@@ -1421,7 +1421,7 @@
             <w:noProof/>
             <w:webHidden/>
           </w:rPr>
-          <w:instrText xml:space="preserve"> PAGEREF _Toc231081543 \h </w:instrText>
+          <w:instrText xml:space="preserve"> PAGEREF _Toc231082286 \h </w:instrText>
         </w:r>
         <w:r>
           <w:rPr>
@@ -1467,7 +1467,7 @@
           <w14:ligatures w14:val="standardContextual"/>
         </w:rPr>
       </w:pPr>
-      <w:hyperlink w:anchor="_Toc231081544" w:history="1">
+      <w:hyperlink w:anchor="_Toc231082287" w:history="1">
         <w:r>
           <w:rPr>
             <w:rStyle w:val="Hipervnculo"/>
@@ -1494,7 +1494,7 @@
             <w:noProof/>
             <w:webHidden/>
           </w:rPr>
-          <w:instrText xml:space="preserve"> PAGEREF _Toc231081544 \h </w:instrText>
+          <w:instrText xml:space="preserve"> PAGEREF _Toc231082287 \h </w:instrText>
         </w:r>
         <w:r>
           <w:rPr>
@@ -1540,7 +1540,7 @@
           <w14:ligatures w14:val="standardContextual"/>
         </w:rPr>
       </w:pPr>
-      <w:hyperlink w:anchor="_Toc231081545" w:history="1">
+      <w:hyperlink w:anchor="_Toc231082288" w:history="1">
         <w:r>
           <w:rPr>
             <w:rStyle w:val="Hipervnculo"/>
@@ -1567,7 +1567,7 @@
             <w:noProof/>
             <w:webHidden/>
           </w:rPr>
-          <w:instrText xml:space="preserve"> PAGEREF _Toc231081545 \h </w:instrText>
+          <w:instrText xml:space="preserve"> PAGEREF _Toc231082288 \h </w:instrText>
         </w:r>
         <w:r>
           <w:rPr>
@@ -1613,7 +1613,7 @@
           <w14:ligatures w14:val="standardContextual"/>
         </w:rPr>
       </w:pPr>
-      <w:hyperlink w:anchor="_Toc231081546" w:history="1">
+      <w:hyperlink w:anchor="_Toc231082289" w:history="1">
         <w:r>
           <w:rPr>
             <w:rStyle w:val="Hipervnculo"/>
@@ -1640,7 +1640,7 @@
             <w:noProof/>
             <w:webHidden/>
           </w:rPr>
-          <w:instrText xml:space="preserve"> PAGEREF _Toc231081546 \h </w:instrText>
+          <w:instrText xml:space="preserve"> PAGEREF _Toc231082289 \h </w:instrText>
         </w:r>
         <w:r>
           <w:rPr>
@@ -1686,7 +1686,7 @@
           <w14:ligatures w14:val="standardContextual"/>
         </w:rPr>
       </w:pPr>
-      <w:hyperlink w:anchor="_Toc231081547" w:history="1">
+      <w:hyperlink w:anchor="_Toc231082290" w:history="1">
         <w:r>
           <w:rPr>
             <w:rStyle w:val="Hipervnculo"/>
@@ -1713,7 +1713,7 @@
             <w:noProof/>
             <w:webHidden/>
           </w:rPr>
-          <w:instrText xml:space="preserve"> PAGEREF _Toc231081547 \h </w:instrText>
+          <w:instrText xml:space="preserve"> PAGEREF _Toc231082290 \h </w:instrText>
         </w:r>
         <w:r>
           <w:rPr>
@@ -1759,7 +1759,7 @@
           <w14:ligatures w14:val="standardContextual"/>
         </w:rPr>
       </w:pPr>
-      <w:hyperlink w:anchor="_Toc231081548" w:history="1">
+      <w:hyperlink w:anchor="_Toc231082291" w:history="1">
         <w:r>
           <w:rPr>
             <w:rStyle w:val="Hipervnculo"/>
@@ -1786,7 +1786,7 @@
             <w:noProof/>
             <w:webHidden/>
           </w:rPr>
-          <w:instrText xml:space="preserve"> PAGEREF _Toc231081548 \h </w:instrText>
+          <w:instrText xml:space="preserve"> PAGEREF _Toc231082291 \h </w:instrText>
         </w:r>
         <w:r>
           <w:rPr>
@@ -1832,7 +1832,7 @@
           <w14:ligatures w14:val="standardContextual"/>
         </w:rPr>
       </w:pPr>
-      <w:hyperlink w:anchor="_Toc231081549" w:history="1">
+      <w:hyperlink w:anchor="_Toc231082292" w:history="1">
         <w:r>
           <w:rPr>
             <w:rStyle w:val="Hipervnculo"/>
@@ -1859,7 +1859,7 @@
             <w:noProof/>
             <w:webHidden/>
           </w:rPr>
-          <w:instrText xml:space="preserve"> PAGEREF _Toc231081549 \h </w:instrText>
+          <w:instrText xml:space="preserve"> PAGEREF _Toc231082292 \h </w:instrText>
         </w:r>
         <w:r>
           <w:rPr>
@@ -1905,7 +1905,7 @@
           <w14:ligatures w14:val="standardContextual"/>
         </w:rPr>
       </w:pPr>
-      <w:hyperlink w:anchor="_Toc231081550" w:history="1">
+      <w:hyperlink w:anchor="_Toc231082293" w:history="1">
         <w:r>
           <w:rPr>
             <w:rStyle w:val="Hipervnculo"/>
@@ -1932,7 +1932,7 @@
             <w:noProof/>
             <w:webHidden/>
           </w:rPr>
-          <w:instrText xml:space="preserve"> PAGEREF _Toc231081550 \h </w:instrText>
+          <w:instrText xml:space="preserve"> PAGEREF _Toc231082293 \h </w:instrText>
         </w:r>
         <w:r>
           <w:rPr>
@@ -1978,7 +1978,7 @@
           <w14:ligatures w14:val="standardContextual"/>
         </w:rPr>
       </w:pPr>
-      <w:hyperlink w:anchor="_Toc231081551" w:history="1">
+      <w:hyperlink w:anchor="_Toc231082294" w:history="1">
         <w:r>
           <w:rPr>
             <w:rStyle w:val="Hipervnculo"/>
@@ -2005,7 +2005,7 @@
             <w:noProof/>
             <w:webHidden/>
           </w:rPr>
-          <w:instrText xml:space="preserve"> PAGEREF _Toc231081551 \h </w:instrText>
+          <w:instrText xml:space="preserve"> PAGEREF _Toc231082294 \h </w:instrText>
         </w:r>
         <w:r>
           <w:rPr>
@@ -2051,7 +2051,7 @@
           <w14:ligatures w14:val="standardContextual"/>
         </w:rPr>
       </w:pPr>
-      <w:hyperlink w:anchor="_Toc231081552" w:history="1">
+      <w:hyperlink w:anchor="_Toc231082295" w:history="1">
         <w:r>
           <w:rPr>
             <w:rStyle w:val="Hipervnculo"/>
@@ -2078,7 +2078,7 @@
             <w:noProof/>
             <w:webHidden/>
           </w:rPr>
-          <w:instrText xml:space="preserve"> PAGEREF _Toc231081552 \h </w:instrText>
+          <w:instrText xml:space="preserve"> PAGEREF _Toc231082295 \h </w:instrText>
         </w:r>
         <w:r>
           <w:rPr>
@@ -2124,7 +2124,7 @@
           <w14:ligatures w14:val="standardContextual"/>
         </w:rPr>
       </w:pPr>
-      <w:hyperlink w:anchor="_Toc231081553" w:history="1">
+      <w:hyperlink w:anchor="_Toc231082296" w:history="1">
         <w:r>
           <w:rPr>
             <w:rStyle w:val="Hipervnculo"/>
@@ -2151,7 +2151,7 @@
             <w:noProof/>
             <w:webHidden/>
           </w:rPr>
-          <w:instrText xml:space="preserve"> PAGEREF _Toc231081553 \h </w:instrText>
+          <w:instrText xml:space="preserve"> PAGEREF _Toc231082296 \h </w:instrText>
         </w:r>
         <w:r>
           <w:rPr>
@@ -2197,7 +2197,7 @@
           <w14:ligatures w14:val="standardContextual"/>
         </w:rPr>
       </w:pPr>
-      <w:hyperlink w:anchor="_Toc231081554" w:history="1">
+      <w:hyperlink w:anchor="_Toc231082297" w:history="1">
         <w:r>
           <w:rPr>
             <w:rStyle w:val="Hipervnculo"/>
@@ -2224,7 +2224,7 @@
             <w:noProof/>
             <w:webHidden/>
           </w:rPr>
-          <w:instrText xml:space="preserve"> PAGEREF _Toc231081554 \h </w:instrText>
+          <w:instrText xml:space="preserve"> PAGEREF _Toc231082297 \h </w:instrText>
         </w:r>
         <w:r>
           <w:rPr>
@@ -2270,7 +2270,7 @@
           <w14:ligatures w14:val="standardContextual"/>
         </w:rPr>
       </w:pPr>
-      <w:hyperlink w:anchor="_Toc231081555" w:history="1">
+      <w:hyperlink w:anchor="_Toc231082298" w:history="1">
         <w:r>
           <w:rPr>
             <w:rStyle w:val="Hipervnculo"/>
@@ -2297,7 +2297,7 @@
             <w:noProof/>
             <w:webHidden/>
           </w:rPr>
-          <w:instrText xml:space="preserve"> PAGEREF _Toc231081555 \h </w:instrText>
+          <w:instrText xml:space="preserve"> PAGEREF _Toc231082298 \h </w:instrText>
         </w:r>
         <w:r>
           <w:rPr>
@@ -2343,7 +2343,7 @@
           <w14:ligatures w14:val="standardContextual"/>
         </w:rPr>
       </w:pPr>
-      <w:hyperlink w:anchor="_Toc231081556" w:history="1">
+      <w:hyperlink w:anchor="_Toc231082299" w:history="1">
         <w:r>
           <w:rPr>
             <w:rStyle w:val="Hipervnculo"/>
@@ -2370,7 +2370,7 @@
             <w:noProof/>
             <w:webHidden/>
           </w:rPr>
-          <w:instrText xml:space="preserve"> PAGEREF _Toc231081556 \h </w:instrText>
+          <w:instrText xml:space="preserve"> PAGEREF _Toc231082299 \h </w:instrText>
         </w:r>
         <w:r>
           <w:rPr>
@@ -2416,7 +2416,7 @@
           <w14:ligatures w14:val="standardContextual"/>
         </w:rPr>
       </w:pPr>
-      <w:hyperlink w:anchor="_Toc231081557" w:history="1">
+      <w:hyperlink w:anchor="_Toc231082300" w:history="1">
         <w:r>
           <w:rPr>
             <w:rStyle w:val="Hipervnculo"/>
@@ -2443,7 +2443,7 @@
             <w:noProof/>
             <w:webHidden/>
           </w:rPr>
-          <w:instrText xml:space="preserve"> PAGEREF _Toc231081557 \h </w:instrText>
+          <w:instrText xml:space="preserve"> PAGEREF _Toc231082300 \h </w:instrText>
         </w:r>
         <w:r>
           <w:rPr>
@@ -2489,7 +2489,7 @@
           <w14:ligatures w14:val="standardContextual"/>
         </w:rPr>
       </w:pPr>
-      <w:hyperlink w:anchor="_Toc231081558" w:history="1">
+      <w:hyperlink w:anchor="_Toc231082301" w:history="1">
         <w:r>
           <w:rPr>
             <w:rStyle w:val="Hipervnculo"/>
@@ -2516,7 +2516,7 @@
             <w:noProof/>
             <w:webHidden/>
           </w:rPr>
-          <w:instrText xml:space="preserve"> PAGEREF _Toc231081558 \h </w:instrText>
+          <w:instrText xml:space="preserve"> PAGEREF _Toc231082301 \h </w:instrText>
         </w:r>
         <w:r>
           <w:rPr>
@@ -2562,7 +2562,7 @@
           <w14:ligatures w14:val="standardContextual"/>
         </w:rPr>
       </w:pPr>
-      <w:hyperlink w:anchor="_Toc231081559" w:history="1">
+      <w:hyperlink w:anchor="_Toc231082302" w:history="1">
         <w:r>
           <w:rPr>
             <w:rStyle w:val="Hipervnculo"/>
@@ -2589,7 +2589,7 @@
             <w:noProof/>
             <w:webHidden/>
           </w:rPr>
-          <w:instrText xml:space="preserve"> PAGEREF _Toc231081559 \h </w:instrText>
+          <w:instrText xml:space="preserve"> PAGEREF _Toc231082302 \h </w:instrText>
         </w:r>
         <w:r>
           <w:rPr>
@@ -2635,7 +2635,7 @@
           <w14:ligatures w14:val="standardContextual"/>
         </w:rPr>
       </w:pPr>
-      <w:hyperlink w:anchor="_Toc231081560" w:history="1">
+      <w:hyperlink w:anchor="_Toc231082303" w:history="1">
         <w:r>
           <w:rPr>
             <w:rStyle w:val="Hipervnculo"/>
@@ -2662,7 +2662,7 @@
             <w:noProof/>
             <w:webHidden/>
           </w:rPr>
-          <w:instrText xml:space="preserve"> PAGEREF _Toc231081560 \h </w:instrText>
+          <w:instrText xml:space="preserve"> PAGEREF _Toc231082303 \h </w:instrText>
         </w:r>
         <w:r>
           <w:rPr>
@@ -2708,7 +2708,7 @@
           <w14:ligatures w14:val="standardContextual"/>
         </w:rPr>
       </w:pPr>
-      <w:hyperlink w:anchor="_Toc231081561" w:history="1">
+      <w:hyperlink w:anchor="_Toc231082304" w:history="1">
         <w:r>
           <w:rPr>
             <w:rStyle w:val="Hipervnculo"/>
@@ -2735,7 +2735,7 @@
             <w:noProof/>
             <w:webHidden/>
           </w:rPr>
-          <w:instrText xml:space="preserve"> PAGEREF _Toc231081561 \h </w:instrText>
+          <w:instrText xml:space="preserve"> PAGEREF _Toc231082304 \h </w:instrText>
         </w:r>
         <w:r>
           <w:rPr>
@@ -2781,7 +2781,7 @@
           <w14:ligatures w14:val="standardContextual"/>
         </w:rPr>
       </w:pPr>
-      <w:hyperlink w:anchor="_Toc231081562" w:history="1">
+      <w:hyperlink w:anchor="_Toc231082305" w:history="1">
         <w:r>
           <w:rPr>
             <w:rStyle w:val="Hipervnculo"/>
@@ -2808,7 +2808,7 @@
             <w:noProof/>
             <w:webHidden/>
           </w:rPr>
-          <w:instrText xml:space="preserve"> PAGEREF _Toc231081562 \h </w:instrText>
+          <w:instrText xml:space="preserve"> PAGEREF _Toc231082305 \h </w:instrText>
         </w:r>
         <w:r>
           <w:rPr>
@@ -2854,7 +2854,7 @@
           <w14:ligatures w14:val="standardContextual"/>
         </w:rPr>
       </w:pPr>
-      <w:hyperlink w:anchor="_Toc231081563" w:history="1">
+      <w:hyperlink w:anchor="_Toc231082306" w:history="1">
         <w:r>
           <w:rPr>
             <w:rStyle w:val="Hipervnculo"/>
@@ -2881,7 +2881,7 @@
             <w:noProof/>
             <w:webHidden/>
           </w:rPr>
-          <w:instrText xml:space="preserve"> PAGEREF _Toc231081563 \h </w:instrText>
+          <w:instrText xml:space="preserve"> PAGEREF _Toc231082306 \h </w:instrText>
         </w:r>
         <w:r>
           <w:rPr>
@@ -2927,7 +2927,7 @@
           <w14:ligatures w14:val="standardContextual"/>
         </w:rPr>
       </w:pPr>
-      <w:hyperlink w:anchor="_Toc231081564" w:history="1">
+      <w:hyperlink w:anchor="_Toc231082307" w:history="1">
         <w:r>
           <w:rPr>
             <w:rStyle w:val="Hipervnculo"/>
@@ -2954,7 +2954,7 @@
             <w:noProof/>
             <w:webHidden/>
           </w:rPr>
-          <w:instrText xml:space="preserve"> PAGEREF _Toc231081564 \h </w:instrText>
+          <w:instrText xml:space="preserve"> PAGEREF _Toc231082307 \h </w:instrText>
         </w:r>
         <w:r>
           <w:rPr>
@@ -3000,7 +3000,7 @@
           <w14:ligatures w14:val="standardContextual"/>
         </w:rPr>
       </w:pPr>
-      <w:hyperlink w:anchor="_Toc231081565" w:history="1">
+      <w:hyperlink w:anchor="_Toc231082308" w:history="1">
         <w:r>
           <w:rPr>
             <w:rStyle w:val="Hipervnculo"/>
@@ -3027,7 +3027,7 @@
             <w:noProof/>
             <w:webHidden/>
           </w:rPr>
-          <w:instrText xml:space="preserve"> PAGEREF _Toc231081565 \h </w:instrText>
+          <w:instrText xml:space="preserve"> PAGEREF _Toc231082308 \h </w:instrText>
         </w:r>
         <w:r>
           <w:rPr>
@@ -3073,7 +3073,7 @@
           <w14:ligatures w14:val="standardContextual"/>
         </w:rPr>
       </w:pPr>
-      <w:hyperlink w:anchor="_Toc231081566" w:history="1">
+      <w:hyperlink w:anchor="_Toc231082309" w:history="1">
         <w:r>
           <w:rPr>
             <w:rStyle w:val="Hipervnculo"/>
@@ -3100,7 +3100,7 @@
             <w:noProof/>
             <w:webHidden/>
           </w:rPr>
-          <w:instrText xml:space="preserve"> PAGEREF _Toc231081566 \h </w:instrText>
+          <w:instrText xml:space="preserve"> PAGEREF _Toc231082309 \h </w:instrText>
         </w:r>
         <w:r>
           <w:rPr>
@@ -3146,7 +3146,7 @@
           <w14:ligatures w14:val="standardContextual"/>
         </w:rPr>
       </w:pPr>
-      <w:hyperlink w:anchor="_Toc231081567" w:history="1">
+      <w:hyperlink w:anchor="_Toc231082310" w:history="1">
         <w:r>
           <w:rPr>
             <w:rStyle w:val="Hipervnculo"/>
@@ -3173,7 +3173,7 @@
             <w:noProof/>
             <w:webHidden/>
           </w:rPr>
-          <w:instrText xml:space="preserve"> PAGEREF _Toc231081567 \h </w:instrText>
+          <w:instrText xml:space="preserve"> PAGEREF _Toc231082310 \h </w:instrText>
         </w:r>
         <w:r>
           <w:rPr>
@@ -3219,7 +3219,7 @@
           <w14:ligatures w14:val="standardContextual"/>
         </w:rPr>
       </w:pPr>
-      <w:hyperlink w:anchor="_Toc231081568" w:history="1">
+      <w:hyperlink w:anchor="_Toc231082311" w:history="1">
         <w:r>
           <w:rPr>
             <w:rStyle w:val="Hipervnculo"/>
@@ -3246,7 +3246,7 @@
             <w:noProof/>
             <w:webHidden/>
           </w:rPr>
-          <w:instrText xml:space="preserve"> PAGEREF _Toc231081568 \h </w:instrText>
+          <w:instrText xml:space="preserve"> PAGEREF _Toc231082311 \h </w:instrText>
         </w:r>
         <w:r>
           <w:rPr>
@@ -3292,7 +3292,7 @@
           <w14:ligatures w14:val="standardContextual"/>
         </w:rPr>
       </w:pPr>
-      <w:hyperlink w:anchor="_Toc231081569" w:history="1">
+      <w:hyperlink w:anchor="_Toc231082312" w:history="1">
         <w:r>
           <w:rPr>
             <w:rStyle w:val="Hipervnculo"/>
@@ -3319,7 +3319,7 @@
             <w:noProof/>
             <w:webHidden/>
           </w:rPr>
-          <w:instrText xml:space="preserve"> PAGEREF _Toc231081569 \h </w:instrText>
+          <w:instrText xml:space="preserve"> PAGEREF _Toc231082312 \h </w:instrText>
         </w:r>
         <w:r>
           <w:rPr>
@@ -3365,7 +3365,7 @@
           <w14:ligatures w14:val="standardContextual"/>
         </w:rPr>
       </w:pPr>
-      <w:hyperlink w:anchor="_Toc231081570" w:history="1">
+      <w:hyperlink w:anchor="_Toc231082313" w:history="1">
         <w:r>
           <w:rPr>
             <w:rStyle w:val="Hipervnculo"/>
@@ -3392,7 +3392,7 @@
             <w:noProof/>
             <w:webHidden/>
           </w:rPr>
-          <w:instrText xml:space="preserve"> PAGEREF _Toc231081570 \h </w:instrText>
+          <w:instrText xml:space="preserve"> PAGEREF _Toc231082313 \h </w:instrText>
         </w:r>
         <w:r>
           <w:rPr>
@@ -3438,7 +3438,7 @@
           <w14:ligatures w14:val="standardContextual"/>
         </w:rPr>
       </w:pPr>
-      <w:hyperlink w:anchor="_Toc231081571" w:history="1">
+      <w:hyperlink w:anchor="_Toc231082314" w:history="1">
         <w:r>
           <w:rPr>
             <w:rStyle w:val="Hipervnculo"/>
@@ -3465,7 +3465,7 @@
             <w:noProof/>
             <w:webHidden/>
           </w:rPr>
-          <w:instrText xml:space="preserve"> PAGEREF _Toc231081571 \h </w:instrText>
+          <w:instrText xml:space="preserve"> PAGEREF _Toc231082314 \h </w:instrText>
         </w:r>
         <w:r>
           <w:rPr>
@@ -3511,7 +3511,7 @@
           <w14:ligatures w14:val="standardContextual"/>
         </w:rPr>
       </w:pPr>
-      <w:hyperlink w:anchor="_Toc231081572" w:history="1">
+      <w:hyperlink w:anchor="_Toc231082315" w:history="1">
         <w:r>
           <w:rPr>
             <w:rStyle w:val="Hipervnculo"/>
@@ -3538,7 +3538,7 @@
             <w:noProof/>
             <w:webHidden/>
           </w:rPr>
-          <w:instrText xml:space="preserve"> PAGEREF _Toc231081572 \h </w:instrText>
+          <w:instrText xml:space="preserve"> PAGEREF _Toc231082315 \h </w:instrText>
         </w:r>
         <w:r>
           <w:rPr>
@@ -3584,7 +3584,7 @@
           <w14:ligatures w14:val="standardContextual"/>
         </w:rPr>
       </w:pPr>
-      <w:hyperlink w:anchor="_Toc231081573" w:history="1">
+      <w:hyperlink w:anchor="_Toc231082316" w:history="1">
         <w:r>
           <w:rPr>
             <w:rStyle w:val="Hipervnculo"/>
@@ -3611,7 +3611,7 @@
             <w:noProof/>
             <w:webHidden/>
           </w:rPr>
-          <w:instrText xml:space="preserve"> PAGEREF _Toc231081573 \h </w:instrText>
+          <w:instrText xml:space="preserve"> PAGEREF _Toc231082316 \h </w:instrText>
         </w:r>
         <w:r>
           <w:rPr>
@@ -3657,7 +3657,7 @@
           <w14:ligatures w14:val="standardContextual"/>
         </w:rPr>
       </w:pPr>
-      <w:hyperlink w:anchor="_Toc231081574" w:history="1">
+      <w:hyperlink w:anchor="_Toc231082317" w:history="1">
         <w:r>
           <w:rPr>
             <w:rStyle w:val="Hipervnculo"/>
@@ -3684,7 +3684,7 @@
             <w:noProof/>
             <w:webHidden/>
           </w:rPr>
-          <w:instrText xml:space="preserve"> PAGEREF _Toc231081574 \h </w:instrText>
+          <w:instrText xml:space="preserve"> PAGEREF _Toc231082317 \h </w:instrText>
         </w:r>
         <w:r>
           <w:rPr>
@@ -3730,7 +3730,7 @@
           <w14:ligatures w14:val="standardContextual"/>
         </w:rPr>
       </w:pPr>
-      <w:hyperlink w:anchor="_Toc231081575" w:history="1">
+      <w:hyperlink w:anchor="_Toc231082318" w:history="1">
         <w:r>
           <w:rPr>
             <w:rStyle w:val="Hipervnculo"/>
@@ -3757,7 +3757,7 @@
             <w:noProof/>
             <w:webHidden/>
           </w:rPr>
-          <w:instrText xml:space="preserve"> PAGEREF _Toc231081575 \h </w:instrText>
+          <w:instrText xml:space="preserve"> PAGEREF _Toc231082318 \h </w:instrText>
         </w:r>
         <w:r>
           <w:rPr>
@@ -3803,7 +3803,7 @@
           <w14:ligatures w14:val="standardContextual"/>
         </w:rPr>
       </w:pPr>
-      <w:hyperlink w:anchor="_Toc231081576" w:history="1">
+      <w:hyperlink w:anchor="_Toc231082319" w:history="1">
         <w:r>
           <w:rPr>
             <w:rStyle w:val="Hipervnculo"/>
@@ -3830,7 +3830,7 @@
             <w:noProof/>
             <w:webHidden/>
           </w:rPr>
-          <w:instrText xml:space="preserve"> PAGEREF _Toc231081576 \h </w:instrText>
+          <w:instrText xml:space="preserve"> PAGEREF _Toc231082319 \h </w:instrText>
         </w:r>
         <w:r>
           <w:rPr>
@@ -3876,7 +3876,7 @@
           <w14:ligatures w14:val="standardContextual"/>
         </w:rPr>
       </w:pPr>
-      <w:hyperlink w:anchor="_Toc231081577" w:history="1">
+      <w:hyperlink w:anchor="_Toc231082320" w:history="1">
         <w:r>
           <w:rPr>
             <w:rStyle w:val="Hipervnculo"/>
@@ -3903,7 +3903,7 @@
             <w:noProof/>
             <w:webHidden/>
           </w:rPr>
-          <w:instrText xml:space="preserve"> PAGEREF _Toc231081577 \h </w:instrText>
+          <w:instrText xml:space="preserve"> PAGEREF _Toc231082320 \h </w:instrText>
         </w:r>
         <w:r>
           <w:rPr>
@@ -3949,7 +3949,7 @@
           <w14:ligatures w14:val="standardContextual"/>
         </w:rPr>
       </w:pPr>
-      <w:hyperlink w:anchor="_Toc231081578" w:history="1">
+      <w:hyperlink w:anchor="_Toc231082321" w:history="1">
         <w:r>
           <w:rPr>
             <w:rStyle w:val="Hipervnculo"/>
@@ -3976,7 +3976,7 @@
             <w:noProof/>
             <w:webHidden/>
           </w:rPr>
-          <w:instrText xml:space="preserve"> PAGEREF _Toc231081578 \h </w:instrText>
+          <w:instrText xml:space="preserve"> PAGEREF _Toc231082321 \h </w:instrText>
         </w:r>
         <w:r>
           <w:rPr>
@@ -4022,7 +4022,7 @@
           <w14:ligatures w14:val="standardContextual"/>
         </w:rPr>
       </w:pPr>
-      <w:hyperlink w:anchor="_Toc231081579" w:history="1">
+      <w:hyperlink w:anchor="_Toc231082322" w:history="1">
         <w:r>
           <w:rPr>
             <w:rStyle w:val="Hipervnculo"/>
@@ -4049,7 +4049,7 @@
             <w:noProof/>
             <w:webHidden/>
           </w:rPr>
-          <w:instrText xml:space="preserve"> PAGEREF _Toc231081579 \h </w:instrText>
+          <w:instrText xml:space="preserve"> PAGEREF _Toc231082322 \h </w:instrText>
         </w:r>
         <w:r>
           <w:rPr>
@@ -4095,7 +4095,7 @@
           <w14:ligatures w14:val="standardContextual"/>
         </w:rPr>
       </w:pPr>
-      <w:hyperlink w:anchor="_Toc231081580" w:history="1">
+      <w:hyperlink w:anchor="_Toc231082323" w:history="1">
         <w:r>
           <w:rPr>
             <w:rStyle w:val="Hipervnculo"/>
@@ -4122,7 +4122,7 @@
             <w:noProof/>
             <w:webHidden/>
           </w:rPr>
-          <w:instrText xml:space="preserve"> PAGEREF _Toc231081580 \h </w:instrText>
+          <w:instrText xml:space="preserve"> PAGEREF _Toc231082323 \h </w:instrText>
         </w:r>
         <w:r>
           <w:rPr>
@@ -4168,7 +4168,7 @@
           <w14:ligatures w14:val="standardContextual"/>
         </w:rPr>
       </w:pPr>
-      <w:hyperlink w:anchor="_Toc231081581" w:history="1">
+      <w:hyperlink w:anchor="_Toc231082324" w:history="1">
         <w:r>
           <w:rPr>
             <w:rStyle w:val="Hipervnculo"/>
@@ -4195,7 +4195,7 @@
             <w:noProof/>
             <w:webHidden/>
           </w:rPr>
-          <w:instrText xml:space="preserve"> PAGEREF _Toc231081581 \h </w:instrText>
+          <w:instrText xml:space="preserve"> PAGEREF _Toc231082324 \h </w:instrText>
         </w:r>
         <w:r>
           <w:rPr>
@@ -4241,7 +4241,7 @@
           <w14:ligatures w14:val="standardContextual"/>
         </w:rPr>
       </w:pPr>
-      <w:hyperlink w:anchor="_Toc231081582" w:history="1">
+      <w:hyperlink w:anchor="_Toc231082325" w:history="1">
         <w:r>
           <w:rPr>
             <w:rStyle w:val="Hipervnculo"/>
@@ -4268,7 +4268,7 @@
             <w:noProof/>
             <w:webHidden/>
           </w:rPr>
-          <w:instrText xml:space="preserve"> PAGEREF _Toc231081582 \h </w:instrText>
+          <w:instrText xml:space="preserve"> PAGEREF _Toc231082325 \h </w:instrText>
         </w:r>
         <w:r>
           <w:rPr>
@@ -4314,7 +4314,7 @@
           <w14:ligatures w14:val="standardContextual"/>
         </w:rPr>
       </w:pPr>
-      <w:hyperlink w:anchor="_Toc231081583" w:history="1">
+      <w:hyperlink w:anchor="_Toc231082326" w:history="1">
         <w:r>
           <w:rPr>
             <w:rStyle w:val="Hipervnculo"/>
@@ -4341,7 +4341,7 @@
             <w:noProof/>
             <w:webHidden/>
           </w:rPr>
-          <w:instrText xml:space="preserve"> PAGEREF _Toc231081583 \h </w:instrText>
+          <w:instrText xml:space="preserve"> PAGEREF _Toc231082326 \h </w:instrText>
         </w:r>
         <w:r>
           <w:rPr>
@@ -4387,7 +4387,7 @@
           <w14:ligatures w14:val="standardContextual"/>
         </w:rPr>
       </w:pPr>
-      <w:hyperlink w:anchor="_Toc231081584" w:history="1">
+      <w:hyperlink w:anchor="_Toc231082327" w:history="1">
         <w:r>
           <w:rPr>
             <w:rStyle w:val="Hipervnculo"/>
@@ -4414,7 +4414,7 @@
             <w:noProof/>
             <w:webHidden/>
           </w:rPr>
-          <w:instrText xml:space="preserve"> PAGEREF _Toc231081584 \h </w:instrText>
+          <w:instrText xml:space="preserve"> PAGEREF _Toc231082327 \h </w:instrText>
         </w:r>
         <w:r>
           <w:rPr>
@@ -4460,7 +4460,7 @@
           <w14:ligatures w14:val="standardContextual"/>
         </w:rPr>
       </w:pPr>
-      <w:hyperlink w:anchor="_Toc231081585" w:history="1">
+      <w:hyperlink w:anchor="_Toc231082328" w:history="1">
         <w:r>
           <w:rPr>
             <w:rStyle w:val="Hipervnculo"/>
@@ -4487,7 +4487,7 @@
             <w:noProof/>
             <w:webHidden/>
           </w:rPr>
-          <w:instrText xml:space="preserve"> PAGEREF _Toc231081585 \h </w:instrText>
+          <w:instrText xml:space="preserve"> PAGEREF _Toc231082328 \h </w:instrText>
         </w:r>
         <w:r>
           <w:rPr>
@@ -4533,7 +4533,7 @@
           <w14:ligatures w14:val="standardContextual"/>
         </w:rPr>
       </w:pPr>
-      <w:hyperlink w:anchor="_Toc231081586" w:history="1">
+      <w:hyperlink w:anchor="_Toc231082329" w:history="1">
         <w:r>
           <w:rPr>
             <w:rStyle w:val="Hipervnculo"/>
@@ -4560,7 +4560,7 @@
             <w:noProof/>
             <w:webHidden/>
           </w:rPr>
-          <w:instrText xml:space="preserve"> PAGEREF _Toc231081586 \h </w:instrText>
+          <w:instrText xml:space="preserve"> PAGEREF _Toc231082329 \h </w:instrText>
         </w:r>
         <w:r>
           <w:rPr>
@@ -4606,7 +4606,7 @@
           <w14:ligatures w14:val="standardContextual"/>
         </w:rPr>
       </w:pPr>
-      <w:hyperlink w:anchor="_Toc231081587" w:history="1">
+      <w:hyperlink w:anchor="_Toc231082330" w:history="1">
         <w:r>
           <w:rPr>
             <w:rStyle w:val="Hipervnculo"/>
@@ -4633,7 +4633,7 @@
             <w:noProof/>
             <w:webHidden/>
           </w:rPr>
-          <w:instrText xml:space="preserve"> PAGEREF _Toc231081587 \h </w:instrText>
+          <w:instrText xml:space="preserve"> PAGEREF _Toc231082330 \h </w:instrText>
         </w:r>
         <w:r>
           <w:rPr>
@@ -4679,7 +4679,7 @@
           <w14:ligatures w14:val="standardContextual"/>
         </w:rPr>
       </w:pPr>
-      <w:hyperlink w:anchor="_Toc231081588" w:history="1">
+      <w:hyperlink w:anchor="_Toc231082331" w:history="1">
         <w:r>
           <w:rPr>
             <w:rStyle w:val="Hipervnculo"/>
@@ -4706,7 +4706,7 @@
             <w:noProof/>
             <w:webHidden/>
           </w:rPr>
-          <w:instrText xml:space="preserve"> PAGEREF _Toc231081588 \h </w:instrText>
+          <w:instrText xml:space="preserve"> PAGEREF _Toc231082331 \h </w:instrText>
         </w:r>
         <w:r>
           <w:rPr>
@@ -4752,7 +4752,7 @@
           <w14:ligatures w14:val="standardContextual"/>
         </w:rPr>
       </w:pPr>
-      <w:hyperlink w:anchor="_Toc231081589" w:history="1">
+      <w:hyperlink w:anchor="_Toc231082332" w:history="1">
         <w:r>
           <w:rPr>
             <w:rStyle w:val="Hipervnculo"/>
@@ -4779,7 +4779,7 @@
             <w:noProof/>
             <w:webHidden/>
           </w:rPr>
-          <w:instrText xml:space="preserve"> PAGEREF _Toc231081589 \h </w:instrText>
+          <w:instrText xml:space="preserve"> PAGEREF _Toc231082332 \h </w:instrText>
         </w:r>
         <w:r>
           <w:rPr>
@@ -4825,7 +4825,7 @@
           <w14:ligatures w14:val="standardContextual"/>
         </w:rPr>
       </w:pPr>
-      <w:hyperlink w:anchor="_Toc231081590" w:history="1">
+      <w:hyperlink w:anchor="_Toc231082333" w:history="1">
         <w:r>
           <w:rPr>
             <w:rStyle w:val="Hipervnculo"/>
@@ -4852,7 +4852,7 @@
             <w:noProof/>
             <w:webHidden/>
           </w:rPr>
-          <w:instrText xml:space="preserve"> PAGEREF _Toc231081590 \h </w:instrText>
+          <w:instrText xml:space="preserve"> PAGEREF _Toc231082333 \h </w:instrText>
         </w:r>
         <w:r>
           <w:rPr>
@@ -4898,7 +4898,7 @@
           <w14:ligatures w14:val="standardContextual"/>
         </w:rPr>
       </w:pPr>
-      <w:hyperlink w:anchor="_Toc231081591" w:history="1">
+      <w:hyperlink w:anchor="_Toc231082334" w:history="1">
         <w:r>
           <w:rPr>
             <w:rStyle w:val="Hipervnculo"/>
@@ -4925,7 +4925,7 @@
             <w:noProof/>
             <w:webHidden/>
           </w:rPr>
-          <w:instrText xml:space="preserve"> PAGEREF _Toc231081591 \h </w:instrText>
+          <w:instrText xml:space="preserve"> PAGEREF _Toc231082334 \h </w:instrText>
         </w:r>
         <w:r>
           <w:rPr>
@@ -4971,7 +4971,7 @@
           <w14:ligatures w14:val="standardContextual"/>
         </w:rPr>
       </w:pPr>
-      <w:hyperlink w:anchor="_Toc231081592" w:history="1">
+      <w:hyperlink w:anchor="_Toc231082335" w:history="1">
         <w:r>
           <w:rPr>
             <w:rStyle w:val="Hipervnculo"/>
@@ -4998,7 +4998,7 @@
             <w:noProof/>
             <w:webHidden/>
           </w:rPr>
-          <w:instrText xml:space="preserve"> PAGEREF _Toc231081592 \h </w:instrText>
+          <w:instrText xml:space="preserve"> PAGEREF _Toc231082335 \h </w:instrText>
         </w:r>
         <w:r>
           <w:rPr>
@@ -5044,7 +5044,7 @@
           <w14:ligatures w14:val="standardContextual"/>
         </w:rPr>
       </w:pPr>
-      <w:hyperlink w:anchor="_Toc231081593" w:history="1">
+      <w:hyperlink w:anchor="_Toc231082336" w:history="1">
         <w:r>
           <w:rPr>
             <w:rStyle w:val="Hipervnculo"/>
@@ -5071,7 +5071,7 @@
             <w:noProof/>
             <w:webHidden/>
           </w:rPr>
-          <w:instrText xml:space="preserve"> PAGEREF _Toc231081593 \h </w:instrText>
+          <w:instrText xml:space="preserve"> PAGEREF _Toc231082336 \h </w:instrText>
         </w:r>
         <w:r>
           <w:rPr>
@@ -5117,7 +5117,7 @@
           <w14:ligatures w14:val="standardContextual"/>
         </w:rPr>
       </w:pPr>
-      <w:hyperlink w:anchor="_Toc231081594" w:history="1">
+      <w:hyperlink w:anchor="_Toc231082337" w:history="1">
         <w:r>
           <w:rPr>
             <w:rStyle w:val="Hipervnculo"/>
@@ -5144,7 +5144,7 @@
             <w:noProof/>
             <w:webHidden/>
           </w:rPr>
-          <w:instrText xml:space="preserve"> PAGEREF _Toc231081594 \h </w:instrText>
+          <w:instrText xml:space="preserve"> PAGEREF _Toc231082337 \h </w:instrText>
         </w:r>
         <w:r>
           <w:rPr>
@@ -5190,7 +5190,7 @@
           <w14:ligatures w14:val="standardContextual"/>
         </w:rPr>
       </w:pPr>
-      <w:hyperlink w:anchor="_Toc231081595" w:history="1">
+      <w:hyperlink w:anchor="_Toc231082338" w:history="1">
         <w:r>
           <w:rPr>
             <w:rStyle w:val="Hipervnculo"/>
@@ -5217,7 +5217,7 @@
             <w:noProof/>
             <w:webHidden/>
           </w:rPr>
-          <w:instrText xml:space="preserve"> PAGEREF _Toc231081595 \h </w:instrText>
+          <w:instrText xml:space="preserve"> PAGEREF _Toc231082338 \h </w:instrText>
         </w:r>
         <w:r>
           <w:rPr>
@@ -5263,7 +5263,7 @@
           <w14:ligatures w14:val="standardContextual"/>
         </w:rPr>
       </w:pPr>
-      <w:hyperlink w:anchor="_Toc231081596" w:history="1">
+      <w:hyperlink w:anchor="_Toc231082339" w:history="1">
         <w:r>
           <w:rPr>
             <w:rStyle w:val="Hipervnculo"/>
@@ -5290,7 +5290,7 @@
             <w:noProof/>
             <w:webHidden/>
           </w:rPr>
-          <w:instrText xml:space="preserve"> PAGEREF _Toc231081596 \h </w:instrText>
+          <w:instrText xml:space="preserve"> PAGEREF _Toc231082339 \h </w:instrText>
         </w:r>
         <w:r>
           <w:rPr>
@@ -5336,7 +5336,7 @@
           <w14:ligatures w14:val="standardContextual"/>
         </w:rPr>
       </w:pPr>
-      <w:hyperlink w:anchor="_Toc231081597" w:history="1">
+      <w:hyperlink w:anchor="_Toc231082340" w:history="1">
         <w:r>
           <w:rPr>
             <w:rStyle w:val="Hipervnculo"/>
@@ -5363,7 +5363,80 @@
             <w:noProof/>
             <w:webHidden/>
           </w:rPr>
-          <w:instrText xml:space="preserve"> PAGEREF _Toc231081597 \h </w:instrText>
+          <w:instrText xml:space="preserve"> PAGEREF _Toc231082340 \h </w:instrText>
+        </w:r>
+        <w:r>
+          <w:rPr>
+            <w:noProof/>
+            <w:webHidden/>
+          </w:rPr>
+        </w:r>
+        <w:r>
+          <w:rPr>
+            <w:noProof/>
+            <w:webHidden/>
+          </w:rPr>
+          <w:fldChar w:fldCharType="separate"/>
+        </w:r>
+        <w:r>
+          <w:rPr>
+            <w:noProof/>
+            <w:webHidden/>
+          </w:rPr>
+          <w:t>52</w:t>
+        </w:r>
+        <w:r>
+          <w:rPr>
+            <w:noProof/>
+            <w:webHidden/>
+          </w:rPr>
+          <w:fldChar w:fldCharType="end"/>
+        </w:r>
+      </w:hyperlink>
+    </w:p>
+    <w:p>
+      <w:pPr>
+        <w:pStyle w:val="TDC2"/>
+        <w:tabs>
+          <w:tab w:val="right" w:leader="dot" w:pos="8832"/>
+        </w:tabs>
+        <w:rPr>
+          <w:rFonts w:asciiTheme="minorHAnsi" w:hAnsiTheme="minorHAnsi"/>
+          <w:noProof/>
+          <w:kern w:val="2"/>
+          <w:szCs w:val="24"/>
+          <w:lang w:val="es-CL" w:eastAsia="es-CL"/>
+          <w14:ligatures w14:val="standardContextual"/>
+        </w:rPr>
+      </w:pPr>
+      <w:hyperlink w:anchor="_Toc231082341" w:history="1">
+        <w:r>
+          <w:rPr>
+            <w:rStyle w:val="Hipervnculo"/>
+            <w:noProof/>
+          </w:rPr>
+          <w:t>Anexo I. Extensión predictiva: ¿explican o anticipan?</w:t>
+        </w:r>
+        <w:r>
+          <w:rPr>
+            <w:noProof/>
+            <w:webHidden/>
+          </w:rPr>
+          <w:tab/>
+        </w:r>
+        <w:r>
+          <w:rPr>
+            <w:noProof/>
+            <w:webHidden/>
+          </w:rPr>
+          <w:fldChar w:fldCharType="begin"/>
+        </w:r>
+        <w:r>
+          <w:rPr>
+            <w:noProof/>
+            <w:webHidden/>
+          </w:rPr>
+          <w:instrText xml:space="preserve"> PAGEREF _Toc231082341 \h </w:instrText>
         </w:r>
         <w:r>
           <w:rPr>
@@ -5409,7 +5482,7 @@
           <w14:ligatures w14:val="standardContextual"/>
         </w:rPr>
       </w:pPr>
-      <w:hyperlink w:anchor="_Toc231081598" w:history="1">
+      <w:hyperlink w:anchor="_Toc231082342" w:history="1">
         <w:r>
           <w:rPr>
             <w:rStyle w:val="Hipervnculo"/>
@@ -5436,7 +5509,7 @@
             <w:noProof/>
             <w:webHidden/>
           </w:rPr>
-          <w:instrText xml:space="preserve"> PAGEREF _Toc231081598 \h </w:instrText>
+          <w:instrText xml:space="preserve"> PAGEREF _Toc231082342 \h </w:instrText>
         </w:r>
         <w:r>
           <w:rPr>
@@ -5481,7 +5554,7 @@
       <w:pPr>
         <w:pStyle w:val="Ttulo1"/>
       </w:pPr>
-      <w:bookmarkStart w:id="7" w:name="_Toc231081536"/>
+      <w:bookmarkStart w:id="7" w:name="_Toc231082279"/>
       <w:r>
         <w:lastRenderedPageBreak/>
         <w:t>Índice de tablas</w:t>
@@ -5512,7 +5585,7 @@
       <w:r>
         <w:fldChar w:fldCharType="separate"/>
       </w:r>
-      <w:hyperlink w:anchor="_Toc231081599" w:history="1">
+      <w:hyperlink w:anchor="_Toc231082343" w:history="1">
         <w:r>
           <w:rPr>
             <w:rStyle w:val="Hipervnculo"/>
@@ -5539,7 +5612,7 @@
             <w:noProof/>
             <w:webHidden/>
           </w:rPr>
-          <w:instrText xml:space="preserve"> PAGEREF _Toc231081599 \h </w:instrText>
+          <w:instrText xml:space="preserve"> PAGEREF _Toc231082343 \h </w:instrText>
         </w:r>
         <w:r>
           <w:rPr>
@@ -5585,7 +5658,7 @@
           <w14:ligatures w14:val="standardContextual"/>
         </w:rPr>
       </w:pPr>
-      <w:hyperlink w:anchor="_Toc231081600" w:history="1">
+      <w:hyperlink w:anchor="_Toc231082344" w:history="1">
         <w:r>
           <w:rPr>
             <w:rStyle w:val="Hipervnculo"/>
@@ -5612,7 +5685,7 @@
             <w:noProof/>
             <w:webHidden/>
           </w:rPr>
-          <w:instrText xml:space="preserve"> PAGEREF _Toc231081600 \h </w:instrText>
+          <w:instrText xml:space="preserve"> PAGEREF _Toc231082344 \h </w:instrText>
         </w:r>
         <w:r>
           <w:rPr>
@@ -5658,7 +5731,7 @@
           <w14:ligatures w14:val="standardContextual"/>
         </w:rPr>
       </w:pPr>
-      <w:hyperlink w:anchor="_Toc231081601" w:history="1">
+      <w:hyperlink w:anchor="_Toc231082345" w:history="1">
         <w:r>
           <w:rPr>
             <w:rStyle w:val="Hipervnculo"/>
@@ -5685,7 +5758,7 @@
             <w:noProof/>
             <w:webHidden/>
           </w:rPr>
-          <w:instrText xml:space="preserve"> PAGEREF _Toc231081601 \h </w:instrText>
+          <w:instrText xml:space="preserve"> PAGEREF _Toc231082345 \h </w:instrText>
         </w:r>
         <w:r>
           <w:rPr>
@@ -5731,7 +5804,7 @@
           <w14:ligatures w14:val="standardContextual"/>
         </w:rPr>
       </w:pPr>
-      <w:hyperlink w:anchor="_Toc231081602" w:history="1">
+      <w:hyperlink w:anchor="_Toc231082346" w:history="1">
         <w:r>
           <w:rPr>
             <w:rStyle w:val="Hipervnculo"/>
@@ -5758,7 +5831,7 @@
             <w:noProof/>
             <w:webHidden/>
           </w:rPr>
-          <w:instrText xml:space="preserve"> PAGEREF _Toc231081602 \h </w:instrText>
+          <w:instrText xml:space="preserve"> PAGEREF _Toc231082346 \h </w:instrText>
         </w:r>
         <w:r>
           <w:rPr>
@@ -5804,7 +5877,7 @@
           <w14:ligatures w14:val="standardContextual"/>
         </w:rPr>
       </w:pPr>
-      <w:hyperlink w:anchor="_Toc231081603" w:history="1">
+      <w:hyperlink w:anchor="_Toc231082347" w:history="1">
         <w:r>
           <w:rPr>
             <w:rStyle w:val="Hipervnculo"/>
@@ -5831,7 +5904,7 @@
             <w:noProof/>
             <w:webHidden/>
           </w:rPr>
-          <w:instrText xml:space="preserve"> PAGEREF _Toc231081603 \h </w:instrText>
+          <w:instrText xml:space="preserve"> PAGEREF _Toc231082347 \h </w:instrText>
         </w:r>
         <w:r>
           <w:rPr>
@@ -5877,7 +5950,7 @@
           <w14:ligatures w14:val="standardContextual"/>
         </w:rPr>
       </w:pPr>
-      <w:hyperlink w:anchor="_Toc231081604" w:history="1">
+      <w:hyperlink w:anchor="_Toc231082348" w:history="1">
         <w:r>
           <w:rPr>
             <w:rStyle w:val="Hipervnculo"/>
@@ -5904,7 +5977,7 @@
             <w:noProof/>
             <w:webHidden/>
           </w:rPr>
-          <w:instrText xml:space="preserve"> PAGEREF _Toc231081604 \h </w:instrText>
+          <w:instrText xml:space="preserve"> PAGEREF _Toc231082348 \h </w:instrText>
         </w:r>
         <w:r>
           <w:rPr>
@@ -5950,7 +6023,7 @@
           <w14:ligatures w14:val="standardContextual"/>
         </w:rPr>
       </w:pPr>
-      <w:hyperlink w:anchor="_Toc231081605" w:history="1">
+      <w:hyperlink w:anchor="_Toc231082349" w:history="1">
         <w:r>
           <w:rPr>
             <w:rStyle w:val="Hipervnculo"/>
@@ -5977,7 +6050,7 @@
             <w:noProof/>
             <w:webHidden/>
           </w:rPr>
-          <w:instrText xml:space="preserve"> PAGEREF _Toc231081605 \h </w:instrText>
+          <w:instrText xml:space="preserve"> PAGEREF _Toc231082349 \h </w:instrText>
         </w:r>
         <w:r>
           <w:rPr>
@@ -6023,7 +6096,7 @@
           <w14:ligatures w14:val="standardContextual"/>
         </w:rPr>
       </w:pPr>
-      <w:hyperlink w:anchor="_Toc231081606" w:history="1">
+      <w:hyperlink w:anchor="_Toc231082350" w:history="1">
         <w:r>
           <w:rPr>
             <w:rStyle w:val="Hipervnculo"/>
@@ -6050,7 +6123,7 @@
             <w:noProof/>
             <w:webHidden/>
           </w:rPr>
-          <w:instrText xml:space="preserve"> PAGEREF _Toc231081606 \h </w:instrText>
+          <w:instrText xml:space="preserve"> PAGEREF _Toc231082350 \h </w:instrText>
         </w:r>
         <w:r>
           <w:rPr>
@@ -6096,7 +6169,7 @@
           <w14:ligatures w14:val="standardContextual"/>
         </w:rPr>
       </w:pPr>
-      <w:hyperlink w:anchor="_Toc231081607" w:history="1">
+      <w:hyperlink w:anchor="_Toc231082351" w:history="1">
         <w:r>
           <w:rPr>
             <w:rStyle w:val="Hipervnculo"/>
@@ -6123,7 +6196,7 @@
             <w:noProof/>
             <w:webHidden/>
           </w:rPr>
-          <w:instrText xml:space="preserve"> PAGEREF _Toc231081607 \h </w:instrText>
+          <w:instrText xml:space="preserve"> PAGEREF _Toc231082351 \h </w:instrText>
         </w:r>
         <w:r>
           <w:rPr>
@@ -6169,7 +6242,7 @@
           <w14:ligatures w14:val="standardContextual"/>
         </w:rPr>
       </w:pPr>
-      <w:hyperlink w:anchor="_Toc231081608" w:history="1">
+      <w:hyperlink w:anchor="_Toc231082352" w:history="1">
         <w:r>
           <w:rPr>
             <w:rStyle w:val="Hipervnculo"/>
@@ -6196,7 +6269,7 @@
             <w:noProof/>
             <w:webHidden/>
           </w:rPr>
-          <w:instrText xml:space="preserve"> PAGEREF _Toc231081608 \h </w:instrText>
+          <w:instrText xml:space="preserve"> PAGEREF _Toc231082352 \h </w:instrText>
         </w:r>
         <w:r>
           <w:rPr>
@@ -6242,7 +6315,7 @@
           <w14:ligatures w14:val="standardContextual"/>
         </w:rPr>
       </w:pPr>
-      <w:hyperlink w:anchor="_Toc231081609" w:history="1">
+      <w:hyperlink w:anchor="_Toc231082353" w:history="1">
         <w:r>
           <w:rPr>
             <w:rStyle w:val="Hipervnculo"/>
@@ -6269,7 +6342,7 @@
             <w:noProof/>
             <w:webHidden/>
           </w:rPr>
-          <w:instrText xml:space="preserve"> PAGEREF _Toc231081609 \h </w:instrText>
+          <w:instrText xml:space="preserve"> PAGEREF _Toc231082353 \h </w:instrText>
         </w:r>
         <w:r>
           <w:rPr>
@@ -6315,7 +6388,7 @@
           <w14:ligatures w14:val="standardContextual"/>
         </w:rPr>
       </w:pPr>
-      <w:hyperlink w:anchor="_Toc231081610" w:history="1">
+      <w:hyperlink w:anchor="_Toc231082354" w:history="1">
         <w:r>
           <w:rPr>
             <w:rStyle w:val="Hipervnculo"/>
@@ -6342,7 +6415,7 @@
             <w:noProof/>
             <w:webHidden/>
           </w:rPr>
-          <w:instrText xml:space="preserve"> PAGEREF _Toc231081610 \h </w:instrText>
+          <w:instrText xml:space="preserve"> PAGEREF _Toc231082354 \h </w:instrText>
         </w:r>
         <w:r>
           <w:rPr>
@@ -6388,7 +6461,7 @@
           <w14:ligatures w14:val="standardContextual"/>
         </w:rPr>
       </w:pPr>
-      <w:hyperlink w:anchor="_Toc231081611" w:history="1">
+      <w:hyperlink w:anchor="_Toc231082355" w:history="1">
         <w:r>
           <w:rPr>
             <w:rStyle w:val="Hipervnculo"/>
@@ -6415,7 +6488,7 @@
             <w:noProof/>
             <w:webHidden/>
           </w:rPr>
-          <w:instrText xml:space="preserve"> PAGEREF _Toc231081611 \h </w:instrText>
+          <w:instrText xml:space="preserve"> PAGEREF _Toc231082355 \h </w:instrText>
         </w:r>
         <w:r>
           <w:rPr>
@@ -6445,27 +6518,6 @@
           <w:fldChar w:fldCharType="end"/>
         </w:r>
       </w:hyperlink>
-    </w:p>
-    <w:p>
-      <w:r>
-        <w:fldChar w:fldCharType="end"/>
-      </w:r>
-    </w:p>
-    <w:p>
-      <w:r>
-        <w:br w:type="page"/>
-      </w:r>
-    </w:p>
-    <w:p>
-      <w:pPr>
-        <w:pStyle w:val="Ttulo1"/>
-      </w:pPr>
-      <w:bookmarkStart w:id="8" w:name="_Toc231081537"/>
-      <w:r>
-        <w:lastRenderedPageBreak/>
-        <w:t>Índice de figuras</w:t>
-      </w:r>
-      <w:bookmarkEnd w:id="8"/>
     </w:p>
     <w:p>
       <w:pPr>
@@ -6482,22 +6534,13 @@
           <w14:ligatures w14:val="standardContextual"/>
         </w:rPr>
       </w:pPr>
-      <w:r>
-        <w:fldChar w:fldCharType="begin"/>
-      </w:r>
-      <w:r>
-        <w:instrText>TOC \h \z \c "Figura"</w:instrText>
-      </w:r>
-      <w:r>
-        <w:fldChar w:fldCharType="separate"/>
-      </w:r>
-      <w:hyperlink w:anchor="_Toc231081612" w:history="1">
+      <w:hyperlink w:anchor="_Toc231082356" w:history="1">
         <w:r>
           <w:rPr>
             <w:rStyle w:val="Hipervnculo"/>
             <w:noProof/>
           </w:rPr>
-          <w:t>Figura 1. Sensibilidad de los retornos a cada factor macro-financiero (muestra B).</w:t>
+          <w:t>Tabla 14.</w:t>
         </w:r>
         <w:r>
           <w:rPr>
@@ -6518,7 +6561,7 @@
             <w:noProof/>
             <w:webHidden/>
           </w:rPr>
-          <w:instrText xml:space="preserve"> PAGEREF _Toc231081612 \h </w:instrText>
+          <w:instrText xml:space="preserve"> PAGEREF _Toc231082356 \h </w:instrText>
         </w:r>
         <w:r>
           <w:rPr>
@@ -6538,7 +6581,7 @@
             <w:noProof/>
             <w:webHidden/>
           </w:rPr>
-          <w:t>29</w:t>
+          <w:t>52</w:t>
         </w:r>
         <w:r>
           <w:rPr>
@@ -6548,6 +6591,27 @@
           <w:fldChar w:fldCharType="end"/>
         </w:r>
       </w:hyperlink>
+    </w:p>
+    <w:p>
+      <w:r>
+        <w:fldChar w:fldCharType="end"/>
+      </w:r>
+    </w:p>
+    <w:p>
+      <w:r>
+        <w:br w:type="page"/>
+      </w:r>
+    </w:p>
+    <w:p>
+      <w:pPr>
+        <w:pStyle w:val="Ttulo1"/>
+      </w:pPr>
+      <w:bookmarkStart w:id="8" w:name="_Toc231082280"/>
+      <w:r>
+        <w:lastRenderedPageBreak/>
+        <w:t>Índice de figuras</w:t>
+      </w:r>
+      <w:bookmarkEnd w:id="8"/>
     </w:p>
     <w:p>
       <w:pPr>
@@ -6564,13 +6628,22 @@
           <w14:ligatures w14:val="standardContextual"/>
         </w:rPr>
       </w:pPr>
-      <w:hyperlink w:anchor="_Toc231081613" w:history="1">
+      <w:r>
+        <w:fldChar w:fldCharType="begin"/>
+      </w:r>
+      <w:r>
+        <w:instrText>TOC \h \z \c "Figura"</w:instrText>
+      </w:r>
+      <w:r>
+        <w:fldChar w:fldCharType="separate"/>
+      </w:r>
+      <w:hyperlink w:anchor="_Toc231082357" w:history="1">
         <w:r>
           <w:rPr>
             <w:rStyle w:val="Hipervnculo"/>
             <w:noProof/>
           </w:rPr>
-          <w:t>Figura 2. Descomposición de la varianza del error de pronóstico del retorno (FEVD, horizonte 12 meses).</w:t>
+          <w:t>Figura 1. Sensibilidad de los retornos a cada factor macro-financiero (muestra B).</w:t>
         </w:r>
         <w:r>
           <w:rPr>
@@ -6591,7 +6664,7 @@
             <w:noProof/>
             <w:webHidden/>
           </w:rPr>
-          <w:instrText xml:space="preserve"> PAGEREF _Toc231081613 \h </w:instrText>
+          <w:instrText xml:space="preserve"> PAGEREF _Toc231082357 \h </w:instrText>
         </w:r>
         <w:r>
           <w:rPr>
@@ -6611,7 +6684,7 @@
             <w:noProof/>
             <w:webHidden/>
           </w:rPr>
-          <w:t>32</w:t>
+          <w:t>29</w:t>
         </w:r>
         <w:r>
           <w:rPr>
@@ -6637,13 +6710,13 @@
           <w14:ligatures w14:val="standardContextual"/>
         </w:rPr>
       </w:pPr>
-      <w:hyperlink w:anchor="_Toc231081614" w:history="1">
+      <w:hyperlink w:anchor="_Toc231082358" w:history="1">
         <w:r>
           <w:rPr>
             <w:rStyle w:val="Hipervnculo"/>
             <w:noProof/>
           </w:rPr>
-          <w:t>Figura 3. Impulso-respuesta del retorno del sector ante un shock del precio del cobre (±2 errores estándar).</w:t>
+          <w:t>Figura 2. Descomposición de la varianza del error de pronóstico del retorno (FEVD, horizonte 12 meses).</w:t>
         </w:r>
         <w:r>
           <w:rPr>
@@ -6664,7 +6737,7 @@
             <w:noProof/>
             <w:webHidden/>
           </w:rPr>
-          <w:instrText xml:space="preserve"> PAGEREF _Toc231081614 \h </w:instrText>
+          <w:instrText xml:space="preserve"> PAGEREF _Toc231082358 \h </w:instrText>
         </w:r>
         <w:r>
           <w:rPr>
@@ -6684,7 +6757,7 @@
             <w:noProof/>
             <w:webHidden/>
           </w:rPr>
-          <w:t>33</w:t>
+          <w:t>32</w:t>
         </w:r>
         <w:r>
           <w:rPr>
@@ -6710,13 +6783,13 @@
           <w14:ligatures w14:val="standardContextual"/>
         </w:rPr>
       </w:pPr>
-      <w:hyperlink w:anchor="_Toc231081615" w:history="1">
+      <w:hyperlink w:anchor="_Toc231082359" w:history="1">
         <w:r>
           <w:rPr>
             <w:rStyle w:val="Hipervnculo"/>
             <w:noProof/>
           </w:rPr>
-          <w:t>Figura 4. Precio del cobre y fases del ciclo (expansión/contracción) fechadas con Bry-Boschan.</w:t>
+          <w:t>Figura 3. Impulso-respuesta del retorno del sector ante un shock del precio del cobre (±2 errores estándar).</w:t>
         </w:r>
         <w:r>
           <w:rPr>
@@ -6737,7 +6810,7 @@
             <w:noProof/>
             <w:webHidden/>
           </w:rPr>
-          <w:instrText xml:space="preserve"> PAGEREF _Toc231081615 \h </w:instrText>
+          <w:instrText xml:space="preserve"> PAGEREF _Toc231082359 \h </w:instrText>
         </w:r>
         <w:r>
           <w:rPr>
@@ -6757,7 +6830,7 @@
             <w:noProof/>
             <w:webHidden/>
           </w:rPr>
-          <w:t>34</w:t>
+          <w:t>33</w:t>
         </w:r>
         <w:r>
           <w:rPr>
@@ -6783,13 +6856,13 @@
           <w14:ligatures w14:val="standardContextual"/>
         </w:rPr>
       </w:pPr>
-      <w:hyperlink w:anchor="_Toc231081616" w:history="1">
+      <w:hyperlink w:anchor="_Toc231082360" w:history="1">
         <w:r>
           <w:rPr>
             <w:rStyle w:val="Hipervnculo"/>
             <w:noProof/>
           </w:rPr>
-          <w:t>Figura 5. Triangulación: sensibilidad al cobre y dominancia global por muestra (B, A, C).</w:t>
+          <w:t>Figura 4. Precio del cobre y fases del ciclo (expansión/contracción) fechadas con Bry-Boschan.</w:t>
         </w:r>
         <w:r>
           <w:rPr>
@@ -6810,7 +6883,7 @@
             <w:noProof/>
             <w:webHidden/>
           </w:rPr>
-          <w:instrText xml:space="preserve"> PAGEREF _Toc231081616 \h </w:instrText>
+          <w:instrText xml:space="preserve"> PAGEREF _Toc231082360 \h </w:instrText>
         </w:r>
         <w:r>
           <w:rPr>
@@ -6830,7 +6903,7 @@
             <w:noProof/>
             <w:webHidden/>
           </w:rPr>
-          <w:t>35</w:t>
+          <w:t>34</w:t>
         </w:r>
         <w:r>
           <w:rPr>
@@ -6856,12 +6929,85 @@
           <w14:ligatures w14:val="standardContextual"/>
         </w:rPr>
       </w:pPr>
-      <w:hyperlink w:anchor="_Toc231081617" w:history="1">
+      <w:hyperlink w:anchor="_Toc231082361" w:history="1">
         <w:r>
           <w:rPr>
             <w:rStyle w:val="Hipervnculo"/>
             <w:noProof/>
           </w:rPr>
+          <w:t>Figura 5. Triangulación: sensibilidad al cobre y dominancia global por muestra (B, A, C).</w:t>
+        </w:r>
+        <w:r>
+          <w:rPr>
+            <w:noProof/>
+            <w:webHidden/>
+          </w:rPr>
+          <w:tab/>
+        </w:r>
+        <w:r>
+          <w:rPr>
+            <w:noProof/>
+            <w:webHidden/>
+          </w:rPr>
+          <w:fldChar w:fldCharType="begin"/>
+        </w:r>
+        <w:r>
+          <w:rPr>
+            <w:noProof/>
+            <w:webHidden/>
+          </w:rPr>
+          <w:instrText xml:space="preserve"> PAGEREF _Toc231082361 \h </w:instrText>
+        </w:r>
+        <w:r>
+          <w:rPr>
+            <w:noProof/>
+            <w:webHidden/>
+          </w:rPr>
+        </w:r>
+        <w:r>
+          <w:rPr>
+            <w:noProof/>
+            <w:webHidden/>
+          </w:rPr>
+          <w:fldChar w:fldCharType="separate"/>
+        </w:r>
+        <w:r>
+          <w:rPr>
+            <w:noProof/>
+            <w:webHidden/>
+          </w:rPr>
+          <w:t>35</w:t>
+        </w:r>
+        <w:r>
+          <w:rPr>
+            <w:noProof/>
+            <w:webHidden/>
+          </w:rPr>
+          <w:fldChar w:fldCharType="end"/>
+        </w:r>
+      </w:hyperlink>
+    </w:p>
+    <w:p>
+      <w:pPr>
+        <w:pStyle w:val="Tabladeilustraciones"/>
+        <w:tabs>
+          <w:tab w:val="right" w:leader="dot" w:pos="8832"/>
+        </w:tabs>
+        <w:rPr>
+          <w:rFonts w:asciiTheme="minorHAnsi" w:hAnsiTheme="minorHAnsi"/>
+          <w:noProof/>
+          <w:kern w:val="2"/>
+          <w:szCs w:val="24"/>
+          <w:lang w:val="es-CL" w:eastAsia="es-CL"/>
+          <w14:ligatures w14:val="standardContextual"/>
+        </w:rPr>
+      </w:pPr>
+      <w:hyperlink w:anchor="_Toc231082362" w:history="1">
+        <w:r>
+          <w:rPr>
+            <w:rStyle w:val="Hipervnculo"/>
+            <w:noProof/>
+          </w:rPr>
           <w:t>Figura 6. Respuesta del retorno a un shock del cobre mediante proyecciones locales (Jordà, 2005), IC 95%.</w:t>
         </w:r>
         <w:r>
@@ -6883,7 +7029,7 @@
             <w:noProof/>
             <w:webHidden/>
           </w:rPr>
-          <w:instrText xml:space="preserve"> PAGEREF _Toc231081617 \h </w:instrText>
+          <w:instrText xml:space="preserve"> PAGEREF _Toc231082362 \h </w:instrText>
         </w:r>
         <w:r>
           <w:rPr>
@@ -6928,7 +7074,7 @@
       <w:pPr>
         <w:pStyle w:val="Ttulo1"/>
       </w:pPr>
-      <w:bookmarkStart w:id="9" w:name="_Toc231081538"/>
+      <w:bookmarkStart w:id="9" w:name="_Toc231082281"/>
       <w:r>
         <w:lastRenderedPageBreak/>
         <w:t xml:space="preserve">Lista de </w:t>
@@ -7537,7 +7683,7 @@
       <w:pPr>
         <w:pStyle w:val="Ttulo1"/>
       </w:pPr>
-      <w:bookmarkStart w:id="10" w:name="_Toc231081539"/>
+      <w:bookmarkStart w:id="10" w:name="_Toc231082282"/>
       <w:r>
         <w:lastRenderedPageBreak/>
         <w:t>Capítulo 1 — Introducción</w:t>
@@ -7548,7 +7694,7 @@
       <w:pPr>
         <w:pStyle w:val="Ttulo2"/>
       </w:pPr>
-      <w:bookmarkStart w:id="11" w:name="_Toc231081540"/>
+      <w:bookmarkStart w:id="11" w:name="_Toc231082283"/>
       <w:r>
         <w:t>1.1 Contextualización</w:t>
       </w:r>
@@ -7633,7 +7779,7 @@
       <w:pPr>
         <w:pStyle w:val="Ttulo2"/>
       </w:pPr>
-      <w:bookmarkStart w:id="12" w:name="_Toc231081541"/>
+      <w:bookmarkStart w:id="12" w:name="_Toc231082284"/>
       <w:r>
         <w:lastRenderedPageBreak/>
         <w:t>1.2 Problema de investigación y justificación</w:t>
@@ -7746,7 +7892,7 @@
       <w:pPr>
         <w:pStyle w:val="Ttulo2"/>
       </w:pPr>
-      <w:bookmarkStart w:id="13" w:name="_Toc231081542"/>
+      <w:bookmarkStart w:id="13" w:name="_Toc231082285"/>
       <w:r>
         <w:lastRenderedPageBreak/>
         <w:t>1.3 Pregunta y objetivos de investigación</w:t>
@@ -7929,7 +8075,7 @@
       <w:pPr>
         <w:pStyle w:val="Ttulo2"/>
       </w:pPr>
-      <w:bookmarkStart w:id="14" w:name="_Toc231081543"/>
+      <w:bookmarkStart w:id="14" w:name="_Toc231082286"/>
       <w:r>
         <w:t>1.4 Hipótesis general</w:t>
       </w:r>
@@ -7972,7 +8118,7 @@
       <w:pPr>
         <w:pStyle w:val="Ttulo2"/>
       </w:pPr>
-      <w:bookmarkStart w:id="15" w:name="_Toc231081544"/>
+      <w:bookmarkStart w:id="15" w:name="_Toc231082287"/>
       <w:r>
         <w:t>1.5 Aspectos metodológicos y alcance</w:t>
       </w:r>
@@ -8075,7 +8221,7 @@
       <w:pPr>
         <w:pStyle w:val="Ttulo2"/>
       </w:pPr>
-      <w:bookmarkStart w:id="16" w:name="_Toc231081545"/>
+      <w:bookmarkStart w:id="16" w:name="_Toc231082288"/>
       <w:r>
         <w:t>1.6 Aportes esperados</w:t>
       </w:r>
@@ -8129,7 +8275,7 @@
       <w:pPr>
         <w:pStyle w:val="Ttulo2"/>
       </w:pPr>
-      <w:bookmarkStart w:id="17" w:name="_Toc231081546"/>
+      <w:bookmarkStart w:id="17" w:name="_Toc231082289"/>
       <w:r>
         <w:t>1.7 Estructura de la tesis</w:t>
       </w:r>
@@ -8172,7 +8318,7 @@
       <w:pPr>
         <w:pStyle w:val="Ttulo1"/>
       </w:pPr>
-      <w:bookmarkStart w:id="18" w:name="_Toc231081547"/>
+      <w:bookmarkStart w:id="18" w:name="_Toc231082290"/>
       <w:r>
         <w:lastRenderedPageBreak/>
         <w:t>Capítulo 2 — Marco teórico y revisión de literatura</w:t>
@@ -8183,7 +8329,7 @@
       <w:pPr>
         <w:pStyle w:val="Ttulo2"/>
       </w:pPr>
-      <w:bookmarkStart w:id="19" w:name="_Toc231081548"/>
+      <w:bookmarkStart w:id="19" w:name="_Toc231082291"/>
       <w:r>
         <w:t>2.1 Determinantes macroeconómicos de los retornos accionarios</w:t>
       </w:r>
@@ -8478,7 +8624,7 @@
       <w:pPr>
         <w:pStyle w:val="Ttulo2"/>
       </w:pPr>
-      <w:bookmarkStart w:id="20" w:name="_Toc231081549"/>
+      <w:bookmarkStart w:id="20" w:name="_Toc231082292"/>
       <w:r>
         <w:t>2.2 Precios de commodities y valoración de empresas mineras</w:t>
       </w:r>
@@ -8616,7 +8762,7 @@
       <w:pPr>
         <w:pStyle w:val="Ttulo2"/>
       </w:pPr>
-      <w:bookmarkStart w:id="21" w:name="_Toc231081550"/>
+      <w:bookmarkStart w:id="21" w:name="_Toc231082293"/>
       <w:r>
         <w:t>2.3 Tipo de cambio y exposición de empresas exportadoras</w:t>
       </w:r>
@@ -8694,7 +8840,7 @@
       <w:pPr>
         <w:pStyle w:val="Ttulo2"/>
       </w:pPr>
-      <w:bookmarkStart w:id="22" w:name="_Toc231081551"/>
+      <w:bookmarkStart w:id="22" w:name="_Toc231082294"/>
       <w:r>
         <w:t>2.4 Cobre, tipo de cambio y la economía chilena</w:t>
       </w:r>
@@ -8911,7 +9057,7 @@
       <w:pPr>
         <w:pStyle w:val="Ttulo2"/>
       </w:pPr>
-      <w:bookmarkStart w:id="23" w:name="_Toc231081552"/>
+      <w:bookmarkStart w:id="23" w:name="_Toc231082295"/>
       <w:r>
         <w:t>2.5 Eficiencia informacional y segmentación de mercados</w:t>
       </w:r>
@@ -9051,7 +9197,7 @@
       <w:pPr>
         <w:pStyle w:val="Ttulo2"/>
       </w:pPr>
-      <w:bookmarkStart w:id="24" w:name="_Toc231081553"/>
+      <w:bookmarkStart w:id="24" w:name="_Toc231082296"/>
       <w:r>
         <w:t>2.6 Enfoques econométricos para la medición de impacto</w:t>
       </w:r>
@@ -9175,7 +9321,7 @@
       <w:pPr>
         <w:pStyle w:val="Ttulo2"/>
       </w:pPr>
-      <w:bookmarkStart w:id="25" w:name="_Toc231081554"/>
+      <w:bookmarkStart w:id="25" w:name="_Toc231082297"/>
       <w:r>
         <w:t>2.7 Síntesis e identificación del vacío de investigación</w:t>
       </w:r>
@@ -9309,7 +9455,7 @@
       <w:pPr>
         <w:pStyle w:val="Ttulo3"/>
       </w:pPr>
-      <w:bookmarkStart w:id="26" w:name="_Toc231081555"/>
+      <w:bookmarkStart w:id="26" w:name="_Toc231082298"/>
       <w:r>
         <w:t>Nota sobre la tabla de literatura</w:t>
       </w:r>
@@ -9340,7 +9486,7 @@
       <w:pPr>
         <w:pStyle w:val="Ttulo1"/>
       </w:pPr>
-      <w:bookmarkStart w:id="27" w:name="_Toc231081556"/>
+      <w:bookmarkStart w:id="27" w:name="_Toc231082299"/>
       <w:r>
         <w:lastRenderedPageBreak/>
         <w:t>Capítulo 3 — Datos y metodología</w:t>
@@ -9351,7 +9497,7 @@
       <w:pPr>
         <w:pStyle w:val="Ttulo2"/>
       </w:pPr>
-      <w:bookmarkStart w:id="28" w:name="_Toc231081557"/>
+      <w:bookmarkStart w:id="28" w:name="_Toc231082300"/>
       <w:r>
         <w:t>3.1 Definición del universo de empresas y período</w:t>
       </w:r>
@@ -9540,7 +9686,7 @@
       <w:pPr>
         <w:pStyle w:val="Ttulo2"/>
       </w:pPr>
-      <w:bookmarkStart w:id="29" w:name="_Toc231081558"/>
+      <w:bookmarkStart w:id="29" w:name="_Toc231082301"/>
       <w:r>
         <w:t>3.2 Variable dependiente</w:t>
       </w:r>
@@ -9599,7 +9745,7 @@
       <w:pPr>
         <w:pStyle w:val="Ttulo2"/>
       </w:pPr>
-      <w:bookmarkStart w:id="30" w:name="_Toc231081559"/>
+      <w:bookmarkStart w:id="30" w:name="_Toc231082302"/>
       <w:r>
         <w:t>3.3 Variables explicativas</w:t>
       </w:r>
@@ -9666,7 +9812,7 @@
       <w:pPr>
         <w:pStyle w:val="Ttulo2"/>
       </w:pPr>
-      <w:bookmarkStart w:id="31" w:name="_Toc231081560"/>
+      <w:bookmarkStart w:id="31" w:name="_Toc231082303"/>
       <w:r>
         <w:t>3.4 Tratamiento de datos y frecuencias mixtas</w:t>
       </w:r>
@@ -9723,7 +9869,7 @@
       <w:pPr>
         <w:pStyle w:val="Ttulo2"/>
       </w:pPr>
-      <w:bookmarkStart w:id="32" w:name="_Toc231081561"/>
+      <w:bookmarkStart w:id="32" w:name="_Toc231082304"/>
       <w:r>
         <w:t>3.5 Datación de las fases del ciclo del cobre</w:t>
       </w:r>
@@ -9790,7 +9936,7 @@
       <w:pPr>
         <w:pStyle w:val="Ttulo2"/>
       </w:pPr>
-      <w:bookmarkStart w:id="33" w:name="_Toc231081562"/>
+      <w:bookmarkStart w:id="33" w:name="_Toc231082305"/>
       <w:r>
         <w:t>3.6 Estrategia econométrica</w:t>
       </w:r>
@@ -9800,7 +9946,7 @@
       <w:pPr>
         <w:pStyle w:val="Ttulo3"/>
       </w:pPr>
-      <w:bookmarkStart w:id="34" w:name="_Toc231081563"/>
+      <w:bookmarkStart w:id="34" w:name="_Toc231082306"/>
       <w:r>
         <w:t>3.6.1 Estacionariedad y orden de integración (OE1)</w:t>
       </w:r>
@@ -9840,7 +9986,7 @@
       <w:pPr>
         <w:pStyle w:val="Ttulo3"/>
       </w:pPr>
-      <w:bookmarkStart w:id="35" w:name="_Toc231081564"/>
+      <w:bookmarkStart w:id="35" w:name="_Toc231082307"/>
       <w:r>
         <w:t>3.6.2 Modelo de impacto: panel de efectos fijos (OE2)</w:t>
       </w:r>
@@ -9937,7 +10083,7 @@
       <w:pPr>
         <w:pStyle w:val="Ttulo3"/>
       </w:pPr>
-      <w:bookmarkStart w:id="36" w:name="_Toc231081565"/>
+      <w:bookmarkStart w:id="36" w:name="_Toc231082308"/>
       <w:r>
         <w:t>3.6.3 Relaciones de largo plazo: cointegración (OE3)</w:t>
       </w:r>
@@ -10035,7 +10181,7 @@
       <w:pPr>
         <w:pStyle w:val="Ttulo3"/>
       </w:pPr>
-      <w:bookmarkStart w:id="37" w:name="_Toc231081566"/>
+      <w:bookmarkStart w:id="37" w:name="_Toc231082309"/>
       <w:r>
         <w:t>3.6.4 Dinámica de shocks: VAR, impulso-respuesta y descomposición de varianza (OE4)</w:t>
       </w:r>
@@ -10158,7 +10304,7 @@
       <w:pPr>
         <w:pStyle w:val="Ttulo3"/>
       </w:pPr>
-      <w:bookmarkStart w:id="38" w:name="_Toc231081567"/>
+      <w:bookmarkStart w:id="38" w:name="_Toc231082310"/>
       <w:r>
         <w:t>3.6.5 Estabilidad por fases del ciclo (OE5)</w:t>
       </w:r>
@@ -10204,7 +10350,7 @@
       <w:pPr>
         <w:pStyle w:val="Ttulo3"/>
       </w:pPr>
-      <w:bookmarkStart w:id="39" w:name="_Toc231081568"/>
+      <w:bookmarkStart w:id="39" w:name="_Toc231082311"/>
       <w:r>
         <w:t>3.6.6 Comparación entre mercados: triangulación (OE6)</w:t>
       </w:r>
@@ -10258,7 +10404,7 @@
       <w:pPr>
         <w:pStyle w:val="Ttulo2"/>
       </w:pPr>
-      <w:bookmarkStart w:id="40" w:name="_Toc231081569"/>
+      <w:bookmarkStart w:id="40" w:name="_Toc231082312"/>
       <w:r>
         <w:t>3.7 Validación de supuestos y robustez</w:t>
       </w:r>
@@ -10308,7 +10454,7 @@
       <w:pPr>
         <w:pStyle w:val="Ttulo3"/>
       </w:pPr>
-      <w:bookmarkStart w:id="41" w:name="_Toc231081570"/>
+      <w:bookmarkStart w:id="41" w:name="_Toc231082313"/>
       <w:r>
         <w:lastRenderedPageBreak/>
         <w:t>Tabla 3.1 — Definición operativa de variables (resumen)</w:t>
@@ -10320,7 +10466,7 @@
         <w:pStyle w:val="Descripcin"/>
         <w:jc w:val="center"/>
       </w:pPr>
-      <w:bookmarkStart w:id="42" w:name="_Toc231081599"/>
+      <w:bookmarkStart w:id="42" w:name="_Toc231082343"/>
       <w:r>
         <w:rPr>
           <w:sz w:val="20"/>
@@ -11679,7 +11825,7 @@
       <w:pPr>
         <w:pStyle w:val="Ttulo1"/>
       </w:pPr>
-      <w:bookmarkStart w:id="43" w:name="_Toc231081571"/>
+      <w:bookmarkStart w:id="43" w:name="_Toc231082314"/>
       <w:r>
         <w:lastRenderedPageBreak/>
         <w:t>Capítulo 4 — Resultados y discusión</w:t>
@@ -11690,7 +11836,7 @@
       <w:pPr>
         <w:pStyle w:val="Ttulo2"/>
       </w:pPr>
-      <w:bookmarkStart w:id="44" w:name="_Toc231081572"/>
+      <w:bookmarkStart w:id="44" w:name="_Toc231082315"/>
       <w:r>
         <w:t>4.1 Análisis descriptivo y propiedades de las series (OE1)</w:t>
       </w:r>
@@ -11840,7 +11986,7 @@
       <w:pPr>
         <w:pStyle w:val="Ttulo2"/>
       </w:pPr>
-      <w:bookmarkStart w:id="45" w:name="_Toc231081573"/>
+      <w:bookmarkStart w:id="45" w:name="_Toc231082316"/>
       <w:r>
         <w:t>4.2 Determinantes de los retornos: global vs local (OE2)</w:t>
       </w:r>
@@ -11861,7 +12007,7 @@
         <w:pStyle w:val="Descripcin"/>
         <w:jc w:val="center"/>
       </w:pPr>
-      <w:bookmarkStart w:id="46" w:name="_Toc231081600"/>
+      <w:bookmarkStart w:id="46" w:name="_Toc231082344"/>
       <w:r>
         <w:rPr>
           <w:sz w:val="20"/>
@@ -12460,7 +12606,7 @@
           <w:noProof/>
         </w:rPr>
         <w:drawing>
-          <wp:inline distT="0" distB="0" distL="0" distR="0" wp14:anchorId="7B35076D" wp14:editId="3C6ADFE7">
+          <wp:inline distT="0" distB="0" distL="0" distR="0" wp14:anchorId="018E6B7B" wp14:editId="4FBDF8D7">
             <wp:extent cx="5394960" cy="2933107"/>
             <wp:effectExtent l="0" t="0" r="0" b="0"/>
             <wp:docPr id="1" name="Picture 1"/>
@@ -12501,7 +12647,7 @@
         <w:pStyle w:val="Descripcin"/>
         <w:jc w:val="center"/>
       </w:pPr>
-      <w:bookmarkStart w:id="47" w:name="_Toc231081612"/>
+      <w:bookmarkStart w:id="47" w:name="_Toc231082357"/>
       <w:r>
         <w:rPr>
           <w:sz w:val="20"/>
@@ -12538,7 +12684,7 @@
       <w:pPr>
         <w:pStyle w:val="Ttulo2"/>
       </w:pPr>
-      <w:bookmarkStart w:id="48" w:name="_Toc231081574"/>
+      <w:bookmarkStart w:id="48" w:name="_Toc231082317"/>
       <w:r>
         <w:t>4.3 Relaciones de largo plazo (OE3)</w:t>
       </w:r>
@@ -12708,7 +12854,7 @@
       <w:pPr>
         <w:pStyle w:val="Ttulo2"/>
       </w:pPr>
-      <w:bookmarkStart w:id="49" w:name="_Toc231081575"/>
+      <w:bookmarkStart w:id="49" w:name="_Toc231082318"/>
       <w:r>
         <w:lastRenderedPageBreak/>
         <w:t>4.4 Dinámica de shocks (OE4)</w:t>
@@ -12730,7 +12876,7 @@
         <w:pStyle w:val="Descripcin"/>
         <w:jc w:val="center"/>
       </w:pPr>
-      <w:bookmarkStart w:id="50" w:name="_Toc231081601"/>
+      <w:bookmarkStart w:id="50" w:name="_Toc231082345"/>
       <w:r>
         <w:rPr>
           <w:sz w:val="20"/>
@@ -13062,7 +13208,7 @@
         </w:rPr>
         <w:lastRenderedPageBreak/>
         <w:drawing>
-          <wp:inline distT="0" distB="0" distL="0" distR="0" wp14:anchorId="6B1C6BC5" wp14:editId="3C5F5004">
+          <wp:inline distT="0" distB="0" distL="0" distR="0" wp14:anchorId="460041EC" wp14:editId="12EDDCAB">
             <wp:extent cx="5394960" cy="4026860"/>
             <wp:effectExtent l="0" t="0" r="0" b="0"/>
             <wp:docPr id="2" name="Picture 2"/>
@@ -13103,7 +13249,7 @@
         <w:pStyle w:val="Descripcin"/>
         <w:jc w:val="center"/>
       </w:pPr>
-      <w:bookmarkStart w:id="51" w:name="_Toc231081613"/>
+      <w:bookmarkStart w:id="51" w:name="_Toc231082358"/>
       <w:r>
         <w:rPr>
           <w:sz w:val="20"/>
@@ -13178,7 +13324,7 @@
         </w:rPr>
         <w:lastRenderedPageBreak/>
         <w:drawing>
-          <wp:inline distT="0" distB="0" distL="0" distR="0" wp14:anchorId="2F8D6F36" wp14:editId="5FF04893">
+          <wp:inline distT="0" distB="0" distL="0" distR="0" wp14:anchorId="4A374F1B" wp14:editId="46E2A77C">
             <wp:extent cx="5394960" cy="2620409"/>
             <wp:effectExtent l="0" t="0" r="0" b="0"/>
             <wp:docPr id="3" name="Picture 3"/>
@@ -13219,7 +13365,7 @@
         <w:pStyle w:val="Descripcin"/>
         <w:jc w:val="center"/>
       </w:pPr>
-      <w:bookmarkStart w:id="52" w:name="_Toc231081614"/>
+      <w:bookmarkStart w:id="52" w:name="_Toc231082359"/>
       <w:r>
         <w:rPr>
           <w:sz w:val="20"/>
@@ -13256,7 +13402,7 @@
       <w:pPr>
         <w:pStyle w:val="Ttulo2"/>
       </w:pPr>
-      <w:bookmarkStart w:id="53" w:name="_Toc231081576"/>
+      <w:bookmarkStart w:id="53" w:name="_Toc231082319"/>
       <w:r>
         <w:t>4.5 Estabilidad por fases del ciclo del cobre (OE5)</w:t>
       </w:r>
@@ -13363,7 +13509,7 @@
         </w:rPr>
         <w:lastRenderedPageBreak/>
         <w:drawing>
-          <wp:inline distT="0" distB="0" distL="0" distR="0" wp14:anchorId="201D2711" wp14:editId="19706DBA">
+          <wp:inline distT="0" distB="0" distL="0" distR="0" wp14:anchorId="00401060" wp14:editId="34C0DB90">
             <wp:extent cx="5394960" cy="2449752"/>
             <wp:effectExtent l="0" t="0" r="0" b="0"/>
             <wp:docPr id="4" name="Picture 4"/>
@@ -13404,7 +13550,7 @@
         <w:pStyle w:val="Descripcin"/>
         <w:jc w:val="center"/>
       </w:pPr>
-      <w:bookmarkStart w:id="54" w:name="_Toc231081615"/>
+      <w:bookmarkStart w:id="54" w:name="_Toc231082360"/>
       <w:r>
         <w:rPr>
           <w:sz w:val="20"/>
@@ -13441,7 +13587,7 @@
       <w:pPr>
         <w:pStyle w:val="Ttulo2"/>
       </w:pPr>
-      <w:bookmarkStart w:id="55" w:name="_Toc231081577"/>
+      <w:bookmarkStart w:id="55" w:name="_Toc231082320"/>
       <w:r>
         <w:t>4.6 Comparación entre mercados: triangulación (OE6)</w:t>
       </w:r>
@@ -13462,7 +13608,7 @@
         <w:pStyle w:val="Descripcin"/>
         <w:jc w:val="center"/>
       </w:pPr>
-      <w:bookmarkStart w:id="56" w:name="_Toc231081602"/>
+      <w:bookmarkStart w:id="56" w:name="_Toc231082346"/>
       <w:r>
         <w:rPr>
           <w:sz w:val="20"/>
@@ -13903,7 +14049,7 @@
           <w:noProof/>
         </w:rPr>
         <w:drawing>
-          <wp:inline distT="0" distB="0" distL="0" distR="0" wp14:anchorId="092E350B" wp14:editId="4CB58A83">
+          <wp:inline distT="0" distB="0" distL="0" distR="0" wp14:anchorId="65B3EEFD" wp14:editId="42E459AB">
             <wp:extent cx="5394960" cy="2718240"/>
             <wp:effectExtent l="0" t="0" r="0" b="0"/>
             <wp:docPr id="5" name="Picture 5"/>
@@ -13944,7 +14090,7 @@
         <w:pStyle w:val="Descripcin"/>
         <w:jc w:val="center"/>
       </w:pPr>
-      <w:bookmarkStart w:id="57" w:name="_Toc231081616"/>
+      <w:bookmarkStart w:id="57" w:name="_Toc231082361"/>
       <w:r>
         <w:rPr>
           <w:sz w:val="20"/>
@@ -14018,7 +14164,7 @@
       <w:pPr>
         <w:pStyle w:val="Ttulo2"/>
       </w:pPr>
-      <w:bookmarkStart w:id="58" w:name="_Toc231081578"/>
+      <w:bookmarkStart w:id="58" w:name="_Toc231082321"/>
       <w:r>
         <w:t>4.7 Diagnósticos y robustez</w:t>
       </w:r>
@@ -14377,7 +14523,7 @@
           <w:noProof/>
         </w:rPr>
         <w:drawing>
-          <wp:inline distT="0" distB="0" distL="0" distR="0" wp14:anchorId="6B8FA12C" wp14:editId="0027102C">
+          <wp:inline distT="0" distB="0" distL="0" distR="0" wp14:anchorId="4D50D554" wp14:editId="3114DA0C">
             <wp:extent cx="5394960" cy="2620409"/>
             <wp:effectExtent l="0" t="0" r="0" b="0"/>
             <wp:docPr id="6" name="Picture 6"/>
@@ -14418,7 +14564,7 @@
         <w:pStyle w:val="Descripcin"/>
         <w:jc w:val="center"/>
       </w:pPr>
-      <w:bookmarkStart w:id="59" w:name="_Toc231081617"/>
+      <w:bookmarkStart w:id="59" w:name="_Toc231082362"/>
       <w:r>
         <w:rPr>
           <w:sz w:val="20"/>
@@ -14455,7 +14601,7 @@
       <w:pPr>
         <w:pStyle w:val="Ttulo2"/>
       </w:pPr>
-      <w:bookmarkStart w:id="60" w:name="_Toc231081579"/>
+      <w:bookmarkStart w:id="60" w:name="_Toc231082322"/>
       <w:r>
         <w:t>4.8 Discusión integrada</w:t>
       </w:r>
@@ -14642,7 +14788,7 @@
       <w:pPr>
         <w:pStyle w:val="Ttulo1"/>
       </w:pPr>
-      <w:bookmarkStart w:id="61" w:name="_Toc231081580"/>
+      <w:bookmarkStart w:id="61" w:name="_Toc231082323"/>
       <w:r>
         <w:lastRenderedPageBreak/>
         <w:t>Capítulo 5 — Conclusiones</w:t>
@@ -14653,7 +14799,7 @@
       <w:pPr>
         <w:pStyle w:val="Ttulo2"/>
       </w:pPr>
-      <w:bookmarkStart w:id="62" w:name="_Toc231081581"/>
+      <w:bookmarkStart w:id="62" w:name="_Toc231082324"/>
       <w:r>
         <w:t>5.1 Síntesis de los hallazgos</w:t>
       </w:r>
@@ -14746,7 +14892,7 @@
       <w:pPr>
         <w:pStyle w:val="Ttulo2"/>
       </w:pPr>
-      <w:bookmarkStart w:id="63" w:name="_Toc231081582"/>
+      <w:bookmarkStart w:id="63" w:name="_Toc231082325"/>
       <w:r>
         <w:lastRenderedPageBreak/>
         <w:t>5.2 Implicancias</w:t>
@@ -14819,7 +14965,7 @@
       <w:pPr>
         <w:pStyle w:val="Ttulo2"/>
       </w:pPr>
-      <w:bookmarkStart w:id="64" w:name="_Toc231081583"/>
+      <w:bookmarkStart w:id="64" w:name="_Toc231082326"/>
       <w:r>
         <w:t>5.3 Limitaciones</w:t>
       </w:r>
@@ -14869,7 +15015,7 @@
       <w:pPr>
         <w:pStyle w:val="Ttulo2"/>
       </w:pPr>
-      <w:bookmarkStart w:id="65" w:name="_Toc231081584"/>
+      <w:bookmarkStart w:id="65" w:name="_Toc231082327"/>
       <w:r>
         <w:t>5.4 Líneas futuras de investigación</w:t>
       </w:r>
@@ -14905,7 +15051,7 @@
       <w:pPr>
         <w:pStyle w:val="Ttulo1"/>
       </w:pPr>
-      <w:bookmarkStart w:id="66" w:name="_Toc231081585"/>
+      <w:bookmarkStart w:id="66" w:name="_Toc231082328"/>
       <w:r>
         <w:lastRenderedPageBreak/>
         <w:t>Referencias</w:t>
@@ -15148,7 +15294,7 @@
       <w:pPr>
         <w:pStyle w:val="Ttulo1"/>
       </w:pPr>
-      <w:bookmarkStart w:id="67" w:name="_Toc231081586"/>
+      <w:bookmarkStart w:id="67" w:name="_Toc231082329"/>
       <w:r>
         <w:lastRenderedPageBreak/>
         <w:t>Anexos</w:t>
@@ -15159,7 +15305,7 @@
       <w:pPr>
         <w:pStyle w:val="Ttulo2"/>
       </w:pPr>
-      <w:bookmarkStart w:id="68" w:name="_Toc231081587"/>
+      <w:bookmarkStart w:id="68" w:name="_Toc231082330"/>
       <w:r>
         <w:t>Anexo A. Estadística descriptiva</w:t>
       </w:r>
@@ -15170,7 +15316,7 @@
         <w:pStyle w:val="Descripcin"/>
         <w:jc w:val="center"/>
       </w:pPr>
-      <w:bookmarkStart w:id="69" w:name="_Toc231081603"/>
+      <w:bookmarkStart w:id="69" w:name="_Toc231082347"/>
       <w:r>
         <w:rPr>
           <w:sz w:val="20"/>
@@ -16672,7 +16818,7 @@
       <w:pPr>
         <w:pStyle w:val="Ttulo2"/>
       </w:pPr>
-      <w:bookmarkStart w:id="70" w:name="_Toc231081588"/>
+      <w:bookmarkStart w:id="70" w:name="_Toc231082331"/>
       <w:r>
         <w:t>Anexo B. Matriz de correlación de los factores</w:t>
       </w:r>
@@ -16683,7 +16829,7 @@
         <w:pStyle w:val="Descripcin"/>
         <w:jc w:val="center"/>
       </w:pPr>
-      <w:bookmarkStart w:id="71" w:name="_Toc231081604"/>
+      <w:bookmarkStart w:id="71" w:name="_Toc231082348"/>
       <w:r>
         <w:rPr>
           <w:sz w:val="20"/>
@@ -18068,7 +18214,7 @@
       <w:pPr>
         <w:pStyle w:val="Ttulo2"/>
       </w:pPr>
-      <w:bookmarkStart w:id="72" w:name="_Toc231081589"/>
+      <w:bookmarkStart w:id="72" w:name="_Toc231082332"/>
       <w:r>
         <w:t>Anexo C. Pruebas de raíz unitaria y orden de integración</w:t>
       </w:r>
@@ -18079,7 +18225,7 @@
         <w:pStyle w:val="Descripcin"/>
         <w:jc w:val="center"/>
       </w:pPr>
-      <w:bookmarkStart w:id="73" w:name="_Toc231081605"/>
+      <w:bookmarkStart w:id="73" w:name="_Toc231082349"/>
       <w:r>
         <w:rPr>
           <w:sz w:val="20"/>
@@ -18648,7 +18794,7 @@
       <w:pPr>
         <w:pStyle w:val="Ttulo2"/>
       </w:pPr>
-      <w:bookmarkStart w:id="74" w:name="_Toc231081590"/>
+      <w:bookmarkStart w:id="74" w:name="_Toc231082333"/>
       <w:r>
         <w:t>Anexo D. Resultados completos del modelo de panel</w:t>
       </w:r>
@@ -18658,7 +18804,7 @@
       <w:pPr>
         <w:pStyle w:val="Ttulo3"/>
       </w:pPr>
-      <w:bookmarkStart w:id="75" w:name="_Toc231081591"/>
+      <w:bookmarkStart w:id="75" w:name="_Toc231082334"/>
       <w:r>
         <w:t>D.1 Muestra B — cobre, mercado internacional</w:t>
       </w:r>
@@ -18669,7 +18815,7 @@
         <w:pStyle w:val="Descripcin"/>
         <w:jc w:val="center"/>
       </w:pPr>
-      <w:bookmarkStart w:id="76" w:name="_Toc231081606"/>
+      <w:bookmarkStart w:id="76" w:name="_Toc231082350"/>
       <w:r>
         <w:rPr>
           <w:sz w:val="20"/>
@@ -19482,7 +19628,7 @@
       <w:pPr>
         <w:pStyle w:val="Ttulo3"/>
       </w:pPr>
-      <w:bookmarkStart w:id="77" w:name="_Toc231081592"/>
+      <w:bookmarkStart w:id="77" w:name="_Toc231082335"/>
       <w:r>
         <w:t>D.2 Muestra A — cobre, mercado chileno (Pucobre)</w:t>
       </w:r>
@@ -19493,7 +19639,7 @@
         <w:pStyle w:val="Descripcin"/>
         <w:jc w:val="center"/>
       </w:pPr>
-      <w:bookmarkStart w:id="78" w:name="_Toc231081607"/>
+      <w:bookmarkStart w:id="78" w:name="_Toc231082351"/>
       <w:r>
         <w:rPr>
           <w:sz w:val="20"/>
@@ -20310,7 +20456,7 @@
       <w:pPr>
         <w:pStyle w:val="Ttulo3"/>
       </w:pPr>
-      <w:bookmarkStart w:id="79" w:name="_Toc231081593"/>
+      <w:bookmarkStart w:id="79" w:name="_Toc231082336"/>
       <w:r>
         <w:t xml:space="preserve">D.3 </w:t>
       </w:r>
@@ -20324,7 +20470,7 @@
         <w:pStyle w:val="Descripcin"/>
         <w:jc w:val="center"/>
       </w:pPr>
-      <w:bookmarkStart w:id="80" w:name="_Toc231081608"/>
+      <w:bookmarkStart w:id="80" w:name="_Toc231082352"/>
       <w:r>
         <w:rPr>
           <w:sz w:val="20"/>
@@ -21134,7 +21280,7 @@
       <w:pPr>
         <w:pStyle w:val="Ttulo2"/>
       </w:pPr>
-      <w:bookmarkStart w:id="81" w:name="_Toc231081594"/>
+      <w:bookmarkStart w:id="81" w:name="_Toc231082337"/>
       <w:r>
         <w:t xml:space="preserve">Anexo E. </w:t>
       </w:r>
@@ -21148,7 +21294,7 @@
         <w:pStyle w:val="Descripcin"/>
         <w:jc w:val="center"/>
       </w:pPr>
-      <w:bookmarkStart w:id="82" w:name="_Toc231081609"/>
+      <w:bookmarkStart w:id="82" w:name="_Toc231082353"/>
       <w:r>
         <w:rPr>
           <w:sz w:val="20"/>
@@ -21603,7 +21749,7 @@
       <w:pPr>
         <w:pStyle w:val="Ttulo2"/>
       </w:pPr>
-      <w:bookmarkStart w:id="83" w:name="_Toc231081595"/>
+      <w:bookmarkStart w:id="83" w:name="_Toc231082338"/>
       <w:r>
         <w:t>Anexo F. Descomposición de varianza (FEVD) por horizonte — muestra B</w:t>
       </w:r>
@@ -21614,7 +21760,7 @@
         <w:pStyle w:val="Descripcin"/>
         <w:jc w:val="center"/>
       </w:pPr>
-      <w:bookmarkStart w:id="84" w:name="_Toc231081610"/>
+      <w:bookmarkStart w:id="84" w:name="_Toc231082354"/>
       <w:r>
         <w:rPr>
           <w:sz w:val="20"/>
@@ -22175,7 +22321,7 @@
       <w:pPr>
         <w:pStyle w:val="Ttulo2"/>
       </w:pPr>
-      <w:bookmarkStart w:id="85" w:name="_Toc231081596"/>
+      <w:bookmarkStart w:id="85" w:name="_Toc231082339"/>
       <w:r>
         <w:t>Anexo G. Fuentes de datos</w:t>
       </w:r>
@@ -22186,7 +22332,7 @@
         <w:pStyle w:val="Descripcin"/>
         <w:jc w:val="center"/>
       </w:pPr>
-      <w:bookmarkStart w:id="86" w:name="_Toc231081611"/>
+      <w:bookmarkStart w:id="86" w:name="_Toc231082355"/>
       <w:r>
         <w:rPr>
           <w:sz w:val="20"/>
@@ -22980,7 +23126,7 @@
       <w:pPr>
         <w:pStyle w:val="Ttulo2"/>
       </w:pPr>
-      <w:bookmarkStart w:id="87" w:name="_Toc231081597"/>
+      <w:bookmarkStart w:id="87" w:name="_Toc231082340"/>
       <w:r>
         <w:lastRenderedPageBreak/>
         <w:t>Anexo H. Disponibilidad del código</w:t>
@@ -22993,6 +23139,628 @@
       </w:r>
       <w:r>
         <w:t>código de adquisición, transformación, estimación y generación de figuras y tablas está disponible en el repositorio público del proyecto, organizado en módulos reproducibles (`src/`) y cuadernos Jupyter (`notebooks/`). Cada resultado de esta tesis puede regenerarse ejecutando los scripts correspondientes.</w:t>
+      </w:r>
+    </w:p>
+    <w:p>
+      <w:pPr>
+        <w:pStyle w:val="Ttulo2"/>
+      </w:pPr>
+      <w:bookmarkStart w:id="88" w:name="_Toc231082341"/>
+      <w:r>
+        <w:t>Anexo I. Extensión predictiva: ¿explican o anticipan?</w:t>
+      </w:r>
+      <w:bookmarkEnd w:id="88"/>
+    </w:p>
+    <w:p>
+      <w:r>
+        <w:t xml:space="preserve">Como complemento a la naturaleza explicativa de la tesis, se evaluó la capacidad </w:t>
+      </w:r>
+      <w:r>
+        <w:rPr>
+          <w:b/>
+        </w:rPr>
+        <w:t>predictiva</w:t>
+      </w:r>
+      <w:r>
+        <w:t xml:space="preserve"> fuera de muestra de los factores macroeconómicos sobre el retorno mensual del cobre (a un mes), comparando un baseline ingenuo, un AR(1), un modelo lineal regularizado (Ridge) y dos modelos no lineales (Random Forest, Gradient Boosting), con división temporal 180/61 (entrenamiento/prueba).</w:t>
+      </w:r>
+    </w:p>
+    <w:p>
+      <w:pPr>
+        <w:pStyle w:val="Descripcin"/>
+        <w:jc w:val="center"/>
+      </w:pPr>
+      <w:bookmarkStart w:id="89" w:name="_Toc231082356"/>
+      <w:r>
+        <w:rPr>
+          <w:sz w:val="20"/>
+        </w:rPr>
+        <w:t xml:space="preserve">Tabla </w:t>
+      </w:r>
+      <w:r>
+        <w:fldChar w:fldCharType="begin"/>
+      </w:r>
+      <w:r>
+        <w:instrText xml:space="preserve"> SEQ Tabla \* ARABIC </w:instrText>
+      </w:r>
+      <w:r>
+        <w:fldChar w:fldCharType="separate"/>
+      </w:r>
+      <w:r>
+        <w:rPr>
+          <w:noProof/>
+        </w:rPr>
+        <w:t>14</w:t>
+      </w:r>
+      <w:r>
+        <w:fldChar w:fldCharType="end"/>
+      </w:r>
+      <w:r>
+        <w:rPr>
+          <w:sz w:val="20"/>
+        </w:rPr>
+        <w:t>.</w:t>
+      </w:r>
+      <w:bookmarkEnd w:id="89"/>
+      <w:r>
+        <w:rPr>
+          <w:sz w:val="20"/>
+        </w:rPr>
+        <w:t xml:space="preserve"> </w:t>
+      </w:r>
+    </w:p>
+    <w:tbl>
+      <w:tblPr>
+        <w:tblStyle w:val="Cuadrculaclara-nfasis1"/>
+        <w:tblW w:w="0" w:type="auto"/>
+        <w:tblLook w:val="04A0" w:firstRow="1" w:lastRow="0" w:firstColumn="1" w:lastColumn="0" w:noHBand="0" w:noVBand="1"/>
+      </w:tblPr>
+      <w:tblGrid>
+        <w:gridCol w:w="1768"/>
+        <w:gridCol w:w="1768"/>
+        <w:gridCol w:w="1768"/>
+        <w:gridCol w:w="1768"/>
+        <w:gridCol w:w="1768"/>
+      </w:tblGrid>
+      <w:tr>
+        <w:trPr>
+          <w:cnfStyle w:val="100000000000" w:firstRow="1" w:lastRow="0" w:firstColumn="0" w:lastColumn="0" w:oddVBand="0" w:evenVBand="0" w:oddHBand="0" w:evenHBand="0" w:firstRowFirstColumn="0" w:firstRowLastColumn="0" w:lastRowFirstColumn="0" w:lastRowLastColumn="0"/>
+        </w:trPr>
+        <w:tc>
+          <w:tcPr>
+            <w:cnfStyle w:val="001000000000" w:firstRow="0" w:lastRow="0" w:firstColumn="1" w:lastColumn="0" w:oddVBand="0" w:evenVBand="0" w:oddHBand="0" w:evenHBand="0" w:firstRowFirstColumn="0" w:firstRowLastColumn="0" w:lastRowFirstColumn="0" w:lastRowLastColumn="0"/>
+            <w:tcW w:w="1768" w:type="dxa"/>
+          </w:tcPr>
+          <w:p>
+            <w:r>
+              <w:rPr>
+                <w:sz w:val="20"/>
+              </w:rPr>
+              <w:t>Modelo</w:t>
+            </w:r>
+          </w:p>
+        </w:tc>
+        <w:tc>
+          <w:tcPr>
+            <w:tcW w:w="1768" w:type="dxa"/>
+          </w:tcPr>
+          <w:p>
+            <w:pPr>
+              <w:cnfStyle w:val="100000000000" w:firstRow="1" w:lastRow="0" w:firstColumn="0" w:lastColumn="0" w:oddVBand="0" w:evenVBand="0" w:oddHBand="0" w:evenHBand="0" w:firstRowFirstColumn="0" w:firstRowLastColumn="0" w:lastRowFirstColumn="0" w:lastRowLastColumn="0"/>
+            </w:pPr>
+            <w:r>
+              <w:rPr>
+                <w:sz w:val="20"/>
+              </w:rPr>
+              <w:t>R² fuera de muestra</w:t>
+            </w:r>
+          </w:p>
+        </w:tc>
+        <w:tc>
+          <w:tcPr>
+            <w:tcW w:w="1768" w:type="dxa"/>
+          </w:tcPr>
+          <w:p>
+            <w:pPr>
+              <w:cnfStyle w:val="100000000000" w:firstRow="1" w:lastRow="0" w:firstColumn="0" w:lastColumn="0" w:oddVBand="0" w:evenVBand="0" w:oddHBand="0" w:evenHBand="0" w:firstRowFirstColumn="0" w:firstRowLastColumn="0" w:lastRowFirstColumn="0" w:lastRowLastColumn="0"/>
+            </w:pPr>
+            <w:r>
+              <w:rPr>
+                <w:sz w:val="20"/>
+              </w:rPr>
+              <w:t>Acierto direccional</w:t>
+            </w:r>
+          </w:p>
+        </w:tc>
+        <w:tc>
+          <w:tcPr>
+            <w:tcW w:w="1768" w:type="dxa"/>
+          </w:tcPr>
+          <w:p>
+            <w:pPr>
+              <w:cnfStyle w:val="100000000000" w:firstRow="1" w:lastRow="0" w:firstColumn="0" w:lastColumn="0" w:oddVBand="0" w:evenVBand="0" w:oddHBand="0" w:evenHBand="0" w:firstRowFirstColumn="0" w:firstRowLastColumn="0" w:lastRowFirstColumn="0" w:lastRowLastColumn="0"/>
+            </w:pPr>
+            <w:r>
+              <w:rPr>
+                <w:sz w:val="20"/>
+              </w:rPr>
+              <w:t>RMSE</w:t>
+            </w:r>
+          </w:p>
+        </w:tc>
+        <w:tc>
+          <w:tcPr>
+            <w:tcW w:w="1768" w:type="dxa"/>
+          </w:tcPr>
+          <w:p>
+            <w:pPr>
+              <w:cnfStyle w:val="100000000000" w:firstRow="1" w:lastRow="0" w:firstColumn="0" w:lastColumn="0" w:oddVBand="0" w:evenVBand="0" w:oddHBand="0" w:evenHBand="0" w:firstRowFirstColumn="0" w:firstRowLastColumn="0" w:lastRowFirstColumn="0" w:lastRowLastColumn="0"/>
+            </w:pPr>
+            <w:r>
+              <w:rPr>
+                <w:sz w:val="20"/>
+              </w:rPr>
+              <w:t>MAE</w:t>
+            </w:r>
+          </w:p>
+        </w:tc>
+      </w:tr>
+      <w:tr>
+        <w:trPr>
+          <w:cnfStyle w:val="000000100000" w:firstRow="0" w:lastRow="0" w:firstColumn="0" w:lastColumn="0" w:oddVBand="0" w:evenVBand="0" w:oddHBand="1" w:evenHBand="0" w:firstRowFirstColumn="0" w:firstRowLastColumn="0" w:lastRowFirstColumn="0" w:lastRowLastColumn="0"/>
+        </w:trPr>
+        <w:tc>
+          <w:tcPr>
+            <w:cnfStyle w:val="001000000000" w:firstRow="0" w:lastRow="0" w:firstColumn="1" w:lastColumn="0" w:oddVBand="0" w:evenVBand="0" w:oddHBand="0" w:evenHBand="0" w:firstRowFirstColumn="0" w:firstRowLastColumn="0" w:lastRowFirstColumn="0" w:lastRowLastColumn="0"/>
+            <w:tcW w:w="1768" w:type="dxa"/>
+          </w:tcPr>
+          <w:p>
+            <w:r>
+              <w:rPr>
+                <w:sz w:val="20"/>
+              </w:rPr>
+              <w:t>Random walk (0)</w:t>
+            </w:r>
+          </w:p>
+        </w:tc>
+        <w:tc>
+          <w:tcPr>
+            <w:tcW w:w="1768" w:type="dxa"/>
+          </w:tcPr>
+          <w:p>
+            <w:pPr>
+              <w:cnfStyle w:val="000000100000" w:firstRow="0" w:lastRow="0" w:firstColumn="0" w:lastColumn="0" w:oddVBand="0" w:evenVBand="0" w:oddHBand="1" w:evenHBand="0" w:firstRowFirstColumn="0" w:firstRowLastColumn="0" w:lastRowFirstColumn="0" w:lastRowLastColumn="0"/>
+            </w:pPr>
+            <w:r>
+              <w:rPr>
+                <w:sz w:val="20"/>
+              </w:rPr>
+              <w:t>-0.016</w:t>
+            </w:r>
+          </w:p>
+        </w:tc>
+        <w:tc>
+          <w:tcPr>
+            <w:tcW w:w="1768" w:type="dxa"/>
+          </w:tcPr>
+          <w:p>
+            <w:pPr>
+              <w:cnfStyle w:val="000000100000" w:firstRow="0" w:lastRow="0" w:firstColumn="0" w:lastColumn="0" w:oddVBand="0" w:evenVBand="0" w:oddHBand="1" w:evenHBand="0" w:firstRowFirstColumn="0" w:firstRowLastColumn="0" w:lastRowFirstColumn="0" w:lastRowLastColumn="0"/>
+            </w:pPr>
+            <w:r>
+              <w:rPr>
+                <w:sz w:val="20"/>
+              </w:rPr>
+              <w:t>0%</w:t>
+            </w:r>
+          </w:p>
+        </w:tc>
+        <w:tc>
+          <w:tcPr>
+            <w:tcW w:w="1768" w:type="dxa"/>
+          </w:tcPr>
+          <w:p>
+            <w:pPr>
+              <w:cnfStyle w:val="000000100000" w:firstRow="0" w:lastRow="0" w:firstColumn="0" w:lastColumn="0" w:oddVBand="0" w:evenVBand="0" w:oddHBand="1" w:evenHBand="0" w:firstRowFirstColumn="0" w:firstRowLastColumn="0" w:lastRowFirstColumn="0" w:lastRowLastColumn="0"/>
+            </w:pPr>
+            <w:r>
+              <w:rPr>
+                <w:sz w:val="20"/>
+              </w:rPr>
+              <w:t>0.0500</w:t>
+            </w:r>
+          </w:p>
+        </w:tc>
+        <w:tc>
+          <w:tcPr>
+            <w:tcW w:w="1768" w:type="dxa"/>
+          </w:tcPr>
+          <w:p>
+            <w:pPr>
+              <w:cnfStyle w:val="000000100000" w:firstRow="0" w:lastRow="0" w:firstColumn="0" w:lastColumn="0" w:oddVBand="0" w:evenVBand="0" w:oddHBand="1" w:evenHBand="0" w:firstRowFirstColumn="0" w:firstRowLastColumn="0" w:lastRowFirstColumn="0" w:lastRowLastColumn="0"/>
+            </w:pPr>
+            <w:r>
+              <w:rPr>
+                <w:sz w:val="20"/>
+              </w:rPr>
+              <w:t>0.0372</w:t>
+            </w:r>
+          </w:p>
+        </w:tc>
+      </w:tr>
+      <w:tr>
+        <w:trPr>
+          <w:cnfStyle w:val="000000010000" w:firstRow="0" w:lastRow="0" w:firstColumn="0" w:lastColumn="0" w:oddVBand="0" w:evenVBand="0" w:oddHBand="0" w:evenHBand="1" w:firstRowFirstColumn="0" w:firstRowLastColumn="0" w:lastRowFirstColumn="0" w:lastRowLastColumn="0"/>
+        </w:trPr>
+        <w:tc>
+          <w:tcPr>
+            <w:cnfStyle w:val="001000000000" w:firstRow="0" w:lastRow="0" w:firstColumn="1" w:lastColumn="0" w:oddVBand="0" w:evenVBand="0" w:oddHBand="0" w:evenHBand="0" w:firstRowFirstColumn="0" w:firstRowLastColumn="0" w:lastRowFirstColumn="0" w:lastRowLastColumn="0"/>
+            <w:tcW w:w="1768" w:type="dxa"/>
+          </w:tcPr>
+          <w:p>
+            <w:r>
+              <w:rPr>
+                <w:sz w:val="20"/>
+              </w:rPr>
+              <w:t>AR(1)</w:t>
+            </w:r>
+          </w:p>
+        </w:tc>
+        <w:tc>
+          <w:tcPr>
+            <w:tcW w:w="1768" w:type="dxa"/>
+          </w:tcPr>
+          <w:p>
+            <w:pPr>
+              <w:cnfStyle w:val="000000010000" w:firstRow="0" w:lastRow="0" w:firstColumn="0" w:lastColumn="0" w:oddVBand="0" w:evenVBand="0" w:oddHBand="0" w:evenHBand="1" w:firstRowFirstColumn="0" w:firstRowLastColumn="0" w:lastRowFirstColumn="0" w:lastRowLastColumn="0"/>
+            </w:pPr>
+            <w:r>
+              <w:rPr>
+                <w:sz w:val="20"/>
+              </w:rPr>
+              <w:t>+0.056</w:t>
+            </w:r>
+          </w:p>
+        </w:tc>
+        <w:tc>
+          <w:tcPr>
+            <w:tcW w:w="1768" w:type="dxa"/>
+          </w:tcPr>
+          <w:p>
+            <w:pPr>
+              <w:cnfStyle w:val="000000010000" w:firstRow="0" w:lastRow="0" w:firstColumn="0" w:lastColumn="0" w:oddVBand="0" w:evenVBand="0" w:oddHBand="0" w:evenHBand="1" w:firstRowFirstColumn="0" w:firstRowLastColumn="0" w:lastRowFirstColumn="0" w:lastRowLastColumn="0"/>
+            </w:pPr>
+            <w:r>
+              <w:rPr>
+                <w:sz w:val="20"/>
+              </w:rPr>
+              <w:t>64%</w:t>
+            </w:r>
+          </w:p>
+        </w:tc>
+        <w:tc>
+          <w:tcPr>
+            <w:tcW w:w="1768" w:type="dxa"/>
+          </w:tcPr>
+          <w:p>
+            <w:pPr>
+              <w:cnfStyle w:val="000000010000" w:firstRow="0" w:lastRow="0" w:firstColumn="0" w:lastColumn="0" w:oddVBand="0" w:evenVBand="0" w:oddHBand="0" w:evenHBand="1" w:firstRowFirstColumn="0" w:firstRowLastColumn="0" w:lastRowFirstColumn="0" w:lastRowLastColumn="0"/>
+            </w:pPr>
+            <w:r>
+              <w:rPr>
+                <w:sz w:val="20"/>
+              </w:rPr>
+              <w:t>0.0482</w:t>
+            </w:r>
+          </w:p>
+        </w:tc>
+        <w:tc>
+          <w:tcPr>
+            <w:tcW w:w="1768" w:type="dxa"/>
+          </w:tcPr>
+          <w:p>
+            <w:pPr>
+              <w:cnfStyle w:val="000000010000" w:firstRow="0" w:lastRow="0" w:firstColumn="0" w:lastColumn="0" w:oddVBand="0" w:evenVBand="0" w:oddHBand="0" w:evenHBand="1" w:firstRowFirstColumn="0" w:firstRowLastColumn="0" w:lastRowFirstColumn="0" w:lastRowLastColumn="0"/>
+            </w:pPr>
+            <w:r>
+              <w:rPr>
+                <w:sz w:val="20"/>
+              </w:rPr>
+              <w:t>0.0357</w:t>
+            </w:r>
+          </w:p>
+        </w:tc>
+      </w:tr>
+      <w:tr>
+        <w:trPr>
+          <w:cnfStyle w:val="000000100000" w:firstRow="0" w:lastRow="0" w:firstColumn="0" w:lastColumn="0" w:oddVBand="0" w:evenVBand="0" w:oddHBand="1" w:evenHBand="0" w:firstRowFirstColumn="0" w:firstRowLastColumn="0" w:lastRowFirstColumn="0" w:lastRowLastColumn="0"/>
+        </w:trPr>
+        <w:tc>
+          <w:tcPr>
+            <w:cnfStyle w:val="001000000000" w:firstRow="0" w:lastRow="0" w:firstColumn="1" w:lastColumn="0" w:oddVBand="0" w:evenVBand="0" w:oddHBand="0" w:evenHBand="0" w:firstRowFirstColumn="0" w:firstRowLastColumn="0" w:lastRowFirstColumn="0" w:lastRowLastColumn="0"/>
+            <w:tcW w:w="1768" w:type="dxa"/>
+          </w:tcPr>
+          <w:p>
+            <w:r>
+              <w:rPr>
+                <w:sz w:val="20"/>
+              </w:rPr>
+              <w:t>Ridge (lineal)</w:t>
+            </w:r>
+          </w:p>
+        </w:tc>
+        <w:tc>
+          <w:tcPr>
+            <w:tcW w:w="1768" w:type="dxa"/>
+          </w:tcPr>
+          <w:p>
+            <w:pPr>
+              <w:cnfStyle w:val="000000100000" w:firstRow="0" w:lastRow="0" w:firstColumn="0" w:lastColumn="0" w:oddVBand="0" w:evenVBand="0" w:oddHBand="1" w:evenHBand="0" w:firstRowFirstColumn="0" w:firstRowLastColumn="0" w:lastRowFirstColumn="0" w:lastRowLastColumn="0"/>
+            </w:pPr>
+            <w:r>
+              <w:rPr>
+                <w:sz w:val="20"/>
+              </w:rPr>
+              <w:t>-0.117</w:t>
+            </w:r>
+          </w:p>
+        </w:tc>
+        <w:tc>
+          <w:tcPr>
+            <w:tcW w:w="1768" w:type="dxa"/>
+          </w:tcPr>
+          <w:p>
+            <w:pPr>
+              <w:cnfStyle w:val="000000100000" w:firstRow="0" w:lastRow="0" w:firstColumn="0" w:lastColumn="0" w:oddVBand="0" w:evenVBand="0" w:oddHBand="1" w:evenHBand="0" w:firstRowFirstColumn="0" w:firstRowLastColumn="0" w:lastRowFirstColumn="0" w:lastRowLastColumn="0"/>
+            </w:pPr>
+            <w:r>
+              <w:rPr>
+                <w:sz w:val="20"/>
+              </w:rPr>
+              <w:t>54%</w:t>
+            </w:r>
+          </w:p>
+        </w:tc>
+        <w:tc>
+          <w:tcPr>
+            <w:tcW w:w="1768" w:type="dxa"/>
+          </w:tcPr>
+          <w:p>
+            <w:pPr>
+              <w:cnfStyle w:val="000000100000" w:firstRow="0" w:lastRow="0" w:firstColumn="0" w:lastColumn="0" w:oddVBand="0" w:evenVBand="0" w:oddHBand="1" w:evenHBand="0" w:firstRowFirstColumn="0" w:firstRowLastColumn="0" w:lastRowFirstColumn="0" w:lastRowLastColumn="0"/>
+            </w:pPr>
+            <w:r>
+              <w:rPr>
+                <w:sz w:val="20"/>
+              </w:rPr>
+              <w:t>0.0525</w:t>
+            </w:r>
+          </w:p>
+        </w:tc>
+        <w:tc>
+          <w:tcPr>
+            <w:tcW w:w="1768" w:type="dxa"/>
+          </w:tcPr>
+          <w:p>
+            <w:pPr>
+              <w:cnfStyle w:val="000000100000" w:firstRow="0" w:lastRow="0" w:firstColumn="0" w:lastColumn="0" w:oddVBand="0" w:evenVBand="0" w:oddHBand="1" w:evenHBand="0" w:firstRowFirstColumn="0" w:firstRowLastColumn="0" w:lastRowFirstColumn="0" w:lastRowLastColumn="0"/>
+            </w:pPr>
+            <w:r>
+              <w:rPr>
+                <w:sz w:val="20"/>
+              </w:rPr>
+              <w:t>0.0388</w:t>
+            </w:r>
+          </w:p>
+        </w:tc>
+      </w:tr>
+      <w:tr>
+        <w:trPr>
+          <w:cnfStyle w:val="000000010000" w:firstRow="0" w:lastRow="0" w:firstColumn="0" w:lastColumn="0" w:oddVBand="0" w:evenVBand="0" w:oddHBand="0" w:evenHBand="1" w:firstRowFirstColumn="0" w:firstRowLastColumn="0" w:lastRowFirstColumn="0" w:lastRowLastColumn="0"/>
+        </w:trPr>
+        <w:tc>
+          <w:tcPr>
+            <w:cnfStyle w:val="001000000000" w:firstRow="0" w:lastRow="0" w:firstColumn="1" w:lastColumn="0" w:oddVBand="0" w:evenVBand="0" w:oddHBand="0" w:evenHBand="0" w:firstRowFirstColumn="0" w:firstRowLastColumn="0" w:lastRowFirstColumn="0" w:lastRowLastColumn="0"/>
+            <w:tcW w:w="1768" w:type="dxa"/>
+          </w:tcPr>
+          <w:p>
+            <w:r>
+              <w:rPr>
+                <w:sz w:val="20"/>
+              </w:rPr>
+              <w:t>Random Forest</w:t>
+            </w:r>
+          </w:p>
+        </w:tc>
+        <w:tc>
+          <w:tcPr>
+            <w:tcW w:w="1768" w:type="dxa"/>
+          </w:tcPr>
+          <w:p>
+            <w:pPr>
+              <w:cnfStyle w:val="000000010000" w:firstRow="0" w:lastRow="0" w:firstColumn="0" w:lastColumn="0" w:oddVBand="0" w:evenVBand="0" w:oddHBand="0" w:evenHBand="1" w:firstRowFirstColumn="0" w:firstRowLastColumn="0" w:lastRowFirstColumn="0" w:lastRowLastColumn="0"/>
+            </w:pPr>
+            <w:r>
+              <w:rPr>
+                <w:sz w:val="20"/>
+              </w:rPr>
+              <w:t>+0.033</w:t>
+            </w:r>
+          </w:p>
+        </w:tc>
+        <w:tc>
+          <w:tcPr>
+            <w:tcW w:w="1768" w:type="dxa"/>
+          </w:tcPr>
+          <w:p>
+            <w:pPr>
+              <w:cnfStyle w:val="000000010000" w:firstRow="0" w:lastRow="0" w:firstColumn="0" w:lastColumn="0" w:oddVBand="0" w:evenVBand="0" w:oddHBand="0" w:evenHBand="1" w:firstRowFirstColumn="0" w:firstRowLastColumn="0" w:lastRowFirstColumn="0" w:lastRowLastColumn="0"/>
+            </w:pPr>
+            <w:r>
+              <w:rPr>
+                <w:sz w:val="20"/>
+              </w:rPr>
+              <w:t>56%</w:t>
+            </w:r>
+          </w:p>
+        </w:tc>
+        <w:tc>
+          <w:tcPr>
+            <w:tcW w:w="1768" w:type="dxa"/>
+          </w:tcPr>
+          <w:p>
+            <w:pPr>
+              <w:cnfStyle w:val="000000010000" w:firstRow="0" w:lastRow="0" w:firstColumn="0" w:lastColumn="0" w:oddVBand="0" w:evenVBand="0" w:oddHBand="0" w:evenHBand="1" w:firstRowFirstColumn="0" w:firstRowLastColumn="0" w:lastRowFirstColumn="0" w:lastRowLastColumn="0"/>
+            </w:pPr>
+            <w:r>
+              <w:rPr>
+                <w:sz w:val="20"/>
+              </w:rPr>
+              <w:t>0.0488</w:t>
+            </w:r>
+          </w:p>
+        </w:tc>
+        <w:tc>
+          <w:tcPr>
+            <w:tcW w:w="1768" w:type="dxa"/>
+          </w:tcPr>
+          <w:p>
+            <w:pPr>
+              <w:cnfStyle w:val="000000010000" w:firstRow="0" w:lastRow="0" w:firstColumn="0" w:lastColumn="0" w:oddVBand="0" w:evenVBand="0" w:oddHBand="0" w:evenHBand="1" w:firstRowFirstColumn="0" w:firstRowLastColumn="0" w:lastRowFirstColumn="0" w:lastRowLastColumn="0"/>
+            </w:pPr>
+            <w:r>
+              <w:rPr>
+                <w:sz w:val="20"/>
+              </w:rPr>
+              <w:t>0.0361</w:t>
+            </w:r>
+          </w:p>
+        </w:tc>
+      </w:tr>
+      <w:tr>
+        <w:trPr>
+          <w:cnfStyle w:val="000000100000" w:firstRow="0" w:lastRow="0" w:firstColumn="0" w:lastColumn="0" w:oddVBand="0" w:evenVBand="0" w:oddHBand="1" w:evenHBand="0" w:firstRowFirstColumn="0" w:firstRowLastColumn="0" w:lastRowFirstColumn="0" w:lastRowLastColumn="0"/>
+        </w:trPr>
+        <w:tc>
+          <w:tcPr>
+            <w:cnfStyle w:val="001000000000" w:firstRow="0" w:lastRow="0" w:firstColumn="1" w:lastColumn="0" w:oddVBand="0" w:evenVBand="0" w:oddHBand="0" w:evenHBand="0" w:firstRowFirstColumn="0" w:firstRowLastColumn="0" w:lastRowFirstColumn="0" w:lastRowLastColumn="0"/>
+            <w:tcW w:w="1768" w:type="dxa"/>
+          </w:tcPr>
+          <w:p>
+            <w:r>
+              <w:rPr>
+                <w:sz w:val="20"/>
+              </w:rPr>
+              <w:t>Gradient Boosting</w:t>
+            </w:r>
+          </w:p>
+        </w:tc>
+        <w:tc>
+          <w:tcPr>
+            <w:tcW w:w="1768" w:type="dxa"/>
+          </w:tcPr>
+          <w:p>
+            <w:pPr>
+              <w:cnfStyle w:val="000000100000" w:firstRow="0" w:lastRow="0" w:firstColumn="0" w:lastColumn="0" w:oddVBand="0" w:evenVBand="0" w:oddHBand="1" w:evenHBand="0" w:firstRowFirstColumn="0" w:firstRowLastColumn="0" w:lastRowFirstColumn="0" w:lastRowLastColumn="0"/>
+            </w:pPr>
+            <w:r>
+              <w:rPr>
+                <w:sz w:val="20"/>
+              </w:rPr>
+              <w:t>-0.167</w:t>
+            </w:r>
+          </w:p>
+        </w:tc>
+        <w:tc>
+          <w:tcPr>
+            <w:tcW w:w="1768" w:type="dxa"/>
+          </w:tcPr>
+          <w:p>
+            <w:pPr>
+              <w:cnfStyle w:val="000000100000" w:firstRow="0" w:lastRow="0" w:firstColumn="0" w:lastColumn="0" w:oddVBand="0" w:evenVBand="0" w:oddHBand="1" w:evenHBand="0" w:firstRowFirstColumn="0" w:firstRowLastColumn="0" w:lastRowFirstColumn="0" w:lastRowLastColumn="0"/>
+            </w:pPr>
+            <w:r>
+              <w:rPr>
+                <w:sz w:val="20"/>
+              </w:rPr>
+              <w:t>54%</w:t>
+            </w:r>
+          </w:p>
+        </w:tc>
+        <w:tc>
+          <w:tcPr>
+            <w:tcW w:w="1768" w:type="dxa"/>
+          </w:tcPr>
+          <w:p>
+            <w:pPr>
+              <w:cnfStyle w:val="000000100000" w:firstRow="0" w:lastRow="0" w:firstColumn="0" w:lastColumn="0" w:oddVBand="0" w:evenVBand="0" w:oddHBand="1" w:evenHBand="0" w:firstRowFirstColumn="0" w:firstRowLastColumn="0" w:lastRowFirstColumn="0" w:lastRowLastColumn="0"/>
+            </w:pPr>
+            <w:r>
+              <w:rPr>
+                <w:sz w:val="20"/>
+              </w:rPr>
+              <w:t>0.0536</w:t>
+            </w:r>
+          </w:p>
+        </w:tc>
+        <w:tc>
+          <w:tcPr>
+            <w:tcW w:w="1768" w:type="dxa"/>
+          </w:tcPr>
+          <w:p>
+            <w:pPr>
+              <w:cnfStyle w:val="000000100000" w:firstRow="0" w:lastRow="0" w:firstColumn="0" w:lastColumn="0" w:oddVBand="0" w:evenVBand="0" w:oddHBand="1" w:evenHBand="0" w:firstRowFirstColumn="0" w:firstRowLastColumn="0" w:lastRowFirstColumn="0" w:lastRowLastColumn="0"/>
+            </w:pPr>
+            <w:r>
+              <w:rPr>
+                <w:sz w:val="20"/>
+              </w:rPr>
+              <w:t>0.0399</w:t>
+            </w:r>
+          </w:p>
+        </w:tc>
+      </w:tr>
+    </w:tbl>
+    <w:p/>
+    <w:p>
+      <w:r>
+        <w:t xml:space="preserve">El </w:t>
+      </w:r>
+      <w:r>
+        <w:rPr>
+          <w:b/>
+        </w:rPr>
+        <w:t>R² fuera de muestra es cercano a cero o negativo</w:t>
+      </w:r>
+      <w:r>
+        <w:t xml:space="preserve"> en todos los modelos: los factores macroeconómicos </w:t>
+      </w:r>
+      <w:r>
+        <w:rPr>
+          <w:b/>
+        </w:rPr>
+        <w:t>explican</w:t>
+      </w:r>
+      <w:r>
+        <w:t xml:space="preserve"> el retorno contemporáneo del cobre (Capítulo 4) pero apenas lo </w:t>
+      </w:r>
+      <w:r>
+        <w:rPr>
+          <w:b/>
+        </w:rPr>
+        <w:t>anticipan</w:t>
+      </w:r>
+      <w:r>
+        <w:t xml:space="preserve"> a un mes. Este resultado, lejos de ser una debilidad, </w:t>
+      </w:r>
+      <w:r>
+        <w:rPr>
+          <w:b/>
+        </w:rPr>
+        <w:t>refuerza la hipótesis de eficiencia de mercado en su forma débil</w:t>
+      </w:r>
+      <w:r>
+        <w:t xml:space="preserve"> y justifica el enfoque explicativo —y no predictivo— adoptado. El mejor desempeño direccional corresponde al término de momentum (AR(1)). Una versión interactiva de este modelo se encuentra en la plataforma web del proyecto.</w:t>
       </w:r>
     </w:p>
     <w:p>
@@ -23004,12 +23772,12 @@
       <w:pPr>
         <w:pStyle w:val="Ttulo1"/>
       </w:pPr>
-      <w:bookmarkStart w:id="88" w:name="_Toc231081598"/>
+      <w:bookmarkStart w:id="90" w:name="_Toc231082342"/>
       <w:r>
         <w:lastRenderedPageBreak/>
         <w:t>Glosario de términos econométricos</w:t>
       </w:r>
-      <w:bookmarkEnd w:id="88"/>
+      <w:bookmarkEnd w:id="90"/>
     </w:p>
     <w:p>
       <w:r>
@@ -23174,7 +23942,10 @@
     </w:p>
     <w:p>
       <w:r>
-        <w:t>largo plazo tras una desviación, en un modelo VECM.</w:t>
+        <w:t xml:space="preserve">largo plazo tras una </w:t>
+      </w:r>
+      <w:r>
+        <w:t>desviación, en un modelo VECM.</w:t>
       </w:r>
     </w:p>
     <w:p>
@@ -23591,31 +24362,31 @@
       </w:rPr>
     </w:lvl>
   </w:abstractNum>
-  <w:num w:numId="1" w16cid:durableId="503126561">
+  <w:num w:numId="1" w16cid:durableId="1602879720">
     <w:abstractNumId w:val="8"/>
   </w:num>
-  <w:num w:numId="2" w16cid:durableId="1244101367">
+  <w:num w:numId="2" w16cid:durableId="412431591">
     <w:abstractNumId w:val="6"/>
   </w:num>
-  <w:num w:numId="3" w16cid:durableId="369037244">
+  <w:num w:numId="3" w16cid:durableId="384183837">
     <w:abstractNumId w:val="5"/>
   </w:num>
-  <w:num w:numId="4" w16cid:durableId="1182865629">
+  <w:num w:numId="4" w16cid:durableId="1053039108">
     <w:abstractNumId w:val="4"/>
   </w:num>
-  <w:num w:numId="5" w16cid:durableId="65692468">
+  <w:num w:numId="5" w16cid:durableId="1508328494">
     <w:abstractNumId w:val="7"/>
   </w:num>
-  <w:num w:numId="6" w16cid:durableId="1650090300">
+  <w:num w:numId="6" w16cid:durableId="449207472">
     <w:abstractNumId w:val="3"/>
   </w:num>
-  <w:num w:numId="7" w16cid:durableId="817108351">
+  <w:num w:numId="7" w16cid:durableId="1385450663">
     <w:abstractNumId w:val="2"/>
   </w:num>
-  <w:num w:numId="8" w16cid:durableId="915898363">
+  <w:num w:numId="8" w16cid:durableId="892932886">
     <w:abstractNumId w:val="1"/>
   </w:num>
-  <w:num w:numId="9" w16cid:durableId="708410719">
+  <w:num w:numId="9" w16cid:durableId="1207520874">
     <w:abstractNumId w:val="0"/>
   </w:num>
 </w:numbering>
@@ -35007,7 +35778,7 @@
     <w:autoRedefine/>
     <w:uiPriority w:val="39"/>
     <w:unhideWhenUsed/>
-    <w:rsid w:val="00E96965"/>
+    <w:rsid w:val="00914A83"/>
     <w:pPr>
       <w:spacing w:after="100"/>
     </w:pPr>
@@ -35019,7 +35790,7 @@
     <w:autoRedefine/>
     <w:uiPriority w:val="39"/>
     <w:unhideWhenUsed/>
-    <w:rsid w:val="00E96965"/>
+    <w:rsid w:val="00914A83"/>
     <w:pPr>
       <w:spacing w:after="100"/>
       <w:ind w:left="240"/>
@@ -35032,7 +35803,7 @@
     <w:autoRedefine/>
     <w:uiPriority w:val="39"/>
     <w:unhideWhenUsed/>
-    <w:rsid w:val="00E96965"/>
+    <w:rsid w:val="00914A83"/>
     <w:pPr>
       <w:spacing w:after="100"/>
       <w:ind w:left="480"/>
@@ -35043,7 +35814,7 @@
     <w:basedOn w:val="Fuentedeprrafopredeter"/>
     <w:uiPriority w:val="99"/>
     <w:unhideWhenUsed/>
-    <w:rsid w:val="00E96965"/>
+    <w:rsid w:val="00914A83"/>
     <w:rPr>
       <w:color w:val="0000FF" w:themeColor="hyperlink"/>
       <w:u w:val="single"/>
@@ -35055,7 +35826,7 @@
     <w:next w:val="Normal"/>
     <w:uiPriority w:val="99"/>
     <w:unhideWhenUsed/>
-    <w:rsid w:val="00E96965"/>
+    <w:rsid w:val="00914A83"/>
     <w:pPr>
       <w:spacing w:after="0"/>
     </w:pPr>

</xml_diff>

<commit_message>
OE1: prueba CIPS de Pesaran (2007), raíz unitaria en panel robusta a dependencia cruzada
log-precios I(1) (CIPS -2.29), retornos I(0) (CIPS -16.32). Refuerza la doble vía del diseño.

Co-Authored-By: Claude Opus 4.8 <noreply@anthropic.com>
</commit_message>
<xml_diff>
--- a/outputs/Tesis_Francisco_Rietta.docx
+++ b/outputs/Tesis_Francisco_Rietta.docx
@@ -91,7 +91,7 @@
       <w:pPr>
         <w:pStyle w:val="Ttulo1"/>
       </w:pPr>
-      <w:bookmarkStart w:id="0" w:name="_Toc231082272"/>
+      <w:bookmarkStart w:id="0" w:name="_Toc231082761"/>
       <w:r>
         <w:lastRenderedPageBreak/>
         <w:t>Página de aprobación</w:t>
@@ -172,7 +172,7 @@
       <w:pPr>
         <w:pStyle w:val="Ttulo1"/>
       </w:pPr>
-      <w:bookmarkStart w:id="1" w:name="_Toc231082273"/>
+      <w:bookmarkStart w:id="1" w:name="_Toc231082762"/>
       <w:r>
         <w:lastRenderedPageBreak/>
         <w:t>Declaración de originalidad</w:t>
@@ -211,7 +211,7 @@
       <w:pPr>
         <w:pStyle w:val="Ttulo1"/>
       </w:pPr>
-      <w:bookmarkStart w:id="2" w:name="_Toc231082274"/>
+      <w:bookmarkStart w:id="2" w:name="_Toc231082763"/>
       <w:r>
         <w:lastRenderedPageBreak/>
         <w:t>Dedicatoria</w:t>
@@ -247,7 +247,7 @@
       <w:pPr>
         <w:pStyle w:val="Ttulo1"/>
       </w:pPr>
-      <w:bookmarkStart w:id="3" w:name="_Toc231082275"/>
+      <w:bookmarkStart w:id="3" w:name="_Toc231082764"/>
       <w:r>
         <w:lastRenderedPageBreak/>
         <w:t>Agradecimientos</w:t>
@@ -271,7 +271,7 @@
       <w:pPr>
         <w:pStyle w:val="Ttulo1"/>
       </w:pPr>
-      <w:bookmarkStart w:id="4" w:name="_Toc231082276"/>
+      <w:bookmarkStart w:id="4" w:name="_Toc231082765"/>
       <w:r>
         <w:lastRenderedPageBreak/>
         <w:t>Resumen</w:t>
@@ -306,7 +306,7 @@
       <w:pPr>
         <w:pStyle w:val="Ttulo1"/>
       </w:pPr>
-      <w:bookmarkStart w:id="5" w:name="_Toc231082277"/>
+      <w:bookmarkStart w:id="5" w:name="_Toc231082766"/>
       <w:r>
         <w:lastRenderedPageBreak/>
         <w:t>Abstract</w:t>
@@ -341,7 +341,7 @@
       <w:pPr>
         <w:pStyle w:val="Ttulo1"/>
       </w:pPr>
-      <w:bookmarkStart w:id="6" w:name="_Toc231082278"/>
+      <w:bookmarkStart w:id="6" w:name="_Toc231082767"/>
       <w:r>
         <w:lastRenderedPageBreak/>
         <w:t>Índice general</w:t>
@@ -372,7 +372,7 @@
       <w:r>
         <w:fldChar w:fldCharType="separate"/>
       </w:r>
-      <w:hyperlink w:anchor="_Toc231082272" w:history="1">
+      <w:hyperlink w:anchor="_Toc231082761" w:history="1">
         <w:r>
           <w:rPr>
             <w:rStyle w:val="Hipervnculo"/>
@@ -399,7 +399,7 @@
             <w:noProof/>
             <w:webHidden/>
           </w:rPr>
-          <w:instrText xml:space="preserve"> PAGEREF _Toc231082272 \h </w:instrText>
+          <w:instrText xml:space="preserve"> PAGEREF _Toc231082761 \h </w:instrText>
         </w:r>
         <w:r>
           <w:rPr>
@@ -445,7 +445,7 @@
           <w14:ligatures w14:val="standardContextual"/>
         </w:rPr>
       </w:pPr>
-      <w:hyperlink w:anchor="_Toc231082273" w:history="1">
+      <w:hyperlink w:anchor="_Toc231082762" w:history="1">
         <w:r>
           <w:rPr>
             <w:rStyle w:val="Hipervnculo"/>
@@ -472,7 +472,7 @@
             <w:noProof/>
             <w:webHidden/>
           </w:rPr>
-          <w:instrText xml:space="preserve"> PAGEREF _Toc231082273 \h </w:instrText>
+          <w:instrText xml:space="preserve"> PAGEREF _Toc231082762 \h </w:instrText>
         </w:r>
         <w:r>
           <w:rPr>
@@ -518,7 +518,7 @@
           <w14:ligatures w14:val="standardContextual"/>
         </w:rPr>
       </w:pPr>
-      <w:hyperlink w:anchor="_Toc231082274" w:history="1">
+      <w:hyperlink w:anchor="_Toc231082763" w:history="1">
         <w:r>
           <w:rPr>
             <w:rStyle w:val="Hipervnculo"/>
@@ -545,7 +545,7 @@
             <w:noProof/>
             <w:webHidden/>
           </w:rPr>
-          <w:instrText xml:space="preserve"> PAGEREF _Toc231082274 \h </w:instrText>
+          <w:instrText xml:space="preserve"> PAGEREF _Toc231082763 \h </w:instrText>
         </w:r>
         <w:r>
           <w:rPr>
@@ -591,7 +591,7 @@
           <w14:ligatures w14:val="standardContextual"/>
         </w:rPr>
       </w:pPr>
-      <w:hyperlink w:anchor="_Toc231082275" w:history="1">
+      <w:hyperlink w:anchor="_Toc231082764" w:history="1">
         <w:r>
           <w:rPr>
             <w:rStyle w:val="Hipervnculo"/>
@@ -618,7 +618,7 @@
             <w:noProof/>
             <w:webHidden/>
           </w:rPr>
-          <w:instrText xml:space="preserve"> PAGEREF _Toc231082275 \h </w:instrText>
+          <w:instrText xml:space="preserve"> PAGEREF _Toc231082764 \h </w:instrText>
         </w:r>
         <w:r>
           <w:rPr>
@@ -664,7 +664,7 @@
           <w14:ligatures w14:val="standardContextual"/>
         </w:rPr>
       </w:pPr>
-      <w:hyperlink w:anchor="_Toc231082276" w:history="1">
+      <w:hyperlink w:anchor="_Toc231082765" w:history="1">
         <w:r>
           <w:rPr>
             <w:rStyle w:val="Hipervnculo"/>
@@ -691,7 +691,7 @@
             <w:noProof/>
             <w:webHidden/>
           </w:rPr>
-          <w:instrText xml:space="preserve"> PAGEREF _Toc231082276 \h </w:instrText>
+          <w:instrText xml:space="preserve"> PAGEREF _Toc231082765 \h </w:instrText>
         </w:r>
         <w:r>
           <w:rPr>
@@ -737,7 +737,7 @@
           <w14:ligatures w14:val="standardContextual"/>
         </w:rPr>
       </w:pPr>
-      <w:hyperlink w:anchor="_Toc231082277" w:history="1">
+      <w:hyperlink w:anchor="_Toc231082766" w:history="1">
         <w:r>
           <w:rPr>
             <w:rStyle w:val="Hipervnculo"/>
@@ -764,7 +764,7 @@
             <w:noProof/>
             <w:webHidden/>
           </w:rPr>
-          <w:instrText xml:space="preserve"> PAGEREF _Toc231082277 \h </w:instrText>
+          <w:instrText xml:space="preserve"> PAGEREF _Toc231082766 \h </w:instrText>
         </w:r>
         <w:r>
           <w:rPr>
@@ -810,7 +810,7 @@
           <w14:ligatures w14:val="standardContextual"/>
         </w:rPr>
       </w:pPr>
-      <w:hyperlink w:anchor="_Toc231082278" w:history="1">
+      <w:hyperlink w:anchor="_Toc231082767" w:history="1">
         <w:r>
           <w:rPr>
             <w:rStyle w:val="Hipervnculo"/>
@@ -837,7 +837,7 @@
             <w:noProof/>
             <w:webHidden/>
           </w:rPr>
-          <w:instrText xml:space="preserve"> PAGEREF _Toc231082278 \h </w:instrText>
+          <w:instrText xml:space="preserve"> PAGEREF _Toc231082767 \h </w:instrText>
         </w:r>
         <w:r>
           <w:rPr>
@@ -883,7 +883,7 @@
           <w14:ligatures w14:val="standardContextual"/>
         </w:rPr>
       </w:pPr>
-      <w:hyperlink w:anchor="_Toc231082279" w:history="1">
+      <w:hyperlink w:anchor="_Toc231082768" w:history="1">
         <w:r>
           <w:rPr>
             <w:rStyle w:val="Hipervnculo"/>
@@ -910,7 +910,7 @@
             <w:noProof/>
             <w:webHidden/>
           </w:rPr>
-          <w:instrText xml:space="preserve"> PAGEREF _Toc231082279 \h </w:instrText>
+          <w:instrText xml:space="preserve"> PAGEREF _Toc231082768 \h </w:instrText>
         </w:r>
         <w:r>
           <w:rPr>
@@ -956,7 +956,7 @@
           <w14:ligatures w14:val="standardContextual"/>
         </w:rPr>
       </w:pPr>
-      <w:hyperlink w:anchor="_Toc231082280" w:history="1">
+      <w:hyperlink w:anchor="_Toc231082769" w:history="1">
         <w:r>
           <w:rPr>
             <w:rStyle w:val="Hipervnculo"/>
@@ -983,7 +983,7 @@
             <w:noProof/>
             <w:webHidden/>
           </w:rPr>
-          <w:instrText xml:space="preserve"> PAGEREF _Toc231082280 \h </w:instrText>
+          <w:instrText xml:space="preserve"> PAGEREF _Toc231082769 \h </w:instrText>
         </w:r>
         <w:r>
           <w:rPr>
@@ -1029,7 +1029,7 @@
           <w14:ligatures w14:val="standardContextual"/>
         </w:rPr>
       </w:pPr>
-      <w:hyperlink w:anchor="_Toc231082281" w:history="1">
+      <w:hyperlink w:anchor="_Toc231082770" w:history="1">
         <w:r>
           <w:rPr>
             <w:rStyle w:val="Hipervnculo"/>
@@ -1056,7 +1056,7 @@
             <w:noProof/>
             <w:webHidden/>
           </w:rPr>
-          <w:instrText xml:space="preserve"> PAGEREF _Toc231082281 \h </w:instrText>
+          <w:instrText xml:space="preserve"> PAGEREF _Toc231082770 \h </w:instrText>
         </w:r>
         <w:r>
           <w:rPr>
@@ -1102,7 +1102,7 @@
           <w14:ligatures w14:val="standardContextual"/>
         </w:rPr>
       </w:pPr>
-      <w:hyperlink w:anchor="_Toc231082282" w:history="1">
+      <w:hyperlink w:anchor="_Toc231082771" w:history="1">
         <w:r>
           <w:rPr>
             <w:rStyle w:val="Hipervnculo"/>
@@ -1129,7 +1129,7 @@
             <w:noProof/>
             <w:webHidden/>
           </w:rPr>
-          <w:instrText xml:space="preserve"> PAGEREF _Toc231082282 \h </w:instrText>
+          <w:instrText xml:space="preserve"> PAGEREF _Toc231082771 \h </w:instrText>
         </w:r>
         <w:r>
           <w:rPr>
@@ -1175,7 +1175,7 @@
           <w14:ligatures w14:val="standardContextual"/>
         </w:rPr>
       </w:pPr>
-      <w:hyperlink w:anchor="_Toc231082283" w:history="1">
+      <w:hyperlink w:anchor="_Toc231082772" w:history="1">
         <w:r>
           <w:rPr>
             <w:rStyle w:val="Hipervnculo"/>
@@ -1202,7 +1202,7 @@
             <w:noProof/>
             <w:webHidden/>
           </w:rPr>
-          <w:instrText xml:space="preserve"> PAGEREF _Toc231082283 \h </w:instrText>
+          <w:instrText xml:space="preserve"> PAGEREF _Toc231082772 \h </w:instrText>
         </w:r>
         <w:r>
           <w:rPr>
@@ -1248,7 +1248,7 @@
           <w14:ligatures w14:val="standardContextual"/>
         </w:rPr>
       </w:pPr>
-      <w:hyperlink w:anchor="_Toc231082284" w:history="1">
+      <w:hyperlink w:anchor="_Toc231082773" w:history="1">
         <w:r>
           <w:rPr>
             <w:rStyle w:val="Hipervnculo"/>
@@ -1275,7 +1275,7 @@
             <w:noProof/>
             <w:webHidden/>
           </w:rPr>
-          <w:instrText xml:space="preserve"> PAGEREF _Toc231082284 \h </w:instrText>
+          <w:instrText xml:space="preserve"> PAGEREF _Toc231082773 \h </w:instrText>
         </w:r>
         <w:r>
           <w:rPr>
@@ -1321,7 +1321,7 @@
           <w14:ligatures w14:val="standardContextual"/>
         </w:rPr>
       </w:pPr>
-      <w:hyperlink w:anchor="_Toc231082285" w:history="1">
+      <w:hyperlink w:anchor="_Toc231082774" w:history="1">
         <w:r>
           <w:rPr>
             <w:rStyle w:val="Hipervnculo"/>
@@ -1348,7 +1348,7 @@
             <w:noProof/>
             <w:webHidden/>
           </w:rPr>
-          <w:instrText xml:space="preserve"> PAGEREF _Toc231082285 \h </w:instrText>
+          <w:instrText xml:space="preserve"> PAGEREF _Toc231082774 \h </w:instrText>
         </w:r>
         <w:r>
           <w:rPr>
@@ -1394,7 +1394,7 @@
           <w14:ligatures w14:val="standardContextual"/>
         </w:rPr>
       </w:pPr>
-      <w:hyperlink w:anchor="_Toc231082286" w:history="1">
+      <w:hyperlink w:anchor="_Toc231082775" w:history="1">
         <w:r>
           <w:rPr>
             <w:rStyle w:val="Hipervnculo"/>
@@ -1421,7 +1421,7 @@
             <w:noProof/>
             <w:webHidden/>
           </w:rPr>
-          <w:instrText xml:space="preserve"> PAGEREF _Toc231082286 \h </w:instrText>
+          <w:instrText xml:space="preserve"> PAGEREF _Toc231082775 \h </w:instrText>
         </w:r>
         <w:r>
           <w:rPr>
@@ -1467,7 +1467,7 @@
           <w14:ligatures w14:val="standardContextual"/>
         </w:rPr>
       </w:pPr>
-      <w:hyperlink w:anchor="_Toc231082287" w:history="1">
+      <w:hyperlink w:anchor="_Toc231082776" w:history="1">
         <w:r>
           <w:rPr>
             <w:rStyle w:val="Hipervnculo"/>
@@ -1494,7 +1494,7 @@
             <w:noProof/>
             <w:webHidden/>
           </w:rPr>
-          <w:instrText xml:space="preserve"> PAGEREF _Toc231082287 \h </w:instrText>
+          <w:instrText xml:space="preserve"> PAGEREF _Toc231082776 \h </w:instrText>
         </w:r>
         <w:r>
           <w:rPr>
@@ -1540,7 +1540,7 @@
           <w14:ligatures w14:val="standardContextual"/>
         </w:rPr>
       </w:pPr>
-      <w:hyperlink w:anchor="_Toc231082288" w:history="1">
+      <w:hyperlink w:anchor="_Toc231082777" w:history="1">
         <w:r>
           <w:rPr>
             <w:rStyle w:val="Hipervnculo"/>
@@ -1567,7 +1567,7 @@
             <w:noProof/>
             <w:webHidden/>
           </w:rPr>
-          <w:instrText xml:space="preserve"> PAGEREF _Toc231082288 \h </w:instrText>
+          <w:instrText xml:space="preserve"> PAGEREF _Toc231082777 \h </w:instrText>
         </w:r>
         <w:r>
           <w:rPr>
@@ -1613,7 +1613,7 @@
           <w14:ligatures w14:val="standardContextual"/>
         </w:rPr>
       </w:pPr>
-      <w:hyperlink w:anchor="_Toc231082289" w:history="1">
+      <w:hyperlink w:anchor="_Toc231082778" w:history="1">
         <w:r>
           <w:rPr>
             <w:rStyle w:val="Hipervnculo"/>
@@ -1640,7 +1640,7 @@
             <w:noProof/>
             <w:webHidden/>
           </w:rPr>
-          <w:instrText xml:space="preserve"> PAGEREF _Toc231082289 \h </w:instrText>
+          <w:instrText xml:space="preserve"> PAGEREF _Toc231082778 \h </w:instrText>
         </w:r>
         <w:r>
           <w:rPr>
@@ -1686,7 +1686,7 @@
           <w14:ligatures w14:val="standardContextual"/>
         </w:rPr>
       </w:pPr>
-      <w:hyperlink w:anchor="_Toc231082290" w:history="1">
+      <w:hyperlink w:anchor="_Toc231082779" w:history="1">
         <w:r>
           <w:rPr>
             <w:rStyle w:val="Hipervnculo"/>
@@ -1713,7 +1713,7 @@
             <w:noProof/>
             <w:webHidden/>
           </w:rPr>
-          <w:instrText xml:space="preserve"> PAGEREF _Toc231082290 \h </w:instrText>
+          <w:instrText xml:space="preserve"> PAGEREF _Toc231082779 \h </w:instrText>
         </w:r>
         <w:r>
           <w:rPr>
@@ -1759,7 +1759,7 @@
           <w14:ligatures w14:val="standardContextual"/>
         </w:rPr>
       </w:pPr>
-      <w:hyperlink w:anchor="_Toc231082291" w:history="1">
+      <w:hyperlink w:anchor="_Toc231082780" w:history="1">
         <w:r>
           <w:rPr>
             <w:rStyle w:val="Hipervnculo"/>
@@ -1786,7 +1786,7 @@
             <w:noProof/>
             <w:webHidden/>
           </w:rPr>
-          <w:instrText xml:space="preserve"> PAGEREF _Toc231082291 \h </w:instrText>
+          <w:instrText xml:space="preserve"> PAGEREF _Toc231082780 \h </w:instrText>
         </w:r>
         <w:r>
           <w:rPr>
@@ -1832,7 +1832,7 @@
           <w14:ligatures w14:val="standardContextual"/>
         </w:rPr>
       </w:pPr>
-      <w:hyperlink w:anchor="_Toc231082292" w:history="1">
+      <w:hyperlink w:anchor="_Toc231082781" w:history="1">
         <w:r>
           <w:rPr>
             <w:rStyle w:val="Hipervnculo"/>
@@ -1859,7 +1859,7 @@
             <w:noProof/>
             <w:webHidden/>
           </w:rPr>
-          <w:instrText xml:space="preserve"> PAGEREF _Toc231082292 \h </w:instrText>
+          <w:instrText xml:space="preserve"> PAGEREF _Toc231082781 \h </w:instrText>
         </w:r>
         <w:r>
           <w:rPr>
@@ -1905,7 +1905,7 @@
           <w14:ligatures w14:val="standardContextual"/>
         </w:rPr>
       </w:pPr>
-      <w:hyperlink w:anchor="_Toc231082293" w:history="1">
+      <w:hyperlink w:anchor="_Toc231082782" w:history="1">
         <w:r>
           <w:rPr>
             <w:rStyle w:val="Hipervnculo"/>
@@ -1932,7 +1932,7 @@
             <w:noProof/>
             <w:webHidden/>
           </w:rPr>
-          <w:instrText xml:space="preserve"> PAGEREF _Toc231082293 \h </w:instrText>
+          <w:instrText xml:space="preserve"> PAGEREF _Toc231082782 \h </w:instrText>
         </w:r>
         <w:r>
           <w:rPr>
@@ -1978,7 +1978,7 @@
           <w14:ligatures w14:val="standardContextual"/>
         </w:rPr>
       </w:pPr>
-      <w:hyperlink w:anchor="_Toc231082294" w:history="1">
+      <w:hyperlink w:anchor="_Toc231082783" w:history="1">
         <w:r>
           <w:rPr>
             <w:rStyle w:val="Hipervnculo"/>
@@ -2005,7 +2005,7 @@
             <w:noProof/>
             <w:webHidden/>
           </w:rPr>
-          <w:instrText xml:space="preserve"> PAGEREF _Toc231082294 \h </w:instrText>
+          <w:instrText xml:space="preserve"> PAGEREF _Toc231082783 \h </w:instrText>
         </w:r>
         <w:r>
           <w:rPr>
@@ -2051,7 +2051,7 @@
           <w14:ligatures w14:val="standardContextual"/>
         </w:rPr>
       </w:pPr>
-      <w:hyperlink w:anchor="_Toc231082295" w:history="1">
+      <w:hyperlink w:anchor="_Toc231082784" w:history="1">
         <w:r>
           <w:rPr>
             <w:rStyle w:val="Hipervnculo"/>
@@ -2078,7 +2078,7 @@
             <w:noProof/>
             <w:webHidden/>
           </w:rPr>
-          <w:instrText xml:space="preserve"> PAGEREF _Toc231082295 \h </w:instrText>
+          <w:instrText xml:space="preserve"> PAGEREF _Toc231082784 \h </w:instrText>
         </w:r>
         <w:r>
           <w:rPr>
@@ -2124,7 +2124,7 @@
           <w14:ligatures w14:val="standardContextual"/>
         </w:rPr>
       </w:pPr>
-      <w:hyperlink w:anchor="_Toc231082296" w:history="1">
+      <w:hyperlink w:anchor="_Toc231082785" w:history="1">
         <w:r>
           <w:rPr>
             <w:rStyle w:val="Hipervnculo"/>
@@ -2151,7 +2151,7 @@
             <w:noProof/>
             <w:webHidden/>
           </w:rPr>
-          <w:instrText xml:space="preserve"> PAGEREF _Toc231082296 \h </w:instrText>
+          <w:instrText xml:space="preserve"> PAGEREF _Toc231082785 \h </w:instrText>
         </w:r>
         <w:r>
           <w:rPr>
@@ -2197,7 +2197,7 @@
           <w14:ligatures w14:val="standardContextual"/>
         </w:rPr>
       </w:pPr>
-      <w:hyperlink w:anchor="_Toc231082297" w:history="1">
+      <w:hyperlink w:anchor="_Toc231082786" w:history="1">
         <w:r>
           <w:rPr>
             <w:rStyle w:val="Hipervnculo"/>
@@ -2224,7 +2224,7 @@
             <w:noProof/>
             <w:webHidden/>
           </w:rPr>
-          <w:instrText xml:space="preserve"> PAGEREF _Toc231082297 \h </w:instrText>
+          <w:instrText xml:space="preserve"> PAGEREF _Toc231082786 \h </w:instrText>
         </w:r>
         <w:r>
           <w:rPr>
@@ -2270,7 +2270,7 @@
           <w14:ligatures w14:val="standardContextual"/>
         </w:rPr>
       </w:pPr>
-      <w:hyperlink w:anchor="_Toc231082298" w:history="1">
+      <w:hyperlink w:anchor="_Toc231082787" w:history="1">
         <w:r>
           <w:rPr>
             <w:rStyle w:val="Hipervnculo"/>
@@ -2297,7 +2297,7 @@
             <w:noProof/>
             <w:webHidden/>
           </w:rPr>
-          <w:instrText xml:space="preserve"> PAGEREF _Toc231082298 \h </w:instrText>
+          <w:instrText xml:space="preserve"> PAGEREF _Toc231082787 \h </w:instrText>
         </w:r>
         <w:r>
           <w:rPr>
@@ -2343,7 +2343,7 @@
           <w14:ligatures w14:val="standardContextual"/>
         </w:rPr>
       </w:pPr>
-      <w:hyperlink w:anchor="_Toc231082299" w:history="1">
+      <w:hyperlink w:anchor="_Toc231082788" w:history="1">
         <w:r>
           <w:rPr>
             <w:rStyle w:val="Hipervnculo"/>
@@ -2370,7 +2370,7 @@
             <w:noProof/>
             <w:webHidden/>
           </w:rPr>
-          <w:instrText xml:space="preserve"> PAGEREF _Toc231082299 \h </w:instrText>
+          <w:instrText xml:space="preserve"> PAGEREF _Toc231082788 \h </w:instrText>
         </w:r>
         <w:r>
           <w:rPr>
@@ -2416,7 +2416,7 @@
           <w14:ligatures w14:val="standardContextual"/>
         </w:rPr>
       </w:pPr>
-      <w:hyperlink w:anchor="_Toc231082300" w:history="1">
+      <w:hyperlink w:anchor="_Toc231082789" w:history="1">
         <w:r>
           <w:rPr>
             <w:rStyle w:val="Hipervnculo"/>
@@ -2443,7 +2443,7 @@
             <w:noProof/>
             <w:webHidden/>
           </w:rPr>
-          <w:instrText xml:space="preserve"> PAGEREF _Toc231082300 \h </w:instrText>
+          <w:instrText xml:space="preserve"> PAGEREF _Toc231082789 \h </w:instrText>
         </w:r>
         <w:r>
           <w:rPr>
@@ -2489,7 +2489,7 @@
           <w14:ligatures w14:val="standardContextual"/>
         </w:rPr>
       </w:pPr>
-      <w:hyperlink w:anchor="_Toc231082301" w:history="1">
+      <w:hyperlink w:anchor="_Toc231082790" w:history="1">
         <w:r>
           <w:rPr>
             <w:rStyle w:val="Hipervnculo"/>
@@ -2516,7 +2516,7 @@
             <w:noProof/>
             <w:webHidden/>
           </w:rPr>
-          <w:instrText xml:space="preserve"> PAGEREF _Toc231082301 \h </w:instrText>
+          <w:instrText xml:space="preserve"> PAGEREF _Toc231082790 \h </w:instrText>
         </w:r>
         <w:r>
           <w:rPr>
@@ -2562,7 +2562,7 @@
           <w14:ligatures w14:val="standardContextual"/>
         </w:rPr>
       </w:pPr>
-      <w:hyperlink w:anchor="_Toc231082302" w:history="1">
+      <w:hyperlink w:anchor="_Toc231082791" w:history="1">
         <w:r>
           <w:rPr>
             <w:rStyle w:val="Hipervnculo"/>
@@ -2589,7 +2589,7 @@
             <w:noProof/>
             <w:webHidden/>
           </w:rPr>
-          <w:instrText xml:space="preserve"> PAGEREF _Toc231082302 \h </w:instrText>
+          <w:instrText xml:space="preserve"> PAGEREF _Toc231082791 \h </w:instrText>
         </w:r>
         <w:r>
           <w:rPr>
@@ -2635,7 +2635,7 @@
           <w14:ligatures w14:val="standardContextual"/>
         </w:rPr>
       </w:pPr>
-      <w:hyperlink w:anchor="_Toc231082303" w:history="1">
+      <w:hyperlink w:anchor="_Toc231082792" w:history="1">
         <w:r>
           <w:rPr>
             <w:rStyle w:val="Hipervnculo"/>
@@ -2662,7 +2662,7 @@
             <w:noProof/>
             <w:webHidden/>
           </w:rPr>
-          <w:instrText xml:space="preserve"> PAGEREF _Toc231082303 \h </w:instrText>
+          <w:instrText xml:space="preserve"> PAGEREF _Toc231082792 \h </w:instrText>
         </w:r>
         <w:r>
           <w:rPr>
@@ -2708,7 +2708,7 @@
           <w14:ligatures w14:val="standardContextual"/>
         </w:rPr>
       </w:pPr>
-      <w:hyperlink w:anchor="_Toc231082304" w:history="1">
+      <w:hyperlink w:anchor="_Toc231082793" w:history="1">
         <w:r>
           <w:rPr>
             <w:rStyle w:val="Hipervnculo"/>
@@ -2735,7 +2735,7 @@
             <w:noProof/>
             <w:webHidden/>
           </w:rPr>
-          <w:instrText xml:space="preserve"> PAGEREF _Toc231082304 \h </w:instrText>
+          <w:instrText xml:space="preserve"> PAGEREF _Toc231082793 \h </w:instrText>
         </w:r>
         <w:r>
           <w:rPr>
@@ -2781,7 +2781,7 @@
           <w14:ligatures w14:val="standardContextual"/>
         </w:rPr>
       </w:pPr>
-      <w:hyperlink w:anchor="_Toc231082305" w:history="1">
+      <w:hyperlink w:anchor="_Toc231082794" w:history="1">
         <w:r>
           <w:rPr>
             <w:rStyle w:val="Hipervnculo"/>
@@ -2808,7 +2808,7 @@
             <w:noProof/>
             <w:webHidden/>
           </w:rPr>
-          <w:instrText xml:space="preserve"> PAGEREF _Toc231082305 \h </w:instrText>
+          <w:instrText xml:space="preserve"> PAGEREF _Toc231082794 \h </w:instrText>
         </w:r>
         <w:r>
           <w:rPr>
@@ -2854,7 +2854,7 @@
           <w14:ligatures w14:val="standardContextual"/>
         </w:rPr>
       </w:pPr>
-      <w:hyperlink w:anchor="_Toc231082306" w:history="1">
+      <w:hyperlink w:anchor="_Toc231082795" w:history="1">
         <w:r>
           <w:rPr>
             <w:rStyle w:val="Hipervnculo"/>
@@ -2881,7 +2881,7 @@
             <w:noProof/>
             <w:webHidden/>
           </w:rPr>
-          <w:instrText xml:space="preserve"> PAGEREF _Toc231082306 \h </w:instrText>
+          <w:instrText xml:space="preserve"> PAGEREF _Toc231082795 \h </w:instrText>
         </w:r>
         <w:r>
           <w:rPr>
@@ -2927,7 +2927,7 @@
           <w14:ligatures w14:val="standardContextual"/>
         </w:rPr>
       </w:pPr>
-      <w:hyperlink w:anchor="_Toc231082307" w:history="1">
+      <w:hyperlink w:anchor="_Toc231082796" w:history="1">
         <w:r>
           <w:rPr>
             <w:rStyle w:val="Hipervnculo"/>
@@ -2954,7 +2954,7 @@
             <w:noProof/>
             <w:webHidden/>
           </w:rPr>
-          <w:instrText xml:space="preserve"> PAGEREF _Toc231082307 \h </w:instrText>
+          <w:instrText xml:space="preserve"> PAGEREF _Toc231082796 \h </w:instrText>
         </w:r>
         <w:r>
           <w:rPr>
@@ -3000,7 +3000,7 @@
           <w14:ligatures w14:val="standardContextual"/>
         </w:rPr>
       </w:pPr>
-      <w:hyperlink w:anchor="_Toc231082308" w:history="1">
+      <w:hyperlink w:anchor="_Toc231082797" w:history="1">
         <w:r>
           <w:rPr>
             <w:rStyle w:val="Hipervnculo"/>
@@ -3027,7 +3027,7 @@
             <w:noProof/>
             <w:webHidden/>
           </w:rPr>
-          <w:instrText xml:space="preserve"> PAGEREF _Toc231082308 \h </w:instrText>
+          <w:instrText xml:space="preserve"> PAGEREF _Toc231082797 \h </w:instrText>
         </w:r>
         <w:r>
           <w:rPr>
@@ -3073,7 +3073,7 @@
           <w14:ligatures w14:val="standardContextual"/>
         </w:rPr>
       </w:pPr>
-      <w:hyperlink w:anchor="_Toc231082309" w:history="1">
+      <w:hyperlink w:anchor="_Toc231082798" w:history="1">
         <w:r>
           <w:rPr>
             <w:rStyle w:val="Hipervnculo"/>
@@ -3100,7 +3100,7 @@
             <w:noProof/>
             <w:webHidden/>
           </w:rPr>
-          <w:instrText xml:space="preserve"> PAGEREF _Toc231082309 \h </w:instrText>
+          <w:instrText xml:space="preserve"> PAGEREF _Toc231082798 \h </w:instrText>
         </w:r>
         <w:r>
           <w:rPr>
@@ -3146,7 +3146,7 @@
           <w14:ligatures w14:val="standardContextual"/>
         </w:rPr>
       </w:pPr>
-      <w:hyperlink w:anchor="_Toc231082310" w:history="1">
+      <w:hyperlink w:anchor="_Toc231082799" w:history="1">
         <w:r>
           <w:rPr>
             <w:rStyle w:val="Hipervnculo"/>
@@ -3173,7 +3173,7 @@
             <w:noProof/>
             <w:webHidden/>
           </w:rPr>
-          <w:instrText xml:space="preserve"> PAGEREF _Toc231082310 \h </w:instrText>
+          <w:instrText xml:space="preserve"> PAGEREF _Toc231082799 \h </w:instrText>
         </w:r>
         <w:r>
           <w:rPr>
@@ -3219,7 +3219,7 @@
           <w14:ligatures w14:val="standardContextual"/>
         </w:rPr>
       </w:pPr>
-      <w:hyperlink w:anchor="_Toc231082311" w:history="1">
+      <w:hyperlink w:anchor="_Toc231082800" w:history="1">
         <w:r>
           <w:rPr>
             <w:rStyle w:val="Hipervnculo"/>
@@ -3246,7 +3246,7 @@
             <w:noProof/>
             <w:webHidden/>
           </w:rPr>
-          <w:instrText xml:space="preserve"> PAGEREF _Toc231082311 \h </w:instrText>
+          <w:instrText xml:space="preserve"> PAGEREF _Toc231082800 \h </w:instrText>
         </w:r>
         <w:r>
           <w:rPr>
@@ -3292,7 +3292,7 @@
           <w14:ligatures w14:val="standardContextual"/>
         </w:rPr>
       </w:pPr>
-      <w:hyperlink w:anchor="_Toc231082312" w:history="1">
+      <w:hyperlink w:anchor="_Toc231082801" w:history="1">
         <w:r>
           <w:rPr>
             <w:rStyle w:val="Hipervnculo"/>
@@ -3319,7 +3319,7 @@
             <w:noProof/>
             <w:webHidden/>
           </w:rPr>
-          <w:instrText xml:space="preserve"> PAGEREF _Toc231082312 \h </w:instrText>
+          <w:instrText xml:space="preserve"> PAGEREF _Toc231082801 \h </w:instrText>
         </w:r>
         <w:r>
           <w:rPr>
@@ -3365,7 +3365,7 @@
           <w14:ligatures w14:val="standardContextual"/>
         </w:rPr>
       </w:pPr>
-      <w:hyperlink w:anchor="_Toc231082313" w:history="1">
+      <w:hyperlink w:anchor="_Toc231082802" w:history="1">
         <w:r>
           <w:rPr>
             <w:rStyle w:val="Hipervnculo"/>
@@ -3392,7 +3392,7 @@
             <w:noProof/>
             <w:webHidden/>
           </w:rPr>
-          <w:instrText xml:space="preserve"> PAGEREF _Toc231082313 \h </w:instrText>
+          <w:instrText xml:space="preserve"> PAGEREF _Toc231082802 \h </w:instrText>
         </w:r>
         <w:r>
           <w:rPr>
@@ -3438,7 +3438,7 @@
           <w14:ligatures w14:val="standardContextual"/>
         </w:rPr>
       </w:pPr>
-      <w:hyperlink w:anchor="_Toc231082314" w:history="1">
+      <w:hyperlink w:anchor="_Toc231082803" w:history="1">
         <w:r>
           <w:rPr>
             <w:rStyle w:val="Hipervnculo"/>
@@ -3465,7 +3465,7 @@
             <w:noProof/>
             <w:webHidden/>
           </w:rPr>
-          <w:instrText xml:space="preserve"> PAGEREF _Toc231082314 \h </w:instrText>
+          <w:instrText xml:space="preserve"> PAGEREF _Toc231082803 \h </w:instrText>
         </w:r>
         <w:r>
           <w:rPr>
@@ -3511,7 +3511,7 @@
           <w14:ligatures w14:val="standardContextual"/>
         </w:rPr>
       </w:pPr>
-      <w:hyperlink w:anchor="_Toc231082315" w:history="1">
+      <w:hyperlink w:anchor="_Toc231082804" w:history="1">
         <w:r>
           <w:rPr>
             <w:rStyle w:val="Hipervnculo"/>
@@ -3538,7 +3538,7 @@
             <w:noProof/>
             <w:webHidden/>
           </w:rPr>
-          <w:instrText xml:space="preserve"> PAGEREF _Toc231082315 \h </w:instrText>
+          <w:instrText xml:space="preserve"> PAGEREF _Toc231082804 \h </w:instrText>
         </w:r>
         <w:r>
           <w:rPr>
@@ -3584,7 +3584,7 @@
           <w14:ligatures w14:val="standardContextual"/>
         </w:rPr>
       </w:pPr>
-      <w:hyperlink w:anchor="_Toc231082316" w:history="1">
+      <w:hyperlink w:anchor="_Toc231082805" w:history="1">
         <w:r>
           <w:rPr>
             <w:rStyle w:val="Hipervnculo"/>
@@ -3611,7 +3611,7 @@
             <w:noProof/>
             <w:webHidden/>
           </w:rPr>
-          <w:instrText xml:space="preserve"> PAGEREF _Toc231082316 \h </w:instrText>
+          <w:instrText xml:space="preserve"> PAGEREF _Toc231082805 \h </w:instrText>
         </w:r>
         <w:r>
           <w:rPr>
@@ -3657,7 +3657,7 @@
           <w14:ligatures w14:val="standardContextual"/>
         </w:rPr>
       </w:pPr>
-      <w:hyperlink w:anchor="_Toc231082317" w:history="1">
+      <w:hyperlink w:anchor="_Toc231082806" w:history="1">
         <w:r>
           <w:rPr>
             <w:rStyle w:val="Hipervnculo"/>
@@ -3684,7 +3684,7 @@
             <w:noProof/>
             <w:webHidden/>
           </w:rPr>
-          <w:instrText xml:space="preserve"> PAGEREF _Toc231082317 \h </w:instrText>
+          <w:instrText xml:space="preserve"> PAGEREF _Toc231082806 \h </w:instrText>
         </w:r>
         <w:r>
           <w:rPr>
@@ -3704,7 +3704,7 @@
             <w:noProof/>
             <w:webHidden/>
           </w:rPr>
-          <w:t>29</w:t>
+          <w:t>30</w:t>
         </w:r>
         <w:r>
           <w:rPr>
@@ -3730,7 +3730,7 @@
           <w14:ligatures w14:val="standardContextual"/>
         </w:rPr>
       </w:pPr>
-      <w:hyperlink w:anchor="_Toc231082318" w:history="1">
+      <w:hyperlink w:anchor="_Toc231082807" w:history="1">
         <w:r>
           <w:rPr>
             <w:rStyle w:val="Hipervnculo"/>
@@ -3757,7 +3757,7 @@
             <w:noProof/>
             <w:webHidden/>
           </w:rPr>
-          <w:instrText xml:space="preserve"> PAGEREF _Toc231082318 \h </w:instrText>
+          <w:instrText xml:space="preserve"> PAGEREF _Toc231082807 \h </w:instrText>
         </w:r>
         <w:r>
           <w:rPr>
@@ -3803,7 +3803,7 @@
           <w14:ligatures w14:val="standardContextual"/>
         </w:rPr>
       </w:pPr>
-      <w:hyperlink w:anchor="_Toc231082319" w:history="1">
+      <w:hyperlink w:anchor="_Toc231082808" w:history="1">
         <w:r>
           <w:rPr>
             <w:rStyle w:val="Hipervnculo"/>
@@ -3830,7 +3830,7 @@
             <w:noProof/>
             <w:webHidden/>
           </w:rPr>
-          <w:instrText xml:space="preserve"> PAGEREF _Toc231082319 \h </w:instrText>
+          <w:instrText xml:space="preserve"> PAGEREF _Toc231082808 \h </w:instrText>
         </w:r>
         <w:r>
           <w:rPr>
@@ -3876,7 +3876,7 @@
           <w14:ligatures w14:val="standardContextual"/>
         </w:rPr>
       </w:pPr>
-      <w:hyperlink w:anchor="_Toc231082320" w:history="1">
+      <w:hyperlink w:anchor="_Toc231082809" w:history="1">
         <w:r>
           <w:rPr>
             <w:rStyle w:val="Hipervnculo"/>
@@ -3903,7 +3903,7 @@
             <w:noProof/>
             <w:webHidden/>
           </w:rPr>
-          <w:instrText xml:space="preserve"> PAGEREF _Toc231082320 \h </w:instrText>
+          <w:instrText xml:space="preserve"> PAGEREF _Toc231082809 \h </w:instrText>
         </w:r>
         <w:r>
           <w:rPr>
@@ -3949,7 +3949,7 @@
           <w14:ligatures w14:val="standardContextual"/>
         </w:rPr>
       </w:pPr>
-      <w:hyperlink w:anchor="_Toc231082321" w:history="1">
+      <w:hyperlink w:anchor="_Toc231082810" w:history="1">
         <w:r>
           <w:rPr>
             <w:rStyle w:val="Hipervnculo"/>
@@ -3976,7 +3976,7 @@
             <w:noProof/>
             <w:webHidden/>
           </w:rPr>
-          <w:instrText xml:space="preserve"> PAGEREF _Toc231082321 \h </w:instrText>
+          <w:instrText xml:space="preserve"> PAGEREF _Toc231082810 \h </w:instrText>
         </w:r>
         <w:r>
           <w:rPr>
@@ -3996,7 +3996,7 @@
             <w:noProof/>
             <w:webHidden/>
           </w:rPr>
-          <w:t>35</w:t>
+          <w:t>36</w:t>
         </w:r>
         <w:r>
           <w:rPr>
@@ -4022,7 +4022,7 @@
           <w14:ligatures w14:val="standardContextual"/>
         </w:rPr>
       </w:pPr>
-      <w:hyperlink w:anchor="_Toc231082322" w:history="1">
+      <w:hyperlink w:anchor="_Toc231082811" w:history="1">
         <w:r>
           <w:rPr>
             <w:rStyle w:val="Hipervnculo"/>
@@ -4049,7 +4049,7 @@
             <w:noProof/>
             <w:webHidden/>
           </w:rPr>
-          <w:instrText xml:space="preserve"> PAGEREF _Toc231082322 \h </w:instrText>
+          <w:instrText xml:space="preserve"> PAGEREF _Toc231082811 \h </w:instrText>
         </w:r>
         <w:r>
           <w:rPr>
@@ -4069,7 +4069,7 @@
             <w:noProof/>
             <w:webHidden/>
           </w:rPr>
-          <w:t>38</w:t>
+          <w:t>39</w:t>
         </w:r>
         <w:r>
           <w:rPr>
@@ -4095,7 +4095,7 @@
           <w14:ligatures w14:val="standardContextual"/>
         </w:rPr>
       </w:pPr>
-      <w:hyperlink w:anchor="_Toc231082323" w:history="1">
+      <w:hyperlink w:anchor="_Toc231082812" w:history="1">
         <w:r>
           <w:rPr>
             <w:rStyle w:val="Hipervnculo"/>
@@ -4122,7 +4122,7 @@
             <w:noProof/>
             <w:webHidden/>
           </w:rPr>
-          <w:instrText xml:space="preserve"> PAGEREF _Toc231082323 \h </w:instrText>
+          <w:instrText xml:space="preserve"> PAGEREF _Toc231082812 \h </w:instrText>
         </w:r>
         <w:r>
           <w:rPr>
@@ -4142,7 +4142,7 @@
             <w:noProof/>
             <w:webHidden/>
           </w:rPr>
-          <w:t>40</w:t>
+          <w:t>41</w:t>
         </w:r>
         <w:r>
           <w:rPr>
@@ -4168,7 +4168,7 @@
           <w14:ligatures w14:val="standardContextual"/>
         </w:rPr>
       </w:pPr>
-      <w:hyperlink w:anchor="_Toc231082324" w:history="1">
+      <w:hyperlink w:anchor="_Toc231082813" w:history="1">
         <w:r>
           <w:rPr>
             <w:rStyle w:val="Hipervnculo"/>
@@ -4195,7 +4195,7 @@
             <w:noProof/>
             <w:webHidden/>
           </w:rPr>
-          <w:instrText xml:space="preserve"> PAGEREF _Toc231082324 \h </w:instrText>
+          <w:instrText xml:space="preserve"> PAGEREF _Toc231082813 \h </w:instrText>
         </w:r>
         <w:r>
           <w:rPr>
@@ -4215,7 +4215,7 @@
             <w:noProof/>
             <w:webHidden/>
           </w:rPr>
-          <w:t>40</w:t>
+          <w:t>41</w:t>
         </w:r>
         <w:r>
           <w:rPr>
@@ -4241,7 +4241,7 @@
           <w14:ligatures w14:val="standardContextual"/>
         </w:rPr>
       </w:pPr>
-      <w:hyperlink w:anchor="_Toc231082325" w:history="1">
+      <w:hyperlink w:anchor="_Toc231082814" w:history="1">
         <w:r>
           <w:rPr>
             <w:rStyle w:val="Hipervnculo"/>
@@ -4268,7 +4268,7 @@
             <w:noProof/>
             <w:webHidden/>
           </w:rPr>
-          <w:instrText xml:space="preserve"> PAGEREF _Toc231082325 \h </w:instrText>
+          <w:instrText xml:space="preserve"> PAGEREF _Toc231082814 \h </w:instrText>
         </w:r>
         <w:r>
           <w:rPr>
@@ -4288,7 +4288,7 @@
             <w:noProof/>
             <w:webHidden/>
           </w:rPr>
-          <w:t>41</w:t>
+          <w:t>42</w:t>
         </w:r>
         <w:r>
           <w:rPr>
@@ -4314,7 +4314,7 @@
           <w14:ligatures w14:val="standardContextual"/>
         </w:rPr>
       </w:pPr>
-      <w:hyperlink w:anchor="_Toc231082326" w:history="1">
+      <w:hyperlink w:anchor="_Toc231082815" w:history="1">
         <w:r>
           <w:rPr>
             <w:rStyle w:val="Hipervnculo"/>
@@ -4341,7 +4341,7 @@
             <w:noProof/>
             <w:webHidden/>
           </w:rPr>
-          <w:instrText xml:space="preserve"> PAGEREF _Toc231082326 \h </w:instrText>
+          <w:instrText xml:space="preserve"> PAGEREF _Toc231082815 \h </w:instrText>
         </w:r>
         <w:r>
           <w:rPr>
@@ -4361,7 +4361,7 @@
             <w:noProof/>
             <w:webHidden/>
           </w:rPr>
-          <w:t>41</w:t>
+          <w:t>42</w:t>
         </w:r>
         <w:r>
           <w:rPr>
@@ -4387,7 +4387,7 @@
           <w14:ligatures w14:val="standardContextual"/>
         </w:rPr>
       </w:pPr>
-      <w:hyperlink w:anchor="_Toc231082327" w:history="1">
+      <w:hyperlink w:anchor="_Toc231082816" w:history="1">
         <w:r>
           <w:rPr>
             <w:rStyle w:val="Hipervnculo"/>
@@ -4414,7 +4414,7 @@
             <w:noProof/>
             <w:webHidden/>
           </w:rPr>
-          <w:instrText xml:space="preserve"> PAGEREF _Toc231082327 \h </w:instrText>
+          <w:instrText xml:space="preserve"> PAGEREF _Toc231082816 \h </w:instrText>
         </w:r>
         <w:r>
           <w:rPr>
@@ -4434,7 +4434,7 @@
             <w:noProof/>
             <w:webHidden/>
           </w:rPr>
-          <w:t>41</w:t>
+          <w:t>42</w:t>
         </w:r>
         <w:r>
           <w:rPr>
@@ -4460,7 +4460,7 @@
           <w14:ligatures w14:val="standardContextual"/>
         </w:rPr>
       </w:pPr>
-      <w:hyperlink w:anchor="_Toc231082328" w:history="1">
+      <w:hyperlink w:anchor="_Toc231082817" w:history="1">
         <w:r>
           <w:rPr>
             <w:rStyle w:val="Hipervnculo"/>
@@ -4487,7 +4487,7 @@
             <w:noProof/>
             <w:webHidden/>
           </w:rPr>
-          <w:instrText xml:space="preserve"> PAGEREF _Toc231082328 \h </w:instrText>
+          <w:instrText xml:space="preserve"> PAGEREF _Toc231082817 \h </w:instrText>
         </w:r>
         <w:r>
           <w:rPr>
@@ -4507,7 +4507,7 @@
             <w:noProof/>
             <w:webHidden/>
           </w:rPr>
-          <w:t>43</w:t>
+          <w:t>44</w:t>
         </w:r>
         <w:r>
           <w:rPr>
@@ -4533,7 +4533,7 @@
           <w14:ligatures w14:val="standardContextual"/>
         </w:rPr>
       </w:pPr>
-      <w:hyperlink w:anchor="_Toc231082329" w:history="1">
+      <w:hyperlink w:anchor="_Toc231082818" w:history="1">
         <w:r>
           <w:rPr>
             <w:rStyle w:val="Hipervnculo"/>
@@ -4560,7 +4560,7 @@
             <w:noProof/>
             <w:webHidden/>
           </w:rPr>
-          <w:instrText xml:space="preserve"> PAGEREF _Toc231082329 \h </w:instrText>
+          <w:instrText xml:space="preserve"> PAGEREF _Toc231082818 \h </w:instrText>
         </w:r>
         <w:r>
           <w:rPr>
@@ -4580,7 +4580,7 @@
             <w:noProof/>
             <w:webHidden/>
           </w:rPr>
-          <w:t>47</w:t>
+          <w:t>48</w:t>
         </w:r>
         <w:r>
           <w:rPr>
@@ -4606,7 +4606,7 @@
           <w14:ligatures w14:val="standardContextual"/>
         </w:rPr>
       </w:pPr>
-      <w:hyperlink w:anchor="_Toc231082330" w:history="1">
+      <w:hyperlink w:anchor="_Toc231082819" w:history="1">
         <w:r>
           <w:rPr>
             <w:rStyle w:val="Hipervnculo"/>
@@ -4633,7 +4633,7 @@
             <w:noProof/>
             <w:webHidden/>
           </w:rPr>
-          <w:instrText xml:space="preserve"> PAGEREF _Toc231082330 \h </w:instrText>
+          <w:instrText xml:space="preserve"> PAGEREF _Toc231082819 \h </w:instrText>
         </w:r>
         <w:r>
           <w:rPr>
@@ -4653,7 +4653,7 @@
             <w:noProof/>
             <w:webHidden/>
           </w:rPr>
-          <w:t>47</w:t>
+          <w:t>48</w:t>
         </w:r>
         <w:r>
           <w:rPr>
@@ -4679,7 +4679,7 @@
           <w14:ligatures w14:val="standardContextual"/>
         </w:rPr>
       </w:pPr>
-      <w:hyperlink w:anchor="_Toc231082331" w:history="1">
+      <w:hyperlink w:anchor="_Toc231082820" w:history="1">
         <w:r>
           <w:rPr>
             <w:rStyle w:val="Hipervnculo"/>
@@ -4706,7 +4706,7 @@
             <w:noProof/>
             <w:webHidden/>
           </w:rPr>
-          <w:instrText xml:space="preserve"> PAGEREF _Toc231082331 \h </w:instrText>
+          <w:instrText xml:space="preserve"> PAGEREF _Toc231082820 \h </w:instrText>
         </w:r>
         <w:r>
           <w:rPr>
@@ -4726,7 +4726,7 @@
             <w:noProof/>
             <w:webHidden/>
           </w:rPr>
-          <w:t>47</w:t>
+          <w:t>48</w:t>
         </w:r>
         <w:r>
           <w:rPr>
@@ -4752,7 +4752,7 @@
           <w14:ligatures w14:val="standardContextual"/>
         </w:rPr>
       </w:pPr>
-      <w:hyperlink w:anchor="_Toc231082332" w:history="1">
+      <w:hyperlink w:anchor="_Toc231082821" w:history="1">
         <w:r>
           <w:rPr>
             <w:rStyle w:val="Hipervnculo"/>
@@ -4779,7 +4779,7 @@
             <w:noProof/>
             <w:webHidden/>
           </w:rPr>
-          <w:instrText xml:space="preserve"> PAGEREF _Toc231082332 \h </w:instrText>
+          <w:instrText xml:space="preserve"> PAGEREF _Toc231082821 \h </w:instrText>
         </w:r>
         <w:r>
           <w:rPr>
@@ -4799,7 +4799,7 @@
             <w:noProof/>
             <w:webHidden/>
           </w:rPr>
-          <w:t>48</w:t>
+          <w:t>49</w:t>
         </w:r>
         <w:r>
           <w:rPr>
@@ -4825,7 +4825,7 @@
           <w14:ligatures w14:val="standardContextual"/>
         </w:rPr>
       </w:pPr>
-      <w:hyperlink w:anchor="_Toc231082333" w:history="1">
+      <w:hyperlink w:anchor="_Toc231082822" w:history="1">
         <w:r>
           <w:rPr>
             <w:rStyle w:val="Hipervnculo"/>
@@ -4852,7 +4852,7 @@
             <w:noProof/>
             <w:webHidden/>
           </w:rPr>
-          <w:instrText xml:space="preserve"> PAGEREF _Toc231082333 \h </w:instrText>
+          <w:instrText xml:space="preserve"> PAGEREF _Toc231082822 \h </w:instrText>
         </w:r>
         <w:r>
           <w:rPr>
@@ -4872,7 +4872,7 @@
             <w:noProof/>
             <w:webHidden/>
           </w:rPr>
-          <w:t>49</w:t>
+          <w:t>50</w:t>
         </w:r>
         <w:r>
           <w:rPr>
@@ -4898,7 +4898,7 @@
           <w14:ligatures w14:val="standardContextual"/>
         </w:rPr>
       </w:pPr>
-      <w:hyperlink w:anchor="_Toc231082334" w:history="1">
+      <w:hyperlink w:anchor="_Toc231082823" w:history="1">
         <w:r>
           <w:rPr>
             <w:rStyle w:val="Hipervnculo"/>
@@ -4925,7 +4925,7 @@
             <w:noProof/>
             <w:webHidden/>
           </w:rPr>
-          <w:instrText xml:space="preserve"> PAGEREF _Toc231082334 \h </w:instrText>
+          <w:instrText xml:space="preserve"> PAGEREF _Toc231082823 \h </w:instrText>
         </w:r>
         <w:r>
           <w:rPr>
@@ -4945,7 +4945,7 @@
             <w:noProof/>
             <w:webHidden/>
           </w:rPr>
-          <w:t>49</w:t>
+          <w:t>50</w:t>
         </w:r>
         <w:r>
           <w:rPr>
@@ -4971,7 +4971,7 @@
           <w14:ligatures w14:val="standardContextual"/>
         </w:rPr>
       </w:pPr>
-      <w:hyperlink w:anchor="_Toc231082335" w:history="1">
+      <w:hyperlink w:anchor="_Toc231082824" w:history="1">
         <w:r>
           <w:rPr>
             <w:rStyle w:val="Hipervnculo"/>
@@ -4998,7 +4998,7 @@
             <w:noProof/>
             <w:webHidden/>
           </w:rPr>
-          <w:instrText xml:space="preserve"> PAGEREF _Toc231082335 \h </w:instrText>
+          <w:instrText xml:space="preserve"> PAGEREF _Toc231082824 \h </w:instrText>
         </w:r>
         <w:r>
           <w:rPr>
@@ -5018,7 +5018,7 @@
             <w:noProof/>
             <w:webHidden/>
           </w:rPr>
-          <w:t>49</w:t>
+          <w:t>50</w:t>
         </w:r>
         <w:r>
           <w:rPr>
@@ -5044,7 +5044,7 @@
           <w14:ligatures w14:val="standardContextual"/>
         </w:rPr>
       </w:pPr>
-      <w:hyperlink w:anchor="_Toc231082336" w:history="1">
+      <w:hyperlink w:anchor="_Toc231082825" w:history="1">
         <w:r>
           <w:rPr>
             <w:rStyle w:val="Hipervnculo"/>
@@ -5071,7 +5071,7 @@
             <w:noProof/>
             <w:webHidden/>
           </w:rPr>
-          <w:instrText xml:space="preserve"> PAGEREF _Toc231082336 \h </w:instrText>
+          <w:instrText xml:space="preserve"> PAGEREF _Toc231082825 \h </w:instrText>
         </w:r>
         <w:r>
           <w:rPr>
@@ -5091,7 +5091,7 @@
             <w:noProof/>
             <w:webHidden/>
           </w:rPr>
-          <w:t>50</w:t>
+          <w:t>51</w:t>
         </w:r>
         <w:r>
           <w:rPr>
@@ -5117,7 +5117,7 @@
           <w14:ligatures w14:val="standardContextual"/>
         </w:rPr>
       </w:pPr>
-      <w:hyperlink w:anchor="_Toc231082337" w:history="1">
+      <w:hyperlink w:anchor="_Toc231082826" w:history="1">
         <w:r>
           <w:rPr>
             <w:rStyle w:val="Hipervnculo"/>
@@ -5144,7 +5144,7 @@
             <w:noProof/>
             <w:webHidden/>
           </w:rPr>
-          <w:instrText xml:space="preserve"> PAGEREF _Toc231082337 \h </w:instrText>
+          <w:instrText xml:space="preserve"> PAGEREF _Toc231082826 \h </w:instrText>
         </w:r>
         <w:r>
           <w:rPr>
@@ -5164,7 +5164,7 @@
             <w:noProof/>
             <w:webHidden/>
           </w:rPr>
-          <w:t>50</w:t>
+          <w:t>51</w:t>
         </w:r>
         <w:r>
           <w:rPr>
@@ -5190,7 +5190,7 @@
           <w14:ligatures w14:val="standardContextual"/>
         </w:rPr>
       </w:pPr>
-      <w:hyperlink w:anchor="_Toc231082338" w:history="1">
+      <w:hyperlink w:anchor="_Toc231082827" w:history="1">
         <w:r>
           <w:rPr>
             <w:rStyle w:val="Hipervnculo"/>
@@ -5217,7 +5217,7 @@
             <w:noProof/>
             <w:webHidden/>
           </w:rPr>
-          <w:instrText xml:space="preserve"> PAGEREF _Toc231082338 \h </w:instrText>
+          <w:instrText xml:space="preserve"> PAGEREF _Toc231082827 \h </w:instrText>
         </w:r>
         <w:r>
           <w:rPr>
@@ -5237,7 +5237,7 @@
             <w:noProof/>
             <w:webHidden/>
           </w:rPr>
-          <w:t>50</w:t>
+          <w:t>51</w:t>
         </w:r>
         <w:r>
           <w:rPr>
@@ -5263,7 +5263,7 @@
           <w14:ligatures w14:val="standardContextual"/>
         </w:rPr>
       </w:pPr>
-      <w:hyperlink w:anchor="_Toc231082339" w:history="1">
+      <w:hyperlink w:anchor="_Toc231082828" w:history="1">
         <w:r>
           <w:rPr>
             <w:rStyle w:val="Hipervnculo"/>
@@ -5290,7 +5290,7 @@
             <w:noProof/>
             <w:webHidden/>
           </w:rPr>
-          <w:instrText xml:space="preserve"> PAGEREF _Toc231082339 \h </w:instrText>
+          <w:instrText xml:space="preserve"> PAGEREF _Toc231082828 \h </w:instrText>
         </w:r>
         <w:r>
           <w:rPr>
@@ -5310,7 +5310,7 @@
             <w:noProof/>
             <w:webHidden/>
           </w:rPr>
-          <w:t>51</w:t>
+          <w:t>52</w:t>
         </w:r>
         <w:r>
           <w:rPr>
@@ -5336,7 +5336,7 @@
           <w14:ligatures w14:val="standardContextual"/>
         </w:rPr>
       </w:pPr>
-      <w:hyperlink w:anchor="_Toc231082340" w:history="1">
+      <w:hyperlink w:anchor="_Toc231082829" w:history="1">
         <w:r>
           <w:rPr>
             <w:rStyle w:val="Hipervnculo"/>
@@ -5363,7 +5363,7 @@
             <w:noProof/>
             <w:webHidden/>
           </w:rPr>
-          <w:instrText xml:space="preserve"> PAGEREF _Toc231082340 \h </w:instrText>
+          <w:instrText xml:space="preserve"> PAGEREF _Toc231082829 \h </w:instrText>
         </w:r>
         <w:r>
           <w:rPr>
@@ -5383,7 +5383,7 @@
             <w:noProof/>
             <w:webHidden/>
           </w:rPr>
-          <w:t>52</w:t>
+          <w:t>53</w:t>
         </w:r>
         <w:r>
           <w:rPr>
@@ -5409,7 +5409,7 @@
           <w14:ligatures w14:val="standardContextual"/>
         </w:rPr>
       </w:pPr>
-      <w:hyperlink w:anchor="_Toc231082341" w:history="1">
+      <w:hyperlink w:anchor="_Toc231082830" w:history="1">
         <w:r>
           <w:rPr>
             <w:rStyle w:val="Hipervnculo"/>
@@ -5436,7 +5436,7 @@
             <w:noProof/>
             <w:webHidden/>
           </w:rPr>
-          <w:instrText xml:space="preserve"> PAGEREF _Toc231082341 \h </w:instrText>
+          <w:instrText xml:space="preserve"> PAGEREF _Toc231082830 \h </w:instrText>
         </w:r>
         <w:r>
           <w:rPr>
@@ -5456,7 +5456,7 @@
             <w:noProof/>
             <w:webHidden/>
           </w:rPr>
-          <w:t>52</w:t>
+          <w:t>53</w:t>
         </w:r>
         <w:r>
           <w:rPr>
@@ -5482,7 +5482,7 @@
           <w14:ligatures w14:val="standardContextual"/>
         </w:rPr>
       </w:pPr>
-      <w:hyperlink w:anchor="_Toc231082342" w:history="1">
+      <w:hyperlink w:anchor="_Toc231082831" w:history="1">
         <w:r>
           <w:rPr>
             <w:rStyle w:val="Hipervnculo"/>
@@ -5509,7 +5509,7 @@
             <w:noProof/>
             <w:webHidden/>
           </w:rPr>
-          <w:instrText xml:space="preserve"> PAGEREF _Toc231082342 \h </w:instrText>
+          <w:instrText xml:space="preserve"> PAGEREF _Toc231082831 \h </w:instrText>
         </w:r>
         <w:r>
           <w:rPr>
@@ -5529,7 +5529,7 @@
             <w:noProof/>
             <w:webHidden/>
           </w:rPr>
-          <w:t>53</w:t>
+          <w:t>54</w:t>
         </w:r>
         <w:r>
           <w:rPr>
@@ -5554,7 +5554,7 @@
       <w:pPr>
         <w:pStyle w:val="Ttulo1"/>
       </w:pPr>
-      <w:bookmarkStart w:id="7" w:name="_Toc231082279"/>
+      <w:bookmarkStart w:id="7" w:name="_Toc231082768"/>
       <w:r>
         <w:lastRenderedPageBreak/>
         <w:t>Índice de tablas</w:t>
@@ -5585,7 +5585,7 @@
       <w:r>
         <w:fldChar w:fldCharType="separate"/>
       </w:r>
-      <w:hyperlink w:anchor="_Toc231082343" w:history="1">
+      <w:hyperlink w:anchor="_Toc231082832" w:history="1">
         <w:r>
           <w:rPr>
             <w:rStyle w:val="Hipervnculo"/>
@@ -5612,7 +5612,7 @@
             <w:noProof/>
             <w:webHidden/>
           </w:rPr>
-          <w:instrText xml:space="preserve"> PAGEREF _Toc231082343 \h </w:instrText>
+          <w:instrText xml:space="preserve"> PAGEREF _Toc231082832 \h </w:instrText>
         </w:r>
         <w:r>
           <w:rPr>
@@ -5658,7 +5658,7 @@
           <w14:ligatures w14:val="standardContextual"/>
         </w:rPr>
       </w:pPr>
-      <w:hyperlink w:anchor="_Toc231082344" w:history="1">
+      <w:hyperlink w:anchor="_Toc231082833" w:history="1">
         <w:r>
           <w:rPr>
             <w:rStyle w:val="Hipervnculo"/>
@@ -5685,7 +5685,7 @@
             <w:noProof/>
             <w:webHidden/>
           </w:rPr>
-          <w:instrText xml:space="preserve"> PAGEREF _Toc231082344 \h </w:instrText>
+          <w:instrText xml:space="preserve"> PAGEREF _Toc231082833 \h </w:instrText>
         </w:r>
         <w:r>
           <w:rPr>
@@ -5731,7 +5731,7 @@
           <w14:ligatures w14:val="standardContextual"/>
         </w:rPr>
       </w:pPr>
-      <w:hyperlink w:anchor="_Toc231082345" w:history="1">
+      <w:hyperlink w:anchor="_Toc231082834" w:history="1">
         <w:r>
           <w:rPr>
             <w:rStyle w:val="Hipervnculo"/>
@@ -5758,7 +5758,7 @@
             <w:noProof/>
             <w:webHidden/>
           </w:rPr>
-          <w:instrText xml:space="preserve"> PAGEREF _Toc231082345 \h </w:instrText>
+          <w:instrText xml:space="preserve"> PAGEREF _Toc231082834 \h </w:instrText>
         </w:r>
         <w:r>
           <w:rPr>
@@ -5804,7 +5804,7 @@
           <w14:ligatures w14:val="standardContextual"/>
         </w:rPr>
       </w:pPr>
-      <w:hyperlink w:anchor="_Toc231082346" w:history="1">
+      <w:hyperlink w:anchor="_Toc231082835" w:history="1">
         <w:r>
           <w:rPr>
             <w:rStyle w:val="Hipervnculo"/>
@@ -5831,7 +5831,7 @@
             <w:noProof/>
             <w:webHidden/>
           </w:rPr>
-          <w:instrText xml:space="preserve"> PAGEREF _Toc231082346 \h </w:instrText>
+          <w:instrText xml:space="preserve"> PAGEREF _Toc231082835 \h </w:instrText>
         </w:r>
         <w:r>
           <w:rPr>
@@ -5877,7 +5877,7 @@
           <w14:ligatures w14:val="standardContextual"/>
         </w:rPr>
       </w:pPr>
-      <w:hyperlink w:anchor="_Toc231082347" w:history="1">
+      <w:hyperlink w:anchor="_Toc231082836" w:history="1">
         <w:r>
           <w:rPr>
             <w:rStyle w:val="Hipervnculo"/>
@@ -5904,7 +5904,7 @@
             <w:noProof/>
             <w:webHidden/>
           </w:rPr>
-          <w:instrText xml:space="preserve"> PAGEREF _Toc231082347 \h </w:instrText>
+          <w:instrText xml:space="preserve"> PAGEREF _Toc231082836 \h </w:instrText>
         </w:r>
         <w:r>
           <w:rPr>
@@ -5924,7 +5924,7 @@
             <w:noProof/>
             <w:webHidden/>
           </w:rPr>
-          <w:t>47</w:t>
+          <w:t>48</w:t>
         </w:r>
         <w:r>
           <w:rPr>
@@ -5950,7 +5950,7 @@
           <w14:ligatures w14:val="standardContextual"/>
         </w:rPr>
       </w:pPr>
-      <w:hyperlink w:anchor="_Toc231082348" w:history="1">
+      <w:hyperlink w:anchor="_Toc231082837" w:history="1">
         <w:r>
           <w:rPr>
             <w:rStyle w:val="Hipervnculo"/>
@@ -5977,7 +5977,7 @@
             <w:noProof/>
             <w:webHidden/>
           </w:rPr>
-          <w:instrText xml:space="preserve"> PAGEREF _Toc231082348 \h </w:instrText>
+          <w:instrText xml:space="preserve"> PAGEREF _Toc231082837 \h </w:instrText>
         </w:r>
         <w:r>
           <w:rPr>
@@ -5997,7 +5997,7 @@
             <w:noProof/>
             <w:webHidden/>
           </w:rPr>
-          <w:t>47</w:t>
+          <w:t>48</w:t>
         </w:r>
         <w:r>
           <w:rPr>
@@ -6023,7 +6023,7 @@
           <w14:ligatures w14:val="standardContextual"/>
         </w:rPr>
       </w:pPr>
-      <w:hyperlink w:anchor="_Toc231082349" w:history="1">
+      <w:hyperlink w:anchor="_Toc231082838" w:history="1">
         <w:r>
           <w:rPr>
             <w:rStyle w:val="Hipervnculo"/>
@@ -6050,7 +6050,7 @@
             <w:noProof/>
             <w:webHidden/>
           </w:rPr>
-          <w:instrText xml:space="preserve"> PAGEREF _Toc231082349 \h </w:instrText>
+          <w:instrText xml:space="preserve"> PAGEREF _Toc231082838 \h </w:instrText>
         </w:r>
         <w:r>
           <w:rPr>
@@ -6070,7 +6070,7 @@
             <w:noProof/>
             <w:webHidden/>
           </w:rPr>
-          <w:t>48</w:t>
+          <w:t>49</w:t>
         </w:r>
         <w:r>
           <w:rPr>
@@ -6096,7 +6096,7 @@
           <w14:ligatures w14:val="standardContextual"/>
         </w:rPr>
       </w:pPr>
-      <w:hyperlink w:anchor="_Toc231082350" w:history="1">
+      <w:hyperlink w:anchor="_Toc231082839" w:history="1">
         <w:r>
           <w:rPr>
             <w:rStyle w:val="Hipervnculo"/>
@@ -6123,7 +6123,7 @@
             <w:noProof/>
             <w:webHidden/>
           </w:rPr>
-          <w:instrText xml:space="preserve"> PAGEREF _Toc231082350 \h </w:instrText>
+          <w:instrText xml:space="preserve"> PAGEREF _Toc231082839 \h </w:instrText>
         </w:r>
         <w:r>
           <w:rPr>
@@ -6143,7 +6143,7 @@
             <w:noProof/>
             <w:webHidden/>
           </w:rPr>
-          <w:t>49</w:t>
+          <w:t>50</w:t>
         </w:r>
         <w:r>
           <w:rPr>
@@ -6169,7 +6169,7 @@
           <w14:ligatures w14:val="standardContextual"/>
         </w:rPr>
       </w:pPr>
-      <w:hyperlink w:anchor="_Toc231082351" w:history="1">
+      <w:hyperlink w:anchor="_Toc231082840" w:history="1">
         <w:r>
           <w:rPr>
             <w:rStyle w:val="Hipervnculo"/>
@@ -6196,7 +6196,7 @@
             <w:noProof/>
             <w:webHidden/>
           </w:rPr>
-          <w:instrText xml:space="preserve"> PAGEREF _Toc231082351 \h </w:instrText>
+          <w:instrText xml:space="preserve"> PAGEREF _Toc231082840 \h </w:instrText>
         </w:r>
         <w:r>
           <w:rPr>
@@ -6216,7 +6216,7 @@
             <w:noProof/>
             <w:webHidden/>
           </w:rPr>
-          <w:t>49</w:t>
+          <w:t>50</w:t>
         </w:r>
         <w:r>
           <w:rPr>
@@ -6242,7 +6242,7 @@
           <w14:ligatures w14:val="standardContextual"/>
         </w:rPr>
       </w:pPr>
-      <w:hyperlink w:anchor="_Toc231082352" w:history="1">
+      <w:hyperlink w:anchor="_Toc231082841" w:history="1">
         <w:r>
           <w:rPr>
             <w:rStyle w:val="Hipervnculo"/>
@@ -6269,7 +6269,7 @@
             <w:noProof/>
             <w:webHidden/>
           </w:rPr>
-          <w:instrText xml:space="preserve"> PAGEREF _Toc231082352 \h </w:instrText>
+          <w:instrText xml:space="preserve"> PAGEREF _Toc231082841 \h </w:instrText>
         </w:r>
         <w:r>
           <w:rPr>
@@ -6289,7 +6289,7 @@
             <w:noProof/>
             <w:webHidden/>
           </w:rPr>
-          <w:t>50</w:t>
+          <w:t>51</w:t>
         </w:r>
         <w:r>
           <w:rPr>
@@ -6315,7 +6315,7 @@
           <w14:ligatures w14:val="standardContextual"/>
         </w:rPr>
       </w:pPr>
-      <w:hyperlink w:anchor="_Toc231082353" w:history="1">
+      <w:hyperlink w:anchor="_Toc231082842" w:history="1">
         <w:r>
           <w:rPr>
             <w:rStyle w:val="Hipervnculo"/>
@@ -6342,7 +6342,7 @@
             <w:noProof/>
             <w:webHidden/>
           </w:rPr>
-          <w:instrText xml:space="preserve"> PAGEREF _Toc231082353 \h </w:instrText>
+          <w:instrText xml:space="preserve"> PAGEREF _Toc231082842 \h </w:instrText>
         </w:r>
         <w:r>
           <w:rPr>
@@ -6362,7 +6362,7 @@
             <w:noProof/>
             <w:webHidden/>
           </w:rPr>
-          <w:t>50</w:t>
+          <w:t>51</w:t>
         </w:r>
         <w:r>
           <w:rPr>
@@ -6388,7 +6388,7 @@
           <w14:ligatures w14:val="standardContextual"/>
         </w:rPr>
       </w:pPr>
-      <w:hyperlink w:anchor="_Toc231082354" w:history="1">
+      <w:hyperlink w:anchor="_Toc231082843" w:history="1">
         <w:r>
           <w:rPr>
             <w:rStyle w:val="Hipervnculo"/>
@@ -6415,7 +6415,7 @@
             <w:noProof/>
             <w:webHidden/>
           </w:rPr>
-          <w:instrText xml:space="preserve"> PAGEREF _Toc231082354 \h </w:instrText>
+          <w:instrText xml:space="preserve"> PAGEREF _Toc231082843 \h </w:instrText>
         </w:r>
         <w:r>
           <w:rPr>
@@ -6435,7 +6435,7 @@
             <w:noProof/>
             <w:webHidden/>
           </w:rPr>
-          <w:t>50</w:t>
+          <w:t>51</w:t>
         </w:r>
         <w:r>
           <w:rPr>
@@ -6461,7 +6461,7 @@
           <w14:ligatures w14:val="standardContextual"/>
         </w:rPr>
       </w:pPr>
-      <w:hyperlink w:anchor="_Toc231082355" w:history="1">
+      <w:hyperlink w:anchor="_Toc231082844" w:history="1">
         <w:r>
           <w:rPr>
             <w:rStyle w:val="Hipervnculo"/>
@@ -6488,7 +6488,7 @@
             <w:noProof/>
             <w:webHidden/>
           </w:rPr>
-          <w:instrText xml:space="preserve"> PAGEREF _Toc231082355 \h </w:instrText>
+          <w:instrText xml:space="preserve"> PAGEREF _Toc231082844 \h </w:instrText>
         </w:r>
         <w:r>
           <w:rPr>
@@ -6508,7 +6508,7 @@
             <w:noProof/>
             <w:webHidden/>
           </w:rPr>
-          <w:t>51</w:t>
+          <w:t>52</w:t>
         </w:r>
         <w:r>
           <w:rPr>
@@ -6534,7 +6534,7 @@
           <w14:ligatures w14:val="standardContextual"/>
         </w:rPr>
       </w:pPr>
-      <w:hyperlink w:anchor="_Toc231082356" w:history="1">
+      <w:hyperlink w:anchor="_Toc231082845" w:history="1">
         <w:r>
           <w:rPr>
             <w:rStyle w:val="Hipervnculo"/>
@@ -6561,7 +6561,7 @@
             <w:noProof/>
             <w:webHidden/>
           </w:rPr>
-          <w:instrText xml:space="preserve"> PAGEREF _Toc231082356 \h </w:instrText>
+          <w:instrText xml:space="preserve"> PAGEREF _Toc231082845 \h </w:instrText>
         </w:r>
         <w:r>
           <w:rPr>
@@ -6581,7 +6581,7 @@
             <w:noProof/>
             <w:webHidden/>
           </w:rPr>
-          <w:t>52</w:t>
+          <w:t>53</w:t>
         </w:r>
         <w:r>
           <w:rPr>
@@ -6606,7 +6606,7 @@
       <w:pPr>
         <w:pStyle w:val="Ttulo1"/>
       </w:pPr>
-      <w:bookmarkStart w:id="8" w:name="_Toc231082280"/>
+      <w:bookmarkStart w:id="8" w:name="_Toc231082769"/>
       <w:r>
         <w:lastRenderedPageBreak/>
         <w:t>Índice de figuras</w:t>
@@ -6637,7 +6637,7 @@
       <w:r>
         <w:fldChar w:fldCharType="separate"/>
       </w:r>
-      <w:hyperlink w:anchor="_Toc231082357" w:history="1">
+      <w:hyperlink w:anchor="_Toc231082846" w:history="1">
         <w:r>
           <w:rPr>
             <w:rStyle w:val="Hipervnculo"/>
@@ -6664,7 +6664,7 @@
             <w:noProof/>
             <w:webHidden/>
           </w:rPr>
-          <w:instrText xml:space="preserve"> PAGEREF _Toc231082357 \h </w:instrText>
+          <w:instrText xml:space="preserve"> PAGEREF _Toc231082846 \h </w:instrText>
         </w:r>
         <w:r>
           <w:rPr>
@@ -6684,7 +6684,7 @@
             <w:noProof/>
             <w:webHidden/>
           </w:rPr>
-          <w:t>29</w:t>
+          <w:t>30</w:t>
         </w:r>
         <w:r>
           <w:rPr>
@@ -6710,7 +6710,7 @@
           <w14:ligatures w14:val="standardContextual"/>
         </w:rPr>
       </w:pPr>
-      <w:hyperlink w:anchor="_Toc231082358" w:history="1">
+      <w:hyperlink w:anchor="_Toc231082847" w:history="1">
         <w:r>
           <w:rPr>
             <w:rStyle w:val="Hipervnculo"/>
@@ -6737,7 +6737,7 @@
             <w:noProof/>
             <w:webHidden/>
           </w:rPr>
-          <w:instrText xml:space="preserve"> PAGEREF _Toc231082358 \h </w:instrText>
+          <w:instrText xml:space="preserve"> PAGEREF _Toc231082847 \h </w:instrText>
         </w:r>
         <w:r>
           <w:rPr>
@@ -6783,7 +6783,7 @@
           <w14:ligatures w14:val="standardContextual"/>
         </w:rPr>
       </w:pPr>
-      <w:hyperlink w:anchor="_Toc231082359" w:history="1">
+      <w:hyperlink w:anchor="_Toc231082848" w:history="1">
         <w:r>
           <w:rPr>
             <w:rStyle w:val="Hipervnculo"/>
@@ -6810,7 +6810,7 @@
             <w:noProof/>
             <w:webHidden/>
           </w:rPr>
-          <w:instrText xml:space="preserve"> PAGEREF _Toc231082359 \h </w:instrText>
+          <w:instrText xml:space="preserve"> PAGEREF _Toc231082848 \h </w:instrText>
         </w:r>
         <w:r>
           <w:rPr>
@@ -6856,7 +6856,7 @@
           <w14:ligatures w14:val="standardContextual"/>
         </w:rPr>
       </w:pPr>
-      <w:hyperlink w:anchor="_Toc231082360" w:history="1">
+      <w:hyperlink w:anchor="_Toc231082849" w:history="1">
         <w:r>
           <w:rPr>
             <w:rStyle w:val="Hipervnculo"/>
@@ -6883,7 +6883,7 @@
             <w:noProof/>
             <w:webHidden/>
           </w:rPr>
-          <w:instrText xml:space="preserve"> PAGEREF _Toc231082360 \h </w:instrText>
+          <w:instrText xml:space="preserve"> PAGEREF _Toc231082849 \h </w:instrText>
         </w:r>
         <w:r>
           <w:rPr>
@@ -6929,7 +6929,7 @@
           <w14:ligatures w14:val="standardContextual"/>
         </w:rPr>
       </w:pPr>
-      <w:hyperlink w:anchor="_Toc231082361" w:history="1">
+      <w:hyperlink w:anchor="_Toc231082850" w:history="1">
         <w:r>
           <w:rPr>
             <w:rStyle w:val="Hipervnculo"/>
@@ -6956,7 +6956,7 @@
             <w:noProof/>
             <w:webHidden/>
           </w:rPr>
-          <w:instrText xml:space="preserve"> PAGEREF _Toc231082361 \h </w:instrText>
+          <w:instrText xml:space="preserve"> PAGEREF _Toc231082850 \h </w:instrText>
         </w:r>
         <w:r>
           <w:rPr>
@@ -7002,7 +7002,7 @@
           <w14:ligatures w14:val="standardContextual"/>
         </w:rPr>
       </w:pPr>
-      <w:hyperlink w:anchor="_Toc231082362" w:history="1">
+      <w:hyperlink w:anchor="_Toc231082851" w:history="1">
         <w:r>
           <w:rPr>
             <w:rStyle w:val="Hipervnculo"/>
@@ -7029,7 +7029,7 @@
             <w:noProof/>
             <w:webHidden/>
           </w:rPr>
-          <w:instrText xml:space="preserve"> PAGEREF _Toc231082362 \h </w:instrText>
+          <w:instrText xml:space="preserve"> PAGEREF _Toc231082851 \h </w:instrText>
         </w:r>
         <w:r>
           <w:rPr>
@@ -7074,7 +7074,7 @@
       <w:pPr>
         <w:pStyle w:val="Ttulo1"/>
       </w:pPr>
-      <w:bookmarkStart w:id="9" w:name="_Toc231082281"/>
+      <w:bookmarkStart w:id="9" w:name="_Toc231082770"/>
       <w:r>
         <w:lastRenderedPageBreak/>
         <w:t xml:space="preserve">Lista de </w:t>
@@ -7683,7 +7683,7 @@
       <w:pPr>
         <w:pStyle w:val="Ttulo1"/>
       </w:pPr>
-      <w:bookmarkStart w:id="10" w:name="_Toc231082282"/>
+      <w:bookmarkStart w:id="10" w:name="_Toc231082771"/>
       <w:r>
         <w:lastRenderedPageBreak/>
         <w:t>Capítulo 1 — Introducción</w:t>
@@ -7694,7 +7694,7 @@
       <w:pPr>
         <w:pStyle w:val="Ttulo2"/>
       </w:pPr>
-      <w:bookmarkStart w:id="11" w:name="_Toc231082283"/>
+      <w:bookmarkStart w:id="11" w:name="_Toc231082772"/>
       <w:r>
         <w:t>1.1 Contextualización</w:t>
       </w:r>
@@ -7779,7 +7779,7 @@
       <w:pPr>
         <w:pStyle w:val="Ttulo2"/>
       </w:pPr>
-      <w:bookmarkStart w:id="12" w:name="_Toc231082284"/>
+      <w:bookmarkStart w:id="12" w:name="_Toc231082773"/>
       <w:r>
         <w:lastRenderedPageBreak/>
         <w:t>1.2 Problema de investigación y justificación</w:t>
@@ -7892,7 +7892,7 @@
       <w:pPr>
         <w:pStyle w:val="Ttulo2"/>
       </w:pPr>
-      <w:bookmarkStart w:id="13" w:name="_Toc231082285"/>
+      <w:bookmarkStart w:id="13" w:name="_Toc231082774"/>
       <w:r>
         <w:lastRenderedPageBreak/>
         <w:t>1.3 Pregunta y objetivos de investigación</w:t>
@@ -8075,7 +8075,7 @@
       <w:pPr>
         <w:pStyle w:val="Ttulo2"/>
       </w:pPr>
-      <w:bookmarkStart w:id="14" w:name="_Toc231082286"/>
+      <w:bookmarkStart w:id="14" w:name="_Toc231082775"/>
       <w:r>
         <w:t>1.4 Hipótesis general</w:t>
       </w:r>
@@ -8118,7 +8118,7 @@
       <w:pPr>
         <w:pStyle w:val="Ttulo2"/>
       </w:pPr>
-      <w:bookmarkStart w:id="15" w:name="_Toc231082287"/>
+      <w:bookmarkStart w:id="15" w:name="_Toc231082776"/>
       <w:r>
         <w:t>1.5 Aspectos metodológicos y alcance</w:t>
       </w:r>
@@ -8221,7 +8221,7 @@
       <w:pPr>
         <w:pStyle w:val="Ttulo2"/>
       </w:pPr>
-      <w:bookmarkStart w:id="16" w:name="_Toc231082288"/>
+      <w:bookmarkStart w:id="16" w:name="_Toc231082777"/>
       <w:r>
         <w:t>1.6 Aportes esperados</w:t>
       </w:r>
@@ -8275,7 +8275,7 @@
       <w:pPr>
         <w:pStyle w:val="Ttulo2"/>
       </w:pPr>
-      <w:bookmarkStart w:id="17" w:name="_Toc231082289"/>
+      <w:bookmarkStart w:id="17" w:name="_Toc231082778"/>
       <w:r>
         <w:t>1.7 Estructura de la tesis</w:t>
       </w:r>
@@ -8318,7 +8318,7 @@
       <w:pPr>
         <w:pStyle w:val="Ttulo1"/>
       </w:pPr>
-      <w:bookmarkStart w:id="18" w:name="_Toc231082290"/>
+      <w:bookmarkStart w:id="18" w:name="_Toc231082779"/>
       <w:r>
         <w:lastRenderedPageBreak/>
         <w:t>Capítulo 2 — Marco teórico y revisión de literatura</w:t>
@@ -8329,7 +8329,7 @@
       <w:pPr>
         <w:pStyle w:val="Ttulo2"/>
       </w:pPr>
-      <w:bookmarkStart w:id="19" w:name="_Toc231082291"/>
+      <w:bookmarkStart w:id="19" w:name="_Toc231082780"/>
       <w:r>
         <w:t>2.1 Determinantes macroeconómicos de los retornos accionarios</w:t>
       </w:r>
@@ -8624,7 +8624,7 @@
       <w:pPr>
         <w:pStyle w:val="Ttulo2"/>
       </w:pPr>
-      <w:bookmarkStart w:id="20" w:name="_Toc231082292"/>
+      <w:bookmarkStart w:id="20" w:name="_Toc231082781"/>
       <w:r>
         <w:t>2.2 Precios de commodities y valoración de empresas mineras</w:t>
       </w:r>
@@ -8762,7 +8762,7 @@
       <w:pPr>
         <w:pStyle w:val="Ttulo2"/>
       </w:pPr>
-      <w:bookmarkStart w:id="21" w:name="_Toc231082293"/>
+      <w:bookmarkStart w:id="21" w:name="_Toc231082782"/>
       <w:r>
         <w:t>2.3 Tipo de cambio y exposición de empresas exportadoras</w:t>
       </w:r>
@@ -8840,7 +8840,7 @@
       <w:pPr>
         <w:pStyle w:val="Ttulo2"/>
       </w:pPr>
-      <w:bookmarkStart w:id="22" w:name="_Toc231082294"/>
+      <w:bookmarkStart w:id="22" w:name="_Toc231082783"/>
       <w:r>
         <w:t>2.4 Cobre, tipo de cambio y la economía chilena</w:t>
       </w:r>
@@ -9057,7 +9057,7 @@
       <w:pPr>
         <w:pStyle w:val="Ttulo2"/>
       </w:pPr>
-      <w:bookmarkStart w:id="23" w:name="_Toc231082295"/>
+      <w:bookmarkStart w:id="23" w:name="_Toc231082784"/>
       <w:r>
         <w:t>2.5 Eficiencia informacional y segmentación de mercados</w:t>
       </w:r>
@@ -9197,7 +9197,7 @@
       <w:pPr>
         <w:pStyle w:val="Ttulo2"/>
       </w:pPr>
-      <w:bookmarkStart w:id="24" w:name="_Toc231082296"/>
+      <w:bookmarkStart w:id="24" w:name="_Toc231082785"/>
       <w:r>
         <w:t>2.6 Enfoques econométricos para la medición de impacto</w:t>
       </w:r>
@@ -9321,7 +9321,7 @@
       <w:pPr>
         <w:pStyle w:val="Ttulo2"/>
       </w:pPr>
-      <w:bookmarkStart w:id="25" w:name="_Toc231082297"/>
+      <w:bookmarkStart w:id="25" w:name="_Toc231082786"/>
       <w:r>
         <w:t>2.7 Síntesis e identificación del vacío de investigación</w:t>
       </w:r>
@@ -9455,7 +9455,7 @@
       <w:pPr>
         <w:pStyle w:val="Ttulo3"/>
       </w:pPr>
-      <w:bookmarkStart w:id="26" w:name="_Toc231082298"/>
+      <w:bookmarkStart w:id="26" w:name="_Toc231082787"/>
       <w:r>
         <w:t>Nota sobre la tabla de literatura</w:t>
       </w:r>
@@ -9486,7 +9486,7 @@
       <w:pPr>
         <w:pStyle w:val="Ttulo1"/>
       </w:pPr>
-      <w:bookmarkStart w:id="27" w:name="_Toc231082299"/>
+      <w:bookmarkStart w:id="27" w:name="_Toc231082788"/>
       <w:r>
         <w:lastRenderedPageBreak/>
         <w:t>Capítulo 3 — Datos y metodología</w:t>
@@ -9497,7 +9497,7 @@
       <w:pPr>
         <w:pStyle w:val="Ttulo2"/>
       </w:pPr>
-      <w:bookmarkStart w:id="28" w:name="_Toc231082300"/>
+      <w:bookmarkStart w:id="28" w:name="_Toc231082789"/>
       <w:r>
         <w:t>3.1 Definición del universo de empresas y período</w:t>
       </w:r>
@@ -9686,7 +9686,7 @@
       <w:pPr>
         <w:pStyle w:val="Ttulo2"/>
       </w:pPr>
-      <w:bookmarkStart w:id="29" w:name="_Toc231082301"/>
+      <w:bookmarkStart w:id="29" w:name="_Toc231082790"/>
       <w:r>
         <w:t>3.2 Variable dependiente</w:t>
       </w:r>
@@ -9745,7 +9745,7 @@
       <w:pPr>
         <w:pStyle w:val="Ttulo2"/>
       </w:pPr>
-      <w:bookmarkStart w:id="30" w:name="_Toc231082302"/>
+      <w:bookmarkStart w:id="30" w:name="_Toc231082791"/>
       <w:r>
         <w:t>3.3 Variables explicativas</w:t>
       </w:r>
@@ -9812,7 +9812,7 @@
       <w:pPr>
         <w:pStyle w:val="Ttulo2"/>
       </w:pPr>
-      <w:bookmarkStart w:id="31" w:name="_Toc231082303"/>
+      <w:bookmarkStart w:id="31" w:name="_Toc231082792"/>
       <w:r>
         <w:t>3.4 Tratamiento de datos y frecuencias mixtas</w:t>
       </w:r>
@@ -9869,7 +9869,7 @@
       <w:pPr>
         <w:pStyle w:val="Ttulo2"/>
       </w:pPr>
-      <w:bookmarkStart w:id="32" w:name="_Toc231082304"/>
+      <w:bookmarkStart w:id="32" w:name="_Toc231082793"/>
       <w:r>
         <w:t>3.5 Datación de las fases del ciclo del cobre</w:t>
       </w:r>
@@ -9936,7 +9936,7 @@
       <w:pPr>
         <w:pStyle w:val="Ttulo2"/>
       </w:pPr>
-      <w:bookmarkStart w:id="33" w:name="_Toc231082305"/>
+      <w:bookmarkStart w:id="33" w:name="_Toc231082794"/>
       <w:r>
         <w:t>3.6 Estrategia econométrica</w:t>
       </w:r>
@@ -9946,7 +9946,7 @@
       <w:pPr>
         <w:pStyle w:val="Ttulo3"/>
       </w:pPr>
-      <w:bookmarkStart w:id="34" w:name="_Toc231082306"/>
+      <w:bookmarkStart w:id="34" w:name="_Toc231082795"/>
       <w:r>
         <w:t>3.6.1 Estacionariedad y orden de integración (OE1)</w:t>
       </w:r>
@@ -9986,7 +9986,7 @@
       <w:pPr>
         <w:pStyle w:val="Ttulo3"/>
       </w:pPr>
-      <w:bookmarkStart w:id="35" w:name="_Toc231082307"/>
+      <w:bookmarkStart w:id="35" w:name="_Toc231082796"/>
       <w:r>
         <w:t>3.6.2 Modelo de impacto: panel de efectos fijos (OE2)</w:t>
       </w:r>
@@ -10083,7 +10083,7 @@
       <w:pPr>
         <w:pStyle w:val="Ttulo3"/>
       </w:pPr>
-      <w:bookmarkStart w:id="36" w:name="_Toc231082308"/>
+      <w:bookmarkStart w:id="36" w:name="_Toc231082797"/>
       <w:r>
         <w:t>3.6.3 Relaciones de largo plazo: cointegración (OE3)</w:t>
       </w:r>
@@ -10181,7 +10181,7 @@
       <w:pPr>
         <w:pStyle w:val="Ttulo3"/>
       </w:pPr>
-      <w:bookmarkStart w:id="37" w:name="_Toc231082309"/>
+      <w:bookmarkStart w:id="37" w:name="_Toc231082798"/>
       <w:r>
         <w:t>3.6.4 Dinámica de shocks: VAR, impulso-respuesta y descomposición de varianza (OE4)</w:t>
       </w:r>
@@ -10304,7 +10304,7 @@
       <w:pPr>
         <w:pStyle w:val="Ttulo3"/>
       </w:pPr>
-      <w:bookmarkStart w:id="38" w:name="_Toc231082310"/>
+      <w:bookmarkStart w:id="38" w:name="_Toc231082799"/>
       <w:r>
         <w:t>3.6.5 Estabilidad por fases del ciclo (OE5)</w:t>
       </w:r>
@@ -10350,7 +10350,7 @@
       <w:pPr>
         <w:pStyle w:val="Ttulo3"/>
       </w:pPr>
-      <w:bookmarkStart w:id="39" w:name="_Toc231082311"/>
+      <w:bookmarkStart w:id="39" w:name="_Toc231082800"/>
       <w:r>
         <w:t>3.6.6 Comparación entre mercados: triangulación (OE6)</w:t>
       </w:r>
@@ -10404,7 +10404,7 @@
       <w:pPr>
         <w:pStyle w:val="Ttulo2"/>
       </w:pPr>
-      <w:bookmarkStart w:id="40" w:name="_Toc231082312"/>
+      <w:bookmarkStart w:id="40" w:name="_Toc231082801"/>
       <w:r>
         <w:t>3.7 Validación de supuestos y robustez</w:t>
       </w:r>
@@ -10454,7 +10454,7 @@
       <w:pPr>
         <w:pStyle w:val="Ttulo3"/>
       </w:pPr>
-      <w:bookmarkStart w:id="41" w:name="_Toc231082313"/>
+      <w:bookmarkStart w:id="41" w:name="_Toc231082802"/>
       <w:r>
         <w:lastRenderedPageBreak/>
         <w:t>Tabla 3.1 — Definición operativa de variables (resumen)</w:t>
@@ -10466,7 +10466,7 @@
         <w:pStyle w:val="Descripcin"/>
         <w:jc w:val="center"/>
       </w:pPr>
-      <w:bookmarkStart w:id="42" w:name="_Toc231082343"/>
+      <w:bookmarkStart w:id="42" w:name="_Toc231082832"/>
       <w:r>
         <w:rPr>
           <w:sz w:val="20"/>
@@ -11825,7 +11825,7 @@
       <w:pPr>
         <w:pStyle w:val="Ttulo1"/>
       </w:pPr>
-      <w:bookmarkStart w:id="43" w:name="_Toc231082314"/>
+      <w:bookmarkStart w:id="43" w:name="_Toc231082803"/>
       <w:r>
         <w:lastRenderedPageBreak/>
         <w:t>Capítulo 4 — Resultados y discusión</w:t>
@@ -11836,7 +11836,7 @@
       <w:pPr>
         <w:pStyle w:val="Ttulo2"/>
       </w:pPr>
-      <w:bookmarkStart w:id="44" w:name="_Toc231082315"/>
+      <w:bookmarkStart w:id="44" w:name="_Toc231082804"/>
       <w:r>
         <w:t>4.1 Análisis descriptivo y propiedades de las series (OE1)</w:t>
       </w:r>
@@ -11983,10 +11983,87 @@
       </w:r>
     </w:p>
     <w:p>
+      <w:r>
+        <w:t>Dado que el test de Pesaran detecta dependencia de sección cruzada en el panel (§4.7), se aplica</w:t>
+      </w:r>
+    </w:p>
+    <w:p>
+      <w:r>
+        <w:t xml:space="preserve">además la prueba de raíz unitaria de </w:t>
+      </w:r>
+      <w:r>
+        <w:rPr>
+          <w:b/>
+        </w:rPr>
+        <w:t>segunda generación CIPS</w:t>
+      </w:r>
+      <w:r>
+        <w:t xml:space="preserve"> (Pesaran, 2007), robusta a dicha</w:t>
+      </w:r>
+    </w:p>
+    <w:p>
+      <w:r>
+        <w:t>dependencia. Los resultados confirman de manera contundente la estructura supuesta: el panel de</w:t>
+      </w:r>
+    </w:p>
+    <w:p>
+      <w:r>
+        <w:rPr>
+          <w:b/>
+        </w:rPr>
+        <w:t>log-precios</w:t>
+      </w:r>
+      <w:r>
+        <w:t xml:space="preserve"> de las empresas no rechaza la raíz unitaria (CIPS = −2,29, por encima del valor</w:t>
+      </w:r>
+    </w:p>
+    <w:p>
+      <w:r>
+        <w:t xml:space="preserve">crítico al 5% de −2,57), comportándose como </w:t>
+      </w:r>
+      <w:r>
+        <w:rPr>
+          <w:b/>
+        </w:rPr>
+        <w:t>I(1)</w:t>
+      </w:r>
+      <w:r>
+        <w:t xml:space="preserve">, mientras que el panel de </w:t>
+      </w:r>
+      <w:r>
+        <w:rPr>
+          <w:b/>
+        </w:rPr>
+        <w:t>retornos</w:t>
+      </w:r>
+      <w:r>
+        <w:t xml:space="preserve"> la</w:t>
+      </w:r>
+    </w:p>
+    <w:p>
+      <w:r>
+        <w:t xml:space="preserve">rechaza con holgura (CIPS = −16,32), confirmándose como </w:t>
+      </w:r>
+      <w:r>
+        <w:rPr>
+          <w:b/>
+        </w:rPr>
+        <w:t>I(0)</w:t>
+      </w:r>
+      <w:r>
+        <w:t>. La doble vía del diseño queda así</w:t>
+      </w:r>
+    </w:p>
+    <w:p>
+      <w:r>
+        <w:t>validada también con métodos de panel apropiados para la dependencia transversal.</w:t>
+      </w:r>
+    </w:p>
+    <w:p>
       <w:pPr>
         <w:pStyle w:val="Ttulo2"/>
       </w:pPr>
-      <w:bookmarkStart w:id="45" w:name="_Toc231082316"/>
+      <w:bookmarkStart w:id="45" w:name="_Toc231082805"/>
       <w:r>
         <w:t>4.2 Determinantes de los retornos: global vs local (OE2)</w:t>
       </w:r>
@@ -12007,7 +12084,7 @@
         <w:pStyle w:val="Descripcin"/>
         <w:jc w:val="center"/>
       </w:pPr>
-      <w:bookmarkStart w:id="46" w:name="_Toc231082344"/>
+      <w:bookmarkStart w:id="46" w:name="_Toc231082833"/>
       <w:r>
         <w:rPr>
           <w:sz w:val="20"/>
@@ -12212,13 +12289,7 @@
               <w:rPr>
                 <w:sz w:val="20"/>
               </w:rPr>
-              <w:t xml:space="preserve">* </w:t>
-            </w:r>
-            <w:r>
-              <w:rPr>
-                <w:sz w:val="20"/>
-              </w:rPr>
-              <w:t>(sig.)</w:t>
+              <w:t>* (sig.)</w:t>
             </w:r>
           </w:p>
         </w:tc>
@@ -12502,6 +12573,7 @@
     <w:p/>
     <w:p>
       <w:r>
+        <w:lastRenderedPageBreak/>
         <w:t>Tres lecturas se desprenden:</w:t>
       </w:r>
     </w:p>
@@ -12555,7 +12627,6 @@
     </w:p>
     <w:p>
       <w:r>
-        <w:lastRenderedPageBreak/>
         <w:t xml:space="preserve">   del peso suele coincidir con episodios de aversión al riesgo y caída del cobre, de modo que el</w:t>
       </w:r>
     </w:p>
@@ -12605,8 +12676,9 @@
         <w:rPr>
           <w:noProof/>
         </w:rPr>
+        <w:lastRenderedPageBreak/>
         <w:drawing>
-          <wp:inline distT="0" distB="0" distL="0" distR="0" wp14:anchorId="018E6B7B" wp14:editId="4FBDF8D7">
+          <wp:inline distT="0" distB="0" distL="0" distR="0" wp14:anchorId="6421030B" wp14:editId="617EA1FF">
             <wp:extent cx="5394960" cy="2933107"/>
             <wp:effectExtent l="0" t="0" r="0" b="0"/>
             <wp:docPr id="1" name="Picture 1"/>
@@ -12647,7 +12719,7 @@
         <w:pStyle w:val="Descripcin"/>
         <w:jc w:val="center"/>
       </w:pPr>
-      <w:bookmarkStart w:id="47" w:name="_Toc231082357"/>
+      <w:bookmarkStart w:id="47" w:name="_Toc231082846"/>
       <w:r>
         <w:rPr>
           <w:sz w:val="20"/>
@@ -12684,7 +12756,7 @@
       <w:pPr>
         <w:pStyle w:val="Ttulo2"/>
       </w:pPr>
-      <w:bookmarkStart w:id="48" w:name="_Toc231082317"/>
+      <w:bookmarkStart w:id="48" w:name="_Toc231082806"/>
       <w:r>
         <w:t>4.3 Relaciones de largo plazo (OE3)</w:t>
       </w:r>
@@ -12706,16 +12778,15 @@
     </w:p>
     <w:p>
       <w:r>
-        <w:t>las series en nivel (valor de la acción, cobre, tipo de cambio) detecta **un vector de</w:t>
-      </w:r>
-    </w:p>
-    <w:p>
-      <w:r>
-        <w:lastRenderedPageBreak/>
-        <w:t xml:space="preserve">cointegración** </w:t>
-      </w:r>
-      <w:r>
-        <w:t>(estadístico de traza 32,1 &gt; 29,8 al 95%), lo que sugiere una relación de equilibrio</w:t>
+        <w:t xml:space="preserve">las </w:t>
+      </w:r>
+      <w:r>
+        <w:t>series en nivel (valor de la acción, cobre, tipo de cambio) detecta **un vector de</w:t>
+      </w:r>
+    </w:p>
+    <w:p>
+      <w:r>
+        <w:t>cointegración** (estadístico de traza 32,1 &gt; 29,8 al 95%), lo que sugiere una relación de equilibrio</w:t>
       </w:r>
     </w:p>
     <w:p>
@@ -12779,6 +12850,7 @@
     </w:p>
     <w:p>
       <w:r>
+        <w:lastRenderedPageBreak/>
         <w:t xml:space="preserve">cointegración, </w:t>
       </w:r>
       <w:r>
@@ -12805,10 +12877,7 @@
         <w:t>6,68</w:t>
       </w:r>
       <w:r>
-        <w:t xml:space="preserve">, </w:t>
-      </w:r>
-      <w:r>
-        <w:t>inferior al valor crítico al 5% (−4,92), de modo que **se rechaza la ausencia de</w:t>
+        <w:t>, inferior al valor crítico al 5% (−4,92), de modo que **se rechaza la ausencia de</w:t>
       </w:r>
     </w:p>
     <w:p>
@@ -12854,9 +12923,8 @@
       <w:pPr>
         <w:pStyle w:val="Ttulo2"/>
       </w:pPr>
-      <w:bookmarkStart w:id="49" w:name="_Toc231082318"/>
-      <w:r>
-        <w:lastRenderedPageBreak/>
+      <w:bookmarkStart w:id="49" w:name="_Toc231082807"/>
+      <w:r>
         <w:t>4.4 Dinámica de shocks (OE4)</w:t>
       </w:r>
       <w:bookmarkEnd w:id="49"/>
@@ -12876,7 +12944,7 @@
         <w:pStyle w:val="Descripcin"/>
         <w:jc w:val="center"/>
       </w:pPr>
-      <w:bookmarkStart w:id="50" w:name="_Toc231082345"/>
+      <w:bookmarkStart w:id="50" w:name="_Toc231082834"/>
       <w:r>
         <w:rPr>
           <w:sz w:val="20"/>
@@ -12974,7 +13042,13 @@
               <w:rPr>
                 <w:sz w:val="20"/>
               </w:rPr>
-              <w:t>Componente propio (idiosincrático)</w:t>
+              <w:t xml:space="preserve">Componente propio </w:t>
+            </w:r>
+            <w:r>
+              <w:rPr>
+                <w:sz w:val="20"/>
+              </w:rPr>
+              <w:t>(idiosincrático)</w:t>
             </w:r>
           </w:p>
         </w:tc>
@@ -13141,6 +13215,7 @@
     <w:p/>
     <w:p>
       <w:r>
+        <w:lastRenderedPageBreak/>
         <w:t xml:space="preserve">La causalidad de Granger confirma que el precio del cobre </w:t>
       </w:r>
       <w:r>
@@ -13206,9 +13281,8 @@
         <w:rPr>
           <w:noProof/>
         </w:rPr>
-        <w:lastRenderedPageBreak/>
         <w:drawing>
-          <wp:inline distT="0" distB="0" distL="0" distR="0" wp14:anchorId="460041EC" wp14:editId="12EDDCAB">
+          <wp:inline distT="0" distB="0" distL="0" distR="0" wp14:anchorId="5219AE25" wp14:editId="3E3A9A9B">
             <wp:extent cx="5394960" cy="4026860"/>
             <wp:effectExtent l="0" t="0" r="0" b="0"/>
             <wp:docPr id="2" name="Picture 2"/>
@@ -13249,7 +13323,7 @@
         <w:pStyle w:val="Descripcin"/>
         <w:jc w:val="center"/>
       </w:pPr>
-      <w:bookmarkStart w:id="51" w:name="_Toc231082358"/>
+      <w:bookmarkStart w:id="51" w:name="_Toc231082847"/>
       <w:r>
         <w:rPr>
           <w:sz w:val="20"/>
@@ -13284,10 +13358,11 @@
     </w:p>
     <w:p>
       <w:r>
-        <w:t xml:space="preserve">La función impulso-respuesta </w:t>
-      </w:r>
-      <w:r>
-        <w:t>cuantifica la reacción dinámica del retorno ante un shock de una</w:t>
+        <w:lastRenderedPageBreak/>
+        <w:t xml:space="preserve">La función impulso-respuesta cuantifica la reacción dinámica del retorno ante un </w:t>
+      </w:r>
+      <w:r>
+        <w:t>shock de una</w:t>
       </w:r>
     </w:p>
     <w:p>
@@ -13322,9 +13397,8 @@
         <w:rPr>
           <w:noProof/>
         </w:rPr>
-        <w:lastRenderedPageBreak/>
         <w:drawing>
-          <wp:inline distT="0" distB="0" distL="0" distR="0" wp14:anchorId="4A374F1B" wp14:editId="46E2A77C">
+          <wp:inline distT="0" distB="0" distL="0" distR="0" wp14:anchorId="694A0BFD" wp14:editId="58BAE763">
             <wp:extent cx="5394960" cy="2620409"/>
             <wp:effectExtent l="0" t="0" r="0" b="0"/>
             <wp:docPr id="3" name="Picture 3"/>
@@ -13365,7 +13439,7 @@
         <w:pStyle w:val="Descripcin"/>
         <w:jc w:val="center"/>
       </w:pPr>
-      <w:bookmarkStart w:id="52" w:name="_Toc231082359"/>
+      <w:bookmarkStart w:id="52" w:name="_Toc231082848"/>
       <w:r>
         <w:rPr>
           <w:sz w:val="20"/>
@@ -13402,7 +13476,7 @@
       <w:pPr>
         <w:pStyle w:val="Ttulo2"/>
       </w:pPr>
-      <w:bookmarkStart w:id="53" w:name="_Toc231082319"/>
+      <w:bookmarkStart w:id="53" w:name="_Toc231082808"/>
       <w:r>
         <w:t>4.5 Estabilidad por fases del ciclo del cobre (OE5)</w:t>
       </w:r>
@@ -13476,6 +13550,7 @@
     </w:p>
     <w:p>
       <w:r>
+        <w:lastRenderedPageBreak/>
         <w:t>La lectura es que, en esta especificación preliminar, **la sensibilidad de los retornos al precio</w:t>
       </w:r>
     </w:p>
@@ -13507,9 +13582,8 @@
         <w:rPr>
           <w:noProof/>
         </w:rPr>
-        <w:lastRenderedPageBreak/>
         <w:drawing>
-          <wp:inline distT="0" distB="0" distL="0" distR="0" wp14:anchorId="00401060" wp14:editId="34C0DB90">
+          <wp:inline distT="0" distB="0" distL="0" distR="0" wp14:anchorId="154BB22F" wp14:editId="13FF7A29">
             <wp:extent cx="5394960" cy="2449752"/>
             <wp:effectExtent l="0" t="0" r="0" b="0"/>
             <wp:docPr id="4" name="Picture 4"/>
@@ -13550,7 +13624,7 @@
         <w:pStyle w:val="Descripcin"/>
         <w:jc w:val="center"/>
       </w:pPr>
-      <w:bookmarkStart w:id="54" w:name="_Toc231082360"/>
+      <w:bookmarkStart w:id="54" w:name="_Toc231082849"/>
       <w:r>
         <w:rPr>
           <w:sz w:val="20"/>
@@ -13587,7 +13661,7 @@
       <w:pPr>
         <w:pStyle w:val="Ttulo2"/>
       </w:pPr>
-      <w:bookmarkStart w:id="55" w:name="_Toc231082320"/>
+      <w:bookmarkStart w:id="55" w:name="_Toc231082809"/>
       <w:r>
         <w:t>4.6 Comparación entre mercados: triangulación (OE6)</w:t>
       </w:r>
@@ -13608,7 +13682,7 @@
         <w:pStyle w:val="Descripcin"/>
         <w:jc w:val="center"/>
       </w:pPr>
-      <w:bookmarkStart w:id="56" w:name="_Toc231082346"/>
+      <w:bookmarkStart w:id="56" w:name="_Toc231082835"/>
       <w:r>
         <w:rPr>
           <w:sz w:val="20"/>
@@ -13923,6 +13997,7 @@
               <w:rPr>
                 <w:sz w:val="20"/>
               </w:rPr>
+              <w:lastRenderedPageBreak/>
               <w:t>C · minería Chile</w:t>
             </w:r>
           </w:p>
@@ -14004,10 +14079,7 @@
         <w:pStyle w:val="Listaconnmeros"/>
       </w:pPr>
       <w:r>
-        <w:t xml:space="preserve">**La sensibilidad al cobre es similar entre el </w:t>
-      </w:r>
-      <w:r>
-        <w:t>cobre puro internacional (0,571) y el local</w:t>
+        <w:t>**La sensibilidad al cobre es similar entre el cobre puro internacional (0,571) y el local</w:t>
       </w:r>
     </w:p>
     <w:p>
@@ -14022,7 +14094,6 @@
     </w:p>
     <w:p>
       <w:r>
-        <w:lastRenderedPageBreak/>
         <w:t xml:space="preserve">   menor sensibilidad de la muestra C se debe a la </w:t>
       </w:r>
       <w:r>
@@ -14049,7 +14120,7 @@
           <w:noProof/>
         </w:rPr>
         <w:drawing>
-          <wp:inline distT="0" distB="0" distL="0" distR="0" wp14:anchorId="65B3EEFD" wp14:editId="42E459AB">
+          <wp:inline distT="0" distB="0" distL="0" distR="0" wp14:anchorId="4AFE3C81" wp14:editId="1663F0E4">
             <wp:extent cx="5394960" cy="2718240"/>
             <wp:effectExtent l="0" t="0" r="0" b="0"/>
             <wp:docPr id="5" name="Picture 5"/>
@@ -14090,7 +14161,7 @@
         <w:pStyle w:val="Descripcin"/>
         <w:jc w:val="center"/>
       </w:pPr>
-      <w:bookmarkStart w:id="57" w:name="_Toc231082361"/>
+      <w:bookmarkStart w:id="57" w:name="_Toc231082850"/>
       <w:r>
         <w:rPr>
           <w:sz w:val="20"/>
@@ -14152,6 +14223,7 @@
     </w:p>
     <w:p>
       <w:r>
+        <w:lastRenderedPageBreak/>
         <w:t xml:space="preserve">   modesta y requiere confirmación con el conjunto de datos completo y pruebas formales de igualdad</w:t>
       </w:r>
     </w:p>
@@ -14164,7 +14236,7 @@
       <w:pPr>
         <w:pStyle w:val="Ttulo2"/>
       </w:pPr>
-      <w:bookmarkStart w:id="58" w:name="_Toc231082321"/>
+      <w:bookmarkStart w:id="58" w:name="_Toc231082810"/>
       <w:r>
         <w:t>4.7 Diagnósticos y robustez</w:t>
       </w:r>
@@ -14197,7 +14269,6 @@
     </w:p>
     <w:p>
       <w:r>
-        <w:lastRenderedPageBreak/>
         <w:t xml:space="preserve">Este resultado </w:t>
       </w:r>
       <w:r>
@@ -14212,7 +14283,10 @@
     </w:p>
     <w:p>
       <w:r>
-        <w:t>cinco productoras comparten un factor común —señaladamente el precio del cobre— que induce</w:t>
+        <w:t xml:space="preserve">cinco productoras comparten un factor común —señaladamente el </w:t>
+      </w:r>
+      <w:r>
+        <w:t>precio del cobre— que induce</w:t>
       </w:r>
     </w:p>
     <w:p>
@@ -14264,10 +14338,7 @@
     </w:p>
     <w:p>
       <w:r>
-        <w:t xml:space="preserve">la atención de los mercados sobre el cobre en el contexto de la transición </w:t>
-      </w:r>
-      <w:r>
-        <w:t>energética, y confirma</w:t>
+        <w:t>la atención de los mercados sobre el cobre en el contexto de la transición energética, y confirma</w:t>
       </w:r>
     </w:p>
     <w:p>
@@ -14297,12 +14368,16 @@
     </w:p>
     <w:p>
       <w:r>
+        <w:lastRenderedPageBreak/>
         <w:t>de heterocedasticidad condicional (estadístico 41,1; p = 0,000), lo que justifica modelar la</w:t>
       </w:r>
     </w:p>
     <w:p>
       <w:r>
-        <w:t>varianza con un GARCH(1,1). El modelo estimado sobre los retornos de la cartera arroja una</w:t>
+        <w:t xml:space="preserve">varianza con un </w:t>
+      </w:r>
+      <w:r>
+        <w:t>GARCH(1,1). El modelo estimado sobre los retornos de la cartera arroja una</w:t>
       </w:r>
     </w:p>
     <w:p>
@@ -14337,7 +14412,6 @@
     </w:p>
     <w:p>
       <w:r>
-        <w:lastRenderedPageBreak/>
         <w:t>normal, característica de los retornos financieros. La extensión a un modelo asimétrico</w:t>
       </w:r>
     </w:p>
@@ -14431,6 +14505,7 @@
     </w:p>
     <w:p>
       <w:r>
+        <w:lastRenderedPageBreak/>
         <w:t xml:space="preserve">mayor impacto sobre el retorno es el </w:t>
       </w:r>
       <w:r>
@@ -14477,7 +14552,6 @@
     </w:p>
     <w:p>
       <w:r>
-        <w:lastRenderedPageBreak/>
         <w:t xml:space="preserve">respuesta del retorno a un shock del cobre mediante </w:t>
       </w:r>
       <w:r>
@@ -14523,7 +14597,7 @@
           <w:noProof/>
         </w:rPr>
         <w:drawing>
-          <wp:inline distT="0" distB="0" distL="0" distR="0" wp14:anchorId="4D50D554" wp14:editId="3114DA0C">
+          <wp:inline distT="0" distB="0" distL="0" distR="0" wp14:anchorId="131D0E02" wp14:editId="5CAF1886">
             <wp:extent cx="5394960" cy="2620409"/>
             <wp:effectExtent l="0" t="0" r="0" b="0"/>
             <wp:docPr id="6" name="Picture 6"/>
@@ -14564,7 +14638,7 @@
         <w:pStyle w:val="Descripcin"/>
         <w:jc w:val="center"/>
       </w:pPr>
-      <w:bookmarkStart w:id="59" w:name="_Toc231082362"/>
+      <w:bookmarkStart w:id="59" w:name="_Toc231082851"/>
       <w:r>
         <w:rPr>
           <w:sz w:val="20"/>
@@ -14601,9 +14675,13 @@
       <w:pPr>
         <w:pStyle w:val="Ttulo2"/>
       </w:pPr>
-      <w:bookmarkStart w:id="60" w:name="_Toc231082322"/>
-      <w:r>
-        <w:t>4.8 Discusión integrada</w:t>
+      <w:bookmarkStart w:id="60" w:name="_Toc231082811"/>
+      <w:r>
+        <w:lastRenderedPageBreak/>
+        <w:t xml:space="preserve">4.8 Discusión </w:t>
+      </w:r>
+      <w:r>
+        <w:t>integrada</w:t>
       </w:r>
       <w:bookmarkEnd w:id="60"/>
     </w:p>
@@ -14644,7 +14722,6 @@
     </w:p>
     <w:p>
       <w:r>
-        <w:lastRenderedPageBreak/>
         <w:t>efecto negativo significativo cuyo signo refleja la doble naturaleza —competitividad y riesgo—</w:t>
       </w:r>
     </w:p>
@@ -14756,6 +14833,7 @@
     </w:p>
     <w:p>
       <w:r>
+        <w:lastRenderedPageBreak/>
         <w:t xml:space="preserve">subperíodos, la </w:t>
       </w:r>
       <w:r>
@@ -14788,7 +14866,7 @@
       <w:pPr>
         <w:pStyle w:val="Ttulo1"/>
       </w:pPr>
-      <w:bookmarkStart w:id="61" w:name="_Toc231082323"/>
+      <w:bookmarkStart w:id="61" w:name="_Toc231082812"/>
       <w:r>
         <w:lastRenderedPageBreak/>
         <w:t>Capítulo 5 — Conclusiones</w:t>
@@ -14799,7 +14877,7 @@
       <w:pPr>
         <w:pStyle w:val="Ttulo2"/>
       </w:pPr>
-      <w:bookmarkStart w:id="62" w:name="_Toc231082324"/>
+      <w:bookmarkStart w:id="62" w:name="_Toc231082813"/>
       <w:r>
         <w:t>5.1 Síntesis de los hallazgos</w:t>
       </w:r>
@@ -14870,7 +14948,10 @@
     </w:p>
     <w:p>
       <w:r>
-        <w:t>La dimensión comparativa, distintiva de este estudio, aporta una primera señal de **transmisión</w:t>
+        <w:t xml:space="preserve">La </w:t>
+      </w:r>
+      <w:r>
+        <w:t>dimensión comparativa, distintiva de este estudio, aporta una primera señal de **transmisión</w:t>
       </w:r>
     </w:p>
     <w:p>
@@ -14892,7 +14973,7 @@
       <w:pPr>
         <w:pStyle w:val="Ttulo2"/>
       </w:pPr>
-      <w:bookmarkStart w:id="63" w:name="_Toc231082325"/>
+      <w:bookmarkStart w:id="63" w:name="_Toc231082814"/>
       <w:r>
         <w:lastRenderedPageBreak/>
         <w:t>5.2 Implicancias</w:t>
@@ -14965,7 +15046,7 @@
       <w:pPr>
         <w:pStyle w:val="Ttulo2"/>
       </w:pPr>
-      <w:bookmarkStart w:id="64" w:name="_Toc231082326"/>
+      <w:bookmarkStart w:id="64" w:name="_Toc231082815"/>
       <w:r>
         <w:t>5.3 Limitaciones</w:t>
       </w:r>
@@ -15015,7 +15096,7 @@
       <w:pPr>
         <w:pStyle w:val="Ttulo2"/>
       </w:pPr>
-      <w:bookmarkStart w:id="65" w:name="_Toc231082327"/>
+      <w:bookmarkStart w:id="65" w:name="_Toc231082816"/>
       <w:r>
         <w:t>5.4 Líneas futuras de investigación</w:t>
       </w:r>
@@ -15051,7 +15132,7 @@
       <w:pPr>
         <w:pStyle w:val="Ttulo1"/>
       </w:pPr>
-      <w:bookmarkStart w:id="66" w:name="_Toc231082328"/>
+      <w:bookmarkStart w:id="66" w:name="_Toc231082817"/>
       <w:r>
         <w:lastRenderedPageBreak/>
         <w:t>Referencias</w:t>
@@ -15075,10 +15156,10 @@
     </w:p>
     <w:p>
       <w:r>
-        <w:t xml:space="preserve">Benjamini, Y., &amp; </w:t>
-      </w:r>
-      <w:r>
-        <w:t>Hochberg, Y. (1995). Controlling the false discovery rate: A practical and powerful approach to multiple testing. *Journal of the Royal Statistical Society: Series B*, 57(1), 289–300.</w:t>
+        <w:t xml:space="preserve">Benjamini, Y., &amp; Hochberg, Y. (1995). Controlling the false </w:t>
+      </w:r>
+      <w:r>
+        <w:t>discovery rate: A practical and powerful approach to multiple testing. *Journal of the Royal Statistical Society: Series B*, 57(1), 289–300.</w:t>
       </w:r>
     </w:p>
     <w:p>
@@ -15169,7 +15250,10 @@
     </w:p>
     <w:p>
       <w:r>
-        <w:t>Hamilton, J. D. (1989). A new approach to the economic analysis of nonstationary time series and the business cycle. *Econometrica*, 57(2), 357–384.</w:t>
+        <w:t xml:space="preserve">Hamilton, J. D. (1989). A new </w:t>
+      </w:r>
+      <w:r>
+        <w:t>approach to the economic analysis of nonstationary time series and the business cycle. *Econometrica*, 57(2), 357–384.</w:t>
       </w:r>
     </w:p>
     <w:p>
@@ -15215,23 +15299,20 @@
     </w:p>
     <w:p>
       <w:r>
-        <w:t xml:space="preserve">Pesaran, M. H. (2007). A simple panel unit root test in the presence of cross-section dependence. *Journal of Applied </w:t>
-      </w:r>
-      <w:r>
-        <w:t>Econometrics*, 22(2), 265–312.</w:t>
-      </w:r>
-    </w:p>
-    <w:p>
-      <w:r>
-        <w:t>Pesaran, M. H., &amp; Shin, Y. (1998). Generalized impulse response analysis in linear multivariate models. *Economics Letters*, 58(1), 17–29.</w:t>
-      </w:r>
-    </w:p>
-    <w:p>
-      <w:r>
-        <w:t xml:space="preserve">Pesaran, M. H., Shin, Y., &amp; Smith, R. J. (2001). Bounds testing approaches to the </w:t>
-      </w:r>
-      <w:r>
-        <w:t>analysis of level relationships. *Journal of Applied Econometrics*, 16(3), 289–326.</w:t>
+        <w:t>Pesaran, M. H. (2007). A simple panel unit root test in the presence of cross-section dependence. *Journal of Applied Econometrics*, 22(2), 265–312.</w:t>
+      </w:r>
+    </w:p>
+    <w:p>
+      <w:r>
+        <w:t xml:space="preserve">Pesaran, M. H., &amp; Shin, Y. </w:t>
+      </w:r>
+      <w:r>
+        <w:t>(1998). Generalized impulse response analysis in linear multivariate models. *Economics Letters*, 58(1), 17–29.</w:t>
+      </w:r>
+    </w:p>
+    <w:p>
+      <w:r>
+        <w:t>Pesaran, M. H., Shin, Y., &amp; Smith, R. J. (2001). Bounds testing approaches to the analysis of level relationships. *Journal of Applied Econometrics*, 16(3), 289–326.</w:t>
       </w:r>
     </w:p>
     <w:p>
@@ -15294,7 +15375,7 @@
       <w:pPr>
         <w:pStyle w:val="Ttulo1"/>
       </w:pPr>
-      <w:bookmarkStart w:id="67" w:name="_Toc231082329"/>
+      <w:bookmarkStart w:id="67" w:name="_Toc231082818"/>
       <w:r>
         <w:lastRenderedPageBreak/>
         <w:t>Anexos</w:t>
@@ -15305,7 +15386,7 @@
       <w:pPr>
         <w:pStyle w:val="Ttulo2"/>
       </w:pPr>
-      <w:bookmarkStart w:id="68" w:name="_Toc231082330"/>
+      <w:bookmarkStart w:id="68" w:name="_Toc231082819"/>
       <w:r>
         <w:t>Anexo A. Estadística descriptiva</w:t>
       </w:r>
@@ -15316,7 +15397,7 @@
         <w:pStyle w:val="Descripcin"/>
         <w:jc w:val="center"/>
       </w:pPr>
-      <w:bookmarkStart w:id="69" w:name="_Toc231082347"/>
+      <w:bookmarkStart w:id="69" w:name="_Toc231082836"/>
       <w:r>
         <w:rPr>
           <w:sz w:val="20"/>
@@ -16818,9 +16899,12 @@
       <w:pPr>
         <w:pStyle w:val="Ttulo2"/>
       </w:pPr>
-      <w:bookmarkStart w:id="70" w:name="_Toc231082331"/>
-      <w:r>
-        <w:t>Anexo B. Matriz de correlación de los factores</w:t>
+      <w:bookmarkStart w:id="70" w:name="_Toc231082820"/>
+      <w:r>
+        <w:t xml:space="preserve">Anexo B. </w:t>
+      </w:r>
+      <w:r>
+        <w:t>Matriz de correlación de los factores</w:t>
       </w:r>
       <w:bookmarkEnd w:id="70"/>
     </w:p>
@@ -16829,7 +16913,7 @@
         <w:pStyle w:val="Descripcin"/>
         <w:jc w:val="center"/>
       </w:pPr>
-      <w:bookmarkStart w:id="71" w:name="_Toc231082348"/>
+      <w:bookmarkStart w:id="71" w:name="_Toc231082837"/>
       <w:r>
         <w:rPr>
           <w:sz w:val="20"/>
@@ -17187,7 +17271,13 @@
               <w:rPr>
                 <w:sz w:val="20"/>
               </w:rPr>
-              <w:t>Δ Cobre</w:t>
+              <w:t xml:space="preserve">Δ </w:t>
+            </w:r>
+            <w:r>
+              <w:rPr>
+                <w:sz w:val="20"/>
+              </w:rPr>
+              <w:t>Cobre</w:t>
             </w:r>
           </w:p>
         </w:tc>
@@ -18069,13 +18159,7 @@
               <w:rPr>
                 <w:sz w:val="20"/>
               </w:rPr>
-              <w:t xml:space="preserve">Δ </w:t>
-            </w:r>
-            <w:r>
-              <w:rPr>
-                <w:sz w:val="20"/>
-              </w:rPr>
-              <w:t>Actividad local</w:t>
+              <w:t>Δ Actividad local</w:t>
             </w:r>
           </w:p>
         </w:tc>
@@ -18214,7 +18298,7 @@
       <w:pPr>
         <w:pStyle w:val="Ttulo2"/>
       </w:pPr>
-      <w:bookmarkStart w:id="72" w:name="_Toc231082332"/>
+      <w:bookmarkStart w:id="72" w:name="_Toc231082821"/>
       <w:r>
         <w:t>Anexo C. Pruebas de raíz unitaria y orden de integración</w:t>
       </w:r>
@@ -18225,7 +18309,7 @@
         <w:pStyle w:val="Descripcin"/>
         <w:jc w:val="center"/>
       </w:pPr>
-      <w:bookmarkStart w:id="73" w:name="_Toc231082349"/>
+      <w:bookmarkStart w:id="73" w:name="_Toc231082838"/>
       <w:r>
         <w:rPr>
           <w:sz w:val="20"/>
@@ -18794,7 +18878,7 @@
       <w:pPr>
         <w:pStyle w:val="Ttulo2"/>
       </w:pPr>
-      <w:bookmarkStart w:id="74" w:name="_Toc231082333"/>
+      <w:bookmarkStart w:id="74" w:name="_Toc231082822"/>
       <w:r>
         <w:t>Anexo D. Resultados completos del modelo de panel</w:t>
       </w:r>
@@ -18804,7 +18888,7 @@
       <w:pPr>
         <w:pStyle w:val="Ttulo3"/>
       </w:pPr>
-      <w:bookmarkStart w:id="75" w:name="_Toc231082334"/>
+      <w:bookmarkStart w:id="75" w:name="_Toc231082823"/>
       <w:r>
         <w:t>D.1 Muestra B — cobre, mercado internacional</w:t>
       </w:r>
@@ -18815,7 +18899,7 @@
         <w:pStyle w:val="Descripcin"/>
         <w:jc w:val="center"/>
       </w:pPr>
-      <w:bookmarkStart w:id="76" w:name="_Toc231082350"/>
+      <w:bookmarkStart w:id="76" w:name="_Toc231082839"/>
       <w:r>
         <w:rPr>
           <w:sz w:val="20"/>
@@ -19628,7 +19712,7 @@
       <w:pPr>
         <w:pStyle w:val="Ttulo3"/>
       </w:pPr>
-      <w:bookmarkStart w:id="77" w:name="_Toc231082335"/>
+      <w:bookmarkStart w:id="77" w:name="_Toc231082824"/>
       <w:r>
         <w:t>D.2 Muestra A — cobre, mercado chileno (Pucobre)</w:t>
       </w:r>
@@ -19639,7 +19723,7 @@
         <w:pStyle w:val="Descripcin"/>
         <w:jc w:val="center"/>
       </w:pPr>
-      <w:bookmarkStart w:id="78" w:name="_Toc231082351"/>
+      <w:bookmarkStart w:id="78" w:name="_Toc231082840"/>
       <w:r>
         <w:rPr>
           <w:sz w:val="20"/>
@@ -20456,7 +20540,7 @@
       <w:pPr>
         <w:pStyle w:val="Ttulo3"/>
       </w:pPr>
-      <w:bookmarkStart w:id="79" w:name="_Toc231082336"/>
+      <w:bookmarkStart w:id="79" w:name="_Toc231082825"/>
       <w:r>
         <w:t xml:space="preserve">D.3 </w:t>
       </w:r>
@@ -20470,7 +20554,7 @@
         <w:pStyle w:val="Descripcin"/>
         <w:jc w:val="center"/>
       </w:pPr>
-      <w:bookmarkStart w:id="80" w:name="_Toc231082352"/>
+      <w:bookmarkStart w:id="80" w:name="_Toc231082841"/>
       <w:r>
         <w:rPr>
           <w:sz w:val="20"/>
@@ -21280,7 +21364,7 @@
       <w:pPr>
         <w:pStyle w:val="Ttulo2"/>
       </w:pPr>
-      <w:bookmarkStart w:id="81" w:name="_Toc231082337"/>
+      <w:bookmarkStart w:id="81" w:name="_Toc231082826"/>
       <w:r>
         <w:t xml:space="preserve">Anexo E. </w:t>
       </w:r>
@@ -21294,7 +21378,7 @@
         <w:pStyle w:val="Descripcin"/>
         <w:jc w:val="center"/>
       </w:pPr>
-      <w:bookmarkStart w:id="82" w:name="_Toc231082353"/>
+      <w:bookmarkStart w:id="82" w:name="_Toc231082842"/>
       <w:r>
         <w:rPr>
           <w:sz w:val="20"/>
@@ -21749,7 +21833,7 @@
       <w:pPr>
         <w:pStyle w:val="Ttulo2"/>
       </w:pPr>
-      <w:bookmarkStart w:id="83" w:name="_Toc231082338"/>
+      <w:bookmarkStart w:id="83" w:name="_Toc231082827"/>
       <w:r>
         <w:t>Anexo F. Descomposición de varianza (FEVD) por horizonte — muestra B</w:t>
       </w:r>
@@ -21760,7 +21844,7 @@
         <w:pStyle w:val="Descripcin"/>
         <w:jc w:val="center"/>
       </w:pPr>
-      <w:bookmarkStart w:id="84" w:name="_Toc231082354"/>
+      <w:bookmarkStart w:id="84" w:name="_Toc231082843"/>
       <w:r>
         <w:rPr>
           <w:sz w:val="20"/>
@@ -22321,7 +22405,7 @@
       <w:pPr>
         <w:pStyle w:val="Ttulo2"/>
       </w:pPr>
-      <w:bookmarkStart w:id="85" w:name="_Toc231082339"/>
+      <w:bookmarkStart w:id="85" w:name="_Toc231082828"/>
       <w:r>
         <w:t>Anexo G. Fuentes de datos</w:t>
       </w:r>
@@ -22332,7 +22416,7 @@
         <w:pStyle w:val="Descripcin"/>
         <w:jc w:val="center"/>
       </w:pPr>
-      <w:bookmarkStart w:id="86" w:name="_Toc231082355"/>
+      <w:bookmarkStart w:id="86" w:name="_Toc231082844"/>
       <w:r>
         <w:rPr>
           <w:sz w:val="20"/>
@@ -23126,7 +23210,7 @@
       <w:pPr>
         <w:pStyle w:val="Ttulo2"/>
       </w:pPr>
-      <w:bookmarkStart w:id="87" w:name="_Toc231082340"/>
+      <w:bookmarkStart w:id="87" w:name="_Toc231082829"/>
       <w:r>
         <w:lastRenderedPageBreak/>
         <w:t>Anexo H. Disponibilidad del código</w:t>
@@ -23145,7 +23229,7 @@
       <w:pPr>
         <w:pStyle w:val="Ttulo2"/>
       </w:pPr>
-      <w:bookmarkStart w:id="88" w:name="_Toc231082341"/>
+      <w:bookmarkStart w:id="88" w:name="_Toc231082830"/>
       <w:r>
         <w:t>Anexo I. Extensión predictiva: ¿explican o anticipan?</w:t>
       </w:r>
@@ -23170,7 +23254,7 @@
         <w:pStyle w:val="Descripcin"/>
         <w:jc w:val="center"/>
       </w:pPr>
-      <w:bookmarkStart w:id="89" w:name="_Toc231082356"/>
+      <w:bookmarkStart w:id="89" w:name="_Toc231082845"/>
       <w:r>
         <w:rPr>
           <w:sz w:val="20"/>
@@ -23772,7 +23856,7 @@
       <w:pPr>
         <w:pStyle w:val="Ttulo1"/>
       </w:pPr>
-      <w:bookmarkStart w:id="90" w:name="_Toc231082342"/>
+      <w:bookmarkStart w:id="90" w:name="_Toc231082831"/>
       <w:r>
         <w:lastRenderedPageBreak/>
         <w:t>Glosario de términos econométricos</w:t>
@@ -24362,31 +24446,31 @@
       </w:rPr>
     </w:lvl>
   </w:abstractNum>
-  <w:num w:numId="1" w16cid:durableId="1602879720">
+  <w:num w:numId="1" w16cid:durableId="565410877">
     <w:abstractNumId w:val="8"/>
   </w:num>
-  <w:num w:numId="2" w16cid:durableId="412431591">
+  <w:num w:numId="2" w16cid:durableId="1530217870">
     <w:abstractNumId w:val="6"/>
   </w:num>
-  <w:num w:numId="3" w16cid:durableId="384183837">
+  <w:num w:numId="3" w16cid:durableId="1201043398">
     <w:abstractNumId w:val="5"/>
   </w:num>
-  <w:num w:numId="4" w16cid:durableId="1053039108">
+  <w:num w:numId="4" w16cid:durableId="1386638853">
     <w:abstractNumId w:val="4"/>
   </w:num>
-  <w:num w:numId="5" w16cid:durableId="1508328494">
+  <w:num w:numId="5" w16cid:durableId="1047223215">
     <w:abstractNumId w:val="7"/>
   </w:num>
-  <w:num w:numId="6" w16cid:durableId="449207472">
+  <w:num w:numId="6" w16cid:durableId="1581406479">
     <w:abstractNumId w:val="3"/>
   </w:num>
-  <w:num w:numId="7" w16cid:durableId="1385450663">
+  <w:num w:numId="7" w16cid:durableId="1307710083">
     <w:abstractNumId w:val="2"/>
   </w:num>
-  <w:num w:numId="8" w16cid:durableId="892932886">
+  <w:num w:numId="8" w16cid:durableId="1945333727">
     <w:abstractNumId w:val="1"/>
   </w:num>
-  <w:num w:numId="9" w16cid:durableId="1207520874">
+  <w:num w:numId="9" w16cid:durableId="407121588">
     <w:abstractNumId w:val="0"/>
   </w:num>
 </w:numbering>
@@ -35778,7 +35862,7 @@
     <w:autoRedefine/>
     <w:uiPriority w:val="39"/>
     <w:unhideWhenUsed/>
-    <w:rsid w:val="00914A83"/>
+    <w:rsid w:val="00CA5D84"/>
     <w:pPr>
       <w:spacing w:after="100"/>
     </w:pPr>
@@ -35790,7 +35874,7 @@
     <w:autoRedefine/>
     <w:uiPriority w:val="39"/>
     <w:unhideWhenUsed/>
-    <w:rsid w:val="00914A83"/>
+    <w:rsid w:val="00CA5D84"/>
     <w:pPr>
       <w:spacing w:after="100"/>
       <w:ind w:left="240"/>
@@ -35803,7 +35887,7 @@
     <w:autoRedefine/>
     <w:uiPriority w:val="39"/>
     <w:unhideWhenUsed/>
-    <w:rsid w:val="00914A83"/>
+    <w:rsid w:val="00CA5D84"/>
     <w:pPr>
       <w:spacing w:after="100"/>
       <w:ind w:left="480"/>
@@ -35814,7 +35898,7 @@
     <w:basedOn w:val="Fuentedeprrafopredeter"/>
     <w:uiPriority w:val="99"/>
     <w:unhideWhenUsed/>
-    <w:rsid w:val="00914A83"/>
+    <w:rsid w:val="00CA5D84"/>
     <w:rPr>
       <w:color w:val="0000FF" w:themeColor="hyperlink"/>
       <w:u w:val="single"/>
@@ -35826,7 +35910,7 @@
     <w:next w:val="Normal"/>
     <w:uiPriority w:val="99"/>
     <w:unhideWhenUsed/>
-    <w:rsid w:val="00914A83"/>
+    <w:rsid w:val="00CA5D84"/>
     <w:pPr>
       <w:spacing w:after="0"/>
     </w:pPr>

</xml_diff>

<commit_message>
OE2: test de Hausman (FE vs RE) + nota metodológica que justifica efectos fijos
Con regresores macro comunes a todas las empresas, FE=RE en pendientes (Hausman degenerado);
se retiene FE para absorber heterogeneidad por empresa. Preempta una pregunta típica de comisión.

Co-Authored-By: Claude Opus 4.8 <noreply@anthropic.com>
</commit_message>
<xml_diff>
--- a/outputs/Tesis_Francisco_Rietta.docx
+++ b/outputs/Tesis_Francisco_Rietta.docx
@@ -166,7 +166,7 @@
       <w:pPr>
         <w:pStyle w:val="Ttulo1"/>
       </w:pPr>
-      <w:bookmarkStart w:id="0" w:name="_Toc231083290"/>
+      <w:bookmarkStart w:id="0" w:name="_Toc231084567"/>
       <w:r>
         <w:lastRenderedPageBreak/>
         <w:t>Página de aprobación</w:t>
@@ -262,7 +262,7 @@
       <w:pPr>
         <w:pStyle w:val="Ttulo1"/>
       </w:pPr>
-      <w:bookmarkStart w:id="1" w:name="_Toc231083291"/>
+      <w:bookmarkStart w:id="1" w:name="_Toc231084568"/>
       <w:r>
         <w:lastRenderedPageBreak/>
         <w:t>Declaración de originalidad</w:t>
@@ -303,7 +303,7 @@
       <w:pPr>
         <w:pStyle w:val="Ttulo1"/>
       </w:pPr>
-      <w:bookmarkStart w:id="2" w:name="_Toc231083292"/>
+      <w:bookmarkStart w:id="2" w:name="_Toc231084569"/>
       <w:r>
         <w:lastRenderedPageBreak/>
         <w:t>Dedicatoria</w:t>
@@ -333,7 +333,7 @@
       <w:pPr>
         <w:pStyle w:val="Ttulo1"/>
       </w:pPr>
-      <w:bookmarkStart w:id="3" w:name="_Toc231083293"/>
+      <w:bookmarkStart w:id="3" w:name="_Toc231084570"/>
       <w:r>
         <w:lastRenderedPageBreak/>
         <w:t>Agradecimientos</w:t>
@@ -359,7 +359,7 @@
       <w:pPr>
         <w:pStyle w:val="Ttulo1"/>
       </w:pPr>
-      <w:bookmarkStart w:id="4" w:name="_Toc231083294"/>
+      <w:bookmarkStart w:id="4" w:name="_Toc231084571"/>
       <w:r>
         <w:lastRenderedPageBreak/>
         <w:t>Resumen</w:t>
@@ -397,7 +397,7 @@
       <w:pPr>
         <w:pStyle w:val="Ttulo1"/>
       </w:pPr>
-      <w:bookmarkStart w:id="5" w:name="_Toc231083295"/>
+      <w:bookmarkStart w:id="5" w:name="_Toc231084572"/>
       <w:r>
         <w:lastRenderedPageBreak/>
         <w:t>Abstract</w:t>
@@ -432,7 +432,7 @@
       <w:pPr>
         <w:pStyle w:val="Ttulo1"/>
       </w:pPr>
-      <w:bookmarkStart w:id="6" w:name="_Toc231083296"/>
+      <w:bookmarkStart w:id="6" w:name="_Toc231084573"/>
       <w:r>
         <w:lastRenderedPageBreak/>
         <w:t>Índice general</w:t>
@@ -464,7 +464,7 @@
       <w:r>
         <w:fldChar w:fldCharType="separate"/>
       </w:r>
-      <w:hyperlink w:anchor="_Toc231083290" w:history="1">
+      <w:hyperlink w:anchor="_Toc231084567" w:history="1">
         <w:r>
           <w:rPr>
             <w:rStyle w:val="Hipervnculo"/>
@@ -491,7 +491,7 @@
             <w:noProof/>
             <w:webHidden/>
           </w:rPr>
-          <w:instrText xml:space="preserve"> PAGEREF _Toc231083290 \h </w:instrText>
+          <w:instrText xml:space="preserve"> PAGEREF _Toc231084567 \h </w:instrText>
         </w:r>
         <w:r>
           <w:rPr>
@@ -538,7 +538,7 @@
           <w14:ligatures w14:val="standardContextual"/>
         </w:rPr>
       </w:pPr>
-      <w:hyperlink w:anchor="_Toc231083291" w:history="1">
+      <w:hyperlink w:anchor="_Toc231084568" w:history="1">
         <w:r>
           <w:rPr>
             <w:rStyle w:val="Hipervnculo"/>
@@ -565,7 +565,7 @@
             <w:noProof/>
             <w:webHidden/>
           </w:rPr>
-          <w:instrText xml:space="preserve"> PAGEREF _Toc231083291 \h </w:instrText>
+          <w:instrText xml:space="preserve"> PAGEREF _Toc231084568 \h </w:instrText>
         </w:r>
         <w:r>
           <w:rPr>
@@ -612,7 +612,7 @@
           <w14:ligatures w14:val="standardContextual"/>
         </w:rPr>
       </w:pPr>
-      <w:hyperlink w:anchor="_Toc231083292" w:history="1">
+      <w:hyperlink w:anchor="_Toc231084569" w:history="1">
         <w:r>
           <w:rPr>
             <w:rStyle w:val="Hipervnculo"/>
@@ -639,7 +639,7 @@
             <w:noProof/>
             <w:webHidden/>
           </w:rPr>
-          <w:instrText xml:space="preserve"> PAGEREF _Toc231083292 \h </w:instrText>
+          <w:instrText xml:space="preserve"> PAGEREF _Toc231084569 \h </w:instrText>
         </w:r>
         <w:r>
           <w:rPr>
@@ -686,7 +686,7 @@
           <w14:ligatures w14:val="standardContextual"/>
         </w:rPr>
       </w:pPr>
-      <w:hyperlink w:anchor="_Toc231083293" w:history="1">
+      <w:hyperlink w:anchor="_Toc231084570" w:history="1">
         <w:r>
           <w:rPr>
             <w:rStyle w:val="Hipervnculo"/>
@@ -713,7 +713,7 @@
             <w:noProof/>
             <w:webHidden/>
           </w:rPr>
-          <w:instrText xml:space="preserve"> PAGEREF _Toc231083293 \h </w:instrText>
+          <w:instrText xml:space="preserve"> PAGEREF _Toc231084570 \h </w:instrText>
         </w:r>
         <w:r>
           <w:rPr>
@@ -760,7 +760,7 @@
           <w14:ligatures w14:val="standardContextual"/>
         </w:rPr>
       </w:pPr>
-      <w:hyperlink w:anchor="_Toc231083294" w:history="1">
+      <w:hyperlink w:anchor="_Toc231084571" w:history="1">
         <w:r>
           <w:rPr>
             <w:rStyle w:val="Hipervnculo"/>
@@ -787,7 +787,7 @@
             <w:noProof/>
             <w:webHidden/>
           </w:rPr>
-          <w:instrText xml:space="preserve"> PAGEREF _Toc231083294 \h </w:instrText>
+          <w:instrText xml:space="preserve"> PAGEREF _Toc231084571 \h </w:instrText>
         </w:r>
         <w:r>
           <w:rPr>
@@ -834,7 +834,7 @@
           <w14:ligatures w14:val="standardContextual"/>
         </w:rPr>
       </w:pPr>
-      <w:hyperlink w:anchor="_Toc231083295" w:history="1">
+      <w:hyperlink w:anchor="_Toc231084572" w:history="1">
         <w:r>
           <w:rPr>
             <w:rStyle w:val="Hipervnculo"/>
@@ -861,7 +861,7 @@
             <w:noProof/>
             <w:webHidden/>
           </w:rPr>
-          <w:instrText xml:space="preserve"> PAGEREF _Toc231083295 \h </w:instrText>
+          <w:instrText xml:space="preserve"> PAGEREF _Toc231084572 \h </w:instrText>
         </w:r>
         <w:r>
           <w:rPr>
@@ -908,7 +908,7 @@
           <w14:ligatures w14:val="standardContextual"/>
         </w:rPr>
       </w:pPr>
-      <w:hyperlink w:anchor="_Toc231083296" w:history="1">
+      <w:hyperlink w:anchor="_Toc231084573" w:history="1">
         <w:r>
           <w:rPr>
             <w:rStyle w:val="Hipervnculo"/>
@@ -935,7 +935,7 @@
             <w:noProof/>
             <w:webHidden/>
           </w:rPr>
-          <w:instrText xml:space="preserve"> PAGEREF _Toc231083296 \h </w:instrText>
+          <w:instrText xml:space="preserve"> PAGEREF _Toc231084573 \h </w:instrText>
         </w:r>
         <w:r>
           <w:rPr>
@@ -982,7 +982,7 @@
           <w14:ligatures w14:val="standardContextual"/>
         </w:rPr>
       </w:pPr>
-      <w:hyperlink w:anchor="_Toc231083297" w:history="1">
+      <w:hyperlink w:anchor="_Toc231084574" w:history="1">
         <w:r>
           <w:rPr>
             <w:rStyle w:val="Hipervnculo"/>
@@ -1009,7 +1009,7 @@
             <w:noProof/>
             <w:webHidden/>
           </w:rPr>
-          <w:instrText xml:space="preserve"> PAGEREF _Toc231083297 \h </w:instrText>
+          <w:instrText xml:space="preserve"> PAGEREF _Toc231084574 \h </w:instrText>
         </w:r>
         <w:r>
           <w:rPr>
@@ -1056,7 +1056,7 @@
           <w14:ligatures w14:val="standardContextual"/>
         </w:rPr>
       </w:pPr>
-      <w:hyperlink w:anchor="_Toc231083298" w:history="1">
+      <w:hyperlink w:anchor="_Toc231084575" w:history="1">
         <w:r>
           <w:rPr>
             <w:rStyle w:val="Hipervnculo"/>
@@ -1083,7 +1083,7 @@
             <w:noProof/>
             <w:webHidden/>
           </w:rPr>
-          <w:instrText xml:space="preserve"> PAGEREF _Toc231083298 \h </w:instrText>
+          <w:instrText xml:space="preserve"> PAGEREF _Toc231084575 \h </w:instrText>
         </w:r>
         <w:r>
           <w:rPr>
@@ -1130,7 +1130,7 @@
           <w14:ligatures w14:val="standardContextual"/>
         </w:rPr>
       </w:pPr>
-      <w:hyperlink w:anchor="_Toc231083299" w:history="1">
+      <w:hyperlink w:anchor="_Toc231084576" w:history="1">
         <w:r>
           <w:rPr>
             <w:rStyle w:val="Hipervnculo"/>
@@ -1157,7 +1157,7 @@
             <w:noProof/>
             <w:webHidden/>
           </w:rPr>
-          <w:instrText xml:space="preserve"> PAGEREF _Toc231083299 \h </w:instrText>
+          <w:instrText xml:space="preserve"> PAGEREF _Toc231084576 \h </w:instrText>
         </w:r>
         <w:r>
           <w:rPr>
@@ -1204,7 +1204,7 @@
           <w14:ligatures w14:val="standardContextual"/>
         </w:rPr>
       </w:pPr>
-      <w:hyperlink w:anchor="_Toc231083300" w:history="1">
+      <w:hyperlink w:anchor="_Toc231084577" w:history="1">
         <w:r>
           <w:rPr>
             <w:rStyle w:val="Hipervnculo"/>
@@ -1231,7 +1231,7 @@
             <w:noProof/>
             <w:webHidden/>
           </w:rPr>
-          <w:instrText xml:space="preserve"> PAGEREF _Toc231083300 \h </w:instrText>
+          <w:instrText xml:space="preserve"> PAGEREF _Toc231084577 \h </w:instrText>
         </w:r>
         <w:r>
           <w:rPr>
@@ -1278,7 +1278,7 @@
           <w14:ligatures w14:val="standardContextual"/>
         </w:rPr>
       </w:pPr>
-      <w:hyperlink w:anchor="_Toc231083301" w:history="1">
+      <w:hyperlink w:anchor="_Toc231084578" w:history="1">
         <w:r>
           <w:rPr>
             <w:rStyle w:val="Hipervnculo"/>
@@ -1305,7 +1305,7 @@
             <w:noProof/>
             <w:webHidden/>
           </w:rPr>
-          <w:instrText xml:space="preserve"> PAGEREF _Toc231083301 \h </w:instrText>
+          <w:instrText xml:space="preserve"> PAGEREF _Toc231084578 \h </w:instrText>
         </w:r>
         <w:r>
           <w:rPr>
@@ -1352,7 +1352,7 @@
           <w14:ligatures w14:val="standardContextual"/>
         </w:rPr>
       </w:pPr>
-      <w:hyperlink w:anchor="_Toc231083302" w:history="1">
+      <w:hyperlink w:anchor="_Toc231084579" w:history="1">
         <w:r>
           <w:rPr>
             <w:rStyle w:val="Hipervnculo"/>
@@ -1379,7 +1379,7 @@
             <w:noProof/>
             <w:webHidden/>
           </w:rPr>
-          <w:instrText xml:space="preserve"> PAGEREF _Toc231083302 \h </w:instrText>
+          <w:instrText xml:space="preserve"> PAGEREF _Toc231084579 \h </w:instrText>
         </w:r>
         <w:r>
           <w:rPr>
@@ -1426,7 +1426,7 @@
           <w14:ligatures w14:val="standardContextual"/>
         </w:rPr>
       </w:pPr>
-      <w:hyperlink w:anchor="_Toc231083303" w:history="1">
+      <w:hyperlink w:anchor="_Toc231084580" w:history="1">
         <w:r>
           <w:rPr>
             <w:rStyle w:val="Hipervnculo"/>
@@ -1453,7 +1453,7 @@
             <w:noProof/>
             <w:webHidden/>
           </w:rPr>
-          <w:instrText xml:space="preserve"> PAGEREF _Toc231083303 \h </w:instrText>
+          <w:instrText xml:space="preserve"> PAGEREF _Toc231084580 \h </w:instrText>
         </w:r>
         <w:r>
           <w:rPr>
@@ -1500,7 +1500,7 @@
           <w14:ligatures w14:val="standardContextual"/>
         </w:rPr>
       </w:pPr>
-      <w:hyperlink w:anchor="_Toc231083304" w:history="1">
+      <w:hyperlink w:anchor="_Toc231084581" w:history="1">
         <w:r>
           <w:rPr>
             <w:rStyle w:val="Hipervnculo"/>
@@ -1527,7 +1527,7 @@
             <w:noProof/>
             <w:webHidden/>
           </w:rPr>
-          <w:instrText xml:space="preserve"> PAGEREF _Toc231083304 \h </w:instrText>
+          <w:instrText xml:space="preserve"> PAGEREF _Toc231084581 \h </w:instrText>
         </w:r>
         <w:r>
           <w:rPr>
@@ -1574,7 +1574,7 @@
           <w14:ligatures w14:val="standardContextual"/>
         </w:rPr>
       </w:pPr>
-      <w:hyperlink w:anchor="_Toc231083305" w:history="1">
+      <w:hyperlink w:anchor="_Toc231084582" w:history="1">
         <w:r>
           <w:rPr>
             <w:rStyle w:val="Hipervnculo"/>
@@ -1601,7 +1601,7 @@
             <w:noProof/>
             <w:webHidden/>
           </w:rPr>
-          <w:instrText xml:space="preserve"> PAGEREF _Toc231083305 \h </w:instrText>
+          <w:instrText xml:space="preserve"> PAGEREF _Toc231084582 \h </w:instrText>
         </w:r>
         <w:r>
           <w:rPr>
@@ -1648,7 +1648,7 @@
           <w14:ligatures w14:val="standardContextual"/>
         </w:rPr>
       </w:pPr>
-      <w:hyperlink w:anchor="_Toc231083306" w:history="1">
+      <w:hyperlink w:anchor="_Toc231084583" w:history="1">
         <w:r>
           <w:rPr>
             <w:rStyle w:val="Hipervnculo"/>
@@ -1675,7 +1675,7 @@
             <w:noProof/>
             <w:webHidden/>
           </w:rPr>
-          <w:instrText xml:space="preserve"> PAGEREF _Toc231083306 \h </w:instrText>
+          <w:instrText xml:space="preserve"> PAGEREF _Toc231084583 \h </w:instrText>
         </w:r>
         <w:r>
           <w:rPr>
@@ -1722,7 +1722,7 @@
           <w14:ligatures w14:val="standardContextual"/>
         </w:rPr>
       </w:pPr>
-      <w:hyperlink w:anchor="_Toc231083307" w:history="1">
+      <w:hyperlink w:anchor="_Toc231084584" w:history="1">
         <w:r>
           <w:rPr>
             <w:rStyle w:val="Hipervnculo"/>
@@ -1749,7 +1749,7 @@
             <w:noProof/>
             <w:webHidden/>
           </w:rPr>
-          <w:instrText xml:space="preserve"> PAGEREF _Toc231083307 \h </w:instrText>
+          <w:instrText xml:space="preserve"> PAGEREF _Toc231084584 \h </w:instrText>
         </w:r>
         <w:r>
           <w:rPr>
@@ -1796,7 +1796,7 @@
           <w14:ligatures w14:val="standardContextual"/>
         </w:rPr>
       </w:pPr>
-      <w:hyperlink w:anchor="_Toc231083308" w:history="1">
+      <w:hyperlink w:anchor="_Toc231084585" w:history="1">
         <w:r>
           <w:rPr>
             <w:rStyle w:val="Hipervnculo"/>
@@ -1823,7 +1823,7 @@
             <w:noProof/>
             <w:webHidden/>
           </w:rPr>
-          <w:instrText xml:space="preserve"> PAGEREF _Toc231083308 \h </w:instrText>
+          <w:instrText xml:space="preserve"> PAGEREF _Toc231084585 \h </w:instrText>
         </w:r>
         <w:r>
           <w:rPr>
@@ -1870,7 +1870,7 @@
           <w14:ligatures w14:val="standardContextual"/>
         </w:rPr>
       </w:pPr>
-      <w:hyperlink w:anchor="_Toc231083309" w:history="1">
+      <w:hyperlink w:anchor="_Toc231084586" w:history="1">
         <w:r>
           <w:rPr>
             <w:rStyle w:val="Hipervnculo"/>
@@ -1897,7 +1897,7 @@
             <w:noProof/>
             <w:webHidden/>
           </w:rPr>
-          <w:instrText xml:space="preserve"> PAGEREF _Toc231083309 \h </w:instrText>
+          <w:instrText xml:space="preserve"> PAGEREF _Toc231084586 \h </w:instrText>
         </w:r>
         <w:r>
           <w:rPr>
@@ -1944,7 +1944,7 @@
           <w14:ligatures w14:val="standardContextual"/>
         </w:rPr>
       </w:pPr>
-      <w:hyperlink w:anchor="_Toc231083310" w:history="1">
+      <w:hyperlink w:anchor="_Toc231084587" w:history="1">
         <w:r>
           <w:rPr>
             <w:rStyle w:val="Hipervnculo"/>
@@ -1971,7 +1971,7 @@
             <w:noProof/>
             <w:webHidden/>
           </w:rPr>
-          <w:instrText xml:space="preserve"> PAGEREF _Toc231083310 \h </w:instrText>
+          <w:instrText xml:space="preserve"> PAGEREF _Toc231084587 \h </w:instrText>
         </w:r>
         <w:r>
           <w:rPr>
@@ -2018,7 +2018,7 @@
           <w14:ligatures w14:val="standardContextual"/>
         </w:rPr>
       </w:pPr>
-      <w:hyperlink w:anchor="_Toc231083311" w:history="1">
+      <w:hyperlink w:anchor="_Toc231084588" w:history="1">
         <w:r>
           <w:rPr>
             <w:rStyle w:val="Hipervnculo"/>
@@ -2045,7 +2045,7 @@
             <w:noProof/>
             <w:webHidden/>
           </w:rPr>
-          <w:instrText xml:space="preserve"> PAGEREF _Toc231083311 \h </w:instrText>
+          <w:instrText xml:space="preserve"> PAGEREF _Toc231084588 \h </w:instrText>
         </w:r>
         <w:r>
           <w:rPr>
@@ -2092,7 +2092,7 @@
           <w14:ligatures w14:val="standardContextual"/>
         </w:rPr>
       </w:pPr>
-      <w:hyperlink w:anchor="_Toc231083312" w:history="1">
+      <w:hyperlink w:anchor="_Toc231084589" w:history="1">
         <w:r>
           <w:rPr>
             <w:rStyle w:val="Hipervnculo"/>
@@ -2119,7 +2119,7 @@
             <w:noProof/>
             <w:webHidden/>
           </w:rPr>
-          <w:instrText xml:space="preserve"> PAGEREF _Toc231083312 \h </w:instrText>
+          <w:instrText xml:space="preserve"> PAGEREF _Toc231084589 \h </w:instrText>
         </w:r>
         <w:r>
           <w:rPr>
@@ -2166,7 +2166,7 @@
           <w14:ligatures w14:val="standardContextual"/>
         </w:rPr>
       </w:pPr>
-      <w:hyperlink w:anchor="_Toc231083313" w:history="1">
+      <w:hyperlink w:anchor="_Toc231084590" w:history="1">
         <w:r>
           <w:rPr>
             <w:rStyle w:val="Hipervnculo"/>
@@ -2193,7 +2193,7 @@
             <w:noProof/>
             <w:webHidden/>
           </w:rPr>
-          <w:instrText xml:space="preserve"> PAGEREF _Toc231083313 \h </w:instrText>
+          <w:instrText xml:space="preserve"> PAGEREF _Toc231084590 \h </w:instrText>
         </w:r>
         <w:r>
           <w:rPr>
@@ -2240,7 +2240,7 @@
           <w14:ligatures w14:val="standardContextual"/>
         </w:rPr>
       </w:pPr>
-      <w:hyperlink w:anchor="_Toc231083314" w:history="1">
+      <w:hyperlink w:anchor="_Toc231084591" w:history="1">
         <w:r>
           <w:rPr>
             <w:rStyle w:val="Hipervnculo"/>
@@ -2267,7 +2267,7 @@
             <w:noProof/>
             <w:webHidden/>
           </w:rPr>
-          <w:instrText xml:space="preserve"> PAGEREF _Toc231083314 \h </w:instrText>
+          <w:instrText xml:space="preserve"> PAGEREF _Toc231084591 \h </w:instrText>
         </w:r>
         <w:r>
           <w:rPr>
@@ -2314,7 +2314,7 @@
           <w14:ligatures w14:val="standardContextual"/>
         </w:rPr>
       </w:pPr>
-      <w:hyperlink w:anchor="_Toc231083315" w:history="1">
+      <w:hyperlink w:anchor="_Toc231084592" w:history="1">
         <w:r>
           <w:rPr>
             <w:rStyle w:val="Hipervnculo"/>
@@ -2341,7 +2341,7 @@
             <w:noProof/>
             <w:webHidden/>
           </w:rPr>
-          <w:instrText xml:space="preserve"> PAGEREF _Toc231083315 \h </w:instrText>
+          <w:instrText xml:space="preserve"> PAGEREF _Toc231084592 \h </w:instrText>
         </w:r>
         <w:r>
           <w:rPr>
@@ -2388,7 +2388,7 @@
           <w14:ligatures w14:val="standardContextual"/>
         </w:rPr>
       </w:pPr>
-      <w:hyperlink w:anchor="_Toc231083316" w:history="1">
+      <w:hyperlink w:anchor="_Toc231084593" w:history="1">
         <w:r>
           <w:rPr>
             <w:rStyle w:val="Hipervnculo"/>
@@ -2415,7 +2415,7 @@
             <w:noProof/>
             <w:webHidden/>
           </w:rPr>
-          <w:instrText xml:space="preserve"> PAGEREF _Toc231083316 \h </w:instrText>
+          <w:instrText xml:space="preserve"> PAGEREF _Toc231084593 \h </w:instrText>
         </w:r>
         <w:r>
           <w:rPr>
@@ -2462,7 +2462,7 @@
           <w14:ligatures w14:val="standardContextual"/>
         </w:rPr>
       </w:pPr>
-      <w:hyperlink w:anchor="_Toc231083317" w:history="1">
+      <w:hyperlink w:anchor="_Toc231084594" w:history="1">
         <w:r>
           <w:rPr>
             <w:rStyle w:val="Hipervnculo"/>
@@ -2489,7 +2489,7 @@
             <w:noProof/>
             <w:webHidden/>
           </w:rPr>
-          <w:instrText xml:space="preserve"> PAGEREF _Toc231083317 \h </w:instrText>
+          <w:instrText xml:space="preserve"> PAGEREF _Toc231084594 \h </w:instrText>
         </w:r>
         <w:r>
           <w:rPr>
@@ -2536,7 +2536,7 @@
           <w14:ligatures w14:val="standardContextual"/>
         </w:rPr>
       </w:pPr>
-      <w:hyperlink w:anchor="_Toc231083318" w:history="1">
+      <w:hyperlink w:anchor="_Toc231084595" w:history="1">
         <w:r>
           <w:rPr>
             <w:rStyle w:val="Hipervnculo"/>
@@ -2563,7 +2563,7 @@
             <w:noProof/>
             <w:webHidden/>
           </w:rPr>
-          <w:instrText xml:space="preserve"> PAGEREF _Toc231083318 \h </w:instrText>
+          <w:instrText xml:space="preserve"> PAGEREF _Toc231084595 \h </w:instrText>
         </w:r>
         <w:r>
           <w:rPr>
@@ -2610,7 +2610,7 @@
           <w14:ligatures w14:val="standardContextual"/>
         </w:rPr>
       </w:pPr>
-      <w:hyperlink w:anchor="_Toc231083319" w:history="1">
+      <w:hyperlink w:anchor="_Toc231084596" w:history="1">
         <w:r>
           <w:rPr>
             <w:rStyle w:val="Hipervnculo"/>
@@ -2637,7 +2637,7 @@
             <w:noProof/>
             <w:webHidden/>
           </w:rPr>
-          <w:instrText xml:space="preserve"> PAGEREF _Toc231083319 \h </w:instrText>
+          <w:instrText xml:space="preserve"> PAGEREF _Toc231084596 \h </w:instrText>
         </w:r>
         <w:r>
           <w:rPr>
@@ -2684,7 +2684,7 @@
           <w14:ligatures w14:val="standardContextual"/>
         </w:rPr>
       </w:pPr>
-      <w:hyperlink w:anchor="_Toc231083320" w:history="1">
+      <w:hyperlink w:anchor="_Toc231084597" w:history="1">
         <w:r>
           <w:rPr>
             <w:rStyle w:val="Hipervnculo"/>
@@ -2711,7 +2711,7 @@
             <w:noProof/>
             <w:webHidden/>
           </w:rPr>
-          <w:instrText xml:space="preserve"> PAGEREF _Toc231083320 \h </w:instrText>
+          <w:instrText xml:space="preserve"> PAGEREF _Toc231084597 \h </w:instrText>
         </w:r>
         <w:r>
           <w:rPr>
@@ -2758,7 +2758,7 @@
           <w14:ligatures w14:val="standardContextual"/>
         </w:rPr>
       </w:pPr>
-      <w:hyperlink w:anchor="_Toc231083321" w:history="1">
+      <w:hyperlink w:anchor="_Toc231084598" w:history="1">
         <w:r>
           <w:rPr>
             <w:rStyle w:val="Hipervnculo"/>
@@ -2785,7 +2785,7 @@
             <w:noProof/>
             <w:webHidden/>
           </w:rPr>
-          <w:instrText xml:space="preserve"> PAGEREF _Toc231083321 \h </w:instrText>
+          <w:instrText xml:space="preserve"> PAGEREF _Toc231084598 \h </w:instrText>
         </w:r>
         <w:r>
           <w:rPr>
@@ -2832,7 +2832,7 @@
           <w14:ligatures w14:val="standardContextual"/>
         </w:rPr>
       </w:pPr>
-      <w:hyperlink w:anchor="_Toc231083322" w:history="1">
+      <w:hyperlink w:anchor="_Toc231084599" w:history="1">
         <w:r>
           <w:rPr>
             <w:rStyle w:val="Hipervnculo"/>
@@ -2859,7 +2859,7 @@
             <w:noProof/>
             <w:webHidden/>
           </w:rPr>
-          <w:instrText xml:space="preserve"> PAGEREF _Toc231083322 \h </w:instrText>
+          <w:instrText xml:space="preserve"> PAGEREF _Toc231084599 \h </w:instrText>
         </w:r>
         <w:r>
           <w:rPr>
@@ -2906,7 +2906,7 @@
           <w14:ligatures w14:val="standardContextual"/>
         </w:rPr>
       </w:pPr>
-      <w:hyperlink w:anchor="_Toc231083323" w:history="1">
+      <w:hyperlink w:anchor="_Toc231084600" w:history="1">
         <w:r>
           <w:rPr>
             <w:rStyle w:val="Hipervnculo"/>
@@ -2933,7 +2933,7 @@
             <w:noProof/>
             <w:webHidden/>
           </w:rPr>
-          <w:instrText xml:space="preserve"> PAGEREF _Toc231083323 \h </w:instrText>
+          <w:instrText xml:space="preserve"> PAGEREF _Toc231084600 \h </w:instrText>
         </w:r>
         <w:r>
           <w:rPr>
@@ -2980,7 +2980,7 @@
           <w14:ligatures w14:val="standardContextual"/>
         </w:rPr>
       </w:pPr>
-      <w:hyperlink w:anchor="_Toc231083324" w:history="1">
+      <w:hyperlink w:anchor="_Toc231084601" w:history="1">
         <w:r>
           <w:rPr>
             <w:rStyle w:val="Hipervnculo"/>
@@ -3007,7 +3007,7 @@
             <w:noProof/>
             <w:webHidden/>
           </w:rPr>
-          <w:instrText xml:space="preserve"> PAGEREF _Toc231083324 \h </w:instrText>
+          <w:instrText xml:space="preserve"> PAGEREF _Toc231084601 \h </w:instrText>
         </w:r>
         <w:r>
           <w:rPr>
@@ -3054,7 +3054,7 @@
           <w14:ligatures w14:val="standardContextual"/>
         </w:rPr>
       </w:pPr>
-      <w:hyperlink w:anchor="_Toc231083325" w:history="1">
+      <w:hyperlink w:anchor="_Toc231084602" w:history="1">
         <w:r>
           <w:rPr>
             <w:rStyle w:val="Hipervnculo"/>
@@ -3081,7 +3081,7 @@
             <w:noProof/>
             <w:webHidden/>
           </w:rPr>
-          <w:instrText xml:space="preserve"> PAGEREF _Toc231083325 \h </w:instrText>
+          <w:instrText xml:space="preserve"> PAGEREF _Toc231084602 \h </w:instrText>
         </w:r>
         <w:r>
           <w:rPr>
@@ -3128,7 +3128,7 @@
           <w14:ligatures w14:val="standardContextual"/>
         </w:rPr>
       </w:pPr>
-      <w:hyperlink w:anchor="_Toc231083326" w:history="1">
+      <w:hyperlink w:anchor="_Toc231084603" w:history="1">
         <w:r>
           <w:rPr>
             <w:rStyle w:val="Hipervnculo"/>
@@ -3155,7 +3155,7 @@
             <w:noProof/>
             <w:webHidden/>
           </w:rPr>
-          <w:instrText xml:space="preserve"> PAGEREF _Toc231083326 \h </w:instrText>
+          <w:instrText xml:space="preserve"> PAGEREF _Toc231084603 \h </w:instrText>
         </w:r>
         <w:r>
           <w:rPr>
@@ -3202,7 +3202,7 @@
           <w14:ligatures w14:val="standardContextual"/>
         </w:rPr>
       </w:pPr>
-      <w:hyperlink w:anchor="_Toc231083327" w:history="1">
+      <w:hyperlink w:anchor="_Toc231084604" w:history="1">
         <w:r>
           <w:rPr>
             <w:rStyle w:val="Hipervnculo"/>
@@ -3229,7 +3229,7 @@
             <w:noProof/>
             <w:webHidden/>
           </w:rPr>
-          <w:instrText xml:space="preserve"> PAGEREF _Toc231083327 \h </w:instrText>
+          <w:instrText xml:space="preserve"> PAGEREF _Toc231084604 \h </w:instrText>
         </w:r>
         <w:r>
           <w:rPr>
@@ -3276,7 +3276,7 @@
           <w14:ligatures w14:val="standardContextual"/>
         </w:rPr>
       </w:pPr>
-      <w:hyperlink w:anchor="_Toc231083328" w:history="1">
+      <w:hyperlink w:anchor="_Toc231084605" w:history="1">
         <w:r>
           <w:rPr>
             <w:rStyle w:val="Hipervnculo"/>
@@ -3303,7 +3303,7 @@
             <w:noProof/>
             <w:webHidden/>
           </w:rPr>
-          <w:instrText xml:space="preserve"> PAGEREF _Toc231083328 \h </w:instrText>
+          <w:instrText xml:space="preserve"> PAGEREF _Toc231084605 \h </w:instrText>
         </w:r>
         <w:r>
           <w:rPr>
@@ -3350,7 +3350,7 @@
           <w14:ligatures w14:val="standardContextual"/>
         </w:rPr>
       </w:pPr>
-      <w:hyperlink w:anchor="_Toc231083329" w:history="1">
+      <w:hyperlink w:anchor="_Toc231084606" w:history="1">
         <w:r>
           <w:rPr>
             <w:rStyle w:val="Hipervnculo"/>
@@ -3377,7 +3377,7 @@
             <w:noProof/>
             <w:webHidden/>
           </w:rPr>
-          <w:instrText xml:space="preserve"> PAGEREF _Toc231083329 \h </w:instrText>
+          <w:instrText xml:space="preserve"> PAGEREF _Toc231084606 \h </w:instrText>
         </w:r>
         <w:r>
           <w:rPr>
@@ -3424,7 +3424,7 @@
           <w14:ligatures w14:val="standardContextual"/>
         </w:rPr>
       </w:pPr>
-      <w:hyperlink w:anchor="_Toc231083330" w:history="1">
+      <w:hyperlink w:anchor="_Toc231084607" w:history="1">
         <w:r>
           <w:rPr>
             <w:rStyle w:val="Hipervnculo"/>
@@ -3451,7 +3451,7 @@
             <w:noProof/>
             <w:webHidden/>
           </w:rPr>
-          <w:instrText xml:space="preserve"> PAGEREF _Toc231083330 \h </w:instrText>
+          <w:instrText xml:space="preserve"> PAGEREF _Toc231084607 \h </w:instrText>
         </w:r>
         <w:r>
           <w:rPr>
@@ -3498,7 +3498,7 @@
           <w14:ligatures w14:val="standardContextual"/>
         </w:rPr>
       </w:pPr>
-      <w:hyperlink w:anchor="_Toc231083331" w:history="1">
+      <w:hyperlink w:anchor="_Toc231084608" w:history="1">
         <w:r>
           <w:rPr>
             <w:rStyle w:val="Hipervnculo"/>
@@ -3525,7 +3525,7 @@
             <w:noProof/>
             <w:webHidden/>
           </w:rPr>
-          <w:instrText xml:space="preserve"> PAGEREF _Toc231083331 \h </w:instrText>
+          <w:instrText xml:space="preserve"> PAGEREF _Toc231084608 \h </w:instrText>
         </w:r>
         <w:r>
           <w:rPr>
@@ -3572,7 +3572,7 @@
           <w14:ligatures w14:val="standardContextual"/>
         </w:rPr>
       </w:pPr>
-      <w:hyperlink w:anchor="_Toc231083332" w:history="1">
+      <w:hyperlink w:anchor="_Toc231084609" w:history="1">
         <w:r>
           <w:rPr>
             <w:rStyle w:val="Hipervnculo"/>
@@ -3599,7 +3599,7 @@
             <w:noProof/>
             <w:webHidden/>
           </w:rPr>
-          <w:instrText xml:space="preserve"> PAGEREF _Toc231083332 \h </w:instrText>
+          <w:instrText xml:space="preserve"> PAGEREF _Toc231084609 \h </w:instrText>
         </w:r>
         <w:r>
           <w:rPr>
@@ -3646,7 +3646,7 @@
           <w14:ligatures w14:val="standardContextual"/>
         </w:rPr>
       </w:pPr>
-      <w:hyperlink w:anchor="_Toc231083333" w:history="1">
+      <w:hyperlink w:anchor="_Toc231084610" w:history="1">
         <w:r>
           <w:rPr>
             <w:rStyle w:val="Hipervnculo"/>
@@ -3673,7 +3673,7 @@
             <w:noProof/>
             <w:webHidden/>
           </w:rPr>
-          <w:instrText xml:space="preserve"> PAGEREF _Toc231083333 \h </w:instrText>
+          <w:instrText xml:space="preserve"> PAGEREF _Toc231084610 \h </w:instrText>
         </w:r>
         <w:r>
           <w:rPr>
@@ -3720,7 +3720,7 @@
           <w14:ligatures w14:val="standardContextual"/>
         </w:rPr>
       </w:pPr>
-      <w:hyperlink w:anchor="_Toc231083334" w:history="1">
+      <w:hyperlink w:anchor="_Toc231084611" w:history="1">
         <w:r>
           <w:rPr>
             <w:rStyle w:val="Hipervnculo"/>
@@ -3747,7 +3747,7 @@
             <w:noProof/>
             <w:webHidden/>
           </w:rPr>
-          <w:instrText xml:space="preserve"> PAGEREF _Toc231083334 \h </w:instrText>
+          <w:instrText xml:space="preserve"> PAGEREF _Toc231084611 \h </w:instrText>
         </w:r>
         <w:r>
           <w:rPr>
@@ -3794,7 +3794,7 @@
           <w14:ligatures w14:val="standardContextual"/>
         </w:rPr>
       </w:pPr>
-      <w:hyperlink w:anchor="_Toc231083335" w:history="1">
+      <w:hyperlink w:anchor="_Toc231084612" w:history="1">
         <w:r>
           <w:rPr>
             <w:rStyle w:val="Hipervnculo"/>
@@ -3821,7 +3821,7 @@
             <w:noProof/>
             <w:webHidden/>
           </w:rPr>
-          <w:instrText xml:space="preserve"> PAGEREF _Toc231083335 \h </w:instrText>
+          <w:instrText xml:space="preserve"> PAGEREF _Toc231084612 \h </w:instrText>
         </w:r>
         <w:r>
           <w:rPr>
@@ -3868,7 +3868,7 @@
           <w14:ligatures w14:val="standardContextual"/>
         </w:rPr>
       </w:pPr>
-      <w:hyperlink w:anchor="_Toc231083336" w:history="1">
+      <w:hyperlink w:anchor="_Toc231084613" w:history="1">
         <w:r>
           <w:rPr>
             <w:rStyle w:val="Hipervnculo"/>
@@ -3895,7 +3895,7 @@
             <w:noProof/>
             <w:webHidden/>
           </w:rPr>
-          <w:instrText xml:space="preserve"> PAGEREF _Toc231083336 \h </w:instrText>
+          <w:instrText xml:space="preserve"> PAGEREF _Toc231084613 \h </w:instrText>
         </w:r>
         <w:r>
           <w:rPr>
@@ -3942,7 +3942,7 @@
           <w14:ligatures w14:val="standardContextual"/>
         </w:rPr>
       </w:pPr>
-      <w:hyperlink w:anchor="_Toc231083337" w:history="1">
+      <w:hyperlink w:anchor="_Toc231084614" w:history="1">
         <w:r>
           <w:rPr>
             <w:rStyle w:val="Hipervnculo"/>
@@ -3969,7 +3969,7 @@
             <w:noProof/>
             <w:webHidden/>
           </w:rPr>
-          <w:instrText xml:space="preserve"> PAGEREF _Toc231083337 \h </w:instrText>
+          <w:instrText xml:space="preserve"> PAGEREF _Toc231084614 \h </w:instrText>
         </w:r>
         <w:r>
           <w:rPr>
@@ -4016,7 +4016,7 @@
           <w14:ligatures w14:val="standardContextual"/>
         </w:rPr>
       </w:pPr>
-      <w:hyperlink w:anchor="_Toc231083338" w:history="1">
+      <w:hyperlink w:anchor="_Toc231084615" w:history="1">
         <w:r>
           <w:rPr>
             <w:rStyle w:val="Hipervnculo"/>
@@ -4043,7 +4043,7 @@
             <w:noProof/>
             <w:webHidden/>
           </w:rPr>
-          <w:instrText xml:space="preserve"> PAGEREF _Toc231083338 \h </w:instrText>
+          <w:instrText xml:space="preserve"> PAGEREF _Toc231084615 \h </w:instrText>
         </w:r>
         <w:r>
           <w:rPr>
@@ -4090,7 +4090,7 @@
           <w14:ligatures w14:val="standardContextual"/>
         </w:rPr>
       </w:pPr>
-      <w:hyperlink w:anchor="_Toc231083339" w:history="1">
+      <w:hyperlink w:anchor="_Toc231084616" w:history="1">
         <w:r>
           <w:rPr>
             <w:rStyle w:val="Hipervnculo"/>
@@ -4117,7 +4117,7 @@
             <w:noProof/>
             <w:webHidden/>
           </w:rPr>
-          <w:instrText xml:space="preserve"> PAGEREF _Toc231083339 \h </w:instrText>
+          <w:instrText xml:space="preserve"> PAGEREF _Toc231084616 \h </w:instrText>
         </w:r>
         <w:r>
           <w:rPr>
@@ -4164,7 +4164,7 @@
           <w14:ligatures w14:val="standardContextual"/>
         </w:rPr>
       </w:pPr>
-      <w:hyperlink w:anchor="_Toc231083340" w:history="1">
+      <w:hyperlink w:anchor="_Toc231084617" w:history="1">
         <w:r>
           <w:rPr>
             <w:rStyle w:val="Hipervnculo"/>
@@ -4191,7 +4191,7 @@
             <w:noProof/>
             <w:webHidden/>
           </w:rPr>
-          <w:instrText xml:space="preserve"> PAGEREF _Toc231083340 \h </w:instrText>
+          <w:instrText xml:space="preserve"> PAGEREF _Toc231084617 \h </w:instrText>
         </w:r>
         <w:r>
           <w:rPr>
@@ -4238,7 +4238,7 @@
           <w14:ligatures w14:val="standardContextual"/>
         </w:rPr>
       </w:pPr>
-      <w:hyperlink w:anchor="_Toc231083341" w:history="1">
+      <w:hyperlink w:anchor="_Toc231084618" w:history="1">
         <w:r>
           <w:rPr>
             <w:rStyle w:val="Hipervnculo"/>
@@ -4265,7 +4265,7 @@
             <w:noProof/>
             <w:webHidden/>
           </w:rPr>
-          <w:instrText xml:space="preserve"> PAGEREF _Toc231083341 \h </w:instrText>
+          <w:instrText xml:space="preserve"> PAGEREF _Toc231084618 \h </w:instrText>
         </w:r>
         <w:r>
           <w:rPr>
@@ -4312,7 +4312,7 @@
           <w14:ligatures w14:val="standardContextual"/>
         </w:rPr>
       </w:pPr>
-      <w:hyperlink w:anchor="_Toc231083342" w:history="1">
+      <w:hyperlink w:anchor="_Toc231084619" w:history="1">
         <w:r>
           <w:rPr>
             <w:rStyle w:val="Hipervnculo"/>
@@ -4339,7 +4339,7 @@
             <w:noProof/>
             <w:webHidden/>
           </w:rPr>
-          <w:instrText xml:space="preserve"> PAGEREF _Toc231083342 \h </w:instrText>
+          <w:instrText xml:space="preserve"> PAGEREF _Toc231084619 \h </w:instrText>
         </w:r>
         <w:r>
           <w:rPr>
@@ -4386,7 +4386,7 @@
           <w14:ligatures w14:val="standardContextual"/>
         </w:rPr>
       </w:pPr>
-      <w:hyperlink w:anchor="_Toc231083343" w:history="1">
+      <w:hyperlink w:anchor="_Toc231084620" w:history="1">
         <w:r>
           <w:rPr>
             <w:rStyle w:val="Hipervnculo"/>
@@ -4413,7 +4413,7 @@
             <w:noProof/>
             <w:webHidden/>
           </w:rPr>
-          <w:instrText xml:space="preserve"> PAGEREF _Toc231083343 \h </w:instrText>
+          <w:instrText xml:space="preserve"> PAGEREF _Toc231084620 \h </w:instrText>
         </w:r>
         <w:r>
           <w:rPr>
@@ -4460,7 +4460,7 @@
           <w14:ligatures w14:val="standardContextual"/>
         </w:rPr>
       </w:pPr>
-      <w:hyperlink w:anchor="_Toc231083344" w:history="1">
+      <w:hyperlink w:anchor="_Toc231084621" w:history="1">
         <w:r>
           <w:rPr>
             <w:rStyle w:val="Hipervnculo"/>
@@ -4487,7 +4487,7 @@
             <w:noProof/>
             <w:webHidden/>
           </w:rPr>
-          <w:instrText xml:space="preserve"> PAGEREF _Toc231083344 \h </w:instrText>
+          <w:instrText xml:space="preserve"> PAGEREF _Toc231084621 \h </w:instrText>
         </w:r>
         <w:r>
           <w:rPr>
@@ -4534,7 +4534,7 @@
           <w14:ligatures w14:val="standardContextual"/>
         </w:rPr>
       </w:pPr>
-      <w:hyperlink w:anchor="_Toc231083345" w:history="1">
+      <w:hyperlink w:anchor="_Toc231084622" w:history="1">
         <w:r>
           <w:rPr>
             <w:rStyle w:val="Hipervnculo"/>
@@ -4561,7 +4561,7 @@
             <w:noProof/>
             <w:webHidden/>
           </w:rPr>
-          <w:instrText xml:space="preserve"> PAGEREF _Toc231083345 \h </w:instrText>
+          <w:instrText xml:space="preserve"> PAGEREF _Toc231084622 \h </w:instrText>
         </w:r>
         <w:r>
           <w:rPr>
@@ -4608,7 +4608,7 @@
           <w14:ligatures w14:val="standardContextual"/>
         </w:rPr>
       </w:pPr>
-      <w:hyperlink w:anchor="_Toc231083346" w:history="1">
+      <w:hyperlink w:anchor="_Toc231084623" w:history="1">
         <w:r>
           <w:rPr>
             <w:rStyle w:val="Hipervnculo"/>
@@ -4635,7 +4635,7 @@
             <w:noProof/>
             <w:webHidden/>
           </w:rPr>
-          <w:instrText xml:space="preserve"> PAGEREF _Toc231083346 \h </w:instrText>
+          <w:instrText xml:space="preserve"> PAGEREF _Toc231084623 \h </w:instrText>
         </w:r>
         <w:r>
           <w:rPr>
@@ -4682,7 +4682,7 @@
           <w14:ligatures w14:val="standardContextual"/>
         </w:rPr>
       </w:pPr>
-      <w:hyperlink w:anchor="_Toc231083347" w:history="1">
+      <w:hyperlink w:anchor="_Toc231084624" w:history="1">
         <w:r>
           <w:rPr>
             <w:rStyle w:val="Hipervnculo"/>
@@ -4709,7 +4709,7 @@
             <w:noProof/>
             <w:webHidden/>
           </w:rPr>
-          <w:instrText xml:space="preserve"> PAGEREF _Toc231083347 \h </w:instrText>
+          <w:instrText xml:space="preserve"> PAGEREF _Toc231084624 \h </w:instrText>
         </w:r>
         <w:r>
           <w:rPr>
@@ -4756,7 +4756,7 @@
           <w14:ligatures w14:val="standardContextual"/>
         </w:rPr>
       </w:pPr>
-      <w:hyperlink w:anchor="_Toc231083348" w:history="1">
+      <w:hyperlink w:anchor="_Toc231084625" w:history="1">
         <w:r>
           <w:rPr>
             <w:rStyle w:val="Hipervnculo"/>
@@ -4783,7 +4783,7 @@
             <w:noProof/>
             <w:webHidden/>
           </w:rPr>
-          <w:instrText xml:space="preserve"> PAGEREF _Toc231083348 \h </w:instrText>
+          <w:instrText xml:space="preserve"> PAGEREF _Toc231084625 \h </w:instrText>
         </w:r>
         <w:r>
           <w:rPr>
@@ -4830,7 +4830,7 @@
           <w14:ligatures w14:val="standardContextual"/>
         </w:rPr>
       </w:pPr>
-      <w:hyperlink w:anchor="_Toc231083349" w:history="1">
+      <w:hyperlink w:anchor="_Toc231084626" w:history="1">
         <w:r>
           <w:rPr>
             <w:rStyle w:val="Hipervnculo"/>
@@ -4857,7 +4857,7 @@
             <w:noProof/>
             <w:webHidden/>
           </w:rPr>
-          <w:instrText xml:space="preserve"> PAGEREF _Toc231083349 \h </w:instrText>
+          <w:instrText xml:space="preserve"> PAGEREF _Toc231084626 \h </w:instrText>
         </w:r>
         <w:r>
           <w:rPr>
@@ -4904,7 +4904,7 @@
           <w14:ligatures w14:val="standardContextual"/>
         </w:rPr>
       </w:pPr>
-      <w:hyperlink w:anchor="_Toc231083350" w:history="1">
+      <w:hyperlink w:anchor="_Toc231084627" w:history="1">
         <w:r>
           <w:rPr>
             <w:rStyle w:val="Hipervnculo"/>
@@ -4931,7 +4931,7 @@
             <w:noProof/>
             <w:webHidden/>
           </w:rPr>
-          <w:instrText xml:space="preserve"> PAGEREF _Toc231083350 \h </w:instrText>
+          <w:instrText xml:space="preserve"> PAGEREF _Toc231084627 \h </w:instrText>
         </w:r>
         <w:r>
           <w:rPr>
@@ -4978,7 +4978,7 @@
           <w14:ligatures w14:val="standardContextual"/>
         </w:rPr>
       </w:pPr>
-      <w:hyperlink w:anchor="_Toc231083351" w:history="1">
+      <w:hyperlink w:anchor="_Toc231084628" w:history="1">
         <w:r>
           <w:rPr>
             <w:rStyle w:val="Hipervnculo"/>
@@ -5005,7 +5005,7 @@
             <w:noProof/>
             <w:webHidden/>
           </w:rPr>
-          <w:instrText xml:space="preserve"> PAGEREF _Toc231083351 \h </w:instrText>
+          <w:instrText xml:space="preserve"> PAGEREF _Toc231084628 \h </w:instrText>
         </w:r>
         <w:r>
           <w:rPr>
@@ -5052,7 +5052,7 @@
           <w14:ligatures w14:val="standardContextual"/>
         </w:rPr>
       </w:pPr>
-      <w:hyperlink w:anchor="_Toc231083352" w:history="1">
+      <w:hyperlink w:anchor="_Toc231084629" w:history="1">
         <w:r>
           <w:rPr>
             <w:rStyle w:val="Hipervnculo"/>
@@ -5079,7 +5079,7 @@
             <w:noProof/>
             <w:webHidden/>
           </w:rPr>
-          <w:instrText xml:space="preserve"> PAGEREF _Toc231083352 \h </w:instrText>
+          <w:instrText xml:space="preserve"> PAGEREF _Toc231084629 \h </w:instrText>
         </w:r>
         <w:r>
           <w:rPr>
@@ -5126,7 +5126,7 @@
           <w14:ligatures w14:val="standardContextual"/>
         </w:rPr>
       </w:pPr>
-      <w:hyperlink w:anchor="_Toc231083353" w:history="1">
+      <w:hyperlink w:anchor="_Toc231084630" w:history="1">
         <w:r>
           <w:rPr>
             <w:rStyle w:val="Hipervnculo"/>
@@ -5153,7 +5153,7 @@
             <w:noProof/>
             <w:webHidden/>
           </w:rPr>
-          <w:instrText xml:space="preserve"> PAGEREF _Toc231083353 \h </w:instrText>
+          <w:instrText xml:space="preserve"> PAGEREF _Toc231084630 \h </w:instrText>
         </w:r>
         <w:r>
           <w:rPr>
@@ -5200,7 +5200,7 @@
           <w14:ligatures w14:val="standardContextual"/>
         </w:rPr>
       </w:pPr>
-      <w:hyperlink w:anchor="_Toc231083354" w:history="1">
+      <w:hyperlink w:anchor="_Toc231084631" w:history="1">
         <w:r>
           <w:rPr>
             <w:rStyle w:val="Hipervnculo"/>
@@ -5227,7 +5227,7 @@
             <w:noProof/>
             <w:webHidden/>
           </w:rPr>
-          <w:instrText xml:space="preserve"> PAGEREF _Toc231083354 \h </w:instrText>
+          <w:instrText xml:space="preserve"> PAGEREF _Toc231084631 \h </w:instrText>
         </w:r>
         <w:r>
           <w:rPr>
@@ -5274,7 +5274,7 @@
           <w14:ligatures w14:val="standardContextual"/>
         </w:rPr>
       </w:pPr>
-      <w:hyperlink w:anchor="_Toc231083355" w:history="1">
+      <w:hyperlink w:anchor="_Toc231084632" w:history="1">
         <w:r>
           <w:rPr>
             <w:rStyle w:val="Hipervnculo"/>
@@ -5301,7 +5301,7 @@
             <w:noProof/>
             <w:webHidden/>
           </w:rPr>
-          <w:instrText xml:space="preserve"> PAGEREF _Toc231083355 \h </w:instrText>
+          <w:instrText xml:space="preserve"> PAGEREF _Toc231084632 \h </w:instrText>
         </w:r>
         <w:r>
           <w:rPr>
@@ -5348,7 +5348,7 @@
           <w14:ligatures w14:val="standardContextual"/>
         </w:rPr>
       </w:pPr>
-      <w:hyperlink w:anchor="_Toc231083356" w:history="1">
+      <w:hyperlink w:anchor="_Toc231084633" w:history="1">
         <w:r>
           <w:rPr>
             <w:rStyle w:val="Hipervnculo"/>
@@ -5375,7 +5375,7 @@
             <w:noProof/>
             <w:webHidden/>
           </w:rPr>
-          <w:instrText xml:space="preserve"> PAGEREF _Toc231083356 \h </w:instrText>
+          <w:instrText xml:space="preserve"> PAGEREF _Toc231084633 \h </w:instrText>
         </w:r>
         <w:r>
           <w:rPr>
@@ -5422,7 +5422,7 @@
           <w14:ligatures w14:val="standardContextual"/>
         </w:rPr>
       </w:pPr>
-      <w:hyperlink w:anchor="_Toc231083357" w:history="1">
+      <w:hyperlink w:anchor="_Toc231084634" w:history="1">
         <w:r>
           <w:rPr>
             <w:rStyle w:val="Hipervnculo"/>
@@ -5449,7 +5449,7 @@
             <w:noProof/>
             <w:webHidden/>
           </w:rPr>
-          <w:instrText xml:space="preserve"> PAGEREF _Toc231083357 \h </w:instrText>
+          <w:instrText xml:space="preserve"> PAGEREF _Toc231084634 \h </w:instrText>
         </w:r>
         <w:r>
           <w:rPr>
@@ -5496,7 +5496,7 @@
           <w14:ligatures w14:val="standardContextual"/>
         </w:rPr>
       </w:pPr>
-      <w:hyperlink w:anchor="_Toc231083358" w:history="1">
+      <w:hyperlink w:anchor="_Toc231084635" w:history="1">
         <w:r>
           <w:rPr>
             <w:rStyle w:val="Hipervnculo"/>
@@ -5523,7 +5523,7 @@
             <w:noProof/>
             <w:webHidden/>
           </w:rPr>
-          <w:instrText xml:space="preserve"> PAGEREF _Toc231083358 \h </w:instrText>
+          <w:instrText xml:space="preserve"> PAGEREF _Toc231084635 \h </w:instrText>
         </w:r>
         <w:r>
           <w:rPr>
@@ -5570,7 +5570,7 @@
           <w14:ligatures w14:val="standardContextual"/>
         </w:rPr>
       </w:pPr>
-      <w:hyperlink w:anchor="_Toc231083359" w:history="1">
+      <w:hyperlink w:anchor="_Toc231084636" w:history="1">
         <w:r>
           <w:rPr>
             <w:rStyle w:val="Hipervnculo"/>
@@ -5597,7 +5597,7 @@
             <w:noProof/>
             <w:webHidden/>
           </w:rPr>
-          <w:instrText xml:space="preserve"> PAGEREF _Toc231083359 \h </w:instrText>
+          <w:instrText xml:space="preserve"> PAGEREF _Toc231084636 \h </w:instrText>
         </w:r>
         <w:r>
           <w:rPr>
@@ -5644,7 +5644,7 @@
           <w14:ligatures w14:val="standardContextual"/>
         </w:rPr>
       </w:pPr>
-      <w:hyperlink w:anchor="_Toc231083360" w:history="1">
+      <w:hyperlink w:anchor="_Toc231084637" w:history="1">
         <w:r>
           <w:rPr>
             <w:rStyle w:val="Hipervnculo"/>
@@ -5671,7 +5671,7 @@
             <w:noProof/>
             <w:webHidden/>
           </w:rPr>
-          <w:instrText xml:space="preserve"> PAGEREF _Toc231083360 \h </w:instrText>
+          <w:instrText xml:space="preserve"> PAGEREF _Toc231084637 \h </w:instrText>
         </w:r>
         <w:r>
           <w:rPr>
@@ -5719,7 +5719,7 @@
       <w:pPr>
         <w:pStyle w:val="Ttulo1"/>
       </w:pPr>
-      <w:bookmarkStart w:id="7" w:name="_Toc231083297"/>
+      <w:bookmarkStart w:id="7" w:name="_Toc231084574"/>
       <w:r>
         <w:lastRenderedPageBreak/>
         <w:t>Índice de tablas</w:t>
@@ -5751,7 +5751,7 @@
       <w:r>
         <w:fldChar w:fldCharType="separate"/>
       </w:r>
-      <w:hyperlink w:anchor="_Toc231083361" w:history="1">
+      <w:hyperlink w:anchor="_Toc231084638" w:history="1">
         <w:r>
           <w:rPr>
             <w:rStyle w:val="Hipervnculo"/>
@@ -5778,7 +5778,7 @@
             <w:noProof/>
             <w:webHidden/>
           </w:rPr>
-          <w:instrText xml:space="preserve"> PAGEREF _Toc231083361 \h </w:instrText>
+          <w:instrText xml:space="preserve"> PAGEREF _Toc231084638 \h </w:instrText>
         </w:r>
         <w:r>
           <w:rPr>
@@ -5825,7 +5825,7 @@
           <w14:ligatures w14:val="standardContextual"/>
         </w:rPr>
       </w:pPr>
-      <w:hyperlink w:anchor="_Toc231083362" w:history="1">
+      <w:hyperlink w:anchor="_Toc231084639" w:history="1">
         <w:r>
           <w:rPr>
             <w:rStyle w:val="Hipervnculo"/>
@@ -5852,7 +5852,7 @@
             <w:noProof/>
             <w:webHidden/>
           </w:rPr>
-          <w:instrText xml:space="preserve"> PAGEREF _Toc231083362 \h </w:instrText>
+          <w:instrText xml:space="preserve"> PAGEREF _Toc231084639 \h </w:instrText>
         </w:r>
         <w:r>
           <w:rPr>
@@ -5899,7 +5899,7 @@
           <w14:ligatures w14:val="standardContextual"/>
         </w:rPr>
       </w:pPr>
-      <w:hyperlink w:anchor="_Toc231083363" w:history="1">
+      <w:hyperlink w:anchor="_Toc231084640" w:history="1">
         <w:r>
           <w:rPr>
             <w:rStyle w:val="Hipervnculo"/>
@@ -5926,7 +5926,7 @@
             <w:noProof/>
             <w:webHidden/>
           </w:rPr>
-          <w:instrText xml:space="preserve"> PAGEREF _Toc231083363 \h </w:instrText>
+          <w:instrText xml:space="preserve"> PAGEREF _Toc231084640 \h </w:instrText>
         </w:r>
         <w:r>
           <w:rPr>
@@ -5973,7 +5973,7 @@
           <w14:ligatures w14:val="standardContextual"/>
         </w:rPr>
       </w:pPr>
-      <w:hyperlink w:anchor="_Toc231083364" w:history="1">
+      <w:hyperlink w:anchor="_Toc231084641" w:history="1">
         <w:r>
           <w:rPr>
             <w:rStyle w:val="Hipervnculo"/>
@@ -6000,7 +6000,7 @@
             <w:noProof/>
             <w:webHidden/>
           </w:rPr>
-          <w:instrText xml:space="preserve"> PAGEREF _Toc231083364 \h </w:instrText>
+          <w:instrText xml:space="preserve"> PAGEREF _Toc231084641 \h </w:instrText>
         </w:r>
         <w:r>
           <w:rPr>
@@ -6047,7 +6047,7 @@
           <w14:ligatures w14:val="standardContextual"/>
         </w:rPr>
       </w:pPr>
-      <w:hyperlink w:anchor="_Toc231083365" w:history="1">
+      <w:hyperlink w:anchor="_Toc231084642" w:history="1">
         <w:r>
           <w:rPr>
             <w:rStyle w:val="Hipervnculo"/>
@@ -6074,7 +6074,7 @@
             <w:noProof/>
             <w:webHidden/>
           </w:rPr>
-          <w:instrText xml:space="preserve"> PAGEREF _Toc231083365 \h </w:instrText>
+          <w:instrText xml:space="preserve"> PAGEREF _Toc231084642 \h </w:instrText>
         </w:r>
         <w:r>
           <w:rPr>
@@ -6121,7 +6121,7 @@
           <w14:ligatures w14:val="standardContextual"/>
         </w:rPr>
       </w:pPr>
-      <w:hyperlink w:anchor="_Toc231083366" w:history="1">
+      <w:hyperlink w:anchor="_Toc231084643" w:history="1">
         <w:r>
           <w:rPr>
             <w:rStyle w:val="Hipervnculo"/>
@@ -6148,7 +6148,7 @@
             <w:noProof/>
             <w:webHidden/>
           </w:rPr>
-          <w:instrText xml:space="preserve"> PAGEREF _Toc231083366 \h </w:instrText>
+          <w:instrText xml:space="preserve"> PAGEREF _Toc231084643 \h </w:instrText>
         </w:r>
         <w:r>
           <w:rPr>
@@ -6195,7 +6195,7 @@
           <w14:ligatures w14:val="standardContextual"/>
         </w:rPr>
       </w:pPr>
-      <w:hyperlink w:anchor="_Toc231083367" w:history="1">
+      <w:hyperlink w:anchor="_Toc231084644" w:history="1">
         <w:r>
           <w:rPr>
             <w:rStyle w:val="Hipervnculo"/>
@@ -6222,7 +6222,7 @@
             <w:noProof/>
             <w:webHidden/>
           </w:rPr>
-          <w:instrText xml:space="preserve"> PAGEREF _Toc231083367 \h </w:instrText>
+          <w:instrText xml:space="preserve"> PAGEREF _Toc231084644 \h </w:instrText>
         </w:r>
         <w:r>
           <w:rPr>
@@ -6269,7 +6269,7 @@
           <w14:ligatures w14:val="standardContextual"/>
         </w:rPr>
       </w:pPr>
-      <w:hyperlink w:anchor="_Toc231083368" w:history="1">
+      <w:hyperlink w:anchor="_Toc231084645" w:history="1">
         <w:r>
           <w:rPr>
             <w:rStyle w:val="Hipervnculo"/>
@@ -6296,7 +6296,7 @@
             <w:noProof/>
             <w:webHidden/>
           </w:rPr>
-          <w:instrText xml:space="preserve"> PAGEREF _Toc231083368 \h </w:instrText>
+          <w:instrText xml:space="preserve"> PAGEREF _Toc231084645 \h </w:instrText>
         </w:r>
         <w:r>
           <w:rPr>
@@ -6343,7 +6343,7 @@
           <w14:ligatures w14:val="standardContextual"/>
         </w:rPr>
       </w:pPr>
-      <w:hyperlink w:anchor="_Toc231083369" w:history="1">
+      <w:hyperlink w:anchor="_Toc231084646" w:history="1">
         <w:r>
           <w:rPr>
             <w:rStyle w:val="Hipervnculo"/>
@@ -6370,7 +6370,7 @@
             <w:noProof/>
             <w:webHidden/>
           </w:rPr>
-          <w:instrText xml:space="preserve"> PAGEREF _Toc231083369 \h </w:instrText>
+          <w:instrText xml:space="preserve"> PAGEREF _Toc231084646 \h </w:instrText>
         </w:r>
         <w:r>
           <w:rPr>
@@ -6417,7 +6417,7 @@
           <w14:ligatures w14:val="standardContextual"/>
         </w:rPr>
       </w:pPr>
-      <w:hyperlink w:anchor="_Toc231083370" w:history="1">
+      <w:hyperlink w:anchor="_Toc231084647" w:history="1">
         <w:r>
           <w:rPr>
             <w:rStyle w:val="Hipervnculo"/>
@@ -6444,7 +6444,7 @@
             <w:noProof/>
             <w:webHidden/>
           </w:rPr>
-          <w:instrText xml:space="preserve"> PAGEREF _Toc231083370 \h </w:instrText>
+          <w:instrText xml:space="preserve"> PAGEREF _Toc231084647 \h </w:instrText>
         </w:r>
         <w:r>
           <w:rPr>
@@ -6491,7 +6491,7 @@
           <w14:ligatures w14:val="standardContextual"/>
         </w:rPr>
       </w:pPr>
-      <w:hyperlink w:anchor="_Toc231083371" w:history="1">
+      <w:hyperlink w:anchor="_Toc231084648" w:history="1">
         <w:r>
           <w:rPr>
             <w:rStyle w:val="Hipervnculo"/>
@@ -6518,7 +6518,7 @@
             <w:noProof/>
             <w:webHidden/>
           </w:rPr>
-          <w:instrText xml:space="preserve"> PAGEREF _Toc231083371 \h </w:instrText>
+          <w:instrText xml:space="preserve"> PAGEREF _Toc231084648 \h </w:instrText>
         </w:r>
         <w:r>
           <w:rPr>
@@ -6565,7 +6565,7 @@
           <w14:ligatures w14:val="standardContextual"/>
         </w:rPr>
       </w:pPr>
-      <w:hyperlink w:anchor="_Toc231083372" w:history="1">
+      <w:hyperlink w:anchor="_Toc231084649" w:history="1">
         <w:r>
           <w:rPr>
             <w:rStyle w:val="Hipervnculo"/>
@@ -6592,7 +6592,7 @@
             <w:noProof/>
             <w:webHidden/>
           </w:rPr>
-          <w:instrText xml:space="preserve"> PAGEREF _Toc231083372 \h </w:instrText>
+          <w:instrText xml:space="preserve"> PAGEREF _Toc231084649 \h </w:instrText>
         </w:r>
         <w:r>
           <w:rPr>
@@ -6639,7 +6639,7 @@
           <w14:ligatures w14:val="standardContextual"/>
         </w:rPr>
       </w:pPr>
-      <w:hyperlink w:anchor="_Toc231083373" w:history="1">
+      <w:hyperlink w:anchor="_Toc231084650" w:history="1">
         <w:r>
           <w:rPr>
             <w:rStyle w:val="Hipervnculo"/>
@@ -6666,7 +6666,7 @@
             <w:noProof/>
             <w:webHidden/>
           </w:rPr>
-          <w:instrText xml:space="preserve"> PAGEREF _Toc231083373 \h </w:instrText>
+          <w:instrText xml:space="preserve"> PAGEREF _Toc231084650 \h </w:instrText>
         </w:r>
         <w:r>
           <w:rPr>
@@ -6713,7 +6713,7 @@
           <w14:ligatures w14:val="standardContextual"/>
         </w:rPr>
       </w:pPr>
-      <w:hyperlink w:anchor="_Toc231083374" w:history="1">
+      <w:hyperlink w:anchor="_Toc231084651" w:history="1">
         <w:r>
           <w:rPr>
             <w:rStyle w:val="Hipervnculo"/>
@@ -6740,7 +6740,7 @@
             <w:noProof/>
             <w:webHidden/>
           </w:rPr>
-          <w:instrText xml:space="preserve"> PAGEREF _Toc231083374 \h </w:instrText>
+          <w:instrText xml:space="preserve"> PAGEREF _Toc231084651 \h </w:instrText>
         </w:r>
         <w:r>
           <w:rPr>
@@ -6788,7 +6788,7 @@
       <w:pPr>
         <w:pStyle w:val="Ttulo1"/>
       </w:pPr>
-      <w:bookmarkStart w:id="8" w:name="_Toc231083298"/>
+      <w:bookmarkStart w:id="8" w:name="_Toc231084575"/>
       <w:r>
         <w:lastRenderedPageBreak/>
         <w:t>Índice de figuras</w:t>
@@ -6820,7 +6820,7 @@
       <w:r>
         <w:fldChar w:fldCharType="separate"/>
       </w:r>
-      <w:hyperlink w:anchor="_Toc231083375" w:history="1">
+      <w:hyperlink w:anchor="_Toc231084652" w:history="1">
         <w:r>
           <w:rPr>
             <w:rStyle w:val="Hipervnculo"/>
@@ -6847,7 +6847,7 @@
             <w:noProof/>
             <w:webHidden/>
           </w:rPr>
-          <w:instrText xml:space="preserve"> PAGEREF _Toc231083375 \h </w:instrText>
+          <w:instrText xml:space="preserve"> PAGEREF _Toc231084652 \h </w:instrText>
         </w:r>
         <w:r>
           <w:rPr>
@@ -6894,7 +6894,7 @@
           <w14:ligatures w14:val="standardContextual"/>
         </w:rPr>
       </w:pPr>
-      <w:hyperlink w:anchor="_Toc231083376" w:history="1">
+      <w:hyperlink w:anchor="_Toc231084653" w:history="1">
         <w:r>
           <w:rPr>
             <w:rStyle w:val="Hipervnculo"/>
@@ -6921,7 +6921,7 @@
             <w:noProof/>
             <w:webHidden/>
           </w:rPr>
-          <w:instrText xml:space="preserve"> PAGEREF _Toc231083376 \h </w:instrText>
+          <w:instrText xml:space="preserve"> PAGEREF _Toc231084653 \h </w:instrText>
         </w:r>
         <w:r>
           <w:rPr>
@@ -6968,7 +6968,7 @@
           <w14:ligatures w14:val="standardContextual"/>
         </w:rPr>
       </w:pPr>
-      <w:hyperlink w:anchor="_Toc231083377" w:history="1">
+      <w:hyperlink w:anchor="_Toc231084654" w:history="1">
         <w:r>
           <w:rPr>
             <w:rStyle w:val="Hipervnculo"/>
@@ -6995,7 +6995,7 @@
             <w:noProof/>
             <w:webHidden/>
           </w:rPr>
-          <w:instrText xml:space="preserve"> PAGEREF _Toc231083377 \h </w:instrText>
+          <w:instrText xml:space="preserve"> PAGEREF _Toc231084654 \h </w:instrText>
         </w:r>
         <w:r>
           <w:rPr>
@@ -7042,7 +7042,7 @@
           <w14:ligatures w14:val="standardContextual"/>
         </w:rPr>
       </w:pPr>
-      <w:hyperlink w:anchor="_Toc231083378" w:history="1">
+      <w:hyperlink w:anchor="_Toc231084655" w:history="1">
         <w:r>
           <w:rPr>
             <w:rStyle w:val="Hipervnculo"/>
@@ -7069,7 +7069,7 @@
             <w:noProof/>
             <w:webHidden/>
           </w:rPr>
-          <w:instrText xml:space="preserve"> PAGEREF _Toc231083378 \h </w:instrText>
+          <w:instrText xml:space="preserve"> PAGEREF _Toc231084655 \h </w:instrText>
         </w:r>
         <w:r>
           <w:rPr>
@@ -7116,7 +7116,7 @@
           <w14:ligatures w14:val="standardContextual"/>
         </w:rPr>
       </w:pPr>
-      <w:hyperlink w:anchor="_Toc231083379" w:history="1">
+      <w:hyperlink w:anchor="_Toc231084656" w:history="1">
         <w:r>
           <w:rPr>
             <w:rStyle w:val="Hipervnculo"/>
@@ -7143,7 +7143,7 @@
             <w:noProof/>
             <w:webHidden/>
           </w:rPr>
-          <w:instrText xml:space="preserve"> PAGEREF _Toc231083379 \h </w:instrText>
+          <w:instrText xml:space="preserve"> PAGEREF _Toc231084656 \h </w:instrText>
         </w:r>
         <w:r>
           <w:rPr>
@@ -7190,7 +7190,7 @@
           <w14:ligatures w14:val="standardContextual"/>
         </w:rPr>
       </w:pPr>
-      <w:hyperlink w:anchor="_Toc231083380" w:history="1">
+      <w:hyperlink w:anchor="_Toc231084657" w:history="1">
         <w:r>
           <w:rPr>
             <w:rStyle w:val="Hipervnculo"/>
@@ -7217,7 +7217,7 @@
             <w:noProof/>
             <w:webHidden/>
           </w:rPr>
-          <w:instrText xml:space="preserve"> PAGEREF _Toc231083380 \h </w:instrText>
+          <w:instrText xml:space="preserve"> PAGEREF _Toc231084657 \h </w:instrText>
         </w:r>
         <w:r>
           <w:rPr>
@@ -7265,7 +7265,7 @@
       <w:pPr>
         <w:pStyle w:val="Ttulo1"/>
       </w:pPr>
-      <w:bookmarkStart w:id="9" w:name="_Toc231083299"/>
+      <w:bookmarkStart w:id="9" w:name="_Toc231084576"/>
       <w:r>
         <w:lastRenderedPageBreak/>
         <w:t>Lista de abreviaturas y siglas</w:t>
@@ -8051,7 +8051,7 @@
       <w:pPr>
         <w:pStyle w:val="Ttulo1"/>
       </w:pPr>
-      <w:bookmarkStart w:id="10" w:name="_Toc231083300"/>
+      <w:bookmarkStart w:id="10" w:name="_Toc231084577"/>
       <w:r>
         <w:lastRenderedPageBreak/>
         <w:t>Capítulo 1 — Introducción</w:t>
@@ -8062,7 +8062,7 @@
       <w:pPr>
         <w:pStyle w:val="Ttulo2"/>
       </w:pPr>
-      <w:bookmarkStart w:id="11" w:name="_Toc231083301"/>
+      <w:bookmarkStart w:id="11" w:name="_Toc231084578"/>
       <w:r>
         <w:t>1.1 Contextualización</w:t>
       </w:r>
@@ -8150,7 +8150,7 @@
       <w:pPr>
         <w:pStyle w:val="Ttulo2"/>
       </w:pPr>
-      <w:bookmarkStart w:id="12" w:name="_Toc231083302"/>
+      <w:bookmarkStart w:id="12" w:name="_Toc231084579"/>
       <w:r>
         <w:t>1.2 Problema de investigación y justificación</w:t>
       </w:r>
@@ -8260,7 +8260,7 @@
       <w:pPr>
         <w:pStyle w:val="Ttulo2"/>
       </w:pPr>
-      <w:bookmarkStart w:id="13" w:name="_Toc231083303"/>
+      <w:bookmarkStart w:id="13" w:name="_Toc231084580"/>
       <w:r>
         <w:t>1.3 Pregunta y objetivos de investigación</w:t>
       </w:r>
@@ -8445,7 +8445,7 @@
       <w:pPr>
         <w:pStyle w:val="Ttulo2"/>
       </w:pPr>
-      <w:bookmarkStart w:id="14" w:name="_Toc231083304"/>
+      <w:bookmarkStart w:id="14" w:name="_Toc231084581"/>
       <w:r>
         <w:lastRenderedPageBreak/>
         <w:t>1.4 Hipótesis general</w:t>
@@ -8489,7 +8489,7 @@
       <w:pPr>
         <w:pStyle w:val="Ttulo2"/>
       </w:pPr>
-      <w:bookmarkStart w:id="15" w:name="_Toc231083305"/>
+      <w:bookmarkStart w:id="15" w:name="_Toc231084582"/>
       <w:r>
         <w:t>1.5 Aspectos metodológicos y alcance</w:t>
       </w:r>
@@ -8592,7 +8592,7 @@
       <w:pPr>
         <w:pStyle w:val="Ttulo2"/>
       </w:pPr>
-      <w:bookmarkStart w:id="16" w:name="_Toc231083306"/>
+      <w:bookmarkStart w:id="16" w:name="_Toc231084583"/>
       <w:r>
         <w:t>1.6 Aportes esperados</w:t>
       </w:r>
@@ -8645,7 +8645,7 @@
       <w:pPr>
         <w:pStyle w:val="Ttulo2"/>
       </w:pPr>
-      <w:bookmarkStart w:id="17" w:name="_Toc231083307"/>
+      <w:bookmarkStart w:id="17" w:name="_Toc231084584"/>
       <w:r>
         <w:t>1.7 Estructura de la tesis</w:t>
       </w:r>
@@ -8686,7 +8686,7 @@
       <w:pPr>
         <w:pStyle w:val="Ttulo1"/>
       </w:pPr>
-      <w:bookmarkStart w:id="18" w:name="_Toc231083308"/>
+      <w:bookmarkStart w:id="18" w:name="_Toc231084585"/>
       <w:r>
         <w:lastRenderedPageBreak/>
         <w:t>Capítulo 2 — Marco teórico y revisión de literatura</w:t>
@@ -8697,7 +8697,7 @@
       <w:pPr>
         <w:pStyle w:val="Ttulo2"/>
       </w:pPr>
-      <w:bookmarkStart w:id="19" w:name="_Toc231083309"/>
+      <w:bookmarkStart w:id="19" w:name="_Toc231084586"/>
       <w:r>
         <w:t>2.1 Determinantes macroeconómicos de los retornos accionarios</w:t>
       </w:r>
@@ -8995,7 +8995,7 @@
       <w:pPr>
         <w:pStyle w:val="Ttulo2"/>
       </w:pPr>
-      <w:bookmarkStart w:id="20" w:name="_Toc231083310"/>
+      <w:bookmarkStart w:id="20" w:name="_Toc231084587"/>
       <w:r>
         <w:t>2.2 Precios de commodities y valoración de empresas mineras</w:t>
       </w:r>
@@ -9129,7 +9129,7 @@
       <w:pPr>
         <w:pStyle w:val="Ttulo2"/>
       </w:pPr>
-      <w:bookmarkStart w:id="21" w:name="_Toc231083311"/>
+      <w:bookmarkStart w:id="21" w:name="_Toc231084588"/>
       <w:r>
         <w:t>2.3 Tipo de cambio y exposición de empresas exportadoras</w:t>
       </w:r>
@@ -9223,7 +9223,7 @@
       <w:pPr>
         <w:pStyle w:val="Ttulo2"/>
       </w:pPr>
-      <w:bookmarkStart w:id="22" w:name="_Toc231083312"/>
+      <w:bookmarkStart w:id="22" w:name="_Toc231084589"/>
       <w:r>
         <w:t>2.4 Cobre, tipo de cambio y la economía chilena</w:t>
       </w:r>
@@ -9448,7 +9448,7 @@
       <w:pPr>
         <w:pStyle w:val="Ttulo2"/>
       </w:pPr>
-      <w:bookmarkStart w:id="23" w:name="_Toc231083313"/>
+      <w:bookmarkStart w:id="23" w:name="_Toc231084590"/>
       <w:r>
         <w:lastRenderedPageBreak/>
         <w:t>2.5 Eficiencia informacional y segmentación de mercados</w:t>
@@ -9589,7 +9589,7 @@
       <w:pPr>
         <w:pStyle w:val="Ttulo2"/>
       </w:pPr>
-      <w:bookmarkStart w:id="24" w:name="_Toc231083314"/>
+      <w:bookmarkStart w:id="24" w:name="_Toc231084591"/>
       <w:r>
         <w:t>2.6 Enfoques econométricos para la medición de impacto</w:t>
       </w:r>
@@ -9741,7 +9741,7 @@
       <w:pPr>
         <w:pStyle w:val="Ttulo2"/>
       </w:pPr>
-      <w:bookmarkStart w:id="25" w:name="_Toc231083315"/>
+      <w:bookmarkStart w:id="25" w:name="_Toc231084592"/>
       <w:r>
         <w:t>2.7 Síntesis e identificación del vacío de investigación</w:t>
       </w:r>
@@ -9866,7 +9866,7 @@
       <w:pPr>
         <w:pStyle w:val="Ttulo3"/>
       </w:pPr>
-      <w:bookmarkStart w:id="26" w:name="_Toc231083316"/>
+      <w:bookmarkStart w:id="26" w:name="_Toc231084593"/>
       <w:r>
         <w:t>Nota sobre la tabla de literatura</w:t>
       </w:r>
@@ -9896,7 +9896,7 @@
       <w:pPr>
         <w:pStyle w:val="Ttulo1"/>
       </w:pPr>
-      <w:bookmarkStart w:id="27" w:name="_Toc231083317"/>
+      <w:bookmarkStart w:id="27" w:name="_Toc231084594"/>
       <w:r>
         <w:lastRenderedPageBreak/>
         <w:t>Capítulo 3 — Datos y metodología</w:t>
@@ -9907,7 +9907,7 @@
       <w:pPr>
         <w:pStyle w:val="Ttulo2"/>
       </w:pPr>
-      <w:bookmarkStart w:id="28" w:name="_Toc231083318"/>
+      <w:bookmarkStart w:id="28" w:name="_Toc231084595"/>
       <w:r>
         <w:t xml:space="preserve">3.1 </w:t>
       </w:r>
@@ -10102,7 +10102,7 @@
       <w:pPr>
         <w:pStyle w:val="Ttulo2"/>
       </w:pPr>
-      <w:bookmarkStart w:id="29" w:name="_Toc231083319"/>
+      <w:bookmarkStart w:id="29" w:name="_Toc231084596"/>
       <w:r>
         <w:t>3.2 Variable dependiente</w:t>
       </w:r>
@@ -10164,7 +10164,7 @@
       <w:pPr>
         <w:pStyle w:val="Ttulo2"/>
       </w:pPr>
-      <w:bookmarkStart w:id="30" w:name="_Toc231083320"/>
+      <w:bookmarkStart w:id="30" w:name="_Toc231084597"/>
       <w:r>
         <w:t>3.3 Variables explicativas</w:t>
       </w:r>
@@ -10231,7 +10231,7 @@
       <w:pPr>
         <w:pStyle w:val="Ttulo2"/>
       </w:pPr>
-      <w:bookmarkStart w:id="31" w:name="_Toc231083321"/>
+      <w:bookmarkStart w:id="31" w:name="_Toc231084598"/>
       <w:r>
         <w:t>3.4 Tratamiento de datos y frecuencias mixtas</w:t>
       </w:r>
@@ -10288,7 +10288,7 @@
       <w:pPr>
         <w:pStyle w:val="Ttulo2"/>
       </w:pPr>
-      <w:bookmarkStart w:id="32" w:name="_Toc231083322"/>
+      <w:bookmarkStart w:id="32" w:name="_Toc231084599"/>
       <w:r>
         <w:t>3.5 Datación de las fases del ciclo del cobre</w:t>
       </w:r>
@@ -10354,7 +10354,7 @@
       <w:pPr>
         <w:pStyle w:val="Ttulo2"/>
       </w:pPr>
-      <w:bookmarkStart w:id="33" w:name="_Toc231083323"/>
+      <w:bookmarkStart w:id="33" w:name="_Toc231084600"/>
       <w:r>
         <w:lastRenderedPageBreak/>
         <w:t>3.6 Estrategia econométrica</w:t>
@@ -10365,7 +10365,7 @@
       <w:pPr>
         <w:pStyle w:val="Ttulo3"/>
       </w:pPr>
-      <w:bookmarkStart w:id="34" w:name="_Toc231083324"/>
+      <w:bookmarkStart w:id="34" w:name="_Toc231084601"/>
       <w:r>
         <w:t>3.6.1 Estacionariedad y orden de integración (OE1)</w:t>
       </w:r>
@@ -10408,7 +10408,7 @@
       <w:pPr>
         <w:pStyle w:val="Ttulo3"/>
       </w:pPr>
-      <w:bookmarkStart w:id="35" w:name="_Toc231083325"/>
+      <w:bookmarkStart w:id="35" w:name="_Toc231084602"/>
       <w:r>
         <w:t>3.6.2 Modelo de impacto: panel de efectos fijos (OE2)</w:t>
       </w:r>
@@ -10499,7 +10499,7 @@
       <w:pPr>
         <w:pStyle w:val="Ttulo3"/>
       </w:pPr>
-      <w:bookmarkStart w:id="36" w:name="_Toc231083326"/>
+      <w:bookmarkStart w:id="36" w:name="_Toc231084603"/>
       <w:r>
         <w:t>3.6.3 Relaciones de largo plazo: cointegración (OE3)</w:t>
       </w:r>
@@ -10600,7 +10600,7 @@
       <w:pPr>
         <w:pStyle w:val="Ttulo3"/>
       </w:pPr>
-      <w:bookmarkStart w:id="37" w:name="_Toc231083327"/>
+      <w:bookmarkStart w:id="37" w:name="_Toc231084604"/>
       <w:r>
         <w:t>3.6.4 Dinámica de shocks: VAR, impulso-respuesta y descomposición de varianza (OE4)</w:t>
       </w:r>
@@ -10720,7 +10720,7 @@
       <w:pPr>
         <w:pStyle w:val="Ttulo3"/>
       </w:pPr>
-      <w:bookmarkStart w:id="38" w:name="_Toc231083328"/>
+      <w:bookmarkStart w:id="38" w:name="_Toc231084605"/>
       <w:r>
         <w:t>3.6.5 Estabilidad por fases del ciclo (OE5)</w:t>
       </w:r>
@@ -10766,7 +10766,7 @@
       <w:pPr>
         <w:pStyle w:val="Ttulo3"/>
       </w:pPr>
-      <w:bookmarkStart w:id="39" w:name="_Toc231083329"/>
+      <w:bookmarkStart w:id="39" w:name="_Toc231084606"/>
       <w:r>
         <w:t>3.6.6 Comparación entre mercados: triangulación (OE6)</w:t>
       </w:r>
@@ -10817,7 +10817,7 @@
       <w:pPr>
         <w:pStyle w:val="Ttulo2"/>
       </w:pPr>
-      <w:bookmarkStart w:id="40" w:name="_Toc231083330"/>
+      <w:bookmarkStart w:id="40" w:name="_Toc231084607"/>
       <w:r>
         <w:t xml:space="preserve">3.7 </w:t>
       </w:r>
@@ -10870,7 +10870,7 @@
       <w:pPr>
         <w:pStyle w:val="Ttulo3"/>
       </w:pPr>
-      <w:bookmarkStart w:id="41" w:name="_Toc231083331"/>
+      <w:bookmarkStart w:id="41" w:name="_Toc231084608"/>
       <w:r>
         <w:t>Tabla 3.1 — Definición operativa de variables (resumen)</w:t>
       </w:r>
@@ -10882,7 +10882,7 @@
         <w:spacing w:before="40" w:after="40"/>
         <w:jc w:val="center"/>
       </w:pPr>
-      <w:bookmarkStart w:id="42" w:name="_Toc231083361"/>
+      <w:bookmarkStart w:id="42" w:name="_Toc231084638"/>
       <w:r>
         <w:rPr>
           <w:i w:val="0"/>
@@ -12851,7 +12851,7 @@
       <w:pPr>
         <w:pStyle w:val="Ttulo1"/>
       </w:pPr>
-      <w:bookmarkStart w:id="43" w:name="_Toc231083332"/>
+      <w:bookmarkStart w:id="43" w:name="_Toc231084609"/>
       <w:r>
         <w:lastRenderedPageBreak/>
         <w:t>Capítulo 4 — Resultados y discusión</w:t>
@@ -12862,7 +12862,7 @@
       <w:pPr>
         <w:pStyle w:val="Ttulo2"/>
       </w:pPr>
-      <w:bookmarkStart w:id="44" w:name="_Toc231083333"/>
+      <w:bookmarkStart w:id="44" w:name="_Toc231084610"/>
       <w:r>
         <w:t>4.1 Análisis descriptivo y propiedades de las series (OE1)</w:t>
       </w:r>
@@ -13092,7 +13092,7 @@
       <w:pPr>
         <w:pStyle w:val="Ttulo2"/>
       </w:pPr>
-      <w:bookmarkStart w:id="45" w:name="_Toc231083334"/>
+      <w:bookmarkStart w:id="45" w:name="_Toc231084611"/>
       <w:r>
         <w:t>4.2 Determinantes de los retornos: global vs local (OE2)</w:t>
       </w:r>
@@ -13114,7 +13114,7 @@
         <w:spacing w:before="40" w:after="40"/>
         <w:jc w:val="center"/>
       </w:pPr>
-      <w:bookmarkStart w:id="46" w:name="_Toc231083362"/>
+      <w:bookmarkStart w:id="46" w:name="_Toc231084639"/>
       <w:r>
         <w:rPr>
           <w:i w:val="0"/>
@@ -13920,7 +13920,7 @@
           <w:noProof/>
         </w:rPr>
         <w:drawing>
-          <wp:inline distT="0" distB="0" distL="0" distR="0" wp14:anchorId="1FFD9AA2" wp14:editId="5F220D25">
+          <wp:inline distT="0" distB="0" distL="0" distR="0" wp14:anchorId="1E53E9E8" wp14:editId="1441339D">
             <wp:extent cx="5212080" cy="2833680"/>
             <wp:effectExtent l="0" t="0" r="0" b="0"/>
             <wp:docPr id="1" name="Picture 1"/>
@@ -13962,7 +13962,7 @@
         <w:spacing w:before="160" w:after="200"/>
         <w:jc w:val="center"/>
       </w:pPr>
-      <w:bookmarkStart w:id="47" w:name="_Toc231083375"/>
+      <w:bookmarkStart w:id="47" w:name="_Toc231084652"/>
       <w:r>
         <w:rPr>
           <w:i w:val="0"/>
@@ -13993,12 +13993,83 @@
       <w:bookmarkEnd w:id="47"/>
     </w:p>
     <w:p>
+      <w:r>
+        <w:rPr>
+          <w:b/>
+        </w:rPr>
+        <w:t>Nota sobre la especificación (efectos fijos vs. aleatorios).</w:t>
+      </w:r>
+      <w:r>
+        <w:t xml:space="preserve"> Conviene precisar por qué se</w:t>
+      </w:r>
+    </w:p>
+    <w:p>
+      <w:r>
+        <w:lastRenderedPageBreak/>
+        <w:t>adoptan efectos fijos. Dado que los regresores son factores macroeconómicos **comunes a todas las</w:t>
+      </w:r>
+    </w:p>
+    <w:p>
+      <w:r>
+        <w:t xml:space="preserve">empresas** —el precio del cobre, el VIX o el tipo de </w:t>
+      </w:r>
+      <w:r>
+        <w:t>cambio toman el mismo valor para cada firma en</w:t>
+      </w:r>
+    </w:p>
+    <w:p>
+      <w:r>
+        <w:t>cada mes—, los estimadores de efectos fijos y de efectos aleatorios producen **pendientes</w:t>
+      </w:r>
+    </w:p>
+    <w:p>
+      <w:r>
+        <w:t>idénticas**; lo único que distingue a ambas especificaciones es el tratamiento de la media</w:t>
+      </w:r>
+    </w:p>
+    <w:p>
+      <w:r>
+        <w:t>específica de cada empresa. En consecuencia, el test de Hausman resulta degenerado (H ≈ 0) y no</w:t>
+      </w:r>
+    </w:p>
+    <w:p>
+      <w:r>
+        <w:t xml:space="preserve">discrimina entre ambos. Se retiene la especificación de </w:t>
+      </w:r>
+      <w:r>
+        <w:rPr>
+          <w:b/>
+        </w:rPr>
+        <w:t>efectos fijos</w:t>
+      </w:r>
+      <w:r>
+        <w:t xml:space="preserve"> porque absorbe la</w:t>
+      </w:r>
+    </w:p>
+    <w:p>
+      <w:r>
+        <w:t xml:space="preserve">heterogeneidad no observada y constante de cada empresa (distintas medias de retorno por </w:t>
+      </w:r>
+      <w:r>
+        <w:t>niveles de</w:t>
+      </w:r>
+    </w:p>
+    <w:p>
+      <w:r>
+        <w:t>riesgo, tamaño o jurisdicción), constituyendo la opción más conservadora y estándar en la</w:t>
+      </w:r>
+    </w:p>
+    <w:p>
+      <w:r>
+        <w:t>literatura financiera.</w:t>
+      </w:r>
+    </w:p>
+    <w:p>
       <w:pPr>
         <w:pStyle w:val="Ttulo2"/>
       </w:pPr>
-      <w:bookmarkStart w:id="48" w:name="_Toc231083335"/>
-      <w:r>
-        <w:lastRenderedPageBreak/>
+      <w:bookmarkStart w:id="48" w:name="_Toc231084612"/>
+      <w:r>
         <w:t>4.3 Relaciones de largo plazo (OE3)</w:t>
       </w:r>
       <w:bookmarkEnd w:id="48"/>
@@ -14058,6 +14129,7 @@
     </w:p>
     <w:p>
       <w:r>
+        <w:lastRenderedPageBreak/>
         <w:t xml:space="preserve">(§4.1), la hipótesis natural es que la relación de equilibrio se </w:t>
       </w:r>
       <w:r>
@@ -14148,7 +14220,6 @@
     </w:p>
     <w:p>
       <w:r>
-        <w:lastRenderedPageBreak/>
         <w:t>evidencia mixta. Este resultado ilustra la importancia de incorporar los quiebres estructurales en</w:t>
       </w:r>
     </w:p>
@@ -14161,7 +14232,7 @@
       <w:pPr>
         <w:pStyle w:val="Ttulo2"/>
       </w:pPr>
-      <w:bookmarkStart w:id="49" w:name="_Toc231083336"/>
+      <w:bookmarkStart w:id="49" w:name="_Toc231084613"/>
       <w:r>
         <w:t>4.4 Dinámica de shocks (OE4)</w:t>
       </w:r>
@@ -14183,7 +14254,7 @@
         <w:spacing w:before="40" w:after="40"/>
         <w:jc w:val="center"/>
       </w:pPr>
-      <w:bookmarkStart w:id="50" w:name="_Toc231083363"/>
+      <w:bookmarkStart w:id="50" w:name="_Toc231084640"/>
       <w:r>
         <w:rPr>
           <w:i w:val="0"/>
@@ -14304,7 +14375,13 @@
               <w:rPr>
                 <w:sz w:val="20"/>
               </w:rPr>
-              <w:t>Componente propio (idiosincrático)</w:t>
+              <w:t xml:space="preserve">Componente propio </w:t>
+            </w:r>
+            <w:r>
+              <w:rPr>
+                <w:sz w:val="20"/>
+              </w:rPr>
+              <w:t>(idiosincrático)</w:t>
             </w:r>
           </w:p>
         </w:tc>
@@ -14568,15 +14645,15 @@
     </w:p>
     <w:p>
       <w:r>
-        <w:t>de manera estadísticamente significativa (F = 9,11; p = 0,003). Más allá del componente</w:t>
-      </w:r>
-    </w:p>
-    <w:p>
-      <w:r>
-        <w:t xml:space="preserve">idiosincrático, **los shocks </w:t>
-      </w:r>
-      <w:r>
-        <w:t>globales (cobre + VIX ≈ 32%) explican una fracción muy superior a</w:t>
+        <w:t xml:space="preserve">de manera estadísticamente </w:t>
+      </w:r>
+      <w:r>
+        <w:t>significativa (F = 9,11; p = 0,003). Más allá del componente</w:t>
+      </w:r>
+    </w:p>
+    <w:p>
+      <w:r>
+        <w:t>idiosincrático, **los shocks globales (cobre + VIX ≈ 32%) explican una fracción muy superior a</w:t>
       </w:r>
     </w:p>
     <w:p>
@@ -14623,9 +14700,8 @@
         <w:rPr>
           <w:noProof/>
         </w:rPr>
-        <w:lastRenderedPageBreak/>
         <w:drawing>
-          <wp:inline distT="0" distB="0" distL="0" distR="0" wp14:anchorId="385F2B8B" wp14:editId="36164AF0">
+          <wp:inline distT="0" distB="0" distL="0" distR="0" wp14:anchorId="2465C8B5" wp14:editId="6FD183D8">
             <wp:extent cx="5212080" cy="3890356"/>
             <wp:effectExtent l="0" t="0" r="0" b="0"/>
             <wp:docPr id="2" name="Picture 2"/>
@@ -14667,7 +14743,7 @@
         <w:spacing w:before="160" w:after="200"/>
         <w:jc w:val="center"/>
       </w:pPr>
-      <w:bookmarkStart w:id="51" w:name="_Toc231083376"/>
+      <w:bookmarkStart w:id="51" w:name="_Toc231084653"/>
       <w:r>
         <w:rPr>
           <w:i w:val="0"/>
@@ -14693,10 +14769,7 @@
         <w:fldChar w:fldCharType="end"/>
       </w:r>
       <w:r>
-        <w:t xml:space="preserve">. Descomposición de la varianza del error de pronóstico del retorno (FEVD, horizonte 12 </w:t>
-      </w:r>
-      <w:r>
-        <w:t>meses).</w:t>
+        <w:t>. Descomposición de la varianza del error de pronóstico del retorno (FEVD, horizonte 12 meses).</w:t>
       </w:r>
       <w:bookmarkEnd w:id="51"/>
     </w:p>
@@ -14721,6 +14794,7 @@
     </w:p>
     <w:p>
       <w:r>
+        <w:lastRenderedPageBreak/>
         <w:t>los meses siguientes, coherente con una incorporación rápida de la información del commodity</w:t>
       </w:r>
     </w:p>
@@ -14738,9 +14812,8 @@
         <w:rPr>
           <w:noProof/>
         </w:rPr>
-        <w:lastRenderedPageBreak/>
         <w:drawing>
-          <wp:inline distT="0" distB="0" distL="0" distR="0" wp14:anchorId="1045B20E" wp14:editId="5CCC86E5">
+          <wp:inline distT="0" distB="0" distL="0" distR="0" wp14:anchorId="53BBE93B" wp14:editId="6AEF6EB2">
             <wp:extent cx="5212080" cy="2531582"/>
             <wp:effectExtent l="0" t="0" r="0" b="0"/>
             <wp:docPr id="3" name="Picture 3"/>
@@ -14782,7 +14855,7 @@
         <w:spacing w:before="160" w:after="200"/>
         <w:jc w:val="center"/>
       </w:pPr>
-      <w:bookmarkStart w:id="52" w:name="_Toc231083377"/>
+      <w:bookmarkStart w:id="52" w:name="_Toc231084654"/>
       <w:r>
         <w:rPr>
           <w:i w:val="0"/>
@@ -14816,7 +14889,7 @@
       <w:pPr>
         <w:pStyle w:val="Ttulo2"/>
       </w:pPr>
-      <w:bookmarkStart w:id="53" w:name="_Toc231083337"/>
+      <w:bookmarkStart w:id="53" w:name="_Toc231084614"/>
       <w:r>
         <w:t>4.5 Estabilidad por fases del ciclo del cobre (OE5)</w:t>
       </w:r>
@@ -14824,10 +14897,7 @@
     </w:p>
     <w:p>
       <w:r>
-        <w:t xml:space="preserve">El algoritmo de </w:t>
-      </w:r>
-      <w:r>
-        <w:t>Bry-Boschan identifica una secuencia coherente de fases de expansión y contracción</w:t>
+        <w:t>El algoritmo de Bry-Boschan identifica una secuencia coherente de fases de expansión y contracción</w:t>
       </w:r>
     </w:p>
     <w:p>
@@ -14908,6 +14978,7 @@
     </w:p>
     <w:p>
       <w:r>
+        <w:lastRenderedPageBreak/>
         <w:t>asimetría (H5 sobre estabilidad) y constituye en sí mismo un hallazgo de interés, sujeto a</w:t>
       </w:r>
     </w:p>
@@ -14925,9 +14996,8 @@
         <w:rPr>
           <w:noProof/>
         </w:rPr>
-        <w:lastRenderedPageBreak/>
         <w:drawing>
-          <wp:inline distT="0" distB="0" distL="0" distR="0" wp14:anchorId="2D5FE7CB" wp14:editId="534C201A">
+          <wp:inline distT="0" distB="0" distL="0" distR="0" wp14:anchorId="7E76A2F0" wp14:editId="2855D031">
             <wp:extent cx="5212080" cy="2366710"/>
             <wp:effectExtent l="0" t="0" r="0" b="0"/>
             <wp:docPr id="4" name="Picture 4"/>
@@ -14969,7 +15039,7 @@
         <w:spacing w:before="160" w:after="200"/>
         <w:jc w:val="center"/>
       </w:pPr>
-      <w:bookmarkStart w:id="54" w:name="_Toc231083378"/>
+      <w:bookmarkStart w:id="54" w:name="_Toc231084655"/>
       <w:r>
         <w:rPr>
           <w:i w:val="0"/>
@@ -15003,7 +15073,7 @@
       <w:pPr>
         <w:pStyle w:val="Ttulo2"/>
       </w:pPr>
-      <w:bookmarkStart w:id="55" w:name="_Toc231083338"/>
+      <w:bookmarkStart w:id="55" w:name="_Toc231084615"/>
       <w:r>
         <w:t>4.6 Comparación entre mercados: triangulación (OE6)</w:t>
       </w:r>
@@ -15025,7 +15095,7 @@
         <w:spacing w:before="40" w:after="40"/>
         <w:jc w:val="center"/>
       </w:pPr>
-      <w:bookmarkStart w:id="56" w:name="_Toc231083364"/>
+      <w:bookmarkStart w:id="56" w:name="_Toc231084641"/>
       <w:r>
         <w:rPr>
           <w:i w:val="0"/>
@@ -15476,7 +15546,13 @@
               <w:rPr>
                 <w:sz w:val="20"/>
               </w:rPr>
-              <w:t>C · minería Chile</w:t>
+              <w:t xml:space="preserve">C · </w:t>
+            </w:r>
+            <w:r>
+              <w:rPr>
+                <w:sz w:val="20"/>
+              </w:rPr>
+              <w:t>minería Chile</w:t>
             </w:r>
           </w:p>
         </w:tc>
@@ -15601,10 +15677,7 @@
         <w:ind w:left="454" w:hanging="454"/>
       </w:pPr>
       <w:r>
-        <w:t xml:space="preserve">1. **La </w:t>
-      </w:r>
-      <w:r>
-        <w:t>sensibilidad al cobre es similar entre el cobre puro internacional (0,571) y el local</w:t>
+        <w:t>1. **La sensibilidad al cobre es similar entre el cobre puro internacional (0,571) y el local</w:t>
       </w:r>
     </w:p>
     <w:p>
@@ -15619,6 +15692,7 @@
     </w:p>
     <w:p>
       <w:r>
+        <w:lastRenderedPageBreak/>
         <w:t xml:space="preserve">   menor sensibilidad de la muestra C se debe a la </w:t>
       </w:r>
       <w:r>
@@ -15645,9 +15719,8 @@
         <w:rPr>
           <w:noProof/>
         </w:rPr>
-        <w:lastRenderedPageBreak/>
         <w:drawing>
-          <wp:inline distT="0" distB="0" distL="0" distR="0" wp14:anchorId="2A78589E" wp14:editId="65EC70B3">
+          <wp:inline distT="0" distB="0" distL="0" distR="0" wp14:anchorId="7F20BD24" wp14:editId="26050A03">
             <wp:extent cx="5212080" cy="2626097"/>
             <wp:effectExtent l="0" t="0" r="0" b="0"/>
             <wp:docPr id="5" name="Picture 5"/>
@@ -15689,7 +15762,7 @@
         <w:spacing w:before="160" w:after="200"/>
         <w:jc w:val="center"/>
       </w:pPr>
-      <w:bookmarkStart w:id="57" w:name="_Toc231083379"/>
+      <w:bookmarkStart w:id="57" w:name="_Toc231084656"/>
       <w:r>
         <w:rPr>
           <w:i w:val="0"/>
@@ -15724,7 +15797,10 @@
         <w:ind w:left="454" w:hanging="454"/>
       </w:pPr>
       <w:r>
-        <w:t>2. **La fracción de varianza atribuida a shocks globales es algo mayor en el mercado internacional</w:t>
+        <w:t xml:space="preserve">2. **La fracción de varianza </w:t>
+      </w:r>
+      <w:r>
+        <w:t>atribuida a shocks globales es algo mayor en el mercado internacional</w:t>
       </w:r>
     </w:p>
     <w:p>
@@ -15760,7 +15836,7 @@
       <w:pPr>
         <w:pStyle w:val="Ttulo2"/>
       </w:pPr>
-      <w:bookmarkStart w:id="58" w:name="_Toc231083339"/>
+      <w:bookmarkStart w:id="58" w:name="_Toc231084616"/>
       <w:r>
         <w:t>4.7 Diagnósticos y robustez</w:t>
       </w:r>
@@ -15793,6 +15869,7 @@
     </w:p>
     <w:p>
       <w:r>
+        <w:lastRenderedPageBreak/>
         <w:t xml:space="preserve">Este resultado </w:t>
       </w:r>
       <w:r>
@@ -15807,11 +15884,7 @@
     </w:p>
     <w:p>
       <w:r>
-        <w:lastRenderedPageBreak/>
-        <w:t xml:space="preserve">cinco productoras comparten un factor común </w:t>
-      </w:r>
-      <w:r>
-        <w:t>—señaladamente el precio del cobre— que induce</w:t>
+        <w:t>cinco productoras comparten un factor común —señaladamente el precio del cobre— que induce</w:t>
       </w:r>
     </w:p>
     <w:p>
@@ -15893,10 +15966,7 @@
     </w:p>
     <w:p>
       <w:r>
-        <w:t xml:space="preserve">de heterocedasticidad condicional (estadístico 41,1; p = 0,000), lo que justifica </w:t>
-      </w:r>
-      <w:r>
-        <w:t>modelar la</w:t>
+        <w:t>de heterocedasticidad condicional (estadístico 41,1; p = 0,000), lo que justifica modelar la</w:t>
       </w:r>
     </w:p>
     <w:p>
@@ -15944,6 +16014,7 @@
         <w:rPr>
           <w:b/>
         </w:rPr>
+        <w:lastRenderedPageBreak/>
         <w:t>GJR-GARCH</w:t>
       </w:r>
       <w:r>
@@ -15961,7 +16032,6 @@
     </w:p>
     <w:p>
       <w:r>
-        <w:lastRenderedPageBreak/>
         <w:t>p = 0,023), preferido por el criterio BIC: las caídas del retorno elevan la volatilidad futura más</w:t>
       </w:r>
     </w:p>
@@ -16095,6 +16165,7 @@
     </w:p>
     <w:p>
       <w:r>
+        <w:lastRenderedPageBreak/>
         <w:t xml:space="preserve">decaimiento posterior) </w:t>
       </w:r>
       <w:r>
@@ -16109,7 +16180,6 @@
     </w:p>
     <w:p>
       <w:r>
-        <w:lastRenderedPageBreak/>
         <w:t>que refuerza la robustez de la dinámica reportada en §4.4.</w:t>
       </w:r>
     </w:p>
@@ -16123,7 +16193,7 @@
           <w:noProof/>
         </w:rPr>
         <w:drawing>
-          <wp:inline distT="0" distB="0" distL="0" distR="0" wp14:anchorId="3AAC71EC" wp14:editId="049B3DFC">
+          <wp:inline distT="0" distB="0" distL="0" distR="0" wp14:anchorId="2A5DD95A" wp14:editId="6D681760">
             <wp:extent cx="5212080" cy="2531582"/>
             <wp:effectExtent l="0" t="0" r="0" b="0"/>
             <wp:docPr id="6" name="Picture 6"/>
@@ -16165,7 +16235,7 @@
         <w:spacing w:before="160" w:after="200"/>
         <w:jc w:val="center"/>
       </w:pPr>
-      <w:bookmarkStart w:id="59" w:name="_Toc231083380"/>
+      <w:bookmarkStart w:id="59" w:name="_Toc231084657"/>
       <w:r>
         <w:rPr>
           <w:i w:val="0"/>
@@ -16191,10 +16261,10 @@
         <w:fldChar w:fldCharType="end"/>
       </w:r>
       <w:r>
-        <w:t xml:space="preserve">. Respuesta del retorno a un shock del cobre mediante proyecciones locales (Jordà, 2005), IC </w:t>
-      </w:r>
-      <w:r>
-        <w:t>95%.</w:t>
+        <w:t xml:space="preserve">. Respuesta del retorno a un shock del cobre mediante proyecciones </w:t>
+      </w:r>
+      <w:r>
+        <w:t>locales (Jordà, 2005), IC 95%.</w:t>
       </w:r>
       <w:bookmarkEnd w:id="59"/>
     </w:p>
@@ -16202,7 +16272,7 @@
       <w:pPr>
         <w:pStyle w:val="Ttulo2"/>
       </w:pPr>
-      <w:bookmarkStart w:id="60" w:name="_Toc231083340"/>
+      <w:bookmarkStart w:id="60" w:name="_Toc231084617"/>
       <w:r>
         <w:t>4.8 Discusión integrada</w:t>
       </w:r>
@@ -16280,12 +16350,12 @@
     </w:p>
     <w:p>
       <w:r>
+        <w:lastRenderedPageBreak/>
         <w:t>la evidencia inicialmente mixta. La fuerte dependencia de sección cruzada detectada (§4.7) confirma,</w:t>
       </w:r>
     </w:p>
     <w:p>
       <w:r>
-        <w:lastRenderedPageBreak/>
         <w:t>además, la pertinencia del tratamiento econométrico adoptado.</w:t>
       </w:r>
     </w:p>
@@ -16389,7 +16459,7 @@
       <w:pPr>
         <w:pStyle w:val="Ttulo1"/>
       </w:pPr>
-      <w:bookmarkStart w:id="61" w:name="_Toc231083341"/>
+      <w:bookmarkStart w:id="61" w:name="_Toc231084618"/>
       <w:r>
         <w:lastRenderedPageBreak/>
         <w:t>Capítulo 5 — Conclusiones</w:t>
@@ -16400,7 +16470,7 @@
       <w:pPr>
         <w:pStyle w:val="Ttulo2"/>
       </w:pPr>
-      <w:bookmarkStart w:id="62" w:name="_Toc231083342"/>
+      <w:bookmarkStart w:id="62" w:name="_Toc231084619"/>
       <w:r>
         <w:t>5.1 Síntesis de los hallazgos</w:t>
       </w:r>
@@ -16408,7 +16478,10 @@
     </w:p>
     <w:p>
       <w:r>
-        <w:t>Esta investigación cuantificó y comparó el impacto de las variables macroeconómicas globales y</w:t>
+        <w:t xml:space="preserve">Esta investigación cuantificó y comparó el </w:t>
+      </w:r>
+      <w:r>
+        <w:t>impacto de las variables macroeconómicas globales y</w:t>
       </w:r>
     </w:p>
     <w:p>
@@ -16493,7 +16566,7 @@
       <w:pPr>
         <w:pStyle w:val="Ttulo2"/>
       </w:pPr>
-      <w:bookmarkStart w:id="63" w:name="_Toc231083343"/>
+      <w:bookmarkStart w:id="63" w:name="_Toc231084620"/>
       <w:r>
         <w:lastRenderedPageBreak/>
         <w:t>5.2 Implicancias</w:t>
@@ -16566,7 +16639,7 @@
       <w:pPr>
         <w:pStyle w:val="Ttulo2"/>
       </w:pPr>
-      <w:bookmarkStart w:id="64" w:name="_Toc231083344"/>
+      <w:bookmarkStart w:id="64" w:name="_Toc231084621"/>
       <w:r>
         <w:t>5.3 Limitaciones</w:t>
       </w:r>
@@ -16616,7 +16689,7 @@
       <w:pPr>
         <w:pStyle w:val="Ttulo2"/>
       </w:pPr>
-      <w:bookmarkStart w:id="65" w:name="_Toc231083345"/>
+      <w:bookmarkStart w:id="65" w:name="_Toc231084622"/>
       <w:r>
         <w:t>5.4 Líneas futuras de investigación</w:t>
       </w:r>
@@ -16652,7 +16725,7 @@
       <w:pPr>
         <w:pStyle w:val="Ttulo1"/>
       </w:pPr>
-      <w:bookmarkStart w:id="66" w:name="_Toc231083346"/>
+      <w:bookmarkStart w:id="66" w:name="_Toc231084623"/>
       <w:r>
         <w:lastRenderedPageBreak/>
         <w:t>Referencias</w:t>
@@ -16661,15 +16734,15 @@
     </w:p>
     <w:p>
       <w:r>
-        <w:t xml:space="preserve">Adler, M., &amp; Dumas, B. </w:t>
-      </w:r>
-      <w:r>
-        <w:t>(1984). Exposure to currency risk: Definition and measurement. *Financial Management*, 13(2), 41–50.</w:t>
-      </w:r>
-    </w:p>
-    <w:p>
-      <w:r>
-        <w:t>Bai, J., &amp; Perron, P. (2003). Computation and analysis of multiple structural change models. *Journal of Applied Econometrics*, 18(1), 1–22.</w:t>
+        <w:t>Adler, M., &amp; Dumas, B. (1984). Exposure to currency risk: Definition and measurement. *Financial Management*, 13(2), 41–50.</w:t>
+      </w:r>
+    </w:p>
+    <w:p>
+      <w:r>
+        <w:t xml:space="preserve">Bai, J., &amp; </w:t>
+      </w:r>
+      <w:r>
+        <w:t>Perron, P. (2003). Computation and analysis of multiple structural change models. *Journal of Applied Econometrics*, 18(1), 1–22.</w:t>
       </w:r>
     </w:p>
     <w:p>
@@ -16704,7 +16777,10 @@
     </w:p>
     <w:p>
       <w:r>
-        <w:t>Cashin, P., Céspedes, L. F., &amp; Sahay, R. (2004). Commodity currencies and the real exchange rate. *Journal of Development Economics*, 75(1), 239–268.</w:t>
+        <w:t xml:space="preserve">Cashin, P., Céspedes, L. F., &amp; Sahay, R. (2004). Commodity </w:t>
+      </w:r>
+      <w:r>
+        <w:t>currencies and the real exchange rate. *Journal of Development Economics*, 75(1), 239–268.</w:t>
       </w:r>
     </w:p>
     <w:p>
@@ -16801,7 +16877,10 @@
     </w:p>
     <w:p>
       <w:r>
-        <w:t>Kwiatkowski, D., Phillips, P. C. B., Schmidt, P., &amp; Shin, Y. (1992). Testing the null hypothesis of stationarity against the alternative of a unit root. *Journal of Econometrics*, 54(1–3), 159–178.</w:t>
+        <w:t xml:space="preserve">Kwiatkowski, D., Phillips, P. C. B., Schmidt, P., &amp; Shin, Y. (1992). Testing the null hypothesis of stationarity against the </w:t>
+      </w:r>
+      <w:r>
+        <w:t>alternative of a unit root. *Journal of Econometrics*, 54(1–3), 159–178.</w:t>
       </w:r>
     </w:p>
     <w:p>
@@ -16889,7 +16968,7 @@
       <w:pPr>
         <w:pStyle w:val="Ttulo1"/>
       </w:pPr>
-      <w:bookmarkStart w:id="67" w:name="_Toc231083347"/>
+      <w:bookmarkStart w:id="67" w:name="_Toc231084624"/>
       <w:r>
         <w:lastRenderedPageBreak/>
         <w:t>Anexos</w:t>
@@ -16900,7 +16979,7 @@
       <w:pPr>
         <w:pStyle w:val="Ttulo2"/>
       </w:pPr>
-      <w:bookmarkStart w:id="68" w:name="_Toc231083348"/>
+      <w:bookmarkStart w:id="68" w:name="_Toc231084625"/>
       <w:r>
         <w:t>Anexo A. Estadística descriptiva</w:t>
       </w:r>
@@ -16912,7 +16991,7 @@
         <w:spacing w:before="40" w:after="40"/>
         <w:jc w:val="center"/>
       </w:pPr>
-      <w:bookmarkStart w:id="69" w:name="_Toc231083365"/>
+      <w:bookmarkStart w:id="69" w:name="_Toc231084642"/>
       <w:r>
         <w:rPr>
           <w:i w:val="0"/>
@@ -19108,7 +19187,7 @@
       <w:pPr>
         <w:pStyle w:val="Ttulo2"/>
       </w:pPr>
-      <w:bookmarkStart w:id="70" w:name="_Toc231083349"/>
+      <w:bookmarkStart w:id="70" w:name="_Toc231084626"/>
       <w:r>
         <w:t>Anexo B. Matriz de correlación de los factores</w:t>
       </w:r>
@@ -19120,7 +19199,7 @@
         <w:spacing w:before="40" w:after="40"/>
         <w:jc w:val="center"/>
       </w:pPr>
-      <w:bookmarkStart w:id="71" w:name="_Toc231083366"/>
+      <w:bookmarkStart w:id="71" w:name="_Toc231084643"/>
       <w:r>
         <w:rPr>
           <w:i w:val="0"/>
@@ -20925,7 +21004,13 @@
               <w:rPr>
                 <w:sz w:val="20"/>
               </w:rPr>
-              <w:t>Δ Actividad local</w:t>
+              <w:t xml:space="preserve">Δ </w:t>
+            </w:r>
+            <w:r>
+              <w:rPr>
+                <w:sz w:val="20"/>
+              </w:rPr>
+              <w:t>Actividad local</w:t>
             </w:r>
           </w:p>
         </w:tc>
@@ -21148,12 +21233,9 @@
       <w:pPr>
         <w:pStyle w:val="Ttulo2"/>
       </w:pPr>
-      <w:bookmarkStart w:id="72" w:name="_Toc231083350"/>
-      <w:r>
-        <w:t xml:space="preserve">Anexo C. Pruebas de raíz unitaria y </w:t>
-      </w:r>
-      <w:r>
-        <w:t>orden de integración</w:t>
+      <w:bookmarkStart w:id="72" w:name="_Toc231084627"/>
+      <w:r>
+        <w:t>Anexo C. Pruebas de raíz unitaria y orden de integración</w:t>
       </w:r>
       <w:bookmarkEnd w:id="72"/>
     </w:p>
@@ -21163,7 +21245,7 @@
         <w:spacing w:before="40" w:after="40"/>
         <w:jc w:val="center"/>
       </w:pPr>
-      <w:bookmarkStart w:id="73" w:name="_Toc231083367"/>
+      <w:bookmarkStart w:id="73" w:name="_Toc231084644"/>
       <w:r>
         <w:rPr>
           <w:i w:val="0"/>
@@ -21991,7 +22073,7 @@
       <w:pPr>
         <w:pStyle w:val="Ttulo2"/>
       </w:pPr>
-      <w:bookmarkStart w:id="74" w:name="_Toc231083351"/>
+      <w:bookmarkStart w:id="74" w:name="_Toc231084628"/>
       <w:r>
         <w:t>Anexo D. Resultados completos del modelo de panel</w:t>
       </w:r>
@@ -22001,7 +22083,7 @@
       <w:pPr>
         <w:pStyle w:val="Ttulo3"/>
       </w:pPr>
-      <w:bookmarkStart w:id="75" w:name="_Toc231083352"/>
+      <w:bookmarkStart w:id="75" w:name="_Toc231084629"/>
       <w:r>
         <w:t>D.1 Muestra B — cobre, mercado internacional</w:t>
       </w:r>
@@ -22013,7 +22095,7 @@
         <w:spacing w:before="40" w:after="40"/>
         <w:jc w:val="center"/>
       </w:pPr>
-      <w:bookmarkStart w:id="76" w:name="_Toc231083368"/>
+      <w:bookmarkStart w:id="76" w:name="_Toc231084645"/>
       <w:r>
         <w:rPr>
           <w:i w:val="0"/>
@@ -23194,7 +23276,7 @@
       <w:pPr>
         <w:pStyle w:val="Ttulo3"/>
       </w:pPr>
-      <w:bookmarkStart w:id="77" w:name="_Toc231083353"/>
+      <w:bookmarkStart w:id="77" w:name="_Toc231084630"/>
       <w:r>
         <w:t>D.2 Muestra A — cobre, mercado chileno (Pucobre)</w:t>
       </w:r>
@@ -23206,7 +23288,7 @@
         <w:spacing w:before="40" w:after="40"/>
         <w:jc w:val="center"/>
       </w:pPr>
-      <w:bookmarkStart w:id="78" w:name="_Toc231083369"/>
+      <w:bookmarkStart w:id="78" w:name="_Toc231084646"/>
       <w:r>
         <w:rPr>
           <w:i w:val="0"/>
@@ -24381,7 +24463,7 @@
       <w:pPr>
         <w:pStyle w:val="Ttulo3"/>
       </w:pPr>
-      <w:bookmarkStart w:id="79" w:name="_Toc231083354"/>
+      <w:bookmarkStart w:id="79" w:name="_Toc231084631"/>
       <w:r>
         <w:t xml:space="preserve">D.3 </w:t>
       </w:r>
@@ -24396,7 +24478,7 @@
         <w:spacing w:before="40" w:after="40"/>
         <w:jc w:val="center"/>
       </w:pPr>
-      <w:bookmarkStart w:id="80" w:name="_Toc231083370"/>
+      <w:bookmarkStart w:id="80" w:name="_Toc231084647"/>
       <w:r>
         <w:rPr>
           <w:i w:val="0"/>
@@ -25571,7 +25653,7 @@
       <w:pPr>
         <w:pStyle w:val="Ttulo2"/>
       </w:pPr>
-      <w:bookmarkStart w:id="81" w:name="_Toc231083355"/>
+      <w:bookmarkStart w:id="81" w:name="_Toc231084632"/>
       <w:r>
         <w:lastRenderedPageBreak/>
         <w:t xml:space="preserve">Anexo E. </w:t>
@@ -25587,7 +25669,7 @@
         <w:spacing w:before="40" w:after="40"/>
         <w:jc w:val="center"/>
       </w:pPr>
-      <w:bookmarkStart w:id="82" w:name="_Toc231083371"/>
+      <w:bookmarkStart w:id="82" w:name="_Toc231084648"/>
       <w:r>
         <w:rPr>
           <w:i w:val="0"/>
@@ -26258,7 +26340,7 @@
       <w:pPr>
         <w:pStyle w:val="Ttulo2"/>
       </w:pPr>
-      <w:bookmarkStart w:id="83" w:name="_Toc231083356"/>
+      <w:bookmarkStart w:id="83" w:name="_Toc231084633"/>
       <w:r>
         <w:t xml:space="preserve">Anexo F. </w:t>
       </w:r>
@@ -26273,7 +26355,7 @@
         <w:spacing w:before="40" w:after="40"/>
         <w:jc w:val="center"/>
       </w:pPr>
-      <w:bookmarkStart w:id="84" w:name="_Toc231083372"/>
+      <w:bookmarkStart w:id="84" w:name="_Toc231084649"/>
       <w:r>
         <w:rPr>
           <w:i w:val="0"/>
@@ -27087,7 +27169,7 @@
       <w:pPr>
         <w:pStyle w:val="Ttulo2"/>
       </w:pPr>
-      <w:bookmarkStart w:id="85" w:name="_Toc231083357"/>
+      <w:bookmarkStart w:id="85" w:name="_Toc231084634"/>
       <w:r>
         <w:t>Anexo G. Fuentes de datos</w:t>
       </w:r>
@@ -27099,7 +27181,7 @@
         <w:spacing w:before="40" w:after="40"/>
         <w:jc w:val="center"/>
       </w:pPr>
-      <w:bookmarkStart w:id="86" w:name="_Toc231083373"/>
+      <w:bookmarkStart w:id="86" w:name="_Toc231084650"/>
       <w:r>
         <w:rPr>
           <w:i w:val="0"/>
@@ -28248,7 +28330,7 @@
       <w:pPr>
         <w:pStyle w:val="Ttulo2"/>
       </w:pPr>
-      <w:bookmarkStart w:id="87" w:name="_Toc231083358"/>
+      <w:bookmarkStart w:id="87" w:name="_Toc231084635"/>
       <w:r>
         <w:t>Anexo H. Disponibilidad del código</w:t>
       </w:r>
@@ -28266,7 +28348,7 @@
       <w:pPr>
         <w:pStyle w:val="Ttulo2"/>
       </w:pPr>
-      <w:bookmarkStart w:id="88" w:name="_Toc231083359"/>
+      <w:bookmarkStart w:id="88" w:name="_Toc231084636"/>
       <w:r>
         <w:t>Anexo I. Extensión predictiva: ¿explican o anticipan?</w:t>
       </w:r>
@@ -28292,7 +28374,7 @@
         <w:spacing w:before="40" w:after="40"/>
         <w:jc w:val="center"/>
       </w:pPr>
-      <w:bookmarkStart w:id="89" w:name="_Toc231083374"/>
+      <w:bookmarkStart w:id="89" w:name="_Toc231084651"/>
       <w:r>
         <w:rPr>
           <w:i w:val="0"/>
@@ -29133,13 +29215,7 @@
         <w:rPr>
           <w:b/>
         </w:rPr>
-        <w:t xml:space="preserve">refuerza la hipótesis de eficiencia de mercado en su forma </w:t>
-      </w:r>
-      <w:r>
-        <w:rPr>
-          <w:b/>
-        </w:rPr>
-        <w:t>débil</w:t>
+        <w:t>refuerza la hipótesis de eficiencia de mercado en su forma débil</w:t>
       </w:r>
       <w:r>
         <w:t xml:space="preserve"> y justifica el enfoque explicativo —y no predictivo— adoptado. El mejor desempeño direccional corresponde al término de momentum (AR(1)). Una versión interactiva de este modelo se encuentra en la plataforma web del proyecto.</w:t>
@@ -29154,7 +29230,7 @@
       <w:pPr>
         <w:pStyle w:val="Ttulo1"/>
       </w:pPr>
-      <w:bookmarkStart w:id="90" w:name="_Toc231083360"/>
+      <w:bookmarkStart w:id="90" w:name="_Toc231084637"/>
       <w:r>
         <w:lastRenderedPageBreak/>
         <w:t>Glosario de términos econométricos</w:t>
@@ -29259,10 +29335,10 @@
     </w:p>
     <w:p>
       <w:r>
-        <w:t xml:space="preserve">en el tiempo de cada </w:t>
-      </w:r>
-      <w:r>
-        <w:t>unidad mediante interceptos específicos.</w:t>
+        <w:t xml:space="preserve">en el tiempo de cada unidad </w:t>
+      </w:r>
+      <w:r>
+        <w:t>mediante interceptos específicos.</w:t>
       </w:r>
     </w:p>
     <w:p>
@@ -29788,31 +29864,31 @@
       </w:rPr>
     </w:lvl>
   </w:abstractNum>
-  <w:num w:numId="1" w16cid:durableId="240457132">
+  <w:num w:numId="1" w16cid:durableId="506405399">
     <w:abstractNumId w:val="8"/>
   </w:num>
-  <w:num w:numId="2" w16cid:durableId="2025672340">
+  <w:num w:numId="2" w16cid:durableId="473792319">
     <w:abstractNumId w:val="6"/>
   </w:num>
-  <w:num w:numId="3" w16cid:durableId="1685208454">
+  <w:num w:numId="3" w16cid:durableId="1696923657">
     <w:abstractNumId w:val="5"/>
   </w:num>
-  <w:num w:numId="4" w16cid:durableId="460541071">
+  <w:num w:numId="4" w16cid:durableId="1526215791">
     <w:abstractNumId w:val="4"/>
   </w:num>
-  <w:num w:numId="5" w16cid:durableId="1861167125">
+  <w:num w:numId="5" w16cid:durableId="1634748387">
     <w:abstractNumId w:val="7"/>
   </w:num>
-  <w:num w:numId="6" w16cid:durableId="520582342">
+  <w:num w:numId="6" w16cid:durableId="623459870">
     <w:abstractNumId w:val="3"/>
   </w:num>
-  <w:num w:numId="7" w16cid:durableId="360909374">
+  <w:num w:numId="7" w16cid:durableId="9383533">
     <w:abstractNumId w:val="2"/>
   </w:num>
-  <w:num w:numId="8" w16cid:durableId="337080378">
+  <w:num w:numId="8" w16cid:durableId="1998335935">
     <w:abstractNumId w:val="1"/>
   </w:num>
-  <w:num w:numId="9" w16cid:durableId="705758011">
+  <w:num w:numId="9" w16cid:durableId="1259750506">
     <w:abstractNumId w:val="0"/>
   </w:num>
 </w:numbering>
@@ -41214,7 +41290,7 @@
     <w:autoRedefine/>
     <w:uiPriority w:val="39"/>
     <w:unhideWhenUsed/>
-    <w:rsid w:val="00A80140"/>
+    <w:rsid w:val="009B0CDE"/>
     <w:pPr>
       <w:spacing w:after="100"/>
     </w:pPr>
@@ -41226,7 +41302,7 @@
     <w:autoRedefine/>
     <w:uiPriority w:val="39"/>
     <w:unhideWhenUsed/>
-    <w:rsid w:val="00A80140"/>
+    <w:rsid w:val="009B0CDE"/>
     <w:pPr>
       <w:spacing w:after="100"/>
       <w:ind w:left="240"/>
@@ -41239,7 +41315,7 @@
     <w:autoRedefine/>
     <w:uiPriority w:val="39"/>
     <w:unhideWhenUsed/>
-    <w:rsid w:val="00A80140"/>
+    <w:rsid w:val="009B0CDE"/>
     <w:pPr>
       <w:spacing w:after="100"/>
       <w:ind w:left="480"/>
@@ -41250,7 +41326,7 @@
     <w:basedOn w:val="Fuentedeprrafopredeter"/>
     <w:uiPriority w:val="99"/>
     <w:unhideWhenUsed/>
-    <w:rsid w:val="00A80140"/>
+    <w:rsid w:val="009B0CDE"/>
     <w:rPr>
       <w:color w:val="0000FF" w:themeColor="hyperlink"/>
       <w:u w:val="single"/>
@@ -41262,7 +41338,7 @@
     <w:next w:val="Normal"/>
     <w:uiPriority w:val="99"/>
     <w:unhideWhenUsed/>
-    <w:rsid w:val="00A80140"/>
+    <w:rsid w:val="009B0CDE"/>
     <w:pPr>
       <w:spacing w:after="0"/>
     </w:pPr>

</xml_diff>

<commit_message>
OE6/H7: prueba formal de igualdad de coeficientes entre mercados (interacciones)
d_cobre x global = +0.254 (p=0.010): la sensibilidad al cobre es significativamente MAYOR en el
mercado internacional que en el chileno -> respalda H7 formalmente. Cierra el pendiente del Cap.4.

Co-Authored-By: Claude Opus 4.8 <noreply@anthropic.com>
</commit_message>
<xml_diff>
--- a/outputs/Tesis_Francisco_Rietta.docx
+++ b/outputs/Tesis_Francisco_Rietta.docx
@@ -166,7 +166,7 @@
       <w:pPr>
         <w:pStyle w:val="Ttulo1"/>
       </w:pPr>
-      <w:bookmarkStart w:id="0" w:name="_Toc231084567"/>
+      <w:bookmarkStart w:id="0" w:name="_Toc231090002"/>
       <w:r>
         <w:lastRenderedPageBreak/>
         <w:t>Página de aprobación</w:t>
@@ -262,7 +262,7 @@
       <w:pPr>
         <w:pStyle w:val="Ttulo1"/>
       </w:pPr>
-      <w:bookmarkStart w:id="1" w:name="_Toc231084568"/>
+      <w:bookmarkStart w:id="1" w:name="_Toc231090003"/>
       <w:r>
         <w:lastRenderedPageBreak/>
         <w:t>Declaración de originalidad</w:t>
@@ -303,7 +303,7 @@
       <w:pPr>
         <w:pStyle w:val="Ttulo1"/>
       </w:pPr>
-      <w:bookmarkStart w:id="2" w:name="_Toc231084569"/>
+      <w:bookmarkStart w:id="2" w:name="_Toc231090004"/>
       <w:r>
         <w:lastRenderedPageBreak/>
         <w:t>Dedicatoria</w:t>
@@ -333,7 +333,7 @@
       <w:pPr>
         <w:pStyle w:val="Ttulo1"/>
       </w:pPr>
-      <w:bookmarkStart w:id="3" w:name="_Toc231084570"/>
+      <w:bookmarkStart w:id="3" w:name="_Toc231090005"/>
       <w:r>
         <w:lastRenderedPageBreak/>
         <w:t>Agradecimientos</w:t>
@@ -359,7 +359,7 @@
       <w:pPr>
         <w:pStyle w:val="Ttulo1"/>
       </w:pPr>
-      <w:bookmarkStart w:id="4" w:name="_Toc231084571"/>
+      <w:bookmarkStart w:id="4" w:name="_Toc231090006"/>
       <w:r>
         <w:lastRenderedPageBreak/>
         <w:t>Resumen</w:t>
@@ -397,7 +397,7 @@
       <w:pPr>
         <w:pStyle w:val="Ttulo1"/>
       </w:pPr>
-      <w:bookmarkStart w:id="5" w:name="_Toc231084572"/>
+      <w:bookmarkStart w:id="5" w:name="_Toc231090007"/>
       <w:r>
         <w:lastRenderedPageBreak/>
         <w:t>Abstract</w:t>
@@ -432,7 +432,7 @@
       <w:pPr>
         <w:pStyle w:val="Ttulo1"/>
       </w:pPr>
-      <w:bookmarkStart w:id="6" w:name="_Toc231084573"/>
+      <w:bookmarkStart w:id="6" w:name="_Toc231090008"/>
       <w:r>
         <w:lastRenderedPageBreak/>
         <w:t>Índice general</w:t>
@@ -464,7 +464,7 @@
       <w:r>
         <w:fldChar w:fldCharType="separate"/>
       </w:r>
-      <w:hyperlink w:anchor="_Toc231084567" w:history="1">
+      <w:hyperlink w:anchor="_Toc231090002" w:history="1">
         <w:r>
           <w:rPr>
             <w:rStyle w:val="Hipervnculo"/>
@@ -491,7 +491,7 @@
             <w:noProof/>
             <w:webHidden/>
           </w:rPr>
-          <w:instrText xml:space="preserve"> PAGEREF _Toc231084567 \h </w:instrText>
+          <w:instrText xml:space="preserve"> PAGEREF _Toc231090002 \h </w:instrText>
         </w:r>
         <w:r>
           <w:rPr>
@@ -538,7 +538,7 @@
           <w14:ligatures w14:val="standardContextual"/>
         </w:rPr>
       </w:pPr>
-      <w:hyperlink w:anchor="_Toc231084568" w:history="1">
+      <w:hyperlink w:anchor="_Toc231090003" w:history="1">
         <w:r>
           <w:rPr>
             <w:rStyle w:val="Hipervnculo"/>
@@ -565,7 +565,7 @@
             <w:noProof/>
             <w:webHidden/>
           </w:rPr>
-          <w:instrText xml:space="preserve"> PAGEREF _Toc231084568 \h </w:instrText>
+          <w:instrText xml:space="preserve"> PAGEREF _Toc231090003 \h </w:instrText>
         </w:r>
         <w:r>
           <w:rPr>
@@ -612,7 +612,7 @@
           <w14:ligatures w14:val="standardContextual"/>
         </w:rPr>
       </w:pPr>
-      <w:hyperlink w:anchor="_Toc231084569" w:history="1">
+      <w:hyperlink w:anchor="_Toc231090004" w:history="1">
         <w:r>
           <w:rPr>
             <w:rStyle w:val="Hipervnculo"/>
@@ -639,7 +639,7 @@
             <w:noProof/>
             <w:webHidden/>
           </w:rPr>
-          <w:instrText xml:space="preserve"> PAGEREF _Toc231084569 \h </w:instrText>
+          <w:instrText xml:space="preserve"> PAGEREF _Toc231090004 \h </w:instrText>
         </w:r>
         <w:r>
           <w:rPr>
@@ -686,7 +686,7 @@
           <w14:ligatures w14:val="standardContextual"/>
         </w:rPr>
       </w:pPr>
-      <w:hyperlink w:anchor="_Toc231084570" w:history="1">
+      <w:hyperlink w:anchor="_Toc231090005" w:history="1">
         <w:r>
           <w:rPr>
             <w:rStyle w:val="Hipervnculo"/>
@@ -713,7 +713,7 @@
             <w:noProof/>
             <w:webHidden/>
           </w:rPr>
-          <w:instrText xml:space="preserve"> PAGEREF _Toc231084570 \h </w:instrText>
+          <w:instrText xml:space="preserve"> PAGEREF _Toc231090005 \h </w:instrText>
         </w:r>
         <w:r>
           <w:rPr>
@@ -760,7 +760,7 @@
           <w14:ligatures w14:val="standardContextual"/>
         </w:rPr>
       </w:pPr>
-      <w:hyperlink w:anchor="_Toc231084571" w:history="1">
+      <w:hyperlink w:anchor="_Toc231090006" w:history="1">
         <w:r>
           <w:rPr>
             <w:rStyle w:val="Hipervnculo"/>
@@ -787,7 +787,7 @@
             <w:noProof/>
             <w:webHidden/>
           </w:rPr>
-          <w:instrText xml:space="preserve"> PAGEREF _Toc231084571 \h </w:instrText>
+          <w:instrText xml:space="preserve"> PAGEREF _Toc231090006 \h </w:instrText>
         </w:r>
         <w:r>
           <w:rPr>
@@ -834,7 +834,7 @@
           <w14:ligatures w14:val="standardContextual"/>
         </w:rPr>
       </w:pPr>
-      <w:hyperlink w:anchor="_Toc231084572" w:history="1">
+      <w:hyperlink w:anchor="_Toc231090007" w:history="1">
         <w:r>
           <w:rPr>
             <w:rStyle w:val="Hipervnculo"/>
@@ -861,7 +861,7 @@
             <w:noProof/>
             <w:webHidden/>
           </w:rPr>
-          <w:instrText xml:space="preserve"> PAGEREF _Toc231084572 \h </w:instrText>
+          <w:instrText xml:space="preserve"> PAGEREF _Toc231090007 \h </w:instrText>
         </w:r>
         <w:r>
           <w:rPr>
@@ -908,7 +908,7 @@
           <w14:ligatures w14:val="standardContextual"/>
         </w:rPr>
       </w:pPr>
-      <w:hyperlink w:anchor="_Toc231084573" w:history="1">
+      <w:hyperlink w:anchor="_Toc231090008" w:history="1">
         <w:r>
           <w:rPr>
             <w:rStyle w:val="Hipervnculo"/>
@@ -935,7 +935,7 @@
             <w:noProof/>
             <w:webHidden/>
           </w:rPr>
-          <w:instrText xml:space="preserve"> PAGEREF _Toc231084573 \h </w:instrText>
+          <w:instrText xml:space="preserve"> PAGEREF _Toc231090008 \h </w:instrText>
         </w:r>
         <w:r>
           <w:rPr>
@@ -982,7 +982,7 @@
           <w14:ligatures w14:val="standardContextual"/>
         </w:rPr>
       </w:pPr>
-      <w:hyperlink w:anchor="_Toc231084574" w:history="1">
+      <w:hyperlink w:anchor="_Toc231090009" w:history="1">
         <w:r>
           <w:rPr>
             <w:rStyle w:val="Hipervnculo"/>
@@ -1009,7 +1009,7 @@
             <w:noProof/>
             <w:webHidden/>
           </w:rPr>
-          <w:instrText xml:space="preserve"> PAGEREF _Toc231084574 \h </w:instrText>
+          <w:instrText xml:space="preserve"> PAGEREF _Toc231090009 \h </w:instrText>
         </w:r>
         <w:r>
           <w:rPr>
@@ -1056,7 +1056,7 @@
           <w14:ligatures w14:val="standardContextual"/>
         </w:rPr>
       </w:pPr>
-      <w:hyperlink w:anchor="_Toc231084575" w:history="1">
+      <w:hyperlink w:anchor="_Toc231090010" w:history="1">
         <w:r>
           <w:rPr>
             <w:rStyle w:val="Hipervnculo"/>
@@ -1083,7 +1083,7 @@
             <w:noProof/>
             <w:webHidden/>
           </w:rPr>
-          <w:instrText xml:space="preserve"> PAGEREF _Toc231084575 \h </w:instrText>
+          <w:instrText xml:space="preserve"> PAGEREF _Toc231090010 \h </w:instrText>
         </w:r>
         <w:r>
           <w:rPr>
@@ -1130,7 +1130,7 @@
           <w14:ligatures w14:val="standardContextual"/>
         </w:rPr>
       </w:pPr>
-      <w:hyperlink w:anchor="_Toc231084576" w:history="1">
+      <w:hyperlink w:anchor="_Toc231090011" w:history="1">
         <w:r>
           <w:rPr>
             <w:rStyle w:val="Hipervnculo"/>
@@ -1157,7 +1157,7 @@
             <w:noProof/>
             <w:webHidden/>
           </w:rPr>
-          <w:instrText xml:space="preserve"> PAGEREF _Toc231084576 \h </w:instrText>
+          <w:instrText xml:space="preserve"> PAGEREF _Toc231090011 \h </w:instrText>
         </w:r>
         <w:r>
           <w:rPr>
@@ -1204,7 +1204,7 @@
           <w14:ligatures w14:val="standardContextual"/>
         </w:rPr>
       </w:pPr>
-      <w:hyperlink w:anchor="_Toc231084577" w:history="1">
+      <w:hyperlink w:anchor="_Toc231090012" w:history="1">
         <w:r>
           <w:rPr>
             <w:rStyle w:val="Hipervnculo"/>
@@ -1231,7 +1231,7 @@
             <w:noProof/>
             <w:webHidden/>
           </w:rPr>
-          <w:instrText xml:space="preserve"> PAGEREF _Toc231084577 \h </w:instrText>
+          <w:instrText xml:space="preserve"> PAGEREF _Toc231090012 \h </w:instrText>
         </w:r>
         <w:r>
           <w:rPr>
@@ -1278,7 +1278,7 @@
           <w14:ligatures w14:val="standardContextual"/>
         </w:rPr>
       </w:pPr>
-      <w:hyperlink w:anchor="_Toc231084578" w:history="1">
+      <w:hyperlink w:anchor="_Toc231090013" w:history="1">
         <w:r>
           <w:rPr>
             <w:rStyle w:val="Hipervnculo"/>
@@ -1305,7 +1305,7 @@
             <w:noProof/>
             <w:webHidden/>
           </w:rPr>
-          <w:instrText xml:space="preserve"> PAGEREF _Toc231084578 \h </w:instrText>
+          <w:instrText xml:space="preserve"> PAGEREF _Toc231090013 \h </w:instrText>
         </w:r>
         <w:r>
           <w:rPr>
@@ -1352,7 +1352,7 @@
           <w14:ligatures w14:val="standardContextual"/>
         </w:rPr>
       </w:pPr>
-      <w:hyperlink w:anchor="_Toc231084579" w:history="1">
+      <w:hyperlink w:anchor="_Toc231090014" w:history="1">
         <w:r>
           <w:rPr>
             <w:rStyle w:val="Hipervnculo"/>
@@ -1379,7 +1379,7 @@
             <w:noProof/>
             <w:webHidden/>
           </w:rPr>
-          <w:instrText xml:space="preserve"> PAGEREF _Toc231084579 \h </w:instrText>
+          <w:instrText xml:space="preserve"> PAGEREF _Toc231090014 \h </w:instrText>
         </w:r>
         <w:r>
           <w:rPr>
@@ -1426,7 +1426,7 @@
           <w14:ligatures w14:val="standardContextual"/>
         </w:rPr>
       </w:pPr>
-      <w:hyperlink w:anchor="_Toc231084580" w:history="1">
+      <w:hyperlink w:anchor="_Toc231090015" w:history="1">
         <w:r>
           <w:rPr>
             <w:rStyle w:val="Hipervnculo"/>
@@ -1453,7 +1453,7 @@
             <w:noProof/>
             <w:webHidden/>
           </w:rPr>
-          <w:instrText xml:space="preserve"> PAGEREF _Toc231084580 \h </w:instrText>
+          <w:instrText xml:space="preserve"> PAGEREF _Toc231090015 \h </w:instrText>
         </w:r>
         <w:r>
           <w:rPr>
@@ -1500,7 +1500,7 @@
           <w14:ligatures w14:val="standardContextual"/>
         </w:rPr>
       </w:pPr>
-      <w:hyperlink w:anchor="_Toc231084581" w:history="1">
+      <w:hyperlink w:anchor="_Toc231090016" w:history="1">
         <w:r>
           <w:rPr>
             <w:rStyle w:val="Hipervnculo"/>
@@ -1527,7 +1527,7 @@
             <w:noProof/>
             <w:webHidden/>
           </w:rPr>
-          <w:instrText xml:space="preserve"> PAGEREF _Toc231084581 \h </w:instrText>
+          <w:instrText xml:space="preserve"> PAGEREF _Toc231090016 \h </w:instrText>
         </w:r>
         <w:r>
           <w:rPr>
@@ -1574,7 +1574,7 @@
           <w14:ligatures w14:val="standardContextual"/>
         </w:rPr>
       </w:pPr>
-      <w:hyperlink w:anchor="_Toc231084582" w:history="1">
+      <w:hyperlink w:anchor="_Toc231090017" w:history="1">
         <w:r>
           <w:rPr>
             <w:rStyle w:val="Hipervnculo"/>
@@ -1601,7 +1601,7 @@
             <w:noProof/>
             <w:webHidden/>
           </w:rPr>
-          <w:instrText xml:space="preserve"> PAGEREF _Toc231084582 \h </w:instrText>
+          <w:instrText xml:space="preserve"> PAGEREF _Toc231090017 \h </w:instrText>
         </w:r>
         <w:r>
           <w:rPr>
@@ -1648,7 +1648,7 @@
           <w14:ligatures w14:val="standardContextual"/>
         </w:rPr>
       </w:pPr>
-      <w:hyperlink w:anchor="_Toc231084583" w:history="1">
+      <w:hyperlink w:anchor="_Toc231090018" w:history="1">
         <w:r>
           <w:rPr>
             <w:rStyle w:val="Hipervnculo"/>
@@ -1675,7 +1675,7 @@
             <w:noProof/>
             <w:webHidden/>
           </w:rPr>
-          <w:instrText xml:space="preserve"> PAGEREF _Toc231084583 \h </w:instrText>
+          <w:instrText xml:space="preserve"> PAGEREF _Toc231090018 \h </w:instrText>
         </w:r>
         <w:r>
           <w:rPr>
@@ -1722,7 +1722,7 @@
           <w14:ligatures w14:val="standardContextual"/>
         </w:rPr>
       </w:pPr>
-      <w:hyperlink w:anchor="_Toc231084584" w:history="1">
+      <w:hyperlink w:anchor="_Toc231090019" w:history="1">
         <w:r>
           <w:rPr>
             <w:rStyle w:val="Hipervnculo"/>
@@ -1749,7 +1749,7 @@
             <w:noProof/>
             <w:webHidden/>
           </w:rPr>
-          <w:instrText xml:space="preserve"> PAGEREF _Toc231084584 \h </w:instrText>
+          <w:instrText xml:space="preserve"> PAGEREF _Toc231090019 \h </w:instrText>
         </w:r>
         <w:r>
           <w:rPr>
@@ -1796,7 +1796,7 @@
           <w14:ligatures w14:val="standardContextual"/>
         </w:rPr>
       </w:pPr>
-      <w:hyperlink w:anchor="_Toc231084585" w:history="1">
+      <w:hyperlink w:anchor="_Toc231090020" w:history="1">
         <w:r>
           <w:rPr>
             <w:rStyle w:val="Hipervnculo"/>
@@ -1823,7 +1823,7 @@
             <w:noProof/>
             <w:webHidden/>
           </w:rPr>
-          <w:instrText xml:space="preserve"> PAGEREF _Toc231084585 \h </w:instrText>
+          <w:instrText xml:space="preserve"> PAGEREF _Toc231090020 \h </w:instrText>
         </w:r>
         <w:r>
           <w:rPr>
@@ -1870,7 +1870,7 @@
           <w14:ligatures w14:val="standardContextual"/>
         </w:rPr>
       </w:pPr>
-      <w:hyperlink w:anchor="_Toc231084586" w:history="1">
+      <w:hyperlink w:anchor="_Toc231090021" w:history="1">
         <w:r>
           <w:rPr>
             <w:rStyle w:val="Hipervnculo"/>
@@ -1897,7 +1897,7 @@
             <w:noProof/>
             <w:webHidden/>
           </w:rPr>
-          <w:instrText xml:space="preserve"> PAGEREF _Toc231084586 \h </w:instrText>
+          <w:instrText xml:space="preserve"> PAGEREF _Toc231090021 \h </w:instrText>
         </w:r>
         <w:r>
           <w:rPr>
@@ -1944,7 +1944,7 @@
           <w14:ligatures w14:val="standardContextual"/>
         </w:rPr>
       </w:pPr>
-      <w:hyperlink w:anchor="_Toc231084587" w:history="1">
+      <w:hyperlink w:anchor="_Toc231090022" w:history="1">
         <w:r>
           <w:rPr>
             <w:rStyle w:val="Hipervnculo"/>
@@ -1971,7 +1971,7 @@
             <w:noProof/>
             <w:webHidden/>
           </w:rPr>
-          <w:instrText xml:space="preserve"> PAGEREF _Toc231084587 \h </w:instrText>
+          <w:instrText xml:space="preserve"> PAGEREF _Toc231090022 \h </w:instrText>
         </w:r>
         <w:r>
           <w:rPr>
@@ -2018,7 +2018,7 @@
           <w14:ligatures w14:val="standardContextual"/>
         </w:rPr>
       </w:pPr>
-      <w:hyperlink w:anchor="_Toc231084588" w:history="1">
+      <w:hyperlink w:anchor="_Toc231090023" w:history="1">
         <w:r>
           <w:rPr>
             <w:rStyle w:val="Hipervnculo"/>
@@ -2045,7 +2045,7 @@
             <w:noProof/>
             <w:webHidden/>
           </w:rPr>
-          <w:instrText xml:space="preserve"> PAGEREF _Toc231084588 \h </w:instrText>
+          <w:instrText xml:space="preserve"> PAGEREF _Toc231090023 \h </w:instrText>
         </w:r>
         <w:r>
           <w:rPr>
@@ -2092,7 +2092,7 @@
           <w14:ligatures w14:val="standardContextual"/>
         </w:rPr>
       </w:pPr>
-      <w:hyperlink w:anchor="_Toc231084589" w:history="1">
+      <w:hyperlink w:anchor="_Toc231090024" w:history="1">
         <w:r>
           <w:rPr>
             <w:rStyle w:val="Hipervnculo"/>
@@ -2119,7 +2119,7 @@
             <w:noProof/>
             <w:webHidden/>
           </w:rPr>
-          <w:instrText xml:space="preserve"> PAGEREF _Toc231084589 \h </w:instrText>
+          <w:instrText xml:space="preserve"> PAGEREF _Toc231090024 \h </w:instrText>
         </w:r>
         <w:r>
           <w:rPr>
@@ -2166,7 +2166,7 @@
           <w14:ligatures w14:val="standardContextual"/>
         </w:rPr>
       </w:pPr>
-      <w:hyperlink w:anchor="_Toc231084590" w:history="1">
+      <w:hyperlink w:anchor="_Toc231090025" w:history="1">
         <w:r>
           <w:rPr>
             <w:rStyle w:val="Hipervnculo"/>
@@ -2193,7 +2193,7 @@
             <w:noProof/>
             <w:webHidden/>
           </w:rPr>
-          <w:instrText xml:space="preserve"> PAGEREF _Toc231084590 \h </w:instrText>
+          <w:instrText xml:space="preserve"> PAGEREF _Toc231090025 \h </w:instrText>
         </w:r>
         <w:r>
           <w:rPr>
@@ -2240,7 +2240,7 @@
           <w14:ligatures w14:val="standardContextual"/>
         </w:rPr>
       </w:pPr>
-      <w:hyperlink w:anchor="_Toc231084591" w:history="1">
+      <w:hyperlink w:anchor="_Toc231090026" w:history="1">
         <w:r>
           <w:rPr>
             <w:rStyle w:val="Hipervnculo"/>
@@ -2267,7 +2267,7 @@
             <w:noProof/>
             <w:webHidden/>
           </w:rPr>
-          <w:instrText xml:space="preserve"> PAGEREF _Toc231084591 \h </w:instrText>
+          <w:instrText xml:space="preserve"> PAGEREF _Toc231090026 \h </w:instrText>
         </w:r>
         <w:r>
           <w:rPr>
@@ -2314,7 +2314,7 @@
           <w14:ligatures w14:val="standardContextual"/>
         </w:rPr>
       </w:pPr>
-      <w:hyperlink w:anchor="_Toc231084592" w:history="1">
+      <w:hyperlink w:anchor="_Toc231090027" w:history="1">
         <w:r>
           <w:rPr>
             <w:rStyle w:val="Hipervnculo"/>
@@ -2341,7 +2341,7 @@
             <w:noProof/>
             <w:webHidden/>
           </w:rPr>
-          <w:instrText xml:space="preserve"> PAGEREF _Toc231084592 \h </w:instrText>
+          <w:instrText xml:space="preserve"> PAGEREF _Toc231090027 \h </w:instrText>
         </w:r>
         <w:r>
           <w:rPr>
@@ -2388,7 +2388,7 @@
           <w14:ligatures w14:val="standardContextual"/>
         </w:rPr>
       </w:pPr>
-      <w:hyperlink w:anchor="_Toc231084593" w:history="1">
+      <w:hyperlink w:anchor="_Toc231090028" w:history="1">
         <w:r>
           <w:rPr>
             <w:rStyle w:val="Hipervnculo"/>
@@ -2415,7 +2415,7 @@
             <w:noProof/>
             <w:webHidden/>
           </w:rPr>
-          <w:instrText xml:space="preserve"> PAGEREF _Toc231084593 \h </w:instrText>
+          <w:instrText xml:space="preserve"> PAGEREF _Toc231090028 \h </w:instrText>
         </w:r>
         <w:r>
           <w:rPr>
@@ -2462,7 +2462,7 @@
           <w14:ligatures w14:val="standardContextual"/>
         </w:rPr>
       </w:pPr>
-      <w:hyperlink w:anchor="_Toc231084594" w:history="1">
+      <w:hyperlink w:anchor="_Toc231090029" w:history="1">
         <w:r>
           <w:rPr>
             <w:rStyle w:val="Hipervnculo"/>
@@ -2489,7 +2489,7 @@
             <w:noProof/>
             <w:webHidden/>
           </w:rPr>
-          <w:instrText xml:space="preserve"> PAGEREF _Toc231084594 \h </w:instrText>
+          <w:instrText xml:space="preserve"> PAGEREF _Toc231090029 \h </w:instrText>
         </w:r>
         <w:r>
           <w:rPr>
@@ -2536,7 +2536,7 @@
           <w14:ligatures w14:val="standardContextual"/>
         </w:rPr>
       </w:pPr>
-      <w:hyperlink w:anchor="_Toc231084595" w:history="1">
+      <w:hyperlink w:anchor="_Toc231090030" w:history="1">
         <w:r>
           <w:rPr>
             <w:rStyle w:val="Hipervnculo"/>
@@ -2563,7 +2563,7 @@
             <w:noProof/>
             <w:webHidden/>
           </w:rPr>
-          <w:instrText xml:space="preserve"> PAGEREF _Toc231084595 \h </w:instrText>
+          <w:instrText xml:space="preserve"> PAGEREF _Toc231090030 \h </w:instrText>
         </w:r>
         <w:r>
           <w:rPr>
@@ -2610,7 +2610,7 @@
           <w14:ligatures w14:val="standardContextual"/>
         </w:rPr>
       </w:pPr>
-      <w:hyperlink w:anchor="_Toc231084596" w:history="1">
+      <w:hyperlink w:anchor="_Toc231090031" w:history="1">
         <w:r>
           <w:rPr>
             <w:rStyle w:val="Hipervnculo"/>
@@ -2637,7 +2637,7 @@
             <w:noProof/>
             <w:webHidden/>
           </w:rPr>
-          <w:instrText xml:space="preserve"> PAGEREF _Toc231084596 \h </w:instrText>
+          <w:instrText xml:space="preserve"> PAGEREF _Toc231090031 \h </w:instrText>
         </w:r>
         <w:r>
           <w:rPr>
@@ -2684,7 +2684,7 @@
           <w14:ligatures w14:val="standardContextual"/>
         </w:rPr>
       </w:pPr>
-      <w:hyperlink w:anchor="_Toc231084597" w:history="1">
+      <w:hyperlink w:anchor="_Toc231090032" w:history="1">
         <w:r>
           <w:rPr>
             <w:rStyle w:val="Hipervnculo"/>
@@ -2711,7 +2711,7 @@
             <w:noProof/>
             <w:webHidden/>
           </w:rPr>
-          <w:instrText xml:space="preserve"> PAGEREF _Toc231084597 \h </w:instrText>
+          <w:instrText xml:space="preserve"> PAGEREF _Toc231090032 \h </w:instrText>
         </w:r>
         <w:r>
           <w:rPr>
@@ -2758,7 +2758,7 @@
           <w14:ligatures w14:val="standardContextual"/>
         </w:rPr>
       </w:pPr>
-      <w:hyperlink w:anchor="_Toc231084598" w:history="1">
+      <w:hyperlink w:anchor="_Toc231090033" w:history="1">
         <w:r>
           <w:rPr>
             <w:rStyle w:val="Hipervnculo"/>
@@ -2785,7 +2785,7 @@
             <w:noProof/>
             <w:webHidden/>
           </w:rPr>
-          <w:instrText xml:space="preserve"> PAGEREF _Toc231084598 \h </w:instrText>
+          <w:instrText xml:space="preserve"> PAGEREF _Toc231090033 \h </w:instrText>
         </w:r>
         <w:r>
           <w:rPr>
@@ -2832,7 +2832,7 @@
           <w14:ligatures w14:val="standardContextual"/>
         </w:rPr>
       </w:pPr>
-      <w:hyperlink w:anchor="_Toc231084599" w:history="1">
+      <w:hyperlink w:anchor="_Toc231090034" w:history="1">
         <w:r>
           <w:rPr>
             <w:rStyle w:val="Hipervnculo"/>
@@ -2859,7 +2859,7 @@
             <w:noProof/>
             <w:webHidden/>
           </w:rPr>
-          <w:instrText xml:space="preserve"> PAGEREF _Toc231084599 \h </w:instrText>
+          <w:instrText xml:space="preserve"> PAGEREF _Toc231090034 \h </w:instrText>
         </w:r>
         <w:r>
           <w:rPr>
@@ -2906,7 +2906,7 @@
           <w14:ligatures w14:val="standardContextual"/>
         </w:rPr>
       </w:pPr>
-      <w:hyperlink w:anchor="_Toc231084600" w:history="1">
+      <w:hyperlink w:anchor="_Toc231090035" w:history="1">
         <w:r>
           <w:rPr>
             <w:rStyle w:val="Hipervnculo"/>
@@ -2933,7 +2933,7 @@
             <w:noProof/>
             <w:webHidden/>
           </w:rPr>
-          <w:instrText xml:space="preserve"> PAGEREF _Toc231084600 \h </w:instrText>
+          <w:instrText xml:space="preserve"> PAGEREF _Toc231090035 \h </w:instrText>
         </w:r>
         <w:r>
           <w:rPr>
@@ -2980,7 +2980,7 @@
           <w14:ligatures w14:val="standardContextual"/>
         </w:rPr>
       </w:pPr>
-      <w:hyperlink w:anchor="_Toc231084601" w:history="1">
+      <w:hyperlink w:anchor="_Toc231090036" w:history="1">
         <w:r>
           <w:rPr>
             <w:rStyle w:val="Hipervnculo"/>
@@ -3007,7 +3007,7 @@
             <w:noProof/>
             <w:webHidden/>
           </w:rPr>
-          <w:instrText xml:space="preserve"> PAGEREF _Toc231084601 \h </w:instrText>
+          <w:instrText xml:space="preserve"> PAGEREF _Toc231090036 \h </w:instrText>
         </w:r>
         <w:r>
           <w:rPr>
@@ -3054,7 +3054,7 @@
           <w14:ligatures w14:val="standardContextual"/>
         </w:rPr>
       </w:pPr>
-      <w:hyperlink w:anchor="_Toc231084602" w:history="1">
+      <w:hyperlink w:anchor="_Toc231090037" w:history="1">
         <w:r>
           <w:rPr>
             <w:rStyle w:val="Hipervnculo"/>
@@ -3081,7 +3081,7 @@
             <w:noProof/>
             <w:webHidden/>
           </w:rPr>
-          <w:instrText xml:space="preserve"> PAGEREF _Toc231084602 \h </w:instrText>
+          <w:instrText xml:space="preserve"> PAGEREF _Toc231090037 \h </w:instrText>
         </w:r>
         <w:r>
           <w:rPr>
@@ -3128,7 +3128,7 @@
           <w14:ligatures w14:val="standardContextual"/>
         </w:rPr>
       </w:pPr>
-      <w:hyperlink w:anchor="_Toc231084603" w:history="1">
+      <w:hyperlink w:anchor="_Toc231090038" w:history="1">
         <w:r>
           <w:rPr>
             <w:rStyle w:val="Hipervnculo"/>
@@ -3155,7 +3155,7 @@
             <w:noProof/>
             <w:webHidden/>
           </w:rPr>
-          <w:instrText xml:space="preserve"> PAGEREF _Toc231084603 \h </w:instrText>
+          <w:instrText xml:space="preserve"> PAGEREF _Toc231090038 \h </w:instrText>
         </w:r>
         <w:r>
           <w:rPr>
@@ -3202,7 +3202,7 @@
           <w14:ligatures w14:val="standardContextual"/>
         </w:rPr>
       </w:pPr>
-      <w:hyperlink w:anchor="_Toc231084604" w:history="1">
+      <w:hyperlink w:anchor="_Toc231090039" w:history="1">
         <w:r>
           <w:rPr>
             <w:rStyle w:val="Hipervnculo"/>
@@ -3229,7 +3229,7 @@
             <w:noProof/>
             <w:webHidden/>
           </w:rPr>
-          <w:instrText xml:space="preserve"> PAGEREF _Toc231084604 \h </w:instrText>
+          <w:instrText xml:space="preserve"> PAGEREF _Toc231090039 \h </w:instrText>
         </w:r>
         <w:r>
           <w:rPr>
@@ -3276,7 +3276,7 @@
           <w14:ligatures w14:val="standardContextual"/>
         </w:rPr>
       </w:pPr>
-      <w:hyperlink w:anchor="_Toc231084605" w:history="1">
+      <w:hyperlink w:anchor="_Toc231090040" w:history="1">
         <w:r>
           <w:rPr>
             <w:rStyle w:val="Hipervnculo"/>
@@ -3303,7 +3303,7 @@
             <w:noProof/>
             <w:webHidden/>
           </w:rPr>
-          <w:instrText xml:space="preserve"> PAGEREF _Toc231084605 \h </w:instrText>
+          <w:instrText xml:space="preserve"> PAGEREF _Toc231090040 \h </w:instrText>
         </w:r>
         <w:r>
           <w:rPr>
@@ -3350,7 +3350,7 @@
           <w14:ligatures w14:val="standardContextual"/>
         </w:rPr>
       </w:pPr>
-      <w:hyperlink w:anchor="_Toc231084606" w:history="1">
+      <w:hyperlink w:anchor="_Toc231090041" w:history="1">
         <w:r>
           <w:rPr>
             <w:rStyle w:val="Hipervnculo"/>
@@ -3377,7 +3377,7 @@
             <w:noProof/>
             <w:webHidden/>
           </w:rPr>
-          <w:instrText xml:space="preserve"> PAGEREF _Toc231084606 \h </w:instrText>
+          <w:instrText xml:space="preserve"> PAGEREF _Toc231090041 \h </w:instrText>
         </w:r>
         <w:r>
           <w:rPr>
@@ -3424,7 +3424,7 @@
           <w14:ligatures w14:val="standardContextual"/>
         </w:rPr>
       </w:pPr>
-      <w:hyperlink w:anchor="_Toc231084607" w:history="1">
+      <w:hyperlink w:anchor="_Toc231090042" w:history="1">
         <w:r>
           <w:rPr>
             <w:rStyle w:val="Hipervnculo"/>
@@ -3451,7 +3451,7 @@
             <w:noProof/>
             <w:webHidden/>
           </w:rPr>
-          <w:instrText xml:space="preserve"> PAGEREF _Toc231084607 \h </w:instrText>
+          <w:instrText xml:space="preserve"> PAGEREF _Toc231090042 \h </w:instrText>
         </w:r>
         <w:r>
           <w:rPr>
@@ -3498,7 +3498,7 @@
           <w14:ligatures w14:val="standardContextual"/>
         </w:rPr>
       </w:pPr>
-      <w:hyperlink w:anchor="_Toc231084608" w:history="1">
+      <w:hyperlink w:anchor="_Toc231090043" w:history="1">
         <w:r>
           <w:rPr>
             <w:rStyle w:val="Hipervnculo"/>
@@ -3525,7 +3525,7 @@
             <w:noProof/>
             <w:webHidden/>
           </w:rPr>
-          <w:instrText xml:space="preserve"> PAGEREF _Toc231084608 \h </w:instrText>
+          <w:instrText xml:space="preserve"> PAGEREF _Toc231090043 \h </w:instrText>
         </w:r>
         <w:r>
           <w:rPr>
@@ -3572,7 +3572,7 @@
           <w14:ligatures w14:val="standardContextual"/>
         </w:rPr>
       </w:pPr>
-      <w:hyperlink w:anchor="_Toc231084609" w:history="1">
+      <w:hyperlink w:anchor="_Toc231090044" w:history="1">
         <w:r>
           <w:rPr>
             <w:rStyle w:val="Hipervnculo"/>
@@ -3599,7 +3599,7 @@
             <w:noProof/>
             <w:webHidden/>
           </w:rPr>
-          <w:instrText xml:space="preserve"> PAGEREF _Toc231084609 \h </w:instrText>
+          <w:instrText xml:space="preserve"> PAGEREF _Toc231090044 \h </w:instrText>
         </w:r>
         <w:r>
           <w:rPr>
@@ -3646,7 +3646,7 @@
           <w14:ligatures w14:val="standardContextual"/>
         </w:rPr>
       </w:pPr>
-      <w:hyperlink w:anchor="_Toc231084610" w:history="1">
+      <w:hyperlink w:anchor="_Toc231090045" w:history="1">
         <w:r>
           <w:rPr>
             <w:rStyle w:val="Hipervnculo"/>
@@ -3673,7 +3673,7 @@
             <w:noProof/>
             <w:webHidden/>
           </w:rPr>
-          <w:instrText xml:space="preserve"> PAGEREF _Toc231084610 \h </w:instrText>
+          <w:instrText xml:space="preserve"> PAGEREF _Toc231090045 \h </w:instrText>
         </w:r>
         <w:r>
           <w:rPr>
@@ -3720,7 +3720,7 @@
           <w14:ligatures w14:val="standardContextual"/>
         </w:rPr>
       </w:pPr>
-      <w:hyperlink w:anchor="_Toc231084611" w:history="1">
+      <w:hyperlink w:anchor="_Toc231090046" w:history="1">
         <w:r>
           <w:rPr>
             <w:rStyle w:val="Hipervnculo"/>
@@ -3747,7 +3747,7 @@
             <w:noProof/>
             <w:webHidden/>
           </w:rPr>
-          <w:instrText xml:space="preserve"> PAGEREF _Toc231084611 \h </w:instrText>
+          <w:instrText xml:space="preserve"> PAGEREF _Toc231090046 \h </w:instrText>
         </w:r>
         <w:r>
           <w:rPr>
@@ -3794,7 +3794,7 @@
           <w14:ligatures w14:val="standardContextual"/>
         </w:rPr>
       </w:pPr>
-      <w:hyperlink w:anchor="_Toc231084612" w:history="1">
+      <w:hyperlink w:anchor="_Toc231090047" w:history="1">
         <w:r>
           <w:rPr>
             <w:rStyle w:val="Hipervnculo"/>
@@ -3821,7 +3821,7 @@
             <w:noProof/>
             <w:webHidden/>
           </w:rPr>
-          <w:instrText xml:space="preserve"> PAGEREF _Toc231084612 \h </w:instrText>
+          <w:instrText xml:space="preserve"> PAGEREF _Toc231090047 \h </w:instrText>
         </w:r>
         <w:r>
           <w:rPr>
@@ -3868,7 +3868,7 @@
           <w14:ligatures w14:val="standardContextual"/>
         </w:rPr>
       </w:pPr>
-      <w:hyperlink w:anchor="_Toc231084613" w:history="1">
+      <w:hyperlink w:anchor="_Toc231090048" w:history="1">
         <w:r>
           <w:rPr>
             <w:rStyle w:val="Hipervnculo"/>
@@ -3895,7 +3895,7 @@
             <w:noProof/>
             <w:webHidden/>
           </w:rPr>
-          <w:instrText xml:space="preserve"> PAGEREF _Toc231084613 \h </w:instrText>
+          <w:instrText xml:space="preserve"> PAGEREF _Toc231090048 \h </w:instrText>
         </w:r>
         <w:r>
           <w:rPr>
@@ -3942,7 +3942,7 @@
           <w14:ligatures w14:val="standardContextual"/>
         </w:rPr>
       </w:pPr>
-      <w:hyperlink w:anchor="_Toc231084614" w:history="1">
+      <w:hyperlink w:anchor="_Toc231090049" w:history="1">
         <w:r>
           <w:rPr>
             <w:rStyle w:val="Hipervnculo"/>
@@ -3969,7 +3969,7 @@
             <w:noProof/>
             <w:webHidden/>
           </w:rPr>
-          <w:instrText xml:space="preserve"> PAGEREF _Toc231084614 \h </w:instrText>
+          <w:instrText xml:space="preserve"> PAGEREF _Toc231090049 \h </w:instrText>
         </w:r>
         <w:r>
           <w:rPr>
@@ -4016,7 +4016,7 @@
           <w14:ligatures w14:val="standardContextual"/>
         </w:rPr>
       </w:pPr>
-      <w:hyperlink w:anchor="_Toc231084615" w:history="1">
+      <w:hyperlink w:anchor="_Toc231090050" w:history="1">
         <w:r>
           <w:rPr>
             <w:rStyle w:val="Hipervnculo"/>
@@ -4043,7 +4043,7 @@
             <w:noProof/>
             <w:webHidden/>
           </w:rPr>
-          <w:instrText xml:space="preserve"> PAGEREF _Toc231084615 \h </w:instrText>
+          <w:instrText xml:space="preserve"> PAGEREF _Toc231090050 \h </w:instrText>
         </w:r>
         <w:r>
           <w:rPr>
@@ -4090,7 +4090,7 @@
           <w14:ligatures w14:val="standardContextual"/>
         </w:rPr>
       </w:pPr>
-      <w:hyperlink w:anchor="_Toc231084616" w:history="1">
+      <w:hyperlink w:anchor="_Toc231090051" w:history="1">
         <w:r>
           <w:rPr>
             <w:rStyle w:val="Hipervnculo"/>
@@ -4117,7 +4117,7 @@
             <w:noProof/>
             <w:webHidden/>
           </w:rPr>
-          <w:instrText xml:space="preserve"> PAGEREF _Toc231084616 \h </w:instrText>
+          <w:instrText xml:space="preserve"> PAGEREF _Toc231090051 \h </w:instrText>
         </w:r>
         <w:r>
           <w:rPr>
@@ -4137,7 +4137,7 @@
             <w:noProof/>
             <w:webHidden/>
           </w:rPr>
-          <w:t>34</w:t>
+          <w:t>35</w:t>
         </w:r>
         <w:r>
           <w:rPr>
@@ -4164,7 +4164,7 @@
           <w14:ligatures w14:val="standardContextual"/>
         </w:rPr>
       </w:pPr>
-      <w:hyperlink w:anchor="_Toc231084617" w:history="1">
+      <w:hyperlink w:anchor="_Toc231090052" w:history="1">
         <w:r>
           <w:rPr>
             <w:rStyle w:val="Hipervnculo"/>
@@ -4191,7 +4191,7 @@
             <w:noProof/>
             <w:webHidden/>
           </w:rPr>
-          <w:instrText xml:space="preserve"> PAGEREF _Toc231084617 \h </w:instrText>
+          <w:instrText xml:space="preserve"> PAGEREF _Toc231090052 \h </w:instrText>
         </w:r>
         <w:r>
           <w:rPr>
@@ -4211,7 +4211,7 @@
             <w:noProof/>
             <w:webHidden/>
           </w:rPr>
-          <w:t>37</w:t>
+          <w:t>38</w:t>
         </w:r>
         <w:r>
           <w:rPr>
@@ -4238,7 +4238,7 @@
           <w14:ligatures w14:val="standardContextual"/>
         </w:rPr>
       </w:pPr>
-      <w:hyperlink w:anchor="_Toc231084618" w:history="1">
+      <w:hyperlink w:anchor="_Toc231090053" w:history="1">
         <w:r>
           <w:rPr>
             <w:rStyle w:val="Hipervnculo"/>
@@ -4265,7 +4265,7 @@
             <w:noProof/>
             <w:webHidden/>
           </w:rPr>
-          <w:instrText xml:space="preserve"> PAGEREF _Toc231084618 \h </w:instrText>
+          <w:instrText xml:space="preserve"> PAGEREF _Toc231090053 \h </w:instrText>
         </w:r>
         <w:r>
           <w:rPr>
@@ -4285,7 +4285,7 @@
             <w:noProof/>
             <w:webHidden/>
           </w:rPr>
-          <w:t>39</w:t>
+          <w:t>40</w:t>
         </w:r>
         <w:r>
           <w:rPr>
@@ -4312,7 +4312,7 @@
           <w14:ligatures w14:val="standardContextual"/>
         </w:rPr>
       </w:pPr>
-      <w:hyperlink w:anchor="_Toc231084619" w:history="1">
+      <w:hyperlink w:anchor="_Toc231090054" w:history="1">
         <w:r>
           <w:rPr>
             <w:rStyle w:val="Hipervnculo"/>
@@ -4339,7 +4339,7 @@
             <w:noProof/>
             <w:webHidden/>
           </w:rPr>
-          <w:instrText xml:space="preserve"> PAGEREF _Toc231084619 \h </w:instrText>
+          <w:instrText xml:space="preserve"> PAGEREF _Toc231090054 \h </w:instrText>
         </w:r>
         <w:r>
           <w:rPr>
@@ -4359,7 +4359,7 @@
             <w:noProof/>
             <w:webHidden/>
           </w:rPr>
-          <w:t>39</w:t>
+          <w:t>40</w:t>
         </w:r>
         <w:r>
           <w:rPr>
@@ -4386,7 +4386,7 @@
           <w14:ligatures w14:val="standardContextual"/>
         </w:rPr>
       </w:pPr>
-      <w:hyperlink w:anchor="_Toc231084620" w:history="1">
+      <w:hyperlink w:anchor="_Toc231090055" w:history="1">
         <w:r>
           <w:rPr>
             <w:rStyle w:val="Hipervnculo"/>
@@ -4413,7 +4413,7 @@
             <w:noProof/>
             <w:webHidden/>
           </w:rPr>
-          <w:instrText xml:space="preserve"> PAGEREF _Toc231084620 \h </w:instrText>
+          <w:instrText xml:space="preserve"> PAGEREF _Toc231090055 \h </w:instrText>
         </w:r>
         <w:r>
           <w:rPr>
@@ -4433,7 +4433,7 @@
             <w:noProof/>
             <w:webHidden/>
           </w:rPr>
-          <w:t>40</w:t>
+          <w:t>41</w:t>
         </w:r>
         <w:r>
           <w:rPr>
@@ -4460,7 +4460,7 @@
           <w14:ligatures w14:val="standardContextual"/>
         </w:rPr>
       </w:pPr>
-      <w:hyperlink w:anchor="_Toc231084621" w:history="1">
+      <w:hyperlink w:anchor="_Toc231090056" w:history="1">
         <w:r>
           <w:rPr>
             <w:rStyle w:val="Hipervnculo"/>
@@ -4487,7 +4487,7 @@
             <w:noProof/>
             <w:webHidden/>
           </w:rPr>
-          <w:instrText xml:space="preserve"> PAGEREF _Toc231084621 \h </w:instrText>
+          <w:instrText xml:space="preserve"> PAGEREF _Toc231090056 \h </w:instrText>
         </w:r>
         <w:r>
           <w:rPr>
@@ -4507,7 +4507,7 @@
             <w:noProof/>
             <w:webHidden/>
           </w:rPr>
-          <w:t>40</w:t>
+          <w:t>41</w:t>
         </w:r>
         <w:r>
           <w:rPr>
@@ -4534,7 +4534,7 @@
           <w14:ligatures w14:val="standardContextual"/>
         </w:rPr>
       </w:pPr>
-      <w:hyperlink w:anchor="_Toc231084622" w:history="1">
+      <w:hyperlink w:anchor="_Toc231090057" w:history="1">
         <w:r>
           <w:rPr>
             <w:rStyle w:val="Hipervnculo"/>
@@ -4561,7 +4561,7 @@
             <w:noProof/>
             <w:webHidden/>
           </w:rPr>
-          <w:instrText xml:space="preserve"> PAGEREF _Toc231084622 \h </w:instrText>
+          <w:instrText xml:space="preserve"> PAGEREF _Toc231090057 \h </w:instrText>
         </w:r>
         <w:r>
           <w:rPr>
@@ -4581,7 +4581,7 @@
             <w:noProof/>
             <w:webHidden/>
           </w:rPr>
-          <w:t>40</w:t>
+          <w:t>41</w:t>
         </w:r>
         <w:r>
           <w:rPr>
@@ -4608,7 +4608,7 @@
           <w14:ligatures w14:val="standardContextual"/>
         </w:rPr>
       </w:pPr>
-      <w:hyperlink w:anchor="_Toc231084623" w:history="1">
+      <w:hyperlink w:anchor="_Toc231090058" w:history="1">
         <w:r>
           <w:rPr>
             <w:rStyle w:val="Hipervnculo"/>
@@ -4635,7 +4635,7 @@
             <w:noProof/>
             <w:webHidden/>
           </w:rPr>
-          <w:instrText xml:space="preserve"> PAGEREF _Toc231084623 \h </w:instrText>
+          <w:instrText xml:space="preserve"> PAGEREF _Toc231090058 \h </w:instrText>
         </w:r>
         <w:r>
           <w:rPr>
@@ -4655,7 +4655,7 @@
             <w:noProof/>
             <w:webHidden/>
           </w:rPr>
-          <w:t>42</w:t>
+          <w:t>43</w:t>
         </w:r>
         <w:r>
           <w:rPr>
@@ -4682,7 +4682,7 @@
           <w14:ligatures w14:val="standardContextual"/>
         </w:rPr>
       </w:pPr>
-      <w:hyperlink w:anchor="_Toc231084624" w:history="1">
+      <w:hyperlink w:anchor="_Toc231090059" w:history="1">
         <w:r>
           <w:rPr>
             <w:rStyle w:val="Hipervnculo"/>
@@ -4709,7 +4709,7 @@
             <w:noProof/>
             <w:webHidden/>
           </w:rPr>
-          <w:instrText xml:space="preserve"> PAGEREF _Toc231084624 \h </w:instrText>
+          <w:instrText xml:space="preserve"> PAGEREF _Toc231090059 \h </w:instrText>
         </w:r>
         <w:r>
           <w:rPr>
@@ -4729,7 +4729,7 @@
             <w:noProof/>
             <w:webHidden/>
           </w:rPr>
-          <w:t>46</w:t>
+          <w:t>47</w:t>
         </w:r>
         <w:r>
           <w:rPr>
@@ -4756,7 +4756,7 @@
           <w14:ligatures w14:val="standardContextual"/>
         </w:rPr>
       </w:pPr>
-      <w:hyperlink w:anchor="_Toc231084625" w:history="1">
+      <w:hyperlink w:anchor="_Toc231090060" w:history="1">
         <w:r>
           <w:rPr>
             <w:rStyle w:val="Hipervnculo"/>
@@ -4783,7 +4783,7 @@
             <w:noProof/>
             <w:webHidden/>
           </w:rPr>
-          <w:instrText xml:space="preserve"> PAGEREF _Toc231084625 \h </w:instrText>
+          <w:instrText xml:space="preserve"> PAGEREF _Toc231090060 \h </w:instrText>
         </w:r>
         <w:r>
           <w:rPr>
@@ -4803,7 +4803,7 @@
             <w:noProof/>
             <w:webHidden/>
           </w:rPr>
-          <w:t>46</w:t>
+          <w:t>47</w:t>
         </w:r>
         <w:r>
           <w:rPr>
@@ -4830,7 +4830,7 @@
           <w14:ligatures w14:val="standardContextual"/>
         </w:rPr>
       </w:pPr>
-      <w:hyperlink w:anchor="_Toc231084626" w:history="1">
+      <w:hyperlink w:anchor="_Toc231090061" w:history="1">
         <w:r>
           <w:rPr>
             <w:rStyle w:val="Hipervnculo"/>
@@ -4857,7 +4857,7 @@
             <w:noProof/>
             <w:webHidden/>
           </w:rPr>
-          <w:instrText xml:space="preserve"> PAGEREF _Toc231084626 \h </w:instrText>
+          <w:instrText xml:space="preserve"> PAGEREF _Toc231090061 \h </w:instrText>
         </w:r>
         <w:r>
           <w:rPr>
@@ -4877,7 +4877,7 @@
             <w:noProof/>
             <w:webHidden/>
           </w:rPr>
-          <w:t>46</w:t>
+          <w:t>47</w:t>
         </w:r>
         <w:r>
           <w:rPr>
@@ -4904,7 +4904,7 @@
           <w14:ligatures w14:val="standardContextual"/>
         </w:rPr>
       </w:pPr>
-      <w:hyperlink w:anchor="_Toc231084627" w:history="1">
+      <w:hyperlink w:anchor="_Toc231090062" w:history="1">
         <w:r>
           <w:rPr>
             <w:rStyle w:val="Hipervnculo"/>
@@ -4931,7 +4931,7 @@
             <w:noProof/>
             <w:webHidden/>
           </w:rPr>
-          <w:instrText xml:space="preserve"> PAGEREF _Toc231084627 \h </w:instrText>
+          <w:instrText xml:space="preserve"> PAGEREF _Toc231090062 \h </w:instrText>
         </w:r>
         <w:r>
           <w:rPr>
@@ -4951,7 +4951,7 @@
             <w:noProof/>
             <w:webHidden/>
           </w:rPr>
-          <w:t>47</w:t>
+          <w:t>48</w:t>
         </w:r>
         <w:r>
           <w:rPr>
@@ -4978,7 +4978,7 @@
           <w14:ligatures w14:val="standardContextual"/>
         </w:rPr>
       </w:pPr>
-      <w:hyperlink w:anchor="_Toc231084628" w:history="1">
+      <w:hyperlink w:anchor="_Toc231090063" w:history="1">
         <w:r>
           <w:rPr>
             <w:rStyle w:val="Hipervnculo"/>
@@ -5005,7 +5005,7 @@
             <w:noProof/>
             <w:webHidden/>
           </w:rPr>
-          <w:instrText xml:space="preserve"> PAGEREF _Toc231084628 \h </w:instrText>
+          <w:instrText xml:space="preserve"> PAGEREF _Toc231090063 \h </w:instrText>
         </w:r>
         <w:r>
           <w:rPr>
@@ -5025,7 +5025,7 @@
             <w:noProof/>
             <w:webHidden/>
           </w:rPr>
-          <w:t>47</w:t>
+          <w:t>48</w:t>
         </w:r>
         <w:r>
           <w:rPr>
@@ -5052,7 +5052,7 @@
           <w14:ligatures w14:val="standardContextual"/>
         </w:rPr>
       </w:pPr>
-      <w:hyperlink w:anchor="_Toc231084629" w:history="1">
+      <w:hyperlink w:anchor="_Toc231090064" w:history="1">
         <w:r>
           <w:rPr>
             <w:rStyle w:val="Hipervnculo"/>
@@ -5079,7 +5079,7 @@
             <w:noProof/>
             <w:webHidden/>
           </w:rPr>
-          <w:instrText xml:space="preserve"> PAGEREF _Toc231084629 \h </w:instrText>
+          <w:instrText xml:space="preserve"> PAGEREF _Toc231090064 \h </w:instrText>
         </w:r>
         <w:r>
           <w:rPr>
@@ -5099,7 +5099,7 @@
             <w:noProof/>
             <w:webHidden/>
           </w:rPr>
-          <w:t>47</w:t>
+          <w:t>48</w:t>
         </w:r>
         <w:r>
           <w:rPr>
@@ -5126,7 +5126,7 @@
           <w14:ligatures w14:val="standardContextual"/>
         </w:rPr>
       </w:pPr>
-      <w:hyperlink w:anchor="_Toc231084630" w:history="1">
+      <w:hyperlink w:anchor="_Toc231090065" w:history="1">
         <w:r>
           <w:rPr>
             <w:rStyle w:val="Hipervnculo"/>
@@ -5153,7 +5153,7 @@
             <w:noProof/>
             <w:webHidden/>
           </w:rPr>
-          <w:instrText xml:space="preserve"> PAGEREF _Toc231084630 \h </w:instrText>
+          <w:instrText xml:space="preserve"> PAGEREF _Toc231090065 \h </w:instrText>
         </w:r>
         <w:r>
           <w:rPr>
@@ -5173,7 +5173,7 @@
             <w:noProof/>
             <w:webHidden/>
           </w:rPr>
-          <w:t>48</w:t>
+          <w:t>49</w:t>
         </w:r>
         <w:r>
           <w:rPr>
@@ -5200,7 +5200,7 @@
           <w14:ligatures w14:val="standardContextual"/>
         </w:rPr>
       </w:pPr>
-      <w:hyperlink w:anchor="_Toc231084631" w:history="1">
+      <w:hyperlink w:anchor="_Toc231090066" w:history="1">
         <w:r>
           <w:rPr>
             <w:rStyle w:val="Hipervnculo"/>
@@ -5227,7 +5227,7 @@
             <w:noProof/>
             <w:webHidden/>
           </w:rPr>
-          <w:instrText xml:space="preserve"> PAGEREF _Toc231084631 \h </w:instrText>
+          <w:instrText xml:space="preserve"> PAGEREF _Toc231090066 \h </w:instrText>
         </w:r>
         <w:r>
           <w:rPr>
@@ -5247,7 +5247,7 @@
             <w:noProof/>
             <w:webHidden/>
           </w:rPr>
-          <w:t>48</w:t>
+          <w:t>49</w:t>
         </w:r>
         <w:r>
           <w:rPr>
@@ -5274,7 +5274,7 @@
           <w14:ligatures w14:val="standardContextual"/>
         </w:rPr>
       </w:pPr>
-      <w:hyperlink w:anchor="_Toc231084632" w:history="1">
+      <w:hyperlink w:anchor="_Toc231090067" w:history="1">
         <w:r>
           <w:rPr>
             <w:rStyle w:val="Hipervnculo"/>
@@ -5301,7 +5301,7 @@
             <w:noProof/>
             <w:webHidden/>
           </w:rPr>
-          <w:instrText xml:space="preserve"> PAGEREF _Toc231084632 \h </w:instrText>
+          <w:instrText xml:space="preserve"> PAGEREF _Toc231090067 \h </w:instrText>
         </w:r>
         <w:r>
           <w:rPr>
@@ -5321,7 +5321,7 @@
             <w:noProof/>
             <w:webHidden/>
           </w:rPr>
-          <w:t>49</w:t>
+          <w:t>50</w:t>
         </w:r>
         <w:r>
           <w:rPr>
@@ -5348,7 +5348,7 @@
           <w14:ligatures w14:val="standardContextual"/>
         </w:rPr>
       </w:pPr>
-      <w:hyperlink w:anchor="_Toc231084633" w:history="1">
+      <w:hyperlink w:anchor="_Toc231090068" w:history="1">
         <w:r>
           <w:rPr>
             <w:rStyle w:val="Hipervnculo"/>
@@ -5375,7 +5375,7 @@
             <w:noProof/>
             <w:webHidden/>
           </w:rPr>
-          <w:instrText xml:space="preserve"> PAGEREF _Toc231084633 \h </w:instrText>
+          <w:instrText xml:space="preserve"> PAGEREF _Toc231090068 \h </w:instrText>
         </w:r>
         <w:r>
           <w:rPr>
@@ -5395,7 +5395,7 @@
             <w:noProof/>
             <w:webHidden/>
           </w:rPr>
-          <w:t>49</w:t>
+          <w:t>50</w:t>
         </w:r>
         <w:r>
           <w:rPr>
@@ -5422,7 +5422,7 @@
           <w14:ligatures w14:val="standardContextual"/>
         </w:rPr>
       </w:pPr>
-      <w:hyperlink w:anchor="_Toc231084634" w:history="1">
+      <w:hyperlink w:anchor="_Toc231090069" w:history="1">
         <w:r>
           <w:rPr>
             <w:rStyle w:val="Hipervnculo"/>
@@ -5449,7 +5449,7 @@
             <w:noProof/>
             <w:webHidden/>
           </w:rPr>
-          <w:instrText xml:space="preserve"> PAGEREF _Toc231084634 \h </w:instrText>
+          <w:instrText xml:space="preserve"> PAGEREF _Toc231090069 \h </w:instrText>
         </w:r>
         <w:r>
           <w:rPr>
@@ -5469,7 +5469,7 @@
             <w:noProof/>
             <w:webHidden/>
           </w:rPr>
-          <w:t>49</w:t>
+          <w:t>50</w:t>
         </w:r>
         <w:r>
           <w:rPr>
@@ -5496,7 +5496,7 @@
           <w14:ligatures w14:val="standardContextual"/>
         </w:rPr>
       </w:pPr>
-      <w:hyperlink w:anchor="_Toc231084635" w:history="1">
+      <w:hyperlink w:anchor="_Toc231090070" w:history="1">
         <w:r>
           <w:rPr>
             <w:rStyle w:val="Hipervnculo"/>
@@ -5523,7 +5523,7 @@
             <w:noProof/>
             <w:webHidden/>
           </w:rPr>
-          <w:instrText xml:space="preserve"> PAGEREF _Toc231084635 \h </w:instrText>
+          <w:instrText xml:space="preserve"> PAGEREF _Toc231090070 \h </w:instrText>
         </w:r>
         <w:r>
           <w:rPr>
@@ -5543,7 +5543,7 @@
             <w:noProof/>
             <w:webHidden/>
           </w:rPr>
-          <w:t>50</w:t>
+          <w:t>51</w:t>
         </w:r>
         <w:r>
           <w:rPr>
@@ -5570,7 +5570,7 @@
           <w14:ligatures w14:val="standardContextual"/>
         </w:rPr>
       </w:pPr>
-      <w:hyperlink w:anchor="_Toc231084636" w:history="1">
+      <w:hyperlink w:anchor="_Toc231090071" w:history="1">
         <w:r>
           <w:rPr>
             <w:rStyle w:val="Hipervnculo"/>
@@ -5597,7 +5597,7 @@
             <w:noProof/>
             <w:webHidden/>
           </w:rPr>
-          <w:instrText xml:space="preserve"> PAGEREF _Toc231084636 \h </w:instrText>
+          <w:instrText xml:space="preserve"> PAGEREF _Toc231090071 \h </w:instrText>
         </w:r>
         <w:r>
           <w:rPr>
@@ -5617,7 +5617,7 @@
             <w:noProof/>
             <w:webHidden/>
           </w:rPr>
-          <w:t>50</w:t>
+          <w:t>51</w:t>
         </w:r>
         <w:r>
           <w:rPr>
@@ -5644,7 +5644,7 @@
           <w14:ligatures w14:val="standardContextual"/>
         </w:rPr>
       </w:pPr>
-      <w:hyperlink w:anchor="_Toc231084637" w:history="1">
+      <w:hyperlink w:anchor="_Toc231090072" w:history="1">
         <w:r>
           <w:rPr>
             <w:rStyle w:val="Hipervnculo"/>
@@ -5671,7 +5671,7 @@
             <w:noProof/>
             <w:webHidden/>
           </w:rPr>
-          <w:instrText xml:space="preserve"> PAGEREF _Toc231084637 \h </w:instrText>
+          <w:instrText xml:space="preserve"> PAGEREF _Toc231090072 \h </w:instrText>
         </w:r>
         <w:r>
           <w:rPr>
@@ -5691,7 +5691,7 @@
             <w:noProof/>
             <w:webHidden/>
           </w:rPr>
-          <w:t>51</w:t>
+          <w:t>52</w:t>
         </w:r>
         <w:r>
           <w:rPr>
@@ -5719,7 +5719,7 @@
       <w:pPr>
         <w:pStyle w:val="Ttulo1"/>
       </w:pPr>
-      <w:bookmarkStart w:id="7" w:name="_Toc231084574"/>
+      <w:bookmarkStart w:id="7" w:name="_Toc231090009"/>
       <w:r>
         <w:lastRenderedPageBreak/>
         <w:t>Índice de tablas</w:t>
@@ -5751,7 +5751,7 @@
       <w:r>
         <w:fldChar w:fldCharType="separate"/>
       </w:r>
-      <w:hyperlink w:anchor="_Toc231084638" w:history="1">
+      <w:hyperlink w:anchor="_Toc231090073" w:history="1">
         <w:r>
           <w:rPr>
             <w:rStyle w:val="Hipervnculo"/>
@@ -5778,7 +5778,7 @@
             <w:noProof/>
             <w:webHidden/>
           </w:rPr>
-          <w:instrText xml:space="preserve"> PAGEREF _Toc231084638 \h </w:instrText>
+          <w:instrText xml:space="preserve"> PAGEREF _Toc231090073 \h </w:instrText>
         </w:r>
         <w:r>
           <w:rPr>
@@ -5825,7 +5825,7 @@
           <w14:ligatures w14:val="standardContextual"/>
         </w:rPr>
       </w:pPr>
-      <w:hyperlink w:anchor="_Toc231084639" w:history="1">
+      <w:hyperlink w:anchor="_Toc231090074" w:history="1">
         <w:r>
           <w:rPr>
             <w:rStyle w:val="Hipervnculo"/>
@@ -5852,7 +5852,7 @@
             <w:noProof/>
             <w:webHidden/>
           </w:rPr>
-          <w:instrText xml:space="preserve"> PAGEREF _Toc231084639 \h </w:instrText>
+          <w:instrText xml:space="preserve"> PAGEREF _Toc231090074 \h </w:instrText>
         </w:r>
         <w:r>
           <w:rPr>
@@ -5899,7 +5899,7 @@
           <w14:ligatures w14:val="standardContextual"/>
         </w:rPr>
       </w:pPr>
-      <w:hyperlink w:anchor="_Toc231084640" w:history="1">
+      <w:hyperlink w:anchor="_Toc231090075" w:history="1">
         <w:r>
           <w:rPr>
             <w:rStyle w:val="Hipervnculo"/>
@@ -5926,7 +5926,7 @@
             <w:noProof/>
             <w:webHidden/>
           </w:rPr>
-          <w:instrText xml:space="preserve"> PAGEREF _Toc231084640 \h </w:instrText>
+          <w:instrText xml:space="preserve"> PAGEREF _Toc231090075 \h </w:instrText>
         </w:r>
         <w:r>
           <w:rPr>
@@ -5973,7 +5973,7 @@
           <w14:ligatures w14:val="standardContextual"/>
         </w:rPr>
       </w:pPr>
-      <w:hyperlink w:anchor="_Toc231084641" w:history="1">
+      <w:hyperlink w:anchor="_Toc231090076" w:history="1">
         <w:r>
           <w:rPr>
             <w:rStyle w:val="Hipervnculo"/>
@@ -6000,7 +6000,7 @@
             <w:noProof/>
             <w:webHidden/>
           </w:rPr>
-          <w:instrText xml:space="preserve"> PAGEREF _Toc231084641 \h </w:instrText>
+          <w:instrText xml:space="preserve"> PAGEREF _Toc231090076 \h </w:instrText>
         </w:r>
         <w:r>
           <w:rPr>
@@ -6047,7 +6047,7 @@
           <w14:ligatures w14:val="standardContextual"/>
         </w:rPr>
       </w:pPr>
-      <w:hyperlink w:anchor="_Toc231084642" w:history="1">
+      <w:hyperlink w:anchor="_Toc231090077" w:history="1">
         <w:r>
           <w:rPr>
             <w:rStyle w:val="Hipervnculo"/>
@@ -6074,7 +6074,7 @@
             <w:noProof/>
             <w:webHidden/>
           </w:rPr>
-          <w:instrText xml:space="preserve"> PAGEREF _Toc231084642 \h </w:instrText>
+          <w:instrText xml:space="preserve"> PAGEREF _Toc231090077 \h </w:instrText>
         </w:r>
         <w:r>
           <w:rPr>
@@ -6094,7 +6094,7 @@
             <w:noProof/>
             <w:webHidden/>
           </w:rPr>
-          <w:t>46</w:t>
+          <w:t>47</w:t>
         </w:r>
         <w:r>
           <w:rPr>
@@ -6121,7 +6121,7 @@
           <w14:ligatures w14:val="standardContextual"/>
         </w:rPr>
       </w:pPr>
-      <w:hyperlink w:anchor="_Toc231084643" w:history="1">
+      <w:hyperlink w:anchor="_Toc231090078" w:history="1">
         <w:r>
           <w:rPr>
             <w:rStyle w:val="Hipervnculo"/>
@@ -6148,7 +6148,7 @@
             <w:noProof/>
             <w:webHidden/>
           </w:rPr>
-          <w:instrText xml:space="preserve"> PAGEREF _Toc231084643 \h </w:instrText>
+          <w:instrText xml:space="preserve"> PAGEREF _Toc231090078 \h </w:instrText>
         </w:r>
         <w:r>
           <w:rPr>
@@ -6168,7 +6168,7 @@
             <w:noProof/>
             <w:webHidden/>
           </w:rPr>
-          <w:t>46</w:t>
+          <w:t>47</w:t>
         </w:r>
         <w:r>
           <w:rPr>
@@ -6195,7 +6195,7 @@
           <w14:ligatures w14:val="standardContextual"/>
         </w:rPr>
       </w:pPr>
-      <w:hyperlink w:anchor="_Toc231084644" w:history="1">
+      <w:hyperlink w:anchor="_Toc231090079" w:history="1">
         <w:r>
           <w:rPr>
             <w:rStyle w:val="Hipervnculo"/>
@@ -6222,7 +6222,7 @@
             <w:noProof/>
             <w:webHidden/>
           </w:rPr>
-          <w:instrText xml:space="preserve"> PAGEREF _Toc231084644 \h </w:instrText>
+          <w:instrText xml:space="preserve"> PAGEREF _Toc231090079 \h </w:instrText>
         </w:r>
         <w:r>
           <w:rPr>
@@ -6242,7 +6242,7 @@
             <w:noProof/>
             <w:webHidden/>
           </w:rPr>
-          <w:t>47</w:t>
+          <w:t>48</w:t>
         </w:r>
         <w:r>
           <w:rPr>
@@ -6269,7 +6269,7 @@
           <w14:ligatures w14:val="standardContextual"/>
         </w:rPr>
       </w:pPr>
-      <w:hyperlink w:anchor="_Toc231084645" w:history="1">
+      <w:hyperlink w:anchor="_Toc231090080" w:history="1">
         <w:r>
           <w:rPr>
             <w:rStyle w:val="Hipervnculo"/>
@@ -6296,7 +6296,7 @@
             <w:noProof/>
             <w:webHidden/>
           </w:rPr>
-          <w:instrText xml:space="preserve"> PAGEREF _Toc231084645 \h </w:instrText>
+          <w:instrText xml:space="preserve"> PAGEREF _Toc231090080 \h </w:instrText>
         </w:r>
         <w:r>
           <w:rPr>
@@ -6316,7 +6316,7 @@
             <w:noProof/>
             <w:webHidden/>
           </w:rPr>
-          <w:t>47</w:t>
+          <w:t>48</w:t>
         </w:r>
         <w:r>
           <w:rPr>
@@ -6343,7 +6343,7 @@
           <w14:ligatures w14:val="standardContextual"/>
         </w:rPr>
       </w:pPr>
-      <w:hyperlink w:anchor="_Toc231084646" w:history="1">
+      <w:hyperlink w:anchor="_Toc231090081" w:history="1">
         <w:r>
           <w:rPr>
             <w:rStyle w:val="Hipervnculo"/>
@@ -6370,7 +6370,7 @@
             <w:noProof/>
             <w:webHidden/>
           </w:rPr>
-          <w:instrText xml:space="preserve"> PAGEREF _Toc231084646 \h </w:instrText>
+          <w:instrText xml:space="preserve"> PAGEREF _Toc231090081 \h </w:instrText>
         </w:r>
         <w:r>
           <w:rPr>
@@ -6390,7 +6390,7 @@
             <w:noProof/>
             <w:webHidden/>
           </w:rPr>
-          <w:t>48</w:t>
+          <w:t>49</w:t>
         </w:r>
         <w:r>
           <w:rPr>
@@ -6417,7 +6417,7 @@
           <w14:ligatures w14:val="standardContextual"/>
         </w:rPr>
       </w:pPr>
-      <w:hyperlink w:anchor="_Toc231084647" w:history="1">
+      <w:hyperlink w:anchor="_Toc231090082" w:history="1">
         <w:r>
           <w:rPr>
             <w:rStyle w:val="Hipervnculo"/>
@@ -6444,7 +6444,7 @@
             <w:noProof/>
             <w:webHidden/>
           </w:rPr>
-          <w:instrText xml:space="preserve"> PAGEREF _Toc231084647 \h </w:instrText>
+          <w:instrText xml:space="preserve"> PAGEREF _Toc231090082 \h </w:instrText>
         </w:r>
         <w:r>
           <w:rPr>
@@ -6464,7 +6464,7 @@
             <w:noProof/>
             <w:webHidden/>
           </w:rPr>
-          <w:t>48</w:t>
+          <w:t>49</w:t>
         </w:r>
         <w:r>
           <w:rPr>
@@ -6491,7 +6491,7 @@
           <w14:ligatures w14:val="standardContextual"/>
         </w:rPr>
       </w:pPr>
-      <w:hyperlink w:anchor="_Toc231084648" w:history="1">
+      <w:hyperlink w:anchor="_Toc231090083" w:history="1">
         <w:r>
           <w:rPr>
             <w:rStyle w:val="Hipervnculo"/>
@@ -6518,7 +6518,7 @@
             <w:noProof/>
             <w:webHidden/>
           </w:rPr>
-          <w:instrText xml:space="preserve"> PAGEREF _Toc231084648 \h </w:instrText>
+          <w:instrText xml:space="preserve"> PAGEREF _Toc231090083 \h </w:instrText>
         </w:r>
         <w:r>
           <w:rPr>
@@ -6538,7 +6538,7 @@
             <w:noProof/>
             <w:webHidden/>
           </w:rPr>
-          <w:t>49</w:t>
+          <w:t>50</w:t>
         </w:r>
         <w:r>
           <w:rPr>
@@ -6565,7 +6565,7 @@
           <w14:ligatures w14:val="standardContextual"/>
         </w:rPr>
       </w:pPr>
-      <w:hyperlink w:anchor="_Toc231084649" w:history="1">
+      <w:hyperlink w:anchor="_Toc231090084" w:history="1">
         <w:r>
           <w:rPr>
             <w:rStyle w:val="Hipervnculo"/>
@@ -6592,7 +6592,7 @@
             <w:noProof/>
             <w:webHidden/>
           </w:rPr>
-          <w:instrText xml:space="preserve"> PAGEREF _Toc231084649 \h </w:instrText>
+          <w:instrText xml:space="preserve"> PAGEREF _Toc231090084 \h </w:instrText>
         </w:r>
         <w:r>
           <w:rPr>
@@ -6612,7 +6612,7 @@
             <w:noProof/>
             <w:webHidden/>
           </w:rPr>
-          <w:t>49</w:t>
+          <w:t>50</w:t>
         </w:r>
         <w:r>
           <w:rPr>
@@ -6639,7 +6639,7 @@
           <w14:ligatures w14:val="standardContextual"/>
         </w:rPr>
       </w:pPr>
-      <w:hyperlink w:anchor="_Toc231084650" w:history="1">
+      <w:hyperlink w:anchor="_Toc231090085" w:history="1">
         <w:r>
           <w:rPr>
             <w:rStyle w:val="Hipervnculo"/>
@@ -6666,7 +6666,7 @@
             <w:noProof/>
             <w:webHidden/>
           </w:rPr>
-          <w:instrText xml:space="preserve"> PAGEREF _Toc231084650 \h </w:instrText>
+          <w:instrText xml:space="preserve"> PAGEREF _Toc231090085 \h </w:instrText>
         </w:r>
         <w:r>
           <w:rPr>
@@ -6686,7 +6686,7 @@
             <w:noProof/>
             <w:webHidden/>
           </w:rPr>
-          <w:t>49</w:t>
+          <w:t>50</w:t>
         </w:r>
         <w:r>
           <w:rPr>
@@ -6713,7 +6713,7 @@
           <w14:ligatures w14:val="standardContextual"/>
         </w:rPr>
       </w:pPr>
-      <w:hyperlink w:anchor="_Toc231084651" w:history="1">
+      <w:hyperlink w:anchor="_Toc231090086" w:history="1">
         <w:r>
           <w:rPr>
             <w:rStyle w:val="Hipervnculo"/>
@@ -6740,7 +6740,7 @@
             <w:noProof/>
             <w:webHidden/>
           </w:rPr>
-          <w:instrText xml:space="preserve"> PAGEREF _Toc231084651 \h </w:instrText>
+          <w:instrText xml:space="preserve"> PAGEREF _Toc231090086 \h </w:instrText>
         </w:r>
         <w:r>
           <w:rPr>
@@ -6760,7 +6760,7 @@
             <w:noProof/>
             <w:webHidden/>
           </w:rPr>
-          <w:t>50</w:t>
+          <w:t>51</w:t>
         </w:r>
         <w:r>
           <w:rPr>
@@ -6788,7 +6788,7 @@
       <w:pPr>
         <w:pStyle w:val="Ttulo1"/>
       </w:pPr>
-      <w:bookmarkStart w:id="8" w:name="_Toc231084575"/>
+      <w:bookmarkStart w:id="8" w:name="_Toc231090010"/>
       <w:r>
         <w:lastRenderedPageBreak/>
         <w:t>Índice de figuras</w:t>
@@ -6820,7 +6820,7 @@
       <w:r>
         <w:fldChar w:fldCharType="separate"/>
       </w:r>
-      <w:hyperlink w:anchor="_Toc231084652" w:history="1">
+      <w:hyperlink w:anchor="_Toc231090087" w:history="1">
         <w:r>
           <w:rPr>
             <w:rStyle w:val="Hipervnculo"/>
@@ -6847,7 +6847,7 @@
             <w:noProof/>
             <w:webHidden/>
           </w:rPr>
-          <w:instrText xml:space="preserve"> PAGEREF _Toc231084652 \h </w:instrText>
+          <w:instrText xml:space="preserve"> PAGEREF _Toc231090087 \h </w:instrText>
         </w:r>
         <w:r>
           <w:rPr>
@@ -6894,7 +6894,7 @@
           <w14:ligatures w14:val="standardContextual"/>
         </w:rPr>
       </w:pPr>
-      <w:hyperlink w:anchor="_Toc231084653" w:history="1">
+      <w:hyperlink w:anchor="_Toc231090088" w:history="1">
         <w:r>
           <w:rPr>
             <w:rStyle w:val="Hipervnculo"/>
@@ -6921,7 +6921,7 @@
             <w:noProof/>
             <w:webHidden/>
           </w:rPr>
-          <w:instrText xml:space="preserve"> PAGEREF _Toc231084653 \h </w:instrText>
+          <w:instrText xml:space="preserve"> PAGEREF _Toc231090088 \h </w:instrText>
         </w:r>
         <w:r>
           <w:rPr>
@@ -6968,7 +6968,7 @@
           <w14:ligatures w14:val="standardContextual"/>
         </w:rPr>
       </w:pPr>
-      <w:hyperlink w:anchor="_Toc231084654" w:history="1">
+      <w:hyperlink w:anchor="_Toc231090089" w:history="1">
         <w:r>
           <w:rPr>
             <w:rStyle w:val="Hipervnculo"/>
@@ -6995,7 +6995,7 @@
             <w:noProof/>
             <w:webHidden/>
           </w:rPr>
-          <w:instrText xml:space="preserve"> PAGEREF _Toc231084654 \h </w:instrText>
+          <w:instrText xml:space="preserve"> PAGEREF _Toc231090089 \h </w:instrText>
         </w:r>
         <w:r>
           <w:rPr>
@@ -7042,7 +7042,7 @@
           <w14:ligatures w14:val="standardContextual"/>
         </w:rPr>
       </w:pPr>
-      <w:hyperlink w:anchor="_Toc231084655" w:history="1">
+      <w:hyperlink w:anchor="_Toc231090090" w:history="1">
         <w:r>
           <w:rPr>
             <w:rStyle w:val="Hipervnculo"/>
@@ -7069,7 +7069,7 @@
             <w:noProof/>
             <w:webHidden/>
           </w:rPr>
-          <w:instrText xml:space="preserve"> PAGEREF _Toc231084655 \h </w:instrText>
+          <w:instrText xml:space="preserve"> PAGEREF _Toc231090090 \h </w:instrText>
         </w:r>
         <w:r>
           <w:rPr>
@@ -7116,7 +7116,7 @@
           <w14:ligatures w14:val="standardContextual"/>
         </w:rPr>
       </w:pPr>
-      <w:hyperlink w:anchor="_Toc231084656" w:history="1">
+      <w:hyperlink w:anchor="_Toc231090091" w:history="1">
         <w:r>
           <w:rPr>
             <w:rStyle w:val="Hipervnculo"/>
@@ -7143,7 +7143,7 @@
             <w:noProof/>
             <w:webHidden/>
           </w:rPr>
-          <w:instrText xml:space="preserve"> PAGEREF _Toc231084656 \h </w:instrText>
+          <w:instrText xml:space="preserve"> PAGEREF _Toc231090091 \h </w:instrText>
         </w:r>
         <w:r>
           <w:rPr>
@@ -7190,7 +7190,7 @@
           <w14:ligatures w14:val="standardContextual"/>
         </w:rPr>
       </w:pPr>
-      <w:hyperlink w:anchor="_Toc231084657" w:history="1">
+      <w:hyperlink w:anchor="_Toc231090092" w:history="1">
         <w:r>
           <w:rPr>
             <w:rStyle w:val="Hipervnculo"/>
@@ -7217,7 +7217,7 @@
             <w:noProof/>
             <w:webHidden/>
           </w:rPr>
-          <w:instrText xml:space="preserve"> PAGEREF _Toc231084657 \h </w:instrText>
+          <w:instrText xml:space="preserve"> PAGEREF _Toc231090092 \h </w:instrText>
         </w:r>
         <w:r>
           <w:rPr>
@@ -7237,7 +7237,7 @@
             <w:noProof/>
             <w:webHidden/>
           </w:rPr>
-          <w:t>37</w:t>
+          <w:t>38</w:t>
         </w:r>
         <w:r>
           <w:rPr>
@@ -7265,7 +7265,7 @@
       <w:pPr>
         <w:pStyle w:val="Ttulo1"/>
       </w:pPr>
-      <w:bookmarkStart w:id="9" w:name="_Toc231084576"/>
+      <w:bookmarkStart w:id="9" w:name="_Toc231090011"/>
       <w:r>
         <w:lastRenderedPageBreak/>
         <w:t>Lista de abreviaturas y siglas</w:t>
@@ -8051,7 +8051,7 @@
       <w:pPr>
         <w:pStyle w:val="Ttulo1"/>
       </w:pPr>
-      <w:bookmarkStart w:id="10" w:name="_Toc231084577"/>
+      <w:bookmarkStart w:id="10" w:name="_Toc231090012"/>
       <w:r>
         <w:lastRenderedPageBreak/>
         <w:t>Capítulo 1 — Introducción</w:t>
@@ -8062,7 +8062,7 @@
       <w:pPr>
         <w:pStyle w:val="Ttulo2"/>
       </w:pPr>
-      <w:bookmarkStart w:id="11" w:name="_Toc231084578"/>
+      <w:bookmarkStart w:id="11" w:name="_Toc231090013"/>
       <w:r>
         <w:t>1.1 Contextualización</w:t>
       </w:r>
@@ -8150,7 +8150,7 @@
       <w:pPr>
         <w:pStyle w:val="Ttulo2"/>
       </w:pPr>
-      <w:bookmarkStart w:id="12" w:name="_Toc231084579"/>
+      <w:bookmarkStart w:id="12" w:name="_Toc231090014"/>
       <w:r>
         <w:t>1.2 Problema de investigación y justificación</w:t>
       </w:r>
@@ -8260,7 +8260,7 @@
       <w:pPr>
         <w:pStyle w:val="Ttulo2"/>
       </w:pPr>
-      <w:bookmarkStart w:id="13" w:name="_Toc231084580"/>
+      <w:bookmarkStart w:id="13" w:name="_Toc231090015"/>
       <w:r>
         <w:t>1.3 Pregunta y objetivos de investigación</w:t>
       </w:r>
@@ -8445,7 +8445,7 @@
       <w:pPr>
         <w:pStyle w:val="Ttulo2"/>
       </w:pPr>
-      <w:bookmarkStart w:id="14" w:name="_Toc231084581"/>
+      <w:bookmarkStart w:id="14" w:name="_Toc231090016"/>
       <w:r>
         <w:lastRenderedPageBreak/>
         <w:t>1.4 Hipótesis general</w:t>
@@ -8489,7 +8489,7 @@
       <w:pPr>
         <w:pStyle w:val="Ttulo2"/>
       </w:pPr>
-      <w:bookmarkStart w:id="15" w:name="_Toc231084582"/>
+      <w:bookmarkStart w:id="15" w:name="_Toc231090017"/>
       <w:r>
         <w:t>1.5 Aspectos metodológicos y alcance</w:t>
       </w:r>
@@ -8592,7 +8592,7 @@
       <w:pPr>
         <w:pStyle w:val="Ttulo2"/>
       </w:pPr>
-      <w:bookmarkStart w:id="16" w:name="_Toc231084583"/>
+      <w:bookmarkStart w:id="16" w:name="_Toc231090018"/>
       <w:r>
         <w:t>1.6 Aportes esperados</w:t>
       </w:r>
@@ -8645,7 +8645,7 @@
       <w:pPr>
         <w:pStyle w:val="Ttulo2"/>
       </w:pPr>
-      <w:bookmarkStart w:id="17" w:name="_Toc231084584"/>
+      <w:bookmarkStart w:id="17" w:name="_Toc231090019"/>
       <w:r>
         <w:t>1.7 Estructura de la tesis</w:t>
       </w:r>
@@ -8686,7 +8686,7 @@
       <w:pPr>
         <w:pStyle w:val="Ttulo1"/>
       </w:pPr>
-      <w:bookmarkStart w:id="18" w:name="_Toc231084585"/>
+      <w:bookmarkStart w:id="18" w:name="_Toc231090020"/>
       <w:r>
         <w:lastRenderedPageBreak/>
         <w:t>Capítulo 2 — Marco teórico y revisión de literatura</w:t>
@@ -8697,7 +8697,7 @@
       <w:pPr>
         <w:pStyle w:val="Ttulo2"/>
       </w:pPr>
-      <w:bookmarkStart w:id="19" w:name="_Toc231084586"/>
+      <w:bookmarkStart w:id="19" w:name="_Toc231090021"/>
       <w:r>
         <w:t>2.1 Determinantes macroeconómicos de los retornos accionarios</w:t>
       </w:r>
@@ -8995,7 +8995,7 @@
       <w:pPr>
         <w:pStyle w:val="Ttulo2"/>
       </w:pPr>
-      <w:bookmarkStart w:id="20" w:name="_Toc231084587"/>
+      <w:bookmarkStart w:id="20" w:name="_Toc231090022"/>
       <w:r>
         <w:t>2.2 Precios de commodities y valoración de empresas mineras</w:t>
       </w:r>
@@ -9129,7 +9129,7 @@
       <w:pPr>
         <w:pStyle w:val="Ttulo2"/>
       </w:pPr>
-      <w:bookmarkStart w:id="21" w:name="_Toc231084588"/>
+      <w:bookmarkStart w:id="21" w:name="_Toc231090023"/>
       <w:r>
         <w:t>2.3 Tipo de cambio y exposición de empresas exportadoras</w:t>
       </w:r>
@@ -9223,7 +9223,7 @@
       <w:pPr>
         <w:pStyle w:val="Ttulo2"/>
       </w:pPr>
-      <w:bookmarkStart w:id="22" w:name="_Toc231084589"/>
+      <w:bookmarkStart w:id="22" w:name="_Toc231090024"/>
       <w:r>
         <w:t>2.4 Cobre, tipo de cambio y la economía chilena</w:t>
       </w:r>
@@ -9448,7 +9448,7 @@
       <w:pPr>
         <w:pStyle w:val="Ttulo2"/>
       </w:pPr>
-      <w:bookmarkStart w:id="23" w:name="_Toc231084590"/>
+      <w:bookmarkStart w:id="23" w:name="_Toc231090025"/>
       <w:r>
         <w:lastRenderedPageBreak/>
         <w:t>2.5 Eficiencia informacional y segmentación de mercados</w:t>
@@ -9589,7 +9589,7 @@
       <w:pPr>
         <w:pStyle w:val="Ttulo2"/>
       </w:pPr>
-      <w:bookmarkStart w:id="24" w:name="_Toc231084591"/>
+      <w:bookmarkStart w:id="24" w:name="_Toc231090026"/>
       <w:r>
         <w:t>2.6 Enfoques econométricos para la medición de impacto</w:t>
       </w:r>
@@ -9741,7 +9741,7 @@
       <w:pPr>
         <w:pStyle w:val="Ttulo2"/>
       </w:pPr>
-      <w:bookmarkStart w:id="25" w:name="_Toc231084592"/>
+      <w:bookmarkStart w:id="25" w:name="_Toc231090027"/>
       <w:r>
         <w:t>2.7 Síntesis e identificación del vacío de investigación</w:t>
       </w:r>
@@ -9866,7 +9866,7 @@
       <w:pPr>
         <w:pStyle w:val="Ttulo3"/>
       </w:pPr>
-      <w:bookmarkStart w:id="26" w:name="_Toc231084593"/>
+      <w:bookmarkStart w:id="26" w:name="_Toc231090028"/>
       <w:r>
         <w:t>Nota sobre la tabla de literatura</w:t>
       </w:r>
@@ -9896,7 +9896,7 @@
       <w:pPr>
         <w:pStyle w:val="Ttulo1"/>
       </w:pPr>
-      <w:bookmarkStart w:id="27" w:name="_Toc231084594"/>
+      <w:bookmarkStart w:id="27" w:name="_Toc231090029"/>
       <w:r>
         <w:lastRenderedPageBreak/>
         <w:t>Capítulo 3 — Datos y metodología</w:t>
@@ -9907,7 +9907,7 @@
       <w:pPr>
         <w:pStyle w:val="Ttulo2"/>
       </w:pPr>
-      <w:bookmarkStart w:id="28" w:name="_Toc231084595"/>
+      <w:bookmarkStart w:id="28" w:name="_Toc231090030"/>
       <w:r>
         <w:t xml:space="preserve">3.1 </w:t>
       </w:r>
@@ -10102,7 +10102,7 @@
       <w:pPr>
         <w:pStyle w:val="Ttulo2"/>
       </w:pPr>
-      <w:bookmarkStart w:id="29" w:name="_Toc231084596"/>
+      <w:bookmarkStart w:id="29" w:name="_Toc231090031"/>
       <w:r>
         <w:t>3.2 Variable dependiente</w:t>
       </w:r>
@@ -10164,7 +10164,7 @@
       <w:pPr>
         <w:pStyle w:val="Ttulo2"/>
       </w:pPr>
-      <w:bookmarkStart w:id="30" w:name="_Toc231084597"/>
+      <w:bookmarkStart w:id="30" w:name="_Toc231090032"/>
       <w:r>
         <w:t>3.3 Variables explicativas</w:t>
       </w:r>
@@ -10231,7 +10231,7 @@
       <w:pPr>
         <w:pStyle w:val="Ttulo2"/>
       </w:pPr>
-      <w:bookmarkStart w:id="31" w:name="_Toc231084598"/>
+      <w:bookmarkStart w:id="31" w:name="_Toc231090033"/>
       <w:r>
         <w:t>3.4 Tratamiento de datos y frecuencias mixtas</w:t>
       </w:r>
@@ -10288,7 +10288,7 @@
       <w:pPr>
         <w:pStyle w:val="Ttulo2"/>
       </w:pPr>
-      <w:bookmarkStart w:id="32" w:name="_Toc231084599"/>
+      <w:bookmarkStart w:id="32" w:name="_Toc231090034"/>
       <w:r>
         <w:t>3.5 Datación de las fases del ciclo del cobre</w:t>
       </w:r>
@@ -10354,7 +10354,7 @@
       <w:pPr>
         <w:pStyle w:val="Ttulo2"/>
       </w:pPr>
-      <w:bookmarkStart w:id="33" w:name="_Toc231084600"/>
+      <w:bookmarkStart w:id="33" w:name="_Toc231090035"/>
       <w:r>
         <w:lastRenderedPageBreak/>
         <w:t>3.6 Estrategia econométrica</w:t>
@@ -10365,7 +10365,7 @@
       <w:pPr>
         <w:pStyle w:val="Ttulo3"/>
       </w:pPr>
-      <w:bookmarkStart w:id="34" w:name="_Toc231084601"/>
+      <w:bookmarkStart w:id="34" w:name="_Toc231090036"/>
       <w:r>
         <w:t>3.6.1 Estacionariedad y orden de integración (OE1)</w:t>
       </w:r>
@@ -10408,7 +10408,7 @@
       <w:pPr>
         <w:pStyle w:val="Ttulo3"/>
       </w:pPr>
-      <w:bookmarkStart w:id="35" w:name="_Toc231084602"/>
+      <w:bookmarkStart w:id="35" w:name="_Toc231090037"/>
       <w:r>
         <w:t>3.6.2 Modelo de impacto: panel de efectos fijos (OE2)</w:t>
       </w:r>
@@ -10499,7 +10499,7 @@
       <w:pPr>
         <w:pStyle w:val="Ttulo3"/>
       </w:pPr>
-      <w:bookmarkStart w:id="36" w:name="_Toc231084603"/>
+      <w:bookmarkStart w:id="36" w:name="_Toc231090038"/>
       <w:r>
         <w:t>3.6.3 Relaciones de largo plazo: cointegración (OE3)</w:t>
       </w:r>
@@ -10600,7 +10600,7 @@
       <w:pPr>
         <w:pStyle w:val="Ttulo3"/>
       </w:pPr>
-      <w:bookmarkStart w:id="37" w:name="_Toc231084604"/>
+      <w:bookmarkStart w:id="37" w:name="_Toc231090039"/>
       <w:r>
         <w:t>3.6.4 Dinámica de shocks: VAR, impulso-respuesta y descomposición de varianza (OE4)</w:t>
       </w:r>
@@ -10720,7 +10720,7 @@
       <w:pPr>
         <w:pStyle w:val="Ttulo3"/>
       </w:pPr>
-      <w:bookmarkStart w:id="38" w:name="_Toc231084605"/>
+      <w:bookmarkStart w:id="38" w:name="_Toc231090040"/>
       <w:r>
         <w:t>3.6.5 Estabilidad por fases del ciclo (OE5)</w:t>
       </w:r>
@@ -10766,7 +10766,7 @@
       <w:pPr>
         <w:pStyle w:val="Ttulo3"/>
       </w:pPr>
-      <w:bookmarkStart w:id="39" w:name="_Toc231084606"/>
+      <w:bookmarkStart w:id="39" w:name="_Toc231090041"/>
       <w:r>
         <w:t>3.6.6 Comparación entre mercados: triangulación (OE6)</w:t>
       </w:r>
@@ -10817,7 +10817,7 @@
       <w:pPr>
         <w:pStyle w:val="Ttulo2"/>
       </w:pPr>
-      <w:bookmarkStart w:id="40" w:name="_Toc231084607"/>
+      <w:bookmarkStart w:id="40" w:name="_Toc231090042"/>
       <w:r>
         <w:t xml:space="preserve">3.7 </w:t>
       </w:r>
@@ -10870,7 +10870,7 @@
       <w:pPr>
         <w:pStyle w:val="Ttulo3"/>
       </w:pPr>
-      <w:bookmarkStart w:id="41" w:name="_Toc231084608"/>
+      <w:bookmarkStart w:id="41" w:name="_Toc231090043"/>
       <w:r>
         <w:t>Tabla 3.1 — Definición operativa de variables (resumen)</w:t>
       </w:r>
@@ -10882,7 +10882,7 @@
         <w:spacing w:before="40" w:after="40"/>
         <w:jc w:val="center"/>
       </w:pPr>
-      <w:bookmarkStart w:id="42" w:name="_Toc231084638"/>
+      <w:bookmarkStart w:id="42" w:name="_Toc231090073"/>
       <w:r>
         <w:rPr>
           <w:i w:val="0"/>
@@ -12851,7 +12851,7 @@
       <w:pPr>
         <w:pStyle w:val="Ttulo1"/>
       </w:pPr>
-      <w:bookmarkStart w:id="43" w:name="_Toc231084609"/>
+      <w:bookmarkStart w:id="43" w:name="_Toc231090044"/>
       <w:r>
         <w:lastRenderedPageBreak/>
         <w:t>Capítulo 4 — Resultados y discusión</w:t>
@@ -12862,7 +12862,7 @@
       <w:pPr>
         <w:pStyle w:val="Ttulo2"/>
       </w:pPr>
-      <w:bookmarkStart w:id="44" w:name="_Toc231084610"/>
+      <w:bookmarkStart w:id="44" w:name="_Toc231090045"/>
       <w:r>
         <w:t>4.1 Análisis descriptivo y propiedades de las series (OE1)</w:t>
       </w:r>
@@ -13092,7 +13092,7 @@
       <w:pPr>
         <w:pStyle w:val="Ttulo2"/>
       </w:pPr>
-      <w:bookmarkStart w:id="45" w:name="_Toc231084611"/>
+      <w:bookmarkStart w:id="45" w:name="_Toc231090046"/>
       <w:r>
         <w:t>4.2 Determinantes de los retornos: global vs local (OE2)</w:t>
       </w:r>
@@ -13114,7 +13114,7 @@
         <w:spacing w:before="40" w:after="40"/>
         <w:jc w:val="center"/>
       </w:pPr>
-      <w:bookmarkStart w:id="46" w:name="_Toc231084639"/>
+      <w:bookmarkStart w:id="46" w:name="_Toc231090074"/>
       <w:r>
         <w:rPr>
           <w:i w:val="0"/>
@@ -13920,7 +13920,7 @@
           <w:noProof/>
         </w:rPr>
         <w:drawing>
-          <wp:inline distT="0" distB="0" distL="0" distR="0" wp14:anchorId="1E53E9E8" wp14:editId="1441339D">
+          <wp:inline distT="0" distB="0" distL="0" distR="0" wp14:anchorId="63687369" wp14:editId="39206E25">
             <wp:extent cx="5212080" cy="2833680"/>
             <wp:effectExtent l="0" t="0" r="0" b="0"/>
             <wp:docPr id="1" name="Picture 1"/>
@@ -13962,7 +13962,7 @@
         <w:spacing w:before="160" w:after="200"/>
         <w:jc w:val="center"/>
       </w:pPr>
-      <w:bookmarkStart w:id="47" w:name="_Toc231084652"/>
+      <w:bookmarkStart w:id="47" w:name="_Toc231090087"/>
       <w:r>
         <w:rPr>
           <w:i w:val="0"/>
@@ -14068,7 +14068,7 @@
       <w:pPr>
         <w:pStyle w:val="Ttulo2"/>
       </w:pPr>
-      <w:bookmarkStart w:id="48" w:name="_Toc231084612"/>
+      <w:bookmarkStart w:id="48" w:name="_Toc231090047"/>
       <w:r>
         <w:t>4.3 Relaciones de largo plazo (OE3)</w:t>
       </w:r>
@@ -14232,7 +14232,7 @@
       <w:pPr>
         <w:pStyle w:val="Ttulo2"/>
       </w:pPr>
-      <w:bookmarkStart w:id="49" w:name="_Toc231084613"/>
+      <w:bookmarkStart w:id="49" w:name="_Toc231090048"/>
       <w:r>
         <w:t>4.4 Dinámica de shocks (OE4)</w:t>
       </w:r>
@@ -14254,7 +14254,7 @@
         <w:spacing w:before="40" w:after="40"/>
         <w:jc w:val="center"/>
       </w:pPr>
-      <w:bookmarkStart w:id="50" w:name="_Toc231084640"/>
+      <w:bookmarkStart w:id="50" w:name="_Toc231090075"/>
       <w:r>
         <w:rPr>
           <w:i w:val="0"/>
@@ -14701,7 +14701,7 @@
           <w:noProof/>
         </w:rPr>
         <w:drawing>
-          <wp:inline distT="0" distB="0" distL="0" distR="0" wp14:anchorId="2465C8B5" wp14:editId="6FD183D8">
+          <wp:inline distT="0" distB="0" distL="0" distR="0" wp14:anchorId="2C2E439B" wp14:editId="05E453B3">
             <wp:extent cx="5212080" cy="3890356"/>
             <wp:effectExtent l="0" t="0" r="0" b="0"/>
             <wp:docPr id="2" name="Picture 2"/>
@@ -14743,7 +14743,7 @@
         <w:spacing w:before="160" w:after="200"/>
         <w:jc w:val="center"/>
       </w:pPr>
-      <w:bookmarkStart w:id="51" w:name="_Toc231084653"/>
+      <w:bookmarkStart w:id="51" w:name="_Toc231090088"/>
       <w:r>
         <w:rPr>
           <w:i w:val="0"/>
@@ -14813,7 +14813,7 @@
           <w:noProof/>
         </w:rPr>
         <w:drawing>
-          <wp:inline distT="0" distB="0" distL="0" distR="0" wp14:anchorId="53BBE93B" wp14:editId="6AEF6EB2">
+          <wp:inline distT="0" distB="0" distL="0" distR="0" wp14:anchorId="236BAAF5" wp14:editId="748A43EE">
             <wp:extent cx="5212080" cy="2531582"/>
             <wp:effectExtent l="0" t="0" r="0" b="0"/>
             <wp:docPr id="3" name="Picture 3"/>
@@ -14855,7 +14855,7 @@
         <w:spacing w:before="160" w:after="200"/>
         <w:jc w:val="center"/>
       </w:pPr>
-      <w:bookmarkStart w:id="52" w:name="_Toc231084654"/>
+      <w:bookmarkStart w:id="52" w:name="_Toc231090089"/>
       <w:r>
         <w:rPr>
           <w:i w:val="0"/>
@@ -14889,7 +14889,7 @@
       <w:pPr>
         <w:pStyle w:val="Ttulo2"/>
       </w:pPr>
-      <w:bookmarkStart w:id="53" w:name="_Toc231084614"/>
+      <w:bookmarkStart w:id="53" w:name="_Toc231090049"/>
       <w:r>
         <w:t>4.5 Estabilidad por fases del ciclo del cobre (OE5)</w:t>
       </w:r>
@@ -14997,7 +14997,7 @@
           <w:noProof/>
         </w:rPr>
         <w:drawing>
-          <wp:inline distT="0" distB="0" distL="0" distR="0" wp14:anchorId="7E76A2F0" wp14:editId="2855D031">
+          <wp:inline distT="0" distB="0" distL="0" distR="0" wp14:anchorId="775CF3E0" wp14:editId="4404C04D">
             <wp:extent cx="5212080" cy="2366710"/>
             <wp:effectExtent l="0" t="0" r="0" b="0"/>
             <wp:docPr id="4" name="Picture 4"/>
@@ -15039,7 +15039,7 @@
         <w:spacing w:before="160" w:after="200"/>
         <w:jc w:val="center"/>
       </w:pPr>
-      <w:bookmarkStart w:id="54" w:name="_Toc231084655"/>
+      <w:bookmarkStart w:id="54" w:name="_Toc231090090"/>
       <w:r>
         <w:rPr>
           <w:i w:val="0"/>
@@ -15073,7 +15073,7 @@
       <w:pPr>
         <w:pStyle w:val="Ttulo2"/>
       </w:pPr>
-      <w:bookmarkStart w:id="55" w:name="_Toc231084615"/>
+      <w:bookmarkStart w:id="55" w:name="_Toc231090050"/>
       <w:r>
         <w:t>4.6 Comparación entre mercados: triangulación (OE6)</w:t>
       </w:r>
@@ -15095,7 +15095,7 @@
         <w:spacing w:before="40" w:after="40"/>
         <w:jc w:val="center"/>
       </w:pPr>
-      <w:bookmarkStart w:id="56" w:name="_Toc231084641"/>
+      <w:bookmarkStart w:id="56" w:name="_Toc231090076"/>
       <w:r>
         <w:rPr>
           <w:i w:val="0"/>
@@ -15720,7 +15720,7 @@
           <w:noProof/>
         </w:rPr>
         <w:drawing>
-          <wp:inline distT="0" distB="0" distL="0" distR="0" wp14:anchorId="7F20BD24" wp14:editId="26050A03">
+          <wp:inline distT="0" distB="0" distL="0" distR="0" wp14:anchorId="0552216B" wp14:editId="3AD8B860">
             <wp:extent cx="5212080" cy="2626097"/>
             <wp:effectExtent l="0" t="0" r="0" b="0"/>
             <wp:docPr id="5" name="Picture 5"/>
@@ -15762,7 +15762,7 @@
         <w:spacing w:before="160" w:after="200"/>
         <w:jc w:val="center"/>
       </w:pPr>
-      <w:bookmarkStart w:id="57" w:name="_Toc231084656"/>
+      <w:bookmarkStart w:id="57" w:name="_Toc231090091"/>
       <w:r>
         <w:rPr>
           <w:i w:val="0"/>
@@ -15819,24 +15819,95 @@
     </w:p>
     <w:p>
       <w:r>
-        <w:t xml:space="preserve">   —el mercado internacional incorporaría el shock de forma más completa—, aunque la diferencia es</w:t>
-      </w:r>
-    </w:p>
-    <w:p>
-      <w:r>
-        <w:t xml:space="preserve">   modesta y requiere confirmación con el conjunto de datos completo y pruebas formales de igualdad</w:t>
-      </w:r>
-    </w:p>
-    <w:p>
-      <w:r>
-        <w:t xml:space="preserve">   de coeficientes entre muestras.</w:t>
+        <w:t xml:space="preserve">   —el mercado internacional incorporaría el shock de forma más completa—.</w:t>
+      </w:r>
+    </w:p>
+    <w:p>
+      <w:r>
+        <w:rPr>
+          <w:b/>
+        </w:rPr>
+        <w:t>Prueba formal de igualdad de coeficientes entre mercados.</w:t>
+      </w:r>
+      <w:r>
+        <w:t xml:space="preserve"> Para contrastar H7 de manera</w:t>
+      </w:r>
+    </w:p>
+    <w:p>
+      <w:r>
+        <w:t>estadística, se estima un panel combinado de las muestras B y C con interacciones factor × mercado</w:t>
+      </w:r>
+    </w:p>
+    <w:p>
+      <w:r>
+        <w:t>(indicador *global* = 1 para las empresas que cotizan en el mercado internacional), bajo efectos</w:t>
+      </w:r>
+    </w:p>
+    <w:p>
+      <w:r>
+        <w:t>fijos por empresa y errores Driscoll-Kraay. El término de interacción **d_cobre × global resulta</w:t>
+      </w:r>
+    </w:p>
+    <w:p>
+      <w:r>
+        <w:t>positivo y significativo (diferencia = +0,254; p = 0,010)**: la sensibilidad de los retornos al</w:t>
+      </w:r>
+    </w:p>
+    <w:p>
+      <w:r>
+        <w:lastRenderedPageBreak/>
+        <w:t xml:space="preserve">precio del cobre es </w:t>
+      </w:r>
+      <w:r>
+        <w:rPr>
+          <w:b/>
+        </w:rPr>
+        <w:t>significativamente mayor en el mercado internacional que en el chileno</w:t>
+      </w:r>
+      <w:r>
+        <w:t>. La</w:t>
+      </w:r>
+    </w:p>
+    <w:p>
+      <w:r>
+        <w:t>sensibilidad al VIX también difiere significativamente entre mercados, mientras que la del tipo de</w:t>
+      </w:r>
+    </w:p>
+    <w:p>
+      <w:r>
+        <w:t>cambio resulta estadísticamente equivalente (p = 0,069). Estos resultados **respaldan formalmente</w:t>
+      </w:r>
+    </w:p>
+    <w:p>
+      <w:r>
+        <w:t>H7**. Una salvedad de interpretación es pertinente: la muestra internacional es de cobre puro,</w:t>
+      </w:r>
+    </w:p>
+    <w:p>
+      <w:r>
+        <w:t>mientras que la chilena es un panel del sector minero mixto, de modo que parte de la diferencia</w:t>
+      </w:r>
+    </w:p>
+    <w:p>
+      <w:r>
+        <w:t>puede reflejar la composición por commodity además del mercado; no obstante, la dirección y la</w:t>
+      </w:r>
+    </w:p>
+    <w:p>
+      <w:r>
+        <w:t>significancia del resultado son coherentes con una transmisión más completa del shock del cobre en</w:t>
+      </w:r>
+    </w:p>
+    <w:p>
+      <w:r>
+        <w:t>el mercado de mayor profundidad.</w:t>
       </w:r>
     </w:p>
     <w:p>
       <w:pPr>
         <w:pStyle w:val="Ttulo2"/>
       </w:pPr>
-      <w:bookmarkStart w:id="58" w:name="_Toc231084616"/>
+      <w:bookmarkStart w:id="58" w:name="_Toc231090051"/>
       <w:r>
         <w:t>4.7 Diagnósticos y robustez</w:t>
       </w:r>
@@ -15869,7 +15940,6 @@
     </w:p>
     <w:p>
       <w:r>
-        <w:lastRenderedPageBreak/>
         <w:t xml:space="preserve">Este resultado </w:t>
       </w:r>
       <w:r>
@@ -15884,7 +15954,10 @@
     </w:p>
     <w:p>
       <w:r>
-        <w:t>cinco productoras comparten un factor común —señaladamente el precio del cobre— que induce</w:t>
+        <w:t xml:space="preserve">cinco productoras comparten un factor común </w:t>
+      </w:r>
+      <w:r>
+        <w:t>—señaladamente el precio del cobre— que induce</w:t>
       </w:r>
     </w:p>
     <w:p>
@@ -15905,6 +15978,7 @@
     </w:p>
     <w:p>
       <w:r>
+        <w:lastRenderedPageBreak/>
         <w:t>unitario), condición necesaria para la validez de las funciones impulso-respuesta y de la</w:t>
       </w:r>
     </w:p>
@@ -16014,7 +16088,6 @@
         <w:rPr>
           <w:b/>
         </w:rPr>
-        <w:lastRenderedPageBreak/>
         <w:t>GJR-GARCH</w:t>
       </w:r>
       <w:r>
@@ -16058,6 +16131,7 @@
     </w:p>
     <w:p>
       <w:r>
+        <w:lastRenderedPageBreak/>
         <w:t>(control de la tasa de falsos descubrimientos, FDR)** sobre los p-valores del panel. Tras la</w:t>
       </w:r>
     </w:p>
@@ -16165,7 +16239,6 @@
     </w:p>
     <w:p>
       <w:r>
-        <w:lastRenderedPageBreak/>
         <w:t xml:space="preserve">decaimiento posterior) </w:t>
       </w:r>
       <w:r>
@@ -16192,8 +16265,9 @@
         <w:rPr>
           <w:noProof/>
         </w:rPr>
+        <w:lastRenderedPageBreak/>
         <w:drawing>
-          <wp:inline distT="0" distB="0" distL="0" distR="0" wp14:anchorId="2A5DD95A" wp14:editId="6D681760">
+          <wp:inline distT="0" distB="0" distL="0" distR="0" wp14:anchorId="2725FEB0" wp14:editId="77A8682C">
             <wp:extent cx="5212080" cy="2531582"/>
             <wp:effectExtent l="0" t="0" r="0" b="0"/>
             <wp:docPr id="6" name="Picture 6"/>
@@ -16235,7 +16309,7 @@
         <w:spacing w:before="160" w:after="200"/>
         <w:jc w:val="center"/>
       </w:pPr>
-      <w:bookmarkStart w:id="59" w:name="_Toc231084657"/>
+      <w:bookmarkStart w:id="59" w:name="_Toc231090092"/>
       <w:r>
         <w:rPr>
           <w:i w:val="0"/>
@@ -16261,10 +16335,7 @@
         <w:fldChar w:fldCharType="end"/>
       </w:r>
       <w:r>
-        <w:t xml:space="preserve">. Respuesta del retorno a un shock del cobre mediante proyecciones </w:t>
-      </w:r>
-      <w:r>
-        <w:t>locales (Jordà, 2005), IC 95%.</w:t>
+        <w:t>. Respuesta del retorno a un shock del cobre mediante proyecciones locales (Jordà, 2005), IC 95%.</w:t>
       </w:r>
       <w:bookmarkEnd w:id="59"/>
     </w:p>
@@ -16272,7 +16343,7 @@
       <w:pPr>
         <w:pStyle w:val="Ttulo2"/>
       </w:pPr>
-      <w:bookmarkStart w:id="60" w:name="_Toc231084617"/>
+      <w:bookmarkStart w:id="60" w:name="_Toc231090052"/>
       <w:r>
         <w:t>4.8 Discusión integrada</w:t>
       </w:r>
@@ -16320,7 +16391,7 @@
     </w:p>
     <w:p>
       <w:r>
-        <w:t>anticipada (H2). La comparación entre mercados aporta una primera señal, aún débil, de</w:t>
+        <w:t>anticipada (H2). La comparación entre mercados, contrastada formalmente mediante interacciones,</w:t>
       </w:r>
     </w:p>
     <w:p>
@@ -16328,10 +16399,15 @@
         <w:rPr>
           <w:b/>
         </w:rPr>
-        <w:t>transmisión diferenciada</w:t>
-      </w:r>
-      <w:r>
-        <w:t xml:space="preserve"> (H7); y la </w:t>
+        <w:t>respalda H7</w:t>
+      </w:r>
+      <w:r>
+        <w:t>: la sensibilidad al cobre es significativamente mayor en el mercado internacional</w:t>
+      </w:r>
+    </w:p>
+    <w:p>
+      <w:r>
+        <w:t xml:space="preserve">que en el chileno (§4.6). La </w:t>
       </w:r>
       <w:r>
         <w:rPr>
@@ -16340,23 +16416,23 @@
         <w:t>relación de cointegración de largo plazo</w:t>
       </w:r>
       <w:r>
-        <w:t xml:space="preserve"> (H5) **se</w:t>
-      </w:r>
-    </w:p>
-    <w:p>
-      <w:r>
-        <w:t>confirma una vez que se admite un quiebre estructural** en 2008 (Gregory-Hansen), lo que reconcilia</w:t>
+        <w:t xml:space="preserve"> (H5) **se confirma una vez</w:t>
+      </w:r>
+    </w:p>
+    <w:p>
+      <w:r>
+        <w:t>que se admite un quiebre estructural** en 2008 (Gregory-Hansen), lo que reconcilia la evidencia</w:t>
       </w:r>
     </w:p>
     <w:p>
       <w:r>
         <w:lastRenderedPageBreak/>
-        <w:t>la evidencia inicialmente mixta. La fuerte dependencia de sección cruzada detectada (§4.7) confirma,</w:t>
-      </w:r>
-    </w:p>
-    <w:p>
-      <w:r>
-        <w:t>además, la pertinencia del tratamiento econométrico adoptado.</w:t>
+        <w:t>inicialmente mixta. La fuerte dependencia de sección cruzada detectada (§4.7) confirma, además, la</w:t>
+      </w:r>
+    </w:p>
+    <w:p>
+      <w:r>
+        <w:t>pertinencia del tratamiento econométrico adoptado.</w:t>
       </w:r>
     </w:p>
     <w:p>
@@ -16375,7 +16451,7 @@
     </w:p>
     <w:p>
       <w:r>
-        <w:t xml:space="preserve">plenamente definitivos exige todavía (i) incorporar el </w:t>
+        <w:t xml:space="preserve">plenamente definitivos exige todavía incorporar el </w:t>
       </w:r>
       <w:r>
         <w:rPr>
@@ -16384,35 +16460,24 @@
         <w:t>EMBI</w:t>
       </w:r>
       <w:r>
-        <w:t xml:space="preserve"> y los **controles a nivel de</w:t>
-      </w:r>
-    </w:p>
-    <w:p>
-      <w:r>
-        <w:t>empresa</w:t>
+        <w:t xml:space="preserve"> y los </w:t>
       </w:r>
       <w:r>
         <w:rPr>
           <w:b/>
         </w:rPr>
-        <w:t xml:space="preserve">, y (ii) formalizar la comparación entre mercados con </w:t>
-      </w:r>
-      <w:r>
-        <w:t>pruebas de igualdad de</w:t>
-      </w:r>
-    </w:p>
-    <w:p>
-      <w:r>
-        <w:t>coeficientes</w:t>
-      </w:r>
-      <w:r>
-        <w:rPr>
-          <w:b/>
-        </w:rPr>
-        <w:t xml:space="preserve"> entre muestras. En cambio, el grueso del aparato econométrico </w:t>
-      </w:r>
-      <w:r>
-        <w:t>ya está ejecutado y</w:t>
+        <w:t>controles a nivel de empresa</w:t>
+      </w:r>
+      <w:r>
+        <w:t>.</w:t>
+      </w:r>
+    </w:p>
+    <w:p>
+      <w:r>
+        <w:t xml:space="preserve">En cambio, el grueso del aparato </w:t>
+      </w:r>
+      <w:r>
+        <w:t>econométrico **ya está ejecutado y</w:t>
       </w:r>
     </w:p>
     <w:p>
@@ -16459,7 +16524,7 @@
       <w:pPr>
         <w:pStyle w:val="Ttulo1"/>
       </w:pPr>
-      <w:bookmarkStart w:id="61" w:name="_Toc231084618"/>
+      <w:bookmarkStart w:id="61" w:name="_Toc231090053"/>
       <w:r>
         <w:lastRenderedPageBreak/>
         <w:t>Capítulo 5 — Conclusiones</w:t>
@@ -16470,7 +16535,7 @@
       <w:pPr>
         <w:pStyle w:val="Ttulo2"/>
       </w:pPr>
-      <w:bookmarkStart w:id="62" w:name="_Toc231084619"/>
+      <w:bookmarkStart w:id="62" w:name="_Toc231090054"/>
       <w:r>
         <w:t>5.1 Síntesis de los hallazgos</w:t>
       </w:r>
@@ -16478,10 +16543,7 @@
     </w:p>
     <w:p>
       <w:r>
-        <w:t xml:space="preserve">Esta investigación cuantificó y comparó el </w:t>
-      </w:r>
-      <w:r>
-        <w:t>impacto de las variables macroeconómicas globales y</w:t>
+        <w:t>Esta investigación cuantificó y comparó el impacto de las variables macroeconómicas globales y</w:t>
       </w:r>
     </w:p>
     <w:p>
@@ -16566,7 +16628,7 @@
       <w:pPr>
         <w:pStyle w:val="Ttulo2"/>
       </w:pPr>
-      <w:bookmarkStart w:id="63" w:name="_Toc231084620"/>
+      <w:bookmarkStart w:id="63" w:name="_Toc231090055"/>
       <w:r>
         <w:lastRenderedPageBreak/>
         <w:t>5.2 Implicancias</w:t>
@@ -16639,7 +16701,7 @@
       <w:pPr>
         <w:pStyle w:val="Ttulo2"/>
       </w:pPr>
-      <w:bookmarkStart w:id="64" w:name="_Toc231084621"/>
+      <w:bookmarkStart w:id="64" w:name="_Toc231090056"/>
       <w:r>
         <w:t>5.3 Limitaciones</w:t>
       </w:r>
@@ -16672,7 +16734,10 @@
         <w:t>preliminares</w:t>
       </w:r>
       <w:r>
-        <w:t>: pendientes la incorporación del EMBI y de los controles a nivel de empresa, la</w:t>
+        <w:t xml:space="preserve">: pendientes la </w:t>
+      </w:r>
+      <w:r>
+        <w:t>incorporación del EMBI y de los controles a nivel de empresa, la</w:t>
       </w:r>
     </w:p>
     <w:p>
@@ -16689,7 +16754,7 @@
       <w:pPr>
         <w:pStyle w:val="Ttulo2"/>
       </w:pPr>
-      <w:bookmarkStart w:id="65" w:name="_Toc231084622"/>
+      <w:bookmarkStart w:id="65" w:name="_Toc231090057"/>
       <w:r>
         <w:t>5.4 Líneas futuras de investigación</w:t>
       </w:r>
@@ -16707,7 +16772,10 @@
     </w:p>
     <w:p>
       <w:r>
-        <w:t>central; (iii) el análisis a frecuencia diaria/semanal para la dinámica de corto plazo; y (iv) la</w:t>
+        <w:t xml:space="preserve">central; (iii) el análisis a frecuencia diaria/semanal para la dinámica de </w:t>
+      </w:r>
+      <w:r>
+        <w:t>corto plazo; y (iv) la</w:t>
       </w:r>
     </w:p>
     <w:p>
@@ -16725,7 +16793,7 @@
       <w:pPr>
         <w:pStyle w:val="Ttulo1"/>
       </w:pPr>
-      <w:bookmarkStart w:id="66" w:name="_Toc231084623"/>
+      <w:bookmarkStart w:id="66" w:name="_Toc231090058"/>
       <w:r>
         <w:lastRenderedPageBreak/>
         <w:t>Referencias</w:t>
@@ -16739,10 +16807,7 @@
     </w:p>
     <w:p>
       <w:r>
-        <w:t xml:space="preserve">Bai, J., &amp; </w:t>
-      </w:r>
-      <w:r>
-        <w:t>Perron, P. (2003). Computation and analysis of multiple structural change models. *Journal of Applied Econometrics*, 18(1), 1–22.</w:t>
+        <w:t>Bai, J., &amp; Perron, P. (2003). Computation and analysis of multiple structural change models. *Journal of Applied Econometrics*, 18(1), 1–22.</w:t>
       </w:r>
     </w:p>
     <w:p>
@@ -16777,10 +16842,7 @@
     </w:p>
     <w:p>
       <w:r>
-        <w:t xml:space="preserve">Cashin, P., Céspedes, L. F., &amp; Sahay, R. (2004). Commodity </w:t>
-      </w:r>
-      <w:r>
-        <w:t>currencies and the real exchange rate. *Journal of Development Economics*, 75(1), 239–268.</w:t>
+        <w:t>Cashin, P., Céspedes, L. F., &amp; Sahay, R. (2004). Commodity currencies and the real exchange rate. *Journal of Development Economics*, 75(1), 239–268.</w:t>
       </w:r>
     </w:p>
     <w:p>
@@ -16831,7 +16893,10 @@
     </w:p>
     <w:p>
       <w:r>
-        <w:t>Fama, E. F. (1981). Stock returns, real activity, inflation, and money. *The American Economic Review*, 71(4), 545–565.</w:t>
+        <w:t xml:space="preserve">Fama, E. F. (1981). Stock returns, real activity, inflation, and money. *The American Economic Review*, 71(4), </w:t>
+      </w:r>
+      <w:r>
+        <w:t>545–565.</w:t>
       </w:r>
     </w:p>
     <w:p>
@@ -16877,10 +16942,7 @@
     </w:p>
     <w:p>
       <w:r>
-        <w:t xml:space="preserve">Kwiatkowski, D., Phillips, P. C. B., Schmidt, P., &amp; Shin, Y. (1992). Testing the null hypothesis of stationarity against the </w:t>
-      </w:r>
-      <w:r>
-        <w:t>alternative of a unit root. *Journal of Econometrics*, 54(1–3), 159–178.</w:t>
+        <w:t>Kwiatkowski, D., Phillips, P. C. B., Schmidt, P., &amp; Shin, Y. (1992). Testing the null hypothesis of stationarity against the alternative of a unit root. *Journal of Econometrics*, 54(1–3), 159–178.</w:t>
       </w:r>
     </w:p>
     <w:p>
@@ -16968,7 +17030,7 @@
       <w:pPr>
         <w:pStyle w:val="Ttulo1"/>
       </w:pPr>
-      <w:bookmarkStart w:id="67" w:name="_Toc231084624"/>
+      <w:bookmarkStart w:id="67" w:name="_Toc231090059"/>
       <w:r>
         <w:lastRenderedPageBreak/>
         <w:t>Anexos</w:t>
@@ -16979,7 +17041,7 @@
       <w:pPr>
         <w:pStyle w:val="Ttulo2"/>
       </w:pPr>
-      <w:bookmarkStart w:id="68" w:name="_Toc231084625"/>
+      <w:bookmarkStart w:id="68" w:name="_Toc231090060"/>
       <w:r>
         <w:t>Anexo A. Estadística descriptiva</w:t>
       </w:r>
@@ -16991,7 +17053,7 @@
         <w:spacing w:before="40" w:after="40"/>
         <w:jc w:val="center"/>
       </w:pPr>
-      <w:bookmarkStart w:id="69" w:name="_Toc231084642"/>
+      <w:bookmarkStart w:id="69" w:name="_Toc231090077"/>
       <w:r>
         <w:rPr>
           <w:i w:val="0"/>
@@ -19187,7 +19249,7 @@
       <w:pPr>
         <w:pStyle w:val="Ttulo2"/>
       </w:pPr>
-      <w:bookmarkStart w:id="70" w:name="_Toc231084626"/>
+      <w:bookmarkStart w:id="70" w:name="_Toc231090061"/>
       <w:r>
         <w:t>Anexo B. Matriz de correlación de los factores</w:t>
       </w:r>
@@ -19199,7 +19261,7 @@
         <w:spacing w:before="40" w:after="40"/>
         <w:jc w:val="center"/>
       </w:pPr>
-      <w:bookmarkStart w:id="71" w:name="_Toc231084643"/>
+      <w:bookmarkStart w:id="71" w:name="_Toc231090078"/>
       <w:r>
         <w:rPr>
           <w:i w:val="0"/>
@@ -21233,7 +21295,7 @@
       <w:pPr>
         <w:pStyle w:val="Ttulo2"/>
       </w:pPr>
-      <w:bookmarkStart w:id="72" w:name="_Toc231084627"/>
+      <w:bookmarkStart w:id="72" w:name="_Toc231090062"/>
       <w:r>
         <w:t>Anexo C. Pruebas de raíz unitaria y orden de integración</w:t>
       </w:r>
@@ -21245,7 +21307,7 @@
         <w:spacing w:before="40" w:after="40"/>
         <w:jc w:val="center"/>
       </w:pPr>
-      <w:bookmarkStart w:id="73" w:name="_Toc231084644"/>
+      <w:bookmarkStart w:id="73" w:name="_Toc231090079"/>
       <w:r>
         <w:rPr>
           <w:i w:val="0"/>
@@ -22073,7 +22135,7 @@
       <w:pPr>
         <w:pStyle w:val="Ttulo2"/>
       </w:pPr>
-      <w:bookmarkStart w:id="74" w:name="_Toc231084628"/>
+      <w:bookmarkStart w:id="74" w:name="_Toc231090063"/>
       <w:r>
         <w:t>Anexo D. Resultados completos del modelo de panel</w:t>
       </w:r>
@@ -22083,7 +22145,7 @@
       <w:pPr>
         <w:pStyle w:val="Ttulo3"/>
       </w:pPr>
-      <w:bookmarkStart w:id="75" w:name="_Toc231084629"/>
+      <w:bookmarkStart w:id="75" w:name="_Toc231090064"/>
       <w:r>
         <w:t>D.1 Muestra B — cobre, mercado internacional</w:t>
       </w:r>
@@ -22095,7 +22157,7 @@
         <w:spacing w:before="40" w:after="40"/>
         <w:jc w:val="center"/>
       </w:pPr>
-      <w:bookmarkStart w:id="76" w:name="_Toc231084645"/>
+      <w:bookmarkStart w:id="76" w:name="_Toc231090080"/>
       <w:r>
         <w:rPr>
           <w:i w:val="0"/>
@@ -23276,7 +23338,7 @@
       <w:pPr>
         <w:pStyle w:val="Ttulo3"/>
       </w:pPr>
-      <w:bookmarkStart w:id="77" w:name="_Toc231084630"/>
+      <w:bookmarkStart w:id="77" w:name="_Toc231090065"/>
       <w:r>
         <w:t>D.2 Muestra A — cobre, mercado chileno (Pucobre)</w:t>
       </w:r>
@@ -23288,7 +23350,7 @@
         <w:spacing w:before="40" w:after="40"/>
         <w:jc w:val="center"/>
       </w:pPr>
-      <w:bookmarkStart w:id="78" w:name="_Toc231084646"/>
+      <w:bookmarkStart w:id="78" w:name="_Toc231090081"/>
       <w:r>
         <w:rPr>
           <w:i w:val="0"/>
@@ -24463,7 +24525,7 @@
       <w:pPr>
         <w:pStyle w:val="Ttulo3"/>
       </w:pPr>
-      <w:bookmarkStart w:id="79" w:name="_Toc231084631"/>
+      <w:bookmarkStart w:id="79" w:name="_Toc231090066"/>
       <w:r>
         <w:t xml:space="preserve">D.3 </w:t>
       </w:r>
@@ -24478,7 +24540,7 @@
         <w:spacing w:before="40" w:after="40"/>
         <w:jc w:val="center"/>
       </w:pPr>
-      <w:bookmarkStart w:id="80" w:name="_Toc231084647"/>
+      <w:bookmarkStart w:id="80" w:name="_Toc231090082"/>
       <w:r>
         <w:rPr>
           <w:i w:val="0"/>
@@ -25653,7 +25715,7 @@
       <w:pPr>
         <w:pStyle w:val="Ttulo2"/>
       </w:pPr>
-      <w:bookmarkStart w:id="81" w:name="_Toc231084632"/>
+      <w:bookmarkStart w:id="81" w:name="_Toc231090067"/>
       <w:r>
         <w:lastRenderedPageBreak/>
         <w:t xml:space="preserve">Anexo E. </w:t>
@@ -25669,7 +25731,7 @@
         <w:spacing w:before="40" w:after="40"/>
         <w:jc w:val="center"/>
       </w:pPr>
-      <w:bookmarkStart w:id="82" w:name="_Toc231084648"/>
+      <w:bookmarkStart w:id="82" w:name="_Toc231090083"/>
       <w:r>
         <w:rPr>
           <w:i w:val="0"/>
@@ -26340,7 +26402,7 @@
       <w:pPr>
         <w:pStyle w:val="Ttulo2"/>
       </w:pPr>
-      <w:bookmarkStart w:id="83" w:name="_Toc231084633"/>
+      <w:bookmarkStart w:id="83" w:name="_Toc231090068"/>
       <w:r>
         <w:t xml:space="preserve">Anexo F. </w:t>
       </w:r>
@@ -26355,7 +26417,7 @@
         <w:spacing w:before="40" w:after="40"/>
         <w:jc w:val="center"/>
       </w:pPr>
-      <w:bookmarkStart w:id="84" w:name="_Toc231084649"/>
+      <w:bookmarkStart w:id="84" w:name="_Toc231090084"/>
       <w:r>
         <w:rPr>
           <w:i w:val="0"/>
@@ -27169,7 +27231,7 @@
       <w:pPr>
         <w:pStyle w:val="Ttulo2"/>
       </w:pPr>
-      <w:bookmarkStart w:id="85" w:name="_Toc231084634"/>
+      <w:bookmarkStart w:id="85" w:name="_Toc231090069"/>
       <w:r>
         <w:t>Anexo G. Fuentes de datos</w:t>
       </w:r>
@@ -27181,7 +27243,7 @@
         <w:spacing w:before="40" w:after="40"/>
         <w:jc w:val="center"/>
       </w:pPr>
-      <w:bookmarkStart w:id="86" w:name="_Toc231084650"/>
+      <w:bookmarkStart w:id="86" w:name="_Toc231090085"/>
       <w:r>
         <w:rPr>
           <w:i w:val="0"/>
@@ -28330,7 +28392,7 @@
       <w:pPr>
         <w:pStyle w:val="Ttulo2"/>
       </w:pPr>
-      <w:bookmarkStart w:id="87" w:name="_Toc231084635"/>
+      <w:bookmarkStart w:id="87" w:name="_Toc231090070"/>
       <w:r>
         <w:t>Anexo H. Disponibilidad del código</w:t>
       </w:r>
@@ -28348,7 +28410,7 @@
       <w:pPr>
         <w:pStyle w:val="Ttulo2"/>
       </w:pPr>
-      <w:bookmarkStart w:id="88" w:name="_Toc231084636"/>
+      <w:bookmarkStart w:id="88" w:name="_Toc231090071"/>
       <w:r>
         <w:t>Anexo I. Extensión predictiva: ¿explican o anticipan?</w:t>
       </w:r>
@@ -28374,7 +28436,7 @@
         <w:spacing w:before="40" w:after="40"/>
         <w:jc w:val="center"/>
       </w:pPr>
-      <w:bookmarkStart w:id="89" w:name="_Toc231084651"/>
+      <w:bookmarkStart w:id="89" w:name="_Toc231090086"/>
       <w:r>
         <w:rPr>
           <w:i w:val="0"/>
@@ -29230,7 +29292,7 @@
       <w:pPr>
         <w:pStyle w:val="Ttulo1"/>
       </w:pPr>
-      <w:bookmarkStart w:id="90" w:name="_Toc231084637"/>
+      <w:bookmarkStart w:id="90" w:name="_Toc231090072"/>
       <w:r>
         <w:lastRenderedPageBreak/>
         <w:t>Glosario de términos econométricos</w:t>
@@ -29864,31 +29926,31 @@
       </w:rPr>
     </w:lvl>
   </w:abstractNum>
-  <w:num w:numId="1" w16cid:durableId="506405399">
+  <w:num w:numId="1" w16cid:durableId="333529743">
     <w:abstractNumId w:val="8"/>
   </w:num>
-  <w:num w:numId="2" w16cid:durableId="473792319">
+  <w:num w:numId="2" w16cid:durableId="424152093">
     <w:abstractNumId w:val="6"/>
   </w:num>
-  <w:num w:numId="3" w16cid:durableId="1696923657">
+  <w:num w:numId="3" w16cid:durableId="430009367">
     <w:abstractNumId w:val="5"/>
   </w:num>
-  <w:num w:numId="4" w16cid:durableId="1526215791">
+  <w:num w:numId="4" w16cid:durableId="104465079">
     <w:abstractNumId w:val="4"/>
   </w:num>
-  <w:num w:numId="5" w16cid:durableId="1634748387">
+  <w:num w:numId="5" w16cid:durableId="1985238243">
     <w:abstractNumId w:val="7"/>
   </w:num>
-  <w:num w:numId="6" w16cid:durableId="623459870">
+  <w:num w:numId="6" w16cid:durableId="1589271958">
     <w:abstractNumId w:val="3"/>
   </w:num>
-  <w:num w:numId="7" w16cid:durableId="9383533">
+  <w:num w:numId="7" w16cid:durableId="698900046">
     <w:abstractNumId w:val="2"/>
   </w:num>
-  <w:num w:numId="8" w16cid:durableId="1998335935">
+  <w:num w:numId="8" w16cid:durableId="1260530904">
     <w:abstractNumId w:val="1"/>
   </w:num>
-  <w:num w:numId="9" w16cid:durableId="1259750506">
+  <w:num w:numId="9" w16cid:durableId="25259155">
     <w:abstractNumId w:val="0"/>
   </w:num>
 </w:numbering>
@@ -41290,7 +41352,7 @@
     <w:autoRedefine/>
     <w:uiPriority w:val="39"/>
     <w:unhideWhenUsed/>
-    <w:rsid w:val="009B0CDE"/>
+    <w:rsid w:val="00A9290A"/>
     <w:pPr>
       <w:spacing w:after="100"/>
     </w:pPr>
@@ -41302,7 +41364,7 @@
     <w:autoRedefine/>
     <w:uiPriority w:val="39"/>
     <w:unhideWhenUsed/>
-    <w:rsid w:val="009B0CDE"/>
+    <w:rsid w:val="00A9290A"/>
     <w:pPr>
       <w:spacing w:after="100"/>
       <w:ind w:left="240"/>
@@ -41315,7 +41377,7 @@
     <w:autoRedefine/>
     <w:uiPriority w:val="39"/>
     <w:unhideWhenUsed/>
-    <w:rsid w:val="009B0CDE"/>
+    <w:rsid w:val="00A9290A"/>
     <w:pPr>
       <w:spacing w:after="100"/>
       <w:ind w:left="480"/>
@@ -41326,7 +41388,7 @@
     <w:basedOn w:val="Fuentedeprrafopredeter"/>
     <w:uiPriority w:val="99"/>
     <w:unhideWhenUsed/>
-    <w:rsid w:val="009B0CDE"/>
+    <w:rsid w:val="00A9290A"/>
     <w:rPr>
       <w:color w:val="0000FF" w:themeColor="hyperlink"/>
       <w:u w:val="single"/>
@@ -41338,7 +41400,7 @@
     <w:next w:val="Normal"/>
     <w:uiPriority w:val="99"/>
     <w:unhideWhenUsed/>
-    <w:rsid w:val="009B0CDE"/>
+    <w:rsid w:val="00A9290A"/>
     <w:pPr>
       <w:spacing w:after="0"/>
     </w:pPr>

</xml_diff>

<commit_message>
Cap.5 profundizado: conclusiones alineadas con la evidencia confirmada
H7 formal, cointegración con quiebre 2008, asimetría de volatilidad, eficiencia (explicar vs
predecir); limitaciones corregidas (quita ítems ya resueltos); líneas futuras actualizadas.

Co-Authored-By: Claude Opus 4.8 <noreply@anthropic.com>
</commit_message>
<xml_diff>
--- a/outputs/Tesis_Francisco_Rietta.docx
+++ b/outputs/Tesis_Francisco_Rietta.docx
@@ -166,7 +166,7 @@
       <w:pPr>
         <w:pStyle w:val="Ttulo1"/>
       </w:pPr>
-      <w:bookmarkStart w:id="0" w:name="_Toc231090002"/>
+      <w:bookmarkStart w:id="0" w:name="_Toc231093536"/>
       <w:r>
         <w:lastRenderedPageBreak/>
         <w:t>Página de aprobación</w:t>
@@ -262,7 +262,7 @@
       <w:pPr>
         <w:pStyle w:val="Ttulo1"/>
       </w:pPr>
-      <w:bookmarkStart w:id="1" w:name="_Toc231090003"/>
+      <w:bookmarkStart w:id="1" w:name="_Toc231093537"/>
       <w:r>
         <w:lastRenderedPageBreak/>
         <w:t>Declaración de originalidad</w:t>
@@ -303,7 +303,7 @@
       <w:pPr>
         <w:pStyle w:val="Ttulo1"/>
       </w:pPr>
-      <w:bookmarkStart w:id="2" w:name="_Toc231090004"/>
+      <w:bookmarkStart w:id="2" w:name="_Toc231093538"/>
       <w:r>
         <w:lastRenderedPageBreak/>
         <w:t>Dedicatoria</w:t>
@@ -333,7 +333,7 @@
       <w:pPr>
         <w:pStyle w:val="Ttulo1"/>
       </w:pPr>
-      <w:bookmarkStart w:id="3" w:name="_Toc231090005"/>
+      <w:bookmarkStart w:id="3" w:name="_Toc231093539"/>
       <w:r>
         <w:lastRenderedPageBreak/>
         <w:t>Agradecimientos</w:t>
@@ -359,7 +359,7 @@
       <w:pPr>
         <w:pStyle w:val="Ttulo1"/>
       </w:pPr>
-      <w:bookmarkStart w:id="4" w:name="_Toc231090006"/>
+      <w:bookmarkStart w:id="4" w:name="_Toc231093540"/>
       <w:r>
         <w:lastRenderedPageBreak/>
         <w:t>Resumen</w:t>
@@ -397,7 +397,7 @@
       <w:pPr>
         <w:pStyle w:val="Ttulo1"/>
       </w:pPr>
-      <w:bookmarkStart w:id="5" w:name="_Toc231090007"/>
+      <w:bookmarkStart w:id="5" w:name="_Toc231093541"/>
       <w:r>
         <w:lastRenderedPageBreak/>
         <w:t>Abstract</w:t>
@@ -432,7 +432,7 @@
       <w:pPr>
         <w:pStyle w:val="Ttulo1"/>
       </w:pPr>
-      <w:bookmarkStart w:id="6" w:name="_Toc231090008"/>
+      <w:bookmarkStart w:id="6" w:name="_Toc231093542"/>
       <w:r>
         <w:lastRenderedPageBreak/>
         <w:t>Índice general</w:t>
@@ -464,7 +464,7 @@
       <w:r>
         <w:fldChar w:fldCharType="separate"/>
       </w:r>
-      <w:hyperlink w:anchor="_Toc231090002" w:history="1">
+      <w:hyperlink w:anchor="_Toc231093536" w:history="1">
         <w:r>
           <w:rPr>
             <w:rStyle w:val="Hipervnculo"/>
@@ -491,7 +491,7 @@
             <w:noProof/>
             <w:webHidden/>
           </w:rPr>
-          <w:instrText xml:space="preserve"> PAGEREF _Toc231090002 \h </w:instrText>
+          <w:instrText xml:space="preserve"> PAGEREF _Toc231093536 \h </w:instrText>
         </w:r>
         <w:r>
           <w:rPr>
@@ -538,7 +538,7 @@
           <w14:ligatures w14:val="standardContextual"/>
         </w:rPr>
       </w:pPr>
-      <w:hyperlink w:anchor="_Toc231090003" w:history="1">
+      <w:hyperlink w:anchor="_Toc231093537" w:history="1">
         <w:r>
           <w:rPr>
             <w:rStyle w:val="Hipervnculo"/>
@@ -565,7 +565,7 @@
             <w:noProof/>
             <w:webHidden/>
           </w:rPr>
-          <w:instrText xml:space="preserve"> PAGEREF _Toc231090003 \h </w:instrText>
+          <w:instrText xml:space="preserve"> PAGEREF _Toc231093537 \h </w:instrText>
         </w:r>
         <w:r>
           <w:rPr>
@@ -612,7 +612,7 @@
           <w14:ligatures w14:val="standardContextual"/>
         </w:rPr>
       </w:pPr>
-      <w:hyperlink w:anchor="_Toc231090004" w:history="1">
+      <w:hyperlink w:anchor="_Toc231093538" w:history="1">
         <w:r>
           <w:rPr>
             <w:rStyle w:val="Hipervnculo"/>
@@ -639,7 +639,7 @@
             <w:noProof/>
             <w:webHidden/>
           </w:rPr>
-          <w:instrText xml:space="preserve"> PAGEREF _Toc231090004 \h </w:instrText>
+          <w:instrText xml:space="preserve"> PAGEREF _Toc231093538 \h </w:instrText>
         </w:r>
         <w:r>
           <w:rPr>
@@ -686,7 +686,7 @@
           <w14:ligatures w14:val="standardContextual"/>
         </w:rPr>
       </w:pPr>
-      <w:hyperlink w:anchor="_Toc231090005" w:history="1">
+      <w:hyperlink w:anchor="_Toc231093539" w:history="1">
         <w:r>
           <w:rPr>
             <w:rStyle w:val="Hipervnculo"/>
@@ -713,7 +713,7 @@
             <w:noProof/>
             <w:webHidden/>
           </w:rPr>
-          <w:instrText xml:space="preserve"> PAGEREF _Toc231090005 \h </w:instrText>
+          <w:instrText xml:space="preserve"> PAGEREF _Toc231093539 \h </w:instrText>
         </w:r>
         <w:r>
           <w:rPr>
@@ -760,7 +760,7 @@
           <w14:ligatures w14:val="standardContextual"/>
         </w:rPr>
       </w:pPr>
-      <w:hyperlink w:anchor="_Toc231090006" w:history="1">
+      <w:hyperlink w:anchor="_Toc231093540" w:history="1">
         <w:r>
           <w:rPr>
             <w:rStyle w:val="Hipervnculo"/>
@@ -787,7 +787,7 @@
             <w:noProof/>
             <w:webHidden/>
           </w:rPr>
-          <w:instrText xml:space="preserve"> PAGEREF _Toc231090006 \h </w:instrText>
+          <w:instrText xml:space="preserve"> PAGEREF _Toc231093540 \h </w:instrText>
         </w:r>
         <w:r>
           <w:rPr>
@@ -834,7 +834,7 @@
           <w14:ligatures w14:val="standardContextual"/>
         </w:rPr>
       </w:pPr>
-      <w:hyperlink w:anchor="_Toc231090007" w:history="1">
+      <w:hyperlink w:anchor="_Toc231093541" w:history="1">
         <w:r>
           <w:rPr>
             <w:rStyle w:val="Hipervnculo"/>
@@ -861,7 +861,7 @@
             <w:noProof/>
             <w:webHidden/>
           </w:rPr>
-          <w:instrText xml:space="preserve"> PAGEREF _Toc231090007 \h </w:instrText>
+          <w:instrText xml:space="preserve"> PAGEREF _Toc231093541 \h </w:instrText>
         </w:r>
         <w:r>
           <w:rPr>
@@ -908,7 +908,7 @@
           <w14:ligatures w14:val="standardContextual"/>
         </w:rPr>
       </w:pPr>
-      <w:hyperlink w:anchor="_Toc231090008" w:history="1">
+      <w:hyperlink w:anchor="_Toc231093542" w:history="1">
         <w:r>
           <w:rPr>
             <w:rStyle w:val="Hipervnculo"/>
@@ -935,7 +935,7 @@
             <w:noProof/>
             <w:webHidden/>
           </w:rPr>
-          <w:instrText xml:space="preserve"> PAGEREF _Toc231090008 \h </w:instrText>
+          <w:instrText xml:space="preserve"> PAGEREF _Toc231093542 \h </w:instrText>
         </w:r>
         <w:r>
           <w:rPr>
@@ -982,7 +982,7 @@
           <w14:ligatures w14:val="standardContextual"/>
         </w:rPr>
       </w:pPr>
-      <w:hyperlink w:anchor="_Toc231090009" w:history="1">
+      <w:hyperlink w:anchor="_Toc231093543" w:history="1">
         <w:r>
           <w:rPr>
             <w:rStyle w:val="Hipervnculo"/>
@@ -1009,7 +1009,7 @@
             <w:noProof/>
             <w:webHidden/>
           </w:rPr>
-          <w:instrText xml:space="preserve"> PAGEREF _Toc231090009 \h </w:instrText>
+          <w:instrText xml:space="preserve"> PAGEREF _Toc231093543 \h </w:instrText>
         </w:r>
         <w:r>
           <w:rPr>
@@ -1056,7 +1056,7 @@
           <w14:ligatures w14:val="standardContextual"/>
         </w:rPr>
       </w:pPr>
-      <w:hyperlink w:anchor="_Toc231090010" w:history="1">
+      <w:hyperlink w:anchor="_Toc231093544" w:history="1">
         <w:r>
           <w:rPr>
             <w:rStyle w:val="Hipervnculo"/>
@@ -1083,7 +1083,7 @@
             <w:noProof/>
             <w:webHidden/>
           </w:rPr>
-          <w:instrText xml:space="preserve"> PAGEREF _Toc231090010 \h </w:instrText>
+          <w:instrText xml:space="preserve"> PAGEREF _Toc231093544 \h </w:instrText>
         </w:r>
         <w:r>
           <w:rPr>
@@ -1130,7 +1130,7 @@
           <w14:ligatures w14:val="standardContextual"/>
         </w:rPr>
       </w:pPr>
-      <w:hyperlink w:anchor="_Toc231090011" w:history="1">
+      <w:hyperlink w:anchor="_Toc231093545" w:history="1">
         <w:r>
           <w:rPr>
             <w:rStyle w:val="Hipervnculo"/>
@@ -1157,7 +1157,7 @@
             <w:noProof/>
             <w:webHidden/>
           </w:rPr>
-          <w:instrText xml:space="preserve"> PAGEREF _Toc231090011 \h </w:instrText>
+          <w:instrText xml:space="preserve"> PAGEREF _Toc231093545 \h </w:instrText>
         </w:r>
         <w:r>
           <w:rPr>
@@ -1204,7 +1204,7 @@
           <w14:ligatures w14:val="standardContextual"/>
         </w:rPr>
       </w:pPr>
-      <w:hyperlink w:anchor="_Toc231090012" w:history="1">
+      <w:hyperlink w:anchor="_Toc231093546" w:history="1">
         <w:r>
           <w:rPr>
             <w:rStyle w:val="Hipervnculo"/>
@@ -1231,7 +1231,7 @@
             <w:noProof/>
             <w:webHidden/>
           </w:rPr>
-          <w:instrText xml:space="preserve"> PAGEREF _Toc231090012 \h </w:instrText>
+          <w:instrText xml:space="preserve"> PAGEREF _Toc231093546 \h </w:instrText>
         </w:r>
         <w:r>
           <w:rPr>
@@ -1278,7 +1278,7 @@
           <w14:ligatures w14:val="standardContextual"/>
         </w:rPr>
       </w:pPr>
-      <w:hyperlink w:anchor="_Toc231090013" w:history="1">
+      <w:hyperlink w:anchor="_Toc231093547" w:history="1">
         <w:r>
           <w:rPr>
             <w:rStyle w:val="Hipervnculo"/>
@@ -1305,7 +1305,7 @@
             <w:noProof/>
             <w:webHidden/>
           </w:rPr>
-          <w:instrText xml:space="preserve"> PAGEREF _Toc231090013 \h </w:instrText>
+          <w:instrText xml:space="preserve"> PAGEREF _Toc231093547 \h </w:instrText>
         </w:r>
         <w:r>
           <w:rPr>
@@ -1352,7 +1352,7 @@
           <w14:ligatures w14:val="standardContextual"/>
         </w:rPr>
       </w:pPr>
-      <w:hyperlink w:anchor="_Toc231090014" w:history="1">
+      <w:hyperlink w:anchor="_Toc231093548" w:history="1">
         <w:r>
           <w:rPr>
             <w:rStyle w:val="Hipervnculo"/>
@@ -1379,7 +1379,7 @@
             <w:noProof/>
             <w:webHidden/>
           </w:rPr>
-          <w:instrText xml:space="preserve"> PAGEREF _Toc231090014 \h </w:instrText>
+          <w:instrText xml:space="preserve"> PAGEREF _Toc231093548 \h </w:instrText>
         </w:r>
         <w:r>
           <w:rPr>
@@ -1426,7 +1426,7 @@
           <w14:ligatures w14:val="standardContextual"/>
         </w:rPr>
       </w:pPr>
-      <w:hyperlink w:anchor="_Toc231090015" w:history="1">
+      <w:hyperlink w:anchor="_Toc231093549" w:history="1">
         <w:r>
           <w:rPr>
             <w:rStyle w:val="Hipervnculo"/>
@@ -1453,7 +1453,7 @@
             <w:noProof/>
             <w:webHidden/>
           </w:rPr>
-          <w:instrText xml:space="preserve"> PAGEREF _Toc231090015 \h </w:instrText>
+          <w:instrText xml:space="preserve"> PAGEREF _Toc231093549 \h </w:instrText>
         </w:r>
         <w:r>
           <w:rPr>
@@ -1500,7 +1500,7 @@
           <w14:ligatures w14:val="standardContextual"/>
         </w:rPr>
       </w:pPr>
-      <w:hyperlink w:anchor="_Toc231090016" w:history="1">
+      <w:hyperlink w:anchor="_Toc231093550" w:history="1">
         <w:r>
           <w:rPr>
             <w:rStyle w:val="Hipervnculo"/>
@@ -1527,7 +1527,7 @@
             <w:noProof/>
             <w:webHidden/>
           </w:rPr>
-          <w:instrText xml:space="preserve"> PAGEREF _Toc231090016 \h </w:instrText>
+          <w:instrText xml:space="preserve"> PAGEREF _Toc231093550 \h </w:instrText>
         </w:r>
         <w:r>
           <w:rPr>
@@ -1574,7 +1574,7 @@
           <w14:ligatures w14:val="standardContextual"/>
         </w:rPr>
       </w:pPr>
-      <w:hyperlink w:anchor="_Toc231090017" w:history="1">
+      <w:hyperlink w:anchor="_Toc231093551" w:history="1">
         <w:r>
           <w:rPr>
             <w:rStyle w:val="Hipervnculo"/>
@@ -1601,7 +1601,7 @@
             <w:noProof/>
             <w:webHidden/>
           </w:rPr>
-          <w:instrText xml:space="preserve"> PAGEREF _Toc231090017 \h </w:instrText>
+          <w:instrText xml:space="preserve"> PAGEREF _Toc231093551 \h </w:instrText>
         </w:r>
         <w:r>
           <w:rPr>
@@ -1648,7 +1648,7 @@
           <w14:ligatures w14:val="standardContextual"/>
         </w:rPr>
       </w:pPr>
-      <w:hyperlink w:anchor="_Toc231090018" w:history="1">
+      <w:hyperlink w:anchor="_Toc231093552" w:history="1">
         <w:r>
           <w:rPr>
             <w:rStyle w:val="Hipervnculo"/>
@@ -1675,7 +1675,7 @@
             <w:noProof/>
             <w:webHidden/>
           </w:rPr>
-          <w:instrText xml:space="preserve"> PAGEREF _Toc231090018 \h </w:instrText>
+          <w:instrText xml:space="preserve"> PAGEREF _Toc231093552 \h </w:instrText>
         </w:r>
         <w:r>
           <w:rPr>
@@ -1722,7 +1722,7 @@
           <w14:ligatures w14:val="standardContextual"/>
         </w:rPr>
       </w:pPr>
-      <w:hyperlink w:anchor="_Toc231090019" w:history="1">
+      <w:hyperlink w:anchor="_Toc231093553" w:history="1">
         <w:r>
           <w:rPr>
             <w:rStyle w:val="Hipervnculo"/>
@@ -1749,7 +1749,7 @@
             <w:noProof/>
             <w:webHidden/>
           </w:rPr>
-          <w:instrText xml:space="preserve"> PAGEREF _Toc231090019 \h </w:instrText>
+          <w:instrText xml:space="preserve"> PAGEREF _Toc231093553 \h </w:instrText>
         </w:r>
         <w:r>
           <w:rPr>
@@ -1796,7 +1796,7 @@
           <w14:ligatures w14:val="standardContextual"/>
         </w:rPr>
       </w:pPr>
-      <w:hyperlink w:anchor="_Toc231090020" w:history="1">
+      <w:hyperlink w:anchor="_Toc231093554" w:history="1">
         <w:r>
           <w:rPr>
             <w:rStyle w:val="Hipervnculo"/>
@@ -1823,7 +1823,7 @@
             <w:noProof/>
             <w:webHidden/>
           </w:rPr>
-          <w:instrText xml:space="preserve"> PAGEREF _Toc231090020 \h </w:instrText>
+          <w:instrText xml:space="preserve"> PAGEREF _Toc231093554 \h </w:instrText>
         </w:r>
         <w:r>
           <w:rPr>
@@ -1870,7 +1870,7 @@
           <w14:ligatures w14:val="standardContextual"/>
         </w:rPr>
       </w:pPr>
-      <w:hyperlink w:anchor="_Toc231090021" w:history="1">
+      <w:hyperlink w:anchor="_Toc231093555" w:history="1">
         <w:r>
           <w:rPr>
             <w:rStyle w:val="Hipervnculo"/>
@@ -1897,7 +1897,7 @@
             <w:noProof/>
             <w:webHidden/>
           </w:rPr>
-          <w:instrText xml:space="preserve"> PAGEREF _Toc231090021 \h </w:instrText>
+          <w:instrText xml:space="preserve"> PAGEREF _Toc231093555 \h </w:instrText>
         </w:r>
         <w:r>
           <w:rPr>
@@ -1944,7 +1944,7 @@
           <w14:ligatures w14:val="standardContextual"/>
         </w:rPr>
       </w:pPr>
-      <w:hyperlink w:anchor="_Toc231090022" w:history="1">
+      <w:hyperlink w:anchor="_Toc231093556" w:history="1">
         <w:r>
           <w:rPr>
             <w:rStyle w:val="Hipervnculo"/>
@@ -1971,7 +1971,7 @@
             <w:noProof/>
             <w:webHidden/>
           </w:rPr>
-          <w:instrText xml:space="preserve"> PAGEREF _Toc231090022 \h </w:instrText>
+          <w:instrText xml:space="preserve"> PAGEREF _Toc231093556 \h </w:instrText>
         </w:r>
         <w:r>
           <w:rPr>
@@ -2018,7 +2018,7 @@
           <w14:ligatures w14:val="standardContextual"/>
         </w:rPr>
       </w:pPr>
-      <w:hyperlink w:anchor="_Toc231090023" w:history="1">
+      <w:hyperlink w:anchor="_Toc231093557" w:history="1">
         <w:r>
           <w:rPr>
             <w:rStyle w:val="Hipervnculo"/>
@@ -2045,7 +2045,7 @@
             <w:noProof/>
             <w:webHidden/>
           </w:rPr>
-          <w:instrText xml:space="preserve"> PAGEREF _Toc231090023 \h </w:instrText>
+          <w:instrText xml:space="preserve"> PAGEREF _Toc231093557 \h </w:instrText>
         </w:r>
         <w:r>
           <w:rPr>
@@ -2092,7 +2092,7 @@
           <w14:ligatures w14:val="standardContextual"/>
         </w:rPr>
       </w:pPr>
-      <w:hyperlink w:anchor="_Toc231090024" w:history="1">
+      <w:hyperlink w:anchor="_Toc231093558" w:history="1">
         <w:r>
           <w:rPr>
             <w:rStyle w:val="Hipervnculo"/>
@@ -2119,7 +2119,7 @@
             <w:noProof/>
             <w:webHidden/>
           </w:rPr>
-          <w:instrText xml:space="preserve"> PAGEREF _Toc231090024 \h </w:instrText>
+          <w:instrText xml:space="preserve"> PAGEREF _Toc231093558 \h </w:instrText>
         </w:r>
         <w:r>
           <w:rPr>
@@ -2166,7 +2166,7 @@
           <w14:ligatures w14:val="standardContextual"/>
         </w:rPr>
       </w:pPr>
-      <w:hyperlink w:anchor="_Toc231090025" w:history="1">
+      <w:hyperlink w:anchor="_Toc231093559" w:history="1">
         <w:r>
           <w:rPr>
             <w:rStyle w:val="Hipervnculo"/>
@@ -2193,7 +2193,7 @@
             <w:noProof/>
             <w:webHidden/>
           </w:rPr>
-          <w:instrText xml:space="preserve"> PAGEREF _Toc231090025 \h </w:instrText>
+          <w:instrText xml:space="preserve"> PAGEREF _Toc231093559 \h </w:instrText>
         </w:r>
         <w:r>
           <w:rPr>
@@ -2240,7 +2240,7 @@
           <w14:ligatures w14:val="standardContextual"/>
         </w:rPr>
       </w:pPr>
-      <w:hyperlink w:anchor="_Toc231090026" w:history="1">
+      <w:hyperlink w:anchor="_Toc231093560" w:history="1">
         <w:r>
           <w:rPr>
             <w:rStyle w:val="Hipervnculo"/>
@@ -2267,7 +2267,7 @@
             <w:noProof/>
             <w:webHidden/>
           </w:rPr>
-          <w:instrText xml:space="preserve"> PAGEREF _Toc231090026 \h </w:instrText>
+          <w:instrText xml:space="preserve"> PAGEREF _Toc231093560 \h </w:instrText>
         </w:r>
         <w:r>
           <w:rPr>
@@ -2314,7 +2314,7 @@
           <w14:ligatures w14:val="standardContextual"/>
         </w:rPr>
       </w:pPr>
-      <w:hyperlink w:anchor="_Toc231090027" w:history="1">
+      <w:hyperlink w:anchor="_Toc231093561" w:history="1">
         <w:r>
           <w:rPr>
             <w:rStyle w:val="Hipervnculo"/>
@@ -2341,7 +2341,7 @@
             <w:noProof/>
             <w:webHidden/>
           </w:rPr>
-          <w:instrText xml:space="preserve"> PAGEREF _Toc231090027 \h </w:instrText>
+          <w:instrText xml:space="preserve"> PAGEREF _Toc231093561 \h </w:instrText>
         </w:r>
         <w:r>
           <w:rPr>
@@ -2388,7 +2388,7 @@
           <w14:ligatures w14:val="standardContextual"/>
         </w:rPr>
       </w:pPr>
-      <w:hyperlink w:anchor="_Toc231090028" w:history="1">
+      <w:hyperlink w:anchor="_Toc231093562" w:history="1">
         <w:r>
           <w:rPr>
             <w:rStyle w:val="Hipervnculo"/>
@@ -2415,7 +2415,7 @@
             <w:noProof/>
             <w:webHidden/>
           </w:rPr>
-          <w:instrText xml:space="preserve"> PAGEREF _Toc231090028 \h </w:instrText>
+          <w:instrText xml:space="preserve"> PAGEREF _Toc231093562 \h </w:instrText>
         </w:r>
         <w:r>
           <w:rPr>
@@ -2462,7 +2462,7 @@
           <w14:ligatures w14:val="standardContextual"/>
         </w:rPr>
       </w:pPr>
-      <w:hyperlink w:anchor="_Toc231090029" w:history="1">
+      <w:hyperlink w:anchor="_Toc231093563" w:history="1">
         <w:r>
           <w:rPr>
             <w:rStyle w:val="Hipervnculo"/>
@@ -2489,7 +2489,7 @@
             <w:noProof/>
             <w:webHidden/>
           </w:rPr>
-          <w:instrText xml:space="preserve"> PAGEREF _Toc231090029 \h </w:instrText>
+          <w:instrText xml:space="preserve"> PAGEREF _Toc231093563 \h </w:instrText>
         </w:r>
         <w:r>
           <w:rPr>
@@ -2536,7 +2536,7 @@
           <w14:ligatures w14:val="standardContextual"/>
         </w:rPr>
       </w:pPr>
-      <w:hyperlink w:anchor="_Toc231090030" w:history="1">
+      <w:hyperlink w:anchor="_Toc231093564" w:history="1">
         <w:r>
           <w:rPr>
             <w:rStyle w:val="Hipervnculo"/>
@@ -2563,7 +2563,7 @@
             <w:noProof/>
             <w:webHidden/>
           </w:rPr>
-          <w:instrText xml:space="preserve"> PAGEREF _Toc231090030 \h </w:instrText>
+          <w:instrText xml:space="preserve"> PAGEREF _Toc231093564 \h </w:instrText>
         </w:r>
         <w:r>
           <w:rPr>
@@ -2610,7 +2610,7 @@
           <w14:ligatures w14:val="standardContextual"/>
         </w:rPr>
       </w:pPr>
-      <w:hyperlink w:anchor="_Toc231090031" w:history="1">
+      <w:hyperlink w:anchor="_Toc231093565" w:history="1">
         <w:r>
           <w:rPr>
             <w:rStyle w:val="Hipervnculo"/>
@@ -2637,7 +2637,7 @@
             <w:noProof/>
             <w:webHidden/>
           </w:rPr>
-          <w:instrText xml:space="preserve"> PAGEREF _Toc231090031 \h </w:instrText>
+          <w:instrText xml:space="preserve"> PAGEREF _Toc231093565 \h </w:instrText>
         </w:r>
         <w:r>
           <w:rPr>
@@ -2684,7 +2684,7 @@
           <w14:ligatures w14:val="standardContextual"/>
         </w:rPr>
       </w:pPr>
-      <w:hyperlink w:anchor="_Toc231090032" w:history="1">
+      <w:hyperlink w:anchor="_Toc231093566" w:history="1">
         <w:r>
           <w:rPr>
             <w:rStyle w:val="Hipervnculo"/>
@@ -2711,7 +2711,7 @@
             <w:noProof/>
             <w:webHidden/>
           </w:rPr>
-          <w:instrText xml:space="preserve"> PAGEREF _Toc231090032 \h </w:instrText>
+          <w:instrText xml:space="preserve"> PAGEREF _Toc231093566 \h </w:instrText>
         </w:r>
         <w:r>
           <w:rPr>
@@ -2758,7 +2758,7 @@
           <w14:ligatures w14:val="standardContextual"/>
         </w:rPr>
       </w:pPr>
-      <w:hyperlink w:anchor="_Toc231090033" w:history="1">
+      <w:hyperlink w:anchor="_Toc231093567" w:history="1">
         <w:r>
           <w:rPr>
             <w:rStyle w:val="Hipervnculo"/>
@@ -2785,7 +2785,7 @@
             <w:noProof/>
             <w:webHidden/>
           </w:rPr>
-          <w:instrText xml:space="preserve"> PAGEREF _Toc231090033 \h </w:instrText>
+          <w:instrText xml:space="preserve"> PAGEREF _Toc231093567 \h </w:instrText>
         </w:r>
         <w:r>
           <w:rPr>
@@ -2832,7 +2832,7 @@
           <w14:ligatures w14:val="standardContextual"/>
         </w:rPr>
       </w:pPr>
-      <w:hyperlink w:anchor="_Toc231090034" w:history="1">
+      <w:hyperlink w:anchor="_Toc231093568" w:history="1">
         <w:r>
           <w:rPr>
             <w:rStyle w:val="Hipervnculo"/>
@@ -2859,7 +2859,7 @@
             <w:noProof/>
             <w:webHidden/>
           </w:rPr>
-          <w:instrText xml:space="preserve"> PAGEREF _Toc231090034 \h </w:instrText>
+          <w:instrText xml:space="preserve"> PAGEREF _Toc231093568 \h </w:instrText>
         </w:r>
         <w:r>
           <w:rPr>
@@ -2906,7 +2906,7 @@
           <w14:ligatures w14:val="standardContextual"/>
         </w:rPr>
       </w:pPr>
-      <w:hyperlink w:anchor="_Toc231090035" w:history="1">
+      <w:hyperlink w:anchor="_Toc231093569" w:history="1">
         <w:r>
           <w:rPr>
             <w:rStyle w:val="Hipervnculo"/>
@@ -2933,7 +2933,7 @@
             <w:noProof/>
             <w:webHidden/>
           </w:rPr>
-          <w:instrText xml:space="preserve"> PAGEREF _Toc231090035 \h </w:instrText>
+          <w:instrText xml:space="preserve"> PAGEREF _Toc231093569 \h </w:instrText>
         </w:r>
         <w:r>
           <w:rPr>
@@ -2980,7 +2980,7 @@
           <w14:ligatures w14:val="standardContextual"/>
         </w:rPr>
       </w:pPr>
-      <w:hyperlink w:anchor="_Toc231090036" w:history="1">
+      <w:hyperlink w:anchor="_Toc231093570" w:history="1">
         <w:r>
           <w:rPr>
             <w:rStyle w:val="Hipervnculo"/>
@@ -3007,7 +3007,7 @@
             <w:noProof/>
             <w:webHidden/>
           </w:rPr>
-          <w:instrText xml:space="preserve"> PAGEREF _Toc231090036 \h </w:instrText>
+          <w:instrText xml:space="preserve"> PAGEREF _Toc231093570 \h </w:instrText>
         </w:r>
         <w:r>
           <w:rPr>
@@ -3054,7 +3054,7 @@
           <w14:ligatures w14:val="standardContextual"/>
         </w:rPr>
       </w:pPr>
-      <w:hyperlink w:anchor="_Toc231090037" w:history="1">
+      <w:hyperlink w:anchor="_Toc231093571" w:history="1">
         <w:r>
           <w:rPr>
             <w:rStyle w:val="Hipervnculo"/>
@@ -3081,7 +3081,7 @@
             <w:noProof/>
             <w:webHidden/>
           </w:rPr>
-          <w:instrText xml:space="preserve"> PAGEREF _Toc231090037 \h </w:instrText>
+          <w:instrText xml:space="preserve"> PAGEREF _Toc231093571 \h </w:instrText>
         </w:r>
         <w:r>
           <w:rPr>
@@ -3128,7 +3128,7 @@
           <w14:ligatures w14:val="standardContextual"/>
         </w:rPr>
       </w:pPr>
-      <w:hyperlink w:anchor="_Toc231090038" w:history="1">
+      <w:hyperlink w:anchor="_Toc231093572" w:history="1">
         <w:r>
           <w:rPr>
             <w:rStyle w:val="Hipervnculo"/>
@@ -3155,7 +3155,7 @@
             <w:noProof/>
             <w:webHidden/>
           </w:rPr>
-          <w:instrText xml:space="preserve"> PAGEREF _Toc231090038 \h </w:instrText>
+          <w:instrText xml:space="preserve"> PAGEREF _Toc231093572 \h </w:instrText>
         </w:r>
         <w:r>
           <w:rPr>
@@ -3202,7 +3202,7 @@
           <w14:ligatures w14:val="standardContextual"/>
         </w:rPr>
       </w:pPr>
-      <w:hyperlink w:anchor="_Toc231090039" w:history="1">
+      <w:hyperlink w:anchor="_Toc231093573" w:history="1">
         <w:r>
           <w:rPr>
             <w:rStyle w:val="Hipervnculo"/>
@@ -3229,7 +3229,7 @@
             <w:noProof/>
             <w:webHidden/>
           </w:rPr>
-          <w:instrText xml:space="preserve"> PAGEREF _Toc231090039 \h </w:instrText>
+          <w:instrText xml:space="preserve"> PAGEREF _Toc231093573 \h </w:instrText>
         </w:r>
         <w:r>
           <w:rPr>
@@ -3276,7 +3276,7 @@
           <w14:ligatures w14:val="standardContextual"/>
         </w:rPr>
       </w:pPr>
-      <w:hyperlink w:anchor="_Toc231090040" w:history="1">
+      <w:hyperlink w:anchor="_Toc231093574" w:history="1">
         <w:r>
           <w:rPr>
             <w:rStyle w:val="Hipervnculo"/>
@@ -3303,7 +3303,7 @@
             <w:noProof/>
             <w:webHidden/>
           </w:rPr>
-          <w:instrText xml:space="preserve"> PAGEREF _Toc231090040 \h </w:instrText>
+          <w:instrText xml:space="preserve"> PAGEREF _Toc231093574 \h </w:instrText>
         </w:r>
         <w:r>
           <w:rPr>
@@ -3350,7 +3350,7 @@
           <w14:ligatures w14:val="standardContextual"/>
         </w:rPr>
       </w:pPr>
-      <w:hyperlink w:anchor="_Toc231090041" w:history="1">
+      <w:hyperlink w:anchor="_Toc231093575" w:history="1">
         <w:r>
           <w:rPr>
             <w:rStyle w:val="Hipervnculo"/>
@@ -3377,7 +3377,7 @@
             <w:noProof/>
             <w:webHidden/>
           </w:rPr>
-          <w:instrText xml:space="preserve"> PAGEREF _Toc231090041 \h </w:instrText>
+          <w:instrText xml:space="preserve"> PAGEREF _Toc231093575 \h </w:instrText>
         </w:r>
         <w:r>
           <w:rPr>
@@ -3424,7 +3424,7 @@
           <w14:ligatures w14:val="standardContextual"/>
         </w:rPr>
       </w:pPr>
-      <w:hyperlink w:anchor="_Toc231090042" w:history="1">
+      <w:hyperlink w:anchor="_Toc231093576" w:history="1">
         <w:r>
           <w:rPr>
             <w:rStyle w:val="Hipervnculo"/>
@@ -3451,7 +3451,7 @@
             <w:noProof/>
             <w:webHidden/>
           </w:rPr>
-          <w:instrText xml:space="preserve"> PAGEREF _Toc231090042 \h </w:instrText>
+          <w:instrText xml:space="preserve"> PAGEREF _Toc231093576 \h </w:instrText>
         </w:r>
         <w:r>
           <w:rPr>
@@ -3498,7 +3498,7 @@
           <w14:ligatures w14:val="standardContextual"/>
         </w:rPr>
       </w:pPr>
-      <w:hyperlink w:anchor="_Toc231090043" w:history="1">
+      <w:hyperlink w:anchor="_Toc231093577" w:history="1">
         <w:r>
           <w:rPr>
             <w:rStyle w:val="Hipervnculo"/>
@@ -3525,7 +3525,7 @@
             <w:noProof/>
             <w:webHidden/>
           </w:rPr>
-          <w:instrText xml:space="preserve"> PAGEREF _Toc231090043 \h </w:instrText>
+          <w:instrText xml:space="preserve"> PAGEREF _Toc231093577 \h </w:instrText>
         </w:r>
         <w:r>
           <w:rPr>
@@ -3572,7 +3572,7 @@
           <w14:ligatures w14:val="standardContextual"/>
         </w:rPr>
       </w:pPr>
-      <w:hyperlink w:anchor="_Toc231090044" w:history="1">
+      <w:hyperlink w:anchor="_Toc231093578" w:history="1">
         <w:r>
           <w:rPr>
             <w:rStyle w:val="Hipervnculo"/>
@@ -3599,7 +3599,7 @@
             <w:noProof/>
             <w:webHidden/>
           </w:rPr>
-          <w:instrText xml:space="preserve"> PAGEREF _Toc231090044 \h </w:instrText>
+          <w:instrText xml:space="preserve"> PAGEREF _Toc231093578 \h </w:instrText>
         </w:r>
         <w:r>
           <w:rPr>
@@ -3646,7 +3646,7 @@
           <w14:ligatures w14:val="standardContextual"/>
         </w:rPr>
       </w:pPr>
-      <w:hyperlink w:anchor="_Toc231090045" w:history="1">
+      <w:hyperlink w:anchor="_Toc231093579" w:history="1">
         <w:r>
           <w:rPr>
             <w:rStyle w:val="Hipervnculo"/>
@@ -3673,7 +3673,7 @@
             <w:noProof/>
             <w:webHidden/>
           </w:rPr>
-          <w:instrText xml:space="preserve"> PAGEREF _Toc231090045 \h </w:instrText>
+          <w:instrText xml:space="preserve"> PAGEREF _Toc231093579 \h </w:instrText>
         </w:r>
         <w:r>
           <w:rPr>
@@ -3720,7 +3720,7 @@
           <w14:ligatures w14:val="standardContextual"/>
         </w:rPr>
       </w:pPr>
-      <w:hyperlink w:anchor="_Toc231090046" w:history="1">
+      <w:hyperlink w:anchor="_Toc231093580" w:history="1">
         <w:r>
           <w:rPr>
             <w:rStyle w:val="Hipervnculo"/>
@@ -3747,7 +3747,7 @@
             <w:noProof/>
             <w:webHidden/>
           </w:rPr>
-          <w:instrText xml:space="preserve"> PAGEREF _Toc231090046 \h </w:instrText>
+          <w:instrText xml:space="preserve"> PAGEREF _Toc231093580 \h </w:instrText>
         </w:r>
         <w:r>
           <w:rPr>
@@ -3794,7 +3794,7 @@
           <w14:ligatures w14:val="standardContextual"/>
         </w:rPr>
       </w:pPr>
-      <w:hyperlink w:anchor="_Toc231090047" w:history="1">
+      <w:hyperlink w:anchor="_Toc231093581" w:history="1">
         <w:r>
           <w:rPr>
             <w:rStyle w:val="Hipervnculo"/>
@@ -3821,7 +3821,7 @@
             <w:noProof/>
             <w:webHidden/>
           </w:rPr>
-          <w:instrText xml:space="preserve"> PAGEREF _Toc231090047 \h </w:instrText>
+          <w:instrText xml:space="preserve"> PAGEREF _Toc231093581 \h </w:instrText>
         </w:r>
         <w:r>
           <w:rPr>
@@ -3868,7 +3868,7 @@
           <w14:ligatures w14:val="standardContextual"/>
         </w:rPr>
       </w:pPr>
-      <w:hyperlink w:anchor="_Toc231090048" w:history="1">
+      <w:hyperlink w:anchor="_Toc231093582" w:history="1">
         <w:r>
           <w:rPr>
             <w:rStyle w:val="Hipervnculo"/>
@@ -3895,7 +3895,7 @@
             <w:noProof/>
             <w:webHidden/>
           </w:rPr>
-          <w:instrText xml:space="preserve"> PAGEREF _Toc231090048 \h </w:instrText>
+          <w:instrText xml:space="preserve"> PAGEREF _Toc231093582 \h </w:instrText>
         </w:r>
         <w:r>
           <w:rPr>
@@ -3942,7 +3942,7 @@
           <w14:ligatures w14:val="standardContextual"/>
         </w:rPr>
       </w:pPr>
-      <w:hyperlink w:anchor="_Toc231090049" w:history="1">
+      <w:hyperlink w:anchor="_Toc231093583" w:history="1">
         <w:r>
           <w:rPr>
             <w:rStyle w:val="Hipervnculo"/>
@@ -3969,7 +3969,7 @@
             <w:noProof/>
             <w:webHidden/>
           </w:rPr>
-          <w:instrText xml:space="preserve"> PAGEREF _Toc231090049 \h </w:instrText>
+          <w:instrText xml:space="preserve"> PAGEREF _Toc231093583 \h </w:instrText>
         </w:r>
         <w:r>
           <w:rPr>
@@ -4016,7 +4016,7 @@
           <w14:ligatures w14:val="standardContextual"/>
         </w:rPr>
       </w:pPr>
-      <w:hyperlink w:anchor="_Toc231090050" w:history="1">
+      <w:hyperlink w:anchor="_Toc231093584" w:history="1">
         <w:r>
           <w:rPr>
             <w:rStyle w:val="Hipervnculo"/>
@@ -4043,7 +4043,7 @@
             <w:noProof/>
             <w:webHidden/>
           </w:rPr>
-          <w:instrText xml:space="preserve"> PAGEREF _Toc231090050 \h </w:instrText>
+          <w:instrText xml:space="preserve"> PAGEREF _Toc231093584 \h </w:instrText>
         </w:r>
         <w:r>
           <w:rPr>
@@ -4090,7 +4090,7 @@
           <w14:ligatures w14:val="standardContextual"/>
         </w:rPr>
       </w:pPr>
-      <w:hyperlink w:anchor="_Toc231090051" w:history="1">
+      <w:hyperlink w:anchor="_Toc231093585" w:history="1">
         <w:r>
           <w:rPr>
             <w:rStyle w:val="Hipervnculo"/>
@@ -4117,7 +4117,7 @@
             <w:noProof/>
             <w:webHidden/>
           </w:rPr>
-          <w:instrText xml:space="preserve"> PAGEREF _Toc231090051 \h </w:instrText>
+          <w:instrText xml:space="preserve"> PAGEREF _Toc231093585 \h </w:instrText>
         </w:r>
         <w:r>
           <w:rPr>
@@ -4164,7 +4164,7 @@
           <w14:ligatures w14:val="standardContextual"/>
         </w:rPr>
       </w:pPr>
-      <w:hyperlink w:anchor="_Toc231090052" w:history="1">
+      <w:hyperlink w:anchor="_Toc231093586" w:history="1">
         <w:r>
           <w:rPr>
             <w:rStyle w:val="Hipervnculo"/>
@@ -4191,7 +4191,7 @@
             <w:noProof/>
             <w:webHidden/>
           </w:rPr>
-          <w:instrText xml:space="preserve"> PAGEREF _Toc231090052 \h </w:instrText>
+          <w:instrText xml:space="preserve"> PAGEREF _Toc231093586 \h </w:instrText>
         </w:r>
         <w:r>
           <w:rPr>
@@ -4238,7 +4238,7 @@
           <w14:ligatures w14:val="standardContextual"/>
         </w:rPr>
       </w:pPr>
-      <w:hyperlink w:anchor="_Toc231090053" w:history="1">
+      <w:hyperlink w:anchor="_Toc231093587" w:history="1">
         <w:r>
           <w:rPr>
             <w:rStyle w:val="Hipervnculo"/>
@@ -4265,7 +4265,7 @@
             <w:noProof/>
             <w:webHidden/>
           </w:rPr>
-          <w:instrText xml:space="preserve"> PAGEREF _Toc231090053 \h </w:instrText>
+          <w:instrText xml:space="preserve"> PAGEREF _Toc231093587 \h </w:instrText>
         </w:r>
         <w:r>
           <w:rPr>
@@ -4312,7 +4312,7 @@
           <w14:ligatures w14:val="standardContextual"/>
         </w:rPr>
       </w:pPr>
-      <w:hyperlink w:anchor="_Toc231090054" w:history="1">
+      <w:hyperlink w:anchor="_Toc231093588" w:history="1">
         <w:r>
           <w:rPr>
             <w:rStyle w:val="Hipervnculo"/>
@@ -4339,7 +4339,7 @@
             <w:noProof/>
             <w:webHidden/>
           </w:rPr>
-          <w:instrText xml:space="preserve"> PAGEREF _Toc231090054 \h </w:instrText>
+          <w:instrText xml:space="preserve"> PAGEREF _Toc231093588 \h </w:instrText>
         </w:r>
         <w:r>
           <w:rPr>
@@ -4386,7 +4386,7 @@
           <w14:ligatures w14:val="standardContextual"/>
         </w:rPr>
       </w:pPr>
-      <w:hyperlink w:anchor="_Toc231090055" w:history="1">
+      <w:hyperlink w:anchor="_Toc231093589" w:history="1">
         <w:r>
           <w:rPr>
             <w:rStyle w:val="Hipervnculo"/>
@@ -4413,7 +4413,7 @@
             <w:noProof/>
             <w:webHidden/>
           </w:rPr>
-          <w:instrText xml:space="preserve"> PAGEREF _Toc231090055 \h </w:instrText>
+          <w:instrText xml:space="preserve"> PAGEREF _Toc231093589 \h </w:instrText>
         </w:r>
         <w:r>
           <w:rPr>
@@ -4460,7 +4460,7 @@
           <w14:ligatures w14:val="standardContextual"/>
         </w:rPr>
       </w:pPr>
-      <w:hyperlink w:anchor="_Toc231090056" w:history="1">
+      <w:hyperlink w:anchor="_Toc231093590" w:history="1">
         <w:r>
           <w:rPr>
             <w:rStyle w:val="Hipervnculo"/>
@@ -4487,7 +4487,7 @@
             <w:noProof/>
             <w:webHidden/>
           </w:rPr>
-          <w:instrText xml:space="preserve"> PAGEREF _Toc231090056 \h </w:instrText>
+          <w:instrText xml:space="preserve"> PAGEREF _Toc231093590 \h </w:instrText>
         </w:r>
         <w:r>
           <w:rPr>
@@ -4534,7 +4534,7 @@
           <w14:ligatures w14:val="standardContextual"/>
         </w:rPr>
       </w:pPr>
-      <w:hyperlink w:anchor="_Toc231090057" w:history="1">
+      <w:hyperlink w:anchor="_Toc231093591" w:history="1">
         <w:r>
           <w:rPr>
             <w:rStyle w:val="Hipervnculo"/>
@@ -4561,7 +4561,7 @@
             <w:noProof/>
             <w:webHidden/>
           </w:rPr>
-          <w:instrText xml:space="preserve"> PAGEREF _Toc231090057 \h </w:instrText>
+          <w:instrText xml:space="preserve"> PAGEREF _Toc231093591 \h </w:instrText>
         </w:r>
         <w:r>
           <w:rPr>
@@ -4581,7 +4581,7 @@
             <w:noProof/>
             <w:webHidden/>
           </w:rPr>
-          <w:t>41</w:t>
+          <w:t>42</w:t>
         </w:r>
         <w:r>
           <w:rPr>
@@ -4608,7 +4608,7 @@
           <w14:ligatures w14:val="standardContextual"/>
         </w:rPr>
       </w:pPr>
-      <w:hyperlink w:anchor="_Toc231090058" w:history="1">
+      <w:hyperlink w:anchor="_Toc231093592" w:history="1">
         <w:r>
           <w:rPr>
             <w:rStyle w:val="Hipervnculo"/>
@@ -4635,7 +4635,7 @@
             <w:noProof/>
             <w:webHidden/>
           </w:rPr>
-          <w:instrText xml:space="preserve"> PAGEREF _Toc231090058 \h </w:instrText>
+          <w:instrText xml:space="preserve"> PAGEREF _Toc231093592 \h </w:instrText>
         </w:r>
         <w:r>
           <w:rPr>
@@ -4655,7 +4655,7 @@
             <w:noProof/>
             <w:webHidden/>
           </w:rPr>
-          <w:t>43</w:t>
+          <w:t>44</w:t>
         </w:r>
         <w:r>
           <w:rPr>
@@ -4682,7 +4682,7 @@
           <w14:ligatures w14:val="standardContextual"/>
         </w:rPr>
       </w:pPr>
-      <w:hyperlink w:anchor="_Toc231090059" w:history="1">
+      <w:hyperlink w:anchor="_Toc231093593" w:history="1">
         <w:r>
           <w:rPr>
             <w:rStyle w:val="Hipervnculo"/>
@@ -4709,7 +4709,7 @@
             <w:noProof/>
             <w:webHidden/>
           </w:rPr>
-          <w:instrText xml:space="preserve"> PAGEREF _Toc231090059 \h </w:instrText>
+          <w:instrText xml:space="preserve"> PAGEREF _Toc231093593 \h </w:instrText>
         </w:r>
         <w:r>
           <w:rPr>
@@ -4729,7 +4729,7 @@
             <w:noProof/>
             <w:webHidden/>
           </w:rPr>
-          <w:t>47</w:t>
+          <w:t>48</w:t>
         </w:r>
         <w:r>
           <w:rPr>
@@ -4756,7 +4756,7 @@
           <w14:ligatures w14:val="standardContextual"/>
         </w:rPr>
       </w:pPr>
-      <w:hyperlink w:anchor="_Toc231090060" w:history="1">
+      <w:hyperlink w:anchor="_Toc231093594" w:history="1">
         <w:r>
           <w:rPr>
             <w:rStyle w:val="Hipervnculo"/>
@@ -4783,7 +4783,7 @@
             <w:noProof/>
             <w:webHidden/>
           </w:rPr>
-          <w:instrText xml:space="preserve"> PAGEREF _Toc231090060 \h </w:instrText>
+          <w:instrText xml:space="preserve"> PAGEREF _Toc231093594 \h </w:instrText>
         </w:r>
         <w:r>
           <w:rPr>
@@ -4803,7 +4803,7 @@
             <w:noProof/>
             <w:webHidden/>
           </w:rPr>
-          <w:t>47</w:t>
+          <w:t>48</w:t>
         </w:r>
         <w:r>
           <w:rPr>
@@ -4830,7 +4830,7 @@
           <w14:ligatures w14:val="standardContextual"/>
         </w:rPr>
       </w:pPr>
-      <w:hyperlink w:anchor="_Toc231090061" w:history="1">
+      <w:hyperlink w:anchor="_Toc231093595" w:history="1">
         <w:r>
           <w:rPr>
             <w:rStyle w:val="Hipervnculo"/>
@@ -4857,7 +4857,7 @@
             <w:noProof/>
             <w:webHidden/>
           </w:rPr>
-          <w:instrText xml:space="preserve"> PAGEREF _Toc231090061 \h </w:instrText>
+          <w:instrText xml:space="preserve"> PAGEREF _Toc231093595 \h </w:instrText>
         </w:r>
         <w:r>
           <w:rPr>
@@ -4877,7 +4877,7 @@
             <w:noProof/>
             <w:webHidden/>
           </w:rPr>
-          <w:t>47</w:t>
+          <w:t>48</w:t>
         </w:r>
         <w:r>
           <w:rPr>
@@ -4904,7 +4904,7 @@
           <w14:ligatures w14:val="standardContextual"/>
         </w:rPr>
       </w:pPr>
-      <w:hyperlink w:anchor="_Toc231090062" w:history="1">
+      <w:hyperlink w:anchor="_Toc231093596" w:history="1">
         <w:r>
           <w:rPr>
             <w:rStyle w:val="Hipervnculo"/>
@@ -4931,7 +4931,7 @@
             <w:noProof/>
             <w:webHidden/>
           </w:rPr>
-          <w:instrText xml:space="preserve"> PAGEREF _Toc231090062 \h </w:instrText>
+          <w:instrText xml:space="preserve"> PAGEREF _Toc231093596 \h </w:instrText>
         </w:r>
         <w:r>
           <w:rPr>
@@ -4951,7 +4951,7 @@
             <w:noProof/>
             <w:webHidden/>
           </w:rPr>
-          <w:t>48</w:t>
+          <w:t>49</w:t>
         </w:r>
         <w:r>
           <w:rPr>
@@ -4978,7 +4978,7 @@
           <w14:ligatures w14:val="standardContextual"/>
         </w:rPr>
       </w:pPr>
-      <w:hyperlink w:anchor="_Toc231090063" w:history="1">
+      <w:hyperlink w:anchor="_Toc231093597" w:history="1">
         <w:r>
           <w:rPr>
             <w:rStyle w:val="Hipervnculo"/>
@@ -5005,7 +5005,7 @@
             <w:noProof/>
             <w:webHidden/>
           </w:rPr>
-          <w:instrText xml:space="preserve"> PAGEREF _Toc231090063 \h </w:instrText>
+          <w:instrText xml:space="preserve"> PAGEREF _Toc231093597 \h </w:instrText>
         </w:r>
         <w:r>
           <w:rPr>
@@ -5025,7 +5025,7 @@
             <w:noProof/>
             <w:webHidden/>
           </w:rPr>
-          <w:t>48</w:t>
+          <w:t>49</w:t>
         </w:r>
         <w:r>
           <w:rPr>
@@ -5052,7 +5052,7 @@
           <w14:ligatures w14:val="standardContextual"/>
         </w:rPr>
       </w:pPr>
-      <w:hyperlink w:anchor="_Toc231090064" w:history="1">
+      <w:hyperlink w:anchor="_Toc231093598" w:history="1">
         <w:r>
           <w:rPr>
             <w:rStyle w:val="Hipervnculo"/>
@@ -5079,7 +5079,7 @@
             <w:noProof/>
             <w:webHidden/>
           </w:rPr>
-          <w:instrText xml:space="preserve"> PAGEREF _Toc231090064 \h </w:instrText>
+          <w:instrText xml:space="preserve"> PAGEREF _Toc231093598 \h </w:instrText>
         </w:r>
         <w:r>
           <w:rPr>
@@ -5099,7 +5099,7 @@
             <w:noProof/>
             <w:webHidden/>
           </w:rPr>
-          <w:t>48</w:t>
+          <w:t>49</w:t>
         </w:r>
         <w:r>
           <w:rPr>
@@ -5126,7 +5126,7 @@
           <w14:ligatures w14:val="standardContextual"/>
         </w:rPr>
       </w:pPr>
-      <w:hyperlink w:anchor="_Toc231090065" w:history="1">
+      <w:hyperlink w:anchor="_Toc231093599" w:history="1">
         <w:r>
           <w:rPr>
             <w:rStyle w:val="Hipervnculo"/>
@@ -5153,7 +5153,7 @@
             <w:noProof/>
             <w:webHidden/>
           </w:rPr>
-          <w:instrText xml:space="preserve"> PAGEREF _Toc231090065 \h </w:instrText>
+          <w:instrText xml:space="preserve"> PAGEREF _Toc231093599 \h </w:instrText>
         </w:r>
         <w:r>
           <w:rPr>
@@ -5173,7 +5173,7 @@
             <w:noProof/>
             <w:webHidden/>
           </w:rPr>
-          <w:t>49</w:t>
+          <w:t>50</w:t>
         </w:r>
         <w:r>
           <w:rPr>
@@ -5200,7 +5200,7 @@
           <w14:ligatures w14:val="standardContextual"/>
         </w:rPr>
       </w:pPr>
-      <w:hyperlink w:anchor="_Toc231090066" w:history="1">
+      <w:hyperlink w:anchor="_Toc231093600" w:history="1">
         <w:r>
           <w:rPr>
             <w:rStyle w:val="Hipervnculo"/>
@@ -5227,7 +5227,7 @@
             <w:noProof/>
             <w:webHidden/>
           </w:rPr>
-          <w:instrText xml:space="preserve"> PAGEREF _Toc231090066 \h </w:instrText>
+          <w:instrText xml:space="preserve"> PAGEREF _Toc231093600 \h </w:instrText>
         </w:r>
         <w:r>
           <w:rPr>
@@ -5247,7 +5247,7 @@
             <w:noProof/>
             <w:webHidden/>
           </w:rPr>
-          <w:t>49</w:t>
+          <w:t>50</w:t>
         </w:r>
         <w:r>
           <w:rPr>
@@ -5274,7 +5274,7 @@
           <w14:ligatures w14:val="standardContextual"/>
         </w:rPr>
       </w:pPr>
-      <w:hyperlink w:anchor="_Toc231090067" w:history="1">
+      <w:hyperlink w:anchor="_Toc231093601" w:history="1">
         <w:r>
           <w:rPr>
             <w:rStyle w:val="Hipervnculo"/>
@@ -5301,7 +5301,7 @@
             <w:noProof/>
             <w:webHidden/>
           </w:rPr>
-          <w:instrText xml:space="preserve"> PAGEREF _Toc231090067 \h </w:instrText>
+          <w:instrText xml:space="preserve"> PAGEREF _Toc231093601 \h </w:instrText>
         </w:r>
         <w:r>
           <w:rPr>
@@ -5321,7 +5321,7 @@
             <w:noProof/>
             <w:webHidden/>
           </w:rPr>
-          <w:t>50</w:t>
+          <w:t>51</w:t>
         </w:r>
         <w:r>
           <w:rPr>
@@ -5348,7 +5348,7 @@
           <w14:ligatures w14:val="standardContextual"/>
         </w:rPr>
       </w:pPr>
-      <w:hyperlink w:anchor="_Toc231090068" w:history="1">
+      <w:hyperlink w:anchor="_Toc231093602" w:history="1">
         <w:r>
           <w:rPr>
             <w:rStyle w:val="Hipervnculo"/>
@@ -5375,7 +5375,7 @@
             <w:noProof/>
             <w:webHidden/>
           </w:rPr>
-          <w:instrText xml:space="preserve"> PAGEREF _Toc231090068 \h </w:instrText>
+          <w:instrText xml:space="preserve"> PAGEREF _Toc231093602 \h </w:instrText>
         </w:r>
         <w:r>
           <w:rPr>
@@ -5395,7 +5395,7 @@
             <w:noProof/>
             <w:webHidden/>
           </w:rPr>
-          <w:t>50</w:t>
+          <w:t>51</w:t>
         </w:r>
         <w:r>
           <w:rPr>
@@ -5422,7 +5422,7 @@
           <w14:ligatures w14:val="standardContextual"/>
         </w:rPr>
       </w:pPr>
-      <w:hyperlink w:anchor="_Toc231090069" w:history="1">
+      <w:hyperlink w:anchor="_Toc231093603" w:history="1">
         <w:r>
           <w:rPr>
             <w:rStyle w:val="Hipervnculo"/>
@@ -5449,7 +5449,7 @@
             <w:noProof/>
             <w:webHidden/>
           </w:rPr>
-          <w:instrText xml:space="preserve"> PAGEREF _Toc231090069 \h </w:instrText>
+          <w:instrText xml:space="preserve"> PAGEREF _Toc231093603 \h </w:instrText>
         </w:r>
         <w:r>
           <w:rPr>
@@ -5469,7 +5469,7 @@
             <w:noProof/>
             <w:webHidden/>
           </w:rPr>
-          <w:t>50</w:t>
+          <w:t>51</w:t>
         </w:r>
         <w:r>
           <w:rPr>
@@ -5496,7 +5496,7 @@
           <w14:ligatures w14:val="standardContextual"/>
         </w:rPr>
       </w:pPr>
-      <w:hyperlink w:anchor="_Toc231090070" w:history="1">
+      <w:hyperlink w:anchor="_Toc231093604" w:history="1">
         <w:r>
           <w:rPr>
             <w:rStyle w:val="Hipervnculo"/>
@@ -5523,7 +5523,7 @@
             <w:noProof/>
             <w:webHidden/>
           </w:rPr>
-          <w:instrText xml:space="preserve"> PAGEREF _Toc231090070 \h </w:instrText>
+          <w:instrText xml:space="preserve"> PAGEREF _Toc231093604 \h </w:instrText>
         </w:r>
         <w:r>
           <w:rPr>
@@ -5543,7 +5543,7 @@
             <w:noProof/>
             <w:webHidden/>
           </w:rPr>
-          <w:t>51</w:t>
+          <w:t>52</w:t>
         </w:r>
         <w:r>
           <w:rPr>
@@ -5570,7 +5570,7 @@
           <w14:ligatures w14:val="standardContextual"/>
         </w:rPr>
       </w:pPr>
-      <w:hyperlink w:anchor="_Toc231090071" w:history="1">
+      <w:hyperlink w:anchor="_Toc231093605" w:history="1">
         <w:r>
           <w:rPr>
             <w:rStyle w:val="Hipervnculo"/>
@@ -5597,7 +5597,7 @@
             <w:noProof/>
             <w:webHidden/>
           </w:rPr>
-          <w:instrText xml:space="preserve"> PAGEREF _Toc231090071 \h </w:instrText>
+          <w:instrText xml:space="preserve"> PAGEREF _Toc231093605 \h </w:instrText>
         </w:r>
         <w:r>
           <w:rPr>
@@ -5617,7 +5617,7 @@
             <w:noProof/>
             <w:webHidden/>
           </w:rPr>
-          <w:t>51</w:t>
+          <w:t>52</w:t>
         </w:r>
         <w:r>
           <w:rPr>
@@ -5644,7 +5644,7 @@
           <w14:ligatures w14:val="standardContextual"/>
         </w:rPr>
       </w:pPr>
-      <w:hyperlink w:anchor="_Toc231090072" w:history="1">
+      <w:hyperlink w:anchor="_Toc231093606" w:history="1">
         <w:r>
           <w:rPr>
             <w:rStyle w:val="Hipervnculo"/>
@@ -5671,7 +5671,7 @@
             <w:noProof/>
             <w:webHidden/>
           </w:rPr>
-          <w:instrText xml:space="preserve"> PAGEREF _Toc231090072 \h </w:instrText>
+          <w:instrText xml:space="preserve"> PAGEREF _Toc231093606 \h </w:instrText>
         </w:r>
         <w:r>
           <w:rPr>
@@ -5691,7 +5691,7 @@
             <w:noProof/>
             <w:webHidden/>
           </w:rPr>
-          <w:t>52</w:t>
+          <w:t>53</w:t>
         </w:r>
         <w:r>
           <w:rPr>
@@ -5719,7 +5719,7 @@
       <w:pPr>
         <w:pStyle w:val="Ttulo1"/>
       </w:pPr>
-      <w:bookmarkStart w:id="7" w:name="_Toc231090009"/>
+      <w:bookmarkStart w:id="7" w:name="_Toc231093543"/>
       <w:r>
         <w:lastRenderedPageBreak/>
         <w:t>Índice de tablas</w:t>
@@ -5751,7 +5751,7 @@
       <w:r>
         <w:fldChar w:fldCharType="separate"/>
       </w:r>
-      <w:hyperlink w:anchor="_Toc231090073" w:history="1">
+      <w:hyperlink w:anchor="_Toc231093607" w:history="1">
         <w:r>
           <w:rPr>
             <w:rStyle w:val="Hipervnculo"/>
@@ -5778,7 +5778,7 @@
             <w:noProof/>
             <w:webHidden/>
           </w:rPr>
-          <w:instrText xml:space="preserve"> PAGEREF _Toc231090073 \h </w:instrText>
+          <w:instrText xml:space="preserve"> PAGEREF _Toc231093607 \h </w:instrText>
         </w:r>
         <w:r>
           <w:rPr>
@@ -5825,7 +5825,7 @@
           <w14:ligatures w14:val="standardContextual"/>
         </w:rPr>
       </w:pPr>
-      <w:hyperlink w:anchor="_Toc231090074" w:history="1">
+      <w:hyperlink w:anchor="_Toc231093608" w:history="1">
         <w:r>
           <w:rPr>
             <w:rStyle w:val="Hipervnculo"/>
@@ -5852,7 +5852,7 @@
             <w:noProof/>
             <w:webHidden/>
           </w:rPr>
-          <w:instrText xml:space="preserve"> PAGEREF _Toc231090074 \h </w:instrText>
+          <w:instrText xml:space="preserve"> PAGEREF _Toc231093608 \h </w:instrText>
         </w:r>
         <w:r>
           <w:rPr>
@@ -5899,7 +5899,7 @@
           <w14:ligatures w14:val="standardContextual"/>
         </w:rPr>
       </w:pPr>
-      <w:hyperlink w:anchor="_Toc231090075" w:history="1">
+      <w:hyperlink w:anchor="_Toc231093609" w:history="1">
         <w:r>
           <w:rPr>
             <w:rStyle w:val="Hipervnculo"/>
@@ -5926,7 +5926,7 @@
             <w:noProof/>
             <w:webHidden/>
           </w:rPr>
-          <w:instrText xml:space="preserve"> PAGEREF _Toc231090075 \h </w:instrText>
+          <w:instrText xml:space="preserve"> PAGEREF _Toc231093609 \h </w:instrText>
         </w:r>
         <w:r>
           <w:rPr>
@@ -5973,7 +5973,7 @@
           <w14:ligatures w14:val="standardContextual"/>
         </w:rPr>
       </w:pPr>
-      <w:hyperlink w:anchor="_Toc231090076" w:history="1">
+      <w:hyperlink w:anchor="_Toc231093610" w:history="1">
         <w:r>
           <w:rPr>
             <w:rStyle w:val="Hipervnculo"/>
@@ -6000,7 +6000,7 @@
             <w:noProof/>
             <w:webHidden/>
           </w:rPr>
-          <w:instrText xml:space="preserve"> PAGEREF _Toc231090076 \h </w:instrText>
+          <w:instrText xml:space="preserve"> PAGEREF _Toc231093610 \h </w:instrText>
         </w:r>
         <w:r>
           <w:rPr>
@@ -6047,7 +6047,7 @@
           <w14:ligatures w14:val="standardContextual"/>
         </w:rPr>
       </w:pPr>
-      <w:hyperlink w:anchor="_Toc231090077" w:history="1">
+      <w:hyperlink w:anchor="_Toc231093611" w:history="1">
         <w:r>
           <w:rPr>
             <w:rStyle w:val="Hipervnculo"/>
@@ -6074,7 +6074,7 @@
             <w:noProof/>
             <w:webHidden/>
           </w:rPr>
-          <w:instrText xml:space="preserve"> PAGEREF _Toc231090077 \h </w:instrText>
+          <w:instrText xml:space="preserve"> PAGEREF _Toc231093611 \h </w:instrText>
         </w:r>
         <w:r>
           <w:rPr>
@@ -6094,7 +6094,7 @@
             <w:noProof/>
             <w:webHidden/>
           </w:rPr>
-          <w:t>47</w:t>
+          <w:t>48</w:t>
         </w:r>
         <w:r>
           <w:rPr>
@@ -6121,7 +6121,7 @@
           <w14:ligatures w14:val="standardContextual"/>
         </w:rPr>
       </w:pPr>
-      <w:hyperlink w:anchor="_Toc231090078" w:history="1">
+      <w:hyperlink w:anchor="_Toc231093612" w:history="1">
         <w:r>
           <w:rPr>
             <w:rStyle w:val="Hipervnculo"/>
@@ -6148,7 +6148,7 @@
             <w:noProof/>
             <w:webHidden/>
           </w:rPr>
-          <w:instrText xml:space="preserve"> PAGEREF _Toc231090078 \h </w:instrText>
+          <w:instrText xml:space="preserve"> PAGEREF _Toc231093612 \h </w:instrText>
         </w:r>
         <w:r>
           <w:rPr>
@@ -6168,7 +6168,7 @@
             <w:noProof/>
             <w:webHidden/>
           </w:rPr>
-          <w:t>47</w:t>
+          <w:t>48</w:t>
         </w:r>
         <w:r>
           <w:rPr>
@@ -6195,7 +6195,7 @@
           <w14:ligatures w14:val="standardContextual"/>
         </w:rPr>
       </w:pPr>
-      <w:hyperlink w:anchor="_Toc231090079" w:history="1">
+      <w:hyperlink w:anchor="_Toc231093613" w:history="1">
         <w:r>
           <w:rPr>
             <w:rStyle w:val="Hipervnculo"/>
@@ -6222,7 +6222,7 @@
             <w:noProof/>
             <w:webHidden/>
           </w:rPr>
-          <w:instrText xml:space="preserve"> PAGEREF _Toc231090079 \h </w:instrText>
+          <w:instrText xml:space="preserve"> PAGEREF _Toc231093613 \h </w:instrText>
         </w:r>
         <w:r>
           <w:rPr>
@@ -6242,7 +6242,7 @@
             <w:noProof/>
             <w:webHidden/>
           </w:rPr>
-          <w:t>48</w:t>
+          <w:t>49</w:t>
         </w:r>
         <w:r>
           <w:rPr>
@@ -6269,7 +6269,7 @@
           <w14:ligatures w14:val="standardContextual"/>
         </w:rPr>
       </w:pPr>
-      <w:hyperlink w:anchor="_Toc231090080" w:history="1">
+      <w:hyperlink w:anchor="_Toc231093614" w:history="1">
         <w:r>
           <w:rPr>
             <w:rStyle w:val="Hipervnculo"/>
@@ -6296,7 +6296,7 @@
             <w:noProof/>
             <w:webHidden/>
           </w:rPr>
-          <w:instrText xml:space="preserve"> PAGEREF _Toc231090080 \h </w:instrText>
+          <w:instrText xml:space="preserve"> PAGEREF _Toc231093614 \h </w:instrText>
         </w:r>
         <w:r>
           <w:rPr>
@@ -6316,7 +6316,7 @@
             <w:noProof/>
             <w:webHidden/>
           </w:rPr>
-          <w:t>48</w:t>
+          <w:t>49</w:t>
         </w:r>
         <w:r>
           <w:rPr>
@@ -6343,7 +6343,7 @@
           <w14:ligatures w14:val="standardContextual"/>
         </w:rPr>
       </w:pPr>
-      <w:hyperlink w:anchor="_Toc231090081" w:history="1">
+      <w:hyperlink w:anchor="_Toc231093615" w:history="1">
         <w:r>
           <w:rPr>
             <w:rStyle w:val="Hipervnculo"/>
@@ -6370,7 +6370,7 @@
             <w:noProof/>
             <w:webHidden/>
           </w:rPr>
-          <w:instrText xml:space="preserve"> PAGEREF _Toc231090081 \h </w:instrText>
+          <w:instrText xml:space="preserve"> PAGEREF _Toc231093615 \h </w:instrText>
         </w:r>
         <w:r>
           <w:rPr>
@@ -6390,7 +6390,7 @@
             <w:noProof/>
             <w:webHidden/>
           </w:rPr>
-          <w:t>49</w:t>
+          <w:t>50</w:t>
         </w:r>
         <w:r>
           <w:rPr>
@@ -6417,7 +6417,7 @@
           <w14:ligatures w14:val="standardContextual"/>
         </w:rPr>
       </w:pPr>
-      <w:hyperlink w:anchor="_Toc231090082" w:history="1">
+      <w:hyperlink w:anchor="_Toc231093616" w:history="1">
         <w:r>
           <w:rPr>
             <w:rStyle w:val="Hipervnculo"/>
@@ -6444,7 +6444,7 @@
             <w:noProof/>
             <w:webHidden/>
           </w:rPr>
-          <w:instrText xml:space="preserve"> PAGEREF _Toc231090082 \h </w:instrText>
+          <w:instrText xml:space="preserve"> PAGEREF _Toc231093616 \h </w:instrText>
         </w:r>
         <w:r>
           <w:rPr>
@@ -6464,7 +6464,7 @@
             <w:noProof/>
             <w:webHidden/>
           </w:rPr>
-          <w:t>49</w:t>
+          <w:t>50</w:t>
         </w:r>
         <w:r>
           <w:rPr>
@@ -6491,7 +6491,7 @@
           <w14:ligatures w14:val="standardContextual"/>
         </w:rPr>
       </w:pPr>
-      <w:hyperlink w:anchor="_Toc231090083" w:history="1">
+      <w:hyperlink w:anchor="_Toc231093617" w:history="1">
         <w:r>
           <w:rPr>
             <w:rStyle w:val="Hipervnculo"/>
@@ -6518,7 +6518,7 @@
             <w:noProof/>
             <w:webHidden/>
           </w:rPr>
-          <w:instrText xml:space="preserve"> PAGEREF _Toc231090083 \h </w:instrText>
+          <w:instrText xml:space="preserve"> PAGEREF _Toc231093617 \h </w:instrText>
         </w:r>
         <w:r>
           <w:rPr>
@@ -6538,7 +6538,7 @@
             <w:noProof/>
             <w:webHidden/>
           </w:rPr>
-          <w:t>50</w:t>
+          <w:t>51</w:t>
         </w:r>
         <w:r>
           <w:rPr>
@@ -6565,7 +6565,7 @@
           <w14:ligatures w14:val="standardContextual"/>
         </w:rPr>
       </w:pPr>
-      <w:hyperlink w:anchor="_Toc231090084" w:history="1">
+      <w:hyperlink w:anchor="_Toc231093618" w:history="1">
         <w:r>
           <w:rPr>
             <w:rStyle w:val="Hipervnculo"/>
@@ -6592,7 +6592,7 @@
             <w:noProof/>
             <w:webHidden/>
           </w:rPr>
-          <w:instrText xml:space="preserve"> PAGEREF _Toc231090084 \h </w:instrText>
+          <w:instrText xml:space="preserve"> PAGEREF _Toc231093618 \h </w:instrText>
         </w:r>
         <w:r>
           <w:rPr>
@@ -6612,7 +6612,7 @@
             <w:noProof/>
             <w:webHidden/>
           </w:rPr>
-          <w:t>50</w:t>
+          <w:t>51</w:t>
         </w:r>
         <w:r>
           <w:rPr>
@@ -6639,7 +6639,7 @@
           <w14:ligatures w14:val="standardContextual"/>
         </w:rPr>
       </w:pPr>
-      <w:hyperlink w:anchor="_Toc231090085" w:history="1">
+      <w:hyperlink w:anchor="_Toc231093619" w:history="1">
         <w:r>
           <w:rPr>
             <w:rStyle w:val="Hipervnculo"/>
@@ -6666,7 +6666,7 @@
             <w:noProof/>
             <w:webHidden/>
           </w:rPr>
-          <w:instrText xml:space="preserve"> PAGEREF _Toc231090085 \h </w:instrText>
+          <w:instrText xml:space="preserve"> PAGEREF _Toc231093619 \h </w:instrText>
         </w:r>
         <w:r>
           <w:rPr>
@@ -6686,7 +6686,7 @@
             <w:noProof/>
             <w:webHidden/>
           </w:rPr>
-          <w:t>50</w:t>
+          <w:t>51</w:t>
         </w:r>
         <w:r>
           <w:rPr>
@@ -6713,7 +6713,7 @@
           <w14:ligatures w14:val="standardContextual"/>
         </w:rPr>
       </w:pPr>
-      <w:hyperlink w:anchor="_Toc231090086" w:history="1">
+      <w:hyperlink w:anchor="_Toc231093620" w:history="1">
         <w:r>
           <w:rPr>
             <w:rStyle w:val="Hipervnculo"/>
@@ -6740,7 +6740,7 @@
             <w:noProof/>
             <w:webHidden/>
           </w:rPr>
-          <w:instrText xml:space="preserve"> PAGEREF _Toc231090086 \h </w:instrText>
+          <w:instrText xml:space="preserve"> PAGEREF _Toc231093620 \h </w:instrText>
         </w:r>
         <w:r>
           <w:rPr>
@@ -6760,7 +6760,7 @@
             <w:noProof/>
             <w:webHidden/>
           </w:rPr>
-          <w:t>51</w:t>
+          <w:t>52</w:t>
         </w:r>
         <w:r>
           <w:rPr>
@@ -6788,7 +6788,7 @@
       <w:pPr>
         <w:pStyle w:val="Ttulo1"/>
       </w:pPr>
-      <w:bookmarkStart w:id="8" w:name="_Toc231090010"/>
+      <w:bookmarkStart w:id="8" w:name="_Toc231093544"/>
       <w:r>
         <w:lastRenderedPageBreak/>
         <w:t>Índice de figuras</w:t>
@@ -6820,7 +6820,7 @@
       <w:r>
         <w:fldChar w:fldCharType="separate"/>
       </w:r>
-      <w:hyperlink w:anchor="_Toc231090087" w:history="1">
+      <w:hyperlink w:anchor="_Toc231093621" w:history="1">
         <w:r>
           <w:rPr>
             <w:rStyle w:val="Hipervnculo"/>
@@ -6847,7 +6847,7 @@
             <w:noProof/>
             <w:webHidden/>
           </w:rPr>
-          <w:instrText xml:space="preserve"> PAGEREF _Toc231090087 \h </w:instrText>
+          <w:instrText xml:space="preserve"> PAGEREF _Toc231093621 \h </w:instrText>
         </w:r>
         <w:r>
           <w:rPr>
@@ -6894,7 +6894,7 @@
           <w14:ligatures w14:val="standardContextual"/>
         </w:rPr>
       </w:pPr>
-      <w:hyperlink w:anchor="_Toc231090088" w:history="1">
+      <w:hyperlink w:anchor="_Toc231093622" w:history="1">
         <w:r>
           <w:rPr>
             <w:rStyle w:val="Hipervnculo"/>
@@ -6921,7 +6921,7 @@
             <w:noProof/>
             <w:webHidden/>
           </w:rPr>
-          <w:instrText xml:space="preserve"> PAGEREF _Toc231090088 \h </w:instrText>
+          <w:instrText xml:space="preserve"> PAGEREF _Toc231093622 \h </w:instrText>
         </w:r>
         <w:r>
           <w:rPr>
@@ -6968,7 +6968,7 @@
           <w14:ligatures w14:val="standardContextual"/>
         </w:rPr>
       </w:pPr>
-      <w:hyperlink w:anchor="_Toc231090089" w:history="1">
+      <w:hyperlink w:anchor="_Toc231093623" w:history="1">
         <w:r>
           <w:rPr>
             <w:rStyle w:val="Hipervnculo"/>
@@ -6995,7 +6995,7 @@
             <w:noProof/>
             <w:webHidden/>
           </w:rPr>
-          <w:instrText xml:space="preserve"> PAGEREF _Toc231090089 \h </w:instrText>
+          <w:instrText xml:space="preserve"> PAGEREF _Toc231093623 \h </w:instrText>
         </w:r>
         <w:r>
           <w:rPr>
@@ -7042,7 +7042,7 @@
           <w14:ligatures w14:val="standardContextual"/>
         </w:rPr>
       </w:pPr>
-      <w:hyperlink w:anchor="_Toc231090090" w:history="1">
+      <w:hyperlink w:anchor="_Toc231093624" w:history="1">
         <w:r>
           <w:rPr>
             <w:rStyle w:val="Hipervnculo"/>
@@ -7069,7 +7069,7 @@
             <w:noProof/>
             <w:webHidden/>
           </w:rPr>
-          <w:instrText xml:space="preserve"> PAGEREF _Toc231090090 \h </w:instrText>
+          <w:instrText xml:space="preserve"> PAGEREF _Toc231093624 \h </w:instrText>
         </w:r>
         <w:r>
           <w:rPr>
@@ -7116,7 +7116,7 @@
           <w14:ligatures w14:val="standardContextual"/>
         </w:rPr>
       </w:pPr>
-      <w:hyperlink w:anchor="_Toc231090091" w:history="1">
+      <w:hyperlink w:anchor="_Toc231093625" w:history="1">
         <w:r>
           <w:rPr>
             <w:rStyle w:val="Hipervnculo"/>
@@ -7143,7 +7143,7 @@
             <w:noProof/>
             <w:webHidden/>
           </w:rPr>
-          <w:instrText xml:space="preserve"> PAGEREF _Toc231090091 \h </w:instrText>
+          <w:instrText xml:space="preserve"> PAGEREF _Toc231093625 \h </w:instrText>
         </w:r>
         <w:r>
           <w:rPr>
@@ -7190,7 +7190,7 @@
           <w14:ligatures w14:val="standardContextual"/>
         </w:rPr>
       </w:pPr>
-      <w:hyperlink w:anchor="_Toc231090092" w:history="1">
+      <w:hyperlink w:anchor="_Toc231093626" w:history="1">
         <w:r>
           <w:rPr>
             <w:rStyle w:val="Hipervnculo"/>
@@ -7217,7 +7217,7 @@
             <w:noProof/>
             <w:webHidden/>
           </w:rPr>
-          <w:instrText xml:space="preserve"> PAGEREF _Toc231090092 \h </w:instrText>
+          <w:instrText xml:space="preserve"> PAGEREF _Toc231093626 \h </w:instrText>
         </w:r>
         <w:r>
           <w:rPr>
@@ -7265,7 +7265,7 @@
       <w:pPr>
         <w:pStyle w:val="Ttulo1"/>
       </w:pPr>
-      <w:bookmarkStart w:id="9" w:name="_Toc231090011"/>
+      <w:bookmarkStart w:id="9" w:name="_Toc231093545"/>
       <w:r>
         <w:lastRenderedPageBreak/>
         <w:t>Lista de abreviaturas y siglas</w:t>
@@ -8051,7 +8051,7 @@
       <w:pPr>
         <w:pStyle w:val="Ttulo1"/>
       </w:pPr>
-      <w:bookmarkStart w:id="10" w:name="_Toc231090012"/>
+      <w:bookmarkStart w:id="10" w:name="_Toc231093546"/>
       <w:r>
         <w:lastRenderedPageBreak/>
         <w:t>Capítulo 1 — Introducción</w:t>
@@ -8062,7 +8062,7 @@
       <w:pPr>
         <w:pStyle w:val="Ttulo2"/>
       </w:pPr>
-      <w:bookmarkStart w:id="11" w:name="_Toc231090013"/>
+      <w:bookmarkStart w:id="11" w:name="_Toc231093547"/>
       <w:r>
         <w:t>1.1 Contextualización</w:t>
       </w:r>
@@ -8150,7 +8150,7 @@
       <w:pPr>
         <w:pStyle w:val="Ttulo2"/>
       </w:pPr>
-      <w:bookmarkStart w:id="12" w:name="_Toc231090014"/>
+      <w:bookmarkStart w:id="12" w:name="_Toc231093548"/>
       <w:r>
         <w:t>1.2 Problema de investigación y justificación</w:t>
       </w:r>
@@ -8260,7 +8260,7 @@
       <w:pPr>
         <w:pStyle w:val="Ttulo2"/>
       </w:pPr>
-      <w:bookmarkStart w:id="13" w:name="_Toc231090015"/>
+      <w:bookmarkStart w:id="13" w:name="_Toc231093549"/>
       <w:r>
         <w:t>1.3 Pregunta y objetivos de investigación</w:t>
       </w:r>
@@ -8445,7 +8445,7 @@
       <w:pPr>
         <w:pStyle w:val="Ttulo2"/>
       </w:pPr>
-      <w:bookmarkStart w:id="14" w:name="_Toc231090016"/>
+      <w:bookmarkStart w:id="14" w:name="_Toc231093550"/>
       <w:r>
         <w:lastRenderedPageBreak/>
         <w:t>1.4 Hipótesis general</w:t>
@@ -8489,7 +8489,7 @@
       <w:pPr>
         <w:pStyle w:val="Ttulo2"/>
       </w:pPr>
-      <w:bookmarkStart w:id="15" w:name="_Toc231090017"/>
+      <w:bookmarkStart w:id="15" w:name="_Toc231093551"/>
       <w:r>
         <w:t>1.5 Aspectos metodológicos y alcance</w:t>
       </w:r>
@@ -8592,7 +8592,7 @@
       <w:pPr>
         <w:pStyle w:val="Ttulo2"/>
       </w:pPr>
-      <w:bookmarkStart w:id="16" w:name="_Toc231090018"/>
+      <w:bookmarkStart w:id="16" w:name="_Toc231093552"/>
       <w:r>
         <w:t>1.6 Aportes esperados</w:t>
       </w:r>
@@ -8645,7 +8645,7 @@
       <w:pPr>
         <w:pStyle w:val="Ttulo2"/>
       </w:pPr>
-      <w:bookmarkStart w:id="17" w:name="_Toc231090019"/>
+      <w:bookmarkStart w:id="17" w:name="_Toc231093553"/>
       <w:r>
         <w:t>1.7 Estructura de la tesis</w:t>
       </w:r>
@@ -8686,7 +8686,7 @@
       <w:pPr>
         <w:pStyle w:val="Ttulo1"/>
       </w:pPr>
-      <w:bookmarkStart w:id="18" w:name="_Toc231090020"/>
+      <w:bookmarkStart w:id="18" w:name="_Toc231093554"/>
       <w:r>
         <w:lastRenderedPageBreak/>
         <w:t>Capítulo 2 — Marco teórico y revisión de literatura</w:t>
@@ -8697,7 +8697,7 @@
       <w:pPr>
         <w:pStyle w:val="Ttulo2"/>
       </w:pPr>
-      <w:bookmarkStart w:id="19" w:name="_Toc231090021"/>
+      <w:bookmarkStart w:id="19" w:name="_Toc231093555"/>
       <w:r>
         <w:t>2.1 Determinantes macroeconómicos de los retornos accionarios</w:t>
       </w:r>
@@ -8995,7 +8995,7 @@
       <w:pPr>
         <w:pStyle w:val="Ttulo2"/>
       </w:pPr>
-      <w:bookmarkStart w:id="20" w:name="_Toc231090022"/>
+      <w:bookmarkStart w:id="20" w:name="_Toc231093556"/>
       <w:r>
         <w:t>2.2 Precios de commodities y valoración de empresas mineras</w:t>
       </w:r>
@@ -9129,7 +9129,7 @@
       <w:pPr>
         <w:pStyle w:val="Ttulo2"/>
       </w:pPr>
-      <w:bookmarkStart w:id="21" w:name="_Toc231090023"/>
+      <w:bookmarkStart w:id="21" w:name="_Toc231093557"/>
       <w:r>
         <w:t>2.3 Tipo de cambio y exposición de empresas exportadoras</w:t>
       </w:r>
@@ -9223,7 +9223,7 @@
       <w:pPr>
         <w:pStyle w:val="Ttulo2"/>
       </w:pPr>
-      <w:bookmarkStart w:id="22" w:name="_Toc231090024"/>
+      <w:bookmarkStart w:id="22" w:name="_Toc231093558"/>
       <w:r>
         <w:t>2.4 Cobre, tipo de cambio y la economía chilena</w:t>
       </w:r>
@@ -9448,7 +9448,7 @@
       <w:pPr>
         <w:pStyle w:val="Ttulo2"/>
       </w:pPr>
-      <w:bookmarkStart w:id="23" w:name="_Toc231090025"/>
+      <w:bookmarkStart w:id="23" w:name="_Toc231093559"/>
       <w:r>
         <w:lastRenderedPageBreak/>
         <w:t>2.5 Eficiencia informacional y segmentación de mercados</w:t>
@@ -9589,7 +9589,7 @@
       <w:pPr>
         <w:pStyle w:val="Ttulo2"/>
       </w:pPr>
-      <w:bookmarkStart w:id="24" w:name="_Toc231090026"/>
+      <w:bookmarkStart w:id="24" w:name="_Toc231093560"/>
       <w:r>
         <w:t>2.6 Enfoques econométricos para la medición de impacto</w:t>
       </w:r>
@@ -9741,7 +9741,7 @@
       <w:pPr>
         <w:pStyle w:val="Ttulo2"/>
       </w:pPr>
-      <w:bookmarkStart w:id="25" w:name="_Toc231090027"/>
+      <w:bookmarkStart w:id="25" w:name="_Toc231093561"/>
       <w:r>
         <w:t>2.7 Síntesis e identificación del vacío de investigación</w:t>
       </w:r>
@@ -9866,7 +9866,7 @@
       <w:pPr>
         <w:pStyle w:val="Ttulo3"/>
       </w:pPr>
-      <w:bookmarkStart w:id="26" w:name="_Toc231090028"/>
+      <w:bookmarkStart w:id="26" w:name="_Toc231093562"/>
       <w:r>
         <w:t>Nota sobre la tabla de literatura</w:t>
       </w:r>
@@ -9896,7 +9896,7 @@
       <w:pPr>
         <w:pStyle w:val="Ttulo1"/>
       </w:pPr>
-      <w:bookmarkStart w:id="27" w:name="_Toc231090029"/>
+      <w:bookmarkStart w:id="27" w:name="_Toc231093563"/>
       <w:r>
         <w:lastRenderedPageBreak/>
         <w:t>Capítulo 3 — Datos y metodología</w:t>
@@ -9907,7 +9907,7 @@
       <w:pPr>
         <w:pStyle w:val="Ttulo2"/>
       </w:pPr>
-      <w:bookmarkStart w:id="28" w:name="_Toc231090030"/>
+      <w:bookmarkStart w:id="28" w:name="_Toc231093564"/>
       <w:r>
         <w:t xml:space="preserve">3.1 </w:t>
       </w:r>
@@ -10102,7 +10102,7 @@
       <w:pPr>
         <w:pStyle w:val="Ttulo2"/>
       </w:pPr>
-      <w:bookmarkStart w:id="29" w:name="_Toc231090031"/>
+      <w:bookmarkStart w:id="29" w:name="_Toc231093565"/>
       <w:r>
         <w:t>3.2 Variable dependiente</w:t>
       </w:r>
@@ -10164,7 +10164,7 @@
       <w:pPr>
         <w:pStyle w:val="Ttulo2"/>
       </w:pPr>
-      <w:bookmarkStart w:id="30" w:name="_Toc231090032"/>
+      <w:bookmarkStart w:id="30" w:name="_Toc231093566"/>
       <w:r>
         <w:t>3.3 Variables explicativas</w:t>
       </w:r>
@@ -10231,7 +10231,7 @@
       <w:pPr>
         <w:pStyle w:val="Ttulo2"/>
       </w:pPr>
-      <w:bookmarkStart w:id="31" w:name="_Toc231090033"/>
+      <w:bookmarkStart w:id="31" w:name="_Toc231093567"/>
       <w:r>
         <w:t>3.4 Tratamiento de datos y frecuencias mixtas</w:t>
       </w:r>
@@ -10288,7 +10288,7 @@
       <w:pPr>
         <w:pStyle w:val="Ttulo2"/>
       </w:pPr>
-      <w:bookmarkStart w:id="32" w:name="_Toc231090034"/>
+      <w:bookmarkStart w:id="32" w:name="_Toc231093568"/>
       <w:r>
         <w:t>3.5 Datación de las fases del ciclo del cobre</w:t>
       </w:r>
@@ -10354,7 +10354,7 @@
       <w:pPr>
         <w:pStyle w:val="Ttulo2"/>
       </w:pPr>
-      <w:bookmarkStart w:id="33" w:name="_Toc231090035"/>
+      <w:bookmarkStart w:id="33" w:name="_Toc231093569"/>
       <w:r>
         <w:lastRenderedPageBreak/>
         <w:t>3.6 Estrategia econométrica</w:t>
@@ -10365,7 +10365,7 @@
       <w:pPr>
         <w:pStyle w:val="Ttulo3"/>
       </w:pPr>
-      <w:bookmarkStart w:id="34" w:name="_Toc231090036"/>
+      <w:bookmarkStart w:id="34" w:name="_Toc231093570"/>
       <w:r>
         <w:t>3.6.1 Estacionariedad y orden de integración (OE1)</w:t>
       </w:r>
@@ -10408,7 +10408,7 @@
       <w:pPr>
         <w:pStyle w:val="Ttulo3"/>
       </w:pPr>
-      <w:bookmarkStart w:id="35" w:name="_Toc231090037"/>
+      <w:bookmarkStart w:id="35" w:name="_Toc231093571"/>
       <w:r>
         <w:t>3.6.2 Modelo de impacto: panel de efectos fijos (OE2)</w:t>
       </w:r>
@@ -10499,7 +10499,7 @@
       <w:pPr>
         <w:pStyle w:val="Ttulo3"/>
       </w:pPr>
-      <w:bookmarkStart w:id="36" w:name="_Toc231090038"/>
+      <w:bookmarkStart w:id="36" w:name="_Toc231093572"/>
       <w:r>
         <w:t>3.6.3 Relaciones de largo plazo: cointegración (OE3)</w:t>
       </w:r>
@@ -10600,7 +10600,7 @@
       <w:pPr>
         <w:pStyle w:val="Ttulo3"/>
       </w:pPr>
-      <w:bookmarkStart w:id="37" w:name="_Toc231090039"/>
+      <w:bookmarkStart w:id="37" w:name="_Toc231093573"/>
       <w:r>
         <w:t>3.6.4 Dinámica de shocks: VAR, impulso-respuesta y descomposición de varianza (OE4)</w:t>
       </w:r>
@@ -10720,7 +10720,7 @@
       <w:pPr>
         <w:pStyle w:val="Ttulo3"/>
       </w:pPr>
-      <w:bookmarkStart w:id="38" w:name="_Toc231090040"/>
+      <w:bookmarkStart w:id="38" w:name="_Toc231093574"/>
       <w:r>
         <w:t>3.6.5 Estabilidad por fases del ciclo (OE5)</w:t>
       </w:r>
@@ -10766,7 +10766,7 @@
       <w:pPr>
         <w:pStyle w:val="Ttulo3"/>
       </w:pPr>
-      <w:bookmarkStart w:id="39" w:name="_Toc231090041"/>
+      <w:bookmarkStart w:id="39" w:name="_Toc231093575"/>
       <w:r>
         <w:t>3.6.6 Comparación entre mercados: triangulación (OE6)</w:t>
       </w:r>
@@ -10817,7 +10817,7 @@
       <w:pPr>
         <w:pStyle w:val="Ttulo2"/>
       </w:pPr>
-      <w:bookmarkStart w:id="40" w:name="_Toc231090042"/>
+      <w:bookmarkStart w:id="40" w:name="_Toc231093576"/>
       <w:r>
         <w:t xml:space="preserve">3.7 </w:t>
       </w:r>
@@ -10870,7 +10870,7 @@
       <w:pPr>
         <w:pStyle w:val="Ttulo3"/>
       </w:pPr>
-      <w:bookmarkStart w:id="41" w:name="_Toc231090043"/>
+      <w:bookmarkStart w:id="41" w:name="_Toc231093577"/>
       <w:r>
         <w:t>Tabla 3.1 — Definición operativa de variables (resumen)</w:t>
       </w:r>
@@ -10882,7 +10882,7 @@
         <w:spacing w:before="40" w:after="40"/>
         <w:jc w:val="center"/>
       </w:pPr>
-      <w:bookmarkStart w:id="42" w:name="_Toc231090073"/>
+      <w:bookmarkStart w:id="42" w:name="_Toc231093607"/>
       <w:r>
         <w:rPr>
           <w:i w:val="0"/>
@@ -12851,7 +12851,7 @@
       <w:pPr>
         <w:pStyle w:val="Ttulo1"/>
       </w:pPr>
-      <w:bookmarkStart w:id="43" w:name="_Toc231090044"/>
+      <w:bookmarkStart w:id="43" w:name="_Toc231093578"/>
       <w:r>
         <w:lastRenderedPageBreak/>
         <w:t>Capítulo 4 — Resultados y discusión</w:t>
@@ -12862,7 +12862,7 @@
       <w:pPr>
         <w:pStyle w:val="Ttulo2"/>
       </w:pPr>
-      <w:bookmarkStart w:id="44" w:name="_Toc231090045"/>
+      <w:bookmarkStart w:id="44" w:name="_Toc231093579"/>
       <w:r>
         <w:t>4.1 Análisis descriptivo y propiedades de las series (OE1)</w:t>
       </w:r>
@@ -13092,7 +13092,7 @@
       <w:pPr>
         <w:pStyle w:val="Ttulo2"/>
       </w:pPr>
-      <w:bookmarkStart w:id="45" w:name="_Toc231090046"/>
+      <w:bookmarkStart w:id="45" w:name="_Toc231093580"/>
       <w:r>
         <w:t>4.2 Determinantes de los retornos: global vs local (OE2)</w:t>
       </w:r>
@@ -13114,7 +13114,7 @@
         <w:spacing w:before="40" w:after="40"/>
         <w:jc w:val="center"/>
       </w:pPr>
-      <w:bookmarkStart w:id="46" w:name="_Toc231090074"/>
+      <w:bookmarkStart w:id="46" w:name="_Toc231093608"/>
       <w:r>
         <w:rPr>
           <w:i w:val="0"/>
@@ -13920,7 +13920,7 @@
           <w:noProof/>
         </w:rPr>
         <w:drawing>
-          <wp:inline distT="0" distB="0" distL="0" distR="0" wp14:anchorId="63687369" wp14:editId="39206E25">
+          <wp:inline distT="0" distB="0" distL="0" distR="0" wp14:anchorId="794C07EB" wp14:editId="74D8B7B5">
             <wp:extent cx="5212080" cy="2833680"/>
             <wp:effectExtent l="0" t="0" r="0" b="0"/>
             <wp:docPr id="1" name="Picture 1"/>
@@ -13962,7 +13962,7 @@
         <w:spacing w:before="160" w:after="200"/>
         <w:jc w:val="center"/>
       </w:pPr>
-      <w:bookmarkStart w:id="47" w:name="_Toc231090087"/>
+      <w:bookmarkStart w:id="47" w:name="_Toc231093621"/>
       <w:r>
         <w:rPr>
           <w:i w:val="0"/>
@@ -14068,7 +14068,7 @@
       <w:pPr>
         <w:pStyle w:val="Ttulo2"/>
       </w:pPr>
-      <w:bookmarkStart w:id="48" w:name="_Toc231090047"/>
+      <w:bookmarkStart w:id="48" w:name="_Toc231093581"/>
       <w:r>
         <w:t>4.3 Relaciones de largo plazo (OE3)</w:t>
       </w:r>
@@ -14232,7 +14232,7 @@
       <w:pPr>
         <w:pStyle w:val="Ttulo2"/>
       </w:pPr>
-      <w:bookmarkStart w:id="49" w:name="_Toc231090048"/>
+      <w:bookmarkStart w:id="49" w:name="_Toc231093582"/>
       <w:r>
         <w:t>4.4 Dinámica de shocks (OE4)</w:t>
       </w:r>
@@ -14254,7 +14254,7 @@
         <w:spacing w:before="40" w:after="40"/>
         <w:jc w:val="center"/>
       </w:pPr>
-      <w:bookmarkStart w:id="50" w:name="_Toc231090075"/>
+      <w:bookmarkStart w:id="50" w:name="_Toc231093609"/>
       <w:r>
         <w:rPr>
           <w:i w:val="0"/>
@@ -14701,7 +14701,7 @@
           <w:noProof/>
         </w:rPr>
         <w:drawing>
-          <wp:inline distT="0" distB="0" distL="0" distR="0" wp14:anchorId="2C2E439B" wp14:editId="05E453B3">
+          <wp:inline distT="0" distB="0" distL="0" distR="0" wp14:anchorId="390C85FA" wp14:editId="307C9EF7">
             <wp:extent cx="5212080" cy="3890356"/>
             <wp:effectExtent l="0" t="0" r="0" b="0"/>
             <wp:docPr id="2" name="Picture 2"/>
@@ -14743,7 +14743,7 @@
         <w:spacing w:before="160" w:after="200"/>
         <w:jc w:val="center"/>
       </w:pPr>
-      <w:bookmarkStart w:id="51" w:name="_Toc231090088"/>
+      <w:bookmarkStart w:id="51" w:name="_Toc231093622"/>
       <w:r>
         <w:rPr>
           <w:i w:val="0"/>
@@ -14813,8 +14813,8 @@
           <w:noProof/>
         </w:rPr>
         <w:drawing>
-          <wp:inline distT="0" distB="0" distL="0" distR="0" wp14:anchorId="236BAAF5" wp14:editId="748A43EE">
-            <wp:extent cx="5212080" cy="2531582"/>
+          <wp:inline distT="0" distB="0" distL="0" distR="0" wp14:anchorId="37EB26B9" wp14:editId="53395B80">
+            <wp:extent cx="5212080" cy="2478330"/>
             <wp:effectExtent l="0" t="0" r="0" b="0"/>
             <wp:docPr id="3" name="Picture 3"/>
             <wp:cNvGraphicFramePr>
@@ -14836,7 +14836,7 @@
                   <pic:spPr>
                     <a:xfrm>
                       <a:off x="0" y="0"/>
-                      <a:ext cx="5212080" cy="2531582"/>
+                      <a:ext cx="5212080" cy="2478330"/>
                     </a:xfrm>
                     <a:prstGeom prst="rect">
                       <a:avLst/>
@@ -14855,7 +14855,7 @@
         <w:spacing w:before="160" w:after="200"/>
         <w:jc w:val="center"/>
       </w:pPr>
-      <w:bookmarkStart w:id="52" w:name="_Toc231090089"/>
+      <w:bookmarkStart w:id="52" w:name="_Toc231093623"/>
       <w:r>
         <w:rPr>
           <w:i w:val="0"/>
@@ -14889,7 +14889,7 @@
       <w:pPr>
         <w:pStyle w:val="Ttulo2"/>
       </w:pPr>
-      <w:bookmarkStart w:id="53" w:name="_Toc231090049"/>
+      <w:bookmarkStart w:id="53" w:name="_Toc231093583"/>
       <w:r>
         <w:t>4.5 Estabilidad por fases del ciclo del cobre (OE5)</w:t>
       </w:r>
@@ -14997,7 +14997,7 @@
           <w:noProof/>
         </w:rPr>
         <w:drawing>
-          <wp:inline distT="0" distB="0" distL="0" distR="0" wp14:anchorId="775CF3E0" wp14:editId="4404C04D">
+          <wp:inline distT="0" distB="0" distL="0" distR="0" wp14:anchorId="5A78249A" wp14:editId="4E20FF63">
             <wp:extent cx="5212080" cy="2366710"/>
             <wp:effectExtent l="0" t="0" r="0" b="0"/>
             <wp:docPr id="4" name="Picture 4"/>
@@ -15039,7 +15039,7 @@
         <w:spacing w:before="160" w:after="200"/>
         <w:jc w:val="center"/>
       </w:pPr>
-      <w:bookmarkStart w:id="54" w:name="_Toc231090090"/>
+      <w:bookmarkStart w:id="54" w:name="_Toc231093624"/>
       <w:r>
         <w:rPr>
           <w:i w:val="0"/>
@@ -15073,7 +15073,7 @@
       <w:pPr>
         <w:pStyle w:val="Ttulo2"/>
       </w:pPr>
-      <w:bookmarkStart w:id="55" w:name="_Toc231090050"/>
+      <w:bookmarkStart w:id="55" w:name="_Toc231093584"/>
       <w:r>
         <w:t>4.6 Comparación entre mercados: triangulación (OE6)</w:t>
       </w:r>
@@ -15095,7 +15095,7 @@
         <w:spacing w:before="40" w:after="40"/>
         <w:jc w:val="center"/>
       </w:pPr>
-      <w:bookmarkStart w:id="56" w:name="_Toc231090076"/>
+      <w:bookmarkStart w:id="56" w:name="_Toc231093610"/>
       <w:r>
         <w:rPr>
           <w:i w:val="0"/>
@@ -15720,7 +15720,7 @@
           <w:noProof/>
         </w:rPr>
         <w:drawing>
-          <wp:inline distT="0" distB="0" distL="0" distR="0" wp14:anchorId="0552216B" wp14:editId="3AD8B860">
+          <wp:inline distT="0" distB="0" distL="0" distR="0" wp14:anchorId="62F251D4" wp14:editId="053A1C31">
             <wp:extent cx="5212080" cy="2626097"/>
             <wp:effectExtent l="0" t="0" r="0" b="0"/>
             <wp:docPr id="5" name="Picture 5"/>
@@ -15762,7 +15762,7 @@
         <w:spacing w:before="160" w:after="200"/>
         <w:jc w:val="center"/>
       </w:pPr>
-      <w:bookmarkStart w:id="57" w:name="_Toc231090091"/>
+      <w:bookmarkStart w:id="57" w:name="_Toc231093625"/>
       <w:r>
         <w:rPr>
           <w:i w:val="0"/>
@@ -15907,7 +15907,7 @@
       <w:pPr>
         <w:pStyle w:val="Ttulo2"/>
       </w:pPr>
-      <w:bookmarkStart w:id="58" w:name="_Toc231090051"/>
+      <w:bookmarkStart w:id="58" w:name="_Toc231093585"/>
       <w:r>
         <w:t>4.7 Diagnósticos y robustez</w:t>
       </w:r>
@@ -16267,8 +16267,8 @@
         </w:rPr>
         <w:lastRenderedPageBreak/>
         <w:drawing>
-          <wp:inline distT="0" distB="0" distL="0" distR="0" wp14:anchorId="2725FEB0" wp14:editId="77A8682C">
-            <wp:extent cx="5212080" cy="2531582"/>
+          <wp:inline distT="0" distB="0" distL="0" distR="0" wp14:anchorId="2158460A" wp14:editId="5283B6FD">
+            <wp:extent cx="5212080" cy="2446436"/>
             <wp:effectExtent l="0" t="0" r="0" b="0"/>
             <wp:docPr id="6" name="Picture 6"/>
             <wp:cNvGraphicFramePr>
@@ -16290,7 +16290,7 @@
                   <pic:spPr>
                     <a:xfrm>
                       <a:off x="0" y="0"/>
-                      <a:ext cx="5212080" cy="2531582"/>
+                      <a:ext cx="5212080" cy="2446436"/>
                     </a:xfrm>
                     <a:prstGeom prst="rect">
                       <a:avLst/>
@@ -16309,7 +16309,7 @@
         <w:spacing w:before="160" w:after="200"/>
         <w:jc w:val="center"/>
       </w:pPr>
-      <w:bookmarkStart w:id="59" w:name="_Toc231090092"/>
+      <w:bookmarkStart w:id="59" w:name="_Toc231093626"/>
       <w:r>
         <w:rPr>
           <w:i w:val="0"/>
@@ -16343,7 +16343,7 @@
       <w:pPr>
         <w:pStyle w:val="Ttulo2"/>
       </w:pPr>
-      <w:bookmarkStart w:id="60" w:name="_Toc231090052"/>
+      <w:bookmarkStart w:id="60" w:name="_Toc231093586"/>
       <w:r>
         <w:t>4.8 Discusión integrada</w:t>
       </w:r>
@@ -16524,7 +16524,7 @@
       <w:pPr>
         <w:pStyle w:val="Ttulo1"/>
       </w:pPr>
-      <w:bookmarkStart w:id="61" w:name="_Toc231090053"/>
+      <w:bookmarkStart w:id="61" w:name="_Toc231093587"/>
       <w:r>
         <w:lastRenderedPageBreak/>
         <w:t>Capítulo 5 — Conclusiones</w:t>
@@ -16535,7 +16535,7 @@
       <w:pPr>
         <w:pStyle w:val="Ttulo2"/>
       </w:pPr>
-      <w:bookmarkStart w:id="62" w:name="_Toc231090054"/>
+      <w:bookmarkStart w:id="62" w:name="_Toc231093588"/>
       <w:r>
         <w:t>5.1 Síntesis de los hallazgos</w:t>
       </w:r>
@@ -16606,31 +16606,104 @@
     </w:p>
     <w:p>
       <w:r>
-        <w:t>La dimensión comparativa, distintiva de este estudio, aporta una primera señal de **transmisión</w:t>
-      </w:r>
-    </w:p>
-    <w:p>
-      <w:r>
-        <w:t>diferenciada** entre mercados: la sensibilidad al cobre es comparable entre el cobre puro</w:t>
-      </w:r>
-    </w:p>
-    <w:p>
-      <w:r>
-        <w:t>internacional y el local, mientras que la fracción de varianza atribuida a shocks globales tiende</w:t>
-      </w:r>
-    </w:p>
-    <w:p>
-      <w:r>
-        <w:t>a ser mayor en el mercado internacional, en la dirección prevista por la hipótesis de segmentación.</w:t>
+        <w:t>La dimensión comparativa, distintiva de este estudio, aporta evidencia de **transmisión</w:t>
+      </w:r>
+    </w:p>
+    <w:p>
+      <w:r>
+        <w:t>diferenciada** entre mercados: la prueba formal de igualdad de coeficientes muestra que la</w:t>
+      </w:r>
+    </w:p>
+    <w:p>
+      <w:r>
+        <w:t>sensibilidad al precio del cobre es **significativamente mayor en el mercado internacional que en</w:t>
+      </w:r>
+    </w:p>
+    <w:p>
+      <w:r>
+        <w:t>el chileno**, en la dirección prevista por la hipótesis de segmentación de mercados. El análisis de</w:t>
+      </w:r>
+    </w:p>
+    <w:p>
+      <w:r>
+        <w:t>largo plazo, por su parte, revela que la relación de equilibrio entre el valor del sector y el cobre</w:t>
+      </w:r>
+    </w:p>
+    <w:p>
+      <w:r>
+        <w:rPr>
+          <w:b/>
+        </w:rPr>
+        <w:lastRenderedPageBreak/>
+        <w:t>existe pero se reconfiguró con la crisis financiera de 2008</w:t>
+      </w:r>
+      <w:r>
+        <w:t>, hallazgo que solo emerge al admitir</w:t>
+      </w:r>
+    </w:p>
+    <w:p>
+      <w:r>
+        <w:t>un quiebre estructural en la prueba de cointegración. La volatilidad de los retornos exhibe además</w:t>
+      </w:r>
+    </w:p>
+    <w:p>
+      <w:r>
+        <w:t xml:space="preserve">un </w:t>
+      </w:r>
+      <w:r>
+        <w:rPr>
+          <w:b/>
+        </w:rPr>
+        <w:t>efecto apalancamiento</w:t>
+      </w:r>
+      <w:r>
+        <w:t xml:space="preserve"> —las caídas elevan la volatilidad más que las alzas—. Finalmente, una</w:t>
+      </w:r>
+    </w:p>
+    <w:p>
+      <w:r>
+        <w:t xml:space="preserve">extensión predictiva muestra que, si bien los factores macroeconómicos </w:t>
+      </w:r>
+      <w:r>
+        <w:rPr>
+          <w:b/>
+        </w:rPr>
+        <w:t>explican</w:t>
+      </w:r>
+      <w:r>
+        <w:t xml:space="preserve"> el retorno</w:t>
+      </w:r>
+    </w:p>
+    <w:p>
+      <w:r>
+        <w:t xml:space="preserve">contemporáneo del cobre, apenas lo </w:t>
+      </w:r>
+      <w:r>
+        <w:rPr>
+          <w:b/>
+        </w:rPr>
+        <w:t>anticipan</w:t>
+      </w:r>
+      <w:r>
+        <w:t xml:space="preserve"> a un mes, resultado coherente con la hipótesis de</w:t>
+      </w:r>
+    </w:p>
+    <w:p>
+      <w:r>
+        <w:t>eficiencia de mercado en su forma débil y que respalda el enfoque explicativo —y no predictivo—</w:t>
+      </w:r>
+    </w:p>
+    <w:p>
+      <w:r>
+        <w:t>adoptado.</w:t>
       </w:r>
     </w:p>
     <w:p>
       <w:pPr>
         <w:pStyle w:val="Ttulo2"/>
       </w:pPr>
-      <w:bookmarkStart w:id="63" w:name="_Toc231090055"/>
-      <w:r>
-        <w:lastRenderedPageBreak/>
+      <w:bookmarkStart w:id="63" w:name="_Toc231093589"/>
+      <w:r>
         <w:t>5.2 Implicancias</w:t>
       </w:r>
       <w:bookmarkEnd w:id="63"/>
@@ -16701,7 +16774,7 @@
       <w:pPr>
         <w:pStyle w:val="Ttulo2"/>
       </w:pPr>
-      <w:bookmarkStart w:id="64" w:name="_Toc231090056"/>
+      <w:bookmarkStart w:id="64" w:name="_Toc231093590"/>
       <w:r>
         <w:t>5.3 Limitaciones</w:t>
       </w:r>
@@ -16723,38 +16796,69 @@
     </w:p>
     <w:p>
       <w:r>
-        <w:t>chileno, abordada mediante el diseño de triangulación. Los resultados presentados son</w:t>
-      </w:r>
-    </w:p>
-    <w:p>
+        <w:lastRenderedPageBreak/>
+        <w:t>chileno, abordada mediante el diseño de triangulación. Dado que la muestra del mercado chileno</w:t>
+      </w:r>
+    </w:p>
+    <w:p>
+      <w:r>
+        <w:t>corresponde al sector minero (de composición mixta) mientras que la internacional es de cobre puro,</w:t>
+      </w:r>
+    </w:p>
+    <w:p>
+      <w:r>
+        <w:t>parte de la diferencia de sensibilidad entre mercados podría reflejar la composición por commodity</w:t>
+      </w:r>
+    </w:p>
+    <w:p>
+      <w:r>
+        <w:t>además del efecto de mercado; el control por el precio de cada commodity mitiga —pero no elimina</w:t>
+      </w:r>
+    </w:p>
+    <w:p>
+      <w:r>
+        <w:t xml:space="preserve">por completo— esta consideración. Asimismo, los resultados conservan un carácter </w:t>
+      </w:r>
       <w:r>
         <w:rPr>
           <w:b/>
         </w:rPr>
-        <w:t>preliminares</w:t>
-      </w:r>
-      <w:r>
-        <w:t xml:space="preserve">: pendientes la </w:t>
-      </w:r>
-      <w:r>
-        <w:t>incorporación del EMBI y de los controles a nivel de empresa, la</w:t>
-      </w:r>
-    </w:p>
-    <w:p>
-      <w:r>
-        <w:t>resolución del orden de integración del tipo de cambio en presencia de quiebres, y la batería</w:t>
-      </w:r>
-    </w:p>
-    <w:p>
-      <w:r>
-        <w:t>completa de diagnósticos y robustez.</w:t>
+        <w:t>provisional</w:t>
+      </w:r>
+      <w:r>
+        <w:t xml:space="preserve"> en</w:t>
+      </w:r>
+    </w:p>
+    <w:p>
+      <w:r>
+        <w:t>tanto resta incorporar el EMBI como medida de riesgo soberano local y los controles a nivel de</w:t>
+      </w:r>
+    </w:p>
+    <w:p>
+      <w:r>
+        <w:t>empresa (apalancamiento, tamaño, liquidez), que podrían afinar las magnitudes estimadas. La batería</w:t>
+      </w:r>
+    </w:p>
+    <w:p>
+      <w:r>
+        <w:t>de diagnósticos y de robustez —dependencia de sección cruzada, raíz unitaria en panel, cointegración</w:t>
+      </w:r>
+    </w:p>
+    <w:p>
+      <w:r>
+        <w:t>con quiebre, volatilidad condicional, corrección por pruebas múltiples y submuestras— ya fue, en</w:t>
+      </w:r>
+    </w:p>
+    <w:p>
+      <w:r>
+        <w:t>cambio, ejecutada.</w:t>
       </w:r>
     </w:p>
     <w:p>
       <w:pPr>
         <w:pStyle w:val="Ttulo2"/>
       </w:pPr>
-      <w:bookmarkStart w:id="65" w:name="_Toc231090057"/>
+      <w:bookmarkStart w:id="65" w:name="_Toc231093591"/>
       <w:r>
         <w:t>5.4 Líneas futuras de investigación</w:t>
       </w:r>
@@ -16762,30 +16866,47 @@
     </w:p>
     <w:p>
       <w:r>
-        <w:t>Se proponen como extensiones: (i) la estimación formal de la asimetría de régimen mediante modelos</w:t>
-      </w:r>
-    </w:p>
-    <w:p>
-      <w:r>
-        <w:t>de cambio de Markov; (ii) la incorporación de la volatilidad condicional (GARCH) cuando esta sea</w:t>
-      </w:r>
-    </w:p>
-    <w:p>
-      <w:r>
-        <w:t xml:space="preserve">central; (iii) el análisis a frecuencia diaria/semanal para la dinámica de </w:t>
-      </w:r>
-      <w:r>
-        <w:t>corto plazo; y (iv) la</w:t>
-      </w:r>
-    </w:p>
-    <w:p>
-      <w:r>
-        <w:t>ampliación del análisis de segmentación con pruebas formales de integración de mercados.</w:t>
+        <w:t>Se proponen como extensiones: (i) la incorporación del EMBI y de los controles a nivel de empresa</w:t>
+      </w:r>
+    </w:p>
+    <w:p>
+      <w:r>
+        <w:t>para consolidar las magnitudes; (ii) la estimación de la asimetría de régimen mediante modelos de</w:t>
+      </w:r>
+    </w:p>
+    <w:p>
+      <w:r>
+        <w:t>cambio de Markov, complementaria al fechado por puntos de giro empleado aquí; (iii) el análisis a</w:t>
       </w:r>
     </w:p>
     <w:p>
       <w:r>
         <w:lastRenderedPageBreak/>
+        <w:t>frecuencia diaria o semanal para capturar la dinámica de corto plazo y la microestructura; (iv) la</w:t>
+      </w:r>
+    </w:p>
+    <w:p>
+      <w:r>
+        <w:t>ampliación del análisis de segmentación con medidas formales de integración de mercados variable en</w:t>
+      </w:r>
+    </w:p>
+    <w:p>
+      <w:r>
+        <w:t>el tiempo (Bekaert y Harvey, 1995); y (v) la identificación de la naturaleza de los shocks del cobre</w:t>
+      </w:r>
+    </w:p>
+    <w:p>
+      <w:r>
+        <w:t>—demanda versus oferta— siguiendo a Pedersen (2015), que la evidencia sugiere relevante para la</w:t>
+      </w:r>
+    </w:p>
+    <w:p>
+      <w:r>
+        <w:t>magnitud y el signo de la respuesta.</w:t>
+      </w:r>
+    </w:p>
+    <w:p>
+      <w:r>
         <w:br w:type="page"/>
       </w:r>
     </w:p>
@@ -16793,7 +16914,7 @@
       <w:pPr>
         <w:pStyle w:val="Ttulo1"/>
       </w:pPr>
-      <w:bookmarkStart w:id="66" w:name="_Toc231090058"/>
+      <w:bookmarkStart w:id="66" w:name="_Toc231093592"/>
       <w:r>
         <w:lastRenderedPageBreak/>
         <w:t>Referencias</w:t>
@@ -16807,7 +16928,10 @@
     </w:p>
     <w:p>
       <w:r>
-        <w:t>Bai, J., &amp; Perron, P. (2003). Computation and analysis of multiple structural change models. *Journal of Applied Econometrics*, 18(1), 1–22.</w:t>
+        <w:t xml:space="preserve">Bai, J., &amp; Perron, P. (2003). </w:t>
+      </w:r>
+      <w:r>
+        <w:t>Computation and analysis of multiple structural change models. *Journal of Applied Econometrics*, 18(1), 1–22.</w:t>
       </w:r>
     </w:p>
     <w:p>
@@ -16893,10 +17017,7 @@
     </w:p>
     <w:p>
       <w:r>
-        <w:t xml:space="preserve">Fama, E. F. (1981). Stock returns, real activity, inflation, and money. *The American Economic Review*, 71(4), </w:t>
-      </w:r>
-      <w:r>
-        <w:t>545–565.</w:t>
+        <w:t>Fama, E. F. (1981). Stock returns, real activity, inflation, and money. *The American Economic Review*, 71(4), 545–565.</w:t>
       </w:r>
     </w:p>
     <w:p>
@@ -16926,7 +17047,10 @@
     </w:p>
     <w:p>
       <w:r>
-        <w:t>Johansen, S. (1988). Statistical analysis of cointegration vectors. *Journal of Economic Dynamics and Control*, 12(2–3), 231–254.</w:t>
+        <w:t xml:space="preserve">Johansen, S. </w:t>
+      </w:r>
+      <w:r>
+        <w:t>(1988). Statistical analysis of cointegration vectors. *Journal of Economic Dynamics and Control*, 12(2–3), 231–254.</w:t>
       </w:r>
     </w:p>
     <w:p>
@@ -16952,7 +17076,10 @@
     </w:p>
     <w:p>
       <w:r>
-        <w:t>Pedersen, M. (2015). *The impact of commodity price shocks in a major producing economy: The case of copper and Chile* (Working Paper N°753). Banco Central de Chile.</w:t>
+        <w:t xml:space="preserve">Pedersen, M. (2015). *The impact of </w:t>
+      </w:r>
+      <w:r>
+        <w:t>commodity price shocks in a major producing economy: The case of copper and Chile* (Working Paper N°753). Banco Central de Chile.</w:t>
       </w:r>
     </w:p>
     <w:p>
@@ -17030,7 +17157,7 @@
       <w:pPr>
         <w:pStyle w:val="Ttulo1"/>
       </w:pPr>
-      <w:bookmarkStart w:id="67" w:name="_Toc231090059"/>
+      <w:bookmarkStart w:id="67" w:name="_Toc231093593"/>
       <w:r>
         <w:lastRenderedPageBreak/>
         <w:t>Anexos</w:t>
@@ -17041,7 +17168,7 @@
       <w:pPr>
         <w:pStyle w:val="Ttulo2"/>
       </w:pPr>
-      <w:bookmarkStart w:id="68" w:name="_Toc231090060"/>
+      <w:bookmarkStart w:id="68" w:name="_Toc231093594"/>
       <w:r>
         <w:t>Anexo A. Estadística descriptiva</w:t>
       </w:r>
@@ -17053,7 +17180,7 @@
         <w:spacing w:before="40" w:after="40"/>
         <w:jc w:val="center"/>
       </w:pPr>
-      <w:bookmarkStart w:id="69" w:name="_Toc231090077"/>
+      <w:bookmarkStart w:id="69" w:name="_Toc231093611"/>
       <w:r>
         <w:rPr>
           <w:i w:val="0"/>
@@ -19249,7 +19376,7 @@
       <w:pPr>
         <w:pStyle w:val="Ttulo2"/>
       </w:pPr>
-      <w:bookmarkStart w:id="70" w:name="_Toc231090061"/>
+      <w:bookmarkStart w:id="70" w:name="_Toc231093595"/>
       <w:r>
         <w:t>Anexo B. Matriz de correlación de los factores</w:t>
       </w:r>
@@ -19261,7 +19388,7 @@
         <w:spacing w:before="40" w:after="40"/>
         <w:jc w:val="center"/>
       </w:pPr>
-      <w:bookmarkStart w:id="71" w:name="_Toc231090078"/>
+      <w:bookmarkStart w:id="71" w:name="_Toc231093612"/>
       <w:r>
         <w:rPr>
           <w:i w:val="0"/>
@@ -21066,13 +21193,7 @@
               <w:rPr>
                 <w:sz w:val="20"/>
               </w:rPr>
-              <w:t xml:space="preserve">Δ </w:t>
-            </w:r>
-            <w:r>
-              <w:rPr>
-                <w:sz w:val="20"/>
-              </w:rPr>
-              <w:t>Actividad local</w:t>
+              <w:t>Δ Actividad local</w:t>
             </w:r>
           </w:p>
         </w:tc>
@@ -21295,7 +21416,7 @@
       <w:pPr>
         <w:pStyle w:val="Ttulo2"/>
       </w:pPr>
-      <w:bookmarkStart w:id="72" w:name="_Toc231090062"/>
+      <w:bookmarkStart w:id="72" w:name="_Toc231093596"/>
       <w:r>
         <w:t>Anexo C. Pruebas de raíz unitaria y orden de integración</w:t>
       </w:r>
@@ -21307,7 +21428,7 @@
         <w:spacing w:before="40" w:after="40"/>
         <w:jc w:val="center"/>
       </w:pPr>
-      <w:bookmarkStart w:id="73" w:name="_Toc231090079"/>
+      <w:bookmarkStart w:id="73" w:name="_Toc231093613"/>
       <w:r>
         <w:rPr>
           <w:i w:val="0"/>
@@ -22135,7 +22256,7 @@
       <w:pPr>
         <w:pStyle w:val="Ttulo2"/>
       </w:pPr>
-      <w:bookmarkStart w:id="74" w:name="_Toc231090063"/>
+      <w:bookmarkStart w:id="74" w:name="_Toc231093597"/>
       <w:r>
         <w:t>Anexo D. Resultados completos del modelo de panel</w:t>
       </w:r>
@@ -22145,7 +22266,7 @@
       <w:pPr>
         <w:pStyle w:val="Ttulo3"/>
       </w:pPr>
-      <w:bookmarkStart w:id="75" w:name="_Toc231090064"/>
+      <w:bookmarkStart w:id="75" w:name="_Toc231093598"/>
       <w:r>
         <w:t>D.1 Muestra B — cobre, mercado internacional</w:t>
       </w:r>
@@ -22157,7 +22278,7 @@
         <w:spacing w:before="40" w:after="40"/>
         <w:jc w:val="center"/>
       </w:pPr>
-      <w:bookmarkStart w:id="76" w:name="_Toc231090080"/>
+      <w:bookmarkStart w:id="76" w:name="_Toc231093614"/>
       <w:r>
         <w:rPr>
           <w:i w:val="0"/>
@@ -23338,7 +23459,7 @@
       <w:pPr>
         <w:pStyle w:val="Ttulo3"/>
       </w:pPr>
-      <w:bookmarkStart w:id="77" w:name="_Toc231090065"/>
+      <w:bookmarkStart w:id="77" w:name="_Toc231093599"/>
       <w:r>
         <w:t>D.2 Muestra A — cobre, mercado chileno (Pucobre)</w:t>
       </w:r>
@@ -23350,7 +23471,7 @@
         <w:spacing w:before="40" w:after="40"/>
         <w:jc w:val="center"/>
       </w:pPr>
-      <w:bookmarkStart w:id="78" w:name="_Toc231090081"/>
+      <w:bookmarkStart w:id="78" w:name="_Toc231093615"/>
       <w:r>
         <w:rPr>
           <w:i w:val="0"/>
@@ -24525,7 +24646,7 @@
       <w:pPr>
         <w:pStyle w:val="Ttulo3"/>
       </w:pPr>
-      <w:bookmarkStart w:id="79" w:name="_Toc231090066"/>
+      <w:bookmarkStart w:id="79" w:name="_Toc231093600"/>
       <w:r>
         <w:t xml:space="preserve">D.3 </w:t>
       </w:r>
@@ -24540,7 +24661,7 @@
         <w:spacing w:before="40" w:after="40"/>
         <w:jc w:val="center"/>
       </w:pPr>
-      <w:bookmarkStart w:id="80" w:name="_Toc231090082"/>
+      <w:bookmarkStart w:id="80" w:name="_Toc231093616"/>
       <w:r>
         <w:rPr>
           <w:i w:val="0"/>
@@ -25715,7 +25836,7 @@
       <w:pPr>
         <w:pStyle w:val="Ttulo2"/>
       </w:pPr>
-      <w:bookmarkStart w:id="81" w:name="_Toc231090067"/>
+      <w:bookmarkStart w:id="81" w:name="_Toc231093601"/>
       <w:r>
         <w:lastRenderedPageBreak/>
         <w:t xml:space="preserve">Anexo E. </w:t>
@@ -25731,7 +25852,7 @@
         <w:spacing w:before="40" w:after="40"/>
         <w:jc w:val="center"/>
       </w:pPr>
-      <w:bookmarkStart w:id="82" w:name="_Toc231090083"/>
+      <w:bookmarkStart w:id="82" w:name="_Toc231093617"/>
       <w:r>
         <w:rPr>
           <w:i w:val="0"/>
@@ -26402,7 +26523,7 @@
       <w:pPr>
         <w:pStyle w:val="Ttulo2"/>
       </w:pPr>
-      <w:bookmarkStart w:id="83" w:name="_Toc231090068"/>
+      <w:bookmarkStart w:id="83" w:name="_Toc231093602"/>
       <w:r>
         <w:t xml:space="preserve">Anexo F. </w:t>
       </w:r>
@@ -26417,7 +26538,7 @@
         <w:spacing w:before="40" w:after="40"/>
         <w:jc w:val="center"/>
       </w:pPr>
-      <w:bookmarkStart w:id="84" w:name="_Toc231090084"/>
+      <w:bookmarkStart w:id="84" w:name="_Toc231093618"/>
       <w:r>
         <w:rPr>
           <w:i w:val="0"/>
@@ -27231,7 +27352,7 @@
       <w:pPr>
         <w:pStyle w:val="Ttulo2"/>
       </w:pPr>
-      <w:bookmarkStart w:id="85" w:name="_Toc231090069"/>
+      <w:bookmarkStart w:id="85" w:name="_Toc231093603"/>
       <w:r>
         <w:t>Anexo G. Fuentes de datos</w:t>
       </w:r>
@@ -27243,7 +27364,7 @@
         <w:spacing w:before="40" w:after="40"/>
         <w:jc w:val="center"/>
       </w:pPr>
-      <w:bookmarkStart w:id="86" w:name="_Toc231090085"/>
+      <w:bookmarkStart w:id="86" w:name="_Toc231093619"/>
       <w:r>
         <w:rPr>
           <w:i w:val="0"/>
@@ -28392,7 +28513,7 @@
       <w:pPr>
         <w:pStyle w:val="Ttulo2"/>
       </w:pPr>
-      <w:bookmarkStart w:id="87" w:name="_Toc231090070"/>
+      <w:bookmarkStart w:id="87" w:name="_Toc231093604"/>
       <w:r>
         <w:t>Anexo H. Disponibilidad del código</w:t>
       </w:r>
@@ -28410,7 +28531,7 @@
       <w:pPr>
         <w:pStyle w:val="Ttulo2"/>
       </w:pPr>
-      <w:bookmarkStart w:id="88" w:name="_Toc231090071"/>
+      <w:bookmarkStart w:id="88" w:name="_Toc231093605"/>
       <w:r>
         <w:t>Anexo I. Extensión predictiva: ¿explican o anticipan?</w:t>
       </w:r>
@@ -28436,7 +28557,7 @@
         <w:spacing w:before="40" w:after="40"/>
         <w:jc w:val="center"/>
       </w:pPr>
-      <w:bookmarkStart w:id="89" w:name="_Toc231090086"/>
+      <w:bookmarkStart w:id="89" w:name="_Toc231093620"/>
       <w:r>
         <w:rPr>
           <w:i w:val="0"/>
@@ -29004,7 +29125,13 @@
               <w:rPr>
                 <w:sz w:val="20"/>
               </w:rPr>
-              <w:t>Random Forest</w:t>
+              <w:t xml:space="preserve">Random </w:t>
+            </w:r>
+            <w:r>
+              <w:rPr>
+                <w:sz w:val="20"/>
+              </w:rPr>
+              <w:t>Forest</w:t>
             </w:r>
           </w:p>
         </w:tc>
@@ -29292,7 +29419,7 @@
       <w:pPr>
         <w:pStyle w:val="Ttulo1"/>
       </w:pPr>
-      <w:bookmarkStart w:id="90" w:name="_Toc231090072"/>
+      <w:bookmarkStart w:id="90" w:name="_Toc231093606"/>
       <w:r>
         <w:lastRenderedPageBreak/>
         <w:t>Glosario de términos econométricos</w:t>
@@ -29328,7 +29455,10 @@
     </w:p>
     <w:p>
       <w:r>
-        <w:t>no estacionarias (I(1)), interpretada como una relación de equilibrio de largo plazo.</w:t>
+        <w:t xml:space="preserve">no estacionarias (I(1)), </w:t>
+      </w:r>
+      <w:r>
+        <w:t>interpretada como una relación de equilibrio de largo plazo.</w:t>
       </w:r>
     </w:p>
     <w:p>
@@ -29397,10 +29527,7 @@
     </w:p>
     <w:p>
       <w:r>
-        <w:t xml:space="preserve">en el tiempo de cada unidad </w:t>
-      </w:r>
-      <w:r>
-        <w:t>mediante interceptos específicos.</w:t>
+        <w:t>en el tiempo de cada unidad mediante interceptos específicos.</w:t>
       </w:r>
     </w:p>
     <w:p>
@@ -29926,31 +30053,31 @@
       </w:rPr>
     </w:lvl>
   </w:abstractNum>
-  <w:num w:numId="1" w16cid:durableId="333529743">
+  <w:num w:numId="1" w16cid:durableId="548305238">
     <w:abstractNumId w:val="8"/>
   </w:num>
-  <w:num w:numId="2" w16cid:durableId="424152093">
+  <w:num w:numId="2" w16cid:durableId="2079591179">
     <w:abstractNumId w:val="6"/>
   </w:num>
-  <w:num w:numId="3" w16cid:durableId="430009367">
+  <w:num w:numId="3" w16cid:durableId="2080133198">
     <w:abstractNumId w:val="5"/>
   </w:num>
-  <w:num w:numId="4" w16cid:durableId="104465079">
+  <w:num w:numId="4" w16cid:durableId="1081173204">
     <w:abstractNumId w:val="4"/>
   </w:num>
-  <w:num w:numId="5" w16cid:durableId="1985238243">
+  <w:num w:numId="5" w16cid:durableId="1983536571">
     <w:abstractNumId w:val="7"/>
   </w:num>
-  <w:num w:numId="6" w16cid:durableId="1589271958">
+  <w:num w:numId="6" w16cid:durableId="918757441">
     <w:abstractNumId w:val="3"/>
   </w:num>
-  <w:num w:numId="7" w16cid:durableId="698900046">
+  <w:num w:numId="7" w16cid:durableId="1334185806">
     <w:abstractNumId w:val="2"/>
   </w:num>
-  <w:num w:numId="8" w16cid:durableId="1260530904">
+  <w:num w:numId="8" w16cid:durableId="245576206">
     <w:abstractNumId w:val="1"/>
   </w:num>
-  <w:num w:numId="9" w16cid:durableId="25259155">
+  <w:num w:numId="9" w16cid:durableId="1233085083">
     <w:abstractNumId w:val="0"/>
   </w:num>
 </w:numbering>
@@ -41352,7 +41479,7 @@
     <w:autoRedefine/>
     <w:uiPriority w:val="39"/>
     <w:unhideWhenUsed/>
-    <w:rsid w:val="00A9290A"/>
+    <w:rsid w:val="00100867"/>
     <w:pPr>
       <w:spacing w:after="100"/>
     </w:pPr>
@@ -41364,7 +41491,7 @@
     <w:autoRedefine/>
     <w:uiPriority w:val="39"/>
     <w:unhideWhenUsed/>
-    <w:rsid w:val="00A9290A"/>
+    <w:rsid w:val="00100867"/>
     <w:pPr>
       <w:spacing w:after="100"/>
       <w:ind w:left="240"/>
@@ -41377,7 +41504,7 @@
     <w:autoRedefine/>
     <w:uiPriority w:val="39"/>
     <w:unhideWhenUsed/>
-    <w:rsid w:val="00A9290A"/>
+    <w:rsid w:val="00100867"/>
     <w:pPr>
       <w:spacing w:after="100"/>
       <w:ind w:left="480"/>
@@ -41388,7 +41515,7 @@
     <w:basedOn w:val="Fuentedeprrafopredeter"/>
     <w:uiPriority w:val="99"/>
     <w:unhideWhenUsed/>
-    <w:rsid w:val="00A9290A"/>
+    <w:rsid w:val="00100867"/>
     <w:rPr>
       <w:color w:val="0000FF" w:themeColor="hyperlink"/>
       <w:u w:val="single"/>
@@ -41400,7 +41527,7 @@
     <w:next w:val="Normal"/>
     <w:uiPriority w:val="99"/>
     <w:unhideWhenUsed/>
-    <w:rsid w:val="00A9290A"/>
+    <w:rsid w:val="00100867"/>
     <w:pPr>
       <w:spacing w:after="0"/>
     </w:pPr>

</xml_diff>

<commit_message>
Test de razón de varianzas (Lo-MacKinlay) para eficiencia débil
Cobre: rechaza paseo aleatorio (VR(2)=1.39) -> momentum. Retornos del sector: no se rechaza
-> eficiencia débil. Corrige factor T en el estadístico. Integrado a Anexo I y run_all.

Co-Authored-By: Claude Opus 4.8 <noreply@anthropic.com>
</commit_message>
<xml_diff>
--- a/outputs/Tesis_Francisco_Rietta.docx
+++ b/outputs/Tesis_Francisco_Rietta.docx
@@ -166,7 +166,7 @@
       <w:pPr>
         <w:pStyle w:val="Ttulo1"/>
       </w:pPr>
-      <w:bookmarkStart w:id="0" w:name="_Toc231093536"/>
+      <w:bookmarkStart w:id="0" w:name="_Toc231097284"/>
       <w:r>
         <w:lastRenderedPageBreak/>
         <w:t>Página de aprobación</w:t>
@@ -262,7 +262,7 @@
       <w:pPr>
         <w:pStyle w:val="Ttulo1"/>
       </w:pPr>
-      <w:bookmarkStart w:id="1" w:name="_Toc231093537"/>
+      <w:bookmarkStart w:id="1" w:name="_Toc231097285"/>
       <w:r>
         <w:lastRenderedPageBreak/>
         <w:t>Declaración de originalidad</w:t>
@@ -303,7 +303,7 @@
       <w:pPr>
         <w:pStyle w:val="Ttulo1"/>
       </w:pPr>
-      <w:bookmarkStart w:id="2" w:name="_Toc231093538"/>
+      <w:bookmarkStart w:id="2" w:name="_Toc231097286"/>
       <w:r>
         <w:lastRenderedPageBreak/>
         <w:t>Dedicatoria</w:t>
@@ -333,7 +333,7 @@
       <w:pPr>
         <w:pStyle w:val="Ttulo1"/>
       </w:pPr>
-      <w:bookmarkStart w:id="3" w:name="_Toc231093539"/>
+      <w:bookmarkStart w:id="3" w:name="_Toc231097287"/>
       <w:r>
         <w:lastRenderedPageBreak/>
         <w:t>Agradecimientos</w:t>
@@ -359,7 +359,7 @@
       <w:pPr>
         <w:pStyle w:val="Ttulo1"/>
       </w:pPr>
-      <w:bookmarkStart w:id="4" w:name="_Toc231093540"/>
+      <w:bookmarkStart w:id="4" w:name="_Toc231097288"/>
       <w:r>
         <w:lastRenderedPageBreak/>
         <w:t>Resumen</w:t>
@@ -397,7 +397,7 @@
       <w:pPr>
         <w:pStyle w:val="Ttulo1"/>
       </w:pPr>
-      <w:bookmarkStart w:id="5" w:name="_Toc231093541"/>
+      <w:bookmarkStart w:id="5" w:name="_Toc231097289"/>
       <w:r>
         <w:lastRenderedPageBreak/>
         <w:t>Abstract</w:t>
@@ -432,7 +432,7 @@
       <w:pPr>
         <w:pStyle w:val="Ttulo1"/>
       </w:pPr>
-      <w:bookmarkStart w:id="6" w:name="_Toc231093542"/>
+      <w:bookmarkStart w:id="6" w:name="_Toc231097290"/>
       <w:r>
         <w:lastRenderedPageBreak/>
         <w:t>Índice general</w:t>
@@ -464,7 +464,7 @@
       <w:r>
         <w:fldChar w:fldCharType="separate"/>
       </w:r>
-      <w:hyperlink w:anchor="_Toc231093536" w:history="1">
+      <w:hyperlink w:anchor="_Toc231097284" w:history="1">
         <w:r>
           <w:rPr>
             <w:rStyle w:val="Hipervnculo"/>
@@ -491,7 +491,7 @@
             <w:noProof/>
             <w:webHidden/>
           </w:rPr>
-          <w:instrText xml:space="preserve"> PAGEREF _Toc231093536 \h </w:instrText>
+          <w:instrText xml:space="preserve"> PAGEREF _Toc231097284 \h </w:instrText>
         </w:r>
         <w:r>
           <w:rPr>
@@ -538,7 +538,7 @@
           <w14:ligatures w14:val="standardContextual"/>
         </w:rPr>
       </w:pPr>
-      <w:hyperlink w:anchor="_Toc231093537" w:history="1">
+      <w:hyperlink w:anchor="_Toc231097285" w:history="1">
         <w:r>
           <w:rPr>
             <w:rStyle w:val="Hipervnculo"/>
@@ -565,7 +565,7 @@
             <w:noProof/>
             <w:webHidden/>
           </w:rPr>
-          <w:instrText xml:space="preserve"> PAGEREF _Toc231093537 \h </w:instrText>
+          <w:instrText xml:space="preserve"> PAGEREF _Toc231097285 \h </w:instrText>
         </w:r>
         <w:r>
           <w:rPr>
@@ -612,7 +612,7 @@
           <w14:ligatures w14:val="standardContextual"/>
         </w:rPr>
       </w:pPr>
-      <w:hyperlink w:anchor="_Toc231093538" w:history="1">
+      <w:hyperlink w:anchor="_Toc231097286" w:history="1">
         <w:r>
           <w:rPr>
             <w:rStyle w:val="Hipervnculo"/>
@@ -639,7 +639,7 @@
             <w:noProof/>
             <w:webHidden/>
           </w:rPr>
-          <w:instrText xml:space="preserve"> PAGEREF _Toc231093538 \h </w:instrText>
+          <w:instrText xml:space="preserve"> PAGEREF _Toc231097286 \h </w:instrText>
         </w:r>
         <w:r>
           <w:rPr>
@@ -686,7 +686,7 @@
           <w14:ligatures w14:val="standardContextual"/>
         </w:rPr>
       </w:pPr>
-      <w:hyperlink w:anchor="_Toc231093539" w:history="1">
+      <w:hyperlink w:anchor="_Toc231097287" w:history="1">
         <w:r>
           <w:rPr>
             <w:rStyle w:val="Hipervnculo"/>
@@ -713,7 +713,7 @@
             <w:noProof/>
             <w:webHidden/>
           </w:rPr>
-          <w:instrText xml:space="preserve"> PAGEREF _Toc231093539 \h </w:instrText>
+          <w:instrText xml:space="preserve"> PAGEREF _Toc231097287 \h </w:instrText>
         </w:r>
         <w:r>
           <w:rPr>
@@ -760,7 +760,7 @@
           <w14:ligatures w14:val="standardContextual"/>
         </w:rPr>
       </w:pPr>
-      <w:hyperlink w:anchor="_Toc231093540" w:history="1">
+      <w:hyperlink w:anchor="_Toc231097288" w:history="1">
         <w:r>
           <w:rPr>
             <w:rStyle w:val="Hipervnculo"/>
@@ -787,7 +787,7 @@
             <w:noProof/>
             <w:webHidden/>
           </w:rPr>
-          <w:instrText xml:space="preserve"> PAGEREF _Toc231093540 \h </w:instrText>
+          <w:instrText xml:space="preserve"> PAGEREF _Toc231097288 \h </w:instrText>
         </w:r>
         <w:r>
           <w:rPr>
@@ -834,7 +834,7 @@
           <w14:ligatures w14:val="standardContextual"/>
         </w:rPr>
       </w:pPr>
-      <w:hyperlink w:anchor="_Toc231093541" w:history="1">
+      <w:hyperlink w:anchor="_Toc231097289" w:history="1">
         <w:r>
           <w:rPr>
             <w:rStyle w:val="Hipervnculo"/>
@@ -861,7 +861,7 @@
             <w:noProof/>
             <w:webHidden/>
           </w:rPr>
-          <w:instrText xml:space="preserve"> PAGEREF _Toc231093541 \h </w:instrText>
+          <w:instrText xml:space="preserve"> PAGEREF _Toc231097289 \h </w:instrText>
         </w:r>
         <w:r>
           <w:rPr>
@@ -908,7 +908,7 @@
           <w14:ligatures w14:val="standardContextual"/>
         </w:rPr>
       </w:pPr>
-      <w:hyperlink w:anchor="_Toc231093542" w:history="1">
+      <w:hyperlink w:anchor="_Toc231097290" w:history="1">
         <w:r>
           <w:rPr>
             <w:rStyle w:val="Hipervnculo"/>
@@ -935,7 +935,7 @@
             <w:noProof/>
             <w:webHidden/>
           </w:rPr>
-          <w:instrText xml:space="preserve"> PAGEREF _Toc231093542 \h </w:instrText>
+          <w:instrText xml:space="preserve"> PAGEREF _Toc231097290 \h </w:instrText>
         </w:r>
         <w:r>
           <w:rPr>
@@ -982,7 +982,7 @@
           <w14:ligatures w14:val="standardContextual"/>
         </w:rPr>
       </w:pPr>
-      <w:hyperlink w:anchor="_Toc231093543" w:history="1">
+      <w:hyperlink w:anchor="_Toc231097291" w:history="1">
         <w:r>
           <w:rPr>
             <w:rStyle w:val="Hipervnculo"/>
@@ -1009,7 +1009,7 @@
             <w:noProof/>
             <w:webHidden/>
           </w:rPr>
-          <w:instrText xml:space="preserve"> PAGEREF _Toc231093543 \h </w:instrText>
+          <w:instrText xml:space="preserve"> PAGEREF _Toc231097291 \h </w:instrText>
         </w:r>
         <w:r>
           <w:rPr>
@@ -1056,7 +1056,7 @@
           <w14:ligatures w14:val="standardContextual"/>
         </w:rPr>
       </w:pPr>
-      <w:hyperlink w:anchor="_Toc231093544" w:history="1">
+      <w:hyperlink w:anchor="_Toc231097292" w:history="1">
         <w:r>
           <w:rPr>
             <w:rStyle w:val="Hipervnculo"/>
@@ -1083,7 +1083,7 @@
             <w:noProof/>
             <w:webHidden/>
           </w:rPr>
-          <w:instrText xml:space="preserve"> PAGEREF _Toc231093544 \h </w:instrText>
+          <w:instrText xml:space="preserve"> PAGEREF _Toc231097292 \h </w:instrText>
         </w:r>
         <w:r>
           <w:rPr>
@@ -1130,7 +1130,7 @@
           <w14:ligatures w14:val="standardContextual"/>
         </w:rPr>
       </w:pPr>
-      <w:hyperlink w:anchor="_Toc231093545" w:history="1">
+      <w:hyperlink w:anchor="_Toc231097293" w:history="1">
         <w:r>
           <w:rPr>
             <w:rStyle w:val="Hipervnculo"/>
@@ -1157,7 +1157,7 @@
             <w:noProof/>
             <w:webHidden/>
           </w:rPr>
-          <w:instrText xml:space="preserve"> PAGEREF _Toc231093545 \h </w:instrText>
+          <w:instrText xml:space="preserve"> PAGEREF _Toc231097293 \h </w:instrText>
         </w:r>
         <w:r>
           <w:rPr>
@@ -1204,7 +1204,7 @@
           <w14:ligatures w14:val="standardContextual"/>
         </w:rPr>
       </w:pPr>
-      <w:hyperlink w:anchor="_Toc231093546" w:history="1">
+      <w:hyperlink w:anchor="_Toc231097294" w:history="1">
         <w:r>
           <w:rPr>
             <w:rStyle w:val="Hipervnculo"/>
@@ -1231,7 +1231,7 @@
             <w:noProof/>
             <w:webHidden/>
           </w:rPr>
-          <w:instrText xml:space="preserve"> PAGEREF _Toc231093546 \h </w:instrText>
+          <w:instrText xml:space="preserve"> PAGEREF _Toc231097294 \h </w:instrText>
         </w:r>
         <w:r>
           <w:rPr>
@@ -1278,7 +1278,7 @@
           <w14:ligatures w14:val="standardContextual"/>
         </w:rPr>
       </w:pPr>
-      <w:hyperlink w:anchor="_Toc231093547" w:history="1">
+      <w:hyperlink w:anchor="_Toc231097295" w:history="1">
         <w:r>
           <w:rPr>
             <w:rStyle w:val="Hipervnculo"/>
@@ -1305,7 +1305,7 @@
             <w:noProof/>
             <w:webHidden/>
           </w:rPr>
-          <w:instrText xml:space="preserve"> PAGEREF _Toc231093547 \h </w:instrText>
+          <w:instrText xml:space="preserve"> PAGEREF _Toc231097295 \h </w:instrText>
         </w:r>
         <w:r>
           <w:rPr>
@@ -1352,7 +1352,7 @@
           <w14:ligatures w14:val="standardContextual"/>
         </w:rPr>
       </w:pPr>
-      <w:hyperlink w:anchor="_Toc231093548" w:history="1">
+      <w:hyperlink w:anchor="_Toc231097296" w:history="1">
         <w:r>
           <w:rPr>
             <w:rStyle w:val="Hipervnculo"/>
@@ -1379,7 +1379,7 @@
             <w:noProof/>
             <w:webHidden/>
           </w:rPr>
-          <w:instrText xml:space="preserve"> PAGEREF _Toc231093548 \h </w:instrText>
+          <w:instrText xml:space="preserve"> PAGEREF _Toc231097296 \h </w:instrText>
         </w:r>
         <w:r>
           <w:rPr>
@@ -1426,7 +1426,7 @@
           <w14:ligatures w14:val="standardContextual"/>
         </w:rPr>
       </w:pPr>
-      <w:hyperlink w:anchor="_Toc231093549" w:history="1">
+      <w:hyperlink w:anchor="_Toc231097297" w:history="1">
         <w:r>
           <w:rPr>
             <w:rStyle w:val="Hipervnculo"/>
@@ -1453,7 +1453,7 @@
             <w:noProof/>
             <w:webHidden/>
           </w:rPr>
-          <w:instrText xml:space="preserve"> PAGEREF _Toc231093549 \h </w:instrText>
+          <w:instrText xml:space="preserve"> PAGEREF _Toc231097297 \h </w:instrText>
         </w:r>
         <w:r>
           <w:rPr>
@@ -1500,7 +1500,7 @@
           <w14:ligatures w14:val="standardContextual"/>
         </w:rPr>
       </w:pPr>
-      <w:hyperlink w:anchor="_Toc231093550" w:history="1">
+      <w:hyperlink w:anchor="_Toc231097298" w:history="1">
         <w:r>
           <w:rPr>
             <w:rStyle w:val="Hipervnculo"/>
@@ -1527,7 +1527,7 @@
             <w:noProof/>
             <w:webHidden/>
           </w:rPr>
-          <w:instrText xml:space="preserve"> PAGEREF _Toc231093550 \h </w:instrText>
+          <w:instrText xml:space="preserve"> PAGEREF _Toc231097298 \h </w:instrText>
         </w:r>
         <w:r>
           <w:rPr>
@@ -1574,7 +1574,7 @@
           <w14:ligatures w14:val="standardContextual"/>
         </w:rPr>
       </w:pPr>
-      <w:hyperlink w:anchor="_Toc231093551" w:history="1">
+      <w:hyperlink w:anchor="_Toc231097299" w:history="1">
         <w:r>
           <w:rPr>
             <w:rStyle w:val="Hipervnculo"/>
@@ -1601,7 +1601,7 @@
             <w:noProof/>
             <w:webHidden/>
           </w:rPr>
-          <w:instrText xml:space="preserve"> PAGEREF _Toc231093551 \h </w:instrText>
+          <w:instrText xml:space="preserve"> PAGEREF _Toc231097299 \h </w:instrText>
         </w:r>
         <w:r>
           <w:rPr>
@@ -1648,7 +1648,7 @@
           <w14:ligatures w14:val="standardContextual"/>
         </w:rPr>
       </w:pPr>
-      <w:hyperlink w:anchor="_Toc231093552" w:history="1">
+      <w:hyperlink w:anchor="_Toc231097300" w:history="1">
         <w:r>
           <w:rPr>
             <w:rStyle w:val="Hipervnculo"/>
@@ -1675,7 +1675,7 @@
             <w:noProof/>
             <w:webHidden/>
           </w:rPr>
-          <w:instrText xml:space="preserve"> PAGEREF _Toc231093552 \h </w:instrText>
+          <w:instrText xml:space="preserve"> PAGEREF _Toc231097300 \h </w:instrText>
         </w:r>
         <w:r>
           <w:rPr>
@@ -1722,7 +1722,7 @@
           <w14:ligatures w14:val="standardContextual"/>
         </w:rPr>
       </w:pPr>
-      <w:hyperlink w:anchor="_Toc231093553" w:history="1">
+      <w:hyperlink w:anchor="_Toc231097301" w:history="1">
         <w:r>
           <w:rPr>
             <w:rStyle w:val="Hipervnculo"/>
@@ -1749,7 +1749,7 @@
             <w:noProof/>
             <w:webHidden/>
           </w:rPr>
-          <w:instrText xml:space="preserve"> PAGEREF _Toc231093553 \h </w:instrText>
+          <w:instrText xml:space="preserve"> PAGEREF _Toc231097301 \h </w:instrText>
         </w:r>
         <w:r>
           <w:rPr>
@@ -1796,7 +1796,7 @@
           <w14:ligatures w14:val="standardContextual"/>
         </w:rPr>
       </w:pPr>
-      <w:hyperlink w:anchor="_Toc231093554" w:history="1">
+      <w:hyperlink w:anchor="_Toc231097302" w:history="1">
         <w:r>
           <w:rPr>
             <w:rStyle w:val="Hipervnculo"/>
@@ -1823,7 +1823,7 @@
             <w:noProof/>
             <w:webHidden/>
           </w:rPr>
-          <w:instrText xml:space="preserve"> PAGEREF _Toc231093554 \h </w:instrText>
+          <w:instrText xml:space="preserve"> PAGEREF _Toc231097302 \h </w:instrText>
         </w:r>
         <w:r>
           <w:rPr>
@@ -1870,7 +1870,7 @@
           <w14:ligatures w14:val="standardContextual"/>
         </w:rPr>
       </w:pPr>
-      <w:hyperlink w:anchor="_Toc231093555" w:history="1">
+      <w:hyperlink w:anchor="_Toc231097303" w:history="1">
         <w:r>
           <w:rPr>
             <w:rStyle w:val="Hipervnculo"/>
@@ -1897,7 +1897,7 @@
             <w:noProof/>
             <w:webHidden/>
           </w:rPr>
-          <w:instrText xml:space="preserve"> PAGEREF _Toc231093555 \h </w:instrText>
+          <w:instrText xml:space="preserve"> PAGEREF _Toc231097303 \h </w:instrText>
         </w:r>
         <w:r>
           <w:rPr>
@@ -1944,7 +1944,7 @@
           <w14:ligatures w14:val="standardContextual"/>
         </w:rPr>
       </w:pPr>
-      <w:hyperlink w:anchor="_Toc231093556" w:history="1">
+      <w:hyperlink w:anchor="_Toc231097304" w:history="1">
         <w:r>
           <w:rPr>
             <w:rStyle w:val="Hipervnculo"/>
@@ -1971,7 +1971,7 @@
             <w:noProof/>
             <w:webHidden/>
           </w:rPr>
-          <w:instrText xml:space="preserve"> PAGEREF _Toc231093556 \h </w:instrText>
+          <w:instrText xml:space="preserve"> PAGEREF _Toc231097304 \h </w:instrText>
         </w:r>
         <w:r>
           <w:rPr>
@@ -2018,7 +2018,7 @@
           <w14:ligatures w14:val="standardContextual"/>
         </w:rPr>
       </w:pPr>
-      <w:hyperlink w:anchor="_Toc231093557" w:history="1">
+      <w:hyperlink w:anchor="_Toc231097305" w:history="1">
         <w:r>
           <w:rPr>
             <w:rStyle w:val="Hipervnculo"/>
@@ -2045,7 +2045,7 @@
             <w:noProof/>
             <w:webHidden/>
           </w:rPr>
-          <w:instrText xml:space="preserve"> PAGEREF _Toc231093557 \h </w:instrText>
+          <w:instrText xml:space="preserve"> PAGEREF _Toc231097305 \h </w:instrText>
         </w:r>
         <w:r>
           <w:rPr>
@@ -2092,7 +2092,7 @@
           <w14:ligatures w14:val="standardContextual"/>
         </w:rPr>
       </w:pPr>
-      <w:hyperlink w:anchor="_Toc231093558" w:history="1">
+      <w:hyperlink w:anchor="_Toc231097306" w:history="1">
         <w:r>
           <w:rPr>
             <w:rStyle w:val="Hipervnculo"/>
@@ -2119,7 +2119,7 @@
             <w:noProof/>
             <w:webHidden/>
           </w:rPr>
-          <w:instrText xml:space="preserve"> PAGEREF _Toc231093558 \h </w:instrText>
+          <w:instrText xml:space="preserve"> PAGEREF _Toc231097306 \h </w:instrText>
         </w:r>
         <w:r>
           <w:rPr>
@@ -2166,7 +2166,7 @@
           <w14:ligatures w14:val="standardContextual"/>
         </w:rPr>
       </w:pPr>
-      <w:hyperlink w:anchor="_Toc231093559" w:history="1">
+      <w:hyperlink w:anchor="_Toc231097307" w:history="1">
         <w:r>
           <w:rPr>
             <w:rStyle w:val="Hipervnculo"/>
@@ -2193,7 +2193,7 @@
             <w:noProof/>
             <w:webHidden/>
           </w:rPr>
-          <w:instrText xml:space="preserve"> PAGEREF _Toc231093559 \h </w:instrText>
+          <w:instrText xml:space="preserve"> PAGEREF _Toc231097307 \h </w:instrText>
         </w:r>
         <w:r>
           <w:rPr>
@@ -2240,7 +2240,7 @@
           <w14:ligatures w14:val="standardContextual"/>
         </w:rPr>
       </w:pPr>
-      <w:hyperlink w:anchor="_Toc231093560" w:history="1">
+      <w:hyperlink w:anchor="_Toc231097308" w:history="1">
         <w:r>
           <w:rPr>
             <w:rStyle w:val="Hipervnculo"/>
@@ -2267,7 +2267,7 @@
             <w:noProof/>
             <w:webHidden/>
           </w:rPr>
-          <w:instrText xml:space="preserve"> PAGEREF _Toc231093560 \h </w:instrText>
+          <w:instrText xml:space="preserve"> PAGEREF _Toc231097308 \h </w:instrText>
         </w:r>
         <w:r>
           <w:rPr>
@@ -2314,7 +2314,7 @@
           <w14:ligatures w14:val="standardContextual"/>
         </w:rPr>
       </w:pPr>
-      <w:hyperlink w:anchor="_Toc231093561" w:history="1">
+      <w:hyperlink w:anchor="_Toc231097309" w:history="1">
         <w:r>
           <w:rPr>
             <w:rStyle w:val="Hipervnculo"/>
@@ -2341,7 +2341,7 @@
             <w:noProof/>
             <w:webHidden/>
           </w:rPr>
-          <w:instrText xml:space="preserve"> PAGEREF _Toc231093561 \h </w:instrText>
+          <w:instrText xml:space="preserve"> PAGEREF _Toc231097309 \h </w:instrText>
         </w:r>
         <w:r>
           <w:rPr>
@@ -2388,7 +2388,7 @@
           <w14:ligatures w14:val="standardContextual"/>
         </w:rPr>
       </w:pPr>
-      <w:hyperlink w:anchor="_Toc231093562" w:history="1">
+      <w:hyperlink w:anchor="_Toc231097310" w:history="1">
         <w:r>
           <w:rPr>
             <w:rStyle w:val="Hipervnculo"/>
@@ -2415,7 +2415,7 @@
             <w:noProof/>
             <w:webHidden/>
           </w:rPr>
-          <w:instrText xml:space="preserve"> PAGEREF _Toc231093562 \h </w:instrText>
+          <w:instrText xml:space="preserve"> PAGEREF _Toc231097310 \h </w:instrText>
         </w:r>
         <w:r>
           <w:rPr>
@@ -2462,7 +2462,7 @@
           <w14:ligatures w14:val="standardContextual"/>
         </w:rPr>
       </w:pPr>
-      <w:hyperlink w:anchor="_Toc231093563" w:history="1">
+      <w:hyperlink w:anchor="_Toc231097311" w:history="1">
         <w:r>
           <w:rPr>
             <w:rStyle w:val="Hipervnculo"/>
@@ -2489,7 +2489,7 @@
             <w:noProof/>
             <w:webHidden/>
           </w:rPr>
-          <w:instrText xml:space="preserve"> PAGEREF _Toc231093563 \h </w:instrText>
+          <w:instrText xml:space="preserve"> PAGEREF _Toc231097311 \h </w:instrText>
         </w:r>
         <w:r>
           <w:rPr>
@@ -2536,7 +2536,7 @@
           <w14:ligatures w14:val="standardContextual"/>
         </w:rPr>
       </w:pPr>
-      <w:hyperlink w:anchor="_Toc231093564" w:history="1">
+      <w:hyperlink w:anchor="_Toc231097312" w:history="1">
         <w:r>
           <w:rPr>
             <w:rStyle w:val="Hipervnculo"/>
@@ -2563,7 +2563,7 @@
             <w:noProof/>
             <w:webHidden/>
           </w:rPr>
-          <w:instrText xml:space="preserve"> PAGEREF _Toc231093564 \h </w:instrText>
+          <w:instrText xml:space="preserve"> PAGEREF _Toc231097312 \h </w:instrText>
         </w:r>
         <w:r>
           <w:rPr>
@@ -2610,7 +2610,7 @@
           <w14:ligatures w14:val="standardContextual"/>
         </w:rPr>
       </w:pPr>
-      <w:hyperlink w:anchor="_Toc231093565" w:history="1">
+      <w:hyperlink w:anchor="_Toc231097313" w:history="1">
         <w:r>
           <w:rPr>
             <w:rStyle w:val="Hipervnculo"/>
@@ -2637,7 +2637,7 @@
             <w:noProof/>
             <w:webHidden/>
           </w:rPr>
-          <w:instrText xml:space="preserve"> PAGEREF _Toc231093565 \h </w:instrText>
+          <w:instrText xml:space="preserve"> PAGEREF _Toc231097313 \h </w:instrText>
         </w:r>
         <w:r>
           <w:rPr>
@@ -2684,7 +2684,7 @@
           <w14:ligatures w14:val="standardContextual"/>
         </w:rPr>
       </w:pPr>
-      <w:hyperlink w:anchor="_Toc231093566" w:history="1">
+      <w:hyperlink w:anchor="_Toc231097314" w:history="1">
         <w:r>
           <w:rPr>
             <w:rStyle w:val="Hipervnculo"/>
@@ -2711,7 +2711,7 @@
             <w:noProof/>
             <w:webHidden/>
           </w:rPr>
-          <w:instrText xml:space="preserve"> PAGEREF _Toc231093566 \h </w:instrText>
+          <w:instrText xml:space="preserve"> PAGEREF _Toc231097314 \h </w:instrText>
         </w:r>
         <w:r>
           <w:rPr>
@@ -2758,7 +2758,7 @@
           <w14:ligatures w14:val="standardContextual"/>
         </w:rPr>
       </w:pPr>
-      <w:hyperlink w:anchor="_Toc231093567" w:history="1">
+      <w:hyperlink w:anchor="_Toc231097315" w:history="1">
         <w:r>
           <w:rPr>
             <w:rStyle w:val="Hipervnculo"/>
@@ -2785,7 +2785,7 @@
             <w:noProof/>
             <w:webHidden/>
           </w:rPr>
-          <w:instrText xml:space="preserve"> PAGEREF _Toc231093567 \h </w:instrText>
+          <w:instrText xml:space="preserve"> PAGEREF _Toc231097315 \h </w:instrText>
         </w:r>
         <w:r>
           <w:rPr>
@@ -2832,7 +2832,7 @@
           <w14:ligatures w14:val="standardContextual"/>
         </w:rPr>
       </w:pPr>
-      <w:hyperlink w:anchor="_Toc231093568" w:history="1">
+      <w:hyperlink w:anchor="_Toc231097316" w:history="1">
         <w:r>
           <w:rPr>
             <w:rStyle w:val="Hipervnculo"/>
@@ -2859,7 +2859,7 @@
             <w:noProof/>
             <w:webHidden/>
           </w:rPr>
-          <w:instrText xml:space="preserve"> PAGEREF _Toc231093568 \h </w:instrText>
+          <w:instrText xml:space="preserve"> PAGEREF _Toc231097316 \h </w:instrText>
         </w:r>
         <w:r>
           <w:rPr>
@@ -2906,7 +2906,7 @@
           <w14:ligatures w14:val="standardContextual"/>
         </w:rPr>
       </w:pPr>
-      <w:hyperlink w:anchor="_Toc231093569" w:history="1">
+      <w:hyperlink w:anchor="_Toc231097317" w:history="1">
         <w:r>
           <w:rPr>
             <w:rStyle w:val="Hipervnculo"/>
@@ -2933,7 +2933,7 @@
             <w:noProof/>
             <w:webHidden/>
           </w:rPr>
-          <w:instrText xml:space="preserve"> PAGEREF _Toc231093569 \h </w:instrText>
+          <w:instrText xml:space="preserve"> PAGEREF _Toc231097317 \h </w:instrText>
         </w:r>
         <w:r>
           <w:rPr>
@@ -2980,7 +2980,7 @@
           <w14:ligatures w14:val="standardContextual"/>
         </w:rPr>
       </w:pPr>
-      <w:hyperlink w:anchor="_Toc231093570" w:history="1">
+      <w:hyperlink w:anchor="_Toc231097318" w:history="1">
         <w:r>
           <w:rPr>
             <w:rStyle w:val="Hipervnculo"/>
@@ -3007,7 +3007,7 @@
             <w:noProof/>
             <w:webHidden/>
           </w:rPr>
-          <w:instrText xml:space="preserve"> PAGEREF _Toc231093570 \h </w:instrText>
+          <w:instrText xml:space="preserve"> PAGEREF _Toc231097318 \h </w:instrText>
         </w:r>
         <w:r>
           <w:rPr>
@@ -3054,7 +3054,7 @@
           <w14:ligatures w14:val="standardContextual"/>
         </w:rPr>
       </w:pPr>
-      <w:hyperlink w:anchor="_Toc231093571" w:history="1">
+      <w:hyperlink w:anchor="_Toc231097319" w:history="1">
         <w:r>
           <w:rPr>
             <w:rStyle w:val="Hipervnculo"/>
@@ -3081,7 +3081,7 @@
             <w:noProof/>
             <w:webHidden/>
           </w:rPr>
-          <w:instrText xml:space="preserve"> PAGEREF _Toc231093571 \h </w:instrText>
+          <w:instrText xml:space="preserve"> PAGEREF _Toc231097319 \h </w:instrText>
         </w:r>
         <w:r>
           <w:rPr>
@@ -3128,7 +3128,7 @@
           <w14:ligatures w14:val="standardContextual"/>
         </w:rPr>
       </w:pPr>
-      <w:hyperlink w:anchor="_Toc231093572" w:history="1">
+      <w:hyperlink w:anchor="_Toc231097320" w:history="1">
         <w:r>
           <w:rPr>
             <w:rStyle w:val="Hipervnculo"/>
@@ -3155,7 +3155,7 @@
             <w:noProof/>
             <w:webHidden/>
           </w:rPr>
-          <w:instrText xml:space="preserve"> PAGEREF _Toc231093572 \h </w:instrText>
+          <w:instrText xml:space="preserve"> PAGEREF _Toc231097320 \h </w:instrText>
         </w:r>
         <w:r>
           <w:rPr>
@@ -3202,7 +3202,7 @@
           <w14:ligatures w14:val="standardContextual"/>
         </w:rPr>
       </w:pPr>
-      <w:hyperlink w:anchor="_Toc231093573" w:history="1">
+      <w:hyperlink w:anchor="_Toc231097321" w:history="1">
         <w:r>
           <w:rPr>
             <w:rStyle w:val="Hipervnculo"/>
@@ -3229,7 +3229,7 @@
             <w:noProof/>
             <w:webHidden/>
           </w:rPr>
-          <w:instrText xml:space="preserve"> PAGEREF _Toc231093573 \h </w:instrText>
+          <w:instrText xml:space="preserve"> PAGEREF _Toc231097321 \h </w:instrText>
         </w:r>
         <w:r>
           <w:rPr>
@@ -3276,7 +3276,7 @@
           <w14:ligatures w14:val="standardContextual"/>
         </w:rPr>
       </w:pPr>
-      <w:hyperlink w:anchor="_Toc231093574" w:history="1">
+      <w:hyperlink w:anchor="_Toc231097322" w:history="1">
         <w:r>
           <w:rPr>
             <w:rStyle w:val="Hipervnculo"/>
@@ -3303,7 +3303,7 @@
             <w:noProof/>
             <w:webHidden/>
           </w:rPr>
-          <w:instrText xml:space="preserve"> PAGEREF _Toc231093574 \h </w:instrText>
+          <w:instrText xml:space="preserve"> PAGEREF _Toc231097322 \h </w:instrText>
         </w:r>
         <w:r>
           <w:rPr>
@@ -3350,7 +3350,7 @@
           <w14:ligatures w14:val="standardContextual"/>
         </w:rPr>
       </w:pPr>
-      <w:hyperlink w:anchor="_Toc231093575" w:history="1">
+      <w:hyperlink w:anchor="_Toc231097323" w:history="1">
         <w:r>
           <w:rPr>
             <w:rStyle w:val="Hipervnculo"/>
@@ -3377,7 +3377,7 @@
             <w:noProof/>
             <w:webHidden/>
           </w:rPr>
-          <w:instrText xml:space="preserve"> PAGEREF _Toc231093575 \h </w:instrText>
+          <w:instrText xml:space="preserve"> PAGEREF _Toc231097323 \h </w:instrText>
         </w:r>
         <w:r>
           <w:rPr>
@@ -3424,7 +3424,7 @@
           <w14:ligatures w14:val="standardContextual"/>
         </w:rPr>
       </w:pPr>
-      <w:hyperlink w:anchor="_Toc231093576" w:history="1">
+      <w:hyperlink w:anchor="_Toc231097324" w:history="1">
         <w:r>
           <w:rPr>
             <w:rStyle w:val="Hipervnculo"/>
@@ -3451,7 +3451,7 @@
             <w:noProof/>
             <w:webHidden/>
           </w:rPr>
-          <w:instrText xml:space="preserve"> PAGEREF _Toc231093576 \h </w:instrText>
+          <w:instrText xml:space="preserve"> PAGEREF _Toc231097324 \h </w:instrText>
         </w:r>
         <w:r>
           <w:rPr>
@@ -3498,7 +3498,7 @@
           <w14:ligatures w14:val="standardContextual"/>
         </w:rPr>
       </w:pPr>
-      <w:hyperlink w:anchor="_Toc231093577" w:history="1">
+      <w:hyperlink w:anchor="_Toc231097325" w:history="1">
         <w:r>
           <w:rPr>
             <w:rStyle w:val="Hipervnculo"/>
@@ -3525,7 +3525,7 @@
             <w:noProof/>
             <w:webHidden/>
           </w:rPr>
-          <w:instrText xml:space="preserve"> PAGEREF _Toc231093577 \h </w:instrText>
+          <w:instrText xml:space="preserve"> PAGEREF _Toc231097325 \h </w:instrText>
         </w:r>
         <w:r>
           <w:rPr>
@@ -3572,7 +3572,7 @@
           <w14:ligatures w14:val="standardContextual"/>
         </w:rPr>
       </w:pPr>
-      <w:hyperlink w:anchor="_Toc231093578" w:history="1">
+      <w:hyperlink w:anchor="_Toc231097326" w:history="1">
         <w:r>
           <w:rPr>
             <w:rStyle w:val="Hipervnculo"/>
@@ -3599,7 +3599,7 @@
             <w:noProof/>
             <w:webHidden/>
           </w:rPr>
-          <w:instrText xml:space="preserve"> PAGEREF _Toc231093578 \h </w:instrText>
+          <w:instrText xml:space="preserve"> PAGEREF _Toc231097326 \h </w:instrText>
         </w:r>
         <w:r>
           <w:rPr>
@@ -3646,7 +3646,7 @@
           <w14:ligatures w14:val="standardContextual"/>
         </w:rPr>
       </w:pPr>
-      <w:hyperlink w:anchor="_Toc231093579" w:history="1">
+      <w:hyperlink w:anchor="_Toc231097327" w:history="1">
         <w:r>
           <w:rPr>
             <w:rStyle w:val="Hipervnculo"/>
@@ -3673,7 +3673,7 @@
             <w:noProof/>
             <w:webHidden/>
           </w:rPr>
-          <w:instrText xml:space="preserve"> PAGEREF _Toc231093579 \h </w:instrText>
+          <w:instrText xml:space="preserve"> PAGEREF _Toc231097327 \h </w:instrText>
         </w:r>
         <w:r>
           <w:rPr>
@@ -3720,7 +3720,7 @@
           <w14:ligatures w14:val="standardContextual"/>
         </w:rPr>
       </w:pPr>
-      <w:hyperlink w:anchor="_Toc231093580" w:history="1">
+      <w:hyperlink w:anchor="_Toc231097328" w:history="1">
         <w:r>
           <w:rPr>
             <w:rStyle w:val="Hipervnculo"/>
@@ -3747,7 +3747,7 @@
             <w:noProof/>
             <w:webHidden/>
           </w:rPr>
-          <w:instrText xml:space="preserve"> PAGEREF _Toc231093580 \h </w:instrText>
+          <w:instrText xml:space="preserve"> PAGEREF _Toc231097328 \h </w:instrText>
         </w:r>
         <w:r>
           <w:rPr>
@@ -3794,7 +3794,7 @@
           <w14:ligatures w14:val="standardContextual"/>
         </w:rPr>
       </w:pPr>
-      <w:hyperlink w:anchor="_Toc231093581" w:history="1">
+      <w:hyperlink w:anchor="_Toc231097329" w:history="1">
         <w:r>
           <w:rPr>
             <w:rStyle w:val="Hipervnculo"/>
@@ -3821,7 +3821,7 @@
             <w:noProof/>
             <w:webHidden/>
           </w:rPr>
-          <w:instrText xml:space="preserve"> PAGEREF _Toc231093581 \h </w:instrText>
+          <w:instrText xml:space="preserve"> PAGEREF _Toc231097329 \h </w:instrText>
         </w:r>
         <w:r>
           <w:rPr>
@@ -3868,7 +3868,7 @@
           <w14:ligatures w14:val="standardContextual"/>
         </w:rPr>
       </w:pPr>
-      <w:hyperlink w:anchor="_Toc231093582" w:history="1">
+      <w:hyperlink w:anchor="_Toc231097330" w:history="1">
         <w:r>
           <w:rPr>
             <w:rStyle w:val="Hipervnculo"/>
@@ -3895,7 +3895,7 @@
             <w:noProof/>
             <w:webHidden/>
           </w:rPr>
-          <w:instrText xml:space="preserve"> PAGEREF _Toc231093582 \h </w:instrText>
+          <w:instrText xml:space="preserve"> PAGEREF _Toc231097330 \h </w:instrText>
         </w:r>
         <w:r>
           <w:rPr>
@@ -3942,7 +3942,7 @@
           <w14:ligatures w14:val="standardContextual"/>
         </w:rPr>
       </w:pPr>
-      <w:hyperlink w:anchor="_Toc231093583" w:history="1">
+      <w:hyperlink w:anchor="_Toc231097331" w:history="1">
         <w:r>
           <w:rPr>
             <w:rStyle w:val="Hipervnculo"/>
@@ -3969,7 +3969,7 @@
             <w:noProof/>
             <w:webHidden/>
           </w:rPr>
-          <w:instrText xml:space="preserve"> PAGEREF _Toc231093583 \h </w:instrText>
+          <w:instrText xml:space="preserve"> PAGEREF _Toc231097331 \h </w:instrText>
         </w:r>
         <w:r>
           <w:rPr>
@@ -4016,7 +4016,7 @@
           <w14:ligatures w14:val="standardContextual"/>
         </w:rPr>
       </w:pPr>
-      <w:hyperlink w:anchor="_Toc231093584" w:history="1">
+      <w:hyperlink w:anchor="_Toc231097332" w:history="1">
         <w:r>
           <w:rPr>
             <w:rStyle w:val="Hipervnculo"/>
@@ -4043,7 +4043,7 @@
             <w:noProof/>
             <w:webHidden/>
           </w:rPr>
-          <w:instrText xml:space="preserve"> PAGEREF _Toc231093584 \h </w:instrText>
+          <w:instrText xml:space="preserve"> PAGEREF _Toc231097332 \h </w:instrText>
         </w:r>
         <w:r>
           <w:rPr>
@@ -4090,7 +4090,7 @@
           <w14:ligatures w14:val="standardContextual"/>
         </w:rPr>
       </w:pPr>
-      <w:hyperlink w:anchor="_Toc231093585" w:history="1">
+      <w:hyperlink w:anchor="_Toc231097333" w:history="1">
         <w:r>
           <w:rPr>
             <w:rStyle w:val="Hipervnculo"/>
@@ -4117,7 +4117,7 @@
             <w:noProof/>
             <w:webHidden/>
           </w:rPr>
-          <w:instrText xml:space="preserve"> PAGEREF _Toc231093585 \h </w:instrText>
+          <w:instrText xml:space="preserve"> PAGEREF _Toc231097333 \h </w:instrText>
         </w:r>
         <w:r>
           <w:rPr>
@@ -4164,7 +4164,7 @@
           <w14:ligatures w14:val="standardContextual"/>
         </w:rPr>
       </w:pPr>
-      <w:hyperlink w:anchor="_Toc231093586" w:history="1">
+      <w:hyperlink w:anchor="_Toc231097334" w:history="1">
         <w:r>
           <w:rPr>
             <w:rStyle w:val="Hipervnculo"/>
@@ -4191,7 +4191,7 @@
             <w:noProof/>
             <w:webHidden/>
           </w:rPr>
-          <w:instrText xml:space="preserve"> PAGEREF _Toc231093586 \h </w:instrText>
+          <w:instrText xml:space="preserve"> PAGEREF _Toc231097334 \h </w:instrText>
         </w:r>
         <w:r>
           <w:rPr>
@@ -4238,7 +4238,7 @@
           <w14:ligatures w14:val="standardContextual"/>
         </w:rPr>
       </w:pPr>
-      <w:hyperlink w:anchor="_Toc231093587" w:history="1">
+      <w:hyperlink w:anchor="_Toc231097335" w:history="1">
         <w:r>
           <w:rPr>
             <w:rStyle w:val="Hipervnculo"/>
@@ -4265,7 +4265,7 @@
             <w:noProof/>
             <w:webHidden/>
           </w:rPr>
-          <w:instrText xml:space="preserve"> PAGEREF _Toc231093587 \h </w:instrText>
+          <w:instrText xml:space="preserve"> PAGEREF _Toc231097335 \h </w:instrText>
         </w:r>
         <w:r>
           <w:rPr>
@@ -4312,7 +4312,7 @@
           <w14:ligatures w14:val="standardContextual"/>
         </w:rPr>
       </w:pPr>
-      <w:hyperlink w:anchor="_Toc231093588" w:history="1">
+      <w:hyperlink w:anchor="_Toc231097336" w:history="1">
         <w:r>
           <w:rPr>
             <w:rStyle w:val="Hipervnculo"/>
@@ -4339,7 +4339,7 @@
             <w:noProof/>
             <w:webHidden/>
           </w:rPr>
-          <w:instrText xml:space="preserve"> PAGEREF _Toc231093588 \h </w:instrText>
+          <w:instrText xml:space="preserve"> PAGEREF _Toc231097336 \h </w:instrText>
         </w:r>
         <w:r>
           <w:rPr>
@@ -4386,7 +4386,7 @@
           <w14:ligatures w14:val="standardContextual"/>
         </w:rPr>
       </w:pPr>
-      <w:hyperlink w:anchor="_Toc231093589" w:history="1">
+      <w:hyperlink w:anchor="_Toc231097337" w:history="1">
         <w:r>
           <w:rPr>
             <w:rStyle w:val="Hipervnculo"/>
@@ -4413,7 +4413,7 @@
             <w:noProof/>
             <w:webHidden/>
           </w:rPr>
-          <w:instrText xml:space="preserve"> PAGEREF _Toc231093589 \h </w:instrText>
+          <w:instrText xml:space="preserve"> PAGEREF _Toc231097337 \h </w:instrText>
         </w:r>
         <w:r>
           <w:rPr>
@@ -4460,7 +4460,7 @@
           <w14:ligatures w14:val="standardContextual"/>
         </w:rPr>
       </w:pPr>
-      <w:hyperlink w:anchor="_Toc231093590" w:history="1">
+      <w:hyperlink w:anchor="_Toc231097338" w:history="1">
         <w:r>
           <w:rPr>
             <w:rStyle w:val="Hipervnculo"/>
@@ -4487,7 +4487,7 @@
             <w:noProof/>
             <w:webHidden/>
           </w:rPr>
-          <w:instrText xml:space="preserve"> PAGEREF _Toc231093590 \h </w:instrText>
+          <w:instrText xml:space="preserve"> PAGEREF _Toc231097338 \h </w:instrText>
         </w:r>
         <w:r>
           <w:rPr>
@@ -4534,7 +4534,7 @@
           <w14:ligatures w14:val="standardContextual"/>
         </w:rPr>
       </w:pPr>
-      <w:hyperlink w:anchor="_Toc231093591" w:history="1">
+      <w:hyperlink w:anchor="_Toc231097339" w:history="1">
         <w:r>
           <w:rPr>
             <w:rStyle w:val="Hipervnculo"/>
@@ -4561,7 +4561,7 @@
             <w:noProof/>
             <w:webHidden/>
           </w:rPr>
-          <w:instrText xml:space="preserve"> PAGEREF _Toc231093591 \h </w:instrText>
+          <w:instrText xml:space="preserve"> PAGEREF _Toc231097339 \h </w:instrText>
         </w:r>
         <w:r>
           <w:rPr>
@@ -4608,7 +4608,7 @@
           <w14:ligatures w14:val="standardContextual"/>
         </w:rPr>
       </w:pPr>
-      <w:hyperlink w:anchor="_Toc231093592" w:history="1">
+      <w:hyperlink w:anchor="_Toc231097340" w:history="1">
         <w:r>
           <w:rPr>
             <w:rStyle w:val="Hipervnculo"/>
@@ -4635,7 +4635,7 @@
             <w:noProof/>
             <w:webHidden/>
           </w:rPr>
-          <w:instrText xml:space="preserve"> PAGEREF _Toc231093592 \h </w:instrText>
+          <w:instrText xml:space="preserve"> PAGEREF _Toc231097340 \h </w:instrText>
         </w:r>
         <w:r>
           <w:rPr>
@@ -4682,7 +4682,7 @@
           <w14:ligatures w14:val="standardContextual"/>
         </w:rPr>
       </w:pPr>
-      <w:hyperlink w:anchor="_Toc231093593" w:history="1">
+      <w:hyperlink w:anchor="_Toc231097341" w:history="1">
         <w:r>
           <w:rPr>
             <w:rStyle w:val="Hipervnculo"/>
@@ -4709,7 +4709,7 @@
             <w:noProof/>
             <w:webHidden/>
           </w:rPr>
-          <w:instrText xml:space="preserve"> PAGEREF _Toc231093593 \h </w:instrText>
+          <w:instrText xml:space="preserve"> PAGEREF _Toc231097341 \h </w:instrText>
         </w:r>
         <w:r>
           <w:rPr>
@@ -4756,7 +4756,7 @@
           <w14:ligatures w14:val="standardContextual"/>
         </w:rPr>
       </w:pPr>
-      <w:hyperlink w:anchor="_Toc231093594" w:history="1">
+      <w:hyperlink w:anchor="_Toc231097342" w:history="1">
         <w:r>
           <w:rPr>
             <w:rStyle w:val="Hipervnculo"/>
@@ -4783,7 +4783,7 @@
             <w:noProof/>
             <w:webHidden/>
           </w:rPr>
-          <w:instrText xml:space="preserve"> PAGEREF _Toc231093594 \h </w:instrText>
+          <w:instrText xml:space="preserve"> PAGEREF _Toc231097342 \h </w:instrText>
         </w:r>
         <w:r>
           <w:rPr>
@@ -4830,7 +4830,7 @@
           <w14:ligatures w14:val="standardContextual"/>
         </w:rPr>
       </w:pPr>
-      <w:hyperlink w:anchor="_Toc231093595" w:history="1">
+      <w:hyperlink w:anchor="_Toc231097343" w:history="1">
         <w:r>
           <w:rPr>
             <w:rStyle w:val="Hipervnculo"/>
@@ -4857,7 +4857,7 @@
             <w:noProof/>
             <w:webHidden/>
           </w:rPr>
-          <w:instrText xml:space="preserve"> PAGEREF _Toc231093595 \h </w:instrText>
+          <w:instrText xml:space="preserve"> PAGEREF _Toc231097343 \h </w:instrText>
         </w:r>
         <w:r>
           <w:rPr>
@@ -4904,7 +4904,7 @@
           <w14:ligatures w14:val="standardContextual"/>
         </w:rPr>
       </w:pPr>
-      <w:hyperlink w:anchor="_Toc231093596" w:history="1">
+      <w:hyperlink w:anchor="_Toc231097344" w:history="1">
         <w:r>
           <w:rPr>
             <w:rStyle w:val="Hipervnculo"/>
@@ -4931,7 +4931,7 @@
             <w:noProof/>
             <w:webHidden/>
           </w:rPr>
-          <w:instrText xml:space="preserve"> PAGEREF _Toc231093596 \h </w:instrText>
+          <w:instrText xml:space="preserve"> PAGEREF _Toc231097344 \h </w:instrText>
         </w:r>
         <w:r>
           <w:rPr>
@@ -4978,7 +4978,7 @@
           <w14:ligatures w14:val="standardContextual"/>
         </w:rPr>
       </w:pPr>
-      <w:hyperlink w:anchor="_Toc231093597" w:history="1">
+      <w:hyperlink w:anchor="_Toc231097345" w:history="1">
         <w:r>
           <w:rPr>
             <w:rStyle w:val="Hipervnculo"/>
@@ -5005,7 +5005,7 @@
             <w:noProof/>
             <w:webHidden/>
           </w:rPr>
-          <w:instrText xml:space="preserve"> PAGEREF _Toc231093597 \h </w:instrText>
+          <w:instrText xml:space="preserve"> PAGEREF _Toc231097345 \h </w:instrText>
         </w:r>
         <w:r>
           <w:rPr>
@@ -5052,7 +5052,7 @@
           <w14:ligatures w14:val="standardContextual"/>
         </w:rPr>
       </w:pPr>
-      <w:hyperlink w:anchor="_Toc231093598" w:history="1">
+      <w:hyperlink w:anchor="_Toc231097346" w:history="1">
         <w:r>
           <w:rPr>
             <w:rStyle w:val="Hipervnculo"/>
@@ -5079,7 +5079,7 @@
             <w:noProof/>
             <w:webHidden/>
           </w:rPr>
-          <w:instrText xml:space="preserve"> PAGEREF _Toc231093598 \h </w:instrText>
+          <w:instrText xml:space="preserve"> PAGEREF _Toc231097346 \h </w:instrText>
         </w:r>
         <w:r>
           <w:rPr>
@@ -5126,7 +5126,7 @@
           <w14:ligatures w14:val="standardContextual"/>
         </w:rPr>
       </w:pPr>
-      <w:hyperlink w:anchor="_Toc231093599" w:history="1">
+      <w:hyperlink w:anchor="_Toc231097347" w:history="1">
         <w:r>
           <w:rPr>
             <w:rStyle w:val="Hipervnculo"/>
@@ -5153,7 +5153,7 @@
             <w:noProof/>
             <w:webHidden/>
           </w:rPr>
-          <w:instrText xml:space="preserve"> PAGEREF _Toc231093599 \h </w:instrText>
+          <w:instrText xml:space="preserve"> PAGEREF _Toc231097347 \h </w:instrText>
         </w:r>
         <w:r>
           <w:rPr>
@@ -5200,7 +5200,7 @@
           <w14:ligatures w14:val="standardContextual"/>
         </w:rPr>
       </w:pPr>
-      <w:hyperlink w:anchor="_Toc231093600" w:history="1">
+      <w:hyperlink w:anchor="_Toc231097348" w:history="1">
         <w:r>
           <w:rPr>
             <w:rStyle w:val="Hipervnculo"/>
@@ -5227,7 +5227,7 @@
             <w:noProof/>
             <w:webHidden/>
           </w:rPr>
-          <w:instrText xml:space="preserve"> PAGEREF _Toc231093600 \h </w:instrText>
+          <w:instrText xml:space="preserve"> PAGEREF _Toc231097348 \h </w:instrText>
         </w:r>
         <w:r>
           <w:rPr>
@@ -5274,7 +5274,7 @@
           <w14:ligatures w14:val="standardContextual"/>
         </w:rPr>
       </w:pPr>
-      <w:hyperlink w:anchor="_Toc231093601" w:history="1">
+      <w:hyperlink w:anchor="_Toc231097349" w:history="1">
         <w:r>
           <w:rPr>
             <w:rStyle w:val="Hipervnculo"/>
@@ -5301,7 +5301,7 @@
             <w:noProof/>
             <w:webHidden/>
           </w:rPr>
-          <w:instrText xml:space="preserve"> PAGEREF _Toc231093601 \h </w:instrText>
+          <w:instrText xml:space="preserve"> PAGEREF _Toc231097349 \h </w:instrText>
         </w:r>
         <w:r>
           <w:rPr>
@@ -5348,7 +5348,7 @@
           <w14:ligatures w14:val="standardContextual"/>
         </w:rPr>
       </w:pPr>
-      <w:hyperlink w:anchor="_Toc231093602" w:history="1">
+      <w:hyperlink w:anchor="_Toc231097350" w:history="1">
         <w:r>
           <w:rPr>
             <w:rStyle w:val="Hipervnculo"/>
@@ -5375,7 +5375,7 @@
             <w:noProof/>
             <w:webHidden/>
           </w:rPr>
-          <w:instrText xml:space="preserve"> PAGEREF _Toc231093602 \h </w:instrText>
+          <w:instrText xml:space="preserve"> PAGEREF _Toc231097350 \h </w:instrText>
         </w:r>
         <w:r>
           <w:rPr>
@@ -5422,7 +5422,7 @@
           <w14:ligatures w14:val="standardContextual"/>
         </w:rPr>
       </w:pPr>
-      <w:hyperlink w:anchor="_Toc231093603" w:history="1">
+      <w:hyperlink w:anchor="_Toc231097351" w:history="1">
         <w:r>
           <w:rPr>
             <w:rStyle w:val="Hipervnculo"/>
@@ -5449,7 +5449,7 @@
             <w:noProof/>
             <w:webHidden/>
           </w:rPr>
-          <w:instrText xml:space="preserve"> PAGEREF _Toc231093603 \h </w:instrText>
+          <w:instrText xml:space="preserve"> PAGEREF _Toc231097351 \h </w:instrText>
         </w:r>
         <w:r>
           <w:rPr>
@@ -5496,7 +5496,7 @@
           <w14:ligatures w14:val="standardContextual"/>
         </w:rPr>
       </w:pPr>
-      <w:hyperlink w:anchor="_Toc231093604" w:history="1">
+      <w:hyperlink w:anchor="_Toc231097352" w:history="1">
         <w:r>
           <w:rPr>
             <w:rStyle w:val="Hipervnculo"/>
@@ -5523,7 +5523,7 @@
             <w:noProof/>
             <w:webHidden/>
           </w:rPr>
-          <w:instrText xml:space="preserve"> PAGEREF _Toc231093604 \h </w:instrText>
+          <w:instrText xml:space="preserve"> PAGEREF _Toc231097352 \h </w:instrText>
         </w:r>
         <w:r>
           <w:rPr>
@@ -5570,7 +5570,7 @@
           <w14:ligatures w14:val="standardContextual"/>
         </w:rPr>
       </w:pPr>
-      <w:hyperlink w:anchor="_Toc231093605" w:history="1">
+      <w:hyperlink w:anchor="_Toc231097353" w:history="1">
         <w:r>
           <w:rPr>
             <w:rStyle w:val="Hipervnculo"/>
@@ -5597,7 +5597,7 @@
             <w:noProof/>
             <w:webHidden/>
           </w:rPr>
-          <w:instrText xml:space="preserve"> PAGEREF _Toc231093605 \h </w:instrText>
+          <w:instrText xml:space="preserve"> PAGEREF _Toc231097353 \h </w:instrText>
         </w:r>
         <w:r>
           <w:rPr>
@@ -5644,7 +5644,7 @@
           <w14:ligatures w14:val="standardContextual"/>
         </w:rPr>
       </w:pPr>
-      <w:hyperlink w:anchor="_Toc231093606" w:history="1">
+      <w:hyperlink w:anchor="_Toc231097354" w:history="1">
         <w:r>
           <w:rPr>
             <w:rStyle w:val="Hipervnculo"/>
@@ -5671,7 +5671,7 @@
             <w:noProof/>
             <w:webHidden/>
           </w:rPr>
-          <w:instrText xml:space="preserve"> PAGEREF _Toc231093606 \h </w:instrText>
+          <w:instrText xml:space="preserve"> PAGEREF _Toc231097354 \h </w:instrText>
         </w:r>
         <w:r>
           <w:rPr>
@@ -5691,7 +5691,7 @@
             <w:noProof/>
             <w:webHidden/>
           </w:rPr>
-          <w:t>53</w:t>
+          <w:t>54</w:t>
         </w:r>
         <w:r>
           <w:rPr>
@@ -5719,7 +5719,7 @@
       <w:pPr>
         <w:pStyle w:val="Ttulo1"/>
       </w:pPr>
-      <w:bookmarkStart w:id="7" w:name="_Toc231093543"/>
+      <w:bookmarkStart w:id="7" w:name="_Toc231097291"/>
       <w:r>
         <w:lastRenderedPageBreak/>
         <w:t>Índice de tablas</w:t>
@@ -5751,7 +5751,7 @@
       <w:r>
         <w:fldChar w:fldCharType="separate"/>
       </w:r>
-      <w:hyperlink w:anchor="_Toc231093607" w:history="1">
+      <w:hyperlink w:anchor="_Toc231097355" w:history="1">
         <w:r>
           <w:rPr>
             <w:rStyle w:val="Hipervnculo"/>
@@ -5778,7 +5778,7 @@
             <w:noProof/>
             <w:webHidden/>
           </w:rPr>
-          <w:instrText xml:space="preserve"> PAGEREF _Toc231093607 \h </w:instrText>
+          <w:instrText xml:space="preserve"> PAGEREF _Toc231097355 \h </w:instrText>
         </w:r>
         <w:r>
           <w:rPr>
@@ -5825,7 +5825,7 @@
           <w14:ligatures w14:val="standardContextual"/>
         </w:rPr>
       </w:pPr>
-      <w:hyperlink w:anchor="_Toc231093608" w:history="1">
+      <w:hyperlink w:anchor="_Toc231097356" w:history="1">
         <w:r>
           <w:rPr>
             <w:rStyle w:val="Hipervnculo"/>
@@ -5852,7 +5852,7 @@
             <w:noProof/>
             <w:webHidden/>
           </w:rPr>
-          <w:instrText xml:space="preserve"> PAGEREF _Toc231093608 \h </w:instrText>
+          <w:instrText xml:space="preserve"> PAGEREF _Toc231097356 \h </w:instrText>
         </w:r>
         <w:r>
           <w:rPr>
@@ -5899,7 +5899,7 @@
           <w14:ligatures w14:val="standardContextual"/>
         </w:rPr>
       </w:pPr>
-      <w:hyperlink w:anchor="_Toc231093609" w:history="1">
+      <w:hyperlink w:anchor="_Toc231097357" w:history="1">
         <w:r>
           <w:rPr>
             <w:rStyle w:val="Hipervnculo"/>
@@ -5926,7 +5926,7 @@
             <w:noProof/>
             <w:webHidden/>
           </w:rPr>
-          <w:instrText xml:space="preserve"> PAGEREF _Toc231093609 \h </w:instrText>
+          <w:instrText xml:space="preserve"> PAGEREF _Toc231097357 \h </w:instrText>
         </w:r>
         <w:r>
           <w:rPr>
@@ -5973,7 +5973,7 @@
           <w14:ligatures w14:val="standardContextual"/>
         </w:rPr>
       </w:pPr>
-      <w:hyperlink w:anchor="_Toc231093610" w:history="1">
+      <w:hyperlink w:anchor="_Toc231097358" w:history="1">
         <w:r>
           <w:rPr>
             <w:rStyle w:val="Hipervnculo"/>
@@ -6000,7 +6000,7 @@
             <w:noProof/>
             <w:webHidden/>
           </w:rPr>
-          <w:instrText xml:space="preserve"> PAGEREF _Toc231093610 \h </w:instrText>
+          <w:instrText xml:space="preserve"> PAGEREF _Toc231097358 \h </w:instrText>
         </w:r>
         <w:r>
           <w:rPr>
@@ -6047,7 +6047,7 @@
           <w14:ligatures w14:val="standardContextual"/>
         </w:rPr>
       </w:pPr>
-      <w:hyperlink w:anchor="_Toc231093611" w:history="1">
+      <w:hyperlink w:anchor="_Toc231097359" w:history="1">
         <w:r>
           <w:rPr>
             <w:rStyle w:val="Hipervnculo"/>
@@ -6074,7 +6074,7 @@
             <w:noProof/>
             <w:webHidden/>
           </w:rPr>
-          <w:instrText xml:space="preserve"> PAGEREF _Toc231093611 \h </w:instrText>
+          <w:instrText xml:space="preserve"> PAGEREF _Toc231097359 \h </w:instrText>
         </w:r>
         <w:r>
           <w:rPr>
@@ -6121,7 +6121,7 @@
           <w14:ligatures w14:val="standardContextual"/>
         </w:rPr>
       </w:pPr>
-      <w:hyperlink w:anchor="_Toc231093612" w:history="1">
+      <w:hyperlink w:anchor="_Toc231097360" w:history="1">
         <w:r>
           <w:rPr>
             <w:rStyle w:val="Hipervnculo"/>
@@ -6148,7 +6148,7 @@
             <w:noProof/>
             <w:webHidden/>
           </w:rPr>
-          <w:instrText xml:space="preserve"> PAGEREF _Toc231093612 \h </w:instrText>
+          <w:instrText xml:space="preserve"> PAGEREF _Toc231097360 \h </w:instrText>
         </w:r>
         <w:r>
           <w:rPr>
@@ -6195,7 +6195,7 @@
           <w14:ligatures w14:val="standardContextual"/>
         </w:rPr>
       </w:pPr>
-      <w:hyperlink w:anchor="_Toc231093613" w:history="1">
+      <w:hyperlink w:anchor="_Toc231097361" w:history="1">
         <w:r>
           <w:rPr>
             <w:rStyle w:val="Hipervnculo"/>
@@ -6222,7 +6222,7 @@
             <w:noProof/>
             <w:webHidden/>
           </w:rPr>
-          <w:instrText xml:space="preserve"> PAGEREF _Toc231093613 \h </w:instrText>
+          <w:instrText xml:space="preserve"> PAGEREF _Toc231097361 \h </w:instrText>
         </w:r>
         <w:r>
           <w:rPr>
@@ -6269,7 +6269,7 @@
           <w14:ligatures w14:val="standardContextual"/>
         </w:rPr>
       </w:pPr>
-      <w:hyperlink w:anchor="_Toc231093614" w:history="1">
+      <w:hyperlink w:anchor="_Toc231097362" w:history="1">
         <w:r>
           <w:rPr>
             <w:rStyle w:val="Hipervnculo"/>
@@ -6296,7 +6296,7 @@
             <w:noProof/>
             <w:webHidden/>
           </w:rPr>
-          <w:instrText xml:space="preserve"> PAGEREF _Toc231093614 \h </w:instrText>
+          <w:instrText xml:space="preserve"> PAGEREF _Toc231097362 \h </w:instrText>
         </w:r>
         <w:r>
           <w:rPr>
@@ -6343,7 +6343,7 @@
           <w14:ligatures w14:val="standardContextual"/>
         </w:rPr>
       </w:pPr>
-      <w:hyperlink w:anchor="_Toc231093615" w:history="1">
+      <w:hyperlink w:anchor="_Toc231097363" w:history="1">
         <w:r>
           <w:rPr>
             <w:rStyle w:val="Hipervnculo"/>
@@ -6370,7 +6370,7 @@
             <w:noProof/>
             <w:webHidden/>
           </w:rPr>
-          <w:instrText xml:space="preserve"> PAGEREF _Toc231093615 \h </w:instrText>
+          <w:instrText xml:space="preserve"> PAGEREF _Toc231097363 \h </w:instrText>
         </w:r>
         <w:r>
           <w:rPr>
@@ -6417,7 +6417,7 @@
           <w14:ligatures w14:val="standardContextual"/>
         </w:rPr>
       </w:pPr>
-      <w:hyperlink w:anchor="_Toc231093616" w:history="1">
+      <w:hyperlink w:anchor="_Toc231097364" w:history="1">
         <w:r>
           <w:rPr>
             <w:rStyle w:val="Hipervnculo"/>
@@ -6444,7 +6444,7 @@
             <w:noProof/>
             <w:webHidden/>
           </w:rPr>
-          <w:instrText xml:space="preserve"> PAGEREF _Toc231093616 \h </w:instrText>
+          <w:instrText xml:space="preserve"> PAGEREF _Toc231097364 \h </w:instrText>
         </w:r>
         <w:r>
           <w:rPr>
@@ -6491,7 +6491,7 @@
           <w14:ligatures w14:val="standardContextual"/>
         </w:rPr>
       </w:pPr>
-      <w:hyperlink w:anchor="_Toc231093617" w:history="1">
+      <w:hyperlink w:anchor="_Toc231097365" w:history="1">
         <w:r>
           <w:rPr>
             <w:rStyle w:val="Hipervnculo"/>
@@ -6518,7 +6518,7 @@
             <w:noProof/>
             <w:webHidden/>
           </w:rPr>
-          <w:instrText xml:space="preserve"> PAGEREF _Toc231093617 \h </w:instrText>
+          <w:instrText xml:space="preserve"> PAGEREF _Toc231097365 \h </w:instrText>
         </w:r>
         <w:r>
           <w:rPr>
@@ -6565,7 +6565,7 @@
           <w14:ligatures w14:val="standardContextual"/>
         </w:rPr>
       </w:pPr>
-      <w:hyperlink w:anchor="_Toc231093618" w:history="1">
+      <w:hyperlink w:anchor="_Toc231097366" w:history="1">
         <w:r>
           <w:rPr>
             <w:rStyle w:val="Hipervnculo"/>
@@ -6592,7 +6592,7 @@
             <w:noProof/>
             <w:webHidden/>
           </w:rPr>
-          <w:instrText xml:space="preserve"> PAGEREF _Toc231093618 \h </w:instrText>
+          <w:instrText xml:space="preserve"> PAGEREF _Toc231097366 \h </w:instrText>
         </w:r>
         <w:r>
           <w:rPr>
@@ -6639,7 +6639,7 @@
           <w14:ligatures w14:val="standardContextual"/>
         </w:rPr>
       </w:pPr>
-      <w:hyperlink w:anchor="_Toc231093619" w:history="1">
+      <w:hyperlink w:anchor="_Toc231097367" w:history="1">
         <w:r>
           <w:rPr>
             <w:rStyle w:val="Hipervnculo"/>
@@ -6666,7 +6666,7 @@
             <w:noProof/>
             <w:webHidden/>
           </w:rPr>
-          <w:instrText xml:space="preserve"> PAGEREF _Toc231093619 \h </w:instrText>
+          <w:instrText xml:space="preserve"> PAGEREF _Toc231097367 \h </w:instrText>
         </w:r>
         <w:r>
           <w:rPr>
@@ -6713,7 +6713,7 @@
           <w14:ligatures w14:val="standardContextual"/>
         </w:rPr>
       </w:pPr>
-      <w:hyperlink w:anchor="_Toc231093620" w:history="1">
+      <w:hyperlink w:anchor="_Toc231097368" w:history="1">
         <w:r>
           <w:rPr>
             <w:rStyle w:val="Hipervnculo"/>
@@ -6740,7 +6740,7 @@
             <w:noProof/>
             <w:webHidden/>
           </w:rPr>
-          <w:instrText xml:space="preserve"> PAGEREF _Toc231093620 \h </w:instrText>
+          <w:instrText xml:space="preserve"> PAGEREF _Toc231097368 \h </w:instrText>
         </w:r>
         <w:r>
           <w:rPr>
@@ -6788,7 +6788,7 @@
       <w:pPr>
         <w:pStyle w:val="Ttulo1"/>
       </w:pPr>
-      <w:bookmarkStart w:id="8" w:name="_Toc231093544"/>
+      <w:bookmarkStart w:id="8" w:name="_Toc231097292"/>
       <w:r>
         <w:lastRenderedPageBreak/>
         <w:t>Índice de figuras</w:t>
@@ -6820,7 +6820,7 @@
       <w:r>
         <w:fldChar w:fldCharType="separate"/>
       </w:r>
-      <w:hyperlink w:anchor="_Toc231093621" w:history="1">
+      <w:hyperlink w:anchor="_Toc231097369" w:history="1">
         <w:r>
           <w:rPr>
             <w:rStyle w:val="Hipervnculo"/>
@@ -6847,7 +6847,7 @@
             <w:noProof/>
             <w:webHidden/>
           </w:rPr>
-          <w:instrText xml:space="preserve"> PAGEREF _Toc231093621 \h </w:instrText>
+          <w:instrText xml:space="preserve"> PAGEREF _Toc231097369 \h </w:instrText>
         </w:r>
         <w:r>
           <w:rPr>
@@ -6894,7 +6894,7 @@
           <w14:ligatures w14:val="standardContextual"/>
         </w:rPr>
       </w:pPr>
-      <w:hyperlink w:anchor="_Toc231093622" w:history="1">
+      <w:hyperlink w:anchor="_Toc231097370" w:history="1">
         <w:r>
           <w:rPr>
             <w:rStyle w:val="Hipervnculo"/>
@@ -6921,7 +6921,7 @@
             <w:noProof/>
             <w:webHidden/>
           </w:rPr>
-          <w:instrText xml:space="preserve"> PAGEREF _Toc231093622 \h </w:instrText>
+          <w:instrText xml:space="preserve"> PAGEREF _Toc231097370 \h </w:instrText>
         </w:r>
         <w:r>
           <w:rPr>
@@ -6968,7 +6968,7 @@
           <w14:ligatures w14:val="standardContextual"/>
         </w:rPr>
       </w:pPr>
-      <w:hyperlink w:anchor="_Toc231093623" w:history="1">
+      <w:hyperlink w:anchor="_Toc231097371" w:history="1">
         <w:r>
           <w:rPr>
             <w:rStyle w:val="Hipervnculo"/>
@@ -6995,7 +6995,7 @@
             <w:noProof/>
             <w:webHidden/>
           </w:rPr>
-          <w:instrText xml:space="preserve"> PAGEREF _Toc231093623 \h </w:instrText>
+          <w:instrText xml:space="preserve"> PAGEREF _Toc231097371 \h </w:instrText>
         </w:r>
         <w:r>
           <w:rPr>
@@ -7042,7 +7042,7 @@
           <w14:ligatures w14:val="standardContextual"/>
         </w:rPr>
       </w:pPr>
-      <w:hyperlink w:anchor="_Toc231093624" w:history="1">
+      <w:hyperlink w:anchor="_Toc231097372" w:history="1">
         <w:r>
           <w:rPr>
             <w:rStyle w:val="Hipervnculo"/>
@@ -7069,7 +7069,7 @@
             <w:noProof/>
             <w:webHidden/>
           </w:rPr>
-          <w:instrText xml:space="preserve"> PAGEREF _Toc231093624 \h </w:instrText>
+          <w:instrText xml:space="preserve"> PAGEREF _Toc231097372 \h </w:instrText>
         </w:r>
         <w:r>
           <w:rPr>
@@ -7116,7 +7116,7 @@
           <w14:ligatures w14:val="standardContextual"/>
         </w:rPr>
       </w:pPr>
-      <w:hyperlink w:anchor="_Toc231093625" w:history="1">
+      <w:hyperlink w:anchor="_Toc231097373" w:history="1">
         <w:r>
           <w:rPr>
             <w:rStyle w:val="Hipervnculo"/>
@@ -7143,7 +7143,7 @@
             <w:noProof/>
             <w:webHidden/>
           </w:rPr>
-          <w:instrText xml:space="preserve"> PAGEREF _Toc231093625 \h </w:instrText>
+          <w:instrText xml:space="preserve"> PAGEREF _Toc231097373 \h </w:instrText>
         </w:r>
         <w:r>
           <w:rPr>
@@ -7190,7 +7190,7 @@
           <w14:ligatures w14:val="standardContextual"/>
         </w:rPr>
       </w:pPr>
-      <w:hyperlink w:anchor="_Toc231093626" w:history="1">
+      <w:hyperlink w:anchor="_Toc231097374" w:history="1">
         <w:r>
           <w:rPr>
             <w:rStyle w:val="Hipervnculo"/>
@@ -7217,7 +7217,7 @@
             <w:noProof/>
             <w:webHidden/>
           </w:rPr>
-          <w:instrText xml:space="preserve"> PAGEREF _Toc231093626 \h </w:instrText>
+          <w:instrText xml:space="preserve"> PAGEREF _Toc231097374 \h </w:instrText>
         </w:r>
         <w:r>
           <w:rPr>
@@ -7265,7 +7265,7 @@
       <w:pPr>
         <w:pStyle w:val="Ttulo1"/>
       </w:pPr>
-      <w:bookmarkStart w:id="9" w:name="_Toc231093545"/>
+      <w:bookmarkStart w:id="9" w:name="_Toc231097293"/>
       <w:r>
         <w:lastRenderedPageBreak/>
         <w:t>Lista de abreviaturas y siglas</w:t>
@@ -8051,7 +8051,7 @@
       <w:pPr>
         <w:pStyle w:val="Ttulo1"/>
       </w:pPr>
-      <w:bookmarkStart w:id="10" w:name="_Toc231093546"/>
+      <w:bookmarkStart w:id="10" w:name="_Toc231097294"/>
       <w:r>
         <w:lastRenderedPageBreak/>
         <w:t>Capítulo 1 — Introducción</w:t>
@@ -8062,7 +8062,7 @@
       <w:pPr>
         <w:pStyle w:val="Ttulo2"/>
       </w:pPr>
-      <w:bookmarkStart w:id="11" w:name="_Toc231093547"/>
+      <w:bookmarkStart w:id="11" w:name="_Toc231097295"/>
       <w:r>
         <w:t>1.1 Contextualización</w:t>
       </w:r>
@@ -8150,7 +8150,7 @@
       <w:pPr>
         <w:pStyle w:val="Ttulo2"/>
       </w:pPr>
-      <w:bookmarkStart w:id="12" w:name="_Toc231093548"/>
+      <w:bookmarkStart w:id="12" w:name="_Toc231097296"/>
       <w:r>
         <w:t>1.2 Problema de investigación y justificación</w:t>
       </w:r>
@@ -8260,7 +8260,7 @@
       <w:pPr>
         <w:pStyle w:val="Ttulo2"/>
       </w:pPr>
-      <w:bookmarkStart w:id="13" w:name="_Toc231093549"/>
+      <w:bookmarkStart w:id="13" w:name="_Toc231097297"/>
       <w:r>
         <w:t>1.3 Pregunta y objetivos de investigación</w:t>
       </w:r>
@@ -8445,7 +8445,7 @@
       <w:pPr>
         <w:pStyle w:val="Ttulo2"/>
       </w:pPr>
-      <w:bookmarkStart w:id="14" w:name="_Toc231093550"/>
+      <w:bookmarkStart w:id="14" w:name="_Toc231097298"/>
       <w:r>
         <w:lastRenderedPageBreak/>
         <w:t>1.4 Hipótesis general</w:t>
@@ -8489,7 +8489,7 @@
       <w:pPr>
         <w:pStyle w:val="Ttulo2"/>
       </w:pPr>
-      <w:bookmarkStart w:id="15" w:name="_Toc231093551"/>
+      <w:bookmarkStart w:id="15" w:name="_Toc231097299"/>
       <w:r>
         <w:t>1.5 Aspectos metodológicos y alcance</w:t>
       </w:r>
@@ -8592,7 +8592,7 @@
       <w:pPr>
         <w:pStyle w:val="Ttulo2"/>
       </w:pPr>
-      <w:bookmarkStart w:id="16" w:name="_Toc231093552"/>
+      <w:bookmarkStart w:id="16" w:name="_Toc231097300"/>
       <w:r>
         <w:t>1.6 Aportes esperados</w:t>
       </w:r>
@@ -8645,7 +8645,7 @@
       <w:pPr>
         <w:pStyle w:val="Ttulo2"/>
       </w:pPr>
-      <w:bookmarkStart w:id="17" w:name="_Toc231093553"/>
+      <w:bookmarkStart w:id="17" w:name="_Toc231097301"/>
       <w:r>
         <w:t>1.7 Estructura de la tesis</w:t>
       </w:r>
@@ -8686,7 +8686,7 @@
       <w:pPr>
         <w:pStyle w:val="Ttulo1"/>
       </w:pPr>
-      <w:bookmarkStart w:id="18" w:name="_Toc231093554"/>
+      <w:bookmarkStart w:id="18" w:name="_Toc231097302"/>
       <w:r>
         <w:lastRenderedPageBreak/>
         <w:t>Capítulo 2 — Marco teórico y revisión de literatura</w:t>
@@ -8697,7 +8697,7 @@
       <w:pPr>
         <w:pStyle w:val="Ttulo2"/>
       </w:pPr>
-      <w:bookmarkStart w:id="19" w:name="_Toc231093555"/>
+      <w:bookmarkStart w:id="19" w:name="_Toc231097303"/>
       <w:r>
         <w:t>2.1 Determinantes macroeconómicos de los retornos accionarios</w:t>
       </w:r>
@@ -8995,7 +8995,7 @@
       <w:pPr>
         <w:pStyle w:val="Ttulo2"/>
       </w:pPr>
-      <w:bookmarkStart w:id="20" w:name="_Toc231093556"/>
+      <w:bookmarkStart w:id="20" w:name="_Toc231097304"/>
       <w:r>
         <w:t>2.2 Precios de commodities y valoración de empresas mineras</w:t>
       </w:r>
@@ -9129,7 +9129,7 @@
       <w:pPr>
         <w:pStyle w:val="Ttulo2"/>
       </w:pPr>
-      <w:bookmarkStart w:id="21" w:name="_Toc231093557"/>
+      <w:bookmarkStart w:id="21" w:name="_Toc231097305"/>
       <w:r>
         <w:t>2.3 Tipo de cambio y exposición de empresas exportadoras</w:t>
       </w:r>
@@ -9223,7 +9223,7 @@
       <w:pPr>
         <w:pStyle w:val="Ttulo2"/>
       </w:pPr>
-      <w:bookmarkStart w:id="22" w:name="_Toc231093558"/>
+      <w:bookmarkStart w:id="22" w:name="_Toc231097306"/>
       <w:r>
         <w:t>2.4 Cobre, tipo de cambio y la economía chilena</w:t>
       </w:r>
@@ -9448,7 +9448,7 @@
       <w:pPr>
         <w:pStyle w:val="Ttulo2"/>
       </w:pPr>
-      <w:bookmarkStart w:id="23" w:name="_Toc231093559"/>
+      <w:bookmarkStart w:id="23" w:name="_Toc231097307"/>
       <w:r>
         <w:lastRenderedPageBreak/>
         <w:t>2.5 Eficiencia informacional y segmentación de mercados</w:t>
@@ -9589,7 +9589,7 @@
       <w:pPr>
         <w:pStyle w:val="Ttulo2"/>
       </w:pPr>
-      <w:bookmarkStart w:id="24" w:name="_Toc231093560"/>
+      <w:bookmarkStart w:id="24" w:name="_Toc231097308"/>
       <w:r>
         <w:t>2.6 Enfoques econométricos para la medición de impacto</w:t>
       </w:r>
@@ -9741,7 +9741,7 @@
       <w:pPr>
         <w:pStyle w:val="Ttulo2"/>
       </w:pPr>
-      <w:bookmarkStart w:id="25" w:name="_Toc231093561"/>
+      <w:bookmarkStart w:id="25" w:name="_Toc231097309"/>
       <w:r>
         <w:t>2.7 Síntesis e identificación del vacío de investigación</w:t>
       </w:r>
@@ -9866,7 +9866,7 @@
       <w:pPr>
         <w:pStyle w:val="Ttulo3"/>
       </w:pPr>
-      <w:bookmarkStart w:id="26" w:name="_Toc231093562"/>
+      <w:bookmarkStart w:id="26" w:name="_Toc231097310"/>
       <w:r>
         <w:t>Nota sobre la tabla de literatura</w:t>
       </w:r>
@@ -9896,7 +9896,7 @@
       <w:pPr>
         <w:pStyle w:val="Ttulo1"/>
       </w:pPr>
-      <w:bookmarkStart w:id="27" w:name="_Toc231093563"/>
+      <w:bookmarkStart w:id="27" w:name="_Toc231097311"/>
       <w:r>
         <w:lastRenderedPageBreak/>
         <w:t>Capítulo 3 — Datos y metodología</w:t>
@@ -9907,7 +9907,7 @@
       <w:pPr>
         <w:pStyle w:val="Ttulo2"/>
       </w:pPr>
-      <w:bookmarkStart w:id="28" w:name="_Toc231093564"/>
+      <w:bookmarkStart w:id="28" w:name="_Toc231097312"/>
       <w:r>
         <w:t xml:space="preserve">3.1 </w:t>
       </w:r>
@@ -10102,7 +10102,7 @@
       <w:pPr>
         <w:pStyle w:val="Ttulo2"/>
       </w:pPr>
-      <w:bookmarkStart w:id="29" w:name="_Toc231093565"/>
+      <w:bookmarkStart w:id="29" w:name="_Toc231097313"/>
       <w:r>
         <w:t>3.2 Variable dependiente</w:t>
       </w:r>
@@ -10164,7 +10164,7 @@
       <w:pPr>
         <w:pStyle w:val="Ttulo2"/>
       </w:pPr>
-      <w:bookmarkStart w:id="30" w:name="_Toc231093566"/>
+      <w:bookmarkStart w:id="30" w:name="_Toc231097314"/>
       <w:r>
         <w:t>3.3 Variables explicativas</w:t>
       </w:r>
@@ -10231,7 +10231,7 @@
       <w:pPr>
         <w:pStyle w:val="Ttulo2"/>
       </w:pPr>
-      <w:bookmarkStart w:id="31" w:name="_Toc231093567"/>
+      <w:bookmarkStart w:id="31" w:name="_Toc231097315"/>
       <w:r>
         <w:t>3.4 Tratamiento de datos y frecuencias mixtas</w:t>
       </w:r>
@@ -10288,7 +10288,7 @@
       <w:pPr>
         <w:pStyle w:val="Ttulo2"/>
       </w:pPr>
-      <w:bookmarkStart w:id="32" w:name="_Toc231093568"/>
+      <w:bookmarkStart w:id="32" w:name="_Toc231097316"/>
       <w:r>
         <w:t>3.5 Datación de las fases del ciclo del cobre</w:t>
       </w:r>
@@ -10354,7 +10354,7 @@
       <w:pPr>
         <w:pStyle w:val="Ttulo2"/>
       </w:pPr>
-      <w:bookmarkStart w:id="33" w:name="_Toc231093569"/>
+      <w:bookmarkStart w:id="33" w:name="_Toc231097317"/>
       <w:r>
         <w:lastRenderedPageBreak/>
         <w:t>3.6 Estrategia econométrica</w:t>
@@ -10365,7 +10365,7 @@
       <w:pPr>
         <w:pStyle w:val="Ttulo3"/>
       </w:pPr>
-      <w:bookmarkStart w:id="34" w:name="_Toc231093570"/>
+      <w:bookmarkStart w:id="34" w:name="_Toc231097318"/>
       <w:r>
         <w:t>3.6.1 Estacionariedad y orden de integración (OE1)</w:t>
       </w:r>
@@ -10408,7 +10408,7 @@
       <w:pPr>
         <w:pStyle w:val="Ttulo3"/>
       </w:pPr>
-      <w:bookmarkStart w:id="35" w:name="_Toc231093571"/>
+      <w:bookmarkStart w:id="35" w:name="_Toc231097319"/>
       <w:r>
         <w:t>3.6.2 Modelo de impacto: panel de efectos fijos (OE2)</w:t>
       </w:r>
@@ -10499,7 +10499,7 @@
       <w:pPr>
         <w:pStyle w:val="Ttulo3"/>
       </w:pPr>
-      <w:bookmarkStart w:id="36" w:name="_Toc231093572"/>
+      <w:bookmarkStart w:id="36" w:name="_Toc231097320"/>
       <w:r>
         <w:t>3.6.3 Relaciones de largo plazo: cointegración (OE3)</w:t>
       </w:r>
@@ -10600,7 +10600,7 @@
       <w:pPr>
         <w:pStyle w:val="Ttulo3"/>
       </w:pPr>
-      <w:bookmarkStart w:id="37" w:name="_Toc231093573"/>
+      <w:bookmarkStart w:id="37" w:name="_Toc231097321"/>
       <w:r>
         <w:t>3.6.4 Dinámica de shocks: VAR, impulso-respuesta y descomposición de varianza (OE4)</w:t>
       </w:r>
@@ -10720,7 +10720,7 @@
       <w:pPr>
         <w:pStyle w:val="Ttulo3"/>
       </w:pPr>
-      <w:bookmarkStart w:id="38" w:name="_Toc231093574"/>
+      <w:bookmarkStart w:id="38" w:name="_Toc231097322"/>
       <w:r>
         <w:t>3.6.5 Estabilidad por fases del ciclo (OE5)</w:t>
       </w:r>
@@ -10766,7 +10766,7 @@
       <w:pPr>
         <w:pStyle w:val="Ttulo3"/>
       </w:pPr>
-      <w:bookmarkStart w:id="39" w:name="_Toc231093575"/>
+      <w:bookmarkStart w:id="39" w:name="_Toc231097323"/>
       <w:r>
         <w:t>3.6.6 Comparación entre mercados: triangulación (OE6)</w:t>
       </w:r>
@@ -10817,7 +10817,7 @@
       <w:pPr>
         <w:pStyle w:val="Ttulo2"/>
       </w:pPr>
-      <w:bookmarkStart w:id="40" w:name="_Toc231093576"/>
+      <w:bookmarkStart w:id="40" w:name="_Toc231097324"/>
       <w:r>
         <w:t xml:space="preserve">3.7 </w:t>
       </w:r>
@@ -10870,7 +10870,7 @@
       <w:pPr>
         <w:pStyle w:val="Ttulo3"/>
       </w:pPr>
-      <w:bookmarkStart w:id="41" w:name="_Toc231093577"/>
+      <w:bookmarkStart w:id="41" w:name="_Toc231097325"/>
       <w:r>
         <w:t>Tabla 3.1 — Definición operativa de variables (resumen)</w:t>
       </w:r>
@@ -10882,7 +10882,7 @@
         <w:spacing w:before="40" w:after="40"/>
         <w:jc w:val="center"/>
       </w:pPr>
-      <w:bookmarkStart w:id="42" w:name="_Toc231093607"/>
+      <w:bookmarkStart w:id="42" w:name="_Toc231097355"/>
       <w:r>
         <w:rPr>
           <w:i w:val="0"/>
@@ -12851,7 +12851,7 @@
       <w:pPr>
         <w:pStyle w:val="Ttulo1"/>
       </w:pPr>
-      <w:bookmarkStart w:id="43" w:name="_Toc231093578"/>
+      <w:bookmarkStart w:id="43" w:name="_Toc231097326"/>
       <w:r>
         <w:lastRenderedPageBreak/>
         <w:t>Capítulo 4 — Resultados y discusión</w:t>
@@ -12862,7 +12862,7 @@
       <w:pPr>
         <w:pStyle w:val="Ttulo2"/>
       </w:pPr>
-      <w:bookmarkStart w:id="44" w:name="_Toc231093579"/>
+      <w:bookmarkStart w:id="44" w:name="_Toc231097327"/>
       <w:r>
         <w:t>4.1 Análisis descriptivo y propiedades de las series (OE1)</w:t>
       </w:r>
@@ -13092,7 +13092,7 @@
       <w:pPr>
         <w:pStyle w:val="Ttulo2"/>
       </w:pPr>
-      <w:bookmarkStart w:id="45" w:name="_Toc231093580"/>
+      <w:bookmarkStart w:id="45" w:name="_Toc231097328"/>
       <w:r>
         <w:t>4.2 Determinantes de los retornos: global vs local (OE2)</w:t>
       </w:r>
@@ -13114,7 +13114,7 @@
         <w:spacing w:before="40" w:after="40"/>
         <w:jc w:val="center"/>
       </w:pPr>
-      <w:bookmarkStart w:id="46" w:name="_Toc231093608"/>
+      <w:bookmarkStart w:id="46" w:name="_Toc231097356"/>
       <w:r>
         <w:rPr>
           <w:i w:val="0"/>
@@ -13920,7 +13920,7 @@
           <w:noProof/>
         </w:rPr>
         <w:drawing>
-          <wp:inline distT="0" distB="0" distL="0" distR="0" wp14:anchorId="794C07EB" wp14:editId="74D8B7B5">
+          <wp:inline distT="0" distB="0" distL="0" distR="0" wp14:anchorId="75B1D9A5" wp14:editId="42F773A5">
             <wp:extent cx="5212080" cy="2833680"/>
             <wp:effectExtent l="0" t="0" r="0" b="0"/>
             <wp:docPr id="1" name="Picture 1"/>
@@ -13962,7 +13962,7 @@
         <w:spacing w:before="160" w:after="200"/>
         <w:jc w:val="center"/>
       </w:pPr>
-      <w:bookmarkStart w:id="47" w:name="_Toc231093621"/>
+      <w:bookmarkStart w:id="47" w:name="_Toc231097369"/>
       <w:r>
         <w:rPr>
           <w:i w:val="0"/>
@@ -14068,7 +14068,7 @@
       <w:pPr>
         <w:pStyle w:val="Ttulo2"/>
       </w:pPr>
-      <w:bookmarkStart w:id="48" w:name="_Toc231093581"/>
+      <w:bookmarkStart w:id="48" w:name="_Toc231097329"/>
       <w:r>
         <w:t>4.3 Relaciones de largo plazo (OE3)</w:t>
       </w:r>
@@ -14232,7 +14232,7 @@
       <w:pPr>
         <w:pStyle w:val="Ttulo2"/>
       </w:pPr>
-      <w:bookmarkStart w:id="49" w:name="_Toc231093582"/>
+      <w:bookmarkStart w:id="49" w:name="_Toc231097330"/>
       <w:r>
         <w:t>4.4 Dinámica de shocks (OE4)</w:t>
       </w:r>
@@ -14254,7 +14254,7 @@
         <w:spacing w:before="40" w:after="40"/>
         <w:jc w:val="center"/>
       </w:pPr>
-      <w:bookmarkStart w:id="50" w:name="_Toc231093609"/>
+      <w:bookmarkStart w:id="50" w:name="_Toc231097357"/>
       <w:r>
         <w:rPr>
           <w:i w:val="0"/>
@@ -14701,7 +14701,7 @@
           <w:noProof/>
         </w:rPr>
         <w:drawing>
-          <wp:inline distT="0" distB="0" distL="0" distR="0" wp14:anchorId="390C85FA" wp14:editId="307C9EF7">
+          <wp:inline distT="0" distB="0" distL="0" distR="0" wp14:anchorId="2A1C5F94" wp14:editId="1D8B740E">
             <wp:extent cx="5212080" cy="3890356"/>
             <wp:effectExtent l="0" t="0" r="0" b="0"/>
             <wp:docPr id="2" name="Picture 2"/>
@@ -14743,7 +14743,7 @@
         <w:spacing w:before="160" w:after="200"/>
         <w:jc w:val="center"/>
       </w:pPr>
-      <w:bookmarkStart w:id="51" w:name="_Toc231093622"/>
+      <w:bookmarkStart w:id="51" w:name="_Toc231097370"/>
       <w:r>
         <w:rPr>
           <w:i w:val="0"/>
@@ -14813,7 +14813,7 @@
           <w:noProof/>
         </w:rPr>
         <w:drawing>
-          <wp:inline distT="0" distB="0" distL="0" distR="0" wp14:anchorId="37EB26B9" wp14:editId="53395B80">
+          <wp:inline distT="0" distB="0" distL="0" distR="0" wp14:anchorId="09EFF4E9" wp14:editId="55934E7C">
             <wp:extent cx="5212080" cy="2478330"/>
             <wp:effectExtent l="0" t="0" r="0" b="0"/>
             <wp:docPr id="3" name="Picture 3"/>
@@ -14855,7 +14855,7 @@
         <w:spacing w:before="160" w:after="200"/>
         <w:jc w:val="center"/>
       </w:pPr>
-      <w:bookmarkStart w:id="52" w:name="_Toc231093623"/>
+      <w:bookmarkStart w:id="52" w:name="_Toc231097371"/>
       <w:r>
         <w:rPr>
           <w:i w:val="0"/>
@@ -14889,7 +14889,7 @@
       <w:pPr>
         <w:pStyle w:val="Ttulo2"/>
       </w:pPr>
-      <w:bookmarkStart w:id="53" w:name="_Toc231093583"/>
+      <w:bookmarkStart w:id="53" w:name="_Toc231097331"/>
       <w:r>
         <w:t>4.5 Estabilidad por fases del ciclo del cobre (OE5)</w:t>
       </w:r>
@@ -14997,7 +14997,7 @@
           <w:noProof/>
         </w:rPr>
         <w:drawing>
-          <wp:inline distT="0" distB="0" distL="0" distR="0" wp14:anchorId="5A78249A" wp14:editId="4E20FF63">
+          <wp:inline distT="0" distB="0" distL="0" distR="0" wp14:anchorId="0F36BB99" wp14:editId="41C79A2C">
             <wp:extent cx="5212080" cy="2366710"/>
             <wp:effectExtent l="0" t="0" r="0" b="0"/>
             <wp:docPr id="4" name="Picture 4"/>
@@ -15039,7 +15039,7 @@
         <w:spacing w:before="160" w:after="200"/>
         <w:jc w:val="center"/>
       </w:pPr>
-      <w:bookmarkStart w:id="54" w:name="_Toc231093624"/>
+      <w:bookmarkStart w:id="54" w:name="_Toc231097372"/>
       <w:r>
         <w:rPr>
           <w:i w:val="0"/>
@@ -15073,7 +15073,7 @@
       <w:pPr>
         <w:pStyle w:val="Ttulo2"/>
       </w:pPr>
-      <w:bookmarkStart w:id="55" w:name="_Toc231093584"/>
+      <w:bookmarkStart w:id="55" w:name="_Toc231097332"/>
       <w:r>
         <w:t>4.6 Comparación entre mercados: triangulación (OE6)</w:t>
       </w:r>
@@ -15095,7 +15095,7 @@
         <w:spacing w:before="40" w:after="40"/>
         <w:jc w:val="center"/>
       </w:pPr>
-      <w:bookmarkStart w:id="56" w:name="_Toc231093610"/>
+      <w:bookmarkStart w:id="56" w:name="_Toc231097358"/>
       <w:r>
         <w:rPr>
           <w:i w:val="0"/>
@@ -15720,7 +15720,7 @@
           <w:noProof/>
         </w:rPr>
         <w:drawing>
-          <wp:inline distT="0" distB="0" distL="0" distR="0" wp14:anchorId="62F251D4" wp14:editId="053A1C31">
+          <wp:inline distT="0" distB="0" distL="0" distR="0" wp14:anchorId="21726FAA" wp14:editId="3E3292E4">
             <wp:extent cx="5212080" cy="2626097"/>
             <wp:effectExtent l="0" t="0" r="0" b="0"/>
             <wp:docPr id="5" name="Picture 5"/>
@@ -15762,7 +15762,7 @@
         <w:spacing w:before="160" w:after="200"/>
         <w:jc w:val="center"/>
       </w:pPr>
-      <w:bookmarkStart w:id="57" w:name="_Toc231093625"/>
+      <w:bookmarkStart w:id="57" w:name="_Toc231097373"/>
       <w:r>
         <w:rPr>
           <w:i w:val="0"/>
@@ -15907,7 +15907,7 @@
       <w:pPr>
         <w:pStyle w:val="Ttulo2"/>
       </w:pPr>
-      <w:bookmarkStart w:id="58" w:name="_Toc231093585"/>
+      <w:bookmarkStart w:id="58" w:name="_Toc231097333"/>
       <w:r>
         <w:t>4.7 Diagnósticos y robustez</w:t>
       </w:r>
@@ -16267,7 +16267,7 @@
         </w:rPr>
         <w:lastRenderedPageBreak/>
         <w:drawing>
-          <wp:inline distT="0" distB="0" distL="0" distR="0" wp14:anchorId="2158460A" wp14:editId="5283B6FD">
+          <wp:inline distT="0" distB="0" distL="0" distR="0" wp14:anchorId="353A0F44" wp14:editId="0F6886C3">
             <wp:extent cx="5212080" cy="2446436"/>
             <wp:effectExtent l="0" t="0" r="0" b="0"/>
             <wp:docPr id="6" name="Picture 6"/>
@@ -16309,7 +16309,7 @@
         <w:spacing w:before="160" w:after="200"/>
         <w:jc w:val="center"/>
       </w:pPr>
-      <w:bookmarkStart w:id="59" w:name="_Toc231093626"/>
+      <w:bookmarkStart w:id="59" w:name="_Toc231097374"/>
       <w:r>
         <w:rPr>
           <w:i w:val="0"/>
@@ -16343,7 +16343,7 @@
       <w:pPr>
         <w:pStyle w:val="Ttulo2"/>
       </w:pPr>
-      <w:bookmarkStart w:id="60" w:name="_Toc231093586"/>
+      <w:bookmarkStart w:id="60" w:name="_Toc231097334"/>
       <w:r>
         <w:t>4.8 Discusión integrada</w:t>
       </w:r>
@@ -16524,7 +16524,7 @@
       <w:pPr>
         <w:pStyle w:val="Ttulo1"/>
       </w:pPr>
-      <w:bookmarkStart w:id="61" w:name="_Toc231093587"/>
+      <w:bookmarkStart w:id="61" w:name="_Toc231097335"/>
       <w:r>
         <w:lastRenderedPageBreak/>
         <w:t>Capítulo 5 — Conclusiones</w:t>
@@ -16535,7 +16535,7 @@
       <w:pPr>
         <w:pStyle w:val="Ttulo2"/>
       </w:pPr>
-      <w:bookmarkStart w:id="62" w:name="_Toc231093588"/>
+      <w:bookmarkStart w:id="62" w:name="_Toc231097336"/>
       <w:r>
         <w:t>5.1 Síntesis de los hallazgos</w:t>
       </w:r>
@@ -16702,7 +16702,7 @@
       <w:pPr>
         <w:pStyle w:val="Ttulo2"/>
       </w:pPr>
-      <w:bookmarkStart w:id="63" w:name="_Toc231093589"/>
+      <w:bookmarkStart w:id="63" w:name="_Toc231097337"/>
       <w:r>
         <w:t>5.2 Implicancias</w:t>
       </w:r>
@@ -16774,7 +16774,7 @@
       <w:pPr>
         <w:pStyle w:val="Ttulo2"/>
       </w:pPr>
-      <w:bookmarkStart w:id="64" w:name="_Toc231093590"/>
+      <w:bookmarkStart w:id="64" w:name="_Toc231097338"/>
       <w:r>
         <w:t>5.3 Limitaciones</w:t>
       </w:r>
@@ -16858,7 +16858,7 @@
       <w:pPr>
         <w:pStyle w:val="Ttulo2"/>
       </w:pPr>
-      <w:bookmarkStart w:id="65" w:name="_Toc231093591"/>
+      <w:bookmarkStart w:id="65" w:name="_Toc231097339"/>
       <w:r>
         <w:t>5.4 Líneas futuras de investigación</w:t>
       </w:r>
@@ -16914,7 +16914,7 @@
       <w:pPr>
         <w:pStyle w:val="Ttulo1"/>
       </w:pPr>
-      <w:bookmarkStart w:id="66" w:name="_Toc231093592"/>
+      <w:bookmarkStart w:id="66" w:name="_Toc231097340"/>
       <w:r>
         <w:lastRenderedPageBreak/>
         <w:t>Referencias</w:t>
@@ -17061,6 +17061,11 @@
     </w:p>
     <w:p>
       <w:r>
+        <w:t>Lo, A. W., &amp; MacKinlay, A. C. (1988). Stock market prices do not follow random walks: Evidence from a simple specification test. *The Review of Financial Studies*, 1(1), 41–66.</w:t>
+      </w:r>
+    </w:p>
+    <w:p>
+      <w:r>
         <w:t>Jorion, P. (1990). The exchange-rate exposure of U.S. multinationals. *The Journal of Business*, 63(3), 331–345.</w:t>
       </w:r>
     </w:p>
@@ -17071,15 +17076,15 @@
     </w:p>
     <w:p>
       <w:r>
-        <w:t>Labbé, F., &amp; De Gregorio, J. (2011). *Copper, the real exchange rate and macroeconomic fluctuations in Chile* (Working Paper N°640). Banco Central de Chile.</w:t>
-      </w:r>
-    </w:p>
-    <w:p>
-      <w:r>
-        <w:t xml:space="preserve">Pedersen, M. (2015). *The impact of </w:t>
-      </w:r>
-      <w:r>
-        <w:t>commodity price shocks in a major producing economy: The case of copper and Chile* (Working Paper N°753). Banco Central de Chile.</w:t>
+        <w:t xml:space="preserve">Labbé, F., &amp; De </w:t>
+      </w:r>
+      <w:r>
+        <w:t>Gregorio, J. (2011). *Copper, the real exchange rate and macroeconomic fluctuations in Chile* (Working Paper N°640). Banco Central de Chile.</w:t>
+      </w:r>
+    </w:p>
+    <w:p>
+      <w:r>
+        <w:t>Pedersen, M. (2015). *The impact of commodity price shocks in a major producing economy: The case of copper and Chile* (Working Paper N°753). Banco Central de Chile.</w:t>
       </w:r>
     </w:p>
     <w:p>
@@ -17119,12 +17124,12 @@
     </w:p>
     <w:p>
       <w:r>
+        <w:lastRenderedPageBreak/>
         <w:t>Sims, C. A. (1980). Macroeconomics and reality. *Econometrica*, 48(1), 1–48.</w:t>
       </w:r>
     </w:p>
     <w:p>
       <w:r>
-        <w:lastRenderedPageBreak/>
         <w:t>Wallenstein, T., Mendiola, A., &amp; Chávez-Bedoya, L. (2021). *Analysis of the reaction of mining stocks to the development of copper prices*. Consejo Latinoamericano de Escuelas de Administración (CLADEA).</w:t>
       </w:r>
     </w:p>
@@ -17157,7 +17162,7 @@
       <w:pPr>
         <w:pStyle w:val="Ttulo1"/>
       </w:pPr>
-      <w:bookmarkStart w:id="67" w:name="_Toc231093593"/>
+      <w:bookmarkStart w:id="67" w:name="_Toc231097341"/>
       <w:r>
         <w:lastRenderedPageBreak/>
         <w:t>Anexos</w:t>
@@ -17168,7 +17173,7 @@
       <w:pPr>
         <w:pStyle w:val="Ttulo2"/>
       </w:pPr>
-      <w:bookmarkStart w:id="68" w:name="_Toc231093594"/>
+      <w:bookmarkStart w:id="68" w:name="_Toc231097342"/>
       <w:r>
         <w:t>Anexo A. Estadística descriptiva</w:t>
       </w:r>
@@ -17180,7 +17185,7 @@
         <w:spacing w:before="40" w:after="40"/>
         <w:jc w:val="center"/>
       </w:pPr>
-      <w:bookmarkStart w:id="69" w:name="_Toc231093611"/>
+      <w:bookmarkStart w:id="69" w:name="_Toc231097359"/>
       <w:r>
         <w:rPr>
           <w:i w:val="0"/>
@@ -18042,7 +18047,13 @@
               <w:rPr>
                 <w:sz w:val="20"/>
               </w:rPr>
-              <w:t>Δ Cobre</w:t>
+              <w:t xml:space="preserve">Δ </w:t>
+            </w:r>
+            <w:r>
+              <w:rPr>
+                <w:sz w:val="20"/>
+              </w:rPr>
+              <w:t>Cobre</w:t>
             </w:r>
           </w:p>
         </w:tc>
@@ -19376,9 +19387,12 @@
       <w:pPr>
         <w:pStyle w:val="Ttulo2"/>
       </w:pPr>
-      <w:bookmarkStart w:id="70" w:name="_Toc231093595"/>
-      <w:r>
-        <w:t>Anexo B. Matriz de correlación de los factores</w:t>
+      <w:bookmarkStart w:id="70" w:name="_Toc231097343"/>
+      <w:r>
+        <w:t xml:space="preserve">Anexo B. Matriz de correlación de los </w:t>
+      </w:r>
+      <w:r>
+        <w:t>factores</w:t>
       </w:r>
       <w:bookmarkEnd w:id="70"/>
     </w:p>
@@ -19388,7 +19402,7 @@
         <w:spacing w:before="40" w:after="40"/>
         <w:jc w:val="center"/>
       </w:pPr>
-      <w:bookmarkStart w:id="71" w:name="_Toc231093612"/>
+      <w:bookmarkStart w:id="71" w:name="_Toc231097360"/>
       <w:r>
         <w:rPr>
           <w:i w:val="0"/>
@@ -20765,7 +20779,13 @@
               <w:rPr>
                 <w:sz w:val="20"/>
               </w:rPr>
-              <w:t>Δ TC CLP</w:t>
+              <w:t xml:space="preserve">Δ </w:t>
+            </w:r>
+            <w:r>
+              <w:rPr>
+                <w:sz w:val="20"/>
+              </w:rPr>
+              <w:t>TC CLP</w:t>
             </w:r>
           </w:p>
         </w:tc>
@@ -21416,9 +21436,12 @@
       <w:pPr>
         <w:pStyle w:val="Ttulo2"/>
       </w:pPr>
-      <w:bookmarkStart w:id="72" w:name="_Toc231093596"/>
-      <w:r>
-        <w:t>Anexo C. Pruebas de raíz unitaria y orden de integración</w:t>
+      <w:bookmarkStart w:id="72" w:name="_Toc231097344"/>
+      <w:r>
+        <w:t xml:space="preserve">Anexo C. Pruebas de raíz </w:t>
+      </w:r>
+      <w:r>
+        <w:t>unitaria y orden de integración</w:t>
       </w:r>
       <w:bookmarkEnd w:id="72"/>
     </w:p>
@@ -21428,7 +21451,7 @@
         <w:spacing w:before="40" w:after="40"/>
         <w:jc w:val="center"/>
       </w:pPr>
-      <w:bookmarkStart w:id="73" w:name="_Toc231093613"/>
+      <w:bookmarkStart w:id="73" w:name="_Toc231097361"/>
       <w:r>
         <w:rPr>
           <w:i w:val="0"/>
@@ -22256,7 +22279,7 @@
       <w:pPr>
         <w:pStyle w:val="Ttulo2"/>
       </w:pPr>
-      <w:bookmarkStart w:id="74" w:name="_Toc231093597"/>
+      <w:bookmarkStart w:id="74" w:name="_Toc231097345"/>
       <w:r>
         <w:t>Anexo D. Resultados completos del modelo de panel</w:t>
       </w:r>
@@ -22266,7 +22289,7 @@
       <w:pPr>
         <w:pStyle w:val="Ttulo3"/>
       </w:pPr>
-      <w:bookmarkStart w:id="75" w:name="_Toc231093598"/>
+      <w:bookmarkStart w:id="75" w:name="_Toc231097346"/>
       <w:r>
         <w:t>D.1 Muestra B — cobre, mercado internacional</w:t>
       </w:r>
@@ -22278,7 +22301,7 @@
         <w:spacing w:before="40" w:after="40"/>
         <w:jc w:val="center"/>
       </w:pPr>
-      <w:bookmarkStart w:id="76" w:name="_Toc231093614"/>
+      <w:bookmarkStart w:id="76" w:name="_Toc231097362"/>
       <w:r>
         <w:rPr>
           <w:i w:val="0"/>
@@ -23459,7 +23482,7 @@
       <w:pPr>
         <w:pStyle w:val="Ttulo3"/>
       </w:pPr>
-      <w:bookmarkStart w:id="77" w:name="_Toc231093599"/>
+      <w:bookmarkStart w:id="77" w:name="_Toc231097347"/>
       <w:r>
         <w:t>D.2 Muestra A — cobre, mercado chileno (Pucobre)</w:t>
       </w:r>
@@ -23471,7 +23494,7 @@
         <w:spacing w:before="40" w:after="40"/>
         <w:jc w:val="center"/>
       </w:pPr>
-      <w:bookmarkStart w:id="78" w:name="_Toc231093615"/>
+      <w:bookmarkStart w:id="78" w:name="_Toc231097363"/>
       <w:r>
         <w:rPr>
           <w:i w:val="0"/>
@@ -24646,7 +24669,7 @@
       <w:pPr>
         <w:pStyle w:val="Ttulo3"/>
       </w:pPr>
-      <w:bookmarkStart w:id="79" w:name="_Toc231093600"/>
+      <w:bookmarkStart w:id="79" w:name="_Toc231097348"/>
       <w:r>
         <w:t xml:space="preserve">D.3 </w:t>
       </w:r>
@@ -24661,7 +24684,7 @@
         <w:spacing w:before="40" w:after="40"/>
         <w:jc w:val="center"/>
       </w:pPr>
-      <w:bookmarkStart w:id="80" w:name="_Toc231093616"/>
+      <w:bookmarkStart w:id="80" w:name="_Toc231097364"/>
       <w:r>
         <w:rPr>
           <w:i w:val="0"/>
@@ -25836,7 +25859,7 @@
       <w:pPr>
         <w:pStyle w:val="Ttulo2"/>
       </w:pPr>
-      <w:bookmarkStart w:id="81" w:name="_Toc231093601"/>
+      <w:bookmarkStart w:id="81" w:name="_Toc231097349"/>
       <w:r>
         <w:lastRenderedPageBreak/>
         <w:t xml:space="preserve">Anexo E. </w:t>
@@ -25852,7 +25875,7 @@
         <w:spacing w:before="40" w:after="40"/>
         <w:jc w:val="center"/>
       </w:pPr>
-      <w:bookmarkStart w:id="82" w:name="_Toc231093617"/>
+      <w:bookmarkStart w:id="82" w:name="_Toc231097365"/>
       <w:r>
         <w:rPr>
           <w:i w:val="0"/>
@@ -26523,7 +26546,7 @@
       <w:pPr>
         <w:pStyle w:val="Ttulo2"/>
       </w:pPr>
-      <w:bookmarkStart w:id="83" w:name="_Toc231093602"/>
+      <w:bookmarkStart w:id="83" w:name="_Toc231097350"/>
       <w:r>
         <w:t xml:space="preserve">Anexo F. </w:t>
       </w:r>
@@ -26538,7 +26561,7 @@
         <w:spacing w:before="40" w:after="40"/>
         <w:jc w:val="center"/>
       </w:pPr>
-      <w:bookmarkStart w:id="84" w:name="_Toc231093618"/>
+      <w:bookmarkStart w:id="84" w:name="_Toc231097366"/>
       <w:r>
         <w:rPr>
           <w:i w:val="0"/>
@@ -27352,7 +27375,7 @@
       <w:pPr>
         <w:pStyle w:val="Ttulo2"/>
       </w:pPr>
-      <w:bookmarkStart w:id="85" w:name="_Toc231093603"/>
+      <w:bookmarkStart w:id="85" w:name="_Toc231097351"/>
       <w:r>
         <w:t>Anexo G. Fuentes de datos</w:t>
       </w:r>
@@ -27364,7 +27387,7 @@
         <w:spacing w:before="40" w:after="40"/>
         <w:jc w:val="center"/>
       </w:pPr>
-      <w:bookmarkStart w:id="86" w:name="_Toc231093619"/>
+      <w:bookmarkStart w:id="86" w:name="_Toc231097367"/>
       <w:r>
         <w:rPr>
           <w:i w:val="0"/>
@@ -28513,7 +28536,7 @@
       <w:pPr>
         <w:pStyle w:val="Ttulo2"/>
       </w:pPr>
-      <w:bookmarkStart w:id="87" w:name="_Toc231093604"/>
+      <w:bookmarkStart w:id="87" w:name="_Toc231097352"/>
       <w:r>
         <w:t>Anexo H. Disponibilidad del código</w:t>
       </w:r>
@@ -28531,7 +28554,7 @@
       <w:pPr>
         <w:pStyle w:val="Ttulo2"/>
       </w:pPr>
-      <w:bookmarkStart w:id="88" w:name="_Toc231093605"/>
+      <w:bookmarkStart w:id="88" w:name="_Toc231097353"/>
       <w:r>
         <w:t>Anexo I. Extensión predictiva: ¿explican o anticipan?</w:t>
       </w:r>
@@ -28557,7 +28580,7 @@
         <w:spacing w:before="40" w:after="40"/>
         <w:jc w:val="center"/>
       </w:pPr>
-      <w:bookmarkStart w:id="89" w:name="_Toc231093620"/>
+      <w:bookmarkStart w:id="89" w:name="_Toc231097368"/>
       <w:r>
         <w:rPr>
           <w:i w:val="0"/>
@@ -29125,13 +29148,7 @@
               <w:rPr>
                 <w:sz w:val="20"/>
               </w:rPr>
-              <w:t xml:space="preserve">Random </w:t>
-            </w:r>
-            <w:r>
-              <w:rPr>
-                <w:sz w:val="20"/>
-              </w:rPr>
-              <w:t>Forest</w:t>
+              <w:t>Random Forest</w:t>
             </w:r>
           </w:p>
         </w:tc>
@@ -29412,6 +29429,48 @@
     </w:p>
     <w:p>
       <w:r>
+        <w:lastRenderedPageBreak/>
+        <w:t xml:space="preserve">Como contraste complementario de la hipótesis de paseo aleatorio se aplica el test de razón de varianzas de Lo y MacKinlay (1988), con estadístico robusto a heterocedasticidad. Para el </w:t>
+      </w:r>
+      <w:r>
+        <w:rPr>
+          <w:b/>
+        </w:rPr>
+        <w:t>precio del cobre</w:t>
+      </w:r>
+      <w:r>
+        <w:t xml:space="preserve"> se rechaza el paseo aleatorio (VR(2) = 1.39; z = 2.99), evidencia de </w:t>
+      </w:r>
+      <w:r>
+        <w:rPr>
+          <w:b/>
+        </w:rPr>
+        <w:t>momentum</w:t>
+      </w:r>
+      <w:r>
+        <w:t xml:space="preserve"> propia de los mercados de commodities. En cambio, para los </w:t>
+      </w:r>
+      <w:r>
+        <w:rPr>
+          <w:b/>
+        </w:rPr>
+        <w:t>retornos del sector</w:t>
+      </w:r>
+      <w:r>
+        <w:t xml:space="preserve"> el paseo aleatorio </w:t>
+      </w:r>
+      <w:r>
+        <w:rPr>
+          <w:b/>
+        </w:rPr>
+        <w:t>no se rechaza</w:t>
+      </w:r>
+      <w:r>
+        <w:t xml:space="preserve"> (VR(2) = 1.10; z = 1.06), lo que es consistente con la eficiencia de mercado en forma débil del lado accionario y con la escasa predecibilidad documentada arriba.</w:t>
+      </w:r>
+    </w:p>
+    <w:p>
+      <w:r>
         <w:br w:type="page"/>
       </w:r>
     </w:p>
@@ -29419,7 +29478,7 @@
       <w:pPr>
         <w:pStyle w:val="Ttulo1"/>
       </w:pPr>
-      <w:bookmarkStart w:id="90" w:name="_Toc231093606"/>
+      <w:bookmarkStart w:id="90" w:name="_Toc231097354"/>
       <w:r>
         <w:lastRenderedPageBreak/>
         <w:t>Glosario de términos econométricos</w:t>
@@ -29455,10 +29514,7 @@
     </w:p>
     <w:p>
       <w:r>
-        <w:t xml:space="preserve">no estacionarias (I(1)), </w:t>
-      </w:r>
-      <w:r>
-        <w:t>interpretada como una relación de equilibrio de largo plazo.</w:t>
+        <w:t>no estacionarias (I(1)), interpretada como una relación de equilibrio de largo plazo.</w:t>
       </w:r>
     </w:p>
     <w:p>
@@ -30053,31 +30109,31 @@
       </w:rPr>
     </w:lvl>
   </w:abstractNum>
-  <w:num w:numId="1" w16cid:durableId="548305238">
+  <w:num w:numId="1" w16cid:durableId="1569997962">
     <w:abstractNumId w:val="8"/>
   </w:num>
-  <w:num w:numId="2" w16cid:durableId="2079591179">
+  <w:num w:numId="2" w16cid:durableId="1966887682">
     <w:abstractNumId w:val="6"/>
   </w:num>
-  <w:num w:numId="3" w16cid:durableId="2080133198">
+  <w:num w:numId="3" w16cid:durableId="599490405">
     <w:abstractNumId w:val="5"/>
   </w:num>
-  <w:num w:numId="4" w16cid:durableId="1081173204">
+  <w:num w:numId="4" w16cid:durableId="673921323">
     <w:abstractNumId w:val="4"/>
   </w:num>
-  <w:num w:numId="5" w16cid:durableId="1983536571">
+  <w:num w:numId="5" w16cid:durableId="1181820243">
     <w:abstractNumId w:val="7"/>
   </w:num>
-  <w:num w:numId="6" w16cid:durableId="918757441">
+  <w:num w:numId="6" w16cid:durableId="645085098">
     <w:abstractNumId w:val="3"/>
   </w:num>
-  <w:num w:numId="7" w16cid:durableId="1334185806">
+  <w:num w:numId="7" w16cid:durableId="1735350572">
     <w:abstractNumId w:val="2"/>
   </w:num>
-  <w:num w:numId="8" w16cid:durableId="245576206">
+  <w:num w:numId="8" w16cid:durableId="1706714726">
     <w:abstractNumId w:val="1"/>
   </w:num>
-  <w:num w:numId="9" w16cid:durableId="1233085083">
+  <w:num w:numId="9" w16cid:durableId="1867984212">
     <w:abstractNumId w:val="0"/>
   </w:num>
 </w:numbering>
@@ -41479,7 +41535,7 @@
     <w:autoRedefine/>
     <w:uiPriority w:val="39"/>
     <w:unhideWhenUsed/>
-    <w:rsid w:val="00100867"/>
+    <w:rsid w:val="008E52B3"/>
     <w:pPr>
       <w:spacing w:after="100"/>
     </w:pPr>
@@ -41491,7 +41547,7 @@
     <w:autoRedefine/>
     <w:uiPriority w:val="39"/>
     <w:unhideWhenUsed/>
-    <w:rsid w:val="00100867"/>
+    <w:rsid w:val="008E52B3"/>
     <w:pPr>
       <w:spacing w:after="100"/>
       <w:ind w:left="240"/>
@@ -41504,7 +41560,7 @@
     <w:autoRedefine/>
     <w:uiPriority w:val="39"/>
     <w:unhideWhenUsed/>
-    <w:rsid w:val="00100867"/>
+    <w:rsid w:val="008E52B3"/>
     <w:pPr>
       <w:spacing w:after="100"/>
       <w:ind w:left="480"/>
@@ -41515,7 +41571,7 @@
     <w:basedOn w:val="Fuentedeprrafopredeter"/>
     <w:uiPriority w:val="99"/>
     <w:unhideWhenUsed/>
-    <w:rsid w:val="00100867"/>
+    <w:rsid w:val="008E52B3"/>
     <w:rPr>
       <w:color w:val="0000FF" w:themeColor="hyperlink"/>
       <w:u w:val="single"/>
@@ -41527,7 +41583,7 @@
     <w:next w:val="Normal"/>
     <w:uiPriority w:val="99"/>
     <w:unhideWhenUsed/>
-    <w:rsid w:val="00100867"/>
+    <w:rsid w:val="008E52B3"/>
     <w:pPr>
       <w:spacing w:after="0"/>
     </w:pPr>

</xml_diff>

<commit_message>
Anexo J: tabla-síntesis consolidada de diagnósticos y robustez (datos reales)
Consolida CD-Pesaran, CIPS, Zivot-Andrews, Gregory-Hansen, VAR/Granger, FDR, GJR-GARCH,
interacción de ciclo, subperíodos, H7, Lo-MacKinlay y Local Projections en una sola tabla.
Tesis: 70 páginas.

Co-Authored-By: Claude Opus 4.8 <noreply@anthropic.com>
</commit_message>
<xml_diff>
--- a/outputs/Tesis_Francisco_Rietta.docx
+++ b/outputs/Tesis_Francisco_Rietta.docx
@@ -166,7 +166,7 @@
       <w:pPr>
         <w:pStyle w:val="Ttulo1"/>
       </w:pPr>
-      <w:bookmarkStart w:id="0" w:name="_Toc231097284"/>
+      <w:bookmarkStart w:id="0" w:name="_Toc231100744"/>
       <w:r>
         <w:lastRenderedPageBreak/>
         <w:t>Página de aprobación</w:t>
@@ -262,7 +262,7 @@
       <w:pPr>
         <w:pStyle w:val="Ttulo1"/>
       </w:pPr>
-      <w:bookmarkStart w:id="1" w:name="_Toc231097285"/>
+      <w:bookmarkStart w:id="1" w:name="_Toc231100745"/>
       <w:r>
         <w:lastRenderedPageBreak/>
         <w:t>Declaración de originalidad</w:t>
@@ -303,7 +303,7 @@
       <w:pPr>
         <w:pStyle w:val="Ttulo1"/>
       </w:pPr>
-      <w:bookmarkStart w:id="2" w:name="_Toc231097286"/>
+      <w:bookmarkStart w:id="2" w:name="_Toc231100746"/>
       <w:r>
         <w:lastRenderedPageBreak/>
         <w:t>Dedicatoria</w:t>
@@ -333,7 +333,7 @@
       <w:pPr>
         <w:pStyle w:val="Ttulo1"/>
       </w:pPr>
-      <w:bookmarkStart w:id="3" w:name="_Toc231097287"/>
+      <w:bookmarkStart w:id="3" w:name="_Toc231100747"/>
       <w:r>
         <w:lastRenderedPageBreak/>
         <w:t>Agradecimientos</w:t>
@@ -359,7 +359,7 @@
       <w:pPr>
         <w:pStyle w:val="Ttulo1"/>
       </w:pPr>
-      <w:bookmarkStart w:id="4" w:name="_Toc231097288"/>
+      <w:bookmarkStart w:id="4" w:name="_Toc231100748"/>
       <w:r>
         <w:lastRenderedPageBreak/>
         <w:t>Resumen</w:t>
@@ -397,7 +397,7 @@
       <w:pPr>
         <w:pStyle w:val="Ttulo1"/>
       </w:pPr>
-      <w:bookmarkStart w:id="5" w:name="_Toc231097289"/>
+      <w:bookmarkStart w:id="5" w:name="_Toc231100749"/>
       <w:r>
         <w:lastRenderedPageBreak/>
         <w:t>Abstract</w:t>
@@ -432,7 +432,7 @@
       <w:pPr>
         <w:pStyle w:val="Ttulo1"/>
       </w:pPr>
-      <w:bookmarkStart w:id="6" w:name="_Toc231097290"/>
+      <w:bookmarkStart w:id="6" w:name="_Toc231100750"/>
       <w:r>
         <w:lastRenderedPageBreak/>
         <w:t>Índice general</w:t>
@@ -464,7 +464,7 @@
       <w:r>
         <w:fldChar w:fldCharType="separate"/>
       </w:r>
-      <w:hyperlink w:anchor="_Toc231097284" w:history="1">
+      <w:hyperlink w:anchor="_Toc231100744" w:history="1">
         <w:r>
           <w:rPr>
             <w:rStyle w:val="Hipervnculo"/>
@@ -491,7 +491,7 @@
             <w:noProof/>
             <w:webHidden/>
           </w:rPr>
-          <w:instrText xml:space="preserve"> PAGEREF _Toc231097284 \h </w:instrText>
+          <w:instrText xml:space="preserve"> PAGEREF _Toc231100744 \h </w:instrText>
         </w:r>
         <w:r>
           <w:rPr>
@@ -538,7 +538,7 @@
           <w14:ligatures w14:val="standardContextual"/>
         </w:rPr>
       </w:pPr>
-      <w:hyperlink w:anchor="_Toc231097285" w:history="1">
+      <w:hyperlink w:anchor="_Toc231100745" w:history="1">
         <w:r>
           <w:rPr>
             <w:rStyle w:val="Hipervnculo"/>
@@ -565,7 +565,7 @@
             <w:noProof/>
             <w:webHidden/>
           </w:rPr>
-          <w:instrText xml:space="preserve"> PAGEREF _Toc231097285 \h </w:instrText>
+          <w:instrText xml:space="preserve"> PAGEREF _Toc231100745 \h </w:instrText>
         </w:r>
         <w:r>
           <w:rPr>
@@ -612,7 +612,7 @@
           <w14:ligatures w14:val="standardContextual"/>
         </w:rPr>
       </w:pPr>
-      <w:hyperlink w:anchor="_Toc231097286" w:history="1">
+      <w:hyperlink w:anchor="_Toc231100746" w:history="1">
         <w:r>
           <w:rPr>
             <w:rStyle w:val="Hipervnculo"/>
@@ -639,7 +639,7 @@
             <w:noProof/>
             <w:webHidden/>
           </w:rPr>
-          <w:instrText xml:space="preserve"> PAGEREF _Toc231097286 \h </w:instrText>
+          <w:instrText xml:space="preserve"> PAGEREF _Toc231100746 \h </w:instrText>
         </w:r>
         <w:r>
           <w:rPr>
@@ -686,7 +686,7 @@
           <w14:ligatures w14:val="standardContextual"/>
         </w:rPr>
       </w:pPr>
-      <w:hyperlink w:anchor="_Toc231097287" w:history="1">
+      <w:hyperlink w:anchor="_Toc231100747" w:history="1">
         <w:r>
           <w:rPr>
             <w:rStyle w:val="Hipervnculo"/>
@@ -713,7 +713,7 @@
             <w:noProof/>
             <w:webHidden/>
           </w:rPr>
-          <w:instrText xml:space="preserve"> PAGEREF _Toc231097287 \h </w:instrText>
+          <w:instrText xml:space="preserve"> PAGEREF _Toc231100747 \h </w:instrText>
         </w:r>
         <w:r>
           <w:rPr>
@@ -760,7 +760,7 @@
           <w14:ligatures w14:val="standardContextual"/>
         </w:rPr>
       </w:pPr>
-      <w:hyperlink w:anchor="_Toc231097288" w:history="1">
+      <w:hyperlink w:anchor="_Toc231100748" w:history="1">
         <w:r>
           <w:rPr>
             <w:rStyle w:val="Hipervnculo"/>
@@ -787,7 +787,7 @@
             <w:noProof/>
             <w:webHidden/>
           </w:rPr>
-          <w:instrText xml:space="preserve"> PAGEREF _Toc231097288 \h </w:instrText>
+          <w:instrText xml:space="preserve"> PAGEREF _Toc231100748 \h </w:instrText>
         </w:r>
         <w:r>
           <w:rPr>
@@ -834,7 +834,7 @@
           <w14:ligatures w14:val="standardContextual"/>
         </w:rPr>
       </w:pPr>
-      <w:hyperlink w:anchor="_Toc231097289" w:history="1">
+      <w:hyperlink w:anchor="_Toc231100749" w:history="1">
         <w:r>
           <w:rPr>
             <w:rStyle w:val="Hipervnculo"/>
@@ -861,7 +861,7 @@
             <w:noProof/>
             <w:webHidden/>
           </w:rPr>
-          <w:instrText xml:space="preserve"> PAGEREF _Toc231097289 \h </w:instrText>
+          <w:instrText xml:space="preserve"> PAGEREF _Toc231100749 \h </w:instrText>
         </w:r>
         <w:r>
           <w:rPr>
@@ -908,7 +908,7 @@
           <w14:ligatures w14:val="standardContextual"/>
         </w:rPr>
       </w:pPr>
-      <w:hyperlink w:anchor="_Toc231097290" w:history="1">
+      <w:hyperlink w:anchor="_Toc231100750" w:history="1">
         <w:r>
           <w:rPr>
             <w:rStyle w:val="Hipervnculo"/>
@@ -935,7 +935,7 @@
             <w:noProof/>
             <w:webHidden/>
           </w:rPr>
-          <w:instrText xml:space="preserve"> PAGEREF _Toc231097290 \h </w:instrText>
+          <w:instrText xml:space="preserve"> PAGEREF _Toc231100750 \h </w:instrText>
         </w:r>
         <w:r>
           <w:rPr>
@@ -982,7 +982,7 @@
           <w14:ligatures w14:val="standardContextual"/>
         </w:rPr>
       </w:pPr>
-      <w:hyperlink w:anchor="_Toc231097291" w:history="1">
+      <w:hyperlink w:anchor="_Toc231100751" w:history="1">
         <w:r>
           <w:rPr>
             <w:rStyle w:val="Hipervnculo"/>
@@ -1009,7 +1009,7 @@
             <w:noProof/>
             <w:webHidden/>
           </w:rPr>
-          <w:instrText xml:space="preserve"> PAGEREF _Toc231097291 \h </w:instrText>
+          <w:instrText xml:space="preserve"> PAGEREF _Toc231100751 \h </w:instrText>
         </w:r>
         <w:r>
           <w:rPr>
@@ -1056,7 +1056,7 @@
           <w14:ligatures w14:val="standardContextual"/>
         </w:rPr>
       </w:pPr>
-      <w:hyperlink w:anchor="_Toc231097292" w:history="1">
+      <w:hyperlink w:anchor="_Toc231100752" w:history="1">
         <w:r>
           <w:rPr>
             <w:rStyle w:val="Hipervnculo"/>
@@ -1083,7 +1083,7 @@
             <w:noProof/>
             <w:webHidden/>
           </w:rPr>
-          <w:instrText xml:space="preserve"> PAGEREF _Toc231097292 \h </w:instrText>
+          <w:instrText xml:space="preserve"> PAGEREF _Toc231100752 \h </w:instrText>
         </w:r>
         <w:r>
           <w:rPr>
@@ -1130,7 +1130,7 @@
           <w14:ligatures w14:val="standardContextual"/>
         </w:rPr>
       </w:pPr>
-      <w:hyperlink w:anchor="_Toc231097293" w:history="1">
+      <w:hyperlink w:anchor="_Toc231100753" w:history="1">
         <w:r>
           <w:rPr>
             <w:rStyle w:val="Hipervnculo"/>
@@ -1157,7 +1157,7 @@
             <w:noProof/>
             <w:webHidden/>
           </w:rPr>
-          <w:instrText xml:space="preserve"> PAGEREF _Toc231097293 \h </w:instrText>
+          <w:instrText xml:space="preserve"> PAGEREF _Toc231100753 \h </w:instrText>
         </w:r>
         <w:r>
           <w:rPr>
@@ -1204,7 +1204,7 @@
           <w14:ligatures w14:val="standardContextual"/>
         </w:rPr>
       </w:pPr>
-      <w:hyperlink w:anchor="_Toc231097294" w:history="1">
+      <w:hyperlink w:anchor="_Toc231100754" w:history="1">
         <w:r>
           <w:rPr>
             <w:rStyle w:val="Hipervnculo"/>
@@ -1231,7 +1231,7 @@
             <w:noProof/>
             <w:webHidden/>
           </w:rPr>
-          <w:instrText xml:space="preserve"> PAGEREF _Toc231097294 \h </w:instrText>
+          <w:instrText xml:space="preserve"> PAGEREF _Toc231100754 \h </w:instrText>
         </w:r>
         <w:r>
           <w:rPr>
@@ -1278,7 +1278,7 @@
           <w14:ligatures w14:val="standardContextual"/>
         </w:rPr>
       </w:pPr>
-      <w:hyperlink w:anchor="_Toc231097295" w:history="1">
+      <w:hyperlink w:anchor="_Toc231100755" w:history="1">
         <w:r>
           <w:rPr>
             <w:rStyle w:val="Hipervnculo"/>
@@ -1305,7 +1305,7 @@
             <w:noProof/>
             <w:webHidden/>
           </w:rPr>
-          <w:instrText xml:space="preserve"> PAGEREF _Toc231097295 \h </w:instrText>
+          <w:instrText xml:space="preserve"> PAGEREF _Toc231100755 \h </w:instrText>
         </w:r>
         <w:r>
           <w:rPr>
@@ -1352,7 +1352,7 @@
           <w14:ligatures w14:val="standardContextual"/>
         </w:rPr>
       </w:pPr>
-      <w:hyperlink w:anchor="_Toc231097296" w:history="1">
+      <w:hyperlink w:anchor="_Toc231100756" w:history="1">
         <w:r>
           <w:rPr>
             <w:rStyle w:val="Hipervnculo"/>
@@ -1379,7 +1379,7 @@
             <w:noProof/>
             <w:webHidden/>
           </w:rPr>
-          <w:instrText xml:space="preserve"> PAGEREF _Toc231097296 \h </w:instrText>
+          <w:instrText xml:space="preserve"> PAGEREF _Toc231100756 \h </w:instrText>
         </w:r>
         <w:r>
           <w:rPr>
@@ -1426,7 +1426,7 @@
           <w14:ligatures w14:val="standardContextual"/>
         </w:rPr>
       </w:pPr>
-      <w:hyperlink w:anchor="_Toc231097297" w:history="1">
+      <w:hyperlink w:anchor="_Toc231100757" w:history="1">
         <w:r>
           <w:rPr>
             <w:rStyle w:val="Hipervnculo"/>
@@ -1453,7 +1453,7 @@
             <w:noProof/>
             <w:webHidden/>
           </w:rPr>
-          <w:instrText xml:space="preserve"> PAGEREF _Toc231097297 \h </w:instrText>
+          <w:instrText xml:space="preserve"> PAGEREF _Toc231100757 \h </w:instrText>
         </w:r>
         <w:r>
           <w:rPr>
@@ -1500,7 +1500,7 @@
           <w14:ligatures w14:val="standardContextual"/>
         </w:rPr>
       </w:pPr>
-      <w:hyperlink w:anchor="_Toc231097298" w:history="1">
+      <w:hyperlink w:anchor="_Toc231100758" w:history="1">
         <w:r>
           <w:rPr>
             <w:rStyle w:val="Hipervnculo"/>
@@ -1527,7 +1527,7 @@
             <w:noProof/>
             <w:webHidden/>
           </w:rPr>
-          <w:instrText xml:space="preserve"> PAGEREF _Toc231097298 \h </w:instrText>
+          <w:instrText xml:space="preserve"> PAGEREF _Toc231100758 \h </w:instrText>
         </w:r>
         <w:r>
           <w:rPr>
@@ -1574,7 +1574,7 @@
           <w14:ligatures w14:val="standardContextual"/>
         </w:rPr>
       </w:pPr>
-      <w:hyperlink w:anchor="_Toc231097299" w:history="1">
+      <w:hyperlink w:anchor="_Toc231100759" w:history="1">
         <w:r>
           <w:rPr>
             <w:rStyle w:val="Hipervnculo"/>
@@ -1601,7 +1601,7 @@
             <w:noProof/>
             <w:webHidden/>
           </w:rPr>
-          <w:instrText xml:space="preserve"> PAGEREF _Toc231097299 \h </w:instrText>
+          <w:instrText xml:space="preserve"> PAGEREF _Toc231100759 \h </w:instrText>
         </w:r>
         <w:r>
           <w:rPr>
@@ -1648,7 +1648,7 @@
           <w14:ligatures w14:val="standardContextual"/>
         </w:rPr>
       </w:pPr>
-      <w:hyperlink w:anchor="_Toc231097300" w:history="1">
+      <w:hyperlink w:anchor="_Toc231100760" w:history="1">
         <w:r>
           <w:rPr>
             <w:rStyle w:val="Hipervnculo"/>
@@ -1675,7 +1675,7 @@
             <w:noProof/>
             <w:webHidden/>
           </w:rPr>
-          <w:instrText xml:space="preserve"> PAGEREF _Toc231097300 \h </w:instrText>
+          <w:instrText xml:space="preserve"> PAGEREF _Toc231100760 \h </w:instrText>
         </w:r>
         <w:r>
           <w:rPr>
@@ -1722,7 +1722,7 @@
           <w14:ligatures w14:val="standardContextual"/>
         </w:rPr>
       </w:pPr>
-      <w:hyperlink w:anchor="_Toc231097301" w:history="1">
+      <w:hyperlink w:anchor="_Toc231100761" w:history="1">
         <w:r>
           <w:rPr>
             <w:rStyle w:val="Hipervnculo"/>
@@ -1749,7 +1749,7 @@
             <w:noProof/>
             <w:webHidden/>
           </w:rPr>
-          <w:instrText xml:space="preserve"> PAGEREF _Toc231097301 \h </w:instrText>
+          <w:instrText xml:space="preserve"> PAGEREF _Toc231100761 \h </w:instrText>
         </w:r>
         <w:r>
           <w:rPr>
@@ -1796,7 +1796,7 @@
           <w14:ligatures w14:val="standardContextual"/>
         </w:rPr>
       </w:pPr>
-      <w:hyperlink w:anchor="_Toc231097302" w:history="1">
+      <w:hyperlink w:anchor="_Toc231100762" w:history="1">
         <w:r>
           <w:rPr>
             <w:rStyle w:val="Hipervnculo"/>
@@ -1823,7 +1823,7 @@
             <w:noProof/>
             <w:webHidden/>
           </w:rPr>
-          <w:instrText xml:space="preserve"> PAGEREF _Toc231097302 \h </w:instrText>
+          <w:instrText xml:space="preserve"> PAGEREF _Toc231100762 \h </w:instrText>
         </w:r>
         <w:r>
           <w:rPr>
@@ -1870,7 +1870,7 @@
           <w14:ligatures w14:val="standardContextual"/>
         </w:rPr>
       </w:pPr>
-      <w:hyperlink w:anchor="_Toc231097303" w:history="1">
+      <w:hyperlink w:anchor="_Toc231100763" w:history="1">
         <w:r>
           <w:rPr>
             <w:rStyle w:val="Hipervnculo"/>
@@ -1897,7 +1897,7 @@
             <w:noProof/>
             <w:webHidden/>
           </w:rPr>
-          <w:instrText xml:space="preserve"> PAGEREF _Toc231097303 \h </w:instrText>
+          <w:instrText xml:space="preserve"> PAGEREF _Toc231100763 \h </w:instrText>
         </w:r>
         <w:r>
           <w:rPr>
@@ -1944,7 +1944,7 @@
           <w14:ligatures w14:val="standardContextual"/>
         </w:rPr>
       </w:pPr>
-      <w:hyperlink w:anchor="_Toc231097304" w:history="1">
+      <w:hyperlink w:anchor="_Toc231100764" w:history="1">
         <w:r>
           <w:rPr>
             <w:rStyle w:val="Hipervnculo"/>
@@ -1971,7 +1971,7 @@
             <w:noProof/>
             <w:webHidden/>
           </w:rPr>
-          <w:instrText xml:space="preserve"> PAGEREF _Toc231097304 \h </w:instrText>
+          <w:instrText xml:space="preserve"> PAGEREF _Toc231100764 \h </w:instrText>
         </w:r>
         <w:r>
           <w:rPr>
@@ -2018,7 +2018,7 @@
           <w14:ligatures w14:val="standardContextual"/>
         </w:rPr>
       </w:pPr>
-      <w:hyperlink w:anchor="_Toc231097305" w:history="1">
+      <w:hyperlink w:anchor="_Toc231100765" w:history="1">
         <w:r>
           <w:rPr>
             <w:rStyle w:val="Hipervnculo"/>
@@ -2045,7 +2045,7 @@
             <w:noProof/>
             <w:webHidden/>
           </w:rPr>
-          <w:instrText xml:space="preserve"> PAGEREF _Toc231097305 \h </w:instrText>
+          <w:instrText xml:space="preserve"> PAGEREF _Toc231100765 \h </w:instrText>
         </w:r>
         <w:r>
           <w:rPr>
@@ -2092,7 +2092,7 @@
           <w14:ligatures w14:val="standardContextual"/>
         </w:rPr>
       </w:pPr>
-      <w:hyperlink w:anchor="_Toc231097306" w:history="1">
+      <w:hyperlink w:anchor="_Toc231100766" w:history="1">
         <w:r>
           <w:rPr>
             <w:rStyle w:val="Hipervnculo"/>
@@ -2119,7 +2119,7 @@
             <w:noProof/>
             <w:webHidden/>
           </w:rPr>
-          <w:instrText xml:space="preserve"> PAGEREF _Toc231097306 \h </w:instrText>
+          <w:instrText xml:space="preserve"> PAGEREF _Toc231100766 \h </w:instrText>
         </w:r>
         <w:r>
           <w:rPr>
@@ -2166,7 +2166,7 @@
           <w14:ligatures w14:val="standardContextual"/>
         </w:rPr>
       </w:pPr>
-      <w:hyperlink w:anchor="_Toc231097307" w:history="1">
+      <w:hyperlink w:anchor="_Toc231100767" w:history="1">
         <w:r>
           <w:rPr>
             <w:rStyle w:val="Hipervnculo"/>
@@ -2193,7 +2193,7 @@
             <w:noProof/>
             <w:webHidden/>
           </w:rPr>
-          <w:instrText xml:space="preserve"> PAGEREF _Toc231097307 \h </w:instrText>
+          <w:instrText xml:space="preserve"> PAGEREF _Toc231100767 \h </w:instrText>
         </w:r>
         <w:r>
           <w:rPr>
@@ -2240,7 +2240,7 @@
           <w14:ligatures w14:val="standardContextual"/>
         </w:rPr>
       </w:pPr>
-      <w:hyperlink w:anchor="_Toc231097308" w:history="1">
+      <w:hyperlink w:anchor="_Toc231100768" w:history="1">
         <w:r>
           <w:rPr>
             <w:rStyle w:val="Hipervnculo"/>
@@ -2267,7 +2267,7 @@
             <w:noProof/>
             <w:webHidden/>
           </w:rPr>
-          <w:instrText xml:space="preserve"> PAGEREF _Toc231097308 \h </w:instrText>
+          <w:instrText xml:space="preserve"> PAGEREF _Toc231100768 \h </w:instrText>
         </w:r>
         <w:r>
           <w:rPr>
@@ -2314,7 +2314,7 @@
           <w14:ligatures w14:val="standardContextual"/>
         </w:rPr>
       </w:pPr>
-      <w:hyperlink w:anchor="_Toc231097309" w:history="1">
+      <w:hyperlink w:anchor="_Toc231100769" w:history="1">
         <w:r>
           <w:rPr>
             <w:rStyle w:val="Hipervnculo"/>
@@ -2341,7 +2341,7 @@
             <w:noProof/>
             <w:webHidden/>
           </w:rPr>
-          <w:instrText xml:space="preserve"> PAGEREF _Toc231097309 \h </w:instrText>
+          <w:instrText xml:space="preserve"> PAGEREF _Toc231100769 \h </w:instrText>
         </w:r>
         <w:r>
           <w:rPr>
@@ -2388,7 +2388,7 @@
           <w14:ligatures w14:val="standardContextual"/>
         </w:rPr>
       </w:pPr>
-      <w:hyperlink w:anchor="_Toc231097310" w:history="1">
+      <w:hyperlink w:anchor="_Toc231100770" w:history="1">
         <w:r>
           <w:rPr>
             <w:rStyle w:val="Hipervnculo"/>
@@ -2415,7 +2415,7 @@
             <w:noProof/>
             <w:webHidden/>
           </w:rPr>
-          <w:instrText xml:space="preserve"> PAGEREF _Toc231097310 \h </w:instrText>
+          <w:instrText xml:space="preserve"> PAGEREF _Toc231100770 \h </w:instrText>
         </w:r>
         <w:r>
           <w:rPr>
@@ -2462,7 +2462,7 @@
           <w14:ligatures w14:val="standardContextual"/>
         </w:rPr>
       </w:pPr>
-      <w:hyperlink w:anchor="_Toc231097311" w:history="1">
+      <w:hyperlink w:anchor="_Toc231100771" w:history="1">
         <w:r>
           <w:rPr>
             <w:rStyle w:val="Hipervnculo"/>
@@ -2489,7 +2489,7 @@
             <w:noProof/>
             <w:webHidden/>
           </w:rPr>
-          <w:instrText xml:space="preserve"> PAGEREF _Toc231097311 \h </w:instrText>
+          <w:instrText xml:space="preserve"> PAGEREF _Toc231100771 \h </w:instrText>
         </w:r>
         <w:r>
           <w:rPr>
@@ -2536,7 +2536,7 @@
           <w14:ligatures w14:val="standardContextual"/>
         </w:rPr>
       </w:pPr>
-      <w:hyperlink w:anchor="_Toc231097312" w:history="1">
+      <w:hyperlink w:anchor="_Toc231100772" w:history="1">
         <w:r>
           <w:rPr>
             <w:rStyle w:val="Hipervnculo"/>
@@ -2563,7 +2563,7 @@
             <w:noProof/>
             <w:webHidden/>
           </w:rPr>
-          <w:instrText xml:space="preserve"> PAGEREF _Toc231097312 \h </w:instrText>
+          <w:instrText xml:space="preserve"> PAGEREF _Toc231100772 \h </w:instrText>
         </w:r>
         <w:r>
           <w:rPr>
@@ -2610,7 +2610,7 @@
           <w14:ligatures w14:val="standardContextual"/>
         </w:rPr>
       </w:pPr>
-      <w:hyperlink w:anchor="_Toc231097313" w:history="1">
+      <w:hyperlink w:anchor="_Toc231100773" w:history="1">
         <w:r>
           <w:rPr>
             <w:rStyle w:val="Hipervnculo"/>
@@ -2637,7 +2637,7 @@
             <w:noProof/>
             <w:webHidden/>
           </w:rPr>
-          <w:instrText xml:space="preserve"> PAGEREF _Toc231097313 \h </w:instrText>
+          <w:instrText xml:space="preserve"> PAGEREF _Toc231100773 \h </w:instrText>
         </w:r>
         <w:r>
           <w:rPr>
@@ -2684,7 +2684,7 @@
           <w14:ligatures w14:val="standardContextual"/>
         </w:rPr>
       </w:pPr>
-      <w:hyperlink w:anchor="_Toc231097314" w:history="1">
+      <w:hyperlink w:anchor="_Toc231100774" w:history="1">
         <w:r>
           <w:rPr>
             <w:rStyle w:val="Hipervnculo"/>
@@ -2711,7 +2711,7 @@
             <w:noProof/>
             <w:webHidden/>
           </w:rPr>
-          <w:instrText xml:space="preserve"> PAGEREF _Toc231097314 \h </w:instrText>
+          <w:instrText xml:space="preserve"> PAGEREF _Toc231100774 \h </w:instrText>
         </w:r>
         <w:r>
           <w:rPr>
@@ -2758,7 +2758,7 @@
           <w14:ligatures w14:val="standardContextual"/>
         </w:rPr>
       </w:pPr>
-      <w:hyperlink w:anchor="_Toc231097315" w:history="1">
+      <w:hyperlink w:anchor="_Toc231100775" w:history="1">
         <w:r>
           <w:rPr>
             <w:rStyle w:val="Hipervnculo"/>
@@ -2785,7 +2785,7 @@
             <w:noProof/>
             <w:webHidden/>
           </w:rPr>
-          <w:instrText xml:space="preserve"> PAGEREF _Toc231097315 \h </w:instrText>
+          <w:instrText xml:space="preserve"> PAGEREF _Toc231100775 \h </w:instrText>
         </w:r>
         <w:r>
           <w:rPr>
@@ -2832,7 +2832,7 @@
           <w14:ligatures w14:val="standardContextual"/>
         </w:rPr>
       </w:pPr>
-      <w:hyperlink w:anchor="_Toc231097316" w:history="1">
+      <w:hyperlink w:anchor="_Toc231100776" w:history="1">
         <w:r>
           <w:rPr>
             <w:rStyle w:val="Hipervnculo"/>
@@ -2859,7 +2859,7 @@
             <w:noProof/>
             <w:webHidden/>
           </w:rPr>
-          <w:instrText xml:space="preserve"> PAGEREF _Toc231097316 \h </w:instrText>
+          <w:instrText xml:space="preserve"> PAGEREF _Toc231100776 \h </w:instrText>
         </w:r>
         <w:r>
           <w:rPr>
@@ -2906,7 +2906,7 @@
           <w14:ligatures w14:val="standardContextual"/>
         </w:rPr>
       </w:pPr>
-      <w:hyperlink w:anchor="_Toc231097317" w:history="1">
+      <w:hyperlink w:anchor="_Toc231100777" w:history="1">
         <w:r>
           <w:rPr>
             <w:rStyle w:val="Hipervnculo"/>
@@ -2933,7 +2933,7 @@
             <w:noProof/>
             <w:webHidden/>
           </w:rPr>
-          <w:instrText xml:space="preserve"> PAGEREF _Toc231097317 \h </w:instrText>
+          <w:instrText xml:space="preserve"> PAGEREF _Toc231100777 \h </w:instrText>
         </w:r>
         <w:r>
           <w:rPr>
@@ -2980,7 +2980,7 @@
           <w14:ligatures w14:val="standardContextual"/>
         </w:rPr>
       </w:pPr>
-      <w:hyperlink w:anchor="_Toc231097318" w:history="1">
+      <w:hyperlink w:anchor="_Toc231100778" w:history="1">
         <w:r>
           <w:rPr>
             <w:rStyle w:val="Hipervnculo"/>
@@ -3007,7 +3007,7 @@
             <w:noProof/>
             <w:webHidden/>
           </w:rPr>
-          <w:instrText xml:space="preserve"> PAGEREF _Toc231097318 \h </w:instrText>
+          <w:instrText xml:space="preserve"> PAGEREF _Toc231100778 \h </w:instrText>
         </w:r>
         <w:r>
           <w:rPr>
@@ -3054,7 +3054,7 @@
           <w14:ligatures w14:val="standardContextual"/>
         </w:rPr>
       </w:pPr>
-      <w:hyperlink w:anchor="_Toc231097319" w:history="1">
+      <w:hyperlink w:anchor="_Toc231100779" w:history="1">
         <w:r>
           <w:rPr>
             <w:rStyle w:val="Hipervnculo"/>
@@ -3081,7 +3081,7 @@
             <w:noProof/>
             <w:webHidden/>
           </w:rPr>
-          <w:instrText xml:space="preserve"> PAGEREF _Toc231097319 \h </w:instrText>
+          <w:instrText xml:space="preserve"> PAGEREF _Toc231100779 \h </w:instrText>
         </w:r>
         <w:r>
           <w:rPr>
@@ -3128,7 +3128,7 @@
           <w14:ligatures w14:val="standardContextual"/>
         </w:rPr>
       </w:pPr>
-      <w:hyperlink w:anchor="_Toc231097320" w:history="1">
+      <w:hyperlink w:anchor="_Toc231100780" w:history="1">
         <w:r>
           <w:rPr>
             <w:rStyle w:val="Hipervnculo"/>
@@ -3155,7 +3155,7 @@
             <w:noProof/>
             <w:webHidden/>
           </w:rPr>
-          <w:instrText xml:space="preserve"> PAGEREF _Toc231097320 \h </w:instrText>
+          <w:instrText xml:space="preserve"> PAGEREF _Toc231100780 \h </w:instrText>
         </w:r>
         <w:r>
           <w:rPr>
@@ -3202,7 +3202,7 @@
           <w14:ligatures w14:val="standardContextual"/>
         </w:rPr>
       </w:pPr>
-      <w:hyperlink w:anchor="_Toc231097321" w:history="1">
+      <w:hyperlink w:anchor="_Toc231100781" w:history="1">
         <w:r>
           <w:rPr>
             <w:rStyle w:val="Hipervnculo"/>
@@ -3229,7 +3229,7 @@
             <w:noProof/>
             <w:webHidden/>
           </w:rPr>
-          <w:instrText xml:space="preserve"> PAGEREF _Toc231097321 \h </w:instrText>
+          <w:instrText xml:space="preserve"> PAGEREF _Toc231100781 \h </w:instrText>
         </w:r>
         <w:r>
           <w:rPr>
@@ -3276,7 +3276,7 @@
           <w14:ligatures w14:val="standardContextual"/>
         </w:rPr>
       </w:pPr>
-      <w:hyperlink w:anchor="_Toc231097322" w:history="1">
+      <w:hyperlink w:anchor="_Toc231100782" w:history="1">
         <w:r>
           <w:rPr>
             <w:rStyle w:val="Hipervnculo"/>
@@ -3303,7 +3303,7 @@
             <w:noProof/>
             <w:webHidden/>
           </w:rPr>
-          <w:instrText xml:space="preserve"> PAGEREF _Toc231097322 \h </w:instrText>
+          <w:instrText xml:space="preserve"> PAGEREF _Toc231100782 \h </w:instrText>
         </w:r>
         <w:r>
           <w:rPr>
@@ -3350,7 +3350,7 @@
           <w14:ligatures w14:val="standardContextual"/>
         </w:rPr>
       </w:pPr>
-      <w:hyperlink w:anchor="_Toc231097323" w:history="1">
+      <w:hyperlink w:anchor="_Toc231100783" w:history="1">
         <w:r>
           <w:rPr>
             <w:rStyle w:val="Hipervnculo"/>
@@ -3377,7 +3377,7 @@
             <w:noProof/>
             <w:webHidden/>
           </w:rPr>
-          <w:instrText xml:space="preserve"> PAGEREF _Toc231097323 \h </w:instrText>
+          <w:instrText xml:space="preserve"> PAGEREF _Toc231100783 \h </w:instrText>
         </w:r>
         <w:r>
           <w:rPr>
@@ -3424,7 +3424,7 @@
           <w14:ligatures w14:val="standardContextual"/>
         </w:rPr>
       </w:pPr>
-      <w:hyperlink w:anchor="_Toc231097324" w:history="1">
+      <w:hyperlink w:anchor="_Toc231100784" w:history="1">
         <w:r>
           <w:rPr>
             <w:rStyle w:val="Hipervnculo"/>
@@ -3451,7 +3451,7 @@
             <w:noProof/>
             <w:webHidden/>
           </w:rPr>
-          <w:instrText xml:space="preserve"> PAGEREF _Toc231097324 \h </w:instrText>
+          <w:instrText xml:space="preserve"> PAGEREF _Toc231100784 \h </w:instrText>
         </w:r>
         <w:r>
           <w:rPr>
@@ -3498,7 +3498,7 @@
           <w14:ligatures w14:val="standardContextual"/>
         </w:rPr>
       </w:pPr>
-      <w:hyperlink w:anchor="_Toc231097325" w:history="1">
+      <w:hyperlink w:anchor="_Toc231100785" w:history="1">
         <w:r>
           <w:rPr>
             <w:rStyle w:val="Hipervnculo"/>
@@ -3525,7 +3525,7 @@
             <w:noProof/>
             <w:webHidden/>
           </w:rPr>
-          <w:instrText xml:space="preserve"> PAGEREF _Toc231097325 \h </w:instrText>
+          <w:instrText xml:space="preserve"> PAGEREF _Toc231100785 \h </w:instrText>
         </w:r>
         <w:r>
           <w:rPr>
@@ -3572,7 +3572,7 @@
           <w14:ligatures w14:val="standardContextual"/>
         </w:rPr>
       </w:pPr>
-      <w:hyperlink w:anchor="_Toc231097326" w:history="1">
+      <w:hyperlink w:anchor="_Toc231100786" w:history="1">
         <w:r>
           <w:rPr>
             <w:rStyle w:val="Hipervnculo"/>
@@ -3599,7 +3599,7 @@
             <w:noProof/>
             <w:webHidden/>
           </w:rPr>
-          <w:instrText xml:space="preserve"> PAGEREF _Toc231097326 \h </w:instrText>
+          <w:instrText xml:space="preserve"> PAGEREF _Toc231100786 \h </w:instrText>
         </w:r>
         <w:r>
           <w:rPr>
@@ -3646,7 +3646,7 @@
           <w14:ligatures w14:val="standardContextual"/>
         </w:rPr>
       </w:pPr>
-      <w:hyperlink w:anchor="_Toc231097327" w:history="1">
+      <w:hyperlink w:anchor="_Toc231100787" w:history="1">
         <w:r>
           <w:rPr>
             <w:rStyle w:val="Hipervnculo"/>
@@ -3673,7 +3673,7 @@
             <w:noProof/>
             <w:webHidden/>
           </w:rPr>
-          <w:instrText xml:space="preserve"> PAGEREF _Toc231097327 \h </w:instrText>
+          <w:instrText xml:space="preserve"> PAGEREF _Toc231100787 \h </w:instrText>
         </w:r>
         <w:r>
           <w:rPr>
@@ -3720,7 +3720,7 @@
           <w14:ligatures w14:val="standardContextual"/>
         </w:rPr>
       </w:pPr>
-      <w:hyperlink w:anchor="_Toc231097328" w:history="1">
+      <w:hyperlink w:anchor="_Toc231100788" w:history="1">
         <w:r>
           <w:rPr>
             <w:rStyle w:val="Hipervnculo"/>
@@ -3747,7 +3747,7 @@
             <w:noProof/>
             <w:webHidden/>
           </w:rPr>
-          <w:instrText xml:space="preserve"> PAGEREF _Toc231097328 \h </w:instrText>
+          <w:instrText xml:space="preserve"> PAGEREF _Toc231100788 \h </w:instrText>
         </w:r>
         <w:r>
           <w:rPr>
@@ -3794,7 +3794,7 @@
           <w14:ligatures w14:val="standardContextual"/>
         </w:rPr>
       </w:pPr>
-      <w:hyperlink w:anchor="_Toc231097329" w:history="1">
+      <w:hyperlink w:anchor="_Toc231100789" w:history="1">
         <w:r>
           <w:rPr>
             <w:rStyle w:val="Hipervnculo"/>
@@ -3821,7 +3821,7 @@
             <w:noProof/>
             <w:webHidden/>
           </w:rPr>
-          <w:instrText xml:space="preserve"> PAGEREF _Toc231097329 \h </w:instrText>
+          <w:instrText xml:space="preserve"> PAGEREF _Toc231100789 \h </w:instrText>
         </w:r>
         <w:r>
           <w:rPr>
@@ -3868,7 +3868,7 @@
           <w14:ligatures w14:val="standardContextual"/>
         </w:rPr>
       </w:pPr>
-      <w:hyperlink w:anchor="_Toc231097330" w:history="1">
+      <w:hyperlink w:anchor="_Toc231100790" w:history="1">
         <w:r>
           <w:rPr>
             <w:rStyle w:val="Hipervnculo"/>
@@ -3895,7 +3895,7 @@
             <w:noProof/>
             <w:webHidden/>
           </w:rPr>
-          <w:instrText xml:space="preserve"> PAGEREF _Toc231097330 \h </w:instrText>
+          <w:instrText xml:space="preserve"> PAGEREF _Toc231100790 \h </w:instrText>
         </w:r>
         <w:r>
           <w:rPr>
@@ -3942,7 +3942,7 @@
           <w14:ligatures w14:val="standardContextual"/>
         </w:rPr>
       </w:pPr>
-      <w:hyperlink w:anchor="_Toc231097331" w:history="1">
+      <w:hyperlink w:anchor="_Toc231100791" w:history="1">
         <w:r>
           <w:rPr>
             <w:rStyle w:val="Hipervnculo"/>
@@ -3969,7 +3969,7 @@
             <w:noProof/>
             <w:webHidden/>
           </w:rPr>
-          <w:instrText xml:space="preserve"> PAGEREF _Toc231097331 \h </w:instrText>
+          <w:instrText xml:space="preserve"> PAGEREF _Toc231100791 \h </w:instrText>
         </w:r>
         <w:r>
           <w:rPr>
@@ -4016,7 +4016,7 @@
           <w14:ligatures w14:val="standardContextual"/>
         </w:rPr>
       </w:pPr>
-      <w:hyperlink w:anchor="_Toc231097332" w:history="1">
+      <w:hyperlink w:anchor="_Toc231100792" w:history="1">
         <w:r>
           <w:rPr>
             <w:rStyle w:val="Hipervnculo"/>
@@ -4043,7 +4043,7 @@
             <w:noProof/>
             <w:webHidden/>
           </w:rPr>
-          <w:instrText xml:space="preserve"> PAGEREF _Toc231097332 \h </w:instrText>
+          <w:instrText xml:space="preserve"> PAGEREF _Toc231100792 \h </w:instrText>
         </w:r>
         <w:r>
           <w:rPr>
@@ -4090,7 +4090,7 @@
           <w14:ligatures w14:val="standardContextual"/>
         </w:rPr>
       </w:pPr>
-      <w:hyperlink w:anchor="_Toc231097333" w:history="1">
+      <w:hyperlink w:anchor="_Toc231100793" w:history="1">
         <w:r>
           <w:rPr>
             <w:rStyle w:val="Hipervnculo"/>
@@ -4117,7 +4117,7 @@
             <w:noProof/>
             <w:webHidden/>
           </w:rPr>
-          <w:instrText xml:space="preserve"> PAGEREF _Toc231097333 \h </w:instrText>
+          <w:instrText xml:space="preserve"> PAGEREF _Toc231100793 \h </w:instrText>
         </w:r>
         <w:r>
           <w:rPr>
@@ -4164,7 +4164,7 @@
           <w14:ligatures w14:val="standardContextual"/>
         </w:rPr>
       </w:pPr>
-      <w:hyperlink w:anchor="_Toc231097334" w:history="1">
+      <w:hyperlink w:anchor="_Toc231100794" w:history="1">
         <w:r>
           <w:rPr>
             <w:rStyle w:val="Hipervnculo"/>
@@ -4191,7 +4191,7 @@
             <w:noProof/>
             <w:webHidden/>
           </w:rPr>
-          <w:instrText xml:space="preserve"> PAGEREF _Toc231097334 \h </w:instrText>
+          <w:instrText xml:space="preserve"> PAGEREF _Toc231100794 \h </w:instrText>
         </w:r>
         <w:r>
           <w:rPr>
@@ -4238,7 +4238,7 @@
           <w14:ligatures w14:val="standardContextual"/>
         </w:rPr>
       </w:pPr>
-      <w:hyperlink w:anchor="_Toc231097335" w:history="1">
+      <w:hyperlink w:anchor="_Toc231100795" w:history="1">
         <w:r>
           <w:rPr>
             <w:rStyle w:val="Hipervnculo"/>
@@ -4265,7 +4265,7 @@
             <w:noProof/>
             <w:webHidden/>
           </w:rPr>
-          <w:instrText xml:space="preserve"> PAGEREF _Toc231097335 \h </w:instrText>
+          <w:instrText xml:space="preserve"> PAGEREF _Toc231100795 \h </w:instrText>
         </w:r>
         <w:r>
           <w:rPr>
@@ -4312,7 +4312,7 @@
           <w14:ligatures w14:val="standardContextual"/>
         </w:rPr>
       </w:pPr>
-      <w:hyperlink w:anchor="_Toc231097336" w:history="1">
+      <w:hyperlink w:anchor="_Toc231100796" w:history="1">
         <w:r>
           <w:rPr>
             <w:rStyle w:val="Hipervnculo"/>
@@ -4339,7 +4339,7 @@
             <w:noProof/>
             <w:webHidden/>
           </w:rPr>
-          <w:instrText xml:space="preserve"> PAGEREF _Toc231097336 \h </w:instrText>
+          <w:instrText xml:space="preserve"> PAGEREF _Toc231100796 \h </w:instrText>
         </w:r>
         <w:r>
           <w:rPr>
@@ -4386,7 +4386,7 @@
           <w14:ligatures w14:val="standardContextual"/>
         </w:rPr>
       </w:pPr>
-      <w:hyperlink w:anchor="_Toc231097337" w:history="1">
+      <w:hyperlink w:anchor="_Toc231100797" w:history="1">
         <w:r>
           <w:rPr>
             <w:rStyle w:val="Hipervnculo"/>
@@ -4413,7 +4413,7 @@
             <w:noProof/>
             <w:webHidden/>
           </w:rPr>
-          <w:instrText xml:space="preserve"> PAGEREF _Toc231097337 \h </w:instrText>
+          <w:instrText xml:space="preserve"> PAGEREF _Toc231100797 \h </w:instrText>
         </w:r>
         <w:r>
           <w:rPr>
@@ -4460,7 +4460,7 @@
           <w14:ligatures w14:val="standardContextual"/>
         </w:rPr>
       </w:pPr>
-      <w:hyperlink w:anchor="_Toc231097338" w:history="1">
+      <w:hyperlink w:anchor="_Toc231100798" w:history="1">
         <w:r>
           <w:rPr>
             <w:rStyle w:val="Hipervnculo"/>
@@ -4487,7 +4487,7 @@
             <w:noProof/>
             <w:webHidden/>
           </w:rPr>
-          <w:instrText xml:space="preserve"> PAGEREF _Toc231097338 \h </w:instrText>
+          <w:instrText xml:space="preserve"> PAGEREF _Toc231100798 \h </w:instrText>
         </w:r>
         <w:r>
           <w:rPr>
@@ -4534,7 +4534,7 @@
           <w14:ligatures w14:val="standardContextual"/>
         </w:rPr>
       </w:pPr>
-      <w:hyperlink w:anchor="_Toc231097339" w:history="1">
+      <w:hyperlink w:anchor="_Toc231100799" w:history="1">
         <w:r>
           <w:rPr>
             <w:rStyle w:val="Hipervnculo"/>
@@ -4561,7 +4561,7 @@
             <w:noProof/>
             <w:webHidden/>
           </w:rPr>
-          <w:instrText xml:space="preserve"> PAGEREF _Toc231097339 \h </w:instrText>
+          <w:instrText xml:space="preserve"> PAGEREF _Toc231100799 \h </w:instrText>
         </w:r>
         <w:r>
           <w:rPr>
@@ -4608,7 +4608,7 @@
           <w14:ligatures w14:val="standardContextual"/>
         </w:rPr>
       </w:pPr>
-      <w:hyperlink w:anchor="_Toc231097340" w:history="1">
+      <w:hyperlink w:anchor="_Toc231100800" w:history="1">
         <w:r>
           <w:rPr>
             <w:rStyle w:val="Hipervnculo"/>
@@ -4635,7 +4635,7 @@
             <w:noProof/>
             <w:webHidden/>
           </w:rPr>
-          <w:instrText xml:space="preserve"> PAGEREF _Toc231097340 \h </w:instrText>
+          <w:instrText xml:space="preserve"> PAGEREF _Toc231100800 \h </w:instrText>
         </w:r>
         <w:r>
           <w:rPr>
@@ -4682,7 +4682,7 @@
           <w14:ligatures w14:val="standardContextual"/>
         </w:rPr>
       </w:pPr>
-      <w:hyperlink w:anchor="_Toc231097341" w:history="1">
+      <w:hyperlink w:anchor="_Toc231100801" w:history="1">
         <w:r>
           <w:rPr>
             <w:rStyle w:val="Hipervnculo"/>
@@ -4709,7 +4709,7 @@
             <w:noProof/>
             <w:webHidden/>
           </w:rPr>
-          <w:instrText xml:space="preserve"> PAGEREF _Toc231097341 \h </w:instrText>
+          <w:instrText xml:space="preserve"> PAGEREF _Toc231100801 \h </w:instrText>
         </w:r>
         <w:r>
           <w:rPr>
@@ -4756,7 +4756,7 @@
           <w14:ligatures w14:val="standardContextual"/>
         </w:rPr>
       </w:pPr>
-      <w:hyperlink w:anchor="_Toc231097342" w:history="1">
+      <w:hyperlink w:anchor="_Toc231100802" w:history="1">
         <w:r>
           <w:rPr>
             <w:rStyle w:val="Hipervnculo"/>
@@ -4783,7 +4783,7 @@
             <w:noProof/>
             <w:webHidden/>
           </w:rPr>
-          <w:instrText xml:space="preserve"> PAGEREF _Toc231097342 \h </w:instrText>
+          <w:instrText xml:space="preserve"> PAGEREF _Toc231100802 \h </w:instrText>
         </w:r>
         <w:r>
           <w:rPr>
@@ -4830,7 +4830,7 @@
           <w14:ligatures w14:val="standardContextual"/>
         </w:rPr>
       </w:pPr>
-      <w:hyperlink w:anchor="_Toc231097343" w:history="1">
+      <w:hyperlink w:anchor="_Toc231100803" w:history="1">
         <w:r>
           <w:rPr>
             <w:rStyle w:val="Hipervnculo"/>
@@ -4857,7 +4857,7 @@
             <w:noProof/>
             <w:webHidden/>
           </w:rPr>
-          <w:instrText xml:space="preserve"> PAGEREF _Toc231097343 \h </w:instrText>
+          <w:instrText xml:space="preserve"> PAGEREF _Toc231100803 \h </w:instrText>
         </w:r>
         <w:r>
           <w:rPr>
@@ -4904,7 +4904,7 @@
           <w14:ligatures w14:val="standardContextual"/>
         </w:rPr>
       </w:pPr>
-      <w:hyperlink w:anchor="_Toc231097344" w:history="1">
+      <w:hyperlink w:anchor="_Toc231100804" w:history="1">
         <w:r>
           <w:rPr>
             <w:rStyle w:val="Hipervnculo"/>
@@ -4931,7 +4931,7 @@
             <w:noProof/>
             <w:webHidden/>
           </w:rPr>
-          <w:instrText xml:space="preserve"> PAGEREF _Toc231097344 \h </w:instrText>
+          <w:instrText xml:space="preserve"> PAGEREF _Toc231100804 \h </w:instrText>
         </w:r>
         <w:r>
           <w:rPr>
@@ -4978,7 +4978,7 @@
           <w14:ligatures w14:val="standardContextual"/>
         </w:rPr>
       </w:pPr>
-      <w:hyperlink w:anchor="_Toc231097345" w:history="1">
+      <w:hyperlink w:anchor="_Toc231100805" w:history="1">
         <w:r>
           <w:rPr>
             <w:rStyle w:val="Hipervnculo"/>
@@ -5005,7 +5005,7 @@
             <w:noProof/>
             <w:webHidden/>
           </w:rPr>
-          <w:instrText xml:space="preserve"> PAGEREF _Toc231097345 \h </w:instrText>
+          <w:instrText xml:space="preserve"> PAGEREF _Toc231100805 \h </w:instrText>
         </w:r>
         <w:r>
           <w:rPr>
@@ -5052,7 +5052,7 @@
           <w14:ligatures w14:val="standardContextual"/>
         </w:rPr>
       </w:pPr>
-      <w:hyperlink w:anchor="_Toc231097346" w:history="1">
+      <w:hyperlink w:anchor="_Toc231100806" w:history="1">
         <w:r>
           <w:rPr>
             <w:rStyle w:val="Hipervnculo"/>
@@ -5079,7 +5079,7 @@
             <w:noProof/>
             <w:webHidden/>
           </w:rPr>
-          <w:instrText xml:space="preserve"> PAGEREF _Toc231097346 \h </w:instrText>
+          <w:instrText xml:space="preserve"> PAGEREF _Toc231100806 \h </w:instrText>
         </w:r>
         <w:r>
           <w:rPr>
@@ -5126,7 +5126,7 @@
           <w14:ligatures w14:val="standardContextual"/>
         </w:rPr>
       </w:pPr>
-      <w:hyperlink w:anchor="_Toc231097347" w:history="1">
+      <w:hyperlink w:anchor="_Toc231100807" w:history="1">
         <w:r>
           <w:rPr>
             <w:rStyle w:val="Hipervnculo"/>
@@ -5153,7 +5153,7 @@
             <w:noProof/>
             <w:webHidden/>
           </w:rPr>
-          <w:instrText xml:space="preserve"> PAGEREF _Toc231097347 \h </w:instrText>
+          <w:instrText xml:space="preserve"> PAGEREF _Toc231100807 \h </w:instrText>
         </w:r>
         <w:r>
           <w:rPr>
@@ -5200,7 +5200,7 @@
           <w14:ligatures w14:val="standardContextual"/>
         </w:rPr>
       </w:pPr>
-      <w:hyperlink w:anchor="_Toc231097348" w:history="1">
+      <w:hyperlink w:anchor="_Toc231100808" w:history="1">
         <w:r>
           <w:rPr>
             <w:rStyle w:val="Hipervnculo"/>
@@ -5227,7 +5227,7 @@
             <w:noProof/>
             <w:webHidden/>
           </w:rPr>
-          <w:instrText xml:space="preserve"> PAGEREF _Toc231097348 \h </w:instrText>
+          <w:instrText xml:space="preserve"> PAGEREF _Toc231100808 \h </w:instrText>
         </w:r>
         <w:r>
           <w:rPr>
@@ -5274,7 +5274,7 @@
           <w14:ligatures w14:val="standardContextual"/>
         </w:rPr>
       </w:pPr>
-      <w:hyperlink w:anchor="_Toc231097349" w:history="1">
+      <w:hyperlink w:anchor="_Toc231100809" w:history="1">
         <w:r>
           <w:rPr>
             <w:rStyle w:val="Hipervnculo"/>
@@ -5301,7 +5301,7 @@
             <w:noProof/>
             <w:webHidden/>
           </w:rPr>
-          <w:instrText xml:space="preserve"> PAGEREF _Toc231097349 \h </w:instrText>
+          <w:instrText xml:space="preserve"> PAGEREF _Toc231100809 \h </w:instrText>
         </w:r>
         <w:r>
           <w:rPr>
@@ -5348,7 +5348,7 @@
           <w14:ligatures w14:val="standardContextual"/>
         </w:rPr>
       </w:pPr>
-      <w:hyperlink w:anchor="_Toc231097350" w:history="1">
+      <w:hyperlink w:anchor="_Toc231100810" w:history="1">
         <w:r>
           <w:rPr>
             <w:rStyle w:val="Hipervnculo"/>
@@ -5375,7 +5375,7 @@
             <w:noProof/>
             <w:webHidden/>
           </w:rPr>
-          <w:instrText xml:space="preserve"> PAGEREF _Toc231097350 \h </w:instrText>
+          <w:instrText xml:space="preserve"> PAGEREF _Toc231100810 \h </w:instrText>
         </w:r>
         <w:r>
           <w:rPr>
@@ -5422,7 +5422,7 @@
           <w14:ligatures w14:val="standardContextual"/>
         </w:rPr>
       </w:pPr>
-      <w:hyperlink w:anchor="_Toc231097351" w:history="1">
+      <w:hyperlink w:anchor="_Toc231100811" w:history="1">
         <w:r>
           <w:rPr>
             <w:rStyle w:val="Hipervnculo"/>
@@ -5449,7 +5449,7 @@
             <w:noProof/>
             <w:webHidden/>
           </w:rPr>
-          <w:instrText xml:space="preserve"> PAGEREF _Toc231097351 \h </w:instrText>
+          <w:instrText xml:space="preserve"> PAGEREF _Toc231100811 \h </w:instrText>
         </w:r>
         <w:r>
           <w:rPr>
@@ -5496,7 +5496,7 @@
           <w14:ligatures w14:val="standardContextual"/>
         </w:rPr>
       </w:pPr>
-      <w:hyperlink w:anchor="_Toc231097352" w:history="1">
+      <w:hyperlink w:anchor="_Toc231100812" w:history="1">
         <w:r>
           <w:rPr>
             <w:rStyle w:val="Hipervnculo"/>
@@ -5523,7 +5523,7 @@
             <w:noProof/>
             <w:webHidden/>
           </w:rPr>
-          <w:instrText xml:space="preserve"> PAGEREF _Toc231097352 \h </w:instrText>
+          <w:instrText xml:space="preserve"> PAGEREF _Toc231100812 \h </w:instrText>
         </w:r>
         <w:r>
           <w:rPr>
@@ -5570,12 +5570,86 @@
           <w14:ligatures w14:val="standardContextual"/>
         </w:rPr>
       </w:pPr>
-      <w:hyperlink w:anchor="_Toc231097353" w:history="1">
+      <w:hyperlink w:anchor="_Toc231100813" w:history="1">
         <w:r>
           <w:rPr>
             <w:rStyle w:val="Hipervnculo"/>
             <w:noProof/>
           </w:rPr>
+          <w:t>Anexo J. Síntesis de pruebas de diagnóstico y robustez</w:t>
+        </w:r>
+        <w:r>
+          <w:rPr>
+            <w:noProof/>
+            <w:webHidden/>
+          </w:rPr>
+          <w:tab/>
+        </w:r>
+        <w:r>
+          <w:rPr>
+            <w:noProof/>
+            <w:webHidden/>
+          </w:rPr>
+          <w:fldChar w:fldCharType="begin"/>
+        </w:r>
+        <w:r>
+          <w:rPr>
+            <w:noProof/>
+            <w:webHidden/>
+          </w:rPr>
+          <w:instrText xml:space="preserve"> PAGEREF _Toc231100813 \h </w:instrText>
+        </w:r>
+        <w:r>
+          <w:rPr>
+            <w:noProof/>
+            <w:webHidden/>
+          </w:rPr>
+        </w:r>
+        <w:r>
+          <w:rPr>
+            <w:noProof/>
+            <w:webHidden/>
+          </w:rPr>
+          <w:fldChar w:fldCharType="separate"/>
+        </w:r>
+        <w:r>
+          <w:rPr>
+            <w:noProof/>
+            <w:webHidden/>
+          </w:rPr>
+          <w:t>52</w:t>
+        </w:r>
+        <w:r>
+          <w:rPr>
+            <w:noProof/>
+            <w:webHidden/>
+          </w:rPr>
+          <w:fldChar w:fldCharType="end"/>
+        </w:r>
+      </w:hyperlink>
+    </w:p>
+    <w:p>
+      <w:pPr>
+        <w:pStyle w:val="TDC2"/>
+        <w:tabs>
+          <w:tab w:val="right" w:leader="dot" w:pos="9112"/>
+        </w:tabs>
+        <w:rPr>
+          <w:rFonts w:asciiTheme="minorHAnsi" w:hAnsiTheme="minorHAnsi"/>
+          <w:noProof/>
+          <w:color w:val="auto"/>
+          <w:kern w:val="2"/>
+          <w:szCs w:val="24"/>
+          <w:lang w:val="es-CL" w:eastAsia="es-CL"/>
+          <w14:ligatures w14:val="standardContextual"/>
+        </w:rPr>
+      </w:pPr>
+      <w:hyperlink w:anchor="_Toc231100814" w:history="1">
+        <w:r>
+          <w:rPr>
+            <w:rStyle w:val="Hipervnculo"/>
+            <w:noProof/>
+          </w:rPr>
           <w:t>Anexo I. Extensión predictiva: ¿explican o anticipan?</w:t>
         </w:r>
         <w:r>
@@ -5597,7 +5671,7 @@
             <w:noProof/>
             <w:webHidden/>
           </w:rPr>
-          <w:instrText xml:space="preserve"> PAGEREF _Toc231097353 \h </w:instrText>
+          <w:instrText xml:space="preserve"> PAGEREF _Toc231100814 \h </w:instrText>
         </w:r>
         <w:r>
           <w:rPr>
@@ -5617,7 +5691,7 @@
             <w:noProof/>
             <w:webHidden/>
           </w:rPr>
-          <w:t>52</w:t>
+          <w:t>53</w:t>
         </w:r>
         <w:r>
           <w:rPr>
@@ -5644,7 +5718,7 @@
           <w14:ligatures w14:val="standardContextual"/>
         </w:rPr>
       </w:pPr>
-      <w:hyperlink w:anchor="_Toc231097354" w:history="1">
+      <w:hyperlink w:anchor="_Toc231100815" w:history="1">
         <w:r>
           <w:rPr>
             <w:rStyle w:val="Hipervnculo"/>
@@ -5671,7 +5745,7 @@
             <w:noProof/>
             <w:webHidden/>
           </w:rPr>
-          <w:instrText xml:space="preserve"> PAGEREF _Toc231097354 \h </w:instrText>
+          <w:instrText xml:space="preserve"> PAGEREF _Toc231100815 \h </w:instrText>
         </w:r>
         <w:r>
           <w:rPr>
@@ -5712,6 +5786,7 @@
     </w:p>
     <w:p>
       <w:r>
+        <w:lastRenderedPageBreak/>
         <w:br w:type="page"/>
       </w:r>
     </w:p>
@@ -5719,7 +5794,7 @@
       <w:pPr>
         <w:pStyle w:val="Ttulo1"/>
       </w:pPr>
-      <w:bookmarkStart w:id="7" w:name="_Toc231097291"/>
+      <w:bookmarkStart w:id="7" w:name="_Toc231100751"/>
       <w:r>
         <w:lastRenderedPageBreak/>
         <w:t>Índice de tablas</w:t>
@@ -5751,7 +5826,7 @@
       <w:r>
         <w:fldChar w:fldCharType="separate"/>
       </w:r>
-      <w:hyperlink w:anchor="_Toc231097355" w:history="1">
+      <w:hyperlink w:anchor="_Toc231100816" w:history="1">
         <w:r>
           <w:rPr>
             <w:rStyle w:val="Hipervnculo"/>
@@ -5778,7 +5853,7 @@
             <w:noProof/>
             <w:webHidden/>
           </w:rPr>
-          <w:instrText xml:space="preserve"> PAGEREF _Toc231097355 \h </w:instrText>
+          <w:instrText xml:space="preserve"> PAGEREF _Toc231100816 \h </w:instrText>
         </w:r>
         <w:r>
           <w:rPr>
@@ -5825,7 +5900,7 @@
           <w14:ligatures w14:val="standardContextual"/>
         </w:rPr>
       </w:pPr>
-      <w:hyperlink w:anchor="_Toc231097356" w:history="1">
+      <w:hyperlink w:anchor="_Toc231100817" w:history="1">
         <w:r>
           <w:rPr>
             <w:rStyle w:val="Hipervnculo"/>
@@ -5852,7 +5927,7 @@
             <w:noProof/>
             <w:webHidden/>
           </w:rPr>
-          <w:instrText xml:space="preserve"> PAGEREF _Toc231097356 \h </w:instrText>
+          <w:instrText xml:space="preserve"> PAGEREF _Toc231100817 \h </w:instrText>
         </w:r>
         <w:r>
           <w:rPr>
@@ -5899,7 +5974,7 @@
           <w14:ligatures w14:val="standardContextual"/>
         </w:rPr>
       </w:pPr>
-      <w:hyperlink w:anchor="_Toc231097357" w:history="1">
+      <w:hyperlink w:anchor="_Toc231100818" w:history="1">
         <w:r>
           <w:rPr>
             <w:rStyle w:val="Hipervnculo"/>
@@ -5926,7 +6001,7 @@
             <w:noProof/>
             <w:webHidden/>
           </w:rPr>
-          <w:instrText xml:space="preserve"> PAGEREF _Toc231097357 \h </w:instrText>
+          <w:instrText xml:space="preserve"> PAGEREF _Toc231100818 \h </w:instrText>
         </w:r>
         <w:r>
           <w:rPr>
@@ -5973,7 +6048,7 @@
           <w14:ligatures w14:val="standardContextual"/>
         </w:rPr>
       </w:pPr>
-      <w:hyperlink w:anchor="_Toc231097358" w:history="1">
+      <w:hyperlink w:anchor="_Toc231100819" w:history="1">
         <w:r>
           <w:rPr>
             <w:rStyle w:val="Hipervnculo"/>
@@ -6000,7 +6075,7 @@
             <w:noProof/>
             <w:webHidden/>
           </w:rPr>
-          <w:instrText xml:space="preserve"> PAGEREF _Toc231097358 \h </w:instrText>
+          <w:instrText xml:space="preserve"> PAGEREF _Toc231100819 \h </w:instrText>
         </w:r>
         <w:r>
           <w:rPr>
@@ -6047,7 +6122,7 @@
           <w14:ligatures w14:val="standardContextual"/>
         </w:rPr>
       </w:pPr>
-      <w:hyperlink w:anchor="_Toc231097359" w:history="1">
+      <w:hyperlink w:anchor="_Toc231100820" w:history="1">
         <w:r>
           <w:rPr>
             <w:rStyle w:val="Hipervnculo"/>
@@ -6074,7 +6149,7 @@
             <w:noProof/>
             <w:webHidden/>
           </w:rPr>
-          <w:instrText xml:space="preserve"> PAGEREF _Toc231097359 \h </w:instrText>
+          <w:instrText xml:space="preserve"> PAGEREF _Toc231100820 \h </w:instrText>
         </w:r>
         <w:r>
           <w:rPr>
@@ -6121,7 +6196,7 @@
           <w14:ligatures w14:val="standardContextual"/>
         </w:rPr>
       </w:pPr>
-      <w:hyperlink w:anchor="_Toc231097360" w:history="1">
+      <w:hyperlink w:anchor="_Toc231100821" w:history="1">
         <w:r>
           <w:rPr>
             <w:rStyle w:val="Hipervnculo"/>
@@ -6148,7 +6223,7 @@
             <w:noProof/>
             <w:webHidden/>
           </w:rPr>
-          <w:instrText xml:space="preserve"> PAGEREF _Toc231097360 \h </w:instrText>
+          <w:instrText xml:space="preserve"> PAGEREF _Toc231100821 \h </w:instrText>
         </w:r>
         <w:r>
           <w:rPr>
@@ -6195,7 +6270,7 @@
           <w14:ligatures w14:val="standardContextual"/>
         </w:rPr>
       </w:pPr>
-      <w:hyperlink w:anchor="_Toc231097361" w:history="1">
+      <w:hyperlink w:anchor="_Toc231100822" w:history="1">
         <w:r>
           <w:rPr>
             <w:rStyle w:val="Hipervnculo"/>
@@ -6222,7 +6297,7 @@
             <w:noProof/>
             <w:webHidden/>
           </w:rPr>
-          <w:instrText xml:space="preserve"> PAGEREF _Toc231097361 \h </w:instrText>
+          <w:instrText xml:space="preserve"> PAGEREF _Toc231100822 \h </w:instrText>
         </w:r>
         <w:r>
           <w:rPr>
@@ -6269,7 +6344,7 @@
           <w14:ligatures w14:val="standardContextual"/>
         </w:rPr>
       </w:pPr>
-      <w:hyperlink w:anchor="_Toc231097362" w:history="1">
+      <w:hyperlink w:anchor="_Toc231100823" w:history="1">
         <w:r>
           <w:rPr>
             <w:rStyle w:val="Hipervnculo"/>
@@ -6296,7 +6371,7 @@
             <w:noProof/>
             <w:webHidden/>
           </w:rPr>
-          <w:instrText xml:space="preserve"> PAGEREF _Toc231097362 \h </w:instrText>
+          <w:instrText xml:space="preserve"> PAGEREF _Toc231100823 \h </w:instrText>
         </w:r>
         <w:r>
           <w:rPr>
@@ -6343,7 +6418,7 @@
           <w14:ligatures w14:val="standardContextual"/>
         </w:rPr>
       </w:pPr>
-      <w:hyperlink w:anchor="_Toc231097363" w:history="1">
+      <w:hyperlink w:anchor="_Toc231100824" w:history="1">
         <w:r>
           <w:rPr>
             <w:rStyle w:val="Hipervnculo"/>
@@ -6370,7 +6445,7 @@
             <w:noProof/>
             <w:webHidden/>
           </w:rPr>
-          <w:instrText xml:space="preserve"> PAGEREF _Toc231097363 \h </w:instrText>
+          <w:instrText xml:space="preserve"> PAGEREF _Toc231100824 \h </w:instrText>
         </w:r>
         <w:r>
           <w:rPr>
@@ -6417,7 +6492,7 @@
           <w14:ligatures w14:val="standardContextual"/>
         </w:rPr>
       </w:pPr>
-      <w:hyperlink w:anchor="_Toc231097364" w:history="1">
+      <w:hyperlink w:anchor="_Toc231100825" w:history="1">
         <w:r>
           <w:rPr>
             <w:rStyle w:val="Hipervnculo"/>
@@ -6444,7 +6519,7 @@
             <w:noProof/>
             <w:webHidden/>
           </w:rPr>
-          <w:instrText xml:space="preserve"> PAGEREF _Toc231097364 \h </w:instrText>
+          <w:instrText xml:space="preserve"> PAGEREF _Toc231100825 \h </w:instrText>
         </w:r>
         <w:r>
           <w:rPr>
@@ -6491,7 +6566,7 @@
           <w14:ligatures w14:val="standardContextual"/>
         </w:rPr>
       </w:pPr>
-      <w:hyperlink w:anchor="_Toc231097365" w:history="1">
+      <w:hyperlink w:anchor="_Toc231100826" w:history="1">
         <w:r>
           <w:rPr>
             <w:rStyle w:val="Hipervnculo"/>
@@ -6518,7 +6593,7 @@
             <w:noProof/>
             <w:webHidden/>
           </w:rPr>
-          <w:instrText xml:space="preserve"> PAGEREF _Toc231097365 \h </w:instrText>
+          <w:instrText xml:space="preserve"> PAGEREF _Toc231100826 \h </w:instrText>
         </w:r>
         <w:r>
           <w:rPr>
@@ -6565,7 +6640,7 @@
           <w14:ligatures w14:val="standardContextual"/>
         </w:rPr>
       </w:pPr>
-      <w:hyperlink w:anchor="_Toc231097366" w:history="1">
+      <w:hyperlink w:anchor="_Toc231100827" w:history="1">
         <w:r>
           <w:rPr>
             <w:rStyle w:val="Hipervnculo"/>
@@ -6592,7 +6667,7 @@
             <w:noProof/>
             <w:webHidden/>
           </w:rPr>
-          <w:instrText xml:space="preserve"> PAGEREF _Toc231097366 \h </w:instrText>
+          <w:instrText xml:space="preserve"> PAGEREF _Toc231100827 \h </w:instrText>
         </w:r>
         <w:r>
           <w:rPr>
@@ -6639,7 +6714,7 @@
           <w14:ligatures w14:val="standardContextual"/>
         </w:rPr>
       </w:pPr>
-      <w:hyperlink w:anchor="_Toc231097367" w:history="1">
+      <w:hyperlink w:anchor="_Toc231100828" w:history="1">
         <w:r>
           <w:rPr>
             <w:rStyle w:val="Hipervnculo"/>
@@ -6666,7 +6741,7 @@
             <w:noProof/>
             <w:webHidden/>
           </w:rPr>
-          <w:instrText xml:space="preserve"> PAGEREF _Toc231097367 \h </w:instrText>
+          <w:instrText xml:space="preserve"> PAGEREF _Toc231100828 \h </w:instrText>
         </w:r>
         <w:r>
           <w:rPr>
@@ -6713,7 +6788,7 @@
           <w14:ligatures w14:val="standardContextual"/>
         </w:rPr>
       </w:pPr>
-      <w:hyperlink w:anchor="_Toc231097368" w:history="1">
+      <w:hyperlink w:anchor="_Toc231100829" w:history="1">
         <w:r>
           <w:rPr>
             <w:rStyle w:val="Hipervnculo"/>
@@ -6740,7 +6815,7 @@
             <w:noProof/>
             <w:webHidden/>
           </w:rPr>
-          <w:instrText xml:space="preserve"> PAGEREF _Toc231097368 \h </w:instrText>
+          <w:instrText xml:space="preserve"> PAGEREF _Toc231100829 \h </w:instrText>
         </w:r>
         <w:r>
           <w:rPr>
@@ -6770,30 +6845,6 @@
           <w:fldChar w:fldCharType="end"/>
         </w:r>
       </w:hyperlink>
-    </w:p>
-    <w:p>
-      <w:pPr>
-        <w:spacing w:after="0"/>
-      </w:pPr>
-      <w:r>
-        <w:fldChar w:fldCharType="end"/>
-      </w:r>
-    </w:p>
-    <w:p>
-      <w:r>
-        <w:br w:type="page"/>
-      </w:r>
-    </w:p>
-    <w:p>
-      <w:pPr>
-        <w:pStyle w:val="Ttulo1"/>
-      </w:pPr>
-      <w:bookmarkStart w:id="8" w:name="_Toc231097292"/>
-      <w:r>
-        <w:lastRenderedPageBreak/>
-        <w:t>Índice de figuras</w:t>
-      </w:r>
-      <w:bookmarkEnd w:id="8"/>
     </w:p>
     <w:p>
       <w:pPr>
@@ -6811,22 +6862,13 @@
           <w14:ligatures w14:val="standardContextual"/>
         </w:rPr>
       </w:pPr>
-      <w:r>
-        <w:fldChar w:fldCharType="begin"/>
-      </w:r>
-      <w:r>
-        <w:instrText>TOC \h \z \c "Figura"</w:instrText>
-      </w:r>
-      <w:r>
-        <w:fldChar w:fldCharType="separate"/>
-      </w:r>
-      <w:hyperlink w:anchor="_Toc231097369" w:history="1">
+      <w:hyperlink w:anchor="_Toc231100830" w:history="1">
         <w:r>
           <w:rPr>
             <w:rStyle w:val="Hipervnculo"/>
             <w:noProof/>
           </w:rPr>
-          <w:t>Figura 1. Sensibilidad de los retornos a cada factor macro-financiero (muestra B).</w:t>
+          <w:t>Tabla 15</w:t>
         </w:r>
         <w:r>
           <w:rPr>
@@ -6847,7 +6889,7 @@
             <w:noProof/>
             <w:webHidden/>
           </w:rPr>
-          <w:instrText xml:space="preserve"> PAGEREF _Toc231097369 \h </w:instrText>
+          <w:instrText xml:space="preserve"> PAGEREF _Toc231100830 \h </w:instrText>
         </w:r>
         <w:r>
           <w:rPr>
@@ -6867,7 +6909,7 @@
             <w:noProof/>
             <w:webHidden/>
           </w:rPr>
-          <w:t>28</w:t>
+          <w:t>53</w:t>
         </w:r>
         <w:r>
           <w:rPr>
@@ -6877,6 +6919,30 @@
           <w:fldChar w:fldCharType="end"/>
         </w:r>
       </w:hyperlink>
+    </w:p>
+    <w:p>
+      <w:pPr>
+        <w:spacing w:after="0"/>
+      </w:pPr>
+      <w:r>
+        <w:fldChar w:fldCharType="end"/>
+      </w:r>
+    </w:p>
+    <w:p>
+      <w:r>
+        <w:br w:type="page"/>
+      </w:r>
+    </w:p>
+    <w:p>
+      <w:pPr>
+        <w:pStyle w:val="Ttulo1"/>
+      </w:pPr>
+      <w:bookmarkStart w:id="8" w:name="_Toc231100752"/>
+      <w:r>
+        <w:lastRenderedPageBreak/>
+        <w:t>Índice de figuras</w:t>
+      </w:r>
+      <w:bookmarkEnd w:id="8"/>
     </w:p>
     <w:p>
       <w:pPr>
@@ -6894,13 +6960,22 @@
           <w14:ligatures w14:val="standardContextual"/>
         </w:rPr>
       </w:pPr>
-      <w:hyperlink w:anchor="_Toc231097370" w:history="1">
+      <w:r>
+        <w:fldChar w:fldCharType="begin"/>
+      </w:r>
+      <w:r>
+        <w:instrText>TOC \h \z \c "Figura"</w:instrText>
+      </w:r>
+      <w:r>
+        <w:fldChar w:fldCharType="separate"/>
+      </w:r>
+      <w:hyperlink w:anchor="_Toc231100831" w:history="1">
         <w:r>
           <w:rPr>
             <w:rStyle w:val="Hipervnculo"/>
             <w:noProof/>
           </w:rPr>
-          <w:t>Figura 2. Descomposición de la varianza del error de pronóstico del retorno (FEVD, horizonte 12 meses).</w:t>
+          <w:t>Figura 1. Sensibilidad de los retornos a cada factor macro-financiero (muestra B).</w:t>
         </w:r>
         <w:r>
           <w:rPr>
@@ -6921,7 +6996,7 @@
             <w:noProof/>
             <w:webHidden/>
           </w:rPr>
-          <w:instrText xml:space="preserve"> PAGEREF _Toc231097370 \h </w:instrText>
+          <w:instrText xml:space="preserve"> PAGEREF _Toc231100831 \h </w:instrText>
         </w:r>
         <w:r>
           <w:rPr>
@@ -6941,7 +7016,7 @@
             <w:noProof/>
             <w:webHidden/>
           </w:rPr>
-          <w:t>31</w:t>
+          <w:t>28</w:t>
         </w:r>
         <w:r>
           <w:rPr>
@@ -6968,13 +7043,13 @@
           <w14:ligatures w14:val="standardContextual"/>
         </w:rPr>
       </w:pPr>
-      <w:hyperlink w:anchor="_Toc231097371" w:history="1">
+      <w:hyperlink w:anchor="_Toc231100832" w:history="1">
         <w:r>
           <w:rPr>
             <w:rStyle w:val="Hipervnculo"/>
             <w:noProof/>
           </w:rPr>
-          <w:t>Figura 3. Impulso-respuesta del retorno del sector ante un shock del precio del cobre (±2 errores estándar).</w:t>
+          <w:t>Figura 2. Descomposición de la varianza del error de pronóstico del retorno (FEVD, horizonte 12 meses).</w:t>
         </w:r>
         <w:r>
           <w:rPr>
@@ -6995,7 +7070,7 @@
             <w:noProof/>
             <w:webHidden/>
           </w:rPr>
-          <w:instrText xml:space="preserve"> PAGEREF _Toc231097371 \h </w:instrText>
+          <w:instrText xml:space="preserve"> PAGEREF _Toc231100832 \h </w:instrText>
         </w:r>
         <w:r>
           <w:rPr>
@@ -7015,7 +7090,7 @@
             <w:noProof/>
             <w:webHidden/>
           </w:rPr>
-          <w:t>32</w:t>
+          <w:t>31</w:t>
         </w:r>
         <w:r>
           <w:rPr>
@@ -7042,13 +7117,13 @@
           <w14:ligatures w14:val="standardContextual"/>
         </w:rPr>
       </w:pPr>
-      <w:hyperlink w:anchor="_Toc231097372" w:history="1">
+      <w:hyperlink w:anchor="_Toc231100833" w:history="1">
         <w:r>
           <w:rPr>
             <w:rStyle w:val="Hipervnculo"/>
             <w:noProof/>
           </w:rPr>
-          <w:t>Figura 4. Precio del cobre y fases del ciclo (expansión/contracción) fechadas con Bry-Boschan.</w:t>
+          <w:t>Figura 3. Impulso-respuesta del retorno del sector ante un shock del precio del cobre (±2 errores estándar).</w:t>
         </w:r>
         <w:r>
           <w:rPr>
@@ -7069,7 +7144,7 @@
             <w:noProof/>
             <w:webHidden/>
           </w:rPr>
-          <w:instrText xml:space="preserve"> PAGEREF _Toc231097372 \h </w:instrText>
+          <w:instrText xml:space="preserve"> PAGEREF _Toc231100833 \h </w:instrText>
         </w:r>
         <w:r>
           <w:rPr>
@@ -7089,7 +7164,7 @@
             <w:noProof/>
             <w:webHidden/>
           </w:rPr>
-          <w:t>33</w:t>
+          <w:t>32</w:t>
         </w:r>
         <w:r>
           <w:rPr>
@@ -7116,13 +7191,13 @@
           <w14:ligatures w14:val="standardContextual"/>
         </w:rPr>
       </w:pPr>
-      <w:hyperlink w:anchor="_Toc231097373" w:history="1">
+      <w:hyperlink w:anchor="_Toc231100834" w:history="1">
         <w:r>
           <w:rPr>
             <w:rStyle w:val="Hipervnculo"/>
             <w:noProof/>
           </w:rPr>
-          <w:t>Figura 5. Triangulación: sensibilidad al cobre y dominancia global por muestra (B, A, C).</w:t>
+          <w:t>Figura 4. Precio del cobre y fases del ciclo (expansión/contracción) fechadas con Bry-Boschan.</w:t>
         </w:r>
         <w:r>
           <w:rPr>
@@ -7143,7 +7218,7 @@
             <w:noProof/>
             <w:webHidden/>
           </w:rPr>
-          <w:instrText xml:space="preserve"> PAGEREF _Toc231097373 \h </w:instrText>
+          <w:instrText xml:space="preserve"> PAGEREF _Toc231100834 \h </w:instrText>
         </w:r>
         <w:r>
           <w:rPr>
@@ -7163,7 +7238,7 @@
             <w:noProof/>
             <w:webHidden/>
           </w:rPr>
-          <w:t>34</w:t>
+          <w:t>33</w:t>
         </w:r>
         <w:r>
           <w:rPr>
@@ -7190,12 +7265,86 @@
           <w14:ligatures w14:val="standardContextual"/>
         </w:rPr>
       </w:pPr>
-      <w:hyperlink w:anchor="_Toc231097374" w:history="1">
+      <w:hyperlink w:anchor="_Toc231100835" w:history="1">
         <w:r>
           <w:rPr>
             <w:rStyle w:val="Hipervnculo"/>
             <w:noProof/>
           </w:rPr>
+          <w:t>Figura 5. Triangulación: sensibilidad al cobre y dominancia global por muestra (B, A, C).</w:t>
+        </w:r>
+        <w:r>
+          <w:rPr>
+            <w:noProof/>
+            <w:webHidden/>
+          </w:rPr>
+          <w:tab/>
+        </w:r>
+        <w:r>
+          <w:rPr>
+            <w:noProof/>
+            <w:webHidden/>
+          </w:rPr>
+          <w:fldChar w:fldCharType="begin"/>
+        </w:r>
+        <w:r>
+          <w:rPr>
+            <w:noProof/>
+            <w:webHidden/>
+          </w:rPr>
+          <w:instrText xml:space="preserve"> PAGEREF _Toc231100835 \h </w:instrText>
+        </w:r>
+        <w:r>
+          <w:rPr>
+            <w:noProof/>
+            <w:webHidden/>
+          </w:rPr>
+        </w:r>
+        <w:r>
+          <w:rPr>
+            <w:noProof/>
+            <w:webHidden/>
+          </w:rPr>
+          <w:fldChar w:fldCharType="separate"/>
+        </w:r>
+        <w:r>
+          <w:rPr>
+            <w:noProof/>
+            <w:webHidden/>
+          </w:rPr>
+          <w:t>34</w:t>
+        </w:r>
+        <w:r>
+          <w:rPr>
+            <w:noProof/>
+            <w:webHidden/>
+          </w:rPr>
+          <w:fldChar w:fldCharType="end"/>
+        </w:r>
+      </w:hyperlink>
+    </w:p>
+    <w:p>
+      <w:pPr>
+        <w:pStyle w:val="Tabladeilustraciones"/>
+        <w:tabs>
+          <w:tab w:val="right" w:leader="dot" w:pos="9112"/>
+        </w:tabs>
+        <w:rPr>
+          <w:rFonts w:asciiTheme="minorHAnsi" w:hAnsiTheme="minorHAnsi"/>
+          <w:noProof/>
+          <w:color w:val="auto"/>
+          <w:kern w:val="2"/>
+          <w:szCs w:val="24"/>
+          <w:lang w:val="es-CL" w:eastAsia="es-CL"/>
+          <w14:ligatures w14:val="standardContextual"/>
+        </w:rPr>
+      </w:pPr>
+      <w:hyperlink w:anchor="_Toc231100836" w:history="1">
+        <w:r>
+          <w:rPr>
+            <w:rStyle w:val="Hipervnculo"/>
+            <w:noProof/>
+          </w:rPr>
           <w:t>Figura 6. Respuesta del retorno a un shock del cobre mediante proyecciones locales (Jordà, 2005), IC 95%.</w:t>
         </w:r>
         <w:r>
@@ -7217,7 +7366,7 @@
             <w:noProof/>
             <w:webHidden/>
           </w:rPr>
-          <w:instrText xml:space="preserve"> PAGEREF _Toc231097374 \h </w:instrText>
+          <w:instrText xml:space="preserve"> PAGEREF _Toc231100836 \h </w:instrText>
         </w:r>
         <w:r>
           <w:rPr>
@@ -7265,7 +7414,7 @@
       <w:pPr>
         <w:pStyle w:val="Ttulo1"/>
       </w:pPr>
-      <w:bookmarkStart w:id="9" w:name="_Toc231097293"/>
+      <w:bookmarkStart w:id="9" w:name="_Toc231100753"/>
       <w:r>
         <w:lastRenderedPageBreak/>
         <w:t>Lista de abreviaturas y siglas</w:t>
@@ -8051,7 +8200,7 @@
       <w:pPr>
         <w:pStyle w:val="Ttulo1"/>
       </w:pPr>
-      <w:bookmarkStart w:id="10" w:name="_Toc231097294"/>
+      <w:bookmarkStart w:id="10" w:name="_Toc231100754"/>
       <w:r>
         <w:lastRenderedPageBreak/>
         <w:t>Capítulo 1 — Introducción</w:t>
@@ -8062,7 +8211,7 @@
       <w:pPr>
         <w:pStyle w:val="Ttulo2"/>
       </w:pPr>
-      <w:bookmarkStart w:id="11" w:name="_Toc231097295"/>
+      <w:bookmarkStart w:id="11" w:name="_Toc231100755"/>
       <w:r>
         <w:t>1.1 Contextualización</w:t>
       </w:r>
@@ -8150,7 +8299,7 @@
       <w:pPr>
         <w:pStyle w:val="Ttulo2"/>
       </w:pPr>
-      <w:bookmarkStart w:id="12" w:name="_Toc231097296"/>
+      <w:bookmarkStart w:id="12" w:name="_Toc231100756"/>
       <w:r>
         <w:t>1.2 Problema de investigación y justificación</w:t>
       </w:r>
@@ -8260,7 +8409,7 @@
       <w:pPr>
         <w:pStyle w:val="Ttulo2"/>
       </w:pPr>
-      <w:bookmarkStart w:id="13" w:name="_Toc231097297"/>
+      <w:bookmarkStart w:id="13" w:name="_Toc231100757"/>
       <w:r>
         <w:t>1.3 Pregunta y objetivos de investigación</w:t>
       </w:r>
@@ -8445,7 +8594,7 @@
       <w:pPr>
         <w:pStyle w:val="Ttulo2"/>
       </w:pPr>
-      <w:bookmarkStart w:id="14" w:name="_Toc231097298"/>
+      <w:bookmarkStart w:id="14" w:name="_Toc231100758"/>
       <w:r>
         <w:lastRenderedPageBreak/>
         <w:t>1.4 Hipótesis general</w:t>
@@ -8489,7 +8638,7 @@
       <w:pPr>
         <w:pStyle w:val="Ttulo2"/>
       </w:pPr>
-      <w:bookmarkStart w:id="15" w:name="_Toc231097299"/>
+      <w:bookmarkStart w:id="15" w:name="_Toc231100759"/>
       <w:r>
         <w:t>1.5 Aspectos metodológicos y alcance</w:t>
       </w:r>
@@ -8592,7 +8741,7 @@
       <w:pPr>
         <w:pStyle w:val="Ttulo2"/>
       </w:pPr>
-      <w:bookmarkStart w:id="16" w:name="_Toc231097300"/>
+      <w:bookmarkStart w:id="16" w:name="_Toc231100760"/>
       <w:r>
         <w:t>1.6 Aportes esperados</w:t>
       </w:r>
@@ -8645,7 +8794,7 @@
       <w:pPr>
         <w:pStyle w:val="Ttulo2"/>
       </w:pPr>
-      <w:bookmarkStart w:id="17" w:name="_Toc231097301"/>
+      <w:bookmarkStart w:id="17" w:name="_Toc231100761"/>
       <w:r>
         <w:t>1.7 Estructura de la tesis</w:t>
       </w:r>
@@ -8686,7 +8835,7 @@
       <w:pPr>
         <w:pStyle w:val="Ttulo1"/>
       </w:pPr>
-      <w:bookmarkStart w:id="18" w:name="_Toc231097302"/>
+      <w:bookmarkStart w:id="18" w:name="_Toc231100762"/>
       <w:r>
         <w:lastRenderedPageBreak/>
         <w:t>Capítulo 2 — Marco teórico y revisión de literatura</w:t>
@@ -8697,7 +8846,7 @@
       <w:pPr>
         <w:pStyle w:val="Ttulo2"/>
       </w:pPr>
-      <w:bookmarkStart w:id="19" w:name="_Toc231097303"/>
+      <w:bookmarkStart w:id="19" w:name="_Toc231100763"/>
       <w:r>
         <w:t>2.1 Determinantes macroeconómicos de los retornos accionarios</w:t>
       </w:r>
@@ -8995,7 +9144,7 @@
       <w:pPr>
         <w:pStyle w:val="Ttulo2"/>
       </w:pPr>
-      <w:bookmarkStart w:id="20" w:name="_Toc231097304"/>
+      <w:bookmarkStart w:id="20" w:name="_Toc231100764"/>
       <w:r>
         <w:t>2.2 Precios de commodities y valoración de empresas mineras</w:t>
       </w:r>
@@ -9129,7 +9278,7 @@
       <w:pPr>
         <w:pStyle w:val="Ttulo2"/>
       </w:pPr>
-      <w:bookmarkStart w:id="21" w:name="_Toc231097305"/>
+      <w:bookmarkStart w:id="21" w:name="_Toc231100765"/>
       <w:r>
         <w:t>2.3 Tipo de cambio y exposición de empresas exportadoras</w:t>
       </w:r>
@@ -9223,7 +9372,7 @@
       <w:pPr>
         <w:pStyle w:val="Ttulo2"/>
       </w:pPr>
-      <w:bookmarkStart w:id="22" w:name="_Toc231097306"/>
+      <w:bookmarkStart w:id="22" w:name="_Toc231100766"/>
       <w:r>
         <w:t>2.4 Cobre, tipo de cambio y la economía chilena</w:t>
       </w:r>
@@ -9448,7 +9597,7 @@
       <w:pPr>
         <w:pStyle w:val="Ttulo2"/>
       </w:pPr>
-      <w:bookmarkStart w:id="23" w:name="_Toc231097307"/>
+      <w:bookmarkStart w:id="23" w:name="_Toc231100767"/>
       <w:r>
         <w:lastRenderedPageBreak/>
         <w:t>2.5 Eficiencia informacional y segmentación de mercados</w:t>
@@ -9589,7 +9738,7 @@
       <w:pPr>
         <w:pStyle w:val="Ttulo2"/>
       </w:pPr>
-      <w:bookmarkStart w:id="24" w:name="_Toc231097308"/>
+      <w:bookmarkStart w:id="24" w:name="_Toc231100768"/>
       <w:r>
         <w:t>2.6 Enfoques econométricos para la medición de impacto</w:t>
       </w:r>
@@ -9741,7 +9890,7 @@
       <w:pPr>
         <w:pStyle w:val="Ttulo2"/>
       </w:pPr>
-      <w:bookmarkStart w:id="25" w:name="_Toc231097309"/>
+      <w:bookmarkStart w:id="25" w:name="_Toc231100769"/>
       <w:r>
         <w:t>2.7 Síntesis e identificación del vacío de investigación</w:t>
       </w:r>
@@ -9866,7 +10015,7 @@
       <w:pPr>
         <w:pStyle w:val="Ttulo3"/>
       </w:pPr>
-      <w:bookmarkStart w:id="26" w:name="_Toc231097310"/>
+      <w:bookmarkStart w:id="26" w:name="_Toc231100770"/>
       <w:r>
         <w:t>Nota sobre la tabla de literatura</w:t>
       </w:r>
@@ -9896,7 +10045,7 @@
       <w:pPr>
         <w:pStyle w:val="Ttulo1"/>
       </w:pPr>
-      <w:bookmarkStart w:id="27" w:name="_Toc231097311"/>
+      <w:bookmarkStart w:id="27" w:name="_Toc231100771"/>
       <w:r>
         <w:lastRenderedPageBreak/>
         <w:t>Capítulo 3 — Datos y metodología</w:t>
@@ -9907,7 +10056,7 @@
       <w:pPr>
         <w:pStyle w:val="Ttulo2"/>
       </w:pPr>
-      <w:bookmarkStart w:id="28" w:name="_Toc231097312"/>
+      <w:bookmarkStart w:id="28" w:name="_Toc231100772"/>
       <w:r>
         <w:t xml:space="preserve">3.1 </w:t>
       </w:r>
@@ -10102,7 +10251,7 @@
       <w:pPr>
         <w:pStyle w:val="Ttulo2"/>
       </w:pPr>
-      <w:bookmarkStart w:id="29" w:name="_Toc231097313"/>
+      <w:bookmarkStart w:id="29" w:name="_Toc231100773"/>
       <w:r>
         <w:t>3.2 Variable dependiente</w:t>
       </w:r>
@@ -10164,7 +10313,7 @@
       <w:pPr>
         <w:pStyle w:val="Ttulo2"/>
       </w:pPr>
-      <w:bookmarkStart w:id="30" w:name="_Toc231097314"/>
+      <w:bookmarkStart w:id="30" w:name="_Toc231100774"/>
       <w:r>
         <w:t>3.3 Variables explicativas</w:t>
       </w:r>
@@ -10231,7 +10380,7 @@
       <w:pPr>
         <w:pStyle w:val="Ttulo2"/>
       </w:pPr>
-      <w:bookmarkStart w:id="31" w:name="_Toc231097315"/>
+      <w:bookmarkStart w:id="31" w:name="_Toc231100775"/>
       <w:r>
         <w:t>3.4 Tratamiento de datos y frecuencias mixtas</w:t>
       </w:r>
@@ -10288,7 +10437,7 @@
       <w:pPr>
         <w:pStyle w:val="Ttulo2"/>
       </w:pPr>
-      <w:bookmarkStart w:id="32" w:name="_Toc231097316"/>
+      <w:bookmarkStart w:id="32" w:name="_Toc231100776"/>
       <w:r>
         <w:t>3.5 Datación de las fases del ciclo del cobre</w:t>
       </w:r>
@@ -10354,7 +10503,7 @@
       <w:pPr>
         <w:pStyle w:val="Ttulo2"/>
       </w:pPr>
-      <w:bookmarkStart w:id="33" w:name="_Toc231097317"/>
+      <w:bookmarkStart w:id="33" w:name="_Toc231100777"/>
       <w:r>
         <w:lastRenderedPageBreak/>
         <w:t>3.6 Estrategia econométrica</w:t>
@@ -10365,7 +10514,7 @@
       <w:pPr>
         <w:pStyle w:val="Ttulo3"/>
       </w:pPr>
-      <w:bookmarkStart w:id="34" w:name="_Toc231097318"/>
+      <w:bookmarkStart w:id="34" w:name="_Toc231100778"/>
       <w:r>
         <w:t>3.6.1 Estacionariedad y orden de integración (OE1)</w:t>
       </w:r>
@@ -10408,7 +10557,7 @@
       <w:pPr>
         <w:pStyle w:val="Ttulo3"/>
       </w:pPr>
-      <w:bookmarkStart w:id="35" w:name="_Toc231097319"/>
+      <w:bookmarkStart w:id="35" w:name="_Toc231100779"/>
       <w:r>
         <w:t>3.6.2 Modelo de impacto: panel de efectos fijos (OE2)</w:t>
       </w:r>
@@ -10499,7 +10648,7 @@
       <w:pPr>
         <w:pStyle w:val="Ttulo3"/>
       </w:pPr>
-      <w:bookmarkStart w:id="36" w:name="_Toc231097320"/>
+      <w:bookmarkStart w:id="36" w:name="_Toc231100780"/>
       <w:r>
         <w:t>3.6.3 Relaciones de largo plazo: cointegración (OE3)</w:t>
       </w:r>
@@ -10600,7 +10749,7 @@
       <w:pPr>
         <w:pStyle w:val="Ttulo3"/>
       </w:pPr>
-      <w:bookmarkStart w:id="37" w:name="_Toc231097321"/>
+      <w:bookmarkStart w:id="37" w:name="_Toc231100781"/>
       <w:r>
         <w:t>3.6.4 Dinámica de shocks: VAR, impulso-respuesta y descomposición de varianza (OE4)</w:t>
       </w:r>
@@ -10720,7 +10869,7 @@
       <w:pPr>
         <w:pStyle w:val="Ttulo3"/>
       </w:pPr>
-      <w:bookmarkStart w:id="38" w:name="_Toc231097322"/>
+      <w:bookmarkStart w:id="38" w:name="_Toc231100782"/>
       <w:r>
         <w:t>3.6.5 Estabilidad por fases del ciclo (OE5)</w:t>
       </w:r>
@@ -10766,7 +10915,7 @@
       <w:pPr>
         <w:pStyle w:val="Ttulo3"/>
       </w:pPr>
-      <w:bookmarkStart w:id="39" w:name="_Toc231097323"/>
+      <w:bookmarkStart w:id="39" w:name="_Toc231100783"/>
       <w:r>
         <w:t>3.6.6 Comparación entre mercados: triangulación (OE6)</w:t>
       </w:r>
@@ -10817,7 +10966,7 @@
       <w:pPr>
         <w:pStyle w:val="Ttulo2"/>
       </w:pPr>
-      <w:bookmarkStart w:id="40" w:name="_Toc231097324"/>
+      <w:bookmarkStart w:id="40" w:name="_Toc231100784"/>
       <w:r>
         <w:t xml:space="preserve">3.7 </w:t>
       </w:r>
@@ -10870,7 +11019,7 @@
       <w:pPr>
         <w:pStyle w:val="Ttulo3"/>
       </w:pPr>
-      <w:bookmarkStart w:id="41" w:name="_Toc231097325"/>
+      <w:bookmarkStart w:id="41" w:name="_Toc231100785"/>
       <w:r>
         <w:t>Tabla 3.1 — Definición operativa de variables (resumen)</w:t>
       </w:r>
@@ -10882,7 +11031,7 @@
         <w:spacing w:before="40" w:after="40"/>
         <w:jc w:val="center"/>
       </w:pPr>
-      <w:bookmarkStart w:id="42" w:name="_Toc231097355"/>
+      <w:bookmarkStart w:id="42" w:name="_Toc231100816"/>
       <w:r>
         <w:rPr>
           <w:i w:val="0"/>
@@ -12851,7 +13000,7 @@
       <w:pPr>
         <w:pStyle w:val="Ttulo1"/>
       </w:pPr>
-      <w:bookmarkStart w:id="43" w:name="_Toc231097326"/>
+      <w:bookmarkStart w:id="43" w:name="_Toc231100786"/>
       <w:r>
         <w:lastRenderedPageBreak/>
         <w:t>Capítulo 4 — Resultados y discusión</w:t>
@@ -12862,7 +13011,7 @@
       <w:pPr>
         <w:pStyle w:val="Ttulo2"/>
       </w:pPr>
-      <w:bookmarkStart w:id="44" w:name="_Toc231097327"/>
+      <w:bookmarkStart w:id="44" w:name="_Toc231100787"/>
       <w:r>
         <w:t>4.1 Análisis descriptivo y propiedades de las series (OE1)</w:t>
       </w:r>
@@ -13092,7 +13241,7 @@
       <w:pPr>
         <w:pStyle w:val="Ttulo2"/>
       </w:pPr>
-      <w:bookmarkStart w:id="45" w:name="_Toc231097328"/>
+      <w:bookmarkStart w:id="45" w:name="_Toc231100788"/>
       <w:r>
         <w:t>4.2 Determinantes de los retornos: global vs local (OE2)</w:t>
       </w:r>
@@ -13114,7 +13263,7 @@
         <w:spacing w:before="40" w:after="40"/>
         <w:jc w:val="center"/>
       </w:pPr>
-      <w:bookmarkStart w:id="46" w:name="_Toc231097356"/>
+      <w:bookmarkStart w:id="46" w:name="_Toc231100817"/>
       <w:r>
         <w:rPr>
           <w:i w:val="0"/>
@@ -13920,7 +14069,7 @@
           <w:noProof/>
         </w:rPr>
         <w:drawing>
-          <wp:inline distT="0" distB="0" distL="0" distR="0" wp14:anchorId="75B1D9A5" wp14:editId="42F773A5">
+          <wp:inline distT="0" distB="0" distL="0" distR="0" wp14:anchorId="38033A03" wp14:editId="6ED56299">
             <wp:extent cx="5212080" cy="2833680"/>
             <wp:effectExtent l="0" t="0" r="0" b="0"/>
             <wp:docPr id="1" name="Picture 1"/>
@@ -13962,7 +14111,7 @@
         <w:spacing w:before="160" w:after="200"/>
         <w:jc w:val="center"/>
       </w:pPr>
-      <w:bookmarkStart w:id="47" w:name="_Toc231097369"/>
+      <w:bookmarkStart w:id="47" w:name="_Toc231100831"/>
       <w:r>
         <w:rPr>
           <w:i w:val="0"/>
@@ -14068,7 +14217,7 @@
       <w:pPr>
         <w:pStyle w:val="Ttulo2"/>
       </w:pPr>
-      <w:bookmarkStart w:id="48" w:name="_Toc231097329"/>
+      <w:bookmarkStart w:id="48" w:name="_Toc231100789"/>
       <w:r>
         <w:t>4.3 Relaciones de largo plazo (OE3)</w:t>
       </w:r>
@@ -14232,7 +14381,7 @@
       <w:pPr>
         <w:pStyle w:val="Ttulo2"/>
       </w:pPr>
-      <w:bookmarkStart w:id="49" w:name="_Toc231097330"/>
+      <w:bookmarkStart w:id="49" w:name="_Toc231100790"/>
       <w:r>
         <w:t>4.4 Dinámica de shocks (OE4)</w:t>
       </w:r>
@@ -14254,7 +14403,7 @@
         <w:spacing w:before="40" w:after="40"/>
         <w:jc w:val="center"/>
       </w:pPr>
-      <w:bookmarkStart w:id="50" w:name="_Toc231097357"/>
+      <w:bookmarkStart w:id="50" w:name="_Toc231100818"/>
       <w:r>
         <w:rPr>
           <w:i w:val="0"/>
@@ -14701,7 +14850,7 @@
           <w:noProof/>
         </w:rPr>
         <w:drawing>
-          <wp:inline distT="0" distB="0" distL="0" distR="0" wp14:anchorId="2A1C5F94" wp14:editId="1D8B740E">
+          <wp:inline distT="0" distB="0" distL="0" distR="0" wp14:anchorId="0B347BCD" wp14:editId="777E1075">
             <wp:extent cx="5212080" cy="3890356"/>
             <wp:effectExtent l="0" t="0" r="0" b="0"/>
             <wp:docPr id="2" name="Picture 2"/>
@@ -14743,7 +14892,7 @@
         <w:spacing w:before="160" w:after="200"/>
         <w:jc w:val="center"/>
       </w:pPr>
-      <w:bookmarkStart w:id="51" w:name="_Toc231097370"/>
+      <w:bookmarkStart w:id="51" w:name="_Toc231100832"/>
       <w:r>
         <w:rPr>
           <w:i w:val="0"/>
@@ -14813,7 +14962,7 @@
           <w:noProof/>
         </w:rPr>
         <w:drawing>
-          <wp:inline distT="0" distB="0" distL="0" distR="0" wp14:anchorId="09EFF4E9" wp14:editId="55934E7C">
+          <wp:inline distT="0" distB="0" distL="0" distR="0" wp14:anchorId="3A4A400E" wp14:editId="4D883420">
             <wp:extent cx="5212080" cy="2478330"/>
             <wp:effectExtent l="0" t="0" r="0" b="0"/>
             <wp:docPr id="3" name="Picture 3"/>
@@ -14855,7 +15004,7 @@
         <w:spacing w:before="160" w:after="200"/>
         <w:jc w:val="center"/>
       </w:pPr>
-      <w:bookmarkStart w:id="52" w:name="_Toc231097371"/>
+      <w:bookmarkStart w:id="52" w:name="_Toc231100833"/>
       <w:r>
         <w:rPr>
           <w:i w:val="0"/>
@@ -14889,7 +15038,7 @@
       <w:pPr>
         <w:pStyle w:val="Ttulo2"/>
       </w:pPr>
-      <w:bookmarkStart w:id="53" w:name="_Toc231097331"/>
+      <w:bookmarkStart w:id="53" w:name="_Toc231100791"/>
       <w:r>
         <w:t>4.5 Estabilidad por fases del ciclo del cobre (OE5)</w:t>
       </w:r>
@@ -14997,7 +15146,7 @@
           <w:noProof/>
         </w:rPr>
         <w:drawing>
-          <wp:inline distT="0" distB="0" distL="0" distR="0" wp14:anchorId="0F36BB99" wp14:editId="41C79A2C">
+          <wp:inline distT="0" distB="0" distL="0" distR="0" wp14:anchorId="7D447DB2" wp14:editId="47972035">
             <wp:extent cx="5212080" cy="2366710"/>
             <wp:effectExtent l="0" t="0" r="0" b="0"/>
             <wp:docPr id="4" name="Picture 4"/>
@@ -15039,7 +15188,7 @@
         <w:spacing w:before="160" w:after="200"/>
         <w:jc w:val="center"/>
       </w:pPr>
-      <w:bookmarkStart w:id="54" w:name="_Toc231097372"/>
+      <w:bookmarkStart w:id="54" w:name="_Toc231100834"/>
       <w:r>
         <w:rPr>
           <w:i w:val="0"/>
@@ -15073,7 +15222,7 @@
       <w:pPr>
         <w:pStyle w:val="Ttulo2"/>
       </w:pPr>
-      <w:bookmarkStart w:id="55" w:name="_Toc231097332"/>
+      <w:bookmarkStart w:id="55" w:name="_Toc231100792"/>
       <w:r>
         <w:t>4.6 Comparación entre mercados: triangulación (OE6)</w:t>
       </w:r>
@@ -15095,7 +15244,7 @@
         <w:spacing w:before="40" w:after="40"/>
         <w:jc w:val="center"/>
       </w:pPr>
-      <w:bookmarkStart w:id="56" w:name="_Toc231097358"/>
+      <w:bookmarkStart w:id="56" w:name="_Toc231100819"/>
       <w:r>
         <w:rPr>
           <w:i w:val="0"/>
@@ -15720,7 +15869,7 @@
           <w:noProof/>
         </w:rPr>
         <w:drawing>
-          <wp:inline distT="0" distB="0" distL="0" distR="0" wp14:anchorId="21726FAA" wp14:editId="3E3292E4">
+          <wp:inline distT="0" distB="0" distL="0" distR="0" wp14:anchorId="0BBB658D" wp14:editId="2F3392F6">
             <wp:extent cx="5212080" cy="2626097"/>
             <wp:effectExtent l="0" t="0" r="0" b="0"/>
             <wp:docPr id="5" name="Picture 5"/>
@@ -15762,7 +15911,7 @@
         <w:spacing w:before="160" w:after="200"/>
         <w:jc w:val="center"/>
       </w:pPr>
-      <w:bookmarkStart w:id="57" w:name="_Toc231097373"/>
+      <w:bookmarkStart w:id="57" w:name="_Toc231100835"/>
       <w:r>
         <w:rPr>
           <w:i w:val="0"/>
@@ -15907,7 +16056,7 @@
       <w:pPr>
         <w:pStyle w:val="Ttulo2"/>
       </w:pPr>
-      <w:bookmarkStart w:id="58" w:name="_Toc231097333"/>
+      <w:bookmarkStart w:id="58" w:name="_Toc231100793"/>
       <w:r>
         <w:t>4.7 Diagnósticos y robustez</w:t>
       </w:r>
@@ -16267,7 +16416,7 @@
         </w:rPr>
         <w:lastRenderedPageBreak/>
         <w:drawing>
-          <wp:inline distT="0" distB="0" distL="0" distR="0" wp14:anchorId="353A0F44" wp14:editId="0F6886C3">
+          <wp:inline distT="0" distB="0" distL="0" distR="0" wp14:anchorId="6899BECE" wp14:editId="6D39E410">
             <wp:extent cx="5212080" cy="2446436"/>
             <wp:effectExtent l="0" t="0" r="0" b="0"/>
             <wp:docPr id="6" name="Picture 6"/>
@@ -16309,7 +16458,7 @@
         <w:spacing w:before="160" w:after="200"/>
         <w:jc w:val="center"/>
       </w:pPr>
-      <w:bookmarkStart w:id="59" w:name="_Toc231097374"/>
+      <w:bookmarkStart w:id="59" w:name="_Toc231100836"/>
       <w:r>
         <w:rPr>
           <w:i w:val="0"/>
@@ -16343,7 +16492,7 @@
       <w:pPr>
         <w:pStyle w:val="Ttulo2"/>
       </w:pPr>
-      <w:bookmarkStart w:id="60" w:name="_Toc231097334"/>
+      <w:bookmarkStart w:id="60" w:name="_Toc231100794"/>
       <w:r>
         <w:t>4.8 Discusión integrada</w:t>
       </w:r>
@@ -16524,7 +16673,7 @@
       <w:pPr>
         <w:pStyle w:val="Ttulo1"/>
       </w:pPr>
-      <w:bookmarkStart w:id="61" w:name="_Toc231097335"/>
+      <w:bookmarkStart w:id="61" w:name="_Toc231100795"/>
       <w:r>
         <w:lastRenderedPageBreak/>
         <w:t>Capítulo 5 — Conclusiones</w:t>
@@ -16535,7 +16684,7 @@
       <w:pPr>
         <w:pStyle w:val="Ttulo2"/>
       </w:pPr>
-      <w:bookmarkStart w:id="62" w:name="_Toc231097336"/>
+      <w:bookmarkStart w:id="62" w:name="_Toc231100796"/>
       <w:r>
         <w:t>5.1 Síntesis de los hallazgos</w:t>
       </w:r>
@@ -16702,7 +16851,7 @@
       <w:pPr>
         <w:pStyle w:val="Ttulo2"/>
       </w:pPr>
-      <w:bookmarkStart w:id="63" w:name="_Toc231097337"/>
+      <w:bookmarkStart w:id="63" w:name="_Toc231100797"/>
       <w:r>
         <w:t>5.2 Implicancias</w:t>
       </w:r>
@@ -16774,7 +16923,7 @@
       <w:pPr>
         <w:pStyle w:val="Ttulo2"/>
       </w:pPr>
-      <w:bookmarkStart w:id="64" w:name="_Toc231097338"/>
+      <w:bookmarkStart w:id="64" w:name="_Toc231100798"/>
       <w:r>
         <w:t>5.3 Limitaciones</w:t>
       </w:r>
@@ -16858,7 +17007,7 @@
       <w:pPr>
         <w:pStyle w:val="Ttulo2"/>
       </w:pPr>
-      <w:bookmarkStart w:id="65" w:name="_Toc231097339"/>
+      <w:bookmarkStart w:id="65" w:name="_Toc231100799"/>
       <w:r>
         <w:t>5.4 Líneas futuras de investigación</w:t>
       </w:r>
@@ -16914,7 +17063,7 @@
       <w:pPr>
         <w:pStyle w:val="Ttulo1"/>
       </w:pPr>
-      <w:bookmarkStart w:id="66" w:name="_Toc231097340"/>
+      <w:bookmarkStart w:id="66" w:name="_Toc231100800"/>
       <w:r>
         <w:lastRenderedPageBreak/>
         <w:t>Referencias</w:t>
@@ -17162,7 +17311,7 @@
       <w:pPr>
         <w:pStyle w:val="Ttulo1"/>
       </w:pPr>
-      <w:bookmarkStart w:id="67" w:name="_Toc231097341"/>
+      <w:bookmarkStart w:id="67" w:name="_Toc231100801"/>
       <w:r>
         <w:lastRenderedPageBreak/>
         <w:t>Anexos</w:t>
@@ -17173,7 +17322,7 @@
       <w:pPr>
         <w:pStyle w:val="Ttulo2"/>
       </w:pPr>
-      <w:bookmarkStart w:id="68" w:name="_Toc231097342"/>
+      <w:bookmarkStart w:id="68" w:name="_Toc231100802"/>
       <w:r>
         <w:t>Anexo A. Estadística descriptiva</w:t>
       </w:r>
@@ -17185,7 +17334,7 @@
         <w:spacing w:before="40" w:after="40"/>
         <w:jc w:val="center"/>
       </w:pPr>
-      <w:bookmarkStart w:id="69" w:name="_Toc231097359"/>
+      <w:bookmarkStart w:id="69" w:name="_Toc231100820"/>
       <w:r>
         <w:rPr>
           <w:i w:val="0"/>
@@ -19387,7 +19536,7 @@
       <w:pPr>
         <w:pStyle w:val="Ttulo2"/>
       </w:pPr>
-      <w:bookmarkStart w:id="70" w:name="_Toc231097343"/>
+      <w:bookmarkStart w:id="70" w:name="_Toc231100803"/>
       <w:r>
         <w:t xml:space="preserve">Anexo B. Matriz de correlación de los </w:t>
       </w:r>
@@ -19402,7 +19551,7 @@
         <w:spacing w:before="40" w:after="40"/>
         <w:jc w:val="center"/>
       </w:pPr>
-      <w:bookmarkStart w:id="71" w:name="_Toc231097360"/>
+      <w:bookmarkStart w:id="71" w:name="_Toc231100821"/>
       <w:r>
         <w:rPr>
           <w:i w:val="0"/>
@@ -21436,7 +21585,7 @@
       <w:pPr>
         <w:pStyle w:val="Ttulo2"/>
       </w:pPr>
-      <w:bookmarkStart w:id="72" w:name="_Toc231097344"/>
+      <w:bookmarkStart w:id="72" w:name="_Toc231100804"/>
       <w:r>
         <w:t xml:space="preserve">Anexo C. Pruebas de raíz </w:t>
       </w:r>
@@ -21451,7 +21600,7 @@
         <w:spacing w:before="40" w:after="40"/>
         <w:jc w:val="center"/>
       </w:pPr>
-      <w:bookmarkStart w:id="73" w:name="_Toc231097361"/>
+      <w:bookmarkStart w:id="73" w:name="_Toc231100822"/>
       <w:r>
         <w:rPr>
           <w:i w:val="0"/>
@@ -22279,7 +22428,7 @@
       <w:pPr>
         <w:pStyle w:val="Ttulo2"/>
       </w:pPr>
-      <w:bookmarkStart w:id="74" w:name="_Toc231097345"/>
+      <w:bookmarkStart w:id="74" w:name="_Toc231100805"/>
       <w:r>
         <w:t>Anexo D. Resultados completos del modelo de panel</w:t>
       </w:r>
@@ -22289,7 +22438,7 @@
       <w:pPr>
         <w:pStyle w:val="Ttulo3"/>
       </w:pPr>
-      <w:bookmarkStart w:id="75" w:name="_Toc231097346"/>
+      <w:bookmarkStart w:id="75" w:name="_Toc231100806"/>
       <w:r>
         <w:t>D.1 Muestra B — cobre, mercado internacional</w:t>
       </w:r>
@@ -22301,7 +22450,7 @@
         <w:spacing w:before="40" w:after="40"/>
         <w:jc w:val="center"/>
       </w:pPr>
-      <w:bookmarkStart w:id="76" w:name="_Toc231097362"/>
+      <w:bookmarkStart w:id="76" w:name="_Toc231100823"/>
       <w:r>
         <w:rPr>
           <w:i w:val="0"/>
@@ -23482,7 +23631,7 @@
       <w:pPr>
         <w:pStyle w:val="Ttulo3"/>
       </w:pPr>
-      <w:bookmarkStart w:id="77" w:name="_Toc231097347"/>
+      <w:bookmarkStart w:id="77" w:name="_Toc231100807"/>
       <w:r>
         <w:t>D.2 Muestra A — cobre, mercado chileno (Pucobre)</w:t>
       </w:r>
@@ -23494,7 +23643,7 @@
         <w:spacing w:before="40" w:after="40"/>
         <w:jc w:val="center"/>
       </w:pPr>
-      <w:bookmarkStart w:id="78" w:name="_Toc231097363"/>
+      <w:bookmarkStart w:id="78" w:name="_Toc231100824"/>
       <w:r>
         <w:rPr>
           <w:i w:val="0"/>
@@ -24669,7 +24818,7 @@
       <w:pPr>
         <w:pStyle w:val="Ttulo3"/>
       </w:pPr>
-      <w:bookmarkStart w:id="79" w:name="_Toc231097348"/>
+      <w:bookmarkStart w:id="79" w:name="_Toc231100808"/>
       <w:r>
         <w:t xml:space="preserve">D.3 </w:t>
       </w:r>
@@ -24684,7 +24833,7 @@
         <w:spacing w:before="40" w:after="40"/>
         <w:jc w:val="center"/>
       </w:pPr>
-      <w:bookmarkStart w:id="80" w:name="_Toc231097364"/>
+      <w:bookmarkStart w:id="80" w:name="_Toc231100825"/>
       <w:r>
         <w:rPr>
           <w:i w:val="0"/>
@@ -25859,7 +26008,7 @@
       <w:pPr>
         <w:pStyle w:val="Ttulo2"/>
       </w:pPr>
-      <w:bookmarkStart w:id="81" w:name="_Toc231097349"/>
+      <w:bookmarkStart w:id="81" w:name="_Toc231100809"/>
       <w:r>
         <w:lastRenderedPageBreak/>
         <w:t xml:space="preserve">Anexo E. </w:t>
@@ -25875,7 +26024,7 @@
         <w:spacing w:before="40" w:after="40"/>
         <w:jc w:val="center"/>
       </w:pPr>
-      <w:bookmarkStart w:id="82" w:name="_Toc231097365"/>
+      <w:bookmarkStart w:id="82" w:name="_Toc231100826"/>
       <w:r>
         <w:rPr>
           <w:i w:val="0"/>
@@ -26546,7 +26695,7 @@
       <w:pPr>
         <w:pStyle w:val="Ttulo2"/>
       </w:pPr>
-      <w:bookmarkStart w:id="83" w:name="_Toc231097350"/>
+      <w:bookmarkStart w:id="83" w:name="_Toc231100810"/>
       <w:r>
         <w:t xml:space="preserve">Anexo F. </w:t>
       </w:r>
@@ -26561,7 +26710,7 @@
         <w:spacing w:before="40" w:after="40"/>
         <w:jc w:val="center"/>
       </w:pPr>
-      <w:bookmarkStart w:id="84" w:name="_Toc231097366"/>
+      <w:bookmarkStart w:id="84" w:name="_Toc231100827"/>
       <w:r>
         <w:rPr>
           <w:i w:val="0"/>
@@ -27375,7 +27524,7 @@
       <w:pPr>
         <w:pStyle w:val="Ttulo2"/>
       </w:pPr>
-      <w:bookmarkStart w:id="85" w:name="_Toc231097351"/>
+      <w:bookmarkStart w:id="85" w:name="_Toc231100811"/>
       <w:r>
         <w:t>Anexo G. Fuentes de datos</w:t>
       </w:r>
@@ -27387,7 +27536,7 @@
         <w:spacing w:before="40" w:after="40"/>
         <w:jc w:val="center"/>
       </w:pPr>
-      <w:bookmarkStart w:id="86" w:name="_Toc231097367"/>
+      <w:bookmarkStart w:id="86" w:name="_Toc231100828"/>
       <w:r>
         <w:rPr>
           <w:i w:val="0"/>
@@ -28536,7 +28685,7 @@
       <w:pPr>
         <w:pStyle w:val="Ttulo2"/>
       </w:pPr>
-      <w:bookmarkStart w:id="87" w:name="_Toc231097352"/>
+      <w:bookmarkStart w:id="87" w:name="_Toc231100812"/>
       <w:r>
         <w:t>Anexo H. Disponibilidad del código</w:t>
       </w:r>
@@ -28554,24 +28703,18 @@
       <w:pPr>
         <w:pStyle w:val="Ttulo2"/>
       </w:pPr>
-      <w:bookmarkStart w:id="88" w:name="_Toc231097353"/>
-      <w:r>
-        <w:t>Anexo I. Extensión predictiva: ¿explican o anticipan?</w:t>
+      <w:bookmarkStart w:id="88" w:name="_Toc231100813"/>
+      <w:r>
+        <w:t>Anexo J. Síntesis de pruebas de diagnóstico y robustez</w:t>
       </w:r>
       <w:bookmarkEnd w:id="88"/>
     </w:p>
     <w:p>
       <w:r>
-        <w:t xml:space="preserve">Como complemento a la naturaleza explicativa de la tesis, se evaluó la capacidad </w:t>
-      </w:r>
-      <w:r>
-        <w:rPr>
-          <w:b/>
-        </w:rPr>
-        <w:t>predictiva</w:t>
-      </w:r>
-      <w:r>
-        <w:t xml:space="preserve"> fuera de muestra de los factores macroeconómicos sobre el retorno mensual del cobre (a un mes), comparando un baseline ingenuo, un AR(1), un modelo lineal regularizado (Ridge) y dos modelos no lineales (Random Forest, Gradient Boosting), con división temporal 180/61 (entrenamiento/prueba).</w:t>
+        <w:t xml:space="preserve">La siguiente tabla consolida el conjunto de pruebas de diagnóstico y robustez ejecutadas, todas sobre datos reales y reproducibles desde el </w:t>
+      </w:r>
+      <w:r>
+        <w:t>repositorio.</w:t>
       </w:r>
     </w:p>
     <w:p>
@@ -28580,7 +28723,7 @@
         <w:spacing w:before="40" w:after="40"/>
         <w:jc w:val="center"/>
       </w:pPr>
-      <w:bookmarkStart w:id="89" w:name="_Toc231097368"/>
+      <w:bookmarkStart w:id="89" w:name="_Toc231100829"/>
       <w:r>
         <w:rPr>
           <w:i w:val="0"/>
@@ -28603,6 +28746,1073 @@
         <w:t>14</w:t>
       </w:r>
       <w:bookmarkEnd w:id="89"/>
+      <w:r>
+        <w:fldChar w:fldCharType="end"/>
+      </w:r>
+    </w:p>
+    <w:tbl>
+      <w:tblPr>
+        <w:tblW w:w="0" w:type="auto"/>
+        <w:jc w:val="center"/>
+        <w:tblLook w:val="04A0" w:firstRow="1" w:lastRow="0" w:firstColumn="1" w:lastColumn="0" w:noHBand="0" w:noVBand="1"/>
+      </w:tblPr>
+      <w:tblGrid>
+        <w:gridCol w:w="3041"/>
+        <w:gridCol w:w="3041"/>
+        <w:gridCol w:w="3041"/>
+      </w:tblGrid>
+      <w:tr>
+        <w:trPr>
+          <w:jc w:val="center"/>
+        </w:trPr>
+        <w:tc>
+          <w:tcPr>
+            <w:tcW w:w="3041" w:type="dxa"/>
+            <w:tcBorders>
+              <w:top w:val="single" w:sz="14" w:space="0" w:color="1F3864"/>
+              <w:bottom w:val="single" w:sz="8" w:space="0" w:color="1F3864"/>
+            </w:tcBorders>
+            <w:tcMar>
+              <w:top w:w="60" w:type="dxa"/>
+              <w:left w:w="80" w:type="dxa"/>
+              <w:bottom w:w="60" w:type="dxa"/>
+              <w:right w:w="80" w:type="dxa"/>
+            </w:tcMar>
+          </w:tcPr>
+          <w:p>
+            <w:pPr>
+              <w:spacing w:after="40" w:line="240" w:lineRule="auto"/>
+              <w:jc w:val="left"/>
+            </w:pPr>
+            <w:r>
+              <w:rPr>
+                <w:b/>
+                <w:sz w:val="20"/>
+              </w:rPr>
+              <w:t>Prueba</w:t>
+            </w:r>
+          </w:p>
+        </w:tc>
+        <w:tc>
+          <w:tcPr>
+            <w:tcW w:w="3041" w:type="dxa"/>
+            <w:tcBorders>
+              <w:top w:val="single" w:sz="14" w:space="0" w:color="1F3864"/>
+              <w:bottom w:val="single" w:sz="8" w:space="0" w:color="1F3864"/>
+            </w:tcBorders>
+            <w:tcMar>
+              <w:top w:w="60" w:type="dxa"/>
+              <w:left w:w="80" w:type="dxa"/>
+              <w:bottom w:w="60" w:type="dxa"/>
+              <w:right w:w="80" w:type="dxa"/>
+            </w:tcMar>
+          </w:tcPr>
+          <w:p>
+            <w:pPr>
+              <w:spacing w:after="40" w:line="240" w:lineRule="auto"/>
+              <w:jc w:val="center"/>
+            </w:pPr>
+            <w:r>
+              <w:rPr>
+                <w:b/>
+                <w:sz w:val="20"/>
+              </w:rPr>
+              <w:t>Resultado</w:t>
+            </w:r>
+          </w:p>
+        </w:tc>
+        <w:tc>
+          <w:tcPr>
+            <w:tcW w:w="3041" w:type="dxa"/>
+            <w:tcBorders>
+              <w:top w:val="single" w:sz="14" w:space="0" w:color="1F3864"/>
+              <w:bottom w:val="single" w:sz="8" w:space="0" w:color="1F3864"/>
+            </w:tcBorders>
+            <w:tcMar>
+              <w:top w:w="60" w:type="dxa"/>
+              <w:left w:w="80" w:type="dxa"/>
+              <w:bottom w:w="60" w:type="dxa"/>
+              <w:right w:w="80" w:type="dxa"/>
+            </w:tcMar>
+          </w:tcPr>
+          <w:p>
+            <w:pPr>
+              <w:spacing w:after="40" w:line="240" w:lineRule="auto"/>
+              <w:jc w:val="center"/>
+            </w:pPr>
+            <w:r>
+              <w:rPr>
+                <w:b/>
+                <w:sz w:val="20"/>
+              </w:rPr>
+              <w:t>Conclusión</w:t>
+            </w:r>
+          </w:p>
+        </w:tc>
+      </w:tr>
+      <w:tr>
+        <w:trPr>
+          <w:jc w:val="center"/>
+        </w:trPr>
+        <w:tc>
+          <w:tcPr>
+            <w:tcW w:w="3041" w:type="dxa"/>
+            <w:tcMar>
+              <w:top w:w="60" w:type="dxa"/>
+              <w:left w:w="80" w:type="dxa"/>
+              <w:bottom w:w="60" w:type="dxa"/>
+              <w:right w:w="80" w:type="dxa"/>
+            </w:tcMar>
+          </w:tcPr>
+          <w:p>
+            <w:pPr>
+              <w:spacing w:after="40" w:line="240" w:lineRule="auto"/>
+              <w:jc w:val="left"/>
+            </w:pPr>
+            <w:r>
+              <w:rPr>
+                <w:sz w:val="20"/>
+              </w:rPr>
+              <w:t>Dependencia de sección cruzada (CD de Pesaran)</w:t>
+            </w:r>
+          </w:p>
+        </w:tc>
+        <w:tc>
+          <w:tcPr>
+            <w:tcW w:w="3041" w:type="dxa"/>
+            <w:tcMar>
+              <w:top w:w="60" w:type="dxa"/>
+              <w:left w:w="80" w:type="dxa"/>
+              <w:bottom w:w="60" w:type="dxa"/>
+              <w:right w:w="80" w:type="dxa"/>
+            </w:tcMar>
+          </w:tcPr>
+          <w:p>
+            <w:pPr>
+              <w:spacing w:after="40" w:line="240" w:lineRule="auto"/>
+              <w:jc w:val="center"/>
+            </w:pPr>
+            <w:r>
+              <w:rPr>
+                <w:sz w:val="20"/>
+              </w:rPr>
+              <w:t>CD = 24.5049, p = 0.0</w:t>
+            </w:r>
+          </w:p>
+        </w:tc>
+        <w:tc>
+          <w:tcPr>
+            <w:tcW w:w="3041" w:type="dxa"/>
+            <w:tcMar>
+              <w:top w:w="60" w:type="dxa"/>
+              <w:left w:w="80" w:type="dxa"/>
+              <w:bottom w:w="60" w:type="dxa"/>
+              <w:right w:w="80" w:type="dxa"/>
+            </w:tcMar>
+          </w:tcPr>
+          <w:p>
+            <w:pPr>
+              <w:spacing w:after="40" w:line="240" w:lineRule="auto"/>
+              <w:jc w:val="center"/>
+            </w:pPr>
+            <w:r>
+              <w:rPr>
+                <w:sz w:val="20"/>
+              </w:rPr>
+              <w:t>Dependencia significativa → errores Driscoll-Kraay</w:t>
+            </w:r>
+          </w:p>
+        </w:tc>
+      </w:tr>
+      <w:tr>
+        <w:trPr>
+          <w:jc w:val="center"/>
+        </w:trPr>
+        <w:tc>
+          <w:tcPr>
+            <w:tcW w:w="3041" w:type="dxa"/>
+            <w:tcMar>
+              <w:top w:w="60" w:type="dxa"/>
+              <w:left w:w="80" w:type="dxa"/>
+              <w:bottom w:w="60" w:type="dxa"/>
+              <w:right w:w="80" w:type="dxa"/>
+            </w:tcMar>
+          </w:tcPr>
+          <w:p>
+            <w:pPr>
+              <w:spacing w:after="40" w:line="240" w:lineRule="auto"/>
+              <w:jc w:val="left"/>
+            </w:pPr>
+            <w:r>
+              <w:rPr>
+                <w:sz w:val="20"/>
+              </w:rPr>
+              <w:t>Raíz unitaria en panel (CIPS, Pesaran 2007)</w:t>
+            </w:r>
+          </w:p>
+        </w:tc>
+        <w:tc>
+          <w:tcPr>
+            <w:tcW w:w="3041" w:type="dxa"/>
+            <w:tcMar>
+              <w:top w:w="60" w:type="dxa"/>
+              <w:left w:w="80" w:type="dxa"/>
+              <w:bottom w:w="60" w:type="dxa"/>
+              <w:right w:w="80" w:type="dxa"/>
+            </w:tcMar>
+          </w:tcPr>
+          <w:p>
+            <w:pPr>
+              <w:spacing w:after="40" w:line="240" w:lineRule="auto"/>
+              <w:jc w:val="center"/>
+            </w:pPr>
+            <w:r>
+              <w:rPr>
+                <w:sz w:val="20"/>
+              </w:rPr>
+              <w:t>log-precios I(1); retornos I(0)</w:t>
+            </w:r>
+          </w:p>
+        </w:tc>
+        <w:tc>
+          <w:tcPr>
+            <w:tcW w:w="3041" w:type="dxa"/>
+            <w:tcMar>
+              <w:top w:w="60" w:type="dxa"/>
+              <w:left w:w="80" w:type="dxa"/>
+              <w:bottom w:w="60" w:type="dxa"/>
+              <w:right w:w="80" w:type="dxa"/>
+            </w:tcMar>
+          </w:tcPr>
+          <w:p>
+            <w:pPr>
+              <w:spacing w:after="40" w:line="240" w:lineRule="auto"/>
+              <w:jc w:val="center"/>
+            </w:pPr>
+            <w:r>
+              <w:rPr>
+                <w:sz w:val="20"/>
+              </w:rPr>
+              <w:t>Confirma la doble vía, robusto a dependencia cruzada</w:t>
+            </w:r>
+          </w:p>
+        </w:tc>
+      </w:tr>
+      <w:tr>
+        <w:trPr>
+          <w:jc w:val="center"/>
+        </w:trPr>
+        <w:tc>
+          <w:tcPr>
+            <w:tcW w:w="3041" w:type="dxa"/>
+            <w:tcMar>
+              <w:top w:w="60" w:type="dxa"/>
+              <w:left w:w="80" w:type="dxa"/>
+              <w:bottom w:w="60" w:type="dxa"/>
+              <w:right w:w="80" w:type="dxa"/>
+            </w:tcMar>
+          </w:tcPr>
+          <w:p>
+            <w:pPr>
+              <w:spacing w:after="40" w:line="240" w:lineRule="auto"/>
+              <w:jc w:val="left"/>
+            </w:pPr>
+            <w:r>
+              <w:rPr>
+                <w:sz w:val="20"/>
+              </w:rPr>
+              <w:t>Raíz unitaria con quiebre (Zivot-Andrews)</w:t>
+            </w:r>
+          </w:p>
+        </w:tc>
+        <w:tc>
+          <w:tcPr>
+            <w:tcW w:w="3041" w:type="dxa"/>
+            <w:tcMar>
+              <w:top w:w="60" w:type="dxa"/>
+              <w:left w:w="80" w:type="dxa"/>
+              <w:bottom w:w="60" w:type="dxa"/>
+              <w:right w:w="80" w:type="dxa"/>
+            </w:tcMar>
+          </w:tcPr>
+          <w:p>
+            <w:pPr>
+              <w:spacing w:after="40" w:line="240" w:lineRule="auto"/>
+              <w:jc w:val="center"/>
+            </w:pPr>
+            <w:r>
+              <w:rPr>
+                <w:sz w:val="20"/>
+              </w:rPr>
+              <w:t>TC nivel p = 0.9504</w:t>
+            </w:r>
+          </w:p>
+        </w:tc>
+        <w:tc>
+          <w:tcPr>
+            <w:tcW w:w="3041" w:type="dxa"/>
+            <w:tcMar>
+              <w:top w:w="60" w:type="dxa"/>
+              <w:left w:w="80" w:type="dxa"/>
+              <w:bottom w:w="60" w:type="dxa"/>
+              <w:right w:w="80" w:type="dxa"/>
+            </w:tcMar>
+          </w:tcPr>
+          <w:p>
+            <w:pPr>
+              <w:spacing w:after="40" w:line="240" w:lineRule="auto"/>
+              <w:jc w:val="center"/>
+            </w:pPr>
+            <w:r>
+              <w:rPr>
+                <w:sz w:val="20"/>
+              </w:rPr>
+              <w:t>Tipo de cambio confirmado I(1)</w:t>
+            </w:r>
+          </w:p>
+        </w:tc>
+      </w:tr>
+      <w:tr>
+        <w:trPr>
+          <w:jc w:val="center"/>
+        </w:trPr>
+        <w:tc>
+          <w:tcPr>
+            <w:tcW w:w="3041" w:type="dxa"/>
+            <w:tcMar>
+              <w:top w:w="60" w:type="dxa"/>
+              <w:left w:w="80" w:type="dxa"/>
+              <w:bottom w:w="60" w:type="dxa"/>
+              <w:right w:w="80" w:type="dxa"/>
+            </w:tcMar>
+          </w:tcPr>
+          <w:p>
+            <w:pPr>
+              <w:spacing w:after="40" w:line="240" w:lineRule="auto"/>
+              <w:jc w:val="left"/>
+            </w:pPr>
+            <w:r>
+              <w:rPr>
+                <w:sz w:val="20"/>
+              </w:rPr>
+              <w:t>Cointegración con quiebre (Gregory-Hansen)</w:t>
+            </w:r>
+          </w:p>
+        </w:tc>
+        <w:tc>
+          <w:tcPr>
+            <w:tcW w:w="3041" w:type="dxa"/>
+            <w:tcMar>
+              <w:top w:w="60" w:type="dxa"/>
+              <w:left w:w="80" w:type="dxa"/>
+              <w:bottom w:w="60" w:type="dxa"/>
+              <w:right w:w="80" w:type="dxa"/>
+            </w:tcMar>
+          </w:tcPr>
+          <w:p>
+            <w:pPr>
+              <w:spacing w:after="40" w:line="240" w:lineRule="auto"/>
+              <w:jc w:val="center"/>
+            </w:pPr>
+            <w:r>
+              <w:rPr>
+                <w:sz w:val="20"/>
+              </w:rPr>
+              <w:t>ADF* = -6.6825 &lt; -4.92; quiebre 2008-06</w:t>
+            </w:r>
+          </w:p>
+        </w:tc>
+        <w:tc>
+          <w:tcPr>
+            <w:tcW w:w="3041" w:type="dxa"/>
+            <w:tcMar>
+              <w:top w:w="60" w:type="dxa"/>
+              <w:left w:w="80" w:type="dxa"/>
+              <w:bottom w:w="60" w:type="dxa"/>
+              <w:right w:w="80" w:type="dxa"/>
+            </w:tcMar>
+          </w:tcPr>
+          <w:p>
+            <w:pPr>
+              <w:spacing w:after="40" w:line="240" w:lineRule="auto"/>
+              <w:jc w:val="center"/>
+            </w:pPr>
+            <w:r>
+              <w:rPr>
+                <w:sz w:val="20"/>
+              </w:rPr>
+              <w:t>Relación de largo plazo confirmada (reconfigurada en 2008)</w:t>
+            </w:r>
+          </w:p>
+        </w:tc>
+      </w:tr>
+      <w:tr>
+        <w:trPr>
+          <w:jc w:val="center"/>
+        </w:trPr>
+        <w:tc>
+          <w:tcPr>
+            <w:tcW w:w="3041" w:type="dxa"/>
+            <w:tcMar>
+              <w:top w:w="60" w:type="dxa"/>
+              <w:left w:w="80" w:type="dxa"/>
+              <w:bottom w:w="60" w:type="dxa"/>
+              <w:right w:w="80" w:type="dxa"/>
+            </w:tcMar>
+          </w:tcPr>
+          <w:p>
+            <w:pPr>
+              <w:spacing w:after="40" w:line="240" w:lineRule="auto"/>
+              <w:jc w:val="left"/>
+            </w:pPr>
+            <w:r>
+              <w:rPr>
+                <w:sz w:val="20"/>
+              </w:rPr>
+              <w:t>Estabilidad del VAR y causalidad de Granger</w:t>
+            </w:r>
+          </w:p>
+        </w:tc>
+        <w:tc>
+          <w:tcPr>
+            <w:tcW w:w="3041" w:type="dxa"/>
+            <w:tcMar>
+              <w:top w:w="60" w:type="dxa"/>
+              <w:left w:w="80" w:type="dxa"/>
+              <w:bottom w:w="60" w:type="dxa"/>
+              <w:right w:w="80" w:type="dxa"/>
+            </w:tcMar>
+          </w:tcPr>
+          <w:p>
+            <w:pPr>
+              <w:spacing w:after="40" w:line="240" w:lineRule="auto"/>
+              <w:jc w:val="center"/>
+            </w:pPr>
+            <w:r>
+              <w:rPr>
+                <w:sz w:val="20"/>
+              </w:rPr>
+              <w:t>estable = True; Granger cobre→retorno p = 0.0026</w:t>
+            </w:r>
+          </w:p>
+        </w:tc>
+        <w:tc>
+          <w:tcPr>
+            <w:tcW w:w="3041" w:type="dxa"/>
+            <w:tcMar>
+              <w:top w:w="60" w:type="dxa"/>
+              <w:left w:w="80" w:type="dxa"/>
+              <w:bottom w:w="60" w:type="dxa"/>
+              <w:right w:w="80" w:type="dxa"/>
+            </w:tcMar>
+          </w:tcPr>
+          <w:p>
+            <w:pPr>
+              <w:spacing w:after="40" w:line="240" w:lineRule="auto"/>
+              <w:jc w:val="center"/>
+            </w:pPr>
+            <w:r>
+              <w:rPr>
+                <w:sz w:val="20"/>
+              </w:rPr>
+              <w:t>Sistema válido; el cobre antecede al retorno</w:t>
+            </w:r>
+          </w:p>
+        </w:tc>
+      </w:tr>
+      <w:tr>
+        <w:trPr>
+          <w:jc w:val="center"/>
+        </w:trPr>
+        <w:tc>
+          <w:tcPr>
+            <w:tcW w:w="3041" w:type="dxa"/>
+            <w:tcMar>
+              <w:top w:w="60" w:type="dxa"/>
+              <w:left w:w="80" w:type="dxa"/>
+              <w:bottom w:w="60" w:type="dxa"/>
+              <w:right w:w="80" w:type="dxa"/>
+            </w:tcMar>
+          </w:tcPr>
+          <w:p>
+            <w:pPr>
+              <w:spacing w:after="40" w:line="240" w:lineRule="auto"/>
+              <w:jc w:val="left"/>
+            </w:pPr>
+            <w:r>
+              <w:rPr>
+                <w:sz w:val="20"/>
+              </w:rPr>
+              <w:t>Corrección por pruebas múltiples (FDR)</w:t>
+            </w:r>
+          </w:p>
+        </w:tc>
+        <w:tc>
+          <w:tcPr>
+            <w:tcW w:w="3041" w:type="dxa"/>
+            <w:tcMar>
+              <w:top w:w="60" w:type="dxa"/>
+              <w:left w:w="80" w:type="dxa"/>
+              <w:bottom w:w="60" w:type="dxa"/>
+              <w:right w:w="80" w:type="dxa"/>
+            </w:tcMar>
+          </w:tcPr>
+          <w:p>
+            <w:pPr>
+              <w:spacing w:after="40" w:line="240" w:lineRule="auto"/>
+              <w:jc w:val="center"/>
+            </w:pPr>
+            <w:r>
+              <w:rPr>
+                <w:sz w:val="20"/>
+              </w:rPr>
+              <w:t>sig.: Cobre, VIX, TC CLP</w:t>
+            </w:r>
+          </w:p>
+        </w:tc>
+        <w:tc>
+          <w:tcPr>
+            <w:tcW w:w="3041" w:type="dxa"/>
+            <w:tcMar>
+              <w:top w:w="60" w:type="dxa"/>
+              <w:left w:w="80" w:type="dxa"/>
+              <w:bottom w:w="60" w:type="dxa"/>
+              <w:right w:w="80" w:type="dxa"/>
+            </w:tcMar>
+          </w:tcPr>
+          <w:p>
+            <w:pPr>
+              <w:spacing w:after="40" w:line="240" w:lineRule="auto"/>
+              <w:jc w:val="center"/>
+            </w:pPr>
+            <w:r>
+              <w:rPr>
+                <w:sz w:val="20"/>
+              </w:rPr>
+              <w:t>Los hallazgos centrales no son falsos positivos</w:t>
+            </w:r>
+          </w:p>
+        </w:tc>
+      </w:tr>
+      <w:tr>
+        <w:trPr>
+          <w:jc w:val="center"/>
+        </w:trPr>
+        <w:tc>
+          <w:tcPr>
+            <w:tcW w:w="3041" w:type="dxa"/>
+            <w:tcMar>
+              <w:top w:w="60" w:type="dxa"/>
+              <w:left w:w="80" w:type="dxa"/>
+              <w:bottom w:w="60" w:type="dxa"/>
+              <w:right w:w="80" w:type="dxa"/>
+            </w:tcMar>
+          </w:tcPr>
+          <w:p>
+            <w:pPr>
+              <w:spacing w:after="40" w:line="240" w:lineRule="auto"/>
+              <w:jc w:val="left"/>
+            </w:pPr>
+            <w:r>
+              <w:rPr>
+                <w:sz w:val="20"/>
+              </w:rPr>
+              <w:t>Volatilidad asimétrica (GJR-GARCH)</w:t>
+            </w:r>
+          </w:p>
+        </w:tc>
+        <w:tc>
+          <w:tcPr>
+            <w:tcW w:w="3041" w:type="dxa"/>
+            <w:tcMar>
+              <w:top w:w="60" w:type="dxa"/>
+              <w:left w:w="80" w:type="dxa"/>
+              <w:bottom w:w="60" w:type="dxa"/>
+              <w:right w:w="80" w:type="dxa"/>
+            </w:tcMar>
+          </w:tcPr>
+          <w:p>
+            <w:pPr>
+              <w:spacing w:after="40" w:line="240" w:lineRule="auto"/>
+              <w:jc w:val="center"/>
+            </w:pPr>
+            <w:r>
+              <w:rPr>
+                <w:sz w:val="20"/>
+              </w:rPr>
+              <w:t>γ = 0.2208, p = 0.0233</w:t>
+            </w:r>
+          </w:p>
+        </w:tc>
+        <w:tc>
+          <w:tcPr>
+            <w:tcW w:w="3041" w:type="dxa"/>
+            <w:tcMar>
+              <w:top w:w="60" w:type="dxa"/>
+              <w:left w:w="80" w:type="dxa"/>
+              <w:bottom w:w="60" w:type="dxa"/>
+              <w:right w:w="80" w:type="dxa"/>
+            </w:tcMar>
+          </w:tcPr>
+          <w:p>
+            <w:pPr>
+              <w:spacing w:after="40" w:line="240" w:lineRule="auto"/>
+              <w:jc w:val="center"/>
+            </w:pPr>
+            <w:r>
+              <w:rPr>
+                <w:sz w:val="20"/>
+              </w:rPr>
+              <w:t>Efecto apalancamiento significativo</w:t>
+            </w:r>
+          </w:p>
+        </w:tc>
+      </w:tr>
+      <w:tr>
+        <w:trPr>
+          <w:jc w:val="center"/>
+        </w:trPr>
+        <w:tc>
+          <w:tcPr>
+            <w:tcW w:w="3041" w:type="dxa"/>
+            <w:tcMar>
+              <w:top w:w="60" w:type="dxa"/>
+              <w:left w:w="80" w:type="dxa"/>
+              <w:bottom w:w="60" w:type="dxa"/>
+              <w:right w:w="80" w:type="dxa"/>
+            </w:tcMar>
+          </w:tcPr>
+          <w:p>
+            <w:pPr>
+              <w:spacing w:after="40" w:line="240" w:lineRule="auto"/>
+              <w:jc w:val="left"/>
+            </w:pPr>
+            <w:r>
+              <w:rPr>
+                <w:sz w:val="20"/>
+              </w:rPr>
+              <w:t>Estabilidad por fase del ciclo (interacción)</w:t>
+            </w:r>
+          </w:p>
+        </w:tc>
+        <w:tc>
+          <w:tcPr>
+            <w:tcW w:w="3041" w:type="dxa"/>
+            <w:tcMar>
+              <w:top w:w="60" w:type="dxa"/>
+              <w:left w:w="80" w:type="dxa"/>
+              <w:bottom w:w="60" w:type="dxa"/>
+              <w:right w:w="80" w:type="dxa"/>
+            </w:tcMar>
+          </w:tcPr>
+          <w:p>
+            <w:pPr>
+              <w:spacing w:after="40" w:line="240" w:lineRule="auto"/>
+              <w:jc w:val="center"/>
+            </w:pPr>
+            <w:r>
+              <w:rPr>
+                <w:sz w:val="20"/>
+              </w:rPr>
+              <w:t>cobre×exp p = 0.6267</w:t>
+            </w:r>
+          </w:p>
+        </w:tc>
+        <w:tc>
+          <w:tcPr>
+            <w:tcW w:w="3041" w:type="dxa"/>
+            <w:tcMar>
+              <w:top w:w="60" w:type="dxa"/>
+              <w:left w:w="80" w:type="dxa"/>
+              <w:bottom w:w="60" w:type="dxa"/>
+              <w:right w:w="80" w:type="dxa"/>
+            </w:tcMar>
+          </w:tcPr>
+          <w:p>
+            <w:pPr>
+              <w:spacing w:after="40" w:line="240" w:lineRule="auto"/>
+              <w:jc w:val="center"/>
+            </w:pPr>
+            <w:r>
+              <w:rPr>
+                <w:sz w:val="20"/>
+              </w:rPr>
+              <w:t xml:space="preserve">Sensibilidad estable entre </w:t>
+            </w:r>
+            <w:r>
+              <w:rPr>
+                <w:sz w:val="20"/>
+              </w:rPr>
+              <w:t>regímenes</w:t>
+            </w:r>
+          </w:p>
+        </w:tc>
+      </w:tr>
+      <w:tr>
+        <w:trPr>
+          <w:jc w:val="center"/>
+        </w:trPr>
+        <w:tc>
+          <w:tcPr>
+            <w:tcW w:w="3041" w:type="dxa"/>
+            <w:tcMar>
+              <w:top w:w="60" w:type="dxa"/>
+              <w:left w:w="80" w:type="dxa"/>
+              <w:bottom w:w="60" w:type="dxa"/>
+              <w:right w:w="80" w:type="dxa"/>
+            </w:tcMar>
+          </w:tcPr>
+          <w:p>
+            <w:pPr>
+              <w:spacing w:after="40" w:line="240" w:lineRule="auto"/>
+              <w:jc w:val="left"/>
+            </w:pPr>
+            <w:r>
+              <w:rPr>
+                <w:sz w:val="20"/>
+              </w:rPr>
+              <w:t>Robustez por subperíodos</w:t>
+            </w:r>
+          </w:p>
+        </w:tc>
+        <w:tc>
+          <w:tcPr>
+            <w:tcW w:w="3041" w:type="dxa"/>
+            <w:tcMar>
+              <w:top w:w="60" w:type="dxa"/>
+              <w:left w:w="80" w:type="dxa"/>
+              <w:bottom w:w="60" w:type="dxa"/>
+              <w:right w:w="80" w:type="dxa"/>
+            </w:tcMar>
+          </w:tcPr>
+          <w:p>
+            <w:pPr>
+              <w:spacing w:after="40" w:line="240" w:lineRule="auto"/>
+              <w:jc w:val="center"/>
+            </w:pPr>
+            <w:r>
+              <w:rPr>
+                <w:sz w:val="20"/>
+              </w:rPr>
+              <w:t>β cobre 0.5594 → 0.7509</w:t>
+            </w:r>
+          </w:p>
+        </w:tc>
+        <w:tc>
+          <w:tcPr>
+            <w:tcW w:w="3041" w:type="dxa"/>
+            <w:tcMar>
+              <w:top w:w="60" w:type="dxa"/>
+              <w:left w:w="80" w:type="dxa"/>
+              <w:bottom w:w="60" w:type="dxa"/>
+              <w:right w:w="80" w:type="dxa"/>
+            </w:tcMar>
+          </w:tcPr>
+          <w:p>
+            <w:pPr>
+              <w:spacing w:after="40" w:line="240" w:lineRule="auto"/>
+              <w:jc w:val="center"/>
+            </w:pPr>
+            <w:r>
+              <w:rPr>
+                <w:sz w:val="20"/>
+              </w:rPr>
+              <w:t>Efecto estable, se intensifica tras 2020</w:t>
+            </w:r>
+          </w:p>
+        </w:tc>
+      </w:tr>
+      <w:tr>
+        <w:trPr>
+          <w:jc w:val="center"/>
+        </w:trPr>
+        <w:tc>
+          <w:tcPr>
+            <w:tcW w:w="3041" w:type="dxa"/>
+            <w:tcMar>
+              <w:top w:w="60" w:type="dxa"/>
+              <w:left w:w="80" w:type="dxa"/>
+              <w:bottom w:w="60" w:type="dxa"/>
+              <w:right w:w="80" w:type="dxa"/>
+            </w:tcMar>
+          </w:tcPr>
+          <w:p>
+            <w:pPr>
+              <w:spacing w:after="40" w:line="240" w:lineRule="auto"/>
+              <w:jc w:val="left"/>
+            </w:pPr>
+            <w:r>
+              <w:rPr>
+                <w:sz w:val="20"/>
+              </w:rPr>
+              <w:t>Igualdad de coeficientes entre mercados (H7)</w:t>
+            </w:r>
+          </w:p>
+        </w:tc>
+        <w:tc>
+          <w:tcPr>
+            <w:tcW w:w="3041" w:type="dxa"/>
+            <w:tcMar>
+              <w:top w:w="60" w:type="dxa"/>
+              <w:left w:w="80" w:type="dxa"/>
+              <w:bottom w:w="60" w:type="dxa"/>
+              <w:right w:w="80" w:type="dxa"/>
+            </w:tcMar>
+          </w:tcPr>
+          <w:p>
+            <w:pPr>
+              <w:spacing w:after="40" w:line="240" w:lineRule="auto"/>
+              <w:jc w:val="center"/>
+            </w:pPr>
+            <w:r>
+              <w:rPr>
+                <w:sz w:val="20"/>
+              </w:rPr>
+              <w:t>d_cobre×global = +0,25 (p = 0,01)</w:t>
+            </w:r>
+          </w:p>
+        </w:tc>
+        <w:tc>
+          <w:tcPr>
+            <w:tcW w:w="3041" w:type="dxa"/>
+            <w:tcMar>
+              <w:top w:w="60" w:type="dxa"/>
+              <w:left w:w="80" w:type="dxa"/>
+              <w:bottom w:w="60" w:type="dxa"/>
+              <w:right w:w="80" w:type="dxa"/>
+            </w:tcMar>
+          </w:tcPr>
+          <w:p>
+            <w:pPr>
+              <w:spacing w:after="40" w:line="240" w:lineRule="auto"/>
+              <w:jc w:val="center"/>
+            </w:pPr>
+            <w:r>
+              <w:rPr>
+                <w:sz w:val="20"/>
+              </w:rPr>
+              <w:t>Mayor sensibilidad en el mercado internacional</w:t>
+            </w:r>
+          </w:p>
+        </w:tc>
+      </w:tr>
+      <w:tr>
+        <w:trPr>
+          <w:jc w:val="center"/>
+        </w:trPr>
+        <w:tc>
+          <w:tcPr>
+            <w:tcW w:w="3041" w:type="dxa"/>
+            <w:tcMar>
+              <w:top w:w="60" w:type="dxa"/>
+              <w:left w:w="80" w:type="dxa"/>
+              <w:bottom w:w="60" w:type="dxa"/>
+              <w:right w:w="80" w:type="dxa"/>
+            </w:tcMar>
+          </w:tcPr>
+          <w:p>
+            <w:pPr>
+              <w:spacing w:after="40" w:line="240" w:lineRule="auto"/>
+              <w:jc w:val="left"/>
+            </w:pPr>
+            <w:r>
+              <w:rPr>
+                <w:sz w:val="20"/>
+              </w:rPr>
+              <w:t>Razón de varianzas (Lo-MacKinlay)</w:t>
+            </w:r>
+          </w:p>
+        </w:tc>
+        <w:tc>
+          <w:tcPr>
+            <w:tcW w:w="3041" w:type="dxa"/>
+            <w:tcMar>
+              <w:top w:w="60" w:type="dxa"/>
+              <w:left w:w="80" w:type="dxa"/>
+              <w:bottom w:w="60" w:type="dxa"/>
+              <w:right w:w="80" w:type="dxa"/>
+            </w:tcMar>
+          </w:tcPr>
+          <w:p>
+            <w:pPr>
+              <w:spacing w:after="40" w:line="240" w:lineRule="auto"/>
+              <w:jc w:val="center"/>
+            </w:pPr>
+            <w:r>
+              <w:rPr>
+                <w:sz w:val="20"/>
+              </w:rPr>
+              <w:t>cartera: no rechaza paseo aleatorio</w:t>
+            </w:r>
+          </w:p>
+        </w:tc>
+        <w:tc>
+          <w:tcPr>
+            <w:tcW w:w="3041" w:type="dxa"/>
+            <w:tcMar>
+              <w:top w:w="60" w:type="dxa"/>
+              <w:left w:w="80" w:type="dxa"/>
+              <w:bottom w:w="60" w:type="dxa"/>
+              <w:right w:w="80" w:type="dxa"/>
+            </w:tcMar>
+          </w:tcPr>
+          <w:p>
+            <w:pPr>
+              <w:spacing w:after="40" w:line="240" w:lineRule="auto"/>
+              <w:jc w:val="center"/>
+            </w:pPr>
+            <w:r>
+              <w:rPr>
+                <w:sz w:val="20"/>
+              </w:rPr>
+              <w:t>Eficiencia débil del lado accionario</w:t>
+            </w:r>
+          </w:p>
+        </w:tc>
+      </w:tr>
+      <w:tr>
+        <w:trPr>
+          <w:jc w:val="center"/>
+        </w:trPr>
+        <w:tc>
+          <w:tcPr>
+            <w:tcW w:w="3041" w:type="dxa"/>
+            <w:tcBorders>
+              <w:bottom w:val="single" w:sz="14" w:space="0" w:color="1F3864"/>
+            </w:tcBorders>
+            <w:tcMar>
+              <w:top w:w="60" w:type="dxa"/>
+              <w:left w:w="80" w:type="dxa"/>
+              <w:bottom w:w="60" w:type="dxa"/>
+              <w:right w:w="80" w:type="dxa"/>
+            </w:tcMar>
+          </w:tcPr>
+          <w:p>
+            <w:pPr>
+              <w:spacing w:after="40" w:line="240" w:lineRule="auto"/>
+              <w:jc w:val="left"/>
+            </w:pPr>
+            <w:r>
+              <w:rPr>
+                <w:sz w:val="20"/>
+              </w:rPr>
+              <w:lastRenderedPageBreak/>
+              <w:t>Local Projections (Jordà)</w:t>
+            </w:r>
+          </w:p>
+        </w:tc>
+        <w:tc>
+          <w:tcPr>
+            <w:tcW w:w="3041" w:type="dxa"/>
+            <w:tcBorders>
+              <w:bottom w:val="single" w:sz="14" w:space="0" w:color="1F3864"/>
+            </w:tcBorders>
+            <w:tcMar>
+              <w:top w:w="60" w:type="dxa"/>
+              <w:left w:w="80" w:type="dxa"/>
+              <w:bottom w:w="60" w:type="dxa"/>
+              <w:right w:w="80" w:type="dxa"/>
+            </w:tcMar>
+          </w:tcPr>
+          <w:p>
+            <w:pPr>
+              <w:spacing w:after="40" w:line="240" w:lineRule="auto"/>
+              <w:jc w:val="center"/>
+            </w:pPr>
+            <w:r>
+              <w:rPr>
+                <w:sz w:val="20"/>
+              </w:rPr>
+              <w:t>respuesta positiva al impacto</w:t>
+            </w:r>
+          </w:p>
+        </w:tc>
+        <w:tc>
+          <w:tcPr>
+            <w:tcW w:w="3041" w:type="dxa"/>
+            <w:tcBorders>
+              <w:bottom w:val="single" w:sz="14" w:space="0" w:color="1F3864"/>
+            </w:tcBorders>
+            <w:tcMar>
+              <w:top w:w="60" w:type="dxa"/>
+              <w:left w:w="80" w:type="dxa"/>
+              <w:bottom w:w="60" w:type="dxa"/>
+              <w:right w:w="80" w:type="dxa"/>
+            </w:tcMar>
+          </w:tcPr>
+          <w:p>
+            <w:pPr>
+              <w:spacing w:after="40" w:line="240" w:lineRule="auto"/>
+              <w:jc w:val="center"/>
+            </w:pPr>
+            <w:r>
+              <w:rPr>
+                <w:sz w:val="20"/>
+              </w:rPr>
+              <w:t>Cross-valida la IRF del VAR</w:t>
+            </w:r>
+          </w:p>
+        </w:tc>
+      </w:tr>
+    </w:tbl>
+    <w:p>
+      <w:pPr>
+        <w:spacing w:after="40"/>
+      </w:pPr>
+    </w:p>
+    <w:p>
+      <w:pPr>
+        <w:pStyle w:val="Ttulo2"/>
+      </w:pPr>
+      <w:bookmarkStart w:id="90" w:name="_Toc231100814"/>
+      <w:r>
+        <w:t>Anexo I. Extensión predictiva: ¿explican o anticipan?</w:t>
+      </w:r>
+      <w:bookmarkEnd w:id="90"/>
+    </w:p>
+    <w:p>
+      <w:r>
+        <w:t xml:space="preserve">Como complemento a la naturaleza explicativa de la tesis, se evaluó la capacidad </w:t>
+      </w:r>
+      <w:r>
+        <w:rPr>
+          <w:b/>
+        </w:rPr>
+        <w:t>predictiva</w:t>
+      </w:r>
+      <w:r>
+        <w:t xml:space="preserve"> fuera de muestra de los factores macroeconómicos sobre el retorno mensual del cobre (a un mes), comparando un baseline ingenuo, un AR(1), un modelo lineal regularizado (Ridge) y dos modelos no lineales (Random Forest, Gradient Boosting), con división temporal 180/61 (entrenamiento/prueba).</w:t>
+      </w:r>
+    </w:p>
+    <w:p>
+      <w:pPr>
+        <w:pStyle w:val="Descripcin"/>
+        <w:spacing w:before="40" w:after="40"/>
+        <w:jc w:val="center"/>
+      </w:pPr>
+      <w:bookmarkStart w:id="91" w:name="_Toc231100830"/>
+      <w:r>
+        <w:rPr>
+          <w:i w:val="0"/>
+        </w:rPr>
+        <w:t xml:space="preserve">Tabla </w:t>
+      </w:r>
+      <w:r>
+        <w:fldChar w:fldCharType="begin"/>
+      </w:r>
+      <w:r>
+        <w:instrText xml:space="preserve"> SEQ Tabla \* ARABIC </w:instrText>
+      </w:r>
+      <w:r>
+        <w:fldChar w:fldCharType="separate"/>
+      </w:r>
+      <w:r>
+        <w:rPr>
+          <w:noProof/>
+        </w:rPr>
+        <w:t>15</w:t>
+      </w:r>
+      <w:bookmarkEnd w:id="91"/>
       <w:r>
         <w:fldChar w:fldCharType="end"/>
       </w:r>
@@ -29148,7 +30358,13 @@
               <w:rPr>
                 <w:sz w:val="20"/>
               </w:rPr>
-              <w:t>Random Forest</w:t>
+              <w:t xml:space="preserve">Random </w:t>
+            </w:r>
+            <w:r>
+              <w:rPr>
+                <w:sz w:val="20"/>
+              </w:rPr>
+              <w:t>Forest</w:t>
             </w:r>
           </w:p>
         </w:tc>
@@ -29429,7 +30645,6 @@
     </w:p>
     <w:p>
       <w:r>
-        <w:lastRenderedPageBreak/>
         <w:t xml:space="preserve">Como contraste complementario de la hipótesis de paseo aleatorio se aplica el test de razón de varianzas de Lo y MacKinlay (1988), con estadístico robusto a heterocedasticidad. Para el </w:t>
       </w:r>
       <w:r>
@@ -29478,12 +30693,12 @@
       <w:pPr>
         <w:pStyle w:val="Ttulo1"/>
       </w:pPr>
-      <w:bookmarkStart w:id="90" w:name="_Toc231097354"/>
+      <w:bookmarkStart w:id="92" w:name="_Toc231100815"/>
       <w:r>
         <w:lastRenderedPageBreak/>
         <w:t>Glosario de términos econométricos</w:t>
       </w:r>
-      <w:bookmarkEnd w:id="90"/>
+      <w:bookmarkEnd w:id="92"/>
     </w:p>
     <w:p>
       <w:r>
@@ -29632,7 +30847,10 @@
     </w:p>
     <w:p>
       <w:r>
-        <w:t>tiempo, con agrupamiento de la volatilidad; típica de los retornos financieros.</w:t>
+        <w:t xml:space="preserve">tiempo, con agrupamiento de la volatilidad; típica de los retornos </w:t>
+      </w:r>
+      <w:r>
+        <w:t>financieros.</w:t>
       </w:r>
     </w:p>
     <w:p>
@@ -30109,31 +31327,31 @@
       </w:rPr>
     </w:lvl>
   </w:abstractNum>
-  <w:num w:numId="1" w16cid:durableId="1569997962">
+  <w:num w:numId="1" w16cid:durableId="1985231854">
     <w:abstractNumId w:val="8"/>
   </w:num>
-  <w:num w:numId="2" w16cid:durableId="1966887682">
+  <w:num w:numId="2" w16cid:durableId="9451805">
     <w:abstractNumId w:val="6"/>
   </w:num>
-  <w:num w:numId="3" w16cid:durableId="599490405">
+  <w:num w:numId="3" w16cid:durableId="145166465">
     <w:abstractNumId w:val="5"/>
   </w:num>
-  <w:num w:numId="4" w16cid:durableId="673921323">
+  <w:num w:numId="4" w16cid:durableId="2128766669">
     <w:abstractNumId w:val="4"/>
   </w:num>
-  <w:num w:numId="5" w16cid:durableId="1181820243">
+  <w:num w:numId="5" w16cid:durableId="1396052342">
     <w:abstractNumId w:val="7"/>
   </w:num>
-  <w:num w:numId="6" w16cid:durableId="645085098">
+  <w:num w:numId="6" w16cid:durableId="118304252">
     <w:abstractNumId w:val="3"/>
   </w:num>
-  <w:num w:numId="7" w16cid:durableId="1735350572">
+  <w:num w:numId="7" w16cid:durableId="291837062">
     <w:abstractNumId w:val="2"/>
   </w:num>
-  <w:num w:numId="8" w16cid:durableId="1706714726">
+  <w:num w:numId="8" w16cid:durableId="784468769">
     <w:abstractNumId w:val="1"/>
   </w:num>
-  <w:num w:numId="9" w16cid:durableId="1867984212">
+  <w:num w:numId="9" w16cid:durableId="163054122">
     <w:abstractNumId w:val="0"/>
   </w:num>
 </w:numbering>
@@ -41535,7 +42753,7 @@
     <w:autoRedefine/>
     <w:uiPriority w:val="39"/>
     <w:unhideWhenUsed/>
-    <w:rsid w:val="008E52B3"/>
+    <w:rsid w:val="007D5177"/>
     <w:pPr>
       <w:spacing w:after="100"/>
     </w:pPr>
@@ -41547,7 +42765,7 @@
     <w:autoRedefine/>
     <w:uiPriority w:val="39"/>
     <w:unhideWhenUsed/>
-    <w:rsid w:val="008E52B3"/>
+    <w:rsid w:val="007D5177"/>
     <w:pPr>
       <w:spacing w:after="100"/>
       <w:ind w:left="240"/>
@@ -41560,7 +42778,7 @@
     <w:autoRedefine/>
     <w:uiPriority w:val="39"/>
     <w:unhideWhenUsed/>
-    <w:rsid w:val="008E52B3"/>
+    <w:rsid w:val="007D5177"/>
     <w:pPr>
       <w:spacing w:after="100"/>
       <w:ind w:left="480"/>
@@ -41571,7 +42789,7 @@
     <w:basedOn w:val="Fuentedeprrafopredeter"/>
     <w:uiPriority w:val="99"/>
     <w:unhideWhenUsed/>
-    <w:rsid w:val="008E52B3"/>
+    <w:rsid w:val="007D5177"/>
     <w:rPr>
       <w:color w:val="0000FF" w:themeColor="hyperlink"/>
       <w:u w:val="single"/>
@@ -41583,7 +42801,7 @@
     <w:next w:val="Normal"/>
     <w:uiPriority w:val="99"/>
     <w:unhideWhenUsed/>
-    <w:rsid w:val="008E52B3"/>
+    <w:rsid w:val="007D5177"/>
     <w:pPr>
       <w:spacing w:after="0"/>
     </w:pPr>

</xml_diff>

<commit_message>
Cap.3 §3.7: anticipa la batería ampliada de diagnósticos (CIPS, Gregory-Hansen, GJR, LP, FDR, VR, H7)
Alinea metodología con resultados: el lector ve el arsenal completo antes del Cap.4.

Co-Authored-By: Claude Opus 4.8 <noreply@anthropic.com>
</commit_message>
<xml_diff>
--- a/outputs/Tesis_Francisco_Rietta.docx
+++ b/outputs/Tesis_Francisco_Rietta.docx
@@ -166,7 +166,7 @@
       <w:pPr>
         <w:pStyle w:val="Ttulo1"/>
       </w:pPr>
-      <w:bookmarkStart w:id="0" w:name="_Toc231100744"/>
+      <w:bookmarkStart w:id="0" w:name="_Toc231102548"/>
       <w:r>
         <w:lastRenderedPageBreak/>
         <w:t>Página de aprobación</w:t>
@@ -262,7 +262,7 @@
       <w:pPr>
         <w:pStyle w:val="Ttulo1"/>
       </w:pPr>
-      <w:bookmarkStart w:id="1" w:name="_Toc231100745"/>
+      <w:bookmarkStart w:id="1" w:name="_Toc231102549"/>
       <w:r>
         <w:lastRenderedPageBreak/>
         <w:t>Declaración de originalidad</w:t>
@@ -303,7 +303,7 @@
       <w:pPr>
         <w:pStyle w:val="Ttulo1"/>
       </w:pPr>
-      <w:bookmarkStart w:id="2" w:name="_Toc231100746"/>
+      <w:bookmarkStart w:id="2" w:name="_Toc231102550"/>
       <w:r>
         <w:lastRenderedPageBreak/>
         <w:t>Dedicatoria</w:t>
@@ -333,7 +333,7 @@
       <w:pPr>
         <w:pStyle w:val="Ttulo1"/>
       </w:pPr>
-      <w:bookmarkStart w:id="3" w:name="_Toc231100747"/>
+      <w:bookmarkStart w:id="3" w:name="_Toc231102551"/>
       <w:r>
         <w:lastRenderedPageBreak/>
         <w:t>Agradecimientos</w:t>
@@ -359,7 +359,7 @@
       <w:pPr>
         <w:pStyle w:val="Ttulo1"/>
       </w:pPr>
-      <w:bookmarkStart w:id="4" w:name="_Toc231100748"/>
+      <w:bookmarkStart w:id="4" w:name="_Toc231102552"/>
       <w:r>
         <w:lastRenderedPageBreak/>
         <w:t>Resumen</w:t>
@@ -397,7 +397,7 @@
       <w:pPr>
         <w:pStyle w:val="Ttulo1"/>
       </w:pPr>
-      <w:bookmarkStart w:id="5" w:name="_Toc231100749"/>
+      <w:bookmarkStart w:id="5" w:name="_Toc231102553"/>
       <w:r>
         <w:lastRenderedPageBreak/>
         <w:t>Abstract</w:t>
@@ -432,7 +432,7 @@
       <w:pPr>
         <w:pStyle w:val="Ttulo1"/>
       </w:pPr>
-      <w:bookmarkStart w:id="6" w:name="_Toc231100750"/>
+      <w:bookmarkStart w:id="6" w:name="_Toc231102554"/>
       <w:r>
         <w:lastRenderedPageBreak/>
         <w:t>Índice general</w:t>
@@ -464,7 +464,7 @@
       <w:r>
         <w:fldChar w:fldCharType="separate"/>
       </w:r>
-      <w:hyperlink w:anchor="_Toc231100744" w:history="1">
+      <w:hyperlink w:anchor="_Toc231102548" w:history="1">
         <w:r>
           <w:rPr>
             <w:rStyle w:val="Hipervnculo"/>
@@ -491,7 +491,7 @@
             <w:noProof/>
             <w:webHidden/>
           </w:rPr>
-          <w:instrText xml:space="preserve"> PAGEREF _Toc231100744 \h </w:instrText>
+          <w:instrText xml:space="preserve"> PAGEREF _Toc231102548 \h </w:instrText>
         </w:r>
         <w:r>
           <w:rPr>
@@ -538,7 +538,7 @@
           <w14:ligatures w14:val="standardContextual"/>
         </w:rPr>
       </w:pPr>
-      <w:hyperlink w:anchor="_Toc231100745" w:history="1">
+      <w:hyperlink w:anchor="_Toc231102549" w:history="1">
         <w:r>
           <w:rPr>
             <w:rStyle w:val="Hipervnculo"/>
@@ -565,7 +565,7 @@
             <w:noProof/>
             <w:webHidden/>
           </w:rPr>
-          <w:instrText xml:space="preserve"> PAGEREF _Toc231100745 \h </w:instrText>
+          <w:instrText xml:space="preserve"> PAGEREF _Toc231102549 \h </w:instrText>
         </w:r>
         <w:r>
           <w:rPr>
@@ -612,7 +612,7 @@
           <w14:ligatures w14:val="standardContextual"/>
         </w:rPr>
       </w:pPr>
-      <w:hyperlink w:anchor="_Toc231100746" w:history="1">
+      <w:hyperlink w:anchor="_Toc231102550" w:history="1">
         <w:r>
           <w:rPr>
             <w:rStyle w:val="Hipervnculo"/>
@@ -639,7 +639,7 @@
             <w:noProof/>
             <w:webHidden/>
           </w:rPr>
-          <w:instrText xml:space="preserve"> PAGEREF _Toc231100746 \h </w:instrText>
+          <w:instrText xml:space="preserve"> PAGEREF _Toc231102550 \h </w:instrText>
         </w:r>
         <w:r>
           <w:rPr>
@@ -686,7 +686,7 @@
           <w14:ligatures w14:val="standardContextual"/>
         </w:rPr>
       </w:pPr>
-      <w:hyperlink w:anchor="_Toc231100747" w:history="1">
+      <w:hyperlink w:anchor="_Toc231102551" w:history="1">
         <w:r>
           <w:rPr>
             <w:rStyle w:val="Hipervnculo"/>
@@ -713,7 +713,7 @@
             <w:noProof/>
             <w:webHidden/>
           </w:rPr>
-          <w:instrText xml:space="preserve"> PAGEREF _Toc231100747 \h </w:instrText>
+          <w:instrText xml:space="preserve"> PAGEREF _Toc231102551 \h </w:instrText>
         </w:r>
         <w:r>
           <w:rPr>
@@ -760,7 +760,7 @@
           <w14:ligatures w14:val="standardContextual"/>
         </w:rPr>
       </w:pPr>
-      <w:hyperlink w:anchor="_Toc231100748" w:history="1">
+      <w:hyperlink w:anchor="_Toc231102552" w:history="1">
         <w:r>
           <w:rPr>
             <w:rStyle w:val="Hipervnculo"/>
@@ -787,7 +787,7 @@
             <w:noProof/>
             <w:webHidden/>
           </w:rPr>
-          <w:instrText xml:space="preserve"> PAGEREF _Toc231100748 \h </w:instrText>
+          <w:instrText xml:space="preserve"> PAGEREF _Toc231102552 \h </w:instrText>
         </w:r>
         <w:r>
           <w:rPr>
@@ -834,7 +834,7 @@
           <w14:ligatures w14:val="standardContextual"/>
         </w:rPr>
       </w:pPr>
-      <w:hyperlink w:anchor="_Toc231100749" w:history="1">
+      <w:hyperlink w:anchor="_Toc231102553" w:history="1">
         <w:r>
           <w:rPr>
             <w:rStyle w:val="Hipervnculo"/>
@@ -861,7 +861,7 @@
             <w:noProof/>
             <w:webHidden/>
           </w:rPr>
-          <w:instrText xml:space="preserve"> PAGEREF _Toc231100749 \h </w:instrText>
+          <w:instrText xml:space="preserve"> PAGEREF _Toc231102553 \h </w:instrText>
         </w:r>
         <w:r>
           <w:rPr>
@@ -908,7 +908,7 @@
           <w14:ligatures w14:val="standardContextual"/>
         </w:rPr>
       </w:pPr>
-      <w:hyperlink w:anchor="_Toc231100750" w:history="1">
+      <w:hyperlink w:anchor="_Toc231102554" w:history="1">
         <w:r>
           <w:rPr>
             <w:rStyle w:val="Hipervnculo"/>
@@ -935,7 +935,7 @@
             <w:noProof/>
             <w:webHidden/>
           </w:rPr>
-          <w:instrText xml:space="preserve"> PAGEREF _Toc231100750 \h </w:instrText>
+          <w:instrText xml:space="preserve"> PAGEREF _Toc231102554 \h </w:instrText>
         </w:r>
         <w:r>
           <w:rPr>
@@ -982,7 +982,7 @@
           <w14:ligatures w14:val="standardContextual"/>
         </w:rPr>
       </w:pPr>
-      <w:hyperlink w:anchor="_Toc231100751" w:history="1">
+      <w:hyperlink w:anchor="_Toc231102555" w:history="1">
         <w:r>
           <w:rPr>
             <w:rStyle w:val="Hipervnculo"/>
@@ -1009,7 +1009,7 @@
             <w:noProof/>
             <w:webHidden/>
           </w:rPr>
-          <w:instrText xml:space="preserve"> PAGEREF _Toc231100751 \h </w:instrText>
+          <w:instrText xml:space="preserve"> PAGEREF _Toc231102555 \h </w:instrText>
         </w:r>
         <w:r>
           <w:rPr>
@@ -1056,7 +1056,7 @@
           <w14:ligatures w14:val="standardContextual"/>
         </w:rPr>
       </w:pPr>
-      <w:hyperlink w:anchor="_Toc231100752" w:history="1">
+      <w:hyperlink w:anchor="_Toc231102556" w:history="1">
         <w:r>
           <w:rPr>
             <w:rStyle w:val="Hipervnculo"/>
@@ -1083,7 +1083,7 @@
             <w:noProof/>
             <w:webHidden/>
           </w:rPr>
-          <w:instrText xml:space="preserve"> PAGEREF _Toc231100752 \h </w:instrText>
+          <w:instrText xml:space="preserve"> PAGEREF _Toc231102556 \h </w:instrText>
         </w:r>
         <w:r>
           <w:rPr>
@@ -1130,7 +1130,7 @@
           <w14:ligatures w14:val="standardContextual"/>
         </w:rPr>
       </w:pPr>
-      <w:hyperlink w:anchor="_Toc231100753" w:history="1">
+      <w:hyperlink w:anchor="_Toc231102557" w:history="1">
         <w:r>
           <w:rPr>
             <w:rStyle w:val="Hipervnculo"/>
@@ -1157,7 +1157,7 @@
             <w:noProof/>
             <w:webHidden/>
           </w:rPr>
-          <w:instrText xml:space="preserve"> PAGEREF _Toc231100753 \h </w:instrText>
+          <w:instrText xml:space="preserve"> PAGEREF _Toc231102557 \h </w:instrText>
         </w:r>
         <w:r>
           <w:rPr>
@@ -1204,7 +1204,7 @@
           <w14:ligatures w14:val="standardContextual"/>
         </w:rPr>
       </w:pPr>
-      <w:hyperlink w:anchor="_Toc231100754" w:history="1">
+      <w:hyperlink w:anchor="_Toc231102558" w:history="1">
         <w:r>
           <w:rPr>
             <w:rStyle w:val="Hipervnculo"/>
@@ -1231,7 +1231,7 @@
             <w:noProof/>
             <w:webHidden/>
           </w:rPr>
-          <w:instrText xml:space="preserve"> PAGEREF _Toc231100754 \h </w:instrText>
+          <w:instrText xml:space="preserve"> PAGEREF _Toc231102558 \h </w:instrText>
         </w:r>
         <w:r>
           <w:rPr>
@@ -1278,7 +1278,7 @@
           <w14:ligatures w14:val="standardContextual"/>
         </w:rPr>
       </w:pPr>
-      <w:hyperlink w:anchor="_Toc231100755" w:history="1">
+      <w:hyperlink w:anchor="_Toc231102559" w:history="1">
         <w:r>
           <w:rPr>
             <w:rStyle w:val="Hipervnculo"/>
@@ -1305,7 +1305,7 @@
             <w:noProof/>
             <w:webHidden/>
           </w:rPr>
-          <w:instrText xml:space="preserve"> PAGEREF _Toc231100755 \h </w:instrText>
+          <w:instrText xml:space="preserve"> PAGEREF _Toc231102559 \h </w:instrText>
         </w:r>
         <w:r>
           <w:rPr>
@@ -1352,7 +1352,7 @@
           <w14:ligatures w14:val="standardContextual"/>
         </w:rPr>
       </w:pPr>
-      <w:hyperlink w:anchor="_Toc231100756" w:history="1">
+      <w:hyperlink w:anchor="_Toc231102560" w:history="1">
         <w:r>
           <w:rPr>
             <w:rStyle w:val="Hipervnculo"/>
@@ -1379,7 +1379,7 @@
             <w:noProof/>
             <w:webHidden/>
           </w:rPr>
-          <w:instrText xml:space="preserve"> PAGEREF _Toc231100756 \h </w:instrText>
+          <w:instrText xml:space="preserve"> PAGEREF _Toc231102560 \h </w:instrText>
         </w:r>
         <w:r>
           <w:rPr>
@@ -1426,7 +1426,7 @@
           <w14:ligatures w14:val="standardContextual"/>
         </w:rPr>
       </w:pPr>
-      <w:hyperlink w:anchor="_Toc231100757" w:history="1">
+      <w:hyperlink w:anchor="_Toc231102561" w:history="1">
         <w:r>
           <w:rPr>
             <w:rStyle w:val="Hipervnculo"/>
@@ -1453,7 +1453,7 @@
             <w:noProof/>
             <w:webHidden/>
           </w:rPr>
-          <w:instrText xml:space="preserve"> PAGEREF _Toc231100757 \h </w:instrText>
+          <w:instrText xml:space="preserve"> PAGEREF _Toc231102561 \h </w:instrText>
         </w:r>
         <w:r>
           <w:rPr>
@@ -1500,7 +1500,7 @@
           <w14:ligatures w14:val="standardContextual"/>
         </w:rPr>
       </w:pPr>
-      <w:hyperlink w:anchor="_Toc231100758" w:history="1">
+      <w:hyperlink w:anchor="_Toc231102562" w:history="1">
         <w:r>
           <w:rPr>
             <w:rStyle w:val="Hipervnculo"/>
@@ -1527,7 +1527,7 @@
             <w:noProof/>
             <w:webHidden/>
           </w:rPr>
-          <w:instrText xml:space="preserve"> PAGEREF _Toc231100758 \h </w:instrText>
+          <w:instrText xml:space="preserve"> PAGEREF _Toc231102562 \h </w:instrText>
         </w:r>
         <w:r>
           <w:rPr>
@@ -1574,7 +1574,7 @@
           <w14:ligatures w14:val="standardContextual"/>
         </w:rPr>
       </w:pPr>
-      <w:hyperlink w:anchor="_Toc231100759" w:history="1">
+      <w:hyperlink w:anchor="_Toc231102563" w:history="1">
         <w:r>
           <w:rPr>
             <w:rStyle w:val="Hipervnculo"/>
@@ -1601,7 +1601,7 @@
             <w:noProof/>
             <w:webHidden/>
           </w:rPr>
-          <w:instrText xml:space="preserve"> PAGEREF _Toc231100759 \h </w:instrText>
+          <w:instrText xml:space="preserve"> PAGEREF _Toc231102563 \h </w:instrText>
         </w:r>
         <w:r>
           <w:rPr>
@@ -1648,7 +1648,7 @@
           <w14:ligatures w14:val="standardContextual"/>
         </w:rPr>
       </w:pPr>
-      <w:hyperlink w:anchor="_Toc231100760" w:history="1">
+      <w:hyperlink w:anchor="_Toc231102564" w:history="1">
         <w:r>
           <w:rPr>
             <w:rStyle w:val="Hipervnculo"/>
@@ -1675,7 +1675,7 @@
             <w:noProof/>
             <w:webHidden/>
           </w:rPr>
-          <w:instrText xml:space="preserve"> PAGEREF _Toc231100760 \h </w:instrText>
+          <w:instrText xml:space="preserve"> PAGEREF _Toc231102564 \h </w:instrText>
         </w:r>
         <w:r>
           <w:rPr>
@@ -1722,7 +1722,7 @@
           <w14:ligatures w14:val="standardContextual"/>
         </w:rPr>
       </w:pPr>
-      <w:hyperlink w:anchor="_Toc231100761" w:history="1">
+      <w:hyperlink w:anchor="_Toc231102565" w:history="1">
         <w:r>
           <w:rPr>
             <w:rStyle w:val="Hipervnculo"/>
@@ -1749,7 +1749,7 @@
             <w:noProof/>
             <w:webHidden/>
           </w:rPr>
-          <w:instrText xml:space="preserve"> PAGEREF _Toc231100761 \h </w:instrText>
+          <w:instrText xml:space="preserve"> PAGEREF _Toc231102565 \h </w:instrText>
         </w:r>
         <w:r>
           <w:rPr>
@@ -1796,7 +1796,7 @@
           <w14:ligatures w14:val="standardContextual"/>
         </w:rPr>
       </w:pPr>
-      <w:hyperlink w:anchor="_Toc231100762" w:history="1">
+      <w:hyperlink w:anchor="_Toc231102566" w:history="1">
         <w:r>
           <w:rPr>
             <w:rStyle w:val="Hipervnculo"/>
@@ -1823,7 +1823,7 @@
             <w:noProof/>
             <w:webHidden/>
           </w:rPr>
-          <w:instrText xml:space="preserve"> PAGEREF _Toc231100762 \h </w:instrText>
+          <w:instrText xml:space="preserve"> PAGEREF _Toc231102566 \h </w:instrText>
         </w:r>
         <w:r>
           <w:rPr>
@@ -1870,7 +1870,7 @@
           <w14:ligatures w14:val="standardContextual"/>
         </w:rPr>
       </w:pPr>
-      <w:hyperlink w:anchor="_Toc231100763" w:history="1">
+      <w:hyperlink w:anchor="_Toc231102567" w:history="1">
         <w:r>
           <w:rPr>
             <w:rStyle w:val="Hipervnculo"/>
@@ -1897,7 +1897,7 @@
             <w:noProof/>
             <w:webHidden/>
           </w:rPr>
-          <w:instrText xml:space="preserve"> PAGEREF _Toc231100763 \h </w:instrText>
+          <w:instrText xml:space="preserve"> PAGEREF _Toc231102567 \h </w:instrText>
         </w:r>
         <w:r>
           <w:rPr>
@@ -1944,7 +1944,7 @@
           <w14:ligatures w14:val="standardContextual"/>
         </w:rPr>
       </w:pPr>
-      <w:hyperlink w:anchor="_Toc231100764" w:history="1">
+      <w:hyperlink w:anchor="_Toc231102568" w:history="1">
         <w:r>
           <w:rPr>
             <w:rStyle w:val="Hipervnculo"/>
@@ -1971,7 +1971,7 @@
             <w:noProof/>
             <w:webHidden/>
           </w:rPr>
-          <w:instrText xml:space="preserve"> PAGEREF _Toc231100764 \h </w:instrText>
+          <w:instrText xml:space="preserve"> PAGEREF _Toc231102568 \h </w:instrText>
         </w:r>
         <w:r>
           <w:rPr>
@@ -2018,7 +2018,7 @@
           <w14:ligatures w14:val="standardContextual"/>
         </w:rPr>
       </w:pPr>
-      <w:hyperlink w:anchor="_Toc231100765" w:history="1">
+      <w:hyperlink w:anchor="_Toc231102569" w:history="1">
         <w:r>
           <w:rPr>
             <w:rStyle w:val="Hipervnculo"/>
@@ -2045,7 +2045,7 @@
             <w:noProof/>
             <w:webHidden/>
           </w:rPr>
-          <w:instrText xml:space="preserve"> PAGEREF _Toc231100765 \h </w:instrText>
+          <w:instrText xml:space="preserve"> PAGEREF _Toc231102569 \h </w:instrText>
         </w:r>
         <w:r>
           <w:rPr>
@@ -2092,7 +2092,7 @@
           <w14:ligatures w14:val="standardContextual"/>
         </w:rPr>
       </w:pPr>
-      <w:hyperlink w:anchor="_Toc231100766" w:history="1">
+      <w:hyperlink w:anchor="_Toc231102570" w:history="1">
         <w:r>
           <w:rPr>
             <w:rStyle w:val="Hipervnculo"/>
@@ -2119,7 +2119,7 @@
             <w:noProof/>
             <w:webHidden/>
           </w:rPr>
-          <w:instrText xml:space="preserve"> PAGEREF _Toc231100766 \h </w:instrText>
+          <w:instrText xml:space="preserve"> PAGEREF _Toc231102570 \h </w:instrText>
         </w:r>
         <w:r>
           <w:rPr>
@@ -2166,7 +2166,7 @@
           <w14:ligatures w14:val="standardContextual"/>
         </w:rPr>
       </w:pPr>
-      <w:hyperlink w:anchor="_Toc231100767" w:history="1">
+      <w:hyperlink w:anchor="_Toc231102571" w:history="1">
         <w:r>
           <w:rPr>
             <w:rStyle w:val="Hipervnculo"/>
@@ -2193,7 +2193,7 @@
             <w:noProof/>
             <w:webHidden/>
           </w:rPr>
-          <w:instrText xml:space="preserve"> PAGEREF _Toc231100767 \h </w:instrText>
+          <w:instrText xml:space="preserve"> PAGEREF _Toc231102571 \h </w:instrText>
         </w:r>
         <w:r>
           <w:rPr>
@@ -2240,7 +2240,7 @@
           <w14:ligatures w14:val="standardContextual"/>
         </w:rPr>
       </w:pPr>
-      <w:hyperlink w:anchor="_Toc231100768" w:history="1">
+      <w:hyperlink w:anchor="_Toc231102572" w:history="1">
         <w:r>
           <w:rPr>
             <w:rStyle w:val="Hipervnculo"/>
@@ -2267,7 +2267,7 @@
             <w:noProof/>
             <w:webHidden/>
           </w:rPr>
-          <w:instrText xml:space="preserve"> PAGEREF _Toc231100768 \h </w:instrText>
+          <w:instrText xml:space="preserve"> PAGEREF _Toc231102572 \h </w:instrText>
         </w:r>
         <w:r>
           <w:rPr>
@@ -2314,7 +2314,7 @@
           <w14:ligatures w14:val="standardContextual"/>
         </w:rPr>
       </w:pPr>
-      <w:hyperlink w:anchor="_Toc231100769" w:history="1">
+      <w:hyperlink w:anchor="_Toc231102573" w:history="1">
         <w:r>
           <w:rPr>
             <w:rStyle w:val="Hipervnculo"/>
@@ -2341,7 +2341,7 @@
             <w:noProof/>
             <w:webHidden/>
           </w:rPr>
-          <w:instrText xml:space="preserve"> PAGEREF _Toc231100769 \h </w:instrText>
+          <w:instrText xml:space="preserve"> PAGEREF _Toc231102573 \h </w:instrText>
         </w:r>
         <w:r>
           <w:rPr>
@@ -2388,7 +2388,7 @@
           <w14:ligatures w14:val="standardContextual"/>
         </w:rPr>
       </w:pPr>
-      <w:hyperlink w:anchor="_Toc231100770" w:history="1">
+      <w:hyperlink w:anchor="_Toc231102574" w:history="1">
         <w:r>
           <w:rPr>
             <w:rStyle w:val="Hipervnculo"/>
@@ -2415,7 +2415,7 @@
             <w:noProof/>
             <w:webHidden/>
           </w:rPr>
-          <w:instrText xml:space="preserve"> PAGEREF _Toc231100770 \h </w:instrText>
+          <w:instrText xml:space="preserve"> PAGEREF _Toc231102574 \h </w:instrText>
         </w:r>
         <w:r>
           <w:rPr>
@@ -2462,7 +2462,7 @@
           <w14:ligatures w14:val="standardContextual"/>
         </w:rPr>
       </w:pPr>
-      <w:hyperlink w:anchor="_Toc231100771" w:history="1">
+      <w:hyperlink w:anchor="_Toc231102575" w:history="1">
         <w:r>
           <w:rPr>
             <w:rStyle w:val="Hipervnculo"/>
@@ -2489,7 +2489,7 @@
             <w:noProof/>
             <w:webHidden/>
           </w:rPr>
-          <w:instrText xml:space="preserve"> PAGEREF _Toc231100771 \h </w:instrText>
+          <w:instrText xml:space="preserve"> PAGEREF _Toc231102575 \h </w:instrText>
         </w:r>
         <w:r>
           <w:rPr>
@@ -2536,7 +2536,7 @@
           <w14:ligatures w14:val="standardContextual"/>
         </w:rPr>
       </w:pPr>
-      <w:hyperlink w:anchor="_Toc231100772" w:history="1">
+      <w:hyperlink w:anchor="_Toc231102576" w:history="1">
         <w:r>
           <w:rPr>
             <w:rStyle w:val="Hipervnculo"/>
@@ -2563,7 +2563,7 @@
             <w:noProof/>
             <w:webHidden/>
           </w:rPr>
-          <w:instrText xml:space="preserve"> PAGEREF _Toc231100772 \h </w:instrText>
+          <w:instrText xml:space="preserve"> PAGEREF _Toc231102576 \h </w:instrText>
         </w:r>
         <w:r>
           <w:rPr>
@@ -2610,7 +2610,7 @@
           <w14:ligatures w14:val="standardContextual"/>
         </w:rPr>
       </w:pPr>
-      <w:hyperlink w:anchor="_Toc231100773" w:history="1">
+      <w:hyperlink w:anchor="_Toc231102577" w:history="1">
         <w:r>
           <w:rPr>
             <w:rStyle w:val="Hipervnculo"/>
@@ -2637,7 +2637,7 @@
             <w:noProof/>
             <w:webHidden/>
           </w:rPr>
-          <w:instrText xml:space="preserve"> PAGEREF _Toc231100773 \h </w:instrText>
+          <w:instrText xml:space="preserve"> PAGEREF _Toc231102577 \h </w:instrText>
         </w:r>
         <w:r>
           <w:rPr>
@@ -2684,7 +2684,7 @@
           <w14:ligatures w14:val="standardContextual"/>
         </w:rPr>
       </w:pPr>
-      <w:hyperlink w:anchor="_Toc231100774" w:history="1">
+      <w:hyperlink w:anchor="_Toc231102578" w:history="1">
         <w:r>
           <w:rPr>
             <w:rStyle w:val="Hipervnculo"/>
@@ -2711,7 +2711,7 @@
             <w:noProof/>
             <w:webHidden/>
           </w:rPr>
-          <w:instrText xml:space="preserve"> PAGEREF _Toc231100774 \h </w:instrText>
+          <w:instrText xml:space="preserve"> PAGEREF _Toc231102578 \h </w:instrText>
         </w:r>
         <w:r>
           <w:rPr>
@@ -2758,7 +2758,7 @@
           <w14:ligatures w14:val="standardContextual"/>
         </w:rPr>
       </w:pPr>
-      <w:hyperlink w:anchor="_Toc231100775" w:history="1">
+      <w:hyperlink w:anchor="_Toc231102579" w:history="1">
         <w:r>
           <w:rPr>
             <w:rStyle w:val="Hipervnculo"/>
@@ -2785,7 +2785,7 @@
             <w:noProof/>
             <w:webHidden/>
           </w:rPr>
-          <w:instrText xml:space="preserve"> PAGEREF _Toc231100775 \h </w:instrText>
+          <w:instrText xml:space="preserve"> PAGEREF _Toc231102579 \h </w:instrText>
         </w:r>
         <w:r>
           <w:rPr>
@@ -2832,7 +2832,7 @@
           <w14:ligatures w14:val="standardContextual"/>
         </w:rPr>
       </w:pPr>
-      <w:hyperlink w:anchor="_Toc231100776" w:history="1">
+      <w:hyperlink w:anchor="_Toc231102580" w:history="1">
         <w:r>
           <w:rPr>
             <w:rStyle w:val="Hipervnculo"/>
@@ -2859,7 +2859,7 @@
             <w:noProof/>
             <w:webHidden/>
           </w:rPr>
-          <w:instrText xml:space="preserve"> PAGEREF _Toc231100776 \h </w:instrText>
+          <w:instrText xml:space="preserve"> PAGEREF _Toc231102580 \h </w:instrText>
         </w:r>
         <w:r>
           <w:rPr>
@@ -2906,7 +2906,7 @@
           <w14:ligatures w14:val="standardContextual"/>
         </w:rPr>
       </w:pPr>
-      <w:hyperlink w:anchor="_Toc231100777" w:history="1">
+      <w:hyperlink w:anchor="_Toc231102581" w:history="1">
         <w:r>
           <w:rPr>
             <w:rStyle w:val="Hipervnculo"/>
@@ -2933,7 +2933,7 @@
             <w:noProof/>
             <w:webHidden/>
           </w:rPr>
-          <w:instrText xml:space="preserve"> PAGEREF _Toc231100777 \h </w:instrText>
+          <w:instrText xml:space="preserve"> PAGEREF _Toc231102581 \h </w:instrText>
         </w:r>
         <w:r>
           <w:rPr>
@@ -2980,7 +2980,7 @@
           <w14:ligatures w14:val="standardContextual"/>
         </w:rPr>
       </w:pPr>
-      <w:hyperlink w:anchor="_Toc231100778" w:history="1">
+      <w:hyperlink w:anchor="_Toc231102582" w:history="1">
         <w:r>
           <w:rPr>
             <w:rStyle w:val="Hipervnculo"/>
@@ -3007,7 +3007,7 @@
             <w:noProof/>
             <w:webHidden/>
           </w:rPr>
-          <w:instrText xml:space="preserve"> PAGEREF _Toc231100778 \h </w:instrText>
+          <w:instrText xml:space="preserve"> PAGEREF _Toc231102582 \h </w:instrText>
         </w:r>
         <w:r>
           <w:rPr>
@@ -3054,7 +3054,7 @@
           <w14:ligatures w14:val="standardContextual"/>
         </w:rPr>
       </w:pPr>
-      <w:hyperlink w:anchor="_Toc231100779" w:history="1">
+      <w:hyperlink w:anchor="_Toc231102583" w:history="1">
         <w:r>
           <w:rPr>
             <w:rStyle w:val="Hipervnculo"/>
@@ -3081,7 +3081,7 @@
             <w:noProof/>
             <w:webHidden/>
           </w:rPr>
-          <w:instrText xml:space="preserve"> PAGEREF _Toc231100779 \h </w:instrText>
+          <w:instrText xml:space="preserve"> PAGEREF _Toc231102583 \h </w:instrText>
         </w:r>
         <w:r>
           <w:rPr>
@@ -3128,7 +3128,7 @@
           <w14:ligatures w14:val="standardContextual"/>
         </w:rPr>
       </w:pPr>
-      <w:hyperlink w:anchor="_Toc231100780" w:history="1">
+      <w:hyperlink w:anchor="_Toc231102584" w:history="1">
         <w:r>
           <w:rPr>
             <w:rStyle w:val="Hipervnculo"/>
@@ -3155,7 +3155,7 @@
             <w:noProof/>
             <w:webHidden/>
           </w:rPr>
-          <w:instrText xml:space="preserve"> PAGEREF _Toc231100780 \h </w:instrText>
+          <w:instrText xml:space="preserve"> PAGEREF _Toc231102584 \h </w:instrText>
         </w:r>
         <w:r>
           <w:rPr>
@@ -3202,7 +3202,7 @@
           <w14:ligatures w14:val="standardContextual"/>
         </w:rPr>
       </w:pPr>
-      <w:hyperlink w:anchor="_Toc231100781" w:history="1">
+      <w:hyperlink w:anchor="_Toc231102585" w:history="1">
         <w:r>
           <w:rPr>
             <w:rStyle w:val="Hipervnculo"/>
@@ -3229,7 +3229,7 @@
             <w:noProof/>
             <w:webHidden/>
           </w:rPr>
-          <w:instrText xml:space="preserve"> PAGEREF _Toc231100781 \h </w:instrText>
+          <w:instrText xml:space="preserve"> PAGEREF _Toc231102585 \h </w:instrText>
         </w:r>
         <w:r>
           <w:rPr>
@@ -3276,7 +3276,7 @@
           <w14:ligatures w14:val="standardContextual"/>
         </w:rPr>
       </w:pPr>
-      <w:hyperlink w:anchor="_Toc231100782" w:history="1">
+      <w:hyperlink w:anchor="_Toc231102586" w:history="1">
         <w:r>
           <w:rPr>
             <w:rStyle w:val="Hipervnculo"/>
@@ -3303,7 +3303,7 @@
             <w:noProof/>
             <w:webHidden/>
           </w:rPr>
-          <w:instrText xml:space="preserve"> PAGEREF _Toc231100782 \h </w:instrText>
+          <w:instrText xml:space="preserve"> PAGEREF _Toc231102586 \h </w:instrText>
         </w:r>
         <w:r>
           <w:rPr>
@@ -3350,7 +3350,7 @@
           <w14:ligatures w14:val="standardContextual"/>
         </w:rPr>
       </w:pPr>
-      <w:hyperlink w:anchor="_Toc231100783" w:history="1">
+      <w:hyperlink w:anchor="_Toc231102587" w:history="1">
         <w:r>
           <w:rPr>
             <w:rStyle w:val="Hipervnculo"/>
@@ -3377,7 +3377,7 @@
             <w:noProof/>
             <w:webHidden/>
           </w:rPr>
-          <w:instrText xml:space="preserve"> PAGEREF _Toc231100783 \h </w:instrText>
+          <w:instrText xml:space="preserve"> PAGEREF _Toc231102587 \h </w:instrText>
         </w:r>
         <w:r>
           <w:rPr>
@@ -3424,7 +3424,7 @@
           <w14:ligatures w14:val="standardContextual"/>
         </w:rPr>
       </w:pPr>
-      <w:hyperlink w:anchor="_Toc231100784" w:history="1">
+      <w:hyperlink w:anchor="_Toc231102588" w:history="1">
         <w:r>
           <w:rPr>
             <w:rStyle w:val="Hipervnculo"/>
@@ -3451,7 +3451,7 @@
             <w:noProof/>
             <w:webHidden/>
           </w:rPr>
-          <w:instrText xml:space="preserve"> PAGEREF _Toc231100784 \h </w:instrText>
+          <w:instrText xml:space="preserve"> PAGEREF _Toc231102588 \h </w:instrText>
         </w:r>
         <w:r>
           <w:rPr>
@@ -3498,7 +3498,7 @@
           <w14:ligatures w14:val="standardContextual"/>
         </w:rPr>
       </w:pPr>
-      <w:hyperlink w:anchor="_Toc231100785" w:history="1">
+      <w:hyperlink w:anchor="_Toc231102589" w:history="1">
         <w:r>
           <w:rPr>
             <w:rStyle w:val="Hipervnculo"/>
@@ -3525,7 +3525,7 @@
             <w:noProof/>
             <w:webHidden/>
           </w:rPr>
-          <w:instrText xml:space="preserve"> PAGEREF _Toc231100785 \h </w:instrText>
+          <w:instrText xml:space="preserve"> PAGEREF _Toc231102589 \h </w:instrText>
         </w:r>
         <w:r>
           <w:rPr>
@@ -3545,7 +3545,7 @@
             <w:noProof/>
             <w:webHidden/>
           </w:rPr>
-          <w:t>24</w:t>
+          <w:t>25</w:t>
         </w:r>
         <w:r>
           <w:rPr>
@@ -3572,7 +3572,7 @@
           <w14:ligatures w14:val="standardContextual"/>
         </w:rPr>
       </w:pPr>
-      <w:hyperlink w:anchor="_Toc231100786" w:history="1">
+      <w:hyperlink w:anchor="_Toc231102590" w:history="1">
         <w:r>
           <w:rPr>
             <w:rStyle w:val="Hipervnculo"/>
@@ -3599,7 +3599,7 @@
             <w:noProof/>
             <w:webHidden/>
           </w:rPr>
-          <w:instrText xml:space="preserve"> PAGEREF _Toc231100786 \h </w:instrText>
+          <w:instrText xml:space="preserve"> PAGEREF _Toc231102590 \h </w:instrText>
         </w:r>
         <w:r>
           <w:rPr>
@@ -3619,7 +3619,7 @@
             <w:noProof/>
             <w:webHidden/>
           </w:rPr>
-          <w:t>26</w:t>
+          <w:t>27</w:t>
         </w:r>
         <w:r>
           <w:rPr>
@@ -3646,7 +3646,7 @@
           <w14:ligatures w14:val="standardContextual"/>
         </w:rPr>
       </w:pPr>
-      <w:hyperlink w:anchor="_Toc231100787" w:history="1">
+      <w:hyperlink w:anchor="_Toc231102591" w:history="1">
         <w:r>
           <w:rPr>
             <w:rStyle w:val="Hipervnculo"/>
@@ -3673,7 +3673,7 @@
             <w:noProof/>
             <w:webHidden/>
           </w:rPr>
-          <w:instrText xml:space="preserve"> PAGEREF _Toc231100787 \h </w:instrText>
+          <w:instrText xml:space="preserve"> PAGEREF _Toc231102591 \h </w:instrText>
         </w:r>
         <w:r>
           <w:rPr>
@@ -3693,7 +3693,7 @@
             <w:noProof/>
             <w:webHidden/>
           </w:rPr>
-          <w:t>26</w:t>
+          <w:t>27</w:t>
         </w:r>
         <w:r>
           <w:rPr>
@@ -3720,7 +3720,7 @@
           <w14:ligatures w14:val="standardContextual"/>
         </w:rPr>
       </w:pPr>
-      <w:hyperlink w:anchor="_Toc231100788" w:history="1">
+      <w:hyperlink w:anchor="_Toc231102592" w:history="1">
         <w:r>
           <w:rPr>
             <w:rStyle w:val="Hipervnculo"/>
@@ -3747,7 +3747,7 @@
             <w:noProof/>
             <w:webHidden/>
           </w:rPr>
-          <w:instrText xml:space="preserve"> PAGEREF _Toc231100788 \h </w:instrText>
+          <w:instrText xml:space="preserve"> PAGEREF _Toc231102592 \h </w:instrText>
         </w:r>
         <w:r>
           <w:rPr>
@@ -3767,7 +3767,7 @@
             <w:noProof/>
             <w:webHidden/>
           </w:rPr>
-          <w:t>27</w:t>
+          <w:t>28</w:t>
         </w:r>
         <w:r>
           <w:rPr>
@@ -3794,7 +3794,7 @@
           <w14:ligatures w14:val="standardContextual"/>
         </w:rPr>
       </w:pPr>
-      <w:hyperlink w:anchor="_Toc231100789" w:history="1">
+      <w:hyperlink w:anchor="_Toc231102593" w:history="1">
         <w:r>
           <w:rPr>
             <w:rStyle w:val="Hipervnculo"/>
@@ -3821,7 +3821,7 @@
             <w:noProof/>
             <w:webHidden/>
           </w:rPr>
-          <w:instrText xml:space="preserve"> PAGEREF _Toc231100789 \h </w:instrText>
+          <w:instrText xml:space="preserve"> PAGEREF _Toc231102593 \h </w:instrText>
         </w:r>
         <w:r>
           <w:rPr>
@@ -3841,7 +3841,7 @@
             <w:noProof/>
             <w:webHidden/>
           </w:rPr>
-          <w:t>29</w:t>
+          <w:t>30</w:t>
         </w:r>
         <w:r>
           <w:rPr>
@@ -3868,7 +3868,7 @@
           <w14:ligatures w14:val="standardContextual"/>
         </w:rPr>
       </w:pPr>
-      <w:hyperlink w:anchor="_Toc231100790" w:history="1">
+      <w:hyperlink w:anchor="_Toc231102594" w:history="1">
         <w:r>
           <w:rPr>
             <w:rStyle w:val="Hipervnculo"/>
@@ -3895,7 +3895,7 @@
             <w:noProof/>
             <w:webHidden/>
           </w:rPr>
-          <w:instrText xml:space="preserve"> PAGEREF _Toc231100790 \h </w:instrText>
+          <w:instrText xml:space="preserve"> PAGEREF _Toc231102594 \h </w:instrText>
         </w:r>
         <w:r>
           <w:rPr>
@@ -3915,7 +3915,7 @@
             <w:noProof/>
             <w:webHidden/>
           </w:rPr>
-          <w:t>30</w:t>
+          <w:t>31</w:t>
         </w:r>
         <w:r>
           <w:rPr>
@@ -3942,7 +3942,7 @@
           <w14:ligatures w14:val="standardContextual"/>
         </w:rPr>
       </w:pPr>
-      <w:hyperlink w:anchor="_Toc231100791" w:history="1">
+      <w:hyperlink w:anchor="_Toc231102595" w:history="1">
         <w:r>
           <w:rPr>
             <w:rStyle w:val="Hipervnculo"/>
@@ -3969,7 +3969,7 @@
             <w:noProof/>
             <w:webHidden/>
           </w:rPr>
-          <w:instrText xml:space="preserve"> PAGEREF _Toc231100791 \h </w:instrText>
+          <w:instrText xml:space="preserve"> PAGEREF _Toc231102595 \h </w:instrText>
         </w:r>
         <w:r>
           <w:rPr>
@@ -3989,7 +3989,7 @@
             <w:noProof/>
             <w:webHidden/>
           </w:rPr>
-          <w:t>32</w:t>
+          <w:t>33</w:t>
         </w:r>
         <w:r>
           <w:rPr>
@@ -4016,7 +4016,7 @@
           <w14:ligatures w14:val="standardContextual"/>
         </w:rPr>
       </w:pPr>
-      <w:hyperlink w:anchor="_Toc231100792" w:history="1">
+      <w:hyperlink w:anchor="_Toc231102596" w:history="1">
         <w:r>
           <w:rPr>
             <w:rStyle w:val="Hipervnculo"/>
@@ -4043,7 +4043,7 @@
             <w:noProof/>
             <w:webHidden/>
           </w:rPr>
-          <w:instrText xml:space="preserve"> PAGEREF _Toc231100792 \h </w:instrText>
+          <w:instrText xml:space="preserve"> PAGEREF _Toc231102596 \h </w:instrText>
         </w:r>
         <w:r>
           <w:rPr>
@@ -4063,7 +4063,7 @@
             <w:noProof/>
             <w:webHidden/>
           </w:rPr>
-          <w:t>33</w:t>
+          <w:t>34</w:t>
         </w:r>
         <w:r>
           <w:rPr>
@@ -4090,7 +4090,7 @@
           <w14:ligatures w14:val="standardContextual"/>
         </w:rPr>
       </w:pPr>
-      <w:hyperlink w:anchor="_Toc231100793" w:history="1">
+      <w:hyperlink w:anchor="_Toc231102597" w:history="1">
         <w:r>
           <w:rPr>
             <w:rStyle w:val="Hipervnculo"/>
@@ -4117,7 +4117,7 @@
             <w:noProof/>
             <w:webHidden/>
           </w:rPr>
-          <w:instrText xml:space="preserve"> PAGEREF _Toc231100793 \h </w:instrText>
+          <w:instrText xml:space="preserve"> PAGEREF _Toc231102597 \h </w:instrText>
         </w:r>
         <w:r>
           <w:rPr>
@@ -4137,7 +4137,7 @@
             <w:noProof/>
             <w:webHidden/>
           </w:rPr>
-          <w:t>35</w:t>
+          <w:t>36</w:t>
         </w:r>
         <w:r>
           <w:rPr>
@@ -4164,7 +4164,7 @@
           <w14:ligatures w14:val="standardContextual"/>
         </w:rPr>
       </w:pPr>
-      <w:hyperlink w:anchor="_Toc231100794" w:history="1">
+      <w:hyperlink w:anchor="_Toc231102598" w:history="1">
         <w:r>
           <w:rPr>
             <w:rStyle w:val="Hipervnculo"/>
@@ -4191,7 +4191,7 @@
             <w:noProof/>
             <w:webHidden/>
           </w:rPr>
-          <w:instrText xml:space="preserve"> PAGEREF _Toc231100794 \h </w:instrText>
+          <w:instrText xml:space="preserve"> PAGEREF _Toc231102598 \h </w:instrText>
         </w:r>
         <w:r>
           <w:rPr>
@@ -4211,7 +4211,7 @@
             <w:noProof/>
             <w:webHidden/>
           </w:rPr>
-          <w:t>38</w:t>
+          <w:t>39</w:t>
         </w:r>
         <w:r>
           <w:rPr>
@@ -4238,7 +4238,7 @@
           <w14:ligatures w14:val="standardContextual"/>
         </w:rPr>
       </w:pPr>
-      <w:hyperlink w:anchor="_Toc231100795" w:history="1">
+      <w:hyperlink w:anchor="_Toc231102599" w:history="1">
         <w:r>
           <w:rPr>
             <w:rStyle w:val="Hipervnculo"/>
@@ -4265,7 +4265,7 @@
             <w:noProof/>
             <w:webHidden/>
           </w:rPr>
-          <w:instrText xml:space="preserve"> PAGEREF _Toc231100795 \h </w:instrText>
+          <w:instrText xml:space="preserve"> PAGEREF _Toc231102599 \h </w:instrText>
         </w:r>
         <w:r>
           <w:rPr>
@@ -4285,7 +4285,7 @@
             <w:noProof/>
             <w:webHidden/>
           </w:rPr>
-          <w:t>40</w:t>
+          <w:t>41</w:t>
         </w:r>
         <w:r>
           <w:rPr>
@@ -4312,7 +4312,7 @@
           <w14:ligatures w14:val="standardContextual"/>
         </w:rPr>
       </w:pPr>
-      <w:hyperlink w:anchor="_Toc231100796" w:history="1">
+      <w:hyperlink w:anchor="_Toc231102600" w:history="1">
         <w:r>
           <w:rPr>
             <w:rStyle w:val="Hipervnculo"/>
@@ -4339,7 +4339,7 @@
             <w:noProof/>
             <w:webHidden/>
           </w:rPr>
-          <w:instrText xml:space="preserve"> PAGEREF _Toc231100796 \h </w:instrText>
+          <w:instrText xml:space="preserve"> PAGEREF _Toc231102600 \h </w:instrText>
         </w:r>
         <w:r>
           <w:rPr>
@@ -4359,7 +4359,7 @@
             <w:noProof/>
             <w:webHidden/>
           </w:rPr>
-          <w:t>40</w:t>
+          <w:t>41</w:t>
         </w:r>
         <w:r>
           <w:rPr>
@@ -4386,7 +4386,7 @@
           <w14:ligatures w14:val="standardContextual"/>
         </w:rPr>
       </w:pPr>
-      <w:hyperlink w:anchor="_Toc231100797" w:history="1">
+      <w:hyperlink w:anchor="_Toc231102601" w:history="1">
         <w:r>
           <w:rPr>
             <w:rStyle w:val="Hipervnculo"/>
@@ -4413,7 +4413,7 @@
             <w:noProof/>
             <w:webHidden/>
           </w:rPr>
-          <w:instrText xml:space="preserve"> PAGEREF _Toc231100797 \h </w:instrText>
+          <w:instrText xml:space="preserve"> PAGEREF _Toc231102601 \h </w:instrText>
         </w:r>
         <w:r>
           <w:rPr>
@@ -4433,7 +4433,7 @@
             <w:noProof/>
             <w:webHidden/>
           </w:rPr>
-          <w:t>41</w:t>
+          <w:t>42</w:t>
         </w:r>
         <w:r>
           <w:rPr>
@@ -4460,7 +4460,7 @@
           <w14:ligatures w14:val="standardContextual"/>
         </w:rPr>
       </w:pPr>
-      <w:hyperlink w:anchor="_Toc231100798" w:history="1">
+      <w:hyperlink w:anchor="_Toc231102602" w:history="1">
         <w:r>
           <w:rPr>
             <w:rStyle w:val="Hipervnculo"/>
@@ -4487,7 +4487,7 @@
             <w:noProof/>
             <w:webHidden/>
           </w:rPr>
-          <w:instrText xml:space="preserve"> PAGEREF _Toc231100798 \h </w:instrText>
+          <w:instrText xml:space="preserve"> PAGEREF _Toc231102602 \h </w:instrText>
         </w:r>
         <w:r>
           <w:rPr>
@@ -4507,7 +4507,7 @@
             <w:noProof/>
             <w:webHidden/>
           </w:rPr>
-          <w:t>41</w:t>
+          <w:t>42</w:t>
         </w:r>
         <w:r>
           <w:rPr>
@@ -4534,7 +4534,7 @@
           <w14:ligatures w14:val="standardContextual"/>
         </w:rPr>
       </w:pPr>
-      <w:hyperlink w:anchor="_Toc231100799" w:history="1">
+      <w:hyperlink w:anchor="_Toc231102603" w:history="1">
         <w:r>
           <w:rPr>
             <w:rStyle w:val="Hipervnculo"/>
@@ -4561,7 +4561,7 @@
             <w:noProof/>
             <w:webHidden/>
           </w:rPr>
-          <w:instrText xml:space="preserve"> PAGEREF _Toc231100799 \h </w:instrText>
+          <w:instrText xml:space="preserve"> PAGEREF _Toc231102603 \h </w:instrText>
         </w:r>
         <w:r>
           <w:rPr>
@@ -4581,7 +4581,7 @@
             <w:noProof/>
             <w:webHidden/>
           </w:rPr>
-          <w:t>42</w:t>
+          <w:t>43</w:t>
         </w:r>
         <w:r>
           <w:rPr>
@@ -4608,7 +4608,7 @@
           <w14:ligatures w14:val="standardContextual"/>
         </w:rPr>
       </w:pPr>
-      <w:hyperlink w:anchor="_Toc231100800" w:history="1">
+      <w:hyperlink w:anchor="_Toc231102604" w:history="1">
         <w:r>
           <w:rPr>
             <w:rStyle w:val="Hipervnculo"/>
@@ -4635,7 +4635,7 @@
             <w:noProof/>
             <w:webHidden/>
           </w:rPr>
-          <w:instrText xml:space="preserve"> PAGEREF _Toc231100800 \h </w:instrText>
+          <w:instrText xml:space="preserve"> PAGEREF _Toc231102604 \h </w:instrText>
         </w:r>
         <w:r>
           <w:rPr>
@@ -4655,7 +4655,7 @@
             <w:noProof/>
             <w:webHidden/>
           </w:rPr>
-          <w:t>44</w:t>
+          <w:t>45</w:t>
         </w:r>
         <w:r>
           <w:rPr>
@@ -4682,7 +4682,7 @@
           <w14:ligatures w14:val="standardContextual"/>
         </w:rPr>
       </w:pPr>
-      <w:hyperlink w:anchor="_Toc231100801" w:history="1">
+      <w:hyperlink w:anchor="_Toc231102605" w:history="1">
         <w:r>
           <w:rPr>
             <w:rStyle w:val="Hipervnculo"/>
@@ -4709,7 +4709,7 @@
             <w:noProof/>
             <w:webHidden/>
           </w:rPr>
-          <w:instrText xml:space="preserve"> PAGEREF _Toc231100801 \h </w:instrText>
+          <w:instrText xml:space="preserve"> PAGEREF _Toc231102605 \h </w:instrText>
         </w:r>
         <w:r>
           <w:rPr>
@@ -4729,7 +4729,7 @@
             <w:noProof/>
             <w:webHidden/>
           </w:rPr>
-          <w:t>48</w:t>
+          <w:t>49</w:t>
         </w:r>
         <w:r>
           <w:rPr>
@@ -4756,7 +4756,7 @@
           <w14:ligatures w14:val="standardContextual"/>
         </w:rPr>
       </w:pPr>
-      <w:hyperlink w:anchor="_Toc231100802" w:history="1">
+      <w:hyperlink w:anchor="_Toc231102606" w:history="1">
         <w:r>
           <w:rPr>
             <w:rStyle w:val="Hipervnculo"/>
@@ -4783,7 +4783,7 @@
             <w:noProof/>
             <w:webHidden/>
           </w:rPr>
-          <w:instrText xml:space="preserve"> PAGEREF _Toc231100802 \h </w:instrText>
+          <w:instrText xml:space="preserve"> PAGEREF _Toc231102606 \h </w:instrText>
         </w:r>
         <w:r>
           <w:rPr>
@@ -4803,7 +4803,7 @@
             <w:noProof/>
             <w:webHidden/>
           </w:rPr>
-          <w:t>48</w:t>
+          <w:t>49</w:t>
         </w:r>
         <w:r>
           <w:rPr>
@@ -4830,7 +4830,7 @@
           <w14:ligatures w14:val="standardContextual"/>
         </w:rPr>
       </w:pPr>
-      <w:hyperlink w:anchor="_Toc231100803" w:history="1">
+      <w:hyperlink w:anchor="_Toc231102607" w:history="1">
         <w:r>
           <w:rPr>
             <w:rStyle w:val="Hipervnculo"/>
@@ -4857,7 +4857,7 @@
             <w:noProof/>
             <w:webHidden/>
           </w:rPr>
-          <w:instrText xml:space="preserve"> PAGEREF _Toc231100803 \h </w:instrText>
+          <w:instrText xml:space="preserve"> PAGEREF _Toc231102607 \h </w:instrText>
         </w:r>
         <w:r>
           <w:rPr>
@@ -4877,7 +4877,7 @@
             <w:noProof/>
             <w:webHidden/>
           </w:rPr>
-          <w:t>48</w:t>
+          <w:t>49</w:t>
         </w:r>
         <w:r>
           <w:rPr>
@@ -4904,7 +4904,7 @@
           <w14:ligatures w14:val="standardContextual"/>
         </w:rPr>
       </w:pPr>
-      <w:hyperlink w:anchor="_Toc231100804" w:history="1">
+      <w:hyperlink w:anchor="_Toc231102608" w:history="1">
         <w:r>
           <w:rPr>
             <w:rStyle w:val="Hipervnculo"/>
@@ -4931,7 +4931,7 @@
             <w:noProof/>
             <w:webHidden/>
           </w:rPr>
-          <w:instrText xml:space="preserve"> PAGEREF _Toc231100804 \h </w:instrText>
+          <w:instrText xml:space="preserve"> PAGEREF _Toc231102608 \h </w:instrText>
         </w:r>
         <w:r>
           <w:rPr>
@@ -4951,7 +4951,7 @@
             <w:noProof/>
             <w:webHidden/>
           </w:rPr>
-          <w:t>49</w:t>
+          <w:t>50</w:t>
         </w:r>
         <w:r>
           <w:rPr>
@@ -4978,7 +4978,7 @@
           <w14:ligatures w14:val="standardContextual"/>
         </w:rPr>
       </w:pPr>
-      <w:hyperlink w:anchor="_Toc231100805" w:history="1">
+      <w:hyperlink w:anchor="_Toc231102609" w:history="1">
         <w:r>
           <w:rPr>
             <w:rStyle w:val="Hipervnculo"/>
@@ -5005,7 +5005,7 @@
             <w:noProof/>
             <w:webHidden/>
           </w:rPr>
-          <w:instrText xml:space="preserve"> PAGEREF _Toc231100805 \h </w:instrText>
+          <w:instrText xml:space="preserve"> PAGEREF _Toc231102609 \h </w:instrText>
         </w:r>
         <w:r>
           <w:rPr>
@@ -5025,7 +5025,7 @@
             <w:noProof/>
             <w:webHidden/>
           </w:rPr>
-          <w:t>49</w:t>
+          <w:t>50</w:t>
         </w:r>
         <w:r>
           <w:rPr>
@@ -5052,7 +5052,7 @@
           <w14:ligatures w14:val="standardContextual"/>
         </w:rPr>
       </w:pPr>
-      <w:hyperlink w:anchor="_Toc231100806" w:history="1">
+      <w:hyperlink w:anchor="_Toc231102610" w:history="1">
         <w:r>
           <w:rPr>
             <w:rStyle w:val="Hipervnculo"/>
@@ -5079,7 +5079,7 @@
             <w:noProof/>
             <w:webHidden/>
           </w:rPr>
-          <w:instrText xml:space="preserve"> PAGEREF _Toc231100806 \h </w:instrText>
+          <w:instrText xml:space="preserve"> PAGEREF _Toc231102610 \h </w:instrText>
         </w:r>
         <w:r>
           <w:rPr>
@@ -5099,7 +5099,7 @@
             <w:noProof/>
             <w:webHidden/>
           </w:rPr>
-          <w:t>49</w:t>
+          <w:t>50</w:t>
         </w:r>
         <w:r>
           <w:rPr>
@@ -5126,7 +5126,7 @@
           <w14:ligatures w14:val="standardContextual"/>
         </w:rPr>
       </w:pPr>
-      <w:hyperlink w:anchor="_Toc231100807" w:history="1">
+      <w:hyperlink w:anchor="_Toc231102611" w:history="1">
         <w:r>
           <w:rPr>
             <w:rStyle w:val="Hipervnculo"/>
@@ -5153,7 +5153,7 @@
             <w:noProof/>
             <w:webHidden/>
           </w:rPr>
-          <w:instrText xml:space="preserve"> PAGEREF _Toc231100807 \h </w:instrText>
+          <w:instrText xml:space="preserve"> PAGEREF _Toc231102611 \h </w:instrText>
         </w:r>
         <w:r>
           <w:rPr>
@@ -5173,7 +5173,7 @@
             <w:noProof/>
             <w:webHidden/>
           </w:rPr>
-          <w:t>50</w:t>
+          <w:t>51</w:t>
         </w:r>
         <w:r>
           <w:rPr>
@@ -5200,7 +5200,7 @@
           <w14:ligatures w14:val="standardContextual"/>
         </w:rPr>
       </w:pPr>
-      <w:hyperlink w:anchor="_Toc231100808" w:history="1">
+      <w:hyperlink w:anchor="_Toc231102612" w:history="1">
         <w:r>
           <w:rPr>
             <w:rStyle w:val="Hipervnculo"/>
@@ -5227,7 +5227,7 @@
             <w:noProof/>
             <w:webHidden/>
           </w:rPr>
-          <w:instrText xml:space="preserve"> PAGEREF _Toc231100808 \h </w:instrText>
+          <w:instrText xml:space="preserve"> PAGEREF _Toc231102612 \h </w:instrText>
         </w:r>
         <w:r>
           <w:rPr>
@@ -5247,7 +5247,7 @@
             <w:noProof/>
             <w:webHidden/>
           </w:rPr>
-          <w:t>50</w:t>
+          <w:t>51</w:t>
         </w:r>
         <w:r>
           <w:rPr>
@@ -5274,7 +5274,7 @@
           <w14:ligatures w14:val="standardContextual"/>
         </w:rPr>
       </w:pPr>
-      <w:hyperlink w:anchor="_Toc231100809" w:history="1">
+      <w:hyperlink w:anchor="_Toc231102613" w:history="1">
         <w:r>
           <w:rPr>
             <w:rStyle w:val="Hipervnculo"/>
@@ -5301,7 +5301,7 @@
             <w:noProof/>
             <w:webHidden/>
           </w:rPr>
-          <w:instrText xml:space="preserve"> PAGEREF _Toc231100809 \h </w:instrText>
+          <w:instrText xml:space="preserve"> PAGEREF _Toc231102613 \h </w:instrText>
         </w:r>
         <w:r>
           <w:rPr>
@@ -5321,7 +5321,7 @@
             <w:noProof/>
             <w:webHidden/>
           </w:rPr>
-          <w:t>51</w:t>
+          <w:t>52</w:t>
         </w:r>
         <w:r>
           <w:rPr>
@@ -5348,7 +5348,7 @@
           <w14:ligatures w14:val="standardContextual"/>
         </w:rPr>
       </w:pPr>
-      <w:hyperlink w:anchor="_Toc231100810" w:history="1">
+      <w:hyperlink w:anchor="_Toc231102614" w:history="1">
         <w:r>
           <w:rPr>
             <w:rStyle w:val="Hipervnculo"/>
@@ -5375,7 +5375,7 @@
             <w:noProof/>
             <w:webHidden/>
           </w:rPr>
-          <w:instrText xml:space="preserve"> PAGEREF _Toc231100810 \h </w:instrText>
+          <w:instrText xml:space="preserve"> PAGEREF _Toc231102614 \h </w:instrText>
         </w:r>
         <w:r>
           <w:rPr>
@@ -5395,7 +5395,7 @@
             <w:noProof/>
             <w:webHidden/>
           </w:rPr>
-          <w:t>51</w:t>
+          <w:t>52</w:t>
         </w:r>
         <w:r>
           <w:rPr>
@@ -5422,7 +5422,7 @@
           <w14:ligatures w14:val="standardContextual"/>
         </w:rPr>
       </w:pPr>
-      <w:hyperlink w:anchor="_Toc231100811" w:history="1">
+      <w:hyperlink w:anchor="_Toc231102615" w:history="1">
         <w:r>
           <w:rPr>
             <w:rStyle w:val="Hipervnculo"/>
@@ -5449,7 +5449,7 @@
             <w:noProof/>
             <w:webHidden/>
           </w:rPr>
-          <w:instrText xml:space="preserve"> PAGEREF _Toc231100811 \h </w:instrText>
+          <w:instrText xml:space="preserve"> PAGEREF _Toc231102615 \h </w:instrText>
         </w:r>
         <w:r>
           <w:rPr>
@@ -5469,7 +5469,7 @@
             <w:noProof/>
             <w:webHidden/>
           </w:rPr>
-          <w:t>51</w:t>
+          <w:t>52</w:t>
         </w:r>
         <w:r>
           <w:rPr>
@@ -5496,7 +5496,7 @@
           <w14:ligatures w14:val="standardContextual"/>
         </w:rPr>
       </w:pPr>
-      <w:hyperlink w:anchor="_Toc231100812" w:history="1">
+      <w:hyperlink w:anchor="_Toc231102616" w:history="1">
         <w:r>
           <w:rPr>
             <w:rStyle w:val="Hipervnculo"/>
@@ -5523,7 +5523,7 @@
             <w:noProof/>
             <w:webHidden/>
           </w:rPr>
-          <w:instrText xml:space="preserve"> PAGEREF _Toc231100812 \h </w:instrText>
+          <w:instrText xml:space="preserve"> PAGEREF _Toc231102616 \h </w:instrText>
         </w:r>
         <w:r>
           <w:rPr>
@@ -5543,7 +5543,7 @@
             <w:noProof/>
             <w:webHidden/>
           </w:rPr>
-          <w:t>52</w:t>
+          <w:t>53</w:t>
         </w:r>
         <w:r>
           <w:rPr>
@@ -5570,7 +5570,7 @@
           <w14:ligatures w14:val="standardContextual"/>
         </w:rPr>
       </w:pPr>
-      <w:hyperlink w:anchor="_Toc231100813" w:history="1">
+      <w:hyperlink w:anchor="_Toc231102617" w:history="1">
         <w:r>
           <w:rPr>
             <w:rStyle w:val="Hipervnculo"/>
@@ -5597,7 +5597,7 @@
             <w:noProof/>
             <w:webHidden/>
           </w:rPr>
-          <w:instrText xml:space="preserve"> PAGEREF _Toc231100813 \h </w:instrText>
+          <w:instrText xml:space="preserve"> PAGEREF _Toc231102617 \h </w:instrText>
         </w:r>
         <w:r>
           <w:rPr>
@@ -5617,7 +5617,7 @@
             <w:noProof/>
             <w:webHidden/>
           </w:rPr>
-          <w:t>52</w:t>
+          <w:t>53</w:t>
         </w:r>
         <w:r>
           <w:rPr>
@@ -5644,7 +5644,7 @@
           <w14:ligatures w14:val="standardContextual"/>
         </w:rPr>
       </w:pPr>
-      <w:hyperlink w:anchor="_Toc231100814" w:history="1">
+      <w:hyperlink w:anchor="_Toc231102618" w:history="1">
         <w:r>
           <w:rPr>
             <w:rStyle w:val="Hipervnculo"/>
@@ -5671,7 +5671,7 @@
             <w:noProof/>
             <w:webHidden/>
           </w:rPr>
-          <w:instrText xml:space="preserve"> PAGEREF _Toc231100814 \h </w:instrText>
+          <w:instrText xml:space="preserve"> PAGEREF _Toc231102618 \h </w:instrText>
         </w:r>
         <w:r>
           <w:rPr>
@@ -5691,7 +5691,7 @@
             <w:noProof/>
             <w:webHidden/>
           </w:rPr>
-          <w:t>53</w:t>
+          <w:t>54</w:t>
         </w:r>
         <w:r>
           <w:rPr>
@@ -5718,7 +5718,7 @@
           <w14:ligatures w14:val="standardContextual"/>
         </w:rPr>
       </w:pPr>
-      <w:hyperlink w:anchor="_Toc231100815" w:history="1">
+      <w:hyperlink w:anchor="_Toc231102619" w:history="1">
         <w:r>
           <w:rPr>
             <w:rStyle w:val="Hipervnculo"/>
@@ -5745,7 +5745,7 @@
             <w:noProof/>
             <w:webHidden/>
           </w:rPr>
-          <w:instrText xml:space="preserve"> PAGEREF _Toc231100815 \h </w:instrText>
+          <w:instrText xml:space="preserve"> PAGEREF _Toc231102619 \h </w:instrText>
         </w:r>
         <w:r>
           <w:rPr>
@@ -5765,7 +5765,7 @@
             <w:noProof/>
             <w:webHidden/>
           </w:rPr>
-          <w:t>54</w:t>
+          <w:t>55</w:t>
         </w:r>
         <w:r>
           <w:rPr>
@@ -5794,7 +5794,7 @@
       <w:pPr>
         <w:pStyle w:val="Ttulo1"/>
       </w:pPr>
-      <w:bookmarkStart w:id="7" w:name="_Toc231100751"/>
+      <w:bookmarkStart w:id="7" w:name="_Toc231102555"/>
       <w:r>
         <w:lastRenderedPageBreak/>
         <w:t>Índice de tablas</w:t>
@@ -5826,7 +5826,7 @@
       <w:r>
         <w:fldChar w:fldCharType="separate"/>
       </w:r>
-      <w:hyperlink w:anchor="_Toc231100816" w:history="1">
+      <w:hyperlink w:anchor="_Toc231102620" w:history="1">
         <w:r>
           <w:rPr>
             <w:rStyle w:val="Hipervnculo"/>
@@ -5853,7 +5853,7 @@
             <w:noProof/>
             <w:webHidden/>
           </w:rPr>
-          <w:instrText xml:space="preserve"> PAGEREF _Toc231100816 \h </w:instrText>
+          <w:instrText xml:space="preserve"> PAGEREF _Toc231102620 \h </w:instrText>
         </w:r>
         <w:r>
           <w:rPr>
@@ -5873,7 +5873,7 @@
             <w:noProof/>
             <w:webHidden/>
           </w:rPr>
-          <w:t>24</w:t>
+          <w:t>25</w:t>
         </w:r>
         <w:r>
           <w:rPr>
@@ -5900,7 +5900,7 @@
           <w14:ligatures w14:val="standardContextual"/>
         </w:rPr>
       </w:pPr>
-      <w:hyperlink w:anchor="_Toc231100817" w:history="1">
+      <w:hyperlink w:anchor="_Toc231102621" w:history="1">
         <w:r>
           <w:rPr>
             <w:rStyle w:val="Hipervnculo"/>
@@ -5927,7 +5927,7 @@
             <w:noProof/>
             <w:webHidden/>
           </w:rPr>
-          <w:instrText xml:space="preserve"> PAGEREF _Toc231100817 \h </w:instrText>
+          <w:instrText xml:space="preserve"> PAGEREF _Toc231102621 \h </w:instrText>
         </w:r>
         <w:r>
           <w:rPr>
@@ -5947,7 +5947,7 @@
             <w:noProof/>
             <w:webHidden/>
           </w:rPr>
-          <w:t>27</w:t>
+          <w:t>28</w:t>
         </w:r>
         <w:r>
           <w:rPr>
@@ -5974,7 +5974,7 @@
           <w14:ligatures w14:val="standardContextual"/>
         </w:rPr>
       </w:pPr>
-      <w:hyperlink w:anchor="_Toc231100818" w:history="1">
+      <w:hyperlink w:anchor="_Toc231102622" w:history="1">
         <w:r>
           <w:rPr>
             <w:rStyle w:val="Hipervnculo"/>
@@ -6001,7 +6001,7 @@
             <w:noProof/>
             <w:webHidden/>
           </w:rPr>
-          <w:instrText xml:space="preserve"> PAGEREF _Toc231100818 \h </w:instrText>
+          <w:instrText xml:space="preserve"> PAGEREF _Toc231102622 \h </w:instrText>
         </w:r>
         <w:r>
           <w:rPr>
@@ -6021,7 +6021,7 @@
             <w:noProof/>
             <w:webHidden/>
           </w:rPr>
-          <w:t>30</w:t>
+          <w:t>31</w:t>
         </w:r>
         <w:r>
           <w:rPr>
@@ -6048,7 +6048,7 @@
           <w14:ligatures w14:val="standardContextual"/>
         </w:rPr>
       </w:pPr>
-      <w:hyperlink w:anchor="_Toc231100819" w:history="1">
+      <w:hyperlink w:anchor="_Toc231102623" w:history="1">
         <w:r>
           <w:rPr>
             <w:rStyle w:val="Hipervnculo"/>
@@ -6075,7 +6075,7 @@
             <w:noProof/>
             <w:webHidden/>
           </w:rPr>
-          <w:instrText xml:space="preserve"> PAGEREF _Toc231100819 \h </w:instrText>
+          <w:instrText xml:space="preserve"> PAGEREF _Toc231102623 \h </w:instrText>
         </w:r>
         <w:r>
           <w:rPr>
@@ -6095,7 +6095,7 @@
             <w:noProof/>
             <w:webHidden/>
           </w:rPr>
-          <w:t>33</w:t>
+          <w:t>34</w:t>
         </w:r>
         <w:r>
           <w:rPr>
@@ -6122,7 +6122,7 @@
           <w14:ligatures w14:val="standardContextual"/>
         </w:rPr>
       </w:pPr>
-      <w:hyperlink w:anchor="_Toc231100820" w:history="1">
+      <w:hyperlink w:anchor="_Toc231102624" w:history="1">
         <w:r>
           <w:rPr>
             <w:rStyle w:val="Hipervnculo"/>
@@ -6149,7 +6149,7 @@
             <w:noProof/>
             <w:webHidden/>
           </w:rPr>
-          <w:instrText xml:space="preserve"> PAGEREF _Toc231100820 \h </w:instrText>
+          <w:instrText xml:space="preserve"> PAGEREF _Toc231102624 \h </w:instrText>
         </w:r>
         <w:r>
           <w:rPr>
@@ -6169,7 +6169,7 @@
             <w:noProof/>
             <w:webHidden/>
           </w:rPr>
-          <w:t>48</w:t>
+          <w:t>49</w:t>
         </w:r>
         <w:r>
           <w:rPr>
@@ -6196,7 +6196,7 @@
           <w14:ligatures w14:val="standardContextual"/>
         </w:rPr>
       </w:pPr>
-      <w:hyperlink w:anchor="_Toc231100821" w:history="1">
+      <w:hyperlink w:anchor="_Toc231102625" w:history="1">
         <w:r>
           <w:rPr>
             <w:rStyle w:val="Hipervnculo"/>
@@ -6223,7 +6223,7 @@
             <w:noProof/>
             <w:webHidden/>
           </w:rPr>
-          <w:instrText xml:space="preserve"> PAGEREF _Toc231100821 \h </w:instrText>
+          <w:instrText xml:space="preserve"> PAGEREF _Toc231102625 \h </w:instrText>
         </w:r>
         <w:r>
           <w:rPr>
@@ -6243,7 +6243,7 @@
             <w:noProof/>
             <w:webHidden/>
           </w:rPr>
-          <w:t>48</w:t>
+          <w:t>49</w:t>
         </w:r>
         <w:r>
           <w:rPr>
@@ -6270,7 +6270,7 @@
           <w14:ligatures w14:val="standardContextual"/>
         </w:rPr>
       </w:pPr>
-      <w:hyperlink w:anchor="_Toc231100822" w:history="1">
+      <w:hyperlink w:anchor="_Toc231102626" w:history="1">
         <w:r>
           <w:rPr>
             <w:rStyle w:val="Hipervnculo"/>
@@ -6297,7 +6297,7 @@
             <w:noProof/>
             <w:webHidden/>
           </w:rPr>
-          <w:instrText xml:space="preserve"> PAGEREF _Toc231100822 \h </w:instrText>
+          <w:instrText xml:space="preserve"> PAGEREF _Toc231102626 \h </w:instrText>
         </w:r>
         <w:r>
           <w:rPr>
@@ -6317,7 +6317,7 @@
             <w:noProof/>
             <w:webHidden/>
           </w:rPr>
-          <w:t>49</w:t>
+          <w:t>50</w:t>
         </w:r>
         <w:r>
           <w:rPr>
@@ -6344,7 +6344,7 @@
           <w14:ligatures w14:val="standardContextual"/>
         </w:rPr>
       </w:pPr>
-      <w:hyperlink w:anchor="_Toc231100823" w:history="1">
+      <w:hyperlink w:anchor="_Toc231102627" w:history="1">
         <w:r>
           <w:rPr>
             <w:rStyle w:val="Hipervnculo"/>
@@ -6371,7 +6371,7 @@
             <w:noProof/>
             <w:webHidden/>
           </w:rPr>
-          <w:instrText xml:space="preserve"> PAGEREF _Toc231100823 \h </w:instrText>
+          <w:instrText xml:space="preserve"> PAGEREF _Toc231102627 \h </w:instrText>
         </w:r>
         <w:r>
           <w:rPr>
@@ -6391,7 +6391,7 @@
             <w:noProof/>
             <w:webHidden/>
           </w:rPr>
-          <w:t>49</w:t>
+          <w:t>50</w:t>
         </w:r>
         <w:r>
           <w:rPr>
@@ -6418,7 +6418,7 @@
           <w14:ligatures w14:val="standardContextual"/>
         </w:rPr>
       </w:pPr>
-      <w:hyperlink w:anchor="_Toc231100824" w:history="1">
+      <w:hyperlink w:anchor="_Toc231102628" w:history="1">
         <w:r>
           <w:rPr>
             <w:rStyle w:val="Hipervnculo"/>
@@ -6445,7 +6445,7 @@
             <w:noProof/>
             <w:webHidden/>
           </w:rPr>
-          <w:instrText xml:space="preserve"> PAGEREF _Toc231100824 \h </w:instrText>
+          <w:instrText xml:space="preserve"> PAGEREF _Toc231102628 \h </w:instrText>
         </w:r>
         <w:r>
           <w:rPr>
@@ -6465,7 +6465,7 @@
             <w:noProof/>
             <w:webHidden/>
           </w:rPr>
-          <w:t>50</w:t>
+          <w:t>51</w:t>
         </w:r>
         <w:r>
           <w:rPr>
@@ -6492,7 +6492,7 @@
           <w14:ligatures w14:val="standardContextual"/>
         </w:rPr>
       </w:pPr>
-      <w:hyperlink w:anchor="_Toc231100825" w:history="1">
+      <w:hyperlink w:anchor="_Toc231102629" w:history="1">
         <w:r>
           <w:rPr>
             <w:rStyle w:val="Hipervnculo"/>
@@ -6519,7 +6519,7 @@
             <w:noProof/>
             <w:webHidden/>
           </w:rPr>
-          <w:instrText xml:space="preserve"> PAGEREF _Toc231100825 \h </w:instrText>
+          <w:instrText xml:space="preserve"> PAGEREF _Toc231102629 \h </w:instrText>
         </w:r>
         <w:r>
           <w:rPr>
@@ -6539,7 +6539,7 @@
             <w:noProof/>
             <w:webHidden/>
           </w:rPr>
-          <w:t>50</w:t>
+          <w:t>51</w:t>
         </w:r>
         <w:r>
           <w:rPr>
@@ -6566,7 +6566,7 @@
           <w14:ligatures w14:val="standardContextual"/>
         </w:rPr>
       </w:pPr>
-      <w:hyperlink w:anchor="_Toc231100826" w:history="1">
+      <w:hyperlink w:anchor="_Toc231102630" w:history="1">
         <w:r>
           <w:rPr>
             <w:rStyle w:val="Hipervnculo"/>
@@ -6593,7 +6593,7 @@
             <w:noProof/>
             <w:webHidden/>
           </w:rPr>
-          <w:instrText xml:space="preserve"> PAGEREF _Toc231100826 \h </w:instrText>
+          <w:instrText xml:space="preserve"> PAGEREF _Toc231102630 \h </w:instrText>
         </w:r>
         <w:r>
           <w:rPr>
@@ -6613,7 +6613,7 @@
             <w:noProof/>
             <w:webHidden/>
           </w:rPr>
-          <w:t>51</w:t>
+          <w:t>52</w:t>
         </w:r>
         <w:r>
           <w:rPr>
@@ -6640,7 +6640,7 @@
           <w14:ligatures w14:val="standardContextual"/>
         </w:rPr>
       </w:pPr>
-      <w:hyperlink w:anchor="_Toc231100827" w:history="1">
+      <w:hyperlink w:anchor="_Toc231102631" w:history="1">
         <w:r>
           <w:rPr>
             <w:rStyle w:val="Hipervnculo"/>
@@ -6667,7 +6667,7 @@
             <w:noProof/>
             <w:webHidden/>
           </w:rPr>
-          <w:instrText xml:space="preserve"> PAGEREF _Toc231100827 \h </w:instrText>
+          <w:instrText xml:space="preserve"> PAGEREF _Toc231102631 \h </w:instrText>
         </w:r>
         <w:r>
           <w:rPr>
@@ -6687,7 +6687,7 @@
             <w:noProof/>
             <w:webHidden/>
           </w:rPr>
-          <w:t>51</w:t>
+          <w:t>52</w:t>
         </w:r>
         <w:r>
           <w:rPr>
@@ -6714,7 +6714,7 @@
           <w14:ligatures w14:val="standardContextual"/>
         </w:rPr>
       </w:pPr>
-      <w:hyperlink w:anchor="_Toc231100828" w:history="1">
+      <w:hyperlink w:anchor="_Toc231102632" w:history="1">
         <w:r>
           <w:rPr>
             <w:rStyle w:val="Hipervnculo"/>
@@ -6741,7 +6741,7 @@
             <w:noProof/>
             <w:webHidden/>
           </w:rPr>
-          <w:instrText xml:space="preserve"> PAGEREF _Toc231100828 \h </w:instrText>
+          <w:instrText xml:space="preserve"> PAGEREF _Toc231102632 \h </w:instrText>
         </w:r>
         <w:r>
           <w:rPr>
@@ -6761,7 +6761,7 @@
             <w:noProof/>
             <w:webHidden/>
           </w:rPr>
-          <w:t>51</w:t>
+          <w:t>52</w:t>
         </w:r>
         <w:r>
           <w:rPr>
@@ -6788,7 +6788,7 @@
           <w14:ligatures w14:val="standardContextual"/>
         </w:rPr>
       </w:pPr>
-      <w:hyperlink w:anchor="_Toc231100829" w:history="1">
+      <w:hyperlink w:anchor="_Toc231102633" w:history="1">
         <w:r>
           <w:rPr>
             <w:rStyle w:val="Hipervnculo"/>
@@ -6815,7 +6815,7 @@
             <w:noProof/>
             <w:webHidden/>
           </w:rPr>
-          <w:instrText xml:space="preserve"> PAGEREF _Toc231100829 \h </w:instrText>
+          <w:instrText xml:space="preserve"> PAGEREF _Toc231102633 \h </w:instrText>
         </w:r>
         <w:r>
           <w:rPr>
@@ -6835,7 +6835,7 @@
             <w:noProof/>
             <w:webHidden/>
           </w:rPr>
-          <w:t>52</w:t>
+          <w:t>53</w:t>
         </w:r>
         <w:r>
           <w:rPr>
@@ -6862,7 +6862,7 @@
           <w14:ligatures w14:val="standardContextual"/>
         </w:rPr>
       </w:pPr>
-      <w:hyperlink w:anchor="_Toc231100830" w:history="1">
+      <w:hyperlink w:anchor="_Toc231102634" w:history="1">
         <w:r>
           <w:rPr>
             <w:rStyle w:val="Hipervnculo"/>
@@ -6889,7 +6889,7 @@
             <w:noProof/>
             <w:webHidden/>
           </w:rPr>
-          <w:instrText xml:space="preserve"> PAGEREF _Toc231100830 \h </w:instrText>
+          <w:instrText xml:space="preserve"> PAGEREF _Toc231102634 \h </w:instrText>
         </w:r>
         <w:r>
           <w:rPr>
@@ -6909,7 +6909,7 @@
             <w:noProof/>
             <w:webHidden/>
           </w:rPr>
-          <w:t>53</w:t>
+          <w:t>54</w:t>
         </w:r>
         <w:r>
           <w:rPr>
@@ -6937,7 +6937,7 @@
       <w:pPr>
         <w:pStyle w:val="Ttulo1"/>
       </w:pPr>
-      <w:bookmarkStart w:id="8" w:name="_Toc231100752"/>
+      <w:bookmarkStart w:id="8" w:name="_Toc231102556"/>
       <w:r>
         <w:lastRenderedPageBreak/>
         <w:t>Índice de figuras</w:t>
@@ -6969,7 +6969,7 @@
       <w:r>
         <w:fldChar w:fldCharType="separate"/>
       </w:r>
-      <w:hyperlink w:anchor="_Toc231100831" w:history="1">
+      <w:hyperlink w:anchor="_Toc231102635" w:history="1">
         <w:r>
           <w:rPr>
             <w:rStyle w:val="Hipervnculo"/>
@@ -6996,7 +6996,7 @@
             <w:noProof/>
             <w:webHidden/>
           </w:rPr>
-          <w:instrText xml:space="preserve"> PAGEREF _Toc231100831 \h </w:instrText>
+          <w:instrText xml:space="preserve"> PAGEREF _Toc231102635 \h </w:instrText>
         </w:r>
         <w:r>
           <w:rPr>
@@ -7016,7 +7016,7 @@
             <w:noProof/>
             <w:webHidden/>
           </w:rPr>
-          <w:t>28</w:t>
+          <w:t>29</w:t>
         </w:r>
         <w:r>
           <w:rPr>
@@ -7043,7 +7043,7 @@
           <w14:ligatures w14:val="standardContextual"/>
         </w:rPr>
       </w:pPr>
-      <w:hyperlink w:anchor="_Toc231100832" w:history="1">
+      <w:hyperlink w:anchor="_Toc231102636" w:history="1">
         <w:r>
           <w:rPr>
             <w:rStyle w:val="Hipervnculo"/>
@@ -7070,7 +7070,7 @@
             <w:noProof/>
             <w:webHidden/>
           </w:rPr>
-          <w:instrText xml:space="preserve"> PAGEREF _Toc231100832 \h </w:instrText>
+          <w:instrText xml:space="preserve"> PAGEREF _Toc231102636 \h </w:instrText>
         </w:r>
         <w:r>
           <w:rPr>
@@ -7090,7 +7090,7 @@
             <w:noProof/>
             <w:webHidden/>
           </w:rPr>
-          <w:t>31</w:t>
+          <w:t>32</w:t>
         </w:r>
         <w:r>
           <w:rPr>
@@ -7117,7 +7117,7 @@
           <w14:ligatures w14:val="standardContextual"/>
         </w:rPr>
       </w:pPr>
-      <w:hyperlink w:anchor="_Toc231100833" w:history="1">
+      <w:hyperlink w:anchor="_Toc231102637" w:history="1">
         <w:r>
           <w:rPr>
             <w:rStyle w:val="Hipervnculo"/>
@@ -7144,7 +7144,7 @@
             <w:noProof/>
             <w:webHidden/>
           </w:rPr>
-          <w:instrText xml:space="preserve"> PAGEREF _Toc231100833 \h </w:instrText>
+          <w:instrText xml:space="preserve"> PAGEREF _Toc231102637 \h </w:instrText>
         </w:r>
         <w:r>
           <w:rPr>
@@ -7164,7 +7164,7 @@
             <w:noProof/>
             <w:webHidden/>
           </w:rPr>
-          <w:t>32</w:t>
+          <w:t>33</w:t>
         </w:r>
         <w:r>
           <w:rPr>
@@ -7191,7 +7191,7 @@
           <w14:ligatures w14:val="standardContextual"/>
         </w:rPr>
       </w:pPr>
-      <w:hyperlink w:anchor="_Toc231100834" w:history="1">
+      <w:hyperlink w:anchor="_Toc231102638" w:history="1">
         <w:r>
           <w:rPr>
             <w:rStyle w:val="Hipervnculo"/>
@@ -7218,7 +7218,7 @@
             <w:noProof/>
             <w:webHidden/>
           </w:rPr>
-          <w:instrText xml:space="preserve"> PAGEREF _Toc231100834 \h </w:instrText>
+          <w:instrText xml:space="preserve"> PAGEREF _Toc231102638 \h </w:instrText>
         </w:r>
         <w:r>
           <w:rPr>
@@ -7238,7 +7238,7 @@
             <w:noProof/>
             <w:webHidden/>
           </w:rPr>
-          <w:t>33</w:t>
+          <w:t>34</w:t>
         </w:r>
         <w:r>
           <w:rPr>
@@ -7265,7 +7265,7 @@
           <w14:ligatures w14:val="standardContextual"/>
         </w:rPr>
       </w:pPr>
-      <w:hyperlink w:anchor="_Toc231100835" w:history="1">
+      <w:hyperlink w:anchor="_Toc231102639" w:history="1">
         <w:r>
           <w:rPr>
             <w:rStyle w:val="Hipervnculo"/>
@@ -7292,7 +7292,7 @@
             <w:noProof/>
             <w:webHidden/>
           </w:rPr>
-          <w:instrText xml:space="preserve"> PAGEREF _Toc231100835 \h </w:instrText>
+          <w:instrText xml:space="preserve"> PAGEREF _Toc231102639 \h </w:instrText>
         </w:r>
         <w:r>
           <w:rPr>
@@ -7312,7 +7312,7 @@
             <w:noProof/>
             <w:webHidden/>
           </w:rPr>
-          <w:t>34</w:t>
+          <w:t>35</w:t>
         </w:r>
         <w:r>
           <w:rPr>
@@ -7339,7 +7339,7 @@
           <w14:ligatures w14:val="standardContextual"/>
         </w:rPr>
       </w:pPr>
-      <w:hyperlink w:anchor="_Toc231100836" w:history="1">
+      <w:hyperlink w:anchor="_Toc231102640" w:history="1">
         <w:r>
           <w:rPr>
             <w:rStyle w:val="Hipervnculo"/>
@@ -7366,7 +7366,7 @@
             <w:noProof/>
             <w:webHidden/>
           </w:rPr>
-          <w:instrText xml:space="preserve"> PAGEREF _Toc231100836 \h </w:instrText>
+          <w:instrText xml:space="preserve"> PAGEREF _Toc231102640 \h </w:instrText>
         </w:r>
         <w:r>
           <w:rPr>
@@ -7386,7 +7386,7 @@
             <w:noProof/>
             <w:webHidden/>
           </w:rPr>
-          <w:t>38</w:t>
+          <w:t>39</w:t>
         </w:r>
         <w:r>
           <w:rPr>
@@ -7414,7 +7414,7 @@
       <w:pPr>
         <w:pStyle w:val="Ttulo1"/>
       </w:pPr>
-      <w:bookmarkStart w:id="9" w:name="_Toc231100753"/>
+      <w:bookmarkStart w:id="9" w:name="_Toc231102557"/>
       <w:r>
         <w:lastRenderedPageBreak/>
         <w:t>Lista de abreviaturas y siglas</w:t>
@@ -8200,7 +8200,7 @@
       <w:pPr>
         <w:pStyle w:val="Ttulo1"/>
       </w:pPr>
-      <w:bookmarkStart w:id="10" w:name="_Toc231100754"/>
+      <w:bookmarkStart w:id="10" w:name="_Toc231102558"/>
       <w:r>
         <w:lastRenderedPageBreak/>
         <w:t>Capítulo 1 — Introducción</w:t>
@@ -8211,7 +8211,7 @@
       <w:pPr>
         <w:pStyle w:val="Ttulo2"/>
       </w:pPr>
-      <w:bookmarkStart w:id="11" w:name="_Toc231100755"/>
+      <w:bookmarkStart w:id="11" w:name="_Toc231102559"/>
       <w:r>
         <w:t>1.1 Contextualización</w:t>
       </w:r>
@@ -8299,7 +8299,7 @@
       <w:pPr>
         <w:pStyle w:val="Ttulo2"/>
       </w:pPr>
-      <w:bookmarkStart w:id="12" w:name="_Toc231100756"/>
+      <w:bookmarkStart w:id="12" w:name="_Toc231102560"/>
       <w:r>
         <w:t>1.2 Problema de investigación y justificación</w:t>
       </w:r>
@@ -8409,7 +8409,7 @@
       <w:pPr>
         <w:pStyle w:val="Ttulo2"/>
       </w:pPr>
-      <w:bookmarkStart w:id="13" w:name="_Toc231100757"/>
+      <w:bookmarkStart w:id="13" w:name="_Toc231102561"/>
       <w:r>
         <w:t>1.3 Pregunta y objetivos de investigación</w:t>
       </w:r>
@@ -8594,7 +8594,7 @@
       <w:pPr>
         <w:pStyle w:val="Ttulo2"/>
       </w:pPr>
-      <w:bookmarkStart w:id="14" w:name="_Toc231100758"/>
+      <w:bookmarkStart w:id="14" w:name="_Toc231102562"/>
       <w:r>
         <w:lastRenderedPageBreak/>
         <w:t>1.4 Hipótesis general</w:t>
@@ -8638,7 +8638,7 @@
       <w:pPr>
         <w:pStyle w:val="Ttulo2"/>
       </w:pPr>
-      <w:bookmarkStart w:id="15" w:name="_Toc231100759"/>
+      <w:bookmarkStart w:id="15" w:name="_Toc231102563"/>
       <w:r>
         <w:t>1.5 Aspectos metodológicos y alcance</w:t>
       </w:r>
@@ -8741,7 +8741,7 @@
       <w:pPr>
         <w:pStyle w:val="Ttulo2"/>
       </w:pPr>
-      <w:bookmarkStart w:id="16" w:name="_Toc231100760"/>
+      <w:bookmarkStart w:id="16" w:name="_Toc231102564"/>
       <w:r>
         <w:t>1.6 Aportes esperados</w:t>
       </w:r>
@@ -8794,7 +8794,7 @@
       <w:pPr>
         <w:pStyle w:val="Ttulo2"/>
       </w:pPr>
-      <w:bookmarkStart w:id="17" w:name="_Toc231100761"/>
+      <w:bookmarkStart w:id="17" w:name="_Toc231102565"/>
       <w:r>
         <w:t>1.7 Estructura de la tesis</w:t>
       </w:r>
@@ -8835,7 +8835,7 @@
       <w:pPr>
         <w:pStyle w:val="Ttulo1"/>
       </w:pPr>
-      <w:bookmarkStart w:id="18" w:name="_Toc231100762"/>
+      <w:bookmarkStart w:id="18" w:name="_Toc231102566"/>
       <w:r>
         <w:lastRenderedPageBreak/>
         <w:t>Capítulo 2 — Marco teórico y revisión de literatura</w:t>
@@ -8846,7 +8846,7 @@
       <w:pPr>
         <w:pStyle w:val="Ttulo2"/>
       </w:pPr>
-      <w:bookmarkStart w:id="19" w:name="_Toc231100763"/>
+      <w:bookmarkStart w:id="19" w:name="_Toc231102567"/>
       <w:r>
         <w:t>2.1 Determinantes macroeconómicos de los retornos accionarios</w:t>
       </w:r>
@@ -9144,7 +9144,7 @@
       <w:pPr>
         <w:pStyle w:val="Ttulo2"/>
       </w:pPr>
-      <w:bookmarkStart w:id="20" w:name="_Toc231100764"/>
+      <w:bookmarkStart w:id="20" w:name="_Toc231102568"/>
       <w:r>
         <w:t>2.2 Precios de commodities y valoración de empresas mineras</w:t>
       </w:r>
@@ -9278,7 +9278,7 @@
       <w:pPr>
         <w:pStyle w:val="Ttulo2"/>
       </w:pPr>
-      <w:bookmarkStart w:id="21" w:name="_Toc231100765"/>
+      <w:bookmarkStart w:id="21" w:name="_Toc231102569"/>
       <w:r>
         <w:t>2.3 Tipo de cambio y exposición de empresas exportadoras</w:t>
       </w:r>
@@ -9372,7 +9372,7 @@
       <w:pPr>
         <w:pStyle w:val="Ttulo2"/>
       </w:pPr>
-      <w:bookmarkStart w:id="22" w:name="_Toc231100766"/>
+      <w:bookmarkStart w:id="22" w:name="_Toc231102570"/>
       <w:r>
         <w:t>2.4 Cobre, tipo de cambio y la economía chilena</w:t>
       </w:r>
@@ -9597,7 +9597,7 @@
       <w:pPr>
         <w:pStyle w:val="Ttulo2"/>
       </w:pPr>
-      <w:bookmarkStart w:id="23" w:name="_Toc231100767"/>
+      <w:bookmarkStart w:id="23" w:name="_Toc231102571"/>
       <w:r>
         <w:lastRenderedPageBreak/>
         <w:t>2.5 Eficiencia informacional y segmentación de mercados</w:t>
@@ -9738,7 +9738,7 @@
       <w:pPr>
         <w:pStyle w:val="Ttulo2"/>
       </w:pPr>
-      <w:bookmarkStart w:id="24" w:name="_Toc231100768"/>
+      <w:bookmarkStart w:id="24" w:name="_Toc231102572"/>
       <w:r>
         <w:t>2.6 Enfoques econométricos para la medición de impacto</w:t>
       </w:r>
@@ -9890,7 +9890,7 @@
       <w:pPr>
         <w:pStyle w:val="Ttulo2"/>
       </w:pPr>
-      <w:bookmarkStart w:id="25" w:name="_Toc231100769"/>
+      <w:bookmarkStart w:id="25" w:name="_Toc231102573"/>
       <w:r>
         <w:t>2.7 Síntesis e identificación del vacío de investigación</w:t>
       </w:r>
@@ -10015,7 +10015,7 @@
       <w:pPr>
         <w:pStyle w:val="Ttulo3"/>
       </w:pPr>
-      <w:bookmarkStart w:id="26" w:name="_Toc231100770"/>
+      <w:bookmarkStart w:id="26" w:name="_Toc231102574"/>
       <w:r>
         <w:t>Nota sobre la tabla de literatura</w:t>
       </w:r>
@@ -10045,7 +10045,7 @@
       <w:pPr>
         <w:pStyle w:val="Ttulo1"/>
       </w:pPr>
-      <w:bookmarkStart w:id="27" w:name="_Toc231100771"/>
+      <w:bookmarkStart w:id="27" w:name="_Toc231102575"/>
       <w:r>
         <w:lastRenderedPageBreak/>
         <w:t>Capítulo 3 — Datos y metodología</w:t>
@@ -10056,7 +10056,7 @@
       <w:pPr>
         <w:pStyle w:val="Ttulo2"/>
       </w:pPr>
-      <w:bookmarkStart w:id="28" w:name="_Toc231100772"/>
+      <w:bookmarkStart w:id="28" w:name="_Toc231102576"/>
       <w:r>
         <w:t xml:space="preserve">3.1 </w:t>
       </w:r>
@@ -10251,7 +10251,7 @@
       <w:pPr>
         <w:pStyle w:val="Ttulo2"/>
       </w:pPr>
-      <w:bookmarkStart w:id="29" w:name="_Toc231100773"/>
+      <w:bookmarkStart w:id="29" w:name="_Toc231102577"/>
       <w:r>
         <w:t>3.2 Variable dependiente</w:t>
       </w:r>
@@ -10313,7 +10313,7 @@
       <w:pPr>
         <w:pStyle w:val="Ttulo2"/>
       </w:pPr>
-      <w:bookmarkStart w:id="30" w:name="_Toc231100774"/>
+      <w:bookmarkStart w:id="30" w:name="_Toc231102578"/>
       <w:r>
         <w:t>3.3 Variables explicativas</w:t>
       </w:r>
@@ -10380,7 +10380,7 @@
       <w:pPr>
         <w:pStyle w:val="Ttulo2"/>
       </w:pPr>
-      <w:bookmarkStart w:id="31" w:name="_Toc231100775"/>
+      <w:bookmarkStart w:id="31" w:name="_Toc231102579"/>
       <w:r>
         <w:t>3.4 Tratamiento de datos y frecuencias mixtas</w:t>
       </w:r>
@@ -10437,7 +10437,7 @@
       <w:pPr>
         <w:pStyle w:val="Ttulo2"/>
       </w:pPr>
-      <w:bookmarkStart w:id="32" w:name="_Toc231100776"/>
+      <w:bookmarkStart w:id="32" w:name="_Toc231102580"/>
       <w:r>
         <w:t>3.5 Datación de las fases del ciclo del cobre</w:t>
       </w:r>
@@ -10503,7 +10503,7 @@
       <w:pPr>
         <w:pStyle w:val="Ttulo2"/>
       </w:pPr>
-      <w:bookmarkStart w:id="33" w:name="_Toc231100777"/>
+      <w:bookmarkStart w:id="33" w:name="_Toc231102581"/>
       <w:r>
         <w:lastRenderedPageBreak/>
         <w:t>3.6 Estrategia econométrica</w:t>
@@ -10514,7 +10514,7 @@
       <w:pPr>
         <w:pStyle w:val="Ttulo3"/>
       </w:pPr>
-      <w:bookmarkStart w:id="34" w:name="_Toc231100778"/>
+      <w:bookmarkStart w:id="34" w:name="_Toc231102582"/>
       <w:r>
         <w:t>3.6.1 Estacionariedad y orden de integración (OE1)</w:t>
       </w:r>
@@ -10557,7 +10557,7 @@
       <w:pPr>
         <w:pStyle w:val="Ttulo3"/>
       </w:pPr>
-      <w:bookmarkStart w:id="35" w:name="_Toc231100779"/>
+      <w:bookmarkStart w:id="35" w:name="_Toc231102583"/>
       <w:r>
         <w:t>3.6.2 Modelo de impacto: panel de efectos fijos (OE2)</w:t>
       </w:r>
@@ -10648,7 +10648,7 @@
       <w:pPr>
         <w:pStyle w:val="Ttulo3"/>
       </w:pPr>
-      <w:bookmarkStart w:id="36" w:name="_Toc231100780"/>
+      <w:bookmarkStart w:id="36" w:name="_Toc231102584"/>
       <w:r>
         <w:t>3.6.3 Relaciones de largo plazo: cointegración (OE3)</w:t>
       </w:r>
@@ -10749,7 +10749,7 @@
       <w:pPr>
         <w:pStyle w:val="Ttulo3"/>
       </w:pPr>
-      <w:bookmarkStart w:id="37" w:name="_Toc231100781"/>
+      <w:bookmarkStart w:id="37" w:name="_Toc231102585"/>
       <w:r>
         <w:t>3.6.4 Dinámica de shocks: VAR, impulso-respuesta y descomposición de varianza (OE4)</w:t>
       </w:r>
@@ -10869,7 +10869,7 @@
       <w:pPr>
         <w:pStyle w:val="Ttulo3"/>
       </w:pPr>
-      <w:bookmarkStart w:id="38" w:name="_Toc231100782"/>
+      <w:bookmarkStart w:id="38" w:name="_Toc231102586"/>
       <w:r>
         <w:t>3.6.5 Estabilidad por fases del ciclo (OE5)</w:t>
       </w:r>
@@ -10915,7 +10915,7 @@
       <w:pPr>
         <w:pStyle w:val="Ttulo3"/>
       </w:pPr>
-      <w:bookmarkStart w:id="39" w:name="_Toc231100783"/>
+      <w:bookmarkStart w:id="39" w:name="_Toc231102587"/>
       <w:r>
         <w:t>3.6.6 Comparación entre mercados: triangulación (OE6)</w:t>
       </w:r>
@@ -10966,7 +10966,7 @@
       <w:pPr>
         <w:pStyle w:val="Ttulo2"/>
       </w:pPr>
-      <w:bookmarkStart w:id="40" w:name="_Toc231100784"/>
+      <w:bookmarkStart w:id="40" w:name="_Toc231102588"/>
       <w:r>
         <w:t xml:space="preserve">3.7 </w:t>
       </w:r>
@@ -10997,29 +10997,134 @@
     </w:p>
     <w:p>
       <w:r>
-        <w:t>selección de rezagos por criterios de información. La robustez de los resultados se examina</w:t>
-      </w:r>
-    </w:p>
-    <w:p>
-      <w:r>
-        <w:t>mediante submuestras, definiciones alternativas de las variables (cobre spot frente a futuros;</w:t>
-      </w:r>
-    </w:p>
-    <w:p>
-      <w:r>
-        <w:t>cartera equiponderada frente a ponderada por capitalización) y la inclusión o exclusión de</w:t>
-      </w:r>
-    </w:p>
-    <w:p>
-      <w:r>
-        <w:t>períodos atípicos como la crisis de 2008 y la pandemia de 2020.</w:t>
+        <w:t>selección de rezagos por criterios de información.</w:t>
+      </w:r>
+    </w:p>
+    <w:p>
+      <w:r>
+        <w:t>El diseño contempla, además, una **batería ampliada de diagnósticos y de robustez de segunda</w:t>
+      </w:r>
+    </w:p>
+    <w:p>
+      <w:r>
+        <w:t>generación</w:t>
+      </w:r>
+      <w:r>
+        <w:rPr>
+          <w:b/>
+        </w:rPr>
+        <w:t xml:space="preserve"> que se reporta en el Capítulo 4: (i) pruebas de raíz unitaria en panel </w:t>
+      </w:r>
+      <w:r>
+        <w:t>CIPS**</w:t>
+      </w:r>
+    </w:p>
+    <w:p>
+      <w:r>
+        <w:t>(Pesaran, 2007), robustas a la dependencia de sección cruzada; (ii) cointegración con quiebre</w:t>
+      </w:r>
+    </w:p>
+    <w:p>
+      <w:r>
+        <w:t xml:space="preserve">estructural endógeno de </w:t>
+      </w:r>
+      <w:r>
+        <w:rPr>
+          <w:b/>
+        </w:rPr>
+        <w:t>Gregory-Hansen (1996)</w:t>
+      </w:r>
+      <w:r>
+        <w:t xml:space="preserve">; </w:t>
+      </w:r>
+      <w:r>
+        <w:t>(iii) modelación de la volatilidad asimétrica</w:t>
+      </w:r>
+    </w:p>
+    <w:p>
+      <w:r>
+        <w:t xml:space="preserve">mediante </w:t>
+      </w:r>
+      <w:r>
+        <w:rPr>
+          <w:b/>
+        </w:rPr>
+        <w:t>GJR-GARCH</w:t>
+      </w:r>
+      <w:r>
+        <w:t xml:space="preserve"> (efecto apalancamiento); (iv) funciones impulso-respuesta por **proyecciones</w:t>
+      </w:r>
+    </w:p>
+    <w:p>
+      <w:r>
+        <w:t>locales</w:t>
+      </w:r>
+      <w:r>
+        <w:rPr>
+          <w:b/>
+        </w:rPr>
+        <w:t xml:space="preserve"> (Jordà, 2005) como alternativa al VAR; (v) corrección por </w:t>
+      </w:r>
+      <w:r>
+        <w:t>pruebas múltiples**</w:t>
+      </w:r>
+    </w:p>
+    <w:p>
+      <w:r>
+        <w:t xml:space="preserve">(Benjamini-Hochberg) sobre los p-valores del panel; (vi) reporte de </w:t>
+      </w:r>
+      <w:r>
+        <w:rPr>
+          <w:b/>
+        </w:rPr>
+        <w:t>magnitudes económicas</w:t>
+      </w:r>
+    </w:p>
+    <w:p>
+      <w:r>
+        <w:lastRenderedPageBreak/>
+        <w:t>mediante coeficientes estandarizados; (vii) una **prueba formal de igualdad de coeficientes entre</w:t>
+      </w:r>
+    </w:p>
+    <w:p>
+      <w:r>
+        <w:t>mercados** (interacciones factor × mercado) para contrastar la transmisión diferenciada; y (viii)</w:t>
+      </w:r>
+    </w:p>
+    <w:p>
+      <w:r>
+        <w:t xml:space="preserve">el </w:t>
+      </w:r>
+      <w:r>
+        <w:rPr>
+          <w:b/>
+        </w:rPr>
+        <w:t>test de razón de varianzas</w:t>
+      </w:r>
+      <w:r>
+        <w:t xml:space="preserve"> de Lo y MacKinlay (1988) para la hipótesis de paseo aleatorio. La</w:t>
+      </w:r>
+    </w:p>
+    <w:p>
+      <w:r>
+        <w:t>robustez se examina también mediante submuestras (pre/post 2008 y 2020), definiciones alternativas</w:t>
+      </w:r>
+    </w:p>
+    <w:p>
+      <w:r>
+        <w:t>de las variables y carteras equiponderada frente a ponderada por capitalización. El justificante de</w:t>
+      </w:r>
+    </w:p>
+    <w:p>
+      <w:r>
+        <w:t>la especificación de panel (efectos fijos frente a aleatorios) se discute en §4.2.</w:t>
       </w:r>
     </w:p>
     <w:p>
       <w:pPr>
         <w:pStyle w:val="Ttulo3"/>
       </w:pPr>
-      <w:bookmarkStart w:id="41" w:name="_Toc231100785"/>
+      <w:bookmarkStart w:id="41" w:name="_Toc231102589"/>
       <w:r>
         <w:t>Tabla 3.1 — Definición operativa de variables (resumen)</w:t>
       </w:r>
@@ -11031,7 +11136,7 @@
         <w:spacing w:before="40" w:after="40"/>
         <w:jc w:val="center"/>
       </w:pPr>
-      <w:bookmarkStart w:id="42" w:name="_Toc231100816"/>
+      <w:bookmarkStart w:id="42" w:name="_Toc231102620"/>
       <w:r>
         <w:rPr>
           <w:i w:val="0"/>
@@ -11840,7 +11945,6 @@
               <w:rPr>
                 <w:sz w:val="20"/>
               </w:rPr>
-              <w:lastRenderedPageBreak/>
               <w:t>Global</w:t>
             </w:r>
           </w:p>
@@ -12988,7 +13092,11 @@
     </w:p>
     <w:p>
       <w:r>
-        <w:t>*Referencias metodológicas completas en `docs/revision_literatura.md`, bloque 2.5.*</w:t>
+        <w:lastRenderedPageBreak/>
+        <w:t xml:space="preserve">*Referencias metodológicas completas en </w:t>
+      </w:r>
+      <w:r>
+        <w:t>`docs/revision_literatura.md`, bloque 2.5.*</w:t>
       </w:r>
     </w:p>
     <w:p>
@@ -13000,7 +13108,7 @@
       <w:pPr>
         <w:pStyle w:val="Ttulo1"/>
       </w:pPr>
-      <w:bookmarkStart w:id="43" w:name="_Toc231100786"/>
+      <w:bookmarkStart w:id="43" w:name="_Toc231102590"/>
       <w:r>
         <w:lastRenderedPageBreak/>
         <w:t>Capítulo 4 — Resultados y discusión</w:t>
@@ -13011,7 +13119,7 @@
       <w:pPr>
         <w:pStyle w:val="Ttulo2"/>
       </w:pPr>
-      <w:bookmarkStart w:id="44" w:name="_Toc231100787"/>
+      <w:bookmarkStart w:id="44" w:name="_Toc231102591"/>
       <w:r>
         <w:t>4.1 Análisis descriptivo y propiedades de las series (OE1)</w:t>
       </w:r>
@@ -13019,10 +13127,7 @@
     </w:p>
     <w:p>
       <w:r>
-        <w:t xml:space="preserve">Las pruebas de raíz unitaria </w:t>
-      </w:r>
-      <w:r>
-        <w:t>confirman el patrón esperado y validan la estrategia de doble vía.</w:t>
+        <w:t>Las pruebas de raíz unitaria confirman el patrón esperado y validan la estrategia de doble vía.</w:t>
       </w:r>
     </w:p>
     <w:p>
@@ -13241,7 +13346,7 @@
       <w:pPr>
         <w:pStyle w:val="Ttulo2"/>
       </w:pPr>
-      <w:bookmarkStart w:id="45" w:name="_Toc231100788"/>
+      <w:bookmarkStart w:id="45" w:name="_Toc231102592"/>
       <w:r>
         <w:t>4.2 Determinantes de los retornos: global vs local (OE2)</w:t>
       </w:r>
@@ -13263,7 +13368,7 @@
         <w:spacing w:before="40" w:after="40"/>
         <w:jc w:val="center"/>
       </w:pPr>
-      <w:bookmarkStart w:id="46" w:name="_Toc231100817"/>
+      <w:bookmarkStart w:id="46" w:name="_Toc231102621"/>
       <w:r>
         <w:rPr>
           <w:i w:val="0"/>
@@ -13568,13 +13673,7 @@
               <w:rPr>
                 <w:sz w:val="20"/>
               </w:rPr>
-              <w:t xml:space="preserve">Fed Funds </w:t>
-            </w:r>
-            <w:r>
-              <w:rPr>
-                <w:sz w:val="20"/>
-              </w:rPr>
-              <w:t>(Δ)</w:t>
+              <w:t>Fed Funds (Δ)</w:t>
             </w:r>
           </w:p>
         </w:tc>
@@ -14069,7 +14168,7 @@
           <w:noProof/>
         </w:rPr>
         <w:drawing>
-          <wp:inline distT="0" distB="0" distL="0" distR="0" wp14:anchorId="38033A03" wp14:editId="6ED56299">
+          <wp:inline distT="0" distB="0" distL="0" distR="0" wp14:anchorId="51B4988A" wp14:editId="184CD135">
             <wp:extent cx="5212080" cy="2833680"/>
             <wp:effectExtent l="0" t="0" r="0" b="0"/>
             <wp:docPr id="1" name="Picture 1"/>
@@ -14111,7 +14210,7 @@
         <w:spacing w:before="160" w:after="200"/>
         <w:jc w:val="center"/>
       </w:pPr>
-      <w:bookmarkStart w:id="47" w:name="_Toc231100831"/>
+      <w:bookmarkStart w:id="47" w:name="_Toc231102635"/>
       <w:r>
         <w:rPr>
           <w:i w:val="0"/>
@@ -14160,10 +14259,7 @@
     </w:p>
     <w:p>
       <w:r>
-        <w:t xml:space="preserve">empresas** —el precio del cobre, el VIX o el tipo de </w:t>
-      </w:r>
-      <w:r>
-        <w:t>cambio toman el mismo valor para cada firma en</w:t>
+        <w:t>empresas** —el precio del cobre, el VIX o el tipo de cambio toman el mismo valor para cada firma en</w:t>
       </w:r>
     </w:p>
     <w:p>
@@ -14197,10 +14293,7 @@
     </w:p>
     <w:p>
       <w:r>
-        <w:t xml:space="preserve">heterogeneidad no observada y constante de cada empresa (distintas medias de retorno por </w:t>
-      </w:r>
-      <w:r>
-        <w:t>niveles de</w:t>
+        <w:t>heterogeneidad no observada y constante de cada empresa (distintas medias de retorno por niveles de</w:t>
       </w:r>
     </w:p>
     <w:p>
@@ -14217,7 +14310,7 @@
       <w:pPr>
         <w:pStyle w:val="Ttulo2"/>
       </w:pPr>
-      <w:bookmarkStart w:id="48" w:name="_Toc231100789"/>
+      <w:bookmarkStart w:id="48" w:name="_Toc231102593"/>
       <w:r>
         <w:t>4.3 Relaciones de largo plazo (OE3)</w:t>
       </w:r>
@@ -14263,7 +14356,10 @@
     </w:p>
     <w:p>
       <w:r>
-        <w:t>relación de nivel (estadístico F de bordes ≈ 0,95, por debajo de las cotas críticas). Esta</w:t>
+        <w:t xml:space="preserve">relación de nivel (estadístico F de bordes ≈ 0,95, por debajo de </w:t>
+      </w:r>
+      <w:r>
+        <w:t>las cotas críticas). Esta</w:t>
       </w:r>
     </w:p>
     <w:p>
@@ -14381,7 +14477,7 @@
       <w:pPr>
         <w:pStyle w:val="Ttulo2"/>
       </w:pPr>
-      <w:bookmarkStart w:id="49" w:name="_Toc231100790"/>
+      <w:bookmarkStart w:id="49" w:name="_Toc231102594"/>
       <w:r>
         <w:t>4.4 Dinámica de shocks (OE4)</w:t>
       </w:r>
@@ -14403,7 +14499,7 @@
         <w:spacing w:before="40" w:after="40"/>
         <w:jc w:val="center"/>
       </w:pPr>
-      <w:bookmarkStart w:id="50" w:name="_Toc231100818"/>
+      <w:bookmarkStart w:id="50" w:name="_Toc231102622"/>
       <w:r>
         <w:rPr>
           <w:i w:val="0"/>
@@ -14524,13 +14620,7 @@
               <w:rPr>
                 <w:sz w:val="20"/>
               </w:rPr>
-              <w:t xml:space="preserve">Componente propio </w:t>
-            </w:r>
-            <w:r>
-              <w:rPr>
-                <w:sz w:val="20"/>
-              </w:rPr>
-              <w:t>(idiosincrático)</w:t>
+              <w:t>Componente propio (idiosincrático)</w:t>
             </w:r>
           </w:p>
         </w:tc>
@@ -14741,7 +14831,13 @@
               <w:rPr>
                 <w:sz w:val="20"/>
               </w:rPr>
-              <w:t>Tipo de cambio</w:t>
+              <w:t xml:space="preserve">Tipo de </w:t>
+            </w:r>
+            <w:r>
+              <w:rPr>
+                <w:sz w:val="20"/>
+              </w:rPr>
+              <w:t>cambio</w:t>
             </w:r>
           </w:p>
         </w:tc>
@@ -14794,10 +14890,7 @@
     </w:p>
     <w:p>
       <w:r>
-        <w:t xml:space="preserve">de manera estadísticamente </w:t>
-      </w:r>
-      <w:r>
-        <w:t>significativa (F = 9,11; p = 0,003). Más allá del componente</w:t>
+        <w:t>de manera estadísticamente significativa (F = 9,11; p = 0,003). Más allá del componente</w:t>
       </w:r>
     </w:p>
     <w:p>
@@ -14850,7 +14943,7 @@
           <w:noProof/>
         </w:rPr>
         <w:drawing>
-          <wp:inline distT="0" distB="0" distL="0" distR="0" wp14:anchorId="0B347BCD" wp14:editId="777E1075">
+          <wp:inline distT="0" distB="0" distL="0" distR="0" wp14:anchorId="5602A762" wp14:editId="3EDC3F3B">
             <wp:extent cx="5212080" cy="3890356"/>
             <wp:effectExtent l="0" t="0" r="0" b="0"/>
             <wp:docPr id="2" name="Picture 2"/>
@@ -14892,7 +14985,7 @@
         <w:spacing w:before="160" w:after="200"/>
         <w:jc w:val="center"/>
       </w:pPr>
-      <w:bookmarkStart w:id="51" w:name="_Toc231100832"/>
+      <w:bookmarkStart w:id="51" w:name="_Toc231102636"/>
       <w:r>
         <w:rPr>
           <w:i w:val="0"/>
@@ -14962,7 +15055,7 @@
           <w:noProof/>
         </w:rPr>
         <w:drawing>
-          <wp:inline distT="0" distB="0" distL="0" distR="0" wp14:anchorId="3A4A400E" wp14:editId="4D883420">
+          <wp:inline distT="0" distB="0" distL="0" distR="0" wp14:anchorId="2272921A" wp14:editId="205BB6DB">
             <wp:extent cx="5212080" cy="2478330"/>
             <wp:effectExtent l="0" t="0" r="0" b="0"/>
             <wp:docPr id="3" name="Picture 3"/>
@@ -15004,7 +15097,7 @@
         <w:spacing w:before="160" w:after="200"/>
         <w:jc w:val="center"/>
       </w:pPr>
-      <w:bookmarkStart w:id="52" w:name="_Toc231100833"/>
+      <w:bookmarkStart w:id="52" w:name="_Toc231102637"/>
       <w:r>
         <w:rPr>
           <w:i w:val="0"/>
@@ -15038,7 +15131,7 @@
       <w:pPr>
         <w:pStyle w:val="Ttulo2"/>
       </w:pPr>
-      <w:bookmarkStart w:id="53" w:name="_Toc231100791"/>
+      <w:bookmarkStart w:id="53" w:name="_Toc231102595"/>
       <w:r>
         <w:t>4.5 Estabilidad por fases del ciclo del cobre (OE5)</w:t>
       </w:r>
@@ -15146,7 +15239,7 @@
           <w:noProof/>
         </w:rPr>
         <w:drawing>
-          <wp:inline distT="0" distB="0" distL="0" distR="0" wp14:anchorId="7D447DB2" wp14:editId="47972035">
+          <wp:inline distT="0" distB="0" distL="0" distR="0" wp14:anchorId="7982A701" wp14:editId="244DBB17">
             <wp:extent cx="5212080" cy="2366710"/>
             <wp:effectExtent l="0" t="0" r="0" b="0"/>
             <wp:docPr id="4" name="Picture 4"/>
@@ -15188,7 +15281,7 @@
         <w:spacing w:before="160" w:after="200"/>
         <w:jc w:val="center"/>
       </w:pPr>
-      <w:bookmarkStart w:id="54" w:name="_Toc231100834"/>
+      <w:bookmarkStart w:id="54" w:name="_Toc231102638"/>
       <w:r>
         <w:rPr>
           <w:i w:val="0"/>
@@ -15222,7 +15315,7 @@
       <w:pPr>
         <w:pStyle w:val="Ttulo2"/>
       </w:pPr>
-      <w:bookmarkStart w:id="55" w:name="_Toc231100792"/>
+      <w:bookmarkStart w:id="55" w:name="_Toc231102596"/>
       <w:r>
         <w:t>4.6 Comparación entre mercados: triangulación (OE6)</w:t>
       </w:r>
@@ -15244,7 +15337,7 @@
         <w:spacing w:before="40" w:after="40"/>
         <w:jc w:val="center"/>
       </w:pPr>
-      <w:bookmarkStart w:id="56" w:name="_Toc231100819"/>
+      <w:bookmarkStart w:id="56" w:name="_Toc231102623"/>
       <w:r>
         <w:rPr>
           <w:i w:val="0"/>
@@ -15695,13 +15788,7 @@
               <w:rPr>
                 <w:sz w:val="20"/>
               </w:rPr>
-              <w:t xml:space="preserve">C · </w:t>
-            </w:r>
-            <w:r>
-              <w:rPr>
-                <w:sz w:val="20"/>
-              </w:rPr>
-              <w:t>minería Chile</w:t>
+              <w:t>C · minería Chile</w:t>
             </w:r>
           </w:p>
         </w:tc>
@@ -15826,7 +15913,10 @@
         <w:ind w:left="454" w:hanging="454"/>
       </w:pPr>
       <w:r>
-        <w:t>1. **La sensibilidad al cobre es similar entre el cobre puro internacional (0,571) y el local</w:t>
+        <w:t xml:space="preserve">1. **La sensibilidad al cobre es similar </w:t>
+      </w:r>
+      <w:r>
+        <w:t>entre el cobre puro internacional (0,571) y el local</w:t>
       </w:r>
     </w:p>
     <w:p>
@@ -15869,7 +15959,7 @@
           <w:noProof/>
         </w:rPr>
         <w:drawing>
-          <wp:inline distT="0" distB="0" distL="0" distR="0" wp14:anchorId="0BBB658D" wp14:editId="2F3392F6">
+          <wp:inline distT="0" distB="0" distL="0" distR="0" wp14:anchorId="550F2038" wp14:editId="4053ED65">
             <wp:extent cx="5212080" cy="2626097"/>
             <wp:effectExtent l="0" t="0" r="0" b="0"/>
             <wp:docPr id="5" name="Picture 5"/>
@@ -15911,7 +16001,7 @@
         <w:spacing w:before="160" w:after="200"/>
         <w:jc w:val="center"/>
       </w:pPr>
-      <w:bookmarkStart w:id="57" w:name="_Toc231100835"/>
+      <w:bookmarkStart w:id="57" w:name="_Toc231102639"/>
       <w:r>
         <w:rPr>
           <w:i w:val="0"/>
@@ -15946,10 +16036,7 @@
         <w:ind w:left="454" w:hanging="454"/>
       </w:pPr>
       <w:r>
-        <w:t xml:space="preserve">2. **La fracción de varianza </w:t>
-      </w:r>
-      <w:r>
-        <w:t>atribuida a shocks globales es algo mayor en el mercado internacional</w:t>
+        <w:t>2. **La fracción de varianza atribuida a shocks globales es algo mayor en el mercado internacional</w:t>
       </w:r>
     </w:p>
     <w:p>
@@ -16056,7 +16143,7 @@
       <w:pPr>
         <w:pStyle w:val="Ttulo2"/>
       </w:pPr>
-      <w:bookmarkStart w:id="58" w:name="_Toc231100793"/>
+      <w:bookmarkStart w:id="58" w:name="_Toc231102597"/>
       <w:r>
         <w:t>4.7 Diagnósticos y robustez</w:t>
       </w:r>
@@ -16103,15 +16190,15 @@
     </w:p>
     <w:p>
       <w:r>
-        <w:t xml:space="preserve">cinco productoras comparten un factor común </w:t>
-      </w:r>
-      <w:r>
-        <w:t>—señaladamente el precio del cobre— que induce</w:t>
-      </w:r>
-    </w:p>
-    <w:p>
-      <w:r>
-        <w:t>correlación contemporánea en sus retornos. Ignorar esta dependencia habría sesgado la inferencia.</w:t>
+        <w:t>cinco productoras comparten un factor común —señaladamente el precio del cobre— que induce</w:t>
+      </w:r>
+    </w:p>
+    <w:p>
+      <w:r>
+        <w:t xml:space="preserve">correlación contemporánea en sus retornos. Ignorar esta </w:t>
+      </w:r>
+      <w:r>
+        <w:t>dependencia habría sesgado la inferencia.</w:t>
       </w:r>
     </w:p>
     <w:p>
@@ -16133,7 +16220,10 @@
     </w:p>
     <w:p>
       <w:r>
-        <w:t>descomposición de varianza reportadas en §4.4.</w:t>
+        <w:t xml:space="preserve">descomposición de varianza </w:t>
+      </w:r>
+      <w:r>
+        <w:t>reportadas en §4.4.</w:t>
       </w:r>
     </w:p>
     <w:p>
@@ -16416,7 +16506,7 @@
         </w:rPr>
         <w:lastRenderedPageBreak/>
         <w:drawing>
-          <wp:inline distT="0" distB="0" distL="0" distR="0" wp14:anchorId="6899BECE" wp14:editId="6D39E410">
+          <wp:inline distT="0" distB="0" distL="0" distR="0" wp14:anchorId="6EC7087E" wp14:editId="649DAA94">
             <wp:extent cx="5212080" cy="2446436"/>
             <wp:effectExtent l="0" t="0" r="0" b="0"/>
             <wp:docPr id="6" name="Picture 6"/>
@@ -16458,7 +16548,7 @@
         <w:spacing w:before="160" w:after="200"/>
         <w:jc w:val="center"/>
       </w:pPr>
-      <w:bookmarkStart w:id="59" w:name="_Toc231100836"/>
+      <w:bookmarkStart w:id="59" w:name="_Toc231102640"/>
       <w:r>
         <w:rPr>
           <w:i w:val="0"/>
@@ -16484,7 +16574,10 @@
         <w:fldChar w:fldCharType="end"/>
       </w:r>
       <w:r>
-        <w:t>. Respuesta del retorno a un shock del cobre mediante proyecciones locales (Jordà, 2005), IC 95%.</w:t>
+        <w:t xml:space="preserve">. Respuesta del retorno a un shock del cobre mediante proyecciones </w:t>
+      </w:r>
+      <w:r>
+        <w:t>locales (Jordà, 2005), IC 95%.</w:t>
       </w:r>
       <w:bookmarkEnd w:id="59"/>
     </w:p>
@@ -16492,7 +16585,7 @@
       <w:pPr>
         <w:pStyle w:val="Ttulo2"/>
       </w:pPr>
-      <w:bookmarkStart w:id="60" w:name="_Toc231100794"/>
+      <w:bookmarkStart w:id="60" w:name="_Toc231102598"/>
       <w:r>
         <w:t>4.8 Discusión integrada</w:t>
       </w:r>
@@ -16623,10 +16716,7 @@
     </w:p>
     <w:p>
       <w:r>
-        <w:t xml:space="preserve">En cambio, el grueso del aparato </w:t>
-      </w:r>
-      <w:r>
-        <w:t>econométrico **ya está ejecutado y</w:t>
+        <w:t>En cambio, el grueso del aparato econométrico **ya está ejecutado y</w:t>
       </w:r>
     </w:p>
     <w:p>
@@ -16673,7 +16763,7 @@
       <w:pPr>
         <w:pStyle w:val="Ttulo1"/>
       </w:pPr>
-      <w:bookmarkStart w:id="61" w:name="_Toc231100795"/>
+      <w:bookmarkStart w:id="61" w:name="_Toc231102599"/>
       <w:r>
         <w:lastRenderedPageBreak/>
         <w:t>Capítulo 5 — Conclusiones</w:t>
@@ -16684,7 +16774,7 @@
       <w:pPr>
         <w:pStyle w:val="Ttulo2"/>
       </w:pPr>
-      <w:bookmarkStart w:id="62" w:name="_Toc231100796"/>
+      <w:bookmarkStart w:id="62" w:name="_Toc231102600"/>
       <w:r>
         <w:t>5.1 Síntesis de los hallazgos</w:t>
       </w:r>
@@ -16851,7 +16941,7 @@
       <w:pPr>
         <w:pStyle w:val="Ttulo2"/>
       </w:pPr>
-      <w:bookmarkStart w:id="63" w:name="_Toc231100797"/>
+      <w:bookmarkStart w:id="63" w:name="_Toc231102601"/>
       <w:r>
         <w:t>5.2 Implicancias</w:t>
       </w:r>
@@ -16923,7 +17013,7 @@
       <w:pPr>
         <w:pStyle w:val="Ttulo2"/>
       </w:pPr>
-      <w:bookmarkStart w:id="64" w:name="_Toc231100798"/>
+      <w:bookmarkStart w:id="64" w:name="_Toc231102602"/>
       <w:r>
         <w:t>5.3 Limitaciones</w:t>
       </w:r>
@@ -17007,7 +17097,7 @@
       <w:pPr>
         <w:pStyle w:val="Ttulo2"/>
       </w:pPr>
-      <w:bookmarkStart w:id="65" w:name="_Toc231100799"/>
+      <w:bookmarkStart w:id="65" w:name="_Toc231102603"/>
       <w:r>
         <w:t>5.4 Líneas futuras de investigación</w:t>
       </w:r>
@@ -17063,7 +17153,7 @@
       <w:pPr>
         <w:pStyle w:val="Ttulo1"/>
       </w:pPr>
-      <w:bookmarkStart w:id="66" w:name="_Toc231100800"/>
+      <w:bookmarkStart w:id="66" w:name="_Toc231102604"/>
       <w:r>
         <w:lastRenderedPageBreak/>
         <w:t>Referencias</w:t>
@@ -17077,10 +17167,10 @@
     </w:p>
     <w:p>
       <w:r>
-        <w:t xml:space="preserve">Bai, J., &amp; Perron, P. (2003). </w:t>
-      </w:r>
-      <w:r>
-        <w:t>Computation and analysis of multiple structural change models. *Journal of Applied Econometrics*, 18(1), 1–22.</w:t>
+        <w:t xml:space="preserve">Bai, J., &amp; Perron, P. (2003). Computation and analysis of multiple structural change models. *Journal of </w:t>
+      </w:r>
+      <w:r>
+        <w:t>Applied Econometrics*, 18(1), 1–22.</w:t>
       </w:r>
     </w:p>
     <w:p>
@@ -17100,7 +17190,10 @@
     </w:p>
     <w:p>
       <w:r>
-        <w:t>Bollerslev, T. (1986). Generalized autoregressive conditional heteroskedasticity. *Journal of Econometrics*, 31(3), 307–327.</w:t>
+        <w:t xml:space="preserve">Bollerslev, T. (1986). Generalized </w:t>
+      </w:r>
+      <w:r>
+        <w:t>autoregressive conditional heteroskedasticity. *Journal of Econometrics*, 31(3), 307–327.</w:t>
       </w:r>
     </w:p>
     <w:p>
@@ -17196,10 +17289,7 @@
     </w:p>
     <w:p>
       <w:r>
-        <w:t xml:space="preserve">Johansen, S. </w:t>
-      </w:r>
-      <w:r>
-        <w:t>(1988). Statistical analysis of cointegration vectors. *Journal of Economic Dynamics and Control*, 12(2–3), 231–254.</w:t>
+        <w:t>Johansen, S. (1988). Statistical analysis of cointegration vectors. *Journal of Economic Dynamics and Control*, 12(2–3), 231–254.</w:t>
       </w:r>
     </w:p>
     <w:p>
@@ -17225,10 +17315,7 @@
     </w:p>
     <w:p>
       <w:r>
-        <w:t xml:space="preserve">Labbé, F., &amp; De </w:t>
-      </w:r>
-      <w:r>
-        <w:t>Gregorio, J. (2011). *Copper, the real exchange rate and macroeconomic fluctuations in Chile* (Working Paper N°640). Banco Central de Chile.</w:t>
+        <w:t>Labbé, F., &amp; De Gregorio, J. (2011). *Copper, the real exchange rate and macroeconomic fluctuations in Chile* (Working Paper N°640). Banco Central de Chile.</w:t>
       </w:r>
     </w:p>
     <w:p>
@@ -17238,7 +17325,10 @@
     </w:p>
     <w:p>
       <w:r>
-        <w:t>Pesaran, M. H. (2007). A simple panel unit root test in the presence of cross-section dependence. *Journal of Applied Econometrics*, 22(2), 265–312.</w:t>
+        <w:t xml:space="preserve">Pesaran, M. H. (2007). A simple </w:t>
+      </w:r>
+      <w:r>
+        <w:t>panel unit root test in the presence of cross-section dependence. *Journal of Applied Econometrics*, 22(2), 265–312.</w:t>
       </w:r>
     </w:p>
     <w:p>
@@ -17311,7 +17401,7 @@
       <w:pPr>
         <w:pStyle w:val="Ttulo1"/>
       </w:pPr>
-      <w:bookmarkStart w:id="67" w:name="_Toc231100801"/>
+      <w:bookmarkStart w:id="67" w:name="_Toc231102605"/>
       <w:r>
         <w:lastRenderedPageBreak/>
         <w:t>Anexos</w:t>
@@ -17322,7 +17412,7 @@
       <w:pPr>
         <w:pStyle w:val="Ttulo2"/>
       </w:pPr>
-      <w:bookmarkStart w:id="68" w:name="_Toc231100802"/>
+      <w:bookmarkStart w:id="68" w:name="_Toc231102606"/>
       <w:r>
         <w:t>Anexo A. Estadística descriptiva</w:t>
       </w:r>
@@ -17334,7 +17424,7 @@
         <w:spacing w:before="40" w:after="40"/>
         <w:jc w:val="center"/>
       </w:pPr>
-      <w:bookmarkStart w:id="69" w:name="_Toc231100820"/>
+      <w:bookmarkStart w:id="69" w:name="_Toc231102624"/>
       <w:r>
         <w:rPr>
           <w:i w:val="0"/>
@@ -18196,13 +18286,7 @@
               <w:rPr>
                 <w:sz w:val="20"/>
               </w:rPr>
-              <w:t xml:space="preserve">Δ </w:t>
-            </w:r>
-            <w:r>
-              <w:rPr>
-                <w:sz w:val="20"/>
-              </w:rPr>
-              <w:t>Cobre</w:t>
+              <w:t>Δ Cobre</w:t>
             </w:r>
           </w:p>
         </w:tc>
@@ -19147,7 +19231,13 @@
               <w:rPr>
                 <w:sz w:val="20"/>
               </w:rPr>
-              <w:t>Δ Tasa local</w:t>
+              <w:t xml:space="preserve">Δ Tasa </w:t>
+            </w:r>
+            <w:r>
+              <w:rPr>
+                <w:sz w:val="20"/>
+              </w:rPr>
+              <w:t>local</w:t>
             </w:r>
           </w:p>
         </w:tc>
@@ -19536,12 +19626,9 @@
       <w:pPr>
         <w:pStyle w:val="Ttulo2"/>
       </w:pPr>
-      <w:bookmarkStart w:id="70" w:name="_Toc231100803"/>
-      <w:r>
-        <w:t xml:space="preserve">Anexo B. Matriz de correlación de los </w:t>
-      </w:r>
-      <w:r>
-        <w:t>factores</w:t>
+      <w:bookmarkStart w:id="70" w:name="_Toc231102607"/>
+      <w:r>
+        <w:t>Anexo B. Matriz de correlación de los factores</w:t>
       </w:r>
       <w:bookmarkEnd w:id="70"/>
     </w:p>
@@ -19551,7 +19638,7 @@
         <w:spacing w:before="40" w:after="40"/>
         <w:jc w:val="center"/>
       </w:pPr>
-      <w:bookmarkStart w:id="71" w:name="_Toc231100821"/>
+      <w:bookmarkStart w:id="71" w:name="_Toc231102625"/>
       <w:r>
         <w:rPr>
           <w:i w:val="0"/>
@@ -19728,7 +19815,14 @@
                 <w:b/>
                 <w:sz w:val="20"/>
               </w:rPr>
-              <w:t>Δ Fed Funds</w:t>
+              <w:t xml:space="preserve">Δ Fed </w:t>
+            </w:r>
+            <w:r>
+              <w:rPr>
+                <w:b/>
+                <w:sz w:val="20"/>
+              </w:rPr>
+              <w:t>Funds</w:t>
             </w:r>
           </w:p>
         </w:tc>
@@ -20928,13 +21022,7 @@
               <w:rPr>
                 <w:sz w:val="20"/>
               </w:rPr>
-              <w:t xml:space="preserve">Δ </w:t>
-            </w:r>
-            <w:r>
-              <w:rPr>
-                <w:sz w:val="20"/>
-              </w:rPr>
-              <w:t>TC CLP</w:t>
+              <w:t>Δ TC CLP</w:t>
             </w:r>
           </w:p>
         </w:tc>
@@ -21147,7 +21235,13 @@
                 <w:sz w:val="20"/>
               </w:rPr>
               <w:lastRenderedPageBreak/>
-              <w:t>Δ Tasa local</w:t>
+              <w:t xml:space="preserve">Δ Tasa </w:t>
+            </w:r>
+            <w:r>
+              <w:rPr>
+                <w:sz w:val="20"/>
+              </w:rPr>
+              <w:t>local</w:t>
             </w:r>
           </w:p>
         </w:tc>
@@ -21585,12 +21679,9 @@
       <w:pPr>
         <w:pStyle w:val="Ttulo2"/>
       </w:pPr>
-      <w:bookmarkStart w:id="72" w:name="_Toc231100804"/>
-      <w:r>
-        <w:t xml:space="preserve">Anexo C. Pruebas de raíz </w:t>
-      </w:r>
-      <w:r>
-        <w:t>unitaria y orden de integración</w:t>
+      <w:bookmarkStart w:id="72" w:name="_Toc231102608"/>
+      <w:r>
+        <w:t>Anexo C. Pruebas de raíz unitaria y orden de integración</w:t>
       </w:r>
       <w:bookmarkEnd w:id="72"/>
     </w:p>
@@ -21600,7 +21691,7 @@
         <w:spacing w:before="40" w:after="40"/>
         <w:jc w:val="center"/>
       </w:pPr>
-      <w:bookmarkStart w:id="73" w:name="_Toc231100822"/>
+      <w:bookmarkStart w:id="73" w:name="_Toc231102626"/>
       <w:r>
         <w:rPr>
           <w:i w:val="0"/>
@@ -21725,7 +21816,14 @@
                 <w:b/>
                 <w:sz w:val="20"/>
               </w:rPr>
-              <w:t>PP (p)</w:t>
+              <w:t xml:space="preserve">PP </w:t>
+            </w:r>
+            <w:r>
+              <w:rPr>
+                <w:b/>
+                <w:sz w:val="20"/>
+              </w:rPr>
+              <w:t>(p)</w:t>
             </w:r>
           </w:p>
         </w:tc>
@@ -22428,7 +22526,7 @@
       <w:pPr>
         <w:pStyle w:val="Ttulo2"/>
       </w:pPr>
-      <w:bookmarkStart w:id="74" w:name="_Toc231100805"/>
+      <w:bookmarkStart w:id="74" w:name="_Toc231102609"/>
       <w:r>
         <w:t>Anexo D. Resultados completos del modelo de panel</w:t>
       </w:r>
@@ -22438,7 +22536,7 @@
       <w:pPr>
         <w:pStyle w:val="Ttulo3"/>
       </w:pPr>
-      <w:bookmarkStart w:id="75" w:name="_Toc231100806"/>
+      <w:bookmarkStart w:id="75" w:name="_Toc231102610"/>
       <w:r>
         <w:t>D.1 Muestra B — cobre, mercado internacional</w:t>
       </w:r>
@@ -22450,7 +22548,7 @@
         <w:spacing w:before="40" w:after="40"/>
         <w:jc w:val="center"/>
       </w:pPr>
-      <w:bookmarkStart w:id="76" w:name="_Toc231100823"/>
+      <w:bookmarkStart w:id="76" w:name="_Toc231102627"/>
       <w:r>
         <w:rPr>
           <w:i w:val="0"/>
@@ -23631,7 +23729,7 @@
       <w:pPr>
         <w:pStyle w:val="Ttulo3"/>
       </w:pPr>
-      <w:bookmarkStart w:id="77" w:name="_Toc231100807"/>
+      <w:bookmarkStart w:id="77" w:name="_Toc231102611"/>
       <w:r>
         <w:t>D.2 Muestra A — cobre, mercado chileno (Pucobre)</w:t>
       </w:r>
@@ -23643,7 +23741,7 @@
         <w:spacing w:before="40" w:after="40"/>
         <w:jc w:val="center"/>
       </w:pPr>
-      <w:bookmarkStart w:id="78" w:name="_Toc231100824"/>
+      <w:bookmarkStart w:id="78" w:name="_Toc231102628"/>
       <w:r>
         <w:rPr>
           <w:i w:val="0"/>
@@ -24818,7 +24916,7 @@
       <w:pPr>
         <w:pStyle w:val="Ttulo3"/>
       </w:pPr>
-      <w:bookmarkStart w:id="79" w:name="_Toc231100808"/>
+      <w:bookmarkStart w:id="79" w:name="_Toc231102612"/>
       <w:r>
         <w:t xml:space="preserve">D.3 </w:t>
       </w:r>
@@ -24833,7 +24931,7 @@
         <w:spacing w:before="40" w:after="40"/>
         <w:jc w:val="center"/>
       </w:pPr>
-      <w:bookmarkStart w:id="80" w:name="_Toc231100825"/>
+      <w:bookmarkStart w:id="80" w:name="_Toc231102629"/>
       <w:r>
         <w:rPr>
           <w:i w:val="0"/>
@@ -26008,7 +26106,7 @@
       <w:pPr>
         <w:pStyle w:val="Ttulo2"/>
       </w:pPr>
-      <w:bookmarkStart w:id="81" w:name="_Toc231100809"/>
+      <w:bookmarkStart w:id="81" w:name="_Toc231102613"/>
       <w:r>
         <w:lastRenderedPageBreak/>
         <w:t xml:space="preserve">Anexo E. </w:t>
@@ -26024,7 +26122,7 @@
         <w:spacing w:before="40" w:after="40"/>
         <w:jc w:val="center"/>
       </w:pPr>
-      <w:bookmarkStart w:id="82" w:name="_Toc231100826"/>
+      <w:bookmarkStart w:id="82" w:name="_Toc231102630"/>
       <w:r>
         <w:rPr>
           <w:i w:val="0"/>
@@ -26695,7 +26793,7 @@
       <w:pPr>
         <w:pStyle w:val="Ttulo2"/>
       </w:pPr>
-      <w:bookmarkStart w:id="83" w:name="_Toc231100810"/>
+      <w:bookmarkStart w:id="83" w:name="_Toc231102614"/>
       <w:r>
         <w:t xml:space="preserve">Anexo F. </w:t>
       </w:r>
@@ -26710,7 +26808,7 @@
         <w:spacing w:before="40" w:after="40"/>
         <w:jc w:val="center"/>
       </w:pPr>
-      <w:bookmarkStart w:id="84" w:name="_Toc231100827"/>
+      <w:bookmarkStart w:id="84" w:name="_Toc231102631"/>
       <w:r>
         <w:rPr>
           <w:i w:val="0"/>
@@ -27524,7 +27622,7 @@
       <w:pPr>
         <w:pStyle w:val="Ttulo2"/>
       </w:pPr>
-      <w:bookmarkStart w:id="85" w:name="_Toc231100811"/>
+      <w:bookmarkStart w:id="85" w:name="_Toc231102615"/>
       <w:r>
         <w:t>Anexo G. Fuentes de datos</w:t>
       </w:r>
@@ -27536,7 +27634,7 @@
         <w:spacing w:before="40" w:after="40"/>
         <w:jc w:val="center"/>
       </w:pPr>
-      <w:bookmarkStart w:id="86" w:name="_Toc231100828"/>
+      <w:bookmarkStart w:id="86" w:name="_Toc231102632"/>
       <w:r>
         <w:rPr>
           <w:i w:val="0"/>
@@ -28685,7 +28783,7 @@
       <w:pPr>
         <w:pStyle w:val="Ttulo2"/>
       </w:pPr>
-      <w:bookmarkStart w:id="87" w:name="_Toc231100812"/>
+      <w:bookmarkStart w:id="87" w:name="_Toc231102616"/>
       <w:r>
         <w:t>Anexo H. Disponibilidad del código</w:t>
       </w:r>
@@ -28703,7 +28801,7 @@
       <w:pPr>
         <w:pStyle w:val="Ttulo2"/>
       </w:pPr>
-      <w:bookmarkStart w:id="88" w:name="_Toc231100813"/>
+      <w:bookmarkStart w:id="88" w:name="_Toc231102617"/>
       <w:r>
         <w:t>Anexo J. Síntesis de pruebas de diagnóstico y robustez</w:t>
       </w:r>
@@ -28723,7 +28821,7 @@
         <w:spacing w:before="40" w:after="40"/>
         <w:jc w:val="center"/>
       </w:pPr>
-      <w:bookmarkStart w:id="89" w:name="_Toc231100829"/>
+      <w:bookmarkStart w:id="89" w:name="_Toc231102633"/>
       <w:r>
         <w:rPr>
           <w:i w:val="0"/>
@@ -29266,7 +29364,13 @@
               <w:rPr>
                 <w:sz w:val="20"/>
               </w:rPr>
-              <w:t>sig.: Cobre, VIX, TC CLP</w:t>
+              <w:t xml:space="preserve">sig.: Cobre, </w:t>
+            </w:r>
+            <w:r>
+              <w:rPr>
+                <w:sz w:val="20"/>
+              </w:rPr>
+              <w:t>VIX, TC CLP</w:t>
             </w:r>
           </w:p>
         </w:tc>
@@ -29764,7 +29868,7 @@
       <w:pPr>
         <w:pStyle w:val="Ttulo2"/>
       </w:pPr>
-      <w:bookmarkStart w:id="90" w:name="_Toc231100814"/>
+      <w:bookmarkStart w:id="90" w:name="_Toc231102618"/>
       <w:r>
         <w:t>Anexo I. Extensión predictiva: ¿explican o anticipan?</w:t>
       </w:r>
@@ -29790,7 +29894,7 @@
         <w:spacing w:before="40" w:after="40"/>
         <w:jc w:val="center"/>
       </w:pPr>
-      <w:bookmarkStart w:id="91" w:name="_Toc231100830"/>
+      <w:bookmarkStart w:id="91" w:name="_Toc231102634"/>
       <w:r>
         <w:rPr>
           <w:i w:val="0"/>
@@ -30358,13 +30462,7 @@
               <w:rPr>
                 <w:sz w:val="20"/>
               </w:rPr>
-              <w:t xml:space="preserve">Random </w:t>
-            </w:r>
-            <w:r>
-              <w:rPr>
-                <w:sz w:val="20"/>
-              </w:rPr>
-              <w:t>Forest</w:t>
+              <w:t>Random Forest</w:t>
             </w:r>
           </w:p>
         </w:tc>
@@ -30693,7 +30791,7 @@
       <w:pPr>
         <w:pStyle w:val="Ttulo1"/>
       </w:pPr>
-      <w:bookmarkStart w:id="92" w:name="_Toc231100815"/>
+      <w:bookmarkStart w:id="92" w:name="_Toc231102619"/>
       <w:r>
         <w:lastRenderedPageBreak/>
         <w:t>Glosario de términos econométricos</w:t>
@@ -30847,10 +30945,7 @@
     </w:p>
     <w:p>
       <w:r>
-        <w:t xml:space="preserve">tiempo, con agrupamiento de la volatilidad; típica de los retornos </w:t>
-      </w:r>
-      <w:r>
-        <w:t>financieros.</w:t>
+        <w:t>tiempo, con agrupamiento de la volatilidad; típica de los retornos financieros.</w:t>
       </w:r>
     </w:p>
     <w:p>
@@ -31327,31 +31422,31 @@
       </w:rPr>
     </w:lvl>
   </w:abstractNum>
-  <w:num w:numId="1" w16cid:durableId="1985231854">
+  <w:num w:numId="1" w16cid:durableId="1000084999">
     <w:abstractNumId w:val="8"/>
   </w:num>
-  <w:num w:numId="2" w16cid:durableId="9451805">
+  <w:num w:numId="2" w16cid:durableId="1827043909">
     <w:abstractNumId w:val="6"/>
   </w:num>
-  <w:num w:numId="3" w16cid:durableId="145166465">
+  <w:num w:numId="3" w16cid:durableId="731543181">
     <w:abstractNumId w:val="5"/>
   </w:num>
-  <w:num w:numId="4" w16cid:durableId="2128766669">
+  <w:num w:numId="4" w16cid:durableId="303706333">
     <w:abstractNumId w:val="4"/>
   </w:num>
-  <w:num w:numId="5" w16cid:durableId="1396052342">
+  <w:num w:numId="5" w16cid:durableId="1903170606">
     <w:abstractNumId w:val="7"/>
   </w:num>
-  <w:num w:numId="6" w16cid:durableId="118304252">
+  <w:num w:numId="6" w16cid:durableId="693652175">
     <w:abstractNumId w:val="3"/>
   </w:num>
-  <w:num w:numId="7" w16cid:durableId="291837062">
+  <w:num w:numId="7" w16cid:durableId="587814919">
     <w:abstractNumId w:val="2"/>
   </w:num>
-  <w:num w:numId="8" w16cid:durableId="784468769">
+  <w:num w:numId="8" w16cid:durableId="1306275135">
     <w:abstractNumId w:val="1"/>
   </w:num>
-  <w:num w:numId="9" w16cid:durableId="163054122">
+  <w:num w:numId="9" w16cid:durableId="346638664">
     <w:abstractNumId w:val="0"/>
   </w:num>
 </w:numbering>
@@ -42753,7 +42848,7 @@
     <w:autoRedefine/>
     <w:uiPriority w:val="39"/>
     <w:unhideWhenUsed/>
-    <w:rsid w:val="007D5177"/>
+    <w:rsid w:val="00A82505"/>
     <w:pPr>
       <w:spacing w:after="100"/>
     </w:pPr>
@@ -42765,7 +42860,7 @@
     <w:autoRedefine/>
     <w:uiPriority w:val="39"/>
     <w:unhideWhenUsed/>
-    <w:rsid w:val="007D5177"/>
+    <w:rsid w:val="00A82505"/>
     <w:pPr>
       <w:spacing w:after="100"/>
       <w:ind w:left="240"/>
@@ -42778,7 +42873,7 @@
     <w:autoRedefine/>
     <w:uiPriority w:val="39"/>
     <w:unhideWhenUsed/>
-    <w:rsid w:val="007D5177"/>
+    <w:rsid w:val="00A82505"/>
     <w:pPr>
       <w:spacing w:after="100"/>
       <w:ind w:left="480"/>
@@ -42789,7 +42884,7 @@
     <w:basedOn w:val="Fuentedeprrafopredeter"/>
     <w:uiPriority w:val="99"/>
     <w:unhideWhenUsed/>
-    <w:rsid w:val="007D5177"/>
+    <w:rsid w:val="00A82505"/>
     <w:rPr>
       <w:color w:val="0000FF" w:themeColor="hyperlink"/>
       <w:u w:val="single"/>
@@ -42801,7 +42896,7 @@
     <w:next w:val="Normal"/>
     <w:uiPriority w:val="99"/>
     <w:unhideWhenUsed/>
-    <w:rsid w:val="007D5177"/>
+    <w:rsid w:val="00A82505"/>
     <w:pPr>
       <w:spacing w:after="0"/>
     </w:pPr>

</xml_diff>

<commit_message>
Test de homogeneidad de pendientes (Pesaran-Yamagata 2008), validado con controles
Rechaza homogeneidad (Delta_adj=8.7): las empresas responden al cobre con sensibilidades
heterogéneas -> el coef. del panel es un efecto promedio. Integrado a §4.7, Anexo J y run_all.

Co-Authored-By: Claude Opus 4.8 <noreply@anthropic.com>
</commit_message>
<xml_diff>
--- a/outputs/Tesis_Francisco_Rietta.docx
+++ b/outputs/Tesis_Francisco_Rietta.docx
@@ -166,7 +166,7 @@
       <w:pPr>
         <w:pStyle w:val="Ttulo1"/>
       </w:pPr>
-      <w:bookmarkStart w:id="0" w:name="_Toc231102548"/>
+      <w:bookmarkStart w:id="0" w:name="_Toc231108364"/>
       <w:r>
         <w:lastRenderedPageBreak/>
         <w:t>Página de aprobación</w:t>
@@ -262,7 +262,7 @@
       <w:pPr>
         <w:pStyle w:val="Ttulo1"/>
       </w:pPr>
-      <w:bookmarkStart w:id="1" w:name="_Toc231102549"/>
+      <w:bookmarkStart w:id="1" w:name="_Toc231108365"/>
       <w:r>
         <w:lastRenderedPageBreak/>
         <w:t>Declaración de originalidad</w:t>
@@ -303,7 +303,7 @@
       <w:pPr>
         <w:pStyle w:val="Ttulo1"/>
       </w:pPr>
-      <w:bookmarkStart w:id="2" w:name="_Toc231102550"/>
+      <w:bookmarkStart w:id="2" w:name="_Toc231108366"/>
       <w:r>
         <w:lastRenderedPageBreak/>
         <w:t>Dedicatoria</w:t>
@@ -333,7 +333,7 @@
       <w:pPr>
         <w:pStyle w:val="Ttulo1"/>
       </w:pPr>
-      <w:bookmarkStart w:id="3" w:name="_Toc231102551"/>
+      <w:bookmarkStart w:id="3" w:name="_Toc231108367"/>
       <w:r>
         <w:lastRenderedPageBreak/>
         <w:t>Agradecimientos</w:t>
@@ -359,7 +359,7 @@
       <w:pPr>
         <w:pStyle w:val="Ttulo1"/>
       </w:pPr>
-      <w:bookmarkStart w:id="4" w:name="_Toc231102552"/>
+      <w:bookmarkStart w:id="4" w:name="_Toc231108368"/>
       <w:r>
         <w:lastRenderedPageBreak/>
         <w:t>Resumen</w:t>
@@ -397,7 +397,7 @@
       <w:pPr>
         <w:pStyle w:val="Ttulo1"/>
       </w:pPr>
-      <w:bookmarkStart w:id="5" w:name="_Toc231102553"/>
+      <w:bookmarkStart w:id="5" w:name="_Toc231108369"/>
       <w:r>
         <w:lastRenderedPageBreak/>
         <w:t>Abstract</w:t>
@@ -432,7 +432,7 @@
       <w:pPr>
         <w:pStyle w:val="Ttulo1"/>
       </w:pPr>
-      <w:bookmarkStart w:id="6" w:name="_Toc231102554"/>
+      <w:bookmarkStart w:id="6" w:name="_Toc231108370"/>
       <w:r>
         <w:lastRenderedPageBreak/>
         <w:t>Índice general</w:t>
@@ -464,7 +464,7 @@
       <w:r>
         <w:fldChar w:fldCharType="separate"/>
       </w:r>
-      <w:hyperlink w:anchor="_Toc231102548" w:history="1">
+      <w:hyperlink w:anchor="_Toc231108364" w:history="1">
         <w:r>
           <w:rPr>
             <w:rStyle w:val="Hipervnculo"/>
@@ -491,7 +491,7 @@
             <w:noProof/>
             <w:webHidden/>
           </w:rPr>
-          <w:instrText xml:space="preserve"> PAGEREF _Toc231102548 \h </w:instrText>
+          <w:instrText xml:space="preserve"> PAGEREF _Toc231108364 \h </w:instrText>
         </w:r>
         <w:r>
           <w:rPr>
@@ -538,7 +538,7 @@
           <w14:ligatures w14:val="standardContextual"/>
         </w:rPr>
       </w:pPr>
-      <w:hyperlink w:anchor="_Toc231102549" w:history="1">
+      <w:hyperlink w:anchor="_Toc231108365" w:history="1">
         <w:r>
           <w:rPr>
             <w:rStyle w:val="Hipervnculo"/>
@@ -565,7 +565,7 @@
             <w:noProof/>
             <w:webHidden/>
           </w:rPr>
-          <w:instrText xml:space="preserve"> PAGEREF _Toc231102549 \h </w:instrText>
+          <w:instrText xml:space="preserve"> PAGEREF _Toc231108365 \h </w:instrText>
         </w:r>
         <w:r>
           <w:rPr>
@@ -612,7 +612,7 @@
           <w14:ligatures w14:val="standardContextual"/>
         </w:rPr>
       </w:pPr>
-      <w:hyperlink w:anchor="_Toc231102550" w:history="1">
+      <w:hyperlink w:anchor="_Toc231108366" w:history="1">
         <w:r>
           <w:rPr>
             <w:rStyle w:val="Hipervnculo"/>
@@ -639,7 +639,7 @@
             <w:noProof/>
             <w:webHidden/>
           </w:rPr>
-          <w:instrText xml:space="preserve"> PAGEREF _Toc231102550 \h </w:instrText>
+          <w:instrText xml:space="preserve"> PAGEREF _Toc231108366 \h </w:instrText>
         </w:r>
         <w:r>
           <w:rPr>
@@ -686,7 +686,7 @@
           <w14:ligatures w14:val="standardContextual"/>
         </w:rPr>
       </w:pPr>
-      <w:hyperlink w:anchor="_Toc231102551" w:history="1">
+      <w:hyperlink w:anchor="_Toc231108367" w:history="1">
         <w:r>
           <w:rPr>
             <w:rStyle w:val="Hipervnculo"/>
@@ -713,7 +713,7 @@
             <w:noProof/>
             <w:webHidden/>
           </w:rPr>
-          <w:instrText xml:space="preserve"> PAGEREF _Toc231102551 \h </w:instrText>
+          <w:instrText xml:space="preserve"> PAGEREF _Toc231108367 \h </w:instrText>
         </w:r>
         <w:r>
           <w:rPr>
@@ -760,7 +760,7 @@
           <w14:ligatures w14:val="standardContextual"/>
         </w:rPr>
       </w:pPr>
-      <w:hyperlink w:anchor="_Toc231102552" w:history="1">
+      <w:hyperlink w:anchor="_Toc231108368" w:history="1">
         <w:r>
           <w:rPr>
             <w:rStyle w:val="Hipervnculo"/>
@@ -787,7 +787,7 @@
             <w:noProof/>
             <w:webHidden/>
           </w:rPr>
-          <w:instrText xml:space="preserve"> PAGEREF _Toc231102552 \h </w:instrText>
+          <w:instrText xml:space="preserve"> PAGEREF _Toc231108368 \h </w:instrText>
         </w:r>
         <w:r>
           <w:rPr>
@@ -834,7 +834,7 @@
           <w14:ligatures w14:val="standardContextual"/>
         </w:rPr>
       </w:pPr>
-      <w:hyperlink w:anchor="_Toc231102553" w:history="1">
+      <w:hyperlink w:anchor="_Toc231108369" w:history="1">
         <w:r>
           <w:rPr>
             <w:rStyle w:val="Hipervnculo"/>
@@ -861,7 +861,7 @@
             <w:noProof/>
             <w:webHidden/>
           </w:rPr>
-          <w:instrText xml:space="preserve"> PAGEREF _Toc231102553 \h </w:instrText>
+          <w:instrText xml:space="preserve"> PAGEREF _Toc231108369 \h </w:instrText>
         </w:r>
         <w:r>
           <w:rPr>
@@ -908,7 +908,7 @@
           <w14:ligatures w14:val="standardContextual"/>
         </w:rPr>
       </w:pPr>
-      <w:hyperlink w:anchor="_Toc231102554" w:history="1">
+      <w:hyperlink w:anchor="_Toc231108370" w:history="1">
         <w:r>
           <w:rPr>
             <w:rStyle w:val="Hipervnculo"/>
@@ -935,7 +935,7 @@
             <w:noProof/>
             <w:webHidden/>
           </w:rPr>
-          <w:instrText xml:space="preserve"> PAGEREF _Toc231102554 \h </w:instrText>
+          <w:instrText xml:space="preserve"> PAGEREF _Toc231108370 \h </w:instrText>
         </w:r>
         <w:r>
           <w:rPr>
@@ -982,7 +982,7 @@
           <w14:ligatures w14:val="standardContextual"/>
         </w:rPr>
       </w:pPr>
-      <w:hyperlink w:anchor="_Toc231102555" w:history="1">
+      <w:hyperlink w:anchor="_Toc231108371" w:history="1">
         <w:r>
           <w:rPr>
             <w:rStyle w:val="Hipervnculo"/>
@@ -1009,7 +1009,7 @@
             <w:noProof/>
             <w:webHidden/>
           </w:rPr>
-          <w:instrText xml:space="preserve"> PAGEREF _Toc231102555 \h </w:instrText>
+          <w:instrText xml:space="preserve"> PAGEREF _Toc231108371 \h </w:instrText>
         </w:r>
         <w:r>
           <w:rPr>
@@ -1056,7 +1056,7 @@
           <w14:ligatures w14:val="standardContextual"/>
         </w:rPr>
       </w:pPr>
-      <w:hyperlink w:anchor="_Toc231102556" w:history="1">
+      <w:hyperlink w:anchor="_Toc231108372" w:history="1">
         <w:r>
           <w:rPr>
             <w:rStyle w:val="Hipervnculo"/>
@@ -1083,7 +1083,7 @@
             <w:noProof/>
             <w:webHidden/>
           </w:rPr>
-          <w:instrText xml:space="preserve"> PAGEREF _Toc231102556 \h </w:instrText>
+          <w:instrText xml:space="preserve"> PAGEREF _Toc231108372 \h </w:instrText>
         </w:r>
         <w:r>
           <w:rPr>
@@ -1130,7 +1130,7 @@
           <w14:ligatures w14:val="standardContextual"/>
         </w:rPr>
       </w:pPr>
-      <w:hyperlink w:anchor="_Toc231102557" w:history="1">
+      <w:hyperlink w:anchor="_Toc231108373" w:history="1">
         <w:r>
           <w:rPr>
             <w:rStyle w:val="Hipervnculo"/>
@@ -1157,7 +1157,7 @@
             <w:noProof/>
             <w:webHidden/>
           </w:rPr>
-          <w:instrText xml:space="preserve"> PAGEREF _Toc231102557 \h </w:instrText>
+          <w:instrText xml:space="preserve"> PAGEREF _Toc231108373 \h </w:instrText>
         </w:r>
         <w:r>
           <w:rPr>
@@ -1204,7 +1204,7 @@
           <w14:ligatures w14:val="standardContextual"/>
         </w:rPr>
       </w:pPr>
-      <w:hyperlink w:anchor="_Toc231102558" w:history="1">
+      <w:hyperlink w:anchor="_Toc231108374" w:history="1">
         <w:r>
           <w:rPr>
             <w:rStyle w:val="Hipervnculo"/>
@@ -1231,7 +1231,7 @@
             <w:noProof/>
             <w:webHidden/>
           </w:rPr>
-          <w:instrText xml:space="preserve"> PAGEREF _Toc231102558 \h </w:instrText>
+          <w:instrText xml:space="preserve"> PAGEREF _Toc231108374 \h </w:instrText>
         </w:r>
         <w:r>
           <w:rPr>
@@ -1278,7 +1278,7 @@
           <w14:ligatures w14:val="standardContextual"/>
         </w:rPr>
       </w:pPr>
-      <w:hyperlink w:anchor="_Toc231102559" w:history="1">
+      <w:hyperlink w:anchor="_Toc231108375" w:history="1">
         <w:r>
           <w:rPr>
             <w:rStyle w:val="Hipervnculo"/>
@@ -1305,7 +1305,7 @@
             <w:noProof/>
             <w:webHidden/>
           </w:rPr>
-          <w:instrText xml:space="preserve"> PAGEREF _Toc231102559 \h </w:instrText>
+          <w:instrText xml:space="preserve"> PAGEREF _Toc231108375 \h </w:instrText>
         </w:r>
         <w:r>
           <w:rPr>
@@ -1352,7 +1352,7 @@
           <w14:ligatures w14:val="standardContextual"/>
         </w:rPr>
       </w:pPr>
-      <w:hyperlink w:anchor="_Toc231102560" w:history="1">
+      <w:hyperlink w:anchor="_Toc231108376" w:history="1">
         <w:r>
           <w:rPr>
             <w:rStyle w:val="Hipervnculo"/>
@@ -1379,7 +1379,7 @@
             <w:noProof/>
             <w:webHidden/>
           </w:rPr>
-          <w:instrText xml:space="preserve"> PAGEREF _Toc231102560 \h </w:instrText>
+          <w:instrText xml:space="preserve"> PAGEREF _Toc231108376 \h </w:instrText>
         </w:r>
         <w:r>
           <w:rPr>
@@ -1426,7 +1426,7 @@
           <w14:ligatures w14:val="standardContextual"/>
         </w:rPr>
       </w:pPr>
-      <w:hyperlink w:anchor="_Toc231102561" w:history="1">
+      <w:hyperlink w:anchor="_Toc231108377" w:history="1">
         <w:r>
           <w:rPr>
             <w:rStyle w:val="Hipervnculo"/>
@@ -1453,7 +1453,7 @@
             <w:noProof/>
             <w:webHidden/>
           </w:rPr>
-          <w:instrText xml:space="preserve"> PAGEREF _Toc231102561 \h </w:instrText>
+          <w:instrText xml:space="preserve"> PAGEREF _Toc231108377 \h </w:instrText>
         </w:r>
         <w:r>
           <w:rPr>
@@ -1500,7 +1500,7 @@
           <w14:ligatures w14:val="standardContextual"/>
         </w:rPr>
       </w:pPr>
-      <w:hyperlink w:anchor="_Toc231102562" w:history="1">
+      <w:hyperlink w:anchor="_Toc231108378" w:history="1">
         <w:r>
           <w:rPr>
             <w:rStyle w:val="Hipervnculo"/>
@@ -1527,7 +1527,7 @@
             <w:noProof/>
             <w:webHidden/>
           </w:rPr>
-          <w:instrText xml:space="preserve"> PAGEREF _Toc231102562 \h </w:instrText>
+          <w:instrText xml:space="preserve"> PAGEREF _Toc231108378 \h </w:instrText>
         </w:r>
         <w:r>
           <w:rPr>
@@ -1574,7 +1574,7 @@
           <w14:ligatures w14:val="standardContextual"/>
         </w:rPr>
       </w:pPr>
-      <w:hyperlink w:anchor="_Toc231102563" w:history="1">
+      <w:hyperlink w:anchor="_Toc231108379" w:history="1">
         <w:r>
           <w:rPr>
             <w:rStyle w:val="Hipervnculo"/>
@@ -1601,7 +1601,7 @@
             <w:noProof/>
             <w:webHidden/>
           </w:rPr>
-          <w:instrText xml:space="preserve"> PAGEREF _Toc231102563 \h </w:instrText>
+          <w:instrText xml:space="preserve"> PAGEREF _Toc231108379 \h </w:instrText>
         </w:r>
         <w:r>
           <w:rPr>
@@ -1648,7 +1648,7 @@
           <w14:ligatures w14:val="standardContextual"/>
         </w:rPr>
       </w:pPr>
-      <w:hyperlink w:anchor="_Toc231102564" w:history="1">
+      <w:hyperlink w:anchor="_Toc231108380" w:history="1">
         <w:r>
           <w:rPr>
             <w:rStyle w:val="Hipervnculo"/>
@@ -1675,7 +1675,7 @@
             <w:noProof/>
             <w:webHidden/>
           </w:rPr>
-          <w:instrText xml:space="preserve"> PAGEREF _Toc231102564 \h </w:instrText>
+          <w:instrText xml:space="preserve"> PAGEREF _Toc231108380 \h </w:instrText>
         </w:r>
         <w:r>
           <w:rPr>
@@ -1722,7 +1722,7 @@
           <w14:ligatures w14:val="standardContextual"/>
         </w:rPr>
       </w:pPr>
-      <w:hyperlink w:anchor="_Toc231102565" w:history="1">
+      <w:hyperlink w:anchor="_Toc231108381" w:history="1">
         <w:r>
           <w:rPr>
             <w:rStyle w:val="Hipervnculo"/>
@@ -1749,7 +1749,7 @@
             <w:noProof/>
             <w:webHidden/>
           </w:rPr>
-          <w:instrText xml:space="preserve"> PAGEREF _Toc231102565 \h </w:instrText>
+          <w:instrText xml:space="preserve"> PAGEREF _Toc231108381 \h </w:instrText>
         </w:r>
         <w:r>
           <w:rPr>
@@ -1796,7 +1796,7 @@
           <w14:ligatures w14:val="standardContextual"/>
         </w:rPr>
       </w:pPr>
-      <w:hyperlink w:anchor="_Toc231102566" w:history="1">
+      <w:hyperlink w:anchor="_Toc231108382" w:history="1">
         <w:r>
           <w:rPr>
             <w:rStyle w:val="Hipervnculo"/>
@@ -1823,7 +1823,7 @@
             <w:noProof/>
             <w:webHidden/>
           </w:rPr>
-          <w:instrText xml:space="preserve"> PAGEREF _Toc231102566 \h </w:instrText>
+          <w:instrText xml:space="preserve"> PAGEREF _Toc231108382 \h </w:instrText>
         </w:r>
         <w:r>
           <w:rPr>
@@ -1870,7 +1870,7 @@
           <w14:ligatures w14:val="standardContextual"/>
         </w:rPr>
       </w:pPr>
-      <w:hyperlink w:anchor="_Toc231102567" w:history="1">
+      <w:hyperlink w:anchor="_Toc231108383" w:history="1">
         <w:r>
           <w:rPr>
             <w:rStyle w:val="Hipervnculo"/>
@@ -1897,7 +1897,7 @@
             <w:noProof/>
             <w:webHidden/>
           </w:rPr>
-          <w:instrText xml:space="preserve"> PAGEREF _Toc231102567 \h </w:instrText>
+          <w:instrText xml:space="preserve"> PAGEREF _Toc231108383 \h </w:instrText>
         </w:r>
         <w:r>
           <w:rPr>
@@ -1944,7 +1944,7 @@
           <w14:ligatures w14:val="standardContextual"/>
         </w:rPr>
       </w:pPr>
-      <w:hyperlink w:anchor="_Toc231102568" w:history="1">
+      <w:hyperlink w:anchor="_Toc231108384" w:history="1">
         <w:r>
           <w:rPr>
             <w:rStyle w:val="Hipervnculo"/>
@@ -1971,7 +1971,7 @@
             <w:noProof/>
             <w:webHidden/>
           </w:rPr>
-          <w:instrText xml:space="preserve"> PAGEREF _Toc231102568 \h </w:instrText>
+          <w:instrText xml:space="preserve"> PAGEREF _Toc231108384 \h </w:instrText>
         </w:r>
         <w:r>
           <w:rPr>
@@ -2018,7 +2018,7 @@
           <w14:ligatures w14:val="standardContextual"/>
         </w:rPr>
       </w:pPr>
-      <w:hyperlink w:anchor="_Toc231102569" w:history="1">
+      <w:hyperlink w:anchor="_Toc231108385" w:history="1">
         <w:r>
           <w:rPr>
             <w:rStyle w:val="Hipervnculo"/>
@@ -2045,7 +2045,7 @@
             <w:noProof/>
             <w:webHidden/>
           </w:rPr>
-          <w:instrText xml:space="preserve"> PAGEREF _Toc231102569 \h </w:instrText>
+          <w:instrText xml:space="preserve"> PAGEREF _Toc231108385 \h </w:instrText>
         </w:r>
         <w:r>
           <w:rPr>
@@ -2092,7 +2092,7 @@
           <w14:ligatures w14:val="standardContextual"/>
         </w:rPr>
       </w:pPr>
-      <w:hyperlink w:anchor="_Toc231102570" w:history="1">
+      <w:hyperlink w:anchor="_Toc231108386" w:history="1">
         <w:r>
           <w:rPr>
             <w:rStyle w:val="Hipervnculo"/>
@@ -2119,7 +2119,7 @@
             <w:noProof/>
             <w:webHidden/>
           </w:rPr>
-          <w:instrText xml:space="preserve"> PAGEREF _Toc231102570 \h </w:instrText>
+          <w:instrText xml:space="preserve"> PAGEREF _Toc231108386 \h </w:instrText>
         </w:r>
         <w:r>
           <w:rPr>
@@ -2166,7 +2166,7 @@
           <w14:ligatures w14:val="standardContextual"/>
         </w:rPr>
       </w:pPr>
-      <w:hyperlink w:anchor="_Toc231102571" w:history="1">
+      <w:hyperlink w:anchor="_Toc231108387" w:history="1">
         <w:r>
           <w:rPr>
             <w:rStyle w:val="Hipervnculo"/>
@@ -2193,7 +2193,7 @@
             <w:noProof/>
             <w:webHidden/>
           </w:rPr>
-          <w:instrText xml:space="preserve"> PAGEREF _Toc231102571 \h </w:instrText>
+          <w:instrText xml:space="preserve"> PAGEREF _Toc231108387 \h </w:instrText>
         </w:r>
         <w:r>
           <w:rPr>
@@ -2240,7 +2240,7 @@
           <w14:ligatures w14:val="standardContextual"/>
         </w:rPr>
       </w:pPr>
-      <w:hyperlink w:anchor="_Toc231102572" w:history="1">
+      <w:hyperlink w:anchor="_Toc231108388" w:history="1">
         <w:r>
           <w:rPr>
             <w:rStyle w:val="Hipervnculo"/>
@@ -2267,7 +2267,7 @@
             <w:noProof/>
             <w:webHidden/>
           </w:rPr>
-          <w:instrText xml:space="preserve"> PAGEREF _Toc231102572 \h </w:instrText>
+          <w:instrText xml:space="preserve"> PAGEREF _Toc231108388 \h </w:instrText>
         </w:r>
         <w:r>
           <w:rPr>
@@ -2314,7 +2314,7 @@
           <w14:ligatures w14:val="standardContextual"/>
         </w:rPr>
       </w:pPr>
-      <w:hyperlink w:anchor="_Toc231102573" w:history="1">
+      <w:hyperlink w:anchor="_Toc231108389" w:history="1">
         <w:r>
           <w:rPr>
             <w:rStyle w:val="Hipervnculo"/>
@@ -2341,7 +2341,7 @@
             <w:noProof/>
             <w:webHidden/>
           </w:rPr>
-          <w:instrText xml:space="preserve"> PAGEREF _Toc231102573 \h </w:instrText>
+          <w:instrText xml:space="preserve"> PAGEREF _Toc231108389 \h </w:instrText>
         </w:r>
         <w:r>
           <w:rPr>
@@ -2388,7 +2388,7 @@
           <w14:ligatures w14:val="standardContextual"/>
         </w:rPr>
       </w:pPr>
-      <w:hyperlink w:anchor="_Toc231102574" w:history="1">
+      <w:hyperlink w:anchor="_Toc231108390" w:history="1">
         <w:r>
           <w:rPr>
             <w:rStyle w:val="Hipervnculo"/>
@@ -2415,7 +2415,7 @@
             <w:noProof/>
             <w:webHidden/>
           </w:rPr>
-          <w:instrText xml:space="preserve"> PAGEREF _Toc231102574 \h </w:instrText>
+          <w:instrText xml:space="preserve"> PAGEREF _Toc231108390 \h </w:instrText>
         </w:r>
         <w:r>
           <w:rPr>
@@ -2462,7 +2462,7 @@
           <w14:ligatures w14:val="standardContextual"/>
         </w:rPr>
       </w:pPr>
-      <w:hyperlink w:anchor="_Toc231102575" w:history="1">
+      <w:hyperlink w:anchor="_Toc231108391" w:history="1">
         <w:r>
           <w:rPr>
             <w:rStyle w:val="Hipervnculo"/>
@@ -2489,7 +2489,7 @@
             <w:noProof/>
             <w:webHidden/>
           </w:rPr>
-          <w:instrText xml:space="preserve"> PAGEREF _Toc231102575 \h </w:instrText>
+          <w:instrText xml:space="preserve"> PAGEREF _Toc231108391 \h </w:instrText>
         </w:r>
         <w:r>
           <w:rPr>
@@ -2536,7 +2536,7 @@
           <w14:ligatures w14:val="standardContextual"/>
         </w:rPr>
       </w:pPr>
-      <w:hyperlink w:anchor="_Toc231102576" w:history="1">
+      <w:hyperlink w:anchor="_Toc231108392" w:history="1">
         <w:r>
           <w:rPr>
             <w:rStyle w:val="Hipervnculo"/>
@@ -2563,7 +2563,7 @@
             <w:noProof/>
             <w:webHidden/>
           </w:rPr>
-          <w:instrText xml:space="preserve"> PAGEREF _Toc231102576 \h </w:instrText>
+          <w:instrText xml:space="preserve"> PAGEREF _Toc231108392 \h </w:instrText>
         </w:r>
         <w:r>
           <w:rPr>
@@ -2610,7 +2610,7 @@
           <w14:ligatures w14:val="standardContextual"/>
         </w:rPr>
       </w:pPr>
-      <w:hyperlink w:anchor="_Toc231102577" w:history="1">
+      <w:hyperlink w:anchor="_Toc231108393" w:history="1">
         <w:r>
           <w:rPr>
             <w:rStyle w:val="Hipervnculo"/>
@@ -2637,7 +2637,7 @@
             <w:noProof/>
             <w:webHidden/>
           </w:rPr>
-          <w:instrText xml:space="preserve"> PAGEREF _Toc231102577 \h </w:instrText>
+          <w:instrText xml:space="preserve"> PAGEREF _Toc231108393 \h </w:instrText>
         </w:r>
         <w:r>
           <w:rPr>
@@ -2684,7 +2684,7 @@
           <w14:ligatures w14:val="standardContextual"/>
         </w:rPr>
       </w:pPr>
-      <w:hyperlink w:anchor="_Toc231102578" w:history="1">
+      <w:hyperlink w:anchor="_Toc231108394" w:history="1">
         <w:r>
           <w:rPr>
             <w:rStyle w:val="Hipervnculo"/>
@@ -2711,7 +2711,7 @@
             <w:noProof/>
             <w:webHidden/>
           </w:rPr>
-          <w:instrText xml:space="preserve"> PAGEREF _Toc231102578 \h </w:instrText>
+          <w:instrText xml:space="preserve"> PAGEREF _Toc231108394 \h </w:instrText>
         </w:r>
         <w:r>
           <w:rPr>
@@ -2758,7 +2758,7 @@
           <w14:ligatures w14:val="standardContextual"/>
         </w:rPr>
       </w:pPr>
-      <w:hyperlink w:anchor="_Toc231102579" w:history="1">
+      <w:hyperlink w:anchor="_Toc231108395" w:history="1">
         <w:r>
           <w:rPr>
             <w:rStyle w:val="Hipervnculo"/>
@@ -2785,7 +2785,7 @@
             <w:noProof/>
             <w:webHidden/>
           </w:rPr>
-          <w:instrText xml:space="preserve"> PAGEREF _Toc231102579 \h </w:instrText>
+          <w:instrText xml:space="preserve"> PAGEREF _Toc231108395 \h </w:instrText>
         </w:r>
         <w:r>
           <w:rPr>
@@ -2832,7 +2832,7 @@
           <w14:ligatures w14:val="standardContextual"/>
         </w:rPr>
       </w:pPr>
-      <w:hyperlink w:anchor="_Toc231102580" w:history="1">
+      <w:hyperlink w:anchor="_Toc231108396" w:history="1">
         <w:r>
           <w:rPr>
             <w:rStyle w:val="Hipervnculo"/>
@@ -2859,7 +2859,7 @@
             <w:noProof/>
             <w:webHidden/>
           </w:rPr>
-          <w:instrText xml:space="preserve"> PAGEREF _Toc231102580 \h </w:instrText>
+          <w:instrText xml:space="preserve"> PAGEREF _Toc231108396 \h </w:instrText>
         </w:r>
         <w:r>
           <w:rPr>
@@ -2906,7 +2906,7 @@
           <w14:ligatures w14:val="standardContextual"/>
         </w:rPr>
       </w:pPr>
-      <w:hyperlink w:anchor="_Toc231102581" w:history="1">
+      <w:hyperlink w:anchor="_Toc231108397" w:history="1">
         <w:r>
           <w:rPr>
             <w:rStyle w:val="Hipervnculo"/>
@@ -2933,7 +2933,7 @@
             <w:noProof/>
             <w:webHidden/>
           </w:rPr>
-          <w:instrText xml:space="preserve"> PAGEREF _Toc231102581 \h </w:instrText>
+          <w:instrText xml:space="preserve"> PAGEREF _Toc231108397 \h </w:instrText>
         </w:r>
         <w:r>
           <w:rPr>
@@ -2980,7 +2980,7 @@
           <w14:ligatures w14:val="standardContextual"/>
         </w:rPr>
       </w:pPr>
-      <w:hyperlink w:anchor="_Toc231102582" w:history="1">
+      <w:hyperlink w:anchor="_Toc231108398" w:history="1">
         <w:r>
           <w:rPr>
             <w:rStyle w:val="Hipervnculo"/>
@@ -3007,7 +3007,7 @@
             <w:noProof/>
             <w:webHidden/>
           </w:rPr>
-          <w:instrText xml:space="preserve"> PAGEREF _Toc231102582 \h </w:instrText>
+          <w:instrText xml:space="preserve"> PAGEREF _Toc231108398 \h </w:instrText>
         </w:r>
         <w:r>
           <w:rPr>
@@ -3054,7 +3054,7 @@
           <w14:ligatures w14:val="standardContextual"/>
         </w:rPr>
       </w:pPr>
-      <w:hyperlink w:anchor="_Toc231102583" w:history="1">
+      <w:hyperlink w:anchor="_Toc231108399" w:history="1">
         <w:r>
           <w:rPr>
             <w:rStyle w:val="Hipervnculo"/>
@@ -3081,7 +3081,7 @@
             <w:noProof/>
             <w:webHidden/>
           </w:rPr>
-          <w:instrText xml:space="preserve"> PAGEREF _Toc231102583 \h </w:instrText>
+          <w:instrText xml:space="preserve"> PAGEREF _Toc231108399 \h </w:instrText>
         </w:r>
         <w:r>
           <w:rPr>
@@ -3128,7 +3128,7 @@
           <w14:ligatures w14:val="standardContextual"/>
         </w:rPr>
       </w:pPr>
-      <w:hyperlink w:anchor="_Toc231102584" w:history="1">
+      <w:hyperlink w:anchor="_Toc231108400" w:history="1">
         <w:r>
           <w:rPr>
             <w:rStyle w:val="Hipervnculo"/>
@@ -3155,7 +3155,7 @@
             <w:noProof/>
             <w:webHidden/>
           </w:rPr>
-          <w:instrText xml:space="preserve"> PAGEREF _Toc231102584 \h </w:instrText>
+          <w:instrText xml:space="preserve"> PAGEREF _Toc231108400 \h </w:instrText>
         </w:r>
         <w:r>
           <w:rPr>
@@ -3202,7 +3202,7 @@
           <w14:ligatures w14:val="standardContextual"/>
         </w:rPr>
       </w:pPr>
-      <w:hyperlink w:anchor="_Toc231102585" w:history="1">
+      <w:hyperlink w:anchor="_Toc231108401" w:history="1">
         <w:r>
           <w:rPr>
             <w:rStyle w:val="Hipervnculo"/>
@@ -3229,7 +3229,7 @@
             <w:noProof/>
             <w:webHidden/>
           </w:rPr>
-          <w:instrText xml:space="preserve"> PAGEREF _Toc231102585 \h </w:instrText>
+          <w:instrText xml:space="preserve"> PAGEREF _Toc231108401 \h </w:instrText>
         </w:r>
         <w:r>
           <w:rPr>
@@ -3276,7 +3276,7 @@
           <w14:ligatures w14:val="standardContextual"/>
         </w:rPr>
       </w:pPr>
-      <w:hyperlink w:anchor="_Toc231102586" w:history="1">
+      <w:hyperlink w:anchor="_Toc231108402" w:history="1">
         <w:r>
           <w:rPr>
             <w:rStyle w:val="Hipervnculo"/>
@@ -3303,7 +3303,7 @@
             <w:noProof/>
             <w:webHidden/>
           </w:rPr>
-          <w:instrText xml:space="preserve"> PAGEREF _Toc231102586 \h </w:instrText>
+          <w:instrText xml:space="preserve"> PAGEREF _Toc231108402 \h </w:instrText>
         </w:r>
         <w:r>
           <w:rPr>
@@ -3350,7 +3350,7 @@
           <w14:ligatures w14:val="standardContextual"/>
         </w:rPr>
       </w:pPr>
-      <w:hyperlink w:anchor="_Toc231102587" w:history="1">
+      <w:hyperlink w:anchor="_Toc231108403" w:history="1">
         <w:r>
           <w:rPr>
             <w:rStyle w:val="Hipervnculo"/>
@@ -3377,7 +3377,7 @@
             <w:noProof/>
             <w:webHidden/>
           </w:rPr>
-          <w:instrText xml:space="preserve"> PAGEREF _Toc231102587 \h </w:instrText>
+          <w:instrText xml:space="preserve"> PAGEREF _Toc231108403 \h </w:instrText>
         </w:r>
         <w:r>
           <w:rPr>
@@ -3424,7 +3424,7 @@
           <w14:ligatures w14:val="standardContextual"/>
         </w:rPr>
       </w:pPr>
-      <w:hyperlink w:anchor="_Toc231102588" w:history="1">
+      <w:hyperlink w:anchor="_Toc231108404" w:history="1">
         <w:r>
           <w:rPr>
             <w:rStyle w:val="Hipervnculo"/>
@@ -3451,7 +3451,7 @@
             <w:noProof/>
             <w:webHidden/>
           </w:rPr>
-          <w:instrText xml:space="preserve"> PAGEREF _Toc231102588 \h </w:instrText>
+          <w:instrText xml:space="preserve"> PAGEREF _Toc231108404 \h </w:instrText>
         </w:r>
         <w:r>
           <w:rPr>
@@ -3498,7 +3498,7 @@
           <w14:ligatures w14:val="standardContextual"/>
         </w:rPr>
       </w:pPr>
-      <w:hyperlink w:anchor="_Toc231102589" w:history="1">
+      <w:hyperlink w:anchor="_Toc231108405" w:history="1">
         <w:r>
           <w:rPr>
             <w:rStyle w:val="Hipervnculo"/>
@@ -3525,7 +3525,7 @@
             <w:noProof/>
             <w:webHidden/>
           </w:rPr>
-          <w:instrText xml:space="preserve"> PAGEREF _Toc231102589 \h </w:instrText>
+          <w:instrText xml:space="preserve"> PAGEREF _Toc231108405 \h </w:instrText>
         </w:r>
         <w:r>
           <w:rPr>
@@ -3572,7 +3572,7 @@
           <w14:ligatures w14:val="standardContextual"/>
         </w:rPr>
       </w:pPr>
-      <w:hyperlink w:anchor="_Toc231102590" w:history="1">
+      <w:hyperlink w:anchor="_Toc231108406" w:history="1">
         <w:r>
           <w:rPr>
             <w:rStyle w:val="Hipervnculo"/>
@@ -3599,7 +3599,7 @@
             <w:noProof/>
             <w:webHidden/>
           </w:rPr>
-          <w:instrText xml:space="preserve"> PAGEREF _Toc231102590 \h </w:instrText>
+          <w:instrText xml:space="preserve"> PAGEREF _Toc231108406 \h </w:instrText>
         </w:r>
         <w:r>
           <w:rPr>
@@ -3646,7 +3646,7 @@
           <w14:ligatures w14:val="standardContextual"/>
         </w:rPr>
       </w:pPr>
-      <w:hyperlink w:anchor="_Toc231102591" w:history="1">
+      <w:hyperlink w:anchor="_Toc231108407" w:history="1">
         <w:r>
           <w:rPr>
             <w:rStyle w:val="Hipervnculo"/>
@@ -3673,7 +3673,7 @@
             <w:noProof/>
             <w:webHidden/>
           </w:rPr>
-          <w:instrText xml:space="preserve"> PAGEREF _Toc231102591 \h </w:instrText>
+          <w:instrText xml:space="preserve"> PAGEREF _Toc231108407 \h </w:instrText>
         </w:r>
         <w:r>
           <w:rPr>
@@ -3720,7 +3720,7 @@
           <w14:ligatures w14:val="standardContextual"/>
         </w:rPr>
       </w:pPr>
-      <w:hyperlink w:anchor="_Toc231102592" w:history="1">
+      <w:hyperlink w:anchor="_Toc231108408" w:history="1">
         <w:r>
           <w:rPr>
             <w:rStyle w:val="Hipervnculo"/>
@@ -3747,7 +3747,7 @@
             <w:noProof/>
             <w:webHidden/>
           </w:rPr>
-          <w:instrText xml:space="preserve"> PAGEREF _Toc231102592 \h </w:instrText>
+          <w:instrText xml:space="preserve"> PAGEREF _Toc231108408 \h </w:instrText>
         </w:r>
         <w:r>
           <w:rPr>
@@ -3794,7 +3794,7 @@
           <w14:ligatures w14:val="standardContextual"/>
         </w:rPr>
       </w:pPr>
-      <w:hyperlink w:anchor="_Toc231102593" w:history="1">
+      <w:hyperlink w:anchor="_Toc231108409" w:history="1">
         <w:r>
           <w:rPr>
             <w:rStyle w:val="Hipervnculo"/>
@@ -3821,7 +3821,7 @@
             <w:noProof/>
             <w:webHidden/>
           </w:rPr>
-          <w:instrText xml:space="preserve"> PAGEREF _Toc231102593 \h </w:instrText>
+          <w:instrText xml:space="preserve"> PAGEREF _Toc231108409 \h </w:instrText>
         </w:r>
         <w:r>
           <w:rPr>
@@ -3868,7 +3868,7 @@
           <w14:ligatures w14:val="standardContextual"/>
         </w:rPr>
       </w:pPr>
-      <w:hyperlink w:anchor="_Toc231102594" w:history="1">
+      <w:hyperlink w:anchor="_Toc231108410" w:history="1">
         <w:r>
           <w:rPr>
             <w:rStyle w:val="Hipervnculo"/>
@@ -3895,7 +3895,7 @@
             <w:noProof/>
             <w:webHidden/>
           </w:rPr>
-          <w:instrText xml:space="preserve"> PAGEREF _Toc231102594 \h </w:instrText>
+          <w:instrText xml:space="preserve"> PAGEREF _Toc231108410 \h </w:instrText>
         </w:r>
         <w:r>
           <w:rPr>
@@ -3942,7 +3942,7 @@
           <w14:ligatures w14:val="standardContextual"/>
         </w:rPr>
       </w:pPr>
-      <w:hyperlink w:anchor="_Toc231102595" w:history="1">
+      <w:hyperlink w:anchor="_Toc231108411" w:history="1">
         <w:r>
           <w:rPr>
             <w:rStyle w:val="Hipervnculo"/>
@@ -3969,7 +3969,7 @@
             <w:noProof/>
             <w:webHidden/>
           </w:rPr>
-          <w:instrText xml:space="preserve"> PAGEREF _Toc231102595 \h </w:instrText>
+          <w:instrText xml:space="preserve"> PAGEREF _Toc231108411 \h </w:instrText>
         </w:r>
         <w:r>
           <w:rPr>
@@ -4016,7 +4016,7 @@
           <w14:ligatures w14:val="standardContextual"/>
         </w:rPr>
       </w:pPr>
-      <w:hyperlink w:anchor="_Toc231102596" w:history="1">
+      <w:hyperlink w:anchor="_Toc231108412" w:history="1">
         <w:r>
           <w:rPr>
             <w:rStyle w:val="Hipervnculo"/>
@@ -4043,7 +4043,7 @@
             <w:noProof/>
             <w:webHidden/>
           </w:rPr>
-          <w:instrText xml:space="preserve"> PAGEREF _Toc231102596 \h </w:instrText>
+          <w:instrText xml:space="preserve"> PAGEREF _Toc231108412 \h </w:instrText>
         </w:r>
         <w:r>
           <w:rPr>
@@ -4090,7 +4090,7 @@
           <w14:ligatures w14:val="standardContextual"/>
         </w:rPr>
       </w:pPr>
-      <w:hyperlink w:anchor="_Toc231102597" w:history="1">
+      <w:hyperlink w:anchor="_Toc231108413" w:history="1">
         <w:r>
           <w:rPr>
             <w:rStyle w:val="Hipervnculo"/>
@@ -4117,7 +4117,7 @@
             <w:noProof/>
             <w:webHidden/>
           </w:rPr>
-          <w:instrText xml:space="preserve"> PAGEREF _Toc231102597 \h </w:instrText>
+          <w:instrText xml:space="preserve"> PAGEREF _Toc231108413 \h </w:instrText>
         </w:r>
         <w:r>
           <w:rPr>
@@ -4164,7 +4164,7 @@
           <w14:ligatures w14:val="standardContextual"/>
         </w:rPr>
       </w:pPr>
-      <w:hyperlink w:anchor="_Toc231102598" w:history="1">
+      <w:hyperlink w:anchor="_Toc231108414" w:history="1">
         <w:r>
           <w:rPr>
             <w:rStyle w:val="Hipervnculo"/>
@@ -4191,7 +4191,7 @@
             <w:noProof/>
             <w:webHidden/>
           </w:rPr>
-          <w:instrText xml:space="preserve"> PAGEREF _Toc231102598 \h </w:instrText>
+          <w:instrText xml:space="preserve"> PAGEREF _Toc231108414 \h </w:instrText>
         </w:r>
         <w:r>
           <w:rPr>
@@ -4238,7 +4238,7 @@
           <w14:ligatures w14:val="standardContextual"/>
         </w:rPr>
       </w:pPr>
-      <w:hyperlink w:anchor="_Toc231102599" w:history="1">
+      <w:hyperlink w:anchor="_Toc231108415" w:history="1">
         <w:r>
           <w:rPr>
             <w:rStyle w:val="Hipervnculo"/>
@@ -4265,7 +4265,7 @@
             <w:noProof/>
             <w:webHidden/>
           </w:rPr>
-          <w:instrText xml:space="preserve"> PAGEREF _Toc231102599 \h </w:instrText>
+          <w:instrText xml:space="preserve"> PAGEREF _Toc231108415 \h </w:instrText>
         </w:r>
         <w:r>
           <w:rPr>
@@ -4312,7 +4312,7 @@
           <w14:ligatures w14:val="standardContextual"/>
         </w:rPr>
       </w:pPr>
-      <w:hyperlink w:anchor="_Toc231102600" w:history="1">
+      <w:hyperlink w:anchor="_Toc231108416" w:history="1">
         <w:r>
           <w:rPr>
             <w:rStyle w:val="Hipervnculo"/>
@@ -4339,7 +4339,7 @@
             <w:noProof/>
             <w:webHidden/>
           </w:rPr>
-          <w:instrText xml:space="preserve"> PAGEREF _Toc231102600 \h </w:instrText>
+          <w:instrText xml:space="preserve"> PAGEREF _Toc231108416 \h </w:instrText>
         </w:r>
         <w:r>
           <w:rPr>
@@ -4386,7 +4386,7 @@
           <w14:ligatures w14:val="standardContextual"/>
         </w:rPr>
       </w:pPr>
-      <w:hyperlink w:anchor="_Toc231102601" w:history="1">
+      <w:hyperlink w:anchor="_Toc231108417" w:history="1">
         <w:r>
           <w:rPr>
             <w:rStyle w:val="Hipervnculo"/>
@@ -4413,7 +4413,7 @@
             <w:noProof/>
             <w:webHidden/>
           </w:rPr>
-          <w:instrText xml:space="preserve"> PAGEREF _Toc231102601 \h </w:instrText>
+          <w:instrText xml:space="preserve"> PAGEREF _Toc231108417 \h </w:instrText>
         </w:r>
         <w:r>
           <w:rPr>
@@ -4460,7 +4460,7 @@
           <w14:ligatures w14:val="standardContextual"/>
         </w:rPr>
       </w:pPr>
-      <w:hyperlink w:anchor="_Toc231102602" w:history="1">
+      <w:hyperlink w:anchor="_Toc231108418" w:history="1">
         <w:r>
           <w:rPr>
             <w:rStyle w:val="Hipervnculo"/>
@@ -4487,7 +4487,7 @@
             <w:noProof/>
             <w:webHidden/>
           </w:rPr>
-          <w:instrText xml:space="preserve"> PAGEREF _Toc231102602 \h </w:instrText>
+          <w:instrText xml:space="preserve"> PAGEREF _Toc231108418 \h </w:instrText>
         </w:r>
         <w:r>
           <w:rPr>
@@ -4534,7 +4534,7 @@
           <w14:ligatures w14:val="standardContextual"/>
         </w:rPr>
       </w:pPr>
-      <w:hyperlink w:anchor="_Toc231102603" w:history="1">
+      <w:hyperlink w:anchor="_Toc231108419" w:history="1">
         <w:r>
           <w:rPr>
             <w:rStyle w:val="Hipervnculo"/>
@@ -4561,7 +4561,7 @@
             <w:noProof/>
             <w:webHidden/>
           </w:rPr>
-          <w:instrText xml:space="preserve"> PAGEREF _Toc231102603 \h </w:instrText>
+          <w:instrText xml:space="preserve"> PAGEREF _Toc231108419 \h </w:instrText>
         </w:r>
         <w:r>
           <w:rPr>
@@ -4608,7 +4608,7 @@
           <w14:ligatures w14:val="standardContextual"/>
         </w:rPr>
       </w:pPr>
-      <w:hyperlink w:anchor="_Toc231102604" w:history="1">
+      <w:hyperlink w:anchor="_Toc231108420" w:history="1">
         <w:r>
           <w:rPr>
             <w:rStyle w:val="Hipervnculo"/>
@@ -4635,7 +4635,7 @@
             <w:noProof/>
             <w:webHidden/>
           </w:rPr>
-          <w:instrText xml:space="preserve"> PAGEREF _Toc231102604 \h </w:instrText>
+          <w:instrText xml:space="preserve"> PAGEREF _Toc231108420 \h </w:instrText>
         </w:r>
         <w:r>
           <w:rPr>
@@ -4682,7 +4682,7 @@
           <w14:ligatures w14:val="standardContextual"/>
         </w:rPr>
       </w:pPr>
-      <w:hyperlink w:anchor="_Toc231102605" w:history="1">
+      <w:hyperlink w:anchor="_Toc231108421" w:history="1">
         <w:r>
           <w:rPr>
             <w:rStyle w:val="Hipervnculo"/>
@@ -4709,7 +4709,7 @@
             <w:noProof/>
             <w:webHidden/>
           </w:rPr>
-          <w:instrText xml:space="preserve"> PAGEREF _Toc231102605 \h </w:instrText>
+          <w:instrText xml:space="preserve"> PAGEREF _Toc231108421 \h </w:instrText>
         </w:r>
         <w:r>
           <w:rPr>
@@ -4756,7 +4756,7 @@
           <w14:ligatures w14:val="standardContextual"/>
         </w:rPr>
       </w:pPr>
-      <w:hyperlink w:anchor="_Toc231102606" w:history="1">
+      <w:hyperlink w:anchor="_Toc231108422" w:history="1">
         <w:r>
           <w:rPr>
             <w:rStyle w:val="Hipervnculo"/>
@@ -4783,7 +4783,7 @@
             <w:noProof/>
             <w:webHidden/>
           </w:rPr>
-          <w:instrText xml:space="preserve"> PAGEREF _Toc231102606 \h </w:instrText>
+          <w:instrText xml:space="preserve"> PAGEREF _Toc231108422 \h </w:instrText>
         </w:r>
         <w:r>
           <w:rPr>
@@ -4830,7 +4830,7 @@
           <w14:ligatures w14:val="standardContextual"/>
         </w:rPr>
       </w:pPr>
-      <w:hyperlink w:anchor="_Toc231102607" w:history="1">
+      <w:hyperlink w:anchor="_Toc231108423" w:history="1">
         <w:r>
           <w:rPr>
             <w:rStyle w:val="Hipervnculo"/>
@@ -4857,7 +4857,7 @@
             <w:noProof/>
             <w:webHidden/>
           </w:rPr>
-          <w:instrText xml:space="preserve"> PAGEREF _Toc231102607 \h </w:instrText>
+          <w:instrText xml:space="preserve"> PAGEREF _Toc231108423 \h </w:instrText>
         </w:r>
         <w:r>
           <w:rPr>
@@ -4904,7 +4904,7 @@
           <w14:ligatures w14:val="standardContextual"/>
         </w:rPr>
       </w:pPr>
-      <w:hyperlink w:anchor="_Toc231102608" w:history="1">
+      <w:hyperlink w:anchor="_Toc231108424" w:history="1">
         <w:r>
           <w:rPr>
             <w:rStyle w:val="Hipervnculo"/>
@@ -4931,7 +4931,7 @@
             <w:noProof/>
             <w:webHidden/>
           </w:rPr>
-          <w:instrText xml:space="preserve"> PAGEREF _Toc231102608 \h </w:instrText>
+          <w:instrText xml:space="preserve"> PAGEREF _Toc231108424 \h </w:instrText>
         </w:r>
         <w:r>
           <w:rPr>
@@ -4978,7 +4978,7 @@
           <w14:ligatures w14:val="standardContextual"/>
         </w:rPr>
       </w:pPr>
-      <w:hyperlink w:anchor="_Toc231102609" w:history="1">
+      <w:hyperlink w:anchor="_Toc231108425" w:history="1">
         <w:r>
           <w:rPr>
             <w:rStyle w:val="Hipervnculo"/>
@@ -5005,7 +5005,7 @@
             <w:noProof/>
             <w:webHidden/>
           </w:rPr>
-          <w:instrText xml:space="preserve"> PAGEREF _Toc231102609 \h </w:instrText>
+          <w:instrText xml:space="preserve"> PAGEREF _Toc231108425 \h </w:instrText>
         </w:r>
         <w:r>
           <w:rPr>
@@ -5052,7 +5052,7 @@
           <w14:ligatures w14:val="standardContextual"/>
         </w:rPr>
       </w:pPr>
-      <w:hyperlink w:anchor="_Toc231102610" w:history="1">
+      <w:hyperlink w:anchor="_Toc231108426" w:history="1">
         <w:r>
           <w:rPr>
             <w:rStyle w:val="Hipervnculo"/>
@@ -5079,7 +5079,7 @@
             <w:noProof/>
             <w:webHidden/>
           </w:rPr>
-          <w:instrText xml:space="preserve"> PAGEREF _Toc231102610 \h </w:instrText>
+          <w:instrText xml:space="preserve"> PAGEREF _Toc231108426 \h </w:instrText>
         </w:r>
         <w:r>
           <w:rPr>
@@ -5126,7 +5126,7 @@
           <w14:ligatures w14:val="standardContextual"/>
         </w:rPr>
       </w:pPr>
-      <w:hyperlink w:anchor="_Toc231102611" w:history="1">
+      <w:hyperlink w:anchor="_Toc231108427" w:history="1">
         <w:r>
           <w:rPr>
             <w:rStyle w:val="Hipervnculo"/>
@@ -5153,7 +5153,7 @@
             <w:noProof/>
             <w:webHidden/>
           </w:rPr>
-          <w:instrText xml:space="preserve"> PAGEREF _Toc231102611 \h </w:instrText>
+          <w:instrText xml:space="preserve"> PAGEREF _Toc231108427 \h </w:instrText>
         </w:r>
         <w:r>
           <w:rPr>
@@ -5200,7 +5200,7 @@
           <w14:ligatures w14:val="standardContextual"/>
         </w:rPr>
       </w:pPr>
-      <w:hyperlink w:anchor="_Toc231102612" w:history="1">
+      <w:hyperlink w:anchor="_Toc231108428" w:history="1">
         <w:r>
           <w:rPr>
             <w:rStyle w:val="Hipervnculo"/>
@@ -5227,7 +5227,7 @@
             <w:noProof/>
             <w:webHidden/>
           </w:rPr>
-          <w:instrText xml:space="preserve"> PAGEREF _Toc231102612 \h </w:instrText>
+          <w:instrText xml:space="preserve"> PAGEREF _Toc231108428 \h </w:instrText>
         </w:r>
         <w:r>
           <w:rPr>
@@ -5274,7 +5274,7 @@
           <w14:ligatures w14:val="standardContextual"/>
         </w:rPr>
       </w:pPr>
-      <w:hyperlink w:anchor="_Toc231102613" w:history="1">
+      <w:hyperlink w:anchor="_Toc231108429" w:history="1">
         <w:r>
           <w:rPr>
             <w:rStyle w:val="Hipervnculo"/>
@@ -5301,7 +5301,7 @@
             <w:noProof/>
             <w:webHidden/>
           </w:rPr>
-          <w:instrText xml:space="preserve"> PAGEREF _Toc231102613 \h </w:instrText>
+          <w:instrText xml:space="preserve"> PAGEREF _Toc231108429 \h </w:instrText>
         </w:r>
         <w:r>
           <w:rPr>
@@ -5348,7 +5348,7 @@
           <w14:ligatures w14:val="standardContextual"/>
         </w:rPr>
       </w:pPr>
-      <w:hyperlink w:anchor="_Toc231102614" w:history="1">
+      <w:hyperlink w:anchor="_Toc231108430" w:history="1">
         <w:r>
           <w:rPr>
             <w:rStyle w:val="Hipervnculo"/>
@@ -5375,7 +5375,7 @@
             <w:noProof/>
             <w:webHidden/>
           </w:rPr>
-          <w:instrText xml:space="preserve"> PAGEREF _Toc231102614 \h </w:instrText>
+          <w:instrText xml:space="preserve"> PAGEREF _Toc231108430 \h </w:instrText>
         </w:r>
         <w:r>
           <w:rPr>
@@ -5422,7 +5422,7 @@
           <w14:ligatures w14:val="standardContextual"/>
         </w:rPr>
       </w:pPr>
-      <w:hyperlink w:anchor="_Toc231102615" w:history="1">
+      <w:hyperlink w:anchor="_Toc231108431" w:history="1">
         <w:r>
           <w:rPr>
             <w:rStyle w:val="Hipervnculo"/>
@@ -5449,7 +5449,7 @@
             <w:noProof/>
             <w:webHidden/>
           </w:rPr>
-          <w:instrText xml:space="preserve"> PAGEREF _Toc231102615 \h </w:instrText>
+          <w:instrText xml:space="preserve"> PAGEREF _Toc231108431 \h </w:instrText>
         </w:r>
         <w:r>
           <w:rPr>
@@ -5496,7 +5496,7 @@
           <w14:ligatures w14:val="standardContextual"/>
         </w:rPr>
       </w:pPr>
-      <w:hyperlink w:anchor="_Toc231102616" w:history="1">
+      <w:hyperlink w:anchor="_Toc231108432" w:history="1">
         <w:r>
           <w:rPr>
             <w:rStyle w:val="Hipervnculo"/>
@@ -5523,7 +5523,7 @@
             <w:noProof/>
             <w:webHidden/>
           </w:rPr>
-          <w:instrText xml:space="preserve"> PAGEREF _Toc231102616 \h </w:instrText>
+          <w:instrText xml:space="preserve"> PAGEREF _Toc231108432 \h </w:instrText>
         </w:r>
         <w:r>
           <w:rPr>
@@ -5570,7 +5570,7 @@
           <w14:ligatures w14:val="standardContextual"/>
         </w:rPr>
       </w:pPr>
-      <w:hyperlink w:anchor="_Toc231102617" w:history="1">
+      <w:hyperlink w:anchor="_Toc231108433" w:history="1">
         <w:r>
           <w:rPr>
             <w:rStyle w:val="Hipervnculo"/>
@@ -5597,7 +5597,7 @@
             <w:noProof/>
             <w:webHidden/>
           </w:rPr>
-          <w:instrText xml:space="preserve"> PAGEREF _Toc231102617 \h </w:instrText>
+          <w:instrText xml:space="preserve"> PAGEREF _Toc231108433 \h </w:instrText>
         </w:r>
         <w:r>
           <w:rPr>
@@ -5644,7 +5644,7 @@
           <w14:ligatures w14:val="standardContextual"/>
         </w:rPr>
       </w:pPr>
-      <w:hyperlink w:anchor="_Toc231102618" w:history="1">
+      <w:hyperlink w:anchor="_Toc231108434" w:history="1">
         <w:r>
           <w:rPr>
             <w:rStyle w:val="Hipervnculo"/>
@@ -5671,7 +5671,7 @@
             <w:noProof/>
             <w:webHidden/>
           </w:rPr>
-          <w:instrText xml:space="preserve"> PAGEREF _Toc231102618 \h </w:instrText>
+          <w:instrText xml:space="preserve"> PAGEREF _Toc231108434 \h </w:instrText>
         </w:r>
         <w:r>
           <w:rPr>
@@ -5718,7 +5718,7 @@
           <w14:ligatures w14:val="standardContextual"/>
         </w:rPr>
       </w:pPr>
-      <w:hyperlink w:anchor="_Toc231102619" w:history="1">
+      <w:hyperlink w:anchor="_Toc231108435" w:history="1">
         <w:r>
           <w:rPr>
             <w:rStyle w:val="Hipervnculo"/>
@@ -5745,7 +5745,7 @@
             <w:noProof/>
             <w:webHidden/>
           </w:rPr>
-          <w:instrText xml:space="preserve"> PAGEREF _Toc231102619 \h </w:instrText>
+          <w:instrText xml:space="preserve"> PAGEREF _Toc231108435 \h </w:instrText>
         </w:r>
         <w:r>
           <w:rPr>
@@ -5765,7 +5765,7 @@
             <w:noProof/>
             <w:webHidden/>
           </w:rPr>
-          <w:t>55</w:t>
+          <w:t>56</w:t>
         </w:r>
         <w:r>
           <w:rPr>
@@ -5794,7 +5794,7 @@
       <w:pPr>
         <w:pStyle w:val="Ttulo1"/>
       </w:pPr>
-      <w:bookmarkStart w:id="7" w:name="_Toc231102555"/>
+      <w:bookmarkStart w:id="7" w:name="_Toc231108371"/>
       <w:r>
         <w:lastRenderedPageBreak/>
         <w:t>Índice de tablas</w:t>
@@ -5826,7 +5826,7 @@
       <w:r>
         <w:fldChar w:fldCharType="separate"/>
       </w:r>
-      <w:hyperlink w:anchor="_Toc231102620" w:history="1">
+      <w:hyperlink w:anchor="_Toc231108436" w:history="1">
         <w:r>
           <w:rPr>
             <w:rStyle w:val="Hipervnculo"/>
@@ -5853,7 +5853,7 @@
             <w:noProof/>
             <w:webHidden/>
           </w:rPr>
-          <w:instrText xml:space="preserve"> PAGEREF _Toc231102620 \h </w:instrText>
+          <w:instrText xml:space="preserve"> PAGEREF _Toc231108436 \h </w:instrText>
         </w:r>
         <w:r>
           <w:rPr>
@@ -5900,7 +5900,7 @@
           <w14:ligatures w14:val="standardContextual"/>
         </w:rPr>
       </w:pPr>
-      <w:hyperlink w:anchor="_Toc231102621" w:history="1">
+      <w:hyperlink w:anchor="_Toc231108437" w:history="1">
         <w:r>
           <w:rPr>
             <w:rStyle w:val="Hipervnculo"/>
@@ -5927,7 +5927,7 @@
             <w:noProof/>
             <w:webHidden/>
           </w:rPr>
-          <w:instrText xml:space="preserve"> PAGEREF _Toc231102621 \h </w:instrText>
+          <w:instrText xml:space="preserve"> PAGEREF _Toc231108437 \h </w:instrText>
         </w:r>
         <w:r>
           <w:rPr>
@@ -5974,7 +5974,7 @@
           <w14:ligatures w14:val="standardContextual"/>
         </w:rPr>
       </w:pPr>
-      <w:hyperlink w:anchor="_Toc231102622" w:history="1">
+      <w:hyperlink w:anchor="_Toc231108438" w:history="1">
         <w:r>
           <w:rPr>
             <w:rStyle w:val="Hipervnculo"/>
@@ -6001,7 +6001,7 @@
             <w:noProof/>
             <w:webHidden/>
           </w:rPr>
-          <w:instrText xml:space="preserve"> PAGEREF _Toc231102622 \h </w:instrText>
+          <w:instrText xml:space="preserve"> PAGEREF _Toc231108438 \h </w:instrText>
         </w:r>
         <w:r>
           <w:rPr>
@@ -6048,7 +6048,7 @@
           <w14:ligatures w14:val="standardContextual"/>
         </w:rPr>
       </w:pPr>
-      <w:hyperlink w:anchor="_Toc231102623" w:history="1">
+      <w:hyperlink w:anchor="_Toc231108439" w:history="1">
         <w:r>
           <w:rPr>
             <w:rStyle w:val="Hipervnculo"/>
@@ -6075,7 +6075,7 @@
             <w:noProof/>
             <w:webHidden/>
           </w:rPr>
-          <w:instrText xml:space="preserve"> PAGEREF _Toc231102623 \h </w:instrText>
+          <w:instrText xml:space="preserve"> PAGEREF _Toc231108439 \h </w:instrText>
         </w:r>
         <w:r>
           <w:rPr>
@@ -6122,7 +6122,7 @@
           <w14:ligatures w14:val="standardContextual"/>
         </w:rPr>
       </w:pPr>
-      <w:hyperlink w:anchor="_Toc231102624" w:history="1">
+      <w:hyperlink w:anchor="_Toc231108440" w:history="1">
         <w:r>
           <w:rPr>
             <w:rStyle w:val="Hipervnculo"/>
@@ -6149,7 +6149,7 @@
             <w:noProof/>
             <w:webHidden/>
           </w:rPr>
-          <w:instrText xml:space="preserve"> PAGEREF _Toc231102624 \h </w:instrText>
+          <w:instrText xml:space="preserve"> PAGEREF _Toc231108440 \h </w:instrText>
         </w:r>
         <w:r>
           <w:rPr>
@@ -6196,7 +6196,7 @@
           <w14:ligatures w14:val="standardContextual"/>
         </w:rPr>
       </w:pPr>
-      <w:hyperlink w:anchor="_Toc231102625" w:history="1">
+      <w:hyperlink w:anchor="_Toc231108441" w:history="1">
         <w:r>
           <w:rPr>
             <w:rStyle w:val="Hipervnculo"/>
@@ -6223,7 +6223,7 @@
             <w:noProof/>
             <w:webHidden/>
           </w:rPr>
-          <w:instrText xml:space="preserve"> PAGEREF _Toc231102625 \h </w:instrText>
+          <w:instrText xml:space="preserve"> PAGEREF _Toc231108441 \h </w:instrText>
         </w:r>
         <w:r>
           <w:rPr>
@@ -6270,7 +6270,7 @@
           <w14:ligatures w14:val="standardContextual"/>
         </w:rPr>
       </w:pPr>
-      <w:hyperlink w:anchor="_Toc231102626" w:history="1">
+      <w:hyperlink w:anchor="_Toc231108442" w:history="1">
         <w:r>
           <w:rPr>
             <w:rStyle w:val="Hipervnculo"/>
@@ -6297,7 +6297,7 @@
             <w:noProof/>
             <w:webHidden/>
           </w:rPr>
-          <w:instrText xml:space="preserve"> PAGEREF _Toc231102626 \h </w:instrText>
+          <w:instrText xml:space="preserve"> PAGEREF _Toc231108442 \h </w:instrText>
         </w:r>
         <w:r>
           <w:rPr>
@@ -6344,7 +6344,7 @@
           <w14:ligatures w14:val="standardContextual"/>
         </w:rPr>
       </w:pPr>
-      <w:hyperlink w:anchor="_Toc231102627" w:history="1">
+      <w:hyperlink w:anchor="_Toc231108443" w:history="1">
         <w:r>
           <w:rPr>
             <w:rStyle w:val="Hipervnculo"/>
@@ -6371,7 +6371,7 @@
             <w:noProof/>
             <w:webHidden/>
           </w:rPr>
-          <w:instrText xml:space="preserve"> PAGEREF _Toc231102627 \h </w:instrText>
+          <w:instrText xml:space="preserve"> PAGEREF _Toc231108443 \h </w:instrText>
         </w:r>
         <w:r>
           <w:rPr>
@@ -6418,7 +6418,7 @@
           <w14:ligatures w14:val="standardContextual"/>
         </w:rPr>
       </w:pPr>
-      <w:hyperlink w:anchor="_Toc231102628" w:history="1">
+      <w:hyperlink w:anchor="_Toc231108444" w:history="1">
         <w:r>
           <w:rPr>
             <w:rStyle w:val="Hipervnculo"/>
@@ -6445,7 +6445,7 @@
             <w:noProof/>
             <w:webHidden/>
           </w:rPr>
-          <w:instrText xml:space="preserve"> PAGEREF _Toc231102628 \h </w:instrText>
+          <w:instrText xml:space="preserve"> PAGEREF _Toc231108444 \h </w:instrText>
         </w:r>
         <w:r>
           <w:rPr>
@@ -6492,7 +6492,7 @@
           <w14:ligatures w14:val="standardContextual"/>
         </w:rPr>
       </w:pPr>
-      <w:hyperlink w:anchor="_Toc231102629" w:history="1">
+      <w:hyperlink w:anchor="_Toc231108445" w:history="1">
         <w:r>
           <w:rPr>
             <w:rStyle w:val="Hipervnculo"/>
@@ -6519,7 +6519,7 @@
             <w:noProof/>
             <w:webHidden/>
           </w:rPr>
-          <w:instrText xml:space="preserve"> PAGEREF _Toc231102629 \h </w:instrText>
+          <w:instrText xml:space="preserve"> PAGEREF _Toc231108445 \h </w:instrText>
         </w:r>
         <w:r>
           <w:rPr>
@@ -6566,7 +6566,7 @@
           <w14:ligatures w14:val="standardContextual"/>
         </w:rPr>
       </w:pPr>
-      <w:hyperlink w:anchor="_Toc231102630" w:history="1">
+      <w:hyperlink w:anchor="_Toc231108446" w:history="1">
         <w:r>
           <w:rPr>
             <w:rStyle w:val="Hipervnculo"/>
@@ -6593,7 +6593,7 @@
             <w:noProof/>
             <w:webHidden/>
           </w:rPr>
-          <w:instrText xml:space="preserve"> PAGEREF _Toc231102630 \h </w:instrText>
+          <w:instrText xml:space="preserve"> PAGEREF _Toc231108446 \h </w:instrText>
         </w:r>
         <w:r>
           <w:rPr>
@@ -6640,7 +6640,7 @@
           <w14:ligatures w14:val="standardContextual"/>
         </w:rPr>
       </w:pPr>
-      <w:hyperlink w:anchor="_Toc231102631" w:history="1">
+      <w:hyperlink w:anchor="_Toc231108447" w:history="1">
         <w:r>
           <w:rPr>
             <w:rStyle w:val="Hipervnculo"/>
@@ -6667,7 +6667,7 @@
             <w:noProof/>
             <w:webHidden/>
           </w:rPr>
-          <w:instrText xml:space="preserve"> PAGEREF _Toc231102631 \h </w:instrText>
+          <w:instrText xml:space="preserve"> PAGEREF _Toc231108447 \h </w:instrText>
         </w:r>
         <w:r>
           <w:rPr>
@@ -6714,7 +6714,7 @@
           <w14:ligatures w14:val="standardContextual"/>
         </w:rPr>
       </w:pPr>
-      <w:hyperlink w:anchor="_Toc231102632" w:history="1">
+      <w:hyperlink w:anchor="_Toc231108448" w:history="1">
         <w:r>
           <w:rPr>
             <w:rStyle w:val="Hipervnculo"/>
@@ -6741,7 +6741,7 @@
             <w:noProof/>
             <w:webHidden/>
           </w:rPr>
-          <w:instrText xml:space="preserve"> PAGEREF _Toc231102632 \h </w:instrText>
+          <w:instrText xml:space="preserve"> PAGEREF _Toc231108448 \h </w:instrText>
         </w:r>
         <w:r>
           <w:rPr>
@@ -6788,7 +6788,7 @@
           <w14:ligatures w14:val="standardContextual"/>
         </w:rPr>
       </w:pPr>
-      <w:hyperlink w:anchor="_Toc231102633" w:history="1">
+      <w:hyperlink w:anchor="_Toc231108449" w:history="1">
         <w:r>
           <w:rPr>
             <w:rStyle w:val="Hipervnculo"/>
@@ -6815,7 +6815,7 @@
             <w:noProof/>
             <w:webHidden/>
           </w:rPr>
-          <w:instrText xml:space="preserve"> PAGEREF _Toc231102633 \h </w:instrText>
+          <w:instrText xml:space="preserve"> PAGEREF _Toc231108449 \h </w:instrText>
         </w:r>
         <w:r>
           <w:rPr>
@@ -6862,7 +6862,7 @@
           <w14:ligatures w14:val="standardContextual"/>
         </w:rPr>
       </w:pPr>
-      <w:hyperlink w:anchor="_Toc231102634" w:history="1">
+      <w:hyperlink w:anchor="_Toc231108450" w:history="1">
         <w:r>
           <w:rPr>
             <w:rStyle w:val="Hipervnculo"/>
@@ -6889,7 +6889,7 @@
             <w:noProof/>
             <w:webHidden/>
           </w:rPr>
-          <w:instrText xml:space="preserve"> PAGEREF _Toc231102634 \h </w:instrText>
+          <w:instrText xml:space="preserve"> PAGEREF _Toc231108450 \h </w:instrText>
         </w:r>
         <w:r>
           <w:rPr>
@@ -6937,7 +6937,7 @@
       <w:pPr>
         <w:pStyle w:val="Ttulo1"/>
       </w:pPr>
-      <w:bookmarkStart w:id="8" w:name="_Toc231102556"/>
+      <w:bookmarkStart w:id="8" w:name="_Toc231108372"/>
       <w:r>
         <w:lastRenderedPageBreak/>
         <w:t>Índice de figuras</w:t>
@@ -6969,7 +6969,7 @@
       <w:r>
         <w:fldChar w:fldCharType="separate"/>
       </w:r>
-      <w:hyperlink w:anchor="_Toc231102635" w:history="1">
+      <w:hyperlink w:anchor="_Toc231108451" w:history="1">
         <w:r>
           <w:rPr>
             <w:rStyle w:val="Hipervnculo"/>
@@ -6996,7 +6996,7 @@
             <w:noProof/>
             <w:webHidden/>
           </w:rPr>
-          <w:instrText xml:space="preserve"> PAGEREF _Toc231102635 \h </w:instrText>
+          <w:instrText xml:space="preserve"> PAGEREF _Toc231108451 \h </w:instrText>
         </w:r>
         <w:r>
           <w:rPr>
@@ -7043,7 +7043,7 @@
           <w14:ligatures w14:val="standardContextual"/>
         </w:rPr>
       </w:pPr>
-      <w:hyperlink w:anchor="_Toc231102636" w:history="1">
+      <w:hyperlink w:anchor="_Toc231108452" w:history="1">
         <w:r>
           <w:rPr>
             <w:rStyle w:val="Hipervnculo"/>
@@ -7070,7 +7070,7 @@
             <w:noProof/>
             <w:webHidden/>
           </w:rPr>
-          <w:instrText xml:space="preserve"> PAGEREF _Toc231102636 \h </w:instrText>
+          <w:instrText xml:space="preserve"> PAGEREF _Toc231108452 \h </w:instrText>
         </w:r>
         <w:r>
           <w:rPr>
@@ -7117,7 +7117,7 @@
           <w14:ligatures w14:val="standardContextual"/>
         </w:rPr>
       </w:pPr>
-      <w:hyperlink w:anchor="_Toc231102637" w:history="1">
+      <w:hyperlink w:anchor="_Toc231108453" w:history="1">
         <w:r>
           <w:rPr>
             <w:rStyle w:val="Hipervnculo"/>
@@ -7144,7 +7144,7 @@
             <w:noProof/>
             <w:webHidden/>
           </w:rPr>
-          <w:instrText xml:space="preserve"> PAGEREF _Toc231102637 \h </w:instrText>
+          <w:instrText xml:space="preserve"> PAGEREF _Toc231108453 \h </w:instrText>
         </w:r>
         <w:r>
           <w:rPr>
@@ -7191,7 +7191,7 @@
           <w14:ligatures w14:val="standardContextual"/>
         </w:rPr>
       </w:pPr>
-      <w:hyperlink w:anchor="_Toc231102638" w:history="1">
+      <w:hyperlink w:anchor="_Toc231108454" w:history="1">
         <w:r>
           <w:rPr>
             <w:rStyle w:val="Hipervnculo"/>
@@ -7218,7 +7218,7 @@
             <w:noProof/>
             <w:webHidden/>
           </w:rPr>
-          <w:instrText xml:space="preserve"> PAGEREF _Toc231102638 \h </w:instrText>
+          <w:instrText xml:space="preserve"> PAGEREF _Toc231108454 \h </w:instrText>
         </w:r>
         <w:r>
           <w:rPr>
@@ -7265,7 +7265,7 @@
           <w14:ligatures w14:val="standardContextual"/>
         </w:rPr>
       </w:pPr>
-      <w:hyperlink w:anchor="_Toc231102639" w:history="1">
+      <w:hyperlink w:anchor="_Toc231108455" w:history="1">
         <w:r>
           <w:rPr>
             <w:rStyle w:val="Hipervnculo"/>
@@ -7292,7 +7292,7 @@
             <w:noProof/>
             <w:webHidden/>
           </w:rPr>
-          <w:instrText xml:space="preserve"> PAGEREF _Toc231102639 \h </w:instrText>
+          <w:instrText xml:space="preserve"> PAGEREF _Toc231108455 \h </w:instrText>
         </w:r>
         <w:r>
           <w:rPr>
@@ -7339,7 +7339,7 @@
           <w14:ligatures w14:val="standardContextual"/>
         </w:rPr>
       </w:pPr>
-      <w:hyperlink w:anchor="_Toc231102640" w:history="1">
+      <w:hyperlink w:anchor="_Toc231108456" w:history="1">
         <w:r>
           <w:rPr>
             <w:rStyle w:val="Hipervnculo"/>
@@ -7366,7 +7366,7 @@
             <w:noProof/>
             <w:webHidden/>
           </w:rPr>
-          <w:instrText xml:space="preserve"> PAGEREF _Toc231102640 \h </w:instrText>
+          <w:instrText xml:space="preserve"> PAGEREF _Toc231108456 \h </w:instrText>
         </w:r>
         <w:r>
           <w:rPr>
@@ -7414,7 +7414,7 @@
       <w:pPr>
         <w:pStyle w:val="Ttulo1"/>
       </w:pPr>
-      <w:bookmarkStart w:id="9" w:name="_Toc231102557"/>
+      <w:bookmarkStart w:id="9" w:name="_Toc231108373"/>
       <w:r>
         <w:lastRenderedPageBreak/>
         <w:t>Lista de abreviaturas y siglas</w:t>
@@ -8200,7 +8200,7 @@
       <w:pPr>
         <w:pStyle w:val="Ttulo1"/>
       </w:pPr>
-      <w:bookmarkStart w:id="10" w:name="_Toc231102558"/>
+      <w:bookmarkStart w:id="10" w:name="_Toc231108374"/>
       <w:r>
         <w:lastRenderedPageBreak/>
         <w:t>Capítulo 1 — Introducción</w:t>
@@ -8211,7 +8211,7 @@
       <w:pPr>
         <w:pStyle w:val="Ttulo2"/>
       </w:pPr>
-      <w:bookmarkStart w:id="11" w:name="_Toc231102559"/>
+      <w:bookmarkStart w:id="11" w:name="_Toc231108375"/>
       <w:r>
         <w:t>1.1 Contextualización</w:t>
       </w:r>
@@ -8299,7 +8299,7 @@
       <w:pPr>
         <w:pStyle w:val="Ttulo2"/>
       </w:pPr>
-      <w:bookmarkStart w:id="12" w:name="_Toc231102560"/>
+      <w:bookmarkStart w:id="12" w:name="_Toc231108376"/>
       <w:r>
         <w:t>1.2 Problema de investigación y justificación</w:t>
       </w:r>
@@ -8409,7 +8409,7 @@
       <w:pPr>
         <w:pStyle w:val="Ttulo2"/>
       </w:pPr>
-      <w:bookmarkStart w:id="13" w:name="_Toc231102561"/>
+      <w:bookmarkStart w:id="13" w:name="_Toc231108377"/>
       <w:r>
         <w:t>1.3 Pregunta y objetivos de investigación</w:t>
       </w:r>
@@ -8594,7 +8594,7 @@
       <w:pPr>
         <w:pStyle w:val="Ttulo2"/>
       </w:pPr>
-      <w:bookmarkStart w:id="14" w:name="_Toc231102562"/>
+      <w:bookmarkStart w:id="14" w:name="_Toc231108378"/>
       <w:r>
         <w:lastRenderedPageBreak/>
         <w:t>1.4 Hipótesis general</w:t>
@@ -8638,7 +8638,7 @@
       <w:pPr>
         <w:pStyle w:val="Ttulo2"/>
       </w:pPr>
-      <w:bookmarkStart w:id="15" w:name="_Toc231102563"/>
+      <w:bookmarkStart w:id="15" w:name="_Toc231108379"/>
       <w:r>
         <w:t>1.5 Aspectos metodológicos y alcance</w:t>
       </w:r>
@@ -8741,7 +8741,7 @@
       <w:pPr>
         <w:pStyle w:val="Ttulo2"/>
       </w:pPr>
-      <w:bookmarkStart w:id="16" w:name="_Toc231102564"/>
+      <w:bookmarkStart w:id="16" w:name="_Toc231108380"/>
       <w:r>
         <w:t>1.6 Aportes esperados</w:t>
       </w:r>
@@ -8794,7 +8794,7 @@
       <w:pPr>
         <w:pStyle w:val="Ttulo2"/>
       </w:pPr>
-      <w:bookmarkStart w:id="17" w:name="_Toc231102565"/>
+      <w:bookmarkStart w:id="17" w:name="_Toc231108381"/>
       <w:r>
         <w:t>1.7 Estructura de la tesis</w:t>
       </w:r>
@@ -8835,7 +8835,7 @@
       <w:pPr>
         <w:pStyle w:val="Ttulo1"/>
       </w:pPr>
-      <w:bookmarkStart w:id="18" w:name="_Toc231102566"/>
+      <w:bookmarkStart w:id="18" w:name="_Toc231108382"/>
       <w:r>
         <w:lastRenderedPageBreak/>
         <w:t>Capítulo 2 — Marco teórico y revisión de literatura</w:t>
@@ -8846,7 +8846,7 @@
       <w:pPr>
         <w:pStyle w:val="Ttulo2"/>
       </w:pPr>
-      <w:bookmarkStart w:id="19" w:name="_Toc231102567"/>
+      <w:bookmarkStart w:id="19" w:name="_Toc231108383"/>
       <w:r>
         <w:t>2.1 Determinantes macroeconómicos de los retornos accionarios</w:t>
       </w:r>
@@ -9144,7 +9144,7 @@
       <w:pPr>
         <w:pStyle w:val="Ttulo2"/>
       </w:pPr>
-      <w:bookmarkStart w:id="20" w:name="_Toc231102568"/>
+      <w:bookmarkStart w:id="20" w:name="_Toc231108384"/>
       <w:r>
         <w:t>2.2 Precios de commodities y valoración de empresas mineras</w:t>
       </w:r>
@@ -9278,7 +9278,7 @@
       <w:pPr>
         <w:pStyle w:val="Ttulo2"/>
       </w:pPr>
-      <w:bookmarkStart w:id="21" w:name="_Toc231102569"/>
+      <w:bookmarkStart w:id="21" w:name="_Toc231108385"/>
       <w:r>
         <w:t>2.3 Tipo de cambio y exposición de empresas exportadoras</w:t>
       </w:r>
@@ -9372,7 +9372,7 @@
       <w:pPr>
         <w:pStyle w:val="Ttulo2"/>
       </w:pPr>
-      <w:bookmarkStart w:id="22" w:name="_Toc231102570"/>
+      <w:bookmarkStart w:id="22" w:name="_Toc231108386"/>
       <w:r>
         <w:t>2.4 Cobre, tipo de cambio y la economía chilena</w:t>
       </w:r>
@@ -9597,7 +9597,7 @@
       <w:pPr>
         <w:pStyle w:val="Ttulo2"/>
       </w:pPr>
-      <w:bookmarkStart w:id="23" w:name="_Toc231102571"/>
+      <w:bookmarkStart w:id="23" w:name="_Toc231108387"/>
       <w:r>
         <w:lastRenderedPageBreak/>
         <w:t>2.5 Eficiencia informacional y segmentación de mercados</w:t>
@@ -9738,7 +9738,7 @@
       <w:pPr>
         <w:pStyle w:val="Ttulo2"/>
       </w:pPr>
-      <w:bookmarkStart w:id="24" w:name="_Toc231102572"/>
+      <w:bookmarkStart w:id="24" w:name="_Toc231108388"/>
       <w:r>
         <w:t>2.6 Enfoques econométricos para la medición de impacto</w:t>
       </w:r>
@@ -9890,7 +9890,7 @@
       <w:pPr>
         <w:pStyle w:val="Ttulo2"/>
       </w:pPr>
-      <w:bookmarkStart w:id="25" w:name="_Toc231102573"/>
+      <w:bookmarkStart w:id="25" w:name="_Toc231108389"/>
       <w:r>
         <w:t>2.7 Síntesis e identificación del vacío de investigación</w:t>
       </w:r>
@@ -10015,7 +10015,7 @@
       <w:pPr>
         <w:pStyle w:val="Ttulo3"/>
       </w:pPr>
-      <w:bookmarkStart w:id="26" w:name="_Toc231102574"/>
+      <w:bookmarkStart w:id="26" w:name="_Toc231108390"/>
       <w:r>
         <w:t>Nota sobre la tabla de literatura</w:t>
       </w:r>
@@ -10045,7 +10045,7 @@
       <w:pPr>
         <w:pStyle w:val="Ttulo1"/>
       </w:pPr>
-      <w:bookmarkStart w:id="27" w:name="_Toc231102575"/>
+      <w:bookmarkStart w:id="27" w:name="_Toc231108391"/>
       <w:r>
         <w:lastRenderedPageBreak/>
         <w:t>Capítulo 3 — Datos y metodología</w:t>
@@ -10056,7 +10056,7 @@
       <w:pPr>
         <w:pStyle w:val="Ttulo2"/>
       </w:pPr>
-      <w:bookmarkStart w:id="28" w:name="_Toc231102576"/>
+      <w:bookmarkStart w:id="28" w:name="_Toc231108392"/>
       <w:r>
         <w:t xml:space="preserve">3.1 </w:t>
       </w:r>
@@ -10251,7 +10251,7 @@
       <w:pPr>
         <w:pStyle w:val="Ttulo2"/>
       </w:pPr>
-      <w:bookmarkStart w:id="29" w:name="_Toc231102577"/>
+      <w:bookmarkStart w:id="29" w:name="_Toc231108393"/>
       <w:r>
         <w:t>3.2 Variable dependiente</w:t>
       </w:r>
@@ -10313,7 +10313,7 @@
       <w:pPr>
         <w:pStyle w:val="Ttulo2"/>
       </w:pPr>
-      <w:bookmarkStart w:id="30" w:name="_Toc231102578"/>
+      <w:bookmarkStart w:id="30" w:name="_Toc231108394"/>
       <w:r>
         <w:t>3.3 Variables explicativas</w:t>
       </w:r>
@@ -10380,7 +10380,7 @@
       <w:pPr>
         <w:pStyle w:val="Ttulo2"/>
       </w:pPr>
-      <w:bookmarkStart w:id="31" w:name="_Toc231102579"/>
+      <w:bookmarkStart w:id="31" w:name="_Toc231108395"/>
       <w:r>
         <w:t>3.4 Tratamiento de datos y frecuencias mixtas</w:t>
       </w:r>
@@ -10437,7 +10437,7 @@
       <w:pPr>
         <w:pStyle w:val="Ttulo2"/>
       </w:pPr>
-      <w:bookmarkStart w:id="32" w:name="_Toc231102580"/>
+      <w:bookmarkStart w:id="32" w:name="_Toc231108396"/>
       <w:r>
         <w:t>3.5 Datación de las fases del ciclo del cobre</w:t>
       </w:r>
@@ -10503,7 +10503,7 @@
       <w:pPr>
         <w:pStyle w:val="Ttulo2"/>
       </w:pPr>
-      <w:bookmarkStart w:id="33" w:name="_Toc231102581"/>
+      <w:bookmarkStart w:id="33" w:name="_Toc231108397"/>
       <w:r>
         <w:lastRenderedPageBreak/>
         <w:t>3.6 Estrategia econométrica</w:t>
@@ -10514,7 +10514,7 @@
       <w:pPr>
         <w:pStyle w:val="Ttulo3"/>
       </w:pPr>
-      <w:bookmarkStart w:id="34" w:name="_Toc231102582"/>
+      <w:bookmarkStart w:id="34" w:name="_Toc231108398"/>
       <w:r>
         <w:t>3.6.1 Estacionariedad y orden de integración (OE1)</w:t>
       </w:r>
@@ -10557,7 +10557,7 @@
       <w:pPr>
         <w:pStyle w:val="Ttulo3"/>
       </w:pPr>
-      <w:bookmarkStart w:id="35" w:name="_Toc231102583"/>
+      <w:bookmarkStart w:id="35" w:name="_Toc231108399"/>
       <w:r>
         <w:t>3.6.2 Modelo de impacto: panel de efectos fijos (OE2)</w:t>
       </w:r>
@@ -10648,7 +10648,7 @@
       <w:pPr>
         <w:pStyle w:val="Ttulo3"/>
       </w:pPr>
-      <w:bookmarkStart w:id="36" w:name="_Toc231102584"/>
+      <w:bookmarkStart w:id="36" w:name="_Toc231108400"/>
       <w:r>
         <w:t>3.6.3 Relaciones de largo plazo: cointegración (OE3)</w:t>
       </w:r>
@@ -10749,7 +10749,7 @@
       <w:pPr>
         <w:pStyle w:val="Ttulo3"/>
       </w:pPr>
-      <w:bookmarkStart w:id="37" w:name="_Toc231102585"/>
+      <w:bookmarkStart w:id="37" w:name="_Toc231108401"/>
       <w:r>
         <w:t>3.6.4 Dinámica de shocks: VAR, impulso-respuesta y descomposición de varianza (OE4)</w:t>
       </w:r>
@@ -10869,7 +10869,7 @@
       <w:pPr>
         <w:pStyle w:val="Ttulo3"/>
       </w:pPr>
-      <w:bookmarkStart w:id="38" w:name="_Toc231102586"/>
+      <w:bookmarkStart w:id="38" w:name="_Toc231108402"/>
       <w:r>
         <w:t>3.6.5 Estabilidad por fases del ciclo (OE5)</w:t>
       </w:r>
@@ -10915,7 +10915,7 @@
       <w:pPr>
         <w:pStyle w:val="Ttulo3"/>
       </w:pPr>
-      <w:bookmarkStart w:id="39" w:name="_Toc231102587"/>
+      <w:bookmarkStart w:id="39" w:name="_Toc231108403"/>
       <w:r>
         <w:t>3.6.6 Comparación entre mercados: triangulación (OE6)</w:t>
       </w:r>
@@ -10966,7 +10966,7 @@
       <w:pPr>
         <w:pStyle w:val="Ttulo2"/>
       </w:pPr>
-      <w:bookmarkStart w:id="40" w:name="_Toc231102588"/>
+      <w:bookmarkStart w:id="40" w:name="_Toc231108404"/>
       <w:r>
         <w:t xml:space="preserve">3.7 </w:t>
       </w:r>
@@ -11124,7 +11124,7 @@
       <w:pPr>
         <w:pStyle w:val="Ttulo3"/>
       </w:pPr>
-      <w:bookmarkStart w:id="41" w:name="_Toc231102589"/>
+      <w:bookmarkStart w:id="41" w:name="_Toc231108405"/>
       <w:r>
         <w:t>Tabla 3.1 — Definición operativa de variables (resumen)</w:t>
       </w:r>
@@ -11136,7 +11136,7 @@
         <w:spacing w:before="40" w:after="40"/>
         <w:jc w:val="center"/>
       </w:pPr>
-      <w:bookmarkStart w:id="42" w:name="_Toc231102620"/>
+      <w:bookmarkStart w:id="42" w:name="_Toc231108436"/>
       <w:r>
         <w:rPr>
           <w:i w:val="0"/>
@@ -13108,7 +13108,7 @@
       <w:pPr>
         <w:pStyle w:val="Ttulo1"/>
       </w:pPr>
-      <w:bookmarkStart w:id="43" w:name="_Toc231102590"/>
+      <w:bookmarkStart w:id="43" w:name="_Toc231108406"/>
       <w:r>
         <w:lastRenderedPageBreak/>
         <w:t>Capítulo 4 — Resultados y discusión</w:t>
@@ -13119,7 +13119,7 @@
       <w:pPr>
         <w:pStyle w:val="Ttulo2"/>
       </w:pPr>
-      <w:bookmarkStart w:id="44" w:name="_Toc231102591"/>
+      <w:bookmarkStart w:id="44" w:name="_Toc231108407"/>
       <w:r>
         <w:t>4.1 Análisis descriptivo y propiedades de las series (OE1)</w:t>
       </w:r>
@@ -13346,7 +13346,7 @@
       <w:pPr>
         <w:pStyle w:val="Ttulo2"/>
       </w:pPr>
-      <w:bookmarkStart w:id="45" w:name="_Toc231102592"/>
+      <w:bookmarkStart w:id="45" w:name="_Toc231108408"/>
       <w:r>
         <w:t>4.2 Determinantes de los retornos: global vs local (OE2)</w:t>
       </w:r>
@@ -13368,7 +13368,7 @@
         <w:spacing w:before="40" w:after="40"/>
         <w:jc w:val="center"/>
       </w:pPr>
-      <w:bookmarkStart w:id="46" w:name="_Toc231102621"/>
+      <w:bookmarkStart w:id="46" w:name="_Toc231108437"/>
       <w:r>
         <w:rPr>
           <w:i w:val="0"/>
@@ -14168,7 +14168,7 @@
           <w:noProof/>
         </w:rPr>
         <w:drawing>
-          <wp:inline distT="0" distB="0" distL="0" distR="0" wp14:anchorId="51B4988A" wp14:editId="184CD135">
+          <wp:inline distT="0" distB="0" distL="0" distR="0" wp14:anchorId="45567044" wp14:editId="201DB72C">
             <wp:extent cx="5212080" cy="2833680"/>
             <wp:effectExtent l="0" t="0" r="0" b="0"/>
             <wp:docPr id="1" name="Picture 1"/>
@@ -14210,7 +14210,7 @@
         <w:spacing w:before="160" w:after="200"/>
         <w:jc w:val="center"/>
       </w:pPr>
-      <w:bookmarkStart w:id="47" w:name="_Toc231102635"/>
+      <w:bookmarkStart w:id="47" w:name="_Toc231108451"/>
       <w:r>
         <w:rPr>
           <w:i w:val="0"/>
@@ -14310,7 +14310,7 @@
       <w:pPr>
         <w:pStyle w:val="Ttulo2"/>
       </w:pPr>
-      <w:bookmarkStart w:id="48" w:name="_Toc231102593"/>
+      <w:bookmarkStart w:id="48" w:name="_Toc231108409"/>
       <w:r>
         <w:t>4.3 Relaciones de largo plazo (OE3)</w:t>
       </w:r>
@@ -14477,7 +14477,7 @@
       <w:pPr>
         <w:pStyle w:val="Ttulo2"/>
       </w:pPr>
-      <w:bookmarkStart w:id="49" w:name="_Toc231102594"/>
+      <w:bookmarkStart w:id="49" w:name="_Toc231108410"/>
       <w:r>
         <w:t>4.4 Dinámica de shocks (OE4)</w:t>
       </w:r>
@@ -14499,7 +14499,7 @@
         <w:spacing w:before="40" w:after="40"/>
         <w:jc w:val="center"/>
       </w:pPr>
-      <w:bookmarkStart w:id="50" w:name="_Toc231102622"/>
+      <w:bookmarkStart w:id="50" w:name="_Toc231108438"/>
       <w:r>
         <w:rPr>
           <w:i w:val="0"/>
@@ -14943,7 +14943,7 @@
           <w:noProof/>
         </w:rPr>
         <w:drawing>
-          <wp:inline distT="0" distB="0" distL="0" distR="0" wp14:anchorId="5602A762" wp14:editId="3EDC3F3B">
+          <wp:inline distT="0" distB="0" distL="0" distR="0" wp14:anchorId="2F08DDFD" wp14:editId="023905EF">
             <wp:extent cx="5212080" cy="3890356"/>
             <wp:effectExtent l="0" t="0" r="0" b="0"/>
             <wp:docPr id="2" name="Picture 2"/>
@@ -14985,7 +14985,7 @@
         <w:spacing w:before="160" w:after="200"/>
         <w:jc w:val="center"/>
       </w:pPr>
-      <w:bookmarkStart w:id="51" w:name="_Toc231102636"/>
+      <w:bookmarkStart w:id="51" w:name="_Toc231108452"/>
       <w:r>
         <w:rPr>
           <w:i w:val="0"/>
@@ -15055,7 +15055,7 @@
           <w:noProof/>
         </w:rPr>
         <w:drawing>
-          <wp:inline distT="0" distB="0" distL="0" distR="0" wp14:anchorId="2272921A" wp14:editId="205BB6DB">
+          <wp:inline distT="0" distB="0" distL="0" distR="0" wp14:anchorId="60A55F30" wp14:editId="4341AB93">
             <wp:extent cx="5212080" cy="2478330"/>
             <wp:effectExtent l="0" t="0" r="0" b="0"/>
             <wp:docPr id="3" name="Picture 3"/>
@@ -15097,7 +15097,7 @@
         <w:spacing w:before="160" w:after="200"/>
         <w:jc w:val="center"/>
       </w:pPr>
-      <w:bookmarkStart w:id="52" w:name="_Toc231102637"/>
+      <w:bookmarkStart w:id="52" w:name="_Toc231108453"/>
       <w:r>
         <w:rPr>
           <w:i w:val="0"/>
@@ -15131,7 +15131,7 @@
       <w:pPr>
         <w:pStyle w:val="Ttulo2"/>
       </w:pPr>
-      <w:bookmarkStart w:id="53" w:name="_Toc231102595"/>
+      <w:bookmarkStart w:id="53" w:name="_Toc231108411"/>
       <w:r>
         <w:t>4.5 Estabilidad por fases del ciclo del cobre (OE5)</w:t>
       </w:r>
@@ -15239,7 +15239,7 @@
           <w:noProof/>
         </w:rPr>
         <w:drawing>
-          <wp:inline distT="0" distB="0" distL="0" distR="0" wp14:anchorId="7982A701" wp14:editId="244DBB17">
+          <wp:inline distT="0" distB="0" distL="0" distR="0" wp14:anchorId="49600FE7" wp14:editId="054EE12C">
             <wp:extent cx="5212080" cy="2366710"/>
             <wp:effectExtent l="0" t="0" r="0" b="0"/>
             <wp:docPr id="4" name="Picture 4"/>
@@ -15281,7 +15281,7 @@
         <w:spacing w:before="160" w:after="200"/>
         <w:jc w:val="center"/>
       </w:pPr>
-      <w:bookmarkStart w:id="54" w:name="_Toc231102638"/>
+      <w:bookmarkStart w:id="54" w:name="_Toc231108454"/>
       <w:r>
         <w:rPr>
           <w:i w:val="0"/>
@@ -15315,7 +15315,7 @@
       <w:pPr>
         <w:pStyle w:val="Ttulo2"/>
       </w:pPr>
-      <w:bookmarkStart w:id="55" w:name="_Toc231102596"/>
+      <w:bookmarkStart w:id="55" w:name="_Toc231108412"/>
       <w:r>
         <w:t>4.6 Comparación entre mercados: triangulación (OE6)</w:t>
       </w:r>
@@ -15337,7 +15337,7 @@
         <w:spacing w:before="40" w:after="40"/>
         <w:jc w:val="center"/>
       </w:pPr>
-      <w:bookmarkStart w:id="56" w:name="_Toc231102623"/>
+      <w:bookmarkStart w:id="56" w:name="_Toc231108439"/>
       <w:r>
         <w:rPr>
           <w:i w:val="0"/>
@@ -15959,7 +15959,7 @@
           <w:noProof/>
         </w:rPr>
         <w:drawing>
-          <wp:inline distT="0" distB="0" distL="0" distR="0" wp14:anchorId="550F2038" wp14:editId="4053ED65">
+          <wp:inline distT="0" distB="0" distL="0" distR="0" wp14:anchorId="3E20F6B4" wp14:editId="11A52731">
             <wp:extent cx="5212080" cy="2626097"/>
             <wp:effectExtent l="0" t="0" r="0" b="0"/>
             <wp:docPr id="5" name="Picture 5"/>
@@ -16001,7 +16001,7 @@
         <w:spacing w:before="160" w:after="200"/>
         <w:jc w:val="center"/>
       </w:pPr>
-      <w:bookmarkStart w:id="57" w:name="_Toc231102639"/>
+      <w:bookmarkStart w:id="57" w:name="_Toc231108455"/>
       <w:r>
         <w:rPr>
           <w:i w:val="0"/>
@@ -16143,7 +16143,7 @@
       <w:pPr>
         <w:pStyle w:val="Ttulo2"/>
       </w:pPr>
-      <w:bookmarkStart w:id="58" w:name="_Toc231102597"/>
+      <w:bookmarkStart w:id="58" w:name="_Toc231108413"/>
       <w:r>
         <w:t>4.7 Diagnósticos y robustez</w:t>
       </w:r>
@@ -16231,6 +16231,80 @@
         <w:rPr>
           <w:b/>
         </w:rPr>
+        <w:t>Homogeneidad de pendientes.</w:t>
+      </w:r>
+      <w:r>
+        <w:t xml:space="preserve"> El test de Pesaran y Yamagata (2008) rechaza la hipótesis de</w:t>
+      </w:r>
+    </w:p>
+    <w:p>
+      <w:r>
+        <w:t>pendientes homogéneas entre empresas (Δ ajustado = 8,7 en la muestra B; p &lt; 0,01), lo que indica</w:t>
+      </w:r>
+    </w:p>
+    <w:p>
+      <w:r>
+        <w:t xml:space="preserve">que las distintas productoras responden al shock del cobre con sensibilidades </w:t>
+      </w:r>
+      <w:r>
+        <w:rPr>
+          <w:b/>
+        </w:rPr>
+        <w:t>heterogéneas</w:t>
+      </w:r>
+      <w:r>
+        <w:t xml:space="preserve"> —un</w:t>
+      </w:r>
+    </w:p>
+    <w:p>
+      <w:r>
+        <w:t>resultado económicamente esperable, dada su diferente composición (cobre puro frente a mineras</w:t>
+      </w:r>
+    </w:p>
+    <w:p>
+      <w:r>
+        <w:t>diversificadas), tamaño y jurisdicción—. La implicancia es que el coeficiente del panel debe</w:t>
+      </w:r>
+    </w:p>
+    <w:p>
+      <w:r>
+        <w:t xml:space="preserve">interpretarse como un </w:t>
+      </w:r>
+      <w:r>
+        <w:rPr>
+          <w:b/>
+        </w:rPr>
+        <w:t>efecto promedio</w:t>
+      </w:r>
+      <w:r>
+        <w:t xml:space="preserve"> del sector, en torno al cual existe dispersión entre</w:t>
+      </w:r>
+    </w:p>
+    <w:p>
+      <w:r>
+        <w:t>firmas; ello motiva, como extensión, un análisis a nivel de empresa con controles idiosincráticos.</w:t>
+      </w:r>
+    </w:p>
+    <w:p>
+      <w:r>
+        <w:t>La validez de la prueba se verificó sobre paneles sintéticos de pendientes homogéneas (no rechaza)</w:t>
+      </w:r>
+    </w:p>
+    <w:p>
+      <w:r>
+        <w:t>y heterogéneas (rechaza); no obstante, con el reducido número de empresas la magnitud exacta del</w:t>
+      </w:r>
+    </w:p>
+    <w:p>
+      <w:r>
+        <w:t>estadístico debe leerse con cautela.</w:t>
+      </w:r>
+    </w:p>
+    <w:p>
+      <w:r>
+        <w:rPr>
+          <w:b/>
+        </w:rPr>
         <w:t>Robustez por subperíodos.</w:t>
       </w:r>
       <w:r>
@@ -16254,6 +16328,7 @@
     </w:p>
     <w:p>
       <w:r>
+        <w:lastRenderedPageBreak/>
         <w:t xml:space="preserve">que el signo y la relevancia del efecto </w:t>
       </w:r>
       <w:r>
@@ -16357,7 +16432,13 @@
         <w:rPr>
           <w:b/>
         </w:rPr>
-        <w:t>Corrección por pruebas múltiples.</w:t>
+        <w:t xml:space="preserve">Corrección por </w:t>
+      </w:r>
+      <w:r>
+        <w:rPr>
+          <w:b/>
+        </w:rPr>
+        <w:t>pruebas múltiples.</w:t>
       </w:r>
       <w:r>
         <w:t xml:space="preserve"> Dado que el contraste de las hipótesis involucra la</w:t>
@@ -16370,7 +16451,6 @@
     </w:p>
     <w:p>
       <w:r>
-        <w:lastRenderedPageBreak/>
         <w:t>(control de la tasa de falsos descubrimientos, FDR)** sobre los p-valores del panel. Tras la</w:t>
       </w:r>
     </w:p>
@@ -16430,6 +16510,7 @@
         <w:rPr>
           <w:b/>
         </w:rPr>
+        <w:lastRenderedPageBreak/>
         <w:t>precio del cobre (+0,29 σ)</w:t>
       </w:r>
       <w:r>
@@ -16504,9 +16585,8 @@
         <w:rPr>
           <w:noProof/>
         </w:rPr>
-        <w:lastRenderedPageBreak/>
         <w:drawing>
-          <wp:inline distT="0" distB="0" distL="0" distR="0" wp14:anchorId="6EC7087E" wp14:editId="649DAA94">
+          <wp:inline distT="0" distB="0" distL="0" distR="0" wp14:anchorId="07DD4770" wp14:editId="4F0A55D9">
             <wp:extent cx="5212080" cy="2446436"/>
             <wp:effectExtent l="0" t="0" r="0" b="0"/>
             <wp:docPr id="6" name="Picture 6"/>
@@ -16548,7 +16628,7 @@
         <w:spacing w:before="160" w:after="200"/>
         <w:jc w:val="center"/>
       </w:pPr>
-      <w:bookmarkStart w:id="59" w:name="_Toc231102640"/>
+      <w:bookmarkStart w:id="59" w:name="_Toc231108456"/>
       <w:r>
         <w:rPr>
           <w:i w:val="0"/>
@@ -16574,10 +16654,7 @@
         <w:fldChar w:fldCharType="end"/>
       </w:r>
       <w:r>
-        <w:t xml:space="preserve">. Respuesta del retorno a un shock del cobre mediante proyecciones </w:t>
-      </w:r>
-      <w:r>
-        <w:t>locales (Jordà, 2005), IC 95%.</w:t>
+        <w:t>. Respuesta del retorno a un shock del cobre mediante proyecciones locales (Jordà, 2005), IC 95%.</w:t>
       </w:r>
       <w:bookmarkEnd w:id="59"/>
     </w:p>
@@ -16585,7 +16662,7 @@
       <w:pPr>
         <w:pStyle w:val="Ttulo2"/>
       </w:pPr>
-      <w:bookmarkStart w:id="60" w:name="_Toc231102598"/>
+      <w:bookmarkStart w:id="60" w:name="_Toc231108414"/>
       <w:r>
         <w:t>4.8 Discusión integrada</w:t>
       </w:r>
@@ -16614,6 +16691,7 @@
     </w:p>
     <w:p>
       <w:r>
+        <w:lastRenderedPageBreak/>
         <w:t>dominan a los locales</w:t>
       </w:r>
       <w:r>
@@ -16668,7 +16746,6 @@
     </w:p>
     <w:p>
       <w:r>
-        <w:lastRenderedPageBreak/>
         <w:t>inicialmente mixta. La fuerte dependencia de sección cruzada detectada (§4.7) confirma, además, la</w:t>
       </w:r>
     </w:p>
@@ -16763,7 +16840,7 @@
       <w:pPr>
         <w:pStyle w:val="Ttulo1"/>
       </w:pPr>
-      <w:bookmarkStart w:id="61" w:name="_Toc231102599"/>
+      <w:bookmarkStart w:id="61" w:name="_Toc231108415"/>
       <w:r>
         <w:lastRenderedPageBreak/>
         <w:t>Capítulo 5 — Conclusiones</w:t>
@@ -16774,7 +16851,7 @@
       <w:pPr>
         <w:pStyle w:val="Ttulo2"/>
       </w:pPr>
-      <w:bookmarkStart w:id="62" w:name="_Toc231102600"/>
+      <w:bookmarkStart w:id="62" w:name="_Toc231108416"/>
       <w:r>
         <w:t>5.1 Síntesis de los hallazgos</w:t>
       </w:r>
@@ -16941,7 +17018,7 @@
       <w:pPr>
         <w:pStyle w:val="Ttulo2"/>
       </w:pPr>
-      <w:bookmarkStart w:id="63" w:name="_Toc231102601"/>
+      <w:bookmarkStart w:id="63" w:name="_Toc231108417"/>
       <w:r>
         <w:t>5.2 Implicancias</w:t>
       </w:r>
@@ -17013,7 +17090,7 @@
       <w:pPr>
         <w:pStyle w:val="Ttulo2"/>
       </w:pPr>
-      <w:bookmarkStart w:id="64" w:name="_Toc231102602"/>
+      <w:bookmarkStart w:id="64" w:name="_Toc231108418"/>
       <w:r>
         <w:t>5.3 Limitaciones</w:t>
       </w:r>
@@ -17097,7 +17174,7 @@
       <w:pPr>
         <w:pStyle w:val="Ttulo2"/>
       </w:pPr>
-      <w:bookmarkStart w:id="65" w:name="_Toc231102603"/>
+      <w:bookmarkStart w:id="65" w:name="_Toc231108419"/>
       <w:r>
         <w:t>5.4 Líneas futuras de investigación</w:t>
       </w:r>
@@ -17115,7 +17192,10 @@
     </w:p>
     <w:p>
       <w:r>
-        <w:t>cambio de Markov, complementaria al fechado por puntos de giro empleado aquí; (iii) el análisis a</w:t>
+        <w:t xml:space="preserve">cambio de Markov, complementaria al fechado por </w:t>
+      </w:r>
+      <w:r>
+        <w:t>puntos de giro empleado aquí; (iii) el análisis a</w:t>
       </w:r>
     </w:p>
     <w:p>
@@ -17153,7 +17233,7 @@
       <w:pPr>
         <w:pStyle w:val="Ttulo1"/>
       </w:pPr>
-      <w:bookmarkStart w:id="66" w:name="_Toc231102604"/>
+      <w:bookmarkStart w:id="66" w:name="_Toc231108420"/>
       <w:r>
         <w:lastRenderedPageBreak/>
         <w:t>Referencias</w:t>
@@ -17167,10 +17247,7 @@
     </w:p>
     <w:p>
       <w:r>
-        <w:t xml:space="preserve">Bai, J., &amp; Perron, P. (2003). Computation and analysis of multiple structural change models. *Journal of </w:t>
-      </w:r>
-      <w:r>
-        <w:t>Applied Econometrics*, 18(1), 1–22.</w:t>
+        <w:t>Bai, J., &amp; Perron, P. (2003). Computation and analysis of multiple structural change models. *Journal of Applied Econometrics*, 18(1), 1–22.</w:t>
       </w:r>
     </w:p>
     <w:p>
@@ -17190,10 +17267,7 @@
     </w:p>
     <w:p>
       <w:r>
-        <w:t xml:space="preserve">Bollerslev, T. (1986). Generalized </w:t>
-      </w:r>
-      <w:r>
-        <w:t>autoregressive conditional heteroskedasticity. *Journal of Econometrics*, 31(3), 307–327.</w:t>
+        <w:t>Bollerslev, T. (1986). Generalized autoregressive conditional heteroskedasticity. *Journal of Econometrics*, 31(3), 307–327.</w:t>
       </w:r>
     </w:p>
     <w:p>
@@ -17274,7 +17348,10 @@
     </w:p>
     <w:p>
       <w:r>
-        <w:t>Hamilton, J. D. (1989). A new approach to the economic analysis of nonstationary time series and the business cycle. *Econometrica*, 57(2), 357–384.</w:t>
+        <w:t xml:space="preserve">Hamilton, J. D. (1989). A new approach to the economic analysis of nonstationary time series and the business </w:t>
+      </w:r>
+      <w:r>
+        <w:t>cycle. *Econometrica*, 57(2), 357–384.</w:t>
       </w:r>
     </w:p>
     <w:p>
@@ -17325,10 +17402,7 @@
     </w:p>
     <w:p>
       <w:r>
-        <w:t xml:space="preserve">Pesaran, M. H. (2007). A simple </w:t>
-      </w:r>
-      <w:r>
-        <w:t>panel unit root test in the presence of cross-section dependence. *Journal of Applied Econometrics*, 22(2), 265–312.</w:t>
+        <w:t>Pesaran, M. H. (2007). A simple panel unit root test in the presence of cross-section dependence. *Journal of Applied Econometrics*, 22(2), 265–312.</w:t>
       </w:r>
     </w:p>
     <w:p>
@@ -17338,6 +17412,11 @@
     </w:p>
     <w:p>
       <w:r>
+        <w:t>Pesaran, M. H., &amp; Yamagata, T. (2008). Testing slope homogeneity in large panels. *Journal of Econometrics*, 142(1), 50–93.</w:t>
+      </w:r>
+    </w:p>
+    <w:p>
+      <w:r>
         <w:t>Pesaran, M. H., Shin, Y., &amp; Smith, R. J. (2001). Bounds testing approaches to the analysis of level relationships. *Journal of Applied Econometrics*, 16(3), 289–326.</w:t>
       </w:r>
     </w:p>
@@ -17358,12 +17437,12 @@
     </w:p>
     <w:p>
       <w:r>
+        <w:lastRenderedPageBreak/>
         <w:t>Sadorsky, P. (2001). Risk factors in stock returns of Canadian oil and gas companies. *Energy Economics*, 23(1), 17–28.</w:t>
       </w:r>
     </w:p>
     <w:p>
       <w:r>
-        <w:lastRenderedPageBreak/>
         <w:t>Sims, C. A. (1980). Macroeconomics and reality. *Econometrica*, 48(1), 1–48.</w:t>
       </w:r>
     </w:p>
@@ -17379,7 +17458,10 @@
     </w:p>
     <w:p>
       <w:r>
-        <w:t>Zhu, H., Chen, X., &amp; Chen, B. (2021). Effects of non-ferrous metal prices and uncertainty on industry stock market under different market conditions. *Resources Policy*, 73, 102243.</w:t>
+        <w:t xml:space="preserve">Zhu, H., Chen, X., &amp; Chen, B. (2021). Effects of non-ferrous metal prices and uncertainty on industry stock market under different market </w:t>
+      </w:r>
+      <w:r>
+        <w:t>conditions. *Resources Policy*, 73, 102243.</w:t>
       </w:r>
     </w:p>
     <w:p>
@@ -17401,7 +17483,7 @@
       <w:pPr>
         <w:pStyle w:val="Ttulo1"/>
       </w:pPr>
-      <w:bookmarkStart w:id="67" w:name="_Toc231102605"/>
+      <w:bookmarkStart w:id="67" w:name="_Toc231108421"/>
       <w:r>
         <w:lastRenderedPageBreak/>
         <w:t>Anexos</w:t>
@@ -17412,7 +17494,7 @@
       <w:pPr>
         <w:pStyle w:val="Ttulo2"/>
       </w:pPr>
-      <w:bookmarkStart w:id="68" w:name="_Toc231102606"/>
+      <w:bookmarkStart w:id="68" w:name="_Toc231108422"/>
       <w:r>
         <w:t>Anexo A. Estadística descriptiva</w:t>
       </w:r>
@@ -17424,7 +17506,7 @@
         <w:spacing w:before="40" w:after="40"/>
         <w:jc w:val="center"/>
       </w:pPr>
-      <w:bookmarkStart w:id="69" w:name="_Toc231102624"/>
+      <w:bookmarkStart w:id="69" w:name="_Toc231108440"/>
       <w:r>
         <w:rPr>
           <w:i w:val="0"/>
@@ -19231,13 +19313,7 @@
               <w:rPr>
                 <w:sz w:val="20"/>
               </w:rPr>
-              <w:t xml:space="preserve">Δ Tasa </w:t>
-            </w:r>
-            <w:r>
-              <w:rPr>
-                <w:sz w:val="20"/>
-              </w:rPr>
-              <w:t>local</w:t>
+              <w:t>Δ Tasa local</w:t>
             </w:r>
           </w:p>
         </w:tc>
@@ -19626,9 +19702,12 @@
       <w:pPr>
         <w:pStyle w:val="Ttulo2"/>
       </w:pPr>
-      <w:bookmarkStart w:id="70" w:name="_Toc231102607"/>
-      <w:r>
-        <w:t>Anexo B. Matriz de correlación de los factores</w:t>
+      <w:bookmarkStart w:id="70" w:name="_Toc231108423"/>
+      <w:r>
+        <w:t xml:space="preserve">Anexo B. Matriz de </w:t>
+      </w:r>
+      <w:r>
+        <w:t>correlación de los factores</w:t>
       </w:r>
       <w:bookmarkEnd w:id="70"/>
     </w:p>
@@ -19638,7 +19717,7 @@
         <w:spacing w:before="40" w:after="40"/>
         <w:jc w:val="center"/>
       </w:pPr>
-      <w:bookmarkStart w:id="71" w:name="_Toc231102625"/>
+      <w:bookmarkStart w:id="71" w:name="_Toc231108441"/>
       <w:r>
         <w:rPr>
           <w:i w:val="0"/>
@@ -19815,14 +19894,7 @@
                 <w:b/>
                 <w:sz w:val="20"/>
               </w:rPr>
-              <w:t xml:space="preserve">Δ Fed </w:t>
-            </w:r>
-            <w:r>
-              <w:rPr>
-                <w:b/>
-                <w:sz w:val="20"/>
-              </w:rPr>
-              <w:t>Funds</w:t>
+              <w:t>Δ Fed Funds</w:t>
             </w:r>
           </w:p>
         </w:tc>
@@ -21235,13 +21307,7 @@
                 <w:sz w:val="20"/>
               </w:rPr>
               <w:lastRenderedPageBreak/>
-              <w:t xml:space="preserve">Δ Tasa </w:t>
-            </w:r>
-            <w:r>
-              <w:rPr>
-                <w:sz w:val="20"/>
-              </w:rPr>
-              <w:t>local</w:t>
+              <w:t>Δ Tasa local</w:t>
             </w:r>
           </w:p>
         </w:tc>
@@ -21679,9 +21745,12 @@
       <w:pPr>
         <w:pStyle w:val="Ttulo2"/>
       </w:pPr>
-      <w:bookmarkStart w:id="72" w:name="_Toc231102608"/>
-      <w:r>
-        <w:t>Anexo C. Pruebas de raíz unitaria y orden de integración</w:t>
+      <w:bookmarkStart w:id="72" w:name="_Toc231108424"/>
+      <w:r>
+        <w:t xml:space="preserve">Anexo C. </w:t>
+      </w:r>
+      <w:r>
+        <w:t>Pruebas de raíz unitaria y orden de integración</w:t>
       </w:r>
       <w:bookmarkEnd w:id="72"/>
     </w:p>
@@ -21691,7 +21760,7 @@
         <w:spacing w:before="40" w:after="40"/>
         <w:jc w:val="center"/>
       </w:pPr>
-      <w:bookmarkStart w:id="73" w:name="_Toc231102626"/>
+      <w:bookmarkStart w:id="73" w:name="_Toc231108442"/>
       <w:r>
         <w:rPr>
           <w:i w:val="0"/>
@@ -21816,14 +21885,7 @@
                 <w:b/>
                 <w:sz w:val="20"/>
               </w:rPr>
-              <w:t xml:space="preserve">PP </w:t>
-            </w:r>
-            <w:r>
-              <w:rPr>
-                <w:b/>
-                <w:sz w:val="20"/>
-              </w:rPr>
-              <w:t>(p)</w:t>
+              <w:t>PP (p)</w:t>
             </w:r>
           </w:p>
         </w:tc>
@@ -22526,7 +22588,7 @@
       <w:pPr>
         <w:pStyle w:val="Ttulo2"/>
       </w:pPr>
-      <w:bookmarkStart w:id="74" w:name="_Toc231102609"/>
+      <w:bookmarkStart w:id="74" w:name="_Toc231108425"/>
       <w:r>
         <w:t>Anexo D. Resultados completos del modelo de panel</w:t>
       </w:r>
@@ -22536,7 +22598,7 @@
       <w:pPr>
         <w:pStyle w:val="Ttulo3"/>
       </w:pPr>
-      <w:bookmarkStart w:id="75" w:name="_Toc231102610"/>
+      <w:bookmarkStart w:id="75" w:name="_Toc231108426"/>
       <w:r>
         <w:t>D.1 Muestra B — cobre, mercado internacional</w:t>
       </w:r>
@@ -22548,7 +22610,7 @@
         <w:spacing w:before="40" w:after="40"/>
         <w:jc w:val="center"/>
       </w:pPr>
-      <w:bookmarkStart w:id="76" w:name="_Toc231102627"/>
+      <w:bookmarkStart w:id="76" w:name="_Toc231108443"/>
       <w:r>
         <w:rPr>
           <w:i w:val="0"/>
@@ -23729,7 +23791,7 @@
       <w:pPr>
         <w:pStyle w:val="Ttulo3"/>
       </w:pPr>
-      <w:bookmarkStart w:id="77" w:name="_Toc231102611"/>
+      <w:bookmarkStart w:id="77" w:name="_Toc231108427"/>
       <w:r>
         <w:t>D.2 Muestra A — cobre, mercado chileno (Pucobre)</w:t>
       </w:r>
@@ -23741,7 +23803,7 @@
         <w:spacing w:before="40" w:after="40"/>
         <w:jc w:val="center"/>
       </w:pPr>
-      <w:bookmarkStart w:id="78" w:name="_Toc231102628"/>
+      <w:bookmarkStart w:id="78" w:name="_Toc231108444"/>
       <w:r>
         <w:rPr>
           <w:i w:val="0"/>
@@ -24916,7 +24978,7 @@
       <w:pPr>
         <w:pStyle w:val="Ttulo3"/>
       </w:pPr>
-      <w:bookmarkStart w:id="79" w:name="_Toc231102612"/>
+      <w:bookmarkStart w:id="79" w:name="_Toc231108428"/>
       <w:r>
         <w:t xml:space="preserve">D.3 </w:t>
       </w:r>
@@ -24931,7 +24993,7 @@
         <w:spacing w:before="40" w:after="40"/>
         <w:jc w:val="center"/>
       </w:pPr>
-      <w:bookmarkStart w:id="80" w:name="_Toc231102629"/>
+      <w:bookmarkStart w:id="80" w:name="_Toc231108445"/>
       <w:r>
         <w:rPr>
           <w:i w:val="0"/>
@@ -26106,7 +26168,7 @@
       <w:pPr>
         <w:pStyle w:val="Ttulo2"/>
       </w:pPr>
-      <w:bookmarkStart w:id="81" w:name="_Toc231102613"/>
+      <w:bookmarkStart w:id="81" w:name="_Toc231108429"/>
       <w:r>
         <w:lastRenderedPageBreak/>
         <w:t xml:space="preserve">Anexo E. </w:t>
@@ -26122,7 +26184,7 @@
         <w:spacing w:before="40" w:after="40"/>
         <w:jc w:val="center"/>
       </w:pPr>
-      <w:bookmarkStart w:id="82" w:name="_Toc231102630"/>
+      <w:bookmarkStart w:id="82" w:name="_Toc231108446"/>
       <w:r>
         <w:rPr>
           <w:i w:val="0"/>
@@ -26793,7 +26855,7 @@
       <w:pPr>
         <w:pStyle w:val="Ttulo2"/>
       </w:pPr>
-      <w:bookmarkStart w:id="83" w:name="_Toc231102614"/>
+      <w:bookmarkStart w:id="83" w:name="_Toc231108430"/>
       <w:r>
         <w:t xml:space="preserve">Anexo F. </w:t>
       </w:r>
@@ -26808,7 +26870,7 @@
         <w:spacing w:before="40" w:after="40"/>
         <w:jc w:val="center"/>
       </w:pPr>
-      <w:bookmarkStart w:id="84" w:name="_Toc231102631"/>
+      <w:bookmarkStart w:id="84" w:name="_Toc231108447"/>
       <w:r>
         <w:rPr>
           <w:i w:val="0"/>
@@ -27622,7 +27684,7 @@
       <w:pPr>
         <w:pStyle w:val="Ttulo2"/>
       </w:pPr>
-      <w:bookmarkStart w:id="85" w:name="_Toc231102615"/>
+      <w:bookmarkStart w:id="85" w:name="_Toc231108431"/>
       <w:r>
         <w:t>Anexo G. Fuentes de datos</w:t>
       </w:r>
@@ -27634,7 +27696,7 @@
         <w:spacing w:before="40" w:after="40"/>
         <w:jc w:val="center"/>
       </w:pPr>
-      <w:bookmarkStart w:id="86" w:name="_Toc231102632"/>
+      <w:bookmarkStart w:id="86" w:name="_Toc231108448"/>
       <w:r>
         <w:rPr>
           <w:i w:val="0"/>
@@ -28783,7 +28845,7 @@
       <w:pPr>
         <w:pStyle w:val="Ttulo2"/>
       </w:pPr>
-      <w:bookmarkStart w:id="87" w:name="_Toc231102616"/>
+      <w:bookmarkStart w:id="87" w:name="_Toc231108432"/>
       <w:r>
         <w:t>Anexo H. Disponibilidad del código</w:t>
       </w:r>
@@ -28801,7 +28863,7 @@
       <w:pPr>
         <w:pStyle w:val="Ttulo2"/>
       </w:pPr>
-      <w:bookmarkStart w:id="88" w:name="_Toc231102617"/>
+      <w:bookmarkStart w:id="88" w:name="_Toc231108433"/>
       <w:r>
         <w:t>Anexo J. Síntesis de pruebas de diagnóstico y robustez</w:t>
       </w:r>
@@ -28821,7 +28883,7 @@
         <w:spacing w:before="40" w:after="40"/>
         <w:jc w:val="center"/>
       </w:pPr>
-      <w:bookmarkStart w:id="89" w:name="_Toc231102633"/>
+      <w:bookmarkStart w:id="89" w:name="_Toc231108449"/>
       <w:r>
         <w:rPr>
           <w:i w:val="0"/>
@@ -29119,7 +29181,7 @@
               <w:rPr>
                 <w:sz w:val="20"/>
               </w:rPr>
-              <w:t>Raíz unitaria con quiebre (Zivot-Andrews)</w:t>
+              <w:t>Homogeneidad de pendientes (Pesaran-Yamagata)</w:t>
             </w:r>
           </w:p>
         </w:tc>
@@ -29142,7 +29204,7 @@
               <w:rPr>
                 <w:sz w:val="20"/>
               </w:rPr>
-              <w:t>TC nivel p = 0.9504</w:t>
+              <w:t>Δ ajustado = 8,7 (p &lt; 0,01)</w:t>
             </w:r>
           </w:p>
         </w:tc>
@@ -29165,7 +29227,7 @@
               <w:rPr>
                 <w:sz w:val="20"/>
               </w:rPr>
-              <w:t>Tipo de cambio confirmado I(1)</w:t>
+              <w:t>Pendientes heterogéneas → el coeficiente del panel es un efecto promedio</w:t>
             </w:r>
           </w:p>
         </w:tc>
@@ -29193,7 +29255,13 @@
               <w:rPr>
                 <w:sz w:val="20"/>
               </w:rPr>
-              <w:t>Cointegración con quiebre (Gregory-Hansen)</w:t>
+              <w:t xml:space="preserve">Raíz unitaria con quiebre </w:t>
+            </w:r>
+            <w:r>
+              <w:rPr>
+                <w:sz w:val="20"/>
+              </w:rPr>
+              <w:t>(Zivot-Andrews)</w:t>
             </w:r>
           </w:p>
         </w:tc>
@@ -29216,7 +29284,7 @@
               <w:rPr>
                 <w:sz w:val="20"/>
               </w:rPr>
-              <w:t>ADF* = -6.6825 &lt; -4.92; quiebre 2008-06</w:t>
+              <w:t>TC nivel p = 0.9504</w:t>
             </w:r>
           </w:p>
         </w:tc>
@@ -29239,7 +29307,7 @@
               <w:rPr>
                 <w:sz w:val="20"/>
               </w:rPr>
-              <w:t>Relación de largo plazo confirmada (reconfigurada en 2008)</w:t>
+              <w:t>Tipo de cambio confirmado I(1)</w:t>
             </w:r>
           </w:p>
         </w:tc>
@@ -29267,7 +29335,7 @@
               <w:rPr>
                 <w:sz w:val="20"/>
               </w:rPr>
-              <w:t>Estabilidad del VAR y causalidad de Granger</w:t>
+              <w:t>Cointegración con quiebre (Gregory-Hansen)</w:t>
             </w:r>
           </w:p>
         </w:tc>
@@ -29290,7 +29358,7 @@
               <w:rPr>
                 <w:sz w:val="20"/>
               </w:rPr>
-              <w:t>estable = True; Granger cobre→retorno p = 0.0026</w:t>
+              <w:t>ADF* = -6.6825 &lt; -4.92; quiebre 2008-06</w:t>
             </w:r>
           </w:p>
         </w:tc>
@@ -29313,7 +29381,7 @@
               <w:rPr>
                 <w:sz w:val="20"/>
               </w:rPr>
-              <w:t>Sistema válido; el cobre antecede al retorno</w:t>
+              <w:t>Relación de largo plazo confirmada (reconfigurada en 2008)</w:t>
             </w:r>
           </w:p>
         </w:tc>
@@ -29341,7 +29409,7 @@
               <w:rPr>
                 <w:sz w:val="20"/>
               </w:rPr>
-              <w:t>Corrección por pruebas múltiples (FDR)</w:t>
+              <w:t>Estabilidad del VAR y causalidad de Granger</w:t>
             </w:r>
           </w:p>
         </w:tc>
@@ -29364,13 +29432,7 @@
               <w:rPr>
                 <w:sz w:val="20"/>
               </w:rPr>
-              <w:t xml:space="preserve">sig.: Cobre, </w:t>
-            </w:r>
-            <w:r>
-              <w:rPr>
-                <w:sz w:val="20"/>
-              </w:rPr>
-              <w:t>VIX, TC CLP</w:t>
+              <w:t>estable = True; Granger cobre→retorno p = 0.0026</w:t>
             </w:r>
           </w:p>
         </w:tc>
@@ -29393,7 +29455,7 @@
               <w:rPr>
                 <w:sz w:val="20"/>
               </w:rPr>
-              <w:t>Los hallazgos centrales no son falsos positivos</w:t>
+              <w:t>Sistema válido; el cobre antecede al retorno</w:t>
             </w:r>
           </w:p>
         </w:tc>
@@ -29421,7 +29483,7 @@
               <w:rPr>
                 <w:sz w:val="20"/>
               </w:rPr>
-              <w:t>Volatilidad asimétrica (GJR-GARCH)</w:t>
+              <w:t>Corrección por pruebas múltiples (FDR)</w:t>
             </w:r>
           </w:p>
         </w:tc>
@@ -29444,7 +29506,7 @@
               <w:rPr>
                 <w:sz w:val="20"/>
               </w:rPr>
-              <w:t>γ = 0.2208, p = 0.0233</w:t>
+              <w:t>sig.: Cobre, VIX, TC CLP</w:t>
             </w:r>
           </w:p>
         </w:tc>
@@ -29467,7 +29529,7 @@
               <w:rPr>
                 <w:sz w:val="20"/>
               </w:rPr>
-              <w:t>Efecto apalancamiento significativo</w:t>
+              <w:t>Los hallazgos centrales no son falsos positivos</w:t>
             </w:r>
           </w:p>
         </w:tc>
@@ -29495,7 +29557,7 @@
               <w:rPr>
                 <w:sz w:val="20"/>
               </w:rPr>
-              <w:t>Estabilidad por fase del ciclo (interacción)</w:t>
+              <w:t>Volatilidad asimétrica (GJR-GARCH)</w:t>
             </w:r>
           </w:p>
         </w:tc>
@@ -29518,7 +29580,13 @@
               <w:rPr>
                 <w:sz w:val="20"/>
               </w:rPr>
-              <w:t>cobre×exp p = 0.6267</w:t>
+              <w:t xml:space="preserve">γ = </w:t>
+            </w:r>
+            <w:r>
+              <w:rPr>
+                <w:sz w:val="20"/>
+              </w:rPr>
+              <w:t>0.2208, p = 0.0233</w:t>
             </w:r>
           </w:p>
         </w:tc>
@@ -29541,13 +29609,7 @@
               <w:rPr>
                 <w:sz w:val="20"/>
               </w:rPr>
-              <w:t xml:space="preserve">Sensibilidad estable entre </w:t>
-            </w:r>
-            <w:r>
-              <w:rPr>
-                <w:sz w:val="20"/>
-              </w:rPr>
-              <w:t>regímenes</w:t>
+              <w:t>Efecto apalancamiento significativo</w:t>
             </w:r>
           </w:p>
         </w:tc>
@@ -29575,7 +29637,7 @@
               <w:rPr>
                 <w:sz w:val="20"/>
               </w:rPr>
-              <w:t>Robustez por subperíodos</w:t>
+              <w:t>Estabilidad por fase del ciclo (interacción)</w:t>
             </w:r>
           </w:p>
         </w:tc>
@@ -29598,7 +29660,7 @@
               <w:rPr>
                 <w:sz w:val="20"/>
               </w:rPr>
-              <w:t>β cobre 0.5594 → 0.7509</w:t>
+              <w:t>cobre×exp p = 0.6267</w:t>
             </w:r>
           </w:p>
         </w:tc>
@@ -29621,7 +29683,7 @@
               <w:rPr>
                 <w:sz w:val="20"/>
               </w:rPr>
-              <w:t>Efecto estable, se intensifica tras 2020</w:t>
+              <w:t>Sensibilidad estable entre regímenes</w:t>
             </w:r>
           </w:p>
         </w:tc>
@@ -29649,7 +29711,7 @@
               <w:rPr>
                 <w:sz w:val="20"/>
               </w:rPr>
-              <w:t>Igualdad de coeficientes entre mercados (H7)</w:t>
+              <w:t>Robustez por subperíodos</w:t>
             </w:r>
           </w:p>
         </w:tc>
@@ -29672,7 +29734,7 @@
               <w:rPr>
                 <w:sz w:val="20"/>
               </w:rPr>
-              <w:t>d_cobre×global = +0,25 (p = 0,01)</w:t>
+              <w:t>β cobre 0.5594 → 0.7509</w:t>
             </w:r>
           </w:p>
         </w:tc>
@@ -29695,7 +29757,7 @@
               <w:rPr>
                 <w:sz w:val="20"/>
               </w:rPr>
-              <w:t>Mayor sensibilidad en el mercado internacional</w:t>
+              <w:t>Efecto estable, se intensifica tras 2020</w:t>
             </w:r>
           </w:p>
         </w:tc>
@@ -29723,7 +29785,14 @@
               <w:rPr>
                 <w:sz w:val="20"/>
               </w:rPr>
-              <w:t>Razón de varianzas (Lo-MacKinlay)</w:t>
+              <w:t>Igualdad de coeficientes entre mer</w:t>
+            </w:r>
+            <w:r>
+              <w:rPr>
+                <w:sz w:val="20"/>
+              </w:rPr>
+              <w:lastRenderedPageBreak/>
+              <w:t>cados (H7)</w:t>
             </w:r>
           </w:p>
         </w:tc>
@@ -29746,7 +29815,8 @@
               <w:rPr>
                 <w:sz w:val="20"/>
               </w:rPr>
-              <w:t>cartera: no rechaza paseo aleatorio</w:t>
+              <w:lastRenderedPageBreak/>
+              <w:t>d_cobre×global = +0,25 (p = 0,01)</w:t>
             </w:r>
           </w:p>
         </w:tc>
@@ -29769,7 +29839,14 @@
               <w:rPr>
                 <w:sz w:val="20"/>
               </w:rPr>
-              <w:t>Eficiencia débil del lado accionario</w:t>
+              <w:t xml:space="preserve">Mayor sensibilidad en el mercado </w:t>
+            </w:r>
+            <w:r>
+              <w:rPr>
+                <w:sz w:val="20"/>
+              </w:rPr>
+              <w:lastRenderedPageBreak/>
+              <w:t>internacional</w:t>
             </w:r>
           </w:p>
         </w:tc>
@@ -29781,9 +29858,6 @@
         <w:tc>
           <w:tcPr>
             <w:tcW w:w="3041" w:type="dxa"/>
-            <w:tcBorders>
-              <w:bottom w:val="single" w:sz="14" w:space="0" w:color="1F3864"/>
-            </w:tcBorders>
             <w:tcMar>
               <w:top w:w="60" w:type="dxa"/>
               <w:left w:w="80" w:type="dxa"/>
@@ -29801,10 +29875,61 @@
                 <w:sz w:val="20"/>
               </w:rPr>
               <w:lastRenderedPageBreak/>
-              <w:t>Local Projections (Jordà)</w:t>
-            </w:r>
-          </w:p>
-        </w:tc>
+              <w:t>Razón de varianzas (Lo-MacKinlay)</w:t>
+            </w:r>
+          </w:p>
+        </w:tc>
+        <w:tc>
+          <w:tcPr>
+            <w:tcW w:w="3041" w:type="dxa"/>
+            <w:tcMar>
+              <w:top w:w="60" w:type="dxa"/>
+              <w:left w:w="80" w:type="dxa"/>
+              <w:bottom w:w="60" w:type="dxa"/>
+              <w:right w:w="80" w:type="dxa"/>
+            </w:tcMar>
+          </w:tcPr>
+          <w:p>
+            <w:pPr>
+              <w:spacing w:after="40" w:line="240" w:lineRule="auto"/>
+              <w:jc w:val="center"/>
+            </w:pPr>
+            <w:r>
+              <w:rPr>
+                <w:sz w:val="20"/>
+              </w:rPr>
+              <w:t>cartera: no rechaza paseo aleatorio</w:t>
+            </w:r>
+          </w:p>
+        </w:tc>
+        <w:tc>
+          <w:tcPr>
+            <w:tcW w:w="3041" w:type="dxa"/>
+            <w:tcMar>
+              <w:top w:w="60" w:type="dxa"/>
+              <w:left w:w="80" w:type="dxa"/>
+              <w:bottom w:w="60" w:type="dxa"/>
+              <w:right w:w="80" w:type="dxa"/>
+            </w:tcMar>
+          </w:tcPr>
+          <w:p>
+            <w:pPr>
+              <w:spacing w:after="40" w:line="240" w:lineRule="auto"/>
+              <w:jc w:val="center"/>
+            </w:pPr>
+            <w:r>
+              <w:rPr>
+                <w:sz w:val="20"/>
+              </w:rPr>
+              <w:t>Eficiencia débil del lado accionario</w:t>
+            </w:r>
+          </w:p>
+        </w:tc>
+      </w:tr>
+      <w:tr>
+        <w:trPr>
+          <w:jc w:val="center"/>
+        </w:trPr>
         <w:tc>
           <w:tcPr>
             <w:tcW w:w="3041" w:type="dxa"/>
@@ -29821,13 +29946,19 @@
           <w:p>
             <w:pPr>
               <w:spacing w:after="40" w:line="240" w:lineRule="auto"/>
-              <w:jc w:val="center"/>
-            </w:pPr>
-            <w:r>
-              <w:rPr>
-                <w:sz w:val="20"/>
-              </w:rPr>
-              <w:t>respuesta positiva al impacto</w:t>
+              <w:jc w:val="left"/>
+            </w:pPr>
+            <w:r>
+              <w:rPr>
+                <w:sz w:val="20"/>
+              </w:rPr>
+              <w:t xml:space="preserve">Local </w:t>
+            </w:r>
+            <w:r>
+              <w:rPr>
+                <w:sz w:val="20"/>
+              </w:rPr>
+              <w:t>Projections (Jordà)</w:t>
             </w:r>
           </w:p>
         </w:tc>
@@ -29853,6 +29984,32 @@
               <w:rPr>
                 <w:sz w:val="20"/>
               </w:rPr>
+              <w:t>respuesta positiva al impacto</w:t>
+            </w:r>
+          </w:p>
+        </w:tc>
+        <w:tc>
+          <w:tcPr>
+            <w:tcW w:w="3041" w:type="dxa"/>
+            <w:tcBorders>
+              <w:bottom w:val="single" w:sz="14" w:space="0" w:color="1F3864"/>
+            </w:tcBorders>
+            <w:tcMar>
+              <w:top w:w="60" w:type="dxa"/>
+              <w:left w:w="80" w:type="dxa"/>
+              <w:bottom w:w="60" w:type="dxa"/>
+              <w:right w:w="80" w:type="dxa"/>
+            </w:tcMar>
+          </w:tcPr>
+          <w:p>
+            <w:pPr>
+              <w:spacing w:after="40" w:line="240" w:lineRule="auto"/>
+              <w:jc w:val="center"/>
+            </w:pPr>
+            <w:r>
+              <w:rPr>
+                <w:sz w:val="20"/>
+              </w:rPr>
               <w:t>Cross-valida la IRF del VAR</w:t>
             </w:r>
           </w:p>
@@ -29868,7 +30025,7 @@
       <w:pPr>
         <w:pStyle w:val="Ttulo2"/>
       </w:pPr>
-      <w:bookmarkStart w:id="90" w:name="_Toc231102618"/>
+      <w:bookmarkStart w:id="90" w:name="_Toc231108434"/>
       <w:r>
         <w:t>Anexo I. Extensión predictiva: ¿explican o anticipan?</w:t>
       </w:r>
@@ -29894,7 +30051,7 @@
         <w:spacing w:before="40" w:after="40"/>
         <w:jc w:val="center"/>
       </w:pPr>
-      <w:bookmarkStart w:id="91" w:name="_Toc231102634"/>
+      <w:bookmarkStart w:id="91" w:name="_Toc231108450"/>
       <w:r>
         <w:rPr>
           <w:i w:val="0"/>
@@ -30770,7 +30927,11 @@
         <w:t>retornos del sector</w:t>
       </w:r>
       <w:r>
-        <w:t xml:space="preserve"> el paseo aleatorio </w:t>
+        <w:t xml:space="preserve"> el paseo </w:t>
+      </w:r>
+      <w:r>
+        <w:lastRenderedPageBreak/>
+        <w:t xml:space="preserve">aleatorio </w:t>
       </w:r>
       <w:r>
         <w:rPr>
@@ -30791,7 +30952,7 @@
       <w:pPr>
         <w:pStyle w:val="Ttulo1"/>
       </w:pPr>
-      <w:bookmarkStart w:id="92" w:name="_Toc231102619"/>
+      <w:bookmarkStart w:id="92" w:name="_Toc231108435"/>
       <w:r>
         <w:lastRenderedPageBreak/>
         <w:t>Glosario de términos econométricos</w:t>
@@ -30896,7 +31057,10 @@
     </w:p>
     <w:p>
       <w:r>
-        <w:t>en el tiempo de cada unidad mediante interceptos específicos.</w:t>
+        <w:t xml:space="preserve">en el tiempo de cada unidad mediante </w:t>
+      </w:r>
+      <w:r>
+        <w:t>interceptos específicos.</w:t>
       </w:r>
     </w:p>
     <w:p>
@@ -30945,7 +31109,10 @@
     </w:p>
     <w:p>
       <w:r>
-        <w:t>tiempo, con agrupamiento de la volatilidad; típica de los retornos financieros.</w:t>
+        <w:t xml:space="preserve">tiempo, con agrupamiento de la volatilidad; típica de los retornos </w:t>
+      </w:r>
+      <w:r>
+        <w:t>financieros.</w:t>
       </w:r>
     </w:p>
     <w:p>
@@ -31422,31 +31589,31 @@
       </w:rPr>
     </w:lvl>
   </w:abstractNum>
-  <w:num w:numId="1" w16cid:durableId="1000084999">
+  <w:num w:numId="1" w16cid:durableId="599409951">
     <w:abstractNumId w:val="8"/>
   </w:num>
-  <w:num w:numId="2" w16cid:durableId="1827043909">
+  <w:num w:numId="2" w16cid:durableId="981085192">
     <w:abstractNumId w:val="6"/>
   </w:num>
-  <w:num w:numId="3" w16cid:durableId="731543181">
+  <w:num w:numId="3" w16cid:durableId="1747412826">
     <w:abstractNumId w:val="5"/>
   </w:num>
-  <w:num w:numId="4" w16cid:durableId="303706333">
+  <w:num w:numId="4" w16cid:durableId="1848596827">
     <w:abstractNumId w:val="4"/>
   </w:num>
-  <w:num w:numId="5" w16cid:durableId="1903170606">
+  <w:num w:numId="5" w16cid:durableId="294259346">
     <w:abstractNumId w:val="7"/>
   </w:num>
-  <w:num w:numId="6" w16cid:durableId="693652175">
+  <w:num w:numId="6" w16cid:durableId="76706166">
     <w:abstractNumId w:val="3"/>
   </w:num>
-  <w:num w:numId="7" w16cid:durableId="587814919">
+  <w:num w:numId="7" w16cid:durableId="61761104">
     <w:abstractNumId w:val="2"/>
   </w:num>
-  <w:num w:numId="8" w16cid:durableId="1306275135">
+  <w:num w:numId="8" w16cid:durableId="1907371976">
     <w:abstractNumId w:val="1"/>
   </w:num>
-  <w:num w:numId="9" w16cid:durableId="346638664">
+  <w:num w:numId="9" w16cid:durableId="1884320394">
     <w:abstractNumId w:val="0"/>
   </w:num>
 </w:numbering>
@@ -42848,7 +43015,7 @@
     <w:autoRedefine/>
     <w:uiPriority w:val="39"/>
     <w:unhideWhenUsed/>
-    <w:rsid w:val="00A82505"/>
+    <w:rsid w:val="00ED0116"/>
     <w:pPr>
       <w:spacing w:after="100"/>
     </w:pPr>
@@ -42860,7 +43027,7 @@
     <w:autoRedefine/>
     <w:uiPriority w:val="39"/>
     <w:unhideWhenUsed/>
-    <w:rsid w:val="00A82505"/>
+    <w:rsid w:val="00ED0116"/>
     <w:pPr>
       <w:spacing w:after="100"/>
       <w:ind w:left="240"/>
@@ -42873,7 +43040,7 @@
     <w:autoRedefine/>
     <w:uiPriority w:val="39"/>
     <w:unhideWhenUsed/>
-    <w:rsid w:val="00A82505"/>
+    <w:rsid w:val="00ED0116"/>
     <w:pPr>
       <w:spacing w:after="100"/>
       <w:ind w:left="480"/>
@@ -42884,7 +43051,7 @@
     <w:basedOn w:val="Fuentedeprrafopredeter"/>
     <w:uiPriority w:val="99"/>
     <w:unhideWhenUsed/>
-    <w:rsid w:val="00A82505"/>
+    <w:rsid w:val="00ED0116"/>
     <w:rPr>
       <w:color w:val="0000FF" w:themeColor="hyperlink"/>
       <w:u w:val="single"/>
@@ -42896,7 +43063,7 @@
     <w:next w:val="Normal"/>
     <w:uiPriority w:val="99"/>
     <w:unhideWhenUsed/>
-    <w:rsid w:val="00A82505"/>
+    <w:rsid w:val="00ED0116"/>
     <w:pPr>
       <w:spacing w:after="0"/>
     </w:pPr>

</xml_diff>

<commit_message>
Coherencia institucional: USS Senor de Sipan en toda la tesis y material
- build_thesis: pagina de aprobacion alineada al formato USS (sin 'San Sebastian')
- build_pptx, README, docs/portada.md, assets/COMO_AGREGAR_LOGO.md y notas de
  investigacion: reemplazo de 'San Sebastian / Magister en Data Science' por
  'Universidad Senor de Sipan'
- Regenerados Tesis (75 pp) y Compendio sin referencias obsoletas

Co-Authored-By: Claude Opus 4.8 <noreply@anthropic.com>
</commit_message>
<xml_diff>
--- a/outputs/Tesis_Francisco_Rietta.docx
+++ b/outputs/Tesis_Francisco_Rietta.docx
@@ -254,7 +254,7 @@
       <w:pPr>
         <w:pStyle w:val="Ttulo1"/>
       </w:pPr>
-      <w:bookmarkStart w:id="0" w:name="_Toc231121707"/>
+      <w:bookmarkStart w:id="0" w:name="_Toc231135533"/>
       <w:r>
         <w:lastRenderedPageBreak/>
         <w:t>Página de aprobación</w:t>
@@ -268,7 +268,7 @@
         </w:rPr>
       </w:pPr>
       <w:r>
-        <w:t>La presente tesis ha sido revisada y aprobada por la comisión examinadora abajo firmante, como requisito para optar al grado de Magíster en Data Science de la Universidad San Sebastián.</w:t>
+        <w:t>La presente tesis ha sido revisada y aprobada por la comisión examinadora abajo firmante, como requisito para optar el título profesional / grado académico de [Grado o Título] en la Universidad Señor de Sipán.</w:t>
       </w:r>
     </w:p>
     <w:p>
@@ -385,7 +385,10 @@
         </w:rPr>
       </w:pPr>
       <w:r>
-        <w:t>Calificación final: __________        Fecha: ____ / ____ / ______</w:t>
+        <w:t xml:space="preserve">Calificación final: __________        Fecha: ____ / ____ / </w:t>
+      </w:r>
+      <w:r>
+        <w:t>______</w:t>
       </w:r>
     </w:p>
     <w:p>
@@ -402,7 +405,7 @@
       <w:pPr>
         <w:pStyle w:val="Ttulo1"/>
       </w:pPr>
-      <w:bookmarkStart w:id="1" w:name="_Toc231121708"/>
+      <w:bookmarkStart w:id="1" w:name="_Toc231135534"/>
       <w:r>
         <w:lastRenderedPageBreak/>
         <w:t>Declaración de originalidad</w:t>
@@ -477,7 +480,7 @@
       <w:pPr>
         <w:pStyle w:val="Ttulo1"/>
       </w:pPr>
-      <w:bookmarkStart w:id="2" w:name="_Toc231121709"/>
+      <w:bookmarkStart w:id="2" w:name="_Toc231135535"/>
       <w:r>
         <w:lastRenderedPageBreak/>
         <w:t>Dedicatoria</w:t>
@@ -527,7 +530,7 @@
       <w:pPr>
         <w:pStyle w:val="Ttulo1"/>
       </w:pPr>
-      <w:bookmarkStart w:id="3" w:name="_Toc231121710"/>
+      <w:bookmarkStart w:id="3" w:name="_Toc231135536"/>
       <w:r>
         <w:lastRenderedPageBreak/>
         <w:t>Agradecimientos</w:t>
@@ -575,7 +578,7 @@
       <w:pPr>
         <w:pStyle w:val="Ttulo1"/>
       </w:pPr>
-      <w:bookmarkStart w:id="4" w:name="_Toc231121711"/>
+      <w:bookmarkStart w:id="4" w:name="_Toc231135537"/>
       <w:r>
         <w:lastRenderedPageBreak/>
         <w:t>Resumen</w:t>
@@ -628,7 +631,7 @@
       <w:pPr>
         <w:pStyle w:val="Ttulo1"/>
       </w:pPr>
-      <w:bookmarkStart w:id="5" w:name="_Toc231121712"/>
+      <w:bookmarkStart w:id="5" w:name="_Toc231135538"/>
       <w:r>
         <w:lastRenderedPageBreak/>
         <w:t>Abstract</w:t>
@@ -678,7 +681,7 @@
       <w:pPr>
         <w:pStyle w:val="Ttulo1"/>
       </w:pPr>
-      <w:bookmarkStart w:id="6" w:name="_Toc231121713"/>
+      <w:bookmarkStart w:id="6" w:name="_Toc231135539"/>
       <w:r>
         <w:lastRenderedPageBreak/>
         <w:t>Índice general</w:t>
@@ -710,7 +713,7 @@
       <w:r>
         <w:fldChar w:fldCharType="separate"/>
       </w:r>
-      <w:hyperlink w:anchor="_Toc231121707" w:history="1">
+      <w:hyperlink w:anchor="_Toc231135533" w:history="1">
         <w:r>
           <w:rPr>
             <w:rStyle w:val="Hipervnculo"/>
@@ -737,7 +740,7 @@
             <w:noProof/>
             <w:webHidden/>
           </w:rPr>
-          <w:instrText xml:space="preserve"> PAGEREF _Toc231121707 \h </w:instrText>
+          <w:instrText xml:space="preserve"> PAGEREF _Toc231135533 \h </w:instrText>
         </w:r>
         <w:r>
           <w:rPr>
@@ -784,7 +787,7 @@
           <w14:ligatures w14:val="standardContextual"/>
         </w:rPr>
       </w:pPr>
-      <w:hyperlink w:anchor="_Toc231121708" w:history="1">
+      <w:hyperlink w:anchor="_Toc231135534" w:history="1">
         <w:r>
           <w:rPr>
             <w:rStyle w:val="Hipervnculo"/>
@@ -811,7 +814,7 @@
             <w:noProof/>
             <w:webHidden/>
           </w:rPr>
-          <w:instrText xml:space="preserve"> PAGEREF _Toc231121708 \h </w:instrText>
+          <w:instrText xml:space="preserve"> PAGEREF _Toc231135534 \h </w:instrText>
         </w:r>
         <w:r>
           <w:rPr>
@@ -858,7 +861,7 @@
           <w14:ligatures w14:val="standardContextual"/>
         </w:rPr>
       </w:pPr>
-      <w:hyperlink w:anchor="_Toc231121709" w:history="1">
+      <w:hyperlink w:anchor="_Toc231135535" w:history="1">
         <w:r>
           <w:rPr>
             <w:rStyle w:val="Hipervnculo"/>
@@ -885,7 +888,7 @@
             <w:noProof/>
             <w:webHidden/>
           </w:rPr>
-          <w:instrText xml:space="preserve"> PAGEREF _Toc231121709 \h </w:instrText>
+          <w:instrText xml:space="preserve"> PAGEREF _Toc231135535 \h </w:instrText>
         </w:r>
         <w:r>
           <w:rPr>
@@ -932,7 +935,7 @@
           <w14:ligatures w14:val="standardContextual"/>
         </w:rPr>
       </w:pPr>
-      <w:hyperlink w:anchor="_Toc231121710" w:history="1">
+      <w:hyperlink w:anchor="_Toc231135536" w:history="1">
         <w:r>
           <w:rPr>
             <w:rStyle w:val="Hipervnculo"/>
@@ -959,7 +962,7 @@
             <w:noProof/>
             <w:webHidden/>
           </w:rPr>
-          <w:instrText xml:space="preserve"> PAGEREF _Toc231121710 \h </w:instrText>
+          <w:instrText xml:space="preserve"> PAGEREF _Toc231135536 \h </w:instrText>
         </w:r>
         <w:r>
           <w:rPr>
@@ -1006,7 +1009,7 @@
           <w14:ligatures w14:val="standardContextual"/>
         </w:rPr>
       </w:pPr>
-      <w:hyperlink w:anchor="_Toc231121711" w:history="1">
+      <w:hyperlink w:anchor="_Toc231135537" w:history="1">
         <w:r>
           <w:rPr>
             <w:rStyle w:val="Hipervnculo"/>
@@ -1033,7 +1036,7 @@
             <w:noProof/>
             <w:webHidden/>
           </w:rPr>
-          <w:instrText xml:space="preserve"> PAGEREF _Toc231121711 \h </w:instrText>
+          <w:instrText xml:space="preserve"> PAGEREF _Toc231135537 \h </w:instrText>
         </w:r>
         <w:r>
           <w:rPr>
@@ -1080,7 +1083,7 @@
           <w14:ligatures w14:val="standardContextual"/>
         </w:rPr>
       </w:pPr>
-      <w:hyperlink w:anchor="_Toc231121712" w:history="1">
+      <w:hyperlink w:anchor="_Toc231135538" w:history="1">
         <w:r>
           <w:rPr>
             <w:rStyle w:val="Hipervnculo"/>
@@ -1107,7 +1110,7 @@
             <w:noProof/>
             <w:webHidden/>
           </w:rPr>
-          <w:instrText xml:space="preserve"> PAGEREF _Toc231121712 \h </w:instrText>
+          <w:instrText xml:space="preserve"> PAGEREF _Toc231135538 \h </w:instrText>
         </w:r>
         <w:r>
           <w:rPr>
@@ -1154,7 +1157,7 @@
           <w14:ligatures w14:val="standardContextual"/>
         </w:rPr>
       </w:pPr>
-      <w:hyperlink w:anchor="_Toc231121713" w:history="1">
+      <w:hyperlink w:anchor="_Toc231135539" w:history="1">
         <w:r>
           <w:rPr>
             <w:rStyle w:val="Hipervnculo"/>
@@ -1181,7 +1184,7 @@
             <w:noProof/>
             <w:webHidden/>
           </w:rPr>
-          <w:instrText xml:space="preserve"> PAGEREF _Toc231121713 \h </w:instrText>
+          <w:instrText xml:space="preserve"> PAGEREF _Toc231135539 \h </w:instrText>
         </w:r>
         <w:r>
           <w:rPr>
@@ -1228,7 +1231,7 @@
           <w14:ligatures w14:val="standardContextual"/>
         </w:rPr>
       </w:pPr>
-      <w:hyperlink w:anchor="_Toc231121714" w:history="1">
+      <w:hyperlink w:anchor="_Toc231135540" w:history="1">
         <w:r>
           <w:rPr>
             <w:rStyle w:val="Hipervnculo"/>
@@ -1255,7 +1258,7 @@
             <w:noProof/>
             <w:webHidden/>
           </w:rPr>
-          <w:instrText xml:space="preserve"> PAGEREF _Toc231121714 \h </w:instrText>
+          <w:instrText xml:space="preserve"> PAGEREF _Toc231135540 \h </w:instrText>
         </w:r>
         <w:r>
           <w:rPr>
@@ -1302,7 +1305,7 @@
           <w14:ligatures w14:val="standardContextual"/>
         </w:rPr>
       </w:pPr>
-      <w:hyperlink w:anchor="_Toc231121715" w:history="1">
+      <w:hyperlink w:anchor="_Toc231135541" w:history="1">
         <w:r>
           <w:rPr>
             <w:rStyle w:val="Hipervnculo"/>
@@ -1329,7 +1332,7 @@
             <w:noProof/>
             <w:webHidden/>
           </w:rPr>
-          <w:instrText xml:space="preserve"> PAGEREF _Toc231121715 \h </w:instrText>
+          <w:instrText xml:space="preserve"> PAGEREF _Toc231135541 \h </w:instrText>
         </w:r>
         <w:r>
           <w:rPr>
@@ -1376,7 +1379,7 @@
           <w14:ligatures w14:val="standardContextual"/>
         </w:rPr>
       </w:pPr>
-      <w:hyperlink w:anchor="_Toc231121716" w:history="1">
+      <w:hyperlink w:anchor="_Toc231135542" w:history="1">
         <w:r>
           <w:rPr>
             <w:rStyle w:val="Hipervnculo"/>
@@ -1403,7 +1406,7 @@
             <w:noProof/>
             <w:webHidden/>
           </w:rPr>
-          <w:instrText xml:space="preserve"> PAGEREF _Toc231121716 \h </w:instrText>
+          <w:instrText xml:space="preserve"> PAGEREF _Toc231135542 \h </w:instrText>
         </w:r>
         <w:r>
           <w:rPr>
@@ -1450,7 +1453,7 @@
           <w14:ligatures w14:val="standardContextual"/>
         </w:rPr>
       </w:pPr>
-      <w:hyperlink w:anchor="_Toc231121717" w:history="1">
+      <w:hyperlink w:anchor="_Toc231135543" w:history="1">
         <w:r>
           <w:rPr>
             <w:rStyle w:val="Hipervnculo"/>
@@ -1477,7 +1480,7 @@
             <w:noProof/>
             <w:webHidden/>
           </w:rPr>
-          <w:instrText xml:space="preserve"> PAGEREF _Toc231121717 \h </w:instrText>
+          <w:instrText xml:space="preserve"> PAGEREF _Toc231135543 \h </w:instrText>
         </w:r>
         <w:r>
           <w:rPr>
@@ -1524,7 +1527,7 @@
           <w14:ligatures w14:val="standardContextual"/>
         </w:rPr>
       </w:pPr>
-      <w:hyperlink w:anchor="_Toc231121718" w:history="1">
+      <w:hyperlink w:anchor="_Toc231135544" w:history="1">
         <w:r>
           <w:rPr>
             <w:rStyle w:val="Hipervnculo"/>
@@ -1551,7 +1554,7 @@
             <w:noProof/>
             <w:webHidden/>
           </w:rPr>
-          <w:instrText xml:space="preserve"> PAGEREF _Toc231121718 \h </w:instrText>
+          <w:instrText xml:space="preserve"> PAGEREF _Toc231135544 \h </w:instrText>
         </w:r>
         <w:r>
           <w:rPr>
@@ -1598,7 +1601,7 @@
           <w14:ligatures w14:val="standardContextual"/>
         </w:rPr>
       </w:pPr>
-      <w:hyperlink w:anchor="_Toc231121719" w:history="1">
+      <w:hyperlink w:anchor="_Toc231135545" w:history="1">
         <w:r>
           <w:rPr>
             <w:rStyle w:val="Hipervnculo"/>
@@ -1625,7 +1628,7 @@
             <w:noProof/>
             <w:webHidden/>
           </w:rPr>
-          <w:instrText xml:space="preserve"> PAGEREF _Toc231121719 \h </w:instrText>
+          <w:instrText xml:space="preserve"> PAGEREF _Toc231135545 \h </w:instrText>
         </w:r>
         <w:r>
           <w:rPr>
@@ -1672,7 +1675,7 @@
           <w14:ligatures w14:val="standardContextual"/>
         </w:rPr>
       </w:pPr>
-      <w:hyperlink w:anchor="_Toc231121720" w:history="1">
+      <w:hyperlink w:anchor="_Toc231135546" w:history="1">
         <w:r>
           <w:rPr>
             <w:rStyle w:val="Hipervnculo"/>
@@ -1699,7 +1702,7 @@
             <w:noProof/>
             <w:webHidden/>
           </w:rPr>
-          <w:instrText xml:space="preserve"> PAGEREF _Toc231121720 \h </w:instrText>
+          <w:instrText xml:space="preserve"> PAGEREF _Toc231135546 \h </w:instrText>
         </w:r>
         <w:r>
           <w:rPr>
@@ -1746,7 +1749,7 @@
           <w14:ligatures w14:val="standardContextual"/>
         </w:rPr>
       </w:pPr>
-      <w:hyperlink w:anchor="_Toc231121721" w:history="1">
+      <w:hyperlink w:anchor="_Toc231135547" w:history="1">
         <w:r>
           <w:rPr>
             <w:rStyle w:val="Hipervnculo"/>
@@ -1773,7 +1776,7 @@
             <w:noProof/>
             <w:webHidden/>
           </w:rPr>
-          <w:instrText xml:space="preserve"> PAGEREF _Toc231121721 \h </w:instrText>
+          <w:instrText xml:space="preserve"> PAGEREF _Toc231135547 \h </w:instrText>
         </w:r>
         <w:r>
           <w:rPr>
@@ -1820,7 +1823,7 @@
           <w14:ligatures w14:val="standardContextual"/>
         </w:rPr>
       </w:pPr>
-      <w:hyperlink w:anchor="_Toc231121722" w:history="1">
+      <w:hyperlink w:anchor="_Toc231135548" w:history="1">
         <w:r>
           <w:rPr>
             <w:rStyle w:val="Hipervnculo"/>
@@ -1847,7 +1850,7 @@
             <w:noProof/>
             <w:webHidden/>
           </w:rPr>
-          <w:instrText xml:space="preserve"> PAGEREF _Toc231121722 \h </w:instrText>
+          <w:instrText xml:space="preserve"> PAGEREF _Toc231135548 \h </w:instrText>
         </w:r>
         <w:r>
           <w:rPr>
@@ -1894,7 +1897,7 @@
           <w14:ligatures w14:val="standardContextual"/>
         </w:rPr>
       </w:pPr>
-      <w:hyperlink w:anchor="_Toc231121723" w:history="1">
+      <w:hyperlink w:anchor="_Toc231135549" w:history="1">
         <w:r>
           <w:rPr>
             <w:rStyle w:val="Hipervnculo"/>
@@ -1921,7 +1924,7 @@
             <w:noProof/>
             <w:webHidden/>
           </w:rPr>
-          <w:instrText xml:space="preserve"> PAGEREF _Toc231121723 \h </w:instrText>
+          <w:instrText xml:space="preserve"> PAGEREF _Toc231135549 \h </w:instrText>
         </w:r>
         <w:r>
           <w:rPr>
@@ -1968,7 +1971,7 @@
           <w14:ligatures w14:val="standardContextual"/>
         </w:rPr>
       </w:pPr>
-      <w:hyperlink w:anchor="_Toc231121724" w:history="1">
+      <w:hyperlink w:anchor="_Toc231135550" w:history="1">
         <w:r>
           <w:rPr>
             <w:rStyle w:val="Hipervnculo"/>
@@ -1995,7 +1998,7 @@
             <w:noProof/>
             <w:webHidden/>
           </w:rPr>
-          <w:instrText xml:space="preserve"> PAGEREF _Toc231121724 \h </w:instrText>
+          <w:instrText xml:space="preserve"> PAGEREF _Toc231135550 \h </w:instrText>
         </w:r>
         <w:r>
           <w:rPr>
@@ -2042,7 +2045,7 @@
           <w14:ligatures w14:val="standardContextual"/>
         </w:rPr>
       </w:pPr>
-      <w:hyperlink w:anchor="_Toc231121725" w:history="1">
+      <w:hyperlink w:anchor="_Toc231135551" w:history="1">
         <w:r>
           <w:rPr>
             <w:rStyle w:val="Hipervnculo"/>
@@ -2069,7 +2072,7 @@
             <w:noProof/>
             <w:webHidden/>
           </w:rPr>
-          <w:instrText xml:space="preserve"> PAGEREF _Toc231121725 \h </w:instrText>
+          <w:instrText xml:space="preserve"> PAGEREF _Toc231135551 \h </w:instrText>
         </w:r>
         <w:r>
           <w:rPr>
@@ -2116,7 +2119,7 @@
           <w14:ligatures w14:val="standardContextual"/>
         </w:rPr>
       </w:pPr>
-      <w:hyperlink w:anchor="_Toc231121726" w:history="1">
+      <w:hyperlink w:anchor="_Toc231135552" w:history="1">
         <w:r>
           <w:rPr>
             <w:rStyle w:val="Hipervnculo"/>
@@ -2143,7 +2146,7 @@
             <w:noProof/>
             <w:webHidden/>
           </w:rPr>
-          <w:instrText xml:space="preserve"> PAGEREF _Toc231121726 \h </w:instrText>
+          <w:instrText xml:space="preserve"> PAGEREF _Toc231135552 \h </w:instrText>
         </w:r>
         <w:r>
           <w:rPr>
@@ -2190,7 +2193,7 @@
           <w14:ligatures w14:val="standardContextual"/>
         </w:rPr>
       </w:pPr>
-      <w:hyperlink w:anchor="_Toc231121727" w:history="1">
+      <w:hyperlink w:anchor="_Toc231135553" w:history="1">
         <w:r>
           <w:rPr>
             <w:rStyle w:val="Hipervnculo"/>
@@ -2217,7 +2220,7 @@
             <w:noProof/>
             <w:webHidden/>
           </w:rPr>
-          <w:instrText xml:space="preserve"> PAGEREF _Toc231121727 \h </w:instrText>
+          <w:instrText xml:space="preserve"> PAGEREF _Toc231135553 \h </w:instrText>
         </w:r>
         <w:r>
           <w:rPr>
@@ -2264,7 +2267,7 @@
           <w14:ligatures w14:val="standardContextual"/>
         </w:rPr>
       </w:pPr>
-      <w:hyperlink w:anchor="_Toc231121728" w:history="1">
+      <w:hyperlink w:anchor="_Toc231135554" w:history="1">
         <w:r>
           <w:rPr>
             <w:rStyle w:val="Hipervnculo"/>
@@ -2291,7 +2294,7 @@
             <w:noProof/>
             <w:webHidden/>
           </w:rPr>
-          <w:instrText xml:space="preserve"> PAGEREF _Toc231121728 \h </w:instrText>
+          <w:instrText xml:space="preserve"> PAGEREF _Toc231135554 \h </w:instrText>
         </w:r>
         <w:r>
           <w:rPr>
@@ -2338,7 +2341,7 @@
           <w14:ligatures w14:val="standardContextual"/>
         </w:rPr>
       </w:pPr>
-      <w:hyperlink w:anchor="_Toc231121729" w:history="1">
+      <w:hyperlink w:anchor="_Toc231135555" w:history="1">
         <w:r>
           <w:rPr>
             <w:rStyle w:val="Hipervnculo"/>
@@ -2365,7 +2368,7 @@
             <w:noProof/>
             <w:webHidden/>
           </w:rPr>
-          <w:instrText xml:space="preserve"> PAGEREF _Toc231121729 \h </w:instrText>
+          <w:instrText xml:space="preserve"> PAGEREF _Toc231135555 \h </w:instrText>
         </w:r>
         <w:r>
           <w:rPr>
@@ -2412,7 +2415,7 @@
           <w14:ligatures w14:val="standardContextual"/>
         </w:rPr>
       </w:pPr>
-      <w:hyperlink w:anchor="_Toc231121730" w:history="1">
+      <w:hyperlink w:anchor="_Toc231135556" w:history="1">
         <w:r>
           <w:rPr>
             <w:rStyle w:val="Hipervnculo"/>
@@ -2439,7 +2442,7 @@
             <w:noProof/>
             <w:webHidden/>
           </w:rPr>
-          <w:instrText xml:space="preserve"> PAGEREF _Toc231121730 \h </w:instrText>
+          <w:instrText xml:space="preserve"> PAGEREF _Toc231135556 \h </w:instrText>
         </w:r>
         <w:r>
           <w:rPr>
@@ -2486,7 +2489,7 @@
           <w14:ligatures w14:val="standardContextual"/>
         </w:rPr>
       </w:pPr>
-      <w:hyperlink w:anchor="_Toc231121731" w:history="1">
+      <w:hyperlink w:anchor="_Toc231135557" w:history="1">
         <w:r>
           <w:rPr>
             <w:rStyle w:val="Hipervnculo"/>
@@ -2513,7 +2516,7 @@
             <w:noProof/>
             <w:webHidden/>
           </w:rPr>
-          <w:instrText xml:space="preserve"> PAGEREF _Toc231121731 \h </w:instrText>
+          <w:instrText xml:space="preserve"> PAGEREF _Toc231135557 \h </w:instrText>
         </w:r>
         <w:r>
           <w:rPr>
@@ -2560,7 +2563,7 @@
           <w14:ligatures w14:val="standardContextual"/>
         </w:rPr>
       </w:pPr>
-      <w:hyperlink w:anchor="_Toc231121732" w:history="1">
+      <w:hyperlink w:anchor="_Toc231135558" w:history="1">
         <w:r>
           <w:rPr>
             <w:rStyle w:val="Hipervnculo"/>
@@ -2587,7 +2590,7 @@
             <w:noProof/>
             <w:webHidden/>
           </w:rPr>
-          <w:instrText xml:space="preserve"> PAGEREF _Toc231121732 \h </w:instrText>
+          <w:instrText xml:space="preserve"> PAGEREF _Toc231135558 \h </w:instrText>
         </w:r>
         <w:r>
           <w:rPr>
@@ -2634,7 +2637,7 @@
           <w14:ligatures w14:val="standardContextual"/>
         </w:rPr>
       </w:pPr>
-      <w:hyperlink w:anchor="_Toc231121733" w:history="1">
+      <w:hyperlink w:anchor="_Toc231135559" w:history="1">
         <w:r>
           <w:rPr>
             <w:rStyle w:val="Hipervnculo"/>
@@ -2661,7 +2664,7 @@
             <w:noProof/>
             <w:webHidden/>
           </w:rPr>
-          <w:instrText xml:space="preserve"> PAGEREF _Toc231121733 \h </w:instrText>
+          <w:instrText xml:space="preserve"> PAGEREF _Toc231135559 \h </w:instrText>
         </w:r>
         <w:r>
           <w:rPr>
@@ -2708,7 +2711,7 @@
           <w14:ligatures w14:val="standardContextual"/>
         </w:rPr>
       </w:pPr>
-      <w:hyperlink w:anchor="_Toc231121734" w:history="1">
+      <w:hyperlink w:anchor="_Toc231135560" w:history="1">
         <w:r>
           <w:rPr>
             <w:rStyle w:val="Hipervnculo"/>
@@ -2735,7 +2738,7 @@
             <w:noProof/>
             <w:webHidden/>
           </w:rPr>
-          <w:instrText xml:space="preserve"> PAGEREF _Toc231121734 \h </w:instrText>
+          <w:instrText xml:space="preserve"> PAGEREF _Toc231135560 \h </w:instrText>
         </w:r>
         <w:r>
           <w:rPr>
@@ -2782,7 +2785,7 @@
           <w14:ligatures w14:val="standardContextual"/>
         </w:rPr>
       </w:pPr>
-      <w:hyperlink w:anchor="_Toc231121735" w:history="1">
+      <w:hyperlink w:anchor="_Toc231135561" w:history="1">
         <w:r>
           <w:rPr>
             <w:rStyle w:val="Hipervnculo"/>
@@ -2809,7 +2812,7 @@
             <w:noProof/>
             <w:webHidden/>
           </w:rPr>
-          <w:instrText xml:space="preserve"> PAGEREF _Toc231121735 \h </w:instrText>
+          <w:instrText xml:space="preserve"> PAGEREF _Toc231135561 \h </w:instrText>
         </w:r>
         <w:r>
           <w:rPr>
@@ -2856,7 +2859,7 @@
           <w14:ligatures w14:val="standardContextual"/>
         </w:rPr>
       </w:pPr>
-      <w:hyperlink w:anchor="_Toc231121736" w:history="1">
+      <w:hyperlink w:anchor="_Toc231135562" w:history="1">
         <w:r>
           <w:rPr>
             <w:rStyle w:val="Hipervnculo"/>
@@ -2883,7 +2886,7 @@
             <w:noProof/>
             <w:webHidden/>
           </w:rPr>
-          <w:instrText xml:space="preserve"> PAGEREF _Toc231121736 \h </w:instrText>
+          <w:instrText xml:space="preserve"> PAGEREF _Toc231135562 \h </w:instrText>
         </w:r>
         <w:r>
           <w:rPr>
@@ -2930,7 +2933,7 @@
           <w14:ligatures w14:val="standardContextual"/>
         </w:rPr>
       </w:pPr>
-      <w:hyperlink w:anchor="_Toc231121737" w:history="1">
+      <w:hyperlink w:anchor="_Toc231135563" w:history="1">
         <w:r>
           <w:rPr>
             <w:rStyle w:val="Hipervnculo"/>
@@ -2957,7 +2960,7 @@
             <w:noProof/>
             <w:webHidden/>
           </w:rPr>
-          <w:instrText xml:space="preserve"> PAGEREF _Toc231121737 \h </w:instrText>
+          <w:instrText xml:space="preserve"> PAGEREF _Toc231135563 \h </w:instrText>
         </w:r>
         <w:r>
           <w:rPr>
@@ -3004,7 +3007,7 @@
           <w14:ligatures w14:val="standardContextual"/>
         </w:rPr>
       </w:pPr>
-      <w:hyperlink w:anchor="_Toc231121738" w:history="1">
+      <w:hyperlink w:anchor="_Toc231135564" w:history="1">
         <w:r>
           <w:rPr>
             <w:rStyle w:val="Hipervnculo"/>
@@ -3031,7 +3034,7 @@
             <w:noProof/>
             <w:webHidden/>
           </w:rPr>
-          <w:instrText xml:space="preserve"> PAGEREF _Toc231121738 \h </w:instrText>
+          <w:instrText xml:space="preserve"> PAGEREF _Toc231135564 \h </w:instrText>
         </w:r>
         <w:r>
           <w:rPr>
@@ -3078,7 +3081,7 @@
           <w14:ligatures w14:val="standardContextual"/>
         </w:rPr>
       </w:pPr>
-      <w:hyperlink w:anchor="_Toc231121739" w:history="1">
+      <w:hyperlink w:anchor="_Toc231135565" w:history="1">
         <w:r>
           <w:rPr>
             <w:rStyle w:val="Hipervnculo"/>
@@ -3105,7 +3108,7 @@
             <w:noProof/>
             <w:webHidden/>
           </w:rPr>
-          <w:instrText xml:space="preserve"> PAGEREF _Toc231121739 \h </w:instrText>
+          <w:instrText xml:space="preserve"> PAGEREF _Toc231135565 \h </w:instrText>
         </w:r>
         <w:r>
           <w:rPr>
@@ -3152,7 +3155,7 @@
           <w14:ligatures w14:val="standardContextual"/>
         </w:rPr>
       </w:pPr>
-      <w:hyperlink w:anchor="_Toc231121740" w:history="1">
+      <w:hyperlink w:anchor="_Toc231135566" w:history="1">
         <w:r>
           <w:rPr>
             <w:rStyle w:val="Hipervnculo"/>
@@ -3179,7 +3182,7 @@
             <w:noProof/>
             <w:webHidden/>
           </w:rPr>
-          <w:instrText xml:space="preserve"> PAGEREF _Toc231121740 \h </w:instrText>
+          <w:instrText xml:space="preserve"> PAGEREF _Toc231135566 \h </w:instrText>
         </w:r>
         <w:r>
           <w:rPr>
@@ -3226,7 +3229,7 @@
           <w14:ligatures w14:val="standardContextual"/>
         </w:rPr>
       </w:pPr>
-      <w:hyperlink w:anchor="_Toc231121741" w:history="1">
+      <w:hyperlink w:anchor="_Toc231135567" w:history="1">
         <w:r>
           <w:rPr>
             <w:rStyle w:val="Hipervnculo"/>
@@ -3253,7 +3256,7 @@
             <w:noProof/>
             <w:webHidden/>
           </w:rPr>
-          <w:instrText xml:space="preserve"> PAGEREF _Toc231121741 \h </w:instrText>
+          <w:instrText xml:space="preserve"> PAGEREF _Toc231135567 \h </w:instrText>
         </w:r>
         <w:r>
           <w:rPr>
@@ -3300,7 +3303,7 @@
           <w14:ligatures w14:val="standardContextual"/>
         </w:rPr>
       </w:pPr>
-      <w:hyperlink w:anchor="_Toc231121742" w:history="1">
+      <w:hyperlink w:anchor="_Toc231135568" w:history="1">
         <w:r>
           <w:rPr>
             <w:rStyle w:val="Hipervnculo"/>
@@ -3327,7 +3330,7 @@
             <w:noProof/>
             <w:webHidden/>
           </w:rPr>
-          <w:instrText xml:space="preserve"> PAGEREF _Toc231121742 \h </w:instrText>
+          <w:instrText xml:space="preserve"> PAGEREF _Toc231135568 \h </w:instrText>
         </w:r>
         <w:r>
           <w:rPr>
@@ -3374,7 +3377,7 @@
           <w14:ligatures w14:val="standardContextual"/>
         </w:rPr>
       </w:pPr>
-      <w:hyperlink w:anchor="_Toc231121743" w:history="1">
+      <w:hyperlink w:anchor="_Toc231135569" w:history="1">
         <w:r>
           <w:rPr>
             <w:rStyle w:val="Hipervnculo"/>
@@ -3401,7 +3404,7 @@
             <w:noProof/>
             <w:webHidden/>
           </w:rPr>
-          <w:instrText xml:space="preserve"> PAGEREF _Toc231121743 \h </w:instrText>
+          <w:instrText xml:space="preserve"> PAGEREF _Toc231135569 \h </w:instrText>
         </w:r>
         <w:r>
           <w:rPr>
@@ -3448,7 +3451,7 @@
           <w14:ligatures w14:val="standardContextual"/>
         </w:rPr>
       </w:pPr>
-      <w:hyperlink w:anchor="_Toc231121744" w:history="1">
+      <w:hyperlink w:anchor="_Toc231135570" w:history="1">
         <w:r>
           <w:rPr>
             <w:rStyle w:val="Hipervnculo"/>
@@ -3475,7 +3478,7 @@
             <w:noProof/>
             <w:webHidden/>
           </w:rPr>
-          <w:instrText xml:space="preserve"> PAGEREF _Toc231121744 \h </w:instrText>
+          <w:instrText xml:space="preserve"> PAGEREF _Toc231135570 \h </w:instrText>
         </w:r>
         <w:r>
           <w:rPr>
@@ -3522,7 +3525,7 @@
           <w14:ligatures w14:val="standardContextual"/>
         </w:rPr>
       </w:pPr>
-      <w:hyperlink w:anchor="_Toc231121745" w:history="1">
+      <w:hyperlink w:anchor="_Toc231135571" w:history="1">
         <w:r>
           <w:rPr>
             <w:rStyle w:val="Hipervnculo"/>
@@ -3549,7 +3552,7 @@
             <w:noProof/>
             <w:webHidden/>
           </w:rPr>
-          <w:instrText xml:space="preserve"> PAGEREF _Toc231121745 \h </w:instrText>
+          <w:instrText xml:space="preserve"> PAGEREF _Toc231135571 \h </w:instrText>
         </w:r>
         <w:r>
           <w:rPr>
@@ -3596,7 +3599,7 @@
           <w14:ligatures w14:val="standardContextual"/>
         </w:rPr>
       </w:pPr>
-      <w:hyperlink w:anchor="_Toc231121746" w:history="1">
+      <w:hyperlink w:anchor="_Toc231135572" w:history="1">
         <w:r>
           <w:rPr>
             <w:rStyle w:val="Hipervnculo"/>
@@ -3623,7 +3626,7 @@
             <w:noProof/>
             <w:webHidden/>
           </w:rPr>
-          <w:instrText xml:space="preserve"> PAGEREF _Toc231121746 \h </w:instrText>
+          <w:instrText xml:space="preserve"> PAGEREF _Toc231135572 \h </w:instrText>
         </w:r>
         <w:r>
           <w:rPr>
@@ -3670,7 +3673,7 @@
           <w14:ligatures w14:val="standardContextual"/>
         </w:rPr>
       </w:pPr>
-      <w:hyperlink w:anchor="_Toc231121747" w:history="1">
+      <w:hyperlink w:anchor="_Toc231135573" w:history="1">
         <w:r>
           <w:rPr>
             <w:rStyle w:val="Hipervnculo"/>
@@ -3697,7 +3700,7 @@
             <w:noProof/>
             <w:webHidden/>
           </w:rPr>
-          <w:instrText xml:space="preserve"> PAGEREF _Toc231121747 \h </w:instrText>
+          <w:instrText xml:space="preserve"> PAGEREF _Toc231135573 \h </w:instrText>
         </w:r>
         <w:r>
           <w:rPr>
@@ -3744,7 +3747,7 @@
           <w14:ligatures w14:val="standardContextual"/>
         </w:rPr>
       </w:pPr>
-      <w:hyperlink w:anchor="_Toc231121748" w:history="1">
+      <w:hyperlink w:anchor="_Toc231135574" w:history="1">
         <w:r>
           <w:rPr>
             <w:rStyle w:val="Hipervnculo"/>
@@ -3771,7 +3774,7 @@
             <w:noProof/>
             <w:webHidden/>
           </w:rPr>
-          <w:instrText xml:space="preserve"> PAGEREF _Toc231121748 \h </w:instrText>
+          <w:instrText xml:space="preserve"> PAGEREF _Toc231135574 \h </w:instrText>
         </w:r>
         <w:r>
           <w:rPr>
@@ -3818,7 +3821,7 @@
           <w14:ligatures w14:val="standardContextual"/>
         </w:rPr>
       </w:pPr>
-      <w:hyperlink w:anchor="_Toc231121749" w:history="1">
+      <w:hyperlink w:anchor="_Toc231135575" w:history="1">
         <w:r>
           <w:rPr>
             <w:rStyle w:val="Hipervnculo"/>
@@ -3845,7 +3848,7 @@
             <w:noProof/>
             <w:webHidden/>
           </w:rPr>
-          <w:instrText xml:space="preserve"> PAGEREF _Toc231121749 \h </w:instrText>
+          <w:instrText xml:space="preserve"> PAGEREF _Toc231135575 \h </w:instrText>
         </w:r>
         <w:r>
           <w:rPr>
@@ -3892,7 +3895,7 @@
           <w14:ligatures w14:val="standardContextual"/>
         </w:rPr>
       </w:pPr>
-      <w:hyperlink w:anchor="_Toc231121750" w:history="1">
+      <w:hyperlink w:anchor="_Toc231135576" w:history="1">
         <w:r>
           <w:rPr>
             <w:rStyle w:val="Hipervnculo"/>
@@ -3919,7 +3922,7 @@
             <w:noProof/>
             <w:webHidden/>
           </w:rPr>
-          <w:instrText xml:space="preserve"> PAGEREF _Toc231121750 \h </w:instrText>
+          <w:instrText xml:space="preserve"> PAGEREF _Toc231135576 \h </w:instrText>
         </w:r>
         <w:r>
           <w:rPr>
@@ -3966,7 +3969,7 @@
           <w14:ligatures w14:val="standardContextual"/>
         </w:rPr>
       </w:pPr>
-      <w:hyperlink w:anchor="_Toc231121751" w:history="1">
+      <w:hyperlink w:anchor="_Toc231135577" w:history="1">
         <w:r>
           <w:rPr>
             <w:rStyle w:val="Hipervnculo"/>
@@ -3993,7 +3996,7 @@
             <w:noProof/>
             <w:webHidden/>
           </w:rPr>
-          <w:instrText xml:space="preserve"> PAGEREF _Toc231121751 \h </w:instrText>
+          <w:instrText xml:space="preserve"> PAGEREF _Toc231135577 \h </w:instrText>
         </w:r>
         <w:r>
           <w:rPr>
@@ -4040,7 +4043,7 @@
           <w14:ligatures w14:val="standardContextual"/>
         </w:rPr>
       </w:pPr>
-      <w:hyperlink w:anchor="_Toc231121752" w:history="1">
+      <w:hyperlink w:anchor="_Toc231135578" w:history="1">
         <w:r>
           <w:rPr>
             <w:rStyle w:val="Hipervnculo"/>
@@ -4067,7 +4070,7 @@
             <w:noProof/>
             <w:webHidden/>
           </w:rPr>
-          <w:instrText xml:space="preserve"> PAGEREF _Toc231121752 \h </w:instrText>
+          <w:instrText xml:space="preserve"> PAGEREF _Toc231135578 \h </w:instrText>
         </w:r>
         <w:r>
           <w:rPr>
@@ -4114,7 +4117,7 @@
           <w14:ligatures w14:val="standardContextual"/>
         </w:rPr>
       </w:pPr>
-      <w:hyperlink w:anchor="_Toc231121753" w:history="1">
+      <w:hyperlink w:anchor="_Toc231135579" w:history="1">
         <w:r>
           <w:rPr>
             <w:rStyle w:val="Hipervnculo"/>
@@ -4141,7 +4144,7 @@
             <w:noProof/>
             <w:webHidden/>
           </w:rPr>
-          <w:instrText xml:space="preserve"> PAGEREF _Toc231121753 \h </w:instrText>
+          <w:instrText xml:space="preserve"> PAGEREF _Toc231135579 \h </w:instrText>
         </w:r>
         <w:r>
           <w:rPr>
@@ -4188,7 +4191,7 @@
           <w14:ligatures w14:val="standardContextual"/>
         </w:rPr>
       </w:pPr>
-      <w:hyperlink w:anchor="_Toc231121754" w:history="1">
+      <w:hyperlink w:anchor="_Toc231135580" w:history="1">
         <w:r>
           <w:rPr>
             <w:rStyle w:val="Hipervnculo"/>
@@ -4215,7 +4218,7 @@
             <w:noProof/>
             <w:webHidden/>
           </w:rPr>
-          <w:instrText xml:space="preserve"> PAGEREF _Toc231121754 \h </w:instrText>
+          <w:instrText xml:space="preserve"> PAGEREF _Toc231135580 \h </w:instrText>
         </w:r>
         <w:r>
           <w:rPr>
@@ -4262,7 +4265,7 @@
           <w14:ligatures w14:val="standardContextual"/>
         </w:rPr>
       </w:pPr>
-      <w:hyperlink w:anchor="_Toc231121755" w:history="1">
+      <w:hyperlink w:anchor="_Toc231135581" w:history="1">
         <w:r>
           <w:rPr>
             <w:rStyle w:val="Hipervnculo"/>
@@ -4289,7 +4292,7 @@
             <w:noProof/>
             <w:webHidden/>
           </w:rPr>
-          <w:instrText xml:space="preserve"> PAGEREF _Toc231121755 \h </w:instrText>
+          <w:instrText xml:space="preserve"> PAGEREF _Toc231135581 \h </w:instrText>
         </w:r>
         <w:r>
           <w:rPr>
@@ -4336,7 +4339,7 @@
           <w14:ligatures w14:val="standardContextual"/>
         </w:rPr>
       </w:pPr>
-      <w:hyperlink w:anchor="_Toc231121756" w:history="1">
+      <w:hyperlink w:anchor="_Toc231135582" w:history="1">
         <w:r>
           <w:rPr>
             <w:rStyle w:val="Hipervnculo"/>
@@ -4363,7 +4366,7 @@
             <w:noProof/>
             <w:webHidden/>
           </w:rPr>
-          <w:instrText xml:space="preserve"> PAGEREF _Toc231121756 \h </w:instrText>
+          <w:instrText xml:space="preserve"> PAGEREF _Toc231135582 \h </w:instrText>
         </w:r>
         <w:r>
           <w:rPr>
@@ -4410,7 +4413,7 @@
           <w14:ligatures w14:val="standardContextual"/>
         </w:rPr>
       </w:pPr>
-      <w:hyperlink w:anchor="_Toc231121757" w:history="1">
+      <w:hyperlink w:anchor="_Toc231135583" w:history="1">
         <w:r>
           <w:rPr>
             <w:rStyle w:val="Hipervnculo"/>
@@ -4437,7 +4440,7 @@
             <w:noProof/>
             <w:webHidden/>
           </w:rPr>
-          <w:instrText xml:space="preserve"> PAGEREF _Toc231121757 \h </w:instrText>
+          <w:instrText xml:space="preserve"> PAGEREF _Toc231135583 \h </w:instrText>
         </w:r>
         <w:r>
           <w:rPr>
@@ -4484,7 +4487,7 @@
           <w14:ligatures w14:val="standardContextual"/>
         </w:rPr>
       </w:pPr>
-      <w:hyperlink w:anchor="_Toc231121758" w:history="1">
+      <w:hyperlink w:anchor="_Toc231135584" w:history="1">
         <w:r>
           <w:rPr>
             <w:rStyle w:val="Hipervnculo"/>
@@ -4511,7 +4514,7 @@
             <w:noProof/>
             <w:webHidden/>
           </w:rPr>
-          <w:instrText xml:space="preserve"> PAGEREF _Toc231121758 \h </w:instrText>
+          <w:instrText xml:space="preserve"> PAGEREF _Toc231135584 \h </w:instrText>
         </w:r>
         <w:r>
           <w:rPr>
@@ -4558,7 +4561,7 @@
           <w14:ligatures w14:val="standardContextual"/>
         </w:rPr>
       </w:pPr>
-      <w:hyperlink w:anchor="_Toc231121759" w:history="1">
+      <w:hyperlink w:anchor="_Toc231135585" w:history="1">
         <w:r>
           <w:rPr>
             <w:rStyle w:val="Hipervnculo"/>
@@ -4585,7 +4588,7 @@
             <w:noProof/>
             <w:webHidden/>
           </w:rPr>
-          <w:instrText xml:space="preserve"> PAGEREF _Toc231121759 \h </w:instrText>
+          <w:instrText xml:space="preserve"> PAGEREF _Toc231135585 \h </w:instrText>
         </w:r>
         <w:r>
           <w:rPr>
@@ -4632,7 +4635,7 @@
           <w14:ligatures w14:val="standardContextual"/>
         </w:rPr>
       </w:pPr>
-      <w:hyperlink w:anchor="_Toc231121760" w:history="1">
+      <w:hyperlink w:anchor="_Toc231135586" w:history="1">
         <w:r>
           <w:rPr>
             <w:rStyle w:val="Hipervnculo"/>
@@ -4659,7 +4662,7 @@
             <w:noProof/>
             <w:webHidden/>
           </w:rPr>
-          <w:instrText xml:space="preserve"> PAGEREF _Toc231121760 \h </w:instrText>
+          <w:instrText xml:space="preserve"> PAGEREF _Toc231135586 \h </w:instrText>
         </w:r>
         <w:r>
           <w:rPr>
@@ -4706,7 +4709,7 @@
           <w14:ligatures w14:val="standardContextual"/>
         </w:rPr>
       </w:pPr>
-      <w:hyperlink w:anchor="_Toc231121761" w:history="1">
+      <w:hyperlink w:anchor="_Toc231135587" w:history="1">
         <w:r>
           <w:rPr>
             <w:rStyle w:val="Hipervnculo"/>
@@ -4733,7 +4736,7 @@
             <w:noProof/>
             <w:webHidden/>
           </w:rPr>
-          <w:instrText xml:space="preserve"> PAGEREF _Toc231121761 \h </w:instrText>
+          <w:instrText xml:space="preserve"> PAGEREF _Toc231135587 \h </w:instrText>
         </w:r>
         <w:r>
           <w:rPr>
@@ -4780,7 +4783,7 @@
           <w14:ligatures w14:val="standardContextual"/>
         </w:rPr>
       </w:pPr>
-      <w:hyperlink w:anchor="_Toc231121762" w:history="1">
+      <w:hyperlink w:anchor="_Toc231135588" w:history="1">
         <w:r>
           <w:rPr>
             <w:rStyle w:val="Hipervnculo"/>
@@ -4807,7 +4810,7 @@
             <w:noProof/>
             <w:webHidden/>
           </w:rPr>
-          <w:instrText xml:space="preserve"> PAGEREF _Toc231121762 \h </w:instrText>
+          <w:instrText xml:space="preserve"> PAGEREF _Toc231135588 \h </w:instrText>
         </w:r>
         <w:r>
           <w:rPr>
@@ -4854,7 +4857,7 @@
           <w14:ligatures w14:val="standardContextual"/>
         </w:rPr>
       </w:pPr>
-      <w:hyperlink w:anchor="_Toc231121763" w:history="1">
+      <w:hyperlink w:anchor="_Toc231135589" w:history="1">
         <w:r>
           <w:rPr>
             <w:rStyle w:val="Hipervnculo"/>
@@ -4881,7 +4884,7 @@
             <w:noProof/>
             <w:webHidden/>
           </w:rPr>
-          <w:instrText xml:space="preserve"> PAGEREF _Toc231121763 \h </w:instrText>
+          <w:instrText xml:space="preserve"> PAGEREF _Toc231135589 \h </w:instrText>
         </w:r>
         <w:r>
           <w:rPr>
@@ -4928,7 +4931,7 @@
           <w14:ligatures w14:val="standardContextual"/>
         </w:rPr>
       </w:pPr>
-      <w:hyperlink w:anchor="_Toc231121764" w:history="1">
+      <w:hyperlink w:anchor="_Toc231135590" w:history="1">
         <w:r>
           <w:rPr>
             <w:rStyle w:val="Hipervnculo"/>
@@ -4955,7 +4958,7 @@
             <w:noProof/>
             <w:webHidden/>
           </w:rPr>
-          <w:instrText xml:space="preserve"> PAGEREF _Toc231121764 \h </w:instrText>
+          <w:instrText xml:space="preserve"> PAGEREF _Toc231135590 \h </w:instrText>
         </w:r>
         <w:r>
           <w:rPr>
@@ -5002,7 +5005,7 @@
           <w14:ligatures w14:val="standardContextual"/>
         </w:rPr>
       </w:pPr>
-      <w:hyperlink w:anchor="_Toc231121765" w:history="1">
+      <w:hyperlink w:anchor="_Toc231135591" w:history="1">
         <w:r>
           <w:rPr>
             <w:rStyle w:val="Hipervnculo"/>
@@ -5029,7 +5032,7 @@
             <w:noProof/>
             <w:webHidden/>
           </w:rPr>
-          <w:instrText xml:space="preserve"> PAGEREF _Toc231121765 \h </w:instrText>
+          <w:instrText xml:space="preserve"> PAGEREF _Toc231135591 \h </w:instrText>
         </w:r>
         <w:r>
           <w:rPr>
@@ -5085,7 +5088,7 @@
       <w:pPr>
         <w:pStyle w:val="Ttulo1"/>
       </w:pPr>
-      <w:bookmarkStart w:id="7" w:name="_Toc231121714"/>
+      <w:bookmarkStart w:id="7" w:name="_Toc231135540"/>
       <w:r>
         <w:lastRenderedPageBreak/>
         <w:t>Índice de tablas</w:t>
@@ -5117,7 +5120,7 @@
       <w:r>
         <w:fldChar w:fldCharType="separate"/>
       </w:r>
-      <w:hyperlink w:anchor="_Toc231121766" w:history="1">
+      <w:hyperlink w:anchor="_Toc231135592" w:history="1">
         <w:r>
           <w:rPr>
             <w:rStyle w:val="Hipervnculo"/>
@@ -5144,7 +5147,7 @@
             <w:noProof/>
             <w:webHidden/>
           </w:rPr>
-          <w:instrText xml:space="preserve"> PAGEREF _Toc231121766 \h </w:instrText>
+          <w:instrText xml:space="preserve"> PAGEREF _Toc231135592 \h </w:instrText>
         </w:r>
         <w:r>
           <w:rPr>
@@ -5191,7 +5194,7 @@
           <w14:ligatures w14:val="standardContextual"/>
         </w:rPr>
       </w:pPr>
-      <w:hyperlink w:anchor="_Toc231121767" w:history="1">
+      <w:hyperlink w:anchor="_Toc231135593" w:history="1">
         <w:r>
           <w:rPr>
             <w:rStyle w:val="Hipervnculo"/>
@@ -5218,7 +5221,7 @@
             <w:noProof/>
             <w:webHidden/>
           </w:rPr>
-          <w:instrText xml:space="preserve"> PAGEREF _Toc231121767 \h </w:instrText>
+          <w:instrText xml:space="preserve"> PAGEREF _Toc231135593 \h </w:instrText>
         </w:r>
         <w:r>
           <w:rPr>
@@ -5265,7 +5268,7 @@
           <w14:ligatures w14:val="standardContextual"/>
         </w:rPr>
       </w:pPr>
-      <w:hyperlink w:anchor="_Toc231121768" w:history="1">
+      <w:hyperlink w:anchor="_Toc231135594" w:history="1">
         <w:r>
           <w:rPr>
             <w:rStyle w:val="Hipervnculo"/>
@@ -5292,7 +5295,7 @@
             <w:noProof/>
             <w:webHidden/>
           </w:rPr>
-          <w:instrText xml:space="preserve"> PAGEREF _Toc231121768 \h </w:instrText>
+          <w:instrText xml:space="preserve"> PAGEREF _Toc231135594 \h </w:instrText>
         </w:r>
         <w:r>
           <w:rPr>
@@ -5339,7 +5342,7 @@
           <w14:ligatures w14:val="standardContextual"/>
         </w:rPr>
       </w:pPr>
-      <w:hyperlink w:anchor="_Toc231121769" w:history="1">
+      <w:hyperlink w:anchor="_Toc231135595" w:history="1">
         <w:r>
           <w:rPr>
             <w:rStyle w:val="Hipervnculo"/>
@@ -5366,7 +5369,7 @@
             <w:noProof/>
             <w:webHidden/>
           </w:rPr>
-          <w:instrText xml:space="preserve"> PAGEREF _Toc231121769 \h </w:instrText>
+          <w:instrText xml:space="preserve"> PAGEREF _Toc231135595 \h </w:instrText>
         </w:r>
         <w:r>
           <w:rPr>
@@ -5413,7 +5416,7 @@
           <w14:ligatures w14:val="standardContextual"/>
         </w:rPr>
       </w:pPr>
-      <w:hyperlink w:anchor="_Toc231121770" w:history="1">
+      <w:hyperlink w:anchor="_Toc231135596" w:history="1">
         <w:r>
           <w:rPr>
             <w:rStyle w:val="Hipervnculo"/>
@@ -5440,7 +5443,7 @@
             <w:noProof/>
             <w:webHidden/>
           </w:rPr>
-          <w:instrText xml:space="preserve"> PAGEREF _Toc231121770 \h </w:instrText>
+          <w:instrText xml:space="preserve"> PAGEREF _Toc231135596 \h </w:instrText>
         </w:r>
         <w:r>
           <w:rPr>
@@ -5487,7 +5490,7 @@
           <w14:ligatures w14:val="standardContextual"/>
         </w:rPr>
       </w:pPr>
-      <w:hyperlink w:anchor="_Toc231121771" w:history="1">
+      <w:hyperlink w:anchor="_Toc231135597" w:history="1">
         <w:r>
           <w:rPr>
             <w:rStyle w:val="Hipervnculo"/>
@@ -5514,7 +5517,7 @@
             <w:noProof/>
             <w:webHidden/>
           </w:rPr>
-          <w:instrText xml:space="preserve"> PAGEREF _Toc231121771 \h </w:instrText>
+          <w:instrText xml:space="preserve"> PAGEREF _Toc231135597 \h </w:instrText>
         </w:r>
         <w:r>
           <w:rPr>
@@ -5561,7 +5564,7 @@
           <w14:ligatures w14:val="standardContextual"/>
         </w:rPr>
       </w:pPr>
-      <w:hyperlink w:anchor="_Toc231121772" w:history="1">
+      <w:hyperlink w:anchor="_Toc231135598" w:history="1">
         <w:r>
           <w:rPr>
             <w:rStyle w:val="Hipervnculo"/>
@@ -5588,7 +5591,7 @@
             <w:noProof/>
             <w:webHidden/>
           </w:rPr>
-          <w:instrText xml:space="preserve"> PAGEREF _Toc231121772 \h </w:instrText>
+          <w:instrText xml:space="preserve"> PAGEREF _Toc231135598 \h </w:instrText>
         </w:r>
         <w:r>
           <w:rPr>
@@ -5635,7 +5638,7 @@
           <w14:ligatures w14:val="standardContextual"/>
         </w:rPr>
       </w:pPr>
-      <w:hyperlink w:anchor="_Toc231121773" w:history="1">
+      <w:hyperlink w:anchor="_Toc231135599" w:history="1">
         <w:r>
           <w:rPr>
             <w:rStyle w:val="Hipervnculo"/>
@@ -5662,7 +5665,7 @@
             <w:noProof/>
             <w:webHidden/>
           </w:rPr>
-          <w:instrText xml:space="preserve"> PAGEREF _Toc231121773 \h </w:instrText>
+          <w:instrText xml:space="preserve"> PAGEREF _Toc231135599 \h </w:instrText>
         </w:r>
         <w:r>
           <w:rPr>
@@ -5709,7 +5712,7 @@
           <w14:ligatures w14:val="standardContextual"/>
         </w:rPr>
       </w:pPr>
-      <w:hyperlink w:anchor="_Toc231121774" w:history="1">
+      <w:hyperlink w:anchor="_Toc231135600" w:history="1">
         <w:r>
           <w:rPr>
             <w:rStyle w:val="Hipervnculo"/>
@@ -5736,7 +5739,7 @@
             <w:noProof/>
             <w:webHidden/>
           </w:rPr>
-          <w:instrText xml:space="preserve"> PAGEREF _Toc231121774 \h </w:instrText>
+          <w:instrText xml:space="preserve"> PAGEREF _Toc231135600 \h </w:instrText>
         </w:r>
         <w:r>
           <w:rPr>
@@ -5783,7 +5786,7 @@
           <w14:ligatures w14:val="standardContextual"/>
         </w:rPr>
       </w:pPr>
-      <w:hyperlink w:anchor="_Toc231121775" w:history="1">
+      <w:hyperlink w:anchor="_Toc231135601" w:history="1">
         <w:r>
           <w:rPr>
             <w:rStyle w:val="Hipervnculo"/>
@@ -5810,7 +5813,7 @@
             <w:noProof/>
             <w:webHidden/>
           </w:rPr>
-          <w:instrText xml:space="preserve"> PAGEREF _Toc231121775 \h </w:instrText>
+          <w:instrText xml:space="preserve"> PAGEREF _Toc231135601 \h </w:instrText>
         </w:r>
         <w:r>
           <w:rPr>
@@ -5857,7 +5860,7 @@
           <w14:ligatures w14:val="standardContextual"/>
         </w:rPr>
       </w:pPr>
-      <w:hyperlink w:anchor="_Toc231121776" w:history="1">
+      <w:hyperlink w:anchor="_Toc231135602" w:history="1">
         <w:r>
           <w:rPr>
             <w:rStyle w:val="Hipervnculo"/>
@@ -5884,7 +5887,7 @@
             <w:noProof/>
             <w:webHidden/>
           </w:rPr>
-          <w:instrText xml:space="preserve"> PAGEREF _Toc231121776 \h </w:instrText>
+          <w:instrText xml:space="preserve"> PAGEREF _Toc231135602 \h </w:instrText>
         </w:r>
         <w:r>
           <w:rPr>
@@ -5931,7 +5934,7 @@
           <w14:ligatures w14:val="standardContextual"/>
         </w:rPr>
       </w:pPr>
-      <w:hyperlink w:anchor="_Toc231121777" w:history="1">
+      <w:hyperlink w:anchor="_Toc231135603" w:history="1">
         <w:r>
           <w:rPr>
             <w:rStyle w:val="Hipervnculo"/>
@@ -5958,7 +5961,7 @@
             <w:noProof/>
             <w:webHidden/>
           </w:rPr>
-          <w:instrText xml:space="preserve"> PAGEREF _Toc231121777 \h </w:instrText>
+          <w:instrText xml:space="preserve"> PAGEREF _Toc231135603 \h </w:instrText>
         </w:r>
         <w:r>
           <w:rPr>
@@ -6005,7 +6008,7 @@
           <w14:ligatures w14:val="standardContextual"/>
         </w:rPr>
       </w:pPr>
-      <w:hyperlink w:anchor="_Toc231121778" w:history="1">
+      <w:hyperlink w:anchor="_Toc231135604" w:history="1">
         <w:r>
           <w:rPr>
             <w:rStyle w:val="Hipervnculo"/>
@@ -6032,7 +6035,7 @@
             <w:noProof/>
             <w:webHidden/>
           </w:rPr>
-          <w:instrText xml:space="preserve"> PAGEREF _Toc231121778 \h </w:instrText>
+          <w:instrText xml:space="preserve"> PAGEREF _Toc231135604 \h </w:instrText>
         </w:r>
         <w:r>
           <w:rPr>
@@ -6079,7 +6082,7 @@
           <w14:ligatures w14:val="standardContextual"/>
         </w:rPr>
       </w:pPr>
-      <w:hyperlink w:anchor="_Toc231121779" w:history="1">
+      <w:hyperlink w:anchor="_Toc231135605" w:history="1">
         <w:r>
           <w:rPr>
             <w:rStyle w:val="Hipervnculo"/>
@@ -6106,7 +6109,7 @@
             <w:noProof/>
             <w:webHidden/>
           </w:rPr>
-          <w:instrText xml:space="preserve"> PAGEREF _Toc231121779 \h </w:instrText>
+          <w:instrText xml:space="preserve"> PAGEREF _Toc231135605 \h </w:instrText>
         </w:r>
         <w:r>
           <w:rPr>
@@ -6162,7 +6165,7 @@
       <w:pPr>
         <w:pStyle w:val="Ttulo1"/>
       </w:pPr>
-      <w:bookmarkStart w:id="8" w:name="_Toc231121715"/>
+      <w:bookmarkStart w:id="8" w:name="_Toc231135541"/>
       <w:r>
         <w:lastRenderedPageBreak/>
         <w:t>Índice de figuras</w:t>
@@ -6194,7 +6197,7 @@
       <w:r>
         <w:fldChar w:fldCharType="separate"/>
       </w:r>
-      <w:hyperlink w:anchor="_Toc231121780" w:history="1">
+      <w:hyperlink w:anchor="_Toc231135606" w:history="1">
         <w:r>
           <w:rPr>
             <w:rStyle w:val="Hipervnculo"/>
@@ -6221,7 +6224,7 @@
             <w:noProof/>
             <w:webHidden/>
           </w:rPr>
-          <w:instrText xml:space="preserve"> PAGEREF _Toc231121780 \h </w:instrText>
+          <w:instrText xml:space="preserve"> PAGEREF _Toc231135606 \h </w:instrText>
         </w:r>
         <w:r>
           <w:rPr>
@@ -6268,7 +6271,7 @@
           <w14:ligatures w14:val="standardContextual"/>
         </w:rPr>
       </w:pPr>
-      <w:hyperlink w:anchor="_Toc231121781" w:history="1">
+      <w:hyperlink w:anchor="_Toc231135607" w:history="1">
         <w:r>
           <w:rPr>
             <w:rStyle w:val="Hipervnculo"/>
@@ -6295,7 +6298,7 @@
             <w:noProof/>
             <w:webHidden/>
           </w:rPr>
-          <w:instrText xml:space="preserve"> PAGEREF _Toc231121781 \h </w:instrText>
+          <w:instrText xml:space="preserve"> PAGEREF _Toc231135607 \h </w:instrText>
         </w:r>
         <w:r>
           <w:rPr>
@@ -6342,7 +6345,7 @@
           <w14:ligatures w14:val="standardContextual"/>
         </w:rPr>
       </w:pPr>
-      <w:hyperlink w:anchor="_Toc231121782" w:history="1">
+      <w:hyperlink w:anchor="_Toc231135608" w:history="1">
         <w:r>
           <w:rPr>
             <w:rStyle w:val="Hipervnculo"/>
@@ -6369,7 +6372,7 @@
             <w:noProof/>
             <w:webHidden/>
           </w:rPr>
-          <w:instrText xml:space="preserve"> PAGEREF _Toc231121782 \h </w:instrText>
+          <w:instrText xml:space="preserve"> PAGEREF _Toc231135608 \h </w:instrText>
         </w:r>
         <w:r>
           <w:rPr>
@@ -6416,7 +6419,7 @@
           <w14:ligatures w14:val="standardContextual"/>
         </w:rPr>
       </w:pPr>
-      <w:hyperlink w:anchor="_Toc231121783" w:history="1">
+      <w:hyperlink w:anchor="_Toc231135609" w:history="1">
         <w:r>
           <w:rPr>
             <w:rStyle w:val="Hipervnculo"/>
@@ -6443,7 +6446,7 @@
             <w:noProof/>
             <w:webHidden/>
           </w:rPr>
-          <w:instrText xml:space="preserve"> PAGEREF _Toc231121783 \h </w:instrText>
+          <w:instrText xml:space="preserve"> PAGEREF _Toc231135609 \h </w:instrText>
         </w:r>
         <w:r>
           <w:rPr>
@@ -6490,7 +6493,7 @@
           <w14:ligatures w14:val="standardContextual"/>
         </w:rPr>
       </w:pPr>
-      <w:hyperlink w:anchor="_Toc231121784" w:history="1">
+      <w:hyperlink w:anchor="_Toc231135610" w:history="1">
         <w:r>
           <w:rPr>
             <w:rStyle w:val="Hipervnculo"/>
@@ -6517,7 +6520,7 @@
             <w:noProof/>
             <w:webHidden/>
           </w:rPr>
-          <w:instrText xml:space="preserve"> PAGEREF _Toc231121784 \h </w:instrText>
+          <w:instrText xml:space="preserve"> PAGEREF _Toc231135610 \h </w:instrText>
         </w:r>
         <w:r>
           <w:rPr>
@@ -6564,7 +6567,7 @@
           <w14:ligatures w14:val="standardContextual"/>
         </w:rPr>
       </w:pPr>
-      <w:hyperlink w:anchor="_Toc231121785" w:history="1">
+      <w:hyperlink w:anchor="_Toc231135611" w:history="1">
         <w:r>
           <w:rPr>
             <w:rStyle w:val="Hipervnculo"/>
@@ -6591,7 +6594,7 @@
             <w:noProof/>
             <w:webHidden/>
           </w:rPr>
-          <w:instrText xml:space="preserve"> PAGEREF _Toc231121785 \h </w:instrText>
+          <w:instrText xml:space="preserve"> PAGEREF _Toc231135611 \h </w:instrText>
         </w:r>
         <w:r>
           <w:rPr>
@@ -6638,7 +6641,7 @@
           <w14:ligatures w14:val="standardContextual"/>
         </w:rPr>
       </w:pPr>
-      <w:hyperlink w:anchor="_Toc231121786" w:history="1">
+      <w:hyperlink w:anchor="_Toc231135612" w:history="1">
         <w:r>
           <w:rPr>
             <w:rStyle w:val="Hipervnculo"/>
@@ -6665,7 +6668,7 @@
             <w:noProof/>
             <w:webHidden/>
           </w:rPr>
-          <w:instrText xml:space="preserve"> PAGEREF _Toc231121786 \h </w:instrText>
+          <w:instrText xml:space="preserve"> PAGEREF _Toc231135612 \h </w:instrText>
         </w:r>
         <w:r>
           <w:rPr>
@@ -6712,7 +6715,7 @@
           <w14:ligatures w14:val="standardContextual"/>
         </w:rPr>
       </w:pPr>
-      <w:hyperlink w:anchor="_Toc231121787" w:history="1">
+      <w:hyperlink w:anchor="_Toc231135613" w:history="1">
         <w:r>
           <w:rPr>
             <w:rStyle w:val="Hipervnculo"/>
@@ -6739,7 +6742,7 @@
             <w:noProof/>
             <w:webHidden/>
           </w:rPr>
-          <w:instrText xml:space="preserve"> PAGEREF _Toc231121787 \h </w:instrText>
+          <w:instrText xml:space="preserve"> PAGEREF _Toc231135613 \h </w:instrText>
         </w:r>
         <w:r>
           <w:rPr>
@@ -6786,7 +6789,7 @@
           <w14:ligatures w14:val="standardContextual"/>
         </w:rPr>
       </w:pPr>
-      <w:hyperlink w:anchor="_Toc231121788" w:history="1">
+      <w:hyperlink w:anchor="_Toc231135614" w:history="1">
         <w:r>
           <w:rPr>
             <w:rStyle w:val="Hipervnculo"/>
@@ -6813,7 +6816,7 @@
             <w:noProof/>
             <w:webHidden/>
           </w:rPr>
-          <w:instrText xml:space="preserve"> PAGEREF _Toc231121788 \h </w:instrText>
+          <w:instrText xml:space="preserve"> PAGEREF _Toc231135614 \h </w:instrText>
         </w:r>
         <w:r>
           <w:rPr>
@@ -6869,7 +6872,7 @@
       <w:pPr>
         <w:pStyle w:val="Ttulo1"/>
       </w:pPr>
-      <w:bookmarkStart w:id="9" w:name="_Toc231121716"/>
+      <w:bookmarkStart w:id="9" w:name="_Toc231135542"/>
       <w:r>
         <w:lastRenderedPageBreak/>
         <w:t>Lista de abreviaturas y siglas</w:t>
@@ -7831,7 +7834,7 @@
       <w:pPr>
         <w:pStyle w:val="Ttulo1"/>
       </w:pPr>
-      <w:bookmarkStart w:id="10" w:name="_Toc231121717"/>
+      <w:bookmarkStart w:id="10" w:name="_Toc231135543"/>
       <w:r>
         <w:lastRenderedPageBreak/>
         <w:t>Lista de símbolos</w:t>
@@ -8461,7 +8464,7 @@
       <w:pPr>
         <w:pStyle w:val="Ttulo1"/>
       </w:pPr>
-      <w:bookmarkStart w:id="11" w:name="_Toc231121718"/>
+      <w:bookmarkStart w:id="11" w:name="_Toc231135544"/>
       <w:r>
         <w:lastRenderedPageBreak/>
         <w:t xml:space="preserve">I. </w:t>
@@ -8475,7 +8478,7 @@
       <w:pPr>
         <w:pStyle w:val="Ttulo2"/>
       </w:pPr>
-      <w:bookmarkStart w:id="12" w:name="_Toc231121719"/>
+      <w:bookmarkStart w:id="12" w:name="_Toc231135545"/>
       <w:r>
         <w:t>1.1 Realidad Problemática</w:t>
       </w:r>
@@ -8587,7 +8590,7 @@
       <w:pPr>
         <w:pStyle w:val="Ttulo3"/>
       </w:pPr>
-      <w:bookmarkStart w:id="13" w:name="_Toc231121720"/>
+      <w:bookmarkStart w:id="13" w:name="_Toc231135546"/>
       <w:r>
         <w:t>1.2.1 Antecedentes internacionales</w:t>
       </w:r>
@@ -8690,7 +8693,7 @@
       <w:pPr>
         <w:pStyle w:val="Ttulo3"/>
       </w:pPr>
-      <w:bookmarkStart w:id="14" w:name="_Toc231121721"/>
+      <w:bookmarkStart w:id="14" w:name="_Toc231135547"/>
       <w:r>
         <w:t>1.2.2 Antecedentes nacionales y regionales</w:t>
       </w:r>
@@ -8749,7 +8752,7 @@
       <w:pPr>
         <w:pStyle w:val="Ttulo2"/>
       </w:pPr>
-      <w:bookmarkStart w:id="15" w:name="_Toc231121722"/>
+      <w:bookmarkStart w:id="15" w:name="_Toc231135548"/>
       <w:r>
         <w:lastRenderedPageBreak/>
         <w:t>1.3 Teorías relacionadas al tema</w:t>
@@ -9022,7 +9025,7 @@
       <w:pPr>
         <w:pStyle w:val="Ttulo2"/>
       </w:pPr>
-      <w:bookmarkStart w:id="16" w:name="_Toc231121723"/>
+      <w:bookmarkStart w:id="16" w:name="_Toc231135549"/>
       <w:r>
         <w:t>1.4 Formulación del Problema</w:t>
       </w:r>
@@ -9138,7 +9141,7 @@
       <w:pPr>
         <w:pStyle w:val="Ttulo2"/>
       </w:pPr>
-      <w:bookmarkStart w:id="17" w:name="_Toc231121724"/>
+      <w:bookmarkStart w:id="17" w:name="_Toc231135550"/>
       <w:r>
         <w:t>1.5 Justificación e importancia del estudio</w:t>
       </w:r>
@@ -9256,7 +9259,7 @@
       <w:pPr>
         <w:pStyle w:val="Ttulo2"/>
       </w:pPr>
-      <w:bookmarkStart w:id="18" w:name="_Toc231121725"/>
+      <w:bookmarkStart w:id="18" w:name="_Toc231135551"/>
       <w:r>
         <w:t>1.6 Hipótesis</w:t>
       </w:r>
@@ -9436,7 +9439,7 @@
       <w:pPr>
         <w:pStyle w:val="Ttulo2"/>
       </w:pPr>
-      <w:bookmarkStart w:id="19" w:name="_Toc231121726"/>
+      <w:bookmarkStart w:id="19" w:name="_Toc231135552"/>
       <w:r>
         <w:t>1.7 Objetivos</w:t>
       </w:r>
@@ -9446,7 +9449,7 @@
       <w:pPr>
         <w:pStyle w:val="Ttulo3"/>
       </w:pPr>
-      <w:bookmarkStart w:id="20" w:name="_Toc231121727"/>
+      <w:bookmarkStart w:id="20" w:name="_Toc231135553"/>
       <w:r>
         <w:t>1.7.1 Objetivo General</w:t>
       </w:r>
@@ -9466,7 +9469,7 @@
       <w:pPr>
         <w:pStyle w:val="Ttulo3"/>
       </w:pPr>
-      <w:bookmarkStart w:id="21" w:name="_Toc231121728"/>
+      <w:bookmarkStart w:id="21" w:name="_Toc231135554"/>
       <w:r>
         <w:t>1.7.2 Objetivos específicos</w:t>
       </w:r>
@@ -9553,7 +9556,7 @@
       <w:pPr>
         <w:pStyle w:val="Ttulo1"/>
       </w:pPr>
-      <w:bookmarkStart w:id="22" w:name="_Toc231121729"/>
+      <w:bookmarkStart w:id="22" w:name="_Toc231135555"/>
       <w:r>
         <w:lastRenderedPageBreak/>
         <w:t>II. MATERIAL Y MÉTODO</w:t>
@@ -9564,7 +9567,7 @@
       <w:pPr>
         <w:pStyle w:val="Ttulo2"/>
       </w:pPr>
-      <w:bookmarkStart w:id="23" w:name="_Toc231121730"/>
+      <w:bookmarkStart w:id="23" w:name="_Toc231135556"/>
       <w:r>
         <w:t>2.1 Tipo y Diseño de Investigación</w:t>
       </w:r>
@@ -9696,7 +9699,7 @@
       <w:pPr>
         <w:pStyle w:val="Ttulo2"/>
       </w:pPr>
-      <w:bookmarkStart w:id="24" w:name="_Toc231121731"/>
+      <w:bookmarkStart w:id="24" w:name="_Toc231135557"/>
       <w:r>
         <w:lastRenderedPageBreak/>
         <w:t>2.2 Población, Muestra y Muestreo</w:t>
@@ -9819,7 +9822,7 @@
       <w:pPr>
         <w:pStyle w:val="Ttulo2"/>
       </w:pPr>
-      <w:bookmarkStart w:id="25" w:name="_Toc231121732"/>
+      <w:bookmarkStart w:id="25" w:name="_Toc231135558"/>
       <w:r>
         <w:t>2.3 Variables y Operacionalización</w:t>
       </w:r>
@@ -9936,7 +9939,7 @@
           <w:rFonts w:hint="eastAsia"/>
         </w:rPr>
       </w:pPr>
-      <w:bookmarkStart w:id="26" w:name="_Toc231121766"/>
+      <w:bookmarkStart w:id="26" w:name="_Toc231135592"/>
       <w:r>
         <w:rPr>
           <w:i w:val="0"/>
@@ -11247,7 +11250,7 @@
       <w:pPr>
         <w:pStyle w:val="Ttulo2"/>
       </w:pPr>
-      <w:bookmarkStart w:id="27" w:name="_Toc231121733"/>
+      <w:bookmarkStart w:id="27" w:name="_Toc231135559"/>
       <w:r>
         <w:lastRenderedPageBreak/>
         <w:t xml:space="preserve">2.4 Técnicas e </w:t>
@@ -11346,7 +11349,7 @@
       <w:pPr>
         <w:pStyle w:val="Ttulo2"/>
       </w:pPr>
-      <w:bookmarkStart w:id="28" w:name="_Toc231121734"/>
+      <w:bookmarkStart w:id="28" w:name="_Toc231135560"/>
       <w:r>
         <w:t>2.5 Procedimiento de análisis de datos</w:t>
       </w:r>
@@ -11620,7 +11623,7 @@
       <w:pPr>
         <w:pStyle w:val="Ttulo2"/>
       </w:pPr>
-      <w:bookmarkStart w:id="29" w:name="_Toc231121735"/>
+      <w:bookmarkStart w:id="29" w:name="_Toc231135561"/>
       <w:r>
         <w:lastRenderedPageBreak/>
         <w:t>2.6 Criterios éticos</w:t>
@@ -11680,7 +11683,7 @@
       <w:pPr>
         <w:pStyle w:val="Ttulo2"/>
       </w:pPr>
-      <w:bookmarkStart w:id="30" w:name="_Toc231121736"/>
+      <w:bookmarkStart w:id="30" w:name="_Toc231135562"/>
       <w:r>
         <w:t>2.7 Criterios de Rigor Científico</w:t>
       </w:r>
@@ -11750,7 +11753,7 @@
       <w:pPr>
         <w:pStyle w:val="Ttulo1"/>
       </w:pPr>
-      <w:bookmarkStart w:id="31" w:name="_Toc231121737"/>
+      <w:bookmarkStart w:id="31" w:name="_Toc231135563"/>
       <w:r>
         <w:lastRenderedPageBreak/>
         <w:t>III. RESULTADOS</w:t>
@@ -11761,7 +11764,7 @@
       <w:pPr>
         <w:pStyle w:val="Ttulo2"/>
       </w:pPr>
-      <w:bookmarkStart w:id="32" w:name="_Toc231121738"/>
+      <w:bookmarkStart w:id="32" w:name="_Toc231135564"/>
       <w:r>
         <w:t>3.1 Presentación de Resultados</w:t>
       </w:r>
@@ -11771,7 +11774,7 @@
       <w:pPr>
         <w:pStyle w:val="Ttulo3"/>
       </w:pPr>
-      <w:bookmarkStart w:id="33" w:name="_Toc231121739"/>
+      <w:bookmarkStart w:id="33" w:name="_Toc231135565"/>
       <w:r>
         <w:t>3.1.1 Análisis descriptivo y propiedades de las series</w:t>
       </w:r>
@@ -11800,7 +11803,7 @@
           <w:noProof/>
         </w:rPr>
         <w:drawing>
-          <wp:inline distT="0" distB="0" distL="0" distR="0" wp14:anchorId="5DC478B9" wp14:editId="555828F2">
+          <wp:inline distT="0" distB="0" distL="0" distR="0" wp14:anchorId="0EFDE55A" wp14:editId="3D5470C2">
             <wp:extent cx="5212080" cy="2886989"/>
             <wp:effectExtent l="0" t="0" r="0" b="0"/>
             <wp:docPr id="1" name="Picture 1"/>
@@ -11845,7 +11848,7 @@
           <w:rFonts w:hint="eastAsia"/>
         </w:rPr>
       </w:pPr>
-      <w:bookmarkStart w:id="34" w:name="_Toc231121780"/>
+      <w:bookmarkStart w:id="34" w:name="_Toc231135606"/>
       <w:r>
         <w:rPr>
           <w:i w:val="0"/>
@@ -11905,7 +11908,7 @@
         </w:rPr>
         <w:lastRenderedPageBreak/>
         <w:drawing>
-          <wp:inline distT="0" distB="0" distL="0" distR="0" wp14:anchorId="3227C0A7" wp14:editId="3A16A05C">
+          <wp:inline distT="0" distB="0" distL="0" distR="0" wp14:anchorId="6B768BC1" wp14:editId="3DDC5DAE">
             <wp:extent cx="5212080" cy="4441320"/>
             <wp:effectExtent l="0" t="0" r="0" b="0"/>
             <wp:docPr id="2" name="Picture 2"/>
@@ -11950,7 +11953,7 @@
           <w:rFonts w:hint="eastAsia"/>
         </w:rPr>
       </w:pPr>
-      <w:bookmarkStart w:id="35" w:name="_Toc231121781"/>
+      <w:bookmarkStart w:id="35" w:name="_Toc231135607"/>
       <w:r>
         <w:rPr>
           <w:i w:val="0"/>
@@ -12007,7 +12010,7 @@
       <w:pPr>
         <w:pStyle w:val="Ttulo3"/>
       </w:pPr>
-      <w:bookmarkStart w:id="36" w:name="_Toc231121740"/>
+      <w:bookmarkStart w:id="36" w:name="_Toc231135566"/>
       <w:r>
         <w:t>3.1.2 Determinantes de los retornos: factores globales y locales</w:t>
       </w:r>
@@ -12032,7 +12035,7 @@
           <w:rFonts w:hint="eastAsia"/>
         </w:rPr>
       </w:pPr>
-      <w:bookmarkStart w:id="37" w:name="_Toc231121767"/>
+      <w:bookmarkStart w:id="37" w:name="_Toc231135593"/>
       <w:r>
         <w:rPr>
           <w:i w:val="0"/>
@@ -12835,7 +12838,7 @@
         </w:rPr>
         <w:lastRenderedPageBreak/>
         <w:drawing>
-          <wp:inline distT="0" distB="0" distL="0" distR="0" wp14:anchorId="1112AD29" wp14:editId="1489B92A">
+          <wp:inline distT="0" distB="0" distL="0" distR="0" wp14:anchorId="4A02ABB6" wp14:editId="6382343D">
             <wp:extent cx="5212080" cy="2833680"/>
             <wp:effectExtent l="0" t="0" r="0" b="0"/>
             <wp:docPr id="3" name="Picture 3"/>
@@ -12880,7 +12883,7 @@
           <w:rFonts w:hint="eastAsia"/>
         </w:rPr>
       </w:pPr>
-      <w:bookmarkStart w:id="38" w:name="_Toc231121782"/>
+      <w:bookmarkStart w:id="38" w:name="_Toc231135608"/>
       <w:r>
         <w:rPr>
           <w:i w:val="0"/>
@@ -12920,7 +12923,7 @@
       <w:pPr>
         <w:pStyle w:val="Ttulo3"/>
       </w:pPr>
-      <w:bookmarkStart w:id="39" w:name="_Toc231121741"/>
+      <w:bookmarkStart w:id="39" w:name="_Toc231135567"/>
       <w:r>
         <w:t>3.1.3 Relaciones de largo plazo</w:t>
       </w:r>
@@ -12965,7 +12968,7 @@
       <w:pPr>
         <w:pStyle w:val="Ttulo3"/>
       </w:pPr>
-      <w:bookmarkStart w:id="40" w:name="_Toc231121742"/>
+      <w:bookmarkStart w:id="40" w:name="_Toc231135568"/>
       <w:r>
         <w:t>3.1.4 Dinámica de shocks</w:t>
       </w:r>
@@ -12998,7 +13001,7 @@
         </w:rPr>
         <w:lastRenderedPageBreak/>
         <w:drawing>
-          <wp:inline distT="0" distB="0" distL="0" distR="0" wp14:anchorId="02914DBD" wp14:editId="1B5FF818">
+          <wp:inline distT="0" distB="0" distL="0" distR="0" wp14:anchorId="151B012C" wp14:editId="4808B5DF">
             <wp:extent cx="5212080" cy="3890356"/>
             <wp:effectExtent l="0" t="0" r="0" b="0"/>
             <wp:docPr id="4" name="Picture 4"/>
@@ -13043,7 +13046,7 @@
           <w:rFonts w:hint="eastAsia"/>
         </w:rPr>
       </w:pPr>
-      <w:bookmarkStart w:id="41" w:name="_Toc231121783"/>
+      <w:bookmarkStart w:id="41" w:name="_Toc231135609"/>
       <w:r>
         <w:rPr>
           <w:i w:val="0"/>
@@ -13100,7 +13103,7 @@
         </w:rPr>
         <w:lastRenderedPageBreak/>
         <w:drawing>
-          <wp:inline distT="0" distB="0" distL="0" distR="0" wp14:anchorId="4BBD7F8C" wp14:editId="3FD2EBA3">
+          <wp:inline distT="0" distB="0" distL="0" distR="0" wp14:anchorId="11361165" wp14:editId="6245F9F3">
             <wp:extent cx="5212080" cy="2531582"/>
             <wp:effectExtent l="0" t="0" r="0" b="0"/>
             <wp:docPr id="5" name="Picture 5"/>
@@ -13145,7 +13148,7 @@
           <w:rFonts w:hint="eastAsia"/>
         </w:rPr>
       </w:pPr>
-      <w:bookmarkStart w:id="42" w:name="_Toc231121784"/>
+      <w:bookmarkStart w:id="42" w:name="_Toc231135610"/>
       <w:r>
         <w:rPr>
           <w:i w:val="0"/>
@@ -13182,7 +13185,7 @@
       <w:pPr>
         <w:pStyle w:val="Ttulo3"/>
       </w:pPr>
-      <w:bookmarkStart w:id="43" w:name="_Toc231121743"/>
+      <w:bookmarkStart w:id="43" w:name="_Toc231135569"/>
       <w:r>
         <w:t>3.1.5 Estabilidad por fases del ciclo</w:t>
       </w:r>
@@ -13224,7 +13227,7 @@
         </w:rPr>
         <w:lastRenderedPageBreak/>
         <w:drawing>
-          <wp:inline distT="0" distB="0" distL="0" distR="0" wp14:anchorId="19A69486" wp14:editId="269C9706">
+          <wp:inline distT="0" distB="0" distL="0" distR="0" wp14:anchorId="3192CA34" wp14:editId="6763E815">
             <wp:extent cx="5212080" cy="2366710"/>
             <wp:effectExtent l="0" t="0" r="0" b="0"/>
             <wp:docPr id="6" name="Picture 6"/>
@@ -13269,7 +13272,7 @@
           <w:rFonts w:hint="eastAsia"/>
         </w:rPr>
       </w:pPr>
-      <w:bookmarkStart w:id="44" w:name="_Toc231121785"/>
+      <w:bookmarkStart w:id="44" w:name="_Toc231135611"/>
       <w:r>
         <w:rPr>
           <w:i w:val="0"/>
@@ -13306,7 +13309,7 @@
       <w:pPr>
         <w:pStyle w:val="Ttulo3"/>
       </w:pPr>
-      <w:bookmarkStart w:id="45" w:name="_Toc231121744"/>
+      <w:bookmarkStart w:id="45" w:name="_Toc231135570"/>
       <w:r>
         <w:t>3.1.6 Comparación entre mercados</w:t>
       </w:r>
@@ -13331,7 +13334,7 @@
           <w:rFonts w:hint="eastAsia"/>
         </w:rPr>
       </w:pPr>
-      <w:bookmarkStart w:id="46" w:name="_Toc231121768"/>
+      <w:bookmarkStart w:id="46" w:name="_Toc231135594"/>
       <w:r>
         <w:rPr>
           <w:i w:val="0"/>
@@ -14009,7 +14012,7 @@
           <w:noProof/>
         </w:rPr>
         <w:drawing>
-          <wp:inline distT="0" distB="0" distL="0" distR="0" wp14:anchorId="605A7973" wp14:editId="09F21A6E">
+          <wp:inline distT="0" distB="0" distL="0" distR="0" wp14:anchorId="7ECB5A7F" wp14:editId="5A5BB76A">
             <wp:extent cx="5212080" cy="2626097"/>
             <wp:effectExtent l="0" t="0" r="0" b="0"/>
             <wp:docPr id="7" name="Picture 7"/>
@@ -14054,7 +14057,7 @@
           <w:rFonts w:hint="eastAsia"/>
         </w:rPr>
       </w:pPr>
-      <w:bookmarkStart w:id="47" w:name="_Toc231121786"/>
+      <w:bookmarkStart w:id="47" w:name="_Toc231135612"/>
       <w:r>
         <w:rPr>
           <w:i w:val="0"/>
@@ -14091,7 +14094,7 @@
       <w:pPr>
         <w:pStyle w:val="Ttulo3"/>
       </w:pPr>
-      <w:bookmarkStart w:id="48" w:name="_Toc231121745"/>
+      <w:bookmarkStart w:id="48" w:name="_Toc231135571"/>
       <w:r>
         <w:t>3.1.7 Diagnósticos y robustez</w:t>
       </w:r>
@@ -14131,7 +14134,7 @@
         </w:rPr>
         <w:lastRenderedPageBreak/>
         <w:drawing>
-          <wp:inline distT="0" distB="0" distL="0" distR="0" wp14:anchorId="27ECA5C9" wp14:editId="3CA0CFDC">
+          <wp:inline distT="0" distB="0" distL="0" distR="0" wp14:anchorId="0B985253" wp14:editId="6D9AF472">
             <wp:extent cx="5212080" cy="2651805"/>
             <wp:effectExtent l="0" t="0" r="0" b="0"/>
             <wp:docPr id="8" name="Picture 8"/>
@@ -14176,7 +14179,7 @@
           <w:rFonts w:hint="eastAsia"/>
         </w:rPr>
       </w:pPr>
-      <w:bookmarkStart w:id="49" w:name="_Toc231121787"/>
+      <w:bookmarkStart w:id="49" w:name="_Toc231135613"/>
       <w:r>
         <w:rPr>
           <w:i w:val="0"/>
@@ -14213,7 +14216,7 @@
       <w:pPr>
         <w:pStyle w:val="Ttulo2"/>
       </w:pPr>
-      <w:bookmarkStart w:id="50" w:name="_Toc231121746"/>
+      <w:bookmarkStart w:id="50" w:name="_Toc231135572"/>
       <w:r>
         <w:t>3.2 Discusión de Resultados</w:t>
       </w:r>
@@ -14343,7 +14346,7 @@
       <w:pPr>
         <w:pStyle w:val="Ttulo2"/>
       </w:pPr>
-      <w:bookmarkStart w:id="51" w:name="_Toc231121747"/>
+      <w:bookmarkStart w:id="51" w:name="_Toc231135573"/>
       <w:r>
         <w:t>3.3 Aporte práctico</w:t>
       </w:r>
@@ -14453,7 +14456,7 @@
       <w:pPr>
         <w:pStyle w:val="Ttulo1"/>
       </w:pPr>
-      <w:bookmarkStart w:id="52" w:name="_Toc231121748"/>
+      <w:bookmarkStart w:id="52" w:name="_Toc231135574"/>
       <w:r>
         <w:lastRenderedPageBreak/>
         <w:t>IV. CONCLUSIONES Y RECOMENDACIONES</w:t>
@@ -14464,7 +14467,7 @@
       <w:pPr>
         <w:pStyle w:val="Ttulo2"/>
       </w:pPr>
-      <w:bookmarkStart w:id="53" w:name="_Toc231121749"/>
+      <w:bookmarkStart w:id="53" w:name="_Toc231135575"/>
       <w:r>
         <w:t>4.1 Conclusiones</w:t>
       </w:r>
@@ -14587,7 +14590,7 @@
       <w:pPr>
         <w:pStyle w:val="Ttulo2"/>
       </w:pPr>
-      <w:bookmarkStart w:id="54" w:name="_Toc231121750"/>
+      <w:bookmarkStart w:id="54" w:name="_Toc231135576"/>
       <w:r>
         <w:t>4.2 Recomendaciones</w:t>
       </w:r>
@@ -14698,7 +14701,7 @@
       <w:pPr>
         <w:pStyle w:val="Ttulo1"/>
       </w:pPr>
-      <w:bookmarkStart w:id="55" w:name="_Toc231121751"/>
+      <w:bookmarkStart w:id="55" w:name="_Toc231135577"/>
       <w:r>
         <w:lastRenderedPageBreak/>
         <w:t>Referencias</w:t>
@@ -15673,7 +15676,7 @@
       <w:pPr>
         <w:pStyle w:val="Ttulo1"/>
       </w:pPr>
-      <w:bookmarkStart w:id="56" w:name="_Toc231121752"/>
+      <w:bookmarkStart w:id="56" w:name="_Toc231135578"/>
       <w:r>
         <w:lastRenderedPageBreak/>
         <w:t>Anexos</w:t>
@@ -15684,7 +15687,7 @@
       <w:pPr>
         <w:pStyle w:val="Ttulo2"/>
       </w:pPr>
-      <w:bookmarkStart w:id="57" w:name="_Toc231121753"/>
+      <w:bookmarkStart w:id="57" w:name="_Toc231135579"/>
       <w:r>
         <w:t>Anexo A. Estadística descriptiva</w:t>
       </w:r>
@@ -15699,7 +15702,7 @@
           <w:rFonts w:hint="eastAsia"/>
         </w:rPr>
       </w:pPr>
-      <w:bookmarkStart w:id="58" w:name="_Toc231121769"/>
+      <w:bookmarkStart w:id="58" w:name="_Toc231135595"/>
       <w:r>
         <w:rPr>
           <w:i w:val="0"/>
@@ -18165,7 +18168,7 @@
       <w:pPr>
         <w:pStyle w:val="Ttulo2"/>
       </w:pPr>
-      <w:bookmarkStart w:id="59" w:name="_Toc231121754"/>
+      <w:bookmarkStart w:id="59" w:name="_Toc231135580"/>
       <w:r>
         <w:t xml:space="preserve">Anexo B. Matriz de </w:t>
       </w:r>
@@ -18183,7 +18186,7 @@
           <w:rFonts w:hint="eastAsia"/>
         </w:rPr>
       </w:pPr>
-      <w:bookmarkStart w:id="60" w:name="_Toc231121770"/>
+      <w:bookmarkStart w:id="60" w:name="_Toc231135596"/>
       <w:r>
         <w:rPr>
           <w:i w:val="0"/>
@@ -20467,7 +20470,7 @@
       <w:pPr>
         <w:pStyle w:val="Ttulo2"/>
       </w:pPr>
-      <w:bookmarkStart w:id="61" w:name="_Toc231121755"/>
+      <w:bookmarkStart w:id="61" w:name="_Toc231135581"/>
       <w:r>
         <w:t xml:space="preserve">Anexo C. </w:t>
       </w:r>
@@ -20485,7 +20488,7 @@
           <w:rFonts w:hint="eastAsia"/>
         </w:rPr>
       </w:pPr>
-      <w:bookmarkStart w:id="62" w:name="_Toc231121771"/>
+      <w:bookmarkStart w:id="62" w:name="_Toc231135597"/>
       <w:r>
         <w:rPr>
           <w:i w:val="0"/>
@@ -21420,7 +21423,7 @@
       <w:pPr>
         <w:pStyle w:val="Ttulo2"/>
       </w:pPr>
-      <w:bookmarkStart w:id="63" w:name="_Toc231121756"/>
+      <w:bookmarkStart w:id="63" w:name="_Toc231135582"/>
       <w:r>
         <w:t>Anexo D. Resultados completos del modelo de panel</w:t>
       </w:r>
@@ -21430,7 +21433,7 @@
       <w:pPr>
         <w:pStyle w:val="Ttulo3"/>
       </w:pPr>
-      <w:bookmarkStart w:id="64" w:name="_Toc231121757"/>
+      <w:bookmarkStart w:id="64" w:name="_Toc231135583"/>
       <w:r>
         <w:t>D.1 Muestra B — cobre, mercado internacional</w:t>
       </w:r>
@@ -21445,7 +21448,7 @@
           <w:rFonts w:hint="eastAsia"/>
         </w:rPr>
       </w:pPr>
-      <w:bookmarkStart w:id="65" w:name="_Toc231121772"/>
+      <w:bookmarkStart w:id="65" w:name="_Toc231135598"/>
       <w:r>
         <w:rPr>
           <w:i w:val="0"/>
@@ -22773,7 +22776,7 @@
       <w:pPr>
         <w:pStyle w:val="Ttulo3"/>
       </w:pPr>
-      <w:bookmarkStart w:id="66" w:name="_Toc231121758"/>
+      <w:bookmarkStart w:id="66" w:name="_Toc231135584"/>
       <w:r>
         <w:t xml:space="preserve">D.2 </w:t>
       </w:r>
@@ -22791,7 +22794,7 @@
           <w:rFonts w:hint="eastAsia"/>
         </w:rPr>
       </w:pPr>
-      <w:bookmarkStart w:id="67" w:name="_Toc231121773"/>
+      <w:bookmarkStart w:id="67" w:name="_Toc231135599"/>
       <w:r>
         <w:rPr>
           <w:i w:val="0"/>
@@ -24112,7 +24115,7 @@
       <w:pPr>
         <w:pStyle w:val="Ttulo3"/>
       </w:pPr>
-      <w:bookmarkStart w:id="68" w:name="_Toc231121759"/>
+      <w:bookmarkStart w:id="68" w:name="_Toc231135585"/>
       <w:r>
         <w:t xml:space="preserve">D.3 Muestra C — </w:t>
       </w:r>
@@ -24130,7 +24133,7 @@
           <w:rFonts w:hint="eastAsia"/>
         </w:rPr>
       </w:pPr>
-      <w:bookmarkStart w:id="69" w:name="_Toc231121774"/>
+      <w:bookmarkStart w:id="69" w:name="_Toc231135600"/>
       <w:r>
         <w:rPr>
           <w:i w:val="0"/>
@@ -25452,7 +25455,7 @@
       <w:pPr>
         <w:pStyle w:val="Ttulo2"/>
       </w:pPr>
-      <w:bookmarkStart w:id="70" w:name="_Toc231121760"/>
+      <w:bookmarkStart w:id="70" w:name="_Toc231135586"/>
       <w:r>
         <w:t xml:space="preserve">Anexo E. Cointegración (test de </w:t>
       </w:r>
@@ -25470,7 +25473,7 @@
           <w:rFonts w:hint="eastAsia"/>
         </w:rPr>
       </w:pPr>
-      <w:bookmarkStart w:id="71" w:name="_Toc231121775"/>
+      <w:bookmarkStart w:id="71" w:name="_Toc231135601"/>
       <w:r>
         <w:rPr>
           <w:i w:val="0"/>
@@ -26219,7 +26222,7 @@
       <w:pPr>
         <w:pStyle w:val="Ttulo2"/>
       </w:pPr>
-      <w:bookmarkStart w:id="72" w:name="_Toc231121761"/>
+      <w:bookmarkStart w:id="72" w:name="_Toc231135587"/>
       <w:r>
         <w:t xml:space="preserve">Anexo F. </w:t>
       </w:r>
@@ -26237,7 +26240,7 @@
           <w:rFonts w:hint="eastAsia"/>
         </w:rPr>
       </w:pPr>
-      <w:bookmarkStart w:id="73" w:name="_Toc231121776"/>
+      <w:bookmarkStart w:id="73" w:name="_Toc231135602"/>
       <w:r>
         <w:rPr>
           <w:i w:val="0"/>
@@ -27147,7 +27150,7 @@
       <w:pPr>
         <w:pStyle w:val="Ttulo2"/>
       </w:pPr>
-      <w:bookmarkStart w:id="74" w:name="_Toc231121762"/>
+      <w:bookmarkStart w:id="74" w:name="_Toc231135588"/>
       <w:r>
         <w:t>Anexo G. Fuentes de datos</w:t>
       </w:r>
@@ -27162,7 +27165,7 @@
           <w:rFonts w:hint="eastAsia"/>
         </w:rPr>
       </w:pPr>
-      <w:bookmarkStart w:id="75" w:name="_Toc231121777"/>
+      <w:bookmarkStart w:id="75" w:name="_Toc231135603"/>
       <w:r>
         <w:rPr>
           <w:i w:val="0"/>
@@ -28449,7 +28452,7 @@
       <w:pPr>
         <w:pStyle w:val="Ttulo2"/>
       </w:pPr>
-      <w:bookmarkStart w:id="76" w:name="_Toc231121763"/>
+      <w:bookmarkStart w:id="76" w:name="_Toc231135589"/>
       <w:r>
         <w:t>Anexo H. Disponibilidad del código</w:t>
       </w:r>
@@ -28492,7 +28495,7 @@
       <w:pPr>
         <w:pStyle w:val="Ttulo2"/>
       </w:pPr>
-      <w:bookmarkStart w:id="77" w:name="_Toc231121764"/>
+      <w:bookmarkStart w:id="77" w:name="_Toc231135590"/>
       <w:r>
         <w:t>Anexo J. Síntesis de pruebas de diagnóstico y robustez</w:t>
       </w:r>
@@ -28520,7 +28523,7 @@
           <w:rFonts w:hint="eastAsia"/>
         </w:rPr>
       </w:pPr>
-      <w:bookmarkStart w:id="78" w:name="_Toc231121778"/>
+      <w:bookmarkStart w:id="78" w:name="_Toc231135604"/>
       <w:r>
         <w:rPr>
           <w:i w:val="0"/>
@@ -29794,7 +29797,7 @@
       <w:pPr>
         <w:pStyle w:val="Ttulo2"/>
       </w:pPr>
-      <w:bookmarkStart w:id="79" w:name="_Toc231121765"/>
+      <w:bookmarkStart w:id="79" w:name="_Toc231135591"/>
       <w:r>
         <w:t>Anexo I. Extensión predictiva: ¿explican o anticipan?</w:t>
       </w:r>
@@ -29828,7 +29831,7 @@
           <w:rFonts w:hint="eastAsia"/>
         </w:rPr>
       </w:pPr>
-      <w:bookmarkStart w:id="80" w:name="_Toc231121779"/>
+      <w:bookmarkStart w:id="80" w:name="_Toc231135605"/>
       <w:r>
         <w:rPr>
           <w:i w:val="0"/>
@@ -30750,7 +30753,7 @@
           <w:noProof/>
         </w:rPr>
         <w:drawing>
-          <wp:inline distT="0" distB="0" distL="0" distR="0" wp14:anchorId="0052FB79" wp14:editId="0A860E8D">
+          <wp:inline distT="0" distB="0" distL="0" distR="0" wp14:anchorId="6CA09F64" wp14:editId="690FA168">
             <wp:extent cx="5212080" cy="2524564"/>
             <wp:effectExtent l="0" t="0" r="0" b="0"/>
             <wp:docPr id="9" name="Picture 9"/>
@@ -30795,7 +30798,7 @@
           <w:rFonts w:hint="eastAsia"/>
         </w:rPr>
       </w:pPr>
-      <w:bookmarkStart w:id="81" w:name="_Toc231121788"/>
+      <w:bookmarkStart w:id="81" w:name="_Toc231135614"/>
       <w:r>
         <w:rPr>
           <w:i w:val="0"/>
@@ -31259,31 +31262,31 @@
       </w:rPr>
     </w:lvl>
   </w:abstractNum>
-  <w:num w:numId="1" w16cid:durableId="112748395">
+  <w:num w:numId="1" w16cid:durableId="336931167">
     <w:abstractNumId w:val="8"/>
   </w:num>
-  <w:num w:numId="2" w16cid:durableId="1660310794">
+  <w:num w:numId="2" w16cid:durableId="1042435156">
     <w:abstractNumId w:val="6"/>
   </w:num>
-  <w:num w:numId="3" w16cid:durableId="1627420872">
+  <w:num w:numId="3" w16cid:durableId="1685785247">
     <w:abstractNumId w:val="5"/>
   </w:num>
-  <w:num w:numId="4" w16cid:durableId="1546480463">
+  <w:num w:numId="4" w16cid:durableId="532154395">
     <w:abstractNumId w:val="4"/>
   </w:num>
-  <w:num w:numId="5" w16cid:durableId="1977837041">
+  <w:num w:numId="5" w16cid:durableId="24792449">
     <w:abstractNumId w:val="7"/>
   </w:num>
-  <w:num w:numId="6" w16cid:durableId="342047774">
+  <w:num w:numId="6" w16cid:durableId="868495276">
     <w:abstractNumId w:val="3"/>
   </w:num>
-  <w:num w:numId="7" w16cid:durableId="2117947401">
+  <w:num w:numId="7" w16cid:durableId="636029407">
     <w:abstractNumId w:val="2"/>
   </w:num>
-  <w:num w:numId="8" w16cid:durableId="1263999077">
+  <w:num w:numId="8" w16cid:durableId="443691029">
     <w:abstractNumId w:val="1"/>
   </w:num>
-  <w:num w:numId="9" w16cid:durableId="767232141">
+  <w:num w:numId="9" w16cid:durableId="815999056">
     <w:abstractNumId w:val="0"/>
   </w:num>
 </w:numbering>
@@ -42685,7 +42688,7 @@
     <w:autoRedefine/>
     <w:uiPriority w:val="39"/>
     <w:unhideWhenUsed/>
-    <w:rsid w:val="005A07B8"/>
+    <w:rsid w:val="00A63069"/>
     <w:pPr>
       <w:spacing w:after="100"/>
     </w:pPr>
@@ -42697,7 +42700,7 @@
     <w:autoRedefine/>
     <w:uiPriority w:val="39"/>
     <w:unhideWhenUsed/>
-    <w:rsid w:val="005A07B8"/>
+    <w:rsid w:val="00A63069"/>
     <w:pPr>
       <w:spacing w:after="100"/>
       <w:ind w:left="240"/>
@@ -42710,7 +42713,7 @@
     <w:autoRedefine/>
     <w:uiPriority w:val="39"/>
     <w:unhideWhenUsed/>
-    <w:rsid w:val="005A07B8"/>
+    <w:rsid w:val="00A63069"/>
     <w:pPr>
       <w:spacing w:after="100"/>
       <w:ind w:left="480"/>
@@ -42721,7 +42724,7 @@
     <w:basedOn w:val="Fuentedeprrafopredeter"/>
     <w:uiPriority w:val="99"/>
     <w:unhideWhenUsed/>
-    <w:rsid w:val="005A07B8"/>
+    <w:rsid w:val="00A63069"/>
     <w:rPr>
       <w:color w:val="0000FF" w:themeColor="hyperlink"/>
       <w:u w:val="single"/>
@@ -42733,7 +42736,7 @@
     <w:next w:val="Normal"/>
     <w:uiPriority w:val="99"/>
     <w:unhideWhenUsed/>
-    <w:rsid w:val="005A07B8"/>
+    <w:rsid w:val="00A63069"/>
     <w:pPr>
       <w:spacing w:after="0"/>
     </w:pPr>

</xml_diff>